<commit_message>
Rebuild tras P1-P9: DOCX/PDF/EPUB, README y auditoría (ítems 28-29)
TOC verificado 37/37 en dos pasadas; figuras 1-9 únicas; 15 sondas de
contenido OK; EPUB con 41 capítulos. 137 pp (133 de cuerpo), ~47.000
palabras, 17 talleres, ~141 referencias.

Co-Authored-By: Claude Fable 5.1 <noreply@anthropic.com>
Claude-Session: https://claude.ai/code/session_01SPkhDdVzUCxJwqq61ddeLW
</commit_message>
<xml_diff>
--- a/libro/Hechos_inferencias_incertidumbre_edicion_revisada.docx
+++ b/libro/Hechos_inferencias_incertidumbre_edicion_revisada.docx
@@ -547,7 +547,7 @@
         <w:rPr>
           <w:color w:val="8A8A8A"/>
         </w:rPr>
-        <w:t xml:space="preserve">58</w:t>
+        <w:t xml:space="preserve">57</w:t>
       </w:r>
     </w:p>
     <w:p>
@@ -567,7 +567,7 @@
         <w:rPr>
           <w:color w:val="8A8A8A"/>
         </w:rPr>
-        <w:t xml:space="preserve">61</w:t>
+        <w:t xml:space="preserve">60</w:t>
       </w:r>
     </w:p>
     <w:p>
@@ -587,7 +587,7 @@
         <w:rPr>
           <w:color w:val="8A8A8A"/>
         </w:rPr>
-        <w:t xml:space="preserve">65</w:t>
+        <w:t xml:space="preserve">64</w:t>
       </w:r>
     </w:p>
     <w:p>
@@ -607,7 +607,7 @@
         <w:rPr>
           <w:color w:val="8A8A8A"/>
         </w:rPr>
-        <w:t xml:space="preserve">70</w:t>
+        <w:t xml:space="preserve">69</w:t>
       </w:r>
     </w:p>
     <w:p>
@@ -627,7 +627,7 @@
         <w:rPr>
           <w:color w:val="8A8A8A"/>
         </w:rPr>
-        <w:t xml:space="preserve">71</w:t>
+        <w:t xml:space="preserve">70</w:t>
       </w:r>
     </w:p>
     <w:p>
@@ -647,7 +647,7 @@
         <w:rPr>
           <w:color w:val="8A8A8A"/>
         </w:rPr>
-        <w:t xml:space="preserve">72</w:t>
+        <w:t xml:space="preserve">71</w:t>
       </w:r>
     </w:p>
     <w:p>
@@ -667,7 +667,7 @@
         <w:rPr>
           <w:color w:val="8A8A8A"/>
         </w:rPr>
-        <w:t xml:space="preserve">78</w:t>
+        <w:t xml:space="preserve">77</w:t>
       </w:r>
     </w:p>
     <w:p>
@@ -687,7 +687,7 @@
         <w:rPr>
           <w:color w:val="8A8A8A"/>
         </w:rPr>
-        <w:t xml:space="preserve">85</w:t>
+        <w:t xml:space="preserve">84</w:t>
       </w:r>
     </w:p>
     <w:p>
@@ -727,7 +727,7 @@
         <w:rPr>
           <w:color w:val="8A8A8A"/>
         </w:rPr>
-        <w:t xml:space="preserve">97</w:t>
+        <w:t xml:space="preserve">98</w:t>
       </w:r>
     </w:p>
     <w:p>
@@ -747,7 +747,7 @@
         <w:rPr>
           <w:color w:val="8A8A8A"/>
         </w:rPr>
-        <w:t xml:space="preserve">105</w:t>
+        <w:t xml:space="preserve">106</w:t>
       </w:r>
     </w:p>
     <w:p>
@@ -767,7 +767,7 @@
         <w:rPr>
           <w:color w:val="8A8A8A"/>
         </w:rPr>
-        <w:t xml:space="preserve">109</w:t>
+        <w:t xml:space="preserve">110</w:t>
       </w:r>
     </w:p>
     <w:p>
@@ -787,7 +787,7 @@
         <w:rPr>
           <w:color w:val="8A8A8A"/>
         </w:rPr>
-        <w:t xml:space="preserve">111</w:t>
+        <w:t xml:space="preserve">112</w:t>
       </w:r>
     </w:p>
     <w:p>
@@ -807,7 +807,7 @@
         <w:rPr>
           <w:color w:val="8A8A8A"/>
         </w:rPr>
-        <w:t xml:space="preserve">113</w:t>
+        <w:t xml:space="preserve">114</w:t>
       </w:r>
     </w:p>
     <w:p>
@@ -827,7 +827,7 @@
         <w:rPr>
           <w:color w:val="8A8A8A"/>
         </w:rPr>
-        <w:t xml:space="preserve">115</w:t>
+        <w:t xml:space="preserve">116</w:t>
       </w:r>
     </w:p>
     <w:p>
@@ -847,7 +847,7 @@
         <w:rPr>
           <w:color w:val="8A8A8A"/>
         </w:rPr>
-        <w:t xml:space="preserve">117</w:t>
+        <w:t xml:space="preserve">118</w:t>
       </w:r>
     </w:p>
     <w:p>
@@ -867,7 +867,7 @@
         <w:rPr>
           <w:color w:val="8A8A8A"/>
         </w:rPr>
-        <w:t xml:space="preserve">121</w:t>
+        <w:t xml:space="preserve">122</w:t>
       </w:r>
     </w:p>
     <w:p>
@@ -887,7 +887,7 @@
         <w:rPr>
           <w:color w:val="8A8A8A"/>
         </w:rPr>
-        <w:t xml:space="preserve">124</w:t>
+        <w:t xml:space="preserve">125</w:t>
       </w:r>
     </w:p>
     <w:p>
@@ -907,7 +907,7 @@
         <w:rPr>
           <w:color w:val="8A8A8A"/>
         </w:rPr>
-        <w:t xml:space="preserve">125</w:t>
+        <w:t xml:space="preserve">126</w:t>
       </w:r>
     </w:p>
     <w:p>
@@ -1308,7 +1308,7 @@
         <w:pStyle w:val="BodyJ"/>
       </w:pPr>
       <w:r>
-        <w:t xml:space="preserve">Estas capas se mezclan con facilidad. Una nota puede escribir "neumonía aspirativa" donde sólo existen infiltrados pulmonares y un episodio de vómito; puede declarar "infección urinaria" ante bacteriuria en un paciente sondado sin evidencia clínica de infección; puede describir "fracaso del manejo conservador" sin explicitar cuál era el objetivo, durante cuánto tiempo fue intentado y qué desenlace cambió el balance. La frase parece resolver el problema, pero en realidad oculta el camino inferencial. La nota de ingreso de Carmen —"cuadro habitual, manejo habitual"— pertenece a esta familia.</w:t>
+        <w:t xml:space="preserve">Estas capas se mezclan con facilidad. Una nota puede declarar "infección urinaria" ante bacteriuria en un paciente sondado sin evidencia clínica de infección; puede escribir "descompensación cardiaca" donde sólo hay edema y una radiografía congestiva; puede describir "fracaso del manejo conservador" sin explicitar cuál era el objetivo, durante cuánto tiempo fue intentado y qué desenlace cambió el balance. La frase parece resolver el problema, pero en realidad oculta el camino inferencial. La nota de ingreso de Carmen —"cuadro habitual, manejo habitual"— pertenece a esta familia.</w:t>
       </w:r>
     </w:p>
     <w:p>
@@ -1537,6 +1537,14 @@
     </w:p>
     <w:p>
       <w:pPr>
+        <w:pStyle w:val="BodyJ"/>
+      </w:pPr>
+      <w:r>
+        <w:t xml:space="preserve">Conviene precisar, antes de seguir, qué estatuto tiene entonces la palabra "hecho" en este libro, porque la carga teórica de la observación parece amenazar la distinción que organiza todo lo demás: si toda observación ya contiene conceptos, ¿dónde termina el hecho y empieza la inferencia? La respuesta es pragmática, no ontológica. "Hecho" es el estatus provisional que un equipo concede a una afirmación cuando acuerda no cuestionarla para la decisión en curso. "Lactato 6,0" es un hecho mientras nadie discuta el método ni la hora; deja de serlo en el instante en que la decisión dependa de si la muestra era venosa o estaba hemolizada, y entonces hay que bajar un nivel y volver a mirar. La frontera entre capas no es una línea en la naturaleza: es una línea que el equipo traza, puede volver a trazar y debe poder mostrar dónde la trazó. Eso —y no compartimentos puros— es lo que la Figura 1 llama separación funcional y gradual.</w:t>
+      </w:r>
+    </w:p>
+    <w:p>
+      <w:pPr>
         <w:pStyle w:val="Heading3"/>
         <w:spacing w:after="120" w:before="280"/>
       </w:pPr>
@@ -1655,7 +1663,7 @@
         <w:pStyle w:val="BodyJ"/>
       </w:pPr>
       <w:r>
-        <w:t xml:space="preserve">Canguilhem mostró que la medicina no describe simplemente desviaciones estadísticas: juzga relaciones entre el organismo, sus normas y su capacidad de habitar un medio (Canguilhem, 1991). El hecho clínico adquiere relevancia dentro de esa relación. Una cifra fuera de rango puede ser irrelevante; una variación dentro del rango puede ser decisiva para ese paciente. La observación científica y la singularidad no son opuestas, pero deben articularse.</w:t>
+        <w:t xml:space="preserve">Canguilhem mostró que la medicina no describe simplemente desviaciones estadísticas: juzga relaciones entre el organismo, sus normas y su capacidad de habitar un medio (Canguilhem, 1971). El hecho clínico adquiere relevancia dentro de esa relación. Una cifra fuera de rango puede ser irrelevante; una variación dentro del rango puede ser decisiva para ese paciente. La observación científica y la singularidad no son opuestas, pero deben articularse.</w:t>
       </w:r>
     </w:p>
     <w:p>
@@ -2438,7 +2446,7 @@
         <w:pStyle w:val="BodyJ"/>
       </w:pPr>
       <w:r>
-        <w:t xml:space="preserve">Los hallazgos negativos exigen especial cautela. "Sin peritonismo" puede significar examen dirigido negativo; "sin evidencia de isquemia en TAC" limita la conclusión al rendimiento de una técnica y a un momento; "no refiere dolor" depende de capacidad comunicativa, neuroanatomía y contexto. El lenguaje debe impedir que ausencia de evidencia se transforme automáticamente en evidencia de ausencia.</w:t>
+        <w:t xml:space="preserve">Los hallazgos negativos exigen especial cautela. "Sin peritonismo" puede significar examen dirigido negativo; "sin evidencia de isquemia en TAC" limita la conclusión al rendimiento de una técnica y a un momento; "no refiere dolor" depende de capacidad comunicativa, neuroanatomía y contexto.</w:t>
       </w:r>
     </w:p>
     <w:p>
@@ -3449,14 +3457,6 @@
     </w:p>
     <w:p>
       <w:pPr>
-        <w:pStyle w:val="BodyJ"/>
-      </w:pPr>
-      <w:r>
-        <w:t xml:space="preserve">Una medicina lúcida no promete eliminar toda incertidumbre. Promete distinguir sus fuentes, comunicar su alcance, proteger al paciente de sus consecuencias y revisar la conducta cuando el mundo entregue nueva información.</w:t>
-      </w:r>
-    </w:p>
-    <w:p>
-      <w:pPr>
         <w:pStyle w:val="TallerHead"/>
       </w:pPr>
       <w:r>
@@ -3628,7 +3628,7 @@
         <w:pStyle w:val="BodyJ"/>
       </w:pPr>
       <w:r>
-        <w:t xml:space="preserve">La filosofía hermenéutica recuerda que comprendemos desde un horizonte lingüístico e histórico. Gadamer sostuvo que el lenguaje es el medio en el que algo llega a ser comprendido; Foucault mostró que la mirada clínica moderna se organizó mediante formas específicas de describir, localizar y correlacionar signos (Foucault, 1973; Gadamer, 1996). Estas perspectivas no obligan a pensar que toda descripción sea relativa. Obligan a reconocer que las categorías hacen visible una parte de la realidad y pueden ocultar otra.</w:t>
+        <w:t xml:space="preserve">La filosofía hermenéutica recuerda que comprendemos desde un horizonte lingüístico e histórico. Gadamer sostuvo que el lenguaje es el medio en el que algo llega a ser comprendido; Foucault mostró que la mirada clínica moderna se organizó mediante formas específicas de describir, localizar y correlacionar signos (Foucault, 1966; Gadamer, 1996). Estas perspectivas no obligan a pensar que toda descripción sea relativa. Obligan a reconocer que las categorías hacen visible una parte de la realidad y pueden ocultar otra.</w:t>
       </w:r>
     </w:p>
     <w:p>
@@ -5509,7 +5509,7 @@
         <w:pStyle w:val="BodyJ"/>
       </w:pPr>
       <w:r>
-        <w:t xml:space="preserve">Aristóteles distinguió el conocimiento teórico de la prudencia práctica, o phronesis: la capacidad de deliberar bien acerca de lo que conviene hacer en situaciones particulares. La clínica comparte esta estructura. La regla general necesita ser aplicada a un caso con bienes en tensión, información incompleta y consecuencias asimétricas (Aristotle, 2009).</w:t>
+        <w:t xml:space="preserve">Aristóteles distinguió el conocimiento teórico de la prudencia práctica, o phronesis: la capacidad de deliberar bien acerca de lo que conviene hacer en situaciones particulares. La clínica comparte esta estructura. La regla general necesita ser aplicada a un caso con bienes en tensión, información incompleta y consecuencias asimétricas (Aristóteles, 1985).</w:t>
       </w:r>
     </w:p>
     <w:p>
@@ -6283,7 +6283,7 @@
         <w:pStyle w:val="BodyJ"/>
       </w:pPr>
       <w:r>
-        <w:t xml:space="preserve">La revisión retrospectiva corre riesgo de hindsight bias: una vez conocido el desenlace, parece que las señales eran evidentes. El análisis debe reconstruir qué era razonable con la información disponible en cada momento. Una decisión puede haber sido racional y terminar mal; otra puede haber sido irracional y terminar bien. Aprender exige separar calidad del proceso y suerte del resultado.</w:t>
+        <w:t xml:space="preserve">La revisión retrospectiva corre riesgo de hindsight bias: una vez conocido el desenlace, parece que las señales eran evidentes. El análisis debe reconstruir qué era razonable con la información disponible en cada momento. Una decisión puede haber sido racional y terminar mal; otra puede haber sido irracional y terminar bien. Aprender exige separar calidad del proceso y suerte del resultado — y la calidad del proceso tiene componentes nombrables: representación, alternativas consideradas, estimación de consecuencias, comunicación, seguimiento y revisabilidad.</w:t>
       </w:r>
     </w:p>
     <w:p>
@@ -6602,6 +6602,14 @@
       </w:pPr>
       <w:r>
         <w:t xml:space="preserve">La particularización exige varias operaciones inferenciales. Primero, establecer si el paciente se parece de manera relevante a la población estudiada. La semejanza no depende sólo de edad o diagnóstico: incluye severidad, fase de enfermedad, tratamientos concomitantes, capacidad funcional, adherencia posible y desenlaces que realmente importan. Segundo, estimar el riesgo basal. Una reducción relativa idéntica produce beneficios absolutos muy diferentes en pacientes con riesgos iniciales distintos. Tercero, considerar modificación del efecto, riesgos competitivos y tiempo necesario para obtener beneficio.</w:t>
+      </w:r>
+    </w:p>
+    <w:p>
+      <w:pPr>
+        <w:pStyle w:val="BodyJ"/>
+      </w:pPr>
+      <w:r>
+        <w:t xml:space="preserve">Conviene hacer la aritmética con Carmen, con cifras inventadas para el ejercicio. Supongamos que un ensayo de reparación electiva frente a manejo expectante mostró una reducción relativa de 50% en la recurrencia obstructiva a dos años, con un riesgo basal de 20% en la población estudiada: diez puntos absolutos, uno de cada diez pacientes operados evita una recurrencia. Carmen no es esa población: con cuatro episodios en doce meses y el último con shock, su riesgo basal plausible es mucho mayor — digamos 60% —, y la misma reducción relativa vale entonces treinta puntos absolutos, casi uno de cada tres. Pero su riesgo quirúrgico también se aleja del promedio del ensayo: EPOC, un shock reciente, un abdomen reoperado. El daño absoluto escala junto con el beneficio. La aritmética no decide por nadie; muestra qué hay que estimar antes de decidir — dos riesgos basales, no uno — y por qué "está indicado por evidencia" es una frase que esconde ambas estimaciones.</w:t>
       </w:r>
     </w:p>
     <w:p>
@@ -7158,23 +7166,55 @@
           <w:sz w:val="25"/>
           <w:szCs w:val="25"/>
         </w:rPr>
-        <w:t xml:space="preserve">Tiempo y reversibilidad</w:t>
-      </w:r>
-    </w:p>
-    <w:p>
-      <w:pPr>
-        <w:pStyle w:val="BodyJ"/>
-      </w:pPr>
-      <w:r>
-        <w:t xml:space="preserve">La misma probabilidad conduce a decisiones distintas según el tiempo. Cuando el daño progresa rápidamente, el valor de esperar información disminuye. Cuando la conducta es reversible, puede iniciarse con un umbral menor y reevaluarse. Cuando es irreversible, la deliberación debe ser más exigente.</w:t>
-      </w:r>
-    </w:p>
-    <w:p>
-      <w:pPr>
-        <w:pStyle w:val="BodyJ"/>
-      </w:pPr>
-      <w:r>
-        <w:t xml:space="preserve">Una forma práctica de pensar incluye cinco dimensiones: probabilidad, magnitud del daño, velocidad de evolución, reversibilidad de la intervención y capacidad de vigilancia. La observación activa no es "no hacer nada" si incluye objetivos, plazos y criterios de escalamiento. Del mismo modo, iniciar tratamiento empírico no significa declarar certeza etiológica.</w:t>
+        <w:t xml:space="preserve">El cruce con la bioética: el contexto global del paciente como hecho clínico</w:t>
+      </w:r>
+    </w:p>
+    <w:p>
+      <w:pPr>
+        <w:pStyle w:val="BodyJ"/>
+      </w:pPr>
+      <w:r>
+        <w:t xml:space="preserve">Hasta aquí, este capítulo pudo leerse como si decidir fuera un problema de dos variables: probabilidad y consecuencias. La bioética obliga a hacer explícita la pregunta que esa fórmula esconde: ¿consecuencias para quién, medidas en qué moneda? Una intervención terapéutica no actúa sobre una enfermedad; actúa sobre una persona que, además de la enfermedad, tiene una funcionalidad previa, una trayectoria de fondo, una red que la sostiene —o no— y fines propios que nadie puede presumir desde el pasillo. Por eso el razonamiento médico y la bioética no se cruzan al final del proceso, cuando alguien convoca al comité de ética: se cruzan en la premisa, en la decisión previa de qué cuenta como hecho relevante del caso.</w:t>
+      </w:r>
+    </w:p>
+    <w:p>
+      <w:pPr>
+        <w:pStyle w:val="BodyJ"/>
+      </w:pPr>
+      <w:r>
+        <w:t xml:space="preserve">El error más frecuente en ese cruce tiene forma epistémica antes que moral: tratar la indicación como una propiedad de la enfermedad y no como una relación entre la intervención y este enfermo. "La estenosis aórtica severa sintomática tiene indicación de reemplazo valvular" es una frase verdadera sobre una población. Que este hombre de 88 años —frágil, con deterioro cognitivo incipiente, dos hospitalizaciones en el semestre y una hija que ya no puede cuidarlo— vaya a vivir mejor con el reemplazo es otra afirmación, que exige otros hechos. Es la distinción del capítulo 9 entre el efecto promedio y el caso singular, ahora con su carga moral a la vista: lo que se pierde cuando se omite el contexto no es sólo precisión; es el paciente.</w:t>
+      </w:r>
+    </w:p>
+    <w:p>
+      <w:pPr>
+        <w:pStyle w:val="BodyJ"/>
+      </w:pPr>
+      <w:r>
+        <w:t xml:space="preserve">Conviene decirlo con todas sus letras: la funcionalidad, el pronóstico de fondo y el soporte sociofamiliar son hechos clínicos de pleno derecho, no ornamentos "psicosociales" de la anamnesis. La funcionalidad se puede evaluar y graduar en minutos, y predice mortalidad y desenlaces con independencia del diagnóstico que motivó el ingreso (Rockwood et al., 2005). La trayectoria de fondo decide el significado de la enfermedad aguda: la neumonía es la misma bacteria en una curva ascendente que en una descendente, pero no es el mismo problema — la lección del capítulo siguiente, aplicada a los fines del tratamiento. Y la red de apoyo convierte una misma orden de alta en dos intervenciones distintas: "alta a domicilio" con alguien en el domicilio es un plan; sin nadie, es un abandono con firma. Cuando estos datos faltan en la ficha no suele ser porque cuesten mucho: es porque el formato no los pide. Son hechos que la capa H debe registrar para que la capa D pueda usarlos.</w:t>
+      </w:r>
+    </w:p>
+    <w:p>
+      <w:pPr>
+        <w:pStyle w:val="BodyJ"/>
+      </w:pPr>
+      <w:r>
+        <w:t xml:space="preserve">La bioética clínica ofrece herramientas de trabajo para este cruce, y la más difundida tiene un aire de familia con HII-D. Jonsen, Siegler y Winslade propusieron ordenar todo caso en cuatro tópicos: indicaciones médicas, preferencias del paciente, calidad de vida y rasgos contextuales — familia, cultura, recursos, ley (Jonsen, Siegler &amp; Winslade, 2022). El orden importa y no es una jerarquía: las indicaciones van primero porque sin ellas no hay caso, pero nunca van solas. Usado con honestidad, el método funciona como una lista de verificación deliberativa: ningún cuadrante puede quedar vacío sin que la decisión quede coja, y el cuadrante que más cuesta llenar señala exactamente qué conversación falta.</w:t>
+      </w:r>
+    </w:p>
+    <w:p>
+      <w:pPr>
+        <w:pStyle w:val="BodyJ"/>
+      </w:pPr>
+      <w:r>
+        <w:t xml:space="preserve">Dos ideas del mundo hispanohablante completan la caja. La primera es la proporcionalidad terapéutica: la obligación moral de implementar sólo aquellas medidas que guarden debida proporción entre los medios empleados y el resultado previsible (Taboada, 2000). El juicio de proporcionalidad integra pronóstico, cargas de la intervención y fines del paciente — y por eso depende por completo de la calidad epistémica que este libro viene trabajando: un pronóstico inflado por certeza retórica no produce una decisión más esperanzadora; produce un juicio de proporcionalidad falso. La segunda es la deliberación como método (Gracia, 2001): cuando los valores entran en conflicto, la decisión no se calcula, se delibera — identificar qué valores chocan, enumerar los cursos de acción extremos, buscar los intermedios y elegir el curso prudente que pueda defenderse en público. La deliberación es a los valores lo que el diagnóstico diferencial a las hipótesis: un método para no quedarse con la primera respuesta disponible. Los cursos extremos — "hacer todo", "no hacer nada" — casi nunca son los prudentes, y suelen ser los que se eligen cuando nadie deliberó.</w:t>
+      </w:r>
+    </w:p>
+    <w:p>
+      <w:pPr>
+        <w:pStyle w:val="BodyJ"/>
+      </w:pPr>
+      <w:r>
+        <w:t xml:space="preserve">El lector encontrará este cruce ejecutado dos veces en este libro sin la palabra "bioética": en la conversación donde la cirujana recomienda operar a Carmen y le devuelve la decisión (Interludio III), y en la viñeta del final de la vida, donde la incertidumbre que domina no es pronóstica sino de metas (Cuaderno de casos, viñeta 7). En ambas, lo decisivo no fue un principio abstracto: fue que la funcionalidad, la trayectoria y los fines del paciente estuvieran dentro del razonamiento desde el principio. Esa es la tesis de esta sección: la bioética no llega al final a ponerle límites a un razonamiento ya terminado — estaba en el principio, decidiendo qué se mira. Una decisión que ignoró la funcionalidad, el pronóstico de fondo y la red de apoyo no es más "objetiva" por haberse limitado a lo técnico: es más incompleta. Le faltan hechos, no sólo sensibilidad.</w:t>
       </w:r>
     </w:p>
     <w:p>
@@ -7191,104 +7231,6 @@
           <w:sz w:val="25"/>
           <w:szCs w:val="25"/>
         </w:rPr>
-        <w:t xml:space="preserve">Decisiones correctas con desenlaces adversos</w:t>
-      </w:r>
-    </w:p>
-    <w:p>
-      <w:pPr>
-        <w:pStyle w:val="BodyJ"/>
-      </w:pPr>
-      <w:r>
-        <w:t xml:space="preserve">Evaluar una decisión sólo por su resultado produce sesgo. Un médico puede actuar racionalmente con la información disponible y enfrentar un desenlace improbable. También puede tomar una decisión débil y obtener buen resultado por evolución favorable. La calidad debe juzgarse por proceso: representación, alternativas, estimación de consecuencias, comunicación, seguimiento y revisabilidad.</w:t>
-      </w:r>
-    </w:p>
-    <w:p>
-      <w:pPr>
-        <w:pStyle w:val="BodyJ"/>
-      </w:pPr>
-      <w:r>
-        <w:t xml:space="preserve">Esto tiene implicancias éticas. Reconocer incertidumbre no disminuye responsabilidad; la hace más precisa. El médico es responsable de buscar la información razonablemente accesible, interpretar con competencia, comunicar límites y establecer una estrategia de reevaluación. No es responsable de volver determinista un mundo que no lo es.</w:t>
-      </w:r>
-    </w:p>
-    <w:p>
-      <w:pPr>
-        <w:pStyle w:val="Heading3"/>
-        <w:spacing w:after="120" w:before="280"/>
-      </w:pPr>
-      <w:r>
-        <w:rPr>
-          <w:rFonts w:ascii="Georgia" w:cs="Georgia" w:eastAsia="Georgia" w:hAnsi="Georgia"/>
-          <w:b/>
-          <w:bCs/>
-          <w:color w:val="2B2B2B"/>
-          <w:sz w:val="25"/>
-          <w:szCs w:val="25"/>
-        </w:rPr>
-        <w:t xml:space="preserve">El cruce con la bioética: el contexto global del paciente como hecho clínico</w:t>
-      </w:r>
-    </w:p>
-    <w:p>
-      <w:pPr>
-        <w:pStyle w:val="BodyJ"/>
-      </w:pPr>
-      <w:r>
-        <w:t xml:space="preserve">Hasta aquí, este capítulo pudo leerse como si decidir fuera un problema de dos variables: probabilidad y consecuencias. La bioética obliga a hacer explícita la pregunta que esa fórmula esconde: ¿consecuencias para quién, medidas en qué moneda? Una intervención terapéutica no actúa sobre una enfermedad; actúa sobre una persona que, además de la enfermedad, tiene una funcionalidad previa, una trayectoria de fondo, una red que la sostiene —o no— y fines propios que nadie puede presumir desde el pasillo. Por eso el razonamiento médico y la bioética no se cruzan al final del proceso, cuando alguien convoca al comité de ética: se cruzan en la premisa, en la decisión previa de qué cuenta como hecho relevante del caso.</w:t>
-      </w:r>
-    </w:p>
-    <w:p>
-      <w:pPr>
-        <w:pStyle w:val="BodyJ"/>
-      </w:pPr>
-      <w:r>
-        <w:t xml:space="preserve">El error más frecuente en ese cruce tiene forma epistémica antes que moral: tratar la indicación como una propiedad de la enfermedad y no como una relación entre la intervención y este enfermo. "La estenosis aórtica severa sintomática tiene indicación de reemplazo valvular" es una frase verdadera sobre una población. Que este hombre de 88 años —frágil, con deterioro cognitivo incipiente, dos hospitalizaciones en el semestre y una hija que ya no puede cuidarlo— vaya a vivir mejor con el reemplazo es otra afirmación, que exige otros hechos. Es la distinción del capítulo 9 entre el efecto promedio y el caso singular, ahora con su carga moral a la vista: lo que se pierde cuando se omite el contexto no es sólo precisión; es el paciente.</w:t>
-      </w:r>
-    </w:p>
-    <w:p>
-      <w:pPr>
-        <w:pStyle w:val="BodyJ"/>
-      </w:pPr>
-      <w:r>
-        <w:t xml:space="preserve">Conviene decirlo con todas sus letras: la funcionalidad, el pronóstico de fondo y el soporte sociofamiliar son hechos clínicos de pleno derecho, no ornamentos "psicosociales" de la anamnesis. La funcionalidad se puede evaluar y graduar en minutos, y predice mortalidad y desenlaces con independencia del diagnóstico que motivó el ingreso (Rockwood et al., 2005). La trayectoria de fondo decide el significado de la enfermedad aguda: la neumonía es la misma bacteria en una curva ascendente que en una descendente, pero no es el mismo problema — la lección del capítulo siguiente, aplicada a los fines del tratamiento. Y la red de apoyo convierte una misma orden de alta en dos intervenciones distintas: "alta a domicilio" con alguien en el domicilio es un plan; sin nadie, es un abandono con firma. Cuando estos datos faltan en la ficha no suele ser porque cuesten mucho: es porque el formato no los pide. Son hechos que la capa H debe registrar para que la capa D pueda usarlos.</w:t>
-      </w:r>
-    </w:p>
-    <w:p>
-      <w:pPr>
-        <w:pStyle w:val="BodyJ"/>
-      </w:pPr>
-      <w:r>
-        <w:t xml:space="preserve">La bioética clínica ofrece herramientas de trabajo para este cruce, y la más difundida tiene un aire de familia con HII-D. Jonsen, Siegler y Winslade propusieron ordenar todo caso en cuatro tópicos: indicaciones médicas, preferencias del paciente, calidad de vida y rasgos contextuales — familia, cultura, recursos, ley (Jonsen, Siegler &amp; Winslade, 2022). El orden importa y no es una jerarquía: las indicaciones van primero porque sin ellas no hay caso, pero nunca van solas. Usado con honestidad, el método funciona como una lista de verificación deliberativa: ningún cuadrante puede quedar vacío sin que la decisión quede coja, y el cuadrante que más cuesta llenar señala exactamente qué conversación falta.</w:t>
-      </w:r>
-    </w:p>
-    <w:p>
-      <w:pPr>
-        <w:pStyle w:val="BodyJ"/>
-      </w:pPr>
-      <w:r>
-        <w:t xml:space="preserve">Dos ideas del mundo hispanohablante completan la caja. La primera es la proporcionalidad terapéutica: la obligación moral de implementar sólo aquellas medidas que guarden debida proporción entre los medios empleados y el resultado previsible (Taboada, 2000). El juicio de proporcionalidad integra pronóstico, cargas de la intervención y fines del paciente — y por eso depende por completo de la calidad epistémica que este libro viene trabajando: un pronóstico inflado por certeza retórica no produce una decisión más esperanzadora; produce un juicio de proporcionalidad falso. La segunda es la deliberación como método (Gracia, 2001): cuando los valores entran en conflicto, la decisión no se calcula, se delibera — identificar qué valores chocan, enumerar los cursos de acción extremos, buscar los intermedios y elegir el curso prudente que pueda defenderse en público. La deliberación es a los valores lo que el diagnóstico diferencial a las hipótesis: un método para no quedarse con la primera respuesta disponible. Los cursos extremos — "hacer todo", "no hacer nada" — casi nunca son los prudentes, y suelen ser los que se eligen cuando nadie deliberó.</w:t>
-      </w:r>
-    </w:p>
-    <w:p>
-      <w:pPr>
-        <w:pStyle w:val="BodyJ"/>
-      </w:pPr>
-      <w:r>
-        <w:t xml:space="preserve">El lector encontrará este cruce ejecutado dos veces en este libro sin la palabra "bioética": en la conversación donde la cirujana recomienda operar a Carmen y le devuelve la decisión (Interludio III), y en la viñeta del final de la vida, donde la incertidumbre que domina no es pronóstica sino de metas (Cuaderno de casos, viñeta 7). En ambas, lo decisivo no fue un principio abstracto: fue que la funcionalidad, la trayectoria y los fines del paciente estuvieran dentro del razonamiento desde el principio. Esa es la tesis de esta sección: la bioética no llega al final a ponerle límites a un razonamiento ya terminado — estaba en el principio, decidiendo qué se mira. Una decisión que ignoró la funcionalidad, el pronóstico de fondo y la red de apoyo no es más "objetiva" por haberse limitado a lo técnico: es más incompleta. Le faltan hechos, no sólo sensibilidad.</w:t>
-      </w:r>
-    </w:p>
-    <w:p>
-      <w:pPr>
-        <w:pStyle w:val="Heading3"/>
-        <w:spacing w:after="120" w:before="280"/>
-      </w:pPr>
-      <w:r>
-        <w:rPr>
-          <w:rFonts w:ascii="Georgia" w:cs="Georgia" w:eastAsia="Georgia" w:hAnsi="Georgia"/>
-          <w:b/>
-          <w:bCs/>
-          <w:color w:val="2B2B2B"/>
-          <w:sz w:val="25"/>
-          <w:szCs w:val="25"/>
-        </w:rPr>
         <w:t xml:space="preserve">Certeza epistémica y compromiso práctico</w:t>
       </w:r>
     </w:p>
@@ -7298,6 +7240,14 @@
       </w:pPr>
       <w:r>
         <w:t xml:space="preserve">Puede existir alta incertidumbre epistémica y fuerte compromiso práctico. "No conocemos el foco con certeza, pero el cuadro exige antibióticos y control de fuente mientras se investiga." También puede existir alta certeza diagnóstica y decisión expectante. Confundir ambos planos lleva a tratar para demostrar convicción o a retrasar una acción porque el nombre no está completo.</w:t>
+      </w:r>
+    </w:p>
+    <w:p>
+      <w:pPr>
+        <w:pStyle w:val="BodyJ"/>
+      </w:pPr>
+      <w:r>
+        <w:t xml:space="preserve">Reconocer incertidumbre no disminuye la responsabilidad; la hace más precisa. El médico responde por buscar la información razonablemente accesible, interpretar con competencia, comunicar límites y establecer una estrategia de reevaluación — no por volver determinista un mundo que no lo es.</w:t>
       </w:r>
     </w:p>
     <w:p>
@@ -7651,23 +7601,23 @@
           <w:sz w:val="25"/>
           <w:szCs w:val="25"/>
         </w:rPr>
-        <w:t xml:space="preserve">Causalidad y contrafactuales</w:t>
-      </w:r>
-    </w:p>
-    <w:p>
-      <w:pPr>
-        <w:pStyle w:val="BodyJ"/>
-      </w:pPr>
-      <w:r>
-        <w:t xml:space="preserve">Las afirmaciones causales contienen una comparación implícita: qué habría ocurrido sin la exposición, sin la enfermedad o sin la intervención. Ese escenario contrafactual no puede observarse simultáneamente en el mismo paciente. La inferencia causal utiliza comparadores, mecanismos, secuencia y diseños de estudio para aproximarse a él (Hernán &amp; Robins, 2020; Pearl &amp; Mackenzie, 2018). En clínica, los contrafactuales también sirven como disciplina mental: "si esta hipótesis fuera falsa, ¿qué patrón alternativo esperaría?"; "si no intervengo hoy, ¿qué desenlace evitable se vuelve plausible?"; "si operamos y el mecanismo supuesto no existe, ¿qué daño habremos causado?".</w:t>
-      </w:r>
-    </w:p>
-    <w:p>
-      <w:pPr>
-        <w:pStyle w:val="BodyJ"/>
-      </w:pPr>
-      <w:r>
-        <w:t xml:space="preserve">El razonamiento contrafactual puede esclarecer, pero también fabricar certezas retrospectivas. Tras un desenlace adverso es fácil imaginar que otra decisión lo habría evitado. Para que el contrafactual sea serio debe respetar la información, opciones y recursos disponibles en el momento. La evaluación de una decisión no debe contaminarse por el conocimiento posterior del desenlace.</w:t>
+        <w:t xml:space="preserve">Tiempo, reversibilidad y umbral</w:t>
+      </w:r>
+    </w:p>
+    <w:p>
+      <w:pPr>
+        <w:pStyle w:val="BodyJ"/>
+      </w:pPr>
+      <w:r>
+        <w:t xml:space="preserve">La misma probabilidad conduce a decisiones distintas según el tiempo: el umbral del capítulo anterior no está fijo en el eje temporal. Cuando el daño progresa rápidamente, el valor de esperar información disminuye. Cuando la conducta es reversible, puede iniciarse con un umbral menor y reevaluarse. Cuando es irreversible, la deliberación debe ser más exigente — y el tiempo que se compra con una medida reversible es, a menudo, la mejor inversión diagnóstica disponible.</w:t>
+      </w:r>
+    </w:p>
+    <w:p>
+      <w:pPr>
+        <w:pStyle w:val="BodyJ"/>
+      </w:pPr>
+      <w:r>
+        <w:t xml:space="preserve">Una forma práctica de pensar incluye cinco dimensiones: probabilidad, magnitud del daño, velocidad de evolución, reversibilidad de la intervención y capacidad de vigilancia. Iniciar un tratamiento empírico no declara certeza etiológica; declara que, con esta velocidad y esta reversibilidad, actuar supera a esperar. El taller de este capítulo pone la alternativa —esperar con diseño— por escrito.</w:t>
       </w:r>
     </w:p>
     <w:p>
@@ -7684,6 +7634,39 @@
           <w:sz w:val="25"/>
           <w:szCs w:val="25"/>
         </w:rPr>
+        <w:t xml:space="preserve">Causalidad y contrafactuales</w:t>
+      </w:r>
+    </w:p>
+    <w:p>
+      <w:pPr>
+        <w:pStyle w:val="BodyJ"/>
+      </w:pPr>
+      <w:r>
+        <w:t xml:space="preserve">Las afirmaciones causales contienen una comparación implícita: qué habría ocurrido sin la exposición, sin la enfermedad o sin la intervención. Ese escenario contrafactual no puede observarse simultáneamente en el mismo paciente. La inferencia causal utiliza comparadores, mecanismos, secuencia y diseños de estudio para aproximarse a él (Hernán &amp; Robins, 2020; Pearl &amp; Mackenzie, 2018). En clínica, los contrafactuales también sirven como disciplina mental: "si esta hipótesis fuera falsa, ¿qué patrón alternativo esperaría?"; "si no intervengo hoy, ¿qué desenlace evitable se vuelve plausible?"; "si operamos y el mecanismo supuesto no existe, ¿qué daño habremos causado?".</w:t>
+      </w:r>
+    </w:p>
+    <w:p>
+      <w:pPr>
+        <w:pStyle w:val="BodyJ"/>
+      </w:pPr>
+      <w:r>
+        <w:t xml:space="preserve">El razonamiento contrafactual puede esclarecer, pero también fabricar certezas retrospectivas. Tras un desenlace adverso es fácil imaginar que otra decisión lo habría evitado. Para que el contrafactual sea serio debe respetar la información, opciones y recursos disponibles en el momento. La evaluación de una decisión no debe contaminarse por el conocimiento posterior del desenlace.</w:t>
+      </w:r>
+    </w:p>
+    <w:p>
+      <w:pPr>
+        <w:pStyle w:val="Heading3"/>
+        <w:spacing w:after="120" w:before="280"/>
+      </w:pPr>
+      <w:r>
+        <w:rPr>
+          <w:rFonts w:ascii="Georgia" w:cs="Georgia" w:eastAsia="Georgia" w:hAnsi="Georgia"/>
+          <w:b/>
+          <w:bCs/>
+          <w:color w:val="2B2B2B"/>
+          <w:sz w:val="25"/>
+          <w:szCs w:val="25"/>
+        </w:rPr>
         <w:t xml:space="preserve">Puntos de inflexión</w:t>
       </w:r>
     </w:p>
@@ -7907,7 +7890,7 @@
         <w:pStyle w:val="BodyJ"/>
       </w:pPr>
       <w:r>
-        <w:t xml:space="preserve">Foucault mostró que la clínica moderna no nació simplemente de mirar mejor, sino de reorganizar qué era decible y registrable: el hospital, la autopsia y el registro crearon un espacio donde ciertos fenómenos pudieron convertirse en signos y otros ni siquiera podían formularse (Foucault, 1973). La ficha contemporánea hace hoy ese mismo trabajo, silenciosamente. Sus campos deciden qué existe institucionalmente: si la plantilla tiene casilla para "dolor EVA" pero no hay lugar para "esta vez el dolor era otro", la primera afirmación sobrevivirá en el registro y la segunda morirá en el pasillo. Lo que no cabe en el formulario no se pierde por descuido; se pierde por diseño.</w:t>
+        <w:t xml:space="preserve">Foucault mostró que la clínica moderna no nació simplemente de mirar mejor, sino de reorganizar qué era decible y registrable: el hospital, la autopsia y el registro crearon un espacio donde ciertos fenómenos pudieron convertirse en signos y otros ni siquiera podían formularse (Foucault, 1966). La ficha contemporánea hace hoy ese mismo trabajo, silenciosamente. Sus campos deciden qué existe institucionalmente: si la plantilla tiene casilla para "dolor EVA" pero no hay lugar para "esta vez el dolor era otro", la primera afirmación sobrevivirá en el registro y la segunda morirá en el pasillo. Lo que no cabe en el formulario no se pierde por descuido; se pierde por diseño.</w:t>
       </w:r>
     </w:p>
     <w:p>
@@ -7948,7 +7931,7 @@
         <w:pStyle w:val="BodyJ"/>
       </w:pPr>
       <w:r>
-        <w:t xml:space="preserve">El copiado automático amenaza esta función. Una formulación inicial se reproduce durante días, aun cuando la evidencia cambió. El registro deja de representar el estado actual y se transforma en fósil narrativo. Cada evolución debería responder qué cambió en hechos, interpretación, incertidumbre y plan.</w:t>
+        <w:t xml:space="preserve">El copiado automático amenaza esta función. Una formulación inicial se reproduce durante días, aun cuando la evidencia cambió. El registro deja de representar el estado actual y se transforma en fósil narrativo. La magnitud del fenómeno ya fue medida: en 23.630 notas de evolución hospitalarias con trazabilidad de cada carácter, sólo el 18% del texto había sido escrito a mano; el 46% venía copiado de notas previas y el 36% importado automáticamente desde otras partes del registro (Wang, Khanna &amp; Najafi, 2017). Cuatro de cada cinco palabras de una evolución típica no fueron pensadas el día en que aparecen firmadas. Cada evolución debería responder qué cambió en hechos, interpretación, incertidumbre y plan.</w:t>
       </w:r>
     </w:p>
     <w:p>
@@ -8212,14 +8195,6 @@
     </w:p>
     <w:p>
       <w:pPr>
-        <w:pStyle w:val="BodyJ"/>
-      </w:pPr>
-      <w:r>
-        <w:t xml:space="preserve">Escribir bien no es cosmética. Es una intervención sobre el razonamiento colectivo. La frase que mezcla capas puede perpetuar error; la que las distingue crea una oportunidad de corrección.</w:t>
-      </w:r>
-    </w:p>
-    <w:p>
-      <w:pPr>
         <w:pStyle w:val="TallerHead"/>
       </w:pPr>
       <w:r>
@@ -8426,6 +8401,14 @@
     </w:p>
     <w:p>
       <w:pPr>
+        <w:pStyle w:val="BodyJ"/>
+      </w:pPr>
+      <w:r>
+        <w:t xml:space="preserve">Vuelva a la nota de las 2:00. "Más quejumbrosa, rechaza la cena, diuresis límite" contiene tres hechos de pleno derecho que ninguna nota médica de ese día posee: un cambio respecto del basal observado por quien ve a la paciente cada dos horas y no una vez al día; una conducta —rechazar la comida en alguien que venía comiendo— que es dato y no anécdota; y una tendencia que precede en horas a la cifra que activará la alarma. Es la observación profesional de la tabla del capítulo 1 en su forma más valiosa: la serie temporal corta, que sólo enfermería posee. Lo que la frase de las 8:00 hizo —"sin novedades"— no fue mentir: fue aplicar a esa fuente un estándar de relevancia que no se aplica a la propia. La cognición distribuida empieza por conceder a cada integrante su acceso privilegiado, y el de enfermería es el tiempo entre visitas médicas — exactamente donde los pacientes se deterioran.</w:t>
+      </w:r>
+    </w:p>
+    <w:p>
+      <w:pPr>
         <w:pStyle w:val="Heading3"/>
         <w:spacing w:after="120" w:before="280"/>
       </w:pPr>
@@ -8984,6 +8967,14 @@
       </w:pPr>
       <w:r>
         <w:t xml:space="preserve">La hija pregunta si la cirugía "garantiza" que no habrá más obstrucciones. "No", dice la cirujana, "baja mucho la probabilidad; no la hace cero. Si le dijera otra cosa, le estaría mintiendo."</w:t>
+      </w:r>
+    </w:p>
+    <w:p>
+      <w:pPr>
+        <w:pStyle w:val="BodyJ"/>
+      </w:pPr>
+      <w:r>
+        <w:t xml:space="preserve">Carmen se queda callada un momento y después habla más de lo que había hablado en tres semanas: "Yo no quiero otra noche como esa. Pensé que me moría, y mi hija también. Pero tampoco quiero que me abran si no hace falta: la otra vez tardé meses en pararme derecha. Lo que necesito saber es si después de esto voy a poder seguir cuidando a mi nieta". La pregunta no figuraba en ninguna escala de riesgo quirúrgico y era la que ordenaba todas las demás; la cirujana la anotó antes de responder.</w:t>
       </w:r>
     </w:p>
     <w:p>
@@ -11367,7 +11358,7 @@
         <w:t xml:space="preserve">Epílogo.</w:t>
       </w:r>
       <w:r>
-        <w:t xml:space="preserve"> Carmen fue operada seis semanas después, en forma programada. La cirugía encontró adherencias firmes y un anillo herniario estrecho; no hubo complicaciones mayores. Nada de eso demuestra que la decisión fue correcta —un desenlace no valida un proceso—, pero el proceso era defendible antes de conocer el desenlace, que es lo único que puede pedírsele a una decisión clínica. La frase de su ingreso, "cuadro habitual, manejo habitual", quedó en la ficha como lo que era: la hipótesis rápida que el trabajo de tres semanas convirtió en otra cosa.</w:t>
+        <w:t xml:space="preserve"> Carmen fue operada seis semanas después, en forma programada. La cirugía encontró adherencias firmes y un anillo herniario estrecho; no hubo complicaciones mayores. En el control del mes, Carmen puso su propia frase medular: "Esta vez el dolor venía con explicación, y eso lo cambia todo". Nada de eso demuestra que la decisión fue correcta —un desenlace no valida un proceso—, pero el proceso era defendible antes de conocer el desenlace, que es lo único que puede pedírsele a una decisión clínica. La frase de su ingreso, "cuadro habitual, manejo habitual", quedó en la ficha como lo que era: la hipótesis rápida que el trabajo de tres semanas convirtió en otra cosa.</w:t>
       </w:r>
     </w:p>
     <w:p>
@@ -12037,7 +12028,7 @@
         <w:pStyle w:val="BodyJ"/>
       </w:pPr>
       <w:r>
-        <w:t xml:space="preserve">Esta viñeta analiza un error completo, con la disciplina del capítulo 8: sin usar nombres de sesgos y sin dejar que el desenlace conocido juzgue lo que era razonable saber en cada momento.</w:t>
+        <w:t xml:space="preserve">Esta viñeta analiza un error completo, con la disciplina de los capítulos 7 y 8: sin usar nombres de sesgos y sin dejar que el desenlace conocido juzgue lo que era razonable saber en cada momento.</w:t>
       </w:r>
     </w:p>
     <w:p>
@@ -12052,7 +12043,7 @@
         <w:t xml:space="preserve">El caso.</w:t>
       </w:r>
       <w:r>
-        <w:t xml:space="preserve"> Mujer de 82 años, traída de su casa por "compromiso del estado general". Nota de ingreso nocturno: "ITU en anciana, frecuente en ella según hija; orina de mal olor. Se inicia ceftriaxona". Día 2: "afebril, sigue decaída, ITU en tratamiento". Día 3: "evolución lenta, propia de la edad". Noche del día 3: hipotensión, abdomen agudo; laparotomía: colecistitis gangrenosa. Sobrevive tras UCI prolongada.</w:t>
+        <w:t xml:space="preserve"> Mujer de 29 años consulta en urgencias a las 23:40 por disnea súbita de dos horas, palpitaciones y "sensación de que me voy a morir". Antecedente de trastorno de pánico en tratamiento; la nota de triage dice "paciente ansiosa, crisis de pánico conocida". Frecuencia cardiaca 118, saturación 94% ambiental, examen "sin hallazgos". Nota médica: "Crisis de pánico en paciente con antecedente. Lorazepam sublingual. Alta con control en salud mental". A las 36 horas reconsulta traída por su pareja tras un síncope en el baño: tromboembolismo pulmonar bilateral con sobrecarga ventricular derecha. Sobrevive tras trombólisis.</w:t>
       </w:r>
     </w:p>
     <w:p>
@@ -12074,20 +12065,20 @@
           <w:b/>
           <w:bCs/>
         </w:rPr>
-        <w:t xml:space="preserve">Hechos disponibles el día 1:</w:t>
-      </w:r>
-      <w:r>
-        <w:t xml:space="preserve"> compromiso general inespecífico (relato); "ITU frecuente" (dato heredado de la hija, nunca verificado en registros); orina de mal olor (observación de baja especificidad); sin fiebre documentada; abdomen "blando" en un examen nocturno no dirigido; sin laboratorio hepático solicitado. </w:t>
-      </w:r>
-      <w:r>
-        <w:rPr>
-          <w:b/>
-          <w:bCs/>
-        </w:rPr>
-        <w:t xml:space="preserve">Inferencia del día 1:</w:t>
-      </w:r>
-      <w:r>
-        <w:t xml:space="preserve"> "ITU" —formulada como hecho, no como hipótesis; fuerza real: posible, apoyada sobre todo en la frecuencia de la etiqueta en ancianas y en el dato heredado. </w:t>
+        <w:t xml:space="preserve">Hechos disponibles la primera noche:</w:t>
+      </w:r>
+      <w:r>
+        <w:t xml:space="preserve"> disnea súbita (relato, con inicio preciso); taquicardia de 118 al ingreso y de 112 al alta, una hora después de la benzodiacepina (dato medido, registrado y no interpretado); saturación 94% (medida; "normal para una paciente que hiperventila", se dijo en voz alta — pero la hiperventilación sube la saturación, no la baja); uso de anticonceptivos orales combinados y un viaje en bus de nueve horas tres días antes (dos hechos que existían y que nadie preguntó, porque la pregunta que los convoca —"¿qué más podría ser?"— no se formuló); y una etiqueta heredada del triage, "crisis de pánico conocida", que entró a la nota médica con estatus de diagnóstico antes de que el médico viera a la paciente. </w:t>
+      </w:r>
+      <w:r>
+        <w:rPr>
+          <w:b/>
+          <w:bCs/>
+        </w:rPr>
+        <w:t xml:space="preserve">Inferencia de la primera noche:</w:t>
+      </w:r>
+      <w:r>
+        <w:t xml:space="preserve"> "crisis de pánico" — escrita como hecho; fuerza real: posible, apoyada en el antecedente y en la coincidencia de la queja con la etiqueta. </w:t>
       </w:r>
       <w:r>
         <w:rPr>
@@ -12097,27 +12088,17 @@
         <w:t xml:space="preserve">Incertidumbre nunca escrita:</w:t>
       </w:r>
       <w:r>
-        <w:t xml:space="preserve"> ¿qué explica el compromiso general si la orina no lo explica? (una anciana decaída "por ITU" sin fiebre ni sepsis urinaria es una historia que se cuenta mejor de lo que se sostiene). </w:t>
-      </w:r>
-      <w:r>
-        <w:rPr>
-          <w:b/>
-          <w:bCs/>
-        </w:rPr>
-        <w:t xml:space="preserve">Decisión del día 1:</w:t>
-      </w:r>
-      <w:r>
-        <w:t xml:space="preserve"> antibiótico razonable como apuesta empírica; el error no fue tratarla, fue tratarla </w:t>
-      </w:r>
-      <w:r>
-        <w:rPr>
-          <w:i/>
-          <w:iCs/>
-        </w:rPr>
-        <w:t xml:space="preserve">sin criterio de reapertura</w:t>
-      </w:r>
-      <w:r>
-        <w:t xml:space="preserve">: ninguna nota decía qué evolución obligaría a reexaminar.</w:t>
+        <w:t xml:space="preserve"> ¿qué explica una taquicardia que persiste con la paciente ya tranquila, y una saturación que no corresponde a una crisis de ansiedad? Existe una regla de decisión creada exactamente para este momento —los criterios PERC: ocho condiciones que, si se cumplen todas, permiten no estudiar una embolia en pacientes de baja probabilidad (Kline et al., 2004)—, y la paciente incumplía tres: frecuencia cardiaca, saturación y uso de estrógenos. La regla no falló: no se aplicó, porque nadie creyó que hubiera algo que descartar. </w:t>
+      </w:r>
+      <w:r>
+        <w:rPr>
+          <w:b/>
+          <w:bCs/>
+        </w:rPr>
+        <w:t xml:space="preserve">Decisión de la primera noche:</w:t>
+      </w:r>
+      <w:r>
+        <w:t xml:space="preserve"> ansiolisis y alta; defendible como tratamiento sintomático, indefendible como cierre: ninguna línea de la nota decía qué debía hacer volver a la paciente antes del "control en salud mental".</w:t>
       </w:r>
     </w:p>
     <w:p>
@@ -12132,7 +12113,7 @@
         <w:t xml:space="preserve">Dónde estuvo la oportunidad.</w:t>
       </w:r>
       <w:r>
-        <w:t xml:space="preserve"> El día 2, "afebril pero sigue decaída" era una discordancia informativa: el tratamiento correcto de la hipótesis correcta debía producir mejoría del estado general, no sólo apirexia. La reinterpretación ("evolución lenta, propia de la edad") inmunizó la hipótesis justo cuando la evolución la estaba degradando. Un examen abdominal dirigido, un perfil hepático o la simple pregunta de pase de visita —"¿qué no explica la ITU?"— tenían, ese día, su máximo valor. El día 3 la pregunta ya era innecesaria: el abdomen la respondió solo.</w:t>
+        <w:t xml:space="preserve"> En el control de signos previo al alta. Una taquicardia de 112 en una paciente sedada y calmada era la discordancia informativa de la noche: el tratamiento correcto de la hipótesis correcta debía normalizar la frecuencia, no sólo la angustia. La pregunta de pase —"¿qué no explica el pánico?"— tenía ahí su máximo valor y su costo mínimo: dos preguntas de anamnesis, una regla de ocho ítems, quizá un dímero-D. A las 36 horas, la pregunta la respondió el síncope.</w:t>
       </w:r>
     </w:p>
     <w:p>
@@ -12147,22 +12128,22 @@
         <w:t xml:space="preserve">Lo que no debe concluirse.</w:t>
       </w:r>
       <w:r>
-        <w:t xml:space="preserve"> El desenlace no demuestra que el equipo fuera incompetente, ni que toda "ITU en anciana" esconda una colecistitis. Con la información del día 1, la ITU era una apuesta empírica defendible. Lo indefendible era la arquitectura: un dato heredado con autoridad de hecho, una etiqueta que absorbió el caso, ninguna incertidumbre registrada, ninguna condición de reapertura. El mismo proceso, con desenlace benigno (una ITU real que respondía), habría dejado la misma vulnerabilidad instalada para la próxima paciente.</w:t>
-      </w:r>
-    </w:p>
-    <w:p>
-      <w:pPr>
-        <w:pStyle w:val="BodyJ"/>
-      </w:pPr>
-      <w:r>
-        <w:rPr>
-          <w:i/>
-          <w:iCs/>
-        </w:rPr>
-        <w:t xml:space="preserve">Frase medular (la que faltó el día 1):</w:t>
-      </w:r>
-      <w:r>
-        <w:t xml:space="preserve"> "Compromiso del estado general no explicado en mujer de 82 años; bacteriuria posible como causa, no demostrada —tratamiento empírico iniciado. El decaimiento no tiene aún explicación suficiente: reexaminar abdomen y ampliar estudio si no hay mejoría global en 48 horas."</w:t>
+        <w:t xml:space="preserve"> El desenlace no demuestra que toda disnea en una paciente con trastorno de pánico sea una embolia, ni que el médico fuera incompetente: con la información de la primera noche, la crisis de pánico era la explicación más frecuente. Lo indefendible era la arquitectura: una etiqueta de triage convertida en diagnóstico antes del examen, un dato medido —la taquicardia persistente— registrado sin que nadie le pidiera explicación, dos preguntas de anamnesis que la etiqueta volvió innecesarias y un alta sin condición de reapertura. El mismo proceso con desenlace benigno —una crisis de pánico real— habría dejado la misma vulnerabilidad instalada para la siguiente paciente a la que se le cree menos por su diagnóstico.</w:t>
+      </w:r>
+    </w:p>
+    <w:p>
+      <w:pPr>
+        <w:pStyle w:val="BodyJ"/>
+      </w:pPr>
+      <w:r>
+        <w:rPr>
+          <w:i/>
+          <w:iCs/>
+        </w:rPr>
+        <w:t xml:space="preserve">Frase medular (la que faltó la primera noche):</w:t>
+      </w:r>
+      <w:r>
+        <w:t xml:space="preserve"> "Disnea súbita y taquicardia persistente (112 tras ansiolisis) en mujer de 29 años con trastorno de pánico y uso de anticonceptivos orales: crisis de pánico posible, pero la taquicardia y la saturación de 94% no están explicadas; PERC positivo — dímero-D antes de decidir el alta; si se difiere, reconsulta inmediata ante síncope, dolor torácico o disnea en reposo."</w:t>
       </w:r>
     </w:p>
     <w:p>
@@ -12177,7 +12158,7 @@
         <w:t xml:space="preserve">Lectura metacognitiva.</w:t>
       </w:r>
       <w:r>
-        <w:t xml:space="preserve"> Nótese que la frase que faltó no requería más conocimiento médico, más tiempo ni más exámenes esa noche. Requería una disciplina de escritura: separar el hecho (decaimiento no explicado) de la inferencia (bacteriuria posible), conservar la incertidumbre (explicación insuficiente) y programar la revisión (48 horas, criterio global). Es la demostración más dura de la tesis de este libro: la epistemología de una frase puede ser la diferencia entre un susto y una laparotomía de madrugada.</w:t>
+        <w:t xml:space="preserve"> La frase que faltó no requería más conocimiento del que cualquier médico de urgencias ya tiene: requería que el antecedente psiquiátrico no descontara el valor de dos signos medidos. Esta viñeta es el capítulo 14 en su forma más silenciosa —la injusticia testimonial no le dijo a la paciente que no le creía; simplemente dejó de preguntar— y es también el capítulo 10: la regla PERC es un umbral explícito, y los umbrales explícitos sólo protegen a quien recuerda que hay una hipótesis que someterles. La disciplina de escritura habría bastado: separar el hecho (taquicardia persistente no explicada) de la etiqueta (pánico), conservar la incertidumbre y programar la reapertura.</w:t>
       </w:r>
     </w:p>
     <w:p>
@@ -12856,6 +12837,37 @@
     </w:p>
     <w:p>
       <w:pPr>
+        <w:pStyle w:val="TallerHead"/>
+      </w:pPr>
+      <w:r>
+        <w:t xml:space="preserve">Taller 16. Rediseñar la ronda</w:t>
+      </w:r>
+    </w:p>
+    <w:p>
+      <w:pPr>
+        <w:pStyle w:val="BodyJ"/>
+      </w:pPr>
+      <w:r>
+        <w:t xml:space="preserve">Describa por escrito la ronda de su servicio tal como ocurre de verdad: minutos por paciente, quién habla, qué se pregunta siempre y qué no se pregunta nunca. Luego rediséñela con tres cambios como máximo —un disparador objetivo de pausa, una pregunta obligatoria por paciente inestable o incierto, una regla de pase de turno— y estime el costo en minutos por ronda.</w:t>
+      </w:r>
+    </w:p>
+    <w:p>
+      <w:pPr>
+        <w:pStyle w:val="BodyJ"/>
+      </w:pPr>
+      <w:r>
+        <w:rPr>
+          <w:i/>
+          <w:iCs/>
+        </w:rPr>
+        <w:t xml:space="preserve">Solución comentada.</w:t>
+      </w:r>
+      <w:r>
+        <w:t xml:space="preserve"> A modo de ejemplo, una descripción honesta puede parecerse a esto: dos a cuatro minutos por paciente, habla quien presenta y decide quien dirige, se pregunta "¿cómo está?" y "¿qué le falta?", y casi nunca "¿qué nos haría cambiar?". El rediseño más barato es esa tercera pregunta, hecha sólo a los pacientes que cumplen un disparador (reconsulta, discordancia entre gravedad y diagnóstico, 72 horas sin discusión): cuesta alrededor de un minuto por caso seleccionado y produce, de inmediato, criterios de reapertura que antes no existían. Si el rediseño necesita más de tres cambios o más de diez minutos por ronda, probablemente está diseñando una reunión nueva en lugar de mejorar la que existe — y las reuniones nuevas mueren por inasistencia.</w:t>
+      </w:r>
+    </w:p>
+    <w:p>
+      <w:pPr>
         <w:pStyle w:val="EnUnaFrase"/>
       </w:pPr>
       <w:r>
@@ -13129,7 +13141,7 @@
         <w:t xml:space="preserve">Confabulación.</w:t>
       </w:r>
       <w:r>
-        <w:t xml:space="preserve"> Contenido no sustentado presentado con coherencia (Ji et al., 2023). Es la certeza retórica del capítulo 4, industrializada: prosa donde los hechos, las inferencias y lo inventado llegan con la misma sintaxis.</w:t>
+        <w:t xml:space="preserve"> Contenido no sustentado presentado con coherencia (Ji et al., 2023). Es la certeza retórica industrializada: prosa donde los hechos, las inferencias y lo inventado llegan con la misma sintaxis.</w:t>
       </w:r>
     </w:p>
     <w:p>
@@ -13148,7 +13160,7 @@
         <w:t xml:space="preserve">Sesgo de automatización.</w:t>
       </w:r>
       <w:r>
-        <w:t xml:space="preserve"> La tendencia a aceptar la salida de un sistema por venir de un sistema, documentada en los apoyos a la decisión clínica desde mucho antes de los modelos generativos: los sistemas corrigen errores humanos e introducen errores nuevos — el usuario que habría acertado solo y se equivoca por deferencia (Goddard et al., 2012). La versión de la era de los modelos de lenguaje ya tiene ensayo aleatorizado: médicos que habían completado veinte horas de alfabetización en IA, expuestos a recomendaciones de un modelo con errores deliberados, perdieron catorce puntos de exactitud diagnóstica frente a quienes recibieron recomendaciones correctas (Qazi et al., 2026). La alfabetización general no inmuniza; la vigilancia caso a caso no se delega en un curso. Es el anclaje del capítulo 7 más la autoridad no interrogada, con interfaz.</w:t>
+        <w:t xml:space="preserve"> La tendencia a aceptar la salida de un sistema por venir de un sistema, documentada en los apoyos a la decisión clínica desde mucho antes de los modelos generativos: los sistemas corrigen errores humanos e introducen errores nuevos — el usuario que habría acertado solo y se equivoca por deferencia (Goddard et al., 2012). La versión de la era de los modelos de lenguaje ya tiene ensayo aleatorizado: médicos que habían completado veinte horas de alfabetización en IA, expuestos a recomendaciones de un modelo con errores deliberados, perdieron catorce puntos de exactitud diagnóstica frente a quienes recibieron recomendaciones correctas (Qazi et al., 2026). La alfabetización general no inmuniza; la vigilancia caso a caso no se delega en un curso. Es el anclaje más la autoridad no interrogada, con interfaz.</w:t>
       </w:r>
     </w:p>
     <w:p>
@@ -13167,7 +13179,7 @@
         <w:t xml:space="preserve">Atrofia de la pericia.</w:t>
       </w:r>
       <w:r>
-        <w:t xml:space="preserve"> La evidencia más inquietante es reciente: endoscopistas expuestos durante meses a la detección asistida de pólipos detectaron significativamente menos adenomas al volver a trabajar sin asistencia — seis puntos absolutos menos que antes de la exposición (Budzyń et al., 2025). La pericia perceptual del capítulo 6 se mantiene con práctica; si la máquina practica por nosotros, la cuenta llega en la primera guardia sin máquina.</w:t>
+        <w:t xml:space="preserve"> La evidencia más inquietante es reciente: endoscopistas expuestos durante meses a la detección asistida de pólipos detectaron significativamente menos adenomas al volver a trabajar sin asistencia — seis puntos absolutos menos que antes de la exposición (Budzyń et al., 2025). La pericia perceptual se mantiene con práctica; si la máquina practica por nosotros, la cuenta llega en la primera guardia sin máquina.</w:t>
       </w:r>
     </w:p>
     <w:p>
@@ -13205,7 +13217,7 @@
         <w:t xml:space="preserve">Sobreconfianza no calibrada.</w:t>
       </w:r>
       <w:r>
-        <w:t xml:space="preserve"> La confianza verbalizada de los modelos tiende a la sobreconfianza sistemática (Kadavath et al., 2022; Xiong et al., 2024): el "estoy bastante seguro" del modelo es tono, no calibración — la sobreconfianza del capítulo 5, sin siquiera un historial propio de errores que la eduque.</w:t>
+        <w:t xml:space="preserve"> La confianza verbalizada de los modelos tiende a la sobreconfianza sistemática (Kadavath et al., 2022; Xiong et al., 2024): el "estoy bastante seguro" del modelo es tono, no calibración — la sobreconfianza humana, sin siquiera un historial propio de errores que la eduque.</w:t>
       </w:r>
     </w:p>
     <w:p>
@@ -13303,7 +13315,7 @@
         <w:pStyle w:val="BodyJ"/>
       </w:pPr>
       <w:r>
-        <w:t xml:space="preserve">Hay un tercer fenómeno que ni siquiera exige que la IA se equivoque: la captura cognitiva. Quien ve primero la respuesta del modelo ya no genera hipótesis desde el caso: su búsqueda de alternativas, su lectura de los datos y su ponderación posterior quedan condicionadas por lo que ya leyó — el anclaje del capítulo 7, con la diferencia de que aquí el ancla puede llegar antes que el paciente. Una IA excelente que entrega demasiado pronto la hipótesis, la síntesis o la inferencia que el aprendiz debía producir no daña la respuesta de hoy; daña la arquitectura del aprendizaje. Porque el valor cognitivo de un caso no está sólo en llegar a la conclusión correcta: está en ejecutar las operaciones que permiten llegar a ella, revisarla y, cuando corresponde, abandonarla. Una herramienta que aumenta el porcentaje de respuestas correctas puede, paradójicamente, mejorar el desempeño de hoy mientras empeora al razonador de mañana.</w:t>
+        <w:t xml:space="preserve">Hay un tercer fenómeno que ni siquiera exige que la IA se equivoque: la captura cognitiva. Quien ve primero la respuesta del modelo ya no genera hipótesis desde el caso: su búsqueda de alternativas, su lectura de los datos y su ponderación posterior quedan condicionadas por lo que ya leyó — el anclaje de siempre, con la diferencia de que aquí el ancla puede llegar antes que el paciente. Una IA excelente que entrega demasiado pronto la hipótesis, la síntesis o la inferencia que el aprendiz debía producir no daña la respuesta de hoy; daña la arquitectura del aprendizaje. Porque el valor cognitivo de un caso no está sólo en llegar a la conclusión correcta: está en ejecutar las operaciones que permiten llegar a ella, revisarla y, cuando corresponde, abandonarla. Una herramienta que aumenta el porcentaje de respuestas correctas puede, paradójicamente, mejorar el desempeño de hoy mientras empeora al razonador de mañana.</w:t>
       </w:r>
     </w:p>
     <w:p>
@@ -13511,7 +13523,7 @@
         <w:t xml:space="preserve">Nunca pegar y firmar.</w:t>
       </w:r>
       <w:r>
-        <w:t xml:space="preserve"> Lo que entra a la ficha bajo la firma propia es afirmación propia; el capítulo 12 mostró que la ficha produce lo visible, y una confabulación copiada se convierte en hecho heredado para el siguiente lector — y la síntesis delegada es, además, pensamiento que no ocurrió (McCoy et al., 2024).</w:t>
+        <w:t xml:space="preserve"> Lo que entra a la ficha bajo la firma propia es afirmación propia: una confabulación copiada se convierte en hecho heredado para el siguiente lector, y la síntesis delegada es, además, pensamiento que no ocurrió (McCoy et al., 2024).</w:t>
       </w:r>
     </w:p>
     <w:p>
@@ -13782,7 +13794,7 @@
         <w:t xml:space="preserve">Solución comentada.</w:t>
       </w:r>
       <w:r>
-        <w:t xml:space="preserve"> En ejercicios docentes, tres hallazgos vuelven una y otra vez. Primero, el color 2 aparece más de lo esperado: el modelo rellena huecos con verosimilitud — una evolución "esperable", un factor de riesgo "presumible" — y esa es exactamente la definición de confabulación; contarlas cura más que leer sobre ellas. Segundo, el color 3 suele ser genérico ("se sugiere correlacionar con la clínica") y no específico del caso: incertidumbre de fórmula, no de contenido — compárela con la que exige el léxico del capítulo 4. Tercero, la respuesta a la segunda pregunta suele ser mejor que la primera: el modelo enumera con soltura los datos que refutarían su propia propuesta — pero sólo si alguien se lo pide. La herramienta contiene su propio antídoto; la pregunta que lo libera sigue siendo humana.</w:t>
+        <w:t xml:space="preserve"> En ejercicios docentes, tres hallazgos vuelven una y otra vez. Primero, el color 2 aparece más de lo esperado: el modelo rellena huecos con verosimilitud — una evolución "esperable", un factor de riesgo "presumible" — y esa es exactamente la definición de confabulación; contarlas cura más que leer sobre ellas. Segundo, el color 3 suele ser genérico ("se sugiere correlacionar con la clínica") y no específico del caso: incertidumbre de fórmula, no de contenido — compárela con la que exige el léxico de certeza. Tercero, la respuesta a la segunda pregunta suele ser mejor que la primera: el modelo enumera con soltura los datos que refutarían su propia propuesta — pero sólo si alguien se lo pide. La herramienta contiene su propio antídoto; la pregunta que lo libera sigue siendo humana.</w:t>
       </w:r>
     </w:p>
     <w:p>
@@ -13917,7 +13929,7 @@
         <w:pStyle w:val="BodyJ"/>
       </w:pPr>
       <w:r>
-        <w:t xml:space="preserve">El parentesco es lógico antes que sentimental. Una metáfora es la hipótesis de que dos cosas lejanas comparten estructura; un diagnóstico es una metáfora que acepta ser puesta a prueba — "este cuadro es una colecistitis" apuesta a que lo que ocurre en este cuerpo comparte estructura con un patrón aprendido. Ambos movimientos son la abducción del capítulo 2, y ambos requieren el mismo estado que el capítulo 14 llamó humildad en funciones: sostener la conjetura con fuerza suficiente para trabajarla y soltura suficiente para dejarla caer. Bohm lo dijo desde la física: el acto creativo central —percibir un orden nuevo en lo que ya estaba a la vista— es el mismo en el arte y en la ciencia; cambian los materiales y el tribunal (Bohm, 1996).</w:t>
+        <w:t xml:space="preserve">El parentesco es lógico antes que sentimental. Una metáfora es la hipótesis de que dos cosas lejanas comparten estructura; un diagnóstico es una metáfora que acepta ser puesta a prueba — "este cuadro es una colecistitis" apuesta a que lo que ocurre en este cuerpo comparte estructura con un patrón aprendido. Ambos movimientos son la abducción del capítulo 2, y ambos requieren el estado que este libro llamó humildad en funciones: sostener la conjetura con fuerza suficiente para trabajarla y soltura suficiente para dejarla caer. Bohm lo dijo desde la física: el acto creativo central —percibir un orden nuevo en lo que ya estaba a la vista— es el mismo en el arte y en la ciencia; cambian los materiales y el tribunal (Bohm, 1996).</w:t>
       </w:r>
     </w:p>
     <w:p>
@@ -13983,7 +13995,7 @@
         <w:pStyle w:val="BodyJ"/>
       </w:pPr>
       <w:r>
-        <w:t xml:space="preserve">La antipoesía es un programa epistemológico completo: quitarle a la palabra los poderes que no puede sostener y devolverla al tamaño de la experiencia. Visto desde ahí, el léxico del capítulo 4 es antipoesía aplicada: "sin evidencia actual de" es un verso parriano — feo, honesto, exacto, imposible de recitar con voz engolada. La ficha lúcida se escribe más cerca de Parra que de Huidobro: lengua de todos los días, dignidad del "no sé", desconfianza instintiva de toda frase que suene demasiado bien.</w:t>
+        <w:t xml:space="preserve">La antipoesía es un programa epistemológico completo: quitarle a la palabra los poderes que no puede sostener y devolverla al tamaño de la experiencia. Visto desde ahí, el léxico de certeza es antipoesía aplicada: "sin evidencia actual de" es un verso parriano — feo, honesto, exacto, imposible de recitar con voz engolada. La ficha lúcida se escribe más cerca de Parra que de Huidobro: lengua de todos los días, dignidad del "no sé", desconfianza instintiva de toda frase que suene demasiado bien.</w:t>
       </w:r>
     </w:p>
     <w:p>
@@ -14008,23 +14020,23 @@
         <w:pStyle w:val="BodyJ"/>
       </w:pPr>
       <w:r>
-        <w:t xml:space="preserve">El clic estético del diagnóstico existe y es información. La parsimonia, la convergencia, el encaje sin residuo son la forma sensible de aquello que el capítulo 2 llamó fuerza por convergencia: cuando una explicación ordena todos los hechos sin forzar ninguno, algo en nosotros lo registra como belleza antes de poder justificarlo. Esa señal vale: propone candidatos que el análisis no habría listado.</w:t>
-      </w:r>
-    </w:p>
-    <w:p>
-      <w:pPr>
-        <w:pStyle w:val="BodyJ"/>
-      </w:pPr>
-      <w:r>
-        <w:t xml:space="preserve">Pero este libro ya conoció a la impostora. La historia coherente del hindsight, la narrativa atractiva que infla la confianza (capítulo 5), la prosa fluida de los modelos de lenguaje (capítulo 17): todas son bellas y ninguna es, por serlo, verdadera. La belleza no distingue entre orden hallado y orden impuesto — para eso están las pruebas severas. La regla que concilia ambas caras cabe en una línea: la elegancia selecciona hipótesis; nunca las confirma. El verso puede quedarse bello para siempre; el diagnóstico tiene que amanecer verdadero, y la evolución lo audita cada mañana.</w:t>
-      </w:r>
-    </w:p>
-    <w:p>
-      <w:pPr>
-        <w:pStyle w:val="BodyJ"/>
-      </w:pPr>
-      <w:r>
-        <w:t xml:space="preserve">Queda la belleza final, la que menos se nombra: la de hacer lo correcto en el contexto correcto. Una estabilización bien conducida tiene forma estética — nada sobró, nada faltó, cada intervención llegó a su hora; es la phronesis del capítulo 6 vuelta percepción. Pero es una belleza que sólo puede declararse retrospectivamente, y sólo si el proceso era defendible antes de conocer el desenlace (capítulo 10). En medicina la estética es un subproducto del rigor. Cuando se la busca directamente —el diagnóstico brillante, la frase imponente—, se obtiene Huidobro en la ficha.</w:t>
+        <w:t xml:space="preserve">El clic estético del diagnóstico existe y es información. La parsimonia, la convergencia, el encaje sin residuo son la forma sensible de la fuerza por convergencia: cuando una explicación ordena todos los hechos sin forzar ninguno, algo en nosotros lo registra como belleza antes de poder justificarlo. Esa señal vale: propone candidatos que el análisis no habría listado.</w:t>
+      </w:r>
+    </w:p>
+    <w:p>
+      <w:pPr>
+        <w:pStyle w:val="BodyJ"/>
+      </w:pPr>
+      <w:r>
+        <w:t xml:space="preserve">Pero este libro ya conoció a la impostora. La historia coherente del hindsight, la narrativa atractiva que infla la confianza, la prosa fluida de los modelos de lenguaje: todas son bellas y ninguna es, por serlo, verdadera. La belleza no distingue entre orden hallado y orden impuesto — para eso están las pruebas severas. La regla que concilia ambas caras cabe en una línea: la elegancia selecciona hipótesis; nunca las confirma. El verso puede quedarse bello para siempre; el diagnóstico tiene que amanecer verdadero, y la evolución lo audita cada mañana.</w:t>
+      </w:r>
+    </w:p>
+    <w:p>
+      <w:pPr>
+        <w:pStyle w:val="BodyJ"/>
+      </w:pPr>
+      <w:r>
+        <w:t xml:space="preserve">Queda la belleza final, la que menos se nombra: la de hacer lo correcto en el contexto correcto. Una estabilización bien conducida tiene forma estética — nada sobró, nada faltó, cada intervención llegó a su hora; es la phronesis vuelta percepción. Pero es una belleza que sólo puede declararse retrospectivamente, y sólo si el proceso era defendible antes de conocer el desenlace. En medicina la estética es un subproducto del rigor. Cuando se la busca directamente —el diagnóstico brillante, la frase imponente—, se obtiene Huidobro en la ficha.</w:t>
       </w:r>
     </w:p>
     <w:p>
@@ -14049,7 +14061,7 @@
         <w:pStyle w:val="BodyJ"/>
       </w:pPr>
       <w:r>
-        <w:t xml:space="preserve">Si el parentesco es real, leer poesía no es un lujo cultural del médico: es gimnasio específico. Entrena la precisión léxica — el poeta agoniza entre dos palabras casi iguales, que es exactamente la distancia entre "descartado" y "sin evidencia actual de". Entrena la tolerancia a la ambigüedad sostenida — un poema no se "resuelve", se habita; como ciertas incertidumbres del capítulo 3. Entrena el oído para el relato: la anamnesis tiene ritmo, silencios y palabras elegidas, y "esta vez la hernia no se dejó acomodar" es, técnicamente, un verso — el capítulo 1 pidió conservarlo textual por razones epistémicas; este capítulo agrega la razón estética, que es la misma. Y entrena, con Parra, la resistencia a la solemnidad: nadie que haya leído antipoesía vuelve a escribir "se procede a realizar manejo multidisciplinario integral" sin sonrojarse.</w:t>
+        <w:t xml:space="preserve">Si el parentesco es real, leer poesía no es un lujo cultural del médico: es gimnasio específico. Entrena la precisión léxica — el poeta agoniza entre dos palabras casi iguales, que es exactamente la distancia entre "descartado" y "sin evidencia actual de". Entrena la tolerancia a la ambigüedad sostenida — un poema no se "resuelve", se habita; como ciertas incertidumbres clínicas. Entrena el oído para el relato: la anamnesis tiene ritmo, silencios y palabras elegidas, y "esta vez la hernia no se dejó acomodar" es, técnicamente, un verso — el capítulo 1 pidió conservarlo textual por razones epistémicas; este capítulo agrega la razón estética, que es la misma. Y entrena, con Parra, la resistencia a la solemnidad: nadie que haya leído antipoesía vuelve a escribir "se procede a realizar manejo multidisciplinario integral" sin sonrojarse.</w:t>
       </w:r>
     </w:p>
     <w:p>
@@ -14218,7 +14230,7 @@
         <w:pStyle w:val="BodyJ"/>
       </w:pPr>
       <w:r>
-        <w:t xml:space="preserve">La inteligencia artificial vuelve esta exigencia aún más visible. La plausibilidad verbal puede separarse de la verdad. Por ello, tanto ante una respuesta automática como ante nuestra propia narrativa, debemos preguntar qué proviene del caso, qué fue inferido, qué permanece incierto y qué responsabilidad implica actuar.</w:t>
+        <w:t xml:space="preserve">Tres hilos de este libro conviene dejar anudados. El primero va de la abducción a la humildad: la conjetura que crea explicaciones, la vigilancia que la acompaña mientras trabaja y la disposición que la mantiene abierta cuando ya produjo una respuesta cómoda son tres momentos de una misma lealtad al caso, y la prudencia práctica —la phronesis— es su nombre antiguo. El segundo va del dato al contexto: la funcionalidad, el pronóstico de fondo y la red de apoyo son hechos clínicos de pleno derecho, y una decisión que los omitió no es más objetiva sino más incompleta. El tercero va de la ficha al razonador: escribir la nota es parte de pensar, y por eso la inteligencia artificial —que produce exactamente la prosa fluida contra la que este libro entrena: hechos, inferencias e invenciones con la misma sintaxis— no cambia la disciplina, la vuelve urgente, sobre todo para quien todavía está formando el juicio que la herramienta ofrece reemplazar. Ante una respuesta automática como ante la propia narrativa, la pregunta es la misma: qué proviene del caso, qué fue inferido, qué permanece incierto y qué responsabilidad implica actuar.</w:t>
       </w:r>
     </w:p>
     <w:p>
@@ -16697,6 +16709,21 @@
           <w:b/>
           <w:bCs/>
         </w:rPr>
+        <w:t xml:space="preserve">Captura cognitiva.</w:t>
+      </w:r>
+      <w:r>
+        <w:t xml:space="preserve"> Condicionamiento de la búsqueda de hipótesis, la lectura de los datos y la ponderación por una respuesta vista antes de razonar — típicamente la de un asistente de IA. No exige que la respuesta sea errónea: una hipótesis correcta entregada demasiado pronto también sustituye las operaciones que forman el juicio.</w:t>
+      </w:r>
+    </w:p>
+    <w:p>
+      <w:pPr>
+        <w:pStyle w:val="BodyJ"/>
+      </w:pPr>
+      <w:r>
+        <w:rPr>
+          <w:b/>
+          <w:bCs/>
+        </w:rPr>
         <w:t xml:space="preserve">Cierre prematuro.</w:t>
       </w:r>
       <w:r>
@@ -17102,10 +17129,40 @@
           <w:b/>
           <w:bCs/>
         </w:rPr>
+        <w:t xml:space="preserve">Observación activa.</w:t>
+      </w:r>
+      <w:r>
+        <w:t xml:space="preserve"> Espera diseñada como intervención diagnóstica: con objetivo, plazo, variables vigiladas, responsable y criterios de salida en ambas direcciones; lo contrario de "control según evolución".</w:t>
+      </w:r>
+    </w:p>
+    <w:p>
+      <w:pPr>
+        <w:pStyle w:val="BodyJ"/>
+      </w:pPr>
+      <w:r>
+        <w:rPr>
+          <w:b/>
+          <w:bCs/>
+        </w:rPr>
         <w:t xml:space="preserve">Paradoja de la automatización.</w:t>
       </w:r>
       <w:r>
         <w:t xml:space="preserve"> Cuanto más competente es un sistema automatizado, menos ejercita el humano las habilidades necesarias para detectar sus fallas — que es exactamente cuando más se las necesita (Abdulnour et al.).</w:t>
+      </w:r>
+    </w:p>
+    <w:p>
+      <w:pPr>
+        <w:pStyle w:val="BodyJ"/>
+      </w:pPr>
+      <w:r>
+        <w:rPr>
+          <w:b/>
+          <w:bCs/>
+        </w:rPr>
+        <w:t xml:space="preserve">Pausa diagnóstica.</w:t>
+      </w:r>
+      <w:r>
+        <w:t xml:space="preserve"> Interrupción breve y selectiva del flujo clínico, activada por disparadores definidos (reconsulta, evolución discordante, transferencia), para reformular el caso sin su etiqueta y localizar la incertidumbre peligrosa.</w:t>
       </w:r>
     </w:p>
     <w:p>
@@ -17542,7 +17599,7 @@
         </w:numPr>
       </w:pPr>
       <w:r>
-        <w:t xml:space="preserve">Copiado de notas (fósil narrativo) — 12, Ap C</w:t>
+        <w:t xml:space="preserve">Copiado de notas (fósil narrativo; magnitud medida) — 12, Ap C</w:t>
       </w:r>
     </w:p>
     <w:p>
@@ -17830,6 +17887,18 @@
         </w:numPr>
       </w:pPr>
       <w:r>
+        <w:t xml:space="preserve">Hecho como estatus provisional (frontera hecho/inferencia) — 1</w:t>
+      </w:r>
+    </w:p>
+    <w:p>
+      <w:pPr>
+        <w:pStyle w:val="BodyJ"/>
+        <w:numPr>
+          <w:ilvl w:val="0"/>
+          <w:numId w:val="6"/>
+        </w:numPr>
+      </w:pPr>
+      <w:r>
         <w:t xml:space="preserve">Hindsight bias — 8, 11, 16, CC (viñeta 8)</w:t>
       </w:r>
     </w:p>
@@ -17890,7 +17959,7 @@
         </w:numPr>
       </w:pPr>
       <w:r>
-        <w:t xml:space="preserve">Injusticia epistémica — 14, CC (viñeta 10)</w:t>
+        <w:t xml:space="preserve">Injusticia epistémica — 14, CC (viñetas 8 y 10)</w:t>
       </w:r>
     </w:p>
     <w:p>
@@ -18034,7 +18103,7 @@
         </w:numPr>
       </w:pPr>
       <w:r>
-        <w:t xml:space="preserve">Observación activa — 10, 11</w:t>
+        <w:t xml:space="preserve">Nota de enfermería como hecho de pleno derecho — 13</w:t>
       </w:r>
     </w:p>
     <w:p>
@@ -18046,6 +18115,18 @@
         </w:numPr>
       </w:pPr>
       <w:r>
+        <w:t xml:space="preserve">Observación activa — 11</w:t>
+      </w:r>
+    </w:p>
+    <w:p>
+      <w:pPr>
+        <w:pStyle w:val="BodyJ"/>
+        <w:numPr>
+          <w:ilvl w:val="0"/>
+          <w:numId w:val="6"/>
+        </w:numPr>
+      </w:pPr>
+      <w:r>
         <w:t xml:space="preserve">Paradoja de la automatización — 17</w:t>
       </w:r>
     </w:p>
@@ -18070,6 +18151,30 @@
         </w:numPr>
       </w:pPr>
       <w:r>
+        <w:t xml:space="preserve">Pericia y práctica deliberada — 6</w:t>
+      </w:r>
+    </w:p>
+    <w:p>
+      <w:pPr>
+        <w:pStyle w:val="BodyJ"/>
+        <w:numPr>
+          <w:ilvl w:val="0"/>
+          <w:numId w:val="6"/>
+        </w:numPr>
+      </w:pPr>
+      <w:r>
+        <w:t xml:space="preserve">Phronesis — 6, 14</w:t>
+      </w:r>
+    </w:p>
+    <w:p>
+      <w:pPr>
+        <w:pStyle w:val="BodyJ"/>
+        <w:numPr>
+          <w:ilvl w:val="0"/>
+          <w:numId w:val="6"/>
+        </w:numPr>
+      </w:pPr>
+      <w:r>
         <w:t xml:space="preserve">Poesía y juicio clínico (Huidobro, Parra; belleza como señal y trampa) — 18</w:t>
       </w:r>
     </w:p>
@@ -18082,7 +18187,7 @@
         </w:numPr>
       </w:pPr>
       <w:r>
-        <w:t xml:space="preserve">Pericia y práctica deliberada — 6</w:t>
+        <w:t xml:space="preserve">Pronóstico e incertidumbre de plazo — CC (viñeta 7)</w:t>
       </w:r>
     </w:p>
     <w:p>
@@ -18094,7 +18199,7 @@
         </w:numPr>
       </w:pPr>
       <w:r>
-        <w:t xml:space="preserve">Phronesis — 6, 14</w:t>
+        <w:t xml:space="preserve">Proporcionalidad terapéutica (Taboada) — 10, 15, CC (viñeta 7)</w:t>
       </w:r>
     </w:p>
     <w:p>
@@ -18106,7 +18211,7 @@
         </w:numPr>
       </w:pPr>
       <w:r>
-        <w:t xml:space="preserve">Pronóstico e incertidumbre de plazo — CC (viñeta 7)</w:t>
+        <w:t xml:space="preserve">Pruebas severas (Popper) — 2</w:t>
       </w:r>
     </w:p>
     <w:p>
@@ -18118,7 +18223,7 @@
         </w:numPr>
       </w:pPr>
       <w:r>
-        <w:t xml:space="preserve">Proporcionalidad terapéutica (Taboada) — 10, 15, CC (viñeta 7)</w:t>
+        <w:t xml:space="preserve">Puntos de inflexión — 11, Interludio III</w:t>
       </w:r>
     </w:p>
     <w:p>
@@ -18130,19 +18235,7 @@
         </w:numPr>
       </w:pPr>
       <w:r>
-        <w:t xml:space="preserve">Pruebas severas (Popper) — 2</w:t>
-      </w:r>
-    </w:p>
-    <w:p>
-      <w:pPr>
-        <w:pStyle w:val="BodyJ"/>
-        <w:numPr>
-          <w:ilvl w:val="0"/>
-          <w:numId w:val="6"/>
-        </w:numPr>
-      </w:pPr>
-      <w:r>
-        <w:t xml:space="preserve">Puntos de inflexión — 11, Interludio III</w:t>
+        <w:t xml:space="preserve">Reglas de decisión clínica (PERC) y umbral — CC (viñeta 8)</w:t>
       </w:r>
     </w:p>
     <w:p>
@@ -18510,17 +18603,17 @@
         <w:pStyle w:val="BodyJ"/>
       </w:pPr>
       <w:r>
-        <w:t xml:space="preserve">Aristotle. (2009). </w:t>
-      </w:r>
-      <w:r>
-        <w:rPr>
-          <w:i/>
-          <w:iCs/>
-        </w:rPr>
-        <w:t xml:space="preserve">The Nicomachean Ethics</w:t>
-      </w:r>
-      <w:r>
-        <w:t xml:space="preserve"> (D. Ross, Trans.; L. Brown, Rev.). Oxford University Press.</w:t>
+        <w:t xml:space="preserve">Aristóteles. (1985). </w:t>
+      </w:r>
+      <w:r>
+        <w:rPr>
+          <w:i/>
+          <w:iCs/>
+        </w:rPr>
+        <w:t xml:space="preserve">Ética nicomáquea; Ética eudemia</w:t>
+      </w:r>
+      <w:r>
+        <w:t xml:space="preserve"> (J. Pallí Bonet, Trad.; introd. E. Lledó). Gredos.</w:t>
       </w:r>
     </w:p>
     <w:p>
@@ -18708,17 +18801,17 @@
         <w:pStyle w:val="BodyJ"/>
       </w:pPr>
       <w:r>
-        <w:t xml:space="preserve">Canguilhem, G. (1991). </w:t>
-      </w:r>
-      <w:r>
-        <w:rPr>
-          <w:i/>
-          <w:iCs/>
-        </w:rPr>
-        <w:t xml:space="preserve">The Normal and the Pathological</w:t>
-      </w:r>
-      <w:r>
-        <w:t xml:space="preserve">. Zone Books.</w:t>
+        <w:t xml:space="preserve">Canguilhem, G. (1971). </w:t>
+      </w:r>
+      <w:r>
+        <w:rPr>
+          <w:i/>
+          <w:iCs/>
+        </w:rPr>
+        <w:t xml:space="preserve">Lo normal y lo patológico</w:t>
+      </w:r>
+      <w:r>
+        <w:t xml:space="preserve"> (R. Potschart, Trad.). Siglo XXI. (Obra original publicada en 1966).</w:t>
       </w:r>
     </w:p>
     <w:p>
@@ -19194,17 +19287,17 @@
         <w:pStyle w:val="BodyJ"/>
       </w:pPr>
       <w:r>
-        <w:t xml:space="preserve">Foucault, M. (1973). </w:t>
-      </w:r>
-      <w:r>
-        <w:rPr>
-          <w:i/>
-          <w:iCs/>
-        </w:rPr>
-        <w:t xml:space="preserve">The Birth of the Clinic: An Archaeology of Medical Perception</w:t>
-      </w:r>
-      <w:r>
-        <w:t xml:space="preserve"> (A. M. Sheridan Smith, Trans.). Vintage Books.</w:t>
+        <w:t xml:space="preserve">Foucault, M. (1966). </w:t>
+      </w:r>
+      <w:r>
+        <w:rPr>
+          <w:i/>
+          <w:iCs/>
+        </w:rPr>
+        <w:t xml:space="preserve">El nacimiento de la clínica: Una arqueología de la mirada médica</w:t>
+      </w:r>
+      <w:r>
+        <w:t xml:space="preserve"> (F. Perujo, Trad.). Siglo XXI. (Obra original publicada en 1963).</w:t>
       </w:r>
     </w:p>
     <w:p>
@@ -19255,10 +19348,10 @@
           <w:i/>
           <w:iCs/>
         </w:rPr>
-        <w:t xml:space="preserve">The Enigma of Health: The Art of Healing in a Scientific Age</w:t>
-      </w:r>
-      <w:r>
-        <w:t xml:space="preserve"> (J. Gaiger &amp; N. Walker, Trans.). Stanford University Press.</w:t>
+        <w:t xml:space="preserve">El estado oculto de la salud</w:t>
+      </w:r>
+      <w:r>
+        <w:t xml:space="preserve"> (N. Machaín, Trad.). Gedisa.</w:t>
       </w:r>
     </w:p>
     <w:p>
@@ -19410,6 +19503,42 @@
         <w:pStyle w:val="BodyJ"/>
       </w:pPr>
       <w:r>
+        <w:t xml:space="preserve">Greenhalgh, T., &amp; Hurwitz, B. (Eds.). (1998). </w:t>
+      </w:r>
+      <w:r>
+        <w:rPr>
+          <w:i/>
+          <w:iCs/>
+        </w:rPr>
+        <w:t xml:space="preserve">Narrative Based Medicine: Dialogue and Discourse in Clinical Practice</w:t>
+      </w:r>
+      <w:r>
+        <w:t xml:space="preserve">. BMJ Books.</w:t>
+      </w:r>
+    </w:p>
+    <w:p>
+      <w:pPr>
+        <w:pStyle w:val="BodyJ"/>
+      </w:pPr>
+      <w:r>
+        <w:t xml:space="preserve">Greenhalgh, T., Howick, J., &amp; Maskrey, N. (2014). Evidence based medicine: A movement in crisis? </w:t>
+      </w:r>
+      <w:r>
+        <w:rPr>
+          <w:i/>
+          <w:iCs/>
+        </w:rPr>
+        <w:t xml:space="preserve">BMJ, 348</w:t>
+      </w:r>
+      <w:r>
+        <w:t xml:space="preserve">, g3725.</w:t>
+      </w:r>
+    </w:p>
+    <w:p>
+      <w:pPr>
+        <w:pStyle w:val="BodyJ"/>
+      </w:pPr>
+      <w:r>
         <w:t xml:space="preserve">Groopman, J. (2007). </w:t>
       </w:r>
       <w:r>
@@ -19428,42 +19557,6 @@
         <w:pStyle w:val="BodyJ"/>
       </w:pPr>
       <w:r>
-        <w:t xml:space="preserve">Greenhalgh, T., &amp; Hurwitz, B. (Eds.). (1998). </w:t>
-      </w:r>
-      <w:r>
-        <w:rPr>
-          <w:i/>
-          <w:iCs/>
-        </w:rPr>
-        <w:t xml:space="preserve">Narrative Based Medicine: Dialogue and Discourse in Clinical Practice</w:t>
-      </w:r>
-      <w:r>
-        <w:t xml:space="preserve">. BMJ Books.</w:t>
-      </w:r>
-    </w:p>
-    <w:p>
-      <w:pPr>
-        <w:pStyle w:val="BodyJ"/>
-      </w:pPr>
-      <w:r>
-        <w:t xml:space="preserve">Greenhalgh, T., Howick, J., &amp; Maskrey, N. (2014). Evidence based medicine: A movement in crisis? </w:t>
-      </w:r>
-      <w:r>
-        <w:rPr>
-          <w:i/>
-          <w:iCs/>
-        </w:rPr>
-        <w:t xml:space="preserve">BMJ, 348</w:t>
-      </w:r>
-      <w:r>
-        <w:t xml:space="preserve">, g3725.</w:t>
-      </w:r>
-    </w:p>
-    <w:p>
-      <w:pPr>
-        <w:pStyle w:val="BodyJ"/>
-      </w:pPr>
-      <w:r>
         <w:t xml:space="preserve">Han, P. K. J., Klein, W. M. P., &amp; Arora, N. K. (2011). Varieties of uncertainty in health care: A conceptual taxonomy. </w:t>
       </w:r>
       <w:r>
@@ -19680,6 +19773,24 @@
         <w:pStyle w:val="BodyJ"/>
       </w:pPr>
       <w:r>
+        <w:t xml:space="preserve">Jonsen, A. R., &amp; Toulmin, S. (1988). </w:t>
+      </w:r>
+      <w:r>
+        <w:rPr>
+          <w:i/>
+          <w:iCs/>
+        </w:rPr>
+        <w:t xml:space="preserve">The Abuse of Casuistry: A History of Moral Reasoning</w:t>
+      </w:r>
+      <w:r>
+        <w:t xml:space="preserve">. University of California Press.</w:t>
+      </w:r>
+    </w:p>
+    <w:p>
+      <w:pPr>
+        <w:pStyle w:val="BodyJ"/>
+      </w:pPr>
+      <w:r>
         <w:t xml:space="preserve">Kadavath, S., Conerly, T., Askell, A., Henighan, T., Drain, D., Perez, E., et al. (2022). Language models (mostly) know what they know. </w:t>
       </w:r>
       <w:r>
@@ -19698,24 +19809,6 @@
         <w:pStyle w:val="BodyJ"/>
       </w:pPr>
       <w:r>
-        <w:t xml:space="preserve">Jonsen, A. R., &amp; Toulmin, S. (1988). </w:t>
-      </w:r>
-      <w:r>
-        <w:rPr>
-          <w:i/>
-          <w:iCs/>
-        </w:rPr>
-        <w:t xml:space="preserve">The Abuse of Casuistry: A History of Moral Reasoning</w:t>
-      </w:r>
-      <w:r>
-        <w:t xml:space="preserve">. University of California Press.</w:t>
-      </w:r>
-    </w:p>
-    <w:p>
-      <w:pPr>
-        <w:pStyle w:val="BodyJ"/>
-      </w:pPr>
-      <w:r>
         <w:t xml:space="preserve">Kahneman, D. (2011). </w:t>
       </w:r>
       <w:r>
@@ -19788,6 +19881,24 @@
         <w:pStyle w:val="BodyJ"/>
       </w:pPr>
       <w:r>
+        <w:t xml:space="preserve">Kline, J. A., Mitchell, A. M., Kabrhel, C., Richman, P. B., &amp; Courtney, D. M. (2004). Clinical criteria to prevent unnecessary diagnostic testing in emergency department patients with suspected pulmonary embolism. </w:t>
+      </w:r>
+      <w:r>
+        <w:rPr>
+          <w:i/>
+          <w:iCs/>
+        </w:rPr>
+        <w:t xml:space="preserve">Journal of Thrombosis and Haemostasis, 2</w:t>
+      </w:r>
+      <w:r>
+        <w:t xml:space="preserve">(8), 1247–1255.</w:t>
+      </w:r>
+    </w:p>
+    <w:p>
+      <w:pPr>
+        <w:pStyle w:val="BodyJ"/>
+      </w:pPr>
+      <w:r>
         <w:t xml:space="preserve">Knight, F. H. (1921). </w:t>
       </w:r>
       <w:r>
@@ -20735,6 +20846,24 @@
       </w:r>
       <w:r>
         <w:t xml:space="preserve">, e6144.</w:t>
+      </w:r>
+    </w:p>
+    <w:p>
+      <w:pPr>
+        <w:pStyle w:val="BodyJ"/>
+      </w:pPr>
+      <w:r>
+        <w:t xml:space="preserve">Wang, M. D., Khanna, R., &amp; Najafi, N. (2017). Characterizing the source of text in electronic health record progress notes. </w:t>
+      </w:r>
+      <w:r>
+        <w:rPr>
+          <w:i/>
+          <w:iCs/>
+        </w:rPr>
+        <w:t xml:space="preserve">JAMA Internal Medicine, 177</w:t>
+      </w:r>
+      <w:r>
+        <w:t xml:space="preserve">(8), 1212–1213.</w:t>
       </w:r>
     </w:p>
     <w:p>

</xml_diff>

<commit_message>
Rebuild tras los siete recortes: 134 pp, TOC 37/37, sin referencias huérfanas
DOCX/PDF/EPUB regenerados desde las fuentes; figuras 1-9 únicas; 138
referencias, todas citadas (verificación por script); README con el
punto 24 y la extensión actualizada.

Co-Authored-By: Claude Fable 5.1 <noreply@anthropic.com>
Claude-Session: https://claude.ai/code/session_01SPkhDdVzUCxJwqq61ddeLW
</commit_message>
<xml_diff>
--- a/libro/Hechos_inferencias_incertidumbre_edicion_revisada.docx
+++ b/libro/Hechos_inferencias_incertidumbre_edicion_revisada.docx
@@ -678,7 +678,7 @@
         </w:tabs>
       </w:pPr>
       <w:r>
-        <w:t xml:space="preserve">Cuaderno de casos. Diez viñetas para una lectura metacognitiva</w:t>
+        <w:t xml:space="preserve">Cuaderno de casos. Ocho viñetas para una lectura metacognitiva</w:t>
       </w:r>
       <w:r>
         <w:tab/>
@@ -707,7 +707,7 @@
         <w:rPr>
           <w:color w:val="8A8A8A"/>
         </w:rPr>
-        <w:t xml:space="preserve">93</w:t>
+        <w:t xml:space="preserve">92</w:t>
       </w:r>
     </w:p>
     <w:p>
@@ -727,7 +727,7 @@
         <w:rPr>
           <w:color w:val="8A8A8A"/>
         </w:rPr>
-        <w:t xml:space="preserve">98</w:t>
+        <w:t xml:space="preserve">96</w:t>
       </w:r>
     </w:p>
     <w:p>
@@ -747,7 +747,7 @@
         <w:rPr>
           <w:color w:val="8A8A8A"/>
         </w:rPr>
-        <w:t xml:space="preserve">106</w:t>
+        <w:t xml:space="preserve">103</w:t>
       </w:r>
     </w:p>
     <w:p>
@@ -767,7 +767,7 @@
         <w:rPr>
           <w:color w:val="8A8A8A"/>
         </w:rPr>
-        <w:t xml:space="preserve">110</w:t>
+        <w:t xml:space="preserve">107</w:t>
       </w:r>
     </w:p>
     <w:p>
@@ -787,7 +787,7 @@
         <w:rPr>
           <w:color w:val="8A8A8A"/>
         </w:rPr>
-        <w:t xml:space="preserve">112</w:t>
+        <w:t xml:space="preserve">109</w:t>
       </w:r>
     </w:p>
     <w:p>
@@ -807,7 +807,7 @@
         <w:rPr>
           <w:color w:val="8A8A8A"/>
         </w:rPr>
-        <w:t xml:space="preserve">114</w:t>
+        <w:t xml:space="preserve">111</w:t>
       </w:r>
     </w:p>
     <w:p>
@@ -827,7 +827,7 @@
         <w:rPr>
           <w:color w:val="8A8A8A"/>
         </w:rPr>
-        <w:t xml:space="preserve">116</w:t>
+        <w:t xml:space="preserve">113</w:t>
       </w:r>
     </w:p>
     <w:p>
@@ -847,7 +847,7 @@
         <w:rPr>
           <w:color w:val="8A8A8A"/>
         </w:rPr>
-        <w:t xml:space="preserve">118</w:t>
+        <w:t xml:space="preserve">115</w:t>
       </w:r>
     </w:p>
     <w:p>
@@ -867,7 +867,7 @@
         <w:rPr>
           <w:color w:val="8A8A8A"/>
         </w:rPr>
-        <w:t xml:space="preserve">122</w:t>
+        <w:t xml:space="preserve">119</w:t>
       </w:r>
     </w:p>
     <w:p>
@@ -887,7 +887,7 @@
         <w:rPr>
           <w:color w:val="8A8A8A"/>
         </w:rPr>
-        <w:t xml:space="preserve">125</w:t>
+        <w:t xml:space="preserve">122</w:t>
       </w:r>
     </w:p>
     <w:p>
@@ -907,7 +907,7 @@
         <w:rPr>
           <w:color w:val="8A8A8A"/>
         </w:rPr>
-        <w:t xml:space="preserve">126</w:t>
+        <w:t xml:space="preserve">123</w:t>
       </w:r>
     </w:p>
     <w:p>
@@ -1089,7 +1089,7 @@
         <w:t xml:space="preserve">Parte IV</w:t>
       </w:r>
       <w:r>
-        <w:t xml:space="preserve"> propone una epistemología operativa: la responsabilidad —incluido el miedo que también escribe—, el método HII-D, un cuaderno de diez casos, la enseñanza de la metacognición clínica, la inteligencia artificial en el proceso diagnóstico y terapéutico —sus roles, sus riesgos y las defensas frente a ellos— y un cierre desde la poesía chilena — Huidobro y Parra como los dos polos de lo que la palabra clínica puede y no puede permitirse.</w:t>
+        <w:t xml:space="preserve"> propone una epistemología operativa: la responsabilidad —incluido el miedo que también escribe—, el método HII-D, un cuaderno de ocho casos, la enseñanza de la metacognición clínica, la inteligencia artificial en el proceso diagnóstico y terapéutico —sus roles, sus riesgos y las defensas frente a ellos— y un cierre desde la poesía chilena — Huidobro y Parra como los dos polos de lo que la palabra clínica puede y no puede permitirse.</w:t>
       </w:r>
     </w:p>
     <w:p>
@@ -6642,72 +6642,31 @@
           <w:sz w:val="25"/>
           <w:szCs w:val="25"/>
         </w:rPr>
-        <w:t xml:space="preserve">La singularidad no autoriza la arbitrariedad</w:t>
-      </w:r>
-    </w:p>
-    <w:p>
-      <w:pPr>
-        <w:pStyle w:val="BodyJ"/>
-      </w:pPr>
-      <w:r>
-        <w:t xml:space="preserve">La defensa del juicio clínico puede convertirse en excusa para ignorar datos incómodos. Que cada paciente sea singular no significa que toda decisión sea incomparable ni que la experiencia personal tenga igual fuerza que un estudio robusto. La singularidad clínica es una tarea de integración, no una licencia para abandonar estándares. Debe explicitar qué rasgo del caso modifica la inferencia poblacional y por qué.</w:t>
-      </w:r>
-    </w:p>
-    <w:p>
-      <w:pPr>
-        <w:pStyle w:val="BodyJ"/>
-      </w:pPr>
-      <w:r>
-        <w:t xml:space="preserve">Una formulación responsable podría distinguir: evidencia de eficacia; evidencia de seguridad; semejanza del paciente con la población; factores que aumentan o disminuyen el efecto esperado; preferencias; y condiciones locales de implementación. Esta separación evita dos excesos simétricos: el positivismo ingenuo que cree que el estudio decide por sí solo y el particularismo romántico que presenta la intuición del médico como conocimiento inaccesible a examen.</w:t>
-      </w:r>
-    </w:p>
-    <w:p>
-      <w:pPr>
-        <w:pStyle w:val="BodyJ"/>
-      </w:pPr>
-      <w:r>
-        <w:t xml:space="preserve">La medicina clínica utiliza además evidencia que no siempre ocupa la parte superior de una pirámide: evolución temporal, respuesta previa, patrones fisiopatológicos, datos locales, factibilidad y experiencia técnica. Su menor jerarquía para estimar causalidad poblacional no la vuelve irrelevante para una decisión individual. La pregunta correcta es qué función epistémica cumple cada fuente y qué error puede corregir o introducir.</w:t>
-      </w:r>
-    </w:p>
-    <w:p>
-      <w:pPr>
-        <w:pStyle w:val="Heading3"/>
-        <w:spacing w:after="120" w:before="280"/>
-      </w:pPr>
-      <w:r>
-        <w:rPr>
-          <w:rFonts w:ascii="Georgia" w:cs="Georgia" w:eastAsia="Georgia" w:hAnsi="Georgia"/>
-          <w:b/>
-          <w:bCs/>
-          <w:color w:val="2B2B2B"/>
-          <w:sz w:val="25"/>
-          <w:szCs w:val="25"/>
-        </w:rPr>
-        <w:t xml:space="preserve">Evidencia local y aprendizaje del caso</w:t>
-      </w:r>
-    </w:p>
-    <w:p>
-      <w:pPr>
-        <w:pStyle w:val="BodyJ"/>
-      </w:pPr>
-      <w:r>
-        <w:t xml:space="preserve">La evidencia externa convive con conocimiento local: epidemiología, disponibilidad diagnóstica, tiempos de traslado, perfiles de resistencia, experiencia técnica y capacidad de seguimiento. Estos datos pueden modificar la decisión sin contradecir un estudio. Su legitimidad depende de que sean explícitos y actualizables, no simples tradiciones institucionales.</w:t>
-      </w:r>
-    </w:p>
-    <w:p>
-      <w:pPr>
-        <w:pStyle w:val="BodyJ"/>
-      </w:pPr>
-      <w:r>
-        <w:t xml:space="preserve">El paciente también genera evidencia longitudinal sobre sí mismo. Respuestas previas, recurrencias, efectos adversos y preferencias estables constituyen información relevante, aunque no equivalgan a un ensayo N-of-1 formal. El desafío es evitar atribuciones causales fáciles: la mejoría posterior a una intervención no demuestra que haya sido causada por ella, especialmente cuando coexisten historia natural y tratamientos simultáneos.</w:t>
-      </w:r>
-    </w:p>
-    <w:p>
-      <w:pPr>
-        <w:pStyle w:val="BodyJ"/>
-      </w:pPr>
-      <w:r>
-        <w:t xml:space="preserve">Una deliberación bien formulada puede declarar: qué proviene de estudios; qué se extrapola; qué aporta la historia individual; qué depende del contexto local; y qué permanece desconocido. Esa estratificación protege tanto contra la obediencia automática a la evidencia como contra su rechazo anecdótico. La competencia metacognitiva consiste en reconocer cuándo se está citando un resultado, cuándo se está extrapolando, cuándo se está suponiendo un mecanismo y cuándo una preferencia está inclinando la balanza. La pregunta final no es "¿existe evidencia?", sino "¿qué evidencia existe, para qué afirmación, con qué transportabilidad y con qué consecuencias para esta persona?".</w:t>
+        <w:t xml:space="preserve">Singularidad sin arbitrariedad: evidencia externa, local y del propio caso</w:t>
+      </w:r>
+    </w:p>
+    <w:p>
+      <w:pPr>
+        <w:pStyle w:val="BodyJ"/>
+      </w:pPr>
+      <w:r>
+        <w:t xml:space="preserve">La defensa del juicio clínico puede convertirse en excusa para ignorar datos incómodos. Que cada paciente sea singular no significa que toda decisión sea incomparable ni que la experiencia personal tenga igual fuerza que un estudio robusto. La singularidad clínica es una tarea de integración, no una licencia para abandonar estándares: debe explicitar qué rasgo del caso modifica la inferencia poblacional y por qué. Esa exigencia evita dos excesos simétricos: el positivismo ingenuo que cree que el estudio decide por sí solo y el particularismo romántico que presenta la intuición del médico como conocimiento inaccesible a examen.</w:t>
+      </w:r>
+    </w:p>
+    <w:p>
+      <w:pPr>
+        <w:pStyle w:val="BodyJ"/>
+      </w:pPr>
+      <w:r>
+        <w:t xml:space="preserve">La evidencia externa convive con dos fuentes más. La primera es el conocimiento local —epidemiología, perfiles de resistencia, disponibilidad diagnóstica, tiempos de traslado, experiencia técnica, capacidad de seguimiento—, que puede modificar la decisión sin contradecir ningún estudio, siempre que sea explícito y actualizable y no una tradición institucional. La segunda es el propio paciente, que genera evidencia longitudinal sobre sí mismo: respuestas previas, recurrencias, efectos adversos y preferencias estables, información relevante aunque no equivalga a un ensayo N-de-1 formal. El riesgo con ambas es la atribución causal fácil: la mejoría posterior a una intervención no demuestra que haya sido causada por ella cuando coexisten historia natural y tratamientos simultáneos.</w:t>
+      </w:r>
+    </w:p>
+    <w:p>
+      <w:pPr>
+        <w:pStyle w:val="BodyJ"/>
+      </w:pPr>
+      <w:r>
+        <w:t xml:space="preserve">Una deliberación bien formulada declara, por eso, qué proviene de estudios, qué se extrapola, qué aporta la historia individual, qué depende del contexto local y qué permanece desconocido. La competencia metacognitiva consiste en reconocer cuándo se está citando un resultado, cuándo extrapolando, cuándo suponiendo un mecanismo y cuándo una preferencia está inclinando la balanza. La pregunta final no es "¿existe evidencia?", sino "¿qué evidencia existe, para qué afirmación, con qué transportabilidad y con qué consecuencias para esta persona?".</w:t>
       </w:r>
     </w:p>
     <w:p>
@@ -7214,7 +7173,7 @@
         <w:pStyle w:val="BodyJ"/>
       </w:pPr>
       <w:r>
-        <w:t xml:space="preserve">El lector encontrará este cruce ejecutado dos veces en este libro sin la palabra "bioética": en la conversación donde la cirujana recomienda operar a Carmen y le devuelve la decisión (Interludio III), y en la viñeta del final de la vida, donde la incertidumbre que domina no es pronóstica sino de metas (Cuaderno de casos, viñeta 7). En ambas, lo decisivo no fue un principio abstracto: fue que la funcionalidad, la trayectoria y los fines del paciente estuvieran dentro del razonamiento desde el principio. Esa es la tesis de esta sección: la bioética no llega al final a ponerle límites a un razonamiento ya terminado — estaba en el principio, decidiendo qué se mira. Una decisión que ignoró la funcionalidad, el pronóstico de fondo y la red de apoyo no es más "objetiva" por haberse limitado a lo técnico: es más incompleta. Le faltan hechos, no sólo sensibilidad.</w:t>
+        <w:t xml:space="preserve">El lector encontrará este cruce ejecutado dos veces en este libro sin la palabra "bioética": en la conversación donde la cirujana recomienda operar a Carmen y le devuelve la decisión (Interludio III), y en la viñeta del final de la vida, donde la incertidumbre que domina no es pronóstica sino de metas (Cuaderno de casos, viñeta 5). En ambas, lo decisivo no fue un principio abstracto: fue que la funcionalidad, la trayectoria y los fines del paciente estuvieran dentro del razonamiento desde el principio. Esa es la tesis de esta sección: la bioética no llega al final a ponerle límites a un razonamiento ya terminado — estaba en el principio, decidiendo qué se mira. Una decisión que ignoró la funcionalidad, el pronóstico de fondo y la red de apoyo no es más "objetiva" por haberse limitado a lo técnico: es más incompleta. Le faltan hechos, no sólo sensibilidad.</w:t>
       </w:r>
     </w:p>
     <w:p>
@@ -8649,6 +8608,14 @@
     </w:p>
     <w:p>
       <w:pPr>
+        <w:pStyle w:val="BodyJ"/>
+      </w:pPr>
+      <w:r>
+        <w:t xml:space="preserve">La decisión, además, no ocurre dentro de una distribución estadística sino en una biografía (Greenhalgh &amp; Hurwitz, 1998; Charon, 2006): el mismo riesgo es aceptable para una persona e inaceptable para otra según responsabilidades, experiencias previas y concepción de la calidad de vida, y escuchar la historia corrige inferencias — "mala adherencia" puede ser imposibilidad económica, "rechazo" una experiencia anterior, "síntoma funcional" una invalidación vivida. El lenguaje del médico abre o cierra esa posibilidad de conocimiento.</w:t>
+      </w:r>
+    </w:p>
+    <w:p>
+      <w:pPr>
         <w:pStyle w:val="Heading3"/>
         <w:spacing w:after="120" w:before="280"/>
       </w:pPr>
@@ -8661,31 +8628,23 @@
           <w:sz w:val="25"/>
           <w:szCs w:val="25"/>
         </w:rPr>
-        <w:t xml:space="preserve">Decisión compartida y narrativa</w:t>
-      </w:r>
-    </w:p>
-    <w:p>
-      <w:pPr>
-        <w:pStyle w:val="BodyJ"/>
-      </w:pPr>
-      <w:r>
-        <w:t xml:space="preserve">La decisión compartida cobra especial importancia cuando existen varias opciones razonables y los valores modifican el balance. El modelo de Elwyn y colaboradores propone deliberación sobre opciones, preferencias y decisión, no una simple entrega de información (Elwyn et al., 2012). La incertidumbre debe comunicarse de forma que la persona pueda entender cómo afecta las alternativas.</w:t>
-      </w:r>
-    </w:p>
-    <w:p>
-      <w:pPr>
-        <w:pStyle w:val="BodyJ"/>
-      </w:pPr>
-      <w:r>
-        <w:t xml:space="preserve">Los números ayudan cuando son confiables y comprensibles. Las frecuencias naturales —por ejemplo, "de 100 personas similares"— suelen ser más claras que probabilidades condicionales aisladas (Gigerenzer et al., 2007). Pero no todo puede cuantificarse. En esos casos se debe explicar la dirección y magnitud aproximada de la incertidumbre, evitando palabras vagas sin contexto.</w:t>
-      </w:r>
-    </w:p>
-    <w:p>
-      <w:pPr>
-        <w:pStyle w:val="BodyJ"/>
-      </w:pPr>
-      <w:r>
-        <w:t xml:space="preserve">La medicina narrativa recuerda que una decisión no ocurre sólo dentro de una distribución estadística. Ocurre en una biografía (Greenhalgh &amp; Hurwitz, 1998; Charon, 2006). El mismo riesgo puede ser aceptable para una persona y no para otra según responsabilidades, experiencias, temor, tolerancia al deterioro y concepción de calidad de vida. Escuchar la historia también corrige inferencias. Una conducta que parece "mala adherencia" puede ser imposibilidad económica; "rechazo" puede expresar una experiencia previa; "síntoma funcional" puede ser vivido como invalidación. El lenguaje del médico puede abrir o cerrar la posibilidad de conocimiento.</w:t>
+        <w:t xml:space="preserve">Incertidumbre dentro del equipo</w:t>
+      </w:r>
+    </w:p>
+    <w:p>
+      <w:pPr>
+        <w:pStyle w:val="BodyJ"/>
+      </w:pPr>
+      <w:r>
+        <w:t xml:space="preserve">En pases de turno, la frase "está cubierto" suele ocultar supuestos. Es preferible nombrar quién verificará un resultado, qué diagnóstico no debe perderse y qué cambio exige avisar. La incertidumbre compartida se convierte en tarea distribuida.</w:t>
+      </w:r>
+    </w:p>
+    <w:p>
+      <w:pPr>
+        <w:pStyle w:val="BodyJ"/>
+      </w:pPr>
+      <w:r>
+        <w:t xml:space="preserve">Las jerarquías influyen. Si el médico más senior presenta una hipótesis como hecho, los demás pueden dejar de ofrecer datos discordantes. Una formulación como "mi impresión principal es X; me preocupa Y por esta razón; ¿qué dato no encaja?" conserva liderazgo y abre corrección.</w:t>
       </w:r>
     </w:p>
     <w:p>
@@ -8702,39 +8661,6 @@
           <w:sz w:val="25"/>
           <w:szCs w:val="25"/>
         </w:rPr>
-        <w:t xml:space="preserve">Incertidumbre dentro del equipo</w:t>
-      </w:r>
-    </w:p>
-    <w:p>
-      <w:pPr>
-        <w:pStyle w:val="BodyJ"/>
-      </w:pPr>
-      <w:r>
-        <w:t xml:space="preserve">En pases de turno, la frase "está cubierto" suele ocultar supuestos. Es preferible nombrar quién verificará un resultado, qué diagnóstico no debe perderse y qué cambio exige avisar. La incertidumbre compartida se convierte en tarea distribuida.</w:t>
-      </w:r>
-    </w:p>
-    <w:p>
-      <w:pPr>
-        <w:pStyle w:val="BodyJ"/>
-      </w:pPr>
-      <w:r>
-        <w:t xml:space="preserve">Las jerarquías influyen. Si el médico más senior presenta una hipótesis como hecho, los demás pueden dejar de ofrecer datos discordantes. Una formulación como "mi impresión principal es X; me preocupa Y por esta razón; ¿qué dato no encaja?" conserva liderazgo y abre corrección.</w:t>
-      </w:r>
-    </w:p>
-    <w:p>
-      <w:pPr>
-        <w:pStyle w:val="Heading3"/>
-        <w:spacing w:after="120" w:before="280"/>
-      </w:pPr>
-      <w:r>
-        <w:rPr>
-          <w:rFonts w:ascii="Georgia" w:cs="Georgia" w:eastAsia="Georgia" w:hAnsi="Georgia"/>
-          <w:b/>
-          <w:bCs/>
-          <w:color w:val="2B2B2B"/>
-          <w:sz w:val="25"/>
-          <w:szCs w:val="25"/>
-        </w:rPr>
         <w:t xml:space="preserve">La ética de la fuerza verbal</w:t>
       </w:r>
     </w:p>
@@ -9015,7 +8941,7 @@
         <w:pStyle w:val="PartIntro"/>
       </w:pPr>
       <w:r>
-        <w:t xml:space="preserve">Las tres primeras partes construyeron las herramientas; esta las pone a trabajar. Primero frente a la responsabilidad —y el miedo— que ninguna herramienta puede delegar (capítulo 14). Luego, el método HII-D en forma completa y en versión de sesenta segundos (capítulo 15), un cuaderno de diez casos para leer metacognitivamente —incluida la resolución de la historia de Carmen— y el problema de enseñar y organizar todo esto (capítulo 16). Cierran el libro dos espejos: la inteligencia artificial en el proceso diagnóstico y terapéutico —qué hace, qué arriesga, cómo se la enfrenta— (capítulo 17), y la poesía — porque el debate sobre lo que la palabra tiene derecho a hacer también se libró en verso, y en Chile (capítulo 18).</w:t>
+        <w:t xml:space="preserve">Las tres primeras partes construyeron las herramientas; esta las pone a trabajar. Primero frente a la responsabilidad —y el miedo— que ninguna herramienta puede delegar (capítulo 14). Luego, el método HII-D en forma completa y en versión de sesenta segundos (capítulo 15), un cuaderno de ocho casos para leer metacognitivamente —incluida la resolución de la historia de Carmen— y el problema de enseñar y organizar todo esto (capítulo 16). Cierran el libro dos espejos: la inteligencia artificial en el proceso diagnóstico y terapéutico —qué hace, qué arriesga, cómo se la enfrenta— (capítulo 17), y la poesía — porque el debate sobre lo que la palabra tiene derecho a hacer también se libró en verso, y en Chile (capítulo 18).</w:t>
       </w:r>
     </w:p>
     <w:p>
@@ -11227,7 +11153,7 @@
           <w:szCs w:val="32"/>
         </w:rPr>
         <w:br/>
-        <w:t xml:space="preserve">Diez viñetas para una lectura metacognitiva</w:t>
+        <w:t xml:space="preserve">Ocho viñetas para una lectura metacognitiva</w:t>
       </w:r>
     </w:p>
     <w:p>
@@ -11475,75 +11401,75 @@
           <w:sz w:val="25"/>
           <w:szCs w:val="25"/>
         </w:rPr>
-        <w:t xml:space="preserve">Viñeta 3. Globus y necesidad de una explicación no reductiva</w:t>
-      </w:r>
-    </w:p>
-    <w:p>
-      <w:pPr>
-        <w:pStyle w:val="BodyJ"/>
-      </w:pPr>
-      <w:r>
-        <w:t xml:space="preserve">Una paciente refiere sensación persistente de cuerpo extraño faríngeo, sin disfagia progresiva, odinofagia, pérdida de peso ni alteración estructural en evaluación inicial. Los síntomas fluctúan con estrés y atención corporal. Solicita "un examen que muestre qué tiene".</w:t>
-      </w:r>
-    </w:p>
-    <w:p>
-      <w:pPr>
-        <w:pStyle w:val="BodyJ"/>
-      </w:pPr>
-      <w:r>
-        <w:rPr>
-          <w:i/>
-          <w:iCs/>
-        </w:rPr>
-        <w:t xml:space="preserve">Hechos:</w:t>
-      </w:r>
-      <w:r>
-        <w:t xml:space="preserve"> sensación localizada; ausencia de signos de alarma; evaluación estructural no reveladora; variabilidad contextual.</w:t>
-      </w:r>
-    </w:p>
-    <w:p>
-      <w:pPr>
-        <w:pStyle w:val="BodyJ"/>
-      </w:pPr>
-      <w:r>
-        <w:rPr>
-          <w:i/>
-          <w:iCs/>
-        </w:rPr>
-        <w:t xml:space="preserve">Inferencia:</w:t>
-      </w:r>
-      <w:r>
-        <w:t xml:space="preserve"> globus funcional es probable después de una evaluación apropiada. "Funcional" no significa inventado; describe alteración de percepción, atención, sensibilidad y regulación sin lesión estructural suficiente para explicarla.</w:t>
-      </w:r>
-    </w:p>
-    <w:p>
-      <w:pPr>
-        <w:pStyle w:val="BodyJ"/>
-      </w:pPr>
-      <w:r>
-        <w:rPr>
-          <w:i/>
-          <w:iCs/>
-        </w:rPr>
-        <w:t xml:space="preserve">Incertidumbre:</w:t>
-      </w:r>
-      <w:r>
-        <w:t xml:space="preserve"> ningún examen elimina todo riesgo futuro; la conducta depende de evolución y aparición de banderas rojas. Puede coexistir reflujo, tensión muscular o factores afectivos sin causalidad única.</w:t>
-      </w:r>
-    </w:p>
-    <w:p>
-      <w:pPr>
-        <w:pStyle w:val="BodyJ"/>
-      </w:pPr>
-      <w:r>
-        <w:rPr>
-          <w:i/>
-          <w:iCs/>
-        </w:rPr>
-        <w:t xml:space="preserve">Decisión:</w:t>
-      </w:r>
-      <w:r>
-        <w:t xml:space="preserve"> explicar el diagnóstico positivo, evitar escalamiento indiscriminado de pruebas, tratar factores contribuyentes seleccionados y usar estrategias cognitivo-conductuales orientadas a atención, interpretación y respuesta al síntoma.</w:t>
+        <w:t xml:space="preserve">Viñeta 3. Tres de la mañana: decidir con el reloj en contra</w:t>
+      </w:r>
+    </w:p>
+    <w:p>
+      <w:pPr>
+        <w:pStyle w:val="BodyJ"/>
+      </w:pPr>
+      <w:r>
+        <w:t xml:space="preserve">Urgencias, 3:10. Hombre de 54 años, dolor torácico opresivo de 40 minutos, sudoroso, con antecedente de tabaquismo. Electrocardiograma: alteraciones inespecíficas de la repolarización. Primera troponina: pendiente. Hay otros nueve pacientes esperando y una sola reanimación disponible. No hay tiempo para la plantilla completa; hay tiempo para los sesenta segundos.</w:t>
+      </w:r>
+    </w:p>
+    <w:p>
+      <w:pPr>
+        <w:pStyle w:val="BodyJ"/>
+      </w:pPr>
+      <w:r>
+        <w:rPr>
+          <w:i/>
+          <w:iCs/>
+        </w:rPr>
+        <w:t xml:space="preserve">¿Qué vi y qué me contaron?</w:t>
+      </w:r>
+      <w:r>
+        <w:t xml:space="preserve"> Dolor opresivo con descarga adrenérgica, observado; ECG no diagnóstico pero anormal, medido ahora.</w:t>
+      </w:r>
+    </w:p>
+    <w:p>
+      <w:pPr>
+        <w:pStyle w:val="BodyJ"/>
+      </w:pPr>
+      <w:r>
+        <w:rPr>
+          <w:i/>
+          <w:iCs/>
+        </w:rPr>
+        <w:t xml:space="preserve">¿Qué creo y cuánto derecho tengo?</w:t>
+      </w:r>
+      <w:r>
+        <w:t xml:space="preserve"> Síndrome coronario agudo: posible-probable; el patrón clínico pesa más que el ECG inespecífico. No demostrado.</w:t>
+      </w:r>
+    </w:p>
+    <w:p>
+      <w:pPr>
+        <w:pStyle w:val="BodyJ"/>
+      </w:pPr>
+      <w:r>
+        <w:rPr>
+          <w:i/>
+          <w:iCs/>
+        </w:rPr>
+        <w:t xml:space="preserve">¿Qué daño importante podría producir si estoy equivocado?</w:t>
+      </w:r>
+      <w:r>
+        <w:t xml:space="preserve"> Tratarlo como "dolor inespecífico, espera troponina en sala" y que sea una oclusión en evolución. La incertidumbre peligrosa no es la etiqueta; es el tiempo.</w:t>
+      </w:r>
+    </w:p>
+    <w:p>
+      <w:pPr>
+        <w:pStyle w:val="BodyJ"/>
+      </w:pPr>
+      <w:r>
+        <w:rPr>
+          <w:i/>
+          <w:iCs/>
+        </w:rPr>
+        <w:t xml:space="preserve">¿Qué hago y qué me haría cambiar?</w:t>
+      </w:r>
+      <w:r>
+        <w:t xml:space="preserve"> Monitor, acceso, antiagregación según protocolo, ECG seriado en 15 minutos, troponina acelerada; escala a activación de hemodinamia si nuevo ECG cambia o el dolor persiste. Queda escrito: "SCA no demostrado; conducta por umbral dada gravedad del error de omisión".</w:t>
       </w:r>
     </w:p>
     <w:p>
@@ -11558,7 +11484,22 @@
         <w:t xml:space="preserve">Frase medular:</w:t>
       </w:r>
       <w:r>
-        <w:t xml:space="preserve"> "Sensación de globus sin disfagia verdadera ni signos de alarma y con evaluación estructural negativa, compatible con trastorno funcional de percepción faríngea; se propone manejo positivo y seguimiento, no una búsqueda indefinida de lesión oculta."</w:t>
+        <w:t xml:space="preserve"> "Dolor torácico de perfil isquémico con ECG no diagnóstico: se maneja como SCA probable por asimetría de consecuencias mientras la seriación confirma o degrada la hipótesis."</w:t>
+      </w:r>
+    </w:p>
+    <w:p>
+      <w:pPr>
+        <w:pStyle w:val="BodyJ"/>
+      </w:pPr>
+      <w:r>
+        <w:rPr>
+          <w:i/>
+          <w:iCs/>
+        </w:rPr>
+        <w:t xml:space="preserve">Lectura metacognitiva.</w:t>
+      </w:r>
+      <w:r>
+        <w:t xml:space="preserve"> La decisión correcta a las 3:10 no fue diagnóstica sino estratégica: comprar tiempo de vigilancia con intervenciones de bajo riesgo. El error clásico en este escenario no es intelectual, es logístico: la hipótesis correcta ("probable SCA") sin sistema de reevaluación (¿quién repite el ECG si la sala explota?). El criterio de reapertura con responsable es la mitad de la decisión.</w:t>
       </w:r>
     </w:p>
     <w:p>
@@ -11575,15 +11516,15 @@
           <w:sz w:val="25"/>
           <w:szCs w:val="25"/>
         </w:rPr>
-        <w:t xml:space="preserve">Viñeta 4. Infiltrados pulmonares y causalidad múltiple</w:t>
-      </w:r>
-    </w:p>
-    <w:p>
-      <w:pPr>
-        <w:pStyle w:val="BodyJ"/>
-      </w:pPr>
-      <w:r>
-        <w:t xml:space="preserve">Una persona mayor presenta insuficiencia respiratoria con infiltrados multifocales, derrame pequeño y signología obstructiva. Existe posibilidad de infección, congestión, aspiración y reacción inflamatoria farmacológica. Mejora con soporte, antibióticos, broncodilatación y ajuste terapéutico.</w:t>
+        <w:t xml:space="preserve">Viñeta 4. La consulta ambulatoria y el chequeo reciente</w:t>
+      </w:r>
+    </w:p>
+    <w:p>
+      <w:pPr>
+        <w:pStyle w:val="BodyJ"/>
+      </w:pPr>
+      <w:r>
+        <w:t xml:space="preserve">Atención primaria. Mujer de 47 años consulta por fatiga de tres meses. Trae exámenes "normales de hace poco": hemograma y perfil realizados cinco meses atrás, cuando la fatiga no existía. Refiere además sudoración nocturna ocasional que atribuye a "premenopausia" y ha perdido "dos o tres kilos, por comer menos". Agenda llena, doce minutos por paciente.</w:t>
       </w:r>
     </w:p>
     <w:p>
@@ -11598,7 +11539,7 @@
         <w:t xml:space="preserve">Hechos:</w:t>
       </w:r>
       <w:r>
-        <w:t xml:space="preserve"> insuficiencia respiratoria; hallazgos radiológicos mixtos; marcadores inflamatorios; respuesta bajo intervenciones simultáneas.</w:t>
+        <w:t xml:space="preserve"> fatiga nueva de tres meses (relato consistente); exámenes normales previos al síntoma (dato real, pero anterior al problema); sudoración y baja de peso referidas con explicación alternativa plausible; examen físico de hoy sin adenopatías palpables ni visceromegalia (búsqueda dirigida, limitada por tiempo).</w:t>
       </w:r>
     </w:p>
     <w:p>
@@ -11613,7 +11554,7 @@
         <w:t xml:space="preserve">Inferencia:</w:t>
       </w:r>
       <w:r>
-        <w:t xml:space="preserve"> neumopatía multifactorial es una representación más fiel que atribuir todo a una causa. La mejoría no permite identificar qué intervención fue específica.</w:t>
+        <w:t xml:space="preserve"> la mayoría de las fatigas en este contexto son benignas o funcionales: probable. Pero el conjunto fatiga + sudoración + baja de peso configura una tríada que no debe cerrarse contra exámenes previos al síntoma: los "normales de hace poco" no cubren el período de la enfermedad actual.</w:t>
       </w:r>
     </w:p>
     <w:p>
@@ -11628,7 +11569,7 @@
         <w:t xml:space="preserve">Incertidumbre:</w:t>
       </w:r>
       <w:r>
-        <w:t xml:space="preserve"> peso relativo de infección, inflamación y congestión; causalidad farmacológica; riesgo de recurrencia.</w:t>
+        <w:t xml:space="preserve"> la peligrosa no es "¿qué causa la fatiga?" sino "¿hay un proceso sistémico en curso que estos doce minutos no pueden excluir?". Reducible con laboratorio actual dirigido y un control programado, no con más preguntas hoy.</w:t>
       </w:r>
     </w:p>
     <w:p>
@@ -11643,7 +11584,7 @@
         <w:t xml:space="preserve">Decisión:</w:t>
       </w:r>
       <w:r>
-        <w:t xml:space="preserve"> completar una duración antibiótica proporcionada si la probabilidad inicial lo justifica, retirar la exposición sospechosa cuando el balance favorece hacerlo y documentar que la causalidad no está demostrada. El seguimiento debe buscar recurrencia tras reexposición y evolución radiológica.</w:t>
+        <w:t xml:space="preserve"> laboratorio actualizado (hemograma, VHS/PCR, TSH, glicemia, perfil hepático), control con resultados en dos semanas con la misma profesional, y safety-netting explícito por escrito: reconsultar antes si fiebre, adenopatías, dolor óseo o baja de peso mayor. No se tranquiliza con los exámenes viejos ni se alarma sin datos: se convierte el tiempo en prueba diagnóstica con red de seguridad.</w:t>
       </w:r>
     </w:p>
     <w:p>
@@ -11658,7 +11599,22 @@
         <w:t xml:space="preserve">Frase medular:</w:t>
       </w:r>
       <w:r>
-        <w:t xml:space="preserve"> "Insuficiencia respiratoria por neumopatía multifocal probablemente mixta, con componentes infeccioso-inflamatorio y posible contribución farmacológica; evolución favorable bajo medidas concomitantes, sin posibilidad de atribución causal única."</w:t>
+        <w:t xml:space="preserve"> "Fatiga de tres meses con sudoración y baja de peso leves; exámenes normales previos al inicio del cuadro no excluyen proceso actual: se actualiza estudio y se programa control con criterios explícitos de reconsulta."</w:t>
+      </w:r>
+    </w:p>
+    <w:p>
+      <w:pPr>
+        <w:pStyle w:val="BodyJ"/>
+      </w:pPr>
+      <w:r>
+        <w:rPr>
+          <w:i/>
+          <w:iCs/>
+        </w:rPr>
+        <w:t xml:space="preserve">Lectura metacognitiva.</w:t>
+      </w:r>
+      <w:r>
+        <w:t xml:space="preserve"> El riesgo ambulatorio típico es el cierre por evidencia caducada: "tiene exámenes normales" es un hecho cuya fecha lo vuelve casi irrelevante. La herramienta central de la atención primaria —el tiempo longitudinal— sólo funciona como prueba si tiene control programado y red de seguridad; sin ellos, es una espera que confía en la suerte.</w:t>
       </w:r>
     </w:p>
     <w:p>
@@ -11675,75 +11631,75 @@
           <w:sz w:val="25"/>
           <w:szCs w:val="25"/>
         </w:rPr>
-        <w:t xml:space="preserve">Viñeta 5. Tres de la mañana: decidir con el reloj en contra</w:t>
-      </w:r>
-    </w:p>
-    <w:p>
-      <w:pPr>
-        <w:pStyle w:val="BodyJ"/>
-      </w:pPr>
-      <w:r>
-        <w:t xml:space="preserve">Urgencias, 3:10. Hombre de 54 años, dolor torácico opresivo de 40 minutos, sudoroso, con antecedente de tabaquismo. Electrocardiograma: alteraciones inespecíficas de la repolarización. Primera troponina: pendiente. Hay otros nueve pacientes esperando y una sola reanimación disponible. No hay tiempo para la plantilla completa; hay tiempo para los sesenta segundos.</w:t>
-      </w:r>
-    </w:p>
-    <w:p>
-      <w:pPr>
-        <w:pStyle w:val="BodyJ"/>
-      </w:pPr>
-      <w:r>
-        <w:rPr>
-          <w:i/>
-          <w:iCs/>
-        </w:rPr>
-        <w:t xml:space="preserve">¿Qué vi y qué me contaron?</w:t>
-      </w:r>
-      <w:r>
-        <w:t xml:space="preserve"> Dolor opresivo con descarga adrenérgica, observado; ECG no diagnóstico pero anormal, medido ahora.</w:t>
-      </w:r>
-    </w:p>
-    <w:p>
-      <w:pPr>
-        <w:pStyle w:val="BodyJ"/>
-      </w:pPr>
-      <w:r>
-        <w:rPr>
-          <w:i/>
-          <w:iCs/>
-        </w:rPr>
-        <w:t xml:space="preserve">¿Qué creo y cuánto derecho tengo?</w:t>
-      </w:r>
-      <w:r>
-        <w:t xml:space="preserve"> Síndrome coronario agudo: posible-probable; el patrón clínico pesa más que el ECG inespecífico. No demostrado.</w:t>
-      </w:r>
-    </w:p>
-    <w:p>
-      <w:pPr>
-        <w:pStyle w:val="BodyJ"/>
-      </w:pPr>
-      <w:r>
-        <w:rPr>
-          <w:i/>
-          <w:iCs/>
-        </w:rPr>
-        <w:t xml:space="preserve">¿Qué daño importante podría producir si estoy equivocado?</w:t>
-      </w:r>
-      <w:r>
-        <w:t xml:space="preserve"> Tratarlo como "dolor inespecífico, espera troponina en sala" y que sea una oclusión en evolución. La incertidumbre peligrosa no es la etiqueta; es el tiempo.</w:t>
-      </w:r>
-    </w:p>
-    <w:p>
-      <w:pPr>
-        <w:pStyle w:val="BodyJ"/>
-      </w:pPr>
-      <w:r>
-        <w:rPr>
-          <w:i/>
-          <w:iCs/>
-        </w:rPr>
-        <w:t xml:space="preserve">¿Qué hago y qué me haría cambiar?</w:t>
-      </w:r>
-      <w:r>
-        <w:t xml:space="preserve"> Monitor, acceso, antiagregación según protocolo, ECG seriado en 15 minutos, troponina acelerada; escala a activación de hemodinamia si nuevo ECG cambia o el dolor persiste. Queda escrito: "SCA no demostrado; conducta por umbral dada gravedad del error de omisión".</w:t>
+        <w:t xml:space="preserve">Viñeta 5. Pronóstico incierto al final de la vida</w:t>
+      </w:r>
+    </w:p>
+    <w:p>
+      <w:pPr>
+        <w:pStyle w:val="BodyJ"/>
+      </w:pPr>
+      <w:r>
+        <w:t xml:space="preserve">Hombre de 78 años con cáncer de páncreas metastásico, en tercera línea de tratamiento, ingresa por deterioro funcional rápido y una neumonía. La familia pregunta cuánto tiempo queda; una hija pide "que se haga todo"; el equipo de oncología sugiere que "podría haber una ventana para otra línea". El paciente, lúcido a ratos, dice que está cansado.</w:t>
+      </w:r>
+    </w:p>
+    <w:p>
+      <w:pPr>
+        <w:pStyle w:val="BodyJ"/>
+      </w:pPr>
+      <w:r>
+        <w:rPr>
+          <w:i/>
+          <w:iCs/>
+        </w:rPr>
+        <w:t xml:space="preserve">Hechos:</w:t>
+      </w:r>
+      <w:r>
+        <w:t xml:space="preserve"> enfermedad oncológica avanzada en progresión bajo tratamiento (documentado); deterioro funcional acelerado en semanas (trayectoria observada por la familia y objetivable); infección aguda potencialmente reversible; voluntad expresada por el paciente en momentos de lucidez, consistente en dos conversaciones separadas.</w:t>
+      </w:r>
+    </w:p>
+    <w:p>
+      <w:pPr>
+        <w:pStyle w:val="BodyJ"/>
+      </w:pPr>
+      <w:r>
+        <w:rPr>
+          <w:i/>
+          <w:iCs/>
+        </w:rPr>
+        <w:t xml:space="preserve">Inferencia:</w:t>
+      </w:r>
+      <w:r>
+        <w:t xml:space="preserve"> la neumonía es tratable; la trayectoria de fondo es de final de vida próximo. Pronóstico en semanas a pocos meses: probable, con imprecisión irreductible en el caso individual. "Podría responder a otra línea" es una posibilidad no cuantificada, no una expectativa fundada en la evolución observada.</w:t>
+      </w:r>
+    </w:p>
+    <w:p>
+      <w:pPr>
+        <w:pStyle w:val="BodyJ"/>
+      </w:pPr>
+      <w:r>
+        <w:rPr>
+          <w:i/>
+          <w:iCs/>
+        </w:rPr>
+        <w:t xml:space="preserve">Incertidumbre:</w:t>
+      </w:r>
+      <w:r>
+        <w:t xml:space="preserve"> el plazo exacto es incognoscible; lo comunicable es la dirección de la trayectoria y los escenarios. La incertidumbre que domina no es pronóstica sino de metas: ¿qué quiere este hombre para el tiempo que queda? Esa no se resuelve con exámenes sino con conversación.</w:t>
+      </w:r>
+    </w:p>
+    <w:p>
+      <w:pPr>
+        <w:pStyle w:val="BodyJ"/>
+      </w:pPr>
+      <w:r>
+        <w:rPr>
+          <w:i/>
+          <w:iCs/>
+        </w:rPr>
+        <w:t xml:space="preserve">Decisión:</w:t>
+      </w:r>
+      <w:r>
+        <w:t xml:space="preserve"> tratar la neumonía con objetivo de confort y posible retorno a casa (intervención reversible, proporcionada); pausar la discusión de nueva línea hasta ver respuesta funcional; conversación estructurada de metas con paciente y familia: qué sabemos (la enfermedad progresa), qué creemos (el tiempo se mide probablemente en semanas a meses), qué no sabemos (el plazo exacto; si esta infección marcará un descenso definitivo), qué proponemos (priorizar lo que él declaró importante). Criterio de reevaluación: respuesta funcional a 72 horas.</w:t>
       </w:r>
     </w:p>
     <w:p>
@@ -11758,7 +11714,7 @@
         <w:t xml:space="preserve">Frase medular:</w:t>
       </w:r>
       <w:r>
-        <w:t xml:space="preserve"> "Dolor torácico de perfil isquémico con ECG no diagnóstico: se maneja como SCA probable por asimetría de consecuencias mientras la seriación confirma o degrada la hipótesis."</w:t>
+        <w:t xml:space="preserve"> "Neumonía potencialmente reversible sobre cáncer avanzado en progresión con deterioro funcional acelerado: se trata la parte reversible con metas de confort, se comunica la trayectoria sin fingir precisión de plazo, y las decisiones mayores se subordinan a las metas del paciente, no a la disponibilidad de otra línea."</w:t>
       </w:r>
     </w:p>
     <w:p>
@@ -11773,7 +11729,7 @@
         <w:t xml:space="preserve">Lectura metacognitiva.</w:t>
       </w:r>
       <w:r>
-        <w:t xml:space="preserve"> La decisión correcta a las 3:10 no fue diagnóstica sino estratégica: comprar tiempo de vigilancia con intervenciones de bajo riesgo. El error clásico en este escenario no es intelectual, es logístico: la hipótesis correcta ("probable SCA") sin sistema de reevaluación (¿quién repite el ECG si la sala explota?). El criterio de reapertura con responsable es la mitad de la decisión.</w:t>
+        <w:t xml:space="preserve"> El final de la vida concentra todos los temas del libro: la tentación de responder "¿cuánto queda?" con una cifra falsa (certeza retórica), la de esconderse en "no se puede saber" (abandono), y la confusión entre lo técnicamente posible y lo proporcionado — el juicio de proporcionalidad del capítulo 10, que aquí exige lo que más cuesta: un pronóstico honesto. Comunicar dirección y escenarios en vez de plazos, y anclar la decisión en las metas del enfermo, es la forma que toma aquí la incertidumbre bien gobernada.</w:t>
       </w:r>
     </w:p>
     <w:p>
@@ -11790,90 +11746,130 @@
           <w:sz w:val="25"/>
           <w:szCs w:val="25"/>
         </w:rPr>
-        <w:t xml:space="preserve">Viñeta 6. La consulta ambulatoria y el chequeo reciente</w:t>
-      </w:r>
-    </w:p>
-    <w:p>
-      <w:pPr>
-        <w:pStyle w:val="BodyJ"/>
-      </w:pPr>
-      <w:r>
-        <w:t xml:space="preserve">Atención primaria. Mujer de 47 años consulta por fatiga de tres meses. Trae exámenes "normales de hace poco": hemograma y perfil realizados cinco meses atrás, cuando la fatiga no existía. Refiere además sudoración nocturna ocasional que atribuye a "premenopausia" y ha perdido "dos o tres kilos, por comer menos". Agenda llena, doce minutos por paciente.</w:t>
-      </w:r>
-    </w:p>
-    <w:p>
-      <w:pPr>
-        <w:pStyle w:val="BodyJ"/>
-      </w:pPr>
-      <w:r>
-        <w:rPr>
-          <w:i/>
-          <w:iCs/>
-        </w:rPr>
-        <w:t xml:space="preserve">Hechos:</w:t>
-      </w:r>
-      <w:r>
-        <w:t xml:space="preserve"> fatiga nueva de tres meses (relato consistente); exámenes normales previos al síntoma (dato real, pero anterior al problema); sudoración y baja de peso referidas con explicación alternativa plausible; examen físico de hoy sin adenopatías palpables ni visceromegalia (búsqueda dirigida, limitada por tiempo).</w:t>
-      </w:r>
-    </w:p>
-    <w:p>
-      <w:pPr>
-        <w:pStyle w:val="BodyJ"/>
-      </w:pPr>
-      <w:r>
-        <w:rPr>
-          <w:i/>
-          <w:iCs/>
-        </w:rPr>
-        <w:t xml:space="preserve">Inferencia:</w:t>
-      </w:r>
-      <w:r>
-        <w:t xml:space="preserve"> la mayoría de las fatigas en este contexto son benignas o funcionales: probable. Pero el conjunto fatiga + sudoración + baja de peso configura una tríada que no debe cerrarse contra exámenes previos al síntoma: los "normales de hace poco" no cubren el período de la enfermedad actual.</w:t>
-      </w:r>
-    </w:p>
-    <w:p>
-      <w:pPr>
-        <w:pStyle w:val="BodyJ"/>
-      </w:pPr>
-      <w:r>
-        <w:rPr>
-          <w:i/>
-          <w:iCs/>
-        </w:rPr>
-        <w:t xml:space="preserve">Incertidumbre:</w:t>
-      </w:r>
-      <w:r>
-        <w:t xml:space="preserve"> la peligrosa no es "¿qué causa la fatiga?" sino "¿hay un proceso sistémico en curso que estos doce minutos no pueden excluir?". Reducible con laboratorio actual dirigido y un control programado, no con más preguntas hoy.</w:t>
-      </w:r>
-    </w:p>
-    <w:p>
-      <w:pPr>
-        <w:pStyle w:val="BodyJ"/>
-      </w:pPr>
-      <w:r>
-        <w:rPr>
-          <w:i/>
-          <w:iCs/>
-        </w:rPr>
-        <w:t xml:space="preserve">Decisión:</w:t>
-      </w:r>
-      <w:r>
-        <w:t xml:space="preserve"> laboratorio actualizado (hemograma, VHS/PCR, TSH, glicemia, perfil hepático), control con resultados en dos semanas con la misma profesional, y safety-netting explícito por escrito: reconsultar antes si fiebre, adenopatías, dolor óseo o baja de peso mayor. No se tranquiliza con los exámenes viejos ni se alarma sin datos: se convierte el tiempo en prueba diagnóstica con red de seguridad.</w:t>
-      </w:r>
-    </w:p>
-    <w:p>
-      <w:pPr>
-        <w:pStyle w:val="BodyJ"/>
-      </w:pPr>
-      <w:r>
-        <w:rPr>
-          <w:i/>
-          <w:iCs/>
-        </w:rPr>
-        <w:t xml:space="preserve">Frase medular:</w:t>
-      </w:r>
-      <w:r>
-        <w:t xml:space="preserve"> "Fatiga de tres meses con sudoración y baja de peso leves; exámenes normales previos al inicio del cuadro no excluyen proceso actual: se actualiza estudio y se programa control con criterios explícitos de reconsulta."</w:t>
+        <w:t xml:space="preserve">Viñeta 6. Anatomía de un error consumado</w:t>
+      </w:r>
+    </w:p>
+    <w:p>
+      <w:pPr>
+        <w:pStyle w:val="BodyJ"/>
+      </w:pPr>
+      <w:r>
+        <w:t xml:space="preserve">Esta viñeta analiza un error completo, con la disciplina de los capítulos 7 y 8: sin usar nombres de sesgos y sin dejar que el desenlace conocido juzgue lo que era razonable saber en cada momento.</w:t>
+      </w:r>
+    </w:p>
+    <w:p>
+      <w:pPr>
+        <w:pStyle w:val="BodyJ"/>
+      </w:pPr>
+      <w:r>
+        <w:rPr>
+          <w:i/>
+          <w:iCs/>
+        </w:rPr>
+        <w:t xml:space="preserve">El caso.</w:t>
+      </w:r>
+      <w:r>
+        <w:t xml:space="preserve"> Mujer de 29 años consulta en urgencias a las 23:40 por disnea súbita de dos horas, palpitaciones y "sensación de que me voy a morir". Antecedente de trastorno de pánico en tratamiento; la nota de triage dice "paciente ansiosa, crisis de pánico conocida". Frecuencia cardiaca 118, saturación 94% ambiental, examen "sin hallazgos". Nota médica: "Crisis de pánico en paciente con antecedente. Lorazepam sublingual. Alta con control en salud mental". A las 36 horas reconsulta traída por su pareja tras un síncope en el baño: tromboembolismo pulmonar bilateral con sobrecarga ventricular derecha. Sobrevive tras trombólisis.</w:t>
+      </w:r>
+    </w:p>
+    <w:p>
+      <w:pPr>
+        <w:pStyle w:val="BodyJ"/>
+      </w:pPr>
+      <w:r>
+        <w:rPr>
+          <w:i/>
+          <w:iCs/>
+        </w:rPr>
+        <w:t xml:space="preserve">Reconstrucción por capas.</w:t>
+      </w:r>
+      <w:r>
+        <w:t xml:space="preserve"> </w:t>
+      </w:r>
+      <w:r>
+        <w:rPr>
+          <w:b/>
+          <w:bCs/>
+        </w:rPr>
+        <w:t xml:space="preserve">Hechos disponibles la primera noche:</w:t>
+      </w:r>
+      <w:r>
+        <w:t xml:space="preserve"> disnea súbita (relato, con inicio preciso); taquicardia de 118 al ingreso y de 112 al alta, una hora después de la benzodiacepina (dato medido, registrado y no interpretado); saturación 94% (medida; "normal para una paciente que hiperventila", se dijo en voz alta — pero la hiperventilación sube la saturación, no la baja); uso de anticonceptivos orales combinados y un viaje en bus de nueve horas tres días antes (dos hechos que existían y que nadie preguntó, porque la pregunta que los convoca —"¿qué más podría ser?"— no se formuló); y una etiqueta heredada del triage, "crisis de pánico conocida", que entró a la nota médica con estatus de diagnóstico antes de que el médico viera a la paciente. </w:t>
+      </w:r>
+      <w:r>
+        <w:rPr>
+          <w:b/>
+          <w:bCs/>
+        </w:rPr>
+        <w:t xml:space="preserve">Inferencia de la primera noche:</w:t>
+      </w:r>
+      <w:r>
+        <w:t xml:space="preserve"> "crisis de pánico" — escrita como hecho; fuerza real: posible, apoyada en el antecedente y en la coincidencia de la queja con la etiqueta. </w:t>
+      </w:r>
+      <w:r>
+        <w:rPr>
+          <w:b/>
+          <w:bCs/>
+        </w:rPr>
+        <w:t xml:space="preserve">Incertidumbre nunca escrita:</w:t>
+      </w:r>
+      <w:r>
+        <w:t xml:space="preserve"> ¿qué explica una taquicardia que persiste con la paciente ya tranquila, y una saturación que no corresponde a una crisis de ansiedad? Existe una regla de decisión creada exactamente para este momento —los criterios PERC: ocho condiciones que, si se cumplen todas, permiten no estudiar una embolia en pacientes de baja probabilidad (Kline et al., 2004)—, y la paciente incumplía tres: frecuencia cardiaca, saturación y uso de estrógenos. La regla no falló: no se aplicó, porque nadie creyó que hubiera algo que descartar. </w:t>
+      </w:r>
+      <w:r>
+        <w:rPr>
+          <w:b/>
+          <w:bCs/>
+        </w:rPr>
+        <w:t xml:space="preserve">Decisión de la primera noche:</w:t>
+      </w:r>
+      <w:r>
+        <w:t xml:space="preserve"> ansiolisis y alta; defendible como tratamiento sintomático, indefendible como cierre: ninguna línea de la nota decía qué debía hacer volver a la paciente antes del "control en salud mental".</w:t>
+      </w:r>
+    </w:p>
+    <w:p>
+      <w:pPr>
+        <w:pStyle w:val="BodyJ"/>
+      </w:pPr>
+      <w:r>
+        <w:rPr>
+          <w:i/>
+          <w:iCs/>
+        </w:rPr>
+        <w:t xml:space="preserve">Dónde estuvo la oportunidad.</w:t>
+      </w:r>
+      <w:r>
+        <w:t xml:space="preserve"> En el control de signos previo al alta. Una taquicardia de 112 en una paciente sedada y calmada era la discordancia informativa de la noche: el tratamiento correcto de la hipótesis correcta debía normalizar la frecuencia, no sólo la angustia. La pregunta de pase —"¿qué no explica el pánico?"— tenía ahí su máximo valor y su costo mínimo: dos preguntas de anamnesis, una regla de ocho ítems, quizá un dímero-D. A las 36 horas, la pregunta la respondió el síncope.</w:t>
+      </w:r>
+    </w:p>
+    <w:p>
+      <w:pPr>
+        <w:pStyle w:val="BodyJ"/>
+      </w:pPr>
+      <w:r>
+        <w:rPr>
+          <w:i/>
+          <w:iCs/>
+        </w:rPr>
+        <w:t xml:space="preserve">Lo que no debe concluirse.</w:t>
+      </w:r>
+      <w:r>
+        <w:t xml:space="preserve"> El desenlace no demuestra que toda disnea en una paciente con trastorno de pánico sea una embolia, ni que el médico fuera incompetente: con la información de la primera noche, la crisis de pánico era la explicación más frecuente. Lo indefendible era la arquitectura: una etiqueta de triage convertida en diagnóstico antes del examen, un dato medido —la taquicardia persistente— registrado sin que nadie le pidiera explicación, dos preguntas de anamnesis que la etiqueta volvió innecesarias y un alta sin condición de reapertura. El mismo proceso con desenlace benigno —una crisis de pánico real— habría dejado la misma vulnerabilidad instalada para la siguiente paciente a la que se le cree menos por su diagnóstico.</w:t>
+      </w:r>
+    </w:p>
+    <w:p>
+      <w:pPr>
+        <w:pStyle w:val="BodyJ"/>
+      </w:pPr>
+      <w:r>
+        <w:rPr>
+          <w:i/>
+          <w:iCs/>
+        </w:rPr>
+        <w:t xml:space="preserve">Frase medular (la que faltó la primera noche):</w:t>
+      </w:r>
+      <w:r>
+        <w:t xml:space="preserve"> "Disnea súbita y taquicardia persistente (112 tras ansiolisis) en mujer de 29 años con trastorno de pánico y uso de anticonceptivos orales: crisis de pánico posible, pero la taquicardia y la saturación de 94% no están explicadas; PERC positivo — dímero-D antes de decidir el alta; si se difiere, reconsulta inmediata ante síncope, dolor torácico o disnea en reposo."</w:t>
       </w:r>
     </w:p>
     <w:p>
@@ -11888,7 +11884,7 @@
         <w:t xml:space="preserve">Lectura metacognitiva.</w:t>
       </w:r>
       <w:r>
-        <w:t xml:space="preserve"> El riesgo ambulatorio típico es el cierre por evidencia caducada: "tiene exámenes normales" es un hecho cuya fecha lo vuelve casi irrelevante. La herramienta central de la atención primaria —el tiempo longitudinal— sólo funciona como prueba si tiene control programado y red de seguridad; sin ellos, es una espera que confía en la suerte.</w:t>
+        <w:t xml:space="preserve"> La frase que faltó no requería más conocimiento del que cualquier médico de urgencias ya tiene: requería que el antecedente psiquiátrico no descontara el valor de dos signos medidos. Esta viñeta es el capítulo 14 en su forma más silenciosa —la injusticia testimonial no le dijo a la paciente que no le creía; simplemente dejó de preguntar— y es también el capítulo 10: la regla PERC es un umbral explícito, y los umbrales explícitos sólo protegen a quien recuerda que hay una hipótesis que someterles. La disciplina de escritura habría bastado: separar el hecho (taquicardia persistente no explicada) de la etiqueta (pánico), conservar la incertidumbre y programar la reapertura.</w:t>
       </w:r>
     </w:p>
     <w:p>
@@ -11905,15 +11901,15 @@
           <w:sz w:val="25"/>
           <w:szCs w:val="25"/>
         </w:rPr>
-        <w:t xml:space="preserve">Viñeta 7. Pronóstico incierto al final de la vida</w:t>
-      </w:r>
-    </w:p>
-    <w:p>
-      <w:pPr>
-        <w:pStyle w:val="BodyJ"/>
-      </w:pPr>
-      <w:r>
-        <w:t xml:space="preserve">Hombre de 78 años con cáncer de páncreas metastásico, en tercera línea de tratamiento, ingresa por deterioro funcional rápido y una neumonía. La familia pregunta cuánto tiempo queda; una hija pide "que se haga todo"; el equipo de oncología sugiere que "podría haber una ventana para otra línea". El paciente, lúcido a ratos, dice que está cansado.</w:t>
+        <w:t xml:space="preserve">Viñeta 7. "Lo veo raro": el testimonio de la madre</w:t>
+      </w:r>
+    </w:p>
+    <w:p>
+      <w:pPr>
+        <w:pStyle w:val="BodyJ"/>
+      </w:pPr>
+      <w:r>
+        <w:t xml:space="preserve">Un lactante de cinco meses llega a urgencias a las 22:30. Afebril tras paracetamol en casa, signos vitales dentro de rangos para la edad, examen segmentario sin foco. La madre insiste: "No es él. No se ríe, no me busca, está como apagado". La sala está llena y el registro de triage dice "lactante febril en buenas condiciones generales".</w:t>
       </w:r>
     </w:p>
     <w:p>
@@ -11928,7 +11924,7 @@
         <w:t xml:space="preserve">Hechos:</w:t>
       </w:r>
       <w:r>
-        <w:t xml:space="preserve"> enfermedad oncológica avanzada en progresión bajo tratamiento (documentado); deterioro funcional acelerado en semanas (trayectoria observada por la familia y objetivable); infección aguda potencialmente reversible; voluntad expresada por el paciente en momentos de lucidez, consistente en dos conversaciones separadas.</w:t>
+        <w:t xml:space="preserve"> temperatura normalizada bajo antipirético (dato medido, pero bajo intervención); examen sin foco en una evaluación puntual; y un relato de tercero que describe un cambio conductual respecto del basal — información longitudinal a la que ningún examen de veinte minutos accede.</w:t>
       </w:r>
     </w:p>
     <w:p>
@@ -11943,7 +11939,7 @@
         <w:t xml:space="preserve">Inferencia:</w:t>
       </w:r>
       <w:r>
-        <w:t xml:space="preserve"> la neumonía es tratable; la trayectoria de fondo es de final de vida próximo. Pronóstico en semanas a pocos meses: probable, con imprecisión irreductible en el caso individual. "Podría responder a otra línea" es una posibilidad no cuantificada, no una expectativa fundada en la evolución observada.</w:t>
+        <w:t xml:space="preserve"> cuadro viral banal es lo más probable por prevalencia. Pero la preocupación parental por "no ser él mismo" no es ruido afectivo: es una observación experta sobre el único basal disponible, y la evidencia le da rango de señal — en series de atención primaria, la intuición del clínico de que "algo anda mal", frecuentemente gatillada por la inquietud de los padres, tuvo mayor valor diagnóstico que la mayoría de los signos aislados para detectar infección grave (Van den Bruel et al., 2012).</w:t>
       </w:r>
     </w:p>
     <w:p>
@@ -11958,7 +11954,7 @@
         <w:t xml:space="preserve">Incertidumbre:</w:t>
       </w:r>
       <w:r>
-        <w:t xml:space="preserve"> el plazo exacto es incognoscible; lo comunicable es la dirección de la trayectoria y los escenarios. La incertidumbre que domina no es pronóstica sino de metas: ¿qué quiere este hombre para el tiempo que queda? Esa no se resuelve con exámenes sino con conversación.</w:t>
+        <w:t xml:space="preserve"> la peligrosa es una sola: infección bacteriana grave en fase temprana, cuando el examen todavía no la muestra. Reducible sólo parcialmente con laboratorio; la evolución de las próximas horas es la mejor prueba disponible.</w:t>
       </w:r>
     </w:p>
     <w:p>
@@ -11973,7 +11969,7 @@
         <w:t xml:space="preserve">Decisión:</w:t>
       </w:r>
       <w:r>
-        <w:t xml:space="preserve"> tratar la neumonía con objetivo de confort y posible retorno a casa (intervención reversible, proporcionada); pausar la discusión de nueva línea hasta ver respuesta funcional; conversación estructurada de metas con paciente y familia: qué sabemos (la enfermedad progresa), qué creemos (el tiempo se mide probablemente en semanas a meses), qué no sabemos (el plazo exacto; si esta infección marcará un descenso definitivo), qué proponemos (priorizar lo que él declaró importante). Criterio de reevaluación: respuesta funcional a 72 horas.</w:t>
+        <w:t xml:space="preserve"> el dato que gobierna la conducta no es la temperatura sino el cambio de comportamiento reportado. Observación prolongada en urgencias con reevaluación seriada del estado general, umbral bajo para laboratorio, y —si se decide alta— red de seguridad explícita y verificada con la madre: qué mirar, cuándo volver, por qué vía. "Se va tranquila" no es un criterio de alta; "sabe exactamente qué la haría volver" sí.</w:t>
       </w:r>
     </w:p>
     <w:p>
@@ -11988,7 +11984,7 @@
         <w:t xml:space="preserve">Frase medular:</w:t>
       </w:r>
       <w:r>
-        <w:t xml:space="preserve"> "Neumonía potencialmente reversible sobre cáncer avanzado en progresión con deterioro funcional acelerado: se trata la parte reversible con metas de confort, se comunica la trayectoria sin fingir precisión de plazo, y las decisiones mayores se subordinan a las metas del paciente, no a la disponibilidad de otra línea."</w:t>
+        <w:t xml:space="preserve"> "Lactante afebril bajo antipiréticos y sin foco al examen, con cambio conductual significativo según su madre; el testimonio del cuidador se registra como observación del basal y gobierna la vigilancia: reevaluación seriada antes de decidir alta, con red de seguridad verificada."</w:t>
       </w:r>
     </w:p>
     <w:p>
@@ -12003,7 +11999,7 @@
         <w:t xml:space="preserve">Lectura metacognitiva.</w:t>
       </w:r>
       <w:r>
-        <w:t xml:space="preserve"> El final de la vida concentra todos los temas del libro: la tentación de responder "¿cuánto queda?" con una cifra falsa (certeza retórica), la de esconderse en "no se puede saber" (abandono), y la confusión entre lo técnicamente posible y lo proporcionado — el juicio de proporcionalidad del capítulo 10, que aquí exige lo que más cuesta: un pronóstico honesto. Comunicar dirección y escenarios en vez de plazos, y anclar la decisión en las metas del enfermo, es la forma que toma aquí la incertidumbre bien gobernada.</w:t>
+        <w:t xml:space="preserve"> La pediatría radicaliza el capítulo 1: el paciente no habla, y el "hecho" más valioso es un testimonio de tercero sobre un basal que el equipo no conoce. Descartar la preocupación materna como ansiedad es el equivalente pediátrico de la injusticia testimonial del capítulo 14 — y además, simplemente, mala medicina: pocas fuentes de información tienen mejor razón señal-ruido que quien mira a ese niño todos los días.</w:t>
       </w:r>
     </w:p>
     <w:p>
@@ -12020,130 +12016,90 @@
           <w:sz w:val="25"/>
           <w:szCs w:val="25"/>
         </w:rPr>
-        <w:t xml:space="preserve">Viñeta 8. Anatomía de un error consumado</w:t>
-      </w:r>
-    </w:p>
-    <w:p>
-      <w:pPr>
-        <w:pStyle w:val="BodyJ"/>
-      </w:pPr>
-      <w:r>
-        <w:t xml:space="preserve">Esta viñeta analiza un error completo, con la disciplina de los capítulos 7 y 8: sin usar nombres de sesgos y sin dejar que el desenlace conocido juzgue lo que era razonable saber en cada momento.</w:t>
-      </w:r>
-    </w:p>
-    <w:p>
-      <w:pPr>
-        <w:pStyle w:val="BodyJ"/>
-      </w:pPr>
-      <w:r>
-        <w:rPr>
-          <w:i/>
-          <w:iCs/>
-        </w:rPr>
-        <w:t xml:space="preserve">El caso.</w:t>
-      </w:r>
-      <w:r>
-        <w:t xml:space="preserve"> Mujer de 29 años consulta en urgencias a las 23:40 por disnea súbita de dos horas, palpitaciones y "sensación de que me voy a morir". Antecedente de trastorno de pánico en tratamiento; la nota de triage dice "paciente ansiosa, crisis de pánico conocida". Frecuencia cardiaca 118, saturación 94% ambiental, examen "sin hallazgos". Nota médica: "Crisis de pánico en paciente con antecedente. Lorazepam sublingual. Alta con control en salud mental". A las 36 horas reconsulta traída por su pareja tras un síncope en el baño: tromboembolismo pulmonar bilateral con sobrecarga ventricular derecha. Sobrevive tras trombólisis.</w:t>
-      </w:r>
-    </w:p>
-    <w:p>
-      <w:pPr>
-        <w:pStyle w:val="BodyJ"/>
-      </w:pPr>
-      <w:r>
-        <w:rPr>
-          <w:i/>
-          <w:iCs/>
-        </w:rPr>
-        <w:t xml:space="preserve">Reconstrucción por capas.</w:t>
-      </w:r>
-      <w:r>
-        <w:t xml:space="preserve"> </w:t>
-      </w:r>
-      <w:r>
-        <w:rPr>
-          <w:b/>
-          <w:bCs/>
-        </w:rPr>
-        <w:t xml:space="preserve">Hechos disponibles la primera noche:</w:t>
-      </w:r>
-      <w:r>
-        <w:t xml:space="preserve"> disnea súbita (relato, con inicio preciso); taquicardia de 118 al ingreso y de 112 al alta, una hora después de la benzodiacepina (dato medido, registrado y no interpretado); saturación 94% (medida; "normal para una paciente que hiperventila", se dijo en voz alta — pero la hiperventilación sube la saturación, no la baja); uso de anticonceptivos orales combinados y un viaje en bus de nueve horas tres días antes (dos hechos que existían y que nadie preguntó, porque la pregunta que los convoca —"¿qué más podría ser?"— no se formuló); y una etiqueta heredada del triage, "crisis de pánico conocida", que entró a la nota médica con estatus de diagnóstico antes de que el médico viera a la paciente. </w:t>
-      </w:r>
-      <w:r>
-        <w:rPr>
-          <w:b/>
-          <w:bCs/>
-        </w:rPr>
-        <w:t xml:space="preserve">Inferencia de la primera noche:</w:t>
-      </w:r>
-      <w:r>
-        <w:t xml:space="preserve"> "crisis de pánico" — escrita como hecho; fuerza real: posible, apoyada en el antecedente y en la coincidencia de la queja con la etiqueta. </w:t>
-      </w:r>
-      <w:r>
-        <w:rPr>
-          <w:b/>
-          <w:bCs/>
-        </w:rPr>
-        <w:t xml:space="preserve">Incertidumbre nunca escrita:</w:t>
-      </w:r>
-      <w:r>
-        <w:t xml:space="preserve"> ¿qué explica una taquicardia que persiste con la paciente ya tranquila, y una saturación que no corresponde a una crisis de ansiedad? Existe una regla de decisión creada exactamente para este momento —los criterios PERC: ocho condiciones que, si se cumplen todas, permiten no estudiar una embolia en pacientes de baja probabilidad (Kline et al., 2004)—, y la paciente incumplía tres: frecuencia cardiaca, saturación y uso de estrógenos. La regla no falló: no se aplicó, porque nadie creyó que hubiera algo que descartar. </w:t>
-      </w:r>
-      <w:r>
-        <w:rPr>
-          <w:b/>
-          <w:bCs/>
-        </w:rPr>
-        <w:t xml:space="preserve">Decisión de la primera noche:</w:t>
-      </w:r>
-      <w:r>
-        <w:t xml:space="preserve"> ansiolisis y alta; defendible como tratamiento sintomático, indefendible como cierre: ninguna línea de la nota decía qué debía hacer volver a la paciente antes del "control en salud mental".</w:t>
-      </w:r>
-    </w:p>
-    <w:p>
-      <w:pPr>
-        <w:pStyle w:val="BodyJ"/>
-      </w:pPr>
-      <w:r>
-        <w:rPr>
-          <w:i/>
-          <w:iCs/>
-        </w:rPr>
-        <w:t xml:space="preserve">Dónde estuvo la oportunidad.</w:t>
-      </w:r>
-      <w:r>
-        <w:t xml:space="preserve"> En el control de signos previo al alta. Una taquicardia de 112 en una paciente sedada y calmada era la discordancia informativa de la noche: el tratamiento correcto de la hipótesis correcta debía normalizar la frecuencia, no sólo la angustia. La pregunta de pase —"¿qué no explica el pánico?"— tenía ahí su máximo valor y su costo mínimo: dos preguntas de anamnesis, una regla de ocho ítems, quizá un dímero-D. A las 36 horas, la pregunta la respondió el síncope.</w:t>
-      </w:r>
-    </w:p>
-    <w:p>
-      <w:pPr>
-        <w:pStyle w:val="BodyJ"/>
-      </w:pPr>
-      <w:r>
-        <w:rPr>
-          <w:i/>
-          <w:iCs/>
-        </w:rPr>
-        <w:t xml:space="preserve">Lo que no debe concluirse.</w:t>
-      </w:r>
-      <w:r>
-        <w:t xml:space="preserve"> El desenlace no demuestra que toda disnea en una paciente con trastorno de pánico sea una embolia, ni que el médico fuera incompetente: con la información de la primera noche, la crisis de pánico era la explicación más frecuente. Lo indefendible era la arquitectura: una etiqueta de triage convertida en diagnóstico antes del examen, un dato medido —la taquicardia persistente— registrado sin que nadie le pidiera explicación, dos preguntas de anamnesis que la etiqueta volvió innecesarias y un alta sin condición de reapertura. El mismo proceso con desenlace benigno —una crisis de pánico real— habría dejado la misma vulnerabilidad instalada para la siguiente paciente a la que se le cree menos por su diagnóstico.</w:t>
-      </w:r>
-    </w:p>
-    <w:p>
-      <w:pPr>
-        <w:pStyle w:val="BodyJ"/>
-      </w:pPr>
-      <w:r>
-        <w:rPr>
-          <w:i/>
-          <w:iCs/>
-        </w:rPr>
-        <w:t xml:space="preserve">Frase medular (la que faltó la primera noche):</w:t>
-      </w:r>
-      <w:r>
-        <w:t xml:space="preserve"> "Disnea súbita y taquicardia persistente (112 tras ansiolisis) en mujer de 29 años con trastorno de pánico y uso de anticonceptivos orales: crisis de pánico posible, pero la taquicardia y la saturación de 94% no están explicadas; PERC positivo — dímero-D antes de decidir el alta; si se difiere, reconsulta inmediata ante síncope, dolor torácico o disnea en reposo."</w:t>
+        <w:t xml:space="preserve">Viñeta 8. El dolor abdominal de la paciente que "somatiza"</w:t>
+      </w:r>
+    </w:p>
+    <w:p>
+      <w:pPr>
+        <w:pStyle w:val="BodyJ"/>
+      </w:pPr>
+      <w:r>
+        <w:t xml:space="preserve">Una mujer de 34 años con esquizofrenia en tratamiento consulta por dolor abdominal de dos días. En el box, habla poco y evita la mirada; la nota de derivación dice "consultas frecuentes, quejas somáticas múltiples". Taquicardia de 110, abdomen difícil de evaluar — la paciente tolera mal la palpación y su tratamiento antipsicótico puede atenuar la expresión del dolor y enlentecer el tránsito.</w:t>
+      </w:r>
+    </w:p>
+    <w:p>
+      <w:pPr>
+        <w:pStyle w:val="BodyJ"/>
+      </w:pPr>
+      <w:r>
+        <w:rPr>
+          <w:i/>
+          <w:iCs/>
+        </w:rPr>
+        <w:t xml:space="preserve">Hechos:</w:t>
+      </w:r>
+      <w:r>
+        <w:t xml:space="preserve"> taquicardia sostenida (medida, reproducible); dos días de dolor según relato coherente en sus términos; examen abdominal técnicamente limitado —no negativo: limitado—; antecedente psiquiátrico que modifica la expresión clínica y farmacológica del cuadro; una etiqueta heredada ("somatiza") sin procedencia verificable.</w:t>
+      </w:r>
+    </w:p>
+    <w:p>
+      <w:pPr>
+        <w:pStyle w:val="BodyJ"/>
+      </w:pPr>
+      <w:r>
+        <w:rPr>
+          <w:i/>
+          <w:iCs/>
+        </w:rPr>
+        <w:t xml:space="preserve">Inferencia:</w:t>
+      </w:r>
+      <w:r>
+        <w:t xml:space="preserve"> la explicación "queja somática en contexto de patología psiquiátrica" es posible, pero está recibiendo un peso que no proviene de los datos de hoy sino del estigma: nada en la taquicardia es psiquiátrico. El fenómeno tiene nombre —ensombrecimiento diagnóstico: atribuir los síntomas físicos a la enfermedad mental— y consecuencias medibles: las personas con enfermedad mental grave mueren 15 a 20 años antes, en gran parte por enfermedad física subdiagnosticada y subtratada (Thornicroft, 2011).</w:t>
+      </w:r>
+    </w:p>
+    <w:p>
+      <w:pPr>
+        <w:pStyle w:val="BodyJ"/>
+      </w:pPr>
+      <w:r>
+        <w:rPr>
+          <w:i/>
+          <w:iCs/>
+        </w:rPr>
+        <w:t xml:space="preserve">Incertidumbre:</w:t>
+      </w:r>
+      <w:r>
+        <w:t xml:space="preserve"> la peligrosa es un abdomen quirúrgico enmascarado — por el antipsicótico, por la dificultad comunicativa y por la disposición del equipo a cerrar temprano. Es exactamente el caso donde el examen "poco confiable" obliga a más objetividad, no a menos: laboratorio e imagen deciden lo que la palpación no puede.</w:t>
+      </w:r>
+    </w:p>
+    <w:p>
+      <w:pPr>
+        <w:pStyle w:val="BodyJ"/>
+      </w:pPr>
+      <w:r>
+        <w:rPr>
+          <w:i/>
+          <w:iCs/>
+        </w:rPr>
+        <w:t xml:space="preserve">Decisión:</w:t>
+      </w:r>
+      <w:r>
+        <w:t xml:space="preserve"> mismo estándar que para cualquier paciente con dolor abdominal y taquicardia — laboratorio completo, imagen según hallazgos, reevaluación programada— más un estándar adicional: documentar explícitamente que la evaluación fue limitada y por qué, para que el siguiente lector no herede "abdomen negativo" donde hubo "abdomen no evaluable". La etiqueta "somatiza" no entra a la ficha sin procedencia.</w:t>
+      </w:r>
+    </w:p>
+    <w:p>
+      <w:pPr>
+        <w:pStyle w:val="BodyJ"/>
+      </w:pPr>
+      <w:r>
+        <w:rPr>
+          <w:i/>
+          <w:iCs/>
+        </w:rPr>
+        <w:t xml:space="preserve">Frase medular:</w:t>
+      </w:r>
+      <w:r>
+        <w:t xml:space="preserve"> "Dolor abdominal y taquicardia sostenida en paciente con esquizofrenia: examen abdominal limitado —no negativo— y expresión clínica posiblemente atenuada por antipsicóticos; se estudia con el estándar completo, dejando registrado que la atribución psiquiátrica del cuadro exigiría primero excluir lo que la taquicardia sugiere."</w:t>
       </w:r>
     </w:p>
     <w:p>
@@ -12158,7 +12114,7 @@
         <w:t xml:space="preserve">Lectura metacognitiva.</w:t>
       </w:r>
       <w:r>
-        <w:t xml:space="preserve"> La frase que faltó no requería más conocimiento del que cualquier médico de urgencias ya tiene: requería que el antecedente psiquiátrico no descontara el valor de dos signos medidos. Esta viñeta es el capítulo 14 en su forma más silenciosa —la injusticia testimonial no le dijo a la paciente que no le creía; simplemente dejó de preguntar— y es también el capítulo 10: la regla PERC es un umbral explícito, y los umbrales explícitos sólo protegen a quien recuerda que hay una hipótesis que someterles. La disciplina de escritura habría bastado: separar el hecho (taquicardia persistente no explicada) de la etiqueta (pánico), conservar la incertidumbre y programar la reapertura.</w:t>
+        <w:t xml:space="preserve"> Esta viñeta es el capítulo 14 con mortalidad: la injusticia testimonial —descontar el relato por quién lo dice— aquí no es sólo un agravio moral sino un mecanismo causal de la brecha de 15 a 20 años de vida. Nótese el movimiento epistémico central: cuando el testimonio y el examen valen menos de lo habitual, el estándar de estudio objetivo sube en compensación. El ensombrecimiento hace exactamente lo contrario — usa la dificultad como excusa para bajar el estándar — y por eso mata.</w:t>
       </w:r>
     </w:p>
     <w:p>
@@ -12175,105 +12131,53 @@
           <w:sz w:val="25"/>
           <w:szCs w:val="25"/>
         </w:rPr>
-        <w:t xml:space="preserve">Viñeta 9. "Lo veo raro": el testimonio de la madre</w:t>
-      </w:r>
-    </w:p>
-    <w:p>
-      <w:pPr>
-        <w:pStyle w:val="BodyJ"/>
-      </w:pPr>
-      <w:r>
-        <w:t xml:space="preserve">Un lactante de cinco meses llega a urgencias a las 22:30. Afebril tras paracetamol en casa, signos vitales dentro de rangos para la edad, examen segmentario sin foco. La madre insiste: "No es él. No se ríe, no me busca, está como apagado". La sala está llena y el registro de triage dice "lactante febril en buenas condiciones generales".</w:t>
-      </w:r>
-    </w:p>
-    <w:p>
-      <w:pPr>
-        <w:pStyle w:val="BodyJ"/>
-      </w:pPr>
-      <w:r>
-        <w:rPr>
-          <w:i/>
-          <w:iCs/>
-        </w:rPr>
-        <w:t xml:space="preserve">Hechos:</w:t>
-      </w:r>
-      <w:r>
-        <w:t xml:space="preserve"> temperatura normalizada bajo antipirético (dato medido, pero bajo intervención); examen sin foco en una evaluación puntual; y un relato de tercero que describe un cambio conductual respecto del basal — información longitudinal a la que ningún examen de veinte minutos accede.</w:t>
-      </w:r>
-    </w:p>
-    <w:p>
-      <w:pPr>
-        <w:pStyle w:val="BodyJ"/>
-      </w:pPr>
-      <w:r>
-        <w:rPr>
-          <w:i/>
-          <w:iCs/>
-        </w:rPr>
-        <w:t xml:space="preserve">Inferencia:</w:t>
-      </w:r>
-      <w:r>
-        <w:t xml:space="preserve"> cuadro viral banal es lo más probable por prevalencia. Pero la preocupación parental por "no ser él mismo" no es ruido afectivo: es una observación experta sobre el único basal disponible, y la evidencia le da rango de señal — en series de atención primaria, la intuición del clínico de que "algo anda mal", frecuentemente gatillada por la inquietud de los padres, tuvo mayor valor diagnóstico que la mayoría de los signos aislados para detectar infección grave (Van den Bruel et al., 2012).</w:t>
-      </w:r>
-    </w:p>
-    <w:p>
-      <w:pPr>
-        <w:pStyle w:val="BodyJ"/>
-      </w:pPr>
-      <w:r>
-        <w:rPr>
-          <w:i/>
-          <w:iCs/>
-        </w:rPr>
-        <w:t xml:space="preserve">Incertidumbre:</w:t>
-      </w:r>
-      <w:r>
-        <w:t xml:space="preserve"> la peligrosa es una sola: infección bacteriana grave en fase temprana, cuando el examen todavía no la muestra. Reducible sólo parcialmente con laboratorio; la evolución de las próximas horas es la mejor prueba disponible.</w:t>
-      </w:r>
-    </w:p>
-    <w:p>
-      <w:pPr>
-        <w:pStyle w:val="BodyJ"/>
-      </w:pPr>
-      <w:r>
-        <w:rPr>
-          <w:i/>
-          <w:iCs/>
-        </w:rPr>
-        <w:t xml:space="preserve">Decisión:</w:t>
-      </w:r>
-      <w:r>
-        <w:t xml:space="preserve"> el dato que gobierna la conducta no es la temperatura sino el cambio de comportamiento reportado. Observación prolongada en urgencias con reevaluación seriada del estado general, umbral bajo para laboratorio, y —si se decide alta— red de seguridad explícita y verificada con la madre: qué mirar, cuándo volver, por qué vía. "Se va tranquila" no es un criterio de alta; "sabe exactamente qué la haría volver" sí.</w:t>
-      </w:r>
-    </w:p>
-    <w:p>
-      <w:pPr>
-        <w:pStyle w:val="BodyJ"/>
-      </w:pPr>
-      <w:r>
-        <w:rPr>
-          <w:i/>
-          <w:iCs/>
-        </w:rPr>
-        <w:t xml:space="preserve">Frase medular:</w:t>
-      </w:r>
-      <w:r>
-        <w:t xml:space="preserve"> "Lactante afebril bajo antipiréticos y sin foco al examen, con cambio conductual significativo según su madre; el testimonio del cuidador se registra como observación del basal y gobierna la vigilancia: reevaluación seriada antes de decidir alta, con red de seguridad verificada."</w:t>
-      </w:r>
-    </w:p>
-    <w:p>
-      <w:pPr>
-        <w:pStyle w:val="BodyJ"/>
-      </w:pPr>
-      <w:r>
-        <w:rPr>
-          <w:i/>
-          <w:iCs/>
-        </w:rPr>
-        <w:t xml:space="preserve">Lectura metacognitiva.</w:t>
-      </w:r>
-      <w:r>
-        <w:t xml:space="preserve"> La pediatría radicaliza el capítulo 1: el paciente no habla, y el "hecho" más valioso es un testimonio de tercero sobre un basal que el equipo no conoce. Descartar la preocupación materna como ansiedad es el equivalente pediátrico de la injusticia testimonial del capítulo 14 — y además, simplemente, mala medicina: pocas fuentes de información tienen mejor razón señal-ruido que quien mira a ese niño todos los días.</w:t>
+        <w:t xml:space="preserve">Lo común a las ocho viñetas</w:t>
+      </w:r>
+    </w:p>
+    <w:p>
+      <w:pPr>
+        <w:pStyle w:val="BodyJ"/>
+      </w:pPr>
+      <w:r>
+        <w:t xml:space="preserve">En cada caso, la buena formulación evita dos extremos: describir sin interpretar o interpretar como si se hubiera observado directamente. El hecho guía la hipótesis; la incertidumbre modula su fuerza; la consecuencia define la decisión; la evolución conserva el derecho a corregir. Y en todas —de la urgencia de las 3:00 al final de la vida, del lactante que no habla a la paciente a la que no se le cree— la decisión termina con la misma cláusula: qué la haría cambiar, quién lo detectará y cuándo.</w:t>
+      </w:r>
+    </w:p>
+    <w:p>
+      <w:pPr>
+        <w:pStyle w:val="Heading2"/>
+        <w:pageBreakBefore/>
+        <w:spacing w:after="300" w:before="600"/>
+      </w:pPr>
+      <w:r>
+        <w:rPr>
+          <w:rFonts w:ascii="Georgia" w:cs="Georgia" w:eastAsia="Georgia" w:hAnsi="Georgia"/>
+          <w:b/>
+          <w:bCs/>
+          <w:color w:val="8C2F2F"/>
+          <w:sz w:val="22"/>
+          <w:szCs w:val="22"/>
+        </w:rPr>
+        <w:t xml:space="preserve">Capítulo 16</w:t>
+      </w:r>
+      <w:r>
+        <w:rPr>
+          <w:rFonts w:ascii="Georgia" w:cs="Georgia" w:eastAsia="Georgia" w:hAnsi="Georgia"/>
+          <w:b/>
+          <w:bCs/>
+          <w:color w:val="3D5A6C"/>
+          <w:sz w:val="32"/>
+          <w:szCs w:val="32"/>
+        </w:rPr>
+        <w:br/>
+        <w:t xml:space="preserve">Enseñar y organizar la metacognición clínica</w:t>
+      </w:r>
+    </w:p>
+    <w:p>
+      <w:pPr>
+        <w:pStyle w:val="BodyJ"/>
+      </w:pPr>
+      <w:r>
+        <w:t xml:space="preserve">Una jefa de servicio que quiera "instalar metacognición" en su equipo no puede indicarla como se indica un antibiótico. Puede, en cambio, cambiar tres cosas que ve todas las semanas: qué se pregunta en la ronda, qué estructura tiene la ficha y qué pasa después de un error. Este capítulo trata de esas palancas.</w:t>
       </w:r>
     </w:p>
     <w:p>
@@ -12290,105 +12194,23 @@
           <w:sz w:val="25"/>
           <w:szCs w:val="25"/>
         </w:rPr>
-        <w:t xml:space="preserve">Viñeta 10. El dolor abdominal de la paciente que "somatiza"</w:t>
-      </w:r>
-    </w:p>
-    <w:p>
-      <w:pPr>
-        <w:pStyle w:val="BodyJ"/>
-      </w:pPr>
-      <w:r>
-        <w:t xml:space="preserve">Una mujer de 34 años con esquizofrenia en tratamiento consulta por dolor abdominal de dos días. En el box, habla poco y evita la mirada; la nota de derivación dice "consultas frecuentes, quejas somáticas múltiples". Taquicardia de 110, abdomen difícil de evaluar — la paciente tolera mal la palpación y su tratamiento antipsicótico puede atenuar la expresión del dolor y enlentecer el tránsito.</w:t>
-      </w:r>
-    </w:p>
-    <w:p>
-      <w:pPr>
-        <w:pStyle w:val="BodyJ"/>
-      </w:pPr>
-      <w:r>
-        <w:rPr>
-          <w:i/>
-          <w:iCs/>
-        </w:rPr>
-        <w:t xml:space="preserve">Hechos:</w:t>
-      </w:r>
-      <w:r>
-        <w:t xml:space="preserve"> taquicardia sostenida (medida, reproducible); dos días de dolor según relato coherente en sus términos; examen abdominal técnicamente limitado —no negativo: limitado—; antecedente psiquiátrico que modifica la expresión clínica y farmacológica del cuadro; una etiqueta heredada ("somatiza") sin procedencia verificable.</w:t>
-      </w:r>
-    </w:p>
-    <w:p>
-      <w:pPr>
-        <w:pStyle w:val="BodyJ"/>
-      </w:pPr>
-      <w:r>
-        <w:rPr>
-          <w:i/>
-          <w:iCs/>
-        </w:rPr>
-        <w:t xml:space="preserve">Inferencia:</w:t>
-      </w:r>
-      <w:r>
-        <w:t xml:space="preserve"> la explicación "queja somática en contexto de patología psiquiátrica" es posible, pero está recibiendo un peso que no proviene de los datos de hoy sino del estigma: nada en la taquicardia es psiquiátrico. El fenómeno tiene nombre —ensombrecimiento diagnóstico: atribuir los síntomas físicos a la enfermedad mental— y consecuencias medibles: las personas con enfermedad mental grave mueren 15 a 20 años antes, en gran parte por enfermedad física subdiagnosticada y subtratada (Thornicroft, 2011).</w:t>
-      </w:r>
-    </w:p>
-    <w:p>
-      <w:pPr>
-        <w:pStyle w:val="BodyJ"/>
-      </w:pPr>
-      <w:r>
-        <w:rPr>
-          <w:i/>
-          <w:iCs/>
-        </w:rPr>
-        <w:t xml:space="preserve">Incertidumbre:</w:t>
-      </w:r>
-      <w:r>
-        <w:t xml:space="preserve"> la peligrosa es un abdomen quirúrgico enmascarado — por el antipsicótico, por la dificultad comunicativa y por la disposición del equipo a cerrar temprano. Es exactamente el caso donde el examen "poco confiable" obliga a más objetividad, no a menos: laboratorio e imagen deciden lo que la palpación no puede.</w:t>
-      </w:r>
-    </w:p>
-    <w:p>
-      <w:pPr>
-        <w:pStyle w:val="BodyJ"/>
-      </w:pPr>
-      <w:r>
-        <w:rPr>
-          <w:i/>
-          <w:iCs/>
-        </w:rPr>
-        <w:t xml:space="preserve">Decisión:</w:t>
-      </w:r>
-      <w:r>
-        <w:t xml:space="preserve"> mismo estándar que para cualquier paciente con dolor abdominal y taquicardia — laboratorio completo, imagen según hallazgos, reevaluación programada— más un estándar adicional: documentar explícitamente que la evaluación fue limitada y por qué, para que el siguiente lector no herede "abdomen negativo" donde hubo "abdomen no evaluable". La etiqueta "somatiza" no entra a la ficha sin procedencia.</w:t>
-      </w:r>
-    </w:p>
-    <w:p>
-      <w:pPr>
-        <w:pStyle w:val="BodyJ"/>
-      </w:pPr>
-      <w:r>
-        <w:rPr>
-          <w:i/>
-          <w:iCs/>
-        </w:rPr>
-        <w:t xml:space="preserve">Frase medular:</w:t>
-      </w:r>
-      <w:r>
-        <w:t xml:space="preserve"> "Dolor abdominal y taquicardia sostenida en paciente con esquizofrenia: examen abdominal limitado —no negativo— y expresión clínica posiblemente atenuada por antipsicóticos; se estudia con el estándar completo, dejando registrado que la atribución psiquiátrica del cuadro exigiría primero excluir lo que la taquicardia sugiere."</w:t>
-      </w:r>
-    </w:p>
-    <w:p>
-      <w:pPr>
-        <w:pStyle w:val="BodyJ"/>
-      </w:pPr>
-      <w:r>
-        <w:rPr>
-          <w:i/>
-          <w:iCs/>
-        </w:rPr>
-        <w:t xml:space="preserve">Lectura metacognitiva.</w:t>
-      </w:r>
-      <w:r>
-        <w:t xml:space="preserve"> Esta viñeta es el capítulo 14 con mortalidad: la injusticia testimonial —descontar el relato por quién lo dice— aquí no es sólo un agravio moral sino un mecanismo causal de la brecha de 15 a 20 años de vida. Nótese el movimiento epistémico central: cuando el testimonio y el examen valen menos de lo habitual, el estándar de estudio objetivo sube en compensación. El ensombrecimiento hace exactamente lo contrario — usa la dificultad como excusa para bajar el estándar — y por eso mata.</w:t>
+        <w:t xml:space="preserve">De la virtud individual al diseño institucional</w:t>
+      </w:r>
+    </w:p>
+    <w:p>
+      <w:pPr>
+        <w:pStyle w:val="BodyJ"/>
+      </w:pPr>
+      <w:r>
+        <w:t xml:space="preserve">La metacognición suele presentarse como una habilidad personal: el médico debe ser humilde, reflexivo y consciente de sus sesgos. Esa expectativa es insuficiente si el sistema oculta resultados, interrumpe el trabajo, fragmenta información y castiga la duda. La lucidez necesita infraestructura.</w:t>
+      </w:r>
+    </w:p>
+    <w:p>
+      <w:pPr>
+        <w:pStyle w:val="BodyJ"/>
+      </w:pPr>
+      <w:r>
+        <w:t xml:space="preserve">La National Academies recomendó educación diagnóstica, trabajo en equipo, tecnologías que apoyen el proceso y mecanismos de feedback y aprendizaje (National Academies of Sciences, Engineering, and Medicine, 2015). Una institución metacognitiva no sólo registra errores; hace visible cómo se piensa y crea momentos para revisar.</w:t>
       </w:r>
     </w:p>
     <w:p>
@@ -12405,15 +12227,392 @@
           <w:sz w:val="25"/>
           <w:szCs w:val="25"/>
         </w:rPr>
-        <w:t xml:space="preserve">Lo común a las diez viñetas</w:t>
-      </w:r>
-    </w:p>
-    <w:p>
-      <w:pPr>
-        <w:pStyle w:val="BodyJ"/>
-      </w:pPr>
-      <w:r>
-        <w:t xml:space="preserve">En cada caso, la buena formulación evita dos extremos: describir sin interpretar o interpretar como si se hubiera observado directamente. El hecho guía la hipótesis; la incertidumbre modula su fuerza; la consecuencia define la decisión; la evolución conserva el derecho a corregir. Y en todas —de la urgencia de las 3:00 al final de la vida, del lactante que no habla a la paciente a la que no se le cree— la decisión termina con la misma cláusula: qué la haría cambiar, quién lo detectará y cuándo.</w:t>
+        <w:t xml:space="preserve">Enseñar representaciones, no sólo respuestas</w:t>
+      </w:r>
+    </w:p>
+    <w:p>
+      <w:pPr>
+        <w:pStyle w:val="BodyJ"/>
+      </w:pPr>
+      <w:r>
+        <w:t xml:space="preserve">En formación, pedir "el diagnóstico" prematuramente favorece la adivinación. Es más útil solicitar primero una representación del problema y preguntar qué datos fueron transformados en calificadores. Bowen y Eva han destacado la enseñanza explícita del razonamiento, mientras la teoría de illness scripts explica por qué el conocimiento debe organizarse alrededor de condiciones, mecanismos y consecuencias (Eva, 2005; Bowen, 2006).</w:t>
+      </w:r>
+    </w:p>
+    <w:p>
+      <w:pPr>
+        <w:pStyle w:val="BodyJ"/>
+      </w:pPr>
+      <w:r>
+        <w:t xml:space="preserve">El docente puede pedir al aprendiz que marque cada frase como hecho, inferencia o incertidumbre. Luego puede comparar la versión inicial con una formulación experta, no para imponer estilo, sino para mostrar qué relaciones fueron seleccionadas. El feedback debe ser específico: "presentaste la bacteriuria como infección", "omitiste que la imagen sólo excluye complicación actual", "tu plan no indica qué te haría cambiar". La devolución constructiva tiene técnica y tradición docente propia en nuestra lengua: describir conducta observable en lugar de juzgar a la persona, equilibrar lo logrado con lo corregible y terminar en un plan (Alves de Lima, 2008). Y la evaluación debe mirar lo mismo que la enseñanza: premiar el diagnóstico correcto obtenido por un proceso frágil y castigar el incorrecto con incertidumbre bien calibrada enseña a ocultar dudas y a reconstruir narrativas retrospectivas; pedir la confianza antes de conocer la respuesta, y el plan de revisión junto con el diagnóstico, corrige ese incentivo.</w:t>
+      </w:r>
+    </w:p>
+    <w:p>
+      <w:pPr>
+        <w:pStyle w:val="Heading3"/>
+        <w:spacing w:after="120" w:before="280"/>
+      </w:pPr>
+      <w:r>
+        <w:rPr>
+          <w:rFonts w:ascii="Georgia" w:cs="Georgia" w:eastAsia="Georgia" w:hAnsi="Georgia"/>
+          <w:b/>
+          <w:bCs/>
+          <w:color w:val="2B2B2B"/>
+          <w:sz w:val="25"/>
+          <w:szCs w:val="25"/>
+        </w:rPr>
+        <w:t xml:space="preserve">Un debate honesto: ¿se puede enseñar a pensar mejor?</w:t>
+      </w:r>
+    </w:p>
+    <w:p>
+      <w:pPr>
+        <w:pStyle w:val="BodyJ"/>
+      </w:pPr>
+      <w:r>
+        <w:t xml:space="preserve">Este libro toma posición en una controversia real de la educación médica, y conviene declararla. De un lado, Croskerry y su tradición sostienen que conocer los sesgos y entrenar estrategias de debiasing mejora el diagnóstico (Croskerry, 2003; Croskerry et al., 2013a, 2013b). Del otro, Norman, Monteiro y colegas han acumulado evidencia incómoda: la mayoría de los errores diagnósticos se asocia a déficits de conocimiento más que a fallas puras de proceso, los cursos de "pensamiento crítico" generalizable transfieren poco, y obligar a reflexionar sistemáticamente sobre casos fáciles no mejora la precisión y consume tiempo (Norman et al., 2017; Monteiro &amp; Norman, 2013; Monteiro et al., 2020).</w:t>
+      </w:r>
+    </w:p>
+    <w:p>
+      <w:pPr>
+        <w:pStyle w:val="BodyJ"/>
+      </w:pPr>
+      <w:r>
+        <w:t xml:space="preserve">La posición de este libro es intermedia, pero no equidistante. Con los escépticos: no existe una habilidad general de "pensar bien" que flote por encima del conocimiento; la representación rica del problema —illness scripts, experiencia con feedback— es la condición de todo lo demás, y ningún método, HII-D incluido, compensa no saber medicina. Contra el escepticismo total: de esa evidencia no se sigue que la única intervención posible sea enseñar más contenido. Lo que este libro propone no es vigilancia interna permanente ni listas universales —las versiones que la evidencia ha desinflado—, sino artefactos externos y selectivos: un lenguaje que obliga a graduar afirmaciones, una estructura de nota que conserva las capas, pausas activadas por disparadores definidos y circuitos de feedback que conviertan experiencia en calibración. Es una apuesta con compromisos observables (véase el capítulo 15): si estas herramientas no cambian conductas medibles, deben abandonarse como cualquier hipótesis mimada. Entre tanto, la controversia se enseña mejor de lo que se oculta: un residente que conoce el debate sabrá desconfiar por igual del catálogo de sesgos como solución universal y del nihilismo pedagógico como coartada.</w:t>
+      </w:r>
+    </w:p>
+    <w:p>
+      <w:pPr>
+        <w:pStyle w:val="Heading3"/>
+        <w:spacing w:after="120" w:before="280"/>
+      </w:pPr>
+      <w:r>
+        <w:rPr>
+          <w:rFonts w:ascii="Georgia" w:cs="Georgia" w:eastAsia="Georgia" w:hAnsi="Georgia"/>
+          <w:b/>
+          <w:bCs/>
+          <w:color w:val="2B2B2B"/>
+          <w:sz w:val="25"/>
+          <w:szCs w:val="25"/>
+        </w:rPr>
+        <w:t xml:space="preserve">Rondas y pases de turno</w:t>
+      </w:r>
+    </w:p>
+    <w:p>
+      <w:pPr>
+        <w:pStyle w:val="BodyJ"/>
+      </w:pPr>
+      <w:r>
+        <w:t xml:space="preserve">Una ronda puede incorporar una pausa breve en casos seleccionados:</w:t>
+      </w:r>
+    </w:p>
+    <w:p>
+      <w:pPr>
+        <w:pStyle w:val="BodyJ"/>
+        <w:numPr>
+          <w:ilvl w:val="0"/>
+          <w:numId w:val="6"/>
+        </w:numPr>
+      </w:pPr>
+      <w:r>
+        <w:t xml:space="preserve">¿cuál es la pregunta operativa de hoy?;</w:t>
+      </w:r>
+    </w:p>
+    <w:p>
+      <w:pPr>
+        <w:pStyle w:val="BodyJ"/>
+        <w:numPr>
+          <w:ilvl w:val="0"/>
+          <w:numId w:val="6"/>
+        </w:numPr>
+      </w:pPr>
+      <w:r>
+        <w:t xml:space="preserve">¿qué hecho nuevo cambió la representación?;</w:t>
+      </w:r>
+    </w:p>
+    <w:p>
+      <w:pPr>
+        <w:pStyle w:val="BodyJ"/>
+        <w:numPr>
+          <w:ilvl w:val="0"/>
+          <w:numId w:val="6"/>
+        </w:numPr>
+      </w:pPr>
+      <w:r>
+        <w:t xml:space="preserve">¿qué inferencia estamos tratando como si fuera dato?;</w:t>
+      </w:r>
+    </w:p>
+    <w:p>
+      <w:pPr>
+        <w:pStyle w:val="BodyJ"/>
+        <w:numPr>
+          <w:ilvl w:val="0"/>
+          <w:numId w:val="6"/>
+        </w:numPr>
+      </w:pPr>
+      <w:r>
+        <w:t xml:space="preserve">¿qué incertidumbre podría producir mayor daño?;</w:t>
+      </w:r>
+    </w:p>
+    <w:p>
+      <w:pPr>
+        <w:pStyle w:val="BodyJ"/>
+        <w:numPr>
+          <w:ilvl w:val="0"/>
+          <w:numId w:val="6"/>
+        </w:numPr>
+      </w:pPr>
+      <w:r>
+        <w:t xml:space="preserve">¿quién verificará el resultado pendiente?</w:t>
+      </w:r>
+    </w:p>
+    <w:p>
+      <w:pPr>
+        <w:pStyle w:val="BodyJ"/>
+      </w:pPr>
+      <w:r>
+        <w:t xml:space="preserve">El pase de turno debe transmitir tareas epistémicas, no sólo tratamientos. "Pendiente observar si…" y "si ocurre X, reabrir Y" son componentes de seguridad.</w:t>
+      </w:r>
+    </w:p>
+    <w:p>
+      <w:pPr>
+        <w:pStyle w:val="Heading3"/>
+        <w:spacing w:after="120" w:before="280"/>
+      </w:pPr>
+      <w:r>
+        <w:rPr>
+          <w:rFonts w:ascii="Georgia" w:cs="Georgia" w:eastAsia="Georgia" w:hAnsi="Georgia"/>
+          <w:b/>
+          <w:bCs/>
+          <w:color w:val="2B2B2B"/>
+          <w:sz w:val="25"/>
+          <w:szCs w:val="25"/>
+        </w:rPr>
+        <w:t xml:space="preserve">Conferencias de aprendizaje</w:t>
+      </w:r>
+    </w:p>
+    <w:p>
+      <w:pPr>
+        <w:pStyle w:val="BodyJ"/>
+      </w:pPr>
+      <w:r>
+        <w:t xml:space="preserve">La morbimortalidad tradicional puede centrarse en quién se equivocó o en una secuencia factual sin análisis cognitivo. Una revisión más útil reconstruye la evolución de la representación: qué se pensó en cada punto, qué señales estaban disponibles, qué información faltó, qué condiciones favorecieron la inercia y qué barrera podría permitir corrección futura. La viñeta 6 del cuaderno de casos es un ejemplo del formato: capas, oportunidades y barreras, sin moralismo retrospectivo.</w:t>
+      </w:r>
+    </w:p>
+    <w:p>
+      <w:pPr>
+        <w:pStyle w:val="BodyJ"/>
+      </w:pPr>
+      <w:r>
+        <w:t xml:space="preserve">Debe evitarse el hindsight bias. El desenlace no convierte automáticamente en obvia una alternativa que tenía baja probabilidad inicial. El aprendizaje surge al identificar oportunidades razonables de actualización, no al exigir omnisciencia retrospectiva.</w:t>
+      </w:r>
+    </w:p>
+    <w:p>
+      <w:pPr>
+        <w:pStyle w:val="Heading3"/>
+        <w:spacing w:after="120" w:before="280"/>
+      </w:pPr>
+      <w:r>
+        <w:rPr>
+          <w:rFonts w:ascii="Georgia" w:cs="Georgia" w:eastAsia="Georgia" w:hAnsi="Georgia"/>
+          <w:b/>
+          <w:bCs/>
+          <w:color w:val="2B2B2B"/>
+          <w:sz w:val="25"/>
+          <w:szCs w:val="25"/>
+        </w:rPr>
+        <w:t xml:space="preserve">Feedback diagnóstico</w:t>
+      </w:r>
+    </w:p>
+    <w:p>
+      <w:pPr>
+        <w:pStyle w:val="BodyJ"/>
+      </w:pPr>
+      <w:r>
+        <w:t xml:space="preserve">Los médicos necesitan saber qué ocurrió con pacientes derivados, dados de alta o transferidos. Sistemas simples pueden devolver diagnósticos finales, resultados discrepantes, reconsultas y cambios terapéuticos. La calibración requiere series, no recuerdos aislados.</w:t>
+      </w:r>
+    </w:p>
+    <w:p>
+      <w:pPr>
+        <w:pStyle w:val="BodyJ"/>
+      </w:pPr>
+      <w:r>
+        <w:t xml:space="preserve">Un portafolio privado puede registrar: hipótesis principal, confianza aproximada, alternativa relevante, desenlace y aprendizaje. No busca puntuar moralmente; busca detectar patrones: exceso de confianza en un dominio, subestimación de recurrencias, tendencia a tratar cultivos sin síndrome o dificultad para reconocer diagnósticos funcionales. El Taller 5 de este libro es su versión mínima. El portafolio como instrumento docente tiene además desarrollo propio en la educación médica latinoamericana, incluida la validación en español de instrumentos para evaluar su uso (Riquelme et al., 2011).</w:t>
+      </w:r>
+    </w:p>
+    <w:p>
+      <w:pPr>
+        <w:pStyle w:val="Heading3"/>
+        <w:spacing w:after="120" w:before="280"/>
+      </w:pPr>
+      <w:r>
+        <w:rPr>
+          <w:rFonts w:ascii="Georgia" w:cs="Georgia" w:eastAsia="Georgia" w:hAnsi="Georgia"/>
+          <w:b/>
+          <w:bCs/>
+          <w:color w:val="2B2B2B"/>
+          <w:sz w:val="25"/>
+          <w:szCs w:val="25"/>
+        </w:rPr>
+        <w:t xml:space="preserve">Lenguaje institucional</w:t>
+      </w:r>
+    </w:p>
+    <w:p>
+      <w:pPr>
+        <w:pStyle w:val="BodyJ"/>
+      </w:pPr>
+      <w:r>
+        <w:t xml:space="preserve">Las plantillas de ficha pueden apoyar o degradar el pensamiento. Campos obligatorios interminables producen copia; campos demasiado libres ocultan información crítica. Una plantilla equilibrada incluye problema, hechos nuevos, evaluación con grado de certeza, plan y criterios de reevaluación. La tecnología debería facilitar comparación temporal y procedencia de datos, no sólo acumular texto.</w:t>
+      </w:r>
+    </w:p>
+    <w:p>
+      <w:pPr>
+        <w:pStyle w:val="BodyJ"/>
+      </w:pPr>
+      <w:r>
+        <w:t xml:space="preserve">La cultura importa. Un residente debe poder decir "no entiendo este dato" sin perder legitimidad; una enfermera debe poder señalar que la evolución no coincide con el diagnóstico; un especialista debe explicitar límites; un jefe debe corregirse en público. La revisabilidad se aprende por modelamiento.</w:t>
+      </w:r>
+    </w:p>
+    <w:p>
+      <w:pPr>
+        <w:pStyle w:val="Heading3"/>
+        <w:spacing w:after="120" w:before="280"/>
+      </w:pPr>
+      <w:r>
+        <w:rPr>
+          <w:rFonts w:ascii="Georgia" w:cs="Georgia" w:eastAsia="Georgia" w:hAnsi="Georgia"/>
+          <w:b/>
+          <w:bCs/>
+          <w:color w:val="2B2B2B"/>
+          <w:sz w:val="25"/>
+          <w:szCs w:val="25"/>
+        </w:rPr>
+        <w:t xml:space="preserve">Una competencia profesional</w:t>
+      </w:r>
+    </w:p>
+    <w:p>
+      <w:pPr>
+        <w:pStyle w:val="BodyJ"/>
+      </w:pPr>
+      <w:r>
+        <w:t xml:space="preserve">La metacognición no reemplaza conocimiento, técnica ni ética. Los coordina. Puede enseñarse mediante casos contrastados, reflexión estructurada, práctica deliberada y feedback, pero no como asignatura aislada de la clínica (Sandars, 2009; Schmidt &amp; Mamede, 2015).</w:t>
+      </w:r>
+    </w:p>
+    <w:p>
+      <w:pPr>
+        <w:pStyle w:val="Quote1"/>
+      </w:pPr>
+      <w:r>
+        <w:t xml:space="preserve">Una organización clínica aprende cuando convierte las discrepancias entre lo pensado y lo ocurrido en información accesible, no en culpa silenciosa ni en relato retrospectivo perfecto.</w:t>
+      </w:r>
+    </w:p>
+    <w:p>
+      <w:pPr>
+        <w:pStyle w:val="BodyJ"/>
+      </w:pPr>
+      <w:r>
+        <w:t xml:space="preserve">La medicina del futuro necesitará profesionales capaces de trabajar con información creciente, equipos complejos e inteligencia artificial. La competencia decisiva no será sólo producir más respuestas, sino reconocer qué tipo de respuesta se está produciendo y qué evidencia le da derecho a orientar una acción.</w:t>
+      </w:r>
+    </w:p>
+    <w:p>
+      <w:pPr>
+        <w:pStyle w:val="BodyJ"/>
+      </w:pPr>
+      <w:r>
+        <w:t xml:space="preserve">Enseñar metacognición es enseñar una relación con el conocimiento: suficiente confianza para actuar, suficiente humildad para revisar y suficiente precisión para explicar por qué.</w:t>
+      </w:r>
+    </w:p>
+    <w:p>
+      <w:pPr>
+        <w:pStyle w:val="TallerHead"/>
+      </w:pPr>
+      <w:r>
+        <w:t xml:space="preserve">Taller 16. Rediseñar la ronda</w:t>
+      </w:r>
+    </w:p>
+    <w:p>
+      <w:pPr>
+        <w:pStyle w:val="BodyJ"/>
+      </w:pPr>
+      <w:r>
+        <w:t xml:space="preserve">Describa por escrito la ronda de su servicio tal como ocurre de verdad: minutos por paciente, quién habla, qué se pregunta siempre y qué no se pregunta nunca. Luego rediséñela con tres cambios como máximo —un disparador objetivo de pausa, una pregunta obligatoria por paciente inestable o incierto, una regla de pase de turno— y estime el costo en minutos por ronda.</w:t>
+      </w:r>
+    </w:p>
+    <w:p>
+      <w:pPr>
+        <w:pStyle w:val="BodyJ"/>
+      </w:pPr>
+      <w:r>
+        <w:rPr>
+          <w:i/>
+          <w:iCs/>
+        </w:rPr>
+        <w:t xml:space="preserve">Solución comentada.</w:t>
+      </w:r>
+      <w:r>
+        <w:t xml:space="preserve"> A modo de ejemplo, una descripción honesta puede parecerse a esto: dos a cuatro minutos por paciente, habla quien presenta y decide quien dirige, se pregunta "¿cómo está?" y "¿qué le falta?", y casi nunca "¿qué nos haría cambiar?". El rediseño más barato es esa tercera pregunta, hecha sólo a los pacientes que cumplen un disparador (reconsulta, discordancia entre gravedad y diagnóstico, 72 horas sin discusión): cuesta alrededor de un minuto por caso seleccionado y produce, de inmediato, criterios de reapertura que antes no existían. Si el rediseño necesita más de tres cambios o más de diez minutos por ronda, probablemente está diseñando una reunión nueva en lugar de mejorar la que existe — y las reuniones nuevas mueren por inasistencia.</w:t>
+      </w:r>
+    </w:p>
+    <w:p>
+      <w:pPr>
+        <w:pStyle w:val="EnUnaFrase"/>
+      </w:pPr>
+      <w:r>
+        <w:rPr>
+          <w:b/>
+          <w:bCs/>
+        </w:rPr>
+        <w:t xml:space="preserve">En una frase.</w:t>
+      </w:r>
+      <w:r>
+        <w:t xml:space="preserve"> La metacognición clínica se enseña con representaciones y feedback, y se organiza con rondas, fichas y revisiones diseñadas para hacer visible el pensamiento — no se decreta.</w:t>
+      </w:r>
+    </w:p>
+    <w:p>
+      <w:pPr>
+        <w:pStyle w:val="BodyJ"/>
+        <w:spacing w:after="80" w:before="160"/>
+      </w:pPr>
+      <w:r>
+        <w:rPr>
+          <w:b/>
+          <w:bCs/>
+        </w:rPr>
+        <w:t xml:space="preserve">Tres preguntas para la próxima visita.</w:t>
+      </w:r>
+    </w:p>
+    <w:p>
+      <w:pPr>
+        <w:pStyle w:val="BodyJ"/>
+        <w:numPr>
+          <w:ilvl w:val="0"/>
+          <w:numId w:val="24"/>
+        </w:numPr>
+      </w:pPr>
+      <w:r>
+        <w:t xml:space="preserve">La última vez que enseñé un caso, ¿pedí el diagnóstico o pedí primero la representación del problema?</w:t>
+      </w:r>
+    </w:p>
+    <w:p>
+      <w:pPr>
+        <w:pStyle w:val="BodyJ"/>
+        <w:numPr>
+          <w:ilvl w:val="0"/>
+          <w:numId w:val="24"/>
+        </w:numPr>
+      </w:pPr>
+      <w:r>
+        <w:t xml:space="preserve">¿Qué pasó con el último paciente que derivé o di de alta con diagnóstico incierto — y cómo podría enterarme sistemáticamente?</w:t>
+      </w:r>
+    </w:p>
+    <w:p>
+      <w:pPr>
+        <w:pStyle w:val="BodyJ"/>
+        <w:numPr>
+          <w:ilvl w:val="0"/>
+          <w:numId w:val="24"/>
+        </w:numPr>
+      </w:pPr>
+      <w:r>
+        <w:t xml:space="preserve">Si mañana dirigiera mi servicio, ¿cuál de las tres palancas (ronda, ficha, revisión de errores) cambiaría primero, y qué costaría?</w:t>
       </w:r>
     </w:p>
     <w:p>
@@ -12431,7 +12630,7 @@
           <w:sz w:val="22"/>
           <w:szCs w:val="22"/>
         </w:rPr>
-        <w:t xml:space="preserve">Capítulo 16</w:t>
+        <w:t xml:space="preserve">Capítulo 17</w:t>
       </w:r>
       <w:r>
         <w:rPr>
@@ -12443,15 +12642,15 @@
           <w:szCs w:val="32"/>
         </w:rPr>
         <w:br/>
-        <w:t xml:space="preserve">Enseñar y organizar la metacognición clínica</w:t>
-      </w:r>
-    </w:p>
-    <w:p>
-      <w:pPr>
-        <w:pStyle w:val="BodyJ"/>
-      </w:pPr>
-      <w:r>
-        <w:t xml:space="preserve">Una jefa de servicio que quiera "instalar metacognición" en su equipo no puede indicarla como se indica un antibiótico. Puede, en cambio, cambiar tres cosas que ve todas las semanas: qué se pregunta en la ronda, qué estructura tiene la ficha y qué pasa después de un error. Este capítulo trata de esas palancas.</w:t>
+        <w:t xml:space="preserve">La inteligencia artificial en el proceso clínico: roles, riesgos y defensas</w:t>
+      </w:r>
+    </w:p>
+    <w:p>
+      <w:pPr>
+        <w:pStyle w:val="BodyJ"/>
+      </w:pPr>
+      <w:r>
+        <w:t xml:space="preserve">Un residente pega la historia de un paciente en un asistente de lenguaje y recibe, en ocho segundos, una evaluación impecablemente redactada: diagnóstico probable, diferenciales ordenados, plan sugerido. Todo suena verosímil. Este capítulo hace tres preguntas, en orden: qué puede hacer realmente esta tecnología en el proceso diagnóstico y terapéutico; qué riesgos trae — no en abstracto, sino con la evidencia ya disponible—; y cómo enfrentarlos sin renunciar a la herramienta ni al juicio. Y sostiene una tesis transversal: casi ninguno de estos riesgos es nuevo. Cada uno es un sesgo que este libro ya describió, ahora con amplificador.</w:t>
       </w:r>
     </w:p>
     <w:p>
@@ -12468,23 +12667,23 @@
           <w:sz w:val="25"/>
           <w:szCs w:val="25"/>
         </w:rPr>
-        <w:t xml:space="preserve">De la virtud individual al diseño institucional</w:t>
-      </w:r>
-    </w:p>
-    <w:p>
-      <w:pPr>
-        <w:pStyle w:val="BodyJ"/>
-      </w:pPr>
-      <w:r>
-        <w:t xml:space="preserve">La metacognición suele presentarse como una habilidad personal: el médico debe ser humilde, reflexivo y consciente de sus sesgos. Esa expectativa es insuficiente si el sistema oculta resultados, interrumpe el trabajo, fragmenta información y castiga la duda. La lucidez necesita infraestructura.</w:t>
-      </w:r>
-    </w:p>
-    <w:p>
-      <w:pPr>
-        <w:pStyle w:val="BodyJ"/>
-      </w:pPr>
-      <w:r>
-        <w:t xml:space="preserve">La National Academies recomendó educación diagnóstica, trabajo en equipo, tecnologías que apoyen el proceso y mecanismos de feedback y aprendizaje (National Academies of Sciences, Engineering, and Medicine, 2015). Una institución metacognitiva no sólo registra errores; hace visible cómo se piensa y crea momentos para revisar.</w:t>
+        <w:t xml:space="preserve">Lenguaje plausible y verdad</w:t>
+      </w:r>
+    </w:p>
+    <w:p>
+      <w:pPr>
+        <w:pStyle w:val="BodyJ"/>
+      </w:pPr>
+      <w:r>
+        <w:t xml:space="preserve">Los grandes modelos de lenguaje generan continuaciones plausibles a partir de patrones aprendidos en enormes corpus. Su fluidez puede producir respuestas clínicamente útiles, pero también afirmaciones falsas presentadas con coherencia. La literatura denomina hallucination a contenido no sustentado o inconsistente con la fuente o el mundo (Ji et al., 2023). El término es metafórico: el modelo no tiene una experiencia perceptiva que se desorganice como en la alucinación humana.</w:t>
+      </w:r>
+    </w:p>
+    <w:p>
+      <w:pPr>
+        <w:pStyle w:val="BodyJ"/>
+      </w:pPr>
+      <w:r>
+        <w:t xml:space="preserve">La medicina reconoce el peligro porque también trabaja con narrativas plausibles. Un clínico puede completar huecos, atribuir causalidad o recordar un dato de manera congruente con su hipótesis. La semejanza no implica identidad. El médico posee cuerpo, responsabilidad, acceso al paciente, experiencia situada y capacidad de actuar; el modelo manipula representaciones lingüísticas y depende del contexto que recibe.</w:t>
       </w:r>
     </w:p>
     <w:p>
@@ -12501,23 +12700,23 @@
           <w:sz w:val="25"/>
           <w:szCs w:val="25"/>
         </w:rPr>
-        <w:t xml:space="preserve">Enseñar representaciones, no sólo respuestas</w:t>
-      </w:r>
-    </w:p>
-    <w:p>
-      <w:pPr>
-        <w:pStyle w:val="BodyJ"/>
-      </w:pPr>
-      <w:r>
-        <w:t xml:space="preserve">En formación, pedir "el diagnóstico" prematuramente favorece la adivinación. Es más útil solicitar primero una representación del problema y preguntar qué datos fueron transformados en calificadores. Bowen y Eva han destacado la enseñanza explícita del razonamiento, mientras la teoría de illness scripts explica por qué el conocimiento debe organizarse alrededor de condiciones, mecanismos y consecuencias (Eva, 2005; Bowen, 2006).</w:t>
-      </w:r>
-    </w:p>
-    <w:p>
-      <w:pPr>
-        <w:pStyle w:val="BodyJ"/>
-      </w:pPr>
-      <w:r>
-        <w:t xml:space="preserve">El docente puede pedir al aprendiz que marque cada frase como hecho, inferencia o incertidumbre. Luego puede comparar la versión inicial con una formulación experta, no para imponer estilo, sino para mostrar qué relaciones fueron seleccionadas. El feedback debe ser específico: "presentaste la bacteriuria como infección", "omitiste que la imagen sólo excluye complicación actual", "tu plan no indica qué te haría cambiar". La devolución constructiva tiene técnica y tradición docente propia en nuestra lengua: describir conducta observable en lugar de juzgar a la persona, equilibrar lo logrado con lo corregible y terminar en un plan (Alves de Lima, 2008).</w:t>
+        <w:t xml:space="preserve">El rol en el proceso diagnóstico</w:t>
+      </w:r>
+    </w:p>
+    <w:p>
+      <w:pPr>
+        <w:pStyle w:val="BodyJ"/>
+      </w:pPr>
+      <w:r>
+        <w:t xml:space="preserve">Los sistemas actuales hacen bien tareas delimitadas de reconocimiento: señalar pólipos durante una colonoscopía, priorizar radiografías con probable neumotórax, graduar una retinopatía diabética. En esas tareas el patrón está en la imagen y el estándar de referencia es relativamente estable. Los modelos de lenguaje agregaron otra capa: generan diferenciales, resumen historias y responden preguntas clínicas con un conocimiento médico codificado que, en exámenes y casos seleccionados, alcanza rendimiento alto (Singhal et al., 2023; Lee et al., 2023).</w:t>
+      </w:r>
+    </w:p>
+    <w:p>
+      <w:pPr>
+        <w:pStyle w:val="BodyJ"/>
+      </w:pPr>
+      <w:r>
+        <w:t xml:space="preserve">Pero el dato más instructivo sobre el rol diagnóstico real es otro: un ensayo aleatorizado entregó a internistas un modelo de lenguaje como apoyo para resolver casos clínicos. El grupo con el modelo no diagnosticó mejor que el grupo sin él — y el modelo solo, sin médico, superó a ambos (Goh et al., 2024). La lectura fácil ("la máquina ya es mejor") pasa por alto la lección metacognitiva: el eslabón débil no fue el modelo ni el médico, sino la conversación entre ambos. Los clínicos usaron la herramienta como oráculo de confirmación — pegarle el caso y mirar si coincide con lo que ya pensaban — en vez de usarla para lo que mejor hace: ampliar el espacio de hipótesis, proponer el contraejemplo, señalar el dato que no encaja. El capítulo 2 mostró que la generación de alternativas es el momento creativo del diagnóstico; usada ahí, la IA es un multiplicador. Usada como confirmadora rápida, es un espejo del anclaje.</w:t>
       </w:r>
     </w:p>
     <w:p>
@@ -12534,23 +12733,23 @@
           <w:sz w:val="25"/>
           <w:szCs w:val="25"/>
         </w:rPr>
-        <w:t xml:space="preserve">Un debate honesto: ¿se puede enseñar a pensar mejor?</w:t>
-      </w:r>
-    </w:p>
-    <w:p>
-      <w:pPr>
-        <w:pStyle w:val="BodyJ"/>
-      </w:pPr>
-      <w:r>
-        <w:t xml:space="preserve">Este libro toma posición en una controversia real de la educación médica, y conviene declararla. De un lado, Croskerry y su tradición sostienen que conocer los sesgos y entrenar estrategias de debiasing mejora el diagnóstico (Croskerry, 2003; Croskerry et al., 2013a, 2013b). Del otro, Norman, Monteiro y colegas han acumulado evidencia incómoda: la mayoría de los errores diagnósticos se asocia a déficits de conocimiento más que a fallas puras de proceso, los cursos de "pensamiento crítico" generalizable transfieren poco, y obligar a reflexionar sistemáticamente sobre casos fáciles no mejora la precisión y consume tiempo (Norman et al., 2017; Monteiro &amp; Norman, 2013; Monteiro et al., 2020).</w:t>
-      </w:r>
-    </w:p>
-    <w:p>
-      <w:pPr>
-        <w:pStyle w:val="BodyJ"/>
-      </w:pPr>
-      <w:r>
-        <w:t xml:space="preserve">La posición de este libro es intermedia, pero no equidistante. Con los escépticos: no existe una habilidad general de "pensar bien" que flote por encima del conocimiento; la representación rica del problema —illness scripts, experiencia con feedback— es la condición de todo lo demás, y ningún método, HII-D incluido, compensa no saber medicina. Contra el escepticismo total: de esa evidencia no se sigue que la única intervención posible sea enseñar más contenido. Lo que este libro propone no es vigilancia interna permanente ni listas universales —las versiones que la evidencia ha desinflado—, sino artefactos externos y selectivos: un lenguaje que obliga a graduar afirmaciones, una estructura de nota que conserva las capas, pausas activadas por disparadores definidos y circuitos de feedback que conviertan experiencia en calibración. Es una apuesta con compromisos observables (véase el capítulo 15): si estas herramientas no cambian conductas medibles, deben abandonarse como cualquier hipótesis mimada. Entre tanto, la controversia se enseña mejor de lo que se oculta: un residente que conoce el debate sabrá desconfiar por igual del catálogo de sesgos como solución universal y del nihilismo pedagógico como coartada.</w:t>
+        <w:t xml:space="preserve">El rol en el proceso terapéutico</w:t>
+      </w:r>
+    </w:p>
+    <w:p>
+      <w:pPr>
+        <w:pStyle w:val="BodyJ"/>
+      </w:pPr>
+      <w:r>
+        <w:t xml:space="preserve">En la terapéutica la IA llega antes y por caminos menos visibles: alertas de deterioro, predictores de sepsis, sugerencias de dosis, detección de interacciones, estratificaciones de riesgo que deciden quién entra a un programa de cuidados. Aquí la evidencia ya dejó una parábola completa. Un modelo propietario de predicción de sepsis, desplegado en cientos de hospitales, fue validado externamente recién después de su adopción masiva: discriminaba mal, calibraba peor y generaba una carga de alertas capaz de fatigar a cualquier equipo (Wong et al., 2021). La falla profunda no fue estadística sino epistemológica: el sistema se adoptó sin exigirle la evidencia local que este libro pide para cualquier afirmación — ¿funciona aquí, con estos pacientes, con esta prevalencia? Es la lección de la Parte III aplicada al software: una herramienta no hereda la validez de su marca, y la validación externa no es un trámite — es la diferencia entre una alerta y un ruido.</w:t>
+      </w:r>
+    </w:p>
+    <w:p>
+      <w:pPr>
+        <w:pStyle w:val="BodyJ"/>
+      </w:pPr>
+      <w:r>
+        <w:t xml:space="preserve">Hay un segundo límite terapéutico más silencioso. Una recomendación de intervención generada por IA opera sobre lo que está escrito, y el capítulo 10 mostró que lo menos escrito de la ficha es precisamente el contexto global — funcionalidad basal, pronóstico de fondo, red de apoyo, fines del paciente. Un sistema que no ve esos hechos no puede ponderarlos: recomendará la intervención "indicada" para la enfermedad documentada, que es exactamente el error de la indicación aislada. La IA no exime del cruce con la bioética; lo vuelve más urgente, porque automatiza la mitad técnica del razonamiento y deja la otra mitad — la que juzga si la intervención es proporcionada para este enfermo — enteramente del lado humano.</w:t>
       </w:r>
     </w:p>
     <w:p>
@@ -12567,15 +12766,15 @@
           <w:sz w:val="25"/>
           <w:szCs w:val="25"/>
         </w:rPr>
-        <w:t xml:space="preserve">Rondas y pases de turno</w:t>
-      </w:r>
-    </w:p>
-    <w:p>
-      <w:pPr>
-        <w:pStyle w:val="BodyJ"/>
-      </w:pPr>
-      <w:r>
-        <w:t xml:space="preserve">Una ronda puede incorporar una pausa breve en casos seleccionados:</w:t>
+        <w:t xml:space="preserve">El catálogo de riesgos</w:t>
+      </w:r>
+    </w:p>
+    <w:p>
+      <w:pPr>
+        <w:pStyle w:val="BodyJ"/>
+      </w:pPr>
+      <w:r>
+        <w:t xml:space="preserve">Los riesgos de la IA clínica ya no son especulación: tienen literatura propia, y las advertencias sobre las consecuencias no intencionadas del aprendizaje automático —automatizar los sesgos de los datos, erosionar habilidades por deferencia— preceden a los modelos generativos (Cabitza et al., 2017). Conviene tenerlos en catálogo, con su parentesco epistémico a la vista:</w:t>
       </w:r>
     </w:p>
     <w:p>
@@ -12587,7 +12786,14 @@
         </w:numPr>
       </w:pPr>
       <w:r>
-        <w:t xml:space="preserve">¿cuál es la pregunta operativa de hoy?;</w:t>
+        <w:rPr>
+          <w:b/>
+          <w:bCs/>
+        </w:rPr>
+        <w:t xml:space="preserve">Confabulación.</w:t>
+      </w:r>
+      <w:r>
+        <w:t xml:space="preserve"> Contenido no sustentado presentado con coherencia (Ji et al., 2023). Es la certeza retórica industrializada: prosa donde los hechos, las inferencias y lo inventado llegan con la misma sintaxis.</w:t>
       </w:r>
     </w:p>
     <w:p>
@@ -12599,7 +12805,14 @@
         </w:numPr>
       </w:pPr>
       <w:r>
-        <w:t xml:space="preserve">¿qué hecho nuevo cambió la representación?;</w:t>
+        <w:rPr>
+          <w:b/>
+          <w:bCs/>
+        </w:rPr>
+        <w:t xml:space="preserve">Sesgo de automatización.</w:t>
+      </w:r>
+      <w:r>
+        <w:t xml:space="preserve"> La tendencia a aceptar la salida de un sistema por venir de un sistema, documentada en los apoyos a la decisión clínica desde mucho antes de los modelos generativos: los sistemas corrigen errores humanos e introducen errores nuevos — el usuario que habría acertado solo y se equivoca por deferencia (Goddard et al., 2012). La versión de la era de los modelos de lenguaje ya tiene ensayo aleatorizado: médicos que habían completado veinte horas de alfabetización en IA, expuestos a recomendaciones de un modelo con errores deliberados, perdieron catorce puntos de exactitud diagnóstica frente a quienes recibieron recomendaciones correctas (Qazi et al., 2026). La alfabetización general no inmuniza; la vigilancia caso a caso no se delega en un curso. Es el anclaje más la autoridad no interrogada, con interfaz.</w:t>
       </w:r>
     </w:p>
     <w:p>
@@ -12611,7 +12824,14 @@
         </w:numPr>
       </w:pPr>
       <w:r>
-        <w:t xml:space="preserve">¿qué inferencia estamos tratando como si fuera dato?;</w:t>
+        <w:rPr>
+          <w:b/>
+          <w:bCs/>
+        </w:rPr>
+        <w:t xml:space="preserve">Atrofia de la pericia.</w:t>
+      </w:r>
+      <w:r>
+        <w:t xml:space="preserve"> La evidencia más inquietante es reciente: endoscopistas expuestos durante meses a la detección asistida de pólipos detectaron significativamente menos adenomas al volver a trabajar sin asistencia — seis puntos absolutos menos que antes de la exposición (Budzyń et al., 2025). La pericia perceptual se mantiene con práctica; si la máquina practica por nosotros, la cuenta llega en la primera guardia sin máquina.</w:t>
       </w:r>
     </w:p>
     <w:p>
@@ -12623,7 +12843,14 @@
         </w:numPr>
       </w:pPr>
       <w:r>
-        <w:t xml:space="preserve">¿qué incertidumbre podría producir mayor daño?;</w:t>
+        <w:rPr>
+          <w:b/>
+          <w:bCs/>
+        </w:rPr>
+        <w:t xml:space="preserve">Sesgo algorítmico.</w:t>
+      </w:r>
+      <w:r>
+        <w:t xml:space="preserve"> Un algoritmo aplicado a millones de pacientes en Estados Unidos asignaba menos cuidados a pacientes negros igual de enfermos, porque fue entrenado para predecir gasto sanitario como sustituto de necesidad — y en poblaciones históricamente subatendidas se gasta menos (Obermeyer et al., 2019). El error no estaba en la matemática sino en la elección del sustituto: la carga teórica de la observación del capítulo 1, a escala poblacional. Ningún dato de entrenamiento es neutro; alguien decidió qué medir.</w:t>
       </w:r>
     </w:p>
     <w:p>
@@ -12635,15 +12862,41 @@
         </w:numPr>
       </w:pPr>
       <w:r>
-        <w:t xml:space="preserve">¿quién verificará el resultado pendiente?</w:t>
-      </w:r>
-    </w:p>
-    <w:p>
-      <w:pPr>
-        <w:pStyle w:val="BodyJ"/>
-      </w:pPr>
-      <w:r>
-        <w:t xml:space="preserve">El pase de turno debe transmitir tareas epistémicas, no sólo tratamientos. "Pendiente observar si…" y "si ocurre X, reabrir Y" son componentes de seguridad.</w:t>
+        <w:rPr>
+          <w:b/>
+          <w:bCs/>
+        </w:rPr>
+        <w:t xml:space="preserve">Sobreconfianza no calibrada.</w:t>
+      </w:r>
+      <w:r>
+        <w:t xml:space="preserve"> La confianza verbalizada de los modelos tiende a la sobreconfianza sistemática (Kadavath et al., 2022; Xiong et al., 2024): el "estoy bastante seguro" del modelo es tono, no calibración — la sobreconfianza humana, sin siquiera un historial propio de errores que la eduque. Y cuando el modelo "critica" o "revisa" su propia respuesta, esa autocrítica puede ser otra generación entrenada para imitar la evaluación: la pregunta práctica no es si el sistema sabe que sabe, sino si sus señales de confianza están empíricamente calibradas.</w:t>
+      </w:r>
+    </w:p>
+    <w:p>
+      <w:pPr>
+        <w:pStyle w:val="BodyJ"/>
+        <w:numPr>
+          <w:ilvl w:val="0"/>
+          <w:numId w:val="6"/>
+        </w:numPr>
+      </w:pPr>
+      <w:r>
+        <w:rPr>
+          <w:b/>
+          <w:bCs/>
+        </w:rPr>
+        <w:t xml:space="preserve">Degradación silenciosa.</w:t>
+      </w:r>
+      <w:r>
+        <w:t xml:space="preserve"> Los modelos se despliegan sobre poblaciones que cambian: prevalencias, prácticas, codificaciones. El rendimiento decae sin anunciarse, porque el software no siente que está fallando. Sin monitoreo activo, la validación de ayer es la superstición de mañana.</w:t>
+      </w:r>
+    </w:p>
+    <w:p>
+      <w:pPr>
+        <w:pStyle w:val="BodyJ"/>
+      </w:pPr>
+      <w:r>
+        <w:t xml:space="preserve">La columna vertebral del catálogo es una sola observación: la IA no introdujo errores nuevos en la medicina. Automatizó los que ya teníamos y les quitó los frenos naturales — la lentitud, la duda, el cansancio que a veces obligaba a pedir ayuda.</w:t>
       </w:r>
     </w:p>
     <w:p>
@@ -12660,23 +12913,69 @@
           <w:sz w:val="25"/>
           <w:szCs w:val="25"/>
         </w:rPr>
-        <w:t xml:space="preserve">Conferencias de aprendizaje</w:t>
-      </w:r>
-    </w:p>
-    <w:p>
-      <w:pPr>
-        <w:pStyle w:val="BodyJ"/>
-      </w:pPr>
-      <w:r>
-        <w:t xml:space="preserve">La morbimortalidad tradicional puede centrarse en quién se equivocó o en una secuencia factual sin análisis cognitivo. Una revisión más útil reconstruye la evolución de la representación: qué se pensó en cada punto, qué señales estaban disponibles, qué información faltó, qué condiciones favorecieron la inercia y qué barrera podría permitir corrección futura. La viñeta 8 del cuaderno de casos es un ejemplo del formato: capas, oportunidades y barreras, sin moralismo retrospectivo.</w:t>
-      </w:r>
-    </w:p>
-    <w:p>
-      <w:pPr>
-        <w:pStyle w:val="BodyJ"/>
-      </w:pPr>
-      <w:r>
-        <w:t xml:space="preserve">Debe evitarse el hindsight bias. El desenlace no convierte automáticamente en obvia una alternativa que tenía baja probabilidad inicial. El aprendizaje surge al identificar oportunidades razonables de actualización, no al exigir omnisciencia retrospectiva.</w:t>
+        <w:t xml:space="preserve">El riesgo de fondo: la formación del razonador</w:t>
+      </w:r>
+    </w:p>
+    <w:p>
+      <w:pPr>
+        <w:pStyle w:val="BodyJ"/>
+      </w:pPr>
+      <w:r>
+        <w:t xml:space="preserve">Hay un riesgo más lento que todos los del catálogo, y puede importar más: el efecto de la IA sobre quien todavía está aprendiendo a razonar. La educación médica ya le puso nombres a la tríada (Abdulnour et al., 2025): </w:t>
+      </w:r>
+      <w:r>
+        <w:rPr>
+          <w:i/>
+          <w:iCs/>
+        </w:rPr>
+        <w:t xml:space="preserve">deskilling</w:t>
+      </w:r>
+      <w:r>
+        <w:t xml:space="preserve"> — sé razonar, delego repetidamente, dejo de ejercitar, la capacidad se deteriora—; </w:t>
+      </w:r>
+      <w:r>
+        <w:rPr>
+          <w:i/>
+          <w:iCs/>
+        </w:rPr>
+        <w:t xml:space="preserve">never-skilling</w:t>
+      </w:r>
+      <w:r>
+        <w:t xml:space="preserve"> — la IA estuvo disponible desde el inicio de la formación, la operación cognitiva nunca se ejecutó las veces necesarias, la competencia nunca se consolidó—; y </w:t>
+      </w:r>
+      <w:r>
+        <w:rPr>
+          <w:i/>
+          <w:iCs/>
+        </w:rPr>
+        <w:t xml:space="preserve">mis-skilling</w:t>
+      </w:r>
+      <w:r>
+        <w:t xml:space="preserve"> — se aprendió, pero patrones incorrectos, imitando salidas que nadie auditaba—. El segundo es el más grave porque es invisible: la habilidad perdida deja un recuerdo y una alarma; la que nunca se construyó no deja nada que echar de menos.</w:t>
+      </w:r>
+    </w:p>
+    <w:p>
+      <w:pPr>
+        <w:pStyle w:val="BodyJ"/>
+      </w:pPr>
+      <w:r>
+        <w:t xml:space="preserve">El mecanismo es preciso, y una parte de este libro ya lo había descrito sin nombrar la IA. Escribir la nota clínica no es registrar un pensamiento terminado: seleccionar qué dato importa, jerarquizarlo y estructurarlo es parte del proceso mismo de pensar — la tesis del capítulo 12, la ficha como instrumento de pensamiento. Por eso la automatización completa de la escritura clínica no ahorra sólo tiempo: puede eliminar la instancia en la que el clínico construye su razonamiento, degradando el registro y al registrador a la vez (McCoy et al., 2024). La ecuación merece escribirse entera: ahorro de trabajo cognitivo inmediato, a cambio de las operaciones mediante las cuales se construye la competencia.</w:t>
+      </w:r>
+    </w:p>
+    <w:p>
+      <w:pPr>
+        <w:pStyle w:val="BodyJ"/>
+      </w:pPr>
+      <w:r>
+        <w:t xml:space="preserve">Hay un tercer fenómeno que ni siquiera exige que la IA se equivoque: la captura cognitiva. Quien ve primero la respuesta del modelo ya no genera hipótesis desde el caso: su búsqueda de alternativas, su lectura de los datos y su ponderación posterior quedan condicionadas por lo que ya leyó — el anclaje de siempre, con la diferencia de que aquí el ancla puede llegar antes que el paciente. Una IA excelente que entrega demasiado pronto la hipótesis, la síntesis o la inferencia que el aprendiz debía producir no daña la respuesta de hoy; daña la arquitectura del aprendizaje. Porque el valor cognitivo de un caso no está sólo en llegar a la conclusión correcta: está en ejecutar las operaciones que permiten llegar a ella, revisarla y, cuando corresponde, abandonarla. Una herramienta que aumenta el porcentaje de respuestas correctas puede, paradójicamente, mejorar el desempeño de hoy mientras empeora al razonador de mañana.</w:t>
+      </w:r>
+    </w:p>
+    <w:p>
+      <w:pPr>
+        <w:pStyle w:val="BodyJ"/>
+      </w:pPr>
+      <w:r>
+        <w:t xml:space="preserve">La aviación conoce esta trampa con nombre propio: la paradoja de la automatización — cuanto más competente es el sistema, menos ejercita el humano las habilidades necesarias para detectar cuándo falla, que es exactamente cuando más se lo necesita (Abdulnour et al., 2026). La respuesta pedagógica propuesta frente a ella coincide, casi palabra por palabra, con la disciplina de este libro: razonar primero de forma independiente, consultar después, y usar la IA para desafiar, ampliar o refinar ese razonamiento — nunca para reemplazar su ejecución.</w:t>
       </w:r>
     </w:p>
     <w:p>
@@ -12693,23 +12992,217 @@
           <w:sz w:val="25"/>
           <w:szCs w:val="25"/>
         </w:rPr>
-        <w:t xml:space="preserve">Feedback diagnóstico</w:t>
-      </w:r>
-    </w:p>
-    <w:p>
-      <w:pPr>
-        <w:pStyle w:val="BodyJ"/>
-      </w:pPr>
-      <w:r>
-        <w:t xml:space="preserve">Los médicos necesitan saber qué ocurrió con pacientes derivados, dados de alta o transferidos. Sistemas simples pueden devolver diagnósticos finales, resultados discrepantes, reconsultas y cambios terapéuticos. La calibración requiere series, no recuerdos aislados.</w:t>
-      </w:r>
-    </w:p>
-    <w:p>
-      <w:pPr>
-        <w:pStyle w:val="BodyJ"/>
-      </w:pPr>
-      <w:r>
-        <w:t xml:space="preserve">Un portafolio privado puede registrar: hipótesis principal, confianza aproximada, alternativa relevante, desenlace y aprendizaje. No busca puntuar moralmente; busca detectar patrones: exceso de confianza en un dominio, subestimación de recurrencias, tendencia a tratar cultivos sin síndrome o dificultad para reconocer diagnósticos funcionales. El Taller 5 de este libro es su versión mínima. El portafolio como instrumento docente tiene además desarrollo propio en la educación médica latinoamericana, incluida la validación en español de instrumentos para evaluar su uso (Riquelme et al., 2011).</w:t>
+        <w:t xml:space="preserve">Cómo enfrentarlos: las defensas del clínico</w:t>
+      </w:r>
+    </w:p>
+    <w:p>
+      <w:pPr>
+        <w:pStyle w:val="BodyJ"/>
+      </w:pPr>
+      <w:r>
+        <w:t xml:space="preserve">La primera defensa ya está en este libro. El clínico responsable puede distinguir "lo vi", "lo infiero" y "no lo sé"; un modelo suele mezclar esas capas si nadie le exige separación, y puede transformar ausencia de información en un detalle probable, porque su objetivo generativo favorece la continuidad. La matriz HII-D funciona entonces como protocolo de auditoría de cualquier salida de IA:</w:t>
+      </w:r>
+    </w:p>
+    <w:p>
+      <w:pPr>
+        <w:pStyle w:val="BodyJ"/>
+        <w:numPr>
+          <w:ilvl w:val="0"/>
+          <w:numId w:val="6"/>
+        </w:numPr>
+      </w:pPr>
+      <w:r>
+        <w:t xml:space="preserve">¿qué hechos provienen realmente del caso?;</w:t>
+      </w:r>
+    </w:p>
+    <w:p>
+      <w:pPr>
+        <w:pStyle w:val="BodyJ"/>
+        <w:numPr>
+          <w:ilvl w:val="0"/>
+          <w:numId w:val="6"/>
+        </w:numPr>
+      </w:pPr>
+      <w:r>
+        <w:t xml:space="preserve">¿qué información agregó el modelo?;</w:t>
+      </w:r>
+    </w:p>
+    <w:p>
+      <w:pPr>
+        <w:pStyle w:val="BodyJ"/>
+        <w:numPr>
+          <w:ilvl w:val="0"/>
+          <w:numId w:val="6"/>
+        </w:numPr>
+      </w:pPr>
+      <w:r>
+        <w:t xml:space="preserve">¿qué inferencias formula y con qué respaldo?;</w:t>
+      </w:r>
+    </w:p>
+    <w:p>
+      <w:pPr>
+        <w:pStyle w:val="BodyJ"/>
+        <w:numPr>
+          <w:ilvl w:val="0"/>
+          <w:numId w:val="6"/>
+        </w:numPr>
+      </w:pPr>
+      <w:r>
+        <w:t xml:space="preserve">¿qué incertidumbres omitió?;</w:t>
+      </w:r>
+    </w:p>
+    <w:p>
+      <w:pPr>
+        <w:pStyle w:val="BodyJ"/>
+        <w:numPr>
+          <w:ilvl w:val="0"/>
+          <w:numId w:val="6"/>
+        </w:numPr>
+      </w:pPr>
+      <w:r>
+        <w:t xml:space="preserve">¿qué decisión propone y cuáles serían sus riesgos?;</w:t>
+      </w:r>
+    </w:p>
+    <w:p>
+      <w:pPr>
+        <w:pStyle w:val="BodyJ"/>
+        <w:numPr>
+          <w:ilvl w:val="0"/>
+          <w:numId w:val="6"/>
+        </w:numPr>
+      </w:pPr>
+      <w:r>
+        <w:t xml:space="preserve">¿qué fuente primaria permite verificar la afirmación?</w:t>
+      </w:r>
+    </w:p>
+    <w:p>
+      <w:pPr>
+        <w:pStyle w:val="BodyJ"/>
+      </w:pPr>
+      <w:r>
+        <w:t xml:space="preserve">De esa auditoría se desprenden reglas de uso que caben en una tarjeta:</w:t>
+      </w:r>
+    </w:p>
+    <w:p>
+      <w:pPr>
+        <w:pStyle w:val="BodyJ"/>
+        <w:numPr>
+          <w:ilvl w:val="0"/>
+          <w:numId w:val="25"/>
+        </w:numPr>
+      </w:pPr>
+      <w:r>
+        <w:rPr>
+          <w:b/>
+          <w:bCs/>
+        </w:rPr>
+        <w:t xml:space="preserve">Razonar antes de consultar.</w:t>
+      </w:r>
+      <w:r>
+        <w:t xml:space="preserve"> Formular la propia hipótesis y el propio plan antes de abrir el asistente: la respuesta vista primero captura la búsqueda posterior. La IA se usa contra un borrador propio, no en su lugar.</w:t>
+      </w:r>
+    </w:p>
+    <w:p>
+      <w:pPr>
+        <w:pStyle w:val="BodyJ"/>
+        <w:numPr>
+          <w:ilvl w:val="0"/>
+          <w:numId w:val="25"/>
+        </w:numPr>
+      </w:pPr>
+      <w:r>
+        <w:rPr>
+          <w:b/>
+          <w:bCs/>
+        </w:rPr>
+        <w:t xml:space="preserve">Verificar la afirmación decisiva contra una fuente primaria antes de actuar.</w:t>
+      </w:r>
+      <w:r>
+        <w:t xml:space="preserve"> No todas: la decisiva — la que, de ser falsa, cambia la conducta.</w:t>
+      </w:r>
+    </w:p>
+    <w:p>
+      <w:pPr>
+        <w:pStyle w:val="BodyJ"/>
+        <w:numPr>
+          <w:ilvl w:val="0"/>
+          <w:numId w:val="25"/>
+        </w:numPr>
+      </w:pPr>
+      <w:r>
+        <w:rPr>
+          <w:b/>
+          <w:bCs/>
+        </w:rPr>
+        <w:t xml:space="preserve">Usar la herramienta para abrir, no para cerrar.</w:t>
+      </w:r>
+      <w:r>
+        <w:t xml:space="preserve"> Pedir alternativas, contraejemplos y "qué no encaja con este diagnóstico" aprovecha exactamente lo que el ensayo de Goh mostró que desaprovechamos; pedirle confirmación de la hipótesis propia industrializa el anclaje.</w:t>
+      </w:r>
+    </w:p>
+    <w:p>
+      <w:pPr>
+        <w:pStyle w:val="BodyJ"/>
+        <w:numPr>
+          <w:ilvl w:val="0"/>
+          <w:numId w:val="25"/>
+        </w:numPr>
+      </w:pPr>
+      <w:r>
+        <w:rPr>
+          <w:b/>
+          <w:bCs/>
+        </w:rPr>
+        <w:t xml:space="preserve">Tratar su confianza como tono, no como evidencia.</w:t>
+      </w:r>
+      <w:r>
+        <w:t xml:space="preserve"> La seguridad de la prosa no informa la probabilidad de corrección — igual que la seguridad de un colega no sustituye sus razones.</w:t>
+      </w:r>
+    </w:p>
+    <w:p>
+      <w:pPr>
+        <w:pStyle w:val="BodyJ"/>
+        <w:numPr>
+          <w:ilvl w:val="0"/>
+          <w:numId w:val="25"/>
+        </w:numPr>
+      </w:pPr>
+      <w:r>
+        <w:rPr>
+          <w:b/>
+          <w:bCs/>
+        </w:rPr>
+        <w:t xml:space="preserve">Nunca pegar y firmar.</w:t>
+      </w:r>
+      <w:r>
+        <w:t xml:space="preserve"> Lo que entra a la ficha bajo la firma propia es afirmación propia: una confabulación copiada se convierte en hecho heredado para el siguiente lector, y la síntesis delegada es, además, pensamiento que no ocurrió (McCoy et al., 2024).</w:t>
+      </w:r>
+    </w:p>
+    <w:p>
+      <w:pPr>
+        <w:pStyle w:val="BodyJ"/>
+        <w:numPr>
+          <w:ilvl w:val="0"/>
+          <w:numId w:val="25"/>
+        </w:numPr>
+      </w:pPr>
+      <w:r>
+        <w:rPr>
+          <w:b/>
+          <w:bCs/>
+        </w:rPr>
+        <w:t xml:space="preserve">Conservar práctica sin asistencia.</w:t>
+      </w:r>
+      <w:r>
+        <w:t xml:space="preserve"> La lección de los endoscopistas: alternar deliberadamente el trabajo con y sin la herramienta, como se conserva cualquier destreza que puede necesitarse a las tres de la mañana, con el sistema caído.</w:t>
+      </w:r>
+    </w:p>
+    <w:p>
+      <w:pPr>
+        <w:pStyle w:val="BodyJ"/>
+      </w:pPr>
+      <w:r>
+        <w:t xml:space="preserve">El modelo puede servir como generador de alternativas, revisor de coherencia, organizador de información o segundo lector. Su valor aumenta cuando el usuario mantiene la responsabilidad de verificación y disminuye cuando se usa como autoridad final.</w:t>
       </w:r>
     </w:p>
     <w:p>
@@ -12726,23 +13219,129 @@
           <w:sz w:val="25"/>
           <w:szCs w:val="25"/>
         </w:rPr>
-        <w:t xml:space="preserve">Lenguaje institucional</w:t>
-      </w:r>
-    </w:p>
-    <w:p>
-      <w:pPr>
-        <w:pStyle w:val="BodyJ"/>
-      </w:pPr>
-      <w:r>
-        <w:t xml:space="preserve">Las plantillas de ficha pueden apoyar o degradar el pensamiento. Campos obligatorios interminables producen copia; campos demasiado libres ocultan información crítica. Una plantilla equilibrada incluye problema, hechos nuevos, evaluación con grado de certeza, plan y criterios de reevaluación. La tecnología debería facilitar comparación temporal y procedencia de datos, no sólo acumular texto.</w:t>
-      </w:r>
-    </w:p>
-    <w:p>
-      <w:pPr>
-        <w:pStyle w:val="BodyJ"/>
-      </w:pPr>
-      <w:r>
-        <w:t xml:space="preserve">La cultura importa. Un residente debe poder decir "no entiendo este dato" sin perder legitimidad; una enfermera debe poder señalar que la evolución no coincide con el diagnóstico; un especialista debe explicitar límites; un jefe debe corregirse en público. La revisabilidad se aprende por modelamiento.</w:t>
+        <w:t xml:space="preserve">Cómo enfrentarlos: las defensas de la institución</w:t>
+      </w:r>
+    </w:p>
+    <w:p>
+      <w:pPr>
+        <w:pStyle w:val="BodyJ"/>
+      </w:pPr>
+      <w:r>
+        <w:t xml:space="preserve">Las defensas individuales no bastan, porque varios riesgos del catálogo operan a escala de sistema. Una institución que despliega IA clínica contrae obligaciones epistémicas precisas:</w:t>
+      </w:r>
+    </w:p>
+    <w:p>
+      <w:pPr>
+        <w:pStyle w:val="BodyJ"/>
+        <w:numPr>
+          <w:ilvl w:val="0"/>
+          <w:numId w:val="6"/>
+        </w:numPr>
+      </w:pPr>
+      <w:r>
+        <w:rPr>
+          <w:b/>
+          <w:bCs/>
+        </w:rPr>
+        <w:t xml:space="preserve">Validación local antes de usar.</w:t>
+      </w:r>
+      <w:r>
+        <w:t xml:space="preserve"> El desempeño publicado —o prometido— no es el desempeño aquí; la parábola del predictor de sepsis existe porque nadie hizo esta pregunta a tiempo (Wong et al., 2021).</w:t>
+      </w:r>
+    </w:p>
+    <w:p>
+      <w:pPr>
+        <w:pStyle w:val="BodyJ"/>
+        <w:numPr>
+          <w:ilvl w:val="0"/>
+          <w:numId w:val="6"/>
+        </w:numPr>
+      </w:pPr>
+      <w:r>
+        <w:rPr>
+          <w:b/>
+          <w:bCs/>
+        </w:rPr>
+        <w:t xml:space="preserve">Monitoreo continuo con umbrales de retirada.</w:t>
+      </w:r>
+      <w:r>
+        <w:t xml:space="preserve"> Definir antes del despliegue qué degradación obliga a recalibrar o apagar: la falsabilidad del capítulo 15, aplicada al software.</w:t>
+      </w:r>
+    </w:p>
+    <w:p>
+      <w:pPr>
+        <w:pStyle w:val="BodyJ"/>
+        <w:numPr>
+          <w:ilvl w:val="0"/>
+          <w:numId w:val="6"/>
+        </w:numPr>
+      </w:pPr>
+      <w:r>
+        <w:rPr>
+          <w:b/>
+          <w:bCs/>
+        </w:rPr>
+        <w:t xml:space="preserve">Auditoría de equidad.</w:t>
+      </w:r>
+      <w:r>
+        <w:t xml:space="preserve"> Desagregar el rendimiento por subgrupos y examinar los sustitutos con la pregunta de Obermeyer: ¿qué mide realmente esta variable, y para quién?</w:t>
+      </w:r>
+    </w:p>
+    <w:p>
+      <w:pPr>
+        <w:pStyle w:val="BodyJ"/>
+        <w:numPr>
+          <w:ilvl w:val="0"/>
+          <w:numId w:val="6"/>
+        </w:numPr>
+      </w:pPr>
+      <w:r>
+        <w:rPr>
+          <w:b/>
+          <w:bCs/>
+        </w:rPr>
+        <w:t xml:space="preserve">Presupuesto de alertas.</w:t>
+      </w:r>
+      <w:r>
+        <w:t xml:space="preserve"> Cada alarma nueva compite por la misma atención finita; una alerta de bajo valor predictivo no es inocua — es ruido que entrena a ignorar, y el equipo que aprendió a ignorar no distingue qué está ignorando.</w:t>
+      </w:r>
+    </w:p>
+    <w:p>
+      <w:pPr>
+        <w:pStyle w:val="BodyJ"/>
+        <w:numPr>
+          <w:ilvl w:val="0"/>
+          <w:numId w:val="6"/>
+        </w:numPr>
+      </w:pPr>
+      <w:r>
+        <w:rPr>
+          <w:b/>
+          <w:bCs/>
+        </w:rPr>
+        <w:t xml:space="preserve">Formación que supervise el uso, no sólo la respuesta.</w:t>
+      </w:r>
+      <w:r>
+        <w:t xml:space="preserve"> En docencia, observar cómo el aprendiz usa cognitivamente la herramienta — cuándo consulta, qué acepta, qué verifica, qué habría respondido antes de mirar — y proteger espacios deliberados de práctica sin asistencia (Abdulnour et al., 2025): la competencia que nunca se construyó no se puede "recuperar".</w:t>
+      </w:r>
+    </w:p>
+    <w:p>
+      <w:pPr>
+        <w:pStyle w:val="BodyJ"/>
+        <w:numPr>
+          <w:ilvl w:val="0"/>
+          <w:numId w:val="6"/>
+        </w:numPr>
+      </w:pPr>
+      <w:r>
+        <w:rPr>
+          <w:b/>
+          <w:bCs/>
+        </w:rPr>
+        <w:t xml:space="preserve">Responsabilidad trazable.</w:t>
+      </w:r>
+      <w:r>
+        <w:t xml:space="preserve"> Cada recomendación automatizada necesita un dueño humano identificable, con tiempo, datos y autoridad para contradecirla. La OMS ha recomendado gobernanza, evaluación, transparencia y supervisión humana para estos sistemas, atendiendo riesgos de inexactitud, sesgo, privacidad y dependencia excesiva (World Health Organization, 2024); esa supervisión no puede ser una firma ritual al final del flujo.</w:t>
       </w:r>
     </w:p>
     <w:p>
@@ -12759,31 +13358,164 @@
           <w:sz w:val="25"/>
           <w:szCs w:val="25"/>
         </w:rPr>
-        <w:t xml:space="preserve">Evaluar el razonamiento, no sólo la respuesta</w:t>
-      </w:r>
-    </w:p>
-    <w:p>
-      <w:pPr>
-        <w:pStyle w:val="BodyJ"/>
-      </w:pPr>
-      <w:r>
-        <w:t xml:space="preserve">La educación clínica suele premiar el diagnóstico correcto, aunque haya sido obtenido por un proceso frágil, y castigar el diagnóstico incorrecto incluso cuando la incertidumbre estaba bien calibrada. Este patrón enseña a ocultar dudas y reconstruir narrativas retrospectivas. Una evaluación metacognitiva debe observar también representación del problema, calidad de alternativas, uso de evidencia contradictoria, confianza y plan de revisión.</w:t>
-      </w:r>
-    </w:p>
-    <w:p>
-      <w:pPr>
-        <w:pStyle w:val="BodyJ"/>
-      </w:pPr>
-      <w:r>
-        <w:t xml:space="preserve">Los docentes pueden pedir al aprendiz que marque cada afirmación como hecho, inferencia o incertidumbre; que identifique el dato de mayor peso; que señale qué cambio modificaría la conducta; y que estime su confianza antes de conocer la respuesta. El objetivo no es ralentizar todas las decisiones, sino construir un repertorio de pausas transferibles a casos reales.</w:t>
-      </w:r>
-    </w:p>
-    <w:p>
-      <w:pPr>
-        <w:pStyle w:val="BodyJ"/>
-      </w:pPr>
-      <w:r>
-        <w:t xml:space="preserve">Las instituciones aprenden cuando conservan no sólo resultados, sino trayectorias de decisión. Auditorías, reuniones clínicas y sistemas de reporte deberían reconstruir qué información estaba disponible en cada momento y cómo circuló. Esa memoria protege contra el sesgo retrospectivo y permite transformar errores en cambios concretos de representación, coordinación o umbral.</w:t>
+        <w:t xml:space="preserve">La IA como espejo y provocación filosófica</w:t>
+      </w:r>
+    </w:p>
+    <w:p>
+      <w:pPr>
+        <w:pStyle w:val="BodyJ"/>
+      </w:pPr>
+      <w:r>
+        <w:t xml:space="preserve">La IA revela que una frase puede conservar la forma externa del razonamiento sin tener acceso directo al evento. Esto obliga a recordar que la coherencia verbal nunca fue garantía suficiente. También muestra el valor del lenguaje como espacio de prueba: pedir alternativas, contraejemplos y explicitar incertidumbre puede mejorar la deliberación humana, aunque no vuelva verdadero al modelo.</w:t>
+      </w:r>
+    </w:p>
+    <w:p>
+      <w:pPr>
+        <w:pStyle w:val="Quote1"/>
+      </w:pPr>
+      <w:r>
+        <w:t xml:space="preserve">La IA puede ampliar el espacio de hipótesis; no puede asumir por sí sola la responsabilidad de transformar una hipótesis en conducta clínica.</w:t>
+      </w:r>
+    </w:p>
+    <w:p>
+      <w:pPr>
+        <w:pStyle w:val="BodyJ"/>
+      </w:pPr>
+      <w:r>
+        <w:t xml:space="preserve">Usada con disciplina, puede ser un instrumento metacognitivo externo. Usada por deferencia, puede reforzar el mismo error que pretendía corregir: convertir plausibilidad en certeza.</w:t>
+      </w:r>
+    </w:p>
+    <w:p>
+      <w:pPr>
+        <w:pStyle w:val="TallerHead"/>
+      </w:pPr>
+      <w:r>
+        <w:t xml:space="preserve">Taller 17. La autopsia de una respuesta</w:t>
+      </w:r>
+    </w:p>
+    <w:p>
+      <w:pPr>
+        <w:pStyle w:val="BodyJ"/>
+      </w:pPr>
+      <w:r>
+        <w:t xml:space="preserve">Tome un caso real ya resuelto de su servicio —debidamente anonimizado— y péguelo en un asistente de lenguaje pidiendo evaluación y plan. Imprima la respuesta y márquela con tres colores: (1) afirmaciones sustentadas en datos que el caso contenía; (2) contenido que el modelo agregó — detalles "típicos", causalidades, datos que nadie le dio; (3) incertidumbre declarada. Después, haga una segunda pregunta al modelo: "¿qué evidencia haría improbable tu diagnóstico principal?".</w:t>
+      </w:r>
+    </w:p>
+    <w:p>
+      <w:pPr>
+        <w:pStyle w:val="BodyJ"/>
+      </w:pPr>
+      <w:r>
+        <w:rPr>
+          <w:i/>
+          <w:iCs/>
+        </w:rPr>
+        <w:t xml:space="preserve">Solución comentada.</w:t>
+      </w:r>
+      <w:r>
+        <w:t xml:space="preserve"> En ejercicios docentes, tres hallazgos vuelven una y otra vez. Primero, el color 2 aparece más de lo esperado: el modelo rellena huecos con verosimilitud — una evolución "esperable", un factor de riesgo "presumible" — y esa es exactamente la definición de confabulación; contarlas cura más que leer sobre ellas. Segundo, el color 3 suele ser genérico ("se sugiere correlacionar con la clínica") y no específico del caso: incertidumbre de fórmula, no de contenido — compárela con la que exige el léxico de certeza. Tercero, la respuesta a la segunda pregunta suele ser mejor que la primera: el modelo enumera con soltura los datos que refutarían su propia propuesta — pero sólo si alguien se lo pide. La herramienta contiene su propio antídoto; la pregunta que lo libera sigue siendo humana.</w:t>
+      </w:r>
+    </w:p>
+    <w:p>
+      <w:pPr>
+        <w:pStyle w:val="EnUnaFrase"/>
+      </w:pPr>
+      <w:r>
+        <w:rPr>
+          <w:b/>
+          <w:bCs/>
+        </w:rPr>
+        <w:t xml:space="preserve">En una frase.</w:t>
+      </w:r>
+      <w:r>
+        <w:t xml:space="preserve"> La IA generativa produce exactamente aquello contra lo que este libro entrena: prosa fluida donde hechos, inferencias e incertidumbre llegan mezclados — auditarla con HII-D es el mismo ejercicio que auditar la propia escritura.</w:t>
+      </w:r>
+    </w:p>
+    <w:p>
+      <w:pPr>
+        <w:pStyle w:val="BodyJ"/>
+        <w:spacing w:after="80" w:before="160"/>
+      </w:pPr>
+      <w:r>
+        <w:rPr>
+          <w:b/>
+          <w:bCs/>
+        </w:rPr>
+        <w:t xml:space="preserve">Tres preguntas para la próxima visita.</w:t>
+      </w:r>
+    </w:p>
+    <w:p>
+      <w:pPr>
+        <w:pStyle w:val="BodyJ"/>
+        <w:numPr>
+          <w:ilvl w:val="0"/>
+          <w:numId w:val="26"/>
+        </w:numPr>
+      </w:pPr>
+      <w:r>
+        <w:t xml:space="preserve">Si uso IA en este caso, ¿qué dato de su respuesta verifiqué contra una fuente primaria antes de actuar?</w:t>
+      </w:r>
+    </w:p>
+    <w:p>
+      <w:pPr>
+        <w:pStyle w:val="BodyJ"/>
+        <w:numPr>
+          <w:ilvl w:val="0"/>
+          <w:numId w:val="26"/>
+        </w:numPr>
+      </w:pPr>
+      <w:r>
+        <w:t xml:space="preserve">¿Qué agregó el modelo que el caso no contenía?</w:t>
+      </w:r>
+    </w:p>
+    <w:p>
+      <w:pPr>
+        <w:pStyle w:val="BodyJ"/>
+        <w:numPr>
+          <w:ilvl w:val="0"/>
+          <w:numId w:val="26"/>
+        </w:numPr>
+      </w:pPr>
+      <w:r>
+        <w:t xml:space="preserve">¿Estoy usando la herramienta para ampliar hipótesis o para confirmar rápido la que ya tenía?</w:t>
+      </w:r>
+    </w:p>
+    <w:p>
+      <w:pPr>
+        <w:pStyle w:val="Heading2"/>
+        <w:pageBreakBefore/>
+        <w:spacing w:after="300" w:before="600"/>
+      </w:pPr>
+      <w:r>
+        <w:rPr>
+          <w:rFonts w:ascii="Georgia" w:cs="Georgia" w:eastAsia="Georgia" w:hAnsi="Georgia"/>
+          <w:b/>
+          <w:bCs/>
+          <w:color w:val="8C2F2F"/>
+          <w:sz w:val="22"/>
+          <w:szCs w:val="22"/>
+        </w:rPr>
+        <w:t xml:space="preserve">Capítulo 18</w:t>
+      </w:r>
+      <w:r>
+        <w:rPr>
+          <w:rFonts w:ascii="Georgia" w:cs="Georgia" w:eastAsia="Georgia" w:hAnsi="Georgia"/>
+          <w:b/>
+          <w:bCs/>
+          <w:color w:val="3D5A6C"/>
+          <w:sz w:val="32"/>
+          <w:szCs w:val="32"/>
+        </w:rPr>
+        <w:br/>
+        <w:t xml:space="preserve">La palabra exacta: lo que la poesía sabe del juicio clínico</w:t>
+      </w:r>
+    </w:p>
+    <w:p>
+      <w:pPr>
+        <w:pStyle w:val="BodyJ"/>
+      </w:pPr>
+      <w:r>
+        <w:t xml:space="preserve">Hay un momento que los tratados no describen y todo clínico conoce: tres hallazgos sueltos —una taquicardia sin fiebre, un abdomen que "no convence", una frase de la hija— se ordenan de golpe bajo una sola explicación, y algo hace clic. El placer de ese instante no es administrativo. Es físico, breve y sospechosamente parecido al de un verso que cae en su lugar. Este capítulo toma ese parecido en serio: no como adorno humanista, sino como información sobre cómo funciona —y cómo falla— el juicio.</w:t>
       </w:r>
     </w:p>
     <w:p>
@@ -12800,172 +13532,23 @@
           <w:sz w:val="25"/>
           <w:szCs w:val="25"/>
         </w:rPr>
-        <w:t xml:space="preserve">Una competencia profesional</w:t>
-      </w:r>
-    </w:p>
-    <w:p>
-      <w:pPr>
-        <w:pStyle w:val="BodyJ"/>
-      </w:pPr>
-      <w:r>
-        <w:t xml:space="preserve">La metacognición no reemplaza conocimiento, técnica ni ética. Los coordina. Puede enseñarse mediante casos contrastados, reflexión estructurada, práctica deliberada y feedback, pero no como asignatura aislada de la clínica (Sandars, 2009; Schmidt &amp; Mamede, 2015).</w:t>
-      </w:r>
-    </w:p>
-    <w:p>
-      <w:pPr>
-        <w:pStyle w:val="Quote1"/>
-      </w:pPr>
-      <w:r>
-        <w:t xml:space="preserve">Una organización clínica aprende cuando convierte las discrepancias entre lo pensado y lo ocurrido en información accesible, no en culpa silenciosa ni en relato retrospectivo perfecto.</w:t>
-      </w:r>
-    </w:p>
-    <w:p>
-      <w:pPr>
-        <w:pStyle w:val="BodyJ"/>
-      </w:pPr>
-      <w:r>
-        <w:t xml:space="preserve">La medicina del futuro necesitará profesionales capaces de trabajar con información creciente, equipos complejos e inteligencia artificial. La competencia decisiva no será sólo producir más respuestas, sino reconocer qué tipo de respuesta se está produciendo y qué evidencia le da derecho a orientar una acción.</w:t>
-      </w:r>
-    </w:p>
-    <w:p>
-      <w:pPr>
-        <w:pStyle w:val="BodyJ"/>
-      </w:pPr>
-      <w:r>
-        <w:t xml:space="preserve">Enseñar metacognición es enseñar una relación con el conocimiento: suficiente confianza para actuar, suficiente humildad para revisar y suficiente precisión para explicar por qué.</w:t>
-      </w:r>
-    </w:p>
-    <w:p>
-      <w:pPr>
-        <w:pStyle w:val="TallerHead"/>
-      </w:pPr>
-      <w:r>
-        <w:t xml:space="preserve">Taller 16. Rediseñar la ronda</w:t>
-      </w:r>
-    </w:p>
-    <w:p>
-      <w:pPr>
-        <w:pStyle w:val="BodyJ"/>
-      </w:pPr>
-      <w:r>
-        <w:t xml:space="preserve">Describa por escrito la ronda de su servicio tal como ocurre de verdad: minutos por paciente, quién habla, qué se pregunta siempre y qué no se pregunta nunca. Luego rediséñela con tres cambios como máximo —un disparador objetivo de pausa, una pregunta obligatoria por paciente inestable o incierto, una regla de pase de turno— y estime el costo en minutos por ronda.</w:t>
-      </w:r>
-    </w:p>
-    <w:p>
-      <w:pPr>
-        <w:pStyle w:val="BodyJ"/>
-      </w:pPr>
-      <w:r>
-        <w:rPr>
-          <w:i/>
-          <w:iCs/>
-        </w:rPr>
-        <w:t xml:space="preserve">Solución comentada.</w:t>
-      </w:r>
-      <w:r>
-        <w:t xml:space="preserve"> A modo de ejemplo, una descripción honesta puede parecerse a esto: dos a cuatro minutos por paciente, habla quien presenta y decide quien dirige, se pregunta "¿cómo está?" y "¿qué le falta?", y casi nunca "¿qué nos haría cambiar?". El rediseño más barato es esa tercera pregunta, hecha sólo a los pacientes que cumplen un disparador (reconsulta, discordancia entre gravedad y diagnóstico, 72 horas sin discusión): cuesta alrededor de un minuto por caso seleccionado y produce, de inmediato, criterios de reapertura que antes no existían. Si el rediseño necesita más de tres cambios o más de diez minutos por ronda, probablemente está diseñando una reunión nueva en lugar de mejorar la que existe — y las reuniones nuevas mueren por inasistencia.</w:t>
-      </w:r>
-    </w:p>
-    <w:p>
-      <w:pPr>
-        <w:pStyle w:val="EnUnaFrase"/>
-      </w:pPr>
-      <w:r>
-        <w:rPr>
-          <w:b/>
-          <w:bCs/>
-        </w:rPr>
-        <w:t xml:space="preserve">En una frase.</w:t>
-      </w:r>
-      <w:r>
-        <w:t xml:space="preserve"> La metacognición clínica se enseña con representaciones y feedback, y se organiza con rondas, fichas y revisiones diseñadas para hacer visible el pensamiento — no se decreta.</w:t>
-      </w:r>
-    </w:p>
-    <w:p>
-      <w:pPr>
-        <w:pStyle w:val="BodyJ"/>
-        <w:spacing w:after="80" w:before="160"/>
-      </w:pPr>
-      <w:r>
-        <w:rPr>
-          <w:b/>
-          <w:bCs/>
-        </w:rPr>
-        <w:t xml:space="preserve">Tres preguntas para la próxima visita.</w:t>
-      </w:r>
-    </w:p>
-    <w:p>
-      <w:pPr>
-        <w:pStyle w:val="BodyJ"/>
-        <w:numPr>
-          <w:ilvl w:val="0"/>
-          <w:numId w:val="24"/>
-        </w:numPr>
-      </w:pPr>
-      <w:r>
-        <w:t xml:space="preserve">La última vez que enseñé un caso, ¿pedí el diagnóstico o pedí primero la representación del problema?</w:t>
-      </w:r>
-    </w:p>
-    <w:p>
-      <w:pPr>
-        <w:pStyle w:val="BodyJ"/>
-        <w:numPr>
-          <w:ilvl w:val="0"/>
-          <w:numId w:val="24"/>
-        </w:numPr>
-      </w:pPr>
-      <w:r>
-        <w:t xml:space="preserve">¿Qué pasó con el último paciente que derivé o di de alta con diagnóstico incierto — y cómo podría enterarme sistemáticamente?</w:t>
-      </w:r>
-    </w:p>
-    <w:p>
-      <w:pPr>
-        <w:pStyle w:val="BodyJ"/>
-        <w:numPr>
-          <w:ilvl w:val="0"/>
-          <w:numId w:val="24"/>
-        </w:numPr>
-      </w:pPr>
-      <w:r>
-        <w:t xml:space="preserve">Si mañana dirigiera mi servicio, ¿cuál de las tres palancas (ronda, ficha, revisión de errores) cambiaría primero, y qué costaría?</w:t>
-      </w:r>
-    </w:p>
-    <w:p>
-      <w:pPr>
-        <w:pStyle w:val="Heading2"/>
-        <w:pageBreakBefore/>
-        <w:spacing w:after="300" w:before="600"/>
-      </w:pPr>
-      <w:r>
-        <w:rPr>
-          <w:rFonts w:ascii="Georgia" w:cs="Georgia" w:eastAsia="Georgia" w:hAnsi="Georgia"/>
-          <w:b/>
-          <w:bCs/>
-          <w:color w:val="8C2F2F"/>
-          <w:sz w:val="22"/>
-          <w:szCs w:val="22"/>
-        </w:rPr>
-        <w:t xml:space="preserve">Capítulo 17</w:t>
-      </w:r>
-      <w:r>
-        <w:rPr>
-          <w:rFonts w:ascii="Georgia" w:cs="Georgia" w:eastAsia="Georgia" w:hAnsi="Georgia"/>
-          <w:b/>
-          <w:bCs/>
-          <w:color w:val="3D5A6C"/>
-          <w:sz w:val="32"/>
-          <w:szCs w:val="32"/>
-        </w:rPr>
-        <w:br/>
-        <w:t xml:space="preserve">La inteligencia artificial en el proceso clínico: roles, riesgos y defensas</w:t>
-      </w:r>
-    </w:p>
-    <w:p>
-      <w:pPr>
-        <w:pStyle w:val="BodyJ"/>
-      </w:pPr>
-      <w:r>
-        <w:t xml:space="preserve">Un residente pega la historia de un paciente en un asistente de lenguaje y recibe, en ocho segundos, una evaluación impecablemente redactada: diagnóstico probable, diferenciales ordenados, plan sugerido. Todo suena verosímil. Este capítulo hace tres preguntas, en orden: qué puede hacer realmente esta tecnología en el proceso diagnóstico y terapéutico; qué riesgos trae — no en abstracto, sino con la evidencia ya disponible—; y cómo enfrentarlos sin renunciar a la herramienta ni al juicio. Y sostiene una tesis transversal: casi ninguno de estos riesgos es nuevo. Cada uno es un sesgo que este libro ya describió, ahora con amplificador.</w:t>
+        <w:t xml:space="preserve">Dos oficios de la conexión</w:t>
+      </w:r>
+    </w:p>
+    <w:p>
+      <w:pPr>
+        <w:pStyle w:val="BodyJ"/>
+      </w:pPr>
+      <w:r>
+        <w:t xml:space="preserve">El poeta trabaja buscando conexiones: entre palabras, entre una palabra y un sentido que todavía no tiene nombre, entre el sonido y aquello que el sonido vuelve visible. Su estado mental característico combina atención flotante, oído para lo que no encaja y una disposición rara: dejar que el material mande sobre el plan. El clínico que razona bien trabaja igual, con otros materiales: entre el hallazgo y el mecanismo, entre el mecanismo y la intervención que estabiliza, busca la conexión que convierta fragmentos en un caso inteligible.</w:t>
+      </w:r>
+    </w:p>
+    <w:p>
+      <w:pPr>
+        <w:pStyle w:val="BodyJ"/>
+      </w:pPr>
+      <w:r>
+        <w:t xml:space="preserve">El parentesco es lógico antes que sentimental. Una metáfora es la hipótesis de que dos cosas lejanas comparten estructura; un diagnóstico es una metáfora que acepta ser puesta a prueba — "este cuadro es una colecistitis" apuesta a que lo que ocurre en este cuerpo comparte estructura con un patrón aprendido. Ambos movimientos son la abducción del capítulo 2, y ambos requieren el estado que este libro llamó humildad en funciones: sostener la conjetura con fuerza suficiente para trabajarla y soltura suficiente para dejarla caer. Bohm lo dijo desde la física: el acto creativo central —percibir un orden nuevo en lo que ya estaba a la vista— es el mismo en el arte y en la ciencia; cambian los materiales y el tribunal (Bohm, 1996).</w:t>
       </w:r>
     </w:p>
     <w:p>
@@ -12982,970 +13565,6 @@
           <w:sz w:val="25"/>
           <w:szCs w:val="25"/>
         </w:rPr>
-        <w:t xml:space="preserve">Lenguaje plausible y verdad</w:t>
-      </w:r>
-    </w:p>
-    <w:p>
-      <w:pPr>
-        <w:pStyle w:val="BodyJ"/>
-      </w:pPr>
-      <w:r>
-        <w:t xml:space="preserve">Los grandes modelos de lenguaje generan continuaciones plausibles a partir de patrones aprendidos en enormes corpus. Su fluidez puede producir respuestas clínicamente útiles, pero también afirmaciones falsas presentadas con coherencia. La literatura denomina hallucination a contenido no sustentado o inconsistente con la fuente o el mundo (Ji et al., 2023). El término es metafórico: el modelo no tiene una experiencia perceptiva que se desorganice como en la alucinación humana.</w:t>
-      </w:r>
-    </w:p>
-    <w:p>
-      <w:pPr>
-        <w:pStyle w:val="BodyJ"/>
-      </w:pPr>
-      <w:r>
-        <w:t xml:space="preserve">La medicina reconoce el peligro porque también trabaja con narrativas plausibles. Un clínico puede completar huecos, atribuir causalidad o recordar un dato de manera congruente con su hipótesis. La semejanza no implica identidad. El médico posee cuerpo, responsabilidad, acceso al paciente, experiencia situada y capacidad de actuar; el modelo manipula representaciones lingüísticas y depende del contexto que recibe.</w:t>
-      </w:r>
-    </w:p>
-    <w:p>
-      <w:pPr>
-        <w:pStyle w:val="Heading3"/>
-        <w:spacing w:after="120" w:before="280"/>
-      </w:pPr>
-      <w:r>
-        <w:rPr>
-          <w:rFonts w:ascii="Georgia" w:cs="Georgia" w:eastAsia="Georgia" w:hAnsi="Georgia"/>
-          <w:b/>
-          <w:bCs/>
-          <w:color w:val="2B2B2B"/>
-          <w:sz w:val="25"/>
-          <w:szCs w:val="25"/>
-        </w:rPr>
-        <w:t xml:space="preserve">El rol en el proceso diagnóstico</w:t>
-      </w:r>
-    </w:p>
-    <w:p>
-      <w:pPr>
-        <w:pStyle w:val="BodyJ"/>
-      </w:pPr>
-      <w:r>
-        <w:t xml:space="preserve">Los sistemas actuales hacen bien tareas delimitadas de reconocimiento: señalar pólipos durante una colonoscopía, priorizar radiografías con probable neumotórax, graduar una retinopatía diabética. En esas tareas el patrón está en la imagen y el estándar de referencia es relativamente estable. Los modelos de lenguaje agregaron otra capa: generan diferenciales, resumen historias y responden preguntas clínicas con un conocimiento médico codificado que, en exámenes y casos seleccionados, alcanza rendimiento alto (Singhal et al., 2023; Lee et al., 2023).</w:t>
-      </w:r>
-    </w:p>
-    <w:p>
-      <w:pPr>
-        <w:pStyle w:val="BodyJ"/>
-      </w:pPr>
-      <w:r>
-        <w:t xml:space="preserve">Pero el dato más instructivo sobre el rol diagnóstico real es otro: un ensayo aleatorizado entregó a internistas un modelo de lenguaje como apoyo para resolver casos clínicos. El grupo con el modelo no diagnosticó mejor que el grupo sin él — y el modelo solo, sin médico, superó a ambos (Goh et al., 2024). La lectura fácil ("la máquina ya es mejor") pasa por alto la lección metacognitiva: el eslabón débil no fue el modelo ni el médico, sino la conversación entre ambos. Los clínicos usaron la herramienta como oráculo de confirmación — pegarle el caso y mirar si coincide con lo que ya pensaban — en vez de usarla para lo que mejor hace: ampliar el espacio de hipótesis, proponer el contraejemplo, señalar el dato que no encaja. El capítulo 2 mostró que la generación de alternativas es el momento creativo del diagnóstico; usada ahí, la IA es un multiplicador. Usada como confirmadora rápida, es un espejo del anclaje.</w:t>
-      </w:r>
-    </w:p>
-    <w:p>
-      <w:pPr>
-        <w:pStyle w:val="Heading3"/>
-        <w:spacing w:after="120" w:before="280"/>
-      </w:pPr>
-      <w:r>
-        <w:rPr>
-          <w:rFonts w:ascii="Georgia" w:cs="Georgia" w:eastAsia="Georgia" w:hAnsi="Georgia"/>
-          <w:b/>
-          <w:bCs/>
-          <w:color w:val="2B2B2B"/>
-          <w:sz w:val="25"/>
-          <w:szCs w:val="25"/>
-        </w:rPr>
-        <w:t xml:space="preserve">El rol en el proceso terapéutico</w:t>
-      </w:r>
-    </w:p>
-    <w:p>
-      <w:pPr>
-        <w:pStyle w:val="BodyJ"/>
-      </w:pPr>
-      <w:r>
-        <w:t xml:space="preserve">En la terapéutica la IA llega antes y por caminos menos visibles: alertas de deterioro, predictores de sepsis, sugerencias de dosis, detección de interacciones, estratificaciones de riesgo que deciden quién entra a un programa de cuidados. Aquí la evidencia ya dejó una parábola completa. Un modelo propietario de predicción de sepsis, desplegado en cientos de hospitales, fue validado externamente recién después de su adopción masiva: discriminaba mal, calibraba peor y generaba una carga de alertas capaz de fatigar a cualquier equipo (Wong et al., 2021). La falla profunda no fue estadística sino epistemológica: el sistema se adoptó sin exigirle la evidencia local que este libro pide para cualquier afirmación — ¿funciona aquí, con estos pacientes, con esta prevalencia? Es la lección de la Parte III aplicada al software: una herramienta no hereda la validez de su marca, y la validación externa no es un trámite — es la diferencia entre una alerta y un ruido.</w:t>
-      </w:r>
-    </w:p>
-    <w:p>
-      <w:pPr>
-        <w:pStyle w:val="BodyJ"/>
-      </w:pPr>
-      <w:r>
-        <w:t xml:space="preserve">Hay un segundo límite terapéutico más silencioso. Una recomendación de intervención generada por IA opera sobre lo que está escrito, y el capítulo 10 mostró que lo menos escrito de la ficha es precisamente el contexto global — funcionalidad basal, pronóstico de fondo, red de apoyo, fines del paciente. Un sistema que no ve esos hechos no puede ponderarlos: recomendará la intervención "indicada" para la enfermedad documentada, que es exactamente el error de la indicación aislada. La IA no exime del cruce con la bioética; lo vuelve más urgente, porque automatiza la mitad técnica del razonamiento y deja la otra mitad — la que juzga si la intervención es proporcionada para este enfermo — enteramente del lado humano.</w:t>
-      </w:r>
-    </w:p>
-    <w:p>
-      <w:pPr>
-        <w:pStyle w:val="Heading3"/>
-        <w:spacing w:after="120" w:before="280"/>
-      </w:pPr>
-      <w:r>
-        <w:rPr>
-          <w:rFonts w:ascii="Georgia" w:cs="Georgia" w:eastAsia="Georgia" w:hAnsi="Georgia"/>
-          <w:b/>
-          <w:bCs/>
-          <w:color w:val="2B2B2B"/>
-          <w:sz w:val="25"/>
-          <w:szCs w:val="25"/>
-        </w:rPr>
-        <w:t xml:space="preserve">Competencia sin garantía</w:t>
-      </w:r>
-    </w:p>
-    <w:p>
-      <w:pPr>
-        <w:pStyle w:val="BodyJ"/>
-      </w:pPr>
-      <w:r>
-        <w:t xml:space="preserve">Estudios han mostrado que modelos avanzados codifican conocimiento médico y alcanzan alto rendimiento en preguntas y casos seleccionados (Singhal et al., 2023). Lee, Bubeck y Petro describieron beneficios potenciales junto con límites y riesgos de GPT-4 en medicina (Lee et al., 2023). El rendimiento promedio no garantiza confiabilidad en un caso individual, especialmente cuando faltan datos, hay ambigüedad o la tarea exige conocimiento local. Y las consecuencias no intencionadas del aprendizaje automático en medicina —desde la automatización de sesgos presentes en los datos hasta la erosión de habilidades por deferencia— han sido advertidas desde antes de los modelos generativos (Cabitza et al., 2017).</w:t>
-      </w:r>
-    </w:p>
-    <w:p>
-      <w:pPr>
-        <w:pStyle w:val="BodyJ"/>
-      </w:pPr>
-      <w:r>
-        <w:t xml:space="preserve">La fluidez aumenta el riesgo de automatización: el usuario puede aceptar una respuesta porque está bien estructurada. El problema es metacognitivo. La confianza percibida en el lenguaje no informa necesariamente la probabilidad de corrección. La IA puede parecer mejor calibrada de lo que está.</w:t>
-      </w:r>
-    </w:p>
-    <w:p>
-      <w:pPr>
-        <w:pStyle w:val="Heading3"/>
-        <w:spacing w:after="120" w:before="280"/>
-      </w:pPr>
-      <w:r>
-        <w:rPr>
-          <w:rFonts w:ascii="Georgia" w:cs="Georgia" w:eastAsia="Georgia" w:hAnsi="Georgia"/>
-          <w:b/>
-          <w:bCs/>
-          <w:color w:val="2B2B2B"/>
-          <w:sz w:val="25"/>
-          <w:szCs w:val="25"/>
-        </w:rPr>
-        <w:t xml:space="preserve">El catálogo de riesgos</w:t>
-      </w:r>
-    </w:p>
-    <w:p>
-      <w:pPr>
-        <w:pStyle w:val="BodyJ"/>
-      </w:pPr>
-      <w:r>
-        <w:t xml:space="preserve">Los riesgos de la IA clínica ya no son especulación; tienen literatura propia. Conviene tenerlos en catálogo, con su parentesco epistémico a la vista:</w:t>
-      </w:r>
-    </w:p>
-    <w:p>
-      <w:pPr>
-        <w:pStyle w:val="BodyJ"/>
-        <w:numPr>
-          <w:ilvl w:val="0"/>
-          <w:numId w:val="6"/>
-        </w:numPr>
-      </w:pPr>
-      <w:r>
-        <w:rPr>
-          <w:b/>
-          <w:bCs/>
-        </w:rPr>
-        <w:t xml:space="preserve">Confabulación.</w:t>
-      </w:r>
-      <w:r>
-        <w:t xml:space="preserve"> Contenido no sustentado presentado con coherencia (Ji et al., 2023). Es la certeza retórica industrializada: prosa donde los hechos, las inferencias y lo inventado llegan con la misma sintaxis.</w:t>
-      </w:r>
-    </w:p>
-    <w:p>
-      <w:pPr>
-        <w:pStyle w:val="BodyJ"/>
-        <w:numPr>
-          <w:ilvl w:val="0"/>
-          <w:numId w:val="6"/>
-        </w:numPr>
-      </w:pPr>
-      <w:r>
-        <w:rPr>
-          <w:b/>
-          <w:bCs/>
-        </w:rPr>
-        <w:t xml:space="preserve">Sesgo de automatización.</w:t>
-      </w:r>
-      <w:r>
-        <w:t xml:space="preserve"> La tendencia a aceptar la salida de un sistema por venir de un sistema, documentada en los apoyos a la decisión clínica desde mucho antes de los modelos generativos: los sistemas corrigen errores humanos e introducen errores nuevos — el usuario que habría acertado solo y se equivoca por deferencia (Goddard et al., 2012). La versión de la era de los modelos de lenguaje ya tiene ensayo aleatorizado: médicos que habían completado veinte horas de alfabetización en IA, expuestos a recomendaciones de un modelo con errores deliberados, perdieron catorce puntos de exactitud diagnóstica frente a quienes recibieron recomendaciones correctas (Qazi et al., 2026). La alfabetización general no inmuniza; la vigilancia caso a caso no se delega en un curso. Es el anclaje más la autoridad no interrogada, con interfaz.</w:t>
-      </w:r>
-    </w:p>
-    <w:p>
-      <w:pPr>
-        <w:pStyle w:val="BodyJ"/>
-        <w:numPr>
-          <w:ilvl w:val="0"/>
-          <w:numId w:val="6"/>
-        </w:numPr>
-      </w:pPr>
-      <w:r>
-        <w:rPr>
-          <w:b/>
-          <w:bCs/>
-        </w:rPr>
-        <w:t xml:space="preserve">Atrofia de la pericia.</w:t>
-      </w:r>
-      <w:r>
-        <w:t xml:space="preserve"> La evidencia más inquietante es reciente: endoscopistas expuestos durante meses a la detección asistida de pólipos detectaron significativamente menos adenomas al volver a trabajar sin asistencia — seis puntos absolutos menos que antes de la exposición (Budzyń et al., 2025). La pericia perceptual se mantiene con práctica; si la máquina practica por nosotros, la cuenta llega en la primera guardia sin máquina.</w:t>
-      </w:r>
-    </w:p>
-    <w:p>
-      <w:pPr>
-        <w:pStyle w:val="BodyJ"/>
-        <w:numPr>
-          <w:ilvl w:val="0"/>
-          <w:numId w:val="6"/>
-        </w:numPr>
-      </w:pPr>
-      <w:r>
-        <w:rPr>
-          <w:b/>
-          <w:bCs/>
-        </w:rPr>
-        <w:t xml:space="preserve">Sesgo algorítmico.</w:t>
-      </w:r>
-      <w:r>
-        <w:t xml:space="preserve"> Un algoritmo aplicado a millones de pacientes en Estados Unidos asignaba menos cuidados a pacientes negros igual de enfermos, porque fue entrenado para predecir gasto sanitario como sustituto de necesidad — y en poblaciones históricamente subatendidas se gasta menos (Obermeyer et al., 2019). El error no estaba en la matemática sino en la elección del sustituto: la carga teórica de la observación del capítulo 1, a escala poblacional. Ningún dato de entrenamiento es neutro; alguien decidió qué medir.</w:t>
-      </w:r>
-    </w:p>
-    <w:p>
-      <w:pPr>
-        <w:pStyle w:val="BodyJ"/>
-        <w:numPr>
-          <w:ilvl w:val="0"/>
-          <w:numId w:val="6"/>
-        </w:numPr>
-      </w:pPr>
-      <w:r>
-        <w:rPr>
-          <w:b/>
-          <w:bCs/>
-        </w:rPr>
-        <w:t xml:space="preserve">Sobreconfianza no calibrada.</w:t>
-      </w:r>
-      <w:r>
-        <w:t xml:space="preserve"> La confianza verbalizada de los modelos tiende a la sobreconfianza sistemática (Kadavath et al., 2022; Xiong et al., 2024): el "estoy bastante seguro" del modelo es tono, no calibración — la sobreconfianza humana, sin siquiera un historial propio de errores que la eduque.</w:t>
-      </w:r>
-    </w:p>
-    <w:p>
-      <w:pPr>
-        <w:pStyle w:val="BodyJ"/>
-        <w:numPr>
-          <w:ilvl w:val="0"/>
-          <w:numId w:val="6"/>
-        </w:numPr>
-      </w:pPr>
-      <w:r>
-        <w:rPr>
-          <w:b/>
-          <w:bCs/>
-        </w:rPr>
-        <w:t xml:space="preserve">Degradación silenciosa.</w:t>
-      </w:r>
-      <w:r>
-        <w:t xml:space="preserve"> Los modelos se despliegan sobre poblaciones que cambian: prevalencias, prácticas, codificaciones. El rendimiento decae sin anunciarse, porque el software no siente que está fallando. Sin monitoreo activo, la validación de ayer es la superstición de mañana.</w:t>
-      </w:r>
-    </w:p>
-    <w:p>
-      <w:pPr>
-        <w:pStyle w:val="BodyJ"/>
-      </w:pPr>
-      <w:r>
-        <w:t xml:space="preserve">La columna vertebral del catálogo es una sola observación: la IA no introdujo errores nuevos en la medicina. Automatizó los que ya teníamos y les quitó los frenos naturales — la lentitud, la duda, el cansancio que a veces obligaba a pedir ayuda.</w:t>
-      </w:r>
-    </w:p>
-    <w:p>
-      <w:pPr>
-        <w:pStyle w:val="Heading3"/>
-        <w:spacing w:after="120" w:before="280"/>
-      </w:pPr>
-      <w:r>
-        <w:rPr>
-          <w:rFonts w:ascii="Georgia" w:cs="Georgia" w:eastAsia="Georgia" w:hAnsi="Georgia"/>
-          <w:b/>
-          <w:bCs/>
-          <w:color w:val="2B2B2B"/>
-          <w:sz w:val="25"/>
-          <w:szCs w:val="25"/>
-        </w:rPr>
-        <w:t xml:space="preserve">El riesgo de fondo: la formación del razonador</w:t>
-      </w:r>
-    </w:p>
-    <w:p>
-      <w:pPr>
-        <w:pStyle w:val="BodyJ"/>
-      </w:pPr>
-      <w:r>
-        <w:t xml:space="preserve">Hay un riesgo más lento que todos los del catálogo, y puede importar más: el efecto de la IA sobre quien todavía está aprendiendo a razonar. La educación médica ya le puso nombres a la tríada (Abdulnour et al., 2025): </w:t>
-      </w:r>
-      <w:r>
-        <w:rPr>
-          <w:i/>
-          <w:iCs/>
-        </w:rPr>
-        <w:t xml:space="preserve">deskilling</w:t>
-      </w:r>
-      <w:r>
-        <w:t xml:space="preserve"> — sé razonar, delego repetidamente, dejo de ejercitar, la capacidad se deteriora—; </w:t>
-      </w:r>
-      <w:r>
-        <w:rPr>
-          <w:i/>
-          <w:iCs/>
-        </w:rPr>
-        <w:t xml:space="preserve">never-skilling</w:t>
-      </w:r>
-      <w:r>
-        <w:t xml:space="preserve"> — la IA estuvo disponible desde el inicio de la formación, la operación cognitiva nunca se ejecutó las veces necesarias, la competencia nunca se consolidó—; y </w:t>
-      </w:r>
-      <w:r>
-        <w:rPr>
-          <w:i/>
-          <w:iCs/>
-        </w:rPr>
-        <w:t xml:space="preserve">mis-skilling</w:t>
-      </w:r>
-      <w:r>
-        <w:t xml:space="preserve"> — se aprendió, pero patrones incorrectos, imitando salidas que nadie auditaba—. El segundo es el más grave porque es invisible: la habilidad perdida deja un recuerdo y una alarma; la que nunca se construyó no deja nada que echar de menos.</w:t>
-      </w:r>
-    </w:p>
-    <w:p>
-      <w:pPr>
-        <w:pStyle w:val="BodyJ"/>
-      </w:pPr>
-      <w:r>
-        <w:t xml:space="preserve">El mecanismo es preciso, y una parte de este libro ya lo había descrito sin nombrar la IA. Escribir la nota clínica no es registrar un pensamiento terminado: seleccionar qué dato importa, jerarquizarlo y estructurarlo es parte del proceso mismo de pensar — la tesis del capítulo 12, la ficha como instrumento de pensamiento. Por eso la automatización completa de la escritura clínica no ahorra sólo tiempo: puede eliminar la instancia en la que el clínico construye su razonamiento, degradando el registro y al registrador a la vez (McCoy et al., 2024). La ecuación merece escribirse entera: ahorro de trabajo cognitivo inmediato, a cambio de las operaciones mediante las cuales se construye la competencia.</w:t>
-      </w:r>
-    </w:p>
-    <w:p>
-      <w:pPr>
-        <w:pStyle w:val="BodyJ"/>
-      </w:pPr>
-      <w:r>
-        <w:t xml:space="preserve">Hay un tercer fenómeno que ni siquiera exige que la IA se equivoque: la captura cognitiva. Quien ve primero la respuesta del modelo ya no genera hipótesis desde el caso: su búsqueda de alternativas, su lectura de los datos y su ponderación posterior quedan condicionadas por lo que ya leyó — el anclaje de siempre, con la diferencia de que aquí el ancla puede llegar antes que el paciente. Una IA excelente que entrega demasiado pronto la hipótesis, la síntesis o la inferencia que el aprendiz debía producir no daña la respuesta de hoy; daña la arquitectura del aprendizaje. Porque el valor cognitivo de un caso no está sólo en llegar a la conclusión correcta: está en ejecutar las operaciones que permiten llegar a ella, revisarla y, cuando corresponde, abandonarla. Una herramienta que aumenta el porcentaje de respuestas correctas puede, paradójicamente, mejorar el desempeño de hoy mientras empeora al razonador de mañana.</w:t>
-      </w:r>
-    </w:p>
-    <w:p>
-      <w:pPr>
-        <w:pStyle w:val="BodyJ"/>
-      </w:pPr>
-      <w:r>
-        <w:t xml:space="preserve">La aviación conoce esta trampa con nombre propio: la paradoja de la automatización — cuanto más competente es el sistema, menos ejercita el humano las habilidades necesarias para detectar cuándo falla, que es exactamente cuando más se lo necesita (Abdulnour et al., 2026). La respuesta pedagógica propuesta frente a ella coincide, casi palabra por palabra, con la disciplina de este libro: razonar primero de forma independiente, consultar después, y usar la IA para desafiar, ampliar o refinar ese razonamiento — nunca para reemplazar su ejecución.</w:t>
-      </w:r>
-    </w:p>
-    <w:p>
-      <w:pPr>
-        <w:pStyle w:val="Heading3"/>
-        <w:spacing w:after="120" w:before="280"/>
-      </w:pPr>
-      <w:r>
-        <w:rPr>
-          <w:rFonts w:ascii="Georgia" w:cs="Georgia" w:eastAsia="Georgia" w:hAnsi="Georgia"/>
-          <w:b/>
-          <w:bCs/>
-          <w:color w:val="2B2B2B"/>
-          <w:sz w:val="25"/>
-          <w:szCs w:val="25"/>
-        </w:rPr>
-        <w:t xml:space="preserve">Cómo enfrentarlos: las defensas del clínico</w:t>
-      </w:r>
-    </w:p>
-    <w:p>
-      <w:pPr>
-        <w:pStyle w:val="BodyJ"/>
-      </w:pPr>
-      <w:r>
-        <w:t xml:space="preserve">La primera defensa ya está en este libro. El clínico responsable puede distinguir "lo vi", "lo infiero" y "no lo sé"; un modelo suele mezclar esas capas si nadie le exige separación, y puede transformar ausencia de información en un detalle probable, porque su objetivo generativo favorece la continuidad. La matriz HII-D funciona entonces como protocolo de auditoría de cualquier salida de IA:</w:t>
-      </w:r>
-    </w:p>
-    <w:p>
-      <w:pPr>
-        <w:pStyle w:val="BodyJ"/>
-        <w:numPr>
-          <w:ilvl w:val="0"/>
-          <w:numId w:val="6"/>
-        </w:numPr>
-      </w:pPr>
-      <w:r>
-        <w:t xml:space="preserve">¿qué hechos provienen realmente del caso?;</w:t>
-      </w:r>
-    </w:p>
-    <w:p>
-      <w:pPr>
-        <w:pStyle w:val="BodyJ"/>
-        <w:numPr>
-          <w:ilvl w:val="0"/>
-          <w:numId w:val="6"/>
-        </w:numPr>
-      </w:pPr>
-      <w:r>
-        <w:t xml:space="preserve">¿qué información agregó el modelo?;</w:t>
-      </w:r>
-    </w:p>
-    <w:p>
-      <w:pPr>
-        <w:pStyle w:val="BodyJ"/>
-        <w:numPr>
-          <w:ilvl w:val="0"/>
-          <w:numId w:val="6"/>
-        </w:numPr>
-      </w:pPr>
-      <w:r>
-        <w:t xml:space="preserve">¿qué inferencias formula y con qué respaldo?;</w:t>
-      </w:r>
-    </w:p>
-    <w:p>
-      <w:pPr>
-        <w:pStyle w:val="BodyJ"/>
-        <w:numPr>
-          <w:ilvl w:val="0"/>
-          <w:numId w:val="6"/>
-        </w:numPr>
-      </w:pPr>
-      <w:r>
-        <w:t xml:space="preserve">¿qué incertidumbres omitió?;</w:t>
-      </w:r>
-    </w:p>
-    <w:p>
-      <w:pPr>
-        <w:pStyle w:val="BodyJ"/>
-        <w:numPr>
-          <w:ilvl w:val="0"/>
-          <w:numId w:val="6"/>
-        </w:numPr>
-      </w:pPr>
-      <w:r>
-        <w:t xml:space="preserve">¿qué decisión propone y cuáles serían sus riesgos?;</w:t>
-      </w:r>
-    </w:p>
-    <w:p>
-      <w:pPr>
-        <w:pStyle w:val="BodyJ"/>
-        <w:numPr>
-          <w:ilvl w:val="0"/>
-          <w:numId w:val="6"/>
-        </w:numPr>
-      </w:pPr>
-      <w:r>
-        <w:t xml:space="preserve">¿qué fuente primaria permite verificar la afirmación?</w:t>
-      </w:r>
-    </w:p>
-    <w:p>
-      <w:pPr>
-        <w:pStyle w:val="BodyJ"/>
-      </w:pPr>
-      <w:r>
-        <w:t xml:space="preserve">De esa auditoría se desprenden reglas de uso que caben en una tarjeta:</w:t>
-      </w:r>
-    </w:p>
-    <w:p>
-      <w:pPr>
-        <w:pStyle w:val="BodyJ"/>
-        <w:numPr>
-          <w:ilvl w:val="0"/>
-          <w:numId w:val="25"/>
-        </w:numPr>
-      </w:pPr>
-      <w:r>
-        <w:rPr>
-          <w:b/>
-          <w:bCs/>
-        </w:rPr>
-        <w:t xml:space="preserve">Razonar antes de consultar.</w:t>
-      </w:r>
-      <w:r>
-        <w:t xml:space="preserve"> Formular la propia hipótesis y el propio plan antes de abrir el asistente: la respuesta vista primero captura la búsqueda posterior. La IA se usa contra un borrador propio, no en su lugar.</w:t>
-      </w:r>
-    </w:p>
-    <w:p>
-      <w:pPr>
-        <w:pStyle w:val="BodyJ"/>
-        <w:numPr>
-          <w:ilvl w:val="0"/>
-          <w:numId w:val="25"/>
-        </w:numPr>
-      </w:pPr>
-      <w:r>
-        <w:rPr>
-          <w:b/>
-          <w:bCs/>
-        </w:rPr>
-        <w:t xml:space="preserve">Verificar la afirmación decisiva contra una fuente primaria antes de actuar.</w:t>
-      </w:r>
-      <w:r>
-        <w:t xml:space="preserve"> No todas: la decisiva — la que, de ser falsa, cambia la conducta.</w:t>
-      </w:r>
-    </w:p>
-    <w:p>
-      <w:pPr>
-        <w:pStyle w:val="BodyJ"/>
-        <w:numPr>
-          <w:ilvl w:val="0"/>
-          <w:numId w:val="25"/>
-        </w:numPr>
-      </w:pPr>
-      <w:r>
-        <w:rPr>
-          <w:b/>
-          <w:bCs/>
-        </w:rPr>
-        <w:t xml:space="preserve">Usar la herramienta para abrir, no para cerrar.</w:t>
-      </w:r>
-      <w:r>
-        <w:t xml:space="preserve"> Pedir alternativas, contraejemplos y "qué no encaja con este diagnóstico" aprovecha exactamente lo que el ensayo de Goh mostró que desaprovechamos; pedirle confirmación de la hipótesis propia industrializa el anclaje.</w:t>
-      </w:r>
-    </w:p>
-    <w:p>
-      <w:pPr>
-        <w:pStyle w:val="BodyJ"/>
-        <w:numPr>
-          <w:ilvl w:val="0"/>
-          <w:numId w:val="25"/>
-        </w:numPr>
-      </w:pPr>
-      <w:r>
-        <w:rPr>
-          <w:b/>
-          <w:bCs/>
-        </w:rPr>
-        <w:t xml:space="preserve">Tratar su confianza como tono, no como evidencia.</w:t>
-      </w:r>
-      <w:r>
-        <w:t xml:space="preserve"> La seguridad de la prosa no informa la probabilidad de corrección — igual que la seguridad de un colega no sustituye sus razones.</w:t>
-      </w:r>
-    </w:p>
-    <w:p>
-      <w:pPr>
-        <w:pStyle w:val="BodyJ"/>
-        <w:numPr>
-          <w:ilvl w:val="0"/>
-          <w:numId w:val="25"/>
-        </w:numPr>
-      </w:pPr>
-      <w:r>
-        <w:rPr>
-          <w:b/>
-          <w:bCs/>
-        </w:rPr>
-        <w:t xml:space="preserve">Nunca pegar y firmar.</w:t>
-      </w:r>
-      <w:r>
-        <w:t xml:space="preserve"> Lo que entra a la ficha bajo la firma propia es afirmación propia: una confabulación copiada se convierte en hecho heredado para el siguiente lector, y la síntesis delegada es, además, pensamiento que no ocurrió (McCoy et al., 2024).</w:t>
-      </w:r>
-    </w:p>
-    <w:p>
-      <w:pPr>
-        <w:pStyle w:val="BodyJ"/>
-        <w:numPr>
-          <w:ilvl w:val="0"/>
-          <w:numId w:val="25"/>
-        </w:numPr>
-      </w:pPr>
-      <w:r>
-        <w:rPr>
-          <w:b/>
-          <w:bCs/>
-        </w:rPr>
-        <w:t xml:space="preserve">Conservar práctica sin asistencia.</w:t>
-      </w:r>
-      <w:r>
-        <w:t xml:space="preserve"> La lección de los endoscopistas: alternar deliberadamente el trabajo con y sin la herramienta, como se conserva cualquier destreza que puede necesitarse a las tres de la mañana, con el sistema caído.</w:t>
-      </w:r>
-    </w:p>
-    <w:p>
-      <w:pPr>
-        <w:pStyle w:val="BodyJ"/>
-      </w:pPr>
-      <w:r>
-        <w:t xml:space="preserve">El modelo puede servir como generador de alternativas, revisor de coherencia, organizador de información o segundo lector. Su valor aumenta cuando el usuario mantiene la responsabilidad de verificación y disminuye cuando se usa como autoridad final.</w:t>
-      </w:r>
-    </w:p>
-    <w:p>
-      <w:pPr>
-        <w:pStyle w:val="Heading3"/>
-        <w:spacing w:after="120" w:before="280"/>
-      </w:pPr>
-      <w:r>
-        <w:rPr>
-          <w:rFonts w:ascii="Georgia" w:cs="Georgia" w:eastAsia="Georgia" w:hAnsi="Georgia"/>
-          <w:b/>
-          <w:bCs/>
-          <w:color w:val="2B2B2B"/>
-          <w:sz w:val="25"/>
-          <w:szCs w:val="25"/>
-        </w:rPr>
-        <w:t xml:space="preserve">Cómo enfrentarlos: las defensas de la institución</w:t>
-      </w:r>
-    </w:p>
-    <w:p>
-      <w:pPr>
-        <w:pStyle w:val="BodyJ"/>
-      </w:pPr>
-      <w:r>
-        <w:t xml:space="preserve">Las defensas individuales no bastan, porque varios riesgos del catálogo operan a escala de sistema. Una institución que despliega IA clínica contrae obligaciones epistémicas precisas:</w:t>
-      </w:r>
-    </w:p>
-    <w:p>
-      <w:pPr>
-        <w:pStyle w:val="BodyJ"/>
-        <w:numPr>
-          <w:ilvl w:val="0"/>
-          <w:numId w:val="6"/>
-        </w:numPr>
-      </w:pPr>
-      <w:r>
-        <w:rPr>
-          <w:b/>
-          <w:bCs/>
-        </w:rPr>
-        <w:t xml:space="preserve">Validación local antes de usar.</w:t>
-      </w:r>
-      <w:r>
-        <w:t xml:space="preserve"> El desempeño publicado —o prometido— no es el desempeño aquí; la parábola del predictor de sepsis existe porque nadie hizo esta pregunta a tiempo (Wong et al., 2021).</w:t>
-      </w:r>
-    </w:p>
-    <w:p>
-      <w:pPr>
-        <w:pStyle w:val="BodyJ"/>
-        <w:numPr>
-          <w:ilvl w:val="0"/>
-          <w:numId w:val="6"/>
-        </w:numPr>
-      </w:pPr>
-      <w:r>
-        <w:rPr>
-          <w:b/>
-          <w:bCs/>
-        </w:rPr>
-        <w:t xml:space="preserve">Monitoreo continuo con umbrales de retirada.</w:t>
-      </w:r>
-      <w:r>
-        <w:t xml:space="preserve"> Definir antes del despliegue qué degradación obliga a recalibrar o apagar: la falsabilidad del capítulo 15, aplicada al software.</w:t>
-      </w:r>
-    </w:p>
-    <w:p>
-      <w:pPr>
-        <w:pStyle w:val="BodyJ"/>
-        <w:numPr>
-          <w:ilvl w:val="0"/>
-          <w:numId w:val="6"/>
-        </w:numPr>
-      </w:pPr>
-      <w:r>
-        <w:rPr>
-          <w:b/>
-          <w:bCs/>
-        </w:rPr>
-        <w:t xml:space="preserve">Auditoría de equidad.</w:t>
-      </w:r>
-      <w:r>
-        <w:t xml:space="preserve"> Desagregar el rendimiento por subgrupos y examinar los sustitutos con la pregunta de Obermeyer: ¿qué mide realmente esta variable, y para quién?</w:t>
-      </w:r>
-    </w:p>
-    <w:p>
-      <w:pPr>
-        <w:pStyle w:val="BodyJ"/>
-        <w:numPr>
-          <w:ilvl w:val="0"/>
-          <w:numId w:val="6"/>
-        </w:numPr>
-      </w:pPr>
-      <w:r>
-        <w:rPr>
-          <w:b/>
-          <w:bCs/>
-        </w:rPr>
-        <w:t xml:space="preserve">Presupuesto de alertas.</w:t>
-      </w:r>
-      <w:r>
-        <w:t xml:space="preserve"> Cada alarma nueva compite por la misma atención finita; una alerta de bajo valor predictivo no es inocua — es ruido que entrena a ignorar, y el equipo que aprendió a ignorar no distingue qué está ignorando.</w:t>
-      </w:r>
-    </w:p>
-    <w:p>
-      <w:pPr>
-        <w:pStyle w:val="BodyJ"/>
-        <w:numPr>
-          <w:ilvl w:val="0"/>
-          <w:numId w:val="6"/>
-        </w:numPr>
-      </w:pPr>
-      <w:r>
-        <w:rPr>
-          <w:b/>
-          <w:bCs/>
-        </w:rPr>
-        <w:t xml:space="preserve">Formación que supervise el uso, no sólo la respuesta.</w:t>
-      </w:r>
-      <w:r>
-        <w:t xml:space="preserve"> En docencia, observar cómo el aprendiz usa cognitivamente la herramienta — cuándo consulta, qué acepta, qué verifica, qué habría respondido antes de mirar — y proteger espacios deliberados de práctica sin asistencia (Abdulnour et al., 2025): la competencia que nunca se construyó no se puede "recuperar".</w:t>
-      </w:r>
-    </w:p>
-    <w:p>
-      <w:pPr>
-        <w:pStyle w:val="BodyJ"/>
-        <w:numPr>
-          <w:ilvl w:val="0"/>
-          <w:numId w:val="6"/>
-        </w:numPr>
-      </w:pPr>
-      <w:r>
-        <w:rPr>
-          <w:b/>
-          <w:bCs/>
-        </w:rPr>
-        <w:t xml:space="preserve">Responsabilidad trazable.</w:t>
-      </w:r>
-      <w:r>
-        <w:t xml:space="preserve"> Cada recomendación automatizada necesita un dueño humano identificable, con tiempo, datos y autoridad para contradecirla. La OMS ha recomendado gobernanza, evaluación, transparencia y supervisión humana para estos sistemas, atendiendo riesgos de inexactitud, sesgo, privacidad y dependencia excesiva (World Health Organization, 2024); esa supervisión no puede ser una firma ritual al final del flujo.</w:t>
-      </w:r>
-    </w:p>
-    <w:p>
-      <w:pPr>
-        <w:pStyle w:val="Heading3"/>
-        <w:spacing w:after="120" w:before="280"/>
-      </w:pPr>
-      <w:r>
-        <w:rPr>
-          <w:rFonts w:ascii="Georgia" w:cs="Georgia" w:eastAsia="Georgia" w:hAnsi="Georgia"/>
-          <w:b/>
-          <w:bCs/>
-          <w:color w:val="2B2B2B"/>
-          <w:sz w:val="25"/>
-          <w:szCs w:val="25"/>
-        </w:rPr>
-        <w:t xml:space="preserve">Metacognición artificial</w:t>
-      </w:r>
-    </w:p>
-    <w:p>
-      <w:pPr>
-        <w:pStyle w:val="BodyJ"/>
-      </w:pPr>
-      <w:r>
-        <w:t xml:space="preserve">Algunos sistemas pueden expresar confianza, criticar una respuesta o revisar pasos. Eso no demuestra autoconocimiento en el sentido humano. Una salida metacognitiva puede ser otra generación entrenada para imitar evaluación. La pregunta práctica no es si el sistema "sabe que sabe", sino si sus señales de confianza están empíricamente calibradas y si el flujo de trabajo detecta fallas.</w:t>
-      </w:r>
-    </w:p>
-    <w:p>
-      <w:pPr>
-        <w:pStyle w:val="BodyJ"/>
-      </w:pPr>
-      <w:r>
-        <w:t xml:space="preserve">Esa pregunta ya tiene datos. La evidencia disponible muestra que la confianza verbalizada de los grandes modelos —el "estoy bastante seguro" que escriben— tiende a la sobreconfianza sistemática y se calibra mal, aun cuando algunas señales internas del modelo discriminan mejor de lo que su prosa deja ver (Kadavath et al., 2022; Xiong et al., 2024). La implicación práctica es idéntica a la del capítulo 5, aplicada ahora a la máquina: preguntarle a un modelo cuán seguro está no sustituye la verificación, igual que la seguridad de un colega no sustituye sus razones. La calibración se demuestra con series de predicciones y desenlaces, no con tono.</w:t>
-      </w:r>
-    </w:p>
-    <w:p>
-      <w:pPr>
-        <w:pStyle w:val="Heading3"/>
-        <w:spacing w:after="120" w:before="280"/>
-      </w:pPr>
-      <w:r>
-        <w:rPr>
-          <w:rFonts w:ascii="Georgia" w:cs="Georgia" w:eastAsia="Georgia" w:hAnsi="Georgia"/>
-          <w:b/>
-          <w:bCs/>
-          <w:color w:val="2B2B2B"/>
-          <w:sz w:val="25"/>
-          <w:szCs w:val="25"/>
-        </w:rPr>
-        <w:t xml:space="preserve">La IA como espejo y provocación filosófica</w:t>
-      </w:r>
-    </w:p>
-    <w:p>
-      <w:pPr>
-        <w:pStyle w:val="BodyJ"/>
-      </w:pPr>
-      <w:r>
-        <w:t xml:space="preserve">La IA revela que una frase puede conservar la forma externa del razonamiento sin tener acceso directo al evento. Esto obliga a recordar que la coherencia verbal nunca fue garantía suficiente. También muestra el valor del lenguaje como espacio de prueba: pedir alternativas, contraejemplos y explicitar incertidumbre puede mejorar la deliberación humana, aunque no vuelva verdadero al modelo.</w:t>
-      </w:r>
-    </w:p>
-    <w:p>
-      <w:pPr>
-        <w:pStyle w:val="Quote1"/>
-      </w:pPr>
-      <w:r>
-        <w:t xml:space="preserve">La IA puede ampliar el espacio de hipótesis; no puede asumir por sí sola la responsabilidad de transformar una hipótesis en conducta clínica.</w:t>
-      </w:r>
-    </w:p>
-    <w:p>
-      <w:pPr>
-        <w:pStyle w:val="BodyJ"/>
-      </w:pPr>
-      <w:r>
-        <w:t xml:space="preserve">Usada con disciplina, puede ser un instrumento metacognitivo externo. Usada por deferencia, puede reforzar el mismo error que pretendía corregir: convertir plausibilidad en certeza.</w:t>
-      </w:r>
-    </w:p>
-    <w:p>
-      <w:pPr>
-        <w:pStyle w:val="TallerHead"/>
-      </w:pPr>
-      <w:r>
-        <w:t xml:space="preserve">Taller 17. La autopsia de una respuesta</w:t>
-      </w:r>
-    </w:p>
-    <w:p>
-      <w:pPr>
-        <w:pStyle w:val="BodyJ"/>
-      </w:pPr>
-      <w:r>
-        <w:t xml:space="preserve">Tome un caso real ya resuelto de su servicio —debidamente anonimizado— y péguelo en un asistente de lenguaje pidiendo evaluación y plan. Imprima la respuesta y márquela con tres colores: (1) afirmaciones sustentadas en datos que el caso contenía; (2) contenido que el modelo agregó — detalles "típicos", causalidades, datos que nadie le dio; (3) incertidumbre declarada. Después, haga una segunda pregunta al modelo: "¿qué evidencia haría improbable tu diagnóstico principal?".</w:t>
-      </w:r>
-    </w:p>
-    <w:p>
-      <w:pPr>
-        <w:pStyle w:val="BodyJ"/>
-      </w:pPr>
-      <w:r>
-        <w:rPr>
-          <w:i/>
-          <w:iCs/>
-        </w:rPr>
-        <w:t xml:space="preserve">Solución comentada.</w:t>
-      </w:r>
-      <w:r>
-        <w:t xml:space="preserve"> En ejercicios docentes, tres hallazgos vuelven una y otra vez. Primero, el color 2 aparece más de lo esperado: el modelo rellena huecos con verosimilitud — una evolución "esperable", un factor de riesgo "presumible" — y esa es exactamente la definición de confabulación; contarlas cura más que leer sobre ellas. Segundo, el color 3 suele ser genérico ("se sugiere correlacionar con la clínica") y no específico del caso: incertidumbre de fórmula, no de contenido — compárela con la que exige el léxico de certeza. Tercero, la respuesta a la segunda pregunta suele ser mejor que la primera: el modelo enumera con soltura los datos que refutarían su propia propuesta — pero sólo si alguien se lo pide. La herramienta contiene su propio antídoto; la pregunta que lo libera sigue siendo humana.</w:t>
-      </w:r>
-    </w:p>
-    <w:p>
-      <w:pPr>
-        <w:pStyle w:val="EnUnaFrase"/>
-      </w:pPr>
-      <w:r>
-        <w:rPr>
-          <w:b/>
-          <w:bCs/>
-        </w:rPr>
-        <w:t xml:space="preserve">En una frase.</w:t>
-      </w:r>
-      <w:r>
-        <w:t xml:space="preserve"> La IA generativa produce exactamente aquello contra lo que este libro entrena: prosa fluida donde hechos, inferencias e incertidumbre llegan mezclados — auditarla con HII-D es el mismo ejercicio que auditar la propia escritura.</w:t>
-      </w:r>
-    </w:p>
-    <w:p>
-      <w:pPr>
-        <w:pStyle w:val="BodyJ"/>
-        <w:spacing w:after="80" w:before="160"/>
-      </w:pPr>
-      <w:r>
-        <w:rPr>
-          <w:b/>
-          <w:bCs/>
-        </w:rPr>
-        <w:t xml:space="preserve">Tres preguntas para la próxima visita.</w:t>
-      </w:r>
-    </w:p>
-    <w:p>
-      <w:pPr>
-        <w:pStyle w:val="BodyJ"/>
-        <w:numPr>
-          <w:ilvl w:val="0"/>
-          <w:numId w:val="26"/>
-        </w:numPr>
-      </w:pPr>
-      <w:r>
-        <w:t xml:space="preserve">Si uso IA en este caso, ¿qué dato de su respuesta verifiqué contra una fuente primaria antes de actuar?</w:t>
-      </w:r>
-    </w:p>
-    <w:p>
-      <w:pPr>
-        <w:pStyle w:val="BodyJ"/>
-        <w:numPr>
-          <w:ilvl w:val="0"/>
-          <w:numId w:val="26"/>
-        </w:numPr>
-      </w:pPr>
-      <w:r>
-        <w:t xml:space="preserve">¿Qué agregó el modelo que el caso no contenía?</w:t>
-      </w:r>
-    </w:p>
-    <w:p>
-      <w:pPr>
-        <w:pStyle w:val="BodyJ"/>
-        <w:numPr>
-          <w:ilvl w:val="0"/>
-          <w:numId w:val="26"/>
-        </w:numPr>
-      </w:pPr>
-      <w:r>
-        <w:t xml:space="preserve">¿Estoy usando la herramienta para ampliar hipótesis o para confirmar rápido la que ya tenía?</w:t>
-      </w:r>
-    </w:p>
-    <w:p>
-      <w:pPr>
-        <w:pStyle w:val="Heading2"/>
-        <w:pageBreakBefore/>
-        <w:spacing w:after="300" w:before="600"/>
-      </w:pPr>
-      <w:r>
-        <w:rPr>
-          <w:rFonts w:ascii="Georgia" w:cs="Georgia" w:eastAsia="Georgia" w:hAnsi="Georgia"/>
-          <w:b/>
-          <w:bCs/>
-          <w:color w:val="8C2F2F"/>
-          <w:sz w:val="22"/>
-          <w:szCs w:val="22"/>
-        </w:rPr>
-        <w:t xml:space="preserve">Capítulo 18</w:t>
-      </w:r>
-      <w:r>
-        <w:rPr>
-          <w:rFonts w:ascii="Georgia" w:cs="Georgia" w:eastAsia="Georgia" w:hAnsi="Georgia"/>
-          <w:b/>
-          <w:bCs/>
-          <w:color w:val="3D5A6C"/>
-          <w:sz w:val="32"/>
-          <w:szCs w:val="32"/>
-        </w:rPr>
-        <w:br/>
-        <w:t xml:space="preserve">La palabra exacta: lo que la poesía sabe del juicio clínico</w:t>
-      </w:r>
-    </w:p>
-    <w:p>
-      <w:pPr>
-        <w:pStyle w:val="BodyJ"/>
-      </w:pPr>
-      <w:r>
-        <w:t xml:space="preserve">Hay un momento que los tratados no describen y todo clínico conoce: tres hallazgos sueltos —una taquicardia sin fiebre, un abdomen que "no convence", una frase de la hija— se ordenan de golpe bajo una sola explicación, y algo hace clic. El placer de ese instante no es administrativo. Es físico, breve y sospechosamente parecido al de un verso que cae en su lugar. Este capítulo toma ese parecido en serio: no como adorno humanista, sino como información sobre cómo funciona —y cómo falla— el juicio.</w:t>
-      </w:r>
-    </w:p>
-    <w:p>
-      <w:pPr>
-        <w:pStyle w:val="Heading3"/>
-        <w:spacing w:after="120" w:before="280"/>
-      </w:pPr>
-      <w:r>
-        <w:rPr>
-          <w:rFonts w:ascii="Georgia" w:cs="Georgia" w:eastAsia="Georgia" w:hAnsi="Georgia"/>
-          <w:b/>
-          <w:bCs/>
-          <w:color w:val="2B2B2B"/>
-          <w:sz w:val="25"/>
-          <w:szCs w:val="25"/>
-        </w:rPr>
-        <w:t xml:space="preserve">Dos oficios de la conexión</w:t>
-      </w:r>
-    </w:p>
-    <w:p>
-      <w:pPr>
-        <w:pStyle w:val="BodyJ"/>
-      </w:pPr>
-      <w:r>
-        <w:t xml:space="preserve">El poeta trabaja buscando conexiones: entre palabras, entre una palabra y un sentido que todavía no tiene nombre, entre el sonido y aquello que el sonido vuelve visible. Su estado mental característico combina atención flotante, oído para lo que no encaja y una disposición rara: dejar que el material mande sobre el plan. El clínico que razona bien trabaja igual, con otros materiales: entre el hallazgo y el mecanismo, entre el mecanismo y la intervención que estabiliza, busca la conexión que convierta fragmentos en un caso inteligible.</w:t>
-      </w:r>
-    </w:p>
-    <w:p>
-      <w:pPr>
-        <w:pStyle w:val="BodyJ"/>
-      </w:pPr>
-      <w:r>
-        <w:t xml:space="preserve">El parentesco es lógico antes que sentimental. Una metáfora es la hipótesis de que dos cosas lejanas comparten estructura; un diagnóstico es una metáfora que acepta ser puesta a prueba — "este cuadro es una colecistitis" apuesta a que lo que ocurre en este cuerpo comparte estructura con un patrón aprendido. Ambos movimientos son la abducción del capítulo 2, y ambos requieren el estado que este libro llamó humildad en funciones: sostener la conjetura con fuerza suficiente para trabajarla y soltura suficiente para dejarla caer. Bohm lo dijo desde la física: el acto creativo central —percibir un orden nuevo en lo que ya estaba a la vista— es el mismo en el arte y en la ciencia; cambian los materiales y el tribunal (Bohm, 1996).</w:t>
-      </w:r>
-    </w:p>
-    <w:p>
-      <w:pPr>
-        <w:pStyle w:val="Heading3"/>
-        <w:spacing w:after="120" w:before="280"/>
-      </w:pPr>
-      <w:r>
-        <w:rPr>
-          <w:rFonts w:ascii="Georgia" w:cs="Georgia" w:eastAsia="Georgia" w:hAnsi="Georgia"/>
-          <w:b/>
-          <w:bCs/>
-          <w:color w:val="2B2B2B"/>
-          <w:sz w:val="25"/>
-          <w:szCs w:val="25"/>
-        </w:rPr>
         <w:t xml:space="preserve">Huidobro, o la palabra que crea</w:t>
       </w:r>
     </w:p>
@@ -13962,7 +13581,7 @@
         <w:pStyle w:val="BodyJ"/>
       </w:pPr>
       <w:r>
-        <w:t xml:space="preserve">Porque la ficha clínica también hace florecer rosas. La "neumonía aspirativa" del prefacio —dos palabras limpias que crearon un antecedente que nadie observó— es creacionismo puro; el "somatiza" de la viñeta 10, también. El capítulo 12 mostró el mecanismo: la ficha produce lo visible, y sus criaturas verbales adquieren vida institucional. La diferencia con la poesía es brutal: las rosas de Huidobro viven en el poema; las nuestras reciben antibióticos, cirugías y altas. El lenguaje clínico descuidado es creacionista por defecto — y un servicio lleno de pequeños dioses es un lugar peligroso para estar enfermo.</w:t>
+        <w:t xml:space="preserve">Porque la ficha clínica también hace florecer rosas. La "neumonía aspirativa" del prefacio —dos palabras limpias que crearon un antecedente que nadie observó— es creacionismo puro; el "somatiza" de la viñeta 8, también. El capítulo 12 mostró el mecanismo: la ficha produce lo visible, y sus criaturas verbales adquieren vida institucional. La diferencia con la poesía es brutal: las rosas de Huidobro viven en el poema; las nuestras reciben antibióticos, cirugías y altas. El lenguaje clínico descuidado es creacionista por defecto — y un servicio lleno de pequeños dioses es un lugar peligroso para estar enfermo.</w:t>
       </w:r>
     </w:p>
     <w:p>
@@ -16492,7 +16111,7 @@
         </w:numPr>
       </w:pPr>
       <w:r>
-        <w:t xml:space="preserve">Reformatear una reunión de morbimortalidad al formato de la viñeta 8: reconstrucción por capas, con la información disponible en cada momento, sin nombres de sesgos como conclusión y con una barrera concreta como producto de cada sesión.</w:t>
+        <w:t xml:space="preserve">Reformatear una reunión de morbimortalidad al formato de la viñeta 6: reconstrucción por capas, con la información disponible en cada momento, sin nombres de sesgos como conclusión y con una barrera concreta como producto de cada sesión.</w:t>
       </w:r>
     </w:p>
     <w:p>
@@ -16533,99 +16152,6 @@
           <w:sz w:val="25"/>
           <w:szCs w:val="25"/>
         </w:rPr>
-        <w:t xml:space="preserve">Barreras esperables y respuestas</w:t>
-      </w:r>
-    </w:p>
-    <w:p>
-      <w:pPr>
-        <w:pStyle w:val="BodyJ"/>
-        <w:numPr>
-          <w:ilvl w:val="0"/>
-          <w:numId w:val="6"/>
-        </w:numPr>
-      </w:pPr>
-      <w:r>
-        <w:rPr>
-          <w:b/>
-          <w:bCs/>
-        </w:rPr>
-        <w:t xml:space="preserve">"No hay tiempo."</w:t>
-      </w:r>
-      <w:r>
-        <w:t xml:space="preserve"> La versión de 60 segundos existe para eso; la pausa es selectiva por disparador, no universal. El tiempo que consume se compara con el que consume un solo cierre prematuro no detectado.</w:t>
-      </w:r>
-    </w:p>
-    <w:p>
-      <w:pPr>
-        <w:pStyle w:val="BodyJ"/>
-        <w:numPr>
-          <w:ilvl w:val="0"/>
-          <w:numId w:val="6"/>
-        </w:numPr>
-      </w:pPr>
-      <w:r>
-        <w:rPr>
-          <w:b/>
-          <w:bCs/>
-        </w:rPr>
-        <w:t xml:space="preserve">"Esto burocratiza."</w:t>
-      </w:r>
-      <w:r>
-        <w:t xml:space="preserve"> La plantilla se usa en tres situaciones, no en todas. La regla es proporcionalidad: una línea para lo rutinario, estructura para lo grave, incierto o irreversible.</w:t>
-      </w:r>
-    </w:p>
-    <w:p>
-      <w:pPr>
-        <w:pStyle w:val="BodyJ"/>
-        <w:numPr>
-          <w:ilvl w:val="0"/>
-          <w:numId w:val="6"/>
-        </w:numPr>
-      </w:pPr>
-      <w:r>
-        <w:rPr>
-          <w:b/>
-          <w:bCs/>
-        </w:rPr>
-        <w:t xml:space="preserve">"La ficha electrónica no lo permite."</w:t>
-      </w:r>
-      <w:r>
-        <w:t xml:space="preserve"> El léxico y la pausa no requieren software. La plantilla cabe en texto libre.</w:t>
-      </w:r>
-    </w:p>
-    <w:p>
-      <w:pPr>
-        <w:pStyle w:val="BodyJ"/>
-        <w:numPr>
-          <w:ilvl w:val="0"/>
-          <w:numId w:val="6"/>
-        </w:numPr>
-      </w:pPr>
-      <w:r>
-        <w:rPr>
-          <w:b/>
-          <w:bCs/>
-        </w:rPr>
-        <w:t xml:space="preserve">"El equipo no va a exponer sus dudas."</w:t>
-      </w:r>
-      <w:r>
-        <w:t xml:space="preserve"> La seguridad psicológica se modela desde arriba: el primer "no lo sé, y esto es lo que haremos para saberlo" tiene que decirlo la jefatura.</w:t>
-      </w:r>
-    </w:p>
-    <w:p>
-      <w:pPr>
-        <w:pStyle w:val="Heading3"/>
-        <w:spacing w:after="120" w:before="280"/>
-      </w:pPr>
-      <w:r>
-        <w:rPr>
-          <w:rFonts w:ascii="Georgia" w:cs="Georgia" w:eastAsia="Georgia" w:hAnsi="Georgia"/>
-          <w:b/>
-          <w:bCs/>
-          <w:color w:val="2B2B2B"/>
-          <w:sz w:val="25"/>
-          <w:szCs w:val="25"/>
-        </w:rPr>
         <w:t xml:space="preserve">Qué medir (sin inflar métricas)</w:t>
       </w:r>
     </w:p>
@@ -17419,7 +16945,7 @@
         </w:numPr>
       </w:pPr>
       <w:r>
-        <w:t xml:space="preserve">Anclaje — 7, 11, CC (viñeta 8)</w:t>
+        <w:t xml:space="preserve">Anclaje — 7, 11, CC (viñeta 6)</w:t>
       </w:r>
     </w:p>
     <w:p>
@@ -17467,7 +16993,7 @@
         </w:numPr>
       </w:pPr>
       <w:r>
-        <w:t xml:space="preserve">Bioética y razonamiento clínico (cuatro tópicos, proporcionalidad, deliberación) — 10, 15, CC (viñeta 7), Ap A</w:t>
+        <w:t xml:space="preserve">Bioética y razonamiento clínico (cuatro tópicos, proporcionalidad, deliberación) — 10, 15, CC (viñeta 5), Ap A</w:t>
       </w:r>
     </w:p>
     <w:p>
@@ -17515,7 +17041,7 @@
         </w:numPr>
       </w:pPr>
       <w:r>
-        <w:t xml:space="preserve">Cierre prematuro — 2, 7, CC (viñeta 8)</w:t>
+        <w:t xml:space="preserve">Cierre prematuro — 2, 7, CC (viñeta 6)</w:t>
       </w:r>
     </w:p>
     <w:p>
@@ -17551,7 +17077,7 @@
         </w:numPr>
       </w:pPr>
       <w:r>
-        <w:t xml:space="preserve">Comunicación de incertidumbre — 13, 14, CC (viñeta 7)</w:t>
+        <w:t xml:space="preserve">Comunicación de incertidumbre — 13, 14, CC (viñeta 5)</w:t>
       </w:r>
     </w:p>
     <w:p>
@@ -17647,7 +17173,7 @@
         </w:numPr>
       </w:pPr>
       <w:r>
-        <w:t xml:space="preserve">Decisión compartida — 13, 14, Interludio III</w:t>
+        <w:t xml:space="preserve">Decisión compartida — 14, Interludio III</w:t>
       </w:r>
     </w:p>
     <w:p>
@@ -17731,7 +17257,7 @@
         </w:numPr>
       </w:pPr>
       <w:r>
-        <w:t xml:space="preserve">Ensombrecimiento diagnóstico — CC (viñeta 10)</w:t>
+        <w:t xml:space="preserve">Ensombrecimiento diagnóstico — CC (viñeta 8)</w:t>
       </w:r>
     </w:p>
     <w:p>
@@ -17743,7 +17269,7 @@
         </w:numPr>
       </w:pPr>
       <w:r>
-        <w:t xml:space="preserve">Errores asimétricos — 10, CC (viñeta 5)</w:t>
+        <w:t xml:space="preserve">Errores asimétricos — 10, CC (viñeta 3)</w:t>
       </w:r>
     </w:p>
     <w:p>
@@ -17863,7 +17389,7 @@
         </w:numPr>
       </w:pPr>
       <w:r>
-        <w:t xml:space="preserve">Frecuencias naturales — 2, 10, 13</w:t>
+        <w:t xml:space="preserve">Frecuencias naturales — 2, 10</w:t>
       </w:r>
     </w:p>
     <w:p>
@@ -17899,7 +17425,7 @@
         </w:numPr>
       </w:pPr>
       <w:r>
-        <w:t xml:space="preserve">Hindsight bias — 8, 11, 16, CC (viñeta 8)</w:t>
+        <w:t xml:space="preserve">Hindsight bias — 8, 11, 16, CC (viñeta 6)</w:t>
       </w:r>
     </w:p>
     <w:p>
@@ -17959,7 +17485,7 @@
         </w:numPr>
       </w:pPr>
       <w:r>
-        <w:t xml:space="preserve">Injusticia epistémica — 14, CC (viñetas 8 y 10)</w:t>
+        <w:t xml:space="preserve">Injusticia epistémica — 14, CC (viñetas 6 y 8)</w:t>
       </w:r>
     </w:p>
     <w:p>
@@ -18187,7 +17713,7 @@
         </w:numPr>
       </w:pPr>
       <w:r>
-        <w:t xml:space="preserve">Pronóstico e incertidumbre de plazo — CC (viñeta 7)</w:t>
+        <w:t xml:space="preserve">Pronóstico e incertidumbre de plazo — CC (viñeta 5)</w:t>
       </w:r>
     </w:p>
     <w:p>
@@ -18199,7 +17725,7 @@
         </w:numPr>
       </w:pPr>
       <w:r>
-        <w:t xml:space="preserve">Proporcionalidad terapéutica (Taboada) — 10, 15, CC (viñeta 7)</w:t>
+        <w:t xml:space="preserve">Proporcionalidad terapéutica (Taboada) — 10, 15, CC (viñeta 5)</w:t>
       </w:r>
     </w:p>
     <w:p>
@@ -18235,7 +17761,7 @@
         </w:numPr>
       </w:pPr>
       <w:r>
-        <w:t xml:space="preserve">Reglas de decisión clínica (PERC) y umbral — CC (viñeta 8)</w:t>
+        <w:t xml:space="preserve">Reglas de decisión clínica (PERC) y umbral — CC (viñeta 6)</w:t>
       </w:r>
     </w:p>
     <w:p>
@@ -18271,7 +17797,7 @@
         </w:numPr>
       </w:pPr>
       <w:r>
-        <w:t xml:space="preserve">Safety-netting — 11, CC (viñetas 5, 6 y 9)</w:t>
+        <w:t xml:space="preserve">Safety-netting — 11, CC (viñetas 3, 4 y 7)</w:t>
       </w:r>
     </w:p>
     <w:p>
@@ -18355,7 +17881,7 @@
         </w:numPr>
       </w:pPr>
       <w:r>
-        <w:t xml:space="preserve">Testimonio del paciente — 1, 14; epistemología del testimonio (Coady, Lackey) — 14; testimonio de terceros y cuidadores — CC (viñeta 9)</w:t>
+        <w:t xml:space="preserve">Testimonio del paciente — 1, 14; epistemología del testimonio (Coady, Lackey) — 14; testimonio de terceros y cuidadores — CC (viñeta 7)</w:t>
       </w:r>
     </w:p>
     <w:p>
@@ -18379,7 +17905,7 @@
         </w:numPr>
       </w:pPr>
       <w:r>
-        <w:t xml:space="preserve">Umbrales de decisión — 10, Interludio III, CC (viñeta 5)</w:t>
+        <w:t xml:space="preserve">Umbrales de decisión — 10, Interludio III, CC (viñeta 3)</w:t>
       </w:r>
     </w:p>
     <w:p>

</xml_diff>

<commit_message>
Rebuild tras la revisión clínica de pasajes 1-27: 138 pp, TOC 37/37, 139 referencias, EPUB
Co-Authored-By: Claude Fable 5.1 <noreply@anthropic.com>
Claude-Session: https://claude.ai/code/session_01SPkhDdVzUCxJwqq61ddeLW
</commit_message>
<xml_diff>
--- a/libro/Hechos_inferencias_incertidumbre_edicion_revisada.docx
+++ b/libro/Hechos_inferencias_incertidumbre_edicion_revisada.docx
@@ -287,7 +287,7 @@
         <w:rPr>
           <w:color w:val="8A8A8A"/>
         </w:rPr>
-        <w:t xml:space="preserve">14</w:t>
+        <w:t xml:space="preserve">15</w:t>
       </w:r>
     </w:p>
     <w:p>
@@ -307,7 +307,7 @@
         <w:rPr>
           <w:color w:val="8A8A8A"/>
         </w:rPr>
-        <w:t xml:space="preserve">19</w:t>
+        <w:t xml:space="preserve">21</w:t>
       </w:r>
     </w:p>
     <w:p>
@@ -327,7 +327,7 @@
         <w:rPr>
           <w:color w:val="8A8A8A"/>
         </w:rPr>
-        <w:t xml:space="preserve">23</w:t>
+        <w:t xml:space="preserve">25</w:t>
       </w:r>
     </w:p>
     <w:p>
@@ -347,7 +347,7 @@
         <w:rPr>
           <w:color w:val="8A8A8A"/>
         </w:rPr>
-        <w:t xml:space="preserve">28</w:t>
+        <w:t xml:space="preserve">30</w:t>
       </w:r>
     </w:p>
     <w:p>
@@ -367,7 +367,7 @@
         <w:rPr>
           <w:color w:val="8A8A8A"/>
         </w:rPr>
-        <w:t xml:space="preserve">29</w:t>
+        <w:t xml:space="preserve">31</w:t>
       </w:r>
     </w:p>
     <w:p>
@@ -387,7 +387,7 @@
         <w:rPr>
           <w:color w:val="8A8A8A"/>
         </w:rPr>
-        <w:t xml:space="preserve">30</w:t>
+        <w:t xml:space="preserve">32</w:t>
       </w:r>
     </w:p>
     <w:p>
@@ -407,7 +407,7 @@
         <w:rPr>
           <w:color w:val="8A8A8A"/>
         </w:rPr>
-        <w:t xml:space="preserve">36</w:t>
+        <w:t xml:space="preserve">38</w:t>
       </w:r>
     </w:p>
     <w:p>
@@ -427,7 +427,7 @@
         <w:rPr>
           <w:color w:val="8A8A8A"/>
         </w:rPr>
-        <w:t xml:space="preserve">39</w:t>
+        <w:t xml:space="preserve">41</w:t>
       </w:r>
     </w:p>
     <w:p>
@@ -447,7 +447,7 @@
         <w:rPr>
           <w:color w:val="8A8A8A"/>
         </w:rPr>
-        <w:t xml:space="preserve">42</w:t>
+        <w:t xml:space="preserve">45</w:t>
       </w:r>
     </w:p>
     <w:p>
@@ -467,7 +467,7 @@
         <w:rPr>
           <w:color w:val="8A8A8A"/>
         </w:rPr>
-        <w:t xml:space="preserve">45</w:t>
+        <w:t xml:space="preserve">48</w:t>
       </w:r>
     </w:p>
     <w:p>
@@ -487,7 +487,7 @@
         <w:rPr>
           <w:color w:val="8A8A8A"/>
         </w:rPr>
-        <w:t xml:space="preserve">46</w:t>
+        <w:t xml:space="preserve">49</w:t>
       </w:r>
     </w:p>
     <w:p>
@@ -507,7 +507,7 @@
         <w:rPr>
           <w:color w:val="8A8A8A"/>
         </w:rPr>
-        <w:t xml:space="preserve">47</w:t>
+        <w:t xml:space="preserve">50</w:t>
       </w:r>
     </w:p>
     <w:p>
@@ -527,7 +527,7 @@
         <w:rPr>
           <w:color w:val="8A8A8A"/>
         </w:rPr>
-        <w:t xml:space="preserve">50</w:t>
+        <w:t xml:space="preserve">53</w:t>
       </w:r>
     </w:p>
     <w:p>
@@ -547,7 +547,7 @@
         <w:rPr>
           <w:color w:val="8A8A8A"/>
         </w:rPr>
-        <w:t xml:space="preserve">57</w:t>
+        <w:t xml:space="preserve">60</w:t>
       </w:r>
     </w:p>
     <w:p>
@@ -567,7 +567,7 @@
         <w:rPr>
           <w:color w:val="8A8A8A"/>
         </w:rPr>
-        <w:t xml:space="preserve">60</w:t>
+        <w:t xml:space="preserve">63</w:t>
       </w:r>
     </w:p>
     <w:p>
@@ -587,7 +587,7 @@
         <w:rPr>
           <w:color w:val="8A8A8A"/>
         </w:rPr>
-        <w:t xml:space="preserve">64</w:t>
+        <w:t xml:space="preserve">67</w:t>
       </w:r>
     </w:p>
     <w:p>
@@ -607,7 +607,7 @@
         <w:rPr>
           <w:color w:val="8A8A8A"/>
         </w:rPr>
-        <w:t xml:space="preserve">69</w:t>
+        <w:t xml:space="preserve">72</w:t>
       </w:r>
     </w:p>
     <w:p>
@@ -627,7 +627,7 @@
         <w:rPr>
           <w:color w:val="8A8A8A"/>
         </w:rPr>
-        <w:t xml:space="preserve">70</w:t>
+        <w:t xml:space="preserve">73</w:t>
       </w:r>
     </w:p>
     <w:p>
@@ -647,7 +647,7 @@
         <w:rPr>
           <w:color w:val="8A8A8A"/>
         </w:rPr>
-        <w:t xml:space="preserve">71</w:t>
+        <w:t xml:space="preserve">74</w:t>
       </w:r>
     </w:p>
     <w:p>
@@ -667,7 +667,7 @@
         <w:rPr>
           <w:color w:val="8A8A8A"/>
         </w:rPr>
-        <w:t xml:space="preserve">77</w:t>
+        <w:t xml:space="preserve">80</w:t>
       </w:r>
     </w:p>
     <w:p>
@@ -687,7 +687,7 @@
         <w:rPr>
           <w:color w:val="8A8A8A"/>
         </w:rPr>
-        <w:t xml:space="preserve">84</w:t>
+        <w:t xml:space="preserve">87</w:t>
       </w:r>
     </w:p>
     <w:p>
@@ -707,7 +707,7 @@
         <w:rPr>
           <w:color w:val="8A8A8A"/>
         </w:rPr>
-        <w:t xml:space="preserve">92</w:t>
+        <w:t xml:space="preserve">95</w:t>
       </w:r>
     </w:p>
     <w:p>
@@ -727,7 +727,7 @@
         <w:rPr>
           <w:color w:val="8A8A8A"/>
         </w:rPr>
-        <w:t xml:space="preserve">96</w:t>
+        <w:t xml:space="preserve">99</w:t>
       </w:r>
     </w:p>
     <w:p>
@@ -747,7 +747,7 @@
         <w:rPr>
           <w:color w:val="8A8A8A"/>
         </w:rPr>
-        <w:t xml:space="preserve">103</w:t>
+        <w:t xml:space="preserve">106</w:t>
       </w:r>
     </w:p>
     <w:p>
@@ -767,7 +767,7 @@
         <w:rPr>
           <w:color w:val="8A8A8A"/>
         </w:rPr>
-        <w:t xml:space="preserve">107</w:t>
+        <w:t xml:space="preserve">110</w:t>
       </w:r>
     </w:p>
     <w:p>
@@ -787,7 +787,7 @@
         <w:rPr>
           <w:color w:val="8A8A8A"/>
         </w:rPr>
-        <w:t xml:space="preserve">109</w:t>
+        <w:t xml:space="preserve">112</w:t>
       </w:r>
     </w:p>
     <w:p>
@@ -807,7 +807,7 @@
         <w:rPr>
           <w:color w:val="8A8A8A"/>
         </w:rPr>
-        <w:t xml:space="preserve">111</w:t>
+        <w:t xml:space="preserve">114</w:t>
       </w:r>
     </w:p>
     <w:p>
@@ -827,7 +827,7 @@
         <w:rPr>
           <w:color w:val="8A8A8A"/>
         </w:rPr>
-        <w:t xml:space="preserve">113</w:t>
+        <w:t xml:space="preserve">116</w:t>
       </w:r>
     </w:p>
     <w:p>
@@ -847,7 +847,7 @@
         <w:rPr>
           <w:color w:val="8A8A8A"/>
         </w:rPr>
-        <w:t xml:space="preserve">115</w:t>
+        <w:t xml:space="preserve">118</w:t>
       </w:r>
     </w:p>
     <w:p>
@@ -867,7 +867,7 @@
         <w:rPr>
           <w:color w:val="8A8A8A"/>
         </w:rPr>
-        <w:t xml:space="preserve">119</w:t>
+        <w:t xml:space="preserve">122</w:t>
       </w:r>
     </w:p>
     <w:p>
@@ -887,7 +887,7 @@
         <w:rPr>
           <w:color w:val="8A8A8A"/>
         </w:rPr>
-        <w:t xml:space="preserve">122</w:t>
+        <w:t xml:space="preserve">125</w:t>
       </w:r>
     </w:p>
     <w:p>
@@ -907,7 +907,7 @@
         <w:rPr>
           <w:color w:val="8A8A8A"/>
         </w:rPr>
-        <w:t xml:space="preserve">123</w:t>
+        <w:t xml:space="preserve">126</w:t>
       </w:r>
     </w:p>
     <w:p>
@@ -943,7 +943,7 @@
         <w:pStyle w:val="BodyJ"/>
       </w:pPr>
       <w:r>
-        <w:t xml:space="preserve">Durante mi residencia escribí una frase que tardé años en devolver a su tamaño real. El paciente había vomitado durante la noche; en la radiografía de la mañana aparecieron infiltrados basales. Yo escribí: "neumonía aspirativa". Dos palabras, limpias, verosímiles. La frase viajó conmigo al pase de visita, del pase de visita a la epicrisis, de la epicrisis a la nota de ingreso siguiente, meses después, redactada por alguien que nunca vio al paciente vomitar. Nadie mintió en ningún momento. Pero en algún punto del trayecto una hipótesis razonable se había convertido en un antecedente, y el antecedente en un hecho. Cuando volví a encontrar la frase, ya nadie recordaba que había nacido siendo una conjetura mía, escrita a las siete de la mañana, con la certeza frágil de quien lleva doce horas despierto.</w:t>
+        <w:t xml:space="preserve">Durante mi residencia escribí una frase que tardé años en devolver a su tamaño real. El paciente había vomitado durante la noche; en la radiografía de la mañana aparecieron infiltrados basales. Yo escribí: "neumonía aspirativa". Dos palabras limpias y verosímiles que saltaban sin escalas desde el vómito y la sombra radiológica hasta una infección bacteriana establecida. La frase viajó conmigo a la entrega de turno, de la entrega a la visita médica, de la visita a la epicrisis y de la epicrisis a la nota de ingreso siguiente, meses después, redactada por alguien que nunca vio al paciente vomitar. Nadie mintió en ningún momento. Pero en algún punto del trayecto una hipótesis razonable se había convertido en un antecedente, y el antecedente en un hecho. Cuando volví a encontrar la frase, ya nadie recordaba que había nacido siendo una conjetura mía, escrita a las siete de la mañana, con la certeza frágil de quien lleva doce horas de turno.</w:t>
       </w:r>
     </w:p>
     <w:p>
@@ -991,7 +991,7 @@
         <w:pStyle w:val="BodyJ"/>
       </w:pPr>
       <w:r>
-        <w:t xml:space="preserve">Conviene decir desde el inicio en qué conversación entra este libro. Jerome Groopman mostró al gran público cómo piensan los médicos y dónde se tuercen sus atajos (Groopman, 2007); Pat Croskerry catalogó esos desvíos y propuso estrategias para contenerlos (Croskerry, 2003); Kathryn Montgomery demostró que el juicio clínico es un razonamiento práctico irreductible a la aplicación de reglas (Montgomery, 2006). Este ensayo se sitúa después de esas tres operaciones y propone la que falta: cómo escribir y decidir para que las capas del conocimiento clínico —lo observado, lo inferido, lo incierto, lo decidido— permanezcan visibles y auditables en el trabajo de cada día. No va de la teoría hacia la clínica, sino de la ficha, el pase de visita y la nota de evolución hacia la epistemología. Y está escrito en español a propósito: la reflexión sistemática sobre el razonamiento clínico apenas circula en nuestra lengua fuera de traducciones, y las palabras con que un equipo hispanohablante fija sus certezas merecen un examen hecho desde dentro.</w:t>
+        <w:t xml:space="preserve">Conviene decir desde el inicio en qué conversación entra este libro. Jerome Groopman mostró al gran público cómo piensan los médicos y dónde se tuercen sus atajos (Groopman, 2007); Pat Croskerry catalogó esos desvíos y propuso estrategias para contenerlos (Croskerry, 2003); Kathryn Montgomery demostró que el juicio clínico es un razonamiento práctico irreductible a la aplicación de reglas (Montgomery, 2006). Este ensayo se sitúa después de esas tres operaciones y propone la que falta: cómo escribir y decidir para que las capas del conocimiento clínico —lo observado, lo inferido, lo incierto, lo decidido— permanezcan visibles y auditables en el trabajo de cada día. No va de la teoría hacia la clínica, sino de la ficha, la entrega de turno, la visita médica y la nota de evolución hacia la epistemología. Y está escrito en español a propósito: la reflexión sistemática sobre el razonamiento clínico apenas circula en nuestra lengua fuera de traducciones, y las palabras con que un equipo hispanohablante fija sus certezas merecen un examen hecho desde dentro.</w:t>
       </w:r>
     </w:p>
     <w:p>
@@ -1177,15 +1177,15 @@
         <w:pStyle w:val="BodyJ"/>
       </w:pPr>
       <w:r>
-        <w:t xml:space="preserve">Carmen tiene sesenta y un años y una cicatriz mediana que le cruza el abdomen desde una cirugía de hace una década. Sobre la cicatriz, una hernia incisional que ella conoce mejor que nadie: sabe qué comidas la inflaman, sabe dormir de lado cuando "se le aprieta", sabe distinguir la molestia habitual del dolor que la trae al hospital. Ha ingresado tres veces en el último año por episodios de suboclusión intestinal que se resolvieron con reposo digestivo y sonda. Esta madrugada llegó por cuarta vez, y algo es distinto: está hipotensa, taquicárdica, con las rodillas moteadas y un lactato de 6. En la nota de ingreso, alguien escribió: "Paciente con hernia complicada conocida, cuadro habitual, se maneja de forma habitual".</w:t>
-      </w:r>
-    </w:p>
-    <w:p>
-      <w:pPr>
-        <w:pStyle w:val="BodyJ"/>
-      </w:pPr>
-      <w:r>
-        <w:t xml:space="preserve">Casi todo en esa frase es razonable. Y casi todo está por verse. ¿Qué significa "conocida"? ¿Qué significa "habitual" en una paciente que nunca había llegado en shock? ¿"Complicada" describe lo que la tomografía mostró alguna vez o lo que el equipo teme ahora? La frase no es falsa: es prematura. Comprime cuatro operaciones distintas —observar, inferir, reconocer lo incierto y decidir— en un gesto único que ya no deja ver sus partes. Este libro trata de esas cuatro operaciones, de cómo se mezclan y de cómo volver a separarlas cuando importa. Volveremos a la cama de Carmen al final de cada parte.</w:t>
+        <w:t xml:space="preserve">Carmen tiene sesenta y un años y una cicatriz en la línea media que le cruza el abdomen desde una cirugía de hace una década. Sobre la cicatriz, una hernia incisional que ella conoce mejor que nadie: sabe qué comidas la distienden, sabe dormir de lado cuando "se le aprieta", sabe distinguir la molestia habitual del dolor que la obliga a ir a urgencias. Ha ingresado tres veces en el último año por episodios de suboclusión intestinal que cedieron con reposo digestivo y sonda nasogástrica. Esta madrugada llegó por cuarta vez, y algo es radicalmente distinto: está hipotensa, taquicárdica, con las rodillas moteadas y un lactato de 6 mmol/L. En la nota de ingreso, alguien escribió: "Paciente con hernia complicada conocida, cuadro habitual, se maneja de forma habitual".</w:t>
+      </w:r>
+    </w:p>
+    <w:p>
+      <w:pPr>
+        <w:pStyle w:val="BodyJ"/>
+      </w:pPr>
+      <w:r>
+        <w:t xml:space="preserve">Casi todo en esa frase suena razonable, y casi todo oculta el problema real. ¿Qué significa "conocida" cuando el comportamiento biológico acaba de cambiar? ¿Qué tiene de "habitual" una paciente que por primera vez ingresa en shock? ¿"Complicada" describe el atascamiento mecánico de los ingresos previos o la amenaza de isquemia y sepsis que enfrenta hoy? La frase no es falsa: es prematura. Comprime cuatro operaciones distintas —observar los signos de hipoperfusión, inferir la causa del deterioro, reconocer lo que la clínica aún no permite descartar y decidir una conducta proporcional al riesgo— en un gesto único que ya no deja ver sus partes. Este libro trata de esas cuatro operaciones, de cómo se confunden en el registro diario y de cómo volver a separarlas cuando importa. Volveremos a la cama de Carmen al final de cada parte.</w:t>
       </w:r>
     </w:p>
     <w:p>
@@ -1249,7 +1249,7 @@
             <w:r>
               <w:drawing>
                 <wp:inline distT="0" distB="0" distL="0" distR="0">
-                  <wp:extent cx="5619750" cy="2571750"/>
+                  <wp:extent cx="5619750" cy="2562225"/>
                   <wp:effectExtent t="0" r="0" b="0" l="0"/>
                   <wp:docPr id="1" name="" descr="" title=""/>
                   <wp:cNvGraphicFramePr>
@@ -1274,7 +1274,7 @@
                         <pic:spPr bwMode="auto">
                           <a:xfrm>
                             <a:off x="0" y="0"/>
-                            <a:ext cx="5619750" cy="2571750"/>
+                            <a:ext cx="5619750" cy="2562225"/>
                           </a:xfrm>
                           <a:prstGeom prst="rect">
                             <a:avLst/>
@@ -1491,7 +1491,7 @@
         <w:pStyle w:val="BodyJ"/>
       </w:pPr>
       <w:r>
-        <w:t xml:space="preserve">Son las 7:40 y el residente presenta a Carmen en el pase de visita: "Paciente séptica de foco abdominal, hernia complicada". El jefe de servicio mira la hoja de enfermería y hace una sola pregunta: "¿Qué de todo eso lo vio alguien y qué lo estamos suponiendo?". El silencio que sigue es el tema de este capítulo.</w:t>
+        <w:t xml:space="preserve">Son las 7:40 de la mañana y, en la entrega de turno, el residente presenta a Carmen: "Paciente séptica de foco abdominal, con hernia complicada". El jefe de servicio mira la hoja de enfermería de urgencias y hace una sola pregunta: "¿Qué parte de esa frase la observó alguien directamente y qué parte la estamos suponiendo?". El silencio que sigue es el tema de este capítulo.</w:t>
       </w:r>
     </w:p>
     <w:p>
@@ -1638,7 +1638,7 @@
         <w:pStyle w:val="BodyJ"/>
       </w:pPr>
       <w:r>
-        <w:t xml:space="preserve">Carmen, por ejemplo, no dijo "dolor abdominal difuso": dijo que esta vez "la hernia no se dejó acomodar", que el dolor "era otro" y que por primera vez le dio miedo. Tres datos con forma de frase. La nota que los reduce a "dolor abdominal en paciente con hernia conocida" no ha mentido; ha destruido información.</w:t>
+        <w:t xml:space="preserve">Carmen, por ejemplo, no dijo "dolor abdominal difuso": dijo que esta vez "la hernia no se dejó acomodar", que el dolor "era otro" y que por primera vez le dio miedo. No es folclor narrativo; son tres hallazgos semiológicos de alto valor: pérdida de reductibilidad aguda, cambio en el carácter del dolor —que sugiere sufrimiento parietal o vascular más allá de la distensión luminal— y percepción de amenaza vital. La nota que los aplana en "dolor abdominal en paciente con hernia conocida" no ha mentido: ha destruido evidencia diagnóstica primaria.</w:t>
       </w:r>
     </w:p>
     <w:p>
@@ -1671,7 +1671,7 @@
         <w:pStyle w:val="BodyJ"/>
       </w:pPr>
       <w:r>
-        <w:t xml:space="preserve">Por ello, conviene escribir los hechos de modo trazable. Una formulación como "shock séptico abdominal" fusiona estado fisiológico, etiología y foco. Una versión más limpia separa: hipotensión con requerimiento de noradrenalina, hiperlactatemia y relleno capilar prolongado; hemocultivos con bacilos gramnegativos; episodio obstructivo por hernia incisional; sin perforación, isquemia ni estrangulación en tomografía. Recién después puede formularse el foco abdominal como hipótesis probable.</w:t>
+        <w:t xml:space="preserve">Por ello, conviene registrar los hechos de modo trazable en el tiempo. Una etiqueta como "shock séptico abdominal" fusiona estado fisiológico, etiología microbiológica y foco anatómico en un solo bloque. Una formulación limpia separa las capas y sus momentos: al ingreso, hipotensión con requerimiento de noradrenalina, lactato de 6,0 mmol/L y llene capilar de 5 segundos; episodio obstructivo clínico sobre hernia incisional, sin signos tomográficos de perforación ni isquemia; y, a las 14 horas de incubación, hemocultivos periféricos positivos para bacilos gramnegativos. Recién sobre esa arquitectura de datos puede sostenerse el foco abdominal por translocación como hipótesis probable.</w:t>
       </w:r>
     </w:p>
     <w:p>
@@ -2520,7 +2520,7 @@
         </w:numPr>
       </w:pPr>
       <w:r>
-        <w:t xml:space="preserve">"Lactato 6,0 mmol/L (7:15, arterial)."</w:t>
+        <w:t xml:space="preserve">"Lactato 6,0 mmol/L (04:15, arterial)."</w:t>
       </w:r>
     </w:p>
     <w:p>
@@ -2583,7 +2583,7 @@
         <w:t xml:space="preserve">Solución comentada.</w:t>
       </w:r>
       <w:r>
-        <w:t xml:space="preserve"> (1) Medido, con hora y método: el hecho más sólido de la lista. (2) Observación profesional: sólida, pero reproducible sólo si consigna quién y cuándo examinó; en un abdomen que evoluciona, el examen de las 3:00 no cubre las 9:00. (3) Casi siempre heredado: pocas fichas registran quién documentó la alergia, cuándo y con qué reacción; merece la reescritura "alergia a penicilina referida por la paciente (rash, según recuerda; sin registro del episodio)". (4) Ausencia inferida o relato, según cómo se obtuvo: "niega sangrados previos" (relato) no equivale a "sin sangrados documentados en ficha" (revisión de registro). (5) Relato del paciente con material fenomenológico intacto: frágil como medición, valiosísimo como señal de cambio; consérvelo textual.</w:t>
+        <w:t xml:space="preserve"> (1) Dato medido, con hora, unidad y origen de la muestra: el hecho de mayor verificabilidad externa de la lista. (2) Observación profesional: útil, pero sujeta a variabilidad interobservador y caducidad rápida; en un abdomen agudo dinámico, el examen físico de las 04:00 no garantiza el estado peritoneal de las 09:00 si no consigna quién examinó y bajo qué analgesia. (3) Registro heredado: casi ninguna ficha especifica quién documentó la alergia ni con qué clínica; exige reescribirse como "alergia a penicilina referida por la paciente (exantema cutáneo en la juventud, sin registro clínico verificable)". (4) Silencio documental o relato, según su fuente: "niega sangrados previos" (anamnesis) no equivale a "sin episodios de sangrado consignados en fichas previas" (revisión de registro). (5) Testimonio de la paciente con su carga fenomenológica intacta: irreemplazable como marcador de cambio respecto de su basal; debe conservarse entre comillas.</w:t>
       </w:r>
     </w:p>
     <w:p>
@@ -2685,7 +2685,7 @@
         <w:pStyle w:val="BodyJ"/>
       </w:pPr>
       <w:r>
-        <w:t xml:space="preserve">En la carpeta de Carmen, la tomografía informa: "hernia incisional con asas dilatadas, sin signos de isquemia ni perforación". El residente escribe: "TAC descarta complicación". Son siete palabras que transforman un informe radiológico en una sentencia. Este capítulo trata del salto —inevitable, necesario, riesgoso— entre lo que vemos y lo que concluimos.</w:t>
+        <w:t xml:space="preserve">En el registro de Carmen, el informe tomográfico concluye: "hernia incisional con asas de intestino delgado dilatadas, sin signos de isquemia ni perforación". En la evolución de ingreso, el residente transcribe: "TAC descarta complicación". Son tres palabras que transforman una descripción radiológica acotada en una sentencia clínica absoluta. Este capítulo trata del salto —inevitable, necesario y riesgoso— entre los signos que observamos y las explicaciones que conjeturamos.</w:t>
       </w:r>
     </w:p>
     <w:p>
@@ -2751,7 +2751,7 @@
         <w:pStyle w:val="BodyJ"/>
       </w:pPr>
       <w:r>
-        <w:t xml:space="preserve">La compresión no debe confundirse con amputación. "Mujer de 60 años con dolor abdominal" tiene poco poder discriminativo. "Mujer de 60 años con hernia incisional y episodios recurrentes de suboclusión, que presenta obstrucción aguda asociada a shock, bacteriemia por gramnegativos y recuperación con soporte hemodinámico y antibióticos, sin signos tomográficos de isquemia o perforación" conserva temporalidad, recurrencia, gravedad, evidencia microbiológica y límites anatómicos.</w:t>
+        <w:t xml:space="preserve">La compresión semántica no debe confundirse con la amputación de datos críticos. "Mujer de 61 años con dolor abdominal" carece de poder discriminativo para activar un illness script específico. En cambio, "mujer de 61 años con hernia incisional y suboclusiones recurrentes autolimitadas, que cursa con un cuarto episodio obstructivo agudo, esta vez complicado con shock séptico por bacilos gramnegativos rápidamente reversible con soporte vasoactivo y antibióticos, sin signos tomográficos actuales de estrangulación ni perforación" conserva los calificadores que guían el razonamiento: temporalidad, cambio de patrón, gravedad fisiológica, microbiología y límites anatómicos.</w:t>
       </w:r>
     </w:p>
     <w:p>
@@ -2896,7 +2896,7 @@
         <w:t xml:space="preserve">Solución comentada.</w:t>
       </w:r>
       <w:r>
-        <w:t xml:space="preserve"> Una lista generativa razonable: tromboembolismo pulmonar (el EPOC es factor de riesgo, y las sibilancias escasas no explican la hipoxemia), neumotórax sobre bulas, insuficiencia cardiaca izquierda, neumonía en evolución, anemia, arritmia, derrame pleural, crisis de pánico superpuesta. La reformulación clave suele ser: "disnea desproporcionada a la obstrucción auscultada" — un problema distinto de "EPOC descompensado que no responde", porque abre el espacio donde viven el TEP y el neumotórax en vez de invitar a subir la dosis de lo mismo. Nótese el orden deliberado: primero volumen sin censura —la censura temprana es el mecanismo íntimo del cierre prematuro—, después poda severa. Tres minutos de generación cuestan menos que un día de anclaje.</w:t>
+        <w:t xml:space="preserve"> Una lista generativa sin censura inicial incluye: tromboembolismo pulmonar (el EPOC y la inmovilidad aumentan el riesgo, y la escasez de sibilancias no explica una saturación de 89%), neumotórax secundario a ruptura de bula, edema pulmonar cardiogénico, neumonía basal oculta, síndrome coronario agudo con equivalente disneico, anemia severa o fatiga muscular respiratoria. La reformulación que replantea el problema (problem setting) es: "insuficiencia respiratoria hipoxémica aguda desproporcionada al broncoespasmo auscultado". Ese giro lingüístico desactiva el reflejo de indicar una tercera tanda de nebulizaciones y abre el espacio mental donde viven el TEP y el neumotórax. Nótese la secuencia: primero volumen divergente sin filtro —pues la autocensura temprana es el motor del cierre prematuro— y recién después poda severa contra los datos del caso. Tres minutos de generación libre cuestan mucho menos que veinticuatro horas de anclaje.</w:t>
       </w:r>
     </w:p>
     <w:p>
@@ -3025,17 +3025,7 @@
         <w:t xml:space="preserve">Solución comentada.</w:t>
       </w:r>
       <w:r>
-        <w:t xml:space="preserve"> Una versión defendible: "TAC sin signos de isquemia, perforación ni estrangulación </w:t>
-      </w:r>
-      <w:r>
-        <w:rPr>
-          <w:b/>
-          <w:bCs/>
-        </w:rPr>
-        <w:t xml:space="preserve">en este momento</w:t>
-      </w:r>
-      <w:r>
-        <w:t xml:space="preserve">; no excluye isquemia incipiente ni predice recurrencia. Con clínica y laboratorio actuales, baja probabilidad de complicación anatómica que exija cirugía de emergencia." La diferencia no es cosmética: "descarta complicación" cierra la vigilancia; la reescritura define qué se vigila (deterioro clínico, nuevo dolor desproporcionado, lactato en ascenso) y qué autoriza (no operar de urgencia ahora, no "no operar nunca"). Nótese el patrón general: el hallazgo negativo se limita al rendimiento del método y al momento; la conducta se justifica por umbral, no por exclusión ontológica.</w:t>
+        <w:t xml:space="preserve"> Una formulación epistemológicamente rigurosa: "TAC de abdomen confirma obstrucción en hernia incisional sin signos actuales de necrosis transmural, perforación ni sufrimiento vascular mesentérico; por sensibilidad del método, la imagen no excluye isquemia mucosa incipiente ni predice recurrencia a corto plazo. Con la estabilización hemodinámica actual, la probabilidad de estrangulación irreversible es suficientemente baja para diferir cirugía de emergencia y mantener vigilancia activa". La diferencia es operativa: "TAC descarta complicación" apaga las alarmas del equipo; la reescritura especifica qué amenaza sigue viva, qué parámetros obligan a reevaluar (reaparición del dolor, defensa abdominal, ascenso del lactato) y qué autoriza realmente el examen (no entrar a pabellón esta madrugada, no archivar el problema quirúrgico). Nótese el patrón general: el hallazgo negativo se limita al rendimiento del método y al momento; la conducta se justifica por umbral, no por exclusión ontológica.</w:t>
       </w:r>
     </w:p>
     <w:p>
@@ -3137,7 +3127,7 @@
         <w:pStyle w:val="BodyJ"/>
       </w:pPr>
       <w:r>
-        <w:t xml:space="preserve">A las 48 horas, Carmen está estable, afebril, con la sonda en declive. La familia pregunta: "¿Ya saben qué tuvo?". El equipo sabe muchas cosas: que hubo obstrucción, que hubo shock, que los hemocultivos crecieron gramnegativos, que la imagen no mostró isquemia. Y no sabe otras: por qué esta vez fue tan grave, si la bacteriemia vino del abdomen, cuándo volverá a obstruirse. "¿Ya saben qué tuvo?" tiene, en rigor, varias respuestas simultáneas. Este capítulo trata de cómo nombrarlas sin mentir en ninguna dirección.</w:t>
+        <w:t xml:space="preserve">A las 48 horas del ingreso, Carmen está hemodinámicamente estable, afebril y con la sonda nasogástrica aún a caída libre. En la visita, la familia hace la pregunta inevitable: "Doctor, ¿ya saben qué tuvo?". El equipo conoce varios hechos: que hubo una obstrucción intestinal mecánica, que desencadenó un shock grave, que en la sangre crecieron bacilos gramnegativos y que el escáner inicial no mostró intestino necrótico. Pero desconoce otras capas del mismo fenómeno: por qué este cuarto episodio escaló hasta el shock (incertidumbre fisiopatológica), si las bacterias cruzaron desde la pared intestinal inflamada (incertidumbre causal) y cuándo volverá a atascarse la hernia (incertidumbre pronóstica). "¿Ya saben qué tuvo?" exige, en rigor, varias respuestas simultáneas. Este capítulo trata de cómo cartografiarlas y nombrarlas sin mentir en ninguna dirección.</w:t>
       </w:r>
     </w:p>
     <w:p>
@@ -3202,7 +3192,7 @@
             <w:r>
               <w:drawing>
                 <wp:inline distT="0" distB="0" distL="0" distR="0">
-                  <wp:extent cx="5619750" cy="3095625"/>
+                  <wp:extent cx="5619750" cy="3133725"/>
                   <wp:effectExtent t="0" r="0" b="0" l="0"/>
                   <wp:docPr id="1" name="" descr="" title=""/>
                   <wp:cNvGraphicFramePr>
@@ -3227,7 +3217,7 @@
                         <pic:spPr bwMode="auto">
                           <a:xfrm>
                             <a:off x="0" y="0"/>
-                            <a:ext cx="5619750" cy="3095625"/>
+                            <a:ext cx="5619750" cy="3133725"/>
                           </a:xfrm>
                           <a:prstGeom prst="rect">
                             <a:avLst/>
@@ -3335,7 +3325,7 @@
         <w:pStyle w:val="BodyJ"/>
       </w:pPr>
       <w:r>
-        <w:t xml:space="preserve">Decir "todo es incierto" no aporta. La incertidumbre útil es específica. Puede formularse así: el diagnóstico principal es probable, pero el mecanismo exacto no está demostrado; la infección parece poco probable, aunque no puede excluirse por ausencia de síntomas típicos; la imagen no muestra isquemia en este momento, pero no elimina el riesgo de recurrencia; la respuesta terapéutica apoya una hipótesis, sin ser específica de ella.</w:t>
+        <w:t xml:space="preserve">Declarar que "en medicina todo es incierto" es una coartada retórica que no guía ninguna conducta. La incertidumbre clínicamente útil es localizada y específica. En lugar de una duda global, desglosa el límite de cada afirmación: el foco abdominal de la sepsis es altamente probable por secuencia clínica, pero el mecanismo exacto de translocación no es demostrable directamente; la tomografía excluye perforación actual, pero su normalidad vascular no garantiza que el asa no sufra en un próximo atascamiento; y, en otro dominio, en un paciente con vejiga neurogénica febril una infección urinaria no puede descartarse sólo por la ausencia de disuria. Nombrar qué parte exacta del modelo está abierta es lo que permite decidir qué se estudia con un examen y qué se gobierna con vigilancia.</w:t>
       </w:r>
     </w:p>
     <w:p>
@@ -3483,7 +3473,7 @@
         <w:t xml:space="preserve">Solución comentada.</w:t>
       </w:r>
       <w:r>
-        <w:t xml:space="preserve"> (a) Parcialmente reducible (revisar imagen, laboratorio, cronología) pero con residuo probablemente irreductible: puede quedar "no demostrado" sin bloquear ninguna decisión. (b) Reducible sólo en parte (cultivos, foco alternativo); importa porque cambia la duración antibiótica, no la conducta quirúrgica: incertidumbre tolerable con decisión robusta. (c) Irreductible por examen: sólo la evolución la aclarará; es la duda </w:t>
+        <w:t xml:space="preserve"> (a) Parcialmente reducible y retrospectiva: revisar la cronología y la imagen ayuda, pero quedará un residuo fisiopatológico no demostrable que no bloquea la toma de decisiones hoy. (b) Parcialmente reducible mediante descarte de focos alternativos (urocultivo, revisión de catéteres): no exige certeza absoluta para completar el esquema antibiótico, pero su alta plausibilidad refuerza que el shock fue consecuencia directa del episodio obstructivo. (c) Aleatoria e irreductible mediante exámenes: ningún test predice el día del quinto atascamiento; es la incertidumbre </w:t>
       </w:r>
       <w:r>
         <w:rPr>
@@ -3493,7 +3483,7 @@
         <w:t xml:space="preserve">peligrosa</w:t>
       </w:r>
       <w:r>
-        <w:t xml:space="preserve">, porque el error (esperar y que el próximo episodio sea peor) tiene el costo más alto. Domina la decisión. (d) Mixta: la evaluación preoperatoria la reduce; el resto es preferencia de Carmen —cuánto riesgo quirúrgico acepta hoy para evitar un riesgo obstructivo mañana—, es decir, valores. La clasificación no resuelve el caso: ordena qué se estudia, qué se vigila, qué se conversa y qué se tolera.</w:t>
+        <w:t xml:space="preserve"> y dominante del caso, porque el costo del error (esperar y que se obstruya en su casa) puede ser letal. (d) Mixta (epistémica y axiológica): la espirometría y la evaluación preoperatoria reducen la duda biológica, pero el resto depende de los valores de Carmen —cuánto riesgo quirúrgico programado está dispuesta a asumir hoy para evitar una urgencia vital mañana—. La cartografía no adivina el futuro: ordena qué se mide, qué se vigila, qué se tolera y qué se delibera con la enferma.</w:t>
       </w:r>
     </w:p>
     <w:p>
@@ -3595,7 +3585,7 @@
         <w:pStyle w:val="BodyJ"/>
       </w:pPr>
       <w:r>
-        <w:t xml:space="preserve">En el pase de sala, dos residentes presentan a la misma Carmen. Uno dice: "Paciente con hernia y sepsis, actualmente mejor". La otra dice: "Episodio obstructivo recurrente por hernia incisional, esta vez asociado a bacteriemia por gramnegativos, shock e hipoperfusión grave, con resolución bajo soporte y antibióticos y sin signos tomográficos de isquemia o perforación; la mayor gravedad redefine el riesgo de una nueva estrategia expectante". Los dos dicen la verdad. Sólo una de las dos frases piensa.</w:t>
+        <w:t xml:space="preserve">En la visita médica de la mañana, dos residentes resumen el caso de Carmen con los mismos datos sobre la mesa. El primero dice: "Paciente con hernia complicada y sepsis, actualmente mejor". La segunda presenta: "Cuarto episodio obstructivo en el año por hernia incisional, esta vez debutando con shock séptico y bacteriemia por bacilos gramnegativos, revertido con vasopresores y antibióticos, sin signos tomográficos de isquemia aguda; el salto cualitativo de gravedad modifica el riesgo de mantener una conducta expectante". Ambos dicen la verdad. Sólo una de las dos frases piensa.</w:t>
       </w:r>
     </w:p>
     <w:p>
@@ -4468,7 +4458,7 @@
         <w:pStyle w:val="BodyJ"/>
       </w:pPr>
       <w:r>
-        <w:t xml:space="preserve">Una frase operativa enlaza comprensión con acción. No prescribe necesariamente una conducta única, pero explica por qué cambia el umbral. "Tercer episodio de suboclusión" informa recurrencia; "primer episodio complicado por shock y bacteriemia" informa un cambio cualitativo; "sin evidencia de isquemia actual" limita la urgencia anatómica; "riesgo de nueva recurrencia potencialmente grave" informa la oportunidad de resolución electiva.</w:t>
+        <w:t xml:space="preserve">Una frase operativa actúa como un argumento de Toulmin comprimido: enlaza el dato observado con la acción a través de una garantía clínica explícita. No prescribe necesariamente una conducta única, pero transparenta por qué se desplaza el umbral terapéutico. "Cuarto episodio de suboclusión en doce meses" documenta aceleración de la frecuencia; "primer ingreso complicado con shock y bacteriemia" establece un cambio cualitativo en la severidad biológica; "sin evidencia tomográfica de isquemia actual" acota la urgencia quirúrgica inmediata; y "alto riesgo de recurrencia grave fuera del hospital" fundamenta la indicación de reparación electiva pronta.</w:t>
       </w:r>
     </w:p>
     <w:p>
@@ -4509,7 +4499,7 @@
         <w:pStyle w:val="BodyJ"/>
       </w:pPr>
       <w:r>
-        <w:t xml:space="preserve">La estructura gramatical puede mostrar o esconder causalidad. "Shock séptico por hernia" comprime una cadena compleja en una preposición. "Shock con bacteriemia por gramnegativos, temporalmente asociado a obstrucción por hernia; foco abdominal probable, mecanismo exacto no demostrado" separa observación, asociación e inferencia causal. La segunda formulación es más larga, pero también más auditable.</w:t>
+        <w:t xml:space="preserve">La sintaxis misma funciona como un registro de auditoría causal. Escribir "shock séptico por hernia incisional" esconde una cadena fisiopatológica incierta detrás de una preposición. En cambio, "shock séptico con bacteriemia por gramnegativos, temporalmente asociado a obstrucción mecánica en hernia incisional; foco abdominal altamente probable por translocación, mecanismo exacto no demostrado" separa el fenómeno medido, la asociación temporal y el calificador modal de la inferencia. La segunda versión ocupa dos líneas más, pero permite que cualquier miembro del equipo audite dónde termina el hecho y dónde empieza la hipótesis.</w:t>
       </w:r>
     </w:p>
     <w:p>
@@ -4616,7 +4606,7 @@
         <w:t xml:space="preserve">Solución comentada.</w:t>
       </w:r>
       <w:r>
-        <w:t xml:space="preserve"> (1) "AngioTAC sin evidencia de TEP; probabilidad clínica pretest baja: no se justifica más estudio por ahora" —el método, su resultado y la decisión por umbral quedan separados. (2) "Infiltrado con mejoría clínica bajo antibióticos, soporte y kinesioterapia simultáneos; etiología bacteriana probable, no demostrada" —la respuesta terapéutica es un hecho; su atribución causal, una inferencia. (3) "Responde con monosílabos; refiere dolor 8/10 y no durmió; evaluación limitada por dolor no controlado" —el adjetivo moral se sustituye por observaciones y una causa verificable. (4) "Bacteriuria en usuario de sonda, sin síndrome clínico atribuible: no se trata; vigilancia según criterios explícitos" —la etiqueta "ITU" activaba antibióticos que los hechos no piden. (5) "Objetivo del manejo médico era X durante Y días; se alcanzó/no se alcanzó Z; el balance cambia por W" —"fracaso" sin objetivo, plazo ni desenlace es retórica, no evaluación.</w:t>
+        <w:t xml:space="preserve"> (1) "AngioTAC de tórax sin defectos de llenado hasta arterias segmentarias; con probabilidad clínica pretest intermedia y estabilidad hemodinámica, el valor predictivo negativo supera el umbral para no anticoagular y mantener vigilancia clínica" —separa la técnica, su alcance anatómico y la decisión por umbral—. (2) "Opacidad alveolar basal con defervescencia y caída de parámetros inflamatorios tras 72 h de ceftriaxona, oxigenoterapia y kinesioterapia respiratoria; neumonía bacteriana probable, respuesta microbiológica directa no demostrada" —distingue el hecho de la mejoría temporal de la atribución causal a un solo factor—. (3) "Paciente responde con monosílabos, se queja de dolor 8/10 y cursó con insomnio; anamnesis y examen físico limitados por dolor agudo no controlado" —reemplaza una etiqueta moralizante por una barrera clínica modificable—. (4) "Bacteriuria y piuria asintomática en portador crónico de sonda Foley, afebril y sin respuesta inflamatoria sistémica nueva: colonización probable; se difiere antibiótico y se definen criterios de alarma" —desactiva el reflejo de tratar el papel del laboratorio—. (5) "El manejo médico con reposo intestinal y descompresión por sonda nasogástrica tenía como meta recuperar tránsito en 48 h; al persistir débito alto al tercer día, se cumple criterio de resolución quirúrgica" —sustituye la retórica de "fracaso" por el cumplimiento de un umbral predefinido—.</w:t>
       </w:r>
     </w:p>
     <w:p>
@@ -4733,7 +4723,7 @@
         <w:t xml:space="preserve">Hechos.</w:t>
       </w:r>
       <w:r>
-        <w:t xml:space="preserve"> Cuarto episodio obstructivo en doce meses en hernia incisional conocida (tres previos resueltos con manejo médico, según fichas de esos ingresos). Este episodio: hipotensión con requerimiento de noradrenalina por 36 horas, lactato máximo 6,0 (7:15 del ingreso, arterial), relleno capilar 5 segundos documentado por enfermería, hemocultivos 2/2 con bacilos gramnegativos (identificación pendiente), TAC de ingreso sin signos de isquemia, perforación ni estrangulación. Afebril y sin drogas vasoactivas desde hace 24 horas. Refiere, textual: "esta vez la hernia no se dejó acomodar, el dolor era otro".</w:t>
+        <w:t xml:space="preserve"> Cuarto episodio obstructivo en doce meses sobre hernia incisional conocida (tres ingresos previos resueltos con manejo conservador según registro clínico). Episodio actual: ingresó de madrugada en shock con requerimiento de noradrenalina por 36 horas, lactato arterial máximo de 6,0 mmol/L (04:15 h del ingreso) y llene capilar de 5 segundos documentado por enfermería en urgencias. Hemocultivos periféricos 2/2 positivos a las 14 h para Escherichia coli multisensible. TAC de abdomen de ingreso con asas dilatadas en saco herniario, sin signos de isquemia, neumatosis ni perforación. Actualmente en su tercer día: afebril, sin vasoactivos hace 24 horas y con débito por sonda en descenso. Relato de ingreso textual: "esta vez la hernia no se dejó acomodar, el dolor era otro".</w:t>
       </w:r>
     </w:p>
     <w:p>
@@ -4748,7 +4738,7 @@
         <w:t xml:space="preserve">Inferencias.</w:t>
       </w:r>
       <w:r>
-        <w:t xml:space="preserve"> Obstrucción intestinal por hernia incisional: demostrada. Foco abdominal de la bacteriemia: probable (secuencia temporal y microbiología compatible; sin foco alternativo evidente); mecanismo exacto —¿translocación?, ¿isquemia transitoria no captada?— no demostrado. Gravedad de este episodio: cualitativamente distinta de los previos (primer shock, primera bacteriemia).</w:t>
+        <w:t xml:space="preserve"> Obstrucción intestinal mecánica por hernia incisional: demostrada. Sepsis de foco abdominal por translocación bacteriana secundaria al atascamiento: altamente probable (concordancia temporal, aislamiento de enterobacteria comunitaria en sangre y ausencia de foco urinario o respiratorio); isquemia parietal transitoria ya resuelta como mecanismo subyacente: posible, no demostrada. Severidad del cuadro: cualitativamente superior a la serie histórica de la paciente.</w:t>
       </w:r>
     </w:p>
     <w:p>
@@ -4849,7 +4839,7 @@
         <w:pStyle w:val="BodyJ"/>
       </w:pPr>
       <w:r>
-        <w:t xml:space="preserve">Hay un momento, en la madrugada de cualquier turno, en que el diagnóstico "se siente" correcto. Yo aprendí a desconfiar de esa sensación una noche en que la sentí con total nitidez: un cólico renal típico, dolor lumbar irradiado, un paciente joven que se retorcía. Estaba tan seguro que casi no examiné el abdomen. El aneurisma lo encontró el ecografista de la mañana. Desde entonces distingo dos preguntas que esa noche confundí: "¿qué tan seguro me siento?" y "¿qué tan probable es que esté en lo cierto?". Este capítulo trata de la diferencia entre ambas.</w:t>
+        <w:t xml:space="preserve">Hay un momento, en la madrugada de cualquier turno, en que el diagnóstico "se siente" correcto. Yo aprendí a desconfiar de esa sensación una noche en que la experimenté con total nitidez: un hombre de sesenta y ocho años, hipertenso y sin historia de urolitiasis, que se retorcía en la camilla con un dolor lumbar brusco irradiado al flanco izquierdo y microhematuria en la cinta reactiva. El cuadro gritaba "cólico renal" con tal fluidez que casi no palpé el abdomen ni busqué latidos expansivos. El aneurisma de aorta abdominal fisurado lo encontró el radiólogo en la ecografía de la mañana. Desde entonces distingo dos preguntas que esa madrugada confundí: "¿qué tan seguro me siento?" y "¿qué tan probable es que esté en lo cierto?". Este capítulo trata de la brecha entre ambas.</w:t>
       </w:r>
     </w:p>
     <w:p>
@@ -5154,7 +5144,7 @@
         <w:pStyle w:val="BodyJ"/>
       </w:pPr>
       <w:r>
-        <w:t xml:space="preserve">Mi cólico renal de aquella noche tenía todas las claves de la fluidez: el patrón era típico, yo lo había visto muchas veces, el relato era coherente. Ninguna de esas claves medía lo único que importaba: la probabilidad de que otra enfermedad estuviera imitando el patrón. La pregunta productiva no es "¿debo confiar en mi intuición?", sino "¿qué condiciones hacen confiable esta intuición?". La validez aumenta cuando el ambiente posee regularidades estables, existe experiencia extensa y hubo retroalimentación oportuna. Disminuye en dominios raros, cambiantes, con feedback demorado o señales engañosas.</w:t>
+        <w:t xml:space="preserve">Mi falso cólico renal de aquella noche reunía todas las claves de la fluidez cognitiva de Koriat: el patrón clínico era arquetípico, yo había tratado decenas de cólicos similares en urgencias y el relato cerraba sin fisuras. Pero ninguna de esas señales internas medía lo único determinante para la sobrevida del enfermo: la probabilidad previa de que, en un hipertenso de casi setenta años que debuta con dolor lumbar agudo, una catástrofe aórtica estuviera imitando el patrón urológico. La pregunta metacognitiva útil no es "¿debo confiar en mi intuición?", sino "¿bajo qué condiciones ecológicas es confiable esta intuición?". Como mostraron Kahneman y Klein, la validez intuitiva aumenta cuando el entorno posee regularidades estables, existe exposición extensa y el clínico recibe retroalimentación oportuna sobre sus aciertos y errores; se desploma, en cambio, frente a presentaciones solapadas donde el desenlace real ocurre horas después y en otro servicio (Kahneman &amp; Klein, 2009).</w:t>
       </w:r>
     </w:p>
     <w:p>
@@ -5369,7 +5359,7 @@
         <w:pStyle w:val="BodyJ"/>
       </w:pPr>
       <w:r>
-        <w:t xml:space="preserve">La cirujana que evaluó a Carmen tardó menos de un minuto en decir "esta hernia hay que operarla electivamente, pero no hoy". Un interno que la acompañaba anotó la conclusión; lo que no pudo anotar fue el proceso, porque la cirujana misma no habría podido enumerarlo completo: algo en la consistencia del abdomen, en la curva del lactato, en haber operado doscientas hernias parecidas. Este capítulo trata de ese conocimiento que funciona antes de poder explicarse.</w:t>
+        <w:t xml:space="preserve">La cirujana que evaluó a Carmen tardó menos de un minuto junto a la cama en concluir: "Esta hernia hay que operarla de forma programada antes de que se vaya de alta, o apenas se recupere, pero no hoy en urgencia". El interno que la acompañaba anotó la indicación en la ficha; lo que no pudo anotar fue el razonamiento, porque ni la propia cirujana lo había formulado paso a paso antes de hablar: había algo en la tensión elástica del saco herniario, en la pendiente descendente del lactato y en la memoria muscular de haber operado doscientas paredes abdominales complejas. Este capítulo trata de ese conocimiento tácito que acierta antes de poder explicarse.</w:t>
       </w:r>
     </w:p>
     <w:p>
@@ -5558,7 +5548,7 @@
         <w:pStyle w:val="BodyJ"/>
       </w:pPr>
       <w:r>
-        <w:t xml:space="preserve">La enseñanza de la pericia no puede consistir sólo en transmitir conclusiones. Debe hacer visible qué características fueron decisivas, qué alternativas fueron descartadas, qué incertidumbres permanecieron y qué señal habría obligado a cambiar. Cuando el interno le preguntó a la cirujana cómo lo supo tan rápido, ella hizo el ejercicio: la gravedad fisiológica sin correlato anatómico en la imagen, la recurrencia acelerándose, el abdomen que "avisa pero todavía no exige". El razonamiento del experto necesita ser desempaquetado para que el aprendiz no copie únicamente su seguridad.</w:t>
+        <w:t xml:space="preserve">Enseñar la pericia clínica no puede reducirse a dictar conclusiones. Exige hacer visible qué pistas perceptivas resultaron decisivas, qué alternativas se descartaron en silencio y qué hallazgo físico habría cambiado la mano. Cuando el interno le preguntó en el pasillo cómo lo había decidido tan rápido, la cirujana hizo el ejercicio de desempaquetar su intuición: un episodio que demostró potencial letal (shock séptico) pese a un escáner sin necrosis, intervalos libres de enfermedad cada vez más cortos y un examen físico donde el abdomen "avisa pero todavía no exige" —una hernia parcialmente reductible, sensible en el anillo fibroso, pero con pared blanda y sin sufrimiento cutáneo ni irritación peritoneal—. Desplegar el juicio experto en variables observables es lo único que impide que el aprendiz imite el tono de autoridad sin haber adquirido los criterios que lo sostienen.</w:t>
       </w:r>
     </w:p>
     <w:p>
@@ -5676,7 +5666,7 @@
         <w:pStyle w:val="BodyJ"/>
       </w:pPr>
       <w:r>
-        <w:t xml:space="preserve">Voy a contar un error mío. Una paciente mayor, traída por su hija, con decaimiento y orina turbia. La nota de urgencias decía "ITU a repetición"; el urocultivo del ingreso salió positivo. Indiqué el antibiótico, anoté "ITU, evolución favorable esperable" y pasé al siguiente ingreso. Al tercer día, la paciente seguía decaída; al cuarto hizo fiebre y el abdomen se defendió: colecistitis aguda, ya complicada. Durante años conté esta historia como "me anclé". Hoy creo que esa etiqueta, aunque correcta, era otra forma de cierre prematuro: nombrar el sesgo me eximía de reconstruir cómo se produjo el error —una nota heredada con autoridad de hecho, un cultivo que confirmaba lo que yo ya creía, una sala llena, un abdomen que examiné mal porque no esperaba encontrar nada. Este capítulo trata de esa reconstrucción.</w:t>
+        <w:t xml:space="preserve">Voy a contar un error mío. Una paciente de ochenta y dos años, traída por su hija por decaimiento hipoactivo de dos días y orina de mal olor. La hoja de atención de urgencias traía escrito "antecedente de ITU a repetición", el sedimento mostraba piuria y el urocultivo preliminar informó desarrollo bacteriano. Indiqué ceftriaxona, escribí "ITU baja/alta en anciana frágil, evolución favorable esperable" y pasé al siguiente ingreso de la tarde. Al tercer día la paciente seguía postrada e inapetente; al cuarto agregó fiebre alta, ictericia subclínica y defensa en el hipocondrio derecho: era una colecistitis aguda gangrenosa. Durante años conté este caso diciendo "me anclé en la ITU". Hoy entiendo que esa etiqueta psicológica, aunque cierta, era otra forma de cierre prematuro: bautizar el sesgo me ahorraba reconstruir la arquitectura real del fallo. Este capítulo trata de esa reconstrucción.</w:t>
       </w:r>
     </w:p>
     <w:p>
@@ -5742,7 +5732,7 @@
         <w:pStyle w:val="BodyJ"/>
       </w:pPr>
       <w:r>
-        <w:t xml:space="preserve">Mi error con la colecistitis, reconstruido como trayectoria, tiene por lo menos cinco estaciones: una frase heredada ("ITU a repetición") que llegó con estatus de antecedente; un dato confirmatorio (urocultivo) que en una paciente mayor con sondajes previos confirmaba mucho menos de lo que yo le atribuí; un examen abdominal hecho para no encontrar; dos días de evolución "atípica" que reinterpreté para que encajara ("las viejitas responden lento"); y la ausencia de cualquier disparador externo —una pausa, una pregunta de otro, un criterio de reevaluación escrito— que me obligara a mirar de nuevo. El "anclaje" está ahí, pero el error es la trayectoria completa. La responsabilidad cognitiva individual no desaparece; se vuelve contextual.</w:t>
+        <w:t xml:space="preserve">Mi error con aquella colecistitis, analizado como trayectoria ecológica y no como pecado mental aislado, recorrió al menos cinco estaciones: primero, una frase heredada de urgencias ("ITU a repetición") que ingresó a mi nota con jerarquía de hecho comprobado; segundo, un error de ponderación bayesiana al olvidar que la bacteriuria asintomática ronda el 20% en mujeres de ochenta años o más que viven en la comunidad, y es todavía más frecuente en las institucionalizadas (Nicolle et al., 2019), de modo que un urocultivo positivo sin disuria ni dolor lumbar tenía un valor predictivo bajísimo para explicar su postración aguda; tercero, un examen abdominal superficial practicado por trámite porque mi hipótesis ya estaba cerrada; cuarto, cuarenta y ocho horas de falta de respuesta clínica que inmunicé con un lugar común geriátrico ("los adultos mayores tardan más en prender con el antibiótico"); y quinto, un diseño de trabajo sin barreras de salida —ningún criterio escrito de reevaluación a las 48 horas ni una pregunta en la visita de sala que desafiara la etiqueta inicial—. El sesgo de anclaje estuvo presente, pero el error fue el sistema completo operando en línea. La responsabilidad cognitiva individual no desaparece; se vuelve contextual.</w:t>
       </w:r>
     </w:p>
     <w:p>
@@ -5956,7 +5946,7 @@
         <w:t xml:space="preserve">Solución comentada.</w:t>
       </w:r>
       <w:r>
-        <w:t xml:space="preserve"> Sobre el caso del capítulo: (1) "ITU a repetición" viajaba como antecedente sin procedencia —el formato (frase heredada en ficha) le daba más autoridad que su origen (nadie sabía quién la escribió ni con qué base). (2) El urocultivo: en una mujer mayor con sondajes previos, la bacteriuria tiene alta prevalencia basal; confirma poco cuando la probabilidad pretest de otra causa es sustancial. (3) El día 3: "sigue decaída" se convirtió en "responde lento", una reinterpretación que inmunizaba la hipótesis. (4) Dos barreras baratas: un criterio de reevaluación escrito al indicar el antibiótico ("si no mejora en 48 h, reexaminar abdomen y ampliar estudio") y una pausa de pase de visita con la pregunta "¿qué no explica la ITU?" —el decaimiento desproporcionado no lo explicaba. El ejercicio termina cuando puede formular la barrera, no cuando encuentra al culpable.</w:t>
+        <w:t xml:space="preserve"> Sobre el caso del capítulo: (1) "ITU a repetición" viajaba como antecedente sin procedencia —el formato (frase heredada en ficha) le daba más autoridad que su origen (nadie sabía quién la escribió ni con qué base). (2) El urocultivo: en una mujer de ochenta y dos años sin síndrome miccional, la bacteriuria tiene alta prevalencia basal; confirma poco cuando la probabilidad pretest de otra causa es sustancial. (3) El día 3: "sigue decaída" se convirtió en "responde lento", una reinterpretación que inmunizaba la hipótesis. (4) Dos barreras de bajo costo y alto impacto: dejar escrito un criterio de reapertura obligatorio al indicar el tratamiento empírico ("si no recupera estado basal ni apetito en 48 h, reexaminar abdomen dirigido y solicitar pruebas hepáticas o imagen") e instituir en la visita médica de sala la pregunta de resistencia: "¿qué hallazgo de esta paciente no queda explicado por una infección urinaria?". La hipoactividad severa sin síndrome miccional era la pieza suelta. El análisis de trayectoria termina cuando se diseña la barrera operativa, no cuando se rotula el sesgo del médico.</w:t>
       </w:r>
     </w:p>
     <w:p>
@@ -6058,7 +6048,7 @@
         <w:pStyle w:val="BodyJ"/>
       </w:pPr>
       <w:r>
-        <w:t xml:space="preserve">En el pase de las 8:00, el caso de la sala 12 se presenta en cuarenta segundos: "pielonefritis en tratamiento, afebril, buena respuesta". La jefa de sala mira dos segundos la hoja y dice: "Preséntenmelo de nuevo, pero sin usar la palabra pielonefritis". El residente empieza: "Paciente sondado, afebril, hemodinámicamente estable, con orina turbia, piuria y urocultivo positivo, sin síntomas urinarios evaluables por lesión medular, con marcadores inflamatorios elevados y una neoplasia activa como explicación alternativa...". A la tercera frase, ya nadie en la sala está seguro del diagnóstico. Ese es exactamente el punto.</w:t>
+        <w:t xml:space="preserve">En la visita médica de las 8:30, el residente presenta la cama 12 en cuarenta segundos: "Pielonefritis aguda en su tercer día de tratamiento antibiótico, afebril, con buena respuesta clínica". La internista a cargo de la sala mira dos segundos la curva de signos vitales y los exámenes en pantalla y le pide: "Preséntamelo de nuevo, pero sin usar la palabra pielonefritis ni infección". El residente toma aire y reestructura: "Hombre con lesión medular completa y usuario crónico de sonda Foley; tras recambio traumático de sonda presentó orina turbia, piuria y urocultivo positivo, manteniéndose siempre afebril, hemodinámicamente estable y sin disuria ni dolor lumbar evaluables por su nivel lesional; cursa con PCR elevada estable y tiene un cáncer renal metastásico activo como causa inflamatoria concomitante...". Antes de terminar la tercera oración, ya nadie en la sala cree que el paciente tenga una pielonefritis. Ese es exactamente el punto de este capítulo.</w:t>
       </w:r>
     </w:p>
     <w:p>
@@ -6250,7 +6240,7 @@
         <w:pStyle w:val="BodyJ"/>
       </w:pPr>
       <w:r>
-        <w:t xml:space="preserve">Una pausa diagnóstica puede incorporarse a rondas, altas y transferencias. No necesita preguntar por todas las enfermedades posibles. Debe focalizarse en riesgos: ¿qué podría estar pasando que no estamos tratando?, ¿qué supuesto no verificamos?, ¿qué explicación alternativa cambia el destino o el tiempo de intervención?</w:t>
+        <w:t xml:space="preserve">Una pausa diagnóstica puede incorporarse a visitas de sala, altas y entregas de turno. No necesita preguntar por todas las enfermedades posibles. Debe focalizarse en riesgos: ¿qué podría estar pasando que no estamos tratando?, ¿qué supuesto no verificamos?, ¿qué explicación alternativa cambia el destino o el tiempo de intervención?</w:t>
       </w:r>
     </w:p>
     <w:p>
@@ -6323,7 +6313,7 @@
         <w:pStyle w:val="BodyJ"/>
       </w:pPr>
       <w:r>
-        <w:t xml:space="preserve">Elija el paciente de su lista actual cuyo diagnóstico lleva más días sin discutirse. Preséntelo por escrito en cinco líneas sin usar el diagnóstico de trabajo ni sus sinónimos. Luego responda: ¿qué dato reapareció que la etiqueta tenía subordinado?, ¿qué hipótesis alternativa se volvió formulable?, ¿la conducta actual sigue siendo la mejor para la nueva descripción?</w:t>
+        <w:t xml:space="preserve">Elija al paciente hospitalizado de su lista actual cuyo diagnóstico de ingreso lleve más días repitiéndose en las evoluciones sin ser cuestionado. Redacte su presentación en cinco líneas describiendo exclusivamente los hallazgos primarios, la línea temporal y el contexto basal, con prohibición estricta de usar el diagnóstico de trabajo o sus sinónimos. Luego responda: ¿qué dato discordante reapareció apenas quitó la etiqueta que lo mantenía subordinado?, ¿qué hipótesis alternativa se volvió visible?, ¿se sostiene el plan terapéutico actual frente a la nueva representación?</w:t>
       </w:r>
     </w:p>
     <w:p>
@@ -6338,7 +6328,7 @@
         <w:t xml:space="preserve">Solución comentada.</w:t>
       </w:r>
       <w:r>
-        <w:t xml:space="preserve"> El ejercicio funciona por sustracción: la etiqueta organiza la percepción, y quitarla obliga a re-observar. En el caso de la sala 12, la reformulación hizo visible que (a) los "síntomas urinarios" eran inevaluables —dato clave que la palabra "pielonefritis" ocultaba—, (b) los marcadores inflamatorios tenían una explicación alternativa activa (neoplasia), y (c) la "buena respuesta" era atribuible al menos a dos causas. Nada de eso exige cambiar el tratamiento hoy; exige saber qué se vigila y qué reabriría el caso. Si al hacer el ejercicio con su propio paciente no reaparece ningún dato, enhorabuena: la etiqueta probablemente está bien puesta. El costo fueron cinco minutos; el beneficio, saberlo.</w:t>
+        <w:t xml:space="preserve"> El ejercicio funciona por sustracción: la etiqueta organiza la percepción, y quitarla obliga a re-observar. En el caso de la cama 12, la reformulación hizo visible que (a) los "síntomas urinarios" eran inevaluables —dato clave que la palabra "pielonefritis" ocultaba—, (b) los marcadores inflamatorios tenían una explicación alternativa activa (neoplasia), y (c) la "buena respuesta" era atribuible al menos a dos causas. Nada de eso exige cambiar el tratamiento hoy; exige saber qué se vigila y qué reabriría el caso. Si al hacer el ejercicio con su propio paciente no reaparece ningún dato, enhorabuena: la etiqueta probablemente está bien puesta. El costo fueron cinco minutos; el beneficio, saberlo.</w:t>
       </w:r>
     </w:p>
     <w:p>
@@ -6464,15 +6454,15 @@
         <w:pStyle w:val="BodyJ"/>
       </w:pPr>
       <w:r>
-        <w:t xml:space="preserve">La cirujana aportó la intuición entrenada: doscientas hernias la autorizaban a decir "electiva, no hoy" en un minuto. Pero el valor de su juicio para el equipo no estuvo en la conclusión sino en que aceptó desempaquetarla: gravedad sin correlato anatómico, recurrencia acelerándose, abdomen que "avisa". Esa explicitación permitió que la internista y el residente pudieran vigilar lo mismo que ella vigilaba —y discrepar, si la evolución lo justificaba.</w:t>
-      </w:r>
-    </w:p>
-    <w:p>
-      <w:pPr>
-        <w:pStyle w:val="BodyJ"/>
-      </w:pPr>
-      <w:r>
-        <w:t xml:space="preserve">Y está la confianza. En la reunión de la tarde, la internista hizo una pregunta que rara vez se hace en voz alta: "¿Qué tan seguros estamos de que la bacteriemia es de foco abdominal? ¿Ochenta por ciento? ¿Noventa y cinco?". El número exacto importaba menos que el efecto: al ponerle cifra, el equipo descubrió que su seguridad venía sobre todo de la coherencia narrativa —la historia se contaba bien— y no de haber excluido el foco urinario ni revisado el catéter. Diez minutos de trabajo redujeron una incertidumbre que la retórica había tapado.</w:t>
+        <w:t xml:space="preserve">La cirujana aportó la intuición entrenada: doscientas paredes abdominales complejas la autorizaban a decir "programada, no hoy" en un minuto. Pero el valor de su juicio para el equipo no estuvo en la conclusión sino en que aceptó desempaquetarla: gravedad sin correlato anatómico, recurrencia acelerándose, abdomen que "avisa". Esa explicitación permitió que la internista y el residente pudieran vigilar lo mismo que ella vigilaba —y discrepar, si la evolución lo justificaba.</w:t>
+      </w:r>
+    </w:p>
+    <w:p>
+      <w:pPr>
+        <w:pStyle w:val="BodyJ"/>
+      </w:pPr>
+      <w:r>
+        <w:t xml:space="preserve">Y está la calibración de la confianza colectiva. En la visita vespertina del primer día, cuando los hemocultivos preliminares informaron bacilos gramnegativos, la internista hizo una pregunta que rara vez se formula en voz alta: "¿Qué tan seguros estamos hoy de que esta bacteriemia viene del intestino atascado? ¿Ochenta por ciento? ¿Noventa y cinco?". El porcentaje exacto importaba menos que el efecto cognitivo de la pregunta: al obligarse a ponerle número, el equipo notó que su certeza del 95% provenía de la elegancia narrativa —la historia de la hernia cerraba perfecto— y no de haber examinado sistemáticamente los focos rivales. Diez minutos bastaron para solicitar un sedimento urinario con urocultivo, inspeccionar los sitios de punción venosa instalados en urgencias y documentar la ausencia de síntomas respiratorios o biliares. Ese chequeo transformó una seguridad retórica en una inferencia por exclusión verdaderamente respaldada.</w:t>
       </w:r>
     </w:p>
     <w:p>
@@ -6543,7 +6533,7 @@
         <w:pStyle w:val="BodyJ"/>
       </w:pPr>
       <w:r>
-        <w:t xml:space="preserve">El ensayo clínico dice: "la reparación electiva de hernia incisional reduce la recurrencia obstructiva en pacientes comparables". La paciente de la cama 7 tiene 61 años, una recuperación reciente de un shock séptico, un EPOC moderado y una pregunta simple: "¿Y si no me opero?". Entre el ensayo y la respuesta hay una cadena de inferencias que este capítulo intenta hacer visible.</w:t>
+        <w:t xml:space="preserve">La guía clínica cita un ensayo aleatorizado y concluye: "la reparación quirúrgica electiva de la hernia incisional reduce significativamente la recurrencia obstructiva frente al manejo expectante en pacientes comparables". En la cama 7, Carmen —61 años, recién recuperada de un shock séptico, con un EPOC moderado y un abdomen ya operado— escucha la recomendación del equipo y hace una pregunta simple: "¿Y qué pasa si no me opero?". Entre el resultado promedio del artículo científico y la respuesta honesta a Carmen existe una cadena de inferencias que este capítulo intenta hacer visible.</w:t>
       </w:r>
     </w:p>
     <w:p>
@@ -6609,7 +6599,7 @@
         <w:pStyle w:val="BodyJ"/>
       </w:pPr>
       <w:r>
-        <w:t xml:space="preserve">Conviene hacer la aritmética con Carmen, con cifras inventadas para el ejercicio. Supongamos que un ensayo de reparación electiva frente a manejo expectante mostró una reducción relativa de 50% en la recurrencia obstructiva a dos años, con un riesgo basal de 20% en la población estudiada: diez puntos absolutos, uno de cada diez pacientes operados evita una recurrencia. Carmen no es esa población: con cuatro episodios en doce meses y el último con shock, su riesgo basal plausible es mucho mayor — digamos 60% —, y la misma reducción relativa vale entonces treinta puntos absolutos, casi uno de cada tres. Pero su riesgo quirúrgico también se aleja del promedio del ensayo: EPOC, un shock reciente, un abdomen reoperado. El daño absoluto escala junto con el beneficio. La aritmética no decide por nadie; muestra qué hay que estimar antes de decidir — dos riesgos basales, no uno — y por qué "está indicado por evidencia" es una frase que esconde ambas estimaciones.</w:t>
+        <w:t xml:space="preserve">Hagamos la aritmética explícita con Carmen usando cifras ilustrativas. Supongamos que el ensayo clínico de referencia demostró que operar electivamente reduce un 50% el riesgo relativo de sufrir una nueva obstrucción a dos años, partiendo de un riesgo basal de 20% en la cohorte estudiada: eso equivale a una reducción absoluta de 10 puntos porcentuales (es necesario operar a diez pacientes promedio para evitar una obstrucción). Pero Carmen no pertenece al promedio de ese estudio: tras cuatro episodios en doce meses —acelerándose en frecuencia y el último complicado con shock séptico—, su probabilidad basal de volver a obstruirse y sufrir una complicación grave es sustancialmente mayor, digamos un 60%. Si el beneficio relativo se mantuviera, la reducción absoluta en ella subiría a 30 puntos porcentuales: casi uno de cada tres casos como el suyo evitaría un evento potencialmente letal. Sin embargo, su denominador de daño también se aparta del ensayo: el EPOC moderado, el desacondicionamiento post-sepsis y una pared con cicatrices previas elevan su riesgo absoluto de complicaciones respiratorias o quirúrgicas. La aritmética clínica no decide por la paciente, pero desnuda qué debemos estimar antes de recomendar —dos riesgos basales individualizados, el de la enfermedad sin intervención y el del quirófano— y demuestra por qué la muletilla "está indicado por evidencia" suele esconder ambas estimaciones.</w:t>
       </w:r>
     </w:p>
     <w:p>
@@ -6933,7 +6923,7 @@
         <w:pStyle w:val="BodyJ"/>
       </w:pPr>
       <w:r>
-        <w:t xml:space="preserve">Considere la obstrucción recurrente de Carmen. La ausencia de isquemia en la imagen reduce la indicación de cirugía de emergencia, pero un episodio actual con shock y bacteriemia puede modificar el balance de una reparación electiva. La decisión no depende sólo de si hubo estrangulación demostrada; depende de la gravedad alcanzada, recurrencia, aptitud fisiológica futura y mortalidad potencial de un nuevo episodio.</w:t>
+        <w:t xml:space="preserve">Ilustremos esta asimetría de costos con los dos momentos de Carmen. En la madrugada del ingreso, con la paciente en shock pero con una tomografía sin necrosis ni perforación libre, entrar a pabellón en plena inestabilidad hemodinámica conllevaba una mortalidad perioperatoria altísima; como el cuadro cedió rápidamente con descompresión nasogástrica y antibióticos, el umbral para una cirugía de rescate inmediato era muy alto y fue prudente no cruzarlo. Días después, con Carmen recuperada en sala, la matriz de consecuencias se invierte: el error más costoso ya no es operar a una paciente inestable, sino enviarla de alta con el anillo herniario intacto y que un quinto atascamiento reproduzca el shock séptico en su domicilio, lejos de una cama crítica. La anatomía radiológica es la misma; lo que desplazó el umbral terapéutico hacia la reparación electiva fue el nuevo peso pronóstico del error de omisión.</w:t>
       </w:r>
     </w:p>
     <w:p>
@@ -7057,7 +7047,7 @@
             <w:r>
               <w:drawing>
                 <wp:inline distT="0" distB="0" distL="0" distR="0">
-                  <wp:extent cx="5619750" cy="2705100"/>
+                  <wp:extent cx="5619750" cy="2714625"/>
                   <wp:effectExtent t="0" r="0" b="0" l="0"/>
                   <wp:docPr id="1" name="" descr="" title=""/>
                   <wp:cNvGraphicFramePr>
@@ -7082,7 +7072,7 @@
                         <pic:spPr bwMode="auto">
                           <a:xfrm>
                             <a:off x="0" y="0"/>
-                            <a:ext cx="5619750" cy="2705100"/>
+                            <a:ext cx="5619750" cy="2714625"/>
                           </a:xfrm>
                           <a:prstGeom prst="rect">
                             <a:avLst/>
@@ -7141,7 +7131,7 @@
         <w:pStyle w:val="BodyJ"/>
       </w:pPr>
       <w:r>
-        <w:t xml:space="preserve">El error más frecuente en ese cruce tiene forma epistémica antes que moral: tratar la indicación como una propiedad de la enfermedad y no como una relación entre la intervención y este enfermo. "La estenosis aórtica severa sintomática tiene indicación de reemplazo valvular" es una frase verdadera sobre una población. Que este hombre de 88 años —frágil, con deterioro cognitivo incipiente, dos hospitalizaciones en el semestre y una hija que ya no puede cuidarlo— vaya a vivir mejor con el reemplazo es otra afirmación, que exige otros hechos. Es la distinción del capítulo 9 entre el efecto promedio y el caso singular, ahora con su carga moral a la vista: lo que se pierde cuando se omite el contexto no es sólo precisión; es el paciente.</w:t>
+        <w:t xml:space="preserve">El error más frecuente en la frontera entre evidencia técnica y bioética tiene estructura epistémica antes que moral: tratar la "indicación médica" como una propiedad intrínseca del órgano enfermo y no como una relación proporcional entre una intervención y una biografía concreta. "La estenosis aórtica severa sintomática tiene indicación de recambio valvular quirúrgico o percutáneo (TAVI)" es un enunciado verdadero sobre una cohorte seleccionada. Afirmar que este hombre de 88 años —con fragilidad clínica avanzada, deterioro cognitivo incipiente, dos hospitalizaciones por broncoaspiración en el semestre y una hija cuidadora exhausta— va a recuperar calidad de vida o funcionalidad gracias a la prótesis valvular es una inferencia completamente distinta, que exige incorporar otros hechos clínicos a la ecuación. Es la misma distinción del capítulo 9 entre eficacia poblacional y caso singular, pero ahora con su carga moral a la vista: lo que se pierde cuando se omite el contexto no es sólo precisión; es el paciente.</w:t>
       </w:r>
     </w:p>
     <w:p>
@@ -7469,7 +7459,7 @@
         <w:pStyle w:val="BodyJ"/>
       </w:pPr>
       <w:r>
-        <w:t xml:space="preserve">"Está mejor." La frase se dice en cada pase de visita y casi nunca se pregunta: ¿mejor que cuándo?, ¿mejor en qué variable?, ¿mejor a qué velocidad? Un lactato de 3 puede ser una buena noticia (venía de 6) o una pésima (venía de 1,5). Este capítulo trata del tiempo: la dimensión donde los hechos clínicos cambian de significado sin cambiar de valor.</w:t>
+        <w:t xml:space="preserve">"Está mejor." La frase se dice en cada visita médica y casi nunca se pregunta: ¿mejor que cuándo?, ¿mejor en qué variable?, ¿mejor a qué velocidad? Un lactato de 3 puede ser una buena noticia (venía de 6) o una pésima (venía de 1,5). Este capítulo trata del tiempo: la dimensión donde los hechos clínicos cambian de significado sin cambiar de valor.</w:t>
       </w:r>
     </w:p>
     <w:p>
@@ -7689,7 +7679,7 @@
         <w:t xml:space="preserve">Solución comentada.</w:t>
       </w:r>
       <w:r>
-        <w:t xml:space="preserve"> Una versión defendible: "Observación activa por dolor abdominal no filiado, con probabilidad baja pero no excluida de causa quirúrgica. Reevaluación médica dirigida a las 4 h (o antes si dolor creciente, vómitos, fiebre o taquicardia sostenida); control de laboratorio a las 6 h; si el dolor localiza, aparece defensa o el paciente no tolera vía oral, avisar de inmediato y repetir imagen. Si a las 8 h permanece asintomático y camina sin dolor, alta con instrucciones escritas de reconsulta." La estructura tiene los cuatro elementos: qué se espera aprender (evolución del dolor), en qué plazo (4–8 h), qué se vigila (variables nombradas, con responsable implícito) y qué constituye salida en ambas direcciones (escalar o alta). Compárese con "control según evolución", la fórmula que delega en la suerte lo que debía organizar el plan.</w:t>
+        <w:t xml:space="preserve"> Una versión defendible: "Observación activa por dolor abdominal en estudio, con probabilidad baja pero no excluida de causa quirúrgica. Reevaluación médica dirigida a las 4 h (o antes si dolor creciente, vómitos, fiebre o taquicardia sostenida); control de laboratorio a las 6 h; si el dolor localiza, aparece defensa o el paciente no tolera vía oral, avisar de inmediato y repetir imagen. Si a las 8 h permanece asintomático y camina sin dolor, alta con instrucciones escritas de reconsulta." La estructura tiene los cuatro elementos: qué se espera aprender (evolución del dolor), en qué plazo (4–8 h), qué se vigila (variables nombradas, con responsable implícito) y qué constituye salida en ambas direcciones (escalar o alta). Compárese con "control según evolución", la fórmula que delega en la suerte lo que debía organizar el plan.</w:t>
       </w:r>
     </w:p>
     <w:p>
@@ -8100,7 +8090,7 @@
         <w:pStyle w:val="BodyJ"/>
       </w:pPr>
       <w:r>
-        <w:t xml:space="preserve">En el caso anterior: "Bacteriuria y piuria tras recambio de sonda en paciente con colonización crónica probable, sin manifestaciones sistémicas que sostengan CAUTI; se prioriza vigilancia clínica para evitar exposición innecesaria a antibióticos de amplio espectro."</w:t>
+        <w:t xml:space="preserve">En el caso anterior: "Bacteriuria y piuria tras recambio de sonda en paciente con colonización crónica probable, sin manifestaciones sistémicas que sostengan una ITU asociada a catéter urinario permanente (CUP); se prioriza vigilancia clínica para evitar exposición innecesaria a antibióticos de amplio espectro."</w:t>
       </w:r>
     </w:p>
     <w:p>
@@ -8322,7 +8312,7 @@
         <w:pStyle w:val="BodyJ"/>
       </w:pPr>
       <w:r>
-        <w:t xml:space="preserve">A las 2:00, la enfermera de turno anota: "paciente más quejumbrosa, rechaza la cena, diuresis límite". A las 8:00, el pase de turno resume: "sin novedades". Entre esas dos frases no hay mala fe: hay una cadena de transmisión donde la información se comprimió hasta desaparecer. Este capítulo trata del conocimiento clínico como propiedad de un equipo —médicos, enfermería, paciente, familia, artefactos— y de cómo se degrada, se discute y se comunica.</w:t>
+        <w:t xml:space="preserve">A las 2:00, la enfermera de turno anota: "paciente más quejumbrosa, rechaza la cena, diuresis límite". A las 8:00, la entrega de turno resume: "sin novedades". Entre esas dos frases no hay mala fe: hay una cadena de transmisión donde la información se comprimió hasta desaparecer. Este capítulo trata del conocimiento clínico como propiedad de un equipo —médicos, enfermería, paciente, familia, artefactos— y de cómo se degrada, se discute y se comunica.</w:t>
       </w:r>
     </w:p>
     <w:p>
@@ -8445,7 +8435,7 @@
         <w:pStyle w:val="BodyJ"/>
       </w:pPr>
       <w:r>
-        <w:t xml:space="preserve">Las rondas clínicas pueden usar una pausa breve: ¿qué hechos nuevos cambian el caso?, ¿cuál es la inferencia principal y su alternativa?, ¿qué incertidumbre domina el riesgo?, ¿qué conducta se propone y qué la hará cambiar? La estructura HII-D no reemplaza la discusión libre; crea un lenguaje común para localizar la diferencia.</w:t>
+        <w:t xml:space="preserve">Las visitas de sala pueden usar una pausa breve: ¿qué hechos nuevos cambian el caso?, ¿cuál es la inferencia principal y su alternativa?, ¿qué incertidumbre domina el riesgo?, ¿qué conducta se propone y qué la hará cambiar? La estructura HII-D no reemplaza la discusión libre; crea un lenguaje común para localizar la diferencia.</w:t>
       </w:r>
     </w:p>
     <w:p>
@@ -8636,7 +8626,7 @@
         <w:pStyle w:val="BodyJ"/>
       </w:pPr>
       <w:r>
-        <w:t xml:space="preserve">En pases de turno, la frase "está cubierto" suele ocultar supuestos. Es preferible nombrar quién verificará un resultado, qué diagnóstico no debe perderse y qué cambio exige avisar. La incertidumbre compartida se convierte en tarea distribuida.</w:t>
+        <w:t xml:space="preserve">En las entregas de turno, la frase "está cubierto" suele ocultar supuestos. Es preferible nombrar quién verificará un resultado, qué diagnóstico no debe perderse y qué cambio exige avisar. La incertidumbre compartida se convierte en tarea distribuida.</w:t>
       </w:r>
     </w:p>
     <w:p>
@@ -8701,7 +8691,7 @@
         <w:pStyle w:val="BodyJ"/>
       </w:pPr>
       <w:r>
-        <w:t xml:space="preserve">En la ronda, el intensivista dice: "Yo la operaría ahora; esto va a volver a pasar". La internista responde: "Me parece apresurado; acaba de salir de un shock". Traduzca el desacuerdo a proposiciones evaluables: ¿discrepan en hechos, inferencias, incertidumbre, valores o decisión?</w:t>
+        <w:t xml:space="preserve">En la visita de sala, el intensivista dice: "Yo la operaría ahora; esto va a volver a pasar". La internista responde: "Me parece apresurado; acaba de salir de un shock". Traduzca el desacuerdo a proposiciones evaluables: ¿discrepan en hechos, inferencias, incertidumbre, valores o decisión?</w:t>
       </w:r>
     </w:p>
     <w:p>
@@ -8900,15 +8890,15 @@
         <w:pStyle w:val="BodyJ"/>
       </w:pPr>
       <w:r>
-        <w:t xml:space="preserve">Carmen se queda callada un momento y después habla más de lo que había hablado en tres semanas: "Yo no quiero otra noche como esa. Pensé que me moría, y mi hija también. Pero tampoco quiero que me abran si no hace falta: la otra vez tardé meses en pararme derecha. Lo que necesito saber es si después de esto voy a poder seguir cuidando a mi nieta". La pregunta no figuraba en ninguna escala de riesgo quirúrgico y era la que ordenaba todas las demás; la cirujana la anotó antes de responder.</w:t>
-      </w:r>
-    </w:p>
-    <w:p>
-      <w:pPr>
-        <w:pStyle w:val="BodyJ"/>
-      </w:pPr>
-      <w:r>
-        <w:t xml:space="preserve">Carmen acepta. En la ficha, la internista escribe la frase medular que resume tres semanas de trabajo epistémico: "Obstrucción recurrente por hernia incisional, cuarto episodio en un año y primero con shock y bacteriemia; sin complicación anatómica aguda en imagen. El cambio cualitativo de gravedad, la aceleración de las recurrencias y la preferencia informada de la paciente justifican reparación electiva tras optimización, asumiendo riesgo perioperatorio moderado como alternativa preferible a una nueva urgencia no programada. Reevaluar decisión si deterioro funcional o nuevo episodio antes de la fecha quirúrgica."</w:t>
+        <w:t xml:space="preserve">Carmen se queda callada un momento y después habla más de lo que había hablado en toda la semana: "Yo no quiero otra noche como esa. Pensé que me moría, y mi hija también. Pero tampoco quiero que me abran si no hace falta: la otra vez tardé meses en pararme derecha. Lo que necesito saber es si después de esto voy a poder seguir cuidando a mi nieta". La pregunta no figuraba en ninguna escala de riesgo quirúrgico y era la que ordenaba todas las demás; la cirujana la anotó antes de responder.</w:t>
+      </w:r>
+    </w:p>
+    <w:p>
+      <w:pPr>
+        <w:pStyle w:val="BodyJ"/>
+      </w:pPr>
+      <w:r>
+        <w:t xml:space="preserve">Carmen acepta. En la ficha, la internista escribe la frase medular que resume siete días de trabajo epistémico: "Obstrucción recurrente por hernia incisional, cuarto episodio en un año y primero con shock y bacteriemia; sin complicación anatómica aguda en imagen. El cambio cualitativo de gravedad, la aceleración de las recurrencias y la preferencia informada de la paciente justifican reparación electiva tras optimización, asumiendo riesgo perioperatorio moderado como alternativa preferible a una nueva urgencia no programada. Reevaluar decisión si deterioro funcional o nuevo episodio antes de la fecha quirúrgica."</w:t>
       </w:r>
     </w:p>
     <w:p>
@@ -10881,7 +10871,7 @@
         <w:pStyle w:val="BodyJ"/>
       </w:pPr>
       <w:r>
-        <w:t xml:space="preserve">En una ronda, cada integrante puede desafiar una capa distinta. Enfermería aporta evolución y respuesta; radiología delimita lo que la imagen muestra y lo que no; microbiología precisa relevancia y contaminación; cirugía integra anatomía y oportunidad; el paciente aporta síntomas, preferencias y desenlaces que valora. El método no centraliza el conocimiento en una sola voz.</w:t>
+        <w:t xml:space="preserve">En una visita de sala, cada integrante puede desafiar una capa distinta. Enfermería aporta evolución y respuesta; radiología delimita lo que la imagen muestra y lo que no; microbiología precisa relevancia y contaminación; cirugía integra anatomía y oportunidad; el paciente aporta síntomas, preferencias y desenlaces que valora. El método no centraliza el conocimiento en una sola voz.</w:t>
       </w:r>
     </w:p>
     <w:p>
@@ -11044,7 +11034,7 @@
         <w:pStyle w:val="BodyJ"/>
       </w:pPr>
       <w:r>
-        <w:t xml:space="preserve">Elija el caso más incómodo de su lista actual —el que genera discusión en cada ronda o el que nadie discute hace días— y complete la plantilla condensada por escrito. Después compárela con la última evolución de la ficha: ¿qué contiene la plantilla que la ficha no registra?</w:t>
+        <w:t xml:space="preserve">Elija el caso más incómodo de su lista actual —el que genera discusión en cada visita o el que nadie discute hace días— y complete la plantilla condensada por escrito. Después compárela con la última evolución de la ficha: ¿qué contiene la plantilla que la ficha no registra?</w:t>
       </w:r>
     </w:p>
     <w:p>
@@ -11284,7 +11274,7 @@
         <w:t xml:space="preserve">Epílogo.</w:t>
       </w:r>
       <w:r>
-        <w:t xml:space="preserve"> Carmen fue operada seis semanas después, en forma programada. La cirugía encontró adherencias firmes y un anillo herniario estrecho; no hubo complicaciones mayores. En el control del mes, Carmen puso su propia frase medular: "Esta vez el dolor venía con explicación, y eso lo cambia todo". Nada de eso demuestra que la decisión fue correcta —un desenlace no valida un proceso—, pero el proceso era defendible antes de conocer el desenlace, que es lo único que puede pedírsele a una decisión clínica. La frase de su ingreso, "cuadro habitual, manejo habitual", quedó en la ficha como lo que era: la hipótesis rápida que el trabajo de tres semanas convirtió en otra cosa.</w:t>
+        <w:t xml:space="preserve"> Carmen fue operada seis semanas después, en forma programada. La cirugía encontró adherencias firmes y un anillo herniario estrecho; no hubo complicaciones mayores. En el control del mes, Carmen puso su propia frase medular: "Esta vez el dolor venía con explicación, y eso lo cambia todo". Nada de eso demuestra que la decisión fue correcta —un desenlace no valida un proceso—, pero el proceso era defendible antes de conocer el desenlace, que es lo único que puede pedírsele a una decisión clínica. La frase de su ingreso, "cuadro habitual, manejo habitual", quedó en la ficha como lo que era: la hipótesis rápida que el trabajo de una semana convirtió en otra cosa.</w:t>
       </w:r>
     </w:p>
     <w:p>
@@ -11384,7 +11374,7 @@
         <w:t xml:space="preserve">Frase medular:</w:t>
       </w:r>
       <w:r>
-        <w:t xml:space="preserve"> "Urocultivo positivo y piuria en usuario crónico de Foley, sin manifestaciones sistémicas nuevas que sostengan CAUTI; cuadro más compatible con bacteriuria asociada a catéter, con vigilancia reforzada por expresión sintomática limitada y antecedente de resistencia."</w:t>
+        <w:t xml:space="preserve"> "Urocultivo positivo y piuria en usuario crónico de Foley, sin manifestaciones sistémicas nuevas que sostengan una ITU asociada a sonda; cuadro más compatible con bacteriuria asociada a catéter, con vigilancia reforzada por expresión sintomática limitada y antecedente de resistencia."</w:t>
       </w:r>
     </w:p>
     <w:p>
@@ -11839,7 +11829,7 @@
         <w:t xml:space="preserve">Dónde estuvo la oportunidad.</w:t>
       </w:r>
       <w:r>
-        <w:t xml:space="preserve"> En el control de signos previo al alta. Una taquicardia de 112 en una paciente sedada y calmada era la discordancia informativa de la noche: el tratamiento correcto de la hipótesis correcta debía normalizar la frecuencia, no sólo la angustia. La pregunta de pase —"¿qué no explica el pánico?"— tenía ahí su máximo valor y su costo mínimo: dos preguntas de anamnesis, una regla de ocho ítems, quizá un dímero-D. A las 36 horas, la pregunta la respondió el síncope.</w:t>
+        <w:t xml:space="preserve"> En el control de signos previo al alta. Una taquicardia de 112 en una paciente sedada y calmada era la discordancia informativa de la noche: el tratamiento correcto de la hipótesis correcta debía normalizar la frecuencia, no sólo la angustia. La pregunta de resistencia del capítulo 7 —"¿qué no explica el pánico?"— tenía ahí su máximo valor y su costo mínimo: dos preguntas de anamnesis, una regla de ocho ítems y el dímero-D que esa regla, incumplida, obligaba a pedir antes del alta. A las 36 horas, la pregunta la respondió el síncope.</w:t>
       </w:r>
     </w:p>
     <w:p>
@@ -11869,7 +11859,7 @@
         <w:t xml:space="preserve">Frase medular (la que faltó la primera noche):</w:t>
       </w:r>
       <w:r>
-        <w:t xml:space="preserve"> "Disnea súbita y taquicardia persistente (112 tras ansiolisis) en mujer de 29 años con trastorno de pánico y uso de anticonceptivos orales: crisis de pánico posible, pero la taquicardia y la saturación de 94% no están explicadas; PERC positivo — dímero-D antes de decidir el alta; si se difiere, reconsulta inmediata ante síncope, dolor torácico o disnea en reposo."</w:t>
+        <w:t xml:space="preserve"> "Disnea súbita y taquicardia persistente (112 tras ansiolisis) en mujer de 29 años con trastorno de pánico y uso de anticonceptivos orales: crisis de pánico posible, pero la taquicardia y la saturación de 94% no están explicadas; PERC no cumplido (frecuencia cardiaca, saturación, estrógenos): no procede el alta sin estudiar embolia pulmonar — dímero-D ahora y, si resulta elevado o la probabilidad clínica es intermedia, angioTAC; indicaciones escritas de reconsulta inmediata ante síncope, dolor torácico o disnea en reposo."</w:t>
       </w:r>
     </w:p>
     <w:p>
@@ -12177,7 +12167,7 @@
         <w:pStyle w:val="BodyJ"/>
       </w:pPr>
       <w:r>
-        <w:t xml:space="preserve">Una jefa de servicio que quiera "instalar metacognición" en su equipo no puede indicarla como se indica un antibiótico. Puede, en cambio, cambiar tres cosas que ve todas las semanas: qué se pregunta en la ronda, qué estructura tiene la ficha y qué pasa después de un error. Este capítulo trata de esas palancas.</w:t>
+        <w:t xml:space="preserve">Una jefa de servicio que quiera "instalar metacognición" en su equipo no puede indicarla como se indica un antibiótico. Puede, en cambio, cambiar tres cosas que ve todas las semanas: qué se pregunta en la visita de sala, qué estructura tiene la ficha y qué pasa después de un error. Este capítulo trata de esas palancas.</w:t>
       </w:r>
     </w:p>
     <w:p>
@@ -12293,15 +12283,15 @@
           <w:sz w:val="25"/>
           <w:szCs w:val="25"/>
         </w:rPr>
-        <w:t xml:space="preserve">Rondas y pases de turno</w:t>
-      </w:r>
-    </w:p>
-    <w:p>
-      <w:pPr>
-        <w:pStyle w:val="BodyJ"/>
-      </w:pPr>
-      <w:r>
-        <w:t xml:space="preserve">Una ronda puede incorporar una pausa breve en casos seleccionados:</w:t>
+        <w:t xml:space="preserve">Visitas de sala y entregas de turno</w:t>
+      </w:r>
+    </w:p>
+    <w:p>
+      <w:pPr>
+        <w:pStyle w:val="BodyJ"/>
+      </w:pPr>
+      <w:r>
+        <w:t xml:space="preserve">Una visita de sala puede incorporar una pausa breve en casos seleccionados:</w:t>
       </w:r>
     </w:p>
     <w:p>
@@ -12369,7 +12359,7 @@
         <w:pStyle w:val="BodyJ"/>
       </w:pPr>
       <w:r>
-        <w:t xml:space="preserve">El pase de turno debe transmitir tareas epistémicas, no sólo tratamientos. "Pendiente observar si…" y "si ocurre X, reabrir Y" son componentes de seguridad.</w:t>
+        <w:t xml:space="preserve">La entrega de turno debe transmitir tareas epistémicas, no sólo tratamientos. "Pendiente observar si…" y "si ocurre X, reabrir Y" son componentes de seguridad.</w:t>
       </w:r>
     </w:p>
     <w:p>
@@ -12525,15 +12515,15 @@
         <w:pStyle w:val="TallerHead"/>
       </w:pPr>
       <w:r>
-        <w:t xml:space="preserve">Taller 16. Rediseñar la ronda</w:t>
-      </w:r>
-    </w:p>
-    <w:p>
-      <w:pPr>
-        <w:pStyle w:val="BodyJ"/>
-      </w:pPr>
-      <w:r>
-        <w:t xml:space="preserve">Describa por escrito la ronda de su servicio tal como ocurre de verdad: minutos por paciente, quién habla, qué se pregunta siempre y qué no se pregunta nunca. Luego rediséñela con tres cambios como máximo —un disparador objetivo de pausa, una pregunta obligatoria por paciente inestable o incierto, una regla de pase de turno— y estime el costo en minutos por ronda.</w:t>
+        <w:t xml:space="preserve">Taller 16. Rediseñar la visita de sala</w:t>
+      </w:r>
+    </w:p>
+    <w:p>
+      <w:pPr>
+        <w:pStyle w:val="BodyJ"/>
+      </w:pPr>
+      <w:r>
+        <w:t xml:space="preserve">Describa por escrito la visita de sala de su servicio tal como ocurre de verdad: minutos por paciente, quién habla, qué se pregunta siempre y qué no se pregunta nunca. Luego rediséñela con tres cambios como máximo —un disparador objetivo de pausa, una pregunta obligatoria por paciente inestable o incierto, una regla de entrega de turno— y estime el costo en minutos por visita.</w:t>
       </w:r>
     </w:p>
     <w:p>
@@ -12548,7 +12538,7 @@
         <w:t xml:space="preserve">Solución comentada.</w:t>
       </w:r>
       <w:r>
-        <w:t xml:space="preserve"> A modo de ejemplo, una descripción honesta puede parecerse a esto: dos a cuatro minutos por paciente, habla quien presenta y decide quien dirige, se pregunta "¿cómo está?" y "¿qué le falta?", y casi nunca "¿qué nos haría cambiar?". El rediseño más barato es esa tercera pregunta, hecha sólo a los pacientes que cumplen un disparador (reconsulta, discordancia entre gravedad y diagnóstico, 72 horas sin discusión): cuesta alrededor de un minuto por caso seleccionado y produce, de inmediato, criterios de reapertura que antes no existían. Si el rediseño necesita más de tres cambios o más de diez minutos por ronda, probablemente está diseñando una reunión nueva en lugar de mejorar la que existe — y las reuniones nuevas mueren por inasistencia.</w:t>
+        <w:t xml:space="preserve"> A modo de ejemplo, una descripción honesta puede parecerse a esto: dos a cuatro minutos por paciente, habla quien presenta y decide quien dirige, se pregunta "¿cómo está?" y "¿qué le falta?", y casi nunca "¿qué nos haría cambiar?". El rediseño más barato es esa tercera pregunta, hecha sólo a los pacientes que cumplen un disparador (reconsulta, discordancia entre gravedad y diagnóstico, 72 horas sin discusión): cuesta alrededor de un minuto por caso seleccionado y produce, de inmediato, criterios de reapertura que antes no existían. Si el rediseño necesita más de tres cambios o más de diez minutos por visita, probablemente está diseñando una reunión nueva en lugar de mejorar la que existe — y las reuniones nuevas mueren por inasistencia.</w:t>
       </w:r>
     </w:p>
     <w:p>
@@ -12563,7 +12553,7 @@
         <w:t xml:space="preserve">En una frase.</w:t>
       </w:r>
       <w:r>
-        <w:t xml:space="preserve"> La metacognición clínica se enseña con representaciones y feedback, y se organiza con rondas, fichas y revisiones diseñadas para hacer visible el pensamiento — no se decreta.</w:t>
+        <w:t xml:space="preserve"> La metacognición clínica se enseña con representaciones y feedback, y se organiza con visitas de sala, fichas y revisiones diseñadas para hacer visible el pensamiento — no se decreta.</w:t>
       </w:r>
     </w:p>
     <w:p>
@@ -12612,7 +12602,7 @@
         </w:numPr>
       </w:pPr>
       <w:r>
-        <w:t xml:space="preserve">Si mañana dirigiera mi servicio, ¿cuál de las tres palancas (ronda, ficha, revisión de errores) cambiaría primero, y qué costaría?</w:t>
+        <w:t xml:space="preserve">Si mañana dirigiera mi servicio, ¿cuál de las tres palancas (visita de sala, ficha, revisión de errores) cambiaría primero, y qué costaría?</w:t>
       </w:r>
     </w:p>
     <w:p>
@@ -14920,7 +14910,7 @@
                 <w:sz w:val="17"/>
                 <w:szCs w:val="17"/>
               </w:rPr>
-              <w:t xml:space="preserve">"CAUTI probable si aparece fiebre sin otro foco"</w:t>
+              <w:t xml:space="preserve">"ITU asociada a CUP probable si aparece fiebre sin otro foco"</w:t>
             </w:r>
           </w:p>
         </w:tc>
@@ -15923,7 +15913,7 @@
         <w:pStyle w:val="BodyJ"/>
       </w:pPr>
       <w:r>
-        <w:t xml:space="preserve">Esta guía condensa el capítulo 16 en un plan concreto para un servicio que quiera adoptar el lenguaje y las prácticas del libro. Está pensada para un jefe de servicio, un programa de residencia o un grupo de clínicos con voluntad y poco tiempo. Tres advertencias previas: nada de esto está validado como tecnología (véase el capítulo 15, "Límites"); todo debe adaptarse al contexto local; y la palanca más barata —cómo se habla en la ronda— es también la más poderosa.</w:t>
+        <w:t xml:space="preserve">Esta guía condensa el capítulo 16 en un plan concreto para un servicio que quiera adoptar el lenguaje y las prácticas del libro. Está pensada para un jefe de servicio, un programa de residencia o un grupo de clínicos con voluntad y poco tiempo. Tres advertencias previas: nada de esto está validado como tecnología (véase el capítulo 15, "Límites"); todo debe adaptarse al contexto local; y la palanca más barata —cómo se habla en la visita de sala— es también la más poderosa.</w:t>
       </w:r>
     </w:p>
     <w:p>
@@ -15993,7 +15983,7 @@
           <w:sz w:val="25"/>
           <w:szCs w:val="25"/>
         </w:rPr>
-        <w:t xml:space="preserve">Semana 3–4: la pausa en la ronda</w:t>
+        <w:t xml:space="preserve">Semana 3–4: la pausa en la visita de sala</w:t>
       </w:r>
     </w:p>
     <w:p>
@@ -16017,7 +16007,7 @@
         </w:numPr>
       </w:pPr>
       <w:r>
-        <w:t xml:space="preserve">Cuando se active, usar las cuatro preguntas de la versión de 60 segundos en voz alta. Duración objetivo: dos minutos por caso. El jefe de ronda modela; no interroga.</w:t>
+        <w:t xml:space="preserve">Cuando se active, usar las cuatro preguntas de la versión de 60 segundos en voz alta. Duración objetivo: dos minutos por caso. Quien dirige la visita modela; no interroga.</w:t>
       </w:r>
     </w:p>
     <w:p>
@@ -16029,7 +16019,7 @@
         </w:numPr>
       </w:pPr>
       <w:r>
-        <w:t xml:space="preserve">Pase de turno: agregar una línea obligatoria por paciente inestable o incierto: "qué vigilar, qué reabriría el caso, quién verifica el pendiente".</w:t>
+        <w:t xml:space="preserve">Entrega de turno: agregar una línea obligatoria por paciente inestable o incierto: "qué vigilar, qué reabriría el caso, quién verifica el pendiente".</w:t>
       </w:r>
     </w:p>
     <w:p>
@@ -19742,6 +19732,24 @@
       </w:r>
       <w:r>
         <w:t xml:space="preserve"> (Vol. 26, pp. 125–173). Academic Press.</w:t>
+      </w:r>
+    </w:p>
+    <w:p>
+      <w:pPr>
+        <w:pStyle w:val="BodyJ"/>
+      </w:pPr>
+      <w:r>
+        <w:t xml:space="preserve">Nicolle, L. E., Gupta, K., Bradley, S. F., Colgan, R., DeMuri, G. P., Drekonja, D., Eckert, L. O., Geerlings, S. E., Köves, B., Hooton, T. M., Juthani-Mehta, M., Knight, S. L., Saint, S., Schaeffer, A. J., Trautner, B., Wullt, B., &amp; Siemieniuk, R. (2019). Clinical practice guideline for the management of asymptomatic bacteriuria: 2019 update by the Infectious Diseases Society of America. </w:t>
+      </w:r>
+      <w:r>
+        <w:rPr>
+          <w:i/>
+          <w:iCs/>
+        </w:rPr>
+        <w:t xml:space="preserve">Clinical Infectious Diseases, 68</w:t>
+      </w:r>
+      <w:r>
+        <w:t xml:space="preserve">(10), e83–e110.</w:t>
       </w:r>
     </w:p>
     <w:p>

</xml_diff>

<commit_message>
Rebuild tras la segunda entrega de observaciones clínicas (27-37): 141 pp, TOC 37/37, EPUB
Co-Authored-By: Claude Fable 5.1 <noreply@anthropic.com>
Claude-Session: https://claude.ai/code/session_01SPkhDdVzUCxJwqq61ddeLW
</commit_message>
<xml_diff>
--- a/libro/Hechos_inferencias_incertidumbre_edicion_revisada.docx
+++ b/libro/Hechos_inferencias_incertidumbre_edicion_revisada.docx
@@ -627,7 +627,7 @@
         <w:rPr>
           <w:color w:val="8A8A8A"/>
         </w:rPr>
-        <w:t xml:space="preserve">73</w:t>
+        <w:t xml:space="preserve">74</w:t>
       </w:r>
     </w:p>
     <w:p>
@@ -647,7 +647,7 @@
         <w:rPr>
           <w:color w:val="8A8A8A"/>
         </w:rPr>
-        <w:t xml:space="preserve">74</w:t>
+        <w:t xml:space="preserve">75</w:t>
       </w:r>
     </w:p>
     <w:p>
@@ -667,7 +667,7 @@
         <w:rPr>
           <w:color w:val="8A8A8A"/>
         </w:rPr>
-        <w:t xml:space="preserve">80</w:t>
+        <w:t xml:space="preserve">81</w:t>
       </w:r>
     </w:p>
     <w:p>
@@ -687,7 +687,7 @@
         <w:rPr>
           <w:color w:val="8A8A8A"/>
         </w:rPr>
-        <w:t xml:space="preserve">87</w:t>
+        <w:t xml:space="preserve">88</w:t>
       </w:r>
     </w:p>
     <w:p>
@@ -707,7 +707,7 @@
         <w:rPr>
           <w:color w:val="8A8A8A"/>
         </w:rPr>
-        <w:t xml:space="preserve">95</w:t>
+        <w:t xml:space="preserve">98</w:t>
       </w:r>
     </w:p>
     <w:p>
@@ -727,7 +727,7 @@
         <w:rPr>
           <w:color w:val="8A8A8A"/>
         </w:rPr>
-        <w:t xml:space="preserve">99</w:t>
+        <w:t xml:space="preserve">102</w:t>
       </w:r>
     </w:p>
     <w:p>
@@ -747,7 +747,7 @@
         <w:rPr>
           <w:color w:val="8A8A8A"/>
         </w:rPr>
-        <w:t xml:space="preserve">106</w:t>
+        <w:t xml:space="preserve">109</w:t>
       </w:r>
     </w:p>
     <w:p>
@@ -767,7 +767,7 @@
         <w:rPr>
           <w:color w:val="8A8A8A"/>
         </w:rPr>
-        <w:t xml:space="preserve">110</w:t>
+        <w:t xml:space="preserve">113</w:t>
       </w:r>
     </w:p>
     <w:p>
@@ -787,7 +787,7 @@
         <w:rPr>
           <w:color w:val="8A8A8A"/>
         </w:rPr>
-        <w:t xml:space="preserve">112</w:t>
+        <w:t xml:space="preserve">115</w:t>
       </w:r>
     </w:p>
     <w:p>
@@ -807,7 +807,7 @@
         <w:rPr>
           <w:color w:val="8A8A8A"/>
         </w:rPr>
-        <w:t xml:space="preserve">114</w:t>
+        <w:t xml:space="preserve">117</w:t>
       </w:r>
     </w:p>
     <w:p>
@@ -827,7 +827,7 @@
         <w:rPr>
           <w:color w:val="8A8A8A"/>
         </w:rPr>
-        <w:t xml:space="preserve">116</w:t>
+        <w:t xml:space="preserve">119</w:t>
       </w:r>
     </w:p>
     <w:p>
@@ -847,7 +847,7 @@
         <w:rPr>
           <w:color w:val="8A8A8A"/>
         </w:rPr>
-        <w:t xml:space="preserve">118</w:t>
+        <w:t xml:space="preserve">121</w:t>
       </w:r>
     </w:p>
     <w:p>
@@ -867,7 +867,7 @@
         <w:rPr>
           <w:color w:val="8A8A8A"/>
         </w:rPr>
-        <w:t xml:space="preserve">122</w:t>
+        <w:t xml:space="preserve">125</w:t>
       </w:r>
     </w:p>
     <w:p>
@@ -887,7 +887,7 @@
         <w:rPr>
           <w:color w:val="8A8A8A"/>
         </w:rPr>
-        <w:t xml:space="preserve">125</w:t>
+        <w:t xml:space="preserve">128</w:t>
       </w:r>
     </w:p>
     <w:p>
@@ -907,7 +907,7 @@
         <w:rPr>
           <w:color w:val="8A8A8A"/>
         </w:rPr>
-        <w:t xml:space="preserve">126</w:t>
+        <w:t xml:space="preserve">129</w:t>
       </w:r>
     </w:p>
     <w:p>
@@ -7131,7 +7131,7 @@
         <w:pStyle w:val="BodyJ"/>
       </w:pPr>
       <w:r>
-        <w:t xml:space="preserve">El error más frecuente en la frontera entre evidencia técnica y bioética tiene estructura epistémica antes que moral: tratar la "indicación médica" como una propiedad intrínseca del órgano enfermo y no como una relación proporcional entre una intervención y una biografía concreta. "La estenosis aórtica severa sintomática tiene indicación de recambio valvular quirúrgico o percutáneo (TAVI)" es un enunciado verdadero sobre una cohorte seleccionada. Afirmar que este hombre de 88 años —con fragilidad clínica avanzada, deterioro cognitivo incipiente, dos hospitalizaciones por broncoaspiración en el semestre y una hija cuidadora exhausta— va a recuperar calidad de vida o funcionalidad gracias a la prótesis valvular es una inferencia completamente distinta, que exige incorporar otros hechos clínicos a la ecuación. Es la misma distinción del capítulo 9 entre eficacia poblacional y caso singular, pero ahora con su carga moral a la vista: lo que se pierde cuando se omite el contexto no es sólo precisión; es el paciente.</w:t>
+        <w:t xml:space="preserve">El error más frecuente en la frontera entre evidencia técnica y bioética tiene estructura epistémica antes que moral: tratar la "indicación médica" como una propiedad intrínseca del órgano enfermo y no como una relación proporcional entre una intervención y una biografía concreta. "La estenosis aórtica severa sintomática tiene indicación de recambio valvular quirúrgico o percutáneo (TAVI)" es un enunciado verdadero sobre una cohorte seleccionada. Afirmar que este hombre de 88 años —con fragilidad clínica avanzada, deterioro cognitivo incipiente, dos hospitalizaciones por broncoaspiración en el semestre y una hija cuidadora exhausta— va a recuperar calidad de vida o funcionalidad gracias a la prótesis valvular es una inferencia completamente distinta, cuya validez exige incorporar otros hechos clínicos a la ecuación. Aquí la brecha entre el efecto promedio del ensayo y el caso singular exhibe toda su carga moral: cuando la evaluación omite la funcionalidad basal y el soporte familiar, lo que se pierde no es sólo precisión pronóstica; es el paciente mismo.</w:t>
       </w:r>
     </w:p>
     <w:p>
@@ -7342,7 +7342,7 @@
         <w:pStyle w:val="BodyJ"/>
       </w:pPr>
       <w:r>
-        <w:t xml:space="preserve">Elija un paciente actual de su servicio con una decisión de intervención pendiente — cirugía, diálisis, ventilación mecánica, nueva línea oncológica. Dibuje cuatro casillas: indicaciones médicas, preferencias del paciente, calidad de vida, rasgos contextuales. Llénelas en cinco minutos con lo que sabe hoy, sin abrir la ficha. Luego ábrala y verifique: ¿qué casilla quedó vacía — y ese vacío es del caso o de su conocimiento del caso?</w:t>
+        <w:t xml:space="preserve">Elija un paciente actual de su servicio con una decisión mayor pendiente —cirugía, ingreso a diálisis, conexión a ventilación mecánica o inicio de una nueva línea oncológica—. Dibuje en un papel las cuatro casillas de Jonsen: indicaciones médicas, preferencias del paciente, calidad de vida y rasgos contextuales. Complételas en cinco minutos utilizando únicamente lo que recuerda hoy, sin abrir la ficha clínica. Luego ábrala y contraste: ¿qué casilla quedó vacía, y ese vacío refleja una incógnita real del caso o una omisión en el estudio del paciente?</w:t>
       </w:r>
     </w:p>
     <w:p>
@@ -7357,7 +7357,7 @@
         <w:t xml:space="preserve">Solución comentada.</w:t>
       </w:r>
       <w:r>
-        <w:t xml:space="preserve"> El ejercicio suele producir dos hallazgos. Primero: la casilla de indicaciones se llena sola y las otras tres exhiben lagunas que no son opiniones faltantes sino hechos faltantes — nadie preguntó quién vive con el paciente; la funcionalidad basal dice "previamente autovalente" sin que nadie la haya explorado; las preferencias son una presunción de la familia, no una cita del enfermo. Segundo: las cuatro casillas rara vez cambian la intervención; cambian la conversación — con quién falta hablar, qué falta saber, qué está decidiendo el equipo por inercia. Y cuando las casillas están completas y la decisión sigue en disputa, eso también es información: el caso ya no necesita más exámenes; necesita deliberación y, a veces, tiempo.</w:t>
+        <w:t xml:space="preserve"> El ejercicio suele revelar dos hallazgos. Primero: mientras la casilla de indicaciones biomédicas se llena sin esfuerzo, las otras tres exhiben lagunas que no corresponden a opiniones discutibles, sino a hechos clínicos nunca recabados: nadie preguntó con quién vive el paciente, la funcionalidad basal figura como "previamente autovalente" por simple arrastre documental sin evaluación objetiva, y las preferencias registradas son presunciones de la familia en lugar de la voz directa del enfermo. Segundo: completar las cuatro casillas rara vez cambia el aspecto técnico de la intervención, pero transforma de raíz la deliberación clínica: hace evidente con quién falta conversar, qué datos basales urge verificar y qué decisiones está tomando el equipo por pura inercia asistencial. Y cuando las cuatro casillas están completas y aun así persiste el desacuerdo, el ejercicio entrega un último diagnóstico crucial: el caso ya no requiere más exámenes; requiere deliberación estructurada y, a menudo, tiempo.</w:t>
       </w:r>
     </w:p>
     <w:p>
@@ -7459,7 +7459,7 @@
         <w:pStyle w:val="BodyJ"/>
       </w:pPr>
       <w:r>
-        <w:t xml:space="preserve">"Está mejor." La frase se dice en cada visita médica y casi nunca se pregunta: ¿mejor que cuándo?, ¿mejor en qué variable?, ¿mejor a qué velocidad? Un lactato de 3 puede ser una buena noticia (venía de 6) o una pésima (venía de 1,5). Este capítulo trata del tiempo: la dimensión donde los hechos clínicos cambian de significado sin cambiar de valor.</w:t>
+        <w:t xml:space="preserve">"Está mejor." La frase se repite en cada entrega de turno y casi nunca alguien detiene la presentación para preguntar: ¿mejor en comparación con qué momento?, ¿mejor en qué variable fisiológica?, ¿mejor a qué velocidad? Un lactato arterial de 3 mmol/L puede ser una excelente noticia si desciende desde 6 mmol/L tras la reanimación inicial, o una señal ominosa si asciende desde 1,5 mmol/L. Este capítulo trata del tiempo: la dimensión clínica donde los datos cambian radicalmente de significado sin cambiar de valor numérico.</w:t>
       </w:r>
     </w:p>
     <w:p>
@@ -7632,7 +7632,7 @@
         <w:pStyle w:val="BodyJ"/>
       </w:pPr>
       <w:r>
-        <w:t xml:space="preserve">Por ejemplo: "Cuarto episodio obstructivo en un año, esta vez asociado a bacteriemia e hipoperfusión grave, lo que modifica el balance previo favorable al manejo expectante." La frase no afirma que una nueva recurrencia será necesariamente fatal. Expresa que la historia observada ha cambiado la inferencia pronóstica y, con ella, el umbral de intervención.</w:t>
+        <w:t xml:space="preserve">Considere cómo se condensa un punto de inflexión en la ficha: "Cuarto episodio obstructivo en doce meses, por primera vez complicado con bacteriemia y shock séptico, lo que invalida la seguridad del manejo expectante previo." La frase no predice con certeza absoluta que una quinta obstrucción será letal. Expresa algo más riguroso: que la aceleración de las recurrencias y el salto cualitativo en gravedad han modificado la inferencia pronóstica y, al elevar el costo esperado de un nuevo evento, han desplazado el umbral a favor de una intervención electiva.</w:t>
       </w:r>
     </w:p>
     <w:p>
@@ -7664,7 +7664,7 @@
         <w:pStyle w:val="BodyJ"/>
       </w:pPr>
       <w:r>
-        <w:t xml:space="preserve">Un paciente con dolor abdominal inespecífico y laboratorio tranquilizador quedará "en observación". Redacte la indicación en no más de cuatro líneas, de modo que la observación sea una intervención diagnóstica y no una postergación.</w:t>
+        <w:t xml:space="preserve">Un paciente con dolor abdominal inespecífico y exámenes iniciales tranquilizadores quedará hospitalizado o en urgencias "en observación". Redacte el plan en no más de cuatro líneas, de modo que la espera opere como una intervención diagnóstica estructurada y no como una postergación pasiva.</w:t>
       </w:r>
     </w:p>
     <w:p>
@@ -7679,7 +7679,7 @@
         <w:t xml:space="preserve">Solución comentada.</w:t>
       </w:r>
       <w:r>
-        <w:t xml:space="preserve"> Una versión defendible: "Observación activa por dolor abdominal en estudio, con probabilidad baja pero no excluida de causa quirúrgica. Reevaluación médica dirigida a las 4 h (o antes si dolor creciente, vómitos, fiebre o taquicardia sostenida); control de laboratorio a las 6 h; si el dolor localiza, aparece defensa o el paciente no tolera vía oral, avisar de inmediato y repetir imagen. Si a las 8 h permanece asintomático y camina sin dolor, alta con instrucciones escritas de reconsulta." La estructura tiene los cuatro elementos: qué se espera aprender (evolución del dolor), en qué plazo (4–8 h), qué se vigila (variables nombradas, con responsable implícito) y qué constituye salida en ambas direcciones (escalar o alta). Compárese con "control según evolución", la fórmula que delega en la suerte lo que debía organizar el plan.</w:t>
+        <w:t xml:space="preserve"> Una formulación defendible es: "Observación clínica activa por dolor abdominal agudo en estudio, con probabilidad pretest baja pero no excluida de patología quirúrgica. Plan: reevaluación abdominal presencial a las 4 h (o antes si presenta dolor en ascenso, vómitos, fiebre o taquicardia &gt;100 lpm); control de parámetros inflamatorios a las 6 h. Si el dolor migra o localiza, aparece irritación peritoneal o no tolera prueba de vía oral, avisar al médico de turno de inmediato para solicitar tomografía. Si a las 8 h permanece afebril, sin dolor a la deambulación y tolerando régimen líquido, proceder al alta con pauta escrita de signos de alarma." Esta estructura explicita los cuatro pilares que validan al tiempo como prueba diagnóstica: qué se busca evaluar (la trayectoria del dolor y la tolerancia oral), en qué ventana temporal (4 a 8 horas), qué variables gatillan acción (con plazos y responsables definidos) y cuáles son los umbrales de salida en ambas direcciones (escalar el estudio o dar el alta). Compárese con la anotación habitual "control según evolución", una fórmula vacía que delega en el azar lo que debía quedar gobernado por el diseño del plan.</w:t>
       </w:r>
     </w:p>
     <w:p>
@@ -7781,7 +7781,7 @@
         <w:pStyle w:val="BodyJ"/>
       </w:pPr>
       <w:r>
-        <w:t xml:space="preserve">Abra la evolución de cualquier paciente con más de una semana de hospitalización y busque el párrafo que se repite idéntico desde el ingreso. Casi siempre existe. Alguien lo escribió el primer día, alguien lo copió el segundo, y desde entonces viaja como un polizón: "paciente con antecedente de ITU a repetición", "en estudio por baja de peso", "manejo habitual". Este capítulo trata de la ficha como tecnología cognitiva: la diferencia entre un registro que piensa y uno que fosiliza.</w:t>
+        <w:t xml:space="preserve">Abra la ficha clínica de cualquier paciente que lleve más de una semana hospitalizado y busque el párrafo que se repite intacto desde el ingreso. Casi siempre está ahí. Alguien lo redactó el primer día, otro lo copió y pegó el segundo, y desde entonces viaja en las evoluciones como un polizón: "paciente con antecedente de ITU a repetición", "en estudio por baja de peso", "se mantiene manejo habitual". Este capítulo aborda la ficha clínica como tecnología cognitiva: la diferencia entre un registro que sostiene el pensamiento y uno que lo fosiliza.</w:t>
       </w:r>
     </w:p>
     <w:p>
@@ -8012,7 +8012,7 @@
         <w:t xml:space="preserve">Hechos:</w:t>
       </w:r>
       <w:r>
-        <w:t xml:space="preserve"> paciente con vejiga neurogénica y sonda permanente; sonda recambiada; orina turbia, piuria y urocultivo positivo; afebril, estable, sin nuevo deterioro sistémico; marcadores inflamatorios elevados con neoplasia avanzada como explicación alternativa.</w:t>
+        <w:t xml:space="preserve"> paciente con lesión medular, vejiga neurogénica y sonda Foley permanente; presenta orina turbia, piuria y urocultivo positivo tras recambio reciente del catéter. Se mantiene afebril, hemodinámicamente estable y sin deterioro respecto de su basal. Parámetros inflamatorios elevados sin curva previa, en contexto de neoplasia avanzada activa. Antecedente documentado de colonización previa por enterobacteria multirresistente.</w:t>
       </w:r>
     </w:p>
     <w:p>
@@ -8027,7 +8027,7 @@
         <w:t xml:space="preserve">Inferencia:</w:t>
       </w:r>
       <w:r>
-        <w:t xml:space="preserve"> bacteriuria asociada a catéter, sin evidencia clínica suficiente de infección urinaria sintomática.</w:t>
+        <w:t xml:space="preserve"> bacteriuria y piuria asociadas a recambio de catéter en paciente crónicamente colonizado; sin evidencia clínica actual de infección urinaria sintomática asociada a catéter. Los marcadores inflamatorios tienen una explicación oncológica alternativa y plausible.</w:t>
       </w:r>
     </w:p>
     <w:p>
@@ -8042,7 +8042,7 @@
         <w:t xml:space="preserve">Incertidumbre:</w:t>
       </w:r>
       <w:r>
-        <w:t xml:space="preserve"> síntomas urinarios clásicos no evaluables; debe vigilarse aparición de fiebre, inestabilidad, espasticidad nueva u otro cambio autonómico o sistémico.</w:t>
+        <w:t xml:space="preserve"> los síntomas urinarios bajos clásicos no son evaluables por su lesión medular; el riesgo es subestimar una infección incipiente de expresión atípica.</w:t>
       </w:r>
     </w:p>
     <w:p>
@@ -8057,7 +8057,7 @@
         <w:t xml:space="preserve">Decisión:</w:t>
       </w:r>
       <w:r>
-        <w:t xml:space="preserve"> no iniciar antibiótico por ahora; monitorización y reevaluación ante criterios clínicos, considerando que el antecedente de microorganismo multirresistente eleva el costo ecológico de tratamiento innecesario.</w:t>
+        <w:t xml:space="preserve"> no iniciar antibióticos ahora. Mantener vigilancia clínica estrecha ante la aparición de fiebre, inestabilidad hemodinámica, aumento de espasticidad o disreflexia autonómica. El antecedente de colonización multirresistente —declarado en la capa de hechos— eleva el daño ecológico e individual de un tratamiento innecesario, y exige un umbral clínico estricto antes de prescribir.</w:t>
       </w:r>
     </w:p>
     <w:p>
@@ -8090,7 +8090,7 @@
         <w:pStyle w:val="BodyJ"/>
       </w:pPr>
       <w:r>
-        <w:t xml:space="preserve">En el caso anterior: "Bacteriuria y piuria tras recambio de sonda en paciente con colonización crónica probable, sin manifestaciones sistémicas que sostengan una ITU asociada a catéter urinario permanente (CUP); se prioriza vigilancia clínica para evitar exposición innecesaria a antibióticos de amplio espectro."</w:t>
+        <w:t xml:space="preserve">En el caso anterior: "Bacteriuria y piuria tras recambio de sonda Foley en paciente con vejiga neurogénica y antecedente de colonización multirresistente, sin signos sistémicos ni autonómicos que configuren infección activa; se difiere antibioterapia bajo vigilancia dirigida para evitar selección de resistencia."</w:t>
       </w:r>
     </w:p>
     <w:p>
@@ -8155,7 +8155,7 @@
         <w:pStyle w:val="BodyJ"/>
       </w:pPr>
       <w:r>
-        <w:t xml:space="preserve">La siguiente evolución se ha copiado casi idéntica durante cinco días: "Paciente con neumonía en tratamiento antibiótico, hemodinamia estable, afebril, se mantiene manejo". El día 5, los datos reales son: afebril, pero con requerimiento de oxígeno que subió de 2 a 4 litros, PCR estancada y un derrame pleural nuevo en la radiografía de control. Reescriba la evolución del día 5 con estructura HII-D.</w:t>
+        <w:t xml:space="preserve">La siguiente nota se ha copiado casi idéntica durante cinco días seguidos: "Paciente cursando neumonía en tratamiento antibiótico, hemodinamia estable, afebril, se mantiene manejo". Al quinto día, los datos reales en la hoja de enfermería y en el sistema son: afebril, pero con requerimiento de oxígeno que subió de 2 a 4 L/min en 48 horas, PCR estacionaria (180→165 mg/L) y un derrame pleural nuevo en la radiografía de tórax de control. Reescriba la evolución del día 5 aplicando la estructura HII-D.</w:t>
       </w:r>
     </w:p>
     <w:p>
@@ -8180,7 +8180,7 @@
         <w:t xml:space="preserve">Hechos:</w:t>
       </w:r>
       <w:r>
-        <w:t xml:space="preserve"> día 5 de antibióticos por neumonía. Afebril desde el día 2, pero O2 en aumento (2→4 L en 48 h), PCR sin descenso (180→165) y derrame pleural nuevo en radiografía de hoy. </w:t>
+        <w:t xml:space="preserve"> día 5 de tratamiento antibiótico por neumonía adquirida en la comunidad. Afebril desde el día 2 y normotenso, pero con deterioro del intercambio gaseoso (requerimiento de O2 por naricera en ascenso de 2 a 4 L/min en 48 h), PCR estancada (180→165 mg/L) y aparición de derrame pleural ipsilateral en la radiografía de hoy. </w:t>
       </w:r>
       <w:r>
         <w:rPr>
@@ -8190,7 +8190,7 @@
         <w:t xml:space="preserve">Inferencia:</w:t>
       </w:r>
       <w:r>
-        <w:t xml:space="preserve"> evolución discordante con neumonía en resolución; derrame paraneumónico complicado o empiema pasan a ser probables; falla del esquema o diagnóstico alternativo, posibles. </w:t>
+        <w:t xml:space="preserve"> evolución clínica y radiológica discordante con una neumonía en resolución; alta probabilidad de derrame paraneumónico complicado o empiema; falla de cobertura antimicrobiana o diagnóstico alternativo pasan a ser posibles. </w:t>
       </w:r>
       <w:r>
         <w:rPr>
@@ -8200,7 +8200,7 @@
         <w:t xml:space="preserve">Incertidumbre:</w:t>
       </w:r>
       <w:r>
-        <w:t xml:space="preserve"> características del derrame desconocidas hasta punción; la afebrilidad no excluye complicación supurativa. </w:t>
+        <w:t xml:space="preserve"> naturaleza fisicoquímica y microbiológica del líquido pleural desconocida hasta su punción; la ausencia de fiebre no excluye una colección supurada. </w:t>
       </w:r>
       <w:r>
         <w:rPr>
@@ -8210,7 +8210,7 @@
         <w:t xml:space="preserve">Decisión:</w:t>
       </w:r>
       <w:r>
-        <w:t xml:space="preserve"> toracocentesis diagnóstica hoy; reevaluar esquema según resultado; si no se puede puncionar en 24 h, escalar discusión con cirugía de tórax. Criterio de reapertura explícito: cualquier aumento adicional de O2 o inestabilidad adelanta la punción.* La versión copiada no era falsa —el paciente estaba afebril y estable—; era un fósil: describía al paciente del día 2 con los datos del día 5. La reescritura no agregó información nueva: dejó de omitir la que ya existía.</w:t>
+        <w:t xml:space="preserve"> toracocentesis diagnóstica hoy, guiada por ecografía, y ajuste del esquema según el estudio del líquido; si el procedimiento no se concreta en 24 h, interconsulta a cirugía de tórax. Criterio de reapertura inmediata: cualquier incremento adicional en el aporte de oxígeno o taquipnea progresiva obliga a adelantar el drenaje." Nótese que la nota copiada durante cinco días no contenía mentiras literales —el paciente seguía afebril y normotenso—, pero operaba como un fósil narrativo: describía la fisiología del día 2 ignorando la trayectoria del día 5. Desfosilizar la evolución no exigió inventar datos sofisticados, sino dejar de omitir las tendencias que ya estaban a la vista.</w:t>
       </w:r>
     </w:p>
     <w:p>
@@ -8312,7 +8312,7 @@
         <w:pStyle w:val="BodyJ"/>
       </w:pPr>
       <w:r>
-        <w:t xml:space="preserve">A las 2:00, la enfermera de turno anota: "paciente más quejumbrosa, rechaza la cena, diuresis límite". A las 8:00, la entrega de turno resume: "sin novedades". Entre esas dos frases no hay mala fe: hay una cadena de transmisión donde la información se comprimió hasta desaparecer. Este capítulo trata del conocimiento clínico como propiedad de un equipo —médicos, enfermería, paciente, familia, artefactos— y de cómo se degrada, se discute y se comunica.</w:t>
+        <w:t xml:space="preserve">A las 02:00 de la madrugada, la enfermera de turno registra en su hoja: "paciente más quejumbrosa, rechaza la cena, diuresis en el límite inferior". A las 08:00, en la entrega de turno médica, el caso se resume en dos palabras: "sin novedades". Entre ambos registros no hay negligencia ni mala fe; hay una cadena de transmisión donde la señal clínica fue comprimida hasta desaparecer. Este capítulo aborda el conocimiento clínico como una propiedad distribuida en un equipo —médicos, enfermeras, técnicos, kinesiólogos, paciente, familia y sistemas de registro— y examina cómo esa información se degrada, se delibera y se comunica.</w:t>
       </w:r>
     </w:p>
     <w:p>
@@ -8353,7 +8353,7 @@
         <w:pStyle w:val="BodyJ"/>
       </w:pPr>
       <w:r>
-        <w:t xml:space="preserve">Vuelva a la nota de las 2:00. "Más quejumbrosa, rechaza la cena, diuresis límite" contiene tres hechos de pleno derecho que ninguna nota médica de ese día posee: un cambio respecto del basal observado por quien ve a la paciente cada dos horas y no una vez al día; una conducta —rechazar la comida en alguien que venía comiendo— que es dato y no anécdota; y una tendencia que precede en horas a la cifra que activará la alarma. Es la observación profesional de la tabla del capítulo 1 en su forma más valiosa: la serie temporal corta, que sólo enfermería posee. Lo que la frase de las 8:00 hizo —"sin novedades"— no fue mentir: fue aplicar a esa fuente un estándar de relevancia que no se aplica a la propia. La cognición distribuida empieza por conceder a cada integrante su acceso privilegiado, y el de enfermería es el tiempo entre visitas médicas — exactamente donde los pacientes se deterioran.</w:t>
+        <w:t xml:space="preserve">Volvamos al registro de enfermería de las 02:00. "Más quejumbrosa, rechaza la cena, diuresis en el límite" contiene tres hechos clínicos de pleno derecho que ninguna evolución médica de esa mañana recogió: una desviación aguda respecto del estado basal detectada por quien evalúa a la paciente cada dos horas y no una vez al día; un cambio conductual —dejar de comer cuando venía alimentándose bien— que constituye un signo clínico precoz y no una anécdota doméstica; y una pendiente fisiológica descendente que antecede por horas a la hipotensión manifiesta que activará las alarmas. Es la observación profesional en su dimensión más valiosa: la serie temporal corta, un dominio sobre el cual enfermería posee un acceso epistémico privilegiado. Cuando la entrega de turno de las 08:00 tradujo todo eso como "sin novedades", no faltó a la verdad deliberadamente: aplicó a los datos de enfermería un filtro de irrelevancia que jamás aplicaría a un examen de laboratorio. La cognición distribuida comienza cuando el equipo reconoce qué integrante tiene el mejor puesto de observación para cada fenómeno; y el de enfermería es precisamente el intervalo de veinte horas entre una visita médica y la siguiente, que es cuando los pacientes hospitalizados comienzan a deteriorarse.</w:t>
       </w:r>
     </w:p>
     <w:p>
@@ -8378,7 +8378,7 @@
         <w:pStyle w:val="BodyJ"/>
       </w:pPr>
       <w:r>
-        <w:t xml:space="preserve">Un dato no viaja intacto. En cada entrega de turno, llamada o resumen se selecciona, comprime y reinterpreta. "Paciente estable" puede borrar una dosis creciente de oxígeno; "cultivo positivo" puede perder el contexto de colonización; "TAC sin complicaciones" puede convertirse erróneamente en "hernia no complicada" pese a un episodio fisiológicamente grave. Los artefactos también interpretan: una interfaz prioriza ciertos campos, separa otros y convierte opciones discretas en categorías administrativas.</w:t>
+        <w:t xml:space="preserve">Ningún dato clínico viaja intacto a través de una institución. En cada entrega de turno, interconsulta telefónica o resumen de traslado, la información se selecciona, se comprime y se reinterpreta. El rótulo "paciente estable" puede invisibilizar un requerimiento de oxígeno que se duplicó en silencio; "urocultivo positivo" suele perder en el camino la advertencia de que el paciente es usuario crónico de sonda y está asintomático; "TAC sin complicaciones agudas" se traduce inadvertidamente como "hernia no complicada", borrando el hecho de que la paciente ingresó en shock séptico. Y los artefactos tecnológicos también editorializan: la interfaz de la ficha electrónica jerarquiza ciertas casillas, esconde las notas de otros estamentos en pestañas separadas y fuerza realidades clínicas continuas dentro de menús desplegables administrativos.</w:t>
       </w:r>
     </w:p>
     <w:p>
@@ -8691,7 +8691,7 @@
         <w:pStyle w:val="BodyJ"/>
       </w:pPr>
       <w:r>
-        <w:t xml:space="preserve">En la visita de sala, el intensivista dice: "Yo la operaría ahora; esto va a volver a pasar". La internista responde: "Me parece apresurado; acaba de salir de un shock". Traduzca el desacuerdo a proposiciones evaluables: ¿discrepan en hechos, inferencias, incertidumbre, valores o decisión?</w:t>
+        <w:t xml:space="preserve">En la entrega de turno de la mañana, al discutir el caso de Carmen, el intensivista plantea: "Yo la operaría en esta hospitalización; si la mandamos a la casa, esto se va a volver a obstruir". La internista replica: "Operarla ahora me parece apresurado; acaba de salir de un shock séptico grave". Traduzca esta fricción verbal a proposiciones evaluables: ¿están discrepando en los hechos, en las inferencias, en la incertidumbre, en los valores o en el umbral de decisión?</w:t>
       </w:r>
     </w:p>
     <w:p>
@@ -8706,7 +8706,7 @@
         <w:t xml:space="preserve">Solución comentada.</w:t>
       </w:r>
       <w:r>
-        <w:t xml:space="preserve"> Al traducir, el desacuerdo se descompone: en los </w:t>
+        <w:t xml:space="preserve"> Cuando el desacuerdo se desarma por capas, el conflicto aparente cambia de naturaleza. En los </w:t>
       </w:r>
       <w:r>
         <w:rPr>
@@ -8716,7 +8716,7 @@
         <w:t xml:space="preserve">hechos</w:t>
       </w:r>
       <w:r>
-        <w:t xml:space="preserve"> no hay disputa (cuatro episodios, shock reciente, imagen sin isquemia). En la </w:t>
+        <w:t xml:space="preserve"> no existe disputa alguna: ambos conocen los cuatro episodios en el año, el shock reciente y la tomografía sin isquemia. En la </w:t>
       </w:r>
       <w:r>
         <w:rPr>
@@ -8726,7 +8726,7 @@
         <w:t xml:space="preserve">inferencia</w:t>
       </w:r>
       <w:r>
-        <w:t xml:space="preserve"> pronóstica están de acuerdo más de lo que creen: ambos consideran probable una nueva obstrucción. La divergencia real está en dos lugares: la </w:t>
+        <w:t xml:space="preserve"> pronóstica coinciden mucho más de lo que su tono sugiere: ambos estiman como altamente probable una nueva recurrencia obstructiva a corto o mediano plazo. La divergencia real se localiza en dos puntos precisos: primero, en una </w:t>
       </w:r>
       <w:r>
         <w:rPr>
@@ -8736,7 +8736,7 @@
         <w:t xml:space="preserve">incertidumbre</w:t>
       </w:r>
       <w:r>
-        <w:t xml:space="preserve"> sobre la aptitud quirúrgica actual (¿cuánto deteriora el riesgo operatorio el shock reciente? — dato reducible con evaluación objetiva, no con opinión) y el </w:t>
+        <w:t xml:space="preserve"> epistémica reducible respecto de la reserva fisiológica actual de la paciente (¿cuánto incrementa el riesgo perioperatorio el shock recién resuelto?, una duda que no se dirime con opiniones en la entrega de turno, sino mediante una evaluación funcional y preoperatoria formal); y segundo, en el </w:t>
       </w:r>
       <w:r>
         <w:rPr>
@@ -8746,7 +8746,7 @@
         <w:t xml:space="preserve">umbral de decisión</w:t>
       </w:r>
       <w:r>
-        <w:t xml:space="preserve"> (cuánto riesgo perioperatorio aceptar para evitar cuánto riesgo obstructivo — que además involucra </w:t>
+        <w:t xml:space="preserve"> (¿cuánto riesgo quirúrgico programado es razonable asumir hoy para evitar el riesgo incierto de una urgencia futura?, una ponderación que exige incorporar los </w:t>
       </w:r>
       <w:r>
         <w:rPr>
@@ -8756,7 +8756,7 @@
         <w:t xml:space="preserve">valores</w:t>
       </w:r>
       <w:r>
-        <w:t xml:space="preserve"> de la paciente, ausente de la conversación). Traducido así, el plan se escribe solo: evaluación funcional formal, optimización, y una conversación con Carmen sobre los dos riesgos. El desacuerdo no se "ganó": se usó.</w:t>
+        <w:t xml:space="preserve"> y temores de la propia Carmen, quien aún no ha sido escuchada). Traducida la discusión a esta matriz, el plan de trabajo se redacta solo: objetivar la capacidad funcional, optimizar su condición respiratoria y nutricional, y sentarse a conversar con Carmen sobre ambos escenarios de riesgo. Ninguno de los dos médicos "ganó" la discusión: el equipo utilizó el desacuerdo para diagnosticar qué información le faltaba.</w:t>
       </w:r>
     </w:p>
     <w:p>
@@ -8858,55 +8858,111 @@
         <w:pStyle w:val="BodyJ"/>
       </w:pPr>
       <w:r>
-        <w:t xml:space="preserve">El día 7, Carmen está sin sonda, comiendo, caminando por el pasillo. La evaluación preoperatoria muestra un EPOC moderado compensado y una capacidad funcional aceptable. Es el momento de la conversación que el equipo había ido preparando sin decirlo: la internista, la cirujana y Carmen, con su hija presente porque ella lo pidió.</w:t>
-      </w:r>
-    </w:p>
-    <w:p>
-      <w:pPr>
-        <w:pStyle w:val="BodyJ"/>
-      </w:pPr>
-      <w:r>
-        <w:t xml:space="preserve">La cirujana no empieza por la propuesta. Empieza por el esquema de cuatro pasos: "Le voy a contar qué sabemos, qué creemos, qué no sabemos y qué opciones hay. Lo que sabemos: usted tiene una hernia que este año se ha obstruido cuatro veces, y la última vez llegó grave, con infección en la sangre y presión muy baja. Lo que creemos: que la probabilidad de que vuelva a pasar es alta, y que un próximo episodio puede ser tan grave como este o peor; no podemos ponerle fecha. Lo que no sabemos: si la cirugía va a ser sencilla —su tejido está operado de antes— ni cómo va a responder su pulmón a la anestesia; el riesgo existe y no es despreciable. Las opciones: operarnos ahora que usted está recuperada, en forma programada, con todo preparado; o esperar, sabiendo que la próxima obstrucción puede llegar de urgencia, de noche, con usted más débil".</w:t>
-      </w:r>
-    </w:p>
-    <w:p>
-      <w:pPr>
-        <w:pStyle w:val="BodyJ"/>
-      </w:pPr>
-      <w:r>
-        <w:t xml:space="preserve">Carmen pregunta lo que casi todos preguntan: "¿Y usted qué haría?". La cirujana responde con la estructura del capítulo 14 en mente: "Yo le recomiendo operarse, y le digo por qué: prefiero un riesgo quirúrgico conocido, con usted optimizada, a un riesgo obstructivo que no controlamos ni podemos programar. Pero la que pasó el shock fue usted, y la que decide cuánto miedo le tiene a cada uno de esos riesgos también es usted".</w:t>
-      </w:r>
-    </w:p>
-    <w:p>
-      <w:pPr>
-        <w:pStyle w:val="BodyJ"/>
-      </w:pPr>
-      <w:r>
-        <w:t xml:space="preserve">La hija pregunta si la cirugía "garantiza" que no habrá más obstrucciones. "No", dice la cirujana, "baja mucho la probabilidad; no la hace cero. Si le dijera otra cosa, le estaría mintiendo."</w:t>
-      </w:r>
-    </w:p>
-    <w:p>
-      <w:pPr>
-        <w:pStyle w:val="BodyJ"/>
-      </w:pPr>
-      <w:r>
-        <w:t xml:space="preserve">Carmen se queda callada un momento y después habla más de lo que había hablado en toda la semana: "Yo no quiero otra noche como esa. Pensé que me moría, y mi hija también. Pero tampoco quiero que me abran si no hace falta: la otra vez tardé meses en pararme derecha. Lo que necesito saber es si después de esto voy a poder seguir cuidando a mi nieta". La pregunta no figuraba en ninguna escala de riesgo quirúrgico y era la que ordenaba todas las demás; la cirujana la anotó antes de responder.</w:t>
-      </w:r>
-    </w:p>
-    <w:p>
-      <w:pPr>
-        <w:pStyle w:val="BodyJ"/>
-      </w:pPr>
-      <w:r>
-        <w:t xml:space="preserve">Carmen acepta. En la ficha, la internista escribe la frase medular que resume siete días de trabajo epistémico: "Obstrucción recurrente por hernia incisional, cuarto episodio en un año y primero con shock y bacteriemia; sin complicación anatómica aguda en imagen. El cambio cualitativo de gravedad, la aceleración de las recurrencias y la preferencia informada de la paciente justifican reparación electiva tras optimización, asumiendo riesgo perioperatorio moderado como alternativa preferible a una nueva urgencia no programada. Reevaluar decisión si deterioro funcional o nuevo episodio antes de la fecha quirúrgica."</w:t>
-      </w:r>
-    </w:p>
-    <w:p>
-      <w:pPr>
-        <w:pStyle w:val="BodyJ"/>
-      </w:pPr>
-      <w:r>
-        <w:t xml:space="preserve">Ninguna palabra de esa frase es adorno. Cada una carga un capítulo de este libro.</w:t>
+        <w:t xml:space="preserve">Al séptimo día de hospitalización, Carmen ya está sin sonda nasogástrica, tolerando régimen blando y caminando sin disnea por el pasillo del servicio. La evaluación preoperatoria documenta un EPOC moderado bien compensado y una capacidad funcional aceptable. Ha llegado el momento de tener la conversación para la cual el equipo se estuvo preparando toda la semana: se reúnen junto a su cama la internista, la cirujana, Carmen y su hija, cuya presencia ella misma solicitó.</w:t>
+      </w:r>
+    </w:p>
+    <w:p>
+      <w:pPr>
+        <w:pStyle w:val="BodyJ"/>
+      </w:pPr>
+      <w:r>
+        <w:t xml:space="preserve">La cirujana no abre el diálogo proponiendo el pabellón. Comienza transparentando la arquitectura del problema en cuatro estaciones:</w:t>
+      </w:r>
+    </w:p>
+    <w:p>
+      <w:pPr>
+        <w:pStyle w:val="BodyJ"/>
+      </w:pPr>
+      <w:r>
+        <w:t xml:space="preserve">—Le voy a explicar con calma qué sabemos con seguridad, qué creemos que puede pasar, qué cosas no podemos asegurarle y qué caminos tenemos. Lo que sabemos: usted tiene una hernia que en los últimos doce meses se ha atascado cuatro veces, y en este último episodio llegó muy grave, con una infección que pasó a la sangre y la presión tan baja que necesitó medicamentos especiales en la UCI. Lo que creemos: que la probabilidad de que la hernia vuelva a obstruirse es alta, y que un quinto episodio podría ser igual o más grave que este, sin que nadie pueda predecir en qué fecha ocurrirá. Lo que no sabemos: si la operación será técnicamente sencilla —porque su abdomen ya tiene cicatrices internas de antes— ni cómo se comportará exactamente su pulmón con la anestesia; ese riesgo quirúrgico existe y no es menor. Nuestras opciones son dos: programamos la cirugía ahora que usted ya recuperó fuerzas, de día y con todo el equipo preparado; o nos vamos de alta sin operar, asumiendo que la próxima obstrucción puede ocurrir de madrugada, de urgencia y con usted en peores condiciones.</w:t>
+      </w:r>
+    </w:p>
+    <w:p>
+      <w:pPr>
+        <w:pStyle w:val="BodyJ"/>
+      </w:pPr>
+      <w:r>
+        <w:t xml:space="preserve">Carmen hace la pregunta que casi todo paciente formula cuando la incertidumbre se pone sobre la mesa:</w:t>
+      </w:r>
+    </w:p>
+    <w:p>
+      <w:pPr>
+        <w:pStyle w:val="BodyJ"/>
+      </w:pPr>
+      <w:r>
+        <w:t xml:space="preserve">—Doctora, ¿y usted qué haría en mi lugar?</w:t>
+      </w:r>
+    </w:p>
+    <w:p>
+      <w:pPr>
+        <w:pStyle w:val="BodyJ"/>
+      </w:pPr>
+      <w:r>
+        <w:t xml:space="preserve">La cirujana no rehúye la recomendación ni usurpa la decisión:</w:t>
+      </w:r>
+    </w:p>
+    <w:p>
+      <w:pPr>
+        <w:pStyle w:val="BodyJ"/>
+      </w:pPr>
+      <w:r>
+        <w:t xml:space="preserve">—Yo le recomiendo operarse, Carmen, y le transparento mi razón: prefiero asumir un riesgo quirúrgico conocido, con usted compensada y en un pabellón programado, antes que exponerla a un nuevo episodio de urgencia que no controlamos. Pero la que vivió la angustia del shock fue usted, y quien tiene derecho a decidir a cuál de esos dos riesgos le teme más también es usted.</w:t>
+      </w:r>
+    </w:p>
+    <w:p>
+      <w:pPr>
+        <w:pStyle w:val="BodyJ"/>
+      </w:pPr>
+      <w:r>
+        <w:t xml:space="preserve">La hija interviene para preguntar si la operación "garantiza" que el problema nunca se repetirá.</w:t>
+      </w:r>
+    </w:p>
+    <w:p>
+      <w:pPr>
+        <w:pStyle w:val="BodyJ"/>
+      </w:pPr>
+      <w:r>
+        <w:t xml:space="preserve">—No —responde la cirujana sin rodeos—. Reduce muchísimo la probabilidad, pero en medicina nada la lleva a cero. Si le prometiera garantías absolutas, le estaría faltando a la verdad.</w:t>
+      </w:r>
+    </w:p>
+    <w:p>
+      <w:pPr>
+        <w:pStyle w:val="BodyJ"/>
+      </w:pPr>
+      <w:r>
+        <w:t xml:space="preserve">Carmen guarda silencio unos segundos y luego pronuncia el relato más largo que el equipo le ha escuchado en toda la hospitalización:</w:t>
+      </w:r>
+    </w:p>
+    <w:p>
+      <w:pPr>
+        <w:pStyle w:val="BodyJ"/>
+      </w:pPr>
+      <w:r>
+        <w:t xml:space="preserve">—Yo no quiero volver a pasar una noche como la que pasé al llegar. Pensé que me moría, y vi en la cara de mi hija que ella pensó lo mismo. Pero tampoco quiero que me operen por operar: en mi cirugía antigua demoré meses en poder enderezarme bien. Lo único que yo necesito saber, doctora, es si después de recuperarme voy a poder seguir cuidando a mi nieta en las tardes.</w:t>
+      </w:r>
+    </w:p>
+    <w:p>
+      <w:pPr>
+        <w:pStyle w:val="BodyJ"/>
+      </w:pPr>
+      <w:r>
+        <w:t xml:space="preserve">Esa pregunta no figuraba en ninguna calculadora de riesgo perioperatorio, pero era el criterio rector que ordenaba todas las demás variables. La cirujana la anotó en la hoja antes de responderle cómo organizarían la rehabilitación kinésica postoperatoria para proteger esa meta.</w:t>
+      </w:r>
+    </w:p>
+    <w:p>
+      <w:pPr>
+        <w:pStyle w:val="BodyJ"/>
+      </w:pPr>
+      <w:r>
+        <w:t xml:space="preserve">Carmen acepta operarse. De regreso en la estación de enfermería, la internista redacta la frase medular que condensa una semana de deliberación clínica: "Obstrucción intestinal recurrente por hernia incisional, cuarto episodio anual y primero complicado con shock séptico y bacteriemia por gramnegativos; tomografía sin isquemia aguda. El salto cualitativo en gravedad, la aceleración de las recurrencias y la preferencia informada de la paciente —orientada a preservar su rol funcional familiar y evitar una nueva urgencia vital— justifican reparación quirúrgica electiva tras optimización, asumiendo un riesgo perioperatorio moderado como alternativa preferible al manejo expectante. Criterio de reapertura: suspender programación y reevaluar si presenta deterioro respiratorio o nuevo evento obstructivo previo a la fecha de pabellón."</w:t>
+      </w:r>
+    </w:p>
+    <w:p>
+      <w:pPr>
+        <w:pStyle w:val="BodyJ"/>
+      </w:pPr>
+      <w:r>
+        <w:t xml:space="preserve">Ninguna palabra de esa evolución es ornamento retórico. Cada cláusula sostiene una capa completa del juicio clínico.</w:t>
       </w:r>
     </w:p>
     <w:p>
@@ -8969,7 +9025,7 @@
         <w:pStyle w:val="BodyJ"/>
       </w:pPr>
       <w:r>
-        <w:t xml:space="preserve">Hay una frase que me costó años aprender a decir delante de una familia: "no lo sé". La primera vez que la dije completa —"no sé todavía por qué empeoró; sé qué descartamos, sé qué vamos a vigilar esta noche y sé cuándo tendremos más información"— esperaba encontrar decepción. Encontré alivio. La familia no necesitaba mi certeza; necesitaba saber que la incertidumbre estaba siendo trabajada. Este capítulo trata de esa diferencia: entre parecer seguro y ser responsable.</w:t>
+        <w:t xml:space="preserve">Hay una frase de tres palabras que me tomó años aprender a pronunciar frente a la familia de un paciente grave: "no lo sé". La primera vez que me atreví a decirla completa —"todavía no sé con certeza por qué empeoró hoy; pero sí sé qué complicaciones graves ya descartamos, sé qué variables vamos a vigilar esta noche y sé a qué hora de mañana tendremos nuevos resultados"— temía provocar desconfianza o angustia. Encontré exactamente lo contrario: alivio. Esa familia no exigía que yo fuera omnisciente; necesitaba saber que nuestra incertidumbre estaba gobernada por un plan. Este capítulo trata de la distancia moral y técnica que separa el aparentar seguridad del ejercer responsabilidad.</w:t>
       </w:r>
     </w:p>
     <w:p>
@@ -9149,7 +9205,7 @@
         <w:pStyle w:val="BodyJ"/>
       </w:pPr>
       <w:r>
-        <w:t xml:space="preserve">Escuchar de manera epistémica implica preguntar qué sabe esta persona que el equipo no puede observar, qué interpretación atribuye a sus síntomas y qué experiencias anteriores modifican su decisión. También exige distinguir desacuerdo de incapacidad. Un paciente puede comprender la evidencia y valorar de manera diferente los desenlaces. Cuando Carmen dijo "esta vez el dolor era otro", estaba entregando el dato pronóstico más importante del ingreso; la nota que lo hubiera omitido habría cometido, además de una injusticia, un error técnico. La regla general merece escribirse: una ficha que borra el testimonio del paciente no es sólo injusta — es epistemológicamente más pobre, y una frase medular que no conserva la voz del enfermo cuando esa voz es el dato está incompleta según su propio estándar.</w:t>
+        <w:t xml:space="preserve">Practicar una escucha epistémicamente justa exige preguntarse qué información privilegiada posee este paciente a la cual ningún monitor ni laboratorio tiene acceso, qué significado le atribuye a sus propios síntomas y qué biografía previa modela su aversión al riesgo. Exige, además, no confundir una discrepancia de valores con un déficit de comprensión: un enfermo puede entender perfectamente la evidencia médica y, aun así, jerarquizar los desenlaces de otro modo. Cuando Carmen advirtió en urgencias que "esta vez la hernia no se dejó acomodar y el dolor era otro", estaba entregando el indicador pronóstico más fino de todo su ingreso. Una nota clínica que hubiera borrado esa frase para traducirla como "dolor abdominal en paciente con hernia conocida" no habría cometido sólo una falta de empatía o una injusticia testimonial; habría cometido una amputación técnica de los datos. La regla general merece quedar escrita: una ficha que silencia el testimonio del enfermo es epistemológicamente más pobre, y cualquier frase medular que excluya la voz del paciente —cuando esa voz contiene el dato discriminante del cambio clínico— fracasa según su propio estándar de rigor.</w:t>
       </w:r>
     </w:p>
     <w:p>
@@ -11176,15 +11232,15 @@
         <w:pStyle w:val="BodyJ"/>
       </w:pPr>
       <w:r>
-        <w:t xml:space="preserve">La historia completa atraviesa este libro; aquí queda su forma condensada, la que cabría en una discusión de caso.</w:t>
-      </w:r>
-    </w:p>
-    <w:p>
-      <w:pPr>
-        <w:pStyle w:val="BodyJ"/>
-      </w:pPr>
-      <w:r>
-        <w:t xml:space="preserve">Mujer de 61 años con hernia incisional y tres ingresos por suboclusión resueltos sin cirugía. Cuarto episodio con íleo, shock, hiperlactatemia, perfusión periférica alterada y hemocultivos con bacilos gramnegativos. Mejora con reposo digestivo, antibióticos y noradrenalina. La tomografía no muestra perforación, isquemia ni estrangulación.</w:t>
+        <w:t xml:space="preserve">La historia de Carmen atraviesa todo este libro; aquí se presenta en su versión condensada, tal como se sintetizaría en una entrega de turno o en una discusión clínica.</w:t>
+      </w:r>
+    </w:p>
+    <w:p>
+      <w:pPr>
+        <w:pStyle w:val="BodyJ"/>
+      </w:pPr>
+      <w:r>
+        <w:t xml:space="preserve">Mujer de 61 años con hernia incisional de la línea media y tres hospitalizaciones en el último año por suboclusión intestinal, todas resueltas con manejo médico conservador. Ingresa por un cuarto episodio obstructivo, esta vez asociado a shock séptico, hiperlactatemia (6,0 mmol/L), hipoperfusión periférica (llene capilar de 5 segundos) y bacteriemia por bacilos gramnegativos (2/2 hemocultivos). Evoluciona favorablemente con reposo digestivo, descompresión por sonda nasogástrica, noradrenalina y antibioterapia. La tomografía de abdomen no muestra perforación, isquemia mesentérica ni estrangulación actual.</w:t>
       </w:r>
     </w:p>
     <w:p>
@@ -11199,7 +11255,7 @@
         <w:t xml:space="preserve">Hechos:</w:t>
       </w:r>
       <w:r>
-        <w:t xml:space="preserve"> recurrencia documentada y acelerada; episodio actual fisiológicamente grave; bacteriemia; respuesta favorable; ausencia de complicación anatómica visible en la imagen.</w:t>
+        <w:t xml:space="preserve"> recurrencia obstructiva documentada y con intervalos cada vez más cortos; episodio actual con compromiso hemodinámico vital y bacteriemia demostrada; respuesta clínica favorable al soporte intensivo; ausencia de complicación quirúrgica aguda en la tomografía inicial.</w:t>
       </w:r>
     </w:p>
     <w:p>
@@ -11214,7 +11270,7 @@
         <w:t xml:space="preserve">Inferencia:</w:t>
       </w:r>
       <w:r>
-        <w:t xml:space="preserve"> foco abdominal y relación con el evento obstructivo son probables, pero el mecanismo exacto no está demostrado. La ausencia de estrangulación reduce la indicación de emergencia, no el riesgo futuro.</w:t>
+        <w:t xml:space="preserve"> el foco abdominal de la bacteriemia, secundario al evento obstructivo, es altamente probable por secuencia temporal y microbiología compatible, aunque el mecanismo íntimo (translocación bacteriana o microisquemia transitoria) no esté demostrado. La ausencia de estrangulación tomográfica desactiva la urgencia quirúrgica inmediata, pero no mitiga el riesgo acumulado de recurrencia.</w:t>
       </w:r>
     </w:p>
     <w:p>
@@ -11229,7 +11285,7 @@
         <w:t xml:space="preserve">Incertidumbre:</w:t>
       </w:r>
       <w:r>
-        <w:t xml:space="preserve"> probabilidad y momento de recurrencia; causalidad microbiológica exacta; aptitud y riesgo operatorio una vez recuperada.</w:t>
+        <w:t xml:space="preserve"> son inciertos el plazo hasta una quinta obstrucción, la magnitud del daño si ésta ocurre fuera del hospital y la reserva funcional efectiva de la paciente para enfrentar el estrés quirúrgico una vez recuperada.</w:t>
       </w:r>
     </w:p>
     <w:p>
@@ -11244,7 +11300,7 @@
         <w:t xml:space="preserve">Decisión:</w:t>
       </w:r>
       <w:r>
-        <w:t xml:space="preserve"> valoración quirúrgica temprana para reparación electiva una vez optimizada, con decisión compartida documentada. El argumento no es "fracasó todo manejo médico", sino que la gravedad actual cambia el costo esperado de una nueva estrategia expectante.</w:t>
+        <w:t xml:space="preserve"> solicitar evaluación quirúrgica precoz para planificar reparación electiva tras optimización médica y kinésica, documentando una decisión compartida. El fundamento para operar no es que "fracasó el manejo médico" (resolvió el cuadro agudo cuatro veces), sino que la gravedad vital alcanzada en este episodio vuelve inaceptable el riesgo de mantener una conducta expectante.</w:t>
       </w:r>
     </w:p>
     <w:p>
@@ -11259,7 +11315,7 @@
         <w:t xml:space="preserve">Frase medular:</w:t>
       </w:r>
       <w:r>
-        <w:t xml:space="preserve"> "Obstrucción recurrente por hernia incisional, por primera vez asociada a shock y bacteriemia, sin complicación anatómica aguda en tomografía; el cambio cualitativo de gravedad justifica priorizar resolución electiva tras recuperación fisiológica."</w:t>
+        <w:t xml:space="preserve"> "Obstrucción intestinal recurrente por hernia incisional, por primera vez complicada con shock séptico y bacteriemia pero sin isquemia aguda en tomografía; este salto cualitativo de gravedad modifica el umbral terapéutico y justifica priorizar la reparación quirúrgica electiva tras su recuperación fisiológica."</w:t>
       </w:r>
     </w:p>
     <w:p>
@@ -11274,7 +11330,7 @@
         <w:t xml:space="preserve">Epílogo.</w:t>
       </w:r>
       <w:r>
-        <w:t xml:space="preserve"> Carmen fue operada seis semanas después, en forma programada. La cirugía encontró adherencias firmes y un anillo herniario estrecho; no hubo complicaciones mayores. En el control del mes, Carmen puso su propia frase medular: "Esta vez el dolor venía con explicación, y eso lo cambia todo". Nada de eso demuestra que la decisión fue correcta —un desenlace no valida un proceso—, pero el proceso era defendible antes de conocer el desenlace, que es lo único que puede pedírsele a una decisión clínica. La frase de su ingreso, "cuadro habitual, manejo habitual", quedó en la ficha como lo que era: la hipótesis rápida que el trabajo de una semana convirtió en otra cosa.</w:t>
+        <w:t xml:space="preserve"> Carmen fue operada de forma programada seis semanas después. En pabellón se encontraron adherencias firmes y un anillo herniario estrecho, reparado sin incidentes mayores. En su control ambulatorio al mes, Carmen formuló su propio balance del proceso: "Esta vez el dolor tenía una explicación clara, y saber qué estábamos haciendo lo cambió todo". Su buena evolución postoperatoria no demuestra, por sí sola, que la indicación haya sido acertada —un desenlace feliz nunca valida retroactivamente un proceso defectuoso—; lo relevante es que la estructura de la decisión era racional y defendible antes de conocer el resultado, que es todo lo que puede exigírsele al juicio médico. La anotación rápida de su primera madrugada en urgencias —"cuadro habitual, manejo habitual"— permaneció en la ficha como testimonio de lo que una semana de trabajo epistémico permitió transformar.</w:t>
       </w:r>
     </w:p>
     <w:p>
@@ -11299,7 +11355,7 @@
         <w:pStyle w:val="BodyJ"/>
       </w:pPr>
       <w:r>
-        <w:t xml:space="preserve">Un paciente con lesión medular completa, vejiga neurogénica, sonda Foley y neoplasia avanzada presenta orina turbia, piuria y urocultivo positivo después de recambio de sonda. Está afebril, estable y sin otro cambio clínico. Los marcadores inflamatorios están elevados, sin valor basal y con explicación tumoral posible. Tiene antecedente de enterobacteria productora de BLEE.</w:t>
+        <w:t xml:space="preserve">Hombre con lesión medular completa, vejiga neurogénica, usuario crónico de sonda Foley y portador de una neoplasia avanzada en progresión. Tras un recambio traumático de sonda, presenta orina turbia, piuria en el sedimento y urocultivo positivo. Al examen se encuentra afebril, hemodinámicamente estable y sin cambios respecto de su condición basal. Sus marcadores inflamatorios sanguíneos están elevados, sin valores previos para comparar y con su enfermedad tumoral activa como causa concomitante. Registra antecedente de colonización e infecciones previas por enterobacteria productora de BLEE.</w:t>
       </w:r>
     </w:p>
     <w:p>
@@ -11314,7 +11370,7 @@
         <w:t xml:space="preserve">Hechos:</w:t>
       </w:r>
       <w:r>
-        <w:t xml:space="preserve"> colonización de alto riesgo basal; cultivo positivo; piuria; ausencia de fiebre o inestabilidad; síntomas urinarios clásicos no evaluables; costo alto de antibiótico amplio.</w:t>
+        <w:t xml:space="preserve"> usuario crónico de catéter urinario con recambio reciente; piuria y urocultivo positivo; estabilidad hemodinámica y ausencia de fiebre; imposibilidad neuroanatómica de evaluar síntomas urinarios bajos clásicos; elevación de reactantes de fase aguda sin basal conocido en paciente con neoplasia activa; antecedente documentado de colonización por microorganismo productor de BLEE.</w:t>
       </w:r>
     </w:p>
     <w:p>
@@ -11329,7 +11385,7 @@
         <w:t xml:space="preserve">Inferencia:</w:t>
       </w:r>
       <w:r>
-        <w:t xml:space="preserve"> bacteriuria asociada a catéter es más probable que infección sintomática con la información actual. Piuria y turbidez no distinguen por sí solas colonización de infección.</w:t>
+        <w:t xml:space="preserve"> el cuadro es altamente compatible con una bacteriuria asociada a catéter por colonización crónica (favorecida por el arrastre del recambio) más que con una infección urinaria sintomática asociada a sonda. Por sí solas, ni la turbidez ni la piuria discriminan entre colonización e infección invasiva en pacientes sondados, y la elevación inflamatoria sistémica es explicable por su neoplasia de base.</w:t>
       </w:r>
     </w:p>
     <w:p>
@@ -11344,7 +11400,7 @@
         <w:t xml:space="preserve">Incertidumbre:</w:t>
       </w:r>
       <w:r>
-        <w:t xml:space="preserve"> la lesión medular modifica la expresión clínica; se requiere vigilancia de signos autonómicos, espasticidad, malestar nuevo o deterioro sistémico.</w:t>
+        <w:t xml:space="preserve"> la denervación medular enmascara la disuria y el dolor lumbar, por lo que persiste la duda de una infección incipiente con expresión clínica atípica.</w:t>
       </w:r>
     </w:p>
     <w:p>
@@ -11359,7 +11415,7 @@
         <w:t xml:space="preserve">Decisión:</w:t>
       </w:r>
       <w:r>
-        <w:t xml:space="preserve"> no tratar de inmediato; establecer criterios explícitos de reevaluación. El antecedente de BLEE no es argumento para tratar antes, sino una razón adicional para exigir umbral clínico suficiente.</w:t>
+        <w:t xml:space="preserve"> no iniciar tratamiento antibiótico empírico. Instaurar vigilancia clínica dirigida a signos equivalentes de respuesta sistémica o autonómica (fiebre nueva, inestabilidad hemodinámica, aumento súbito de espasticidad, sudoración o malestar general inexplicable). Aquí, el antecedente de germen BLEE no opera como un gatillo para prescribir antes, sino exactamente al revés: como el tratamiento exigiría carbapenémicos de alto impacto ecológico y toxicidad potencial, el umbral clínico para iniciar antibióticos debe ser más exigente.</w:t>
       </w:r>
     </w:p>
     <w:p>
@@ -11374,7 +11430,7 @@
         <w:t xml:space="preserve">Frase medular:</w:t>
       </w:r>
       <w:r>
-        <w:t xml:space="preserve"> "Urocultivo positivo y piuria en usuario crónico de Foley, sin manifestaciones sistémicas nuevas que sostengan una ITU asociada a sonda; cuadro más compatible con bacteriuria asociada a catéter, con vigilancia reforzada por expresión sintomática limitada y antecedente de resistencia."</w:t>
+        <w:t xml:space="preserve"> "Urocultivo positivo y piuria tras recambio de sonda Foley en paciente con lesión medular y antecedente de colonización por BLEE, sin respuesta sistémica ni signos autonómicos que configuren infección activa; se interpreta como bacteriuria asociada a catéter y se mantiene vigilancia clínica estricta con criterios explícitos de reapertura."</w:t>
       </w:r>
     </w:p>
     <w:p>
@@ -11399,67 +11455,67 @@
         <w:pStyle w:val="BodyJ"/>
       </w:pPr>
       <w:r>
-        <w:t xml:space="preserve">Urgencias, 3:10. Hombre de 54 años, dolor torácico opresivo de 40 minutos, sudoroso, con antecedente de tabaquismo. Electrocardiograma: alteraciones inespecíficas de la repolarización. Primera troponina: pendiente. Hay otros nueve pacientes esperando y una sola reanimación disponible. No hay tiempo para la plantilla completa; hay tiempo para los sesenta segundos.</w:t>
-      </w:r>
-    </w:p>
-    <w:p>
-      <w:pPr>
-        <w:pStyle w:val="BodyJ"/>
-      </w:pPr>
-      <w:r>
-        <w:rPr>
-          <w:i/>
-          <w:iCs/>
-        </w:rPr>
-        <w:t xml:space="preserve">¿Qué vi y qué me contaron?</w:t>
-      </w:r>
-      <w:r>
-        <w:t xml:space="preserve"> Dolor opresivo con descarga adrenérgica, observado; ECG no diagnóstico pero anormal, medido ahora.</w:t>
-      </w:r>
-    </w:p>
-    <w:p>
-      <w:pPr>
-        <w:pStyle w:val="BodyJ"/>
-      </w:pPr>
-      <w:r>
-        <w:rPr>
-          <w:i/>
-          <w:iCs/>
-        </w:rPr>
-        <w:t xml:space="preserve">¿Qué creo y cuánto derecho tengo?</w:t>
-      </w:r>
-      <w:r>
-        <w:t xml:space="preserve"> Síndrome coronario agudo: posible-probable; el patrón clínico pesa más que el ECG inespecífico. No demostrado.</w:t>
-      </w:r>
-    </w:p>
-    <w:p>
-      <w:pPr>
-        <w:pStyle w:val="BodyJ"/>
-      </w:pPr>
-      <w:r>
-        <w:rPr>
-          <w:i/>
-          <w:iCs/>
-        </w:rPr>
-        <w:t xml:space="preserve">¿Qué daño importante podría producir si estoy equivocado?</w:t>
-      </w:r>
-      <w:r>
-        <w:t xml:space="preserve"> Tratarlo como "dolor inespecífico, espera troponina en sala" y que sea una oclusión en evolución. La incertidumbre peligrosa no es la etiqueta; es el tiempo.</w:t>
-      </w:r>
-    </w:p>
-    <w:p>
-      <w:pPr>
-        <w:pStyle w:val="BodyJ"/>
-      </w:pPr>
-      <w:r>
-        <w:rPr>
-          <w:i/>
-          <w:iCs/>
-        </w:rPr>
-        <w:t xml:space="preserve">¿Qué hago y qué me haría cambiar?</w:t>
-      </w:r>
-      <w:r>
-        <w:t xml:space="preserve"> Monitor, acceso, antiagregación según protocolo, ECG seriado en 15 minutos, troponina acelerada; escala a activación de hemodinamia si nuevo ECG cambia o el dolor persiste. Queda escrito: "SCA no demostrado; conducta por umbral dada gravedad del error de omisión".</w:t>
+        <w:t xml:space="preserve">Servicio de urgencias, 03:10. Hombre de 54 años, tabáquico activo, consulta por dolor retroesternal opresivo de 40 minutos de evolución, acompañado de diaforesis fría. El electrocardiograma de ingreso muestra alteraciones inespecíficas de la repolarización, sin supradesnivel del ST. La primera troponina está en proceso en el laboratorio. En la sala de espera hay nueve pacientes pendientes de atención y queda un solo cupo en el box de reanimación. Bajo esta presión asistencial no hay margen para redactar una plantilla extensa, pero sí hay sesenta segundos para estructurar el juicio.</w:t>
+      </w:r>
+    </w:p>
+    <w:p>
+      <w:pPr>
+        <w:pStyle w:val="BodyJ"/>
+      </w:pPr>
+      <w:r>
+        <w:rPr>
+          <w:i/>
+          <w:iCs/>
+        </w:rPr>
+        <w:t xml:space="preserve">¿Qué vi y qué me contaron? (Hechos)</w:t>
+      </w:r>
+      <w:r>
+        <w:t xml:space="preserve"> Dolor torácico visceral opresivo con signos autonómicos objetivos (diaforesis fría presenciada en el triage) y un ECG inicial anormal aunque no diagnóstico.</w:t>
+      </w:r>
+    </w:p>
+    <w:p>
+      <w:pPr>
+        <w:pStyle w:val="BodyJ"/>
+      </w:pPr>
+      <w:r>
+        <w:rPr>
+          <w:i/>
+          <w:iCs/>
+        </w:rPr>
+        <w:t xml:space="preserve">¿Qué creo y cuánto derecho tengo a creerlo? (Inferencia)</w:t>
+      </w:r>
+      <w:r>
+        <w:t xml:space="preserve"> Síndrome coronario agudo (SCA) probable; la semiología isquémica típica y el perfil de riesgo tienen mayor peso pretest que un primer trazado electrocardiográfico no concluyente. Diagnóstico aún no demostrado.</w:t>
+      </w:r>
+    </w:p>
+    <w:p>
+      <w:pPr>
+        <w:pStyle w:val="BodyJ"/>
+      </w:pPr>
+      <w:r>
+        <w:rPr>
+          <w:i/>
+          <w:iCs/>
+        </w:rPr>
+        <w:t xml:space="preserve">¿Qué daño importante produciría si me equivoco? (Incertidumbre crítica)</w:t>
+      </w:r>
+      <w:r>
+        <w:t xml:space="preserve"> Rotularlo como "dolor torácico atípico con ECG sin isquemia aguda" y enviarlo a esperar la troponina en una silla de la sala común mientras cursa una oclusión coronaria dinámica. La incertidumbre peligrosa no es la etiqueta nominal; es la ventana de tiempo de miocardio salvable.</w:t>
+      </w:r>
+    </w:p>
+    <w:p>
+      <w:pPr>
+        <w:pStyle w:val="BodyJ"/>
+      </w:pPr>
+      <w:r>
+        <w:rPr>
+          <w:i/>
+          <w:iCs/>
+        </w:rPr>
+        <w:t xml:space="preserve">¿Qué hago ahora y qué me haría cambiar? (Decisión)</w:t>
+      </w:r>
+      <w:r>
+        <w:t xml:space="preserve"> Ingresar a cama monitorizada, instalar vía venosa, administrar antiagregación inicial según protocolo, programar ECG seriado estricto cada 15–30 minutos y gestionar rescate rápido de la troponina; activar hemodinamia de inmediato si el trazado evoluciona a supradesnivel o si el dolor se vuelve refractario. Se registra en la ficha: "SCA en evolución aún no demostrado; se inicia manejo y monitorización continua por asimetría de consecuencias ante el riesgo vital de omisión".</w:t>
       </w:r>
     </w:p>
     <w:p>
@@ -11474,7 +11530,7 @@
         <w:t xml:space="preserve">Frase medular:</w:t>
       </w:r>
       <w:r>
-        <w:t xml:space="preserve"> "Dolor torácico de perfil isquémico con ECG no diagnóstico: se maneja como SCA probable por asimetría de consecuencias mientras la seriación confirma o degrada la hipótesis."</w:t>
+        <w:t xml:space="preserve"> "Dolor torácico de perfil anginoso con descarga adrenérgica y ECG inicial no concluyente: se maneja operativamente como SCA probable bajo monitorización continua, priorizando la protección frente al error de omisión mientras la seriación electrocardiográfica y enzimática confirma o degrada la hipótesis."</w:t>
       </w:r>
     </w:p>
     <w:p>
@@ -11489,7 +11545,7 @@
         <w:t xml:space="preserve">Lectura metacognitiva.</w:t>
       </w:r>
       <w:r>
-        <w:t xml:space="preserve"> La decisión correcta a las 3:10 no fue diagnóstica sino estratégica: comprar tiempo de vigilancia con intervenciones de bajo riesgo. El error clásico en este escenario no es intelectual, es logístico: la hipótesis correcta ("probable SCA") sin sistema de reevaluación (¿quién repite el ECG si la sala explota?). El criterio de reapertura con responsable es la mitad de la decisión.</w:t>
+        <w:t xml:space="preserve"> El acierto clínico a las tres de la mañana no consistió en adivinar el diagnóstico definitivo, sino en tomar una decisión estratégica: comprar tiempo seguro mediante intervenciones de bajo riesgo y vigilancia de alta resolución. En los turnos de urgencia, el fallo catastrófico rara vez es intelectual (casi todo médico piensa en el infarto); suele ser logístico y de diseño: formular la hipótesis correcta ("probable SCA") pero dejar al paciente sin un circuito cerrado de reevaluación (¿quién le toma y quién mira el segundo ECG a los 15 minutos si el turno colapsa?). Fijar el criterio de reapertura con plazo y responsable equivale a la mitad del tratamiento.</w:t>
       </w:r>
     </w:p>
     <w:p>
@@ -11514,7 +11570,7 @@
         <w:pStyle w:val="BodyJ"/>
       </w:pPr>
       <w:r>
-        <w:t xml:space="preserve">Atención primaria. Mujer de 47 años consulta por fatiga de tres meses. Trae exámenes "normales de hace poco": hemograma y perfil realizados cinco meses atrás, cuando la fatiga no existía. Refiere además sudoración nocturna ocasional que atribuye a "premenopausia" y ha perdido "dos o tres kilos, por comer menos". Agenda llena, doce minutos por paciente.</w:t>
+        <w:t xml:space="preserve">Policlínico de atención primaria. Mujer de 47 años consulta por fatiga persistente de tres meses de evolución. Acude con exámenes de sangre "normales de hace poquito": un hemograma y un perfil bioquímico tomados hace cinco meses en un chequeo preventivo, dos meses antes de que comenzara el cansancio. Al interrogatorio dirigido agrega sudoración nocturna ocasional —que ella atribuye al inicio de la menopausia— y una baja de peso involuntaria de unos tres kilos que explica "porque he tenido menos apetito". La agenda médica está copada, con bloques de doce minutos por paciente.</w:t>
       </w:r>
     </w:p>
     <w:p>
@@ -11529,7 +11585,7 @@
         <w:t xml:space="preserve">Hechos:</w:t>
       </w:r>
       <w:r>
-        <w:t xml:space="preserve"> fatiga nueva de tres meses (relato consistente); exámenes normales previos al síntoma (dato real, pero anterior al problema); sudoración y baja de peso referidas con explicación alternativa plausible; examen físico de hoy sin adenopatías palpables ni visceromegalia (búsqueda dirigida, limitada por tiempo).</w:t>
+        <w:t xml:space="preserve"> fatiga progresiva de tres meses de duración (relato consistente); exámenes de laboratorio normales cuya fecha precede en dos meses al inicio del síntoma; sudoración nocturna y baja ponderal referidas con atribuciones causales benignas propuestas por la propia paciente; examen físico segmentario de hoy sin adenopatías periféricas ni visceromegalias palpables (exploración acotada por el tiempo de consulta).</w:t>
       </w:r>
     </w:p>
     <w:p>
@@ -11544,7 +11600,7 @@
         <w:t xml:space="preserve">Inferencia:</w:t>
       </w:r>
       <w:r>
-        <w:t xml:space="preserve"> la mayoría de las fatigas en este contexto son benignas o funcionales: probable. Pero el conjunto fatiga + sudoración + baja de peso configura una tríada que no debe cerrarse contra exámenes previos al síntoma: los "normales de hace poco" no cubren el período de la enfermedad actual.</w:t>
+        <w:t xml:space="preserve"> aunque por prevalencia en atención primaria la mayoría de los cuadros de fatiga corresponden a causas funcionales, carenciales o adaptativas, la coexistencia de fatiga prolongada, sudoración nocturna y baja de peso configura un síndrome constitucional que impide el cierre diagnóstico. Los exámenes traídos por la paciente no descartan patología orgánica actual por una razón temporal simple: fueron tomados cuando la enfermedad aún no se manifestaba.</w:t>
       </w:r>
     </w:p>
     <w:p>
@@ -11559,7 +11615,7 @@
         <w:t xml:space="preserve">Incertidumbre:</w:t>
       </w:r>
       <w:r>
-        <w:t xml:space="preserve"> la peligrosa no es "¿qué causa la fatiga?" sino "¿hay un proceso sistémico en curso que estos doce minutos no pueden excluir?". Reducible con laboratorio actual dirigido y un control programado, no con más preguntas hoy.</w:t>
+        <w:t xml:space="preserve"> la duda relevante hoy no es determinar la etiología exacta en doce minutos, sino responder si subyace un proceso sistémico, inflamatorio o neoplásico en curso. Esa incertidumbre no se reduce alargando la entrevista de hoy, sino actualizando el laboratorio y utilizando el seguimiento longitudinal.</w:t>
       </w:r>
     </w:p>
     <w:p>
@@ -11574,7 +11630,7 @@
         <w:t xml:space="preserve">Decisión:</w:t>
       </w:r>
       <w:r>
-        <w:t xml:space="preserve"> laboratorio actualizado (hemograma, VHS/PCR, TSH, glicemia, perfil hepático), control con resultados en dos semanas con la misma profesional, y safety-netting explícito por escrito: reconsultar antes si fiebre, adenopatías, dolor óseo o baja de peso mayor. No se tranquiliza con los exámenes viejos ni se alarma sin datos: se convierte el tiempo en prueba diagnóstica con red de seguridad.</w:t>
+        <w:t xml:space="preserve"> solicitar estudio actualizado dirigido (hemograma con frotis, VHS, PCR, TSH, glicemia, perfil hepático y renal, LDH), agendar control presencial en dos semanas con la misma médica para revisar resultados, y entregar por escrito una red de seguridad (safety-netting): adelantar la consulta de inmediato si aparece fiebre cuantificada, aumento de volumen ganglionar, dolor óseo localizado o progresión de la baja de peso.</w:t>
       </w:r>
     </w:p>
     <w:p>
@@ -11589,7 +11645,7 @@
         <w:t xml:space="preserve">Frase medular:</w:t>
       </w:r>
       <w:r>
-        <w:t xml:space="preserve"> "Fatiga de tres meses con sudoración y baja de peso leves; exámenes normales previos al inicio del cuadro no excluyen proceso actual: se actualiza estudio y se programa control con criterios explícitos de reconsulta."</w:t>
+        <w:t xml:space="preserve"> "Fatiga de tres meses asociada a sudoración nocturna y baja ponderal leve; dado que el laboratorio normal previo antecede al inicio de los síntomas y no cubre el período actual, se solicita estudio actualizado y se programa control longitudinal con pauta escrita de signos de alarma."</w:t>
       </w:r>
     </w:p>
     <w:p>
@@ -11604,7 +11660,7 @@
         <w:t xml:space="preserve">Lectura metacognitiva.</w:t>
       </w:r>
       <w:r>
-        <w:t xml:space="preserve"> El riesgo ambulatorio típico es el cierre por evidencia caducada: "tiene exámenes normales" es un hecho cuya fecha lo vuelve casi irrelevante. La herramienta central de la atención primaria —el tiempo longitudinal— sólo funciona como prueba si tiene control programado y red de seguridad; sin ellos, es una espera que confía en la suerte.</w:t>
+        <w:t xml:space="preserve"> Uno de los tropiezos más frecuentes en la consulta ambulatoria es la falsa tranquilidad inducida por evidencia caducada: "tiene exámenes normales recientes" es un hecho cierto cuya fecha de toma lo vuelve clínicamente irrelevante para el problema nuevo. La gran ventaja comparativa de la atención primaria —usar el tiempo longitudinal como herramienta diagnóstica— sólo opera con seguridad cuando se estructura con fecha de reevaluación y criterios explícitos de reconsulta; sin ese diseño, dejar pasar el tiempo es simplemente apostar a que el cuadro sea benigno.</w:t>
       </w:r>
     </w:p>
     <w:p>
@@ -11629,7 +11685,7 @@
         <w:pStyle w:val="BodyJ"/>
       </w:pPr>
       <w:r>
-        <w:t xml:space="preserve">Hombre de 78 años con cáncer de páncreas metastásico, en tercera línea de tratamiento, ingresa por deterioro funcional rápido y una neumonía. La familia pregunta cuánto tiempo queda; una hija pide "que se haga todo"; el equipo de oncología sugiere que "podría haber una ventana para otra línea". El paciente, lúcido a ratos, dice que está cansado.</w:t>
+        <w:t xml:space="preserve">Hombre de 78 años con adenocarcinoma de páncreas metastásico en progresión tras tres líneas de quimioterapia. Ingresa al servicio de medicina interna por un deterioro funcional acelerado en las últimas tres semanas —pasó de caminar con apoyo dentro de su casa a permanecer postrado en cama—, sumado a una neumonía aguda hipoxémica. En el pasillo, la familia pregunta angustiada cuánto tiempo de vida le queda; una de las hijas exige "que se le haga todo lo necesario para sacarlo adelante"; el equipo de oncología anota en su interconsulta que, superado el cuadro infeccioso, "eventualmente podría evaluarse una ventana para una cuarta línea paliativa". El paciente, durante sus períodos de lucidez, repite que se siente profundamente agotado.</w:t>
       </w:r>
     </w:p>
     <w:p>
@@ -11644,7 +11700,7 @@
         <w:t xml:space="preserve">Hechos:</w:t>
       </w:r>
       <w:r>
-        <w:t xml:space="preserve"> enfermedad oncológica avanzada en progresión bajo tratamiento (documentado); deterioro funcional acelerado en semanas (trayectoria observada por la familia y objetivable); infección aguda potencialmente reversible; voluntad expresada por el paciente en momentos de lucidez, consistente en dos conversaciones separadas.</w:t>
+        <w:t xml:space="preserve"> neoplasia pancreática metastásica con progresión documentada bajo tercera línea oncológica; declive funcional severo y rápido en las últimas semanas (objetivable con una escala de fragilidad y de desempeño); neumonía bacteriana aguda superpuesta; manifestación reiterada de cansancio vital por parte del paciente en al menos dos entrevistas clínicas lúcidas.</w:t>
       </w:r>
     </w:p>
     <w:p>
@@ -11659,7 +11715,7 @@
         <w:t xml:space="preserve">Inferencia:</w:t>
       </w:r>
       <w:r>
-        <w:t xml:space="preserve"> la neumonía es tratable; la trayectoria de fondo es de final de vida próximo. Pronóstico en semanas a pocos meses: probable, con imprecisión irreductible en el caso individual. "Podría responder a otra línea" es una posibilidad no cuantificada, no una expectativa fundada en la evolución observada.</w:t>
+        <w:t xml:space="preserve"> mientras el cuadro infeccioso respiratorio es potencialmente tratable en lo inmediato, la pendiente funcional previa indica que el paciente se encuentra en una trayectoria irreversible de final de vida, con una sobrevida global estimable en semanas a pocos meses. En este escenario fisiológico, la frase "podría haber ventana para otra línea" no constituye una expectativa terapéutica fundada en su evolución real, sino la mención abstracta de un fármaco disponible en el arsenal técnico.</w:t>
       </w:r>
     </w:p>
     <w:p>
@@ -11674,7 +11730,7 @@
         <w:t xml:space="preserve">Incertidumbre:</w:t>
       </w:r>
       <w:r>
-        <w:t xml:space="preserve"> el plazo exacto es incognoscible; lo comunicable es la dirección de la trayectoria y los escenarios. La incertidumbre que domina no es pronóstica sino de metas: ¿qué quiere este hombre para el tiempo que queda? Esa no se resuelve con exámenes sino con conversación.</w:t>
+        <w:t xml:space="preserve"> el número exacto de días o semanas de vida es biológicamente incognoscible (incertidumbre aleatoria irreductible), por lo que sólo es honesto comunicar la dirección de la pendiente y los escenarios probables. Sin embargo, la incertidumbre crítica que domina el caso no es pronóstica, sino axiológica y de metas: ¿cómo desea vivir este hombre el tiempo que le resta y qué cargas terapéuticas está dispuesto a tolerar?</w:t>
       </w:r>
     </w:p>
     <w:p>
@@ -11689,7 +11745,7 @@
         <w:t xml:space="preserve">Decisión:</w:t>
       </w:r>
       <w:r>
-        <w:t xml:space="preserve"> tratar la neumonía con objetivo de confort y posible retorno a casa (intervención reversible, proporcionada); pausar la discusión de nueva línea hasta ver respuesta funcional; conversación estructurada de metas con paciente y familia: qué sabemos (la enfermedad progresa), qué creemos (el tiempo se mide probablemente en semanas a meses), qué no sabemos (el plazo exacto; si esta infección marcará un descenso definitivo), qué proponemos (priorizar lo que él declaró importante). Criterio de reevaluación: respuesta funcional a 72 horas.</w:t>
+        <w:t xml:space="preserve"> iniciar tratamiento antibiótico endovenoso y oxigenoterapia no invasiva con un objetivo explícito de alivio sintomático y eventual retorno a su hogar (medidas reversibles y proporcionadas); suspender toda discusión sobre nuevas quimioterapias; y realizar una reunión familiar estructurada para alinear el plan de cuidados con la voluntad del paciente, fijando una ventana de reevaluación clínica a las 72 horas según su respuesta funcional y su confort.</w:t>
       </w:r>
     </w:p>
     <w:p>
@@ -11704,7 +11760,7 @@
         <w:t xml:space="preserve">Frase medular:</w:t>
       </w:r>
       <w:r>
-        <w:t xml:space="preserve"> "Neumonía potencialmente reversible sobre cáncer avanzado en progresión con deterioro funcional acelerado: se trata la parte reversible con metas de confort, se comunica la trayectoria sin fingir precisión de plazo, y las decisiones mayores se subordinan a las metas del paciente, no a la disponibilidad de otra línea."</w:t>
+        <w:t xml:space="preserve"> "Neumonía aguda potencialmente reversible en paciente con cáncer de páncreas metastásico refractario y declive funcional acelerado hacia el final de la vida: se inicia tratamiento antimicrobiano con metas de alivio sintomático, se comunica a la familia la trayectoria global sin fingir exactitud de plazos y se subordinan las medidas invasivas a las preferencias expresadas por el enfermo."</w:t>
       </w:r>
     </w:p>
     <w:p>
@@ -11719,7 +11775,7 @@
         <w:t xml:space="preserve">Lectura metacognitiva.</w:t>
       </w:r>
       <w:r>
-        <w:t xml:space="preserve"> El final de la vida concentra todos los temas del libro: la tentación de responder "¿cuánto queda?" con una cifra falsa (certeza retórica), la de esconderse en "no se puede saber" (abandono), y la confusión entre lo técnicamente posible y lo proporcionado — el juicio de proporcionalidad del capítulo 10, que aquí exige lo que más cuesta: un pronóstico honesto. Comunicar dirección y escenarios en vez de plazos, y anclar la decisión en las metas del enfermo, es la forma que toma aquí la incertidumbre bien gobernada.</w:t>
+        <w:t xml:space="preserve"> La medicina al final de la vida pone a prueba todas las capas de este libro: tienta al clínico a responder la pregunta "¿cuánto tiempo le queda?" con una cifra inventada (certeza retórica), o a escudarse en un "eso sólo Dios lo sabe" que desorienta a la familia (abandono comunicacional). Más importante aún, expone la confusión cotidiana entre lo técnicamente factible (indicar una cuarta línea oncológica o intubar) y lo clínicamente proporcionado. Como vimos en el capítulo 10, un juicio de proporcionalidad terapéutica riguroso exige ante todo honestidad epistémica: reconocer la trayectoria de declive basal como un hecho clínico duro y anclar el umbral de acción en los fines biográficos del paciente, no en la inercia de los recursos disponibles.</w:t>
       </w:r>
     </w:p>
     <w:p>
@@ -11744,7 +11800,7 @@
         <w:pStyle w:val="BodyJ"/>
       </w:pPr>
       <w:r>
-        <w:t xml:space="preserve">Esta viñeta analiza un error completo, con la disciplina de los capítulos 7 y 8: sin usar nombres de sesgos y sin dejar que el desenlace conocido juzgue lo que era razonable saber en cada momento.</w:t>
+        <w:t xml:space="preserve">Esta viñeta reconstruye un error diagnóstico completo siguiendo la disciplina de los capítulos 7 y 8: sin conformarse con pegar la etiqueta de un sesgo cognitivo y sin permitir que el desenlace conocido distorsione lo que era exigible saber en el momento de la consulta.</w:t>
       </w:r>
     </w:p>
     <w:p>
@@ -11759,23 +11815,25 @@
         <w:t xml:space="preserve">El caso.</w:t>
       </w:r>
       <w:r>
-        <w:t xml:space="preserve"> Mujer de 29 años consulta en urgencias a las 23:40 por disnea súbita de dos horas, palpitaciones y "sensación de que me voy a morir". Antecedente de trastorno de pánico en tratamiento; la nota de triage dice "paciente ansiosa, crisis de pánico conocida". Frecuencia cardiaca 118, saturación 94% ambiental, examen "sin hallazgos". Nota médica: "Crisis de pánico en paciente con antecedente. Lorazepam sublingual. Alta con control en salud mental". A las 36 horas reconsulta traída por su pareja tras un síncope en el baño: tromboembolismo pulmonar bilateral con sobrecarga ventricular derecha. Sobrevive tras trombólisis.</w:t>
-      </w:r>
-    </w:p>
-    <w:p>
-      <w:pPr>
-        <w:pStyle w:val="BodyJ"/>
-      </w:pPr>
-      <w:r>
-        <w:rPr>
-          <w:i/>
-          <w:iCs/>
-        </w:rPr>
-        <w:t xml:space="preserve">Reconstrucción por capas.</w:t>
-      </w:r>
-      <w:r>
-        <w:t xml:space="preserve"> </w:t>
-      </w:r>
+        <w:t xml:space="preserve"> Mujer de 29 años consulta en urgencias a las 23:40 por disnea de inicio súbito hace dos horas, palpitaciones y "sensación inminente de que me voy a morir". Registra antecedente de trastorno de pánico en control; la hoja de categorización del triage anota: "paciente ansiosa, cursa crisis de pánico conocida". Sus signos vitales de ingreso muestran frecuencia cardiaca de 118 lpm, presión arterial normal, saturación de oxígeno de 94% ambiental y auscultación cardiopulmonar descrita como "sin hallazgos patológicos". La evolución médica consigna: "Crisis de pánico en paciente con antecedente conocido. Se administra lorazepam sublingual, cede angustia. Alta con indicación de control en salud mental". A las 36 horas reingresa al reanimador traída por su pareja tras sufrir un síncope en el baño: el angioTAC confirma un tromboembolismo pulmonar (TEP) bilateral masivo con disfunción ventricular derecha aguda. Sobrevive tras trombólisis sistémica.</w:t>
+      </w:r>
+    </w:p>
+    <w:p>
+      <w:pPr>
+        <w:pStyle w:val="BodyJ"/>
+      </w:pPr>
+      <w:r>
+        <w:rPr>
+          <w:i/>
+          <w:iCs/>
+        </w:rPr>
+        <w:t xml:space="preserve">Reconstrucción epistémica por capas.</w:t>
+      </w:r>
+    </w:p>
+    <w:p>
+      <w:pPr>
+        <w:pStyle w:val="BodyJ"/>
+      </w:pPr>
       <w:r>
         <w:rPr>
           <w:b/>
@@ -11784,8 +11842,13 @@
         <w:t xml:space="preserve">Hechos disponibles la primera noche:</w:t>
       </w:r>
       <w:r>
-        <w:t xml:space="preserve"> disnea súbita (relato, con inicio preciso); taquicardia de 118 al ingreso y de 112 al alta, una hora después de la benzodiacepina (dato medido, registrado y no interpretado); saturación 94% (medida; "normal para una paciente que hiperventila", se dijo en voz alta — pero la hiperventilación sube la saturación, no la baja); uso de anticonceptivos orales combinados y un viaje en bus de nueve horas tres días antes (dos hechos que existían y que nadie preguntó, porque la pregunta que los convoca —"¿qué más podría ser?"— no se formuló); y una etiqueta heredada del triage, "crisis de pánico conocida", que entró a la nota médica con estatus de diagnóstico antes de que el médico viera a la paciente. </w:t>
-      </w:r>
+        <w:t xml:space="preserve"> disnea de instalación brusca con hora de inicio precisa (relato consistente); taquicardia sinusal de 118 lpm al ingreso que persistió en 112 lpm en el control de enfermería previo al alta, una hora después de haber recibido lorazepam y encontrándose ya emocionalmente tranquila (dato medido, registrado en la hoja de signos vitales y omitido en la nota médica); saturación de oxígeno de 94% a aire ambiental (un valor que alguien en el turno minimizó verbalmente como "esperable porque está hiperventilando", ignorando el hecho fisiológico básico de que la hiperventilación alveolar por ansiedad eleva la presión arterial de oxígeno y lleva la saturación hacia el 99–100%, jamás la reduce a 94%); uso actual de anticonceptivos orales combinados y antecedente de un viaje interurbano en bus de nueve horas tres días antes (dos factores de riesgo protrombóticos que estaban presentes en la historia reciente de la paciente, pero que nadie interrogó porque jamás se abrió una hipótesis vascular); y una etiqueta heredada desde la ventanilla de admisión ("crisis de pánico conocida") que ingresó a la ficha médica con rango de diagnóstico definitivo antes de que el clínico pusiera el fonendoscopio sobre el tórax.</w:t>
+      </w:r>
+    </w:p>
+    <w:p>
+      <w:pPr>
+        <w:pStyle w:val="BodyJ"/>
+      </w:pPr>
       <w:r>
         <w:rPr>
           <w:b/>
@@ -11794,18 +11857,28 @@
         <w:t xml:space="preserve">Inferencia de la primera noche:</w:t>
       </w:r>
       <w:r>
-        <w:t xml:space="preserve"> "crisis de pánico" — escrita como hecho; fuerza real: posible, apoyada en el antecedente y en la coincidencia de la queja con la etiqueta. </w:t>
-      </w:r>
-      <w:r>
-        <w:rPr>
-          <w:b/>
-          <w:bCs/>
-        </w:rPr>
-        <w:t xml:space="preserve">Incertidumbre nunca escrita:</w:t>
-      </w:r>
-      <w:r>
-        <w:t xml:space="preserve"> ¿qué explica una taquicardia que persiste con la paciente ya tranquila, y una saturación que no corresponde a una crisis de ansiedad? Existe una regla de decisión creada exactamente para este momento —los criterios PERC: ocho condiciones que, si se cumplen todas, permiten no estudiar una embolia en pacientes de baja probabilidad (Kline et al., 2004)—, y la paciente incumplía tres: frecuencia cardiaca, saturación y uso de estrógenos. La regla no falló: no se aplicó, porque nadie creyó que hubiera algo que descartar. </w:t>
-      </w:r>
+        <w:t xml:space="preserve"> "crisis de pánico" fue redactada como un hecho consumado, cuando su fuerza epistémica real era apenas la de una hipótesis posible, sustentada únicamente en el antecedente psiquiátrico y la similitud superficial del relato.</w:t>
+      </w:r>
+    </w:p>
+    <w:p>
+      <w:pPr>
+        <w:pStyle w:val="BodyJ"/>
+      </w:pPr>
+      <w:r>
+        <w:rPr>
+          <w:b/>
+          <w:bCs/>
+        </w:rPr>
+        <w:t xml:space="preserve">Incertidumbre nunca formulada:</w:t>
+      </w:r>
+      <w:r>
+        <w:t xml:space="preserve"> ¿qué proceso fisiopatológico explica que una mujer de 29 años mantenga una frecuencia cardiaca de 112 lpm estando ya sedada y sin angustia, junto con una saturación de 94% que contradice una hiperventilación psicógena? Para gobernar exactamente este escenario de urgencias se diseñaron y validaron los criterios PERC (Pulmonary Embolism Rule-out Criteria), una regla de decisión clínica de ocho variables que permite excluir razonablemente un TEP sin solicitar dímero-D sólo cuando el paciente de baja sospecha no cumple ningún criterio (Kline et al., 2004). Esta paciente incumplía tres de los ocho puntos de corte: frecuencia cardiaca ≥100 lpm, saturación &lt;95% y uso de estrógenos exógenos. La regla de predicción clínica no falló esa noche; simplemente nunca fue convocada, porque el cierre prematuro impidió sospechar que había una amenaza orgánica que descartar.</w:t>
+      </w:r>
+    </w:p>
+    <w:p>
+      <w:pPr>
+        <w:pStyle w:val="BodyJ"/>
+      </w:pPr>
       <w:r>
         <w:rPr>
           <w:b/>
@@ -11814,22 +11887,22 @@
         <w:t xml:space="preserve">Decisión de la primera noche:</w:t>
       </w:r>
       <w:r>
-        <w:t xml:space="preserve"> ansiolisis y alta; defendible como tratamiento sintomático, indefendible como cierre: ninguna línea de la nota decía qué debía hacer volver a la paciente antes del "control en salud mental".</w:t>
-      </w:r>
-    </w:p>
-    <w:p>
-      <w:pPr>
-        <w:pStyle w:val="BodyJ"/>
-      </w:pPr>
-      <w:r>
-        <w:rPr>
-          <w:i/>
-          <w:iCs/>
-        </w:rPr>
-        <w:t xml:space="preserve">Dónde estuvo la oportunidad.</w:t>
-      </w:r>
-      <w:r>
-        <w:t xml:space="preserve"> En el control de signos previo al alta. Una taquicardia de 112 en una paciente sedada y calmada era la discordancia informativa de la noche: el tratamiento correcto de la hipótesis correcta debía normalizar la frecuencia, no sólo la angustia. La pregunta de resistencia del capítulo 7 —"¿qué no explica el pánico?"— tenía ahí su máximo valor y su costo mínimo: dos preguntas de anamnesis, una regla de ocho ítems y el dímero-D que esa regla, incumplida, obligaba a pedir antes del alta. A las 36 horas, la pregunta la respondió el síncope.</w:t>
+        <w:t xml:space="preserve"> administrar benzodiacepinas era defendible como prueba terapéutica sintomática inicial; dar el alta sin estudio adicional y sin una sola línea de signos de alarma (qué debía motivar su regreso urgente antes del "control en salud mental") constituyó un cierre indefendible.</w:t>
+      </w:r>
+    </w:p>
+    <w:p>
+      <w:pPr>
+        <w:pStyle w:val="BodyJ"/>
+      </w:pPr>
+      <w:r>
+        <w:rPr>
+          <w:i/>
+          <w:iCs/>
+        </w:rPr>
+        <w:t xml:space="preserve">Dónde estuvo el punto de intercepción.</w:t>
+      </w:r>
+      <w:r>
+        <w:t xml:space="preserve"> En la lectura de los signos vitales previos al egreso. Una taquicardia persistente de 112 lpm en una paciente que ya no luce angustiada era la gran discordancia informativa de la madrugada: si la hipótesis de la crisis de pánico hubiese sido verdadera, el control farmacológico de la ansiedad debía normalizar la descarga simpática y descender el pulso. Formularse la pregunta de desaceleración antes de firmar el alta —"¿qué dato objetivo de esta paciente no queda explicado por una crisis de pánico?"— tenía en ese minuto su máxima rentabilidad y su mínimo costo: habría bastado hacer dos preguntas de anamnesis dirigida, aplicar la regla PERC al lado de la camilla y solicitar un dímero-D. Treinta y seis horas más tarde, esa pregunta no formulada la respondió el síncope.</w:t>
       </w:r>
     </w:p>
     <w:p>

</xml_diff>

<commit_message>
Evaluación multiparamétrica del estado actual (6,4) con propuesta de figuras relacionales; rebuild tras los ajustes de aparato
Co-Authored-By: Claude Fable 5.1 <noreply@anthropic.com>
Claude-Session: https://claude.ai/code/session_01SPkhDdVzUCxJwqq61ddeLW
</commit_message>
<xml_diff>
--- a/libro/Hechos_inferencias_incertidumbre_edicion_revisada.docx
+++ b/libro/Hechos_inferencias_incertidumbre_edicion_revisada.docx
@@ -14983,7 +14983,7 @@
                 <w:sz w:val="17"/>
                 <w:szCs w:val="17"/>
               </w:rPr>
-              <w:t xml:space="preserve">"ITU asociada a CUP probable si aparece fiebre sin otro foco"</w:t>
+              <w:t xml:space="preserve">"ITU asociada a catéter urinario permanente (CUP) probable si aparece fiebre sin otro foco"</w:t>
             </w:r>
           </w:p>
         </w:tc>
@@ -17644,7 +17644,7 @@
         </w:numPr>
       </w:pPr>
       <w:r>
-        <w:t xml:space="preserve">Metacognición: definición y niveles — Int, 5; monitoreo y control — 5; social (señales del equipo y del paciente) — 5, 13; sensibilidad vs. sesgo — Int, 5; artificial — 17</w:t>
+        <w:t xml:space="preserve">Metacognición: definición y niveles — Int, 5; monitoreo y control — 5; social (señales del equipo y del paciente) — 5, 13; sensibilidad vs. sesgo — Int, 5; auditoría de salidas de IA — 17</w:t>
       </w:r>
     </w:p>
     <w:p>
@@ -18052,7 +18052,7 @@
         <w:t xml:space="preserve">Estrategia bibliográfica.</w:t>
       </w:r>
       <w:r>
-        <w:t xml:space="preserve"> Las fuentes provienen de tres cuerpos: investigación biomédica y de razonamiento clínico, filosofía de la ciencia y epistemología, y educación médica. Se privilegiaron fuentes primarias y revisiones reconocidas; el período cubierto llega hasta el cierre bibliográfico, en agosto de 2026. Durante la redacción se aplicó una regla fija: ninguna referencia entró al manuscrito sin verificación previa contra su fuente — autoría, año, revista y resultado. No se pretende exhaustividad sistemática: la selección sirve al argumento y se declara como tal.</w:t>
+        <w:t xml:space="preserve"> Las fuentes provienen de tres cuerpos: investigación biomédica y de razonamiento clínico, filosofía de la ciencia y epistemología, y educación médica. Se privilegiaron fuentes primarias y revisiones reconocidas; el período cubierto llega hasta el cierre bibliográfico, en octubre de 2026. Durante la redacción se aplicó una regla fija: ninguna referencia entró al manuscrito sin verificación previa contra su fuente — autoría, año, revista y resultado. No se pretende exhaustividad sistemática: la selección sirve al argumento y se declara como tal.</w:t>
       </w:r>
     </w:p>
     <w:p>

</xml_diff>

<commit_message>
Cap. 8: el estado del que piensa (esfuerzo, sueño, ánimo) como hecho de la capa H y disparador de pausa; cap. 14: pensar bien como ética primordial (Clifford 1877); rebuild 150 pp
Co-Authored-By: Claude Fable 5.1 <noreply@anthropic.com>
Claude-Session: https://claude.ai/code/session_01SPkhDdVzUCxJwqq61ddeLW
</commit_message>
<xml_diff>
--- a/libro/Hechos_inferencias_incertidumbre_edicion_revisada.docx
+++ b/libro/Hechos_inferencias_incertidumbre_edicion_revisada.docx
@@ -467,7 +467,7 @@
         <w:rPr>
           <w:color w:val="8A8A8A"/>
         </w:rPr>
-        <w:t xml:space="preserve">50</w:t>
+        <w:t xml:space="preserve">52</w:t>
       </w:r>
     </w:p>
     <w:p>
@@ -487,7 +487,7 @@
         <w:rPr>
           <w:color w:val="8A8A8A"/>
         </w:rPr>
-        <w:t xml:space="preserve">51</w:t>
+        <w:t xml:space="preserve">53</w:t>
       </w:r>
     </w:p>
     <w:p>
@@ -507,7 +507,7 @@
         <w:rPr>
           <w:color w:val="8A8A8A"/>
         </w:rPr>
-        <w:t xml:space="preserve">52</w:t>
+        <w:t xml:space="preserve">54</w:t>
       </w:r>
     </w:p>
     <w:p>
@@ -527,7 +527,7 @@
         <w:rPr>
           <w:color w:val="8A8A8A"/>
         </w:rPr>
-        <w:t xml:space="preserve">56</w:t>
+        <w:t xml:space="preserve">58</w:t>
       </w:r>
     </w:p>
     <w:p>
@@ -547,7 +547,7 @@
         <w:rPr>
           <w:color w:val="8A8A8A"/>
         </w:rPr>
-        <w:t xml:space="preserve">64</w:t>
+        <w:t xml:space="preserve">66</w:t>
       </w:r>
     </w:p>
     <w:p>
@@ -567,7 +567,7 @@
         <w:rPr>
           <w:color w:val="8A8A8A"/>
         </w:rPr>
-        <w:t xml:space="preserve">67</w:t>
+        <w:t xml:space="preserve">69</w:t>
       </w:r>
     </w:p>
     <w:p>
@@ -587,7 +587,7 @@
         <w:rPr>
           <w:color w:val="8A8A8A"/>
         </w:rPr>
-        <w:t xml:space="preserve">72</w:t>
+        <w:t xml:space="preserve">74</w:t>
       </w:r>
     </w:p>
     <w:p>
@@ -607,7 +607,7 @@
         <w:rPr>
           <w:color w:val="8A8A8A"/>
         </w:rPr>
-        <w:t xml:space="preserve">77</w:t>
+        <w:t xml:space="preserve">79</w:t>
       </w:r>
     </w:p>
     <w:p>
@@ -627,7 +627,7 @@
         <w:rPr>
           <w:color w:val="8A8A8A"/>
         </w:rPr>
-        <w:t xml:space="preserve">79</w:t>
+        <w:t xml:space="preserve">81</w:t>
       </w:r>
     </w:p>
     <w:p>
@@ -647,7 +647,7 @@
         <w:rPr>
           <w:color w:val="8A8A8A"/>
         </w:rPr>
-        <w:t xml:space="preserve">80</w:t>
+        <w:t xml:space="preserve">82</w:t>
       </w:r>
     </w:p>
     <w:p>
@@ -667,7 +667,7 @@
         <w:rPr>
           <w:color w:val="8A8A8A"/>
         </w:rPr>
-        <w:t xml:space="preserve">86</w:t>
+        <w:t xml:space="preserve">88</w:t>
       </w:r>
     </w:p>
     <w:p>
@@ -687,7 +687,7 @@
         <w:rPr>
           <w:color w:val="8A8A8A"/>
         </w:rPr>
-        <w:t xml:space="preserve">93</w:t>
+        <w:t xml:space="preserve">95</w:t>
       </w:r>
     </w:p>
     <w:p>
@@ -707,7 +707,7 @@
         <w:rPr>
           <w:color w:val="8A8A8A"/>
         </w:rPr>
-        <w:t xml:space="preserve">103</w:t>
+        <w:t xml:space="preserve">105</w:t>
       </w:r>
     </w:p>
     <w:p>
@@ -727,7 +727,7 @@
         <w:rPr>
           <w:color w:val="8A8A8A"/>
         </w:rPr>
-        <w:t xml:space="preserve">107</w:t>
+        <w:t xml:space="preserve">109</w:t>
       </w:r>
     </w:p>
     <w:p>
@@ -747,7 +747,7 @@
         <w:rPr>
           <w:color w:val="8A8A8A"/>
         </w:rPr>
-        <w:t xml:space="preserve">115</w:t>
+        <w:t xml:space="preserve">117</w:t>
       </w:r>
     </w:p>
     <w:p>
@@ -767,7 +767,7 @@
         <w:rPr>
           <w:color w:val="8A8A8A"/>
         </w:rPr>
-        <w:t xml:space="preserve">119</w:t>
+        <w:t xml:space="preserve">121</w:t>
       </w:r>
     </w:p>
     <w:p>
@@ -787,7 +787,7 @@
         <w:rPr>
           <w:color w:val="8A8A8A"/>
         </w:rPr>
-        <w:t xml:space="preserve">121</w:t>
+        <w:t xml:space="preserve">123</w:t>
       </w:r>
     </w:p>
     <w:p>
@@ -807,7 +807,7 @@
         <w:rPr>
           <w:color w:val="8A8A8A"/>
         </w:rPr>
-        <w:t xml:space="preserve">123</w:t>
+        <w:t xml:space="preserve">125</w:t>
       </w:r>
     </w:p>
     <w:p>
@@ -827,7 +827,7 @@
         <w:rPr>
           <w:color w:val="8A8A8A"/>
         </w:rPr>
-        <w:t xml:space="preserve">125</w:t>
+        <w:t xml:space="preserve">127</w:t>
       </w:r>
     </w:p>
     <w:p>
@@ -847,7 +847,7 @@
         <w:rPr>
           <w:color w:val="8A8A8A"/>
         </w:rPr>
-        <w:t xml:space="preserve">127</w:t>
+        <w:t xml:space="preserve">129</w:t>
       </w:r>
     </w:p>
     <w:p>
@@ -867,7 +867,7 @@
         <w:rPr>
           <w:color w:val="8A8A8A"/>
         </w:rPr>
-        <w:t xml:space="preserve">131</w:t>
+        <w:t xml:space="preserve">133</w:t>
       </w:r>
     </w:p>
     <w:p>
@@ -887,7 +887,7 @@
         <w:rPr>
           <w:color w:val="8A8A8A"/>
         </w:rPr>
-        <w:t xml:space="preserve">135</w:t>
+        <w:t xml:space="preserve">137</w:t>
       </w:r>
     </w:p>
     <w:p>
@@ -907,7 +907,7 @@
         <w:rPr>
           <w:color w:val="8A8A8A"/>
         </w:rPr>
-        <w:t xml:space="preserve">136</w:t>
+        <w:t xml:space="preserve">138</w:t>
       </w:r>
     </w:p>
     <w:p>
@@ -6395,7 +6395,7 @@
         <w:pStyle w:val="BodyJ"/>
       </w:pPr>
       <w:r>
-        <w:t xml:space="preserve">Disparadores razonables incluyen: evolución inesperada; reconsulta; falta de respuesta; discrepancia entre el diagnóstico y la gravedad; datos incompatibles; transición de cuidados; presión emocional; caso raro en un dominio poco familiar; y decisión irreversible con evidencia débil. La desaceleración debe ser proporcional. Puede durar treinta segundos o requerir una discusión formal.</w:t>
+        <w:t xml:space="preserve">Disparadores razonables incluyen: evolución inesperada; reconsulta; falta de respuesta; discrepancia entre el diagnóstico y la gravedad; datos incompatibles; transición de cuidados; presión emocional; caso raro en un dominio poco familiar; decisión irreversible con evidencia débil; y el estado del propio razonador —hora, horas de turno, ánimo, preocupación ajena al caso—, que la sección siguiente desarrolla. La desaceleración debe ser proporcional. Puede durar treinta segundos o requerir una discusión formal.</w:t>
       </w:r>
     </w:p>
     <w:p>
@@ -6412,91 +6412,63 @@
           <w:sz w:val="25"/>
           <w:szCs w:val="25"/>
         </w:rPr>
-        <w:t xml:space="preserve">Reflexión estructurada</w:t>
-      </w:r>
-    </w:p>
-    <w:p>
-      <w:pPr>
-        <w:pStyle w:val="BodyJ"/>
-      </w:pPr>
-      <w:r>
-        <w:t xml:space="preserve">Mamede y colaboradores estudiaron la reflexión deliberada y encontraron que, en ciertos problemas complejos, comparar hipótesis mediante evidencia a favor y en contra puede mejorar la precisión diagnóstica (Mamede et al., 2008). El mismo grupo mostró después algo más específico: la exposición reciente a ciertos diagnósticos induce sesgo de disponibilidad en residentes, y la reflexión estructurada revierte ese efecto (Mamede et al., 2010) — la mejor evidencia disponible de que la pausa correcta no es un ritual, sino un antídoto con indicación precisa. Otros trabajos y revisiones muestran resultados variables, lo que impide convertir la reflexión en una receta universal (Graber et al., 2012; Lambe et al., 2016).</w:t>
-      </w:r>
-    </w:p>
-    <w:p>
-      <w:pPr>
-        <w:pStyle w:val="BodyJ"/>
-      </w:pPr>
-      <w:r>
-        <w:t xml:space="preserve">Una estructura breve puede ser:</w:t>
-      </w:r>
-    </w:p>
-    <w:p>
-      <w:pPr>
-        <w:pStyle w:val="BodyJ"/>
-        <w:numPr>
-          <w:ilvl w:val="0"/>
-          <w:numId w:val="13"/>
-        </w:numPr>
-      </w:pPr>
-      <w:r>
-        <w:t xml:space="preserve">Reformular el caso sin usar el diagnóstico actual.</w:t>
-      </w:r>
-    </w:p>
-    <w:p>
-      <w:pPr>
-        <w:pStyle w:val="BodyJ"/>
-        <w:numPr>
-          <w:ilvl w:val="0"/>
-          <w:numId w:val="13"/>
-        </w:numPr>
-      </w:pPr>
-      <w:r>
-        <w:t xml:space="preserve">Nombrar dos o tres hipótesis que expliquen los hallazgos decisivos.</w:t>
-      </w:r>
-    </w:p>
-    <w:p>
-      <w:pPr>
-        <w:pStyle w:val="BodyJ"/>
-        <w:numPr>
-          <w:ilvl w:val="0"/>
-          <w:numId w:val="13"/>
-        </w:numPr>
-      </w:pPr>
-      <w:r>
-        <w:t xml:space="preserve">Identificar evidencia a favor y en contra de cada una.</w:t>
-      </w:r>
-    </w:p>
-    <w:p>
-      <w:pPr>
-        <w:pStyle w:val="BodyJ"/>
-        <w:numPr>
-          <w:ilvl w:val="0"/>
-          <w:numId w:val="13"/>
-        </w:numPr>
-      </w:pPr>
-      <w:r>
-        <w:t xml:space="preserve">Buscar el dato que más podría cambiar la conducta.</w:t>
-      </w:r>
-    </w:p>
-    <w:p>
-      <w:pPr>
-        <w:pStyle w:val="BodyJ"/>
-        <w:numPr>
-          <w:ilvl w:val="0"/>
-          <w:numId w:val="13"/>
-        </w:numPr>
-      </w:pPr>
-      <w:r>
-        <w:t xml:space="preserve">Definir qué desenlace obligaría a reabrir el caso.</w:t>
-      </w:r>
-    </w:p>
-    <w:p>
-      <w:pPr>
-        <w:pStyle w:val="BodyJ"/>
-      </w:pPr>
-      <w:r>
-        <w:t xml:space="preserve">La primera instrucción es especialmente poderosa, como muestra la escena que abre este capítulo. Al quitar la etiqueta, reaparecen datos que habían sido subordinados a ella. La nueva representación no resuelve, pero impide que el nombre decida por adelantado.</w:t>
+        <w:t xml:space="preserve">El estado del que piensa: esfuerzo, sueño y ánimo</w:t>
+      </w:r>
+    </w:p>
+    <w:p>
+      <w:pPr>
+        <w:pStyle w:val="BodyJ"/>
+      </w:pPr>
+      <w:r>
+        <w:t xml:space="preserve">Hay un supuesto silencioso en todo lo anterior: que quien debe desacelerar dispone de la energía para hacerlo. Pensar cuesta. La deliberación consume recursos que el reconocimiento de patrones no gasta, y la mente obedece una ley del menor esfuerzo: cuando puede no pensar, no piensa (Kahneman, 2011). Descartar en modo automático no es una falla ocasional; es el estado por defecto, y pensar de verdad es una decisión que se toma contra él. Este libro ha hablado de disposiciones —humildad, curiosidad, lealtad al caso— como si estuvieran siempre disponibles. No lo están. Dependen de tres cosas que ningún modelo del razonamiento clínico incluye y que cualquier médico de turno conoce: cuánto durmió, cómo está de ánimo y qué otra cosa lo preocupa.</w:t>
+      </w:r>
+    </w:p>
+    <w:p>
+      <w:pPr>
+        <w:pStyle w:val="BodyJ"/>
+      </w:pPr>
+      <w:r>
+        <w:t xml:space="preserve">La evidencia es más dura de lo que la cultura hospitalaria admite. Un metaanálisis de sesenta estudios estimó que menos de treinta horas sin dormir reducen el desempeño cognitivo general de los médicos en cerca de una desviación estándar, y el desempeño clínico en más de una y media (Philibert, 2005): el médico de las cuatro de la mañana no es el mismo instrumento que el de las nueve. Cuando se asignó al azar a internos de cuidados intensivos a turnos tradicionales de más de veinticuatro horas o a turnos acotados a dieciséis, los turnos largos produjeron un 36% más de errores graves, y los errores diagnósticos graves se multiplicaron por más de cinco (Landrigan et al., 2004). El efecto no exige noches: en más de 21.000 consultas por infección respiratoria, la probabilidad de salir con un antibiótico subió hora a hora dentro de la misma sesión de policlínico, con independencia del paciente y del diagnóstico, hasta unas chances un 26% mayores en la cuarta hora que en la primera (Linder et al., 2014). Nadie decidió prescribir peor a las cuatro de la tarde; el umbral se movió solo, con el cansancio. Y el ánimo tampoco es neutro: en un experimento clásico, los médicos a quienes se indujo un afecto positivo integraron antes la información de un caso y se anclaron menos en su primera hipótesis (Estrada, Isen &amp; Young, 1997). El estado afectivo no acompaña al razonamiento; lo configura.</w:t>
+      </w:r>
+    </w:p>
+    <w:p>
+      <w:pPr>
+        <w:pStyle w:val="BodyJ"/>
+      </w:pPr>
+      <w:r>
+        <w:t xml:space="preserve">¿Qué hacer con esto, si no se puede decretar el descanso ni el buen ánimo? Tres cosas, todas coherentes con el resto del libro.</w:t>
+      </w:r>
+    </w:p>
+    <w:p>
+      <w:pPr>
+        <w:pStyle w:val="BodyJ"/>
+      </w:pPr>
+      <w:r>
+        <w:t xml:space="preserve">Primero, tratar el propio estado como un hecho de la capa H. "¿En qué condiciones estoy pensando esto?" es una pregunta con respuesta observable —la hora, las horas de turno, lo dormido, el ánimo, la preocupación ajena al caso que ocupa la mitad de la atención—, y esa respuesta es un dato sobre la confiabilidad del instrumento que está produciendo las inferencias, tan pertinente como la calibración de un gasómetro. Reconocerlo no es debilidad: es la trazabilidad que el capítulo 1 exige a cualquier observación, aplicada al observador. Por eso la lista de disparadores de esta sección tiene un ítem más: el estado del razonador. Turno largo, madrugada, ánimo alterado o una preocupación que no es el paciente son condiciones que, por sí solas, justifican la pausa breve o el segundo lector, aunque el caso parezca fácil. Sobre todo si parece fácil.</w:t>
+      </w:r>
+    </w:p>
+    <w:p>
+      <w:pPr>
+        <w:pStyle w:val="BodyJ"/>
+      </w:pPr>
+      <w:r>
+        <w:t xml:space="preserve">Segundo, no apostar a la voluntad. Las herramientas de este libro que más valen a las cuatro de la mañana son las que no necesitan energía para activarse: el criterio de reapertura escrito cuando todavía había lucidez, la pregunta fija de la entrega de turno, la regla de ocho ítems al lado de la camilla, la versión de sesenta segundos. Son prótesis del esfuerzo: trasladan el pensamiento desde el momento en que no está disponible hacia el momento en que lo estuvo, o hacia otra persona. El diseño reemplaza al ánimo porque el ánimo no es confiable, y esa es exactamente la razón para diseñar.</w:t>
+      </w:r>
+    </w:p>
+    <w:p>
+      <w:pPr>
+        <w:pStyle w:val="BodyJ"/>
+      </w:pPr>
+      <w:r>
+        <w:t xml:space="preserve">Tercero, usar el relevo. La entrega de turno no es sólo transferencia de información: es el momento en que un cerebro descansado revisa lo que decidió uno cansado, y eso cambia qué se entrega. "Lo vi a las cinco, con doce horas encima; la hipótesis es X y no alcancé a pensar en Y" es una frase que un equipo maduro puede decir sin vergüenza, y vale más que "sin novedades". El capítulo 13 desarrolla la mitad colectiva de esta idea; el capítulo 16, su mitad institucional, porque los turnos y el descanso son condiciones epistémicas antes que laborales.</w:t>
+      </w:r>
+    </w:p>
+    <w:p>
+      <w:pPr>
+        <w:pStyle w:val="BodyJ"/>
+      </w:pPr>
+      <w:r>
+        <w:t xml:space="preserve">Nada de esto convierte al clínico cansado en lúcido. Lo convierte en alguien que sabe en qué estado está pensando y organiza el trabajo para que su juicio sea revisado por un instrumento mejor calibrado: una regla, una nota escrita antes, un colega que acaba de llegar.</w:t>
       </w:r>
     </w:p>
     <w:p>
@@ -6513,23 +6485,91 @@
           <w:sz w:val="25"/>
           <w:szCs w:val="25"/>
         </w:rPr>
-        <w:t xml:space="preserve">Pausa diagnóstica y segundo lector</w:t>
-      </w:r>
-    </w:p>
-    <w:p>
-      <w:pPr>
-        <w:pStyle w:val="BodyJ"/>
-      </w:pPr>
-      <w:r>
-        <w:t xml:space="preserve">Una pausa diagnóstica puede incorporarse a visitas de sala, altas y entregas de turno. No necesita preguntar por todas las enfermedades posibles. Debe focalizarse en riesgos: ¿qué podría estar pasando que no estamos tratando?, ¿qué supuesto no verificamos?, ¿qué explicación alternativa cambia el destino o el tiempo de intervención?</w:t>
-      </w:r>
-    </w:p>
-    <w:p>
-      <w:pPr>
-        <w:pStyle w:val="BodyJ"/>
-      </w:pPr>
-      <w:r>
-        <w:t xml:space="preserve">El segundo lector —otro médico, un especialista, un equipo interdisciplinario o una herramienta de apoyo— aporta diversidad de representación. Su valor no reside sólo en saber más, sino en no estar comprometido con la narrativa inicial. Para que funcione, el caso debe presentarse con datos suficientes y no sólo con la conclusión del primer equipo.</w:t>
+        <w:t xml:space="preserve">Reflexión estructurada</w:t>
+      </w:r>
+    </w:p>
+    <w:p>
+      <w:pPr>
+        <w:pStyle w:val="BodyJ"/>
+      </w:pPr>
+      <w:r>
+        <w:t xml:space="preserve">Mamede y colaboradores estudiaron la reflexión deliberada y encontraron que, en ciertos problemas complejos, comparar hipótesis mediante evidencia a favor y en contra puede mejorar la precisión diagnóstica (Mamede et al., 2008). El mismo grupo mostró después algo más específico: la exposición reciente a ciertos diagnósticos induce sesgo de disponibilidad en residentes, y la reflexión estructurada revierte ese efecto (Mamede et al., 2010) — la mejor evidencia disponible de que la pausa correcta no es un ritual, sino un antídoto con indicación precisa. Otros trabajos y revisiones muestran resultados variables, lo que impide convertir la reflexión en una receta universal (Graber et al., 2012; Lambe et al., 2016).</w:t>
+      </w:r>
+    </w:p>
+    <w:p>
+      <w:pPr>
+        <w:pStyle w:val="BodyJ"/>
+      </w:pPr>
+      <w:r>
+        <w:t xml:space="preserve">Una estructura breve puede ser:</w:t>
+      </w:r>
+    </w:p>
+    <w:p>
+      <w:pPr>
+        <w:pStyle w:val="BodyJ"/>
+        <w:numPr>
+          <w:ilvl w:val="0"/>
+          <w:numId w:val="13"/>
+        </w:numPr>
+      </w:pPr>
+      <w:r>
+        <w:t xml:space="preserve">Reformular el caso sin usar el diagnóstico actual.</w:t>
+      </w:r>
+    </w:p>
+    <w:p>
+      <w:pPr>
+        <w:pStyle w:val="BodyJ"/>
+        <w:numPr>
+          <w:ilvl w:val="0"/>
+          <w:numId w:val="13"/>
+        </w:numPr>
+      </w:pPr>
+      <w:r>
+        <w:t xml:space="preserve">Nombrar dos o tres hipótesis que expliquen los hallazgos decisivos.</w:t>
+      </w:r>
+    </w:p>
+    <w:p>
+      <w:pPr>
+        <w:pStyle w:val="BodyJ"/>
+        <w:numPr>
+          <w:ilvl w:val="0"/>
+          <w:numId w:val="13"/>
+        </w:numPr>
+      </w:pPr>
+      <w:r>
+        <w:t xml:space="preserve">Identificar evidencia a favor y en contra de cada una.</w:t>
+      </w:r>
+    </w:p>
+    <w:p>
+      <w:pPr>
+        <w:pStyle w:val="BodyJ"/>
+        <w:numPr>
+          <w:ilvl w:val="0"/>
+          <w:numId w:val="13"/>
+        </w:numPr>
+      </w:pPr>
+      <w:r>
+        <w:t xml:space="preserve">Buscar el dato que más podría cambiar la conducta.</w:t>
+      </w:r>
+    </w:p>
+    <w:p>
+      <w:pPr>
+        <w:pStyle w:val="BodyJ"/>
+        <w:numPr>
+          <w:ilvl w:val="0"/>
+          <w:numId w:val="13"/>
+        </w:numPr>
+      </w:pPr>
+      <w:r>
+        <w:t xml:space="preserve">Definir qué desenlace obligaría a reabrir el caso.</w:t>
+      </w:r>
+    </w:p>
+    <w:p>
+      <w:pPr>
+        <w:pStyle w:val="BodyJ"/>
+      </w:pPr>
+      <w:r>
+        <w:t xml:space="preserve">La primera instrucción es especialmente poderosa, como muestra la escena que abre este capítulo. Al quitar la etiqueta, reaparecen datos que habían sido subordinados a ella. La nueva representación no resuelve, pero impide que el nombre decida por adelantado.</w:t>
       </w:r>
     </w:p>
     <w:p>
@@ -6546,6 +6586,39 @@
           <w:sz w:val="25"/>
           <w:szCs w:val="25"/>
         </w:rPr>
+        <w:t xml:space="preserve">Pausa diagnóstica y segundo lector</w:t>
+      </w:r>
+    </w:p>
+    <w:p>
+      <w:pPr>
+        <w:pStyle w:val="BodyJ"/>
+      </w:pPr>
+      <w:r>
+        <w:t xml:space="preserve">Una pausa diagnóstica puede incorporarse a visitas de sala, altas y entregas de turno. No necesita preguntar por todas las enfermedades posibles. Debe focalizarse en riesgos: ¿qué podría estar pasando que no estamos tratando?, ¿qué supuesto no verificamos?, ¿qué explicación alternativa cambia el destino o el tiempo de intervención?</w:t>
+      </w:r>
+    </w:p>
+    <w:p>
+      <w:pPr>
+        <w:pStyle w:val="BodyJ"/>
+      </w:pPr>
+      <w:r>
+        <w:t xml:space="preserve">El segundo lector —otro médico, un especialista, un equipo interdisciplinario o una herramienta de apoyo— aporta diversidad de representación. Su valor no reside sólo en saber más, sino en no estar comprometido con la narrativa inicial. Para que funcione, el caso debe presentarse con datos suficientes y no sólo con la conclusión del primer equipo.</w:t>
+      </w:r>
+    </w:p>
+    <w:p>
+      <w:pPr>
+        <w:pStyle w:val="Heading3"/>
+        <w:spacing w:after="120" w:before="280"/>
+      </w:pPr>
+      <w:r>
+        <w:rPr>
+          <w:rFonts w:ascii="Georgia" w:cs="Georgia" w:eastAsia="Georgia" w:hAnsi="Georgia"/>
+          <w:b/>
+          <w:bCs/>
+          <w:color w:val="2B2B2B"/>
+          <w:sz w:val="25"/>
+          <w:szCs w:val="25"/>
+        </w:rPr>
         <w:t xml:space="preserve">Reflexión después del desenlace</w:t>
       </w:r>
     </w:p>
@@ -6649,7 +6722,7 @@
         </w:numPr>
       </w:pPr>
       <w:r>
-        <w:t xml:space="preserve">¿Cuál de mis pacientes actuales cumple un disparador de desaceleración (evolución inesperada, discordancia gravedad-diagnóstico, reconsulta)?</w:t>
+        <w:t xml:space="preserve">¿Cuál de mis pacientes actuales cumple un disparador de desaceleración (evolución inesperada, discordancia gravedad-diagnóstico, reconsulta), y en qué condiciones estaba yo cuando lo evalué?</w:t>
       </w:r>
     </w:p>
     <w:p>
@@ -9565,6 +9638,14 @@
       </w:pPr>
       <w:r>
         <w:t xml:space="preserve">Una frase clínica no es moralmente neutra. Puede activar una cirugía, justificar aislamiento, etiquetar a una persona, limitar tratamientos o fijar una interpretación que otros repetirán. Cuando escribimos "rechaza", "no adherente", "funcional", "terminal" o "sin indicación", no sólo describimos. Distribuimos credibilidad, urgencia y recursos. La ética del razonamiento comienza antes de la decisión: comienza en la forma en que se recibe un testimonio y se concede fuerza a una afirmación.</w:t>
+      </w:r>
+    </w:p>
+    <w:p>
+      <w:pPr>
+        <w:pStyle w:val="BodyJ"/>
+      </w:pPr>
+      <w:r>
+        <w:t xml:space="preserve">Conviene decirlo sin rodeos, porque el resto del capítulo lo presupone: pensar bien es parte de la ética primordial del médico, no un refinamiento intelectual que se agrega a ella. Es su herramienta principal, de la que parte todo lo demás — y en la que, cuando falla, termina todo lo demás. La idea tiene un antecedente filosófico exacto. Clifford sostuvo en 1877 que creer algo sin evidencia suficiente es siempre, en todo lugar y para cualquiera, un acto reprochable, y lo ilustró con un armador que, sin inspeccionar su barco, se convence de que es seguro y lo deja zarpar: si el barco llega a puerto, el armador no es menos culpable, porque la creencia se formó sin derecho a formarse (Clifford, 1877). La medicina es el oficio donde esa tesis deja de ser una exageración. El médico que escribe "se descarta" sin un método que excluya, o "cuadro habitual" sin haber mirado las rodillas moteadas, ha hecho exactamente lo del armador, y un desenlace benigno no lo absuelve; la viñeta 6 lo dice al revés: el mismo proceso con una crisis de pánico real habría sido igual de indefendible. Por eso el deber de pensar bien no se agota en la competencia. Incluye el deber de saber cuándo uno no está en condiciones de pensar bien (capítulo 8) y de organizar el trabajo para que otro instrumento revise el juicio. La ética clínica no empieza en el comité ni en el consentimiento; empieza en la calidad de la creencia que sostiene la primera frase de la ficha.</w:t>
       </w:r>
     </w:p>
     <w:p>
@@ -12779,7 +12860,7 @@
         <w:pStyle w:val="BodyJ"/>
       </w:pPr>
       <w:r>
-        <w:t xml:space="preserve">La metacognición suele presentarse como una habilidad personal: el médico debe ser humilde, reflexivo y consciente de sus sesgos. Esa expectativa es insuficiente si el sistema oculta resultados, interrumpe el trabajo, fragmenta información y castiga la duda. La lucidez necesita infraestructura.</w:t>
+        <w:t xml:space="preserve">La metacognición suele presentarse como una habilidad personal: el médico debe ser humilde, reflexivo y consciente de sus sesgos. Esa expectativa es insuficiente si el sistema oculta resultados, interrumpe el trabajo, fragmenta información y castiga la duda. La lucidez necesita infraestructura. Y esa infraestructura incluye los turnos: un servicio que deja las decisiones mayores para la hora veinte de una guardia está decidiendo con un instrumento degradado (capítulo 8), y el diseño de los horarios es, por eso, una decisión epistémica antes que administrativa.</w:t>
       </w:r>
     </w:p>
     <w:p>
@@ -14677,7 +14758,7 @@
         <w:pStyle w:val="BodyJ"/>
       </w:pPr>
       <w:r>
-        <w:t xml:space="preserve">Una medicina científicamente seria y humanamente responsable no es la que nunca duda. Es la que sabe qué hacer con su duda.</w:t>
+        <w:t xml:space="preserve">Una medicina científicamente seria y humanamente responsable no es la que nunca duda. Es la que sabe qué hacer con su duda. Y pensar bien —con la evidencia que hay, en el estado en que uno está, con los instrumentos que suplen lo que falta— no es un lujo de la medicina: es la primera de sus obligaciones, de la que parte todo lo demás.</w:t>
       </w:r>
     </w:p>
     <w:p>
@@ -14829,6 +14910,18 @@
       </w:pPr>
       <w:r>
         <w:t xml:space="preserve">Confiabilidad y límites del método.</w:t>
+      </w:r>
+    </w:p>
+    <w:p>
+      <w:pPr>
+        <w:pStyle w:val="BodyJ"/>
+        <w:numPr>
+          <w:ilvl w:val="0"/>
+          <w:numId w:val="6"/>
+        </w:numPr>
+      </w:pPr>
+      <w:r>
+        <w:t xml:space="preserve">Estado del razonador cuando pueda pesar: hora, horas de turno, sueño, ánimo, preocupación ajena al caso.</w:t>
       </w:r>
     </w:p>
     <w:p>
@@ -17176,6 +17269,36 @@
           <w:b/>
           <w:bCs/>
         </w:rPr>
+        <w:t xml:space="preserve">Ética de la creencia.</w:t>
+      </w:r>
+      <w:r>
+        <w:t xml:space="preserve"> Tesis de Clifford (1877) según la cual creer sin evidencia suficiente es en sí mismo reprochable, con independencia del desenlace; en clínica, fundamento del deber de pensar bien como parte de la ética primordial del médico y de la regla de que un buen desenlace no valida un proceso defectuoso.</w:t>
+      </w:r>
+    </w:p>
+    <w:p>
+      <w:pPr>
+        <w:pStyle w:val="BodyJ"/>
+      </w:pPr>
+      <w:r>
+        <w:rPr>
+          <w:b/>
+          <w:bCs/>
+        </w:rPr>
+        <w:t xml:space="preserve">Estado del razonador.</w:t>
+      </w:r>
+      <w:r>
+        <w:t xml:space="preserve"> Condiciones en que se produce un juicio clínico —sueño, horas de turno, hora del día, ánimo, preocupaciones ajenas al caso—, tratadas como un hecho de la capa H sobre la confiabilidad del instrumento que infiere y como disparador de pausa o de segundo lector. Pensar cuesta, y el costo no es constante.</w:t>
+      </w:r>
+    </w:p>
+    <w:p>
+      <w:pPr>
+        <w:pStyle w:val="BodyJ"/>
+      </w:pPr>
+      <w:r>
+        <w:rPr>
+          <w:b/>
+          <w:bCs/>
+        </w:rPr>
         <w:t xml:space="preserve">Fragilidad.</w:t>
       </w:r>
       <w:r>
@@ -17925,7 +18048,7 @@
         </w:numPr>
       </w:pPr>
       <w:r>
-        <w:t xml:space="preserve">Desaceleración selectiva — 8, Interludio II</w:t>
+        <w:t xml:space="preserve">Desaceleración selectiva — 8, Interludio II; disparadores, incluido el estado del razonador — 8</w:t>
       </w:r>
     </w:p>
     <w:p>
@@ -17997,6 +18120,18 @@
         </w:numPr>
       </w:pPr>
       <w:r>
+        <w:t xml:space="preserve">Ética de la creencia (Clifford); pensar bien como deber primordial — 14, C</w:t>
+      </w:r>
+    </w:p>
+    <w:p>
+      <w:pPr>
+        <w:pStyle w:val="BodyJ"/>
+        <w:numPr>
+          <w:ilvl w:val="0"/>
+          <w:numId w:val="6"/>
+        </w:numPr>
+      </w:pPr>
+      <w:r>
         <w:t xml:space="preserve">Escribas ambientales (regla «la capa H sí, la capa D no») — 17</w:t>
       </w:r>
     </w:p>
@@ -18010,6 +18145,18 @@
       </w:pPr>
       <w:r>
         <w:t xml:space="preserve">Estado de verificación de un diagnóstico en la ficha electrónica — 12</w:t>
+      </w:r>
+    </w:p>
+    <w:p>
+      <w:pPr>
+        <w:pStyle w:val="BodyJ"/>
+        <w:numPr>
+          <w:ilvl w:val="0"/>
+          <w:numId w:val="6"/>
+        </w:numPr>
+      </w:pPr>
+      <w:r>
+        <w:t xml:space="preserve">Estado del razonador (esfuerzo, sueño, ánimo; turnos como condición epistémica) — 8, 16, Ap A</w:t>
       </w:r>
     </w:p>
     <w:p>
@@ -19205,79 +19352,79 @@
         <w:pStyle w:val="BodyJ"/>
       </w:pPr>
       <w:r>
-        <w:t xml:space="preserve">Coady, C. A. J. (1992). </w:t>
+        <w:t xml:space="preserve">Clifford, W. K. (1877). The ethics of belief. </w:t>
       </w:r>
       <w:r>
         <w:rPr>
           <w:i/>
           <w:iCs/>
         </w:rPr>
-        <w:t xml:space="preserve">Testimony: A Philosophical Study</w:t>
-      </w:r>
-      <w:r>
-        <w:t xml:space="preserve">. Clarendon Press.</w:t>
-      </w:r>
-    </w:p>
-    <w:p>
-      <w:pPr>
-        <w:pStyle w:val="BodyJ"/>
-      </w:pPr>
-      <w:r>
-        <w:t xml:space="preserve">Croskerry, P. (2003). The importance of cognitive errors in diagnosis and strategies to minimize them. </w:t>
+        <w:t xml:space="preserve">Contemporary Review, 29</w:t>
+      </w:r>
+      <w:r>
+        <w:t xml:space="preserve">, 289–309.</w:t>
+      </w:r>
+    </w:p>
+    <w:p>
+      <w:pPr>
+        <w:pStyle w:val="BodyJ"/>
+      </w:pPr>
+      <w:r>
+        <w:t xml:space="preserve">Coady, C. A. J. (1992). </w:t>
       </w:r>
       <w:r>
         <w:rPr>
           <w:i/>
           <w:iCs/>
         </w:rPr>
-        <w:t xml:space="preserve">Academic Medicine, 78</w:t>
-      </w:r>
-      <w:r>
-        <w:t xml:space="preserve">(8), 775–780.</w:t>
-      </w:r>
-    </w:p>
-    <w:p>
-      <w:pPr>
-        <w:pStyle w:val="BodyJ"/>
-      </w:pPr>
-      <w:r>
-        <w:t xml:space="preserve">Croskerry, P. (2009). A universal model of diagnostic reasoning. </w:t>
+        <w:t xml:space="preserve">Testimony: A Philosophical Study</w:t>
+      </w:r>
+      <w:r>
+        <w:t xml:space="preserve">. Clarendon Press.</w:t>
+      </w:r>
+    </w:p>
+    <w:p>
+      <w:pPr>
+        <w:pStyle w:val="BodyJ"/>
+      </w:pPr>
+      <w:r>
+        <w:t xml:space="preserve">Croskerry, P. (2003). The importance of cognitive errors in diagnosis and strategies to minimize them. </w:t>
       </w:r>
       <w:r>
         <w:rPr>
           <w:i/>
           <w:iCs/>
         </w:rPr>
-        <w:t xml:space="preserve">Academic Medicine, 84</w:t>
-      </w:r>
-      <w:r>
-        <w:t xml:space="preserve">(8), 1022–1028.</w:t>
-      </w:r>
-    </w:p>
-    <w:p>
-      <w:pPr>
-        <w:pStyle w:val="BodyJ"/>
-      </w:pPr>
-      <w:r>
-        <w:t xml:space="preserve">Croskerry, P., Singhal, G., &amp; Mamede, S. (2013a). Cognitive debiasing 1: Origins of bias and theory of debiasing. </w:t>
+        <w:t xml:space="preserve">Academic Medicine, 78</w:t>
+      </w:r>
+      <w:r>
+        <w:t xml:space="preserve">(8), 775–780.</w:t>
+      </w:r>
+    </w:p>
+    <w:p>
+      <w:pPr>
+        <w:pStyle w:val="BodyJ"/>
+      </w:pPr>
+      <w:r>
+        <w:t xml:space="preserve">Croskerry, P. (2009). A universal model of diagnostic reasoning. </w:t>
       </w:r>
       <w:r>
         <w:rPr>
           <w:i/>
           <w:iCs/>
         </w:rPr>
-        <w:t xml:space="preserve">BMJ Quality &amp; Safety, 22</w:t>
-      </w:r>
-      <w:r>
-        <w:t xml:space="preserve">(Suppl 2), ii58–ii64.</w:t>
-      </w:r>
-    </w:p>
-    <w:p>
-      <w:pPr>
-        <w:pStyle w:val="BodyJ"/>
-      </w:pPr>
-      <w:r>
-        <w:t xml:space="preserve">Croskerry, P., Singhal, G., &amp; Mamede, S. (2013b). Cognitive debiasing 2: Impediments to and strategies for change. </w:t>
+        <w:t xml:space="preserve">Academic Medicine, 84</w:t>
+      </w:r>
+      <w:r>
+        <w:t xml:space="preserve">(8), 1022–1028.</w:t>
+      </w:r>
+    </w:p>
+    <w:p>
+      <w:pPr>
+        <w:pStyle w:val="BodyJ"/>
+      </w:pPr>
+      <w:r>
+        <w:t xml:space="preserve">Croskerry, P., Singhal, G., &amp; Mamede, S. (2013a). Cognitive debiasing 1: Origins of bias and theory of debiasing. </w:t>
       </w:r>
       <w:r>
         <w:rPr>
@@ -19287,1447 +19434,1537 @@
         <w:t xml:space="preserve">BMJ Quality &amp; Safety, 22</w:t>
       </w:r>
       <w:r>
-        <w:t xml:space="preserve">(Suppl 2), ii65–ii72.</w:t>
-      </w:r>
-    </w:p>
-    <w:p>
-      <w:pPr>
-        <w:pStyle w:val="BodyJ"/>
-      </w:pPr>
-      <w:r>
-        <w:t xml:space="preserve">Custers, E. J. F. M. (2015). Thirty years of illness scripts: Theoretical origins and practical applications. </w:t>
+        <w:t xml:space="preserve">(Suppl 2), ii58–ii64.</w:t>
+      </w:r>
+    </w:p>
+    <w:p>
+      <w:pPr>
+        <w:pStyle w:val="BodyJ"/>
+      </w:pPr>
+      <w:r>
+        <w:t xml:space="preserve">Croskerry, P., Singhal, G., &amp; Mamede, S. (2013b). Cognitive debiasing 2: Impediments to and strategies for change. </w:t>
       </w:r>
       <w:r>
         <w:rPr>
           <w:i/>
           <w:iCs/>
         </w:rPr>
-        <w:t xml:space="preserve">Medical Teacher, 37</w:t>
-      </w:r>
-      <w:r>
-        <w:t xml:space="preserve">(5), 457–462.</w:t>
-      </w:r>
-    </w:p>
-    <w:p>
-      <w:pPr>
-        <w:pStyle w:val="BodyJ"/>
-      </w:pPr>
-      <w:r>
-        <w:t xml:space="preserve">Djulbegovic, B., &amp; Guyatt, G. H. (2017). Progress in evidence-based medicine: A quarter century on. </w:t>
+        <w:t xml:space="preserve">BMJ Quality &amp; Safety, 22</w:t>
+      </w:r>
+      <w:r>
+        <w:t xml:space="preserve">(Suppl 2), ii65–ii72.</w:t>
+      </w:r>
+    </w:p>
+    <w:p>
+      <w:pPr>
+        <w:pStyle w:val="BodyJ"/>
+      </w:pPr>
+      <w:r>
+        <w:t xml:space="preserve">Custers, E. J. F. M. (2015). Thirty years of illness scripts: Theoretical origins and practical applications. </w:t>
       </w:r>
       <w:r>
         <w:rPr>
           <w:i/>
           <w:iCs/>
         </w:rPr>
-        <w:t xml:space="preserve">The Lancet, 390</w:t>
-      </w:r>
-      <w:r>
-        <w:t xml:space="preserve">(10092), 415–423.</w:t>
-      </w:r>
-    </w:p>
-    <w:p>
-      <w:pPr>
-        <w:pStyle w:val="BodyJ"/>
-      </w:pPr>
-      <w:r>
-        <w:t xml:space="preserve">Douglas, H. (2000). Inductive risk and values in science. </w:t>
+        <w:t xml:space="preserve">Medical Teacher, 37</w:t>
+      </w:r>
+      <w:r>
+        <w:t xml:space="preserve">(5), 457–462.</w:t>
+      </w:r>
+    </w:p>
+    <w:p>
+      <w:pPr>
+        <w:pStyle w:val="BodyJ"/>
+      </w:pPr>
+      <w:r>
+        <w:t xml:space="preserve">Djulbegovic, B., &amp; Guyatt, G. H. (2017). Progress in evidence-based medicine: A quarter century on. </w:t>
       </w:r>
       <w:r>
         <w:rPr>
           <w:i/>
           <w:iCs/>
         </w:rPr>
-        <w:t xml:space="preserve">Philosophy of Science, 67</w:t>
-      </w:r>
-      <w:r>
-        <w:t xml:space="preserve">(4), 559–579.</w:t>
-      </w:r>
-    </w:p>
-    <w:p>
-      <w:pPr>
-        <w:pStyle w:val="BodyJ"/>
-      </w:pPr>
-      <w:r>
-        <w:t xml:space="preserve">Dunlosky, J., &amp; Metcalfe, J. (2009). </w:t>
+        <w:t xml:space="preserve">The Lancet, 390</w:t>
+      </w:r>
+      <w:r>
+        <w:t xml:space="preserve">(10092), 415–423.</w:t>
+      </w:r>
+    </w:p>
+    <w:p>
+      <w:pPr>
+        <w:pStyle w:val="BodyJ"/>
+      </w:pPr>
+      <w:r>
+        <w:t xml:space="preserve">Douglas, H. (2000). Inductive risk and values in science. </w:t>
       </w:r>
       <w:r>
         <w:rPr>
           <w:i/>
           <w:iCs/>
         </w:rPr>
-        <w:t xml:space="preserve">Metacognition</w:t>
-      </w:r>
-      <w:r>
-        <w:t xml:space="preserve">. SAGE.</w:t>
-      </w:r>
-    </w:p>
-    <w:p>
-      <w:pPr>
-        <w:pStyle w:val="BodyJ"/>
-      </w:pPr>
-      <w:r>
-        <w:t xml:space="preserve">Elstein, A. S., Shulman, L. S., &amp; Sprafka, S. A. (1978). </w:t>
+        <w:t xml:space="preserve">Philosophy of Science, 67</w:t>
+      </w:r>
+      <w:r>
+        <w:t xml:space="preserve">(4), 559–579.</w:t>
+      </w:r>
+    </w:p>
+    <w:p>
+      <w:pPr>
+        <w:pStyle w:val="BodyJ"/>
+      </w:pPr>
+      <w:r>
+        <w:t xml:space="preserve">Dunlosky, J., &amp; Metcalfe, J. (2009). </w:t>
       </w:r>
       <w:r>
         <w:rPr>
           <w:i/>
           <w:iCs/>
         </w:rPr>
-        <w:t xml:space="preserve">Medical Problem Solving: An Analysis of Clinical Reasoning</w:t>
-      </w:r>
-      <w:r>
-        <w:t xml:space="preserve">. Harvard University Press.</w:t>
-      </w:r>
-    </w:p>
-    <w:p>
-      <w:pPr>
-        <w:pStyle w:val="BodyJ"/>
-      </w:pPr>
-      <w:r>
-        <w:t xml:space="preserve">Elwyn, G., Frosch, D., Thomson, R., Joseph-Williams, N., Lloyd, A., Kinnersley, P., et al. (2012). Shared decision making: A model for clinical practice. </w:t>
+        <w:t xml:space="preserve">Metacognition</w:t>
+      </w:r>
+      <w:r>
+        <w:t xml:space="preserve">. SAGE.</w:t>
+      </w:r>
+    </w:p>
+    <w:p>
+      <w:pPr>
+        <w:pStyle w:val="BodyJ"/>
+      </w:pPr>
+      <w:r>
+        <w:t xml:space="preserve">Elstein, A. S., Shulman, L. S., &amp; Sprafka, S. A. (1978). </w:t>
       </w:r>
       <w:r>
         <w:rPr>
           <w:i/>
           <w:iCs/>
         </w:rPr>
-        <w:t xml:space="preserve">Journal of General Internal Medicine, 27</w:t>
-      </w:r>
-      <w:r>
-        <w:t xml:space="preserve">(10), 1361–1367.</w:t>
-      </w:r>
-    </w:p>
-    <w:p>
-      <w:pPr>
-        <w:pStyle w:val="BodyJ"/>
-      </w:pPr>
-      <w:r>
-        <w:t xml:space="preserve">Epstein, R. M. (1999). Mindful practice. </w:t>
+        <w:t xml:space="preserve">Medical Problem Solving: An Analysis of Clinical Reasoning</w:t>
+      </w:r>
+      <w:r>
+        <w:t xml:space="preserve">. Harvard University Press.</w:t>
+      </w:r>
+    </w:p>
+    <w:p>
+      <w:pPr>
+        <w:pStyle w:val="BodyJ"/>
+      </w:pPr>
+      <w:r>
+        <w:t xml:space="preserve">Elwyn, G., Frosch, D., Thomson, R., Joseph-Williams, N., Lloyd, A., Kinnersley, P., et al. (2012). Shared decision making: A model for clinical practice. </w:t>
       </w:r>
       <w:r>
         <w:rPr>
           <w:i/>
           <w:iCs/>
         </w:rPr>
-        <w:t xml:space="preserve">JAMA, 282</w:t>
-      </w:r>
-      <w:r>
-        <w:t xml:space="preserve">(9), 833–839.</w:t>
-      </w:r>
-    </w:p>
-    <w:p>
-      <w:pPr>
-        <w:pStyle w:val="BodyJ"/>
-      </w:pPr>
-      <w:r>
-        <w:t xml:space="preserve">Ericsson, K. A., Krampe, R. T., &amp; Tesch-Römer, C. (1993). The role of deliberate practice in the acquisition of expert performance. </w:t>
+        <w:t xml:space="preserve">Journal of General Internal Medicine, 27</w:t>
+      </w:r>
+      <w:r>
+        <w:t xml:space="preserve">(10), 1361–1367.</w:t>
+      </w:r>
+    </w:p>
+    <w:p>
+      <w:pPr>
+        <w:pStyle w:val="BodyJ"/>
+      </w:pPr>
+      <w:r>
+        <w:t xml:space="preserve">Epstein, R. M. (1999). Mindful practice. </w:t>
       </w:r>
       <w:r>
         <w:rPr>
           <w:i/>
           <w:iCs/>
         </w:rPr>
-        <w:t xml:space="preserve">Psychological Review, 100</w:t>
-      </w:r>
-      <w:r>
-        <w:t xml:space="preserve">(3), 363–406.</w:t>
-      </w:r>
-    </w:p>
-    <w:p>
-      <w:pPr>
-        <w:pStyle w:val="BodyJ"/>
-      </w:pPr>
-      <w:r>
-        <w:t xml:space="preserve">Eva, K. W. (2005). What every teacher needs to know about clinical reasoning. </w:t>
+        <w:t xml:space="preserve">JAMA, 282</w:t>
+      </w:r>
+      <w:r>
+        <w:t xml:space="preserve">(9), 833–839.</w:t>
+      </w:r>
+    </w:p>
+    <w:p>
+      <w:pPr>
+        <w:pStyle w:val="BodyJ"/>
+      </w:pPr>
+      <w:r>
+        <w:t xml:space="preserve">Ericsson, K. A., Krampe, R. T., &amp; Tesch-Römer, C. (1993). The role of deliberate practice in the acquisition of expert performance. </w:t>
       </w:r>
       <w:r>
         <w:rPr>
           <w:i/>
           <w:iCs/>
         </w:rPr>
-        <w:t xml:space="preserve">Medical Education, 39</w:t>
-      </w:r>
-      <w:r>
-        <w:t xml:space="preserve">(1), 98–106.</w:t>
-      </w:r>
-    </w:p>
-    <w:p>
-      <w:pPr>
-        <w:pStyle w:val="BodyJ"/>
-      </w:pPr>
-      <w:r>
-        <w:t xml:space="preserve">Eva, K. W., &amp; Regehr, G. (2005). Self-assessment in the health professions: A reformulation and research agenda. </w:t>
+        <w:t xml:space="preserve">Psychological Review, 100</w:t>
+      </w:r>
+      <w:r>
+        <w:t xml:space="preserve">(3), 363–406.</w:t>
+      </w:r>
+    </w:p>
+    <w:p>
+      <w:pPr>
+        <w:pStyle w:val="BodyJ"/>
+      </w:pPr>
+      <w:r>
+        <w:t xml:space="preserve">Estrada, C. A., Isen, A. M., &amp; Young, M. J. (1997). Positive affect facilitates integration of information and decreases anchoring in reasoning among physicians. </w:t>
       </w:r>
       <w:r>
         <w:rPr>
           <w:i/>
           <w:iCs/>
         </w:rPr>
-        <w:t xml:space="preserve">Academic Medicine, 80</w:t>
-      </w:r>
-      <w:r>
-        <w:t xml:space="preserve">(10 Suppl), S46–S54.</w:t>
-      </w:r>
-    </w:p>
-    <w:p>
-      <w:pPr>
-        <w:pStyle w:val="BodyJ"/>
-      </w:pPr>
-      <w:r>
-        <w:t xml:space="preserve">Evans, J. St. B. T., &amp; Stanovich, K. E. (2013). Dual-process theories of higher cognition: Advancing the debate. </w:t>
+        <w:t xml:space="preserve">Organizational Behavior and Human Decision Processes, 72</w:t>
+      </w:r>
+      <w:r>
+        <w:t xml:space="preserve">(1), 117–135.</w:t>
+      </w:r>
+    </w:p>
+    <w:p>
+      <w:pPr>
+        <w:pStyle w:val="BodyJ"/>
+      </w:pPr>
+      <w:r>
+        <w:t xml:space="preserve">Eva, K. W. (2005). What every teacher needs to know about clinical reasoning. </w:t>
       </w:r>
       <w:r>
         <w:rPr>
           <w:i/>
           <w:iCs/>
         </w:rPr>
-        <w:t xml:space="preserve">Perspectives on Psychological Science, 8</w:t>
-      </w:r>
-      <w:r>
-        <w:t xml:space="preserve">(3), 223–241.</w:t>
-      </w:r>
-    </w:p>
-    <w:p>
-      <w:pPr>
-        <w:pStyle w:val="BodyJ"/>
-      </w:pPr>
-      <w:r>
-        <w:t xml:space="preserve">Feinstein, A. R. (1967). </w:t>
+        <w:t xml:space="preserve">Medical Education, 39</w:t>
+      </w:r>
+      <w:r>
+        <w:t xml:space="preserve">(1), 98–106.</w:t>
+      </w:r>
+    </w:p>
+    <w:p>
+      <w:pPr>
+        <w:pStyle w:val="BodyJ"/>
+      </w:pPr>
+      <w:r>
+        <w:t xml:space="preserve">Eva, K. W., &amp; Regehr, G. (2005). Self-assessment in the health professions: A reformulation and research agenda. </w:t>
       </w:r>
       <w:r>
         <w:rPr>
           <w:i/>
           <w:iCs/>
         </w:rPr>
-        <w:t xml:space="preserve">Clinical Judgment</w:t>
-      </w:r>
-      <w:r>
-        <w:t xml:space="preserve">. Williams &amp; Wilkins.</w:t>
-      </w:r>
-    </w:p>
-    <w:p>
-      <w:pPr>
-        <w:pStyle w:val="BodyJ"/>
-      </w:pPr>
-      <w:r>
-        <w:t xml:space="preserve">Flavell, J. H. (1979). Metacognition and cognitive monitoring: A new area of cognitive-developmental inquiry. </w:t>
+        <w:t xml:space="preserve">Academic Medicine, 80</w:t>
+      </w:r>
+      <w:r>
+        <w:t xml:space="preserve">(10 Suppl), S46–S54.</w:t>
+      </w:r>
+    </w:p>
+    <w:p>
+      <w:pPr>
+        <w:pStyle w:val="BodyJ"/>
+      </w:pPr>
+      <w:r>
+        <w:t xml:space="preserve">Evans, J. St. B. T., &amp; Stanovich, K. E. (2013). Dual-process theories of higher cognition: Advancing the debate. </w:t>
       </w:r>
       <w:r>
         <w:rPr>
           <w:i/>
           <w:iCs/>
         </w:rPr>
-        <w:t xml:space="preserve">American Psychologist, 34</w:t>
-      </w:r>
-      <w:r>
-        <w:t xml:space="preserve">(10), 906–911.</w:t>
-      </w:r>
-    </w:p>
-    <w:p>
-      <w:pPr>
-        <w:pStyle w:val="BodyJ"/>
-      </w:pPr>
-      <w:r>
-        <w:t xml:space="preserve">Fleming, S. M. (2021). </w:t>
+        <w:t xml:space="preserve">Perspectives on Psychological Science, 8</w:t>
+      </w:r>
+      <w:r>
+        <w:t xml:space="preserve">(3), 223–241.</w:t>
+      </w:r>
+    </w:p>
+    <w:p>
+      <w:pPr>
+        <w:pStyle w:val="BodyJ"/>
+      </w:pPr>
+      <w:r>
+        <w:t xml:space="preserve">Feinstein, A. R. (1967). </w:t>
       </w:r>
       <w:r>
         <w:rPr>
           <w:i/>
           <w:iCs/>
         </w:rPr>
-        <w:t xml:space="preserve">Know Thyself: The Science of Self-Awareness</w:t>
-      </w:r>
-      <w:r>
-        <w:t xml:space="preserve">. Basic Books.</w:t>
-      </w:r>
-    </w:p>
-    <w:p>
-      <w:pPr>
-        <w:pStyle w:val="BodyJ"/>
-      </w:pPr>
-      <w:r>
-        <w:t xml:space="preserve">Fleming, S. M., &amp; Dolan, R. J. (2012). The neural basis of metacognitive ability. </w:t>
+        <w:t xml:space="preserve">Clinical Judgment</w:t>
+      </w:r>
+      <w:r>
+        <w:t xml:space="preserve">. Williams &amp; Wilkins.</w:t>
+      </w:r>
+    </w:p>
+    <w:p>
+      <w:pPr>
+        <w:pStyle w:val="BodyJ"/>
+      </w:pPr>
+      <w:r>
+        <w:t xml:space="preserve">Flavell, J. H. (1979). Metacognition and cognitive monitoring: A new area of cognitive-developmental inquiry. </w:t>
       </w:r>
       <w:r>
         <w:rPr>
           <w:i/>
           <w:iCs/>
         </w:rPr>
-        <w:t xml:space="preserve">Philosophical Transactions of the Royal Society B, 367</w:t>
-      </w:r>
-      <w:r>
-        <w:t xml:space="preserve">(1594), 1338–1349.</w:t>
-      </w:r>
-    </w:p>
-    <w:p>
-      <w:pPr>
-        <w:pStyle w:val="BodyJ"/>
-      </w:pPr>
-      <w:r>
-        <w:t xml:space="preserve">Fleming, S. M., &amp; Lau, H. C. (2014). How to measure metacognition. </w:t>
+        <w:t xml:space="preserve">American Psychologist, 34</w:t>
+      </w:r>
+      <w:r>
+        <w:t xml:space="preserve">(10), 906–911.</w:t>
+      </w:r>
+    </w:p>
+    <w:p>
+      <w:pPr>
+        <w:pStyle w:val="BodyJ"/>
+      </w:pPr>
+      <w:r>
+        <w:t xml:space="preserve">Fleming, S. M. (2021). </w:t>
       </w:r>
       <w:r>
         <w:rPr>
           <w:i/>
           <w:iCs/>
         </w:rPr>
-        <w:t xml:space="preserve">Frontiers in Human Neuroscience, 8</w:t>
-      </w:r>
-      <w:r>
-        <w:t xml:space="preserve">, 443.</w:t>
-      </w:r>
-    </w:p>
-    <w:p>
-      <w:pPr>
-        <w:pStyle w:val="BodyJ"/>
-      </w:pPr>
-      <w:r>
-        <w:t xml:space="preserve">Foucault, M. (1966). </w:t>
+        <w:t xml:space="preserve">Know Thyself: The Science of Self-Awareness</w:t>
+      </w:r>
+      <w:r>
+        <w:t xml:space="preserve">. Basic Books.</w:t>
+      </w:r>
+    </w:p>
+    <w:p>
+      <w:pPr>
+        <w:pStyle w:val="BodyJ"/>
+      </w:pPr>
+      <w:r>
+        <w:t xml:space="preserve">Fleming, S. M., &amp; Dolan, R. J. (2012). The neural basis of metacognitive ability. </w:t>
       </w:r>
       <w:r>
         <w:rPr>
           <w:i/>
           <w:iCs/>
         </w:rPr>
-        <w:t xml:space="preserve">El nacimiento de la clínica: Una arqueología de la mirada médica</w:t>
-      </w:r>
-      <w:r>
-        <w:t xml:space="preserve"> (F. Perujo, Trad.). Siglo XXI. (Obra original publicada en 1963).</w:t>
-      </w:r>
-    </w:p>
-    <w:p>
-      <w:pPr>
-        <w:pStyle w:val="BodyJ"/>
-      </w:pPr>
-      <w:r>
-        <w:t xml:space="preserve">Fox, R. C. (1980). The evolution of medical uncertainty. </w:t>
+        <w:t xml:space="preserve">Philosophical Transactions of the Royal Society B, 367</w:t>
+      </w:r>
+      <w:r>
+        <w:t xml:space="preserve">(1594), 1338–1349.</w:t>
+      </w:r>
+    </w:p>
+    <w:p>
+      <w:pPr>
+        <w:pStyle w:val="BodyJ"/>
+      </w:pPr>
+      <w:r>
+        <w:t xml:space="preserve">Fleming, S. M., &amp; Lau, H. C. (2014). How to measure metacognition. </w:t>
       </w:r>
       <w:r>
         <w:rPr>
           <w:i/>
           <w:iCs/>
         </w:rPr>
-        <w:t xml:space="preserve">Milbank Memorial Fund Quarterly: Health and Society, 58</w:t>
-      </w:r>
-      <w:r>
-        <w:t xml:space="preserve">(1), 1–49.</w:t>
-      </w:r>
-    </w:p>
-    <w:p>
-      <w:pPr>
-        <w:pStyle w:val="BodyJ"/>
-      </w:pPr>
-      <w:r>
-        <w:t xml:space="preserve">Fricker, M. (2007). </w:t>
+        <w:t xml:space="preserve">Frontiers in Human Neuroscience, 8</w:t>
+      </w:r>
+      <w:r>
+        <w:t xml:space="preserve">, 443.</w:t>
+      </w:r>
+    </w:p>
+    <w:p>
+      <w:pPr>
+        <w:pStyle w:val="BodyJ"/>
+      </w:pPr>
+      <w:r>
+        <w:t xml:space="preserve">Foucault, M. (1966). </w:t>
       </w:r>
       <w:r>
         <w:rPr>
           <w:i/>
           <w:iCs/>
         </w:rPr>
-        <w:t xml:space="preserve">Epistemic Injustice: Power and the Ethics of Knowing</w:t>
-      </w:r>
-      <w:r>
-        <w:t xml:space="preserve">. Oxford University Press.</w:t>
-      </w:r>
-    </w:p>
-    <w:p>
-      <w:pPr>
-        <w:pStyle w:val="BodyJ"/>
-      </w:pPr>
-      <w:r>
-        <w:t xml:space="preserve">Gadamer, H.-G. (1996). </w:t>
+        <w:t xml:space="preserve">El nacimiento de la clínica: Una arqueología de la mirada médica</w:t>
+      </w:r>
+      <w:r>
+        <w:t xml:space="preserve"> (F. Perujo, Trad.). Siglo XXI. (Obra original publicada en 1963).</w:t>
+      </w:r>
+    </w:p>
+    <w:p>
+      <w:pPr>
+        <w:pStyle w:val="BodyJ"/>
+      </w:pPr>
+      <w:r>
+        <w:t xml:space="preserve">Fox, R. C. (1980). The evolution of medical uncertainty. </w:t>
       </w:r>
       <w:r>
         <w:rPr>
           <w:i/>
           <w:iCs/>
         </w:rPr>
-        <w:t xml:space="preserve">El estado oculto de la salud</w:t>
-      </w:r>
-      <w:r>
-        <w:t xml:space="preserve"> (N. Machaín, Trad.). Gedisa.</w:t>
-      </w:r>
-    </w:p>
-    <w:p>
-      <w:pPr>
-        <w:pStyle w:val="BodyJ"/>
-      </w:pPr>
-      <w:r>
-        <w:t xml:space="preserve">Gérvas, J., &amp; Pérez Fernández, M. (2013). </w:t>
+        <w:t xml:space="preserve">Milbank Memorial Fund Quarterly: Health and Society, 58</w:t>
+      </w:r>
+      <w:r>
+        <w:t xml:space="preserve">(1), 1–49.</w:t>
+      </w:r>
+    </w:p>
+    <w:p>
+      <w:pPr>
+        <w:pStyle w:val="BodyJ"/>
+      </w:pPr>
+      <w:r>
+        <w:t xml:space="preserve">Fricker, M. (2007). </w:t>
       </w:r>
       <w:r>
         <w:rPr>
           <w:i/>
           <w:iCs/>
         </w:rPr>
-        <w:t xml:space="preserve">Sano y salvo (y libre de intervenciones médicas innecesarias)</w:t>
-      </w:r>
-      <w:r>
-        <w:t xml:space="preserve">. Los Libros del Lince.</w:t>
-      </w:r>
-    </w:p>
-    <w:p>
-      <w:pPr>
-        <w:pStyle w:val="BodyJ"/>
-      </w:pPr>
-      <w:r>
-        <w:t xml:space="preserve">Gigerenzer, G., &amp; Gaissmaier, W. (2011). Heuristic decision making. </w:t>
+        <w:t xml:space="preserve">Epistemic Injustice: Power and the Ethics of Knowing</w:t>
+      </w:r>
+      <w:r>
+        <w:t xml:space="preserve">. Oxford University Press.</w:t>
+      </w:r>
+    </w:p>
+    <w:p>
+      <w:pPr>
+        <w:pStyle w:val="BodyJ"/>
+      </w:pPr>
+      <w:r>
+        <w:t xml:space="preserve">Gadamer, H.-G. (1996). </w:t>
       </w:r>
       <w:r>
         <w:rPr>
           <w:i/>
           <w:iCs/>
         </w:rPr>
-        <w:t xml:space="preserve">Annual Review of Psychology, 62</w:t>
-      </w:r>
-      <w:r>
-        <w:t xml:space="preserve">, 451–482.</w:t>
-      </w:r>
-    </w:p>
-    <w:p>
-      <w:pPr>
-        <w:pStyle w:val="BodyJ"/>
-      </w:pPr>
-      <w:r>
-        <w:t xml:space="preserve">Gigerenzer, G., Gaissmaier, W., Kurz-Milcke, E., Schwartz, L. M., &amp; Woloshin, S. (2007). Helping doctors and patients make sense of health statistics. </w:t>
+        <w:t xml:space="preserve">El estado oculto de la salud</w:t>
+      </w:r>
+      <w:r>
+        <w:t xml:space="preserve"> (N. Machaín, Trad.). Gedisa.</w:t>
+      </w:r>
+    </w:p>
+    <w:p>
+      <w:pPr>
+        <w:pStyle w:val="BodyJ"/>
+      </w:pPr>
+      <w:r>
+        <w:t xml:space="preserve">Gérvas, J., &amp; Pérez Fernández, M. (2013). </w:t>
       </w:r>
       <w:r>
         <w:rPr>
           <w:i/>
           <w:iCs/>
         </w:rPr>
-        <w:t xml:space="preserve">Psychological Science in the Public Interest, 8</w:t>
-      </w:r>
-      <w:r>
-        <w:t xml:space="preserve">(2), 53–96.</w:t>
-      </w:r>
-    </w:p>
-    <w:p>
-      <w:pPr>
-        <w:pStyle w:val="BodyJ"/>
-      </w:pPr>
-      <w:r>
-        <w:t xml:space="preserve">Goddard, K., Roudsari, A., &amp; Wyatt, J. C. (2012). Automation bias: A systematic review of frequency, effect mediators, and mitigators. </w:t>
+        <w:t xml:space="preserve">Sano y salvo (y libre de intervenciones médicas innecesarias)</w:t>
+      </w:r>
+      <w:r>
+        <w:t xml:space="preserve">. Los Libros del Lince.</w:t>
+      </w:r>
+    </w:p>
+    <w:p>
+      <w:pPr>
+        <w:pStyle w:val="BodyJ"/>
+      </w:pPr>
+      <w:r>
+        <w:t xml:space="preserve">Gigerenzer, G., &amp; Gaissmaier, W. (2011). Heuristic decision making. </w:t>
       </w:r>
       <w:r>
         <w:rPr>
           <w:i/>
           <w:iCs/>
         </w:rPr>
-        <w:t xml:space="preserve">Journal of the American Medical Informatics Association, 19</w:t>
-      </w:r>
-      <w:r>
-        <w:t xml:space="preserve">(1), 121–127.</w:t>
-      </w:r>
-    </w:p>
-    <w:p>
-      <w:pPr>
-        <w:pStyle w:val="BodyJ"/>
-      </w:pPr>
-      <w:r>
-        <w:t xml:space="preserve">Goh, E., Gallo, R., Hom, J., et al. (2024). Large language model influence on diagnostic reasoning: A randomized clinical trial. </w:t>
+        <w:t xml:space="preserve">Annual Review of Psychology, 62</w:t>
+      </w:r>
+      <w:r>
+        <w:t xml:space="preserve">, 451–482.</w:t>
+      </w:r>
+    </w:p>
+    <w:p>
+      <w:pPr>
+        <w:pStyle w:val="BodyJ"/>
+      </w:pPr>
+      <w:r>
+        <w:t xml:space="preserve">Gigerenzer, G., Gaissmaier, W., Kurz-Milcke, E., Schwartz, L. M., &amp; Woloshin, S. (2007). Helping doctors and patients make sense of health statistics. </w:t>
       </w:r>
       <w:r>
         <w:rPr>
           <w:i/>
           <w:iCs/>
         </w:rPr>
-        <w:t xml:space="preserve">JAMA Network Open, 7</w:t>
-      </w:r>
-      <w:r>
-        <w:t xml:space="preserve">(10), e2440969.</w:t>
-      </w:r>
-    </w:p>
-    <w:p>
-      <w:pPr>
-        <w:pStyle w:val="BodyJ"/>
-      </w:pPr>
-      <w:r>
-        <w:t xml:space="preserve">Graber, M. L., Franklin, N., &amp; Gordon, R. (2005). Diagnostic error in internal medicine. </w:t>
+        <w:t xml:space="preserve">Psychological Science in the Public Interest, 8</w:t>
+      </w:r>
+      <w:r>
+        <w:t xml:space="preserve">(2), 53–96.</w:t>
+      </w:r>
+    </w:p>
+    <w:p>
+      <w:pPr>
+        <w:pStyle w:val="BodyJ"/>
+      </w:pPr>
+      <w:r>
+        <w:t xml:space="preserve">Goddard, K., Roudsari, A., &amp; Wyatt, J. C. (2012). Automation bias: A systematic review of frequency, effect mediators, and mitigators. </w:t>
       </w:r>
       <w:r>
         <w:rPr>
           <w:i/>
           <w:iCs/>
         </w:rPr>
-        <w:t xml:space="preserve">Archives of Internal Medicine, 165</w:t>
-      </w:r>
-      <w:r>
-        <w:t xml:space="preserve">(13), 1493–1499.</w:t>
-      </w:r>
-    </w:p>
-    <w:p>
-      <w:pPr>
-        <w:pStyle w:val="BodyJ"/>
-      </w:pPr>
-      <w:r>
-        <w:t xml:space="preserve">Graber, M. L., Kissam, S., Payne, V. L., Meyer, A. N. D., Sorensen, A., Lenfestey, N., et al. (2012). Cognitive interventions to reduce diagnostic error: A narrative review. </w:t>
+        <w:t xml:space="preserve">Journal of the American Medical Informatics Association, 19</w:t>
+      </w:r>
+      <w:r>
+        <w:t xml:space="preserve">(1), 121–127.</w:t>
+      </w:r>
+    </w:p>
+    <w:p>
+      <w:pPr>
+        <w:pStyle w:val="BodyJ"/>
+      </w:pPr>
+      <w:r>
+        <w:t xml:space="preserve">Goh, E., Gallo, R., Hom, J., et al. (2024). Large language model influence on diagnostic reasoning: A randomized clinical trial. </w:t>
       </w:r>
       <w:r>
         <w:rPr>
           <w:i/>
           <w:iCs/>
         </w:rPr>
-        <w:t xml:space="preserve">BMJ Quality &amp; Safety, 21</w:t>
-      </w:r>
-      <w:r>
-        <w:t xml:space="preserve">(7), 535–557.</w:t>
-      </w:r>
-    </w:p>
-    <w:p>
-      <w:pPr>
-        <w:pStyle w:val="BodyJ"/>
-      </w:pPr>
-      <w:r>
-        <w:t xml:space="preserve">Gracia, D. (2001). La deliberación moral: El método de la ética clínica. </w:t>
+        <w:t xml:space="preserve">JAMA Network Open, 7</w:t>
+      </w:r>
+      <w:r>
+        <w:t xml:space="preserve">(10), e2440969.</w:t>
+      </w:r>
+    </w:p>
+    <w:p>
+      <w:pPr>
+        <w:pStyle w:val="BodyJ"/>
+      </w:pPr>
+      <w:r>
+        <w:t xml:space="preserve">Graber, M. L., Franklin, N., &amp; Gordon, R. (2005). Diagnostic error in internal medicine. </w:t>
       </w:r>
       <w:r>
         <w:rPr>
           <w:i/>
           <w:iCs/>
         </w:rPr>
-        <w:t xml:space="preserve">Medicina Clínica, 117</w:t>
-      </w:r>
-      <w:r>
-        <w:t xml:space="preserve">(1), 18–23.</w:t>
-      </w:r>
-    </w:p>
-    <w:p>
-      <w:pPr>
-        <w:pStyle w:val="BodyJ"/>
-      </w:pPr>
-      <w:r>
-        <w:t xml:space="preserve">Greenhalgh, T., &amp; Hurwitz, B. (Eds.). (1998). </w:t>
+        <w:t xml:space="preserve">Archives of Internal Medicine, 165</w:t>
+      </w:r>
+      <w:r>
+        <w:t xml:space="preserve">(13), 1493–1499.</w:t>
+      </w:r>
+    </w:p>
+    <w:p>
+      <w:pPr>
+        <w:pStyle w:val="BodyJ"/>
+      </w:pPr>
+      <w:r>
+        <w:t xml:space="preserve">Graber, M. L., Kissam, S., Payne, V. L., Meyer, A. N. D., Sorensen, A., Lenfestey, N., et al. (2012). Cognitive interventions to reduce diagnostic error: A narrative review. </w:t>
       </w:r>
       <w:r>
         <w:rPr>
           <w:i/>
           <w:iCs/>
         </w:rPr>
-        <w:t xml:space="preserve">Narrative Based Medicine: Dialogue and Discourse in Clinical Practice</w:t>
-      </w:r>
-      <w:r>
-        <w:t xml:space="preserve">. BMJ Books.</w:t>
-      </w:r>
-    </w:p>
-    <w:p>
-      <w:pPr>
-        <w:pStyle w:val="BodyJ"/>
-      </w:pPr>
-      <w:r>
-        <w:t xml:space="preserve">Greenhalgh, T., Howick, J., &amp; Maskrey, N. (2014). Evidence based medicine: A movement in crisis? </w:t>
+        <w:t xml:space="preserve">BMJ Quality &amp; Safety, 21</w:t>
+      </w:r>
+      <w:r>
+        <w:t xml:space="preserve">(7), 535–557.</w:t>
+      </w:r>
+    </w:p>
+    <w:p>
+      <w:pPr>
+        <w:pStyle w:val="BodyJ"/>
+      </w:pPr>
+      <w:r>
+        <w:t xml:space="preserve">Gracia, D. (2001). La deliberación moral: El método de la ética clínica. </w:t>
       </w:r>
       <w:r>
         <w:rPr>
           <w:i/>
           <w:iCs/>
         </w:rPr>
-        <w:t xml:space="preserve">BMJ, 348</w:t>
-      </w:r>
-      <w:r>
-        <w:t xml:space="preserve">, g3725.</w:t>
-      </w:r>
-    </w:p>
-    <w:p>
-      <w:pPr>
-        <w:pStyle w:val="BodyJ"/>
-      </w:pPr>
-      <w:r>
-        <w:t xml:space="preserve">Groopman, J. (2007). </w:t>
+        <w:t xml:space="preserve">Medicina Clínica, 117</w:t>
+      </w:r>
+      <w:r>
+        <w:t xml:space="preserve">(1), 18–23.</w:t>
+      </w:r>
+    </w:p>
+    <w:p>
+      <w:pPr>
+        <w:pStyle w:val="BodyJ"/>
+      </w:pPr>
+      <w:r>
+        <w:t xml:space="preserve">Greenhalgh, T., &amp; Hurwitz, B. (Eds.). (1998). </w:t>
       </w:r>
       <w:r>
         <w:rPr>
           <w:i/>
           <w:iCs/>
         </w:rPr>
-        <w:t xml:space="preserve">How Doctors Think</w:t>
-      </w:r>
-      <w:r>
-        <w:t xml:space="preserve">. Houghton Mifflin.</w:t>
-      </w:r>
-    </w:p>
-    <w:p>
-      <w:pPr>
-        <w:pStyle w:val="BodyJ"/>
-      </w:pPr>
-      <w:r>
-        <w:t xml:space="preserve">Han, P. K. J., Klein, W. M. P., &amp; Arora, N. K. (2011). Varieties of uncertainty in health care: A conceptual taxonomy. </w:t>
+        <w:t xml:space="preserve">Narrative Based Medicine: Dialogue and Discourse in Clinical Practice</w:t>
+      </w:r>
+      <w:r>
+        <w:t xml:space="preserve">. BMJ Books.</w:t>
+      </w:r>
+    </w:p>
+    <w:p>
+      <w:pPr>
+        <w:pStyle w:val="BodyJ"/>
+      </w:pPr>
+      <w:r>
+        <w:t xml:space="preserve">Greenhalgh, T., Howick, J., &amp; Maskrey, N. (2014). Evidence based medicine: A movement in crisis? </w:t>
       </w:r>
       <w:r>
         <w:rPr>
           <w:i/>
           <w:iCs/>
         </w:rPr>
-        <w:t xml:space="preserve">Medical Decision Making, 31</w:t>
-      </w:r>
-      <w:r>
-        <w:t xml:space="preserve">(6), 828–838.</w:t>
-      </w:r>
-    </w:p>
-    <w:p>
-      <w:pPr>
-        <w:pStyle w:val="BodyJ"/>
-      </w:pPr>
-      <w:r>
-        <w:t xml:space="preserve">Hernán, M. A., &amp; Robins, J. M. (2020). </w:t>
+        <w:t xml:space="preserve">BMJ, 348</w:t>
+      </w:r>
+      <w:r>
+        <w:t xml:space="preserve">, g3725.</w:t>
+      </w:r>
+    </w:p>
+    <w:p>
+      <w:pPr>
+        <w:pStyle w:val="BodyJ"/>
+      </w:pPr>
+      <w:r>
+        <w:t xml:space="preserve">Groopman, J. (2007). </w:t>
       </w:r>
       <w:r>
         <w:rPr>
           <w:i/>
           <w:iCs/>
         </w:rPr>
-        <w:t xml:space="preserve">Causal Inference: What If</w:t>
-      </w:r>
-      <w:r>
-        <w:t xml:space="preserve">. Chapman &amp; Hall/CRC.</w:t>
-      </w:r>
-    </w:p>
-    <w:p>
-      <w:pPr>
-        <w:pStyle w:val="BodyJ"/>
-      </w:pPr>
-      <w:r>
-        <w:t xml:space="preserve">Hernández, G., Bellomo, R., &amp; Bakker, J. (2019). The ten pitfalls of lactate clearance in sepsis. </w:t>
+        <w:t xml:space="preserve">How Doctors Think</w:t>
+      </w:r>
+      <w:r>
+        <w:t xml:space="preserve">. Houghton Mifflin.</w:t>
+      </w:r>
+    </w:p>
+    <w:p>
+      <w:pPr>
+        <w:pStyle w:val="BodyJ"/>
+      </w:pPr>
+      <w:r>
+        <w:t xml:space="preserve">Han, P. K. J., Klein, W. M. P., &amp; Arora, N. K. (2011). Varieties of uncertainty in health care: A conceptual taxonomy. </w:t>
       </w:r>
       <w:r>
         <w:rPr>
           <w:i/>
           <w:iCs/>
         </w:rPr>
-        <w:t xml:space="preserve">Intensive Care Medicine, 45</w:t>
-      </w:r>
-      <w:r>
-        <w:t xml:space="preserve">(1), 82–85.</w:t>
-      </w:r>
-    </w:p>
-    <w:p>
-      <w:pPr>
-        <w:pStyle w:val="BodyJ"/>
-      </w:pPr>
-      <w:r>
-        <w:t xml:space="preserve">Hernández, G., Ospina-Tascón, G. A., Damiani, L. P., Estenssoro, E., Dubin, A., Hurtado, J., et al. (2019). Effect of a resuscitation strategy targeting peripheral perfusion status vs serum lactate levels on 28-day mortality among patients with septic shock: The ANDROMEDA-SHOCK randomized clinical trial. </w:t>
+        <w:t xml:space="preserve">Medical Decision Making, 31</w:t>
+      </w:r>
+      <w:r>
+        <w:t xml:space="preserve">(6), 828–838.</w:t>
+      </w:r>
+    </w:p>
+    <w:p>
+      <w:pPr>
+        <w:pStyle w:val="BodyJ"/>
+      </w:pPr>
+      <w:r>
+        <w:t xml:space="preserve">Hernán, M. A., &amp; Robins, J. M. (2020). </w:t>
       </w:r>
       <w:r>
         <w:rPr>
           <w:i/>
           <w:iCs/>
         </w:rPr>
-        <w:t xml:space="preserve">JAMA, 321</w:t>
-      </w:r>
-      <w:r>
-        <w:t xml:space="preserve">(7), 654–664.</w:t>
-      </w:r>
-    </w:p>
-    <w:p>
-      <w:pPr>
-        <w:pStyle w:val="BodyJ"/>
-      </w:pPr>
-      <w:r>
-        <w:t xml:space="preserve">Hernández, G., Ospina-Tascón, G. A., Kattan, E., et al., por los investigadores de ANDROMEDA-SHOCK-2. (2025). Personalized hemodynamic resuscitation targeting capillary refill time in early septic shock: The ANDROMEDA-SHOCK-2 randomized clinical trial. </w:t>
+        <w:t xml:space="preserve">Causal Inference: What If</w:t>
+      </w:r>
+      <w:r>
+        <w:t xml:space="preserve">. Chapman &amp; Hall/CRC.</w:t>
+      </w:r>
+    </w:p>
+    <w:p>
+      <w:pPr>
+        <w:pStyle w:val="BodyJ"/>
+      </w:pPr>
+      <w:r>
+        <w:t xml:space="preserve">Hernández, G., Bellomo, R., &amp; Bakker, J. (2019). The ten pitfalls of lactate clearance in sepsis. </w:t>
       </w:r>
       <w:r>
         <w:rPr>
           <w:i/>
           <w:iCs/>
         </w:rPr>
-        <w:t xml:space="preserve">JAMA, 334</w:t>
-      </w:r>
-      <w:r>
-        <w:t xml:space="preserve">(22), 1988–1999.</w:t>
-      </w:r>
-    </w:p>
-    <w:p>
-      <w:pPr>
-        <w:pStyle w:val="BodyJ"/>
-      </w:pPr>
-      <w:r>
-        <w:t xml:space="preserve">Hoffrage, U., &amp; Gigerenzer, G. (1998). Using natural frequencies to improve diagnostic inferences. </w:t>
+        <w:t xml:space="preserve">Intensive Care Medicine, 45</w:t>
+      </w:r>
+      <w:r>
+        <w:t xml:space="preserve">(1), 82–85.</w:t>
+      </w:r>
+    </w:p>
+    <w:p>
+      <w:pPr>
+        <w:pStyle w:val="BodyJ"/>
+      </w:pPr>
+      <w:r>
+        <w:t xml:space="preserve">Hernández, G., Ospina-Tascón, G. A., Damiani, L. P., Estenssoro, E., Dubin, A., Hurtado, J., et al. (2019). Effect of a resuscitation strategy targeting peripheral perfusion status vs serum lactate levels on 28-day mortality among patients with septic shock: The ANDROMEDA-SHOCK randomized clinical trial. </w:t>
       </w:r>
       <w:r>
         <w:rPr>
           <w:i/>
           <w:iCs/>
         </w:rPr>
-        <w:t xml:space="preserve">Academic Medicine, 73</w:t>
-      </w:r>
-      <w:r>
-        <w:t xml:space="preserve">(5), 538–540.</w:t>
-      </w:r>
-    </w:p>
-    <w:p>
-      <w:pPr>
-        <w:pStyle w:val="BodyJ"/>
-      </w:pPr>
-      <w:r>
-        <w:t xml:space="preserve">Huidobro, V. (1916). </w:t>
+        <w:t xml:space="preserve">JAMA, 321</w:t>
+      </w:r>
+      <w:r>
+        <w:t xml:space="preserve">(7), 654–664.</w:t>
+      </w:r>
+    </w:p>
+    <w:p>
+      <w:pPr>
+        <w:pStyle w:val="BodyJ"/>
+      </w:pPr>
+      <w:r>
+        <w:t xml:space="preserve">Hernández, G., Ospina-Tascón, G. A., Kattan, E., et al., por los investigadores de ANDROMEDA-SHOCK-2. (2025). Personalized hemodynamic resuscitation targeting capillary refill time in early septic shock: The ANDROMEDA-SHOCK-2 randomized clinical trial. </w:t>
       </w:r>
       <w:r>
         <w:rPr>
           <w:i/>
           <w:iCs/>
         </w:rPr>
-        <w:t xml:space="preserve">El espejo de agua</w:t>
-      </w:r>
-      <w:r>
-        <w:t xml:space="preserve">. Orión.</w:t>
-      </w:r>
-    </w:p>
-    <w:p>
-      <w:pPr>
-        <w:pStyle w:val="BodyJ"/>
-      </w:pPr>
-      <w:r>
-        <w:t xml:space="preserve">Hunter, K. M. (1991). </w:t>
+        <w:t xml:space="preserve">JAMA, 334</w:t>
+      </w:r>
+      <w:r>
+        <w:t xml:space="preserve">(22), 1988–1999.</w:t>
+      </w:r>
+    </w:p>
+    <w:p>
+      <w:pPr>
+        <w:pStyle w:val="BodyJ"/>
+      </w:pPr>
+      <w:r>
+        <w:t xml:space="preserve">Hoffrage, U., &amp; Gigerenzer, G. (1998). Using natural frequencies to improve diagnostic inferences. </w:t>
       </w:r>
       <w:r>
         <w:rPr>
           <w:i/>
           <w:iCs/>
         </w:rPr>
-        <w:t xml:space="preserve">Doctors' Stories: The Narrative Structure of Medical Knowledge</w:t>
-      </w:r>
-      <w:r>
-        <w:t xml:space="preserve">. Princeton University Press.</w:t>
-      </w:r>
-    </w:p>
-    <w:p>
-      <w:pPr>
-        <w:pStyle w:val="BodyJ"/>
-      </w:pPr>
-      <w:r>
-        <w:t xml:space="preserve">Hutchins, E. (1995). </w:t>
+        <w:t xml:space="preserve">Academic Medicine, 73</w:t>
+      </w:r>
+      <w:r>
+        <w:t xml:space="preserve">(5), 538–540.</w:t>
+      </w:r>
+    </w:p>
+    <w:p>
+      <w:pPr>
+        <w:pStyle w:val="BodyJ"/>
+      </w:pPr>
+      <w:r>
+        <w:t xml:space="preserve">Huidobro, V. (1916). </w:t>
       </w:r>
       <w:r>
         <w:rPr>
           <w:i/>
           <w:iCs/>
         </w:rPr>
-        <w:t xml:space="preserve">Cognition in the Wild</w:t>
-      </w:r>
-      <w:r>
-        <w:t xml:space="preserve">. MIT Press.</w:t>
-      </w:r>
-    </w:p>
-    <w:p>
-      <w:pPr>
-        <w:pStyle w:val="BodyJ"/>
-      </w:pPr>
-      <w:r>
-        <w:t xml:space="preserve">Hyland, K. (1998). </w:t>
+        <w:t xml:space="preserve">El espejo de agua</w:t>
+      </w:r>
+      <w:r>
+        <w:t xml:space="preserve">. Orión.</w:t>
+      </w:r>
+    </w:p>
+    <w:p>
+      <w:pPr>
+        <w:pStyle w:val="BodyJ"/>
+      </w:pPr>
+      <w:r>
+        <w:t xml:space="preserve">Hunter, K. M. (1991). </w:t>
       </w:r>
       <w:r>
         <w:rPr>
           <w:i/>
           <w:iCs/>
         </w:rPr>
-        <w:t xml:space="preserve">Hedging in Scientific Research Articles</w:t>
-      </w:r>
-      <w:r>
-        <w:t xml:space="preserve">. John Benjamins.</w:t>
-      </w:r>
-    </w:p>
-    <w:p>
-      <w:pPr>
-        <w:pStyle w:val="BodyJ"/>
-      </w:pPr>
-      <w:r>
-        <w:t xml:space="preserve">Ji, Z., Lee, N., Frieske, R., Yu, T., Su, D., Xu, Y., et al. (2023). Survey of hallucination in natural language generation. </w:t>
+        <w:t xml:space="preserve">Doctors' Stories: The Narrative Structure of Medical Knowledge</w:t>
+      </w:r>
+      <w:r>
+        <w:t xml:space="preserve">. Princeton University Press.</w:t>
+      </w:r>
+    </w:p>
+    <w:p>
+      <w:pPr>
+        <w:pStyle w:val="BodyJ"/>
+      </w:pPr>
+      <w:r>
+        <w:t xml:space="preserve">Hutchins, E. (1995). </w:t>
       </w:r>
       <w:r>
         <w:rPr>
           <w:i/>
           <w:iCs/>
         </w:rPr>
-        <w:t xml:space="preserve">ACM Computing Surveys, 55</w:t>
-      </w:r>
-      <w:r>
-        <w:t xml:space="preserve">(12), Article 248.</w:t>
-      </w:r>
-    </w:p>
-    <w:p>
-      <w:pPr>
-        <w:pStyle w:val="BodyJ"/>
-      </w:pPr>
-      <w:r>
-        <w:t xml:space="preserve">Jonsen, A. R., Siegler, M., &amp; Winslade, W. J. (2022). </w:t>
+        <w:t xml:space="preserve">Cognition in the Wild</w:t>
+      </w:r>
+      <w:r>
+        <w:t xml:space="preserve">. MIT Press.</w:t>
+      </w:r>
+    </w:p>
+    <w:p>
+      <w:pPr>
+        <w:pStyle w:val="BodyJ"/>
+      </w:pPr>
+      <w:r>
+        <w:t xml:space="preserve">Hyland, K. (1998). </w:t>
       </w:r>
       <w:r>
         <w:rPr>
           <w:i/>
           <w:iCs/>
         </w:rPr>
-        <w:t xml:space="preserve">Clinical Ethics: A Practical Approach to Ethical Decisions in Clinical Medicine</w:t>
-      </w:r>
-      <w:r>
-        <w:t xml:space="preserve"> (9.ª ed.). McGraw-Hill. (1.ª ed., 1982).</w:t>
-      </w:r>
-    </w:p>
-    <w:p>
-      <w:pPr>
-        <w:pStyle w:val="BodyJ"/>
-      </w:pPr>
-      <w:r>
-        <w:t xml:space="preserve">Jonsen, A. R., &amp; Toulmin, S. (1988). </w:t>
+        <w:t xml:space="preserve">Hedging in Scientific Research Articles</w:t>
+      </w:r>
+      <w:r>
+        <w:t xml:space="preserve">. John Benjamins.</w:t>
+      </w:r>
+    </w:p>
+    <w:p>
+      <w:pPr>
+        <w:pStyle w:val="BodyJ"/>
+      </w:pPr>
+      <w:r>
+        <w:t xml:space="preserve">Ji, Z., Lee, N., Frieske, R., Yu, T., Su, D., Xu, Y., et al. (2023). Survey of hallucination in natural language generation. </w:t>
       </w:r>
       <w:r>
         <w:rPr>
           <w:i/>
           <w:iCs/>
         </w:rPr>
-        <w:t xml:space="preserve">The Abuse of Casuistry: A History of Moral Reasoning</w:t>
-      </w:r>
-      <w:r>
-        <w:t xml:space="preserve">. University of California Press.</w:t>
-      </w:r>
-    </w:p>
-    <w:p>
-      <w:pPr>
-        <w:pStyle w:val="BodyJ"/>
-      </w:pPr>
-      <w:r>
-        <w:t xml:space="preserve">Kadavath, S., Conerly, T., Askell, A., Henighan, T., Drain, D., Perez, E., et al. (2022). Language models (mostly) know what they know. </w:t>
+        <w:t xml:space="preserve">ACM Computing Surveys, 55</w:t>
+      </w:r>
+      <w:r>
+        <w:t xml:space="preserve">(12), Article 248.</w:t>
+      </w:r>
+    </w:p>
+    <w:p>
+      <w:pPr>
+        <w:pStyle w:val="BodyJ"/>
+      </w:pPr>
+      <w:r>
+        <w:t xml:space="preserve">Jonsen, A. R., Siegler, M., &amp; Winslade, W. J. (2022). </w:t>
       </w:r>
       <w:r>
         <w:rPr>
           <w:i/>
           <w:iCs/>
         </w:rPr>
-        <w:t xml:space="preserve">arXiv preprint</w:t>
-      </w:r>
-      <w:r>
-        <w:t xml:space="preserve">, arXiv:2207.05221.</w:t>
-      </w:r>
-    </w:p>
-    <w:p>
-      <w:pPr>
-        <w:pStyle w:val="BodyJ"/>
-      </w:pPr>
-      <w:r>
-        <w:t xml:space="preserve">Kahneman, D. (2011). </w:t>
+        <w:t xml:space="preserve">Clinical Ethics: A Practical Approach to Ethical Decisions in Clinical Medicine</w:t>
+      </w:r>
+      <w:r>
+        <w:t xml:space="preserve"> (9.ª ed.). McGraw-Hill. (1.ª ed., 1982).</w:t>
+      </w:r>
+    </w:p>
+    <w:p>
+      <w:pPr>
+        <w:pStyle w:val="BodyJ"/>
+      </w:pPr>
+      <w:r>
+        <w:t xml:space="preserve">Jonsen, A. R., &amp; Toulmin, S. (1988). </w:t>
       </w:r>
       <w:r>
         <w:rPr>
           <w:i/>
           <w:iCs/>
         </w:rPr>
-        <w:t xml:space="preserve">Thinking, Fast and Slow</w:t>
-      </w:r>
-      <w:r>
-        <w:t xml:space="preserve">. Farrar, Straus and Giroux.</w:t>
-      </w:r>
-    </w:p>
-    <w:p>
-      <w:pPr>
-        <w:pStyle w:val="BodyJ"/>
-      </w:pPr>
-      <w:r>
-        <w:t xml:space="preserve">Kahneman, D., &amp; Klein, G. (2009). Conditions for intuitive expertise: A failure to disagree. </w:t>
+        <w:t xml:space="preserve">The Abuse of Casuistry: A History of Moral Reasoning</w:t>
+      </w:r>
+      <w:r>
+        <w:t xml:space="preserve">. University of California Press.</w:t>
+      </w:r>
+    </w:p>
+    <w:p>
+      <w:pPr>
+        <w:pStyle w:val="BodyJ"/>
+      </w:pPr>
+      <w:r>
+        <w:t xml:space="preserve">Kadavath, S., Conerly, T., Askell, A., Henighan, T., Drain, D., Perez, E., et al. (2022). Language models (mostly) know what they know. </w:t>
       </w:r>
       <w:r>
         <w:rPr>
           <w:i/>
           <w:iCs/>
         </w:rPr>
-        <w:t xml:space="preserve">American Psychologist, 64</w:t>
-      </w:r>
-      <w:r>
-        <w:t xml:space="preserve">(6), 515–526.</w:t>
-      </w:r>
-    </w:p>
-    <w:p>
-      <w:pPr>
-        <w:pStyle w:val="BodyJ"/>
-      </w:pPr>
-      <w:r>
-        <w:t xml:space="preserve">Kassirer, J. P. (1989). Our stubborn quest for diagnostic certainty. </w:t>
+        <w:t xml:space="preserve">arXiv preprint</w:t>
+      </w:r>
+      <w:r>
+        <w:t xml:space="preserve">, arXiv:2207.05221.</w:t>
+      </w:r>
+    </w:p>
+    <w:p>
+      <w:pPr>
+        <w:pStyle w:val="BodyJ"/>
+      </w:pPr>
+      <w:r>
+        <w:t xml:space="preserve">Kahneman, D. (2011). </w:t>
       </w:r>
       <w:r>
         <w:rPr>
           <w:i/>
           <w:iCs/>
         </w:rPr>
-        <w:t xml:space="preserve">New England Journal of Medicine, 320</w:t>
-      </w:r>
-      <w:r>
-        <w:t xml:space="preserve">(22), 1489–1491.</w:t>
-      </w:r>
-    </w:p>
-    <w:p>
-      <w:pPr>
-        <w:pStyle w:val="BodyJ"/>
-      </w:pPr>
-      <w:r>
-        <w:t xml:space="preserve">Kidd, I. J., &amp; Carel, H. (2017). Epistemic injustice and illness. </w:t>
+        <w:t xml:space="preserve">Thinking, Fast and Slow</w:t>
+      </w:r>
+      <w:r>
+        <w:t xml:space="preserve">. Farrar, Straus and Giroux.</w:t>
+      </w:r>
+    </w:p>
+    <w:p>
+      <w:pPr>
+        <w:pStyle w:val="BodyJ"/>
+      </w:pPr>
+      <w:r>
+        <w:t xml:space="preserve">Kahneman, D., &amp; Klein, G. (2009). Conditions for intuitive expertise: A failure to disagree. </w:t>
       </w:r>
       <w:r>
         <w:rPr>
           <w:i/>
           <w:iCs/>
         </w:rPr>
-        <w:t xml:space="preserve">Journal of Applied Philosophy, 34</w:t>
-      </w:r>
-      <w:r>
-        <w:t xml:space="preserve">(2), 172–190.</w:t>
-      </w:r>
-    </w:p>
-    <w:p>
-      <w:pPr>
-        <w:pStyle w:val="BodyJ"/>
-      </w:pPr>
-      <w:r>
-        <w:t xml:space="preserve">Kline, J. A., Mitchell, A. M., Kabrhel, C., Richman, P. B., &amp; Courtney, D. M. (2004). Clinical criteria to prevent unnecessary diagnostic testing in emergency department patients with suspected pulmonary embolism. </w:t>
+        <w:t xml:space="preserve">American Psychologist, 64</w:t>
+      </w:r>
+      <w:r>
+        <w:t xml:space="preserve">(6), 515–526.</w:t>
+      </w:r>
+    </w:p>
+    <w:p>
+      <w:pPr>
+        <w:pStyle w:val="BodyJ"/>
+      </w:pPr>
+      <w:r>
+        <w:t xml:space="preserve">Kassirer, J. P. (1989). Our stubborn quest for diagnostic certainty. </w:t>
       </w:r>
       <w:r>
         <w:rPr>
           <w:i/>
           <w:iCs/>
         </w:rPr>
-        <w:t xml:space="preserve">Journal of Thrombosis and Haemostasis, 2</w:t>
-      </w:r>
-      <w:r>
-        <w:t xml:space="preserve">(8), 1247–1255.</w:t>
-      </w:r>
-    </w:p>
-    <w:p>
-      <w:pPr>
-        <w:pStyle w:val="BodyJ"/>
-      </w:pPr>
-      <w:r>
-        <w:t xml:space="preserve">Knight, F. H. (1921). </w:t>
+        <w:t xml:space="preserve">New England Journal of Medicine, 320</w:t>
+      </w:r>
+      <w:r>
+        <w:t xml:space="preserve">(22), 1489–1491.</w:t>
+      </w:r>
+    </w:p>
+    <w:p>
+      <w:pPr>
+        <w:pStyle w:val="BodyJ"/>
+      </w:pPr>
+      <w:r>
+        <w:t xml:space="preserve">Kidd, I. J., &amp; Carel, H. (2017). Epistemic injustice and illness. </w:t>
       </w:r>
       <w:r>
         <w:rPr>
           <w:i/>
           <w:iCs/>
         </w:rPr>
-        <w:t xml:space="preserve">Risk, Uncertainty and Profit</w:t>
-      </w:r>
-      <w:r>
-        <w:t xml:space="preserve">. Houghton Mifflin.</w:t>
-      </w:r>
-    </w:p>
-    <w:p>
-      <w:pPr>
-        <w:pStyle w:val="BodyJ"/>
-      </w:pPr>
-      <w:r>
-        <w:t xml:space="preserve">Koriat, A. (1997). Monitoring one's own knowledge during study: A cue-utilization approach to judgments of learning. </w:t>
+        <w:t xml:space="preserve">Journal of Applied Philosophy, 34</w:t>
+      </w:r>
+      <w:r>
+        <w:t xml:space="preserve">(2), 172–190.</w:t>
+      </w:r>
+    </w:p>
+    <w:p>
+      <w:pPr>
+        <w:pStyle w:val="BodyJ"/>
+      </w:pPr>
+      <w:r>
+        <w:t xml:space="preserve">Kline, J. A., Mitchell, A. M., Kabrhel, C., Richman, P. B., &amp; Courtney, D. M. (2004). Clinical criteria to prevent unnecessary diagnostic testing in emergency department patients with suspected pulmonary embolism. </w:t>
       </w:r>
       <w:r>
         <w:rPr>
           <w:i/>
           <w:iCs/>
         </w:rPr>
-        <w:t xml:space="preserve">Journal of Experimental Psychology: General, 126</w:t>
-      </w:r>
-      <w:r>
-        <w:t xml:space="preserve">(4), 349–370.</w:t>
-      </w:r>
-    </w:p>
-    <w:p>
-      <w:pPr>
-        <w:pStyle w:val="BodyJ"/>
-      </w:pPr>
-      <w:r>
-        <w:t xml:space="preserve">Lackey, J. (2008). </w:t>
+        <w:t xml:space="preserve">Journal of Thrombosis and Haemostasis, 2</w:t>
+      </w:r>
+      <w:r>
+        <w:t xml:space="preserve">(8), 1247–1255.</w:t>
+      </w:r>
+    </w:p>
+    <w:p>
+      <w:pPr>
+        <w:pStyle w:val="BodyJ"/>
+      </w:pPr>
+      <w:r>
+        <w:t xml:space="preserve">Knight, F. H. (1921). </w:t>
       </w:r>
       <w:r>
         <w:rPr>
           <w:i/>
           <w:iCs/>
         </w:rPr>
-        <w:t xml:space="preserve">Learning from Words: Testimony as a Source of Knowledge</w:t>
-      </w:r>
-      <w:r>
-        <w:t xml:space="preserve">. Oxford University Press.</w:t>
-      </w:r>
-    </w:p>
-    <w:p>
-      <w:pPr>
-        <w:pStyle w:val="BodyJ"/>
-      </w:pPr>
-      <w:r>
-        <w:t xml:space="preserve">Lambe, K. A., O'Reilly, G., Kelly, B. D., &amp; Curristan, S. (2016). Dual-process cognitive interventions to enhance diagnostic reasoning: A systematic review. </w:t>
+        <w:t xml:space="preserve">Risk, Uncertainty and Profit</w:t>
+      </w:r>
+      <w:r>
+        <w:t xml:space="preserve">. Houghton Mifflin.</w:t>
+      </w:r>
+    </w:p>
+    <w:p>
+      <w:pPr>
+        <w:pStyle w:val="BodyJ"/>
+      </w:pPr>
+      <w:r>
+        <w:t xml:space="preserve">Koriat, A. (1997). Monitoring one's own knowledge during study: A cue-utilization approach to judgments of learning. </w:t>
       </w:r>
       <w:r>
         <w:rPr>
           <w:i/>
           <w:iCs/>
         </w:rPr>
-        <w:t xml:space="preserve">BMJ Quality &amp; Safety, 25</w:t>
-      </w:r>
-      <w:r>
-        <w:t xml:space="preserve">(10), 808–820.</w:t>
-      </w:r>
-    </w:p>
-    <w:p>
-      <w:pPr>
-        <w:pStyle w:val="BodyJ"/>
-      </w:pPr>
-      <w:r>
-        <w:t xml:space="preserve">Lee, P., Bubeck, S., &amp; Petro, J. (2023). Benefits, limits, and risks of GPT-4 as an AI chatbot for medicine. </w:t>
+        <w:t xml:space="preserve">Journal of Experimental Psychology: General, 126</w:t>
+      </w:r>
+      <w:r>
+        <w:t xml:space="preserve">(4), 349–370.</w:t>
+      </w:r>
+    </w:p>
+    <w:p>
+      <w:pPr>
+        <w:pStyle w:val="BodyJ"/>
+      </w:pPr>
+      <w:r>
+        <w:t xml:space="preserve">Lackey, J. (2008). </w:t>
       </w:r>
       <w:r>
         <w:rPr>
           <w:i/>
           <w:iCs/>
         </w:rPr>
-        <w:t xml:space="preserve">New England Journal of Medicine, 388</w:t>
-      </w:r>
-      <w:r>
-        <w:t xml:space="preserve">, 1233–1239.</w:t>
-      </w:r>
-    </w:p>
-    <w:p>
-      <w:pPr>
-        <w:pStyle w:val="BodyJ"/>
-      </w:pPr>
-      <w:r>
-        <w:t xml:space="preserve">Lifshitz, A. (2014). </w:t>
+        <w:t xml:space="preserve">Learning from Words: Testimony as a Source of Knowledge</w:t>
+      </w:r>
+      <w:r>
+        <w:t xml:space="preserve">. Oxford University Press.</w:t>
+      </w:r>
+    </w:p>
+    <w:p>
+      <w:pPr>
+        <w:pStyle w:val="BodyJ"/>
+      </w:pPr>
+      <w:r>
+        <w:t xml:space="preserve">Lambe, K. A., O'Reilly, G., Kelly, B. D., &amp; Curristan, S. (2016). Dual-process cognitive interventions to enhance diagnostic reasoning: A systematic review. </w:t>
       </w:r>
       <w:r>
         <w:rPr>
           <w:i/>
           <w:iCs/>
         </w:rPr>
-        <w:t xml:space="preserve">La nueva clínica</w:t>
-      </w:r>
-      <w:r>
-        <w:t xml:space="preserve">. Academia Nacional de Medicina de México.</w:t>
-      </w:r>
-    </w:p>
-    <w:p>
-      <w:pPr>
-        <w:pStyle w:val="BodyJ"/>
-      </w:pPr>
-      <w:r>
-        <w:t xml:space="preserve">Mamede, S., Schmidt, H. G., &amp; Penaforte, J. C. (2008). Effects of reflective practice on the accuracy of medical diagnoses. </w:t>
+        <w:t xml:space="preserve">BMJ Quality &amp; Safety, 25</w:t>
+      </w:r>
+      <w:r>
+        <w:t xml:space="preserve">(10), 808–820.</w:t>
+      </w:r>
+    </w:p>
+    <w:p>
+      <w:pPr>
+        <w:pStyle w:val="BodyJ"/>
+      </w:pPr>
+      <w:r>
+        <w:t xml:space="preserve">Landrigan, C. P., Rothschild, J. M., Cronin, J. W., Kaushal, R., Burdick, E., Katz, J. T., Lilly, C. M., Stone, P. H., Lockley, S. W., Bates, D. W., &amp; Czeisler, C. A. (2004). Effect of reducing interns' work hours on serious medical errors in intensive care units. </w:t>
       </w:r>
       <w:r>
         <w:rPr>
           <w:i/>
           <w:iCs/>
         </w:rPr>
-        <w:t xml:space="preserve">Medical Education, 42</w:t>
-      </w:r>
-      <w:r>
-        <w:t xml:space="preserve">(5), 468–475.</w:t>
-      </w:r>
-    </w:p>
-    <w:p>
-      <w:pPr>
-        <w:pStyle w:val="BodyJ"/>
-      </w:pPr>
-      <w:r>
-        <w:t xml:space="preserve">Mamede, S., van Gog, T., van den Berge, K., Rikers, R. M. J. P., van Saase, J. L. C. M., van Guldener, C., &amp; Schmidt, H. G. (2010). Effect of availability bias and reflective reasoning on diagnostic accuracy among internal medicine residents. </w:t>
+        <w:t xml:space="preserve">New England Journal of Medicine, 351</w:t>
+      </w:r>
+      <w:r>
+        <w:t xml:space="preserve">(18), 1838–1848.</w:t>
+      </w:r>
+    </w:p>
+    <w:p>
+      <w:pPr>
+        <w:pStyle w:val="BodyJ"/>
+      </w:pPr>
+      <w:r>
+        <w:t xml:space="preserve">Lee, P., Bubeck, S., &amp; Petro, J. (2023). Benefits, limits, and risks of GPT-4 as an AI chatbot for medicine. </w:t>
       </w:r>
       <w:r>
         <w:rPr>
           <w:i/>
           <w:iCs/>
         </w:rPr>
-        <w:t xml:space="preserve">JAMA, 304</w:t>
-      </w:r>
-      <w:r>
-        <w:t xml:space="preserve">(11), 1198–1203.</w:t>
-      </w:r>
-    </w:p>
-    <w:p>
-      <w:pPr>
-        <w:pStyle w:val="BodyJ"/>
-      </w:pPr>
-      <w:r>
-        <w:t xml:space="preserve">Maniscalco, B., &amp; Lau, H. (2012). A signal detection theoretic approach for estimating metacognitive sensitivity from confidence ratings. </w:t>
+        <w:t xml:space="preserve">New England Journal of Medicine, 388</w:t>
+      </w:r>
+      <w:r>
+        <w:t xml:space="preserve">, 1233–1239.</w:t>
+      </w:r>
+    </w:p>
+    <w:p>
+      <w:pPr>
+        <w:pStyle w:val="BodyJ"/>
+      </w:pPr>
+      <w:r>
+        <w:t xml:space="preserve">Lifshitz, A. (2014). </w:t>
       </w:r>
       <w:r>
         <w:rPr>
           <w:i/>
           <w:iCs/>
         </w:rPr>
-        <w:t xml:space="preserve">Consciousness and Cognition, 21</w:t>
-      </w:r>
-      <w:r>
-        <w:t xml:space="preserve">(1), 422–430.</w:t>
-      </w:r>
-    </w:p>
-    <w:p>
-      <w:pPr>
-        <w:pStyle w:val="BodyJ"/>
-      </w:pPr>
-      <w:r>
-        <w:t xml:space="preserve">Mann, K., Gordon, J., &amp; MacLeod, A. (2009). Reflection and reflective practice in health professions education: A systematic review. </w:t>
+        <w:t xml:space="preserve">La nueva clínica</w:t>
+      </w:r>
+      <w:r>
+        <w:t xml:space="preserve">. Academia Nacional de Medicina de México.</w:t>
+      </w:r>
+    </w:p>
+    <w:p>
+      <w:pPr>
+        <w:pStyle w:val="BodyJ"/>
+      </w:pPr>
+      <w:r>
+        <w:t xml:space="preserve">Linder, J. A., Doctor, J. N., Friedberg, M. W., Reyes Nieva, H., Birks, C., Meeker, D., &amp; Fox, C. R. (2014). Time of day and the decision to prescribe antibiotics. </w:t>
       </w:r>
       <w:r>
         <w:rPr>
           <w:i/>
           <w:iCs/>
         </w:rPr>
-        <w:t xml:space="preserve">Advances in Health Sciences Education, 14</w:t>
-      </w:r>
-      <w:r>
-        <w:t xml:space="preserve">(4), 595–621.</w:t>
-      </w:r>
-    </w:p>
-    <w:p>
-      <w:pPr>
-        <w:pStyle w:val="BodyJ"/>
-      </w:pPr>
-      <w:r>
-        <w:t xml:space="preserve">McCoy, L. G., Manrai, A. K., &amp; Rodman, A. (2024). Large language models and the degradation of the medical record. </w:t>
+        <w:t xml:space="preserve">JAMA Internal Medicine, 174</w:t>
+      </w:r>
+      <w:r>
+        <w:t xml:space="preserve">(12), 2029–2031.</w:t>
+      </w:r>
+    </w:p>
+    <w:p>
+      <w:pPr>
+        <w:pStyle w:val="BodyJ"/>
+      </w:pPr>
+      <w:r>
+        <w:t xml:space="preserve">Mamede, S., Schmidt, H. G., &amp; Penaforte, J. C. (2008). Effects of reflective practice on the accuracy of medical diagnoses. </w:t>
       </w:r>
       <w:r>
         <w:rPr>
           <w:i/>
           <w:iCs/>
         </w:rPr>
-        <w:t xml:space="preserve">New England Journal of Medicine, 391</w:t>
-      </w:r>
-      <w:r>
-        <w:t xml:space="preserve">(17), 1561–1564.</w:t>
-      </w:r>
-    </w:p>
-    <w:p>
-      <w:pPr>
-        <w:pStyle w:val="BodyJ"/>
-      </w:pPr>
-      <w:r>
-        <w:t xml:space="preserve">Meyer, A. N. D., Payne, V. L., Meeks, D. W., Rao, R., &amp; Singh, H. (2013). Physicians' diagnostic accuracy, confidence, and resource requests: A vignette study. </w:t>
+        <w:t xml:space="preserve">Medical Education, 42</w:t>
+      </w:r>
+      <w:r>
+        <w:t xml:space="preserve">(5), 468–475.</w:t>
+      </w:r>
+    </w:p>
+    <w:p>
+      <w:pPr>
+        <w:pStyle w:val="BodyJ"/>
+      </w:pPr>
+      <w:r>
+        <w:t xml:space="preserve">Mamede, S., van Gog, T., van den Berge, K., Rikers, R. M. J. P., van Saase, J. L. C. M., van Guldener, C., &amp; Schmidt, H. G. (2010). Effect of availability bias and reflective reasoning on diagnostic accuracy among internal medicine residents. </w:t>
       </w:r>
       <w:r>
         <w:rPr>
           <w:i/>
           <w:iCs/>
         </w:rPr>
-        <w:t xml:space="preserve">JAMA Internal Medicine, 173</w:t>
-      </w:r>
-      <w:r>
-        <w:t xml:space="preserve">(21), 1952–1958.</w:t>
-      </w:r>
-    </w:p>
-    <w:p>
-      <w:pPr>
-        <w:pStyle w:val="BodyJ"/>
-      </w:pPr>
-      <w:r>
-        <w:t xml:space="preserve">Monteiro, S., &amp; Norman, G. (2013). Diagnostic reasoning: Where we've been, where we're going. </w:t>
+        <w:t xml:space="preserve">JAMA, 304</w:t>
+      </w:r>
+      <w:r>
+        <w:t xml:space="preserve">(11), 1198–1203.</w:t>
+      </w:r>
+    </w:p>
+    <w:p>
+      <w:pPr>
+        <w:pStyle w:val="BodyJ"/>
+      </w:pPr>
+      <w:r>
+        <w:t xml:space="preserve">Maniscalco, B., &amp; Lau, H. (2012). A signal detection theoretic approach for estimating metacognitive sensitivity from confidence ratings. </w:t>
       </w:r>
       <w:r>
         <w:rPr>
           <w:i/>
           <w:iCs/>
         </w:rPr>
-        <w:t xml:space="preserve">Teaching and Learning in Medicine, 25</w:t>
-      </w:r>
-      <w:r>
-        <w:t xml:space="preserve">(Suppl 1), S26–S32.</w:t>
-      </w:r>
-    </w:p>
-    <w:p>
-      <w:pPr>
-        <w:pStyle w:val="BodyJ"/>
-      </w:pPr>
-      <w:r>
-        <w:t xml:space="preserve">Monteiro, S., Sherbino, J., Sibbald, M., &amp; Norman, G. (2020). Critical thinking, biases and dual processing: The enduring myth of generalisable skills. </w:t>
+        <w:t xml:space="preserve">Consciousness and Cognition, 21</w:t>
+      </w:r>
+      <w:r>
+        <w:t xml:space="preserve">(1), 422–430.</w:t>
+      </w:r>
+    </w:p>
+    <w:p>
+      <w:pPr>
+        <w:pStyle w:val="BodyJ"/>
+      </w:pPr>
+      <w:r>
+        <w:t xml:space="preserve">Mann, K., Gordon, J., &amp; MacLeod, A. (2009). Reflection and reflective practice in health professions education: A systematic review. </w:t>
       </w:r>
       <w:r>
         <w:rPr>
           <w:i/>
           <w:iCs/>
         </w:rPr>
-        <w:t xml:space="preserve">Medical Education, 54</w:t>
-      </w:r>
-      <w:r>
-        <w:t xml:space="preserve">(1), 66–73.</w:t>
-      </w:r>
-    </w:p>
-    <w:p>
-      <w:pPr>
-        <w:pStyle w:val="BodyJ"/>
-      </w:pPr>
-      <w:r>
-        <w:t xml:space="preserve">Montgomery, K. (2006). </w:t>
+        <w:t xml:space="preserve">Advances in Health Sciences Education, 14</w:t>
+      </w:r>
+      <w:r>
+        <w:t xml:space="preserve">(4), 595–621.</w:t>
+      </w:r>
+    </w:p>
+    <w:p>
+      <w:pPr>
+        <w:pStyle w:val="BodyJ"/>
+      </w:pPr>
+      <w:r>
+        <w:t xml:space="preserve">McCoy, L. G., Manrai, A. K., &amp; Rodman, A. (2024). Large language models and the degradation of the medical record. </w:t>
       </w:r>
       <w:r>
         <w:rPr>
           <w:i/>
           <w:iCs/>
         </w:rPr>
-        <w:t xml:space="preserve">How Doctors Think: Clinical Judgment and the Practice of Medicine</w:t>
-      </w:r>
-      <w:r>
-        <w:t xml:space="preserve">. Oxford University Press.</w:t>
-      </w:r>
-    </w:p>
-    <w:p>
-      <w:pPr>
-        <w:pStyle w:val="BodyJ"/>
-      </w:pPr>
-      <w:r>
-        <w:t xml:space="preserve">Moulton, C.-A. E., Regehr, G., Mylopoulos, M., &amp; MacRae, H. M. (2007). Slowing down when you should: A new model of expert judgment. </w:t>
+        <w:t xml:space="preserve">New England Journal of Medicine, 391</w:t>
+      </w:r>
+      <w:r>
+        <w:t xml:space="preserve">(17), 1561–1564.</w:t>
+      </w:r>
+    </w:p>
+    <w:p>
+      <w:pPr>
+        <w:pStyle w:val="BodyJ"/>
+      </w:pPr>
+      <w:r>
+        <w:t xml:space="preserve">Meyer, A. N. D., Payne, V. L., Meeks, D. W., Rao, R., &amp; Singh, H. (2013). Physicians' diagnostic accuracy, confidence, and resource requests: A vignette study. </w:t>
       </w:r>
       <w:r>
         <w:rPr>
           <w:i/>
           <w:iCs/>
         </w:rPr>
-        <w:t xml:space="preserve">Academic Medicine, 82</w:t>
-      </w:r>
-      <w:r>
-        <w:t xml:space="preserve">(10 Suppl), S109–S116.</w:t>
-      </w:r>
-    </w:p>
-    <w:p>
-      <w:pPr>
-        <w:pStyle w:val="BodyJ"/>
-      </w:pPr>
-      <w:r>
-        <w:t xml:space="preserve">National Academies of Sciences, Engineering, and Medicine. (2015). </w:t>
+        <w:t xml:space="preserve">JAMA Internal Medicine, 173</w:t>
+      </w:r>
+      <w:r>
+        <w:t xml:space="preserve">(21), 1952–1958.</w:t>
+      </w:r>
+    </w:p>
+    <w:p>
+      <w:pPr>
+        <w:pStyle w:val="BodyJ"/>
+      </w:pPr>
+      <w:r>
+        <w:t xml:space="preserve">Monteiro, S., &amp; Norman, G. (2013). Diagnostic reasoning: Where we've been, where we're going. </w:t>
       </w:r>
       <w:r>
         <w:rPr>
           <w:i/>
           <w:iCs/>
         </w:rPr>
-        <w:t xml:space="preserve">Improving Diagnosis in Health Care</w:t>
-      </w:r>
-      <w:r>
-        <w:t xml:space="preserve">. The National Academies Press.</w:t>
-      </w:r>
-    </w:p>
-    <w:p>
-      <w:pPr>
-        <w:pStyle w:val="BodyJ"/>
-      </w:pPr>
-      <w:r>
-        <w:t xml:space="preserve">Nelson, T. O., &amp; Narens, L. (1990). Metamemory: A theoretical framework and new findings. In G. H. Bower (Ed.), </w:t>
+        <w:t xml:space="preserve">Teaching and Learning in Medicine, 25</w:t>
+      </w:r>
+      <w:r>
+        <w:t xml:space="preserve">(Suppl 1), S26–S32.</w:t>
+      </w:r>
+    </w:p>
+    <w:p>
+      <w:pPr>
+        <w:pStyle w:val="BodyJ"/>
+      </w:pPr>
+      <w:r>
+        <w:t xml:space="preserve">Monteiro, S., Sherbino, J., Sibbald, M., &amp; Norman, G. (2020). Critical thinking, biases and dual processing: The enduring myth of generalisable skills. </w:t>
       </w:r>
       <w:r>
         <w:rPr>
           <w:i/>
           <w:iCs/>
         </w:rPr>
-        <w:t xml:space="preserve">The Psychology of Learning and Motivation</w:t>
-      </w:r>
-      <w:r>
-        <w:t xml:space="preserve"> (Vol. 26, pp. 125–173). Academic Press.</w:t>
-      </w:r>
-    </w:p>
-    <w:p>
-      <w:pPr>
-        <w:pStyle w:val="BodyJ"/>
-      </w:pPr>
-      <w:r>
-        <w:t xml:space="preserve">Nicolle, L. E., Gupta, K., Bradley, S. F., Colgan, R., DeMuri, G. P., Drekonja, D., Eckert, L. O., Geerlings, S. E., Köves, B., Hooton, T. M., Juthani-Mehta, M., Knight, S. L., Saint, S., Schaeffer, A. J., Trautner, B., Wullt, B., &amp; Siemieniuk, R. (2019). Clinical practice guideline for the management of asymptomatic bacteriuria: 2019 update by the Infectious Diseases Society of America. </w:t>
+        <w:t xml:space="preserve">Medical Education, 54</w:t>
+      </w:r>
+      <w:r>
+        <w:t xml:space="preserve">(1), 66–73.</w:t>
+      </w:r>
+    </w:p>
+    <w:p>
+      <w:pPr>
+        <w:pStyle w:val="BodyJ"/>
+      </w:pPr>
+      <w:r>
+        <w:t xml:space="preserve">Montgomery, K. (2006). </w:t>
       </w:r>
       <w:r>
         <w:rPr>
           <w:i/>
           <w:iCs/>
         </w:rPr>
-        <w:t xml:space="preserve">Clinical Infectious Diseases, 68</w:t>
-      </w:r>
-      <w:r>
-        <w:t xml:space="preserve">(10), e83–e110.</w:t>
-      </w:r>
-    </w:p>
-    <w:p>
-      <w:pPr>
-        <w:pStyle w:val="BodyJ"/>
-      </w:pPr>
-      <w:r>
-        <w:t xml:space="preserve">Norman, G. (2005). Research in clinical reasoning: Past history and current trends. </w:t>
+        <w:t xml:space="preserve">How Doctors Think: Clinical Judgment and the Practice of Medicine</w:t>
+      </w:r>
+      <w:r>
+        <w:t xml:space="preserve">. Oxford University Press.</w:t>
+      </w:r>
+    </w:p>
+    <w:p>
+      <w:pPr>
+        <w:pStyle w:val="BodyJ"/>
+      </w:pPr>
+      <w:r>
+        <w:t xml:space="preserve">Moulton, C.-A. E., Regehr, G., Mylopoulos, M., &amp; MacRae, H. M. (2007). Slowing down when you should: A new model of expert judgment. </w:t>
       </w:r>
       <w:r>
         <w:rPr>
           <w:i/>
           <w:iCs/>
         </w:rPr>
-        <w:t xml:space="preserve">Medical Education, 39</w:t>
-      </w:r>
-      <w:r>
-        <w:t xml:space="preserve">(4), 418–427.</w:t>
-      </w:r>
-    </w:p>
-    <w:p>
-      <w:pPr>
-        <w:pStyle w:val="BodyJ"/>
-      </w:pPr>
-      <w:r>
-        <w:t xml:space="preserve">Norman, G. (2009). Dual processing and diagnostic errors. </w:t>
+        <w:t xml:space="preserve">Academic Medicine, 82</w:t>
+      </w:r>
+      <w:r>
+        <w:t xml:space="preserve">(10 Suppl), S109–S116.</w:t>
+      </w:r>
+    </w:p>
+    <w:p>
+      <w:pPr>
+        <w:pStyle w:val="BodyJ"/>
+      </w:pPr>
+      <w:r>
+        <w:t xml:space="preserve">National Academies of Sciences, Engineering, and Medicine. (2015). </w:t>
       </w:r>
       <w:r>
         <w:rPr>
           <w:i/>
           <w:iCs/>
         </w:rPr>
-        <w:t xml:space="preserve">Advances in Health Sciences Education, 14</w:t>
-      </w:r>
-      <w:r>
-        <w:t xml:space="preserve">(Suppl 1), 37–49.</w:t>
-      </w:r>
-    </w:p>
-    <w:p>
-      <w:pPr>
-        <w:pStyle w:val="BodyJ"/>
-      </w:pPr>
-      <w:r>
-        <w:t xml:space="preserve">Norman, G. R., Monteiro, S. D., Sherbino, J., Ilgen, J. S., Schmidt, H. G., &amp; Mamede, S. (2017). The causes of errors in clinical reasoning: Cognitive biases, knowledge deficits, and dual process thinking. </w:t>
+        <w:t xml:space="preserve">Improving Diagnosis in Health Care</w:t>
+      </w:r>
+      <w:r>
+        <w:t xml:space="preserve">. The National Academies Press.</w:t>
+      </w:r>
+    </w:p>
+    <w:p>
+      <w:pPr>
+        <w:pStyle w:val="BodyJ"/>
+      </w:pPr>
+      <w:r>
+        <w:t xml:space="preserve">Nelson, T. O., &amp; Narens, L. (1990). Metamemory: A theoretical framework and new findings. In G. H. Bower (Ed.), </w:t>
       </w:r>
       <w:r>
         <w:rPr>
           <w:i/>
           <w:iCs/>
         </w:rPr>
-        <w:t xml:space="preserve">Academic Medicine, 92</w:t>
-      </w:r>
-      <w:r>
-        <w:t xml:space="preserve">(1), 23–30.</w:t>
-      </w:r>
-    </w:p>
-    <w:p>
-      <w:pPr>
-        <w:pStyle w:val="BodyJ"/>
-      </w:pPr>
-      <w:r>
-        <w:t xml:space="preserve">Novoa Jurado, A. J. (2025). Terapia epistémica del conocimiento clínico. </w:t>
+        <w:t xml:space="preserve">The Psychology of Learning and Motivation</w:t>
+      </w:r>
+      <w:r>
+        <w:t xml:space="preserve"> (Vol. 26, pp. 125–173). Academic Press.</w:t>
+      </w:r>
+    </w:p>
+    <w:p>
+      <w:pPr>
+        <w:pStyle w:val="BodyJ"/>
+      </w:pPr>
+      <w:r>
+        <w:t xml:space="preserve">Nicolle, L. E., Gupta, K., Bradley, S. F., Colgan, R., DeMuri, G. P., Drekonja, D., Eckert, L. O., Geerlings, S. E., Köves, B., Hooton, T. M., Juthani-Mehta, M., Knight, S. L., Saint, S., Schaeffer, A. J., Trautner, B., Wullt, B., &amp; Siemieniuk, R. (2019). Clinical practice guideline for the management of asymptomatic bacteriuria: 2019 update by the Infectious Diseases Society of America. </w:t>
       </w:r>
       <w:r>
         <w:rPr>
           <w:i/>
           <w:iCs/>
         </w:rPr>
-        <w:t xml:space="preserve">Revista Clínica de Medicina de Familia, 18</w:t>
-      </w:r>
-      <w:r>
-        <w:t xml:space="preserve">(3), 274–282.</w:t>
-      </w:r>
-    </w:p>
-    <w:p>
-      <w:pPr>
-        <w:pStyle w:val="BodyJ"/>
-      </w:pPr>
-      <w:r>
-        <w:t xml:space="preserve">Obermeyer, Z., Powers, B., Vogeli, C., &amp; Mullainathan, S. (2019). Dissecting racial bias in an algorithm used to manage the health of populations. </w:t>
+        <w:t xml:space="preserve">Clinical Infectious Diseases, 68</w:t>
+      </w:r>
+      <w:r>
+        <w:t xml:space="preserve">(10), e83–e110.</w:t>
+      </w:r>
+    </w:p>
+    <w:p>
+      <w:pPr>
+        <w:pStyle w:val="BodyJ"/>
+      </w:pPr>
+      <w:r>
+        <w:t xml:space="preserve">Norman, G. (2005). Research in clinical reasoning: Past history and current trends. </w:t>
       </w:r>
       <w:r>
         <w:rPr>
           <w:i/>
           <w:iCs/>
         </w:rPr>
-        <w:t xml:space="preserve">Science, 366</w:t>
-      </w:r>
-      <w:r>
-        <w:t xml:space="preserve">(6464), 447–453.</w:t>
-      </w:r>
-    </w:p>
-    <w:p>
-      <w:pPr>
-        <w:pStyle w:val="BodyJ"/>
-      </w:pPr>
-      <w:r>
-        <w:t xml:space="preserve">Parra, N. (1954). </w:t>
+        <w:t xml:space="preserve">Medical Education, 39</w:t>
+      </w:r>
+      <w:r>
+        <w:t xml:space="preserve">(4), 418–427.</w:t>
+      </w:r>
+    </w:p>
+    <w:p>
+      <w:pPr>
+        <w:pStyle w:val="BodyJ"/>
+      </w:pPr>
+      <w:r>
+        <w:t xml:space="preserve">Norman, G. (2009). Dual processing and diagnostic errors. </w:t>
       </w:r>
       <w:r>
         <w:rPr>
           <w:i/>
           <w:iCs/>
         </w:rPr>
-        <w:t xml:space="preserve">Poemas y antipoemas</w:t>
-      </w:r>
-      <w:r>
-        <w:t xml:space="preserve">. Nascimento.</w:t>
-      </w:r>
-    </w:p>
-    <w:p>
-      <w:pPr>
-        <w:pStyle w:val="BodyJ"/>
-      </w:pPr>
-      <w:r>
-        <w:t xml:space="preserve">Parra, N. (1969). </w:t>
+        <w:t xml:space="preserve">Advances in Health Sciences Education, 14</w:t>
+      </w:r>
+      <w:r>
+        <w:t xml:space="preserve">(Suppl 1), 37–49.</w:t>
+      </w:r>
+    </w:p>
+    <w:p>
+      <w:pPr>
+        <w:pStyle w:val="BodyJ"/>
+      </w:pPr>
+      <w:r>
+        <w:t xml:space="preserve">Norman, G. R., Monteiro, S. D., Sherbino, J., Ilgen, J. S., Schmidt, H. G., &amp; Mamede, S. (2017). The causes of errors in clinical reasoning: Cognitive biases, knowledge deficits, and dual process thinking. </w:t>
       </w:r>
       <w:r>
         <w:rPr>
           <w:i/>
           <w:iCs/>
         </w:rPr>
-        <w:t xml:space="preserve">Obra gruesa</w:t>
-      </w:r>
-      <w:r>
-        <w:t xml:space="preserve">. Editorial Universitaria.</w:t>
-      </w:r>
-    </w:p>
-    <w:p>
-      <w:pPr>
-        <w:pStyle w:val="BodyJ"/>
-      </w:pPr>
-      <w:r>
-        <w:t xml:space="preserve">Pauker, S. G., &amp; Kassirer, J. P. (1980). The threshold approach to clinical decision making. </w:t>
+        <w:t xml:space="preserve">Academic Medicine, 92</w:t>
+      </w:r>
+      <w:r>
+        <w:t xml:space="preserve">(1), 23–30.</w:t>
+      </w:r>
+    </w:p>
+    <w:p>
+      <w:pPr>
+        <w:pStyle w:val="BodyJ"/>
+      </w:pPr>
+      <w:r>
+        <w:t xml:space="preserve">Novoa Jurado, A. J. (2025). Terapia epistémica del conocimiento clínico. </w:t>
       </w:r>
       <w:r>
         <w:rPr>
           <w:i/>
           <w:iCs/>
         </w:rPr>
-        <w:t xml:space="preserve">New England Journal of Medicine, 302</w:t>
-      </w:r>
-      <w:r>
-        <w:t xml:space="preserve">(20), 1109–1117.</w:t>
-      </w:r>
-    </w:p>
-    <w:p>
-      <w:pPr>
-        <w:pStyle w:val="BodyJ"/>
-      </w:pPr>
-      <w:r>
-        <w:t xml:space="preserve">Pearl, J., &amp; Mackenzie, D. (2018). </w:t>
+        <w:t xml:space="preserve">Revista Clínica de Medicina de Familia, 18</w:t>
+      </w:r>
+      <w:r>
+        <w:t xml:space="preserve">(3), 274–282.</w:t>
+      </w:r>
+    </w:p>
+    <w:p>
+      <w:pPr>
+        <w:pStyle w:val="BodyJ"/>
+      </w:pPr>
+      <w:r>
+        <w:t xml:space="preserve">Obermeyer, Z., Powers, B., Vogeli, C., &amp; Mullainathan, S. (2019). Dissecting racial bias in an algorithm used to manage the health of populations. </w:t>
       </w:r>
       <w:r>
         <w:rPr>
           <w:i/>
           <w:iCs/>
         </w:rPr>
-        <w:t xml:space="preserve">The Book of Why: The New Science of Cause and Effect</w:t>
-      </w:r>
-      <w:r>
-        <w:t xml:space="preserve">. Basic Books.</w:t>
-      </w:r>
-    </w:p>
-    <w:p>
-      <w:pPr>
-        <w:pStyle w:val="BodyJ"/>
-      </w:pPr>
-      <w:r>
-        <w:t xml:space="preserve">Peirce, C. S. (1878). Deduction, induction, and hypothesis. </w:t>
+        <w:t xml:space="preserve">Science, 366</w:t>
+      </w:r>
+      <w:r>
+        <w:t xml:space="preserve">(6464), 447–453.</w:t>
+      </w:r>
+    </w:p>
+    <w:p>
+      <w:pPr>
+        <w:pStyle w:val="BodyJ"/>
+      </w:pPr>
+      <w:r>
+        <w:t xml:space="preserve">Parra, N. (1954). </w:t>
       </w:r>
       <w:r>
         <w:rPr>
           <w:i/>
           <w:iCs/>
         </w:rPr>
-        <w:t xml:space="preserve">Popular Science Monthly, 13</w:t>
-      </w:r>
-      <w:r>
-        <w:t xml:space="preserve">, 470–482.</w:t>
-      </w:r>
-    </w:p>
-    <w:p>
-      <w:pPr>
-        <w:pStyle w:val="BodyJ"/>
-      </w:pPr>
-      <w:r>
-        <w:t xml:space="preserve">Pellegrino, E. D., &amp; Thomasma, D. C. (1981). </w:t>
+        <w:t xml:space="preserve">Poemas y antipoemas</w:t>
+      </w:r>
+      <w:r>
+        <w:t xml:space="preserve">. Nascimento.</w:t>
+      </w:r>
+    </w:p>
+    <w:p>
+      <w:pPr>
+        <w:pStyle w:val="BodyJ"/>
+      </w:pPr>
+      <w:r>
+        <w:t xml:space="preserve">Parra, N. (1969). </w:t>
       </w:r>
       <w:r>
         <w:rPr>
           <w:i/>
           <w:iCs/>
         </w:rPr>
+        <w:t xml:space="preserve">Obra gruesa</w:t>
+      </w:r>
+      <w:r>
+        <w:t xml:space="preserve">. Editorial Universitaria.</w:t>
+      </w:r>
+    </w:p>
+    <w:p>
+      <w:pPr>
+        <w:pStyle w:val="BodyJ"/>
+      </w:pPr>
+      <w:r>
+        <w:t xml:space="preserve">Pauker, S. G., &amp; Kassirer, J. P. (1980). The threshold approach to clinical decision making. </w:t>
+      </w:r>
+      <w:r>
+        <w:rPr>
+          <w:i/>
+          <w:iCs/>
+        </w:rPr>
+        <w:t xml:space="preserve">New England Journal of Medicine, 302</w:t>
+      </w:r>
+      <w:r>
+        <w:t xml:space="preserve">(20), 1109–1117.</w:t>
+      </w:r>
+    </w:p>
+    <w:p>
+      <w:pPr>
+        <w:pStyle w:val="BodyJ"/>
+      </w:pPr>
+      <w:r>
+        <w:t xml:space="preserve">Pearl, J., &amp; Mackenzie, D. (2018). </w:t>
+      </w:r>
+      <w:r>
+        <w:rPr>
+          <w:i/>
+          <w:iCs/>
+        </w:rPr>
+        <w:t xml:space="preserve">The Book of Why: The New Science of Cause and Effect</w:t>
+      </w:r>
+      <w:r>
+        <w:t xml:space="preserve">. Basic Books.</w:t>
+      </w:r>
+    </w:p>
+    <w:p>
+      <w:pPr>
+        <w:pStyle w:val="BodyJ"/>
+      </w:pPr>
+      <w:r>
+        <w:t xml:space="preserve">Peirce, C. S. (1878). Deduction, induction, and hypothesis. </w:t>
+      </w:r>
+      <w:r>
+        <w:rPr>
+          <w:i/>
+          <w:iCs/>
+        </w:rPr>
+        <w:t xml:space="preserve">Popular Science Monthly, 13</w:t>
+      </w:r>
+      <w:r>
+        <w:t xml:space="preserve">, 470–482.</w:t>
+      </w:r>
+    </w:p>
+    <w:p>
+      <w:pPr>
+        <w:pStyle w:val="BodyJ"/>
+      </w:pPr>
+      <w:r>
+        <w:t xml:space="preserve">Pellegrino, E. D., &amp; Thomasma, D. C. (1981). </w:t>
+      </w:r>
+      <w:r>
+        <w:rPr>
+          <w:i/>
+          <w:iCs/>
+        </w:rPr>
         <w:t xml:space="preserve">A Philosophical Basis of Medical Practice: Toward a Philosophy and Ethic of the Healing Professions</w:t>
       </w:r>
       <w:r>
         <w:t xml:space="preserve">. Oxford University Press.</w:t>
+      </w:r>
+    </w:p>
+    <w:p>
+      <w:pPr>
+        <w:pStyle w:val="BodyJ"/>
+      </w:pPr>
+      <w:r>
+        <w:t xml:space="preserve">Philibert, I. (2005). Sleep loss and performance in residents and nonphysicians: A meta-analytic examination. </w:t>
+      </w:r>
+      <w:r>
+        <w:rPr>
+          <w:i/>
+          <w:iCs/>
+        </w:rPr>
+        <w:t xml:space="preserve">Sleep, 28</w:t>
+      </w:r>
+      <w:r>
+        <w:t xml:space="preserve">(11), 1392–1402.</w:t>
       </w:r>
     </w:p>
     <w:p>

</xml_diff>

<commit_message>
Maturana, Varela y Flores en los caps. 1, 8, 13 y 14 (observador y objetividad entre paréntesis, emociones como dominio de acción, conversaciones para la acción, saber hacer y quiebre); rebuild 152 pp
Co-Authored-By: Claude Fable 5.1 <noreply@anthropic.com>
Claude-Session: https://claude.ai/code/session_01SPkhDdVzUCxJwqq61ddeLW
</commit_message>
<xml_diff>
--- a/libro/Hechos_inferencias_incertidumbre_edicion_revisada.docx
+++ b/libro/Hechos_inferencias_incertidumbre_edicion_revisada.docx
@@ -667,7 +667,7 @@
         <w:rPr>
           <w:color w:val="8A8A8A"/>
         </w:rPr>
-        <w:t xml:space="preserve">88</w:t>
+        <w:t xml:space="preserve">89</w:t>
       </w:r>
     </w:p>
     <w:p>
@@ -687,7 +687,7 @@
         <w:rPr>
           <w:color w:val="8A8A8A"/>
         </w:rPr>
-        <w:t xml:space="preserve">95</w:t>
+        <w:t xml:space="preserve">96</w:t>
       </w:r>
     </w:p>
     <w:p>
@@ -707,7 +707,7 @@
         <w:rPr>
           <w:color w:val="8A8A8A"/>
         </w:rPr>
-        <w:t xml:space="preserve">105</w:t>
+        <w:t xml:space="preserve">106</w:t>
       </w:r>
     </w:p>
     <w:p>
@@ -727,7 +727,7 @@
         <w:rPr>
           <w:color w:val="8A8A8A"/>
         </w:rPr>
-        <w:t xml:space="preserve">109</w:t>
+        <w:t xml:space="preserve">110</w:t>
       </w:r>
     </w:p>
     <w:p>
@@ -747,7 +747,7 @@
         <w:rPr>
           <w:color w:val="8A8A8A"/>
         </w:rPr>
-        <w:t xml:space="preserve">117</w:t>
+        <w:t xml:space="preserve">118</w:t>
       </w:r>
     </w:p>
     <w:p>
@@ -767,7 +767,7 @@
         <w:rPr>
           <w:color w:val="8A8A8A"/>
         </w:rPr>
-        <w:t xml:space="preserve">121</w:t>
+        <w:t xml:space="preserve">122</w:t>
       </w:r>
     </w:p>
     <w:p>
@@ -787,7 +787,7 @@
         <w:rPr>
           <w:color w:val="8A8A8A"/>
         </w:rPr>
-        <w:t xml:space="preserve">123</w:t>
+        <w:t xml:space="preserve">124</w:t>
       </w:r>
     </w:p>
     <w:p>
@@ -807,7 +807,7 @@
         <w:rPr>
           <w:color w:val="8A8A8A"/>
         </w:rPr>
-        <w:t xml:space="preserve">125</w:t>
+        <w:t xml:space="preserve">126</w:t>
       </w:r>
     </w:p>
     <w:p>
@@ -827,7 +827,7 @@
         <w:rPr>
           <w:color w:val="8A8A8A"/>
         </w:rPr>
-        <w:t xml:space="preserve">127</w:t>
+        <w:t xml:space="preserve">128</w:t>
       </w:r>
     </w:p>
     <w:p>
@@ -847,7 +847,7 @@
         <w:rPr>
           <w:color w:val="8A8A8A"/>
         </w:rPr>
-        <w:t xml:space="preserve">129</w:t>
+        <w:t xml:space="preserve">130</w:t>
       </w:r>
     </w:p>
     <w:p>
@@ -867,7 +867,7 @@
         <w:rPr>
           <w:color w:val="8A8A8A"/>
         </w:rPr>
-        <w:t xml:space="preserve">133</w:t>
+        <w:t xml:space="preserve">135</w:t>
       </w:r>
     </w:p>
     <w:p>
@@ -887,7 +887,7 @@
         <w:rPr>
           <w:color w:val="8A8A8A"/>
         </w:rPr>
-        <w:t xml:space="preserve">137</w:t>
+        <w:t xml:space="preserve">139</w:t>
       </w:r>
     </w:p>
     <w:p>
@@ -907,7 +907,7 @@
         <w:rPr>
           <w:color w:val="8A8A8A"/>
         </w:rPr>
-        <w:t xml:space="preserve">138</w:t>
+        <w:t xml:space="preserve">140</w:t>
       </w:r>
     </w:p>
     <w:p>
@@ -1640,6 +1640,14 @@
       </w:pPr>
       <w:r>
         <w:t xml:space="preserve">Conviene precisar, antes de seguir, qué estatuto tiene entonces la palabra "hecho" en este libro, porque la carga teórica de la observación parece amenazar la distinción que organiza todo lo demás: si toda observación ya contiene conceptos, ¿dónde termina el hecho y empieza la inferencia? La respuesta es pragmática, no ontológica. "Hecho" es el estatus provisional que un equipo concede a una afirmación cuando acuerda no cuestionarla para la decisión en curso. "Lactato 6,0" es un hecho mientras nadie discuta el método ni la hora; deja de serlo en el instante en que la decisión dependa de si la muestra era venosa o estaba hemolizada, y entonces hay que bajar un nivel y volver a mirar. La frontera entre capas no es una línea en la naturaleza: es una línea que el equipo traza, puede volver a trazar y debe poder mostrar dónde la trazó. Eso —y no compartimentos puros— es lo que la Figura 2 llama separación funcional y gradual.</w:t>
+      </w:r>
+    </w:p>
+    <w:p>
+      <w:pPr>
+        <w:pStyle w:val="BodyJ"/>
+      </w:pPr>
+      <w:r>
+        <w:t xml:space="preserve">Esta posición tiene un antecedente chileno que conviene reconocer con la precisión que su propio autor exigía. Maturana formuló en 1970 la frase que cualquier ficha debería llevar como advertencia: todo lo dicho es dicho por un observador (Maturana, 1970; Maturana &amp; Varela, 1984). Y propuso después distinguir una "objetividad sin paréntesis" —la del que cree hablar de la realidad sin mediación y usa esa creencia como argumento para obligar al otro— de una "objetividad entre paréntesis", que admite que toda afirmación válida lo es dentro de un dominio de condiciones que el observador puede declarar (Maturana, 1990). El "quién lo observó, cómo y cuándo" de este capítulo y el léxico de certeza del capítulo 4 son objetividad entre paréntesis vuelta hábito de escritura. Dos aclaraciones, para que el préstamo no se convierta en coartada. El paréntesis no le quita realidad al lactato: la paciente está hipoperfundida la mida quien la mida, y donde el constructivismo de Maturana da el paso de disolver esa diferencia, este libro no lo acompaña. Y declarar al observador no vuelve relativa la observación: la vuelve auditable, que es lo contrario. La trazabilidad es el paréntesis puesto por escrito.</w:t>
       </w:r>
     </w:p>
     <w:p>
@@ -6428,7 +6436,7 @@
         <w:pStyle w:val="BodyJ"/>
       </w:pPr>
       <w:r>
-        <w:t xml:space="preserve">La evidencia es más dura de lo que la cultura hospitalaria admite. Un metaanálisis de sesenta estudios estimó que menos de treinta horas sin dormir reducen el desempeño cognitivo general de los médicos en cerca de una desviación estándar, y el desempeño clínico en más de una y media (Philibert, 2005): el médico de las cuatro de la mañana no es el mismo instrumento que el de las nueve. Cuando se asignó al azar a internos de cuidados intensivos a turnos tradicionales de más de veinticuatro horas o a turnos acotados a dieciséis, los turnos largos produjeron un 36% más de errores graves, y los errores diagnósticos graves se multiplicaron por más de cinco (Landrigan et al., 2004). El efecto no exige noches: en más de 21.000 consultas por infección respiratoria, la probabilidad de salir con un antibiótico subió hora a hora dentro de la misma sesión de policlínico, con independencia del paciente y del diagnóstico, hasta unas chances un 26% mayores en la cuarta hora que en la primera (Linder et al., 2014). Nadie decidió prescribir peor a las cuatro de la tarde; el umbral se movió solo, con el cansancio. Y el ánimo tampoco es neutro: en un experimento clásico, los médicos a quienes se indujo un afecto positivo integraron antes la información de un caso y se anclaron menos en su primera hipótesis (Estrada, Isen &amp; Young, 1997). El estado afectivo no acompaña al razonamiento; lo configura.</w:t>
+        <w:t xml:space="preserve">La evidencia es más dura de lo que la cultura hospitalaria admite. Un metaanálisis de sesenta estudios estimó que menos de treinta horas sin dormir reducen el desempeño cognitivo general de los médicos en cerca de una desviación estándar, y el desempeño clínico en más de una y media (Philibert, 2005): el médico de las cuatro de la mañana no es el mismo instrumento que el de las nueve. Cuando se asignó al azar a internos de cuidados intensivos a turnos tradicionales de más de veinticuatro horas o a turnos acotados a dieciséis, los turnos largos produjeron un 36% más de errores graves, y los errores diagnósticos graves se multiplicaron por más de cinco (Landrigan et al., 2004). El efecto no exige noches: en más de 21.000 consultas por infección respiratoria, la probabilidad de salir con un antibiótico subió hora a hora dentro de la misma sesión de policlínico, con independencia del paciente y del diagnóstico, hasta unas chances un 26% mayores en la cuarta hora que en la primera (Linder et al., 2014). Nadie decidió prescribir peor a las cuatro de la tarde; el umbral se movió solo, con el cansancio. Y el ánimo tampoco es neutro: en un experimento clásico, los médicos a quienes se indujo un afecto positivo integraron antes la información de un caso y se anclaron menos en su primera hipótesis (Estrada, Isen &amp; Young, 1997). El estado afectivo no acompaña al razonamiento; lo configura. Maturana lo había dicho desde la biología, en una formulación que esta sección adopta: las emociones son disposiciones corporales que especifican el dominio de acciones en que un organismo puede moverse en cada momento (Maturana, 1990). Un ánimo no es ruido sobre el razonamiento; es el repertorio de pensamientos y conductas disponibles, y por eso merece figurar entre los hechos.</w:t>
       </w:r>
     </w:p>
     <w:p>
@@ -9269,6 +9277,14 @@
         <w:pStyle w:val="BodyJ"/>
       </w:pPr>
       <w:r>
+        <w:t xml:space="preserve">Hay una gramática para eso, y la escribió un chileno. Flores, con Winograd, describió el trabajo coordinado como una red de "conversaciones para la acción": alguien pide, alguien promete, la promesa tiene condiciones de satisfacción y un plazo, y se cierra con una declaración de cumplimiento o de incumplimiento (Winograd &amp; Flores, 1986). Leída así, una entrega de turno no transfiere información: distribuye compromisos. "Está cubierto" es una promesa sin dueño ni condiciones; "el hemocultivo lo revisa la residente de noche a las 2:00 y avisa si crece un gramnegativo" es una promesa completa, con quién, qué, cuándo y cómo se sabrá que se cumplió. Es la pregunta de Austin del capítulo 4 —qué acaba de hacer esta oración— aplicada a la frase más frecuente del hospital. La incertidumbre no desaparece al entregarla; cambia de dueño, y la gramática de Flores obliga a decir a quién.</w:t>
+      </w:r>
+    </w:p>
+    <w:p>
+      <w:pPr>
+        <w:pStyle w:val="BodyJ"/>
+      </w:pPr>
+      <w:r>
         <w:t xml:space="preserve">Las jerarquías influyen. Si el médico más senior presenta una hipótesis como hecho, los demás pueden dejar de ofrecer datos discordantes. Una formulación como "mi impresión principal es X; me preocupa Y por esta razón; ¿qué dato no encaja?" conserva liderazgo y abre corrección.</w:t>
       </w:r>
     </w:p>
@@ -9744,6 +9760,24 @@
       </w:pPr>
       <w:r>
         <w:t xml:space="preserve">Vista así, la humildad no es una virtud separada de la phronesis que este libro viene invocando desde el capítulo 6: es su condición de funcionamiento. La prudencia práctica integra, en el caso particular, lo que ningún algoritmo integra por nosotros — conocimiento causal, emoción leída como dato, valores del paciente y oportunidad: el momento de actuar ahora o esperar. Esa integración sólo permanece honesta si alguien vigila sus límites, y la humildad es exactamente eso: la phronesis vuelta sobre sí misma, la parte de la prudencia que sabe cuánta de la propia prudencia es conjetura. Con ella queda a la vista el hilo que el libro venía tendiendo: el capítulo 2 mostró la abducción — la conjetura que crea explicaciones —; el capítulo 5, la metacognición que la vigila mientras trabaja; la humildad es la disposición que la mantiene abierta cuando ya produjo una respuesta cómoda. Generar, vigilar, mantener abierto: tres nombres de una misma lealtad al caso.</w:t>
+      </w:r>
+    </w:p>
+    <w:p>
+      <w:pPr>
+        <w:pStyle w:val="BodyJ"/>
+      </w:pPr>
+      <w:r>
+        <w:t xml:space="preserve">Varela, desde la otra orilla del mismo pensamiento chileno, agrega una corrección que este libro debe aceptar. En las conferencias publicadas como </w:t>
+      </w:r>
+      <w:r>
+        <w:rPr>
+          <w:i/>
+          <w:iCs/>
+        </w:rPr>
+        <w:t xml:space="preserve">Ética y acción</w:t>
+      </w:r>
+      <w:r>
+        <w:t xml:space="preserve"> sostuvo que la pericia ética —y la pericia en general— no es deliberación sino un saber hacer inmediato, encarnado, que responde a la situación sin pasar por reglas ni por juicios explícitos; la deliberación aparece sólo en el quiebre, cuando la respuesta espontánea falla o la situación no calza con lo aprendido (Varela, 1996). La cirujana que dijo "programada, no hoy" en un minuto no calló un razonamiento: no lo había. Esto parece contradecir un libro que pide explicitar en cada página, y no lo contradice si se lee bien. Las pausas del capítulo 8 son los quiebres de Varela puestos por diseño donde la experiencia enseña que la respuesta inmediata se equivoca; la explicitación de la cirujana en el pasillo no fue parte de su juicio sino de su transmisión; y la ficha no fotografía la cognición del que escribe: le presta al siguiente lector lo que necesita para revisarla. Lo que Varela corrige es la descripción: la buena práctica no consiste en pensar explícitamente, consiste en responder bien y en reconocer el quiebre. Y lo que advierte es un costo: la explicitación sin disparador no protege al experto, lo degrada a principiante. Por eso la versión completa de HII-D se reserva para los casos difíciles, y la humildad de este capítulo no es la del que duda de todo, sino la del que sabe cuándo su saber hacer dejó de bastar.</w:t>
       </w:r>
     </w:p>
     <w:p>
@@ -17089,6 +17123,21 @@
           <w:b/>
           <w:bCs/>
         </w:rPr>
+        <w:t xml:space="preserve">Conversaciones para la acción.</w:t>
+      </w:r>
+      <w:r>
+        <w:t xml:space="preserve"> Gramática del trabajo coordinado descrita por Flores y Winograd: pedido, promesa con condiciones de satisfacción y plazo, y declaración de cumplimiento. Leída así, una entrega de turno distribuye compromisos, no sólo información; "está cubierto" es una promesa sin dueño.</w:t>
+      </w:r>
+    </w:p>
+    <w:p>
+      <w:pPr>
+        <w:pStyle w:val="BodyJ"/>
+      </w:pPr>
+      <w:r>
+        <w:rPr>
+          <w:b/>
+          <w:bCs/>
+        </w:rPr>
         <w:t xml:space="preserve">Contrafactual.</w:t>
       </w:r>
       <w:r>
@@ -17494,6 +17543,21 @@
           <w:b/>
           <w:bCs/>
         </w:rPr>
+        <w:t xml:space="preserve">Objetividad entre paréntesis.</w:t>
+      </w:r>
+      <w:r>
+        <w:t xml:space="preserve"> Distinción de Maturana entre el que cree hablar de la realidad sin mediación y usa esa creencia para obligar (objetividad sin paréntesis) y el que admite que toda afirmación válida lo es dentro de condiciones que el observador puede declarar. En este libro, el fundamento de la trazabilidad: declarar al observador no vuelve relativa la observación, la vuelve auditable.</w:t>
+      </w:r>
+    </w:p>
+    <w:p>
+      <w:pPr>
+        <w:pStyle w:val="BodyJ"/>
+      </w:pPr>
+      <w:r>
+        <w:rPr>
+          <w:b/>
+          <w:bCs/>
+        </w:rPr>
         <w:t xml:space="preserve">Observación activa.</w:t>
       </w:r>
       <w:r>
@@ -17573,6 +17637,21 @@
       </w:r>
       <w:r>
         <w:t xml:space="preserve"> Obligación moral de implementar sólo las medidas que guarden debida proporción entre los medios empleados y el resultado previsible, juzgada desde el pronóstico, las cargas y los fines del paciente (Taboada). Exige un pronóstico honesto: sin buen juicio epistémico no hay juicio de proporcionalidad.</w:t>
+      </w:r>
+    </w:p>
+    <w:p>
+      <w:pPr>
+        <w:pStyle w:val="BodyJ"/>
+      </w:pPr>
+      <w:r>
+        <w:rPr>
+          <w:b/>
+          <w:bCs/>
+        </w:rPr>
+        <w:t xml:space="preserve">Quiebre.</w:t>
+      </w:r>
+      <w:r>
+        <w:t xml:space="preserve"> Momento en que la respuesta inmediata del experto falla o la situación no calza con lo aprendido, y la deliberación explícita entra en escena (Varela). Las pausas selectivas de este libro son quiebres puestos por diseño.</w:t>
       </w:r>
     </w:p>
     <w:p>
@@ -17928,7 +18007,7 @@
         </w:numPr>
       </w:pPr>
       <w:r>
-        <w:t xml:space="preserve">Conocimiento tácito — 6</w:t>
+        <w:t xml:space="preserve">Conocimiento tácito — 6; saber hacer y quiebre (Varela) — 14</w:t>
       </w:r>
     </w:p>
     <w:p>
@@ -17940,6 +18019,18 @@
         </w:numPr>
       </w:pPr>
       <w:r>
+        <w:t xml:space="preserve">Conversaciones para la acción (Flores y Winograd) — 13</w:t>
+      </w:r>
+    </w:p>
+    <w:p>
+      <w:pPr>
+        <w:pStyle w:val="BodyJ"/>
+        <w:numPr>
+          <w:ilvl w:val="0"/>
+          <w:numId w:val="6"/>
+        </w:numPr>
+      </w:pPr>
+      <w:r>
         <w:t xml:space="preserve">Contexto global del paciente (funcionalidad, pronóstico de fondo, red de apoyo) — 10, 15, Ap A</w:t>
       </w:r>
     </w:p>
@@ -18517,6 +18608,18 @@
       </w:pPr>
       <w:r>
         <w:t xml:space="preserve">Nota de enfermería como hecho de pleno derecho — 13</w:t>
+      </w:r>
+    </w:p>
+    <w:p>
+      <w:pPr>
+        <w:pStyle w:val="BodyJ"/>
+        <w:numPr>
+          <w:ilvl w:val="0"/>
+          <w:numId w:val="6"/>
+        </w:numPr>
+      </w:pPr>
+      <w:r>
+        <w:t xml:space="preserve">Objetividad entre paréntesis y observador (Maturana) — 1; emociones como dominio de acción — 8</w:t>
       </w:r>
     </w:p>
     <w:p>
@@ -20594,6 +20697,70 @@
         <w:pStyle w:val="BodyJ"/>
       </w:pPr>
       <w:r>
+        <w:t xml:space="preserve">Maturana, H. (1990). </w:t>
+      </w:r>
+      <w:r>
+        <w:rPr>
+          <w:i/>
+          <w:iCs/>
+        </w:rPr>
+        <w:t xml:space="preserve">Emociones y lenguaje en educación y política</w:t>
+      </w:r>
+      <w:r>
+        <w:t xml:space="preserve">. Hachette / CED.</w:t>
+      </w:r>
+    </w:p>
+    <w:p>
+      <w:pPr>
+        <w:pStyle w:val="BodyJ"/>
+      </w:pPr>
+      <w:r>
+        <w:t xml:space="preserve">Maturana, H. R. (1970). </w:t>
+      </w:r>
+      <w:r>
+        <w:rPr>
+          <w:i/>
+          <w:iCs/>
+        </w:rPr>
+        <w:t xml:space="preserve">Biology of cognition</w:t>
+      </w:r>
+      <w:r>
+        <w:t xml:space="preserve"> (BCL Report 9.0). Biological Computer Laboratory, University of Illinois. Reimpreso en H. R. Maturana &amp; F. J. Varela (1980), </w:t>
+      </w:r>
+      <w:r>
+        <w:rPr>
+          <w:i/>
+          <w:iCs/>
+        </w:rPr>
+        <w:t xml:space="preserve">Autopoiesis and Cognition: The Realization of the Living</w:t>
+      </w:r>
+      <w:r>
+        <w:t xml:space="preserve"> (pp. 5–58). Reidel.</w:t>
+      </w:r>
+    </w:p>
+    <w:p>
+      <w:pPr>
+        <w:pStyle w:val="BodyJ"/>
+      </w:pPr>
+      <w:r>
+        <w:t xml:space="preserve">Maturana, H., &amp; Varela, F. (1984). </w:t>
+      </w:r>
+      <w:r>
+        <w:rPr>
+          <w:i/>
+          <w:iCs/>
+        </w:rPr>
+        <w:t xml:space="preserve">El árbol del conocimiento: Las bases biológicas del entendimiento humano</w:t>
+      </w:r>
+      <w:r>
+        <w:t xml:space="preserve">. Editorial Universitaria.</w:t>
+      </w:r>
+    </w:p>
+    <w:p>
+      <w:pPr>
+        <w:pStyle w:val="BodyJ"/>
+      </w:pPr>
+      <w:r>
         <w:t xml:space="preserve">McCoy, L. G., Manrai, A. K., &amp; Rodman, A. (2024). Large language models and the degradation of the medical record. </w:t>
       </w:r>
       <w:r>
@@ -21422,6 +21589,24 @@
         <w:pStyle w:val="BodyJ"/>
       </w:pPr>
       <w:r>
+        <w:t xml:space="preserve">Varela, F. J. (1996). </w:t>
+      </w:r>
+      <w:r>
+        <w:rPr>
+          <w:i/>
+          <w:iCs/>
+        </w:rPr>
+        <w:t xml:space="preserve">Ética y acción</w:t>
+      </w:r>
+      <w:r>
+        <w:t xml:space="preserve">. Dolmen.</w:t>
+      </w:r>
+    </w:p>
+    <w:p>
+      <w:pPr>
+        <w:pStyle w:val="BodyJ"/>
+      </w:pPr>
+      <w:r>
         <w:t xml:space="preserve">Wang, M. D., Khanna, R., &amp; Najafi, N. (2017). Characterizing the source of text in electronic health record progress notes. </w:t>
       </w:r>
       <w:r>
@@ -21487,6 +21672,24 @@
       </w:r>
       <w:r>
         <w:t xml:space="preserve">(3), 509–539.</w:t>
+      </w:r>
+    </w:p>
+    <w:p>
+      <w:pPr>
+        <w:pStyle w:val="BodyJ"/>
+      </w:pPr>
+      <w:r>
+        <w:t xml:space="preserve">Winograd, T., &amp; Flores, F. (1986). </w:t>
+      </w:r>
+      <w:r>
+        <w:rPr>
+          <w:i/>
+          <w:iCs/>
+        </w:rPr>
+        <w:t xml:space="preserve">Understanding Computers and Cognition: A New Foundation for Design</w:t>
+      </w:r>
+      <w:r>
+        <w:t xml:space="preserve">. Ablex.</w:t>
       </w:r>
     </w:p>
     <w:p>

</xml_diff>

<commit_message>
Cap. 12: ficha de resultados vs. ficha de proceso (los verbos del razonamiento, la neumonía en ocho líneas, la PCR con su cinética) y Taller 12B; cap. 8: la mente del principiante; cap. 14: la improvisación como saber hacer; rebuild 156 pp
Co-Authored-By: Claude Fable 5.1 <noreply@anthropic.com>
Claude-Session: https://claude.ai/code/session_01SPkhDdVzUCxJwqq61ddeLW
</commit_message>
<xml_diff>
--- a/libro/Hechos_inferencias_incertidumbre_edicion_revisada.docx
+++ b/libro/Hechos_inferencias_incertidumbre_edicion_revisada.docx
@@ -467,7 +467,7 @@
         <w:rPr>
           <w:color w:val="8A8A8A"/>
         </w:rPr>
-        <w:t xml:space="preserve">52</w:t>
+        <w:t xml:space="preserve">53</w:t>
       </w:r>
     </w:p>
     <w:p>
@@ -487,7 +487,7 @@
         <w:rPr>
           <w:color w:val="8A8A8A"/>
         </w:rPr>
-        <w:t xml:space="preserve">53</w:t>
+        <w:t xml:space="preserve">54</w:t>
       </w:r>
     </w:p>
     <w:p>
@@ -507,7 +507,7 @@
         <w:rPr>
           <w:color w:val="8A8A8A"/>
         </w:rPr>
-        <w:t xml:space="preserve">54</w:t>
+        <w:t xml:space="preserve">55</w:t>
       </w:r>
     </w:p>
     <w:p>
@@ -527,7 +527,7 @@
         <w:rPr>
           <w:color w:val="8A8A8A"/>
         </w:rPr>
-        <w:t xml:space="preserve">58</w:t>
+        <w:t xml:space="preserve">59</w:t>
       </w:r>
     </w:p>
     <w:p>
@@ -547,7 +547,7 @@
         <w:rPr>
           <w:color w:val="8A8A8A"/>
         </w:rPr>
-        <w:t xml:space="preserve">66</w:t>
+        <w:t xml:space="preserve">67</w:t>
       </w:r>
     </w:p>
     <w:p>
@@ -567,7 +567,7 @@
         <w:rPr>
           <w:color w:val="8A8A8A"/>
         </w:rPr>
-        <w:t xml:space="preserve">69</w:t>
+        <w:t xml:space="preserve">70</w:t>
       </w:r>
     </w:p>
     <w:p>
@@ -587,7 +587,7 @@
         <w:rPr>
           <w:color w:val="8A8A8A"/>
         </w:rPr>
-        <w:t xml:space="preserve">74</w:t>
+        <w:t xml:space="preserve">77</w:t>
       </w:r>
     </w:p>
     <w:p>
@@ -607,7 +607,7 @@
         <w:rPr>
           <w:color w:val="8A8A8A"/>
         </w:rPr>
-        <w:t xml:space="preserve">79</w:t>
+        <w:t xml:space="preserve">82</w:t>
       </w:r>
     </w:p>
     <w:p>
@@ -627,7 +627,7 @@
         <w:rPr>
           <w:color w:val="8A8A8A"/>
         </w:rPr>
-        <w:t xml:space="preserve">81</w:t>
+        <w:t xml:space="preserve">84</w:t>
       </w:r>
     </w:p>
     <w:p>
@@ -647,7 +647,7 @@
         <w:rPr>
           <w:color w:val="8A8A8A"/>
         </w:rPr>
-        <w:t xml:space="preserve">82</w:t>
+        <w:t xml:space="preserve">85</w:t>
       </w:r>
     </w:p>
     <w:p>
@@ -667,7 +667,7 @@
         <w:rPr>
           <w:color w:val="8A8A8A"/>
         </w:rPr>
-        <w:t xml:space="preserve">89</w:t>
+        <w:t xml:space="preserve">92</w:t>
       </w:r>
     </w:p>
     <w:p>
@@ -687,7 +687,7 @@
         <w:rPr>
           <w:color w:val="8A8A8A"/>
         </w:rPr>
-        <w:t xml:space="preserve">96</w:t>
+        <w:t xml:space="preserve">99</w:t>
       </w:r>
     </w:p>
     <w:p>
@@ -707,7 +707,7 @@
         <w:rPr>
           <w:color w:val="8A8A8A"/>
         </w:rPr>
-        <w:t xml:space="preserve">106</w:t>
+        <w:t xml:space="preserve">109</w:t>
       </w:r>
     </w:p>
     <w:p>
@@ -727,7 +727,7 @@
         <w:rPr>
           <w:color w:val="8A8A8A"/>
         </w:rPr>
-        <w:t xml:space="preserve">110</w:t>
+        <w:t xml:space="preserve">113</w:t>
       </w:r>
     </w:p>
     <w:p>
@@ -747,7 +747,7 @@
         <w:rPr>
           <w:color w:val="8A8A8A"/>
         </w:rPr>
-        <w:t xml:space="preserve">118</w:t>
+        <w:t xml:space="preserve">121</w:t>
       </w:r>
     </w:p>
     <w:p>
@@ -767,7 +767,7 @@
         <w:rPr>
           <w:color w:val="8A8A8A"/>
         </w:rPr>
-        <w:t xml:space="preserve">122</w:t>
+        <w:t xml:space="preserve">125</w:t>
       </w:r>
     </w:p>
     <w:p>
@@ -787,7 +787,7 @@
         <w:rPr>
           <w:color w:val="8A8A8A"/>
         </w:rPr>
-        <w:t xml:space="preserve">124</w:t>
+        <w:t xml:space="preserve">127</w:t>
       </w:r>
     </w:p>
     <w:p>
@@ -807,7 +807,7 @@
         <w:rPr>
           <w:color w:val="8A8A8A"/>
         </w:rPr>
-        <w:t xml:space="preserve">126</w:t>
+        <w:t xml:space="preserve">129</w:t>
       </w:r>
     </w:p>
     <w:p>
@@ -827,7 +827,7 @@
         <w:rPr>
           <w:color w:val="8A8A8A"/>
         </w:rPr>
-        <w:t xml:space="preserve">128</w:t>
+        <w:t xml:space="preserve">131</w:t>
       </w:r>
     </w:p>
     <w:p>
@@ -847,7 +847,7 @@
         <w:rPr>
           <w:color w:val="8A8A8A"/>
         </w:rPr>
-        <w:t xml:space="preserve">130</w:t>
+        <w:t xml:space="preserve">133</w:t>
       </w:r>
     </w:p>
     <w:p>
@@ -867,7 +867,7 @@
         <w:rPr>
           <w:color w:val="8A8A8A"/>
         </w:rPr>
-        <w:t xml:space="preserve">135</w:t>
+        <w:t xml:space="preserve">138</w:t>
       </w:r>
     </w:p>
     <w:p>
@@ -887,7 +887,7 @@
         <w:rPr>
           <w:color w:val="8A8A8A"/>
         </w:rPr>
-        <w:t xml:space="preserve">139</w:t>
+        <w:t xml:space="preserve">142</w:t>
       </w:r>
     </w:p>
     <w:p>
@@ -907,7 +907,7 @@
         <w:rPr>
           <w:color w:val="8A8A8A"/>
         </w:rPr>
-        <w:t xml:space="preserve">140</w:t>
+        <w:t xml:space="preserve">143</w:t>
       </w:r>
     </w:p>
     <w:p>
@@ -6594,6 +6594,77 @@
           <w:sz w:val="25"/>
           <w:szCs w:val="25"/>
         </w:rPr>
+        <w:t xml:space="preserve">La mente del principiante</w:t>
+      </w:r>
+    </w:p>
+    <w:p>
+      <w:pPr>
+        <w:pStyle w:val="BodyJ"/>
+      </w:pPr>
+      <w:r>
+        <w:t xml:space="preserve">Hay una tradición que lleva siglos entrenando exactamente la operación de esa primera instrucción, y conviene reconocerla aunque venga de lejos de la medicina. Suzuki abrió sus charlas sobre la práctica del Zen con una frase que cualquier residente podría tener pegada en la ficha: en la mente del principiante hay muchas posibilidades; en la del experto, pocas (Suzuki, 1970). </w:t>
+      </w:r>
+      <w:r>
+        <w:rPr>
+          <w:i/>
+          <w:iCs/>
+        </w:rPr>
+        <w:t xml:space="preserve">Shoshin</w:t>
+      </w:r>
+      <w:r>
+        <w:t xml:space="preserve">, la mente del principiante, no es ignorancia: es la disposición a mirar lo que ya se conoce como si fuera la primera vez, sin que el nombre decida por adelantado. Presentar el caso sin la etiqueta es </w:t>
+      </w:r>
+      <w:r>
+        <w:rPr>
+          <w:i/>
+          <w:iCs/>
+        </w:rPr>
+        <w:t xml:space="preserve">shoshin</w:t>
+      </w:r>
+      <w:r>
+        <w:t xml:space="preserve"> vuelto procedimiento; el Taller 8 es una práctica contemplativa con disfraz de ejercicio clínico.</w:t>
+      </w:r>
+    </w:p>
+    <w:p>
+      <w:pPr>
+        <w:pStyle w:val="BodyJ"/>
+      </w:pPr>
+      <w:r>
+        <w:t xml:space="preserve">Lo segundo que el Zen aporta es el "no saber" como disciplina y no como derrota: sostener la pregunta abierta sin precipitarse a cerrarla, que es el "no lo sé" del capítulo 14 y la cartografía del capítulo 3. Y lo tercero es la atención misma como práctica que se entrena. Epstein, cuyo concepto de práctica atenta este capítulo ya usó, lo trajo explícitamente de esa tradición (Epstein, 1999), y con Krasner mostró en setenta médicos de atención primaria que un programa de comunicación atenta se asoció con menos agotamiento y más empatía, aunque sin grupo control (Krasner et al., 2009). El estado del que piensa, tratado páginas atrás, tiene aquí su contraparte: si el ánimo y el cansancio son hechos, la atención es una habilidad, y las habilidades se practican.</w:t>
+      </w:r>
+    </w:p>
+    <w:p>
+      <w:pPr>
+        <w:pStyle w:val="BodyJ"/>
+      </w:pPr>
+      <w:r>
+        <w:t xml:space="preserve">Dos límites, para que el préstamo no se vuelva decorado. Este libro toma del Zen una disciplina de la atención y una actitud ante el no saber, no una metafísica ni una terapéutica. Y la mente del principiante no reemplaza al </w:t>
+      </w:r>
+      <w:r>
+        <w:rPr>
+          <w:i/>
+          <w:iCs/>
+        </w:rPr>
+        <w:t xml:space="preserve">illness script</w:t>
+      </w:r>
+      <w:r>
+        <w:t xml:space="preserve">: el experto que mira como principiante sigue sabiendo lo que sabe; lo que suspende es la prisa con que ese saber cierra el caso. Varela, practicante budista que escribió desde esa experiencia, dirá en el capítulo 14 lo que la une con la pericia: el saber hacer responde sin deliberar, y la deliberación entra en el quiebre. La pausa de este capítulo es ese quiebre buscado a propósito: un respiro entre el patrón que se encendió y la frase que lo fija.</w:t>
+      </w:r>
+    </w:p>
+    <w:p>
+      <w:pPr>
+        <w:pStyle w:val="Heading3"/>
+        <w:spacing w:after="120" w:before="280"/>
+      </w:pPr>
+      <w:r>
+        <w:rPr>
+          <w:rFonts w:ascii="Georgia" w:cs="Georgia" w:eastAsia="Georgia" w:hAnsi="Georgia"/>
+          <w:b/>
+          <w:bCs/>
+          <w:color w:val="2B2B2B"/>
+          <w:sz w:val="25"/>
+          <w:szCs w:val="25"/>
+        </w:rPr>
         <w:t xml:space="preserve">Pausa diagnóstica y segundo lector</w:t>
       </w:r>
     </w:p>
@@ -8758,6 +8829,71 @@
           <w:sz w:val="25"/>
           <w:szCs w:val="25"/>
         </w:rPr>
+        <w:t xml:space="preserve">La ficha de resultados y la ficha de proceso</w:t>
+      </w:r>
+    </w:p>
+    <w:p>
+      <w:pPr>
+        <w:pStyle w:val="BodyJ"/>
+      </w:pPr>
+      <w:r>
+        <w:t xml:space="preserve">"Neumonía. Ceftriaxona 2 g." Casi toda ficha contiene notas así, y casi nadie las considera incompletas: tienen un diagnóstico y un tratamiento, que es lo que la plantilla pide. Pero la flecha entre esas dos palabras esconde una cascada de decisiones que alguien tomó, o dejó de tomar, y que la nota no registra. ¿Tiene realmente neumonía, y en base a qué? ¿Requiere hospitalizarse, y en qué unidad? ¿Qué factores anuncian una evolución tórpida? ¿A qué microorganismos apunta la cobertura empírica, y cuáles quedan deliberadamente fuera? ¿Hay que cubrir anaerobios? ¿Qué complicación conviene descartar, y con qué? ¿Necesita oxígeno? ¿Se beneficia de corticoides, y qué lo vuelve riesgoso en este paciente? ¿Cuánto esperar para evaluar la respuesta, y con qué cinética se lee la PCR? Cada pregunta es un HII-D en miniatura; la nota de resultados las comprime todas en una preposición que ni siquiera está escrita.</w:t>
+      </w:r>
+    </w:p>
+    <w:p>
+      <w:pPr>
+        <w:pStyle w:val="BodyJ"/>
+      </w:pPr>
+      <w:r>
+        <w:t xml:space="preserve">Conviene distinguir, entonces, dos fichas que suelen confundirse. La ficha de resultados registra conclusiones y acciones: lo que se decidió. La ficha de proceso registra, además, los verbos que llevaron hasta ahí: qué se sospechó y por qué, de qué se dudó, qué se descartó y con qué método, qué se priorizó, qué se infirió y con qué grado, qué se realizó, qué se repitió, qué se comprobó y qué se aprendió. No es una lista de virtudes: es una gramática, y cada verbo cae en una capa del método. Sospechado e inferido son la capa I; dudado, descartado y priorizado son la incertidumbre; realizado y repetido son la decisión; comprobado y aprendido son la reevaluación. La ficha de resultados conjuga un solo verbo, "se indica", y por eso no puede ser auditada: no hay camino que recorrer.</w:t>
+      </w:r>
+    </w:p>
+    <w:p>
+      <w:pPr>
+        <w:pStyle w:val="BodyJ"/>
+      </w:pPr>
+      <w:r>
+        <w:t xml:space="preserve">La misma neumonía, escrita como proceso, cabe en ocho líneas:</w:t>
+      </w:r>
+    </w:p>
+    <w:p>
+      <w:pPr>
+        <w:pStyle w:val="BodyJ"/>
+      </w:pPr>
+      <w:r>
+        <w:t xml:space="preserve">"Sospecho neumonía adquirida en la comunidad por fiebre de tres días, tos productiva, crépitos en la base derecha y opacidad nueva en la radiografía. Dudé de insuficiencia cardiaca (sin edema ni ingurgitación, radiografía sin congestión) y de embolia (sin factores de riesgo, dolor pleurítico ni hemoptisis): las degrado a poco probables, no las descarto. Descarto aspiración por anamnesis, no por imagen: no hubo vómito ni compromiso de conciencia. Priorizo la hipoxemia: saturación 92% ambiental y frecuencia respiratoria 26, oxígeno por naricera; sala y no intermedio, porque no hay hipotensión, confusión ni urea elevada. Infiero cobertura para neumococo y atípicos (ceftriaxona más macrólido); sin factores para Pseudomonas ni estafilococo resistente, sin indicación de anaerobios. Corticoides: no, sin criterios de gravedad; una diabetes descompensada elevaría además su costo. Comprobaré a las 72 horas con dos predicciones: afebril y con menos oxígeno; PCR en descenso al cuarto día. Repetiré imagen sólo si persiste la fiebre o aparece matidez: el derrame es la complicación que busco. Reabrir si a las 72 horas no se cumple alguna de las dos predicciones."</w:t>
+      </w:r>
+    </w:p>
+    <w:p>
+      <w:pPr>
+        <w:pStyle w:val="BodyJ"/>
+      </w:pPr>
+      <w:r>
+        <w:t xml:space="preserve">Dos de esas líneas cargan evidencia que conviene nombrar. El "no" a los corticoides se apoya en que su beneficio en mortalidad se demostró en neumonía grave tratada en cuidados intensivos —11,9% frente a 6,2% a los 28 días con hidrocortisona (Dequin et al., 2023)—, no en sala, y la nota lo dice con una palabra: "sin criterios de gravedad". Y el "sin indicación de anaerobios" es un descarte con método, el de la anamnesis que no encontró aspiración, y por eso puede revisarse si la anamnesis cambia. La nota de proceso es apenas más larga que "Neumonía. Ceftriaxona" si se cuentan las líneas que una evolución típica dedica a repetir lo de ayer, y es otra cosa: cualquiera que la lea mañana sabe qué se pensó, qué quedó abierto y qué desmentiría el plan. El riesgo que este capítulo ya advirtió —la nota que crece sin pensar— no se corre aquí: la ficha de proceso no escribe más; escribe lo que hoy no se escribe nunca.</w:t>
+      </w:r>
+    </w:p>
+    <w:p>
+      <w:pPr>
+        <w:pStyle w:val="BodyJ"/>
+      </w:pPr>
+      <w:r>
+        <w:t xml:space="preserve">El último verbo merece párrafo propio, porque es donde la ficha de resultados falla con más silencio: comprobar. "Neumonía. Ceftriaxona" no dice cuándo ni con qué se sabrá si funcionó, y así la respuesta se juzga con lo que llegue primero, que casi siempre es la PCR de las 48 horas. Si viene más alta que al ingreso, con el paciente afebril, comiendo y sin oxígeno, la nota de resultados no tiene con qué leerla y el reflejo es escalar el antibiótico. La ficha de proceso sí tiene con qué, porque escribió la predicción con su tiempo. La proteína C reactiva empieza a subir unas seis horas después del estímulo, alcanza su máximo alrededor de las 48 y tiene una vida media de unas 19 horas (Pepys &amp; Hirschfield, 2003): un valor más alto a las 48 horas no es un fracaso, es la cinética esperada de un estímulo reciente. Lo que sí informa es el cuarto día. En la cohorte de Edimburgo, una PCR de ingreso bajo 100 mg/L se asoció con menos complicaciones y menos mortalidad (Chalmers et al., 2008), y la caída de al menos la mitad al cuarto día se ha usado como marcador de estabilidad, aunque agrega poco a los criterios clínicos salvo para detectar la neumonía complicada (Akram et al., 2013). Es la lección del lactato del capítulo 1 con otro marcador: el estado del paciente manda sobre el número y la trayectoria manda sobre el valor aislado. La ficha de proceso lo deja escrito antes de que llegue el resultado: "una PCR alta a las 48 horas con paciente bien no reabre el caso; una PCR que no cae al cuarto día, sí".</w:t>
+      </w:r>
+    </w:p>
+    <w:p>
+      <w:pPr>
+        <w:pStyle w:val="Heading3"/>
+        <w:spacing w:after="120" w:before="280"/>
+      </w:pPr>
+      <w:r>
+        <w:rPr>
+          <w:rFonts w:ascii="Georgia" w:cs="Georgia" w:eastAsia="Georgia" w:hAnsi="Georgia"/>
+          <w:b/>
+          <w:bCs/>
+          <w:color w:val="2B2B2B"/>
+          <w:sz w:val="25"/>
+          <w:szCs w:val="25"/>
+        </w:rPr>
         <w:t xml:space="preserve">Temporalidad y revisión</w:t>
       </w:r>
     </w:p>
@@ -8854,6 +8990,37 @@
       </w:r>
       <w:r>
         <w:t xml:space="preserve"> toracocentesis diagnóstica hoy, guiada por ecografía, y ajuste del esquema según el estudio del líquido; si el procedimiento no se concreta en 24 h, interconsulta a cirugía de tórax. Criterio de reapertura inmediata: cualquier incremento adicional en el aporte de oxígeno o taquipnea progresiva obliga a adelantar el drenaje." Nótese que la nota copiada durante cinco días no contenía mentiras literales —el paciente seguía afebril y normotenso—, pero operaba como un fósil narrativo: describía la fisiología del día 2 ignorando la trayectoria del día 5. Desfosilizar la evolución no exigió inventar datos sofisticados, sino dejar de omitir las tendencias que ya estaban a la vista.</w:t>
+      </w:r>
+    </w:p>
+    <w:p>
+      <w:pPr>
+        <w:pStyle w:val="TallerHead"/>
+      </w:pPr>
+      <w:r>
+        <w:t xml:space="preserve">Taller 12B. Conjugue los verbos</w:t>
+      </w:r>
+    </w:p>
+    <w:p>
+      <w:pPr>
+        <w:pStyle w:val="BodyJ"/>
+      </w:pPr>
+      <w:r>
+        <w:t xml:space="preserve">Tome su última evolución de una línea —"X en tratamiento, estable"— y escriba primero las preguntas que esconde (al menos seis). Después, reescríbala como ficha de proceso en no más de ocho líneas, con los verbos: sospecho, dudé, descarto, priorizo, infiero, realizo, comprobaré, repetiré, aprendí.</w:t>
+      </w:r>
+    </w:p>
+    <w:p>
+      <w:pPr>
+        <w:pStyle w:val="BodyJ"/>
+      </w:pPr>
+      <w:r>
+        <w:rPr>
+          <w:i/>
+          <w:iCs/>
+        </w:rPr>
+        <w:t xml:space="preserve">Solución comentada.</w:t>
+      </w:r>
+      <w:r>
+        <w:t xml:space="preserve"> No hay solución única. Lo que el ejercicio suele mostrar es que la mitad de las preguntas escondidas nunca se formularon (nadie dudó de nada porque nadie preguntó), que "descarté" casi nunca viene con método, y que "comprobaré" es el verbo que más cuesta conjugar, porque obliga a predecir y a ponerle fecha a la predicción. Si la ficha de proceso no cabe en ocho líneas, está describiendo y no decidiendo: no es la historia clínica completa, es el esqueleto de las decisiones. Y si cabe en dos, probablemente faltan verbos: una nota sin "dudé" ni "comprobaré" es una ficha de resultados con otro formato.</w:t>
       </w:r>
     </w:p>
     <w:p>
@@ -9778,6 +9945,14 @@
       </w:r>
       <w:r>
         <w:t xml:space="preserve"> sostuvo que la pericia ética —y la pericia en general— no es deliberación sino un saber hacer inmediato, encarnado, que responde a la situación sin pasar por reglas ni por juicios explícitos; la deliberación aparece sólo en el quiebre, cuando la respuesta espontánea falla o la situación no calza con lo aprendido (Varela, 1996). La cirujana que dijo "programada, no hoy" en un minuto no calló un razonamiento: no lo había. Esto parece contradecir un libro que pide explicitar en cada página, y no lo contradice si se lee bien. Las pausas del capítulo 8 son los quiebres de Varela puestos por diseño donde la experiencia enseña que la respuesta inmediata se equivoca; la explicitación de la cirujana en el pasillo no fue parte de su juicio sino de su transmisión; y la ficha no fotografía la cognición del que escribe: le presta al siguiente lector lo que necesita para revisarla. Lo que Varela corrige es la descripción: la buena práctica no consiste en pensar explícitamente, consiste en responder bien y en reconocer el quiebre. Y lo que advierte es un costo: la explicitación sin disparador no protege al experto, lo degrada a principiante. Por eso la versión completa de HII-D se reserva para los casos difíciles, y la humildad de este capítulo no es la del que duda de todo, sino la del que sabe cuándo su saber hacer dejó de bastar.</w:t>
+      </w:r>
+    </w:p>
+    <w:p>
+      <w:pPr>
+        <w:pStyle w:val="BodyJ"/>
+      </w:pPr>
+      <w:r>
+        <w:t xml:space="preserve">La música ofrece la imagen más exacta de ese saber hacer, y no como metáfora. La improvisación en jazz es pericia que responde en tiempo real dentro de una estructura —la armonía, el tempo, los otros— sin deliberar nota por nota. Cuando se registró con resonancia funcional a pianistas profesionales improvisando, se observó una desactivación extensa de la corteza prefrontal dorsolateral, la región asociada al automonitoreo y al control consciente de la ejecución, junto con la activación de la corteza prefrontal medial (Limb &amp; Braun, 2008). El experto que improvisa apaga, literalmente, al supervisor. Eso es lo que Varela describe y lo que este libro no debe contradecir: la metacognición madura no es vigilancia continua, porque la vigilancia continua estropea la ejecución; es saber cuándo volver a encender al supervisor. La cirujana frente a Carmen improvisó sobre una estructura de doscientas paredes abdominales; la pausa del capítulo 8 es el momento en que el pianista deja de tocar porque escuchó una nota que no era de la pieza.</w:t>
       </w:r>
     </w:p>
     <w:p>
@@ -17348,6 +17523,21 @@
           <w:b/>
           <w:bCs/>
         </w:rPr>
+        <w:t xml:space="preserve">Ficha de proceso.</w:t>
+      </w:r>
+      <w:r>
+        <w:t xml:space="preserve"> Registro que, además de conclusiones y acciones (ficha de resultados), conjuga los verbos del razonamiento: sospechado, dudado, descartado, priorizado, inferido, realizado, repetido, comprobado, aprendido. Cada verbo cae en una capa de HII-D; "Neumonía. Ceftriaxona" no conjuga ninguno.</w:t>
+      </w:r>
+    </w:p>
+    <w:p>
+      <w:pPr>
+        <w:pStyle w:val="BodyJ"/>
+      </w:pPr>
+      <w:r>
+        <w:rPr>
+          <w:b/>
+          <w:bCs/>
+        </w:rPr>
         <w:t xml:space="preserve">Fragilidad.</w:t>
       </w:r>
       <w:r>
@@ -17487,6 +17677,21 @@
       </w:r>
       <w:r>
         <w:t xml:space="preserve"> Daño cometido contra alguien en su capacidad de sujeto de conocimiento: testimonial (credibilidad rebajada por prejuicio) o hermenéutica (falta de categorías para expresar la experiencia) (Fricker).</w:t>
+      </w:r>
+    </w:p>
+    <w:p>
+      <w:pPr>
+        <w:pStyle w:val="BodyJ"/>
+      </w:pPr>
+      <w:r>
+        <w:rPr>
+          <w:b/>
+          <w:bCs/>
+        </w:rPr>
+        <w:t xml:space="preserve">Mente del principiante (shoshin).</w:t>
+      </w:r>
+      <w:r>
+        <w:t xml:space="preserve"> Disposición, tomada del Zen, a mirar lo conocido como si fuera la primera vez, sin que el nombre decida por adelantado. Presentar el caso sin la etiqueta es su versión clínica; no reemplaza al illness script, suspende la prisa con que cierra el caso.</w:t>
       </w:r>
     </w:p>
     <w:p>
@@ -18307,6 +18512,18 @@
         </w:numPr>
       </w:pPr>
       <w:r>
+        <w:t xml:space="preserve">Ficha de proceso vs. ficha de resultados (los verbos del razonamiento) — 12; Taller 12B</w:t>
+      </w:r>
+    </w:p>
+    <w:p>
+      <w:pPr>
+        <w:pStyle w:val="BodyJ"/>
+        <w:numPr>
+          <w:ilvl w:val="0"/>
+          <w:numId w:val="6"/>
+        </w:numPr>
+      </w:pPr>
+      <w:r>
         <w:t xml:space="preserve">Fichas clínicas y plantillas — 12, 16, Ap C; ficha electrónica pensada desde HII-D — 12</w:t>
       </w:r>
     </w:p>
@@ -18451,6 +18668,18 @@
         </w:numPr>
       </w:pPr>
       <w:r>
+        <w:t xml:space="preserve">Improvisación y saber hacer (jazz; Limb y Braun) — 14</w:t>
+      </w:r>
+    </w:p>
+    <w:p>
+      <w:pPr>
+        <w:pStyle w:val="BodyJ"/>
+        <w:numPr>
+          <w:ilvl w:val="0"/>
+          <w:numId w:val="6"/>
+        </w:numPr>
+      </w:pPr>
+      <w:r>
         <w:t xml:space="preserve">Incertidumbre: taxonomía y cartografía — 3; epistémica y aleatoria — 3; knightiana — 3</w:t>
       </w:r>
     </w:p>
@@ -18559,6 +18788,18 @@
         </w:numPr>
       </w:pPr>
       <w:r>
+        <w:t xml:space="preserve">Mente del principiante (Zen, shoshin) — 8</w:t>
+      </w:r>
+    </w:p>
+    <w:p>
+      <w:pPr>
+        <w:pStyle w:val="BodyJ"/>
+        <w:numPr>
+          <w:ilvl w:val="0"/>
+          <w:numId w:val="6"/>
+        </w:numPr>
+      </w:pPr>
+      <w:r>
         <w:t xml:space="preserve">Metacognición: definición y niveles — Int, 5; monitoreo y control — 5; social (señales del equipo y del paciente) — 5, 13; sensibilidad vs. sesgo — Int, 5; auditoría de salidas de IA — 17</w:t>
       </w:r>
     </w:p>
@@ -18704,6 +18945,18 @@
       </w:pPr>
       <w:r>
         <w:t xml:space="preserve">Pronóstico e incertidumbre de plazo — CC (viñeta 5)</w:t>
+      </w:r>
+    </w:p>
+    <w:p>
+      <w:pPr>
+        <w:pStyle w:val="BodyJ"/>
+        <w:numPr>
+          <w:ilvl w:val="0"/>
+          <w:numId w:val="6"/>
+        </w:numPr>
+      </w:pPr>
+      <w:r>
+        <w:t xml:space="preserve">Proteína C reactiva: cinética y lectura temporal — 12</w:t>
       </w:r>
     </w:p>
     <w:p>
@@ -19113,6 +19366,24 @@
         <w:pStyle w:val="BodyJ"/>
       </w:pPr>
       <w:r>
+        <w:t xml:space="preserve">Akram, A. R., Chalmers, J. D., Taylor, J. K., Rutherford, J., Singanayagam, A., &amp; Hill, A. T. (2013). An evaluation of clinical stability criteria to predict hospital course in community-acquired pneumonia. </w:t>
+      </w:r>
+      <w:r>
+        <w:rPr>
+          <w:i/>
+          <w:iCs/>
+        </w:rPr>
+        <w:t xml:space="preserve">Clinical Microbiology and Infection, 19</w:t>
+      </w:r>
+      <w:r>
+        <w:t xml:space="preserve">(12), 1174–1180.</w:t>
+      </w:r>
+    </w:p>
+    <w:p>
+      <w:pPr>
+        <w:pStyle w:val="BodyJ"/>
+      </w:pPr>
+      <w:r>
         <w:t xml:space="preserve">Alves de Lima, A. (2008). Devolución constructiva: Una estrategia para mejorar el aprendizaje. </w:t>
       </w:r>
       <w:r>
@@ -19419,6 +19690,24 @@
         <w:pStyle w:val="BodyJ"/>
       </w:pPr>
       <w:r>
+        <w:t xml:space="preserve">Chalmers, J. D., Singanayagam, A., &amp; Hill, A. T. (2008). C-reactive protein is an independent predictor of severity in community-acquired pneumonia. </w:t>
+      </w:r>
+      <w:r>
+        <w:rPr>
+          <w:i/>
+          <w:iCs/>
+        </w:rPr>
+        <w:t xml:space="preserve">American Journal of Medicine, 121</w:t>
+      </w:r>
+      <w:r>
+        <w:t xml:space="preserve">(3), 219–225.</w:t>
+      </w:r>
+    </w:p>
+    <w:p>
+      <w:pPr>
+        <w:pStyle w:val="BodyJ"/>
+      </w:pPr>
+      <w:r>
         <w:t xml:space="preserve">Charlin, B., Boshuizen, H. P. A., Custers, E. J. F. M., &amp; Feltovich, P. J. (2007). Scripts and medical diagnostic knowledge: Theory and applications for clinical reasoning instruction and research. </w:t>
       </w:r>
       <w:r>
@@ -19581,6 +19870,24 @@
         <w:pStyle w:val="BodyJ"/>
       </w:pPr>
       <w:r>
+        <w:t xml:space="preserve">Dequin, P.-F., Meziani, F., Quenot, J.-P., Kamel, T., Ricard, J.-D., Badie, J., Reignier, J., Heming, N., Plantefève, G., Souweine, B., Voiriot, G., Colin, G., Frat, J.-P., Mira, J.-P., Barbarot, N., François, B., Louis, G., Gibot, S., Guitton, C., … Le Gouge, A. (2023). Hydrocortisone in severe community-acquired pneumonia. </w:t>
+      </w:r>
+      <w:r>
+        <w:rPr>
+          <w:i/>
+          <w:iCs/>
+        </w:rPr>
+        <w:t xml:space="preserve">New England Journal of Medicine, 388</w:t>
+      </w:r>
+      <w:r>
+        <w:t xml:space="preserve">(21), 1931–1941.</w:t>
+      </w:r>
+    </w:p>
+    <w:p>
+      <w:pPr>
+        <w:pStyle w:val="BodyJ"/>
+      </w:pPr>
+      <w:r>
         <w:t xml:space="preserve">Djulbegovic, B., &amp; Guyatt, G. H. (2017). Progress in evidence-based medicine: A quarter century on. </w:t>
       </w:r>
       <w:r>
@@ -20517,6 +20824,24 @@
         <w:pStyle w:val="BodyJ"/>
       </w:pPr>
       <w:r>
+        <w:t xml:space="preserve">Krasner, M. S., Epstein, R. M., Beckman, H., Suchman, A. L., Chapman, B., Mooney, C. J., &amp; Quill, T. E. (2009). Association of an educational program in mindful communication with burnout, empathy, and attitudes among primary care physicians. </w:t>
+      </w:r>
+      <w:r>
+        <w:rPr>
+          <w:i/>
+          <w:iCs/>
+        </w:rPr>
+        <w:t xml:space="preserve">JAMA, 302</w:t>
+      </w:r>
+      <w:r>
+        <w:t xml:space="preserve">(12), 1284–1293.</w:t>
+      </w:r>
+    </w:p>
+    <w:p>
+      <w:pPr>
+        <w:pStyle w:val="BodyJ"/>
+      </w:pPr>
+      <w:r>
         <w:t xml:space="preserve">Lackey, J. (2008). </w:t>
       </w:r>
       <w:r>
@@ -20607,6 +20932,24 @@
         <w:pStyle w:val="BodyJ"/>
       </w:pPr>
       <w:r>
+        <w:t xml:space="preserve">Limb, C. J., &amp; Braun, A. R. (2008). Neural substrates of spontaneous musical performance: An fMRI study of jazz improvisation. </w:t>
+      </w:r>
+      <w:r>
+        <w:rPr>
+          <w:i/>
+          <w:iCs/>
+        </w:rPr>
+        <w:t xml:space="preserve">PLoS ONE, 3</w:t>
+      </w:r>
+      <w:r>
+        <w:t xml:space="preserve">(2), e1679.</w:t>
+      </w:r>
+    </w:p>
+    <w:p>
+      <w:pPr>
+        <w:pStyle w:val="BodyJ"/>
+      </w:pPr>
+      <w:r>
         <w:t xml:space="preserve">Linder, J. A., Doctor, J. N., Friedberg, M. W., Reyes Nieva, H., Birks, C., Meeker, D., &amp; Fox, C. R. (2014). Time of day and the decision to prescribe antibiotics. </w:t>
       </w:r>
       <w:r>
@@ -21121,6 +21464,24 @@
         <w:pStyle w:val="BodyJ"/>
       </w:pPr>
       <w:r>
+        <w:t xml:space="preserve">Pepys, M. B., &amp; Hirschfield, G. M. (2003). C-reactive protein: A critical update. </w:t>
+      </w:r>
+      <w:r>
+        <w:rPr>
+          <w:i/>
+          <w:iCs/>
+        </w:rPr>
+        <w:t xml:space="preserve">Journal of Clinical Investigation, 111</w:t>
+      </w:r>
+      <w:r>
+        <w:t xml:space="preserve">(12), 1805–1812.</w:t>
+      </w:r>
+    </w:p>
+    <w:p>
+      <w:pPr>
+        <w:pStyle w:val="BodyJ"/>
+      </w:pPr>
+      <w:r>
         <w:t xml:space="preserve">Philibert, I. (2005). Sleep loss and performance in residents and nonphysicians: A meta-analytic examination. </w:t>
       </w:r>
       <w:r>
@@ -21445,6 +21806,34 @@
         <w:pStyle w:val="BodyJ"/>
       </w:pPr>
       <w:r>
+        <w:t xml:space="preserve">Suzuki, S. (1970). </w:t>
+      </w:r>
+      <w:r>
+        <w:rPr>
+          <w:i/>
+          <w:iCs/>
+        </w:rPr>
+        <w:t xml:space="preserve">Zen Mind, Beginner's Mind</w:t>
+      </w:r>
+      <w:r>
+        <w:t xml:space="preserve">. Weatherhill. [Trad. esp.: </w:t>
+      </w:r>
+      <w:r>
+        <w:rPr>
+          <w:i/>
+          <w:iCs/>
+        </w:rPr>
+        <w:t xml:space="preserve">Mente zen, mente de principiante</w:t>
+      </w:r>
+      <w:r>
+        <w:t xml:space="preserve">.]</w:t>
+      </w:r>
+    </w:p>
+    <w:p>
+      <w:pPr>
+        <w:pStyle w:val="BodyJ"/>
+      </w:pPr>
+      <w:r>
         <w:t xml:space="preserve">Taboada, P. (2000). El derecho a morir con dignidad. </w:t>
       </w:r>
       <w:r>
@@ -21715,6 +22104,24 @@
         <w:pStyle w:val="BodyJ"/>
       </w:pPr>
       <w:r>
+        <w:t xml:space="preserve">Wong, A., Otles, E., Donnelly, J. P., et al. (2021). External validation of a widely implemented proprietary sepsis prediction model in hospitalized patients. </w:t>
+      </w:r>
+      <w:r>
+        <w:rPr>
+          <w:i/>
+          <w:iCs/>
+        </w:rPr>
+        <w:t xml:space="preserve">JAMA Internal Medicine, 181</w:t>
+      </w:r>
+      <w:r>
+        <w:t xml:space="preserve">(8), 1065–1070.</w:t>
+      </w:r>
+    </w:p>
+    <w:p>
+      <w:pPr>
+        <w:pStyle w:val="BodyJ"/>
+      </w:pPr>
+      <w:r>
         <w:t xml:space="preserve">World Health Organization. (2024). </w:t>
       </w:r>
       <w:r>
@@ -21726,24 +22133,6 @@
       </w:r>
       <w:r>
         <w:t xml:space="preserve">. World Health Organization.</w:t>
-      </w:r>
-    </w:p>
-    <w:p>
-      <w:pPr>
-        <w:pStyle w:val="BodyJ"/>
-      </w:pPr>
-      <w:r>
-        <w:t xml:space="preserve">Wong, A., Otles, E., Donnelly, J. P., et al. (2021). External validation of a widely implemented proprietary sepsis prediction model in hospitalized patients. </w:t>
-      </w:r>
-      <w:r>
-        <w:rPr>
-          <w:i/>
-          <w:iCs/>
-        </w:rPr>
-        <w:t xml:space="preserve">JAMA Internal Medicine, 181</w:t>
-      </w:r>
-      <w:r>
-        <w:t xml:space="preserve">(8), 1065–1070.</w:t>
       </w:r>
     </w:p>
     <w:p>

</xml_diff>

<commit_message>
Rebuild tras los bloques A y B (156 pp, TOC 37/37) y README punto 32 con la regla de techo de 140 páginas
Co-Authored-By: Claude Fable 5.1 <noreply@anthropic.com>
Claude-Session: https://claude.ai/code/session_01SPkhDdVzUCxJwqq61ddeLW
</commit_message>
<xml_diff>
--- a/libro/Hechos_inferencias_incertidumbre_edicion_revisada.docx
+++ b/libro/Hechos_inferencias_incertidumbre_edicion_revisada.docx
@@ -427,7 +427,7 @@
         <w:rPr>
           <w:color w:val="8A8A8A"/>
         </w:rPr>
-        <w:t xml:space="preserve">43</w:t>
+        <w:t xml:space="preserve">44</w:t>
       </w:r>
     </w:p>
     <w:p>
@@ -438,7 +438,7 @@
         </w:tabs>
       </w:pPr>
       <w:r>
-        <w:t xml:space="preserve">Capítulo 8. Reflexión y desaceleración selectiva</w:t>
+        <w:t xml:space="preserve">Capítulo 8. Desacelerar: cuándo, en qué estado y con qué mente</w:t>
       </w:r>
       <w:r>
         <w:tab/>
@@ -447,7 +447,7 @@
         <w:rPr>
           <w:color w:val="8A8A8A"/>
         </w:rPr>
-        <w:t xml:space="preserve">47</w:t>
+        <w:t xml:space="preserve">48</w:t>
       </w:r>
     </w:p>
     <w:p>
@@ -467,7 +467,7 @@
         <w:rPr>
           <w:color w:val="8A8A8A"/>
         </w:rPr>
-        <w:t xml:space="preserve">53</w:t>
+        <w:t xml:space="preserve">54</w:t>
       </w:r>
     </w:p>
     <w:p>
@@ -487,7 +487,7 @@
         <w:rPr>
           <w:color w:val="8A8A8A"/>
         </w:rPr>
-        <w:t xml:space="preserve">54</w:t>
+        <w:t xml:space="preserve">55</w:t>
       </w:r>
     </w:p>
     <w:p>
@@ -507,7 +507,7 @@
         <w:rPr>
           <w:color w:val="8A8A8A"/>
         </w:rPr>
-        <w:t xml:space="preserve">55</w:t>
+        <w:t xml:space="preserve">56</w:t>
       </w:r>
     </w:p>
     <w:p>
@@ -518,7 +518,7 @@
         </w:tabs>
       </w:pPr>
       <w:r>
-        <w:t xml:space="preserve">Capítulo 10. Decidir sin certeza: umbrales, valores y lectura de la evidencia</w:t>
+        <w:t xml:space="preserve">Capítulo 10. Decidir sin certeza: umbrales, valores y bioética</w:t>
       </w:r>
       <w:r>
         <w:tab/>
@@ -527,7 +527,7 @@
         <w:rPr>
           <w:color w:val="8A8A8A"/>
         </w:rPr>
-        <w:t xml:space="preserve">59</w:t>
+        <w:t xml:space="preserve">61</w:t>
       </w:r>
     </w:p>
     <w:p>
@@ -547,7 +547,7 @@
         <w:rPr>
           <w:color w:val="8A8A8A"/>
         </w:rPr>
-        <w:t xml:space="preserve">67</w:t>
+        <w:t xml:space="preserve">68</w:t>
       </w:r>
     </w:p>
     <w:p>
@@ -567,7 +567,7 @@
         <w:rPr>
           <w:color w:val="8A8A8A"/>
         </w:rPr>
-        <w:t xml:space="preserve">70</w:t>
+        <w:t xml:space="preserve">72</w:t>
       </w:r>
     </w:p>
     <w:p>
@@ -587,7 +587,7 @@
         <w:rPr>
           <w:color w:val="8A8A8A"/>
         </w:rPr>
-        <w:t xml:space="preserve">77</w:t>
+        <w:t xml:space="preserve">79</w:t>
       </w:r>
     </w:p>
     <w:p>
@@ -607,7 +607,7 @@
         <w:rPr>
           <w:color w:val="8A8A8A"/>
         </w:rPr>
-        <w:t xml:space="preserve">82</w:t>
+        <w:t xml:space="preserve">84</w:t>
       </w:r>
     </w:p>
     <w:p>
@@ -627,7 +627,7 @@
         <w:rPr>
           <w:color w:val="8A8A8A"/>
         </w:rPr>
-        <w:t xml:space="preserve">84</w:t>
+        <w:t xml:space="preserve">86</w:t>
       </w:r>
     </w:p>
     <w:p>
@@ -647,7 +647,7 @@
         <w:rPr>
           <w:color w:val="8A8A8A"/>
         </w:rPr>
-        <w:t xml:space="preserve">85</w:t>
+        <w:t xml:space="preserve">87</w:t>
       </w:r>
     </w:p>
     <w:p>
@@ -667,7 +667,7 @@
         <w:rPr>
           <w:color w:val="8A8A8A"/>
         </w:rPr>
-        <w:t xml:space="preserve">92</w:t>
+        <w:t xml:space="preserve">93</w:t>
       </w:r>
     </w:p>
     <w:p>
@@ -687,7 +687,7 @@
         <w:rPr>
           <w:color w:val="8A8A8A"/>
         </w:rPr>
-        <w:t xml:space="preserve">99</w:t>
+        <w:t xml:space="preserve">100</w:t>
       </w:r>
     </w:p>
     <w:p>
@@ -1069,7 +1069,7 @@
         <w:t xml:space="preserve">Parte II</w:t>
       </w:r>
       <w:r>
-        <w:t xml:space="preserve"> examina la mente que se observa a sí misma: metacognición, pericia, error y desaceleración selectiva. La </w:t>
+        <w:t xml:space="preserve"> examina la mente que se observa a sí misma: metacognición, pericia, error y la pausa —cuándo desacelerar, en qué estado y con qué mente—. La </w:t>
       </w:r>
       <w:r>
         <w:rPr>
@@ -1308,7 +1308,7 @@
         <w:pStyle w:val="BodyJ"/>
       </w:pPr>
       <w:r>
-        <w:t xml:space="preserve">La estructura más elemental de este trabajo puede dividirse en cuatro capas. La primera es lo observado: hechos clínicos con una fuente y una confiabilidad determinadas. La segunda es lo inferido: hipótesis diagnósticas, explicaciones causales, pronósticos y atribuciones de relevancia. La tercera es lo incierto: aquello que no se conoce, aquello que se conoce sólo probabilísticamente y aquello cuya propia formulación es ambigua. La cuarta es lo decidido: una acción que incorpora no sólo probabilidad, sino gravedad, oportunidad, reversibilidad, preferencias y costo de los errores.</w:t>
+        <w:t xml:space="preserve">Este libro ordena ese trabajo en cuatro capas —lo observado, lo inferido, lo incierto y lo decidido— que la Figura 2 anticipa y que la Parte I desarrolla una por una.</w:t>
       </w:r>
     </w:p>
     <w:tbl>
@@ -1478,7 +1478,7 @@
         <w:t xml:space="preserve">En una frase.</w:t>
       </w:r>
       <w:r>
-        <w:t xml:space="preserve"> El conocimiento clínico tiene capas —hechos, inferencias, incertidumbre, decisión— que se mezclan con facilidad; la lucidez consiste en mantenerlas separadas pero comunicadas.</w:t>
+        <w:t xml:space="preserve"> Una nota clínica comprime cuatro operaciones —observar, inferir, reconocer lo incierto, decidir— en un solo gesto; este libro enseña a separarlas cuando importa y a dejarlas juntas cuando no.</w:t>
       </w:r>
     </w:p>
     <w:p>
@@ -3546,6 +3546,22 @@
     </w:p>
     <w:p>
       <w:pPr>
+        <w:pStyle w:val="BodyJ"/>
+      </w:pPr>
+      <w:r>
+        <w:t xml:space="preserve">Puede existir alta incertidumbre epistémica y fuerte compromiso práctico. "No conocemos el foco con certeza, pero el cuadro exige antibióticos y control de fuente mientras se investiga." También puede existir alta certeza diagnóstica y decisión expectante. Confundir ambos planos lleva a tratar para demostrar convicción o a retrasar una acción porque el nombre no está completo.</w:t>
+      </w:r>
+    </w:p>
+    <w:p>
+      <w:pPr>
+        <w:pStyle w:val="BodyJ"/>
+      </w:pPr>
+      <w:r>
+        <w:t xml:space="preserve">Reconocer incertidumbre no disminuye la responsabilidad; la hace más precisa. El médico responde por buscar la información razonablemente accesible, interpretar con competencia, comunicar límites y establecer una estrategia de reevaluación — no por volver determinista un mundo que no lo es.</w:t>
+      </w:r>
+    </w:p>
+    <w:p>
+      <w:pPr>
         <w:pStyle w:val="Quote1"/>
       </w:pPr>
       <w:r>
@@ -4906,7 +4922,7 @@
         <w:pStyle w:val="BodyJ"/>
       </w:pPr>
       <w:r>
-        <w:t xml:space="preserve">Al tercer día, la becada del servicio reescribe la evaluación de Carmen usando lo que esta parte del libro ha ido separando. Su versión:</w:t>
+        <w:t xml:space="preserve">Tercer día, 7:00. Antes de la visita, la becada del servicio abre la ficha de Carmen para escribir la evolución y se detiene en la frase que viaja intacta desde la madrugada del ingreso: "cuadro habitual, manejo habitual". La tacha. No porque sea falsa —la hernia es la de siempre—, sino porque dice a la vez más y menos de lo que hoy se sabe: no separa lo demostrado de lo probable y deja fuera la única pregunta que importa esta mañana, qué pasa si vuelve a ocurrir. Reescribe la evaluación con lo que esta parte del libro ha ido separando. Su versión:</w:t>
       </w:r>
     </w:p>
     <w:p>
@@ -5519,7 +5535,7 @@
         </w:numPr>
       </w:pPr>
       <w:r>
-        <w:t xml:space="preserve">¿Cuándo fue la última vez que supe el desenlace de un paciente que di de alta con diagnóstico incierto?</w:t>
+        <w:t xml:space="preserve">¿Cuál fue mi última predicción concreta —un cultivo, una imagen, una evolución— y la contrasté con el resultado cuando llegó, o sólo recuerdo las que acerté?</w:t>
       </w:r>
     </w:p>
     <w:p>
@@ -5747,6 +5763,32 @@
       </w:pPr>
       <w:r>
         <w:t xml:space="preserve">Enseñar la pericia clínica no puede reducirse a dictar conclusiones. Exige hacer visible qué pistas perceptivas resultaron decisivas, qué alternativas se descartaron en silencio y qué hallazgo físico habría cambiado la mano. Cuando el interno le preguntó en el pasillo cómo lo había decidido tan rápido, la cirujana hizo el ejercicio de desempaquetar su intuición: un episodio que demostró potencial letal (shock séptico) pese a un escáner sin necrosis, intervalos libres de enfermedad cada vez más cortos y un examen físico donde el abdomen "avisa pero todavía no exige" —una hernia parcialmente reductible, sensible en el anillo fibroso, pero con pared blanda y sin sufrimiento cutáneo ni irritación peritoneal—. Desplegar el juicio experto en variables observables es lo único que impide que el aprendiz imite el tono de autoridad sin haber adquirido los criterios que lo sostienen.</w:t>
+      </w:r>
+    </w:p>
+    <w:p>
+      <w:pPr>
+        <w:pStyle w:val="BodyJ"/>
+      </w:pPr>
+      <w:r>
+        <w:t xml:space="preserve">Varela, cuya obra con Maturana el capítulo 1 ya convocó, agrega una corrección que este libro debe aceptar. En las conferencias publicadas como </w:t>
+      </w:r>
+      <w:r>
+        <w:rPr>
+          <w:i/>
+          <w:iCs/>
+        </w:rPr>
+        <w:t xml:space="preserve">Ética y acción</w:t>
+      </w:r>
+      <w:r>
+        <w:t xml:space="preserve"> sostuvo que la pericia ética —y la pericia en general— no es deliberación sino un saber hacer inmediato, encarnado, que responde a la situación sin pasar por reglas ni por juicios explícitos; la deliberación aparece sólo en el quiebre, cuando la respuesta espontánea falla o la situación no calza con lo aprendido (Varela, 1996). La cirujana que abre este capítulo no calló un razonamiento en ese minuto: no lo había. Esto parece contradecir un libro que pide explicitar en cada página, y no lo contradice si se lee bien. Las pausas del capítulo 8 son los quiebres de Varela puestos por diseño donde la experiencia enseña que la respuesta inmediata se equivoca; la explicitación de la cirujana en el pasillo no fue parte de su juicio sino de su transmisión; y la ficha no fotografía la cognición del que escribe: le presta al siguiente lector lo que necesita para revisarla. Lo que Varela corrige es la descripción: la buena práctica no consiste en pensar explícitamente, consiste en responder bien y en reconocer el quiebre. Y lo que advierte es un costo: la explicitación sin disparador no protege al experto, lo degrada a principiante. Por eso la versión completa de HII-D se reserva para los casos difíciles, y la humildad que el capítulo 14 defenderá no es la del que duda de todo, sino la del que sabe cuándo su saber hacer dejó de bastar.</w:t>
+      </w:r>
+    </w:p>
+    <w:p>
+      <w:pPr>
+        <w:pStyle w:val="BodyJ"/>
+      </w:pPr>
+      <w:r>
+        <w:t xml:space="preserve">La música ofrece la imagen más exacta de ese saber hacer, y no como metáfora. La improvisación en jazz es pericia que responde en tiempo real dentro de una estructura —la armonía, el tempo, los otros— sin deliberar nota por nota. Cuando se registró con resonancia funcional a pianistas profesionales improvisando, se observó una desactivación extensa de la corteza prefrontal dorsolateral, la región asociada al automonitoreo y al control consciente de la ejecución, junto con la activación de la corteza prefrontal medial (Limb &amp; Braun, 2008). El experto que improvisa apaga, literalmente, al supervisor. Eso es lo que Varela describe y lo que este libro no debe contradecir: la metacognición madura no es vigilancia continua, porque la vigilancia continua estropea la ejecución; es saber cuándo volver a encender al supervisor. La cirujana frente a Carmen improvisó sobre una estructura de doscientas paredes abdominales; la pausa del capítulo 8 es el momento en que el pianista deja de tocar porque escuchó una nota que no era de la pieza.</w:t>
       </w:r>
     </w:p>
     <w:p>
@@ -6329,7 +6371,7 @@
           <w:szCs w:val="32"/>
         </w:rPr>
         <w:br/>
-        <w:t xml:space="preserve">Reflexión y desaceleración selectiva</w:t>
+        <w:t xml:space="preserve">Desacelerar: cuándo, en qué estado y con qué mente</w:t>
       </w:r>
     </w:p>
     <w:p>
@@ -6648,7 +6690,7 @@
         <w:t xml:space="preserve">illness script</w:t>
       </w:r>
       <w:r>
-        <w:t xml:space="preserve">: el experto que mira como principiante sigue sabiendo lo que sabe; lo que suspende es la prisa con que ese saber cierra el caso. Varela, practicante budista que escribió desde esa experiencia, dirá en el capítulo 14 lo que la une con la pericia: el saber hacer responde sin deliberar, y la deliberación entra en el quiebre. La pausa de este capítulo es ese quiebre buscado a propósito: un respiro entre el patrón que se encendió y la frase que lo fija.</w:t>
+        <w:t xml:space="preserve">: el experto que mira como principiante sigue sabiendo lo que sabe; lo que suspende es la prisa con que ese saber cierra el caso. Varela, practicante budista que escribió desde esa experiencia, dijo en el capítulo 6 lo que la une con la pericia: el saber hacer responde sin deliberar, y la deliberación entra en el quiebre. La pausa de este capítulo es ese quiebre buscado a propósito: un respiro entre el patrón que se encendió y la frase que lo fija.</w:t>
       </w:r>
     </w:p>
     <w:p>
@@ -6928,7 +6970,7 @@
         <w:pStyle w:val="PartIntro"/>
       </w:pPr>
       <w:r>
-        <w:t xml:space="preserve">Las dos primeras partes examinaron el conocimiento y la mente que lo maneja. Esta parte los pone en movimiento: la evidencia poblacional que debe traducirse a una persona (capítulo 9), la decisión por umbrales donde los valores entran al cálculo y los ensayos se leen con su marco a la vista (capítulo 10), el tiempo que transforma el significado de los hechos (capítulo 11), la ficha que piensa o que fosiliza (capítulo 12) y el equipo donde el conocimiento circula, se degrada o se corrige, incluida la conversación con el paciente (capítulo 13). El interludio final encuentra a Carmen frente a una decisión de verdad.</w:t>
+        <w:t xml:space="preserve">Las dos primeras partes examinaron el conocimiento y la mente que lo maneja. Esta parte los pone en movimiento: la evidencia poblacional que debe leerse con su marco a la vista y traducirse a una persona (capítulo 9), la decisión por umbrales donde los valores entran al cálculo y la bioética entra en la premisa (capítulo 10), el tiempo que transforma el significado de los hechos (capítulo 11), la ficha que piensa o que fosiliza (capítulo 12) y el equipo donde el conocimiento circula, se degrada o se corrige, incluida la conversación con el paciente (capítulo 13). El interludio final encuentra a Carmen frente a una decisión de verdad.</w:t>
       </w:r>
     </w:p>
     <w:p>
@@ -7156,6 +7198,130 @@
           <w:sz w:val="25"/>
           <w:szCs w:val="25"/>
         </w:rPr>
+        <w:t xml:space="preserve">Una década sobre un mismo dato: la saga ANDROMEDA</w:t>
+      </w:r>
+    </w:p>
+    <w:p>
+      <w:pPr>
+        <w:pStyle w:val="BodyJ"/>
+      </w:pPr>
+      <w:r>
+        <w:t xml:space="preserve">Antes de traducir un resultado al caso hay que leerlo, y leerlo ya es una decisión. Pocas historias recientes lo muestran mejor. En 2019, un ensayo multicéntrico conducido desde una red latinoamericana de investigación en medicina intensiva comparó dos blancos para reanimar el shock séptico: normalizar el lactato o normalizar el relleno capilar. El grupo guiado por la perfusión periférica tuvo una mortalidad absoluta 8,5 puntos menor; el valor p fue 0,06 y el ensayo quedó declarado "negativo" según la convención (Hernández et al., 2019). ¿Qué debía hacer un clínico con ese resultado? El umbral de significación que lo declaró negativo no es una ley de la naturaleza: es el riesgo inductivo que el capítulo siguiente desarrolla, institucionalizado en un número. Un reanálisis bayesiano lo hizo explícito: bajo cualquier prior razonable, la probabilidad de que la estrategia guiada por perfusión fuera superior excedía el 90% (Zampieri et al., 2020). El mismo dato, dos marcos de lectura, dos frases distintas para la ficha.</w:t>
+      </w:r>
+    </w:p>
+    <w:p>
+      <w:pPr>
+        <w:pStyle w:val="BodyJ"/>
+      </w:pPr>
+      <w:r>
+        <w:t xml:space="preserve">La respuesta madura del propio grupo no fue proclamar victoria ni acatar el veredicto: fue refinar la hipótesis —fenotipos hemodinámicos, un algoritmo personalizado— y volver a someterla a una prueba más severa. Seis años después, el segundo ensayo, ahora en 86 centros de 19 países, mostró que la estrategia personalizada guiada por relleno capilar era superior al cuidado habitual (Hernández et al., 2025). La saga deja tres lecciones para este capítulo: un ensayo no se lee solo, porque el marco inferencial es parte de la lectura; "no significativo" no significa "sin efecto", y tratarlos como sinónimos es una decisión con costos; y la incertidumbre residual no se resuelve con retórica, sino con la siguiente pregunta bien diseñada. Hay una cuarta lección que excede la epistemología: esa ciencia de primera línea se hizo desde América Latina, coordinada desde Chile — el mismo continente clínico desde el que este libro escribe.</w:t>
+      </w:r>
+    </w:p>
+    <w:tbl>
+      <w:tblPr>
+        <w:tblW w:type="dxa" w:w="9026"/>
+        <w:tblBorders>
+          <w:top w:val="none" w:color="FFFFFF" w:sz="0"/>
+          <w:left w:val="none" w:color="FFFFFF" w:sz="0"/>
+          <w:bottom w:val="none" w:color="FFFFFF" w:sz="0"/>
+          <w:right w:val="none" w:color="FFFFFF" w:sz="0"/>
+          <w:insideH w:val="none" w:color="FFFFFF" w:sz="0"/>
+          <w:insideV w:val="none" w:color="FFFFFF" w:sz="0"/>
+        </w:tblBorders>
+      </w:tblPr>
+      <w:tblGrid>
+        <w:gridCol w:w="9026"/>
+      </w:tblGrid>
+      <w:tr>
+        <w:trPr>
+          <w:cantSplit/>
+        </w:trPr>
+        <w:tc>
+          <w:tcPr>
+            <w:tcW w:type="dxa" w:w="9026"/>
+            <w:tcBorders>
+              <w:top w:val="none" w:color="FFFFFF" w:sz="0"/>
+              <w:left w:val="none" w:color="FFFFFF" w:sz="0"/>
+              <w:bottom w:val="none" w:color="FFFFFF" w:sz="0"/>
+              <w:right w:val="none" w:color="FFFFFF" w:sz="0"/>
+            </w:tcBorders>
+          </w:tcPr>
+          <w:p>
+            <w:pPr>
+              <w:spacing w:after="40" w:before="200"/>
+              <w:jc w:val="center"/>
+            </w:pPr>
+            <w:r>
+              <w:drawing>
+                <wp:inline distT="0" distB="0" distL="0" distR="0">
+                  <wp:extent cx="5619750" cy="2714625"/>
+                  <wp:effectExtent t="0" r="0" b="0" l="0"/>
+                  <wp:docPr id="1" name="" descr="" title=""/>
+                  <wp:cNvGraphicFramePr>
+                    <a:graphicFrameLocks xmlns:a="http://schemas.openxmlformats.org/drawingml/2006/main" noChangeAspect="1"/>
+                  </wp:cNvGraphicFramePr>
+                  <a:graphic xmlns:a="http://schemas.openxmlformats.org/drawingml/2006/main">
+                    <a:graphicData uri="http://schemas.openxmlformats.org/drawingml/2006/picture">
+                      <pic:pic xmlns:pic="http://schemas.openxmlformats.org/drawingml/2006/picture">
+                        <pic:nvPicPr>
+                          <pic:cNvPr id="0" name="" descr=""/>
+                          <pic:cNvPicPr>
+                            <a:picLocks noChangeAspect="1" noChangeArrowheads="1"/>
+                          </pic:cNvPicPr>
+                        </pic:nvPicPr>
+                        <pic:blipFill>
+                          <a:blip r:embed="rId18" cstate="none"/>
+                          <a:srcRect/>
+                          <a:stretch>
+                            <a:fillRect/>
+                          </a:stretch>
+                        </pic:blipFill>
+                        <pic:spPr bwMode="auto">
+                          <a:xfrm>
+                            <a:off x="0" y="0"/>
+                            <a:ext cx="5619750" cy="2714625"/>
+                          </a:xfrm>
+                          <a:prstGeom prst="rect">
+                            <a:avLst/>
+                          </a:prstGeom>
+                        </pic:spPr>
+                      </pic:pic>
+                    </a:graphicData>
+                  </a:graphic>
+                </wp:inline>
+              </w:drawing>
+            </w:r>
+          </w:p>
+          <w:p>
+            <w:pPr>
+              <w:pStyle w:val="Caption"/>
+            </w:pPr>
+            <w:r>
+              <w:t xml:space="preserve">Figura 10. Una década sobre un mismo dato: la saga ANDROMEDA. El mismo programa de investigación atraviesa un ensayo "negativo", su relectura bayesiana y una segunda prueba más severa — la trayectoria completa que este capítulo propone como modelo de lectura de la evidencia.</w:t>
+            </w:r>
+          </w:p>
+        </w:tc>
+      </w:tr>
+    </w:tbl>
+    <w:p>
+      <w:pPr>
+        <w:spacing w:after="60"/>
+      </w:pPr>
+    </w:p>
+    <w:p>
+      <w:pPr>
+        <w:pStyle w:val="Heading3"/>
+        <w:spacing w:after="120" w:before="280"/>
+      </w:pPr>
+      <w:r>
+        <w:rPr>
+          <w:rFonts w:ascii="Georgia" w:cs="Georgia" w:eastAsia="Georgia" w:hAnsi="Georgia"/>
+          <w:b/>
+          <w:bCs/>
+          <w:color w:val="2B2B2B"/>
+          <w:sz w:val="25"/>
+          <w:szCs w:val="25"/>
+        </w:rPr>
         <w:t xml:space="preserve">Singularidad sin arbitrariedad: evidencia externa, local y del propio caso</w:t>
       </w:r>
     </w:p>
@@ -7203,7 +7369,7 @@
         <w:t xml:space="preserve">En una frase.</w:t>
       </w:r>
       <w:r>
-        <w:t xml:space="preserve"> Un resultado de investigación es un hecho sobre una población; su aplicabilidad a esta persona es una inferencia que debe hacerse explícita — traducir no es obedecer al estudio ni improvisar contra él.</w:t>
+        <w:t xml:space="preserve"> Leer un ensayo es ya una decisión sobre su marco; traducirlo a esta persona es una inferencia que debe declararse — ni obedecer al estudio ni improvisar contra él.</w:t>
       </w:r>
     </w:p>
     <w:p>
@@ -7240,7 +7406,7 @@
         </w:numPr>
       </w:pPr>
       <w:r>
-        <w:t xml:space="preserve">¿Qué rasgo concreto de este caso modifica la inferencia poblacional — y puedo nombrarlo, o sólo lo intuyo?</w:t>
+        <w:t xml:space="preserve">El último ensayo "negativo" que cité: ¿mostró ausencia de efecto o ausencia de significación — y traté esa diferencia como si no existiera?</w:t>
       </w:r>
     </w:p>
     <w:p>
@@ -7282,15 +7448,15 @@
           <w:szCs w:val="32"/>
         </w:rPr>
         <w:br/>
-        <w:t xml:space="preserve">Decidir sin certeza: umbrales, valores y lectura de la evidencia</w:t>
-      </w:r>
-    </w:p>
-    <w:p>
-      <w:pPr>
-        <w:pStyle w:val="BodyJ"/>
-      </w:pPr>
-      <w:r>
-        <w:t xml:space="preserve">Supongamos resuelto lo anterior: la evidencia está traducida, la probabilidad estimada, el caso representado. Queda la pregunta que ninguna estimación responde sola: ¿y ahora qué hacemos? Este capítulo trata del tramo final — donde la probabilidad se encuentra con las consecuencias, los valores entran al cálculo sin pedir permiso, la decisión técnica se cruza con la bioética, y hasta la lectura de un ensayo resulta ser una decisión.</w:t>
+        <w:t xml:space="preserve">Decidir sin certeza: umbrales, valores y bioética</w:t>
+      </w:r>
+    </w:p>
+    <w:p>
+      <w:pPr>
+        <w:pStyle w:val="BodyJ"/>
+      </w:pPr>
+      <w:r>
+        <w:t xml:space="preserve">Supongamos resuelto lo anterior: la evidencia está traducida, la probabilidad estimada, el caso representado. Queda la pregunta que ninguna estimación responde sola: ¿y ahora qué hacemos? Este capítulo trata del tramo final — donde la probabilidad se encuentra con las consecuencias, los valores entran al cálculo sin pedir permiso y la decisión técnica se cruza con la bioética.</w:t>
       </w:r>
     </w:p>
     <w:p>
@@ -7379,7 +7545,7 @@
                           </pic:cNvPicPr>
                         </pic:nvPicPr>
                         <pic:blipFill>
-                          <a:blip r:embed="rId18" cstate="none"/>
+                          <a:blip r:embed="rId19" cstate="none"/>
                           <a:srcRect/>
                           <a:stretch>
                             <a:fillRect/>
@@ -7406,7 +7572,7 @@
               <w:pStyle w:val="Caption"/>
             </w:pPr>
             <w:r>
-              <w:t xml:space="preserve">Figura 10. El enfoque de umbrales de Pauker y Kassirer: la probabilidad de enfermedad se divide en tres zonas de conducta. Los umbrales no son fijos: se desplazan según el daño de omitir, el riesgo de la intervención y el rendimiento de las pruebas disponibles.</w:t>
+              <w:t xml:space="preserve">Figura 11. El enfoque de umbrales de Pauker y Kassirer: la probabilidad de enfermedad se divide en tres zonas de conducta. Los umbrales no son fijos: se desplazan según el daño de omitir, el riesgo de la intervención y el rendimiento de las pruebas disponibles.</w:t>
             </w:r>
           </w:p>
         </w:tc>
@@ -7447,7 +7613,7 @@
         <w:pStyle w:val="BodyJ"/>
       </w:pPr>
       <w:r>
-        <w:t xml:space="preserve">Ilustremos esta asimetría de costos con los dos momentos de Carmen. En la madrugada del ingreso, con la paciente en shock pero con una tomografía sin necrosis ni perforación libre, entrar a pabellón en plena inestabilidad hemodinámica conllevaba una mortalidad perioperatoria altísima; como el cuadro cedió rápidamente con descompresión nasogástrica y antibióticos, el umbral para una cirugía de rescate inmediato era muy alto y fue prudente no cruzarlo. Días después, con Carmen recuperada en sala, la matriz de consecuencias se invierte: el error más costoso ya no es operar a una paciente inestable, sino enviarla de alta con el anillo herniario intacto y que un quinto atascamiento reproduzca el shock séptico en su domicilio, lejos de una cama crítica. La anatomía radiológica es la misma; lo que desplazó el umbral terapéutico hacia la reparación electiva fue el nuevo peso pronóstico del error de omisión. La Figura 11 pone los dos momentos uno junto al otro.</w:t>
+        <w:t xml:space="preserve">Ilustremos esta asimetría de costos con los dos momentos de Carmen. En la madrugada del ingreso, con la paciente en shock pero con una tomografía sin necrosis ni perforación libre, entrar a pabellón en plena inestabilidad hemodinámica conllevaba una mortalidad perioperatoria altísima; como el cuadro cedió rápidamente con descompresión nasogástrica y antibióticos, el umbral para una cirugía de rescate inmediato era muy alto y fue prudente no cruzarlo. Días después, con Carmen recuperada en sala, la matriz de consecuencias se invierte: el error más costoso ya no es operar a una paciente inestable, sino enviarla de alta con el anillo herniario intacto y que un quinto atascamiento reproduzca el shock séptico en su domicilio, lejos de una cama crítica. La anatomía radiológica es la misma; lo que desplazó el umbral terapéutico hacia la reparación electiva fue el nuevo peso pronóstico del error de omisión. La Figura 12 pone los dos momentos uno junto al otro.</w:t>
       </w:r>
     </w:p>
     <w:tbl>
@@ -7503,7 +7669,7 @@
                           </pic:cNvPicPr>
                         </pic:nvPicPr>
                         <pic:blipFill>
-                          <a:blip r:embed="rId19" cstate="none"/>
+                          <a:blip r:embed="rId20" cstate="none"/>
                           <a:srcRect/>
                           <a:stretch>
                             <a:fillRect/>
@@ -7530,7 +7696,7 @@
               <w:pStyle w:val="Caption"/>
             </w:pPr>
             <w:r>
-              <w:t xml:space="preserve">Figura 11. La línea de tiempo de Carmen y el umbral que se mueve: en la madrugada, el daño esperado de operar en shock supera al de esperar; al día 7, el daño esperado de un alta sin operar supera al de una cirugía programada. Los hechos anatómicos no cambiaron; cambió el costo del error de omisión.</w:t>
+              <w:t xml:space="preserve">Figura 12. La línea de tiempo de Carmen y el umbral que se mueve: en la madrugada, el daño esperado de operar en shock supera al de esperar; al día 7, el daño esperado de un alta sin operar supera al de una cirugía programada. Los hechos anatómicos no cambiaron; cambió el costo del error de omisión.</w:t>
             </w:r>
           </w:p>
         </w:tc>
@@ -7606,130 +7772,6 @@
           <w:sz w:val="25"/>
           <w:szCs w:val="25"/>
         </w:rPr>
-        <w:t xml:space="preserve">Una década sobre un mismo dato: la saga ANDROMEDA</w:t>
-      </w:r>
-    </w:p>
-    <w:p>
-      <w:pPr>
-        <w:pStyle w:val="BodyJ"/>
-      </w:pPr>
-      <w:r>
-        <w:t xml:space="preserve">Pocas historias recientes muestran mejor cómo se lee —y se relee— la evidencia. En 2019, un ensayo multicéntrico conducido desde una red latinoamericana de investigación en medicina intensiva comparó dos blancos para reanimar el shock séptico: normalizar el lactato o normalizar el relleno capilar. El grupo guiado por la perfusión periférica tuvo una mortalidad absoluta 8,5 puntos menor; el valor p fue 0,06 y el ensayo quedó declarado "negativo" según la convención (Hernández et al., 2019). ¿Qué debía hacer un clínico con ese resultado? El umbral de significación que lo declaró negativo no es una ley de la naturaleza: es el riesgo inductivo de la sección anterior, institucionalizado en un número. Un reanálisis bayesiano lo hizo explícito: bajo cualquier prior razonable, la probabilidad de que la estrategia guiada por perfusión fuera superior excedía el 90% (Zampieri et al., 2020). El mismo dato, dos marcos de lectura, dos frases distintas para la ficha.</w:t>
-      </w:r>
-    </w:p>
-    <w:p>
-      <w:pPr>
-        <w:pStyle w:val="BodyJ"/>
-      </w:pPr>
-      <w:r>
-        <w:t xml:space="preserve">La respuesta madura del propio grupo no fue proclamar victoria ni acatar el veredicto: fue refinar la hipótesis —fenotipos hemodinámicos, un algoritmo personalizado— y volver a someterla a una prueba más severa. Seis años después, el segundo ensayo, ahora en 86 centros de 19 países, mostró que la estrategia personalizada guiada por relleno capilar era superior al cuidado habitual (Hernández et al., 2025). La saga deja tres lecciones para este capítulo: un ensayo no se lee solo, porque el marco inferencial es parte de la lectura; "no significativo" no significa "sin efecto", y tratarlos como sinónimos es una decisión con costos; y la incertidumbre residual no se resuelve con retórica, sino con la siguiente pregunta bien diseñada. Hay una cuarta lección que excede la epistemología: esa ciencia de primera línea se hizo desde América Latina, coordinada desde Chile — el mismo continente clínico desde el que este libro escribe.</w:t>
-      </w:r>
-    </w:p>
-    <w:tbl>
-      <w:tblPr>
-        <w:tblW w:type="dxa" w:w="9026"/>
-        <w:tblBorders>
-          <w:top w:val="none" w:color="FFFFFF" w:sz="0"/>
-          <w:left w:val="none" w:color="FFFFFF" w:sz="0"/>
-          <w:bottom w:val="none" w:color="FFFFFF" w:sz="0"/>
-          <w:right w:val="none" w:color="FFFFFF" w:sz="0"/>
-          <w:insideH w:val="none" w:color="FFFFFF" w:sz="0"/>
-          <w:insideV w:val="none" w:color="FFFFFF" w:sz="0"/>
-        </w:tblBorders>
-      </w:tblPr>
-      <w:tblGrid>
-        <w:gridCol w:w="9026"/>
-      </w:tblGrid>
-      <w:tr>
-        <w:trPr>
-          <w:cantSplit/>
-        </w:trPr>
-        <w:tc>
-          <w:tcPr>
-            <w:tcW w:type="dxa" w:w="9026"/>
-            <w:tcBorders>
-              <w:top w:val="none" w:color="FFFFFF" w:sz="0"/>
-              <w:left w:val="none" w:color="FFFFFF" w:sz="0"/>
-              <w:bottom w:val="none" w:color="FFFFFF" w:sz="0"/>
-              <w:right w:val="none" w:color="FFFFFF" w:sz="0"/>
-            </w:tcBorders>
-          </w:tcPr>
-          <w:p>
-            <w:pPr>
-              <w:spacing w:after="40" w:before="200"/>
-              <w:jc w:val="center"/>
-            </w:pPr>
-            <w:r>
-              <w:drawing>
-                <wp:inline distT="0" distB="0" distL="0" distR="0">
-                  <wp:extent cx="5619750" cy="2714625"/>
-                  <wp:effectExtent t="0" r="0" b="0" l="0"/>
-                  <wp:docPr id="1" name="" descr="" title=""/>
-                  <wp:cNvGraphicFramePr>
-                    <a:graphicFrameLocks xmlns:a="http://schemas.openxmlformats.org/drawingml/2006/main" noChangeAspect="1"/>
-                  </wp:cNvGraphicFramePr>
-                  <a:graphic xmlns:a="http://schemas.openxmlformats.org/drawingml/2006/main">
-                    <a:graphicData uri="http://schemas.openxmlformats.org/drawingml/2006/picture">
-                      <pic:pic xmlns:pic="http://schemas.openxmlformats.org/drawingml/2006/picture">
-                        <pic:nvPicPr>
-                          <pic:cNvPr id="0" name="" descr=""/>
-                          <pic:cNvPicPr>
-                            <a:picLocks noChangeAspect="1" noChangeArrowheads="1"/>
-                          </pic:cNvPicPr>
-                        </pic:nvPicPr>
-                        <pic:blipFill>
-                          <a:blip r:embed="rId20" cstate="none"/>
-                          <a:srcRect/>
-                          <a:stretch>
-                            <a:fillRect/>
-                          </a:stretch>
-                        </pic:blipFill>
-                        <pic:spPr bwMode="auto">
-                          <a:xfrm>
-                            <a:off x="0" y="0"/>
-                            <a:ext cx="5619750" cy="2714625"/>
-                          </a:xfrm>
-                          <a:prstGeom prst="rect">
-                            <a:avLst/>
-                          </a:prstGeom>
-                        </pic:spPr>
-                      </pic:pic>
-                    </a:graphicData>
-                  </a:graphic>
-                </wp:inline>
-              </w:drawing>
-            </w:r>
-          </w:p>
-          <w:p>
-            <w:pPr>
-              <w:pStyle w:val="Caption"/>
-            </w:pPr>
-            <w:r>
-              <w:t xml:space="preserve">Figura 12. Una década sobre un mismo dato: la saga ANDROMEDA. El mismo programa de investigación atraviesa un ensayo "negativo", su relectura bayesiana y una segunda prueba más severa — la trayectoria completa que este capítulo propone como modelo de lectura de la evidencia.</w:t>
-            </w:r>
-          </w:p>
-        </w:tc>
-      </w:tr>
-    </w:tbl>
-    <w:p>
-      <w:pPr>
-        <w:spacing w:after="60"/>
-      </w:pPr>
-    </w:p>
-    <w:p>
-      <w:pPr>
-        <w:pStyle w:val="Heading3"/>
-        <w:spacing w:after="120" w:before="280"/>
-      </w:pPr>
-      <w:r>
-        <w:rPr>
-          <w:rFonts w:ascii="Georgia" w:cs="Georgia" w:eastAsia="Georgia" w:hAnsi="Georgia"/>
-          <w:b/>
-          <w:bCs/>
-          <w:color w:val="2B2B2B"/>
-          <w:sz w:val="25"/>
-          <w:szCs w:val="25"/>
-        </w:rPr>
         <w:t xml:space="preserve">El cruce con la bioética: el contexto global del paciente como hecho clínico</w:t>
       </w:r>
     </w:p>
@@ -7779,39 +7821,6 @@
       </w:pPr>
       <w:r>
         <w:t xml:space="preserve">El lector encontrará este cruce ejecutado dos veces en este libro sin la palabra "bioética": en la conversación donde la cirujana recomienda operar a Carmen y le devuelve la decisión (Interludio III), y en la viñeta del final de la vida, donde la incertidumbre que domina no es pronóstica sino de metas (Cuaderno de casos, viñeta 5). En ambas, lo decisivo no fue un principio abstracto: fue que la funcionalidad, la trayectoria y los fines del paciente estuvieran dentro del razonamiento desde el principio. Esa es la tesis de esta sección: la bioética no llega al final a ponerle límites a un razonamiento ya terminado — estaba en el principio, decidiendo qué se mira. Una decisión que ignoró la funcionalidad, el pronóstico de fondo y la red de apoyo no es más "objetiva" por haberse limitado a lo técnico: es más incompleta. Le faltan hechos, no sólo sensibilidad.</w:t>
-      </w:r>
-    </w:p>
-    <w:p>
-      <w:pPr>
-        <w:pStyle w:val="Heading3"/>
-        <w:spacing w:after="120" w:before="280"/>
-      </w:pPr>
-      <w:r>
-        <w:rPr>
-          <w:rFonts w:ascii="Georgia" w:cs="Georgia" w:eastAsia="Georgia" w:hAnsi="Georgia"/>
-          <w:b/>
-          <w:bCs/>
-          <w:color w:val="2B2B2B"/>
-          <w:sz w:val="25"/>
-          <w:szCs w:val="25"/>
-        </w:rPr>
-        <w:t xml:space="preserve">Certeza epistémica y compromiso práctico</w:t>
-      </w:r>
-    </w:p>
-    <w:p>
-      <w:pPr>
-        <w:pStyle w:val="BodyJ"/>
-      </w:pPr>
-      <w:r>
-        <w:t xml:space="preserve">Puede existir alta incertidumbre epistémica y fuerte compromiso práctico. "No conocemos el foco con certeza, pero el cuadro exige antibióticos y control de fuente mientras se investiga." También puede existir alta certeza diagnóstica y decisión expectante. Confundir ambos planos lleva a tratar para demostrar convicción o a retrasar una acción porque el nombre no está completo.</w:t>
-      </w:r>
-    </w:p>
-    <w:p>
-      <w:pPr>
-        <w:pStyle w:val="BodyJ"/>
-      </w:pPr>
-      <w:r>
-        <w:t xml:space="preserve">Reconocer incertidumbre no disminuye la responsabilidad; la hace más precisa. El médico responde por buscar la información razonablemente accesible, interpretar con competencia, comunicar límites y establecer una estrategia de reevaluación — no por volver determinista un mundo que no lo es.</w:t>
       </w:r>
     </w:p>
     <w:p>
@@ -7987,7 +7996,7 @@
         <w:t xml:space="preserve">En una frase.</w:t>
       </w:r>
       <w:r>
-        <w:t xml:space="preserve"> Decidir sin certeza no es un mal menor: es la forma normal del juicio clínico cuando trabaja bien — umbrales explícitos, valores declarados, el contexto global del paciente dentro del cálculo y ensayos leídos con su marco inferencial a la vista.</w:t>
+        <w:t xml:space="preserve"> Decidir sin certeza no es un mal menor: es la forma normal del juicio clínico cuando trabaja bien — umbrales explícitos, valores declarados y el contexto global del paciente dentro del cálculo.</w:t>
       </w:r>
     </w:p>
     <w:p>
@@ -8036,7 +8045,7 @@
         </w:numPr>
       </w:pPr>
       <w:r>
-        <w:t xml:space="preserve">El último ensayo "negativo" que cité: ¿mostró ausencia de efecto o ausencia de significación — y traté esa diferencia como si no existiera?</w:t>
+        <w:t xml:space="preserve">De mi paciente más grave de hoy: ¿sé cómo funcionaba antes de enfermar, con quién vive y qué espera del tratamiento — y está escrito en alguna parte?</w:t>
       </w:r>
     </w:p>
     <w:p>
@@ -8133,6 +8142,14 @@
       </w:pPr>
       <w:r>
         <w:t xml:space="preserve">La evolución puede funcionar como prueba diagnóstica. La aparición de un signo esperado, la ausencia persistente de una complicación o la respuesta a una intervención modifican probabilidades. Pero la prueba temporal rara vez es específica. Mejorar con antibióticos no demuestra por sí solo una etiología bacteriana; también pudieron actuar el soporte, el drenaje, la historia natural o tratamientos simultáneos. La respuesta terapéutica es un hecho; atribuirle un mecanismo es una inferencia.</w:t>
+      </w:r>
+    </w:p>
+    <w:p>
+      <w:pPr>
+        <w:pStyle w:val="BodyJ"/>
+      </w:pPr>
+      <w:r>
+        <w:t xml:space="preserve">Los marcadores tienen, además, su propio tiempo, y leerlos sin él fabrica falsos fracasos. La proteína C reactiva empieza a subir unas seis horas después del estímulo, alcanza su máximo alrededor de las 48 y tiene una vida media de unas 19 horas (Pepys &amp; Hirschfield, 2003). Una PCR de las 48 horas más alta que la del ingreso, en una neumonía cuyo paciente ya está afebril, comiendo y sin oxígeno, no es un fracaso del antibiótico: es la cinética esperada de un estímulo reciente, y escalar el tratamiento por ella es tratar al número. Lo que informa es el cuarto día. En la cohorte de Edimburgo, una PCR de ingreso bajo 100 mg/L se asoció con menos complicaciones y menos mortalidad (Chalmers et al., 2008), y la caída de al menos la mitad al cuarto día se ha usado como marcador de estabilidad, aunque agrega poco a los criterios clínicos salvo para detectar la neumonía complicada (Akram et al., 2013). Es la lección del lactato del capítulo 1 con otro marcador: el estado del paciente manda sobre el número y la trayectoria manda sobre el valor aislado. Por eso una predicción útil lleva su plazo escrito: no "PCR en descenso", sino "PCR en descenso al cuarto día".</w:t>
       </w:r>
     </w:p>
     <w:p>
@@ -8877,7 +8894,7 @@
         <w:pStyle w:val="BodyJ"/>
       </w:pPr>
       <w:r>
-        <w:t xml:space="preserve">El último verbo merece párrafo propio, porque es donde la ficha de resultados falla con más silencio: comprobar. "Neumonía. Ceftriaxona" no dice cuándo ni con qué se sabrá si funcionó, y así la respuesta se juzga con lo que llegue primero, que casi siempre es la PCR de las 48 horas. Si viene más alta que al ingreso, con el paciente afebril, comiendo y sin oxígeno, la nota de resultados no tiene con qué leerla y el reflejo es escalar el antibiótico. La ficha de proceso sí tiene con qué, porque escribió la predicción con su tiempo. La proteína C reactiva empieza a subir unas seis horas después del estímulo, alcanza su máximo alrededor de las 48 y tiene una vida media de unas 19 horas (Pepys &amp; Hirschfield, 2003): un valor más alto a las 48 horas no es un fracaso, es la cinética esperada de un estímulo reciente. Lo que sí informa es el cuarto día. En la cohorte de Edimburgo, una PCR de ingreso bajo 100 mg/L se asoció con menos complicaciones y menos mortalidad (Chalmers et al., 2008), y la caída de al menos la mitad al cuarto día se ha usado como marcador de estabilidad, aunque agrega poco a los criterios clínicos salvo para detectar la neumonía complicada (Akram et al., 2013). Es la lección del lactato del capítulo 1 con otro marcador: el estado del paciente manda sobre el número y la trayectoria manda sobre el valor aislado. La ficha de proceso lo deja escrito antes de que llegue el resultado: "una PCR alta a las 48 horas con paciente bien no reabre el caso; una PCR que no cae al cuarto día, sí".</w:t>
+        <w:t xml:space="preserve">El último verbo merece párrafo propio, porque es donde la ficha de resultados falla con más silencio: comprobar. "Neumonía. Ceftriaxona" no dice cuándo ni con qué se sabrá si funcionó, y así la respuesta se juzga con lo que llegue primero, que casi siempre es la PCR de las 48 horas. Si viene más alta que al ingreso, con el paciente afebril, comiendo y sin oxígeno, la nota de resultados no tiene con qué leerla y el reflejo es escalar el antibiótico. La ficha de proceso sí tiene con qué, porque escribió la predicción con su tiempo —la cinética del marcador que el capítulo 11 describió— y la dejó anotada antes de que llegara el resultado: "una PCR alta a las 48 horas con paciente bien no reabre el caso; una PCR que no cae al cuarto día, sí".</w:t>
       </w:r>
     </w:p>
     <w:p>
@@ -9918,49 +9935,23 @@
         <w:pStyle w:val="BodyJ"/>
       </w:pPr>
       <w:r>
-        <w:t xml:space="preserve">Tercero —y es el efecto más clínico de todos—, permite reubicar el foco y el manejo. La dirección de la atención diagnóstica no es un voto de por vida: es una asignación provisional de recursos, revisable cuando la trayectoria contradice el mapa. El humilde redirige sin vivirlo como derrota — de lo urinario a lo abdominal, de la lesión estructural al trastorno funcional, del objetivo curativo al de confort — y ajusta el tratamiento con la misma naturalidad con que lo inició. El orgulloso, en cambio, defiende su primera formulación como se defiende una propiedad, y convierte cada dato discordante en un ataque que repeler. El anclaje del capítulo 7 es, visto así, un fracaso de humildad antes que un fallo de memoria: la información nueva estaba disponible; lo que faltó fue la disposición a dejarla mandar.</w:t>
-      </w:r>
-    </w:p>
-    <w:p>
-      <w:pPr>
-        <w:pStyle w:val="BodyJ"/>
-      </w:pPr>
-      <w:r>
-        <w:t xml:space="preserve">Vista así, la humildad no es una virtud separada de la phronesis que este libro viene invocando desde el capítulo 6: es su condición de funcionamiento. La prudencia práctica integra, en el caso particular, lo que ningún algoritmo integra por nosotros — conocimiento causal, emoción leída como dato, valores del paciente y oportunidad: el momento de actuar ahora o esperar. Esa integración sólo permanece honesta si alguien vigila sus límites, y la humildad es exactamente eso: la phronesis vuelta sobre sí misma, la parte de la prudencia que sabe cuánta de la propia prudencia es conjetura. Con ella queda a la vista el hilo que el libro venía tendiendo: el capítulo 2 mostró la abducción — la conjetura que crea explicaciones —; el capítulo 5, la metacognición que la vigila mientras trabaja; la humildad es la disposición que la mantiene abierta cuando ya produjo una respuesta cómoda. Generar, vigilar, mantener abierto: tres nombres de una misma lealtad al caso.</w:t>
-      </w:r>
-    </w:p>
-    <w:p>
-      <w:pPr>
-        <w:pStyle w:val="BodyJ"/>
-      </w:pPr>
-      <w:r>
-        <w:t xml:space="preserve">Varela, desde la otra orilla del mismo pensamiento chileno, agrega una corrección que este libro debe aceptar. En las conferencias publicadas como </w:t>
-      </w:r>
-      <w:r>
-        <w:rPr>
-          <w:i/>
-          <w:iCs/>
-        </w:rPr>
-        <w:t xml:space="preserve">Ética y acción</w:t>
-      </w:r>
-      <w:r>
-        <w:t xml:space="preserve"> sostuvo que la pericia ética —y la pericia en general— no es deliberación sino un saber hacer inmediato, encarnado, que responde a la situación sin pasar por reglas ni por juicios explícitos; la deliberación aparece sólo en el quiebre, cuando la respuesta espontánea falla o la situación no calza con lo aprendido (Varela, 1996). La cirujana que dijo "programada, no hoy" en un minuto no calló un razonamiento: no lo había. Esto parece contradecir un libro que pide explicitar en cada página, y no lo contradice si se lee bien. Las pausas del capítulo 8 son los quiebres de Varela puestos por diseño donde la experiencia enseña que la respuesta inmediata se equivoca; la explicitación de la cirujana en el pasillo no fue parte de su juicio sino de su transmisión; y la ficha no fotografía la cognición del que escribe: le presta al siguiente lector lo que necesita para revisarla. Lo que Varela corrige es la descripción: la buena práctica no consiste en pensar explícitamente, consiste en responder bien y en reconocer el quiebre. Y lo que advierte es un costo: la explicitación sin disparador no protege al experto, lo degrada a principiante. Por eso la versión completa de HII-D se reserva para los casos difíciles, y la humildad de este capítulo no es la del que duda de todo, sino la del que sabe cuándo su saber hacer dejó de bastar.</w:t>
-      </w:r>
-    </w:p>
-    <w:p>
-      <w:pPr>
-        <w:pStyle w:val="BodyJ"/>
-      </w:pPr>
-      <w:r>
-        <w:t xml:space="preserve">La música ofrece la imagen más exacta de ese saber hacer, y no como metáfora. La improvisación en jazz es pericia que responde en tiempo real dentro de una estructura —la armonía, el tempo, los otros— sin deliberar nota por nota. Cuando se registró con resonancia funcional a pianistas profesionales improvisando, se observó una desactivación extensa de la corteza prefrontal dorsolateral, la región asociada al automonitoreo y al control consciente de la ejecución, junto con la activación de la corteza prefrontal medial (Limb &amp; Braun, 2008). El experto que improvisa apaga, literalmente, al supervisor. Eso es lo que Varela describe y lo que este libro no debe contradecir: la metacognición madura no es vigilancia continua, porque la vigilancia continua estropea la ejecución; es saber cuándo volver a encender al supervisor. La cirujana frente a Carmen improvisó sobre una estructura de doscientas paredes abdominales; la pausa del capítulo 8 es el momento en que el pianista deja de tocar porque escuchó una nota que no era de la pieza.</w:t>
-      </w:r>
-    </w:p>
-    <w:p>
-      <w:pPr>
-        <w:pStyle w:val="BodyJ"/>
-      </w:pPr>
-      <w:r>
-        <w:t xml:space="preserve">Por eso este libro necesita la humildad no como ornamento ético sino como pieza estructural. La reevaluación del método HII-D (capítulo 15) es humildad convertida en procedimiento: la cláusula "qué me haría cambiar", escrita antes de saber si habrá que cambiar, es la forma que toma esta virtud cuando se la obliga a dejar huella en la ficha.</w:t>
+        <w:t xml:space="preserve">Tercero —y es el efecto más clínico de todos—, permite reubicar el foco y el manejo. La dirección de la atención diagnóstica no es un voto de por vida: es una asignación provisional de recursos, revisable cuando la trayectoria contradice el mapa. El humilde redirige sin vivirlo como derrota — de lo urinario a lo abdominal, de la lesión estructural al trastorno funcional, del objetivo curativo al de confort — y ajusta el tratamiento con la misma naturalidad con que lo inició. El orgulloso, en cambio, defiende su primera formulación como se defiende una propiedad, y convierte cada dato discordante en un ataque que repeler. El anclaje es, visto así, un fracaso de humildad antes que un fallo de memoria: la información nueva estaba disponible; lo que faltó fue la disposición a dejarla mandar.</w:t>
+      </w:r>
+    </w:p>
+    <w:p>
+      <w:pPr>
+        <w:pStyle w:val="BodyJ"/>
+      </w:pPr>
+      <w:r>
+        <w:t xml:space="preserve">Vista así, la humildad no es una virtud separada de la phronesis que este libro viene invocando desde el capítulo 6: es su condición de funcionamiento. La prudencia práctica integra, en el caso particular, lo que ningún algoritmo integra por nosotros — conocimiento causal, emoción leída como dato, valores del paciente y oportunidad: el momento de actuar ahora o esperar. Esa integración sólo permanece honesta si alguien vigila sus límites, y la humildad es exactamente eso: la phronesis vuelta sobre sí misma, la parte de la prudencia que sabe cuánta de la propia prudencia es conjetura. Con ella queda a la vista el hilo que el libro venía tendiendo: el capítulo 2 mostró la abducción — la conjetura que crea explicaciones —; el capítulo 5, la metacognición que la vigila mientras trabaja; la humildad es la disposición que la mantiene abierta cuando ya produjo una respuesta cómoda. Generar, vigilar, mantener abierto: tres nombres de una misma lealtad al caso. Y conviene recordar la corrección de Varela que el capítulo 6 aceptó: esa lealtad no es vigilancia continua —el experto responde sin deliberar, y deliberar sin motivo lo degrada—, sino la disposición a reconocer el quiebre, el momento en que el saber hacer dejó de bastar.</w:t>
+      </w:r>
+    </w:p>
+    <w:p>
+      <w:pPr>
+        <w:pStyle w:val="BodyJ"/>
+      </w:pPr>
+      <w:r>
+        <w:t xml:space="preserve">Por eso este libro necesita la humildad no como ornamento ético sino como pieza estructural. La reevaluación del método HII-D es humildad convertida en procedimiento: la cláusula "qué me haría cambiar", escrita antes de saber si habrá que cambiar, es la forma que toma esta virtud cuando se la obliga a dejar huella en la ficha.</w:t>
       </w:r>
     </w:p>
     <w:p>
@@ -10083,7 +10074,7 @@
         <w:pStyle w:val="BodyJ"/>
       </w:pPr>
       <w:r>
-        <w:t xml:space="preserve">El mismo miedo, vuelto hacia adentro, tiene otro nombre. Wu llamó segunda víctima al clínico que, tras un error, queda él mismo dañado: culpa, vergüenza, aislamiento, la revisión obsesiva del momento en que las cosas pudieron ser distintas (Wu, 2000). El punto no es sentimental sino epistemológico: un médico devastado y solo no puede hacer el análisis de trayectoria del capítulo 7 — la vergüenza empuja o al silencio o al relato autoflagelante, y ninguno de los dos produce aprendizaje. Por eso el cuidado del que erró no es blandura institucional: es una condición del circuito de corrección. Un servicio que quiere fichas honestas y morbimortalidades útiles tiene que hacer verosímil una promesa: reconocer un error o una duda aquí no te destruirá. Donde esa promesa no existe, la humildad epistémica se vuelve un lujo peligroso, y el sistema entero paga en errores repetidos lo que ahorra en incomodidad.</w:t>
+        <w:t xml:space="preserve">El mismo miedo, vuelto hacia adentro, tiene otro nombre. Wu llamó segunda víctima al clínico que, tras un error, queda él mismo dañado: culpa, vergüenza, aislamiento, la revisión obsesiva del momento en que las cosas pudieron ser distintas (Wu, 2000). El punto no es sentimental sino epistemológico: un médico devastado y solo no puede reconstruir la trayectoria de su propio error — la vergüenza empuja o al silencio o al relato autoflagelante, y ninguno de los dos produce aprendizaje. Por eso el cuidado del que erró no es blandura institucional: es una condición del circuito de corrección. Un servicio que quiere fichas honestas y morbimortalidades útiles tiene que hacer verosímil una promesa: reconocer un error o una duda aquí no te destruirá. Donde esa promesa no existe, la humildad epistémica se vuelve un lujo peligroso, y el sistema entero paga en errores repetidos lo que ahorra en incomodidad.</w:t>
       </w:r>
     </w:p>
     <w:p>
@@ -12349,7 +12340,7 @@
         <w:t xml:space="preserve">Lectura metacognitiva.</w:t>
       </w:r>
       <w:r>
-        <w:t xml:space="preserve"> El acierto clínico a las tres de la mañana no consistió en adivinar el diagnóstico definitivo, sino en tomar una decisión estratégica: comprar tiempo seguro mediante intervenciones de bajo riesgo y vigilancia de alta resolución. En urgencias, el fallo catastrófico rara vez es intelectual: casi todo médico piensa en el infarto. Suele ser logístico y de diseño: la hipótesis correcta ("probable SCA") sin un circuito cerrado de reevaluación. ¿Quién toma y quién mira el segundo ECG a los 15 minutos si el turno colapsa? Fijar el criterio de reapertura con plazo y responsable es la mitad del tratamiento.</w:t>
+        <w:t xml:space="preserve"> En urgencias, el fallo catastrófico rara vez es intelectual: casi todo médico piensa en el infarto. Suele ser logístico y de diseño: la hipótesis correcta ("probable SCA") sin un circuito cerrado de reevaluación. ¿Quién toma y quién mira el segundo ECG a los 15 minutos si el turno colapsa? Fijar el criterio de reapertura con plazo y responsable es la mitad del tratamiento.</w:t>
       </w:r>
     </w:p>
     <w:p>
@@ -12464,7 +12455,7 @@
         <w:t xml:space="preserve">Lectura metacognitiva.</w:t>
       </w:r>
       <w:r>
-        <w:t xml:space="preserve"> Uno de los tropiezos más frecuentes en la consulta ambulatoria es la falsa tranquilidad inducida por evidencia caducada: "tiene exámenes normales recientes" es un hecho cierto cuya fecha de toma lo vuelve clínicamente irrelevante para el problema nuevo. La ventaja comparativa de la atención primaria —el tiempo longitudinal como herramienta diagnóstica— sólo opera con seguridad si tiene fecha de reevaluación y criterios explícitos de reconsulta. Sin ese diseño, dejar pasar el tiempo es apostar a que el cuadro sea benigno.</w:t>
+        <w:t xml:space="preserve"> Evidencia caducada: "tiene exámenes normales recientes" es un hecho cierto cuya fecha lo vuelve irrelevante para el problema nuevo. Y el tiempo longitudinal, la ventaja comparativa de la atención primaria, sólo es una herramienta diagnóstica cuando tiene fecha de reevaluación y criterios de reconsulta; sin ese diseño, dejar pasar el tiempo es apostar a que el cuadro sea benigno.</w:t>
       </w:r>
     </w:p>
     <w:p>
@@ -12579,7 +12570,7 @@
         <w:t xml:space="preserve">Lectura metacognitiva.</w:t>
       </w:r>
       <w:r>
-        <w:t xml:space="preserve"> La medicina al final de la vida pone a prueba todas las capas de este libro: tienta al clínico a responder la pregunta "¿cuánto tiempo le queda?" con una cifra inventada (certeza retórica), o a escudarse en un "eso sólo Dios lo sabe" que desorienta a la familia (abandono comunicacional). Más importante aún, expone la confusión cotidiana entre lo técnicamente factible (indicar una cuarta línea oncológica o intubar) y lo clínicamente proporcionado. El juicio de proporcionalidad del capítulo 10 exige ante todo honestidad epistémica: reconocer el declive basal como un hecho clínico duro y anclar el umbral de acción en los fines del paciente, no en la inercia de los recursos disponibles.</w:t>
+        <w:t xml:space="preserve"> La pregunta "¿cuánto tiempo le queda?" tienta a dos respuestas simétricas y malas: una cifra inventada (certeza retórica) o un "eso sólo Dios lo sabe" que desorienta a la familia (abandono comunicacional). Y el caso expone la confusión cotidiana entre lo técnicamente factible —una cuarta línea, intubar— y lo clínicamente proporcionado: el juicio de proporcionalidad del capítulo 10 empieza por reconocer el declive basal como un hecho clínico duro.</w:t>
       </w:r>
     </w:p>
     <w:p>
@@ -12866,7 +12857,7 @@
         <w:t xml:space="preserve">Lectura metacognitiva.</w:t>
       </w:r>
       <w:r>
-        <w:t xml:space="preserve"> La pediatría radicaliza el capítulo 1: el paciente no habla, y el "hecho" más valioso es un testimonio de tercero sobre un basal que el equipo no conoce. Descartar la preocupación materna como ansiedad es el equivalente pediátrico de la injusticia testimonial del capítulo 14 — y además, simplemente, mala medicina: pocas fuentes de información tienen mejor razón señal-ruido que quien mira a ese niño todos los días.</w:t>
+        <w:t xml:space="preserve"> La pediatría radicaliza el capítulo 1: el paciente no habla, y el "hecho" más valioso es un testimonio de tercero sobre un basal que el equipo no conoce. Descartar la preocupación materna como ansiedad es injusticia testimonial en versión pediátrica — y además, simplemente, mala medicina: pocas fuentes de información tienen mejor razón señal-ruido que quien mira a ese niño todos los días.</w:t>
       </w:r>
     </w:p>
     <w:p>
@@ -12981,7 +12972,7 @@
         <w:t xml:space="preserve">Lectura metacognitiva.</w:t>
       </w:r>
       <w:r>
-        <w:t xml:space="preserve"> Esta viñeta es el capítulo 14 con mortalidad: la injusticia testimonial —descontar el relato por quién lo dice— aquí no es sólo un agravio moral sino un mecanismo causal de la brecha de 15 a 20 años de vida. Nótese el movimiento epistémico central: cuando el testimonio y el examen valen menos de lo habitual, el estándar de estudio objetivo sube en compensación. El ensombrecimiento hace exactamente lo contrario — usa la dificultad como excusa para bajar el estándar — y por eso mata.</w:t>
+        <w:t xml:space="preserve"> Aquí la injusticia testimonial —descontar el relato por quién lo dice— tiene mortalidad: no es sólo un agravio moral sino un mecanismo causal de la brecha de 15 a 20 años de vida. Nótese el movimiento epistémico central: cuando el testimonio y el examen valen menos de lo habitual, el estándar de estudio objetivo sube en compensación. El ensombrecimiento hace exactamente lo contrario — usa la dificultad como excusa para bajar el estándar — y por eso mata.</w:t>
       </w:r>
     </w:p>
     <w:p>
@@ -13168,67 +13159,7 @@
         <w:pStyle w:val="BodyJ"/>
       </w:pPr>
       <w:r>
-        <w:t xml:space="preserve">Una visita de sala puede incorporar una pausa breve en casos seleccionados:</w:t>
-      </w:r>
-    </w:p>
-    <w:p>
-      <w:pPr>
-        <w:pStyle w:val="BodyJ"/>
-        <w:numPr>
-          <w:ilvl w:val="0"/>
-          <w:numId w:val="6"/>
-        </w:numPr>
-      </w:pPr>
-      <w:r>
-        <w:t xml:space="preserve">¿cuál es la pregunta operativa de hoy?;</w:t>
-      </w:r>
-    </w:p>
-    <w:p>
-      <w:pPr>
-        <w:pStyle w:val="BodyJ"/>
-        <w:numPr>
-          <w:ilvl w:val="0"/>
-          <w:numId w:val="6"/>
-        </w:numPr>
-      </w:pPr>
-      <w:r>
-        <w:t xml:space="preserve">¿qué hecho nuevo cambió la representación?;</w:t>
-      </w:r>
-    </w:p>
-    <w:p>
-      <w:pPr>
-        <w:pStyle w:val="BodyJ"/>
-        <w:numPr>
-          <w:ilvl w:val="0"/>
-          <w:numId w:val="6"/>
-        </w:numPr>
-      </w:pPr>
-      <w:r>
-        <w:t xml:space="preserve">¿qué inferencia estamos tratando como si fuera dato?;</w:t>
-      </w:r>
-    </w:p>
-    <w:p>
-      <w:pPr>
-        <w:pStyle w:val="BodyJ"/>
-        <w:numPr>
-          <w:ilvl w:val="0"/>
-          <w:numId w:val="6"/>
-        </w:numPr>
-      </w:pPr>
-      <w:r>
-        <w:t xml:space="preserve">¿qué incertidumbre podría producir mayor daño?;</w:t>
-      </w:r>
-    </w:p>
-    <w:p>
-      <w:pPr>
-        <w:pStyle w:val="BodyJ"/>
-        <w:numPr>
-          <w:ilvl w:val="0"/>
-          <w:numId w:val="6"/>
-        </w:numPr>
-      </w:pPr>
-      <w:r>
-        <w:t xml:space="preserve">¿quién verificará el resultado pendiente?</w:t>
+        <w:t xml:space="preserve">Una visita de sala puede incorporar una pausa breve en casos seleccionados, y no hace falta inventarle preguntas: las cuatro de la versión de sesenta segundos (capítulo 15) bastan, y el Apéndice C dice con qué disparadores instalarlas, en cuántas semanas y qué medir. Lo que este capítulo aporta es el porqué: la pausa en voz alta es el único momento en que el equipo entero mira la misma representación del problema, y quien dirige la visita la enseña modelándola, no interrogando.</w:t>
       </w:r>
     </w:p>
     <w:p>
@@ -14337,6 +14268,147 @@
     </w:p>
     <w:p>
       <w:pPr>
+        <w:pStyle w:val="Quote1"/>
+      </w:pPr>
+      <w:r>
+        <w:t xml:space="preserve">La IA puede ampliar el espacio de hipótesis; no puede asumir por sí sola la responsabilidad de transformar una hipótesis en conducta clínica.</w:t>
+      </w:r>
+    </w:p>
+    <w:p>
+      <w:pPr>
+        <w:pStyle w:val="TallerHead"/>
+      </w:pPr>
+      <w:r>
+        <w:t xml:space="preserve">Taller 17. La autopsia de una respuesta</w:t>
+      </w:r>
+    </w:p>
+    <w:p>
+      <w:pPr>
+        <w:pStyle w:val="BodyJ"/>
+      </w:pPr>
+      <w:r>
+        <w:t xml:space="preserve">Tome un caso real ya resuelto de su servicio —debidamente anonimizado— y péguelo en un asistente de lenguaje pidiendo evaluación y plan. Imprima la respuesta y márquela con tres colores: (1) afirmaciones sustentadas en datos que el caso contenía; (2) contenido que el modelo agregó — detalles "típicos", causalidades, datos que nadie le dio; (3) incertidumbre declarada. Después, haga una segunda pregunta al modelo: "¿qué evidencia haría improbable tu diagnóstico principal?".</w:t>
+      </w:r>
+    </w:p>
+    <w:p>
+      <w:pPr>
+        <w:pStyle w:val="BodyJ"/>
+      </w:pPr>
+      <w:r>
+        <w:rPr>
+          <w:i/>
+          <w:iCs/>
+        </w:rPr>
+        <w:t xml:space="preserve">Solución comentada.</w:t>
+      </w:r>
+      <w:r>
+        <w:t xml:space="preserve"> En ejercicios docentes, tres hallazgos vuelven una y otra vez. Primero, el color 2 aparece más de lo esperado: el modelo rellena huecos con verosimilitud — una evolución "esperable", un factor de riesgo "presumible" — y esa es exactamente la definición de confabulación; contarlas cura más que leer sobre ellas. Segundo, el color 3 suele ser genérico ("se sugiere correlacionar con la clínica") y no específico del caso: incertidumbre de fórmula, no de contenido — compárela con la que exige el léxico de certeza. Tercero, la respuesta a la segunda pregunta suele ser mejor que la primera: el modelo enumera con soltura los datos que refutarían su propia propuesta — pero sólo si alguien se lo pide. La herramienta contiene su propio antídoto; la pregunta que lo libera sigue siendo humana.</w:t>
+      </w:r>
+    </w:p>
+    <w:p>
+      <w:pPr>
+        <w:pStyle w:val="EnUnaFrase"/>
+      </w:pPr>
+      <w:r>
+        <w:rPr>
+          <w:b/>
+          <w:bCs/>
+        </w:rPr>
+        <w:t xml:space="preserve">En una frase.</w:t>
+      </w:r>
+      <w:r>
+        <w:t xml:space="preserve"> La IA generativa produce exactamente aquello contra lo que este libro entrena: prosa fluida donde hechos, inferencias e incertidumbre llegan mezclados — auditarla con HII-D es el mismo ejercicio que auditar la propia escritura.</w:t>
+      </w:r>
+    </w:p>
+    <w:p>
+      <w:pPr>
+        <w:pStyle w:val="BodyJ"/>
+        <w:spacing w:after="80" w:before="160"/>
+      </w:pPr>
+      <w:r>
+        <w:rPr>
+          <w:b/>
+          <w:bCs/>
+        </w:rPr>
+        <w:t xml:space="preserve">Tres preguntas para la próxima visita.</w:t>
+      </w:r>
+    </w:p>
+    <w:p>
+      <w:pPr>
+        <w:pStyle w:val="BodyJ"/>
+        <w:numPr>
+          <w:ilvl w:val="0"/>
+          <w:numId w:val="26"/>
+        </w:numPr>
+      </w:pPr>
+      <w:r>
+        <w:t xml:space="preserve">Si uso IA en este caso, ¿qué dato de su respuesta verifiqué contra una fuente primaria antes de actuar?</w:t>
+      </w:r>
+    </w:p>
+    <w:p>
+      <w:pPr>
+        <w:pStyle w:val="BodyJ"/>
+        <w:numPr>
+          <w:ilvl w:val="0"/>
+          <w:numId w:val="26"/>
+        </w:numPr>
+      </w:pPr>
+      <w:r>
+        <w:t xml:space="preserve">¿Qué agregó el modelo que el caso no contenía?</w:t>
+      </w:r>
+    </w:p>
+    <w:p>
+      <w:pPr>
+        <w:pStyle w:val="BodyJ"/>
+        <w:numPr>
+          <w:ilvl w:val="0"/>
+          <w:numId w:val="26"/>
+        </w:numPr>
+      </w:pPr>
+      <w:r>
+        <w:t xml:space="preserve">¿Estoy usando la herramienta para ampliar hipótesis o para confirmar rápido la que ya tenía?</w:t>
+      </w:r>
+    </w:p>
+    <w:p>
+      <w:pPr>
+        <w:pStyle w:val="Heading2"/>
+        <w:pageBreakBefore/>
+        <w:spacing w:after="300" w:before="600"/>
+      </w:pPr>
+      <w:r>
+        <w:rPr>
+          <w:rFonts w:ascii="Georgia" w:cs="Georgia" w:eastAsia="Georgia" w:hAnsi="Georgia"/>
+          <w:b/>
+          <w:bCs/>
+          <w:color w:val="8C2F2F"/>
+          <w:sz w:val="22"/>
+          <w:szCs w:val="22"/>
+        </w:rPr>
+        <w:t xml:space="preserve">Capítulo 18</w:t>
+      </w:r>
+      <w:r>
+        <w:rPr>
+          <w:rFonts w:ascii="Georgia" w:cs="Georgia" w:eastAsia="Georgia" w:hAnsi="Georgia"/>
+          <w:b/>
+          <w:bCs/>
+          <w:color w:val="3D5A6C"/>
+          <w:sz w:val="32"/>
+          <w:szCs w:val="32"/>
+        </w:rPr>
+        <w:br/>
+        <w:t xml:space="preserve">La palabra exacta: lo que la poesía sabe del juicio clínico</w:t>
+      </w:r>
+    </w:p>
+    <w:p>
+      <w:pPr>
+        <w:pStyle w:val="BodyJ"/>
+      </w:pPr>
+      <w:r>
+        <w:t xml:space="preserve">Hay un momento que los tratados no describen y todo clínico conoce: tres hallazgos sueltos —una taquicardia sin fiebre, un abdomen que "no convence", una frase de la hija— se ordenan de golpe bajo una sola explicación, y algo hace clic. El placer de ese instante no es administrativo. Es físico, breve y sospechosamente parecido al de un verso que cae en su lugar. Este capítulo toma ese parecido en serio: no como adorno humanista, sino como información sobre cómo funciona —y cómo falla— el juicio.</w:t>
+      </w:r>
+    </w:p>
+    <w:p>
+      <w:pPr>
         <w:pStyle w:val="Heading3"/>
         <w:spacing w:after="120" w:before="280"/>
       </w:pPr>
@@ -14349,164 +14421,23 @@
           <w:sz w:val="25"/>
           <w:szCs w:val="25"/>
         </w:rPr>
-        <w:t xml:space="preserve">La IA como espejo y provocación filosófica</w:t>
-      </w:r>
-    </w:p>
-    <w:p>
-      <w:pPr>
-        <w:pStyle w:val="BodyJ"/>
-      </w:pPr>
-      <w:r>
-        <w:t xml:space="preserve">La IA revela que una frase puede conservar la forma externa del razonamiento sin tener acceso directo al evento. Esto obliga a recordar que la coherencia verbal nunca fue garantía suficiente. También muestra el valor del lenguaje como espacio de prueba: pedir alternativas, contraejemplos y explicitar incertidumbre puede mejorar la deliberación humana, aunque no vuelva verdadero al modelo.</w:t>
-      </w:r>
-    </w:p>
-    <w:p>
-      <w:pPr>
-        <w:pStyle w:val="Quote1"/>
-      </w:pPr>
-      <w:r>
-        <w:t xml:space="preserve">La IA puede ampliar el espacio de hipótesis; no puede asumir por sí sola la responsabilidad de transformar una hipótesis en conducta clínica.</w:t>
-      </w:r>
-    </w:p>
-    <w:p>
-      <w:pPr>
-        <w:pStyle w:val="BodyJ"/>
-      </w:pPr>
-      <w:r>
-        <w:t xml:space="preserve">Usada con disciplina, puede ser un instrumento metacognitivo externo. Usada por deferencia, puede reforzar el mismo error que pretendía corregir: convertir plausibilidad en certeza.</w:t>
-      </w:r>
-    </w:p>
-    <w:p>
-      <w:pPr>
-        <w:pStyle w:val="TallerHead"/>
-      </w:pPr>
-      <w:r>
-        <w:t xml:space="preserve">Taller 17. La autopsia de una respuesta</w:t>
-      </w:r>
-    </w:p>
-    <w:p>
-      <w:pPr>
-        <w:pStyle w:val="BodyJ"/>
-      </w:pPr>
-      <w:r>
-        <w:t xml:space="preserve">Tome un caso real ya resuelto de su servicio —debidamente anonimizado— y péguelo en un asistente de lenguaje pidiendo evaluación y plan. Imprima la respuesta y márquela con tres colores: (1) afirmaciones sustentadas en datos que el caso contenía; (2) contenido que el modelo agregó — detalles "típicos", causalidades, datos que nadie le dio; (3) incertidumbre declarada. Después, haga una segunda pregunta al modelo: "¿qué evidencia haría improbable tu diagnóstico principal?".</w:t>
-      </w:r>
-    </w:p>
-    <w:p>
-      <w:pPr>
-        <w:pStyle w:val="BodyJ"/>
-      </w:pPr>
-      <w:r>
-        <w:rPr>
-          <w:i/>
-          <w:iCs/>
-        </w:rPr>
-        <w:t xml:space="preserve">Solución comentada.</w:t>
-      </w:r>
-      <w:r>
-        <w:t xml:space="preserve"> En ejercicios docentes, tres hallazgos vuelven una y otra vez. Primero, el color 2 aparece más de lo esperado: el modelo rellena huecos con verosimilitud — una evolución "esperable", un factor de riesgo "presumible" — y esa es exactamente la definición de confabulación; contarlas cura más que leer sobre ellas. Segundo, el color 3 suele ser genérico ("se sugiere correlacionar con la clínica") y no específico del caso: incertidumbre de fórmula, no de contenido — compárela con la que exige el léxico de certeza. Tercero, la respuesta a la segunda pregunta suele ser mejor que la primera: el modelo enumera con soltura los datos que refutarían su propia propuesta — pero sólo si alguien se lo pide. La herramienta contiene su propio antídoto; la pregunta que lo libera sigue siendo humana.</w:t>
-      </w:r>
-    </w:p>
-    <w:p>
-      <w:pPr>
-        <w:pStyle w:val="EnUnaFrase"/>
-      </w:pPr>
-      <w:r>
-        <w:rPr>
-          <w:b/>
-          <w:bCs/>
-        </w:rPr>
-        <w:t xml:space="preserve">En una frase.</w:t>
-      </w:r>
-      <w:r>
-        <w:t xml:space="preserve"> La IA generativa produce exactamente aquello contra lo que este libro entrena: prosa fluida donde hechos, inferencias e incertidumbre llegan mezclados — auditarla con HII-D es el mismo ejercicio que auditar la propia escritura.</w:t>
-      </w:r>
-    </w:p>
-    <w:p>
-      <w:pPr>
-        <w:pStyle w:val="BodyJ"/>
-        <w:spacing w:after="80" w:before="160"/>
-      </w:pPr>
-      <w:r>
-        <w:rPr>
-          <w:b/>
-          <w:bCs/>
-        </w:rPr>
-        <w:t xml:space="preserve">Tres preguntas para la próxima visita.</w:t>
-      </w:r>
-    </w:p>
-    <w:p>
-      <w:pPr>
-        <w:pStyle w:val="BodyJ"/>
-        <w:numPr>
-          <w:ilvl w:val="0"/>
-          <w:numId w:val="26"/>
-        </w:numPr>
-      </w:pPr>
-      <w:r>
-        <w:t xml:space="preserve">Si uso IA en este caso, ¿qué dato de su respuesta verifiqué contra una fuente primaria antes de actuar?</w:t>
-      </w:r>
-    </w:p>
-    <w:p>
-      <w:pPr>
-        <w:pStyle w:val="BodyJ"/>
-        <w:numPr>
-          <w:ilvl w:val="0"/>
-          <w:numId w:val="26"/>
-        </w:numPr>
-      </w:pPr>
-      <w:r>
-        <w:t xml:space="preserve">¿Qué agregó el modelo que el caso no contenía?</w:t>
-      </w:r>
-    </w:p>
-    <w:p>
-      <w:pPr>
-        <w:pStyle w:val="BodyJ"/>
-        <w:numPr>
-          <w:ilvl w:val="0"/>
-          <w:numId w:val="26"/>
-        </w:numPr>
-      </w:pPr>
-      <w:r>
-        <w:t xml:space="preserve">¿Estoy usando la herramienta para ampliar hipótesis o para confirmar rápido la que ya tenía?</w:t>
-      </w:r>
-    </w:p>
-    <w:p>
-      <w:pPr>
-        <w:pStyle w:val="Heading2"/>
-        <w:pageBreakBefore/>
-        <w:spacing w:after="300" w:before="600"/>
-      </w:pPr>
-      <w:r>
-        <w:rPr>
-          <w:rFonts w:ascii="Georgia" w:cs="Georgia" w:eastAsia="Georgia" w:hAnsi="Georgia"/>
-          <w:b/>
-          <w:bCs/>
-          <w:color w:val="8C2F2F"/>
-          <w:sz w:val="22"/>
-          <w:szCs w:val="22"/>
-        </w:rPr>
-        <w:t xml:space="preserve">Capítulo 18</w:t>
-      </w:r>
-      <w:r>
-        <w:rPr>
-          <w:rFonts w:ascii="Georgia" w:cs="Georgia" w:eastAsia="Georgia" w:hAnsi="Georgia"/>
-          <w:b/>
-          <w:bCs/>
-          <w:color w:val="3D5A6C"/>
-          <w:sz w:val="32"/>
-          <w:szCs w:val="32"/>
-        </w:rPr>
-        <w:br/>
-        <w:t xml:space="preserve">La palabra exacta: lo que la poesía sabe del juicio clínico</w:t>
-      </w:r>
-    </w:p>
-    <w:p>
-      <w:pPr>
-        <w:pStyle w:val="BodyJ"/>
-      </w:pPr>
-      <w:r>
-        <w:t xml:space="preserve">Hay un momento que los tratados no describen y todo clínico conoce: tres hallazgos sueltos —una taquicardia sin fiebre, un abdomen que "no convence", una frase de la hija— se ordenan de golpe bajo una sola explicación, y algo hace clic. El placer de ese instante no es administrativo. Es físico, breve y sospechosamente parecido al de un verso que cae en su lugar. Este capítulo toma ese parecido en serio: no como adorno humanista, sino como información sobre cómo funciona —y cómo falla— el juicio.</w:t>
+        <w:t xml:space="preserve">Dos oficios de la conexión</w:t>
+      </w:r>
+    </w:p>
+    <w:p>
+      <w:pPr>
+        <w:pStyle w:val="BodyJ"/>
+      </w:pPr>
+      <w:r>
+        <w:t xml:space="preserve">El poeta trabaja buscando conexiones: entre palabras, entre una palabra y un sentido que todavía no tiene nombre, entre el sonido y aquello que el sonido vuelve visible. Su estado mental característico combina atención flotante, oído para lo que no encaja y una disposición rara: dejar que el material mande sobre el plan. El clínico que razona bien trabaja igual, con otros materiales: entre el hallazgo y el mecanismo, entre el mecanismo y la intervención que estabiliza, busca la conexión que convierta fragmentos en un caso inteligible.</w:t>
+      </w:r>
+    </w:p>
+    <w:p>
+      <w:pPr>
+        <w:pStyle w:val="BodyJ"/>
+      </w:pPr>
+      <w:r>
+        <w:t xml:space="preserve">El parentesco es lógico antes que sentimental. Una metáfora es la hipótesis de que dos cosas lejanas comparten estructura; un diagnóstico es una metáfora que acepta ser puesta a prueba — "este cuadro es una colecistitis" apuesta a que lo que ocurre en este cuerpo comparte estructura con un patrón aprendido. Ambos movimientos son la abducción del capítulo 2, y ambos requieren el estado que este libro llamó humildad en funciones: sostener la conjetura con fuerza suficiente para trabajarla y soltura suficiente para dejarla caer. Bohm lo dijo desde la física: el acto creativo central —percibir un orden nuevo en lo que ya estaba a la vista— es el mismo en el arte y en la ciencia; cambian los materiales y el tribunal (Bohm, 1996).</w:t>
       </w:r>
     </w:p>
     <w:p>
@@ -14523,23 +14454,23 @@
           <w:sz w:val="25"/>
           <w:szCs w:val="25"/>
         </w:rPr>
-        <w:t xml:space="preserve">Dos oficios de la conexión</w:t>
-      </w:r>
-    </w:p>
-    <w:p>
-      <w:pPr>
-        <w:pStyle w:val="BodyJ"/>
-      </w:pPr>
-      <w:r>
-        <w:t xml:space="preserve">El poeta trabaja buscando conexiones: entre palabras, entre una palabra y un sentido que todavía no tiene nombre, entre el sonido y aquello que el sonido vuelve visible. Su estado mental característico combina atención flotante, oído para lo que no encaja y una disposición rara: dejar que el material mande sobre el plan. El clínico que razona bien trabaja igual, con otros materiales: entre el hallazgo y el mecanismo, entre el mecanismo y la intervención que estabiliza, busca la conexión que convierta fragmentos en un caso inteligible.</w:t>
-      </w:r>
-    </w:p>
-    <w:p>
-      <w:pPr>
-        <w:pStyle w:val="BodyJ"/>
-      </w:pPr>
-      <w:r>
-        <w:t xml:space="preserve">El parentesco es lógico antes que sentimental. Una metáfora es la hipótesis de que dos cosas lejanas comparten estructura; un diagnóstico es una metáfora que acepta ser puesta a prueba — "este cuadro es una colecistitis" apuesta a que lo que ocurre en este cuerpo comparte estructura con un patrón aprendido. Ambos movimientos son la abducción del capítulo 2, y ambos requieren el estado que este libro llamó humildad en funciones: sostener la conjetura con fuerza suficiente para trabajarla y soltura suficiente para dejarla caer. Bohm lo dijo desde la física: el acto creativo central —percibir un orden nuevo en lo que ya estaba a la vista— es el mismo en el arte y en la ciencia; cambian los materiales y el tribunal (Bohm, 1996).</w:t>
+        <w:t xml:space="preserve">Huidobro, o la palabra que crea</w:t>
+      </w:r>
+    </w:p>
+    <w:p>
+      <w:pPr>
+        <w:pStyle w:val="BodyJ"/>
+      </w:pPr>
+      <w:r>
+        <w:t xml:space="preserve">En 1916, Vicente Huidobro escribió el manifiesto de una poesía que no quería describir el mundo sino aumentarlo: "Por qué cantáis la rosa, ¡oh Poetas! / Hacedla florecer en el poema". Y remató con la línea más citada del creacionismo: "El poeta es un pequeño Dios" (Huidobro, 1916). El poema no canta la rosa: la crea. Como programa poético es glorioso. Como descripción de lo que el lenguaje puede hacer, es exactamente el peligro contra el que este libro lleva diecisiete capítulos escribiendo.</w:t>
+      </w:r>
+    </w:p>
+    <w:p>
+      <w:pPr>
+        <w:pStyle w:val="BodyJ"/>
+      </w:pPr>
+      <w:r>
+        <w:t xml:space="preserve">Porque la ficha clínica también hace florecer rosas. La "neumonía aspirativa" del prefacio —dos palabras limpias que crearon un antecedente que nadie observó— es creacionismo puro; el "somatiza" de la viñeta 8, también. El mecanismo ya es conocido: la ficha produce lo visible, y sus criaturas verbales adquieren vida institucional. La diferencia con la poesía es brutal: las rosas de Huidobro viven en el poema; las nuestras reciben antibióticos, cirugías y altas. El lenguaje clínico descuidado es creacionista por defecto — y un servicio lleno de pequeños dioses es un lugar peligroso para estar enfermo.</w:t>
       </w:r>
     </w:p>
     <w:p>
@@ -14556,23 +14487,23 @@
           <w:sz w:val="25"/>
           <w:szCs w:val="25"/>
         </w:rPr>
-        <w:t xml:space="preserve">Huidobro, o la palabra que crea</w:t>
-      </w:r>
-    </w:p>
-    <w:p>
-      <w:pPr>
-        <w:pStyle w:val="BodyJ"/>
-      </w:pPr>
-      <w:r>
-        <w:t xml:space="preserve">En 1916, Vicente Huidobro escribió el manifiesto de una poesía que no quería describir el mundo sino aumentarlo: "Por qué cantáis la rosa, ¡oh Poetas! / Hacedla florecer en el poema". Y remató con la línea más citada del creacionismo: "El poeta es un pequeño Dios" (Huidobro, 1916). El poema no canta la rosa: la crea. Como programa poético es glorioso. Como descripción de lo que el lenguaje puede hacer, es exactamente el peligro contra el que este libro lleva diecisiete capítulos escribiendo.</w:t>
-      </w:r>
-    </w:p>
-    <w:p>
-      <w:pPr>
-        <w:pStyle w:val="BodyJ"/>
-      </w:pPr>
-      <w:r>
-        <w:t xml:space="preserve">Porque la ficha clínica también hace florecer rosas. La "neumonía aspirativa" del prefacio —dos palabras limpias que crearon un antecedente que nadie observó— es creacionismo puro; el "somatiza" de la viñeta 8, también. El mecanismo ya es conocido: la ficha produce lo visible, y sus criaturas verbales adquieren vida institucional. La diferencia con la poesía es brutal: las rosas de Huidobro viven en el poema; las nuestras reciben antibióticos, cirugías y altas. El lenguaje clínico descuidado es creacionista por defecto — y un servicio lleno de pequeños dioses es un lugar peligroso para estar enfermo.</w:t>
+        <w:t xml:space="preserve">Parra, o la deflación</w:t>
+      </w:r>
+    </w:p>
+    <w:p>
+      <w:pPr>
+        <w:pStyle w:val="BodyJ"/>
+      </w:pPr>
+      <w:r>
+        <w:t xml:space="preserve">El antídoto también lo escribió un chileno, y no uno cualquiera: un profesor de mecánica racional que estudió cosmología en Oxford y sabía, por oficio diurno, lo que cuesta un dato. Nicanor Parra pasó su vida bajándole los humos a la palabra: primero con los antipoemas (Parra, 1954), después con un "Manifiesto" que es casi un léxico de certeza en verso: los poetas bajaron del Olimpo, la poesía debe escribirse en palabras de todos los días — y, con nombre y apellido implícitos, la condena de "la poesía de pequeño dios" (Parra, 1969). La réplica a Huidobro no es una interpretación: está en el texto.</w:t>
+      </w:r>
+    </w:p>
+    <w:p>
+      <w:pPr>
+        <w:pStyle w:val="BodyJ"/>
+      </w:pPr>
+      <w:r>
+        <w:t xml:space="preserve">La antipoesía es un programa epistemológico completo: quitarle a la palabra los poderes que no puede sostener y devolverla al tamaño de la experiencia. Visto desde ahí, el léxico de certeza es antipoesía aplicada: "sin evidencia actual de" es un verso parriano — feo, honesto, exacto, imposible de recitar con voz engolada. La ficha lúcida se escribe más cerca de Parra que de Huidobro: lengua de todos los días, dignidad del "no sé", desconfianza instintiva de toda frase que suene demasiado bien.</w:t>
       </w:r>
     </w:p>
     <w:p>
@@ -14589,23 +14520,31 @@
           <w:sz w:val="25"/>
           <w:szCs w:val="25"/>
         </w:rPr>
-        <w:t xml:space="preserve">Parra, o la deflación</w:t>
-      </w:r>
-    </w:p>
-    <w:p>
-      <w:pPr>
-        <w:pStyle w:val="BodyJ"/>
-      </w:pPr>
-      <w:r>
-        <w:t xml:space="preserve">El antídoto también lo escribió un chileno, y no uno cualquiera: un profesor de mecánica racional que estudió cosmología en Oxford y sabía, por oficio diurno, lo que cuesta un dato. Nicanor Parra pasó su vida bajándole los humos a la palabra: primero con los antipoemas (Parra, 1954), después con un "Manifiesto" que es casi un léxico de certeza en verso: los poetas bajaron del Olimpo, la poesía debe escribirse en palabras de todos los días — y, con nombre y apellido implícitos, la condena de "la poesía de pequeño dios" (Parra, 1969). La réplica a Huidobro no es una interpretación: está en el texto.</w:t>
-      </w:r>
-    </w:p>
-    <w:p>
-      <w:pPr>
-        <w:pStyle w:val="BodyJ"/>
-      </w:pPr>
-      <w:r>
-        <w:t xml:space="preserve">La antipoesía es un programa epistemológico completo: quitarle a la palabra los poderes que no puede sostener y devolverla al tamaño de la experiencia. Visto desde ahí, el léxico de certeza es antipoesía aplicada: "sin evidencia actual de" es un verso parriano — feo, honesto, exacto, imposible de recitar con voz engolada. La ficha lúcida se escribe más cerca de Parra que de Huidobro: lengua de todos los días, dignidad del "no sé", desconfianza instintiva de toda frase que suene demasiado bien.</w:t>
+        <w:t xml:space="preserve">La belleza como señal y como trampa</w:t>
+      </w:r>
+    </w:p>
+    <w:p>
+      <w:pPr>
+        <w:pStyle w:val="BodyJ"/>
+      </w:pPr>
+      <w:r>
+        <w:t xml:space="preserve">El clic estético del diagnóstico existe y es información. La parsimonia, la convergencia, el encaje sin residuo son la forma sensible de la fuerza por convergencia: cuando una explicación ordena todos los hechos sin forzar ninguno, algo en nosotros lo registra como belleza antes de poder justificarlo. Esa señal vale: propone candidatos que el análisis no habría listado.</w:t>
+      </w:r>
+    </w:p>
+    <w:p>
+      <w:pPr>
+        <w:pStyle w:val="BodyJ"/>
+      </w:pPr>
+      <w:r>
+        <w:t xml:space="preserve">Pero este libro ya conoció a la impostora. La historia coherente del hindsight, la narrativa atractiva que infla la confianza, la prosa fluida de los modelos de lenguaje: todas son bellas y ninguna es, por serlo, verdadera. La belleza no distingue entre orden hallado y orden impuesto — para eso están las pruebas severas. La regla que concilia ambas caras cabe en una línea: la elegancia selecciona hipótesis; nunca las confirma. El verso puede quedarse bello para siempre; el diagnóstico tiene que amanecer verdadero, y la evolución lo audita cada mañana.</w:t>
+      </w:r>
+    </w:p>
+    <w:p>
+      <w:pPr>
+        <w:pStyle w:val="BodyJ"/>
+      </w:pPr>
+      <w:r>
+        <w:t xml:space="preserve">Queda la belleza final, la que menos se nombra: la de hacer lo correcto en el contexto correcto. Una estabilización bien conducida tiene forma estética — nada sobró, nada faltó, cada intervención llegó a su hora; es la phronesis vuelta percepción. Pero es una belleza que sólo puede declararse retrospectivamente, y sólo si el proceso era defendible antes de conocer el desenlace. En medicina la estética es un subproducto del rigor. Cuando se la busca directamente —el diagnóstico brillante, la frase imponente—, se obtiene Huidobro en la ficha.</w:t>
       </w:r>
     </w:p>
     <w:p>
@@ -14622,47 +14561,6 @@
           <w:sz w:val="25"/>
           <w:szCs w:val="25"/>
         </w:rPr>
-        <w:t xml:space="preserve">La belleza como señal y como trampa</w:t>
-      </w:r>
-    </w:p>
-    <w:p>
-      <w:pPr>
-        <w:pStyle w:val="BodyJ"/>
-      </w:pPr>
-      <w:r>
-        <w:t xml:space="preserve">El clic estético del diagnóstico existe y es información. La parsimonia, la convergencia, el encaje sin residuo son la forma sensible de la fuerza por convergencia: cuando una explicación ordena todos los hechos sin forzar ninguno, algo en nosotros lo registra como belleza antes de poder justificarlo. Esa señal vale: propone candidatos que el análisis no habría listado.</w:t>
-      </w:r>
-    </w:p>
-    <w:p>
-      <w:pPr>
-        <w:pStyle w:val="BodyJ"/>
-      </w:pPr>
-      <w:r>
-        <w:t xml:space="preserve">Pero este libro ya conoció a la impostora. La historia coherente del hindsight, la narrativa atractiva que infla la confianza, la prosa fluida de los modelos de lenguaje: todas son bellas y ninguna es, por serlo, verdadera. La belleza no distingue entre orden hallado y orden impuesto — para eso están las pruebas severas. La regla que concilia ambas caras cabe en una línea: la elegancia selecciona hipótesis; nunca las confirma. El verso puede quedarse bello para siempre; el diagnóstico tiene que amanecer verdadero, y la evolución lo audita cada mañana.</w:t>
-      </w:r>
-    </w:p>
-    <w:p>
-      <w:pPr>
-        <w:pStyle w:val="BodyJ"/>
-      </w:pPr>
-      <w:r>
-        <w:t xml:space="preserve">Queda la belleza final, la que menos se nombra: la de hacer lo correcto en el contexto correcto. Una estabilización bien conducida tiene forma estética — nada sobró, nada faltó, cada intervención llegó a su hora; es la phronesis vuelta percepción. Pero es una belleza que sólo puede declararse retrospectivamente, y sólo si el proceso era defendible antes de conocer el desenlace. En medicina la estética es un subproducto del rigor. Cuando se la busca directamente —el diagnóstico brillante, la frase imponente—, se obtiene Huidobro en la ficha.</w:t>
-      </w:r>
-    </w:p>
-    <w:p>
-      <w:pPr>
-        <w:pStyle w:val="Heading3"/>
-        <w:spacing w:after="120" w:before="280"/>
-      </w:pPr>
-      <w:r>
-        <w:rPr>
-          <w:rFonts w:ascii="Georgia" w:cs="Georgia" w:eastAsia="Georgia" w:hAnsi="Georgia"/>
-          <w:b/>
-          <w:bCs/>
-          <w:color w:val="2B2B2B"/>
-          <w:sz w:val="25"/>
-          <w:szCs w:val="25"/>
-        </w:rPr>
         <w:t xml:space="preserve">Leer poesía como entrenamiento clínico</w:t>
       </w:r>
     </w:p>
@@ -14679,7 +14577,7 @@
         <w:pStyle w:val="BodyJ"/>
       </w:pPr>
       <w:r>
-        <w:t xml:space="preserve">No es casualidad que el investigador principal de la saga del capítulo 10 —el ensayo que enseñó a medio mundo a mirar la piel antes que el número— escriba también poesía: el oído que distingue una palabra que trabaja de una palabra que decora es el mismo que distingue un blanco de reanimación que informa de uno que sólo tranquiliza.</w:t>
+        <w:t xml:space="preserve">No es casualidad que el investigador principal de la saga del capítulo 9 —el ensayo que enseñó a medio mundo a mirar la piel antes que el número— escriba también poesía: el oído que distingue una palabra que trabaja de una palabra que decora es el mismo que distingue un blanco de reanimación que informa de uno que sólo tranquiliza.</w:t>
       </w:r>
     </w:p>
     <w:p>
@@ -14840,7 +14738,7 @@
         <w:pStyle w:val="BodyJ"/>
       </w:pPr>
       <w:r>
-        <w:t xml:space="preserve">Tres hilos de este libro conviene dejar anudados. El primero va de la abducción a la humildad: la conjetura que crea explicaciones, la vigilancia que la acompaña mientras trabaja y la disposición que la mantiene abierta cuando ya produjo una respuesta cómoda son tres momentos de una misma lealtad al caso, y la prudencia práctica —la phronesis— es su nombre antiguo. El segundo va del dato al contexto: la funcionalidad, el pronóstico de fondo y la red de apoyo son hechos clínicos de pleno derecho, y una decisión que los omitió no es más objetiva sino más incompleta. El tercero va de la ficha al razonador: escribir la nota es parte de pensar, y por eso la inteligencia artificial —que produce exactamente la prosa fluida contra la que este libro entrena: hechos, inferencias e invenciones con la misma sintaxis— no cambia la disciplina, la vuelve urgente, sobre todo para quien todavía está formando el juicio que la herramienta ofrece reemplazar. Ante una respuesta automática como ante la propia narrativa, la pregunta es la misma: qué proviene del caso, qué fue inferido, qué permanece incierto y qué responsabilidad implica actuar.</w:t>
+        <w:t xml:space="preserve">El mapa del comienzo (Figura 1) tendió tres hilos —las capas, el arco que va de la abducción a la humildad y el lenguaje que las conserva—; tres nudos de ese tejido conviene dejar a la vista. El primero va de la abducción a la humildad: la conjetura que crea explicaciones, la vigilancia que la acompaña mientras trabaja y la disposición que la mantiene abierta cuando ya produjo una respuesta cómoda son tres momentos de una misma lealtad al caso, y la prudencia práctica —la phronesis— es su nombre antiguo. El segundo va del dato al contexto: la funcionalidad, el pronóstico de fondo y la red de apoyo son hechos clínicos de pleno derecho, y una decisión que los omitió no es más objetiva sino más incompleta. El tercero va de la ficha al razonador: escribir la nota es parte de pensar, y por eso la inteligencia artificial —que produce exactamente la prosa fluida contra la que este libro entrena: hechos, inferencias e invenciones con la misma sintaxis— no cambia la disciplina, la vuelve urgente, sobre todo para quien todavía está formando el juicio que la herramienta ofrece reemplazar. Ante una respuesta automática como ante la propia narrativa, la pregunta es la misma: qué proviene del caso, qué fue inferido, qué permanece incierto y qué responsabilidad implica actuar.</w:t>
       </w:r>
     </w:p>
     <w:p>
@@ -18212,7 +18110,7 @@
         </w:numPr>
       </w:pPr>
       <w:r>
-        <w:t xml:space="preserve">Conocimiento tácito — 6; saber hacer y quiebre (Varela) — 14</w:t>
+        <w:t xml:space="preserve">Conocimiento tácito — 6; saber hacer y quiebre (Varela) — 6</w:t>
       </w:r>
     </w:p>
     <w:p>
@@ -18668,7 +18566,7 @@
         </w:numPr>
       </w:pPr>
       <w:r>
-        <w:t xml:space="preserve">Improvisación y saber hacer (jazz; Limb y Braun) — 14</w:t>
+        <w:t xml:space="preserve">Improvisación y saber hacer (jazz; Limb y Braun) — 6</w:t>
       </w:r>
     </w:p>
     <w:p>
@@ -18728,7 +18626,7 @@
         </w:numPr>
       </w:pPr>
       <w:r>
-        <w:t xml:space="preserve">Lectura de ensayos clínicos (significación, reanálisis bayesiano, saga ANDROMEDA) — 10</w:t>
+        <w:t xml:space="preserve">Lectura de ensayos clínicos (significación, reanálisis bayesiano, saga ANDROMEDA) — 9</w:t>
       </w:r>
     </w:p>
     <w:p>
@@ -18752,7 +18650,7 @@
         </w:numPr>
       </w:pPr>
       <w:r>
-        <w:t xml:space="preserve">Marcador y enfermedad (lactato, perfusión, ANDROMEDA-SHOCK) — 1, 10</w:t>
+        <w:t xml:space="preserve">Marcador y enfermedad (lactato, perfusión, ANDROMEDA-SHOCK) — 1, 9</w:t>
       </w:r>
     </w:p>
     <w:p>
@@ -18956,7 +18854,7 @@
         </w:numPr>
       </w:pPr>
       <w:r>
-        <w:t xml:space="preserve">Proteína C reactiva: cinética y lectura temporal — 12</w:t>
+        <w:t xml:space="preserve">Proteína C reactiva: cinética y lectura temporal — 11, 12</w:t>
       </w:r>
     </w:p>
     <w:p>

</xml_diff>

<commit_message>
Rebuild tras los bloques C y D (158 pp, TOC 37/37, cero comillas rectas) y README punto 33 con las métricas de prosa
Co-Authored-By: Claude Fable 5.1 <noreply@anthropic.com>
Claude-Session: https://claude.ai/code/session_01SPkhDdVzUCxJwqq61ddeLW
</commit_message>
<xml_diff>
--- a/libro/Hechos_inferencias_incertidumbre_edicion_revisada.docx
+++ b/libro/Hechos_inferencias_incertidumbre_edicion_revisada.docx
@@ -367,7 +367,7 @@
         <w:rPr>
           <w:color w:val="8A8A8A"/>
         </w:rPr>
-        <w:t xml:space="preserve">33</w:t>
+        <w:t xml:space="preserve">34</w:t>
       </w:r>
     </w:p>
     <w:p>
@@ -387,7 +387,7 @@
         <w:rPr>
           <w:color w:val="8A8A8A"/>
         </w:rPr>
-        <w:t xml:space="preserve">34</w:t>
+        <w:t xml:space="preserve">35</w:t>
       </w:r>
     </w:p>
     <w:p>
@@ -407,7 +407,7 @@
         <w:rPr>
           <w:color w:val="8A8A8A"/>
         </w:rPr>
-        <w:t xml:space="preserve">40</w:t>
+        <w:t xml:space="preserve">41</w:t>
       </w:r>
     </w:p>
     <w:p>
@@ -427,7 +427,7 @@
         <w:rPr>
           <w:color w:val="8A8A8A"/>
         </w:rPr>
-        <w:t xml:space="preserve">44</w:t>
+        <w:t xml:space="preserve">45</w:t>
       </w:r>
     </w:p>
     <w:p>
@@ -447,7 +447,7 @@
         <w:rPr>
           <w:color w:val="8A8A8A"/>
         </w:rPr>
-        <w:t xml:space="preserve">48</w:t>
+        <w:t xml:space="preserve">49</w:t>
       </w:r>
     </w:p>
     <w:p>
@@ -467,7 +467,7 @@
         <w:rPr>
           <w:color w:val="8A8A8A"/>
         </w:rPr>
-        <w:t xml:space="preserve">54</w:t>
+        <w:t xml:space="preserve">55</w:t>
       </w:r>
     </w:p>
     <w:p>
@@ -487,7 +487,7 @@
         <w:rPr>
           <w:color w:val="8A8A8A"/>
         </w:rPr>
-        <w:t xml:space="preserve">55</w:t>
+        <w:t xml:space="preserve">57</w:t>
       </w:r>
     </w:p>
     <w:p>
@@ -507,7 +507,7 @@
         <w:rPr>
           <w:color w:val="8A8A8A"/>
         </w:rPr>
-        <w:t xml:space="preserve">56</w:t>
+        <w:t xml:space="preserve">58</w:t>
       </w:r>
     </w:p>
     <w:p>
@@ -527,7 +527,7 @@
         <w:rPr>
           <w:color w:val="8A8A8A"/>
         </w:rPr>
-        <w:t xml:space="preserve">61</w:t>
+        <w:t xml:space="preserve">63</w:t>
       </w:r>
     </w:p>
     <w:p>
@@ -547,7 +547,7 @@
         <w:rPr>
           <w:color w:val="8A8A8A"/>
         </w:rPr>
-        <w:t xml:space="preserve">68</w:t>
+        <w:t xml:space="preserve">70</w:t>
       </w:r>
     </w:p>
     <w:p>
@@ -567,7 +567,7 @@
         <w:rPr>
           <w:color w:val="8A8A8A"/>
         </w:rPr>
-        <w:t xml:space="preserve">72</w:t>
+        <w:t xml:space="preserve">74</w:t>
       </w:r>
     </w:p>
     <w:p>
@@ -587,7 +587,7 @@
         <w:rPr>
           <w:color w:val="8A8A8A"/>
         </w:rPr>
-        <w:t xml:space="preserve">79</w:t>
+        <w:t xml:space="preserve">81</w:t>
       </w:r>
     </w:p>
     <w:p>
@@ -607,7 +607,7 @@
         <w:rPr>
           <w:color w:val="8A8A8A"/>
         </w:rPr>
-        <w:t xml:space="preserve">84</w:t>
+        <w:t xml:space="preserve">86</w:t>
       </w:r>
     </w:p>
     <w:p>
@@ -627,7 +627,7 @@
         <w:rPr>
           <w:color w:val="8A8A8A"/>
         </w:rPr>
-        <w:t xml:space="preserve">86</w:t>
+        <w:t xml:space="preserve">88</w:t>
       </w:r>
     </w:p>
     <w:p>
@@ -647,7 +647,7 @@
         <w:rPr>
           <w:color w:val="8A8A8A"/>
         </w:rPr>
-        <w:t xml:space="preserve">87</w:t>
+        <w:t xml:space="preserve">89</w:t>
       </w:r>
     </w:p>
     <w:p>
@@ -667,7 +667,7 @@
         <w:rPr>
           <w:color w:val="8A8A8A"/>
         </w:rPr>
-        <w:t xml:space="preserve">93</w:t>
+        <w:t xml:space="preserve">95</w:t>
       </w:r>
     </w:p>
     <w:p>
@@ -687,7 +687,7 @@
         <w:rPr>
           <w:color w:val="8A8A8A"/>
         </w:rPr>
-        <w:t xml:space="preserve">100</w:t>
+        <w:t xml:space="preserve">102</w:t>
       </w:r>
     </w:p>
     <w:p>
@@ -707,7 +707,7 @@
         <w:rPr>
           <w:color w:val="8A8A8A"/>
         </w:rPr>
-        <w:t xml:space="preserve">109</w:t>
+        <w:t xml:space="preserve">111</w:t>
       </w:r>
     </w:p>
     <w:p>
@@ -727,7 +727,7 @@
         <w:rPr>
           <w:color w:val="8A8A8A"/>
         </w:rPr>
-        <w:t xml:space="preserve">113</w:t>
+        <w:t xml:space="preserve">115</w:t>
       </w:r>
     </w:p>
     <w:p>
@@ -747,7 +747,7 @@
         <w:rPr>
           <w:color w:val="8A8A8A"/>
         </w:rPr>
-        <w:t xml:space="preserve">121</w:t>
+        <w:t xml:space="preserve">123</w:t>
       </w:r>
     </w:p>
     <w:p>
@@ -767,7 +767,7 @@
         <w:rPr>
           <w:color w:val="8A8A8A"/>
         </w:rPr>
-        <w:t xml:space="preserve">125</w:t>
+        <w:t xml:space="preserve">127</w:t>
       </w:r>
     </w:p>
     <w:p>
@@ -787,7 +787,7 @@
         <w:rPr>
           <w:color w:val="8A8A8A"/>
         </w:rPr>
-        <w:t xml:space="preserve">127</w:t>
+        <w:t xml:space="preserve">129</w:t>
       </w:r>
     </w:p>
     <w:p>
@@ -807,7 +807,7 @@
         <w:rPr>
           <w:color w:val="8A8A8A"/>
         </w:rPr>
-        <w:t xml:space="preserve">129</w:t>
+        <w:t xml:space="preserve">131</w:t>
       </w:r>
     </w:p>
     <w:p>
@@ -827,7 +827,7 @@
         <w:rPr>
           <w:color w:val="8A8A8A"/>
         </w:rPr>
-        <w:t xml:space="preserve">131</w:t>
+        <w:t xml:space="preserve">133</w:t>
       </w:r>
     </w:p>
     <w:p>
@@ -847,7 +847,7 @@
         <w:rPr>
           <w:color w:val="8A8A8A"/>
         </w:rPr>
-        <w:t xml:space="preserve">133</w:t>
+        <w:t xml:space="preserve">135</w:t>
       </w:r>
     </w:p>
     <w:p>
@@ -867,7 +867,7 @@
         <w:rPr>
           <w:color w:val="8A8A8A"/>
         </w:rPr>
-        <w:t xml:space="preserve">138</w:t>
+        <w:t xml:space="preserve">140</w:t>
       </w:r>
     </w:p>
     <w:p>
@@ -887,7 +887,7 @@
         <w:rPr>
           <w:color w:val="8A8A8A"/>
         </w:rPr>
-        <w:t xml:space="preserve">142</w:t>
+        <w:t xml:space="preserve">144</w:t>
       </w:r>
     </w:p>
     <w:p>
@@ -907,7 +907,7 @@
         <w:rPr>
           <w:color w:val="8A8A8A"/>
         </w:rPr>
-        <w:t xml:space="preserve">143</w:t>
+        <w:t xml:space="preserve">145</w:t>
       </w:r>
     </w:p>
     <w:p>
@@ -943,15 +943,15 @@
         <w:pStyle w:val="BodyJ"/>
       </w:pPr>
       <w:r>
-        <w:t xml:space="preserve">Durante mi residencia escribí una frase que tardé años en devolver a su tamaño real. El paciente había vomitado durante la noche; en la radiografía de la mañana aparecieron infiltrados basales. Yo escribí: "neumonía aspirativa". Dos palabras limpias y verosímiles que saltaban sin escalas desde el vómito y la sombra radiológica hasta una infección bacteriana establecida. La frase viajó conmigo a la entrega de turno, de la entrega a la visita médica, de la visita a la epicrisis y de la epicrisis a la nota de ingreso siguiente, meses después, redactada por alguien que nunca vio al paciente vomitar. Nadie mintió en ningún momento. Pero en algún punto del trayecto una hipótesis razonable se había convertido en un antecedente, y el antecedente en un hecho. Cuando volví a encontrar la frase, ya nadie recordaba que había nacido siendo una conjetura mía, escrita a las siete de la mañana, con la certeza frágil de quien lleva doce horas de turno.</w:t>
-      </w:r>
-    </w:p>
-    <w:p>
-      <w:pPr>
-        <w:pStyle w:val="BodyJ"/>
-      </w:pPr>
-      <w:r>
-        <w:t xml:space="preserve">Este libro nace de esa observación, repetida después en mil variantes: algunas frases clínicas hacen algo más que resumir. En pocas líneas consiguen distinguir el dato de su interpretación, jerarquizar lo decisivo, preservar la incertidumbre y dejar visible por qué una conducta es razonable. Otras frases, aun siendo técnicamente correctas, confunden observación con explicación, ocultan los grados de certeza o convierten una posibilidad en un hecho. La diferencia no es sólo estilística. Es epistemológica y, por sus consecuencias, también clínica.</w:t>
+        <w:t xml:space="preserve">Durante mi residencia escribí una frase que tardé años en devolver a su tamaño real. El paciente había vomitado durante la noche; en la radiografía de la mañana aparecieron infiltrados basales. Yo escribí: «neumonía aspirativa». Dos palabras limpias y verosímiles que saltaban sin escalas desde el vómito y la sombra radiológica hasta una infección bacteriana establecida. La frase viajó conmigo a la entrega de turno, de la entrega a la visita médica, de la visita a la epicrisis y de la epicrisis a la nota de ingreso siguiente, meses después, redactada por alguien que nunca vio al paciente vomitar. Nadie mintió en ningún momento. Pero en algún punto del trayecto una hipótesis razonable se había convertido en un antecedente, y el antecedente en un hecho. Cuando volví a encontrar la frase, ya nadie recordaba que había nacido siendo una conjetura mía, escrita a las siete de la mañana, con la certeza frágil de quien lleva doce horas de turno.</w:t>
+      </w:r>
+    </w:p>
+    <w:p>
+      <w:pPr>
+        <w:pStyle w:val="BodyJ"/>
+      </w:pPr>
+      <w:r>
+        <w:t xml:space="preserve">Este libro nace de esa observación, repetida después en mil variantes: algunas frases clínicas hacen algo más que resumir. En pocas líneas consiguen distinguir el dato de su interpretación, jerarquizar lo decisivo, preservar la incertidumbre y dejar visible por qué una conducta es razonable. Otras frases, aun siendo técnicamente correctas, confunden observación con explicación, ocultan los grados de certeza o convierten una posibilidad en un hecho. La diferencia es epistemológica antes que estilística y, por sus consecuencias, también clínica.</w:t>
       </w:r>
     </w:p>
     <w:p>
@@ -991,7 +991,7 @@
         <w:pStyle w:val="BodyJ"/>
       </w:pPr>
       <w:r>
-        <w:t xml:space="preserve">Conviene decir desde el inicio en qué conversación entra este libro. Jerome Groopman mostró al gran público cómo piensan los médicos y dónde se tuercen sus atajos (Groopman, 2007); Pat Croskerry catalogó esos desvíos y propuso estrategias para contenerlos (Croskerry, 2003); Kathryn Montgomery demostró que el juicio clínico es un razonamiento práctico irreductible a la aplicación de reglas (Montgomery, 2006). Este ensayo se sitúa después de esas tres operaciones y propone la que falta: cómo escribir y decidir para que las capas del conocimiento clínico —lo observado, lo inferido, lo incierto, lo decidido— permanezcan visibles y auditables en el trabajo de cada día. No va de la teoría hacia la clínica, sino de la ficha, la entrega de turno, la visita médica y la nota de evolución hacia la epistemología. Y está escrito en español a propósito: la reflexión sistemática sobre el razonamiento clínico apenas circula en nuestra lengua fuera de traducciones, y las palabras con que un equipo hispanohablante fija sus certezas merecen un examen hecho desde dentro.</w:t>
+        <w:t xml:space="preserve">Hay que decir desde el inicio en qué conversación entra este libro. Jerome Groopman mostró al gran público cómo piensan los médicos y dónde se tuercen sus atajos (Groopman, 2007); Pat Croskerry catalogó esos desvíos y propuso estrategias para contenerlos (Croskerry, 2003); Kathryn Montgomery sostuvo que el juicio clínico es un razonamiento práctico irreductible a la aplicación de reglas (Montgomery, 2006). Este ensayo se sitúa después de esas tres operaciones y propone la que falta: cómo escribir y decidir para que las capas del conocimiento clínico —lo observado, lo inferido, lo incierto, lo decidido— permanezcan visibles y auditables en el trabajo de cada día. No va de la teoría hacia la clínica, sino de la ficha, la entrega de turno, la visita médica y la nota de evolución hacia la epistemología. Y está escrito en español a propósito: la reflexión sistemática sobre el razonamiento clínico apenas circula en nuestra lengua fuera de traducciones, y las palabras con que un equipo hispanohablante fija sus certezas merecen un examen hecho desde dentro.</w:t>
       </w:r>
     </w:p>
     <w:p>
@@ -1079,7 +1079,7 @@
         <w:t xml:space="preserve">Parte III</w:t>
       </w:r>
       <w:r>
-        <w:t xml:space="preserve"> amplía el foco hacia la decisión en el tiempo y con otros: la evidencia poblacional y su traducción al caso singular, los umbrales donde los valores entran al cálculo y la decisión se cruza con la bioética, la trayectoria temporal, la ficha clínica, y los equipos y la comunicación de la incertidumbre. La </w:t>
+        <w:t xml:space="preserve"> amplía el foco hacia la decisión en el tiempo y con otros. La evidencia poblacional y su traducción al caso singular; los umbrales donde los valores entran al cálculo y la decisión se cruza con la bioética; la trayectoria temporal; la ficha clínica; los equipos y la comunicación de la incertidumbre. La </w:t>
       </w:r>
       <w:r>
         <w:rPr>
@@ -1089,7 +1089,7 @@
         <w:t xml:space="preserve">Parte IV</w:t>
       </w:r>
       <w:r>
-        <w:t xml:space="preserve"> propone una epistemología operativa: la responsabilidad —incluido el miedo que también escribe—, el método HII-D, un cuaderno de ocho casos, la enseñanza de la metacognición clínica, la inteligencia artificial en el proceso diagnóstico y terapéutico —sus roles, sus riesgos y las defensas frente a ellos— y un cierre desde la poesía chilena — Huidobro y Parra como los dos polos de lo que la palabra clínica puede y no puede permitirse.</w:t>
+        <w:t xml:space="preserve"> propone una epistemología operativa. La responsabilidad, incluido el miedo que también escribe; el método HII-D; un cuaderno de ocho casos; la enseñanza de la metacognición clínica; la inteligencia artificial en el proceso diagnóstico y terapéutico, con sus roles, sus riesgos y las defensas frente a ellos. Y un cierre desde la poesía chilena: Huidobro y Parra como los dos polos de lo que la palabra clínica puede y no puede permitirse.</w:t>
       </w:r>
     </w:p>
     <w:p>
@@ -1143,7 +1143,7 @@
         <w:pStyle w:val="BodyJ"/>
       </w:pPr>
       <w:r>
-        <w:t xml:space="preserve">Conviene leer con un caso propio en mente. Ante cada concepto, puede preguntarse: ¿qué frase uso habitualmente para esto?, ¿qué parte de esa frase es dato?, ¿qué presupuestos contiene?, ¿cómo la entendería otro profesional?, ¿qué conducta habilita? El libro pretende producir una pequeña fricción entre pensamiento y lenguaje. Esa fricción es deliberada: permite observar operaciones que la experiencia vuelve rápidas e invisibles.</w:t>
+        <w:t xml:space="preserve">Lea con un caso propio en mente. Ante cada concepto, puede preguntarse: ¿qué frase uso habitualmente para esto?, ¿qué parte de esa frase es dato?, ¿qué presupuestos contiene?, ¿cómo la entendería otro profesional?, ¿qué conducta habilita? El libro pretende producir una pequeña fricción entre pensamiento y lenguaje. Esa fricción es deliberada: permite observar operaciones que la experiencia vuelve rápidas e invisibles.</w:t>
       </w:r>
     </w:p>
     <w:p>
@@ -1276,15 +1276,15 @@
         <w:pStyle w:val="BodyJ"/>
       </w:pPr>
       <w:r>
-        <w:t xml:space="preserve">Carmen tiene sesenta y un años y una cicatriz en la línea media que le cruza el abdomen desde una cirugía de hace una década. Sobre la cicatriz, una hernia incisional que ella conoce mejor que nadie: sabe qué comidas la distienden, sabe dormir de lado cuando "se le aprieta", sabe distinguir la molestia habitual del dolor que la obliga a ir a urgencias. Ha ingresado tres veces en el último año por episodios de suboclusión intestinal que cedieron con reposo digestivo y sonda nasogástrica. Esta madrugada llegó por cuarta vez, y algo es radicalmente distinto: está hipotensa, taquicárdica, con las rodillas moteadas y un lactato de 6 mmol/L. En la nota de ingreso, alguien escribió: "Paciente con hernia complicada conocida, cuadro habitual, se maneja de forma habitual".</w:t>
-      </w:r>
-    </w:p>
-    <w:p>
-      <w:pPr>
-        <w:pStyle w:val="BodyJ"/>
-      </w:pPr>
-      <w:r>
-        <w:t xml:space="preserve">Casi todo en esa frase suena razonable, y casi todo oculta el problema real. ¿Qué significa "conocida" cuando el comportamiento biológico acaba de cambiar? ¿Qué tiene de "habitual" una paciente que por primera vez ingresa en shock? ¿"Complicada" describe el atascamiento mecánico de los ingresos previos o la amenaza de isquemia y sepsis que enfrenta hoy? La frase no es falsa: es prematura. Comprime cuatro operaciones distintas —observar los signos de hipoperfusión, inferir la causa del deterioro, reconocer lo que la clínica aún no permite descartar y decidir una conducta proporcional al riesgo— en un gesto único que ya no deja ver sus partes. Este libro trata de esas cuatro operaciones, de cómo se confunden en el registro diario y de cómo volver a separarlas cuando importa. Volveremos a la cama de Carmen al final de cada parte.</w:t>
+        <w:t xml:space="preserve">Carmen tiene sesenta y un años, treinta de cigarrillo y una cicatriz en la línea media que le cruza el abdomen desde una cirugía de hace una década. Sobre la cicatriz, una hernia incisional que ella conoce mejor que nadie: sabe qué comidas la distienden, sabe dormir de lado cuando «se le aprieta», sabe distinguir la molestia habitual del dolor que la obliga a ir a urgencias. Ha ingresado tres veces en el último año por episodios de suboclusión intestinal que cedieron con reposo digestivo y sonda nasogástrica. Esta madrugada llegó por cuarta vez, y algo es radicalmente distinto: está hipotensa, taquicárdica, con las rodillas moteadas y un lactato de 6 mmol/L. En la nota de ingreso, alguien escribió: «Paciente con hernia complicada conocida, cuadro habitual, se maneja de forma habitual».</w:t>
+      </w:r>
+    </w:p>
+    <w:p>
+      <w:pPr>
+        <w:pStyle w:val="BodyJ"/>
+      </w:pPr>
+      <w:r>
+        <w:t xml:space="preserve">Casi todo en esa frase suena razonable, y casi todo oculta el problema real. ¿Qué significa «conocida» cuando el comportamiento biológico acaba de cambiar? ¿Qué tiene de «habitual» una paciente que por primera vez ingresa en shock? ¿«Complicada» describe el atascamiento mecánico de los ingresos previos o la amenaza de isquemia y sepsis que enfrenta hoy? La frase no es falsa: es prematura. Comprime cuatro operaciones distintas —observar los signos de hipoperfusión, inferir la causa del deterioro, reconocer lo que la clínica aún no permite descartar y decidir una conducta proporcional al riesgo— en un gesto único que ya no deja ver sus partes. Este libro trata de esas cuatro operaciones, de cómo se confunden en el registro diario y de cómo volver a separarlas cuando importa. El libro vuelve a la cama de Carmen al final de cada parte.</w:t>
       </w:r>
     </w:p>
     <w:p>
@@ -1407,15 +1407,15 @@
         <w:pStyle w:val="BodyJ"/>
       </w:pPr>
       <w:r>
-        <w:t xml:space="preserve">Estas capas se mezclan con facilidad. Una nota puede declarar "infección urinaria" ante bacteriuria en un paciente sondado sin evidencia clínica de infección; puede escribir "descompensación cardiaca" donde sólo hay edema y una radiografía congestiva; puede describir "fracaso del manejo conservador" sin explicitar cuál era el objetivo, durante cuánto tiempo fue intentado y qué desenlace cambió el balance. La frase parece resolver el problema, pero en realidad oculta el camino inferencial. La nota de ingreso de Carmen —"cuadro habitual, manejo habitual"— pertenece a esta familia.</w:t>
-      </w:r>
-    </w:p>
-    <w:p>
-      <w:pPr>
-        <w:pStyle w:val="BodyJ"/>
-      </w:pPr>
-      <w:r>
-        <w:t xml:space="preserve">La metacognición permite examinar ese camino. Desde Flavell, el término designa el conocimiento y monitoreo de los propios procesos cognitivos (Flavell, 1979). Nelson y Narens distinguieron un nivel objeto —el proceso que realiza la tarea— y un nivel meta —el que supervisa y regula ese proceso— (Nelson &amp; Narens, 1990). En clínica, esto implica no sólo preguntar "¿cuál es el diagnóstico?", sino "¿qué me lleva a pensar esto?", "¿qué parte es observación y qué parte interpretación?", "¿qué evidencia podría hacerme cambiar?", "¿mi confianza corresponde a mi precisión?" y "¿por qué este caso requiere actuar ahora?".</w:t>
+        <w:t xml:space="preserve">Estas capas se mezclan con facilidad. Una nota puede declarar «infección urinaria» ante bacteriuria en un paciente sondado sin evidencia clínica de infección, o «descompensación cardiaca» donde sólo hay edema y una radiografía congestiva. Puede describir «fracaso del manejo conservador» sin explicitar cuál era el objetivo, durante cuánto tiempo fue intentado y qué desenlace cambió el balance. La frase parece resolver el problema, pero en realidad oculta el camino inferencial. La nota de ingreso de Carmen —«cuadro habitual, manejo habitual»— pertenece a esta familia.</w:t>
+      </w:r>
+    </w:p>
+    <w:p>
+      <w:pPr>
+        <w:pStyle w:val="BodyJ"/>
+      </w:pPr>
+      <w:r>
+        <w:t xml:space="preserve">La metacognición permite examinar ese camino. Desde Flavell, el término designa el conocimiento y monitoreo de los propios procesos cognitivos (Flavell, 1979). Nelson y Narens distinguieron un nivel objeto —el proceso que realiza la tarea— y un nivel meta —el que supervisa y regula ese proceso— (Nelson &amp; Narens, 1990). En clínica, esto implica no sólo preguntar «¿cuál es el diagnóstico?», sino «¿qué me lleva a pensar esto?», «¿qué parte es observación y qué parte interpretación?», «¿qué evidencia podría hacerme cambiar?», «¿mi confianza corresponde a mi precisión?» y «¿por qué este caso requiere actuar ahora?».</w:t>
       </w:r>
     </w:p>
     <w:p>
@@ -1590,7 +1590,7 @@
         <w:pStyle w:val="BodyJ"/>
       </w:pPr>
       <w:r>
-        <w:t xml:space="preserve">Son las 7:40 de la mañana y, en la entrega de turno, el residente presenta a Carmen: "Paciente séptica de foco abdominal, con hernia complicada". El jefe de servicio mira la hoja de enfermería de urgencias y hace una sola pregunta: "¿Qué parte de esa frase la observó alguien directamente y qué parte la estamos suponiendo?". El silencio que sigue es el tema de este capítulo.</w:t>
+        <w:t xml:space="preserve">Son las 7:40 de la mañana y, en la entrega de turno, el residente presenta a Carmen: «Paciente séptica de foco abdominal, con hernia complicada». El jefe de servicio mira la hoja de enfermería de urgencias y hace una sola pregunta: «¿Qué parte de esa frase la observó alguien directamente y qué parte la estamos suponiendo?». El silencio que sigue es el tema de este capítulo.</w:t>
       </w:r>
     </w:p>
     <w:p>
@@ -1615,7 +1615,7 @@
         <w:pStyle w:val="BodyJ"/>
       </w:pPr>
       <w:r>
-        <w:t xml:space="preserve">En la conversación cotidiana llamamos hecho a algo que simplemente ocurrió. En clínica, el término requiere mayor disciplina. Un hecho clínico es una observación o medición situada, obtenida mediante una fuente y un procedimiento concretos. "Temperatura de 38,4 °C", "hemocultivo positivo", "dolor iniciado hace seis horas" y "sin signos tomográficos de perforación" no tienen la misma procedencia, resolución temporal ni vulnerabilidad al error. Su valor depende de cómo fueron producidos.</w:t>
+        <w:t xml:space="preserve">En la conversación cotidiana se llama hecho a algo que simplemente ocurrió. En clínica, el término requiere mayor disciplina. Un hecho clínico es una observación o medición situada, obtenida mediante una fuente y un procedimiento concretos. «Temperatura de 38,4 °C», «hemocultivo positivo», «dolor iniciado hace seis horas» y «sin signos tomográficos de perforación» no tienen la misma procedencia, resolución temporal ni vulnerabilidad al error. Su valor depende de cómo fueron producidos.</w:t>
       </w:r>
     </w:p>
     <w:p>
@@ -1631,23 +1631,23 @@
         <w:pStyle w:val="BodyJ"/>
       </w:pPr>
       <w:r>
-        <w:t xml:space="preserve">Esto no vuelve arbitraria la observación. Obliga a hacer explícitas sus condiciones. Un dato clínico fuerte conserva al menos cuatro atributos: fuente, método, tiempo y confiabilidad. "Paciente refiere ausencia de dolor" no equivale a "sin dolor a la palpación"; "presión radial invasiva" no equivale sin más a presión femoral en shock vasopléjico; "sin fiebre" puede significar afebril durante una hora, durante 48 horas o bajo antipiréticos. La precisión empieza antes de interpretar.</w:t>
-      </w:r>
-    </w:p>
-    <w:p>
-      <w:pPr>
-        <w:pStyle w:val="BodyJ"/>
-      </w:pPr>
-      <w:r>
-        <w:t xml:space="preserve">Conviene precisar, antes de seguir, qué estatuto tiene entonces la palabra "hecho" en este libro, porque la carga teórica de la observación parece amenazar la distinción que organiza todo lo demás: si toda observación ya contiene conceptos, ¿dónde termina el hecho y empieza la inferencia? La respuesta es pragmática, no ontológica. "Hecho" es el estatus provisional que un equipo concede a una afirmación cuando acuerda no cuestionarla para la decisión en curso. "Lactato 6,0" es un hecho mientras nadie discuta el método ni la hora; deja de serlo en el instante en que la decisión dependa de si la muestra era venosa o estaba hemolizada, y entonces hay que bajar un nivel y volver a mirar. La frontera entre capas no es una línea en la naturaleza: es una línea que el equipo traza, puede volver a trazar y debe poder mostrar dónde la trazó. Eso —y no compartimentos puros— es lo que la Figura 2 llama separación funcional y gradual.</w:t>
-      </w:r>
-    </w:p>
-    <w:p>
-      <w:pPr>
-        <w:pStyle w:val="BodyJ"/>
-      </w:pPr>
-      <w:r>
-        <w:t xml:space="preserve">Esta posición tiene un antecedente chileno que conviene reconocer con la precisión que su propio autor exigía. Maturana formuló en 1970 la frase que cualquier ficha debería llevar como advertencia: todo lo dicho es dicho por un observador (Maturana, 1970; Maturana &amp; Varela, 1984). Y propuso después distinguir una "objetividad sin paréntesis" —la del que cree hablar de la realidad sin mediación y usa esa creencia como argumento para obligar al otro— de una "objetividad entre paréntesis", que admite que toda afirmación válida lo es dentro de un dominio de condiciones que el observador puede declarar (Maturana, 1990). El "quién lo observó, cómo y cuándo" de este capítulo y el léxico de certeza del capítulo 4 son objetividad entre paréntesis vuelta hábito de escritura. Dos aclaraciones, para que el préstamo no se convierta en coartada. El paréntesis no le quita realidad al lactato: la paciente está hipoperfundida la mida quien la mida, y donde el constructivismo de Maturana da el paso de disolver esa diferencia, este libro no lo acompaña. Y declarar al observador no vuelve relativa la observación: la vuelve auditable, que es lo contrario. La trazabilidad es el paréntesis puesto por escrito.</w:t>
+        <w:t xml:space="preserve">Esto no vuelve arbitraria la observación. Obliga a hacer explícitas sus condiciones. Un dato clínico fuerte conserva al menos cuatro atributos: fuente, método, tiempo y confiabilidad. «Paciente refiere ausencia de dolor» no equivale a «sin dolor a la palpación»; «presión radial invasiva» no equivale sin más a presión femoral en shock vasopléjico; «sin fiebre» puede significar afebril durante una hora, durante 48 horas o bajo antipiréticos. La precisión empieza antes de interpretar.</w:t>
+      </w:r>
+    </w:p>
+    <w:p>
+      <w:pPr>
+        <w:pStyle w:val="BodyJ"/>
+      </w:pPr>
+      <w:r>
+        <w:t xml:space="preserve">Antes de seguir, hay que precisar qué estatuto tiene entonces la palabra «hecho» en este libro, porque la carga teórica de la observación parece amenazar la distinción que organiza todo lo demás: si toda observación ya contiene conceptos, ¿dónde termina el hecho y empieza la inferencia? La respuesta es pragmática, no ontológica. «Hecho» es el estatus provisional que un equipo concede a una afirmación cuando acuerda no cuestionarla para la decisión en curso. «Lactato 6,0» es un hecho mientras nadie discuta el método ni la hora; deja de serlo en el instante en que la decisión dependa de si la muestra era venosa o estaba hemolizada, y entonces hay que bajar un nivel y volver a mirar. La frontera entre capas no es una línea en la naturaleza, sino una línea que el equipo traza, puede volver a trazar y debe poder mostrar dónde la trazó. Eso —y no compartimentos puros— es lo que la Figura 2 llama separación funcional y gradual.</w:t>
+      </w:r>
+    </w:p>
+    <w:p>
+      <w:pPr>
+        <w:pStyle w:val="BodyJ"/>
+      </w:pPr>
+      <w:r>
+        <w:t xml:space="preserve">Esta posición tiene un antecedente chileno que pide reconocerse con la precisión que su propio autor exigía. Maturana formuló en 1970 la frase que cualquier ficha debería llevar como advertencia: todo lo dicho es dicho por un observador (Maturana, 1970; Maturana &amp; Varela, 1984). Y propuso después distinguir dos objetividades. La «objetividad sin paréntesis» es la del que cree hablar de la realidad sin mediación y usa esa creencia como argumento para obligar al otro; la «objetividad entre paréntesis» admite que toda afirmación válida lo es dentro de un dominio de condiciones que el observador puede declarar (Maturana, 1990). El «quién lo observó, cómo y cuándo» de este capítulo y el léxico de certeza del capítulo 4 son objetividad entre paréntesis vuelta hábito de escritura. Dos aclaraciones, para que el préstamo no se convierta en coartada. El paréntesis no le quita realidad al lactato: la paciente está hipoperfundida la mida quien la mida, y donde el constructivismo de Maturana da el paso de disolver esa diferencia, este libro no lo acompaña. Y declarar al observador no vuelve relativa la observación: la vuelve auditable, que es lo contrario. La trazabilidad es el paréntesis puesto por escrito.</w:t>
       </w:r>
     </w:p>
     <w:p>
@@ -1680,7 +1680,7 @@
         <w:pStyle w:val="BodyJ"/>
       </w:pPr>
       <w:r>
-        <w:t xml:space="preserve">La ausencia de un dato tampoco es equivalente a un hallazgo negativo. "No consignado" significa que el registro no permite saber; "no evaluado" indica que la observación no se realizó; "ausente" supone una búsqueda adecuada; "sin evidencia de" añade el límite del método. Confundir estas expresiones crea certezas retrospectivas. En seguridad diagnóstica, la distinción entre ausencia de evidencia y evidencia de ausencia es fundamental; volveremos a ella cada vez que un hallazgo negativo amenace con decidir demasiado.</w:t>
+        <w:t xml:space="preserve">La ausencia de un dato tampoco es equivalente a un hallazgo negativo. «No consignado» significa que el registro no permite saber; «no evaluado» indica que la observación no se realizó; «ausente» supone una búsqueda adecuada; «sin evidencia de» añade el límite del método. Confundir estas expresiones crea certezas retrospectivas. En seguridad diagnóstica, la distinción entre ausencia de evidencia y evidencia de ausencia es fundamental; este libro vuelve a ella cada vez que un hallazgo negativo amenace con decidir demasiado.</w:t>
       </w:r>
     </w:p>
     <w:p>
@@ -1696,15 +1696,15 @@
         <w:pStyle w:val="BodyJ"/>
       </w:pPr>
       <w:r>
-        <w:t xml:space="preserve">La distinción no es académica. El ensayo ANDROMEDA-SHOCK comparó dos maneras de leer al mismo paciente en shock séptico —guiar la reanimación por la normalización del lactato o por la del relleno capilar— y la estrategia guiada por el marcador de laboratorio no resultó superior a la guiada por la perfusión periférica observada en la piel (Hernández et al., 2019). Cuando dos blancos que supuestamente "miden lo mismo" conducen a conductas y desenlaces distintos, lo que queda expuesto es exactamente la brecha entre el dato y su interpretación: el lactato era un hecho; "el paciente sigue hipoperfundido" era una inferencia que convenía someter a examen.</w:t>
-      </w:r>
-    </w:p>
-    <w:p>
-      <w:pPr>
-        <w:pStyle w:val="BodyJ"/>
-      </w:pPr>
-      <w:r>
-        <w:t xml:space="preserve">El mismo grupo había advertido antes contra el uso ingenuo de la "depuración de lactato" como blanco terapéutico: la hiperlactatemia que persiste no siempre es hipoperfusión que persiste —puede ser estrés adrenérgico, menor aclaramiento u otra cosa—, y perseguir el número puede inducir más reanimación de la que el paciente tolera (Hernández, Bellomo &amp; Bakker, 2019). Es la lección de este capítulo en versión de cuidados intensivos: tratar el marcador como si fuera el mecanismo no es un refinamiento; es una inferencia disfrazada de hecho, con volumen y vasopresores de por medio.</w:t>
+        <w:t xml:space="preserve">La distinción no es académica. El ensayo ANDROMEDA-SHOCK comparó dos maneras de leer al mismo paciente en shock séptico: guiar la reanimación por la normalización del lactato o por la del relleno capilar. La estrategia guiada por el marcador de laboratorio no resultó superior a la guiada por la perfusión periférica observada en la piel (Hernández et al., 2019). Cuando dos blancos que supuestamente «miden lo mismo» conducen a conductas y desenlaces distintos, lo que queda expuesto es la brecha entre el dato y su interpretación: el lactato era un hecho; «el paciente sigue hipoperfundido» era una inferencia que convenía someter a examen.</w:t>
+      </w:r>
+    </w:p>
+    <w:p>
+      <w:pPr>
+        <w:pStyle w:val="BodyJ"/>
+      </w:pPr>
+      <w:r>
+        <w:t xml:space="preserve">El mismo grupo había advertido antes contra el uso ingenuo de la «depuración de lactato» como blanco terapéutico (Hernández, Bellomo &amp; Bakker, 2019). La hiperlactatemia que persiste no siempre es hipoperfusión que persiste —puede ser estrés adrenérgico, menor aclaramiento u otra cosa—, y perseguir el número puede inducir más reanimación de la que el paciente tolera. Es la lección de este capítulo en versión de cuidados intensivos: tratar el marcador como si fuera el mecanismo no es un refinamiento; es una inferencia disfrazada de hecho, con volumen y vasopresores de por medio.</w:t>
       </w:r>
     </w:p>
     <w:p>
@@ -1737,15 +1737,15 @@
         <w:pStyle w:val="BodyJ"/>
       </w:pPr>
       <w:r>
-        <w:t xml:space="preserve">El problema surge cuando el relato es traducido demasiado rápido a una categoría diagnóstica. "Opresión cervical" puede transformarse en "disfagia", "sensación de falta de aire" en "disnea" y "mareo" en "vértigo" sin haber preservado la descripción original. Cada traducción añade inferencia. Una buena nota conserva suficiente material fenomenológico para que otro clínico pueda reconstruir el paso.</w:t>
-      </w:r>
-    </w:p>
-    <w:p>
-      <w:pPr>
-        <w:pStyle w:val="BodyJ"/>
-      </w:pPr>
-      <w:r>
-        <w:t xml:space="preserve">Carmen, por ejemplo, no dijo "dolor abdominal difuso": dijo que esta vez "la hernia no se dejó acomodar", que el dolor "era otro" y que por primera vez le dio miedo. No es folclor narrativo; son tres hallazgos semiológicos de alto valor: pérdida de reductibilidad aguda, cambio en el carácter del dolor —que sugiere sufrimiento parietal o vascular más allá de la distensión luminal— y percepción de amenaza vital. La nota que los aplana en "dolor abdominal en paciente con hernia conocida" no ha mentido: ha destruido evidencia diagnóstica primaria.</w:t>
+        <w:t xml:space="preserve">El problema surge cuando el relato es traducido demasiado rápido a una categoría diagnóstica. «Opresión cervical» puede transformarse en «disfagia», «sensación de falta de aire» en «disnea» y «mareo» en «vértigo» sin haber preservado la descripción original. Cada traducción añade inferencia. Una buena nota conserva suficiente material fenomenológico para que otro clínico pueda reconstruir el paso.</w:t>
+      </w:r>
+    </w:p>
+    <w:p>
+      <w:pPr>
+        <w:pStyle w:val="BodyJ"/>
+      </w:pPr>
+      <w:r>
+        <w:t xml:space="preserve">Carmen, por ejemplo, no dijo «dolor abdominal difuso»: dijo que esta vez «la hernia no se dejó acomodar», que el dolor «era otro» y que por primera vez le dio miedo. No es folclor narrativo; son tres hallazgos semiológicos de alto valor: pérdida de reductibilidad aguda, cambio en el carácter del dolor —que sugiere sufrimiento parietal o vascular más allá de la distensión luminal— y percepción de amenaza vital. La nota que los aplana en «dolor abdominal en paciente con hernia conocida» no ha mentido: ha destruido evidencia diagnóstica primaria.</w:t>
       </w:r>
     </w:p>
     <w:p>
@@ -1770,15 +1770,15 @@
         <w:pStyle w:val="BodyJ"/>
       </w:pPr>
       <w:r>
-        <w:t xml:space="preserve">Canguilhem mostró que la medicina no describe simplemente desviaciones estadísticas: juzga relaciones entre el organismo, sus normas y su capacidad de habitar un medio (Canguilhem, 1971). El hecho clínico adquiere relevancia dentro de esa relación. Una cifra fuera de rango puede ser irrelevante; una variación dentro del rango puede ser decisiva para ese paciente. La observación científica y la singularidad no son opuestas, pero deben articularse.</w:t>
-      </w:r>
-    </w:p>
-    <w:p>
-      <w:pPr>
-        <w:pStyle w:val="BodyJ"/>
-      </w:pPr>
-      <w:r>
-        <w:t xml:space="preserve">Por ello, conviene registrar los hechos de modo trazable en el tiempo. Una etiqueta como "shock séptico abdominal" fusiona estado fisiológico, etiología microbiológica y foco anatómico en un solo bloque. Una formulación limpia separa las capas y sus momentos: al ingreso, hipotensión con requerimiento de noradrenalina, lactato de 6,0 mmol/L y llene capilar de 5 segundos; episodio obstructivo clínico sobre hernia incisional, sin signos tomográficos de perforación ni isquemia; y, a las 14 horas de incubación, hemocultivos periféricos positivos para bacilos gramnegativos. Recién sobre esa arquitectura de datos puede sostenerse el foco abdominal por translocación como hipótesis probable.</w:t>
+        <w:t xml:space="preserve">Canguilhem sostuvo que la medicina no describe simplemente desviaciones estadísticas: juzga relaciones entre el organismo, sus normas y su capacidad de habitar un medio (Canguilhem, 1971). El hecho clínico adquiere relevancia dentro de esa relación. Una cifra fuera de rango puede ser irrelevante; una variación dentro del rango puede ser decisiva para ese paciente. La observación científica y la singularidad no son opuestas, pero deben articularse.</w:t>
+      </w:r>
+    </w:p>
+    <w:p>
+      <w:pPr>
+        <w:pStyle w:val="BodyJ"/>
+      </w:pPr>
+      <w:r>
+        <w:t xml:space="preserve">Por ello, los hechos se registran de modo trazable en el tiempo. Una etiqueta como «shock séptico abdominal» fusiona estado fisiológico, etiología microbiológica y foco anatómico en un solo bloque. Una formulación limpia separa las capas y sus momentos: al ingreso, hipotensión con requerimiento de noradrenalina, lactato de 6,0 mmol/L y llene capilar de 5 segundos; episodio obstructivo clínico sobre hernia incisional, sin signos tomográficos de perforación ni isquemia; y, a las 14 horas de incubación, hemocultivos periféricos positivos para bacilos gramnegativos. Recién sobre esa arquitectura de datos puede sostenerse el foco abdominal por translocación como hipótesis probable.</w:t>
       </w:r>
     </w:p>
     <w:p>
@@ -1819,7 +1819,7 @@
         <w:pStyle w:val="BodyJ"/>
       </w:pPr>
       <w:r>
-        <w:t xml:space="preserve">No todos los hechos clínicos ofrecen la misma verificabilidad externa. Puede distinguirse un ordenamiento: dato directamente medido y verificable; observación profesional reproducible; relato consistente del paciente o tercero; dato heredado de una nota anterior; y ausencia inferida porque algo no fue registrado. Este ordenamiento no jerarquiza el valor de las fuentes ni desacredita el relato — para el dolor, el cambio respecto del basal y las preferencias del paciente, el testimonio es la fuente primaria y la más pertinente (el capítulo 14 vuelve sobre esto). Busca que la procedencia viaje junto con la afirmación. "Paciente niega fiebre", "afebril durante observación" y "sin fiebre" no son equivalentes.</w:t>
+        <w:t xml:space="preserve">No todos los hechos clínicos ofrecen la misma verificabilidad externa. Puede distinguirse un ordenamiento: dato directamente medido y verificable; observación profesional reproducible; relato consistente del paciente o tercero; dato heredado de una nota anterior; y ausencia inferida porque algo no fue registrado. Este ordenamiento no jerarquiza el valor de las fuentes ni desacredita el relato — para el dolor, el cambio respecto del basal y las preferencias del paciente, el testimonio es la fuente primaria y la más pertinente (el capítulo 14 vuelve sobre esto). Busca que la procedencia viaje junto con la afirmación. «Paciente niega fiebre», «afebril durante observación» y «sin fiebre» no son equivalentes.</w:t>
       </w:r>
     </w:p>
     <w:tbl>
@@ -1918,7 +1918,7 @@
         <w:pStyle w:val="BodyJ"/>
       </w:pPr>
       <w:r>
-        <w:t xml:space="preserve">Cada fuente conviene leerla por lo que sólo ella ofrece y por dónde suele fallar:</w:t>
+        <w:t xml:space="preserve">Cada fuente se lee por lo que sólo ella ofrece y por dónde suele fallar:</w:t>
       </w:r>
     </w:p>
     <w:tbl>
@@ -2553,7 +2553,7 @@
         <w:pStyle w:val="BodyJ"/>
       </w:pPr>
       <w:r>
-        <w:t xml:space="preserve">Los hallazgos negativos exigen especial cautela. "Sin peritonismo" puede significar examen dirigido negativo; "sin evidencia de isquemia en TAC" limita la conclusión al rendimiento de una técnica y a un momento; "no refiere dolor" depende de capacidad comunicativa, neuroanatomía y contexto.</w:t>
+        <w:t xml:space="preserve">Los hallazgos negativos exigen especial cautela. «Sin peritonismo» puede significar examen dirigido negativo; «sin evidencia de isquemia en TAC» limita la conclusión al rendimiento de una técnica y a un momento; «no refiere dolor» depende de capacidad comunicativa, neuroanatomía y contexto.</w:t>
       </w:r>
     </w:p>
     <w:p>
@@ -2627,7 +2627,7 @@
         </w:numPr>
       </w:pPr>
       <w:r>
-        <w:t xml:space="preserve">"Lactato 6,0 mmol/L (04:15, arterial)."</w:t>
+        <w:t xml:space="preserve">«Lactato 6,0 mmol/L (04:15, arterial).»</w:t>
       </w:r>
     </w:p>
     <w:p>
@@ -2639,7 +2639,7 @@
         </w:numPr>
       </w:pPr>
       <w:r>
-        <w:t xml:space="preserve">"Abdomen sin signos de irritación peritoneal."</w:t>
+        <w:t xml:space="preserve">«Abdomen sin signos de irritación peritoneal.»</w:t>
       </w:r>
     </w:p>
     <w:p>
@@ -2651,7 +2651,7 @@
         </w:numPr>
       </w:pPr>
       <w:r>
-        <w:t xml:space="preserve">"Alérgica a penicilina."</w:t>
+        <w:t xml:space="preserve">«Alérgica a penicilina.»</w:t>
       </w:r>
     </w:p>
     <w:p>
@@ -2663,7 +2663,7 @@
         </w:numPr>
       </w:pPr>
       <w:r>
-        <w:t xml:space="preserve">"Sin episodios previos de sangrado."</w:t>
+        <w:t xml:space="preserve">«Sin episodios previos de sangrado.»</w:t>
       </w:r>
     </w:p>
     <w:p>
@@ -2675,7 +2675,7 @@
         </w:numPr>
       </w:pPr>
       <w:r>
-        <w:t xml:space="preserve">"La hernia no se dejó acomodar y el dolor era distinto al de otras veces."</w:t>
+        <w:t xml:space="preserve">«La hernia no se dejó acomodar y el dolor era distinto al de otras veces.»</w:t>
       </w:r>
     </w:p>
     <w:p>
@@ -2690,7 +2690,7 @@
         <w:t xml:space="preserve">Solución comentada.</w:t>
       </w:r>
       <w:r>
-        <w:t xml:space="preserve"> (1) Dato medido, con hora, unidad y origen de la muestra: el hecho de mayor verificabilidad externa de la lista. (2) Observación profesional: útil, pero sujeta a variabilidad interobservador y caducidad rápida; en un abdomen agudo dinámico, el examen físico de las 04:00 no garantiza el estado peritoneal de las 09:00 si no consigna quién examinó y bajo qué analgesia. (3) Registro heredado: casi ninguna ficha especifica quién documentó la alergia ni con qué clínica; exige reescribirse como "alergia a penicilina referida por la paciente (exantema cutáneo en la juventud, sin registro clínico verificable)". (4) Silencio documental o relato, según su fuente: "niega sangrados previos" (anamnesis) no equivale a "sin episodios de sangrado consignados en fichas previas" (revisión de registro). (5) Testimonio de la paciente con su carga fenomenológica intacta: irreemplazable como marcador de cambio respecto de su basal; debe conservarse entre comillas.</w:t>
+        <w:t xml:space="preserve"> (1) Dato medido, con hora, unidad y origen de la muestra: el hecho de mayor verificabilidad externa de la lista. (2) Observación profesional: útil, pero sujeta a variabilidad interobservador y caducidad rápida; en un abdomen agudo dinámico, el examen físico de las 04:00 no garantiza el estado peritoneal de las 09:00 si no consigna quién examinó y bajo qué analgesia. (3) Registro heredado: casi ninguna ficha especifica quién documentó la alergia ni con qué clínica; exige reescribirse como «alergia a penicilina referida por la paciente (exantema cutáneo en la juventud, sin registro clínico verificable)». (4) Silencio documental o relato, según su fuente: «niega sangrados previos» (anamnesis) no equivale a «sin episodios de sangrado consignados en fichas previas» (revisión de registro). (5) Testimonio de la paciente con su carga fenomenológica intacta: irreemplazable como marcador de cambio respecto de su basal; debe conservarse entre comillas.</w:t>
       </w:r>
     </w:p>
     <w:p>
@@ -2742,7 +2742,7 @@
         </w:numPr>
       </w:pPr>
       <w:r>
-        <w:t xml:space="preserve">¿Qué "hallazgo negativo" estoy tratando como evidencia de ausencia sin preguntarme por la sensibilidad de la búsqueda?</w:t>
+        <w:t xml:space="preserve">¿Qué «hallazgo negativo» estoy tratando como evidencia de ausencia sin preguntarme por la sensibilidad de la búsqueda?</w:t>
       </w:r>
     </w:p>
     <w:p>
@@ -2792,7 +2792,7 @@
         <w:pStyle w:val="BodyJ"/>
       </w:pPr>
       <w:r>
-        <w:t xml:space="preserve">En el registro de Carmen, el informe tomográfico concluye: "hernia incisional con asas de intestino delgado dilatadas, sin signos de isquemia ni perforación". En la evolución de ingreso, el residente transcribe: "TAC descarta complicación". Son tres palabras que transforman una descripción radiológica acotada en una sentencia clínica absoluta. Este capítulo trata del salto —inevitable, necesario y riesgoso— entre los signos que observamos y las explicaciones que conjeturamos.</w:t>
+        <w:t xml:space="preserve">En el registro de Carmen, el informe tomográfico concluye: «hernia incisional con asas de intestino delgado dilatadas, sin signos de isquemia ni perforación». En la evolución de ingreso, el residente transcribe: «TAC descarta complicación». Son tres palabras que transforman una descripción radiológica acotada en una sentencia clínica absoluta. Este capítulo trata del salto —inevitable, necesario y riesgoso— entre los signos que observamos y las explicaciones que conjeturamos.</w:t>
       </w:r>
     </w:p>
     <w:p>
@@ -2817,7 +2817,7 @@
         <w:pStyle w:val="BodyJ"/>
       </w:pPr>
       <w:r>
-        <w:t xml:space="preserve">El diagnóstico no aparece contenido dentro del dato. Se propone como la explicación que mejor organiza un conjunto de hallazgos. Peirce describió este movimiento —que en 1878 llamó "hipótesis" y en sus lecciones de 1903 bautizó "abducción"— como la operación por la cual formulamos una conjetura capaz de hacer inteligible un hecho sorprendente. La deducción deriva consecuencias de una regla; la inducción aprende regularidades desde casos; la abducción pregunta qué explicación, si fuera verdadera, volvería esperable lo observado (Peirce, 1878).</w:t>
+        <w:t xml:space="preserve">El diagnóstico no aparece contenido dentro del dato. Se propone como la explicación que mejor organiza un conjunto de hallazgos. Peirce describió este movimiento —que en 1878 llamó «hipótesis» y en sus lecciones de 1903 bautizó «abducción»— como la operación por la cual formulamos una conjetura capaz de hacer inteligible un hecho sorprendente. La deducción deriva consecuencias de una regla; la inducción aprende regularidades desde casos; la abducción pregunta qué explicación, si fuera verdadera, volvería esperable lo observado (Peirce, 1878).</w:t>
       </w:r>
     </w:p>
     <w:p>
@@ -2858,7 +2858,7 @@
         <w:pStyle w:val="BodyJ"/>
       </w:pPr>
       <w:r>
-        <w:t xml:space="preserve">La compresión semántica no debe confundirse con la amputación de datos críticos. "Mujer de 61 años con dolor abdominal" carece de poder discriminativo para activar un illness script específico. En cambio, "mujer de 61 años con hernia incisional y suboclusiones recurrentes autolimitadas, que cursa con un cuarto episodio obstructivo agudo, esta vez complicado con shock séptico por bacilos gramnegativos rápidamente reversible con soporte vasoactivo y antibióticos, sin signos tomográficos actuales de estrangulación ni perforación" conserva los calificadores que guían el razonamiento: temporalidad, cambio de patrón, gravedad fisiológica, microbiología y límites anatómicos.</w:t>
+        <w:t xml:space="preserve">La compresión semántica no debe confundirse con la amputación de datos críticos. «Mujer de 61 años con dolor abdominal» carece de poder discriminativo para activar un illness script específico. En cambio, «mujer de 61 años con hernia incisional y suboclusiones recurrentes autolimitadas, que cursa con un cuarto episodio obstructivo agudo, esta vez complicado con shock séptico por bacilos gramnegativos rápidamente reversible con soporte vasoactivo y antibióticos, sin signos tomográficos actuales de estrangulación ni perforación» conserva los calificadores que guían el razonamiento: temporalidad, cambio de patrón, gravedad fisiológica, microbiología y límites anatómicos.</w:t>
       </w:r>
     </w:p>
     <w:p>
@@ -2932,31 +2932,31 @@
         <w:pStyle w:val="BodyJ"/>
       </w:pPr>
       <w:r>
-        <w:t xml:space="preserve">Hay una palabra que la epistemología clínica suele evitar, como si amenazara su seriedad: creatividad. Conviene devolverla al centro. Peirce, al bautizar la abducción en sus lecciones de 1903, la describió como la única operación lógica que introduce ideas nuevas: la deducción prueba lo que ya estaba contenido en las premisas y la inducción generaliza lo ya observado, pero la hipótesis que organiza un caso no se extrae de los datos — se conjetura hacia ellos. Todo diagnóstico contiene, en ese sentido estricto, un momento creativo. La pregunta no es si el clínico crea; es qué tan bien lo hace.</w:t>
-      </w:r>
-    </w:p>
-    <w:p>
-      <w:pPr>
-        <w:pStyle w:val="BodyJ"/>
-      </w:pPr>
-      <w:r>
-        <w:t xml:space="preserve">La investigación sobre creatividad permite precisar qué significa "bien" aquí. Boden distinguió la creatividad histórica —ideas nuevas para la humanidad— de la creatividad psicológica —ideas nuevas para quien las tiene—, y separó tres formas: combinatoria (asociar lo que no solía asociarse), exploratoria (recorrer a fondo un espacio conceptual existente) y transformacional (cambiar las reglas del espacio mismo) (Boden, 2004). La creatividad diagnóstica es casi siempre psicológica y exploratoria: no exige inventar enfermedades; exige recorrer el espacio de hipótesis más allá del primer patrón que se encendió — considerar la colecistitis cuando la etiqueta heredada dice "ITU", el aneurisma cuando el patrón grita cólico renal. Visto así, el cierre prematuro no es sólo un fallo de verificación: es un fracaso de imaginación. Nadie puede descartar la hipótesis que nunca generó.</w:t>
-      </w:r>
-    </w:p>
-    <w:p>
-      <w:pPr>
-        <w:pStyle w:val="BodyJ"/>
-      </w:pPr>
-      <w:r>
-        <w:t xml:space="preserve">Bohm, físico y filósofo, agregó el diagnóstico del bloqueo: la creatividad es ante todo percepción de un orden nuevo en lo que ya está a la vista, y su obstáculo habitual no es la falta de inteligencia sino el apego a la infraestructura tácita de ideas con la que trabajamos sin verla (Bohm, 1996; Bohm &amp; Peat, 1987). Es exactamente el peligro de la fluidez que examinará el capítulo 6: el patrón conocido no sólo responde rápido — también impide percibir. Por eso varias herramientas de este libro que parecen puramente disciplinarias son, además, técnicas de creatividad: reformular el caso sin usar la etiqueta (capítulo 8) es un procedimiento para forzar la percepción de otro orden posible en los mismos hechos.</w:t>
-      </w:r>
-    </w:p>
-    <w:p>
-      <w:pPr>
-        <w:pStyle w:val="BodyJ"/>
-      </w:pPr>
-      <w:r>
-        <w:t xml:space="preserve">Schön mostró, por último, dónde vive la creatividad profesional más frecuente: no en resolver el problema dado, sino en plantearlo de nuevo — el problem setting precede al problem solving (Schön, 1983). "¿Qué antibiótico damos?" y "¿hay una infección que tratar?" son dos problemas distintos armados con los mismos datos, y elegir cuál se resuelve es el acto creativo que decide todo lo demás. Lo mismo vale para el manejo: cuando las dos conductas sobre la mesa son malas, la salida rara vez es elegir mejor entre ellas — es crear una tercera opción: la prueba terapéutica acotada en el tiempo, el puente reversible que compra información, la redefinición de la meta. Solucionar no siempre es responder; a veces es rehacer la pregunta.</w:t>
+        <w:t xml:space="preserve">Hay una palabra que la epistemología clínica suele evitar, como si amenazara su seriedad: creatividad. Este capítulo la devuelve al centro. Peirce, al bautizar la abducción en sus lecciones de 1903, la describió como la única operación lógica que introduce ideas nuevas. La deducción prueba lo que ya estaba contenido en las premisas y la inducción generaliza lo ya observado; la hipótesis que organiza un caso, en cambio, no se extrae de los datos: se conjetura hacia ellos. Todo diagnóstico contiene, en ese sentido estricto, un momento creativo. La pregunta no es si el clínico crea; es qué tan bien lo hace.</w:t>
+      </w:r>
+    </w:p>
+    <w:p>
+      <w:pPr>
+        <w:pStyle w:val="BodyJ"/>
+      </w:pPr>
+      <w:r>
+        <w:t xml:space="preserve">La investigación sobre creatividad permite precisar qué significa «bien» aquí. Boden distinguió la creatividad histórica —ideas nuevas para la humanidad— de la creatividad psicológica —ideas nuevas para quien las tiene—, y separó tres formas: combinatoria (asociar lo que no solía asociarse), exploratoria (recorrer a fondo un espacio conceptual existente) y transformacional (cambiar las reglas del espacio mismo) (Boden, 2004). La creatividad diagnóstica es casi siempre psicológica y exploratoria: no exige inventar enfermedades; exige recorrer el espacio de hipótesis más allá del primer patrón que se encendió — considerar la colecistitis cuando la etiqueta heredada dice «ITU», el aneurisma cuando el patrón grita cólico renal. Visto así, el cierre prematuro no es sólo un fallo de verificación, sino también un fracaso de imaginación. Nadie puede descartar la hipótesis que nunca generó.</w:t>
+      </w:r>
+    </w:p>
+    <w:p>
+      <w:pPr>
+        <w:pStyle w:val="BodyJ"/>
+      </w:pPr>
+      <w:r>
+        <w:t xml:space="preserve">Bohm, físico y filósofo, agregó el diagnóstico del bloqueo. La creatividad es ante todo percepción de un orden nuevo en lo que ya está a la vista, y su obstáculo habitual no es la falta de inteligencia sino el apego a la infraestructura tácita de ideas con la que se trabaja sin verla (Bohm, 1996; Bohm &amp; Peat, 1987). Es el peligro de la fluidez que examinará el capítulo 6: el patrón conocido no sólo responde rápido — también impide percibir. Por eso varias herramientas de este libro que parecen puramente disciplinarias son, además, técnicas de creatividad: reformular el caso sin usar la etiqueta (capítulo 8) es un procedimiento para forzar la percepción de otro orden posible en los mismos hechos.</w:t>
+      </w:r>
+    </w:p>
+    <w:p>
+      <w:pPr>
+        <w:pStyle w:val="BodyJ"/>
+      </w:pPr>
+      <w:r>
+        <w:t xml:space="preserve">Schön señaló, por último, dónde vive la creatividad profesional más frecuente: no en resolver el problema dado, sino en plantearlo de nuevo — el problem setting precede al problem solving (Schön, 1983). «¿Qué antibiótico damos?» y «¿hay una infección que tratar?» son dos problemas distintos armados con los mismos datos, y elegir cuál se resuelve es el acto creativo que decide todo lo demás. Lo mismo vale para el manejo: cuando las dos conductas sobre la mesa son malas, la salida rara vez es elegir mejor entre ellas — es crear una tercera opción: la prueba terapéutica acotada en el tiempo, el puente reversible que compra información, la redefinición de la meta. Solucionar no siempre es responder; a veces es rehacer la pregunta.</w:t>
       </w:r>
     </w:p>
     <w:p>
@@ -2988,7 +2988,7 @@
         <w:pStyle w:val="BodyJ"/>
       </w:pPr>
       <w:r>
-        <w:t xml:space="preserve">Un paciente con EPOC conocido consulta por disnea que no ha respondido a dos rondas de broncodilatadores en urgencias. La saturación es 89%, la auscultación muestra escasas sibilancias. Tome tres minutos y un papel: (a) genere al menos cinco hipótesis sin censurar ninguna, (b) escriba una reformulación del problema que no use la palabra "EPOC", (c) recién entonces pode con las cuatro preguntas de la prueba de resistencia.</w:t>
+        <w:t xml:space="preserve">Un paciente con EPOC conocido consulta por disnea que no ha respondido a dos rondas de broncodilatadores en urgencias. La saturación es 89%, la auscultación muestra escasas sibilancias. Tome tres minutos y un papel: (a) genere al menos cinco hipótesis sin censurar ninguna, (b) escriba una reformulación del problema que no use la palabra «EPOC», (c) recién entonces pode con las cuatro preguntas de la prueba de resistencia.</w:t>
       </w:r>
     </w:p>
     <w:p>
@@ -3003,7 +3003,7 @@
         <w:t xml:space="preserve">Solución comentada.</w:t>
       </w:r>
       <w:r>
-        <w:t xml:space="preserve"> Una lista generativa sin censura inicial incluye: tromboembolismo pulmonar (el EPOC y la inmovilidad aumentan el riesgo, y la escasez de sibilancias no explica una saturación de 89%), neumotórax secundario a ruptura de bula, edema pulmonar cardiogénico, neumonía basal oculta, síndrome coronario agudo con equivalente disneico, anemia severa o fatiga muscular respiratoria. La reformulación que replantea el problema (problem setting) es: "insuficiencia respiratoria hipoxémica aguda desproporcionada al broncoespasmo auscultado". Ese giro lingüístico desactiva el reflejo de indicar una tercera tanda de nebulizaciones y abre el espacio mental donde viven el TEP y el neumotórax. Nótese la secuencia: primero volumen divergente sin filtro —pues la autocensura temprana es el motor del cierre prematuro— y recién después poda severa contra los datos del caso. Tres minutos de generación libre cuestan mucho menos que veinticuatro horas de anclaje.</w:t>
+        <w:t xml:space="preserve"> Una lista generativa sin censura inicial incluye: tromboembolismo pulmonar (el EPOC y la inmovilidad aumentan el riesgo, y la escasez de sibilancias no explica una saturación de 89%), neumotórax secundario a ruptura de bula, edema pulmonar cardiogénico, neumonía basal oculta, síndrome coronario agudo con equivalente disneico, anemia severa o fatiga muscular respiratoria. La reformulación que replantea el problema (problem setting) es: «insuficiencia respiratoria hipoxémica aguda desproporcionada al broncoespasmo auscultado». Ese giro lingüístico desactiva el reflejo de indicar una tercera tanda de nebulizaciones y abre el espacio mental donde viven el TEP y el neumotórax. Nótese la secuencia: primero volumen divergente sin filtro —pues la autocensura temprana es el motor del cierre prematuro— y recién después poda severa contra los datos del caso. Tres minutos de generación libre cuestan mucho menos que veinticuatro horas de anclaje.</w:t>
       </w:r>
     </w:p>
     <w:p>
@@ -3028,7 +3028,7 @@
         <w:pStyle w:val="BodyJ"/>
       </w:pPr>
       <w:r>
-        <w:t xml:space="preserve">Una inferencia se fortalece cuando sobrevive a alternativas serias. Preguntar "¿qué más podría producir este conjunto?" no exige elaborar listas interminables. Exige identificar competidores capaces de modificar la conducta. La hipótesis rival debe tener derecho a explicar los mismos hechos, no ser un nombre añadido por obligación ritual.</w:t>
+        <w:t xml:space="preserve">Una inferencia se fortalece cuando sobrevive a alternativas serias. Preguntar «¿qué más podría producir este conjunto?» no exige elaborar listas interminables. Exige identificar competidores capaces de modificar la conducta. La hipótesis rival debe tener derecho a explicar los mismos hechos, no ser un nombre añadido por obligación ritual.</w:t>
       </w:r>
     </w:p>
     <w:p>
@@ -3044,7 +3044,7 @@
         <w:pStyle w:val="BodyJ"/>
       </w:pPr>
       <w:r>
-        <w:t xml:space="preserve">La lección de Popper, bien leída, no es el eslogan de que toda hipótesis deba poder refutarse en el acto. Es una asimetría más fina: las confirmaciones valen poco cuando se obtienen buscando lo que la hipótesis predice cómodamente, y valen mucho cuando provienen de pruebas severas — aquellas que tenían una probabilidad real de desmentirla (Popper, 1959). En clínica, esto distingue dos maneras de pedir exámenes: el que confirma lo que ya se cree —otro marcador inflamatorio en quien ya fue etiquetado de infección— y el que somete la hipótesis a riesgo — el examen cuyo resultado obligaría a abandonar el diagnóstico si vuelve normal. Un diagnóstico que sólo acumula hallazgos "compatibles" no está corroborado; está mimado.</w:t>
+        <w:t xml:space="preserve">La lección de Popper, bien leída, no es el eslogan de que toda hipótesis deba poder refutarse en el acto. Es una asimetría más fina: las confirmaciones valen poco cuando se obtienen buscando lo que la hipótesis predice cómodamente, y valen mucho cuando provienen de pruebas severas — aquellas que tenían una probabilidad real de desmentirla (Popper, 1959). En clínica, esto distingue dos maneras de pedir exámenes: el que confirma lo que ya se cree —otro marcador inflamatorio en quien ya fue etiquetado de infección— y el que somete la hipótesis a riesgo — el examen cuyo resultado obligaría a abandonar el diagnóstico si vuelve normal. Un diagnóstico que sólo acumula hallazgos «compatibles» no está corroborado; está mimado.</w:t>
       </w:r>
     </w:p>
     <w:p>
@@ -3101,7 +3101,7 @@
         <w:pStyle w:val="BodyJ"/>
       </w:pPr>
       <w:r>
-        <w:t xml:space="preserve">Una inferencia gana calidad cuando produce compromisos observables: "si esta explicación es correcta, debería mejorar X antes de Y", "esperaría encontrar Z", "la ausencia persistente de W disminuiría su probabilidad". Estos compromisos evitan que la hipótesis se vuelva inmune a la experiencia. También hacen posible una revisión prospectiva, menos contaminada por el desenlace conocido. El buen razonamiento no se limita a contar una historia coherente; especifica qué realidad podría desmentirla.</w:t>
+        <w:t xml:space="preserve">Una inferencia gana calidad cuando produce compromisos observables: «si esta explicación es correcta, debería mejorar X antes de Y», «esperaría encontrar Z», «la ausencia persistente de W disminuiría su probabilidad». Estos compromisos evitan que la hipótesis se vuelva inmune a la experiencia. También hacen posible una revisión prospectiva, menos contaminada por el desenlace conocido. El buen razonamiento no se limita a contar una historia coherente; especifica qué realidad podría desmentirla.</w:t>
       </w:r>
     </w:p>
     <w:p>
@@ -3117,7 +3117,7 @@
         <w:pStyle w:val="BodyJ"/>
       </w:pPr>
       <w:r>
-        <w:t xml:space="preserve">El informe dice: "hernia incisional con asas dilatadas, sin signos de isquemia ni perforación". El residente escribió: "TAC descarta complicación". Reescriba la frase para que conserve (a) lo que la imagen mostró, (b) lo que la imagen no puede mostrar, y (c) la inferencia que de verdad autoriza.</w:t>
+        <w:t xml:space="preserve">El informe dice: «hernia incisional con asas dilatadas, sin signos de isquemia ni perforación». El residente escribió: «TAC descarta complicación». Reescriba la frase para que conserve (a) lo que la imagen mostró, (b) lo que la imagen no puede mostrar, y (c) la inferencia que de verdad autoriza.</w:t>
       </w:r>
     </w:p>
     <w:p>
@@ -3132,7 +3132,23 @@
         <w:t xml:space="preserve">Solución comentada.</w:t>
       </w:r>
       <w:r>
-        <w:t xml:space="preserve"> Una formulación epistemológicamente rigurosa: "TAC de abdomen confirma obstrucción en hernia incisional sin signos actuales de necrosis transmural, perforación ni sufrimiento vascular mesentérico; por sensibilidad del método, la imagen no excluye isquemia mucosa incipiente ni predice recurrencia a corto plazo. Con la estabilización hemodinámica actual, la probabilidad de estrangulación irreversible es suficientemente baja para diferir cirugía de emergencia y mantener vigilancia activa". La diferencia es operativa: "TAC descarta complicación" apaga las alarmas del equipo; la reescritura especifica qué amenaza sigue viva, qué parámetros obligan a reevaluar (reaparición del dolor, defensa abdominal, ascenso del lactato) y qué autoriza realmente el examen (no entrar a pabellón esta madrugada, no archivar el problema quirúrgico). Nótese el patrón general: el hallazgo negativo se limita al rendimiento del método y al momento; la conducta se justifica por umbral, no por exclusión ontológica.</w:t>
+        <w:t xml:space="preserve"> Una formulación epistemológicamente rigurosa:</w:t>
+      </w:r>
+    </w:p>
+    <w:p>
+      <w:pPr>
+        <w:pStyle w:val="Quote1"/>
+      </w:pPr>
+      <w:r>
+        <w:t xml:space="preserve">TAC de abdomen confirma obstrucción en hernia incisional sin signos actuales de necrosis transmural, perforación ni sufrimiento vascular mesentérico; por sensibilidad del método, la imagen no excluye isquemia mucosa incipiente ni predice recurrencia a corto plazo. Con la estabilización hemodinámica actual, la probabilidad de estrangulación irreversible es suficientemente baja para diferir cirugía de emergencia y mantener vigilancia activa</w:t>
+      </w:r>
+    </w:p>
+    <w:p>
+      <w:pPr>
+        <w:pStyle w:val="BodyJ"/>
+      </w:pPr>
+      <w:r>
+        <w:t xml:space="preserve">La diferencia es operativa: «TAC descarta complicación» apaga las alarmas del equipo; la reescritura especifica qué amenaza sigue viva, qué parámetros obligan a reevaluar (reaparición del dolor, defensa abdominal, ascenso del lactato) y qué autoriza realmente el examen (no entrar a pabellón esta madrugada, no archivar el problema quirúrgico). Nótese el patrón general: el hallazgo negativo se limita al rendimiento del método y al momento; la conducta se justifica por umbral, no por exclusión ontológica.</w:t>
       </w:r>
     </w:p>
     <w:p>
@@ -3234,7 +3250,7 @@
         <w:pStyle w:val="BodyJ"/>
       </w:pPr>
       <w:r>
-        <w:t xml:space="preserve">A las 48 horas del ingreso, Carmen está hemodinámicamente estable, afebril y con la sonda nasogástrica aún a caída libre. En la visita, la familia hace la pregunta inevitable: "Doctor, ¿ya saben qué tuvo?". El equipo conoce varios hechos: que hubo una obstrucción intestinal mecánica, que desencadenó un shock grave, que en la sangre crecieron bacilos gramnegativos y que el escáner inicial no mostró intestino necrótico. Pero desconoce otras capas del mismo fenómeno: por qué este cuarto episodio escaló hasta el shock (incertidumbre fisiopatológica), si las bacterias cruzaron desde la pared intestinal inflamada (incertidumbre causal) y cuándo volverá a atascarse la hernia (incertidumbre pronóstica). "¿Ya saben qué tuvo?" exige, en rigor, varias respuestas simultáneas. Este capítulo trata de cómo cartografiarlas y nombrarlas sin mentir en ninguna dirección.</w:t>
+        <w:t xml:space="preserve">A las 48 horas del ingreso, Carmen está hemodinámicamente estable, afebril y con la sonda nasogástrica aún a caída libre. En la visita, la familia hace la pregunta inevitable: «Doctor, ¿ya saben qué tuvo?». El equipo conoce varios hechos: que hubo una obstrucción intestinal mecánica, que desencadenó un shock grave, que en la sangre crecieron bacilos gramnegativos y que el escáner inicial no mostró intestino necrótico. Pero desconoce otras capas del mismo fenómeno: por qué este cuarto episodio escaló hasta el shock (incertidumbre fisiopatológica), si las bacterias cruzaron desde la pared intestinal inflamada (incertidumbre causal) y cuándo volverá a atascarse la hernia (incertidumbre pronóstica). «¿Ya saben qué tuvo?» exige, en rigor, varias respuestas simultáneas. Este capítulo trata de cómo cartografiarlas y nombrarlas sin mentir en ninguna dirección.</w:t>
       </w:r>
     </w:p>
     <w:p>
@@ -3358,7 +3374,7 @@
         <w:pStyle w:val="BodyJ"/>
       </w:pPr>
       <w:r>
-        <w:t xml:space="preserve">También conviene separar incertidumbre epistémica y aleatoria. La primera surge de conocimiento insuficiente y, en principio, puede reducirse mediante nueva información. La segunda proviene de variabilidad o contingencia que persiste incluso con buen conocimiento. En la práctica ambas se mezclan. Una tomografía puede reducir la incertidumbre sobre perforación, pero no determinar con certeza si una obstrucción volverá a ocurrir ni cuándo.</w:t>
+        <w:t xml:space="preserve">También importa separar incertidumbre epistémica y aleatoria. La primera surge de conocimiento insuficiente y, en principio, puede reducirse mediante nueva información. La segunda proviene de variabilidad o contingencia que persiste incluso con buen conocimiento. En la práctica ambas se mezclan. Una tomografía puede reducir la incertidumbre sobre perforación, pero no determinar con certeza si una obstrucción volverá a ocurrir ni cuándo.</w:t>
       </w:r>
     </w:p>
     <w:p>
@@ -3407,7 +3423,7 @@
         <w:pStyle w:val="BodyJ"/>
       </w:pPr>
       <w:r>
-        <w:t xml:space="preserve">La intolerancia puede expresarse como sobreestudio, sobretratamiento, cierre prematuro o derivación defensiva. Curiosamente, conductas opuestas pueden tener la misma raíz: necesidad de escapar de la ambigüedad. Gérvas y Pérez Fernández han documentado la versión poblacional de esa intolerancia: cascadas de intervenciones innecesarias que nacen de no soportar la espera vigilante, y que dañan con especial eficacia a los más sanos (Gérvas &amp; Pérez Fernández, 2013). Por ello, la pregunta no es sólo cuánta incertidumbre existe, sino qué hacemos emocional y cognitivamente con ella.</w:t>
+        <w:t xml:space="preserve">La intolerancia puede expresarse como sobreestudio, sobretratamiento, cierre prematuro o derivación defensiva. Curiosamente, conductas opuestas pueden tener la misma raíz: necesidad de escapar de la ambigüedad. Gérvas y Pérez Fernández han documentado la versión poblacional de esa intolerancia: cascadas de intervenciones innecesarias que nacen de no soportar la espera vigilante, y que dañan con especial eficacia a los más sanos (Gérvas &amp; Pérez Fernández, 2013). Por ello, la pregunta no es sólo cuánta incertidumbre existe, sino qué hace el clínico, emocional y cognitivamente, con ella.</w:t>
       </w:r>
     </w:p>
     <w:p>
@@ -3432,7 +3448,7 @@
         <w:pStyle w:val="BodyJ"/>
       </w:pPr>
       <w:r>
-        <w:t xml:space="preserve">Declarar que "en medicina todo es incierto" es una coartada retórica que no guía ninguna conducta. La incertidumbre clínicamente útil es localizada y específica. En lugar de una duda global, desglosa el límite de cada afirmación: el foco abdominal de la sepsis es altamente probable por secuencia clínica, pero el mecanismo exacto de translocación no es demostrable directamente; la tomografía excluye perforación actual, pero su normalidad vascular no garantiza que el asa no sufra en un próximo atascamiento; y, en otro dominio, en un paciente con vejiga neurogénica febril una infección urinaria no puede descartarse sólo por la ausencia de disuria. Nombrar qué parte exacta del modelo está abierta es lo que permite decidir qué se estudia con un examen y qué se gobierna con vigilancia.</w:t>
+        <w:t xml:space="preserve">Declarar que «en medicina todo es incierto» es una coartada retórica que no guía ninguna conducta. La incertidumbre clínicamente útil es localizada y específica. En lugar de una duda global, desglosa el límite de cada afirmación. El foco abdominal de la sepsis es altamente probable por secuencia clínica, pero el mecanismo exacto de translocación no es demostrable directamente. La tomografía excluye perforación actual, pero su normalidad vascular no garantiza que el asa no sufra en un próximo atascamiento. Y, en otro dominio, en un paciente con vejiga neurogénica febril una infección urinaria no puede descartarse sólo por la ausencia de disuria. Nombrar qué parte exacta del modelo está abierta es lo que permite decidir qué se estudia con un examen y qué se gobierna con vigilancia.</w:t>
       </w:r>
     </w:p>
     <w:p>
@@ -3549,7 +3565,7 @@
         <w:pStyle w:val="BodyJ"/>
       </w:pPr>
       <w:r>
-        <w:t xml:space="preserve">Puede existir alta incertidumbre epistémica y fuerte compromiso práctico. "No conocemos el foco con certeza, pero el cuadro exige antibióticos y control de fuente mientras se investiga." También puede existir alta certeza diagnóstica y decisión expectante. Confundir ambos planos lleva a tratar para demostrar convicción o a retrasar una acción porque el nombre no está completo.</w:t>
+        <w:t xml:space="preserve">Puede existir alta incertidumbre epistémica y fuerte compromiso práctico. «No conocemos el foco con certeza, pero el cuadro exige antibióticos y control de fuente mientras se investiga.» También puede existir alta certeza diagnóstica y decisión expectante. Confundir ambos planos lleva a tratar para demostrar convicción o a retrasar una acción porque el nombre no está completo.</w:t>
       </w:r>
     </w:p>
     <w:p>
@@ -3658,7 +3674,7 @@
         </w:numPr>
       </w:pPr>
       <w:r>
-        <w:t xml:space="preserve">¿Cuál es la duda pequeña con consecuencia catastrófica que merece vigilancia explícita?</w:t>
+        <w:t xml:space="preserve">¿Cuál es la duda pequeña con consecuencia catastrófica que exige vigilancia explícita?</w:t>
       </w:r>
     </w:p>
     <w:p>
@@ -3708,7 +3724,7 @@
         <w:pStyle w:val="BodyJ"/>
       </w:pPr>
       <w:r>
-        <w:t xml:space="preserve">En la visita médica de la mañana, dos residentes resumen el caso de Carmen con los mismos datos sobre la mesa. El primero dice: "Paciente con hernia complicada y sepsis, actualmente mejor". La segunda presenta: "Cuarto episodio obstructivo en el año por hernia incisional, esta vez debutando con shock séptico y bacteriemia por bacilos gramnegativos, revertido con vasopresores y antibióticos, sin signos tomográficos de isquemia aguda; el salto cualitativo de gravedad modifica el riesgo de mantener una conducta expectante". Ambos dicen la verdad. Sólo una de las dos frases piensa.</w:t>
+        <w:t xml:space="preserve">En la visita médica de la mañana, dos residentes resumen el caso de Carmen con los mismos datos sobre la mesa. El primero dice: «Paciente con hernia complicada y sepsis, actualmente mejor». La segunda presenta: «Cuarto episodio obstructivo en el año por hernia incisional, esta vez debutando con shock séptico y bacteriemia por bacilos gramnegativos, revertido con vasopresores y antibióticos, sin signos tomográficos de isquemia aguda; el salto cualitativo de gravedad modifica el riesgo de mantener una conducta expectante». Ambos dicen la verdad. Sólo una de las dos frases piensa.</w:t>
       </w:r>
     </w:p>
     <w:p>
@@ -3733,15 +3749,15 @@
         <w:pStyle w:val="BodyJ"/>
       </w:pPr>
       <w:r>
-        <w:t xml:space="preserve">El lenguaje clínico no se limita a transportar un pensamiento previamente terminado. Ayuda a producirlo. Al elegir entre "dolor torácico", "dolor pleurítico" y "dolor opresivo de esfuerzo", el médico no sólo cambia palabras: delimita mecanismos, comparadores y preguntas. Al escribir "compatible con", "probable" o "demostrado", establece una relación entre evidencia y confianza.</w:t>
-      </w:r>
-    </w:p>
-    <w:p>
-      <w:pPr>
-        <w:pStyle w:val="BodyJ"/>
-      </w:pPr>
-      <w:r>
-        <w:t xml:space="preserve">La filosofía hermenéutica recuerda que comprendemos desde un horizonte lingüístico e histórico. Gadamer sostuvo que el lenguaje es el medio en el que algo llega a ser comprendido; Foucault mostró que la mirada clínica moderna se organizó mediante formas específicas de describir, localizar y correlacionar signos (Foucault, 1966; Gadamer, 1996). Estas perspectivas no obligan a pensar que toda descripción sea relativa. Obligan a reconocer que las categorías hacen visible una parte de la realidad y pueden ocultar otra.</w:t>
+        <w:t xml:space="preserve">El lenguaje clínico no se limita a transportar un pensamiento previamente terminado. Ayuda a producirlo. Al elegir entre «dolor torácico», «dolor pleurítico» y «dolor opresivo de esfuerzo», el médico no sólo cambia palabras: delimita mecanismos, comparadores y preguntas. Al escribir «compatible con», «probable» o «demostrado», establece una relación entre evidencia y confianza.</w:t>
+      </w:r>
+    </w:p>
+    <w:p>
+      <w:pPr>
+        <w:pStyle w:val="BodyJ"/>
+      </w:pPr>
+      <w:r>
+        <w:t xml:space="preserve">La filosofía hermenéutica recuerda que comprendemos desde un horizonte lingüístico e histórico. Gadamer sostuvo que el lenguaje es el medio en el que algo llega a ser comprendido; Foucault sostuvo que la mirada clínica moderna se organizó mediante formas específicas de describir, localizar y correlacionar signos (Foucault, 1966; Gadamer, 1996). Estas perspectivas no obligan a pensar que toda descripción sea relativa. Obligan a reconocer que las categorías hacen visible una parte de la realidad y pueden ocultar otra.</w:t>
       </w:r>
     </w:p>
     <w:p>
@@ -4369,7 +4385,7 @@
         <w:pStyle w:val="BodyJ"/>
       </w:pPr>
       <w:r>
-        <w:t xml:space="preserve">El lenguaje científico dispone de recursos para calibrar afirmaciones. La investigación sobre hedging en textos médicos mostró que expresiones de cautela no son meros adornos defensivos; cumplen funciones retóricas y epistémicas al limitar el alcance de una conclusión (Salager-Meyer, 1994; Hyland, 1998). En clínica, el problema no es usar "probable", sino usarlo sin criterio o reemplazar con él una explicación ausente.</w:t>
+        <w:t xml:space="preserve">El lenguaje científico dispone de recursos para calibrar afirmaciones. La investigación sobre hedging en textos médicos encontró que expresiones de cautela no son meros adornos defensivos; cumplen funciones retóricas y epistémicas al limitar el alcance de una conclusión (Salager-Meyer, 1994; Hyland, 1998). En clínica, el problema no es usar «probable», sino usarlo sin criterio o reemplazar con él una explicación ausente.</w:t>
       </w:r>
     </w:p>
     <w:p>
@@ -4499,7 +4515,7 @@
         <w:pStyle w:val="BodyJ"/>
       </w:pPr>
       <w:r>
-        <w:t xml:space="preserve">"Se descarta" debería reservarse para situaciones en que el método y el contexto realmente permiten excluir. Con frecuencia es más exacto escribir "sin evidencia actual de" o "probabilidad suficientemente baja para no justificar". El Apéndice B desarrolla este léxico completo, con ejemplos de uso correcto e incorrecto de cada término.</w:t>
+        <w:t xml:space="preserve">«Se descarta» debería reservarse para situaciones en que el método y el contexto realmente permiten excluir. Con frecuencia es más exacto escribir «sin evidencia actual de» o «probabilidad suficientemente baja para no justificar». El Apéndice B desarrolla este léxico completo, con ejemplos de uso correcto e incorrecto de cada término.</w:t>
       </w:r>
     </w:p>
     <w:p>
@@ -4515,15 +4531,15 @@
         <w:pStyle w:val="BodyJ"/>
       </w:pPr>
       <w:r>
-        <w:t xml:space="preserve">Dos aportes del siglo XX describen con precisión lo que este capítulo pide. El primero es de J. L. Austin: hay enunciados que no describen el mundo sino que hacen cosas en él — prometer, sentenciar, declarar (Austin, 1962). Buena parte del lenguaje clínico es performativo en ese sentido exacto: "se decide alta", "se descarta abdomen agudo" o "paciente no reanimable" no informan un estado de cosas; dan de alta, suspenden una vigilancia, fijan un límite de tratamiento. Por eso la exigencia de este capítulo no es estilística: una frase que hace cosas debe responder por lo que hace, no sólo por lo que dice. La pregunta de Austin, trasladada a la ficha: ¿qué acaba de hacer esta oración — y con qué derecho?</w:t>
-      </w:r>
-    </w:p>
-    <w:p>
-      <w:pPr>
-        <w:pStyle w:val="BodyJ"/>
-      </w:pPr>
-      <w:r>
-        <w:t xml:space="preserve">El segundo es de Stephen Toulmin, que propuso la anatomía mínima de toda afirmación práctica: un dato, una conclusión, la garantía que autoriza pasar del uno a la otra, el respaldo de esa garantía, un calificador modal que gradúa la fuerza ("probablemente", "salvo que…") y las condiciones de refutación (Toulmin, 1958). La frase medular de este libro es, sin habérselo propuesto, un argumento de Toulmin comprimido: hechos (dato), inferencia graduada (conclusión con calificador), incertidumbre crítica (refutación posible) y decisión (lo que la garantía autoriza a hacer). Escribir "bacteriemia por gramnegativos en contexto de obstrucción: foco abdominal altamente probable, salvo hallazgo alternativo en imagen" es exhibir la anatomía completa; escribir "sepsis abdominal" es esconderla. Toulmin, que décadas después defendió junto a Jonsen la casuística clínica como forma legítima de razonamiento moral (Jonsen &amp; Toulmin, 1988), habría reconocido en la ficha bien escrita a su silogismo práctico favorito. La Figura 5 despliega esa anatomía sobre una frase de Carmen.</w:t>
+        <w:t xml:space="preserve">Dos aportes del siglo XX describen con precisión lo que este capítulo pide. El primero es de J. L. Austin: hay enunciados que no describen el mundo sino que hacen cosas en él — prometer, sentenciar, declarar (Austin, 1962). Buena parte del lenguaje clínico es performativo en ese sentido exacto: «se decide alta», «se descarta abdomen agudo» o «paciente no reanimable» no informan un estado de cosas; dan de alta, suspenden una vigilancia, fijan un límite de tratamiento. Por eso la exigencia de este capítulo no es estilística: una frase que hace cosas debe responder por lo que hace, no sólo por lo que dice. La pregunta de Austin, trasladada a la ficha: ¿qué acaba de hacer esta oración — y con qué derecho?</w:t>
+      </w:r>
+    </w:p>
+    <w:p>
+      <w:pPr>
+        <w:pStyle w:val="BodyJ"/>
+      </w:pPr>
+      <w:r>
+        <w:t xml:space="preserve">El segundo es de Stephen Toulmin, que propuso la anatomía mínima de toda afirmación práctica: un dato, una conclusión, la garantía que autoriza pasar del uno a la otra, el respaldo de esa garantía, un calificador modal que gradúa la fuerza («probablemente», «salvo que…») y las condiciones de refutación (Toulmin, 1958). La frase medular de este libro es, sin habérselo propuesto, un argumento de Toulmin comprimido: hechos (dato), inferencia graduada (conclusión con calificador), incertidumbre crítica (refutación posible) y decisión (lo que la garantía autoriza a hacer). Escribir «bacteriemia por gramnegativos en contexto de obstrucción: foco abdominal altamente probable, salvo hallazgo alternativo en imagen» es exhibir la anatomía completa; escribir «sepsis abdominal» es esconderla. Toulmin, que décadas después defendió junto a Jonsen la casuística clínica como forma legítima de razonamiento moral (Jonsen &amp; Toulmin, 1988), habría reconocido en la ficha bien escrita a su silogismo práctico favorito. La Figura 5 despliega esa anatomía sobre una frase de Carmen.</w:t>
       </w:r>
     </w:p>
     <w:tbl>
@@ -4639,7 +4655,7 @@
         <w:pStyle w:val="BodyJ"/>
       </w:pPr>
       <w:r>
-        <w:t xml:space="preserve">Algunos verbos compactan causalidad sin mostrarla: "secundario a", "debido a", "complicado por", "en contexto de". Son útiles, pero pueden convertir correlación temporal en mecanismo. "En contexto de" es especialmente ambiguo: a veces significa coexistencia, otras causalidad probable y otras simple proximidad narrativa. La buena escritura especifica la relación cuando importa.</w:t>
+        <w:t xml:space="preserve">Algunos verbos compactan causalidad sin mostrarla: «secundario a», «debido a», «complicado por», «en contexto de». Son útiles, pero pueden convertir correlación temporal en mecanismo. «En contexto de» es especialmente ambiguo: a veces significa coexistencia, otras causalidad probable y otras simple proximidad narrativa. La buena escritura especifica la relación cuando importa.</w:t>
       </w:r>
     </w:p>
     <w:p>
@@ -4672,7 +4688,7 @@
         <w:pStyle w:val="BodyJ"/>
       </w:pPr>
       <w:r>
-        <w:t xml:space="preserve">Una frase operativa actúa como un argumento de Toulmin comprimido: enlaza el dato observado con la acción a través de una garantía clínica explícita. No prescribe necesariamente una conducta única, pero transparenta por qué se desplaza el umbral terapéutico. "Cuarto episodio de suboclusión en doce meses" documenta aceleración de la frecuencia; "primer ingreso complicado con shock y bacteriemia" establece un cambio cualitativo en la severidad biológica; "sin evidencia tomográfica de isquemia actual" acota la urgencia quirúrgica inmediata; y "alto riesgo de recurrencia grave fuera del hospital" fundamenta la indicación de reparación electiva pronta.</w:t>
+        <w:t xml:space="preserve">Una frase operativa actúa como un argumento de Toulmin comprimido: enlaza el dato observado con la acción a través de una garantía clínica explícita. No prescribe necesariamente una conducta única, pero transparenta por qué se desplaza el umbral terapéutico. «Cuarto episodio de suboclusión en doce meses» documenta aceleración de la frecuencia; «primer ingreso complicado con shock y bacteriemia» establece un cambio cualitativo en la severidad biológica. «Sin evidencia tomográfica de isquemia actual» acota la urgencia quirúrgica inmediata, y «alto riesgo de recurrencia grave fuera del hospital» fundamenta la indicación de reparación electiva pronta.</w:t>
       </w:r>
     </w:p>
     <w:p>
@@ -4713,15 +4729,15 @@
         <w:pStyle w:val="BodyJ"/>
       </w:pPr>
       <w:r>
-        <w:t xml:space="preserve">La sintaxis misma funciona como un registro de auditoría causal. Escribir "shock séptico por hernia incisional" esconde una cadena fisiopatológica incierta detrás de una preposición. En cambio, "shock séptico con bacteriemia por gramnegativos, temporalmente asociado a obstrucción mecánica en hernia incisional; foco abdominal altamente probable por translocación, mecanismo exacto no demostrado" separa el fenómeno medido, la asociación temporal y el calificador modal de la inferencia. La segunda versión ocupa dos líneas más, pero permite que cualquier miembro del equipo audite dónde termina el hecho y dónde empieza la hipótesis.</w:t>
-      </w:r>
-    </w:p>
-    <w:p>
-      <w:pPr>
-        <w:pStyle w:val="BodyJ"/>
-      </w:pPr>
-      <w:r>
-        <w:t xml:space="preserve">Los verbos cumplen una función epistémica: "muestra" y "documenta" se reservan para evidencia directa; "apoya" expresa contribución; "sugiere" reconoce interpretación; "explica" compromete una relación más fuerte; "no excluye" delimita el rendimiento negativo. Los adverbios de certeza sólo son útiles si corresponden a criterios compartidos. Sin ellos, "probablemente" puede significar desde una intuición leve hasta una convicción casi definitiva.</w:t>
+        <w:t xml:space="preserve">La sintaxis misma funciona como un registro de auditoría causal. Escribir «shock séptico por hernia incisional» esconde una cadena fisiopatológica incierta detrás de una preposición. En cambio, «shock séptico con bacteriemia por gramnegativos, temporalmente asociado a obstrucción mecánica en hernia incisional; foco abdominal altamente probable por translocación, mecanismo exacto no demostrado» separa el fenómeno medido, la asociación temporal y el calificador modal de la inferencia. La segunda versión ocupa dos líneas más, pero permite que cualquier miembro del equipo audite dónde termina el hecho y dónde empieza la hipótesis.</w:t>
+      </w:r>
+    </w:p>
+    <w:p>
+      <w:pPr>
+        <w:pStyle w:val="BodyJ"/>
+      </w:pPr>
+      <w:r>
+        <w:t xml:space="preserve">Los verbos cumplen una función epistémica: «muestra» y «documenta» se reservan para evidencia directa; «apoya» expresa contribución; «sugiere» reconoce interpretación; «explica» compromete una relación más fuerte; «no excluye» delimita el rendimiento negativo. Los adverbios de certeza sólo son útiles si corresponden a criterios compartidos. Sin ellos, «probablemente» puede significar desde una intuición leve hasta una convicción casi definitiva.</w:t>
       </w:r>
     </w:p>
     <w:p>
@@ -4757,7 +4773,7 @@
         </w:numPr>
       </w:pPr>
       <w:r>
-        <w:t xml:space="preserve">"Se descarta tromboembolismo pulmonar."</w:t>
+        <w:t xml:space="preserve">«Se descarta tromboembolismo pulmonar.»</w:t>
       </w:r>
     </w:p>
     <w:p>
@@ -4769,7 +4785,7 @@
         </w:numPr>
       </w:pPr>
       <w:r>
-        <w:t xml:space="preserve">"Neumonía que respondió a antibióticos."</w:t>
+        <w:t xml:space="preserve">«Neumonía que respondió a antibióticos.»</w:t>
       </w:r>
     </w:p>
     <w:p>
@@ -4781,7 +4797,7 @@
         </w:numPr>
       </w:pPr>
       <w:r>
-        <w:t xml:space="preserve">"Paciente poco colaborador."</w:t>
+        <w:t xml:space="preserve">«Paciente poco colaborador.»</w:t>
       </w:r>
     </w:p>
     <w:p>
@@ -4793,7 +4809,7 @@
         </w:numPr>
       </w:pPr>
       <w:r>
-        <w:t xml:space="preserve">"ITU en tratamiento" (paciente sondado, urocultivo positivo, afebril, sin síntomas nuevos).</w:t>
+        <w:t xml:space="preserve">«ITU en tratamiento» (paciente sondado, urocultivo positivo, afebril, sin síntomas nuevos).</w:t>
       </w:r>
     </w:p>
     <w:p>
@@ -4805,7 +4821,7 @@
         </w:numPr>
       </w:pPr>
       <w:r>
-        <w:t xml:space="preserve">"Fracaso de manejo médico."</w:t>
+        <w:t xml:space="preserve">«Fracaso de manejo médico.»</w:t>
       </w:r>
     </w:p>
     <w:p>
@@ -4820,7 +4836,7 @@
         <w:t xml:space="preserve">Solución comentada.</w:t>
       </w:r>
       <w:r>
-        <w:t xml:space="preserve"> (1) "AngioTAC de tórax sin defectos de llenado hasta arterias segmentarias; con probabilidad clínica pretest intermedia y estabilidad hemodinámica, el valor predictivo negativo supera el umbral para no anticoagular y mantener vigilancia clínica" —separa la técnica, su alcance anatómico y la decisión por umbral—. (2) "Opacidad alveolar basal con defervescencia y caída de parámetros inflamatorios tras 72 h de ceftriaxona, oxigenoterapia y kinesioterapia respiratoria; neumonía bacteriana probable, respuesta microbiológica directa no demostrada" —distingue el hecho de la mejoría temporal de la atribución causal a un solo factor—. (3) "Paciente responde con monosílabos, se queja de dolor 8/10 y cursó con insomnio; anamnesis y examen físico limitados por dolor agudo no controlado" —reemplaza una etiqueta moralizante por una barrera clínica modificable—. (4) "Bacteriuria y piuria asintomática en portador crónico de sonda Foley, afebril y sin respuesta inflamatoria sistémica nueva: colonización probable; se difiere antibiótico y se definen criterios de alarma" —desactiva el reflejo de tratar el papel del laboratorio—. (5) "El manejo médico con reposo intestinal y descompresión por sonda nasogástrica tenía como meta recuperar tránsito en 48 h; al persistir débito alto al tercer día, se cumple criterio de resolución quirúrgica" —sustituye la retórica de "fracaso" por el cumplimiento de un umbral predefinido—.</w:t>
+        <w:t xml:space="preserve"> (1) «AngioTAC de tórax sin defectos de llenado hasta arterias segmentarias; con probabilidad clínica pretest intermedia y estabilidad hemodinámica, el valor predictivo negativo supera el umbral para no anticoagular y mantener vigilancia clínica» —separa la técnica, su alcance anatómico y la decisión por umbral—. (2) «Opacidad alveolar basal con defervescencia y caída de parámetros inflamatorios tras 72 h de ceftriaxona, oxigenoterapia y kinesioterapia respiratoria; neumonía bacteriana probable, respuesta microbiológica directa no demostrada» —distingue el hecho de la mejoría temporal de la atribución causal a un solo factor—. (3) «Paciente responde con monosílabos, se queja de dolor 8/10 y cursó con insomnio; anamnesis y examen físico limitados por dolor agudo no controlado» —reemplaza una etiqueta moralizante por una barrera clínica modificable—. (4) «Bacteriuria y piuria asintomática en portador crónico de sonda Foley, afebril y sin respuesta inflamatoria sistémica nueva: colonización probable; se difiere antibiótico y se definen criterios de alarma» —desactiva el reflejo de tratar el papel del laboratorio—. (5) «El manejo médico con reposo intestinal y descompresión por sonda nasogástrica tenía como meta recuperar tránsito en 48 h; al persistir débito alto al tercer día, se cumple criterio de resolución quirúrgica» —sustituye la retórica de «fracaso» por el cumplimiento de un umbral predefinido—.</w:t>
       </w:r>
     </w:p>
     <w:p>
@@ -4860,7 +4876,7 @@
         </w:numPr>
       </w:pPr>
       <w:r>
-        <w:t xml:space="preserve">En mi última evolución, ¿qué verbo causal ("secundario a", "por", "complicado por") no podría defender si me lo preguntaran?</w:t>
+        <w:t xml:space="preserve">En mi última evolución, ¿qué verbo causal («secundario a», «por», «complicado por») no podría defender si me lo preguntaran?</w:t>
       </w:r>
     </w:p>
     <w:p>
@@ -4872,7 +4888,7 @@
         </w:numPr>
       </w:pPr>
       <w:r>
-        <w:t xml:space="preserve">¿Escribí "se descarta" donde sólo tenía "sin evidencia actual de"?</w:t>
+        <w:t xml:space="preserve">¿Escribí «se descarta» donde sólo tenía «sin evidencia actual de»?</w:t>
       </w:r>
     </w:p>
     <w:p>
@@ -4922,7 +4938,7 @@
         <w:pStyle w:val="BodyJ"/>
       </w:pPr>
       <w:r>
-        <w:t xml:space="preserve">Tercer día, 7:00. Antes de la visita, la becada del servicio abre la ficha de Carmen para escribir la evolución y se detiene en la frase que viaja intacta desde la madrugada del ingreso: "cuadro habitual, manejo habitual". La tacha. No porque sea falsa —la hernia es la de siempre—, sino porque dice a la vez más y menos de lo que hoy se sabe: no separa lo demostrado de lo probable y deja fuera la única pregunta que importa esta mañana, qué pasa si vuelve a ocurrir. Reescribe la evaluación con lo que esta parte del libro ha ido separando. Su versión:</w:t>
+        <w:t xml:space="preserve">Tercer día, 7:00. Antes de la visita, la becada del servicio abre la ficha de Carmen para escribir la evolución y se detiene en la frase que viaja intacta desde la madrugada del ingreso: «cuadro habitual, manejo habitual». La tacha. No porque sea falsa —la hernia es la de siempre—, sino porque dice a la vez más y menos de lo que hoy se sabe. No separa lo demostrado de lo probable, y deja fuera la única pregunta que importa esta mañana: qué pasa si vuelve a ocurrir. Reescribe la evaluación con lo que esta parte del libro ha ido separando. Su versión:</w:t>
       </w:r>
     </w:p>
     <w:p>
@@ -4937,7 +4953,7 @@
         <w:t xml:space="preserve">Hechos.</w:t>
       </w:r>
       <w:r>
-        <w:t xml:space="preserve"> Cuarto episodio obstructivo en doce meses sobre hernia incisional conocida (tres ingresos previos resueltos con manejo conservador según registro clínico). Episodio actual: ingresó de madrugada en shock con requerimiento de noradrenalina por 36 horas, lactato arterial máximo de 6,0 mmol/L (04:15 h del ingreso) y llene capilar de 5 segundos documentado por enfermería en urgencias. Hemocultivos periféricos 2/2 positivos a las 14 h para Escherichia coli multisensible. TAC de abdomen de ingreso con asas dilatadas en saco herniario, sin signos de isquemia, neumatosis ni perforación. Actualmente en su tercer día: afebril, sin vasoactivos hace 24 horas y con débito por sonda en descenso. Relato de ingreso textual: "esta vez la hernia no se dejó acomodar, el dolor era otro".</w:t>
+        <w:t xml:space="preserve"> Cuarto episodio obstructivo en doce meses sobre hernia incisional conocida (tres ingresos previos resueltos con manejo conservador según registro clínico). Episodio actual: ingresó de madrugada en shock con requerimiento de noradrenalina por 36 horas, lactato arterial máximo de 6,0 mmol/L (04:15 h del ingreso) y llene capilar de 5 segundos documentado por enfermería en urgencias. Hemocultivos periféricos 2/2 positivos a las 14 h para Escherichia coli multisensible. TAC de abdomen de ingreso con asas dilatadas en saco herniario, sin signos de isquemia, neumatosis ni perforación. Actualmente en su tercer día: afebril, sin vasoactivos hace 24 horas y con débito por sonda en descenso. Relato de ingreso textual: «esta vez la hernia no se dejó acomodar, el dolor era otro». Su hija, que la trajo, agrega lo que ninguna nota recogió: «las otras veces se le pasaba en el día; esta vez aguantó dos días en la casa y no quería venir».</w:t>
       </w:r>
     </w:p>
     <w:p>
@@ -4982,15 +4998,15 @@
         <w:t xml:space="preserve">Decisión.</w:t>
       </w:r>
       <w:r>
-        <w:t xml:space="preserve"> Completar antibióticos según foco probable; evaluación quirúrgica temprana para reparación electiva una vez optimizada. El argumento no es "fracasó el manejo médico" —los tres episodios previos se resolvieron—, sino que la gravedad alcanzada cambia el costo esperado de seguir esperando. Reevaluar si reaparece dolor desproporcionado, fiebre, íleo o inestabilidad; responsable de seguimiento: equipo tratante, con control quirúrgico ambulatorio si alta antes de la evaluación.</w:t>
-      </w:r>
-    </w:p>
-    <w:p>
-      <w:pPr>
-        <w:pStyle w:val="BodyJ"/>
-      </w:pPr>
-      <w:r>
-        <w:t xml:space="preserve">El jefe de servicio lee la nota y no agrega nada clínico. Sólo comenta: "Ahora la ficha piensa. Cualquiera que la abra mañana sabe qué vimos, qué creemos, qué nos falta y por qué hacemos lo que hacemos". La frase de ingreso —"cuadro habitual, manejo habitual"— sigue en la primera página, como recordatorio de lo que una frase puede ocultar.</w:t>
+        <w:t xml:space="preserve"> Completar antibióticos según foco probable; evaluación quirúrgica temprana para reparación electiva una vez optimizada. El argumento no es «fracasó el manejo médico» —los tres episodios previos se resolvieron—, sino que la gravedad alcanzada cambia el costo esperado de seguir esperando. Reevaluar si reaparece dolor desproporcionado, fiebre, íleo o inestabilidad; responsable de seguimiento: equipo tratante, con control quirúrgico ambulatorio si alta antes de la evaluación.</w:t>
+      </w:r>
+    </w:p>
+    <w:p>
+      <w:pPr>
+        <w:pStyle w:val="BodyJ"/>
+      </w:pPr>
+      <w:r>
+        <w:t xml:space="preserve">El jefe de servicio lee la nota y no agrega nada clínico. Sólo comenta: «Ahora la ficha piensa. Cualquiera que la abra mañana sabe qué vimos, qué creemos, qué nos falta y por qué hacemos lo que hacemos». La frase de ingreso —«cuadro habitual, manejo habitual»— sigue en la primera página, como recordatorio de lo que una frase puede ocultar.</w:t>
       </w:r>
     </w:p>
     <w:p>
@@ -5015,7 +5031,7 @@
         <w:pStyle w:val="PartIntro"/>
       </w:pPr>
       <w:r>
-        <w:t xml:space="preserve">Si la Parte I separó los materiales del conocimiento clínico, esta parte se pregunta por el instrumento que los maneja: la propia mente del médico. ¿Cómo se monitorea el juicio mientras juzga (capítulo 5)? ¿Qué es la intuición experta y cuándo merece confianza (capítulo 6)? ¿Cómo se produce realmente el error diagnóstico, más allá del catálogo de sesgos (capítulo 7)? ¿Y cuándo conviene desacelerar (capítulo 8)? El interludio final vuelve a Carmen: esta vez no a su ficha, sino a la cabeza de quienes la atienden.</w:t>
+        <w:t xml:space="preserve">Si la Parte I separó los materiales del conocimiento clínico, esta parte se pregunta por el instrumento que los maneja: la propia mente del médico. ¿Cómo se monitorea el juicio mientras juzga (capítulo 5)? ¿Qué es la intuición experta y cuándo es confiable (capítulo 6)? ¿Cómo se produce realmente el error diagnóstico, más allá del catálogo de sesgos (capítulo 7)? ¿Y cuándo conviene desacelerar (capítulo 8)? El interludio final vuelve a Carmen: esta vez no a su ficha, sino a la cabeza de quienes la atienden.</w:t>
       </w:r>
     </w:p>
     <w:p>
@@ -5053,7 +5069,7 @@
         <w:pStyle w:val="BodyJ"/>
       </w:pPr>
       <w:r>
-        <w:t xml:space="preserve">Hay un momento, en la madrugada de cualquier turno, en que el diagnóstico "se siente" correcto. Yo aprendí a desconfiar de esa sensación una noche en que la experimenté con total nitidez: un hombre de sesenta y ocho años, hipertenso y sin historia de urolitiasis, que se retorcía en la camilla con un dolor lumbar brusco irradiado al flanco izquierdo y microhematuria en la cinta reactiva. El cuadro gritaba "cólico renal" con tal fluidez que casi no palpé el abdomen ni busqué latidos expansivos. El aneurisma de aorta abdominal fisurado lo encontró el radiólogo en la ecografía de la mañana. Desde entonces distingo dos preguntas que esa madrugada confundí: "¿qué tan seguro me siento?" y "¿qué tan probable es que esté en lo cierto?". Este capítulo trata de la brecha entre ambas.</w:t>
+        <w:t xml:space="preserve">Hay un momento, en la madrugada de cualquier turno, en que el diagnóstico «se siente» correcto. Yo aprendí a desconfiar de esa sensación una noche en que la experimenté con total nitidez: un hombre de sesenta y ocho años, hipertenso y sin historia de urolitiasis, que se retorcía en la camilla con un dolor lumbar brusco irradiado al flanco izquierdo y microhematuria en la cinta reactiva. El cuadro gritaba «cólico renal» con tal fluidez que casi no palpé el abdomen ni busqué latidos expansivos. El aneurisma de aorta abdominal fisurado lo encontró el radiólogo en la ecografía de la mañana. Desde entonces distingo dos preguntas que esa madrugada confundí: «¿qué tan seguro me siento?» y «¿qué tan probable es que esté en lo cierto?». Este capítulo trata de la brecha entre ambas.</w:t>
       </w:r>
     </w:p>
     <w:p>
@@ -5325,7 +5341,7 @@
         <w:pStyle w:val="BodyJ"/>
       </w:pPr>
       <w:r>
-        <w:t xml:space="preserve">La investigación contemporánea no se conforma con preguntar "qué tan seguro estás". Distingue y mide por separado tres cosas: el sesgo metacognitivo (la tendencia global a declarar confianzas altas o bajas), la calibración (si el 80% declarado corresponde a un 80% de aciertos reales) y la sensibilidad metacognitiva (si la confianza sube cuando aciertas y baja cuando te equivocas, independiente de su nivel absoluto). Para esta última existe un estándar: el meta-d′, que expresa cuánta de la información disponible para decidir aprovecha el observador al evaluar su propia decisión; dividido por la sensibilidad de la tarea (el llamado M-ratio), permite comparar personas y dominios (Maniscalco &amp; Lau, 2012; Fleming &amp; Lau, 2014). Dos hallazgos de esta literatura importan a la clínica: la sensibilidad metacognitiva varía sustancialmente entre individuos de igual desempeño, y tiene un componente parcialmente general junto a componentes específicos de dominio (Rouault et al., 2018) — ser buen juez de las propias respuestas en un ámbito no garantiza serlo en otro. La letra chica también importa: estas medidas exigen decenas de juicios comparables con desenlace conocido, exactamente lo que la práctica clínica no devuelve por sí sola. Esa es la justificación técnica del portafolio del Taller 5: no calcula un meta-d′ formal, pero construye la serie sin la cual ninguna medición —ni siquiera la intuitiva— es posible.</w:t>
+        <w:t xml:space="preserve">La investigación contemporánea no se conforma con preguntar «qué tan seguro estás». Distingue y mide por separado tres cosas: el sesgo metacognitivo (la tendencia global a declarar confianzas altas o bajas), la calibración (si el 80% declarado corresponde a un 80% de aciertos reales) y la sensibilidad metacognitiva (si la confianza sube cuando aciertas y baja cuando te equivocas, independiente de su nivel absoluto). Para esta última existe un estándar: el meta-d′, que expresa cuánta de la información disponible para decidir aprovecha el observador al evaluar su propia decisión; dividido por la sensibilidad de la tarea (el llamado M-ratio), permite comparar personas y dominios (Maniscalco &amp; Lau, 2012; Fleming &amp; Lau, 2014). Dos hallazgos de esta literatura importan a la clínica: la sensibilidad metacognitiva varía sustancialmente entre individuos de igual desempeño, y tiene un componente parcialmente general junto a componentes específicos de dominio (Rouault et al., 2018) — ser buen juez de las propias respuestas en un ámbito no garantiza serlo en otro. La letra chica también importa: estas medidas exigen decenas de juicios comparables con desenlace conocido, justo lo que la práctica clínica no devuelve por sí sola. Esa es la justificación técnica del portafolio del Taller 5: no calcula un meta-d′ formal, pero construye la serie sin la cual ninguna medición —ni siquiera la intuitiva— es posible.</w:t>
       </w:r>
     </w:p>
     <w:p>
@@ -5358,7 +5374,7 @@
         <w:pStyle w:val="BodyJ"/>
       </w:pPr>
       <w:r>
-        <w:t xml:space="preserve">Mi falso cólico renal de aquella noche reunía todas las claves de la fluidez cognitiva de Koriat: el patrón clínico era arquetípico, yo había tratado decenas de cólicos similares en urgencias y el relato cerraba sin fisuras. Pero ninguna de esas señales internas medía lo único determinante para la sobrevida del enfermo: la probabilidad previa de que, en un hipertenso de casi setenta años que debuta con dolor lumbar agudo, una catástrofe aórtica estuviera imitando el patrón urológico. La pregunta metacognitiva útil no es "¿debo confiar en mi intuición?", sino "¿bajo qué condiciones ecológicas es confiable esta intuición?". Como mostraron Kahneman y Klein, la validez intuitiva aumenta cuando el entorno posee regularidades estables, existe exposición extensa y el clínico recibe retroalimentación oportuna sobre sus aciertos y errores; se desploma, en cambio, frente a presentaciones solapadas donde el desenlace real ocurre horas después y en otro servicio (Kahneman &amp; Klein, 2009).</w:t>
+        <w:t xml:space="preserve">Mi falso cólico renal de aquella noche reunía todas las claves de la fluidez cognitiva de Koriat: el patrón clínico era arquetípico, yo había tratado decenas de cólicos similares en urgencias y el relato cerraba sin fisuras. Pero ninguna de esas señales internas medía lo único determinante para la sobrevida del enfermo: la probabilidad previa de que, en un hipertenso de casi setenta años que debuta con dolor lumbar agudo, una catástrofe aórtica estuviera imitando el patrón urológico. La pregunta metacognitiva útil no es «¿debo confiar en mi intuición?», sino «¿bajo qué condiciones ecológicas es confiable esta intuición?». Como argumentaron Kahneman y Klein, la validez intuitiva aumenta cuando el entorno posee regularidades estables, existe exposición extensa y el clínico recibe retroalimentación oportuna sobre sus aciertos y errores; se desploma, en cambio, frente a presentaciones solapadas donde el desenlace real ocurre horas después y en otro servicio (Kahneman &amp; Klein, 2009).</w:t>
       </w:r>
     </w:p>
     <w:p>
@@ -5383,7 +5399,7 @@
         <w:pStyle w:val="BodyJ"/>
       </w:pPr>
       <w:r>
-        <w:t xml:space="preserve">La metacognición clínica necesita sensibilidad a señales de conflicto. Algunas son cognitivas: un dato no encaja, dos hallazgos exigen mecanismos incompatibles, el diagnóstico depende de una sola pieza. Otras son afectivas: incomodidad, sorpresa, irritación con el paciente, deseo de terminar, excesiva tranquilidad ante un caso complejo. Las emociones no son ruido del trabajo clínico: son parte de su materia. Tajer ha mostrado cómo atraviesan incluso la fisiopatología de aquello que tratamos —del ánimo al infarto—, y con mayor razón atraviesan a quien trata (Tajer, 2008). Epstein llamó práctica atenta a la capacidad de observar no sólo al paciente, sino las propias categorías, emociones y errores potenciales (Epstein, 1999).</w:t>
+        <w:t xml:space="preserve">La metacognición clínica necesita sensibilidad a señales de conflicto. Algunas son cognitivas: un dato no encaja, dos hallazgos exigen mecanismos incompatibles, el diagnóstico depende de una sola pieza. Otras son afectivas: incomodidad, sorpresa, irritación con el paciente, deseo de terminar, excesiva tranquilidad ante un caso complejo. Las emociones no son ruido del trabajo clínico, sino parte de su materia. Tajer ha descrito cómo atraviesan incluso la fisiopatología de lo que se trata —del ánimo al infarto—, y con mayor razón atraviesan a quien trata (Tajer, 2008). Epstein llamó práctica atenta a la capacidad de observar no sólo al paciente, sino las propias categorías, emociones y errores potenciales (Epstein, 1999).</w:t>
       </w:r>
     </w:p>
     <w:p>
@@ -5416,7 +5432,7 @@
         <w:pStyle w:val="BodyJ"/>
       </w:pPr>
       <w:r>
-        <w:t xml:space="preserve">Monitorear sin regular produce conciencia estéril. Conviene fijar la división del trabajo: el monitoreo detecta — la fluidez que se rompe, el dato que no encaja, la emoción que desentona con el caso —; el control decide qué hacer con la señal — releer datos, reformular el problema, buscar una alternativa, pedir una segunda opinión, posponer una decisión reversible, intensificar vigilancia o actuar pese a la duda cuando el costo de esperar es alto. Detectar sin decidir es rumia; decidir sin haber detectado es piloto automático. Y la estrategia elegida debe corresponder a la fuente de la incertidumbre: la duda que nace de un dato débil se trata verificando el dato; la que nace de una representación pobre, reformulando el problema; la que nace del cansancio o del apuro, con un segundo lector.</w:t>
+        <w:t xml:space="preserve">Monitorear sin regular produce conciencia estéril. La división del trabajo es esta: el monitoreo detecta —la fluidez que se rompe, el dato que no encaja, la emoción que desentona con el caso—. El control decide qué hacer con la señal: releer datos, reformular el problema, buscar una alternativa, pedir una segunda opinión, posponer una decisión reversible, intensificar vigilancia o actuar pese a la duda cuando el costo de esperar es alto. Detectar sin decidir es rumia; decidir sin haber detectado es piloto automático. Y la estrategia elegida debe corresponder a la fuente de la incertidumbre: la duda que nace de un dato débil se trata verificando el dato; la que nace de una representación pobre, reformulando el problema; la que nace del cansancio o del apuro, con un segundo lector.</w:t>
       </w:r>
     </w:p>
     <w:p>
@@ -5440,7 +5456,7 @@
         <w:pStyle w:val="BodyJ"/>
       </w:pPr>
       <w:r>
-        <w:t xml:space="preserve">Hay algo más que la palabra "metacognición" puede ocultar si se la toma demasiado literalmente: la vigilancia del propio juicio es sólo en parte introspectiva. Muchas de sus mejores señales vienen de afuera — la ceja de la enfermera que conoce al paciente hace años, la pregunta del interno que no logró entender la síntesis (y quizá no había nada coherente que entender), la madre que insiste, el kinesiólogo que encuentra "distinto" al señor de la cama 12. Monitorear el propio pensamiento incluye leer esas señales como datos sobre el razonamiento, no como interferencias en él. La metacognición clínica es, en ese sentido, parcialmente social; el capítulo 13 la despliega a escala de equipo.</w:t>
+        <w:t xml:space="preserve">Hay algo más que la palabra «metacognición» puede ocultar si se la toma al pie de la letra: la vigilancia del propio juicio es sólo en parte introspectiva. Muchas de sus mejores señales vienen de afuera. La ceja de la enfermera que conoce al paciente hace años; la pregunta del interno que no logró entender la síntesis (y quizá no había nada coherente que entender); la madre que insiste; el kinesiólogo que encuentra «distinto» al señor de la cama 12. Monitorear el propio pensamiento incluye leer esas señales como datos sobre el razonamiento, no como interferencias en él. La metacognición clínica es, en ese sentido, parcialmente social; el capítulo 13 la despliega a escala de equipo.</w:t>
       </w:r>
     </w:p>
     <w:p>
@@ -5471,7 +5487,7 @@
         <w:t xml:space="preserve">Solución comentada.</w:t>
       </w:r>
       <w:r>
-        <w:t xml:space="preserve"> No hay respuesta correcta: el ejercicio produce el dato que la práctica cotidiana casi nunca devuelve. Los patrones típicos que emergen: confianza declarada de 90% con tasa real de confirmación de 70–75% (sobreconfianza moderada, la más frecuente); dominios específicos sistemáticamente peor calibrados (los propios "cólicos renales" de cada uno); y alternativas anotadas que nunca se buscaron activamente. El objetivo no es castigarse: es descubrir en qué franja de confianza las propias palabras ("probable", "seguro") dejan de corresponder a la realidad. Quien repite el ejercicio dos o tres veces al año construye la serie que convierte experiencia en calibración.</w:t>
+        <w:t xml:space="preserve"> No hay respuesta correcta: el ejercicio produce el dato que la práctica cotidiana casi nunca devuelve. Los patrones típicos que emergen: confianza declarada de 90% con tasa real de confirmación de 70–75% (sobreconfianza moderada, la más frecuente); dominios específicos sistemáticamente peor calibrados (los propios «cólicos renales» de cada uno); y alternativas anotadas que nunca se buscaron activamente. El objetivo no es castigarse: es descubrir en qué franja de confianza las propias palabras («probable», «seguro») dejan de corresponder a la realidad. Quien repite el ejercicio dos o tres veces al año construye la serie que convierte experiencia en calibración.</w:t>
       </w:r>
     </w:p>
     <w:p>
@@ -5573,7 +5589,7 @@
         <w:pStyle w:val="BodyJ"/>
       </w:pPr>
       <w:r>
-        <w:t xml:space="preserve">La cirujana que evaluó a Carmen tardó menos de un minuto junto a la cama en concluir: "Esta hernia hay que operarla de forma programada antes de que se vaya de alta, o apenas se recupere, pero no hoy en urgencia". El interno que la acompañaba anotó la indicación en la ficha; lo que no pudo anotar fue el razonamiento, porque ni la propia cirujana lo había formulado paso a paso antes de hablar: había algo en la tensión elástica del saco herniario, en la pendiente descendente del lactato y en la memoria muscular de haber operado doscientas paredes abdominales complejas. Este capítulo trata de ese conocimiento tácito que acierta antes de poder explicarse.</w:t>
+        <w:t xml:space="preserve">La cirujana que evaluó a Carmen tardó menos de un minuto junto a la cama en concluir: «Esta hernia hay que operarla de forma programada antes de que se vaya de alta, o apenas se recupere, pero no hoy en urgencia». El interno que la acompañaba anotó la indicación en la ficha; lo que no pudo anotar fue el razonamiento, porque ni la propia cirujana lo había formulado paso a paso antes de hablar. Había algo en la tensión elástica del saco herniario, en la pendiente descendente del lactato y en la memoria muscular de haber operado doscientas paredes abdominales complejas. Este capítulo trata de ese conocimiento tácito que acierta antes de poder explicarse.</w:t>
       </w:r>
     </w:p>
     <w:p>
@@ -5639,23 +5655,23 @@
         <w:pStyle w:val="BodyJ"/>
       </w:pPr>
       <w:r>
-        <w:t xml:space="preserve">Polanyi sostuvo que "sabemos más de lo que podemos decir". El examen clínico ofrece ejemplos: reconocer que un paciente "se ve tóxico", percibir una respiración preocupante o notar que una historia no tiene la textura habitual. Parte de esta capacidad puede explicitarse; otra permanece integrada en percepción y acción (Polanyi, 1966).</w:t>
-      </w:r>
-    </w:p>
-    <w:p>
-      <w:pPr>
-        <w:pStyle w:val="BodyJ"/>
-      </w:pPr>
-      <w:r>
-        <w:t xml:space="preserve">El carácter tácito no exime de evaluación. Una impresión global puede iniciar vigilancia o generar hipótesis, pero debe buscar anclajes observables. "Mal aspecto general" gana valor cuando se acompaña de perfusión, interacción, patrón respiratorio, tono, postura o cambio respecto del basal. La tarea no es expulsar lo tácito, sino conectarlo con evidencia comunicable.</w:t>
-      </w:r>
-    </w:p>
-    <w:p>
-      <w:pPr>
-        <w:pStyle w:val="BodyJ"/>
-      </w:pPr>
-      <w:r>
-        <w:t xml:space="preserve">Schön agregó el movimiento que a Polanyi le faltaba nombrar: el profesional competente no sólo actúa desde lo tácito — conversa con la situación y, cuando ésta responde con una sorpresa, reflexiona en plena acción (Schön, 1983). Ahí está la tensión productiva entre ambos: lo tácito es el modo normal de operar de la pericia, pero debe poder volverse explícito a demanda, porque sólo lo explícito puede ser interrogado, enseñado y corregido. Una intuición que no tolera la pregunta "¿qué estás viendo que yo no veo?" no es pericia madura: es autoridad con buena prensa. La intuición experta vale precisamente porque puede ser interrogada — y quien la despliega sin poder desempaquetarla está pidiendo fe, no ofreciendo juicio.</w:t>
+        <w:t xml:space="preserve">Polanyi sostuvo que «sabemos más de lo que podemos decir». El examen clínico ofrece ejemplos: reconocer que un paciente «se ve tóxico», percibir una respiración preocupante o notar que una historia no tiene la textura habitual. Parte de esta capacidad puede explicitarse; otra permanece integrada en percepción y acción (Polanyi, 1966).</w:t>
+      </w:r>
+    </w:p>
+    <w:p>
+      <w:pPr>
+        <w:pStyle w:val="BodyJ"/>
+      </w:pPr>
+      <w:r>
+        <w:t xml:space="preserve">El carácter tácito no exime de evaluación. Una impresión global puede iniciar vigilancia o generar hipótesis, pero debe buscar anclajes observables. «Mal aspecto general» gana valor cuando se acompaña de perfusión, interacción, patrón respiratorio, tono, postura o cambio respecto del basal. La tarea no es expulsar lo tácito, sino conectarlo con evidencia comunicable.</w:t>
+      </w:r>
+    </w:p>
+    <w:p>
+      <w:pPr>
+        <w:pStyle w:val="BodyJ"/>
+      </w:pPr>
+      <w:r>
+        <w:t xml:space="preserve">Schön agregó el movimiento que a Polanyi le faltaba nombrar: el profesional competente no sólo actúa desde lo tácito — conversa con la situación y, cuando ésta responde con una sorpresa, reflexiona en plena acción (Schön, 1983). Ahí está la tensión productiva entre ambos: lo tácito es el modo normal de operar de la pericia, pero debe poder volverse explícito a demanda, porque sólo lo explícito puede ser interrogado, enseñado y corregido. Una intuición que no tolera la pregunta «¿qué estás viendo que yo no veo?» no es pericia madura: es autoridad con buena prensa. La intuición experta vale precisamente porque puede ser interrogada — y quien la despliega sin poder desempaquetarla está pidiendo fe, no ofreciendo juicio.</w:t>
       </w:r>
     </w:p>
     <w:p>
@@ -5688,7 +5704,7 @@
         <w:pStyle w:val="BodyJ"/>
       </w:pPr>
       <w:r>
-        <w:t xml:space="preserve">El análisis depende del conocimiento disponible. Un médico puede pensar lentamente y equivocarse por déficit conceptual. La intuición experta puede superar una lista analítica en un patrón familiar. Norman y colaboradores han insistido en que los errores atribuidos a sesgo frecuentemente incluyen conocimiento insuficiente y que enseñar sólo a "pensar despacio" no reemplaza la construcción de representaciones robustas (Norman et al., 2017).</w:t>
+        <w:t xml:space="preserve">El análisis depende del conocimiento disponible. Un médico puede pensar lentamente y equivocarse por déficit conceptual. La intuición experta puede superar una lista analítica en un patrón familiar. Norman y colaboradores han insistido en que los errores atribuidos a sesgo frecuentemente incluyen conocimiento insuficiente y que enseñar sólo a «pensar despacio» no reemplaza la construcción de representaciones robustas (Norman et al., 2017).</w:t>
       </w:r>
     </w:p>
     <w:p>
@@ -5754,15 +5770,15 @@
         <w:pStyle w:val="BodyJ"/>
       </w:pPr>
       <w:r>
-        <w:t xml:space="preserve">¿Cuándo confiar, entonces, en la primera impresión? La respuesta menos romántica salió del debate entre el programa de los sesgos y el de la pericia naturalista, que terminó en un acuerdo célebre: la intuición es confiable cuando se formó en un entorno de validez alta — regularidades estables entre señales y desenlaces — y con oportunidad real de aprenderlas, es decir, feedback oportuno y veraz; sin esas dos condiciones la sensación de saber crece igual, pero sin correlato (Kahneman &amp; Klein, 2009). La clínica contiene ambos mundos. La sala de reanimación y la lectura de patrones radiológicos entrenan intuiciones con feedback rápido; la consulta de síntomas inespecíficos cuyos desenlaces nadie vuelve a ver produce fluidez sin calibración — la sobreconfianza del capítulo 5, fabricada por el entorno. La pregunta operativa frente a la propia seguridad no es "¿cuánta experiencia tengo?", sino "¿en qué entorno se formó esta impresión, y quién me avisó cuando fallé?".</w:t>
-      </w:r>
-    </w:p>
-    <w:p>
-      <w:pPr>
-        <w:pStyle w:val="BodyJ"/>
-      </w:pPr>
-      <w:r>
-        <w:t xml:space="preserve">Enseñar la pericia clínica no puede reducirse a dictar conclusiones. Exige hacer visible qué pistas perceptivas resultaron decisivas, qué alternativas se descartaron en silencio y qué hallazgo físico habría cambiado la mano. Cuando el interno le preguntó en el pasillo cómo lo había decidido tan rápido, la cirujana hizo el ejercicio de desempaquetar su intuición: un episodio que demostró potencial letal (shock séptico) pese a un escáner sin necrosis, intervalos libres de enfermedad cada vez más cortos y un examen físico donde el abdomen "avisa pero todavía no exige" —una hernia parcialmente reductible, sensible en el anillo fibroso, pero con pared blanda y sin sufrimiento cutáneo ni irritación peritoneal—. Desplegar el juicio experto en variables observables es lo único que impide que el aprendiz imite el tono de autoridad sin haber adquirido los criterios que lo sostienen.</w:t>
+        <w:t xml:space="preserve">¿Cuándo confiar, entonces, en la primera impresión? La respuesta menos romántica salió del debate entre el programa de los sesgos y el de la pericia naturalista, que terminó en un acuerdo célebre (Kahneman &amp; Klein, 2009). La intuición es confiable cuando se formó en un entorno de validez alta —regularidades estables entre señales y desenlaces— y con oportunidad real de aprenderlas, es decir, feedback oportuno y veraz. Sin esas dos condiciones la sensación de saber crece igual, pero sin correlato. La clínica contiene ambos mundos. La sala de reanimación y la lectura de patrones radiológicos entrenan intuiciones con feedback rápido; la consulta de síntomas inespecíficos cuyos desenlaces nadie vuelve a ver produce fluidez sin calibración — la sobreconfianza del capítulo 5, fabricada por el entorno. La pregunta operativa frente a la propia seguridad no es «¿cuánta experiencia tengo?», sino «¿en qué entorno se formó esta impresión, y quién me avisó cuando fallé?».</w:t>
+      </w:r>
+    </w:p>
+    <w:p>
+      <w:pPr>
+        <w:pStyle w:val="BodyJ"/>
+      </w:pPr>
+      <w:r>
+        <w:t xml:space="preserve">Enseñar la pericia clínica no puede reducirse a dictar conclusiones. Exige hacer visible qué pistas perceptivas resultaron decisivas, qué alternativas se descartaron en silencio y qué hallazgo físico habría cambiado la mano. Cuando el interno le preguntó en el pasillo cómo lo había decidido tan rápido, la cirujana hizo el ejercicio de desempaquetar su intuición. Un episodio que demostró potencial letal (shock séptico) pese a un escáner sin necrosis; intervalos libres de enfermedad cada vez más cortos; y un examen físico donde el abdomen «avisa pero todavía no exige»: una hernia parcialmente reductible, sensible en el anillo fibroso, pero con pared blanda y sin sufrimiento cutáneo ni irritación peritoneal. Desplegar el juicio experto en variables observables es lo único que impide que el aprendiz imite el tono de autoridad sin haber adquirido los criterios que lo sostienen.</w:t>
       </w:r>
     </w:p>
     <w:p>
@@ -5780,15 +5796,15 @@
         <w:t xml:space="preserve">Ética y acción</w:t>
       </w:r>
       <w:r>
-        <w:t xml:space="preserve"> sostuvo que la pericia ética —y la pericia en general— no es deliberación sino un saber hacer inmediato, encarnado, que responde a la situación sin pasar por reglas ni por juicios explícitos; la deliberación aparece sólo en el quiebre, cuando la respuesta espontánea falla o la situación no calza con lo aprendido (Varela, 1996). La cirujana que abre este capítulo no calló un razonamiento en ese minuto: no lo había. Esto parece contradecir un libro que pide explicitar en cada página, y no lo contradice si se lee bien. Las pausas del capítulo 8 son los quiebres de Varela puestos por diseño donde la experiencia enseña que la respuesta inmediata se equivoca; la explicitación de la cirujana en el pasillo no fue parte de su juicio sino de su transmisión; y la ficha no fotografía la cognición del que escribe: le presta al siguiente lector lo que necesita para revisarla. Lo que Varela corrige es la descripción: la buena práctica no consiste en pensar explícitamente, consiste en responder bien y en reconocer el quiebre. Y lo que advierte es un costo: la explicitación sin disparador no protege al experto, lo degrada a principiante. Por eso la versión completa de HII-D se reserva para los casos difíciles, y la humildad que el capítulo 14 defenderá no es la del que duda de todo, sino la del que sabe cuándo su saber hacer dejó de bastar.</w:t>
-      </w:r>
-    </w:p>
-    <w:p>
-      <w:pPr>
-        <w:pStyle w:val="BodyJ"/>
-      </w:pPr>
-      <w:r>
-        <w:t xml:space="preserve">La música ofrece la imagen más exacta de ese saber hacer, y no como metáfora. La improvisación en jazz es pericia que responde en tiempo real dentro de una estructura —la armonía, el tempo, los otros— sin deliberar nota por nota. Cuando se registró con resonancia funcional a pianistas profesionales improvisando, se observó una desactivación extensa de la corteza prefrontal dorsolateral, la región asociada al automonitoreo y al control consciente de la ejecución, junto con la activación de la corteza prefrontal medial (Limb &amp; Braun, 2008). El experto que improvisa apaga, literalmente, al supervisor. Eso es lo que Varela describe y lo que este libro no debe contradecir: la metacognición madura no es vigilancia continua, porque la vigilancia continua estropea la ejecución; es saber cuándo volver a encender al supervisor. La cirujana frente a Carmen improvisó sobre una estructura de doscientas paredes abdominales; la pausa del capítulo 8 es el momento en que el pianista deja de tocar porque escuchó una nota que no era de la pieza.</w:t>
+        <w:t xml:space="preserve"> sostuvo que la pericia ética —y la pericia en general— no es deliberación sino un saber hacer inmediato, encarnado, que responde a la situación sin pasar por reglas ni por juicios explícitos (Varela, 1996). La deliberación aparece sólo en el quiebre, cuando la respuesta espontánea falla o la situación no calza con lo aprendido. La cirujana que abre este capítulo no calló un razonamiento en ese minuto: no lo había. Esto parece contradecir un libro que pide explicitar en cada página, y no lo contradice si se lee bien. Las pausas del capítulo 8 son los quiebres de Varela puestos por diseño donde la experiencia enseña que la respuesta inmediata se equivoca. La explicitación de la cirujana en el pasillo no fue parte de su juicio sino de su transmisión. Y la ficha no fotografía la cognición del que escribe: le presta al siguiente lector lo que necesita para revisarla. Lo que Varela corrige es la descripción: la buena práctica no consiste en pensar explícitamente, consiste en responder bien y en reconocer el quiebre. Y lo que advierte es un costo: la explicitación sin disparador no protege al experto, lo degrada a principiante. Por eso la versión completa de HII-D se reserva para los casos difíciles, y la humildad que el capítulo 14 defenderá no es la del que duda de todo, sino la del que sabe cuándo su saber hacer dejó de bastar.</w:t>
+      </w:r>
+    </w:p>
+    <w:p>
+      <w:pPr>
+        <w:pStyle w:val="BodyJ"/>
+      </w:pPr>
+      <w:r>
+        <w:t xml:space="preserve">La música ofrece la imagen más exacta de ese saber hacer, y no como metáfora. La improvisación en jazz es pericia que responde en tiempo real dentro de una estructura —la armonía, el tempo, los otros— sin deliberar nota por nota. Cuando se registró con resonancia funcional a pianistas profesionales improvisando, se observó una desactivación extensa de la corteza prefrontal dorsolateral, la región asociada al automonitoreo y al control consciente de la ejecución, junto con la activación de la corteza prefrontal medial (Limb &amp; Braun, 2008). El experto que improvisa apaga al supervisor. Eso es lo que Varela describe y lo que este libro no debe contradecir: la metacognición madura no es vigilancia continua, porque la vigilancia continua estropea la ejecución; es saber cuándo volver a encender al supervisor. La cirujana frente a Carmen improvisó sobre una estructura de doscientas paredes abdominales; la pausa del capítulo 8 es el momento en que el pianista deja de tocar porque escuchó una nota que no era de la pieza.</w:t>
       </w:r>
     </w:p>
     <w:p>
@@ -5804,7 +5820,7 @@
         <w:pStyle w:val="BodyJ"/>
       </w:pPr>
       <w:r>
-        <w:t xml:space="preserve">La excelencia no pertenece al médico que siempre analiza todo ni al que siempre "ve" el diagnóstico. Pertenece a quien cambia de modo de pensamiento según la estructura del caso y puede justificar ese cambio.</w:t>
+        <w:t xml:space="preserve">La excelencia no pertenece al médico que siempre analiza todo ni al que siempre «ve» el diagnóstico. Pertenece a quien cambia de modo de pensamiento según la estructura del caso y puede justificar ese cambio.</w:t>
       </w:r>
     </w:p>
     <w:p>
@@ -5856,7 +5872,7 @@
         </w:numPr>
       </w:pPr>
       <w:r>
-        <w:t xml:space="preserve">La última vez que "vi" un diagnóstico al instante, ¿qué características lo activaron? ¿Puedo nombrarlas?</w:t>
+        <w:t xml:space="preserve">La última vez que «vi» un diagnóstico al instante, ¿qué características lo activaron? ¿Puedo nombrarlas?</w:t>
       </w:r>
     </w:p>
     <w:p>
@@ -5906,7 +5922,7 @@
         <w:pStyle w:val="BodyJ"/>
       </w:pPr>
       <w:r>
-        <w:t xml:space="preserve">Voy a contar un error mío. Una paciente de ochenta y dos años, traída por su hija por decaimiento hipoactivo de dos días y orina de mal olor. La hoja de atención de urgencias traía escrito "antecedente de ITU a repetición", el sedimento mostraba piuria y el urocultivo preliminar informó desarrollo bacteriano. Indiqué ceftriaxona, escribí "ITU baja/alta en anciana frágil, evolución favorable esperable" y pasé al siguiente ingreso de la tarde. Al tercer día la paciente seguía postrada e inapetente; al cuarto agregó fiebre alta, ictericia subclínica y defensa en el hipocondrio derecho: era una colecistitis aguda gangrenosa. Durante años conté este caso diciendo "me anclé en la ITU". Hoy entiendo que esa etiqueta psicológica, aunque cierta, era otra forma de cierre prematuro: bautizar el sesgo me ahorraba reconstruir la arquitectura real del fallo. Este capítulo trata de esa reconstrucción.</w:t>
+        <w:t xml:space="preserve">Voy a contar un error mío. Una paciente de ochenta y dos años, traída por su hija por decaimiento hipoactivo de dos días y orina de mal olor. La hoja de atención de urgencias traía escrito «antecedente de ITU a repetición», el sedimento mostraba piuria y el urocultivo preliminar informó desarrollo bacteriano. Indiqué ceftriaxona, escribí «ITU baja/alta en anciana frágil, evolución favorable esperable» y pasé al siguiente ingreso de la tarde. Al tercer día la paciente seguía postrada e inapetente; al cuarto agregó fiebre alta, ictericia subclínica y defensa en el hipocondrio derecho: era una colecistitis aguda gangrenosa. Durante años conté este caso diciendo «me anclé en la ITU». Hoy entiendo que esa etiqueta psicológica, aunque cierta, era otra forma de cierre prematuro: bautizar el sesgo me ahorraba reconstruir la arquitectura real del fallo. Este capítulo trata de esa reconstrucción.</w:t>
       </w:r>
     </w:p>
     <w:p>
@@ -5931,15 +5947,15 @@
         <w:pStyle w:val="BodyJ"/>
       </w:pPr>
       <w:r>
-        <w:t xml:space="preserve">La literatura sobre heurísticas y sesgos transformó nuestra comprensión del juicio. Tversky y Kahneman mostraron que estimamos probabilidades mediante reglas rápidas que producen errores sistemáticos en determinadas condiciones (Tversky &amp; Kahneman, 1974; Kahneman, 2011). En medicina, Croskerry y otros autores difundieron conceptos como anclaje, disponibilidad, confirmación, cierre prematuro y búsqueda satisfecha (Croskerry, 2003).</w:t>
-      </w:r>
-    </w:p>
-    <w:p>
-      <w:pPr>
-        <w:pStyle w:val="BodyJ"/>
-      </w:pPr>
-      <w:r>
-        <w:t xml:space="preserve">El vocabulario es útil porque permite reconocer patrones. Pero también puede producir una explicación retrospectiva demasiado fácil. Después de un error, casi siempre es posible encontrar un sesgo que parezca describirlo. Etiquetar "anclaje" no demuestra el mecanismo ni explica por qué el anclaje ocurrió en ese momento, con ese equipo y bajo esas condiciones.</w:t>
+        <w:t xml:space="preserve">La literatura sobre heurísticas y sesgos transformó la comprensión del juicio. Tversky y Kahneman mostraron que las personas estiman probabilidades mediante reglas rápidas que producen errores sistemáticos en determinadas condiciones (Tversky &amp; Kahneman, 1974; Kahneman, 2011). En medicina, Croskerry y otros autores difundieron conceptos como anclaje, disponibilidad, confirmación, cierre prematuro y búsqueda satisfecha (Croskerry, 2003).</w:t>
+      </w:r>
+    </w:p>
+    <w:p>
+      <w:pPr>
+        <w:pStyle w:val="BodyJ"/>
+      </w:pPr>
+      <w:r>
+        <w:t xml:space="preserve">El vocabulario es útil porque permite reconocer patrones. Pero también puede producir una explicación retrospectiva demasiado fácil. Después de un error, casi siempre es posible encontrar un sesgo que parezca describirlo. Etiquetar «anclaje» no demuestra el mecanismo ni explica por qué el anclaje ocurrió en ese momento, con ese equipo y bajo esas condiciones.</w:t>
       </w:r>
     </w:p>
     <w:p>
@@ -5972,7 +5988,7 @@
         <w:pStyle w:val="BodyJ"/>
       </w:pPr>
       <w:r>
-        <w:t xml:space="preserve">Mi error con aquella colecistitis, analizado como trayectoria ecológica y no como pecado mental aislado, recorrió al menos cinco estaciones: primero, una frase heredada de urgencias ("ITU a repetición") que ingresó a mi nota con jerarquía de hecho comprobado; segundo, un error de ponderación bayesiana al olvidar que la bacteriuria asintomática ronda el 20% en mujeres de ochenta años o más que viven en la comunidad, y es todavía más frecuente en las institucionalizadas (Nicolle et al., 2019), de modo que un urocultivo positivo sin disuria ni dolor lumbar tenía un valor predictivo bajísimo para explicar su postración aguda; tercero, un examen abdominal superficial practicado por trámite porque mi hipótesis ya estaba cerrada; cuarto, cuarenta y ocho horas de falta de respuesta clínica que inmunicé con un lugar común geriátrico ("los adultos mayores tardan más en prender con el antibiótico"); y quinto, un diseño de trabajo sin barreras de salida —ningún criterio escrito de reevaluación a las 48 horas ni una pregunta en la visita de sala que desafiara la etiqueta inicial—. El sesgo de anclaje estuvo presente, pero el error fue el sistema completo operando en línea. La responsabilidad cognitiva individual no desaparece; se vuelve contextual. La Figura 8 dibuja la trayectoria y marca dónde una barrera la habría interceptado.</w:t>
+        <w:t xml:space="preserve">Mi error con aquella colecistitis, analizado como trayectoria ecológica y no como pecado mental aislado, recorrió al menos cinco estaciones. Primero, una frase heredada de urgencias («ITU a repetición») que ingresó a mi nota con jerarquía de hecho comprobado. Segundo, un error de ponderación bayesiana: olvidé que la bacteriuria asintomática ronda el 20% en mujeres de ochenta años o más que viven en la comunidad, y es todavía más frecuente en las institucionalizadas (Nicolle et al., 2019), de modo que un urocultivo positivo sin disuria ni dolor lumbar tenía un valor predictivo bajísimo para explicar su postración aguda. Tercero, un examen abdominal superficial practicado por trámite porque mi hipótesis ya estaba cerrada. Cuarto, cuarenta y ocho horas de falta de respuesta clínica que inmunicé con un lugar común geriátrico («los adultos mayores tardan más en prender con el antibiótico»). Y quinto, un diseño de trabajo sin barreras de salida: ningún criterio escrito de reevaluación a las 48 horas ni una pregunta en la visita de sala que desafiara la etiqueta inicial. El sesgo de anclaje estuvo presente, pero el error fue el sistema completo operando en línea. La responsabilidad cognitiva individual no desaparece; se vuelve contextual. La Figura 8 dibuja la trayectoria y marca dónde una barrera la habría interceptado.</w:t>
       </w:r>
     </w:p>
     <w:tbl>
@@ -6104,7 +6120,7 @@
         <w:pStyle w:val="BodyJ"/>
       </w:pPr>
       <w:r>
-        <w:t xml:space="preserve">Las heurísticas tampoco son enemigas de la racionalidad. Gigerenzer ha mostrado que reglas simples pueden ser adaptativas cuando corresponden a la estructura del ambiente (Gigerenzer &amp; Gaissmaier, 2011). El problema no es usar atajos, sino usarlos fuera de su ecología de validez. "Lo frecuente es frecuente" funciona como prior, no como veto a la evidencia discordante.</w:t>
+        <w:t xml:space="preserve">Las heurísticas tampoco son enemigas de la racionalidad. Gigerenzer ha mostrado que reglas simples pueden ser adaptativas cuando corresponden a la estructura del ambiente (Gigerenzer &amp; Gaissmaier, 2011). El problema no es usar atajos, sino usarlos fuera de su ecología de validez. «Lo frecuente es frecuente» funciona como prior, no como veto a la evidencia discordante.</w:t>
       </w:r>
     </w:p>
     <w:p>
@@ -6170,7 +6186,7 @@
         <w:pStyle w:val="BodyJ"/>
       </w:pPr>
       <w:r>
-        <w:t xml:space="preserve">En lugar de preguntar siempre "¿qué sesgo tengo?", puede ser más útil preguntar:</w:t>
+        <w:t xml:space="preserve">En lugar de preguntar siempre «¿qué sesgo tengo?», puede ser más útil preguntar:</w:t>
       </w:r>
     </w:p>
     <w:p>
@@ -6277,7 +6293,7 @@
         <w:t xml:space="preserve">Solución comentada.</w:t>
       </w:r>
       <w:r>
-        <w:t xml:space="preserve"> Sobre el caso del capítulo: (1) "ITU a repetición" viajaba como antecedente sin procedencia —el formato (frase heredada en ficha) le daba más autoridad que su origen (nadie sabía quién la escribió ni con qué base). (2) El urocultivo: en una mujer de ochenta y dos años sin síndrome miccional, la bacteriuria tiene alta prevalencia basal; confirma poco cuando la probabilidad pretest de otra causa es sustancial. (3) El día 3: "sigue decaída" se convirtió en "responde lento", una reinterpretación que inmunizaba la hipótesis. (4) Dos barreras de bajo costo y alto impacto: dejar escrito un criterio de reapertura obligatorio al indicar el tratamiento empírico ("si no recupera estado basal ni apetito en 48 h, reexaminar abdomen dirigido y solicitar pruebas hepáticas o imagen") e instituir en la visita médica de sala la pregunta de resistencia: "¿qué hallazgo de esta paciente no queda explicado por una infección urinaria?". La hipoactividad severa sin síndrome miccional era la pieza suelta. El análisis de trayectoria termina cuando se diseña la barrera operativa, no cuando se rotula el sesgo del médico.</w:t>
+        <w:t xml:space="preserve"> Sobre el caso del capítulo: (1) «ITU a repetición» viajaba como antecedente sin procedencia —el formato (frase heredada en ficha) le daba más autoridad que su origen (nadie sabía quién la escribió ni con qué base). (2) El urocultivo: en una mujer de ochenta y dos años sin síndrome miccional, la bacteriuria tiene alta prevalencia basal; confirma poco cuando la probabilidad pretest de otra causa es sustancial. (3) El día 3: «sigue decaída» se convirtió en «responde lento», una reinterpretación que inmunizaba la hipótesis. (4) Dos barreras de bajo costo y alto impacto: dejar escrito un criterio de reapertura obligatorio al indicar el tratamiento empírico («si no recupera estado basal ni apetito en 48 h, reexaminar abdomen dirigido y solicitar pruebas hepáticas o imagen») e instituir en la visita médica de sala la pregunta de resistencia: «¿qué hallazgo de esta paciente no queda explicado por una infección urinaria?». La hipoactividad severa sin síndrome miccional era la pieza suelta. El análisis de trayectoria termina cuando se diseña la barrera operativa, no cuando se rotula el sesgo del médico.</w:t>
       </w:r>
     </w:p>
     <w:p>
@@ -6329,7 +6345,7 @@
         </w:numPr>
       </w:pPr>
       <w:r>
-        <w:t xml:space="preserve">¿Qué dato "confirmatorio" de hoy confirmaría también la hipótesis rival?</w:t>
+        <w:t xml:space="preserve">¿Qué dato «confirmatorio» de hoy confirmaría también la hipótesis rival?</w:t>
       </w:r>
     </w:p>
     <w:p>
@@ -6379,7 +6395,7 @@
         <w:pStyle w:val="BodyJ"/>
       </w:pPr>
       <w:r>
-        <w:t xml:space="preserve">En la visita médica de las 8:30, el residente presenta la cama 12 en cuarenta segundos: "Pielonefritis aguda en su tercer día de tratamiento antibiótico, afebril, con buena respuesta clínica". La internista a cargo de la sala mira dos segundos la curva de signos vitales y los exámenes en pantalla y le pide: "Preséntamelo de nuevo, pero sin usar la palabra pielonefritis ni infección". El residente toma aire y reestructura: "Hombre con lesión medular completa y usuario crónico de sonda Foley; tras recambio traumático de sonda presentó orina turbia, piuria y urocultivo positivo, manteniéndose siempre afebril, hemodinámicamente estable y sin disuria ni dolor lumbar evaluables por su nivel lesional; cursa con PCR elevada estable y tiene un cáncer renal metastásico activo como causa inflamatoria concomitante...". Antes de terminar la tercera oración, ya nadie en la sala cree que el paciente tenga una pielonefritis. Ese es exactamente el punto de este capítulo.</w:t>
+        <w:t xml:space="preserve">En la visita médica de las 8:30, el residente presenta la cama 12 en cuarenta segundos: «Pielonefritis aguda en su tercer día de tratamiento antibiótico, afebril, con buena respuesta clínica». La internista a cargo de la sala mira dos segundos la curva de signos vitales y los exámenes en pantalla y le pide: «Preséntamelo de nuevo, pero sin usar la palabra pielonefritis ni infección». El residente toma aire y reestructura: «Hombre con lesión medular completa y usuario crónico de sonda Foley; tras recambio traumático de sonda presentó orina turbia, piuria y urocultivo positivo, manteniéndose siempre afebril, hemodinámicamente estable y sin disuria ni dolor lumbar evaluables por su nivel lesional; cursa con PCR elevada estable y tiene un cáncer renal metastásico activo como causa inflamatoria concomitante...». Antes de terminar la tercera oración, ya nadie en la sala cree que el paciente tenga una pielonefritis. Ese es exactamente el punto de este capítulo.</w:t>
       </w:r>
     </w:p>
     <w:p>
@@ -6437,7 +6453,7 @@
         <w:pStyle w:val="BodyJ"/>
       </w:pPr>
       <w:r>
-        <w:t xml:space="preserve">Moulton y colaboradores propusieron "desacelerar cuando se debe" como característica del juicio experto. Los profesionales alternan entre flujo automático y esfuerzo deliberado cuando detectan señales de dificultad, novedad o peligro (Moulton et al., 2007). La dificultad es que el momento de desacelerar también debe ser reconocido; si la metacognición falla, el clínico continúa con fluidez precisamente cuando debería detenerse.</w:t>
+        <w:t xml:space="preserve">Moulton y colaboradores propusieron «desacelerar cuando se debe» como característica del juicio experto. Los profesionales alternan entre flujo automático y esfuerzo deliberado cuando detectan señales de dificultad, novedad o peligro (Moulton et al., 2007). La dificultad es que el momento de desacelerar también debe ser reconocido; si la metacognición falla, el clínico continúa con fluidez precisamente cuando debería detenerse.</w:t>
       </w:r>
     </w:p>
     <w:p>
@@ -6478,7 +6494,7 @@
         <w:pStyle w:val="BodyJ"/>
       </w:pPr>
       <w:r>
-        <w:t xml:space="preserve">La evidencia es más dura de lo que la cultura hospitalaria admite. Un metaanálisis de sesenta estudios estimó que menos de treinta horas sin dormir reducen el desempeño cognitivo general de los médicos en cerca de una desviación estándar, y el desempeño clínico en más de una y media (Philibert, 2005): el médico de las cuatro de la mañana no es el mismo instrumento que el de las nueve. Cuando se asignó al azar a internos de cuidados intensivos a turnos tradicionales de más de veinticuatro horas o a turnos acotados a dieciséis, los turnos largos produjeron un 36% más de errores graves, y los errores diagnósticos graves se multiplicaron por más de cinco (Landrigan et al., 2004). El efecto no exige noches: en más de 21.000 consultas por infección respiratoria, la probabilidad de salir con un antibiótico subió hora a hora dentro de la misma sesión de policlínico, con independencia del paciente y del diagnóstico, hasta unas chances un 26% mayores en la cuarta hora que en la primera (Linder et al., 2014). Nadie decidió prescribir peor a las cuatro de la tarde; el umbral se movió solo, con el cansancio. Y el ánimo tampoco es neutro: en un experimento clásico, los médicos a quienes se indujo un afecto positivo integraron antes la información de un caso y se anclaron menos en su primera hipótesis (Estrada, Isen &amp; Young, 1997). El estado afectivo no acompaña al razonamiento; lo configura. Maturana lo había dicho desde la biología, en una formulación que esta sección adopta: las emociones son disposiciones corporales que especifican el dominio de acciones en que un organismo puede moverse en cada momento (Maturana, 1990). Un ánimo no es ruido sobre el razonamiento; es el repertorio de pensamientos y conductas disponibles, y por eso merece figurar entre los hechos.</w:t>
+        <w:t xml:space="preserve">La evidencia es más dura de lo que la cultura hospitalaria admite. Un metaanálisis de sesenta estudios estimó que menos de treinta horas sin dormir reducen el desempeño cognitivo general de los médicos en cerca de una desviación estándar, y el desempeño clínico en más de una y media (Philibert, 2005). El médico de las cuatro de la mañana no es el mismo instrumento que el de las nueve. Cuando se asignó al azar a internos de cuidados intensivos a turnos tradicionales de más de veinticuatro horas o a turnos acotados a dieciséis, los turnos largos produjeron un 36% más de errores graves, y los errores diagnósticos graves se multiplicaron por más de cinco (Landrigan et al., 2004). El efecto no exige noches. En más de 21.000 consultas por infección respiratoria, la probabilidad de salir con un antibiótico subió hora a hora dentro de la misma sesión de policlínico, con independencia del paciente y del diagnóstico: unas chances un 26% mayores en la cuarta hora que en la primera (Linder et al., 2014). Nadie decidió prescribir peor a las cuatro de la tarde; el umbral se movió solo, con el cansancio. Y el ánimo tampoco es neutro: en un experimento clásico, los médicos a quienes se indujo un afecto positivo integraron antes la información de un caso y se anclaron menos en su primera hipótesis (Estrada, Isen &amp; Young, 1997). El estado afectivo no acompaña al razonamiento; lo configura. Maturana lo había dicho desde la biología, en una formulación que esta sección adopta: las emociones son disposiciones corporales que especifican el dominio de acciones en que un organismo puede moverse en cada momento (Maturana, 1990). Un ánimo no es ruido sobre el razonamiento; es el repertorio de pensamientos y conductas disponibles, y por eso debe figurar entre los hechos.</w:t>
       </w:r>
     </w:p>
     <w:p>
@@ -6494,23 +6510,23 @@
         <w:pStyle w:val="BodyJ"/>
       </w:pPr>
       <w:r>
-        <w:t xml:space="preserve">Primero, tratar el propio estado como un hecho de la capa H. "¿En qué condiciones estoy pensando esto?" es una pregunta con respuesta observable —la hora, las horas de turno, lo dormido, el ánimo, la preocupación ajena al caso que ocupa la mitad de la atención—, y esa respuesta es un dato sobre la confiabilidad del instrumento que está produciendo las inferencias, tan pertinente como la calibración de un gasómetro. Reconocerlo no es debilidad: es la trazabilidad que el capítulo 1 exige a cualquier observación, aplicada al observador. Por eso la lista de disparadores de esta sección tiene un ítem más: el estado del razonador. Turno largo, madrugada, ánimo alterado o una preocupación que no es el paciente son condiciones que, por sí solas, justifican la pausa breve o el segundo lector, aunque el caso parezca fácil. Sobre todo si parece fácil.</w:t>
-      </w:r>
-    </w:p>
-    <w:p>
-      <w:pPr>
-        <w:pStyle w:val="BodyJ"/>
-      </w:pPr>
-      <w:r>
-        <w:t xml:space="preserve">Segundo, no apostar a la voluntad. Las herramientas de este libro que más valen a las cuatro de la mañana son las que no necesitan energía para activarse: el criterio de reapertura escrito cuando todavía había lucidez, la pregunta fija de la entrega de turno, la regla de ocho ítems al lado de la camilla, la versión de sesenta segundos. Son prótesis del esfuerzo: trasladan el pensamiento desde el momento en que no está disponible hacia el momento en que lo estuvo, o hacia otra persona. El diseño reemplaza al ánimo porque el ánimo no es confiable, y esa es exactamente la razón para diseñar.</w:t>
-      </w:r>
-    </w:p>
-    <w:p>
-      <w:pPr>
-        <w:pStyle w:val="BodyJ"/>
-      </w:pPr>
-      <w:r>
-        <w:t xml:space="preserve">Tercero, usar el relevo. La entrega de turno no es sólo transferencia de información: es el momento en que un cerebro descansado revisa lo que decidió uno cansado, y eso cambia qué se entrega. "Lo vi a las cinco, con doce horas encima; la hipótesis es X y no alcancé a pensar en Y" es una frase que un equipo maduro puede decir sin vergüenza, y vale más que "sin novedades". El capítulo 13 desarrolla la mitad colectiva de esta idea; el capítulo 16, su mitad institucional, porque los turnos y el descanso son condiciones epistémicas antes que laborales.</w:t>
+        <w:t xml:space="preserve">Primero, tratar el propio estado como un hecho de la capa H. «¿En qué condiciones estoy pensando esto?» es una pregunta con respuesta observable: la hora, las horas de turno, lo dormido, el ánimo, la preocupación ajena al caso que ocupa la mitad de la atención. Y esa respuesta es un dato sobre la confiabilidad del instrumento que está produciendo las inferencias, tan pertinente como la calibración de un gasómetro. Reconocerlo no es debilidad, sino la trazabilidad que el capítulo 1 exige a cualquier observación, aplicada al observador. Por eso la lista de disparadores de esta sección tiene un ítem más: el estado del razonador. Turno largo, madrugada, ánimo alterado o una preocupación que no es el paciente son condiciones que, por sí solas, justifican la pausa breve o el segundo lector, aunque el caso parezca fácil. Sobre todo si parece fácil.</w:t>
+      </w:r>
+    </w:p>
+    <w:p>
+      <w:pPr>
+        <w:pStyle w:val="BodyJ"/>
+      </w:pPr>
+      <w:r>
+        <w:t xml:space="preserve">Segundo, no apostar a la voluntad. Las herramientas de este libro que más valen a las cuatro de la mañana son las que no necesitan energía para activarse: el criterio de reapertura escrito cuando todavía había lucidez, la pregunta fija de la entrega de turno, la regla de ocho ítems al lado de la camilla, la versión de sesenta segundos. Son prótesis del esfuerzo: trasladan el pensamiento desde el momento en que no está disponible hacia el momento en que lo estuvo, o hacia otra persona. El diseño reemplaza al ánimo porque el ánimo no es confiable, y esa es la razón para diseñar.</w:t>
+      </w:r>
+    </w:p>
+    <w:p>
+      <w:pPr>
+        <w:pStyle w:val="BodyJ"/>
+      </w:pPr>
+      <w:r>
+        <w:t xml:space="preserve">Tercero, usar el relevo. La entrega de turno, además de transferir información, es el momento en que un cerebro descansado revisa lo que decidió uno cansado, y eso cambia qué se entrega. «Lo vi a las cinco, con doce horas encima; la hipótesis es X y no alcancé a pensar en Y» es una frase que un equipo maduro puede decir sin vergüenza, y vale más que «sin novedades». El capítulo 13 desarrolla la mitad colectiva de esta idea; el capítulo 16, su mitad institucional, porque los turnos y el descanso son condiciones epistémicas antes que laborales.</w:t>
       </w:r>
     </w:p>
     <w:p>
@@ -6644,7 +6660,7 @@
         <w:pStyle w:val="BodyJ"/>
       </w:pPr>
       <w:r>
-        <w:t xml:space="preserve">Hay una tradición que lleva siglos entrenando exactamente la operación de esa primera instrucción, y conviene reconocerla aunque venga de lejos de la medicina. Suzuki abrió sus charlas sobre la práctica del Zen con una frase que cualquier residente podría tener pegada en la ficha: en la mente del principiante hay muchas posibilidades; en la del experto, pocas (Suzuki, 1970). </w:t>
+        <w:t xml:space="preserve">Hay una tradición que lleva siglos entrenando la operación de esa primera instrucción, y vale reconocerla aunque venga de lejos de la medicina. Suzuki abrió sus charlas sobre la práctica del Zen con una frase que cualquier residente podría tener pegada en la ficha: en la mente del principiante hay muchas posibilidades; en la del experto, pocas (Suzuki, 1970). </w:t>
       </w:r>
       <w:r>
         <w:rPr>
@@ -6654,7 +6670,7 @@
         <w:t xml:space="preserve">Shoshin</w:t>
       </w:r>
       <w:r>
-        <w:t xml:space="preserve">, la mente del principiante, no es ignorancia: es la disposición a mirar lo que ya se conoce como si fuera la primera vez, sin que el nombre decida por adelantado. Presentar el caso sin la etiqueta es </w:t>
+        <w:t xml:space="preserve">, la mente del principiante, no es ignorancia, sino la disposición a mirar lo que ya se conoce como si fuera la primera vez, sin que el nombre decida por adelantado. Presentar el caso sin la etiqueta es </w:t>
       </w:r>
       <w:r>
         <w:rPr>
@@ -6672,7 +6688,7 @@
         <w:pStyle w:val="BodyJ"/>
       </w:pPr>
       <w:r>
-        <w:t xml:space="preserve">Lo segundo que el Zen aporta es el "no saber" como disciplina y no como derrota: sostener la pregunta abierta sin precipitarse a cerrarla, que es el "no lo sé" del capítulo 14 y la cartografía del capítulo 3. Y lo tercero es la atención misma como práctica que se entrena. Epstein, cuyo concepto de práctica atenta este capítulo ya usó, lo trajo explícitamente de esa tradición (Epstein, 1999), y con Krasner mostró en setenta médicos de atención primaria que un programa de comunicación atenta se asoció con menos agotamiento y más empatía, aunque sin grupo control (Krasner et al., 2009). El estado del que piensa, tratado páginas atrás, tiene aquí su contraparte: si el ánimo y el cansancio son hechos, la atención es una habilidad, y las habilidades se practican.</w:t>
+        <w:t xml:space="preserve">Lo segundo que el Zen aporta es el «no saber» como disciplina y no como derrota: sostener la pregunta abierta sin precipitarse a cerrarla, que es el «no lo sé» del capítulo 14 y la cartografía del capítulo 3. Y lo tercero es la atención misma como práctica que se entrena. Epstein, cuyo concepto de práctica atenta este capítulo ya usó, lo trajo explícitamente de esa tradición (Epstein, 1999), y con Krasner observó en setenta médicos de atención primaria que un programa de comunicación atenta se asoció con menos agotamiento y más empatía, aunque sin grupo control (Krasner et al., 2009). El estado del que piensa, tratado páginas atrás, tiene aquí su contraparte: si el ánimo y el cansancio son hechos, la atención es una habilidad, y las habilidades se practican.</w:t>
       </w:r>
     </w:p>
     <w:p>
@@ -6803,7 +6819,7 @@
         <w:t xml:space="preserve">Solución comentada.</w:t>
       </w:r>
       <w:r>
-        <w:t xml:space="preserve"> El ejercicio funciona por sustracción: la etiqueta organiza la percepción, y quitarla obliga a re-observar. En el caso de la cama 12, la reformulación hizo visible que (a) los "síntomas urinarios" eran inevaluables —dato clave que la palabra "pielonefritis" ocultaba—, (b) los marcadores inflamatorios tenían una explicación alternativa activa (neoplasia), y (c) la "buena respuesta" era atribuible al menos a dos causas. Nada de eso exige cambiar el tratamiento hoy; exige saber qué se vigila y qué reabriría el caso. Si al hacer el ejercicio con su propio paciente no reaparece ningún dato, enhorabuena: la etiqueta probablemente está bien puesta. El costo fueron cinco minutos; el beneficio, saberlo.</w:t>
+        <w:t xml:space="preserve"> El ejercicio funciona por sustracción: la etiqueta organiza la percepción, y quitarla obliga a re-observar. En el caso de la cama 12, la reformulación hizo visible que (a) los «síntomas urinarios» eran inevaluables —dato clave que la palabra «pielonefritis» ocultaba—, (b) los marcadores inflamatorios tenían una explicación alternativa activa (neoplasia), y (c) la «buena respuesta» era atribuible al menos a dos causas. Nada de eso exige cambiar el tratamiento hoy; exige saber qué se vigila y qué reabriría el caso. Si al hacer el ejercicio con su propio paciente no reaparece ningún dato, enhorabuena: la etiqueta probablemente está bien puesta. El costo fueron cinco minutos; el beneficio, saberlo.</w:t>
       </w:r>
     </w:p>
     <w:p>
@@ -6905,47 +6921,55 @@
         <w:pStyle w:val="BodyJ"/>
       </w:pPr>
       <w:r>
-        <w:t xml:space="preserve">La historia clínica de Carmen registra qué se hizo. No registra —casi ninguna ficha lo hace— cómo se pensó. Reconstruyámoslo.</w:t>
-      </w:r>
-    </w:p>
-    <w:p>
-      <w:pPr>
-        <w:pStyle w:val="BodyJ"/>
-      </w:pPr>
-      <w:r>
-        <w:t xml:space="preserve">El residente de urgencias que escribió "cuadro habitual, manejo habitual" no fue negligente: reconoció un patrón real (tres episodios previos idénticos, resueltos igual) y su intuición ejecutó el script aprendido. Su error no fue intuir; fue no registrar la señal discordante que su propio examen había encontrado —las rodillas moteadas— y que no pertenecía al patrón. El dato quedó en la hoja de enfermería, huérfano de interpretación.</w:t>
-      </w:r>
-    </w:p>
-    <w:p>
-      <w:pPr>
-        <w:pStyle w:val="BodyJ"/>
-      </w:pPr>
-      <w:r>
-        <w:t xml:space="preserve">La internista de la mañana desaceleró, y vale la pena notar por qué: no porque "pensara despacio" en general, sino porque dos disparadores concretos se activaron —discordancia entre la gravedad fisiológica (shock, lactato 6) y la etiqueta ("suboclusión habitual"), y un dato incompatible con la serie previa (nunca había requerido vasoactivos)—. Su primera acción no fue pedir más exámenes: fue reformular el caso sin la etiqueta. "Mujer con obstrucción mecánica recurrente que hoy está en shock" abre un espacio de hipótesis que "cuadro habitual" cerraba.</w:t>
-      </w:r>
-    </w:p>
-    <w:p>
-      <w:pPr>
-        <w:pStyle w:val="BodyJ"/>
-      </w:pPr>
-      <w:r>
-        <w:t xml:space="preserve">La cirujana aportó la intuición entrenada: doscientas paredes abdominales complejas la autorizaban a decir "programada, no hoy" en un minuto. Pero el valor de su juicio para el equipo no estuvo en la conclusión sino en que aceptó desempaquetarla: gravedad sin correlato anatómico, recurrencia acelerándose, abdomen que "avisa". Esa explicitación permitió que la internista y el residente pudieran vigilar lo mismo que ella vigilaba —y discrepar, si la evolución lo justificaba.</w:t>
-      </w:r>
-    </w:p>
-    <w:p>
-      <w:pPr>
-        <w:pStyle w:val="BodyJ"/>
-      </w:pPr>
-      <w:r>
-        <w:t xml:space="preserve">Y está la calibración de la confianza colectiva. En la visita vespertina del primer día, cuando los hemocultivos preliminares informaron bacilos gramnegativos, la internista hizo una pregunta que rara vez se formula en voz alta: "¿Qué tan seguros estamos hoy de que esta bacteriemia viene del intestino atascado? ¿Ochenta por ciento? ¿Noventa y cinco?". El porcentaje exacto importaba menos que el efecto cognitivo de la pregunta: al obligarse a ponerle número, el equipo notó que su certeza del 95% provenía de la elegancia narrativa —la historia de la hernia cerraba perfecto— y no de haber examinado sistemáticamente los focos rivales. Diez minutos bastaron para solicitar un sedimento urinario con urocultivo, inspeccionar los sitios de punción venosa instalados en urgencias y documentar la ausencia de síntomas respiratorios o biliares. Ese chequeo transformó una seguridad retórica en una inferencia por exclusión verdaderamente respaldada.</w:t>
-      </w:r>
-    </w:p>
-    <w:p>
-      <w:pPr>
-        <w:pStyle w:val="BodyJ"/>
-      </w:pPr>
-      <w:r>
-        <w:t xml:space="preserve">Nada de esto aparece en la ficha como "metacognición". Aparece como una nota mejor escrita, dos exámenes dirigidos y un plan con criterios de reapertura. La metacognición clínica no es un género literario: es la diferencia entre una trayectoria que se corrige a tiempo y otra que necesita que el error se vuelva evidente para ser vista.</w:t>
+        <w:t xml:space="preserve">La historia clínica de Carmen registra qué se hizo. No registra —casi ninguna ficha lo hace— cómo se pensó. Esta es la reconstrucción.</w:t>
+      </w:r>
+    </w:p>
+    <w:p>
+      <w:pPr>
+        <w:pStyle w:val="BodyJ"/>
+      </w:pPr>
+      <w:r>
+        <w:t xml:space="preserve">El residente de urgencias que escribió «cuadro habitual, manejo habitual» no fue negligente: reconoció un patrón real (tres episodios previos idénticos, resueltos igual) y su intuición ejecutó el script aprendido. Su error no fue intuir; fue no registrar la señal discordante que su propio examen había encontrado —las rodillas moteadas— y que no pertenecía al patrón. El dato quedó en la hoja de enfermería, huérfano de interpretación.</w:t>
+      </w:r>
+    </w:p>
+    <w:p>
+      <w:pPr>
+        <w:pStyle w:val="BodyJ"/>
+      </w:pPr>
+      <w:r>
+        <w:t xml:space="preserve">La internista de la mañana desaceleró, y vale la pena notar por qué. No porque «pensara despacio» en general, sino porque se activaron dos disparadores concretos: la discordancia entre la gravedad fisiológica (shock, lactato 6) y la etiqueta («suboclusión habitual»), y un dato incompatible con la serie previa (nunca había requerido vasoactivos). Su primera acción no fue pedir más exámenes: fue reformular el caso sin la etiqueta. «Mujer con obstrucción mecánica recurrente que hoy está en shock» abre un espacio de hipótesis que «cuadro habitual» cerraba.</w:t>
+      </w:r>
+    </w:p>
+    <w:p>
+      <w:pPr>
+        <w:pStyle w:val="BodyJ"/>
+      </w:pPr>
+      <w:r>
+        <w:t xml:space="preserve">La cirujana aportó la intuición entrenada: doscientas paredes abdominales complejas la autorizaban a decir «programada, no hoy» en un minuto. Pero el valor de su juicio para el equipo no estuvo en la conclusión sino en que aceptó desempaquetarla: gravedad sin correlato anatómico, recurrencia acelerándose, abdomen que «avisa». Esa explicitación permitió que la internista y el residente pudieran vigilar lo mismo que ella vigilaba —y discrepar, si la evolución lo justificaba.</w:t>
+      </w:r>
+    </w:p>
+    <w:p>
+      <w:pPr>
+        <w:pStyle w:val="BodyJ"/>
+      </w:pPr>
+      <w:r>
+        <w:t xml:space="preserve">Y está Marcela, la enfermera de urgencias, que midió el llene capilar de cinco segundos y anotó las rodillas moteadas en su hoja. Durante las primeras horas, esa hoja fue el único lugar de la ficha donde la gravedad existía. Nadie le preguntó qué pensaba hasta que la internista lo hizo en la mañana, y la respuesta no cabía en ninguna casilla: «A mí no me pareció la de siempre; no quiso ni el agua». Fue la primera versión de «esta vez es distinto» que el equipo escuchó, y venía de quien había mirado a Carmen más tiempo que nadie.</w:t>
+      </w:r>
+    </w:p>
+    <w:p>
+      <w:pPr>
+        <w:pStyle w:val="BodyJ"/>
+      </w:pPr>
+      <w:r>
+        <w:t xml:space="preserve">Y está la calibración de la confianza colectiva. En la visita vespertina del primer día, cuando los hemocultivos preliminares informaron bacilos gramnegativos, la internista hizo una pregunta que rara vez se formula en voz alta: «¿Qué tan seguros estamos hoy de que esta bacteriemia viene del intestino atascado? ¿Ochenta por ciento? ¿Noventa y cinco?». El porcentaje exacto importaba menos que el efecto cognitivo de la pregunta. Al obligarse a ponerle número, el equipo notó que su certeza del 95% provenía de la elegancia narrativa —la historia de la hernia cerraba perfecto— y no de haber examinado sistemáticamente los focos rivales. Diez minutos bastaron para solicitar un sedimento urinario con urocultivo, inspeccionar los sitios de punción venosa instalados en urgencias y documentar la ausencia de síntomas respiratorios o biliares. Ese chequeo transformó una seguridad retórica en una inferencia por exclusión verdaderamente respaldada.</w:t>
+      </w:r>
+    </w:p>
+    <w:p>
+      <w:pPr>
+        <w:pStyle w:val="BodyJ"/>
+      </w:pPr>
+      <w:r>
+        <w:t xml:space="preserve">Nada de esto aparece en la ficha como «metacognición». Aparece como una nota mejor escrita, dos exámenes dirigidos y un plan con criterios de reapertura. La metacognición clínica no es un género literario: es la diferencia entre una trayectoria que se corrige a tiempo y otra que necesita que el error se vuelva evidente para ser vista.</w:t>
       </w:r>
     </w:p>
     <w:p>
@@ -6970,7 +6994,7 @@
         <w:pStyle w:val="PartIntro"/>
       </w:pPr>
       <w:r>
-        <w:t xml:space="preserve">Las dos primeras partes examinaron el conocimiento y la mente que lo maneja. Esta parte los pone en movimiento: la evidencia poblacional que debe leerse con su marco a la vista y traducirse a una persona (capítulo 9), la decisión por umbrales donde los valores entran al cálculo y la bioética entra en la premisa (capítulo 10), el tiempo que transforma el significado de los hechos (capítulo 11), la ficha que piensa o que fosiliza (capítulo 12) y el equipo donde el conocimiento circula, se degrada o se corrige, incluida la conversación con el paciente (capítulo 13). El interludio final encuentra a Carmen frente a una decisión de verdad.</w:t>
+        <w:t xml:space="preserve">Las dos primeras partes examinaron el conocimiento y la mente que lo maneja. Esta parte los pone en movimiento. La evidencia poblacional que debe leerse con su marco a la vista y traducirse a una persona (capítulo 9); la decisión por umbrales, donde los valores entran al cálculo y la bioética entra en la premisa (capítulo 10); el tiempo que transforma el significado de los hechos (capítulo 11); la ficha que piensa o que fosiliza (capítulo 12); y el equipo donde el conocimiento circula, se degrada o se corrige, incluida la conversación con el paciente (capítulo 13). El interludio final encuentra a Carmen frente a una decisión de verdad.</w:t>
       </w:r>
     </w:p>
     <w:p>
@@ -7008,7 +7032,7 @@
         <w:pStyle w:val="BodyJ"/>
       </w:pPr>
       <w:r>
-        <w:t xml:space="preserve">La guía clínica cita un ensayo aleatorizado y concluye: "la reparación quirúrgica electiva de la hernia incisional reduce significativamente la recurrencia obstructiva frente al manejo expectante en pacientes comparables". En la cama 7, Carmen —61 años, recién recuperada de un shock séptico, con un EPOC moderado y un abdomen ya operado— escucha la recomendación del equipo y hace una pregunta simple: "¿Y qué pasa si no me opero?". Entre el resultado promedio del artículo científico y la respuesta honesta a Carmen existe una cadena de inferencias que este capítulo intenta hacer visible.</w:t>
+        <w:t xml:space="preserve">La guía clínica cita un ensayo aleatorizado y concluye: «la reparación quirúrgica electiva de la hernia incisional reduce significativamente la recurrencia obstructiva frente al manejo expectante en pacientes comparables». En la cama 7, Carmen —61 años, recién recuperada de un shock séptico, con un EPOC moderado y un abdomen ya operado— escucha la recomendación del equipo y hace una pregunta simple: «¿Y qué pasa si no me opero?». Entre el resultado promedio del artículo científico y la respuesta honesta a Carmen existe una cadena de inferencias que este capítulo intenta hacer visible.</w:t>
       </w:r>
     </w:p>
     <w:p>
@@ -7074,7 +7098,7 @@
         <w:pStyle w:val="BodyJ"/>
       </w:pPr>
       <w:r>
-        <w:t xml:space="preserve">Hagamos la aritmética explícita con Carmen usando cifras ilustrativas. Supongamos que el ensayo clínico de referencia demostró que operar electivamente reduce un 50% el riesgo relativo de sufrir una nueva obstrucción a dos años, partiendo de un riesgo basal de 20% en la cohorte estudiada: eso equivale a una reducción absoluta de 10 puntos porcentuales (es necesario operar a diez pacientes promedio para evitar una obstrucción). Pero Carmen no pertenece al promedio de ese estudio: tras cuatro episodios en doce meses —acelerándose en frecuencia y el último complicado con shock séptico—, su probabilidad basal de volver a obstruirse y sufrir una complicación grave es sustancialmente mayor, digamos un 60%. Si el beneficio relativo se mantuviera, la reducción absoluta en ella subiría a 30 puntos porcentuales: casi uno de cada tres casos como el suyo evitaría un evento potencialmente letal. Sin embargo, su denominador de daño también se aparta del ensayo: el EPOC moderado, el desacondicionamiento post-sepsis y una pared con cicatrices previas elevan su riesgo absoluto de complicaciones respiratorias o quirúrgicas. La aritmética clínica no decide por la paciente, pero desnuda qué debemos estimar antes de recomendar —dos riesgos basales individualizados, el de la enfermedad sin intervención y el del quirófano— y demuestra por qué la muletilla "está indicado por evidencia" suele esconder ambas estimaciones.</w:t>
+        <w:t xml:space="preserve">La aritmética, hecha explícita con Carmen y con cifras ilustrativas, lo muestra. Suponga que el ensayo clínico de referencia demostró que operar electivamente reduce un 50% el riesgo relativo de una nueva obstrucción a dos años, con un riesgo basal de 20% en la cohorte estudiada. Eso equivale a una reducción absoluta de 10 puntos: hay que operar a diez pacientes promedio para evitar una obstrucción. Pero Carmen no pertenece al promedio de ese estudio. Tras cuatro episodios en doce meses, cada vez más seguidos y el último con shock séptico, su probabilidad basal de volver a obstruirse con una complicación grave es mucho mayor: por ejemplo, un 60%. Si el beneficio relativo se mantuviera, la reducción absoluta en ella subiría a 30 puntos porcentuales: casi uno de cada tres casos como el suyo evitaría un evento potencialmente letal. Sin embargo, su denominador de daño también se aparta del ensayo: el EPOC moderado, el desacondicionamiento post-sepsis y una pared con cicatrices previas elevan su riesgo absoluto de complicaciones respiratorias o quirúrgicas. La aritmética clínica no decide por la paciente, pero desnuda qué hay que estimar antes de recomendar: dos riesgos basales individualizados, el de la enfermedad sin intervención y el del quirófano. Y muestra por qué la muletilla «está indicado por evidencia» suele esconder ambas estimaciones.</w:t>
       </w:r>
     </w:p>
     <w:tbl>
@@ -7173,15 +7197,15 @@
         <w:pStyle w:val="BodyJ"/>
       </w:pPr>
       <w:r>
-        <w:t xml:space="preserve">La validez externa no es una propiedad binaria del estudio. Es una relación entre una evidencia y un uso propuesto. Tonelli sostuvo que el conocimiento clínico incorpora fuentes heterogéneas y que la individualidad del paciente no puede derivarse por completo de resultados poblacionales (Tonelli, 1998). La crítica no invalida la evidencia; impide exigirle aquello para lo cual no fue diseñada. Cartwright y Hardie expresan una dificultad paralela: saber que una intervención funcionó en un contexto no garantiza que funcione aquí, porque el efecto depende de una red de condiciones de apoyo (Cartwright &amp; Hardie, 2012).</w:t>
-      </w:r>
-    </w:p>
-    <w:p>
-      <w:pPr>
-        <w:pStyle w:val="BodyJ"/>
-      </w:pPr>
-      <w:r>
-        <w:t xml:space="preserve">En términos HII, un resultado de investigación es un hecho acerca de una población estudiada. Su aplicabilidad al caso es una inferencia. El grado de transportabilidad permanece incierto. La conducta surge al integrar esa incertidumbre con la magnitud del beneficio esperado, el daño posible, la reversibilidad y las preferencias. Confundir esas capas produce frases como "está indicado por evidencia" cuando lo demostrado es más limitado: "en pacientes comparables, esta estrategia redujo cierto desenlace; en esta paciente el beneficio absoluto probablemente sea menor y debe ponderarse frente a un riesgo adverso mayor".</w:t>
+        <w:t xml:space="preserve">La validez externa no es una propiedad binaria del estudio, sino una relación entre una evidencia y un uso propuesto. Tonelli sostuvo que el conocimiento clínico incorpora fuentes heterogéneas y que la individualidad del paciente no puede derivarse por completo de resultados poblacionales (Tonelli, 1998). La crítica no invalida la evidencia; impide exigirle aquello para lo cual no fue diseñada. Cartwright y Hardie expresan una dificultad paralela: saber que una intervención funcionó en un contexto no garantiza que funcione aquí, porque el efecto depende de una red de condiciones de apoyo (Cartwright &amp; Hardie, 2012).</w:t>
+      </w:r>
+    </w:p>
+    <w:p>
+      <w:pPr>
+        <w:pStyle w:val="BodyJ"/>
+      </w:pPr>
+      <w:r>
+        <w:t xml:space="preserve">En términos HII, un resultado de investigación es un hecho acerca de una población estudiada. Su aplicabilidad al caso es una inferencia. El grado de transportabilidad permanece incierto. La conducta surge al integrar esa incertidumbre con la magnitud del beneficio esperado, el daño posible, la reversibilidad y las preferencias. Confundir esas capas produce frases como «está indicado por evidencia». Lo demostrado es más limitado: «en pacientes comparables, esta estrategia redujo cierto desenlace; en esta paciente el beneficio absoluto probablemente sea menor y debe ponderarse frente a un riesgo adverso mayor».</w:t>
       </w:r>
     </w:p>
     <w:p>
@@ -7206,15 +7230,15 @@
         <w:pStyle w:val="BodyJ"/>
       </w:pPr>
       <w:r>
-        <w:t xml:space="preserve">Antes de traducir un resultado al caso hay que leerlo, y leerlo ya es una decisión. Pocas historias recientes lo muestran mejor. En 2019, un ensayo multicéntrico conducido desde una red latinoamericana de investigación en medicina intensiva comparó dos blancos para reanimar el shock séptico: normalizar el lactato o normalizar el relleno capilar. El grupo guiado por la perfusión periférica tuvo una mortalidad absoluta 8,5 puntos menor; el valor p fue 0,06 y el ensayo quedó declarado "negativo" según la convención (Hernández et al., 2019). ¿Qué debía hacer un clínico con ese resultado? El umbral de significación que lo declaró negativo no es una ley de la naturaleza: es el riesgo inductivo que el capítulo siguiente desarrolla, institucionalizado en un número. Un reanálisis bayesiano lo hizo explícito: bajo cualquier prior razonable, la probabilidad de que la estrategia guiada por perfusión fuera superior excedía el 90% (Zampieri et al., 2020). El mismo dato, dos marcos de lectura, dos frases distintas para la ficha.</w:t>
-      </w:r>
-    </w:p>
-    <w:p>
-      <w:pPr>
-        <w:pStyle w:val="BodyJ"/>
-      </w:pPr>
-      <w:r>
-        <w:t xml:space="preserve">La respuesta madura del propio grupo no fue proclamar victoria ni acatar el veredicto: fue refinar la hipótesis —fenotipos hemodinámicos, un algoritmo personalizado— y volver a someterla a una prueba más severa. Seis años después, el segundo ensayo, ahora en 86 centros de 19 países, mostró que la estrategia personalizada guiada por relleno capilar era superior al cuidado habitual (Hernández et al., 2025). La saga deja tres lecciones para este capítulo: un ensayo no se lee solo, porque el marco inferencial es parte de la lectura; "no significativo" no significa "sin efecto", y tratarlos como sinónimos es una decisión con costos; y la incertidumbre residual no se resuelve con retórica, sino con la siguiente pregunta bien diseñada. Hay una cuarta lección que excede la epistemología: esa ciencia de primera línea se hizo desde América Latina, coordinada desde Chile — el mismo continente clínico desde el que este libro escribe.</w:t>
+        <w:t xml:space="preserve">Antes de traducir un resultado al caso hay que leerlo, y leerlo ya es una decisión. Pocas historias recientes lo muestran mejor. En 2019, un ensayo multicéntrico conducido desde una red latinoamericana de investigación en medicina intensiva comparó dos blancos para reanimar el shock séptico: normalizar el lactato o normalizar el relleno capilar. El grupo guiado por la perfusión periférica tuvo una mortalidad absoluta 8,5 puntos menor; el valor p fue 0,06 y el ensayo quedó declarado «negativo» según la convención (Hernández et al., 2019). ¿Qué debía hacer un clínico con ese resultado? El umbral de significación que lo declaró negativo no es una ley de la naturaleza, sino el riesgo inductivo que el capítulo siguiente desarrolla, institucionalizado en un número. Un reanálisis bayesiano lo hizo explícito: bajo cualquier prior razonable, la probabilidad de que la estrategia guiada por perfusión fuera superior excedía el 90% (Zampieri et al., 2020). El mismo dato, dos marcos de lectura, dos frases distintas para la ficha.</w:t>
+      </w:r>
+    </w:p>
+    <w:p>
+      <w:pPr>
+        <w:pStyle w:val="BodyJ"/>
+      </w:pPr>
+      <w:r>
+        <w:t xml:space="preserve">La respuesta madura del propio grupo no fue proclamar victoria ni acatar el veredicto: fue refinar la hipótesis —fenotipos hemodinámicos, un algoritmo personalizado— y volver a someterla a una prueba más severa. Seis años después, el segundo ensayo, ahora en 86 centros de 19 países, mostró que la estrategia personalizada guiada por relleno capilar era superior al cuidado habitual (Hernández et al., 2025). La saga deja tres lecciones para este capítulo. Un ensayo no se lee solo, porque el marco inferencial es parte de la lectura. «No significativo» no significa «sin efecto», y tratarlos como sinónimos es una decisión con costos. Y la incertidumbre residual no se resuelve con retórica, sino con la siguiente pregunta bien diseñada. Hay una cuarta lección que excede la epistemología: esa ciencia de primera línea se hizo desde América Latina, coordinada desde Chile — el mismo continente clínico desde el que este libro escribe.</w:t>
       </w:r>
     </w:p>
     <w:tbl>
@@ -7297,7 +7321,7 @@
               <w:pStyle w:val="Caption"/>
             </w:pPr>
             <w:r>
-              <w:t xml:space="preserve">Figura 10. Una década sobre un mismo dato: la saga ANDROMEDA. El mismo programa de investigación atraviesa un ensayo "negativo", su relectura bayesiana y una segunda prueba más severa — la trayectoria completa que este capítulo propone como modelo de lectura de la evidencia.</w:t>
+              <w:t xml:space="preserve">Figura 10. Una década sobre un mismo dato: la saga ANDROMEDA. El mismo programa de investigación atraviesa un ensayo «negativo», su relectura bayesiana y una segunda prueba más severa — la trayectoria completa que este capítulo propone como modelo de lectura de la evidencia.</w:t>
             </w:r>
           </w:p>
         </w:tc>
@@ -7346,7 +7370,7 @@
         <w:pStyle w:val="BodyJ"/>
       </w:pPr>
       <w:r>
-        <w:t xml:space="preserve">Una deliberación bien formulada declara, por eso, qué proviene de estudios, qué se extrapola, qué aporta la historia individual, qué depende del contexto local y qué permanece desconocido. La competencia metacognitiva consiste en reconocer cuándo se está citando un resultado, cuándo extrapolando, cuándo suponiendo un mecanismo y cuándo una preferencia está inclinando la balanza. La pregunta final no es "¿existe evidencia?", sino "¿qué evidencia existe, para qué afirmación, con qué transportabilidad y con qué consecuencias para esta persona?".</w:t>
+        <w:t xml:space="preserve">Una deliberación bien formulada declara, por eso, qué proviene de estudios, qué se extrapola, qué aporta la historia individual, qué depende del contexto local y qué permanece desconocido. La competencia metacognitiva consiste en reconocer cuándo se está citando un resultado, cuándo extrapolando, cuándo suponiendo un mecanismo y cuándo una preferencia está inclinando la balanza. La pregunta final no es «¿existe evidencia?», sino «¿qué evidencia existe, para qué afirmación, con qué transportabilidad y con qué consecuencias para esta persona?».</w:t>
       </w:r>
     </w:p>
     <w:p>
@@ -7406,7 +7430,7 @@
         </w:numPr>
       </w:pPr>
       <w:r>
-        <w:t xml:space="preserve">El último ensayo "negativo" que cité: ¿mostró ausencia de efecto o ausencia de significación — y traté esa diferencia como si no existiera?</w:t>
+        <w:t xml:space="preserve">El último ensayo «negativo» que cité: ¿mostró ausencia de efecto o ausencia de significación — y traté esa diferencia como si no existiera?</w:t>
       </w:r>
     </w:p>
     <w:p>
@@ -7456,7 +7480,7 @@
         <w:pStyle w:val="BodyJ"/>
       </w:pPr>
       <w:r>
-        <w:t xml:space="preserve">Supongamos resuelto lo anterior: la evidencia está traducida, la probabilidad estimada, el caso representado. Queda la pregunta que ninguna estimación responde sola: ¿y ahora qué hacemos? Este capítulo trata del tramo final — donde la probabilidad se encuentra con las consecuencias, los valores entran al cálculo sin pedir permiso y la decisión técnica se cruza con la bioética.</w:t>
+        <w:t xml:space="preserve">Suponga resuelto lo anterior: la evidencia está traducida, la probabilidad estimada, el caso representado. Queda la pregunta que ninguna estimación responde sola: ¿y ahora qué hacemos? Este capítulo trata del tramo final — donde la probabilidad se encuentra con las consecuencias, los valores entran al cálculo sin pedir permiso y la decisión técnica se cruza con la bioética.</w:t>
       </w:r>
     </w:p>
     <w:p>
@@ -7605,15 +7629,15 @@
         <w:pStyle w:val="BodyJ"/>
       </w:pPr>
       <w:r>
-        <w:t xml:space="preserve">Falso positivo y falso negativo no tienen el mismo costo en todos los casos. En una condición letal y tratable, toleramos más falsos positivos para reducir omisiones. En un tratamiento tóxico o irreversible, exigimos mayor evidencia. La incertidumbre diagnóstica debe traducirse en una matriz de consecuencias.</w:t>
-      </w:r>
-    </w:p>
-    <w:p>
-      <w:pPr>
-        <w:pStyle w:val="BodyJ"/>
-      </w:pPr>
-      <w:r>
-        <w:t xml:space="preserve">Ilustremos esta asimetría de costos con los dos momentos de Carmen. En la madrugada del ingreso, con la paciente en shock pero con una tomografía sin necrosis ni perforación libre, entrar a pabellón en plena inestabilidad hemodinámica conllevaba una mortalidad perioperatoria altísima; como el cuadro cedió rápidamente con descompresión nasogástrica y antibióticos, el umbral para una cirugía de rescate inmediato era muy alto y fue prudente no cruzarlo. Días después, con Carmen recuperada en sala, la matriz de consecuencias se invierte: el error más costoso ya no es operar a una paciente inestable, sino enviarla de alta con el anillo herniario intacto y que un quinto atascamiento reproduzca el shock séptico en su domicilio, lejos de una cama crítica. La anatomía radiológica es la misma; lo que desplazó el umbral terapéutico hacia la reparación electiva fue el nuevo peso pronóstico del error de omisión. La Figura 12 pone los dos momentos uno junto al otro.</w:t>
+        <w:t xml:space="preserve">Falso positivo y falso negativo no tienen el mismo costo en todos los casos. En una condición letal y tratable, se toleran más falsos positivos para reducir omisiones. En un tratamiento tóxico o irreversible, se exige mayor evidencia. La incertidumbre diagnóstica debe traducirse en una matriz de consecuencias.</w:t>
+      </w:r>
+    </w:p>
+    <w:p>
+      <w:pPr>
+        <w:pStyle w:val="BodyJ"/>
+      </w:pPr>
+      <w:r>
+        <w:t xml:space="preserve">Los dos momentos de Carmen ilustran esta asimetría de costos. En la madrugada del ingreso, con la paciente en shock pero con una tomografía sin necrosis ni perforación libre, entrar a pabellón en plena inestabilidad hemodinámica conllevaba una mortalidad perioperatoria altísima. Como el cuadro cedió rápido con descompresión nasogástrica y antibióticos, el umbral para una cirugía de rescate inmediato era muy alto, y fue prudente no cruzarlo. Días después, con Carmen recuperada en sala, la matriz de consecuencias se invierte. El error más costoso ya no es operar a una paciente inestable, sino enviarla de alta con el anillo herniario intacto. Un quinto atascamiento reproduciría entonces el shock séptico en su casa, lejos de una cama crítica. La anatomía radiológica es la misma; lo que desplazó el umbral terapéutico hacia la reparación electiva fue el nuevo peso pronóstico del error de omisión. La Figura 12 pone los dos momentos uno junto al otro.</w:t>
       </w:r>
     </w:p>
     <w:tbl>
@@ -7729,7 +7753,7 @@
         <w:pStyle w:val="BodyJ"/>
       </w:pPr>
       <w:r>
-        <w:t xml:space="preserve">La estructura de umbrales tiene una fundamentación filosófica precisa que rara vez se nombra en medicina. Richard Rudner argumentó en 1953 que ningún científico acepta o rechaza una hipótesis por lógica pura: como la evidencia nunca es concluyente, decidir que </w:t>
+        <w:t xml:space="preserve">La estructura de umbrales tiene una fundamentación filosófica precisa que rara vez se nombra en medicina. Richard Rudner argumentó en 1953 que ningún científico acepta o rechaza una hipótesis por lógica pura. Como la evidencia nunca es concluyente, decidir que </w:t>
       </w:r>
       <w:r>
         <w:rPr>
@@ -7739,15 +7763,15 @@
         <w:t xml:space="preserve">ya es suficiente</w:t>
       </w:r>
       <w:r>
-        <w:t xml:space="preserve"> exige ponderar qué tan grave sería equivocarse, y esa ponderación es un juicio de valor (Rudner, 1953). Heather Douglas llamó a esto riesgo inductivo y mostró que atraviesa toda la ciencia con consecuencias prácticas: cuánta evidencia exigimos antes de afirmar que un compuesto es tóxico depende de qué error —afirmar de más o afirmar de menos— produce más daño (Douglas, 2000).</w:t>
-      </w:r>
-    </w:p>
-    <w:p>
-      <w:pPr>
-        <w:pStyle w:val="BodyJ"/>
-      </w:pPr>
-      <w:r>
-        <w:t xml:space="preserve">La clínica es el caso extremo y más honesto de esta tesis. El umbral de Pauker y Kassirer es exactamente el riesgo inductivo vuelto aritmética: el punto donde "suficiente evidencia" queda definido por el costo de los dos errores posibles. Por eso "se descarta" nunca es una afirmación puramente epistémica: descartar una embolia con dímero negativo en un paciente de baja probabilidad no significa que la probabilidad sea cero, sino que el residuo de duda ya no justifica el daño esperado de seguir estudiando. Quien entiende esto deja de buscar un umbral "objetivo" escondido en las guías y empieza a hacer la pregunta correcta: ¿qué error estamos más dispuestos a tolerar en este paciente, y quién decidió eso?</w:t>
+        <w:t xml:space="preserve"> exige ponderar qué tan grave sería equivocarse, y esa ponderación es un juicio de valor (Rudner, 1953). Heather Douglas llamó a esto riesgo inductivo y sostuvo que atraviesa toda la ciencia con consecuencias prácticas. Cuánta evidencia se exige antes de afirmar que un compuesto es tóxico depende de qué error —afirmar de más o afirmar de menos— produce más daño (Douglas, 2000).</w:t>
+      </w:r>
+    </w:p>
+    <w:p>
+      <w:pPr>
+        <w:pStyle w:val="BodyJ"/>
+      </w:pPr>
+      <w:r>
+        <w:t xml:space="preserve">La clínica es el caso extremo y más honesto de esta tesis. El umbral de Pauker y Kassirer es el riesgo inductivo vuelto aritmética: el punto donde «suficiente evidencia» queda definido por el costo de los dos errores posibles. Por eso «se descarta» nunca es una afirmación puramente epistémica. Descartar una embolia con dímero negativo en un paciente de baja probabilidad no significa que la probabilidad sea cero; significa que el residuo de duda ya no justifica el daño esperado de seguir estudiando. Quien entiende esto deja de buscar un umbral «objetivo» escondido en las guías y empieza a hacer la pregunta correcta: ¿qué error estamos más dispuestos a tolerar en este paciente, y quién decidió eso?</w:t>
       </w:r>
     </w:p>
     <w:p>
@@ -7780,47 +7804,47 @@
         <w:pStyle w:val="BodyJ"/>
       </w:pPr>
       <w:r>
-        <w:t xml:space="preserve">Hasta aquí, este capítulo pudo leerse como si decidir fuera un problema de dos variables: probabilidad y consecuencias. La bioética obliga a hacer explícita la pregunta que esa fórmula esconde: ¿consecuencias para quién, medidas en qué moneda? Una intervención terapéutica no actúa sobre una enfermedad; actúa sobre una persona que, además de la enfermedad, tiene una funcionalidad previa, una trayectoria de fondo, una red que la sostiene —o no— y fines propios que nadie puede presumir desde el pasillo. Por eso el razonamiento médico y la bioética no se cruzan al final del proceso, cuando alguien convoca al comité de ética: se cruzan en la premisa, en la decisión previa de qué cuenta como hecho relevante del caso.</w:t>
-      </w:r>
-    </w:p>
-    <w:p>
-      <w:pPr>
-        <w:pStyle w:val="BodyJ"/>
-      </w:pPr>
-      <w:r>
-        <w:t xml:space="preserve">El error más frecuente en la frontera entre evidencia técnica y bioética tiene estructura epistémica antes que moral: tratar la "indicación médica" como una propiedad intrínseca del órgano enfermo y no como una relación proporcional entre una intervención y una biografía concreta. "La estenosis aórtica severa sintomática tiene indicación de recambio valvular quirúrgico o percutáneo (TAVI)" es un enunciado verdadero sobre una cohorte seleccionada. Afirmar que este hombre de 88 años —con fragilidad clínica avanzada, deterioro cognitivo incipiente, dos hospitalizaciones por broncoaspiración en el semestre y una hija cuidadora exhausta— va a recuperar calidad de vida o funcionalidad gracias a la prótesis valvular es una inferencia completamente distinta, cuya validez exige incorporar otros hechos clínicos a la ecuación. Aquí la brecha entre el efecto promedio del ensayo y el caso singular exhibe toda su carga moral: cuando la evaluación omite la funcionalidad basal y el soporte familiar, lo que se pierde no es sólo precisión pronóstica; es el paciente mismo.</w:t>
-      </w:r>
-    </w:p>
-    <w:p>
-      <w:pPr>
-        <w:pStyle w:val="BodyJ"/>
-      </w:pPr>
-      <w:r>
-        <w:t xml:space="preserve">Conviene decirlo con todas sus letras: la funcionalidad, el pronóstico de fondo y el soporte sociofamiliar son hechos clínicos de pleno derecho, no ornamentos "psicosociales" de la anamnesis. La funcionalidad se puede evaluar y graduar en minutos, y predice mortalidad y desenlaces con independencia del diagnóstico que motivó el ingreso (Rockwood et al., 2005). La trayectoria de fondo decide el significado de la enfermedad aguda: la neumonía es la misma bacteria en una curva ascendente que en una descendente, pero no es el mismo problema — la lección del capítulo siguiente, aplicada a los fines del tratamiento. Y la red de apoyo convierte una misma orden de alta en dos intervenciones distintas: "alta a domicilio" con alguien en el domicilio es un plan; sin nadie, es un abandono con firma. Cuando estos datos faltan en la ficha no suele ser porque cuesten mucho: es porque el formato no los pide. Son hechos que la capa H debe registrar para que la capa D pueda usarlos.</w:t>
-      </w:r>
-    </w:p>
-    <w:p>
-      <w:pPr>
-        <w:pStyle w:val="BodyJ"/>
-      </w:pPr>
-      <w:r>
-        <w:t xml:space="preserve">La bioética clínica ofrece herramientas de trabajo para este cruce, y la más difundida tiene un aire de familia con HII-D. Jonsen, Siegler y Winslade propusieron ordenar todo caso en cuatro tópicos: indicaciones médicas, preferencias del paciente, calidad de vida y rasgos contextuales — familia, cultura, recursos, ley (Jonsen, Siegler &amp; Winslade, 2022). El orden importa y no es una jerarquía: las indicaciones van primero porque sin ellas no hay caso, pero nunca van solas. Usado con honestidad, el método funciona como una lista de verificación deliberativa: ningún cuadrante puede quedar vacío sin que la decisión quede coja, y el cuadrante que más cuesta llenar señala exactamente qué conversación falta.</w:t>
-      </w:r>
-    </w:p>
-    <w:p>
-      <w:pPr>
-        <w:pStyle w:val="BodyJ"/>
-      </w:pPr>
-      <w:r>
-        <w:t xml:space="preserve">Dos ideas del mundo hispanohablante completan la caja. La primera es la proporcionalidad terapéutica: la obligación moral de implementar sólo aquellas medidas que guarden debida proporción entre los medios empleados y el resultado previsible (Taboada, 2000). El juicio de proporcionalidad integra pronóstico, cargas de la intervención y fines del paciente — y por eso depende por completo de la calidad epistémica que este libro viene trabajando: un pronóstico inflado por certeza retórica no produce una decisión más esperanzadora; produce un juicio de proporcionalidad falso. La segunda es la deliberación como método (Gracia, 2001): cuando los valores entran en conflicto, la decisión no se calcula, se delibera — identificar qué valores chocan, enumerar los cursos de acción extremos, buscar los intermedios y elegir el curso prudente que pueda defenderse en público. La deliberación es a los valores lo que el diagnóstico diferencial a las hipótesis: un método para no quedarse con la primera respuesta disponible. Los cursos extremos — "hacer todo", "no hacer nada" — casi nunca son los prudentes, y suelen ser los que se eligen cuando nadie deliberó.</w:t>
-      </w:r>
-    </w:p>
-    <w:p>
-      <w:pPr>
-        <w:pStyle w:val="BodyJ"/>
-      </w:pPr>
-      <w:r>
-        <w:t xml:space="preserve">El lector encontrará este cruce ejecutado dos veces en este libro sin la palabra "bioética": en la conversación donde la cirujana recomienda operar a Carmen y le devuelve la decisión (Interludio III), y en la viñeta del final de la vida, donde la incertidumbre que domina no es pronóstica sino de metas (Cuaderno de casos, viñeta 5). En ambas, lo decisivo no fue un principio abstracto: fue que la funcionalidad, la trayectoria y los fines del paciente estuvieran dentro del razonamiento desde el principio. Esa es la tesis de esta sección: la bioética no llega al final a ponerle límites a un razonamiento ya terminado — estaba en el principio, decidiendo qué se mira. Una decisión que ignoró la funcionalidad, el pronóstico de fondo y la red de apoyo no es más "objetiva" por haberse limitado a lo técnico: es más incompleta. Le faltan hechos, no sólo sensibilidad.</w:t>
+        <w:t xml:space="preserve">Hasta aquí, este capítulo pudo leerse como si decidir fuera un problema de dos variables: probabilidad y consecuencias. La bioética obliga a hacer explícita la pregunta que esa fórmula esconde: ¿consecuencias para quién, medidas en qué moneda? Una intervención terapéutica no actúa sobre una enfermedad; actúa sobre una persona. Y la persona, además de la enfermedad, tiene una funcionalidad previa, una trayectoria de fondo, una red que la sostiene —o no— y fines propios que nadie puede presumir desde el pasillo. Por eso el razonamiento médico y la bioética no se cruzan al final del proceso, cuando alguien convoca al comité de ética: se cruzan en la premisa, en la decisión previa de qué cuenta como hecho relevante del caso.</w:t>
+      </w:r>
+    </w:p>
+    <w:p>
+      <w:pPr>
+        <w:pStyle w:val="BodyJ"/>
+      </w:pPr>
+      <w:r>
+        <w:t xml:space="preserve">El error más frecuente en la frontera entre evidencia técnica y bioética tiene estructura epistémica antes que moral. Consiste en tratar la «indicación médica» como una propiedad intrínseca del órgano enfermo y no como una relación proporcional entre una intervención y una biografía concreta. «La estenosis aórtica severa sintomática tiene indicación de recambio valvular quirúrgico o percutáneo (TAVI)» es un enunciado verdadero sobre una cohorte seleccionada. Afirmar que este hombre de 88 años va a recuperar calidad de vida o funcionalidad gracias a la prótesis valvular es una inferencia completamente distinta. Tiene fragilidad clínica avanzada, deterioro cognitivo incipiente, dos hospitalizaciones por broncoaspiración en el semestre y una hija cuidadora exhausta, y la validez de esa inferencia exige meter esos hechos en la ecuación. Aquí la brecha entre el efecto promedio del ensayo y el caso singular exhibe toda su carga moral. Cuando la evaluación omite la funcionalidad basal y el soporte familiar, lo que se pierde no es sólo precisión pronóstica; es el paciente mismo.</w:t>
+      </w:r>
+    </w:p>
+    <w:p>
+      <w:pPr>
+        <w:pStyle w:val="BodyJ"/>
+      </w:pPr>
+      <w:r>
+        <w:t xml:space="preserve">Hay que decirlo con todas sus letras: la funcionalidad, el pronóstico de fondo y el soporte sociofamiliar son hechos clínicos de pleno derecho, no ornamentos «psicosociales» de la anamnesis. La funcionalidad se puede evaluar y graduar en minutos, y predice mortalidad y desenlaces con independencia del diagnóstico que motivó el ingreso (Rockwood et al., 2005). La trayectoria de fondo decide el significado de la enfermedad aguda. La neumonía es la misma bacteria en una curva ascendente que en una descendente, pero no es el mismo problema: la lección del capítulo siguiente, aplicada a los fines del tratamiento. Y la red de apoyo convierte una misma orden de alta en dos intervenciones distintas: «alta a domicilio» con alguien en el domicilio es un plan; sin nadie, es un abandono con firma. Cuando estos datos faltan en la ficha no suele ser porque cuesten mucho: es porque el formato no los pide. Son hechos que la capa H debe registrar para que la capa D pueda usarlos.</w:t>
+      </w:r>
+    </w:p>
+    <w:p>
+      <w:pPr>
+        <w:pStyle w:val="BodyJ"/>
+      </w:pPr>
+      <w:r>
+        <w:t xml:space="preserve">La bioética clínica ofrece herramientas de trabajo para este cruce, y la más difundida tiene un aire de familia con HII-D. Jonsen, Siegler y Winslade propusieron ordenar todo caso en cuatro tópicos: indicaciones médicas, preferencias del paciente, calidad de vida y rasgos contextuales — familia, cultura, recursos, ley (Jonsen, Siegler &amp; Winslade, 2022). El orden importa y no es una jerarquía: las indicaciones van primero porque sin ellas no hay caso, pero nunca van solas. Usado con honestidad, el método funciona como una lista de verificación deliberativa: ningún cuadrante puede quedar vacío sin que la decisión quede coja, y el cuadrante que más cuesta llenar señala qué conversación falta.</w:t>
+      </w:r>
+    </w:p>
+    <w:p>
+      <w:pPr>
+        <w:pStyle w:val="BodyJ"/>
+      </w:pPr>
+      <w:r>
+        <w:t xml:space="preserve">Dos ideas del mundo hispanohablante completan la caja. La primera es la proporcionalidad terapéutica: la obligación moral de implementar sólo aquellas medidas que guarden debida proporción entre los medios empleados y el resultado previsible (Taboada, 2000). El juicio de proporcionalidad integra pronóstico, cargas de la intervención y fines del paciente, y por eso depende por completo de la calidad epistémica que este libro viene trabajando. Un pronóstico inflado por certeza retórica no produce una decisión más esperanzadora; produce un juicio de proporcionalidad falso. La segunda es la deliberación como método (Gracia, 2001). Cuando los valores entran en conflicto, la decisión no se calcula, se delibera: identificar qué valores chocan, enumerar los cursos de acción extremos, buscar los intermedios y elegir el curso prudente que pueda defenderse en público. La deliberación es a los valores lo que el diagnóstico diferencial a las hipótesis: un método para no quedarse con la primera respuesta disponible. Los cursos extremos — «hacer todo», «no hacer nada» — casi nunca son los prudentes, y suelen ser los que se eligen cuando nadie deliberó.</w:t>
+      </w:r>
+    </w:p>
+    <w:p>
+      <w:pPr>
+        <w:pStyle w:val="BodyJ"/>
+      </w:pPr>
+      <w:r>
+        <w:t xml:space="preserve">El lector encontrará este cruce ejecutado dos veces en este libro sin la palabra «bioética». Una, en la conversación donde la cirujana recomienda operar a Carmen y le devuelve la decisión (Interludio III). Otra, en la viñeta del final de la vida, donde la incertidumbre que domina no es pronóstica sino de metas (Cuaderno de casos, viñeta 5). En ambas, lo decisivo no fue un principio abstracto: fue que la funcionalidad, la trayectoria y los fines del paciente estuvieran dentro del razonamiento desde el principio. Esa es la tesis de esta sección: la bioética no llega al final a ponerle límites a un razonamiento ya terminado — estaba en el principio, decidiendo qué se mira. Una decisión que ignoró la funcionalidad, el pronóstico de fondo y la red de apoyo no es más «objetiva» por haberse limitado a lo técnico: es más incompleta. Le faltan hechos, no sólo sensibilidad.</w:t>
       </w:r>
     </w:p>
     <w:p>
@@ -7859,7 +7883,7 @@
         <w:t xml:space="preserve">Solución comentada.</w:t>
       </w:r>
       <w:r>
-        <w:t xml:space="preserve"> De 1.000 pacientes, 100 tienen la condición; de ellos, 90 dan positivo. De los 900 sin la condición, 180 dan positivo (20% de falsos positivos). Total de positivos: 270. Probabilidad postest = 90/270 = 33%. La estimación intuitiva suele quedar muy por encima: cuando Casscells y colaboradores plantearon un problema análogo a médicos y estudiantes de Harvard, la respuesta más frecuente fue 95% donde la correcta rondaba el 2% — el error clásico de ignorar la probabilidad previa (Casscells et al., 1978; Hoffrage &amp; Gigerenzer, 1998). La lección de umbral: con 33%, el caso probablemente queda en la zona de "seguir testeando", no en la de tratar —salvo que el daño de omitir sea catastrófico y el tratamiento, benigno. Repetir este cálculo con las probabilidades del propio hospital (¿qué proporción de los "urocultivos positivos" de su servicio son infección?) suele ser más correctivo que cualquier lectura teórica.</w:t>
+        <w:t xml:space="preserve"> De 1.000 pacientes, 100 tienen la condición; de ellos, 90 dan positivo. De los 900 sin la condición, 180 dan positivo (20% de falsos positivos). Total de positivos: 270. Probabilidad postest = 90/270 = 33%. La estimación intuitiva suele quedar muy por encima. Cuando Casscells y colaboradores plantearon un problema análogo a médicos y estudiantes de Harvard, la respuesta más frecuente fue 95% donde la correcta rondaba el 2%: el error clásico de ignorar la probabilidad previa (Casscells et al., 1978; Hoffrage &amp; Gigerenzer, 1998). La lección de umbral: con 33%, el caso probablemente queda en la zona de «seguir testeando», no en la de tratar —salvo que el daño de omitir sea catastrófico y el tratamiento, benigno. Repetir este cálculo con las probabilidades del propio hospital (¿qué proporción de los «urocultivos positivos» de su servicio son infección?) suele ser más correctivo que cualquier lectura teórica.</w:t>
       </w:r>
     </w:p>
     <w:tbl>
@@ -7942,7 +7966,7 @@
               <w:pStyle w:val="Caption"/>
             </w:pPr>
             <w:r>
-              <w:t xml:space="preserve">Figura 13. El cálculo del Taller 10 en frecuencias naturales: de 270 resultados positivos, sólo 90 corresponden a la enfermedad. La probabilidad postest (33%) queda lejos de la certeza que la intuición atribuye a una "prueba positiva".</w:t>
+              <w:t xml:space="preserve">Figura 13. El cálculo del Taller 10 en frecuencias naturales: de 270 resultados positivos, sólo 90 corresponden a la enfermedad. La probabilidad postest (33%) queda lejos de la certeza que la intuición atribuye a una «prueba positiva».</w:t>
             </w:r>
           </w:p>
         </w:tc>
@@ -7981,7 +8005,7 @@
         <w:t xml:space="preserve">Solución comentada.</w:t>
       </w:r>
       <w:r>
-        <w:t xml:space="preserve"> El ejercicio suele revelar dos hallazgos. Primero: mientras la casilla de indicaciones biomédicas se llena sin esfuerzo, las otras tres exhiben lagunas que no corresponden a opiniones discutibles, sino a hechos clínicos nunca recabados: nadie preguntó con quién vive el paciente, la funcionalidad basal figura como "previamente autovalente" por simple arrastre documental sin evaluación objetiva, y las preferencias registradas son presunciones de la familia en lugar de la voz directa del enfermo. Segundo: completar las cuatro casillas rara vez cambia el aspecto técnico de la intervención, pero transforma de raíz la deliberación clínica: hace evidente con quién falta conversar, qué datos basales urge verificar y qué decisiones está tomando el equipo por pura inercia asistencial. Y cuando las cuatro casillas están completas y aun así persiste el desacuerdo, el ejercicio entrega un último diagnóstico crucial: el caso ya no requiere más exámenes; requiere deliberación estructurada y, a menudo, tiempo.</w:t>
+        <w:t xml:space="preserve"> El ejercicio suele revelar dos hallazgos. Primero: mientras la casilla de indicaciones biomédicas se llena sin esfuerzo, las otras tres exhiben lagunas que no son opiniones discutibles sino hechos nunca recabados. Nadie preguntó con quién vive el paciente; la funcionalidad basal figura como «previamente autovalente» por arrastre documental, sin evaluación objetiva; y las preferencias registradas son presunciones de la familia, no la voz directa del enfermo. Segundo: completar las cuatro casillas rara vez cambia el aspecto técnico de la intervención, pero transforma de raíz la deliberación. Hace evidente con quién falta conversar, qué datos basales urge verificar y qué decisiones está tomando el equipo por pura inercia asistencial. Y cuando las cuatro casillas están completas y aun así persiste el desacuerdo, el ejercicio entrega un último diagnóstico crucial: el caso ya no requiere más exámenes; requiere deliberación estructurada y, a menudo, tiempo.</w:t>
       </w:r>
     </w:p>
     <w:p>
@@ -8083,7 +8107,7 @@
         <w:pStyle w:val="BodyJ"/>
       </w:pPr>
       <w:r>
-        <w:t xml:space="preserve">"Está mejor." La frase se repite en cada entrega de turno y casi nunca alguien detiene la presentación para preguntar: ¿mejor en comparación con qué momento?, ¿mejor en qué variable fisiológica?, ¿mejor a qué velocidad? Un lactato arterial de 3 mmol/L puede ser una excelente noticia si desciende desde 6 mmol/L tras la reanimación inicial, o una señal ominosa si asciende desde 1,5 mmol/L. Este capítulo trata del tiempo: la dimensión clínica donde los datos cambian radicalmente de significado sin cambiar de valor numérico.</w:t>
+        <w:t xml:space="preserve">«Está mejor.» La frase se repite en cada entrega de turno y casi nunca alguien detiene la presentación para preguntar: ¿mejor en comparación con qué momento?, ¿mejor en qué variable fisiológica?, ¿mejor a qué velocidad? Un lactato arterial de 3 mmol/L puede ser una excelente noticia si desciende desde 6 mmol/L tras la reanimación inicial, o una señal ominosa si asciende desde 1,5 mmol/L. Este capítulo trata del tiempo: la dimensión clínica donde los datos cambian radicalmente de significado sin cambiar de valor numérico.</w:t>
       </w:r>
     </w:p>
     <w:p>
@@ -8116,7 +8140,7 @@
         <w:pStyle w:val="BodyJ"/>
       </w:pPr>
       <w:r>
-        <w:t xml:space="preserve">Pensar en trayectorias obliga a preguntar por el punto de comparación. "Mejor" carece de sentido sin un estado previo y un intervalo. "Recurrente" requiere definir episodios y recuperaciones. "Fracaso terapéutico" exige un objetivo, una dosis, un tiempo suficiente y un desenlace observado. La precisión temporal protege contra diagnósticos retrospectivos construidos con información que no estaba disponible al decidir.</w:t>
+        <w:t xml:space="preserve">Pensar en trayectorias obliga a preguntar por el punto de comparación. «Mejor» carece de sentido sin un estado previo y un intervalo. «Recurrente» requiere definir episodios y recuperaciones. «Fracaso terapéutico» exige un objetivo, una dosis, un tiempo suficiente y un desenlace observado. La precisión temporal protege contra diagnósticos retrospectivos construidos con información que no estaba disponible al decidir.</w:t>
       </w:r>
     </w:p>
     <w:p>
@@ -8149,15 +8173,15 @@
         <w:pStyle w:val="BodyJ"/>
       </w:pPr>
       <w:r>
-        <w:t xml:space="preserve">Los marcadores tienen, además, su propio tiempo, y leerlos sin él fabrica falsos fracasos. La proteína C reactiva empieza a subir unas seis horas después del estímulo, alcanza su máximo alrededor de las 48 y tiene una vida media de unas 19 horas (Pepys &amp; Hirschfield, 2003). Una PCR de las 48 horas más alta que la del ingreso, en una neumonía cuyo paciente ya está afebril, comiendo y sin oxígeno, no es un fracaso del antibiótico: es la cinética esperada de un estímulo reciente, y escalar el tratamiento por ella es tratar al número. Lo que informa es el cuarto día. En la cohorte de Edimburgo, una PCR de ingreso bajo 100 mg/L se asoció con menos complicaciones y menos mortalidad (Chalmers et al., 2008), y la caída de al menos la mitad al cuarto día se ha usado como marcador de estabilidad, aunque agrega poco a los criterios clínicos salvo para detectar la neumonía complicada (Akram et al., 2013). Es la lección del lactato del capítulo 1 con otro marcador: el estado del paciente manda sobre el número y la trayectoria manda sobre el valor aislado. Por eso una predicción útil lleva su plazo escrito: no "PCR en descenso", sino "PCR en descenso al cuarto día".</w:t>
-      </w:r>
-    </w:p>
-    <w:p>
-      <w:pPr>
-        <w:pStyle w:val="BodyJ"/>
-      </w:pPr>
-      <w:r>
-        <w:t xml:space="preserve">El tiempo también selecciona qué incertidumbres pueden tolerarse. En un paciente estable, observar puede producir información con bajo costo. En una amenaza tiempo-dependiente, esperar puede destruir la oportunidad terapéutica. "Esperar y observar" no es ausencia de conducta: es una intervención diagnóstica con condiciones de seguridad, variables de vigilancia y criterios de salida. Debe formularse qué se espera aprender, durante cuánto tiempo y qué cambio obligará a actuar.</w:t>
+        <w:t xml:space="preserve">Los marcadores tienen, además, su propio tiempo, y leerlos sin él fabrica falsos fracasos. La proteína C reactiva empieza a subir unas seis horas después del estímulo, alcanza su máximo alrededor de las 48 y tiene una vida media de unas 19 horas (Pepys &amp; Hirschfield, 2003). Una PCR de las 48 horas más alta que la del ingreso, en una neumonía cuyo paciente ya está afebril, comiendo y sin oxígeno, no es un fracaso del antibiótico sino la cinética esperada de un estímulo reciente. Escalar el tratamiento por ella es tratar al número. Lo que informa es el cuarto día. En la cohorte de Edimburgo, una PCR de ingreso bajo 100 mg/L se asoció con menos complicaciones y menos mortalidad (Chalmers et al., 2008). La caída de al menos la mitad al cuarto día se ha usado como marcador de estabilidad, aunque agrega poco a los criterios clínicos salvo para detectar la neumonía complicada (Akram et al., 2013). Es la lección del lactato del capítulo 1 con otro marcador: el estado del paciente manda sobre el número y la trayectoria manda sobre el valor aislado. Por eso una predicción útil lleva su plazo escrito: no «PCR en descenso», sino «PCR en descenso al cuarto día».</w:t>
+      </w:r>
+    </w:p>
+    <w:p>
+      <w:pPr>
+        <w:pStyle w:val="BodyJ"/>
+      </w:pPr>
+      <w:r>
+        <w:t xml:space="preserve">El tiempo también selecciona qué incertidumbres pueden tolerarse. En un paciente estable, observar puede producir información con bajo costo. En una amenaza tiempo-dependiente, esperar puede destruir la oportunidad terapéutica. «Esperar y observar» no es ausencia de conducta, sino una intervención diagnóstica con condiciones de seguridad, variables de vigilancia y criterios de salida. Debe formularse qué se espera aprender, durante cuánto tiempo y qué cambio obligará a actuar.</w:t>
       </w:r>
     </w:p>
     <w:p>
@@ -8203,6 +8227,14 @@
     </w:p>
     <w:p>
       <w:pPr>
+        <w:pStyle w:val="BodyJ"/>
+      </w:pPr>
+      <w:r>
+        <w:t xml:space="preserve">La geografía desplaza el umbral tanto como la velocidad. En un hospital insular, a cinco horas de vuelo del escáner y del cirujano más cercanos, una mujer de 40 años consulta a las 16:00 por dolor en la fosa iliaca derecha de doce horas, con fiebre baja y leucocitosis moderada; la ecografía no logra ver el apéndice. En la ciudad, el plan sería observación activa y tomografía si el dolor localiza. En la isla no hay tomografía, el avión ambulancia tarda horas en llegar y, pasada cierta hora, no despega hasta el día siguiente. La probabilidad de apendicitis es la misma en los dos lugares; lo que cambia es el costo de esperar. El «control a las 4 horas» del taller de este capítulo se convierte en «decidir antes de que cierre la ventana de evacuación», y por eso el umbral para trasladar es más bajo que el umbral para operar. La decisión defendible se escribe con la geografía dentro: «apendicitis probable, no demostrada; se solicita evacuación aeromédica ahora, porque la ventana de traslado vence antes que la ventana de observación». Esperar la certeza que el escáner daría es, aquí, elegir el error más caro.</w:t>
+      </w:r>
+    </w:p>
+    <w:p>
+      <w:pPr>
         <w:pStyle w:val="Heading3"/>
         <w:spacing w:after="120" w:before="280"/>
       </w:pPr>
@@ -8223,7 +8255,7 @@
         <w:pStyle w:val="BodyJ"/>
       </w:pPr>
       <w:r>
-        <w:t xml:space="preserve">Las afirmaciones causales contienen una comparación implícita: qué habría ocurrido sin la exposición, sin la enfermedad o sin la intervención. Ese escenario contrafactual no puede observarse simultáneamente en el mismo paciente. La inferencia causal utiliza comparadores, mecanismos, secuencia y diseños de estudio para aproximarse a él (Hernán &amp; Robins, 2020; Pearl &amp; Mackenzie, 2018). En clínica, los contrafactuales también sirven como disciplina mental: "si esta hipótesis fuera falsa, ¿qué patrón alternativo esperaría?"; "si no intervengo hoy, ¿qué desenlace evitable se vuelve plausible?"; "si operamos y el mecanismo supuesto no existe, ¿qué daño habremos causado?".</w:t>
+        <w:t xml:space="preserve">Las afirmaciones causales contienen una comparación implícita: qué habría ocurrido sin la exposición, sin la enfermedad o sin la intervención. Ese escenario contrafactual no puede observarse simultáneamente en el mismo paciente. La inferencia causal utiliza comparadores, mecanismos, secuencia y diseños de estudio para aproximarse a él (Hernán &amp; Robins, 2020; Pearl &amp; Mackenzie, 2018). En clínica, los contrafactuales también sirven como disciplina mental: «si esta hipótesis fuera falsa, ¿qué patrón alternativo esperaría?»; «si no intervengo hoy, ¿qué desenlace evitable se vuelve plausible?»; «si operamos y el mecanismo supuesto no existe, ¿qué daño habremos causado?».</w:t>
       </w:r>
     </w:p>
     <w:p>
@@ -8264,7 +8296,7 @@
         <w:pStyle w:val="BodyJ"/>
       </w:pPr>
       <w:r>
-        <w:t xml:space="preserve">Considere cómo se condensa un punto de inflexión en la ficha: "Cuarto episodio obstructivo en doce meses, por primera vez complicado con bacteriemia y shock séptico, lo que invalida la seguridad del manejo expectante previo." La frase no predice con certeza absoluta que una quinta obstrucción será letal. Expresa algo más riguroso: que la aceleración de las recurrencias y el salto cualitativo en gravedad han modificado la inferencia pronóstica y, al elevar el costo esperado de un nuevo evento, han desplazado el umbral a favor de una intervención electiva.</w:t>
+        <w:t xml:space="preserve">Considere cómo se condensa un punto de inflexión en la ficha: «Cuarto episodio obstructivo en doce meses, por primera vez complicado con bacteriemia y shock séptico, lo que invalida la seguridad del manejo expectante previo.» La frase no predice con certeza absoluta que una quinta obstrucción será letal. Expresa algo más riguroso: que la aceleración de las recurrencias y el salto cualitativo en gravedad han modificado la inferencia pronóstica. Al elevar el costo esperado de un nuevo evento, han desplazado el umbral a favor de una intervención electiva.</w:t>
       </w:r>
     </w:p>
     <w:p>
@@ -8296,7 +8328,7 @@
         <w:pStyle w:val="BodyJ"/>
       </w:pPr>
       <w:r>
-        <w:t xml:space="preserve">Un paciente con dolor abdominal inespecífico y exámenes iniciales tranquilizadores quedará hospitalizado o en urgencias "en observación". Redacte el plan en no más de cuatro líneas, de modo que la espera opere como una intervención diagnóstica estructurada y no como una postergación pasiva.</w:t>
+        <w:t xml:space="preserve">Un paciente con dolor abdominal inespecífico y exámenes iniciales tranquilizadores quedará hospitalizado o en urgencias «en observación». Redacte el plan en no más de cuatro líneas, de modo que la espera opere como una intervención diagnóstica estructurada y no como una postergación pasiva.</w:t>
       </w:r>
     </w:p>
     <w:p>
@@ -8311,7 +8343,23 @@
         <w:t xml:space="preserve">Solución comentada.</w:t>
       </w:r>
       <w:r>
-        <w:t xml:space="preserve"> Una formulación defendible es: "Observación clínica activa por dolor abdominal agudo en estudio, con probabilidad pretest baja pero no excluida de patología quirúrgica. Plan: reevaluación abdominal presencial a las 4 h (o antes si presenta dolor en ascenso, vómitos, fiebre o taquicardia &gt;100 lpm); control de parámetros inflamatorios a las 6 h. Si el dolor migra o localiza, aparece irritación peritoneal o no tolera prueba de vía oral, avisar al médico de turno de inmediato para solicitar tomografía. Si a las 8 h permanece afebril, sin dolor a la deambulación y tolerando régimen líquido, proceder al alta con pauta escrita de signos de alarma." Esta estructura explicita los cuatro pilares que validan al tiempo como prueba diagnóstica: qué se busca evaluar (la trayectoria del dolor y la tolerancia oral), en qué ventana temporal (4 a 8 horas), qué variables gatillan acción (con plazos y responsables definidos) y cuáles son los umbrales de salida en ambas direcciones (escalar el estudio o dar el alta). Compárese con la anotación habitual "control según evolución", una fórmula vacía que delega en el azar lo que debía quedar gobernado por el diseño del plan.</w:t>
+        <w:t xml:space="preserve"> Una formulación defendible es:</w:t>
+      </w:r>
+    </w:p>
+    <w:p>
+      <w:pPr>
+        <w:pStyle w:val="Quote1"/>
+      </w:pPr>
+      <w:r>
+        <w:t xml:space="preserve">Observación clínica activa por dolor abdominal agudo en estudio, con probabilidad pretest baja pero no excluida de patología quirúrgica. Plan: reevaluación abdominal presencial a las 4 h (o antes si presenta dolor en ascenso, vómitos, fiebre o taquicardia &gt;100 lpm); control de parámetros inflamatorios a las 6 h. Si el dolor migra o localiza, aparece irritación peritoneal o no tolera prueba de vía oral, avisar al médico de turno de inmediato para solicitar tomografía. Si a las 8 h permanece afebril, sin dolor a la deambulación y tolerando régimen líquido, proceder al alta con pauta escrita de signos de alarma.</w:t>
+      </w:r>
+    </w:p>
+    <w:p>
+      <w:pPr>
+        <w:pStyle w:val="BodyJ"/>
+      </w:pPr>
+      <w:r>
+        <w:t xml:space="preserve">Esta estructura explicita los cuatro pilares que validan al tiempo como prueba diagnóstica. Qué se busca evaluar: la trayectoria del dolor y la tolerancia oral. En qué ventana: 4 a 8 horas. Qué variables gatillan acción, con plazos y responsables definidos. Y cuáles son los umbrales de salida en ambas direcciones: escalar el estudio o dar el alta. Compárese con la anotación habitual «control según evolución», una fórmula vacía que delega en el azar lo que debía quedar gobernado por el diseño del plan.</w:t>
       </w:r>
     </w:p>
     <w:p>
@@ -8351,7 +8399,7 @@
         </w:numPr>
       </w:pPr>
       <w:r>
-        <w:t xml:space="preserve">"Está mejor": ¿mejor que cuándo, en qué variable y a qué velocidad?</w:t>
+        <w:t xml:space="preserve">«Está mejor»: ¿mejor que cuándo, en qué variable y a qué velocidad?</w:t>
       </w:r>
     </w:p>
     <w:p>
@@ -8375,7 +8423,7 @@
         </w:numPr>
       </w:pPr>
       <w:r>
-        <w:t xml:space="preserve">Mi "observación" de hoy, ¿tiene plazo, variables y criterio de salida, o es una espera sin diseño?</w:t>
+        <w:t xml:space="preserve">Mi «observación» de hoy, ¿tiene plazo, variables y criterio de salida, o es una espera sin diseño?</w:t>
       </w:r>
     </w:p>
     <w:p>
@@ -8413,7 +8461,7 @@
         <w:pStyle w:val="BodyJ"/>
       </w:pPr>
       <w:r>
-        <w:t xml:space="preserve">Abra la ficha clínica de cualquier paciente que lleve más de una semana hospitalizado y busque el párrafo que se repite intacto desde el ingreso. Casi siempre está ahí. Alguien lo redactó el primer día, otro lo copió y pegó el segundo, y desde entonces viaja en las evoluciones como un polizón: "paciente con antecedente de ITU a repetición", "en estudio por baja de peso", "se mantiene manejo habitual". Este capítulo aborda la ficha clínica como tecnología cognitiva: la diferencia entre un registro que sostiene el pensamiento y uno que lo fosiliza.</w:t>
+        <w:t xml:space="preserve">Abra la ficha clínica de cualquier paciente que lleve más de una semana hospitalizado y busque el párrafo que se repite intacto desde el ingreso. Casi siempre está ahí. Alguien lo redactó el primer día, otro lo copió y pegó el segundo, y desde entonces viaja en las evoluciones como un polizón: «paciente con antecedente de ITU a repetición», «en estudio por baja de peso», «se mantiene manejo habitual». Este capítulo aborda la ficha clínica como tecnología cognitiva: la diferencia entre un registro que sostiene el pensamiento y uno que lo fosiliza.</w:t>
       </w:r>
     </w:p>
     <w:p>
@@ -8471,7 +8519,7 @@
         <w:pStyle w:val="BodyJ"/>
       </w:pPr>
       <w:r>
-        <w:t xml:space="preserve">Foucault mostró que la clínica moderna no nació simplemente de mirar mejor, sino de reorganizar qué era decible y registrable: el hospital, la autopsia y el registro crearon un espacio donde ciertos fenómenos pudieron convertirse en signos y otros ni siquiera podían formularse (Foucault, 1966). La ficha contemporánea hace hoy ese mismo trabajo, silenciosamente. Sus campos deciden qué existe institucionalmente: si la plantilla tiene casilla para "dolor EVA" pero no hay lugar para "esta vez el dolor era otro", la primera afirmación sobrevivirá en el registro y la segunda morirá en el pasillo. Lo que no cabe en el formulario no se pierde por descuido; se pierde por diseño.</w:t>
+        <w:t xml:space="preserve">Foucault sostuvo que la clínica moderna no nació simplemente de mirar mejor, sino de reorganizar qué era decible y registrable. El hospital, la autopsia y el registro crearon un espacio donde ciertos fenómenos pudieron convertirse en signos y otros ni siquiera podían formularse (Foucault, 1966). La ficha contemporánea hace hoy ese mismo trabajo, silenciosamente. Sus campos deciden qué existe institucionalmente: si la plantilla tiene casilla para «dolor EVA» pero no hay lugar para «esta vez el dolor era otro», la primera afirmación sobrevivirá en el registro y la segunda morirá en el pasillo. Lo que no cabe en el formulario no se pierde por descuido; se pierde por diseño.</w:t>
       </w:r>
     </w:p>
     <w:p>
@@ -8487,7 +8535,7 @@
         <w:pStyle w:val="BodyJ"/>
       </w:pPr>
       <w:r>
-        <w:t xml:space="preserve">La crítica tiene una contraparte constructiva, y conviene nombrarla para quien diseña o compra sistemas. Una ficha electrónica pensada desde HII-D no guardaría un diagnóstico como texto libre ni como un código cerrado: lo guardaría como un objeto con atributos obligatorios — estado de verificación (provisional, diferencial, confirmado, refutado), fuente y fecha de cada hecho que lo sostiene, grado de la inferencia según el léxico del Apéndice B y fecha de reevaluación. Un "antecedente" sin autor ni fecha no podría copiarse a la nota siguiente sin arrastrar su procedencia, y una hipótesis que lleva diez días en estado "provisional" se volvería visible por sí sola. No exige una tecnología nueva: es la lógica de trazabilidad con que un laboratorio etiqueta cada muestra, aplicada a las afirmaciones. Mientras esa ficha no exista, el médico puede imitarla a mano: escribir el estado de la hipótesis junto a su nombre.</w:t>
+        <w:t xml:space="preserve">La crítica tiene una contraparte constructiva, y vale nombrarla para quien diseña o compra sistemas. Una ficha electrónica pensada desde HII-D no guardaría un diagnóstico como texto libre ni como un código cerrado. Lo guardaría como un objeto con atributos obligatorios: estado de verificación (provisional, diferencial, confirmado, refutado), fuente y fecha de cada hecho que lo sostiene, grado de la inferencia según el léxico del Apéndice B y fecha de reevaluación. Un «antecedente» sin autor ni fecha no podría copiarse a la nota siguiente sin arrastrar su procedencia, y una hipótesis que lleva diez días en estado «provisional» se volvería visible por sí sola. No exige una tecnología nueva: es la lógica de trazabilidad con que un laboratorio etiqueta cada muestra, aplicada a las afirmaciones. Mientras esa ficha no exista, el médico puede imitarla a mano: escribir el estado de la hipótesis junto a su nombre.</w:t>
       </w:r>
     </w:p>
     <w:p>
@@ -8512,15 +8560,15 @@
         <w:pStyle w:val="BodyJ"/>
       </w:pPr>
       <w:r>
-        <w:t xml:space="preserve">La lista de problemas es más que una colección de diagnósticos. Puede incluir síndromes, hallazgos no explicados, riesgos y decisiones pendientes. "Anemia" puede ser un problema; "probable sangrado digestivo oculto" es una inferencia; "endoscopia pendiente" es una acción; "etiología no aclarada" es incertidumbre. Al separarlos, la ficha evita que una hipótesis adquiera estatus de hecho por repetición.</w:t>
-      </w:r>
-    </w:p>
-    <w:p>
-      <w:pPr>
-        <w:pStyle w:val="BodyJ"/>
-      </w:pPr>
-      <w:r>
-        <w:t xml:space="preserve">El copiado automático amenaza esta función. Una formulación inicial se reproduce durante días, aun cuando la evidencia cambió. El registro deja de representar el estado actual y se transforma en fósil narrativo. La magnitud del fenómeno ya fue medida: en 23.630 notas de evolución hospitalarias con trazabilidad de cada carácter, sólo el 18% del texto había sido escrito a mano; el 46% venía copiado de notas previas y el 36% importado automáticamente desde otras partes del registro (Wang, Khanna &amp; Najafi, 2017). Cuatro de cada cinco palabras de una evolución típica no fueron pensadas el día en que aparecen firmadas. Cada evolución debería responder qué cambió en hechos, interpretación, incertidumbre y plan.</w:t>
+        <w:t xml:space="preserve">La lista de problemas es más que una colección de diagnósticos. Puede incluir síndromes, hallazgos no explicados, riesgos y decisiones pendientes. «Anemia» puede ser un problema; «probable sangrado digestivo oculto» es una inferencia; «endoscopia pendiente» es una acción; «etiología no aclarada» es incertidumbre. Al separarlos, la ficha evita que una hipótesis adquiera estatus de hecho por repetición.</w:t>
+      </w:r>
+    </w:p>
+    <w:p>
+      <w:pPr>
+        <w:pStyle w:val="BodyJ"/>
+      </w:pPr>
+      <w:r>
+        <w:t xml:space="preserve">El copiado automático amenaza esta función. Una formulación inicial se reproduce durante días, aun cuando la evidencia cambió. El registro deja de representar el estado actual y se transforma en fósil narrativo. La magnitud del fenómeno ya fue medida. En 23.630 notas de evolución hospitalarias con trazabilidad de cada carácter, sólo el 18% del texto había sido escrito a mano; el 46% venía copiado de notas previas y el 36% importado automáticamente desde otras partes del registro (Wang et al., 2017). Cuatro de cada cinco palabras de una evolución típica no fueron pensadas el día en que aparecen firmadas. Cada evolución debería responder qué cambió en hechos, interpretación, incertidumbre y plan.</w:t>
       </w:r>
     </w:p>
     <w:tbl>
@@ -8813,15 +8861,15 @@
         <w:pStyle w:val="BodyJ"/>
       </w:pPr>
       <w:r>
-        <w:t xml:space="preserve">Después de ordenar el caso, conviene formular una frase medular. No reemplaza la evolución completa; ofrece una representación operativa. Debe incluir la naturaleza del evento, el elemento que cambia el riesgo y el límite principal de certeza.</w:t>
-      </w:r>
-    </w:p>
-    <w:p>
-      <w:pPr>
-        <w:pStyle w:val="BodyJ"/>
-      </w:pPr>
-      <w:r>
-        <w:t xml:space="preserve">En el caso anterior: "Bacteriuria y piuria tras recambio de sonda Foley en paciente con vejiga neurogénica y antecedente de colonización multirresistente, sin signos sistémicos ni autonómicos que configuren infección activa; se difiere antibioterapia bajo vigilancia dirigida para evitar selección de resistencia."</w:t>
+        <w:t xml:space="preserve">Después de ordenar el caso, el paso siguiente es formular una frase medular. No reemplaza la evolución completa; ofrece una representación operativa. Debe incluir la naturaleza del evento, el elemento que cambia el riesgo y el límite principal de certeza.</w:t>
+      </w:r>
+    </w:p>
+    <w:p>
+      <w:pPr>
+        <w:pStyle w:val="BodyJ"/>
+      </w:pPr>
+      <w:r>
+        <w:t xml:space="preserve">En el caso anterior: «Bacteriuria y piuria tras recambio de sonda Foley en paciente con vejiga neurogénica y antecedente de colonización multirresistente, sin signos sistémicos ni autonómicos que configuren infección activa; se difiere antibioterapia bajo vigilancia dirigida para evitar selección de resistencia.»</w:t>
       </w:r>
     </w:p>
     <w:p>
@@ -8854,15 +8902,15 @@
         <w:pStyle w:val="BodyJ"/>
       </w:pPr>
       <w:r>
-        <w:t xml:space="preserve">"Neumonía. Ceftriaxona 2 g." Casi toda ficha contiene notas así, y casi nadie las considera incompletas: tienen un diagnóstico y un tratamiento, que es lo que la plantilla pide. Pero la flecha entre esas dos palabras esconde una cascada de decisiones que alguien tomó, o dejó de tomar, y que la nota no registra. ¿Tiene realmente neumonía, y en base a qué? ¿Requiere hospitalizarse, y en qué unidad? ¿Qué factores anuncian una evolución tórpida? ¿A qué microorganismos apunta la cobertura empírica, y cuáles quedan deliberadamente fuera? ¿Hay que cubrir anaerobios? ¿Qué complicación conviene descartar, y con qué? ¿Necesita oxígeno? ¿Se beneficia de corticoides, y qué lo vuelve riesgoso en este paciente? ¿Cuánto esperar para evaluar la respuesta, y con qué cinética se lee la PCR? Cada pregunta es un HII-D en miniatura; la nota de resultados las comprime todas en una preposición que ni siquiera está escrita.</w:t>
-      </w:r>
-    </w:p>
-    <w:p>
-      <w:pPr>
-        <w:pStyle w:val="BodyJ"/>
-      </w:pPr>
-      <w:r>
-        <w:t xml:space="preserve">Conviene distinguir, entonces, dos fichas que suelen confundirse. La ficha de resultados registra conclusiones y acciones: lo que se decidió. La ficha de proceso registra, además, los verbos que llevaron hasta ahí: qué se sospechó y por qué, de qué se dudó, qué se descartó y con qué método, qué se priorizó, qué se infirió y con qué grado, qué se realizó, qué se repitió, qué se comprobó y qué se aprendió. No es una lista de virtudes: es una gramática, y cada verbo cae en una capa del método. Sospechado e inferido son la capa I; dudado, descartado y priorizado son la incertidumbre; realizado y repetido son la decisión; comprobado y aprendido son la reevaluación. La ficha de resultados conjuga un solo verbo, "se indica", y por eso no puede ser auditada: no hay camino que recorrer.</w:t>
+        <w:t xml:space="preserve">«Neumonía. Ceftriaxona 2 g.» Casi toda ficha contiene notas así, y casi nadie las considera incompletas: tienen un diagnóstico y un tratamiento, que es lo que la plantilla pide. Pero la flecha entre esas dos palabras esconde una cascada de decisiones que alguien tomó, o dejó de tomar, y que la nota no registra. ¿Tiene realmente neumonía, y en base a qué? ¿Requiere hospitalizarse, y en qué unidad? ¿Qué factores anuncian una evolución tórpida? ¿A qué microorganismos apunta la cobertura empírica, y cuáles quedan deliberadamente fuera? ¿Hay que cubrir anaerobios? ¿Qué complicación conviene descartar, y con qué? ¿Necesita oxígeno? ¿Se beneficia de corticoides, y qué lo vuelve riesgoso en este paciente? ¿Cuánto esperar para evaluar la respuesta, y con qué cinética se lee la PCR? Cada pregunta es un HII-D en miniatura; la nota de resultados las comprime todas en una preposición que ni siquiera está escrita.</w:t>
+      </w:r>
+    </w:p>
+    <w:p>
+      <w:pPr>
+        <w:pStyle w:val="BodyJ"/>
+      </w:pPr>
+      <w:r>
+        <w:t xml:space="preserve">Hay, entonces, dos fichas que suelen confundirse. La ficha de resultados registra conclusiones y acciones: lo que se decidió. La ficha de proceso registra, además, los verbos que llevaron hasta ahí. Qué se sospechó y por qué; de qué se dudó; qué se descartó y con qué método; qué se priorizó; qué se infirió y con qué grado; qué se realizó; qué se repitió; qué se comprobó; qué se aprendió. No es una lista de virtudes: es una gramática, y cada verbo cae en una capa del método. Sospechado e inferido son la capa I; dudado, descartado y priorizado son la incertidumbre; realizado y repetido son la decisión; comprobado y aprendido son la reevaluación. La ficha de resultados conjuga un solo verbo, «se indica», y por eso no puede ser auditada: no hay camino que recorrer.</w:t>
       </w:r>
     </w:p>
     <w:p>
@@ -8875,26 +8923,26 @@
     </w:p>
     <w:p>
       <w:pPr>
-        <w:pStyle w:val="BodyJ"/>
-      </w:pPr>
-      <w:r>
-        <w:t xml:space="preserve">"Sospecho neumonía adquirida en la comunidad por fiebre de tres días, tos productiva, crépitos en la base derecha y opacidad nueva en la radiografía. Dudé de insuficiencia cardiaca (sin edema ni ingurgitación, radiografía sin congestión) y de embolia (sin factores de riesgo, dolor pleurítico ni hemoptisis): las degrado a poco probables, no las descarto. Descarto aspiración por anamnesis, no por imagen: no hubo vómito ni compromiso de conciencia. Priorizo la hipoxemia: saturación 92% ambiental y frecuencia respiratoria 26, oxígeno por naricera; sala y no intermedio, porque no hay hipotensión, confusión ni urea elevada. Infiero cobertura para neumococo y atípicos (ceftriaxona más macrólido); sin factores para Pseudomonas ni estafilococo resistente, sin indicación de anaerobios. Corticoides: no, sin criterios de gravedad; una diabetes descompensada elevaría además su costo. Comprobaré a las 72 horas con dos predicciones: afebril y con menos oxígeno; PCR en descenso al cuarto día. Repetiré imagen sólo si persiste la fiebre o aparece matidez: el derrame es la complicación que busco. Reabrir si a las 72 horas no se cumple alguna de las dos predicciones."</w:t>
-      </w:r>
-    </w:p>
-    <w:p>
-      <w:pPr>
-        <w:pStyle w:val="BodyJ"/>
-      </w:pPr>
-      <w:r>
-        <w:t xml:space="preserve">Dos de esas líneas cargan evidencia que conviene nombrar. El "no" a los corticoides se apoya en que su beneficio en mortalidad se demostró en neumonía grave tratada en cuidados intensivos —11,9% frente a 6,2% a los 28 días con hidrocortisona (Dequin et al., 2023)—, no en sala, y la nota lo dice con una palabra: "sin criterios de gravedad". Y el "sin indicación de anaerobios" es un descarte con método, el de la anamnesis que no encontró aspiración, y por eso puede revisarse si la anamnesis cambia. La nota de proceso es apenas más larga que "Neumonía. Ceftriaxona" si se cuentan las líneas que una evolución típica dedica a repetir lo de ayer, y es otra cosa: cualquiera que la lea mañana sabe qué se pensó, qué quedó abierto y qué desmentiría el plan. El riesgo que este capítulo ya advirtió —la nota que crece sin pensar— no se corre aquí: la ficha de proceso no escribe más; escribe lo que hoy no se escribe nunca.</w:t>
-      </w:r>
-    </w:p>
-    <w:p>
-      <w:pPr>
-        <w:pStyle w:val="BodyJ"/>
-      </w:pPr>
-      <w:r>
-        <w:t xml:space="preserve">El último verbo merece párrafo propio, porque es donde la ficha de resultados falla con más silencio: comprobar. "Neumonía. Ceftriaxona" no dice cuándo ni con qué se sabrá si funcionó, y así la respuesta se juzga con lo que llegue primero, que casi siempre es la PCR de las 48 horas. Si viene más alta que al ingreso, con el paciente afebril, comiendo y sin oxígeno, la nota de resultados no tiene con qué leerla y el reflejo es escalar el antibiótico. La ficha de proceso sí tiene con qué, porque escribió la predicción con su tiempo —la cinética del marcador que el capítulo 11 describió— y la dejó anotada antes de que llegara el resultado: "una PCR alta a las 48 horas con paciente bien no reabre el caso; una PCR que no cae al cuarto día, sí".</w:t>
+        <w:pStyle w:val="Quote1"/>
+      </w:pPr>
+      <w:r>
+        <w:t xml:space="preserve">Sospecho neumonía adquirida en la comunidad en un hombre de 67 años, diabético compensado, por fiebre de tres días, tos productiva, crépitos en la base derecha y opacidad nueva en la radiografía. Dudé de insuficiencia cardiaca (sin edema ni ingurgitación, radiografía sin congestión) y de embolia (sin factores de riesgo, dolor pleurítico ni hemoptisis): las degrado a poco probables, no las descarto. Descarto aspiración por anamnesis, no por imagen: no hubo vómito ni compromiso de conciencia. Priorizo la hipoxemia: saturación 92% ambiental y frecuencia respiratoria 26, oxígeno por naricera; sala y no intermedio, porque no hay hipotensión, confusión ni urea elevada. Infiero cobertura para neumococo y atípicos (ceftriaxona más macrólido); sin factores para Pseudomonas ni estafilococo resistente, sin indicación de anaerobios. Corticoides: no, sin criterios de gravedad, y su diabetes elevaría además el costo. Comprobaré a las 72 horas con dos predicciones: afebril y con menos oxígeno; PCR en descenso al cuarto día. Repetiré imagen sólo si persiste la fiebre o aparece matidez: el derrame es la complicación que busco. Reabrir si a las 72 horas no se cumple alguna de las dos predicciones.</w:t>
+      </w:r>
+    </w:p>
+    <w:p>
+      <w:pPr>
+        <w:pStyle w:val="BodyJ"/>
+      </w:pPr>
+      <w:r>
+        <w:t xml:space="preserve">Dos de esas líneas cargan evidencia que debe nombrarse. El «no» a los corticoides se apoya en que su beneficio en mortalidad se demostró en neumonía grave tratada en cuidados intensivos, no en sala: 6,2% con hidrocortisona frente a 11,9% con placebo a los 28 días (Dequin et al., 2023). La nota lo dice con una palabra: «sin criterios de gravedad». Y el «sin indicación de anaerobios» es un descarte con método, el de la anamnesis que no encontró aspiración, y por eso puede revisarse si la anamnesis cambia. La nota de proceso es apenas más larga que «Neumonía. Ceftriaxona» si se cuentan las líneas que una evolución típica dedica a repetir lo de ayer, y es otra cosa: cualquiera que la lea mañana sabe qué se pensó, qué quedó abierto y qué desmentiría el plan. El riesgo que este capítulo ya advirtió —la nota que crece sin pensar— no se corre aquí: la ficha de proceso no escribe más; escribe lo que hoy no se escribe nunca.</w:t>
+      </w:r>
+    </w:p>
+    <w:p>
+      <w:pPr>
+        <w:pStyle w:val="BodyJ"/>
+      </w:pPr>
+      <w:r>
+        <w:t xml:space="preserve">El último verbo pide párrafo propio, porque es donde la ficha de resultados falla con más silencio: comprobar. «Neumonía. Ceftriaxona» no dice cuándo ni con qué se sabrá si funcionó, y así la respuesta se juzga con lo que llegue primero, que casi siempre es la PCR de las 48 horas. Si viene más alta que al ingreso, con el paciente afebril, comiendo y sin oxígeno, la nota de resultados no tiene con qué leerla y el reflejo es escalar el antibiótico. La ficha de proceso sí tiene con qué, porque escribió la predicción con su tiempo, la cinética del marcador que el capítulo 11 describió. Y la dejó anotada antes de que llegara el resultado: «una PCR alta a las 48 horas con paciente bien no reabre el caso; una PCR que no cae al cuarto día, sí».</w:t>
       </w:r>
     </w:p>
     <w:p>
@@ -8919,15 +8967,15 @@
         <w:pStyle w:val="BodyJ"/>
       </w:pPr>
       <w:r>
-        <w:t xml:space="preserve">La nota clínica debe preservar el tiempo. "Actualmente estable" no borra shock previo; "sin dolor" después de analgesia no describe el ingreso; "imagen sin complicación" no garantiza el futuro. Las fechas y secuencias permiten distinguir respuesta, coincidencia y causalidad.</w:t>
-      </w:r>
-    </w:p>
-    <w:p>
-      <w:pPr>
-        <w:pStyle w:val="BodyJ"/>
-      </w:pPr>
-      <w:r>
-        <w:t xml:space="preserve">También debe registrar qué haría cambiar. "Reevaluar si fiebre o deterioro" es mejor que "control evolutivo", porque define el mecanismo de revisión. Una decisión sin criterio de reapertura se vuelve inercia.</w:t>
+        <w:t xml:space="preserve">La nota clínica debe preservar el tiempo. «Actualmente estable» no borra shock previo; «sin dolor» después de analgesia no describe el ingreso; «imagen sin complicación» no garantiza el futuro. Las fechas y secuencias permiten distinguir respuesta, coincidencia y causalidad.</w:t>
+      </w:r>
+    </w:p>
+    <w:p>
+      <w:pPr>
+        <w:pStyle w:val="BodyJ"/>
+      </w:pPr>
+      <w:r>
+        <w:t xml:space="preserve">También debe registrar qué haría cambiar. «Reevaluar si fiebre o deterioro» es mejor que «control evolutivo», porque define el mecanismo de revisión. Una decisión sin criterio de reapertura se vuelve inercia.</w:t>
       </w:r>
     </w:p>
     <w:p>
@@ -8951,7 +8999,7 @@
         <w:pStyle w:val="BodyJ"/>
       </w:pPr>
       <w:r>
-        <w:t xml:space="preserve">La siguiente nota se ha copiado casi idéntica durante cinco días seguidos: "Paciente cursando neumonía en tratamiento antibiótico, hemodinamia estable, afebril, se mantiene manejo". Al quinto día, los datos reales en la hoja de enfermería y en el sistema son: afebril, pero con requerimiento de oxígeno que subió de 2 a 4 L/min en 48 horas, PCR estacionaria (180→165 mg/L) y un derrame pleural nuevo en la radiografía de tórax de control. Reescriba la evolución del día 5 aplicando la estructura HII-D.</w:t>
+        <w:t xml:space="preserve">La siguiente nota se ha copiado casi idéntica durante cinco días seguidos: «Paciente cursando neumonía en tratamiento antibiótico, hemodinamia estable, afebril, se mantiene manejo». Al quinto día, los datos reales en la hoja de enfermería y en el sistema son otros. Sigue afebril, pero el requerimiento de oxígeno subió de 2 a 4 L/min en 48 horas, la PCR está estacionaria (180→165 mg/L) y hay un derrame pleural nuevo en la radiografía de tórax de control. Reescriba la evolución del día 5 aplicando la estructura HII-D.</w:t>
       </w:r>
     </w:p>
     <w:p>
@@ -8966,8 +9014,13 @@
         <w:t xml:space="preserve">Solución comentada.</w:t>
       </w:r>
       <w:r>
-        <w:t xml:space="preserve"> "</w:t>
-      </w:r>
+        <w:t xml:space="preserve"> La evolución desfosilizada:</w:t>
+      </w:r>
+    </w:p>
+    <w:p>
+      <w:pPr>
+        <w:pStyle w:val="Quote1"/>
+      </w:pPr>
       <w:r>
         <w:rPr>
           <w:i/>
@@ -9006,7 +9059,15 @@
         <w:t xml:space="preserve">Decisión:</w:t>
       </w:r>
       <w:r>
-        <w:t xml:space="preserve"> toracocentesis diagnóstica hoy, guiada por ecografía, y ajuste del esquema según el estudio del líquido; si el procedimiento no se concreta en 24 h, interconsulta a cirugía de tórax. Criterio de reapertura inmediata: cualquier incremento adicional en el aporte de oxígeno o taquipnea progresiva obliga a adelantar el drenaje." Nótese que la nota copiada durante cinco días no contenía mentiras literales —el paciente seguía afebril y normotenso—, pero operaba como un fósil narrativo: describía la fisiología del día 2 ignorando la trayectoria del día 5. Desfosilizar la evolución no exigió inventar datos sofisticados, sino dejar de omitir las tendencias que ya estaban a la vista.</w:t>
+        <w:t xml:space="preserve"> toracocentesis diagnóstica hoy, guiada por ecografía, y ajuste del esquema según el estudio del líquido; si el procedimiento no se concreta en 24 h, interconsulta a cirugía de tórax. Criterio de reapertura inmediata: cualquier incremento adicional en el aporte de oxígeno o taquipnea progresiva obliga a adelantar el drenaje.</w:t>
+      </w:r>
+    </w:p>
+    <w:p>
+      <w:pPr>
+        <w:pStyle w:val="BodyJ"/>
+      </w:pPr>
+      <w:r>
+        <w:t xml:space="preserve">Nótese que la nota copiada durante cinco días no contenía mentiras literales —el paciente seguía afebril y normotenso—, pero operaba como un fósil narrativo: describía la fisiología del día 2 ignorando la trayectoria del día 5. Desfosilizar la evolución no exigió inventar datos sofisticados, sino dejar de omitir las tendencias que ya estaban a la vista.</w:t>
       </w:r>
     </w:p>
     <w:p>
@@ -9022,7 +9083,7 @@
         <w:pStyle w:val="BodyJ"/>
       </w:pPr>
       <w:r>
-        <w:t xml:space="preserve">Tome su última evolución de una línea —"X en tratamiento, estable"— y escriba primero las preguntas que esconde (al menos seis). Después, reescríbala como ficha de proceso en no más de ocho líneas, con los verbos: sospecho, dudé, descarto, priorizo, infiero, realizo, comprobaré, repetiré, aprendí.</w:t>
+        <w:t xml:space="preserve">Tome su última evolución de una línea —«X en tratamiento, estable»— y escriba primero las preguntas que esconde (al menos seis). Después, reescríbala como ficha de proceso en no más de ocho líneas, con los verbos: sospecho, dudé, descarto, priorizo, infiero, realizo, comprobaré, repetiré, aprendí.</w:t>
       </w:r>
     </w:p>
     <w:p>
@@ -9037,7 +9098,7 @@
         <w:t xml:space="preserve">Solución comentada.</w:t>
       </w:r>
       <w:r>
-        <w:t xml:space="preserve"> No hay solución única. Lo que el ejercicio suele mostrar es que la mitad de las preguntas escondidas nunca se formularon (nadie dudó de nada porque nadie preguntó), que "descarté" casi nunca viene con método, y que "comprobaré" es el verbo que más cuesta conjugar, porque obliga a predecir y a ponerle fecha a la predicción. Si la ficha de proceso no cabe en ocho líneas, está describiendo y no decidiendo: no es la historia clínica completa, es el esqueleto de las decisiones. Y si cabe en dos, probablemente faltan verbos: una nota sin "dudé" ni "comprobaré" es una ficha de resultados con otro formato.</w:t>
+        <w:t xml:space="preserve"> No hay solución única. El ejercicio suele mostrar tres cosas. La mitad de las preguntas escondidas nunca se formularon: nadie dudó de nada porque nadie preguntó. «Descarté» casi nunca viene con método. Y «comprobaré» es el verbo que más cuesta conjugar, porque obliga a predecir y a ponerle fecha a la predicción. Si la ficha de proceso no cabe en ocho líneas, está describiendo y no decidiendo: no es la historia clínica completa, es el esqueleto de las decisiones. Y si cabe en dos, probablemente faltan verbos: una nota sin «dudé» ni «comprobaré» es una ficha de resultados con otro formato.</w:t>
       </w:r>
     </w:p>
     <w:p>
@@ -9139,7 +9200,7 @@
         <w:pStyle w:val="BodyJ"/>
       </w:pPr>
       <w:r>
-        <w:t xml:space="preserve">A las 02:00 de la madrugada, la enfermera de turno registra en su hoja: "paciente más quejumbrosa, rechaza la cena, diuresis en el límite inferior". A las 08:00, en la entrega de turno médica, el caso se resume en dos palabras: "sin novedades". Entre ambos registros no hay negligencia ni mala fe; hay una cadena de transmisión donde la señal clínica fue comprimida hasta desaparecer. Este capítulo trata del conocimiento clínico como propiedad distribuida de un equipo —médicos, enfermeras, técnicos, kinesiólogos, paciente, familia y sistemas de registro— y de cómo esa información se degrada, se discute y se comunica.</w:t>
+        <w:t xml:space="preserve">A las 02:00 de la madrugada, Paola, la enfermera de turno, registra en su hoja: «paciente más quejumbrosa, rechaza la cena, diuresis en el límite inferior». A las 08:00, en la entrega de turno médica, el caso se resume en dos palabras: «sin novedades». Entre ambos registros no hay negligencia ni mala fe; hay una cadena de transmisión donde la señal clínica fue comprimida hasta desaparecer. Este capítulo trata del conocimiento clínico como propiedad distribuida de un equipo —médicos, enfermeras, técnicos, kinesiólogos, paciente, familia y sistemas de registro— y de cómo esa información se degrada, se discute y se comunica.</w:t>
       </w:r>
     </w:p>
     <w:p>
@@ -9172,15 +9233,15 @@
         <w:pStyle w:val="BodyJ"/>
       </w:pPr>
       <w:r>
-        <w:t xml:space="preserve">En una unidad hospitalaria, la enfermera puede reconocer primero un cambio de perfusión; el laboratorio produce una medición crítica; el sistema decide cómo la muestra se etiqueta y cuándo el resultado se hace visible; el médico integra el patrón; un familiar aporta la trayectoria basal; una hoja de balance conserva información que ninguna memoria individual podría reconstruir. La decisión emerge de esa red. La responsabilidad profesional permanece, pero el objeto metacognitivo debe ampliarse: no sólo "¿cómo pensé?", sino "¿cómo circuló y se transformó la información?".</w:t>
-      </w:r>
-    </w:p>
-    <w:p>
-      <w:pPr>
-        <w:pStyle w:val="BodyJ"/>
-      </w:pPr>
-      <w:r>
-        <w:t xml:space="preserve">Volvamos al registro de enfermería de las 02:00. "Más quejumbrosa, rechaza la cena, diuresis en el límite" contiene tres hechos de pleno derecho que ninguna evolución médica de esa mañana recogió. Primero, un cambio respecto del basal, detectado por quien evalúa a la paciente cada dos horas y no una vez al día. Segundo, una conducta —dejar de comer cuando venía alimentándose bien— que es signo clínico precoz y no anécdota doméstica. Tercero, una pendiente descendente que antecede por horas a la hipotensión que activará las alarmas. Es la observación profesional en su dimensión más valiosa: la serie temporal corta, un dominio sobre el cual enfermería posee un acceso epistémico privilegiado. Cuando la entrega de turno de las 08:00 tradujo todo eso como "sin novedades", no faltó a la verdad deliberadamente: aplicó a los datos de enfermería un filtro de irrelevancia que jamás aplicaría a un examen de laboratorio. La cognición distribuida comienza cuando el equipo reconoce quién tiene el mejor puesto de observación para cada fenómeno. El de enfermería es el intervalo de veinte horas entre una visita médica y la siguiente: exactamente donde los pacientes hospitalizados empiezan a deteriorarse.</w:t>
+        <w:t xml:space="preserve">En una unidad hospitalaria, la enfermera puede reconocer primero un cambio de perfusión; el laboratorio produce una medición crítica; el sistema decide cómo la muestra se etiqueta y cuándo el resultado se hace visible. El médico integra el patrón, un familiar aporta la trayectoria basal y una hoja de balance conserva información que ninguna memoria individual podría reconstruir. La decisión emerge de esa red. La responsabilidad profesional permanece, pero el objeto metacognitivo debe ampliarse: no sólo «¿cómo pensé?», sino «¿cómo circuló y se transformó la información?».</w:t>
+      </w:r>
+    </w:p>
+    <w:p>
+      <w:pPr>
+        <w:pStyle w:val="BodyJ"/>
+      </w:pPr>
+      <w:r>
+        <w:t xml:space="preserve">Vale la pena volver al registro de enfermería de las 02:00. «Más quejumbrosa, rechaza la cena, diuresis en el límite» contiene tres hechos clínicos completos que ninguna evolución médica de esa mañana recogió. Primero, un cambio respecto del basal, detectado por quien evalúa a la paciente cada dos horas y no una vez al día. Segundo, una conducta —dejar de comer cuando venía alimentándose bien— que es signo clínico precoz y no anécdota doméstica. Tercero, una pendiente descendente que antecede por horas a la hipotensión que activará las alarmas. Es la observación profesional en su dimensión más valiosa: la serie temporal corta, un dominio sobre el cual enfermería posee un acceso epistémico privilegiado. Cuando la entrega de turno de las 08:00 tradujo todo eso como «sin novedades», no faltó a la verdad deliberadamente: aplicó a los datos de enfermería un filtro de irrelevancia que jamás aplicaría a un examen de laboratorio. La cognición distribuida comienza cuando el equipo reconoce quién tiene el mejor puesto de observación para cada fenómeno. El de enfermería es el intervalo de veinte horas entre una visita médica y la siguiente: justo donde los pacientes hospitalizados empiezan a deteriorarse.</w:t>
       </w:r>
     </w:p>
     <w:p>
@@ -9205,15 +9266,15 @@
         <w:pStyle w:val="BodyJ"/>
       </w:pPr>
       <w:r>
-        <w:t xml:space="preserve">Ningún dato clínico viaja intacto a través de una institución. En cada entrega de turno, interconsulta telefónica o resumen de traslado, la información se selecciona, se comprime y se reinterpreta. "Paciente estable" puede esconder un requerimiento de oxígeno que se duplicó en silencio. "Urocultivo positivo" suele perder en el camino que el paciente es usuario crónico de sonda y está asintomático. "TAC sin complicaciones agudas" se traduce, sin que nadie lo decida, como "hernia no complicada", y borra el hecho de que la paciente ingresó en shock séptico. Y los artefactos tecnológicos también editorializan: la interfaz de la ficha electrónica jerarquiza ciertas casillas, esconde las notas de otros estamentos en pestañas separadas y fuerza realidades clínicas continuas dentro de menús desplegables administrativos.</w:t>
-      </w:r>
-    </w:p>
-    <w:p>
-      <w:pPr>
-        <w:pStyle w:val="BodyJ"/>
-      </w:pPr>
-      <w:r>
-        <w:t xml:space="preserve">Rajkomar y Blandford mostraron cómo la administración de infusiones en UCI puede comprenderse mediante cognición distribuida, atendiendo a la interacción entre profesionales, bombas, prescripciones y entorno (Rajkomar &amp; Blandford, 2012). La lección es general: muchos errores que parecen "de una persona" son fallas de propagación, representación o coordinación. El sistema puede aumentar la capacidad cognitiva mediante redundancia y memoria externa, pero también fragmentar la situación y ocultar señales.</w:t>
+        <w:t xml:space="preserve">Ningún dato clínico viaja intacto a través de una institución. En cada entrega de turno, interconsulta telefónica o resumen de traslado, la información se selecciona, se comprime y se reinterpreta. «Paciente estable» puede esconder un requerimiento de oxígeno que se duplicó en silencio. «Urocultivo positivo» suele perder en el camino que el paciente es usuario crónico de sonda y está asintomático. «TAC sin complicaciones agudas» se traduce, sin que nadie lo decida, como «hernia no complicada», y borra el hecho de que la paciente ingresó en shock séptico. Y los artefactos tecnológicos también editorializan: la interfaz de la ficha electrónica jerarquiza ciertas casillas, esconde las notas de otros estamentos en pestañas separadas y fuerza realidades clínicas continuas dentro de menús desplegables administrativos.</w:t>
+      </w:r>
+    </w:p>
+    <w:p>
+      <w:pPr>
+        <w:pStyle w:val="BodyJ"/>
+      </w:pPr>
+      <w:r>
+        <w:t xml:space="preserve">Rajkomar y Blandford describieron cómo la administración de infusiones en UCI puede comprenderse mediante cognición distribuida, atendiendo a la interacción entre profesionales, bombas, prescripciones y entorno (Rajkomar &amp; Blandford, 2012). La lección es general: muchos errores que parecen «de una persona» son fallas de propagación, representación o coordinación. El sistema puede aumentar la capacidad cognitiva mediante redundancia y memoria externa, pero también fragmentar la situación y ocultar señales.</w:t>
       </w:r>
     </w:p>
     <w:p>
@@ -9254,7 +9315,7 @@
         <w:pStyle w:val="BodyJ"/>
       </w:pPr>
       <w:r>
-        <w:t xml:space="preserve">No todo desacuerdo tiene igual valor. Debe traducirse a proposiciones evaluables: "no comparto que exista infección porque los hallazgos se explican mejor por colonización y no hay cambio fisiológico"; "acepto que la probabilidad de isquemia es baja, pero considero inaceptable el daño de perderla"; "estamos de acuerdo en los hechos, pero usamos distintos umbrales de intervención". Esta traducción muestra si la discrepancia está en datos, inferencias, incertidumbre, valores o decisión.</w:t>
+        <w:t xml:space="preserve">No todo desacuerdo tiene igual valor. Debe traducirse a proposiciones evaluables. Por ejemplo: «no comparto que exista infección porque los hallazgos se explican mejor por colonización y no hay cambio fisiológico»; «acepto que la probabilidad de isquemia es baja, pero considero inaceptable el daño de perderla»; «estamos de acuerdo en los hechos, pero usamos distintos umbrales de intervención». Esta traducción muestra si la discrepancia está en datos, inferencias, incertidumbre, valores o decisión.</w:t>
       </w:r>
     </w:p>
     <w:p>
@@ -9320,15 +9381,15 @@
         <w:pStyle w:val="BodyJ"/>
       </w:pPr>
       <w:r>
-        <w:t xml:space="preserve">Muchos clínicos temen que expresar incertidumbre debilite la confianza del paciente o del equipo. El resultado puede ser un lenguaje excesivamente categórico. El dilema es falso: la alternativa a la certeza no es desorientación. Es una explicación estructurada de lo que se sabe, lo que se sospecha, lo que importa y qué se hará.</w:t>
-      </w:r>
-    </w:p>
-    <w:p>
-      <w:pPr>
-        <w:pStyle w:val="BodyJ"/>
-      </w:pPr>
-      <w:r>
-        <w:t xml:space="preserve">La confianza clínica no depende sólo de parecer seguro. Depende de competencia, honestidad, presencia y continuidad. Una frase como "no sabemos nada" abandona; "no puedo asegurar todavía la causa, pero hemos descartado las amenazas inmediatas más probables, vigilaremos estos cambios y repetiremos la evaluación en este plazo" transforma incertidumbre en plan.</w:t>
+        <w:t xml:space="preserve">Muchos clínicos temen que expresar incertidumbre debilite la confianza del paciente o del equipo. El resultado puede ser un lenguaje excesivamente categórico. El dilema es falso: la alternativa a la certeza no es la desorientación, sino una explicación estructurada de lo que se sabe, lo que se sospecha, lo que importa y qué se hará.</w:t>
+      </w:r>
+    </w:p>
+    <w:p>
+      <w:pPr>
+        <w:pStyle w:val="BodyJ"/>
+      </w:pPr>
+      <w:r>
+        <w:t xml:space="preserve">La confianza clínica no depende sólo de parecer seguro. Depende de competencia, honestidad, presencia y continuidad. Una frase como «no sabemos nada» abandona; «no puedo asegurar todavía la causa, pero hemos descartado las amenazas inmediatas más probables, vigilaremos estos cambios y repetiremos la evaluación en este plazo» transforma incertidumbre en plan.</w:t>
       </w:r>
     </w:p>
     <w:p>
@@ -9428,7 +9489,7 @@
         <w:pStyle w:val="BodyJ"/>
       </w:pPr>
       <w:r>
-        <w:t xml:space="preserve">La decisión, además, no ocurre dentro de una distribución estadística sino en una biografía (Greenhalgh &amp; Hurwitz, 1998; Charon, 2006): el mismo riesgo es aceptable para una persona e inaceptable para otra según responsabilidades, experiencias previas y concepción de la calidad de vida, y escuchar la historia corrige inferencias — "mala adherencia" puede ser imposibilidad económica, "rechazo" una experiencia anterior, "síntoma funcional" una invalidación vivida. El lenguaje del médico abre o cierra esa posibilidad de conocimiento.</w:t>
+        <w:t xml:space="preserve">La decisión, además, no ocurre dentro de una distribución estadística sino en una biografía (Greenhalgh &amp; Hurwitz, 1998; Charon, 2006). El mismo riesgo es aceptable para una persona e inaceptable para otra según responsabilidades, experiencias previas y concepción de la calidad de vida. Y escuchar la historia corrige inferencias: «mala adherencia» puede ser imposibilidad económica, «rechazo» una experiencia anterior, «síntoma funcional» una invalidación vivida. El lenguaje del médico abre o cierra esa posibilidad de conocimiento.</w:t>
       </w:r>
     </w:p>
     <w:p>
@@ -9453,23 +9514,23 @@
         <w:pStyle w:val="BodyJ"/>
       </w:pPr>
       <w:r>
-        <w:t xml:space="preserve">En las entregas de turno, la frase "está cubierto" suele ocultar supuestos. Es preferible nombrar quién verificará un resultado, qué diagnóstico no debe perderse y qué cambio exige avisar. La incertidumbre compartida se convierte en tarea distribuida.</w:t>
-      </w:r>
-    </w:p>
-    <w:p>
-      <w:pPr>
-        <w:pStyle w:val="BodyJ"/>
-      </w:pPr>
-      <w:r>
-        <w:t xml:space="preserve">Hay una gramática para eso, y la escribió un chileno. Flores, con Winograd, describió el trabajo coordinado como una red de "conversaciones para la acción": alguien pide, alguien promete, la promesa tiene condiciones de satisfacción y un plazo, y se cierra con una declaración de cumplimiento o de incumplimiento (Winograd &amp; Flores, 1986). Leída así, una entrega de turno no transfiere información: distribuye compromisos. "Está cubierto" es una promesa sin dueño ni condiciones; "el hemocultivo lo revisa la residente de noche a las 2:00 y avisa si crece un gramnegativo" es una promesa completa, con quién, qué, cuándo y cómo se sabrá que se cumplió. Es la pregunta de Austin del capítulo 4 —qué acaba de hacer esta oración— aplicada a la frase más frecuente del hospital. La incertidumbre no desaparece al entregarla; cambia de dueño, y la gramática de Flores obliga a decir a quién.</w:t>
-      </w:r>
-    </w:p>
-    <w:p>
-      <w:pPr>
-        <w:pStyle w:val="BodyJ"/>
-      </w:pPr>
-      <w:r>
-        <w:t xml:space="preserve">Las jerarquías influyen. Si el médico más senior presenta una hipótesis como hecho, los demás pueden dejar de ofrecer datos discordantes. Una formulación como "mi impresión principal es X; me preocupa Y por esta razón; ¿qué dato no encaja?" conserva liderazgo y abre corrección.</w:t>
+        <w:t xml:space="preserve">En las entregas de turno, la frase «está cubierto» suele ocultar supuestos. Es preferible nombrar quién verificará un resultado, qué diagnóstico no debe perderse y qué cambio exige avisar. La incertidumbre compartida se convierte en tarea distribuida.</w:t>
+      </w:r>
+    </w:p>
+    <w:p>
+      <w:pPr>
+        <w:pStyle w:val="BodyJ"/>
+      </w:pPr>
+      <w:r>
+        <w:t xml:space="preserve">Hay una gramática para eso, y la escribió un chileno. Flores, con Winograd, describió el trabajo coordinado como una red de «conversaciones para la acción»: alguien pide, alguien promete, la promesa tiene condiciones de satisfacción y un plazo, y se cierra con una declaración de cumplimiento o de incumplimiento (Winograd &amp; Flores, 1986). Leída así, una entrega de turno no transfiere información: distribuye compromisos. «Está cubierto» es una promesa sin dueño ni condiciones. «El hemocultivo lo revisa la residente de noche a las 2:00 y avisa si crece un gramnegativo» es una promesa completa: quién, qué, cuándo y cómo se sabrá que se cumplió. Es la pregunta de Austin del capítulo 4 —qué acaba de hacer esta oración— aplicada a la frase más frecuente del hospital. La incertidumbre no desaparece al entregarla; cambia de dueño, y la gramática de Flores obliga a decir a quién.</w:t>
+      </w:r>
+    </w:p>
+    <w:p>
+      <w:pPr>
+        <w:pStyle w:val="BodyJ"/>
+      </w:pPr>
+      <w:r>
+        <w:t xml:space="preserve">Las jerarquías influyen. Si el médico más senior presenta una hipótesis como hecho, los demás pueden dejar de ofrecer datos discordantes. Una formulación como «mi impresión principal es X; me preocupa Y por esta razón; ¿qué dato no encaja?» conserva liderazgo y abre corrección.</w:t>
       </w:r>
     </w:p>
     <w:p>
@@ -9494,7 +9555,7 @@
         <w:pStyle w:val="BodyJ"/>
       </w:pPr>
       <w:r>
-        <w:t xml:space="preserve">Cada palabra de certeza distribuye responsabilidad. "Descartado" puede cerrar vigilancia; "probable" puede justificar tratamiento; "posible" puede generar estudios de bajo valor. La modalidad epistémica tiene efectos. Por ello, su uso es también una cuestión ética.</w:t>
+        <w:t xml:space="preserve">Cada palabra de certeza distribuye responsabilidad. «Descartado» puede cerrar vigilancia; «probable» puede justificar tratamiento; «posible» puede generar estudios de bajo valor. La modalidad epistémica tiene efectos. Por ello, su uso es también una cuestión ética.</w:t>
       </w:r>
     </w:p>
     <w:p>
@@ -9510,7 +9571,7 @@
         <w:pStyle w:val="BodyJ"/>
       </w:pPr>
       <w:r>
-        <w:t xml:space="preserve">Después de un error, preguntar "¿quién se equivocó?" puede ser necesario, pero rara vez es suficiente. También debe preguntarse dónde se originó la información, en qué transformación perdió significado, qué señales estaban disponibles, quién podía contradecir la hipótesis y por qué el sistema no aprendió antes. La lucidez de un equipo se mide menos por la ausencia imposible de errores que por su capacidad de hacerlos visibles, limitarlos y convertirlos en conocimiento compartido.</w:t>
+        <w:t xml:space="preserve">Después de un error, preguntar «¿quién se equivocó?» puede ser necesario, pero rara vez es suficiente. También debe preguntarse dónde se originó la información, en qué transformación perdió significado, qué señales estaban disponibles, quién podía contradecir la hipótesis y por qué el sistema no aprendió antes. La lucidez de un equipo se mide menos por la ausencia imposible de errores que por su capacidad de hacerlos visibles, limitarlos y convertirlos en conocimiento compartido.</w:t>
       </w:r>
     </w:p>
     <w:p>
@@ -9526,7 +9587,7 @@
         <w:pStyle w:val="BodyJ"/>
       </w:pPr>
       <w:r>
-        <w:t xml:space="preserve">En la entrega de turno de la mañana, al discutir el caso de Carmen, el intensivista plantea: "Yo la operaría en esta hospitalización; si la mandamos a la casa, esto se va a volver a obstruir". La internista replica: "Operarla ahora me parece apresurado; acaba de salir de un shock séptico grave". Traduzca esta fricción verbal a proposiciones evaluables: ¿están discrepando en los hechos, en las inferencias, en la incertidumbre, en los valores o en el umbral de decisión?</w:t>
+        <w:t xml:space="preserve">En la entrega de turno de la mañana, al discutir el caso de Carmen, el intensivista plantea: «Yo la operaría en esta hospitalización; si la mandamos a la casa, esto se va a volver a obstruir». La internista replica: «Operarla ahora me parece apresurado; acaba de salir de un shock séptico grave». Traduzca esta fricción verbal a proposiciones evaluables: ¿están discrepando en los hechos, en las inferencias, en la incertidumbre, en los valores o en el umbral de decisión?</w:t>
       </w:r>
     </w:p>
     <w:p>
@@ -9581,7 +9642,7 @@
         <w:t xml:space="preserve">umbral de decisión</w:t>
       </w:r>
       <w:r>
-        <w:t xml:space="preserve">: cuánto riesgo quirúrgico programado es razonable asumir hoy para evitar el riesgo incierto de una urgencia futura, una ponderación que exige los </w:t>
+        <w:t xml:space="preserve">: cuánto riesgo quirúrgico programado es razonable asumir hoy para evitar el riesgo incierto de una urgencia futura. Esa ponderación exige los </w:t>
       </w:r>
       <w:r>
         <w:rPr>
@@ -9591,7 +9652,7 @@
         <w:t xml:space="preserve">valores</w:t>
       </w:r>
       <w:r>
-        <w:t xml:space="preserve"> y temores de la propia Carmen, que aún no ha sido escuchada. Traducida la discusión a esta matriz, el plan de trabajo se redacta solo: objetivar la capacidad funcional, optimizar su condición respiratoria y nutricional, y sentarse a conversar con Carmen sobre ambos escenarios de riesgo. Ninguno de los dos médicos "ganó" la discusión: el equipo utilizó el desacuerdo para diagnosticar qué información le faltaba.</w:t>
+        <w:t xml:space="preserve"> y temores de la propia Carmen, que aún no ha sido escuchada. Traducida la discusión a esta matriz, el plan de trabajo se redacta solo: objetivar la capacidad funcional, optimizar su condición respiratoria y nutricional, y sentarse a conversar con Carmen sobre ambos escenarios de riesgo. Ninguno de los dos médicos «ganó» la discusión: el equipo utilizó el desacuerdo para diagnosticar qué información le faltaba.</w:t>
       </w:r>
     </w:p>
     <w:p>
@@ -9701,31 +9762,31 @@
         <w:pStyle w:val="BodyJ"/>
       </w:pPr>
       <w:r>
-        <w:t xml:space="preserve">La cirujana no abre el diálogo proponiendo el pabellón. Empieza por la arquitectura del problema, en cuatro estaciones: "Le voy a explicar con calma qué sabemos con seguridad, qué creemos que puede pasar, qué cosas no podemos asegurarle y qué caminos tenemos. Lo que sabemos: usted tiene una hernia que en los últimos doce meses se ha atascado cuatro veces. En este último episodio llegó muy grave, con una infección que pasó a la sangre y la presión tan baja que necesitó medicamentos especiales en la UCI. Lo que creemos: que la probabilidad de que la hernia vuelva a obstruirse es alta, y que un quinto episodio podría ser igual o más grave que este; nadie puede predecir en qué fecha ocurrirá. Lo que no sabemos: si la operación será técnicamente sencilla, porque su abdomen ya tiene cicatrices internas de antes, ni cómo se comportará su pulmón con la anestesia. Ese riesgo quirúrgico existe y no es menor. Las opciones son dos. Programamos la cirugía ahora que usted ya recuperó fuerzas, de día y con todo el equipo preparado. O se va de alta sin operar, asumiendo que la próxima obstrucción puede ocurrir de madrugada, de urgencia y con usted en peores condiciones".</w:t>
-      </w:r>
-    </w:p>
-    <w:p>
-      <w:pPr>
-        <w:pStyle w:val="BodyJ"/>
-      </w:pPr>
-      <w:r>
-        <w:t xml:space="preserve">Carmen hace la pregunta que casi todo paciente formula cuando la incertidumbre se pone sobre la mesa: "Doctora, ¿y usted qué haría en mi lugar?". La cirujana no rehúye la recomendación ni usurpa la decisión: "Yo le recomiendo operarse, Carmen, y le digo por qué. Prefiero un riesgo quirúrgico conocido, con usted compensada y en un pabellón programado, a un episodio de urgencia que no controlamos. Pero la que vivió la angustia del shock fue usted, y la que decide a cuál de esos dos riesgos le teme más también es usted".</w:t>
-      </w:r>
-    </w:p>
-    <w:p>
-      <w:pPr>
-        <w:pStyle w:val="BodyJ"/>
-      </w:pPr>
-      <w:r>
-        <w:t xml:space="preserve">La hija pregunta si la operación "garantiza" que el problema no se repetirá. "No", responde la cirujana sin rodeos. "Baja mucho la probabilidad, pero no la lleva a cero. Si le prometiera garantías absolutas, le estaría faltando a la verdad".</w:t>
-      </w:r>
-    </w:p>
-    <w:p>
-      <w:pPr>
-        <w:pStyle w:val="BodyJ"/>
-      </w:pPr>
-      <w:r>
-        <w:t xml:space="preserve">Carmen guarda silencio unos segundos y luego dice más de lo que el equipo le ha escuchado en toda la hospitalización: "Yo no quiero volver a pasar una noche como la que pasé al llegar. Pensé que me moría, y vi en la cara de mi hija que ella pensó lo mismo. Pero tampoco quiero que me operen por operar: en mi cirugía antigua demoré meses en poder enderezarme bien. Lo único que necesito saber, doctora, es si después de recuperarme voy a poder seguir cuidando a mi nieta en las tardes".</w:t>
+        <w:t xml:space="preserve">La cirujana no abre el diálogo proponiendo el pabellón. Empieza por la arquitectura del problema, en cuatro estaciones: «Le voy a explicar con calma qué sabemos con seguridad, qué creemos que puede pasar, qué cosas no podemos asegurarle y qué caminos tenemos. Lo que sabemos: usted tiene una hernia que en los últimos doce meses se ha atascado cuatro veces. En este último episodio llegó muy grave, con una infección que pasó a la sangre y la presión tan baja que necesitó medicamentos especiales en la UCI. Lo que creemos: que la probabilidad de que la hernia vuelva a obstruirse es alta, y que un quinto episodio podría ser igual o más grave que este; nadie puede predecir en qué fecha ocurrirá. Lo que no sabemos: si la operación será técnicamente sencilla, porque su abdomen ya tiene cicatrices internas de antes, ni cómo se comportará su pulmón con la anestesia. Ese riesgo quirúrgico existe y no es menor. Las opciones son dos. Programamos la cirugía ahora que usted ya recuperó fuerzas, de día y con todo el equipo preparado. O se va de alta sin operar, asumiendo que la próxima obstrucción puede ocurrir de madrugada, de urgencia y con usted en peores condiciones».</w:t>
+      </w:r>
+    </w:p>
+    <w:p>
+      <w:pPr>
+        <w:pStyle w:val="BodyJ"/>
+      </w:pPr>
+      <w:r>
+        <w:t xml:space="preserve">Carmen hace la pregunta que casi todo paciente formula cuando la incertidumbre se pone sobre la mesa: «Doctora, ¿y usted qué haría en mi lugar?». La cirujana no rehúye la recomendación ni usurpa la decisión: «Yo le recomiendo operarse, Carmen, y le digo por qué. Prefiero un riesgo quirúrgico conocido, con usted compensada y en un pabellón programado, a un episodio de urgencia que no controlamos. Pero la que vivió la angustia del shock fue usted, y la que decide a cuál de esos dos riesgos le teme más también es usted».</w:t>
+      </w:r>
+    </w:p>
+    <w:p>
+      <w:pPr>
+        <w:pStyle w:val="BodyJ"/>
+      </w:pPr>
+      <w:r>
+        <w:t xml:space="preserve">La hija pregunta si la operación «garantiza» que el problema no se repetirá. «No», responde la cirujana sin rodeos. «Baja mucho la probabilidad, pero no la lleva a cero. Si le prometiera garantías absolutas, le estaría faltando a la verdad».</w:t>
+      </w:r>
+    </w:p>
+    <w:p>
+      <w:pPr>
+        <w:pStyle w:val="BodyJ"/>
+      </w:pPr>
+      <w:r>
+        <w:t xml:space="preserve">Carmen guarda silencio unos segundos y luego dice más de lo que el equipo le ha escuchado en toda la hospitalización: «Yo no quiero volver a pasar una noche como la que pasé al llegar. Pensé que me moría, y vi en la cara de mi hija que ella pensó lo mismo. Pero tampoco quiero que me operen por operar: en mi cirugía antigua demoré meses en poder enderezarme bien. Lo único que necesito saber, doctora, es si después de recuperarme voy a poder seguir cuidando a mi nieta en las tardes».</w:t>
       </w:r>
     </w:p>
     <w:p>
@@ -9741,7 +9802,15 @@
         <w:pStyle w:val="BodyJ"/>
       </w:pPr>
       <w:r>
-        <w:t xml:space="preserve">Carmen acepta operarse. De regreso en la estación de enfermería, la internista redacta la frase medular que condensa una semana de deliberación clínica: "Obstrucción intestinal recurrente por hernia incisional, cuarto episodio anual y primero complicado con shock séptico y bacteriemia por gramnegativos; tomografía sin isquemia aguda. El salto cualitativo en gravedad, la aceleración de las recurrencias y la preferencia informada de la paciente —seguir cuidando a su nieta y evitar una nueva urgencia vital— justifican reparación electiva tras optimización. Se asume un riesgo perioperatorio moderado como alternativa preferible al manejo expectante. Criterio de reapertura: suspender programación y reevaluar si presenta deterioro respiratorio o nuevo evento obstructivo previo a la fecha de pabellón."</w:t>
+        <w:t xml:space="preserve">Carmen acepta operarse. De regreso en la estación de enfermería, la internista redacta la frase medular que condensa una semana de deliberación clínica:</w:t>
+      </w:r>
+    </w:p>
+    <w:p>
+      <w:pPr>
+        <w:pStyle w:val="Quote1"/>
+      </w:pPr>
+      <w:r>
+        <w:t xml:space="preserve">Obstrucción intestinal recurrente por hernia incisional, cuarto episodio anual y primero complicado con shock séptico y bacteriemia por gramnegativos; tomografía sin isquemia aguda. El salto cualitativo en gravedad, la aceleración de las recurrencias y la preferencia informada de la paciente —seguir cuidando a su nieta y evitar una nueva urgencia vital— justifican reparación electiva tras optimización. Se asume un riesgo perioperatorio moderado como alternativa preferible al manejo expectante. Criterio de reapertura: suspender programación y reevaluar si presenta deterioro respiratorio o nuevo evento obstructivo previo a la fecha de pabellón.</w:t>
       </w:r>
     </w:p>
     <w:p>
@@ -9812,7 +9881,7 @@
         <w:pStyle w:val="BodyJ"/>
       </w:pPr>
       <w:r>
-        <w:t xml:space="preserve">Hay una frase de tres palabras que me tomó años aprender a pronunciar frente a la familia de un paciente grave: "no lo sé". La primera vez que me atreví a decirla completa —"todavía no sé con certeza por qué empeoró hoy; pero sí sé qué complicaciones graves ya descartamos, sé qué variables vamos a vigilar esta noche y sé a qué hora de mañana tendremos nuevos resultados"— temía provocar desconfianza o angustia. Encontré exactamente lo contrario: alivio. Esa familia no exigía que yo fuera omnisciente; necesitaba saber que nuestra incertidumbre estaba gobernada por un plan. Este capítulo trata de la distancia moral y técnica que separa el aparentar seguridad del ejercer responsabilidad.</w:t>
+        <w:t xml:space="preserve">Hay una frase de tres palabras que me tomó años aprender a pronunciar frente a la familia de un paciente grave: «no lo sé». La primera vez que me atreví a decirla completa —«todavía no sé con certeza por qué empeoró hoy; pero sí sé qué complicaciones graves ya descartamos, sé qué variables vamos a vigilar esta noche y sé a qué hora de mañana tendremos nuevos resultados»— temía provocar desconfianza o angustia. Encontré exactamente lo contrario: alivio. Esa familia no exigía que yo fuera omnisciente; necesitaba saber que nuestra incertidumbre estaba gobernada por un plan. Este capítulo trata de la distancia moral y técnica que separa el aparentar seguridad del ejercer responsabilidad.</w:t>
       </w:r>
     </w:p>
     <w:p>
@@ -9837,15 +9906,15 @@
         <w:pStyle w:val="BodyJ"/>
       </w:pPr>
       <w:r>
-        <w:t xml:space="preserve">Una frase clínica no es moralmente neutra. Puede activar una cirugía, justificar aislamiento, etiquetar a una persona, limitar tratamientos o fijar una interpretación que otros repetirán. Cuando escribimos "rechaza", "no adherente", "funcional", "terminal" o "sin indicación", no sólo describimos. Distribuimos credibilidad, urgencia y recursos. La ética del razonamiento comienza antes de la decisión: comienza en la forma en que se recibe un testimonio y se concede fuerza a una afirmación.</w:t>
-      </w:r>
-    </w:p>
-    <w:p>
-      <w:pPr>
-        <w:pStyle w:val="BodyJ"/>
-      </w:pPr>
-      <w:r>
-        <w:t xml:space="preserve">Conviene decirlo sin rodeos, porque el resto del capítulo lo presupone: pensar bien es parte de la ética primordial del médico, no un refinamiento intelectual que se agrega a ella. Es su herramienta principal, de la que parte todo lo demás — y en la que, cuando falla, termina todo lo demás. La idea tiene un antecedente filosófico exacto. Clifford sostuvo en 1877 que creer algo sin evidencia suficiente es siempre, en todo lugar y para cualquiera, un acto reprochable, y lo ilustró con un armador que, sin inspeccionar su barco, se convence de que es seguro y lo deja zarpar: si el barco llega a puerto, el armador no es menos culpable, porque la creencia se formó sin derecho a formarse (Clifford, 1877). La medicina es el oficio donde esa tesis deja de ser una exageración. El médico que escribe "se descarta" sin un método que excluya, o "cuadro habitual" sin haber mirado las rodillas moteadas, ha hecho exactamente lo del armador, y un desenlace benigno no lo absuelve; la viñeta 6 lo dice al revés: el mismo proceso con una crisis de pánico real habría sido igual de indefendible. Por eso el deber de pensar bien no se agota en la competencia. Incluye el deber de saber cuándo uno no está en condiciones de pensar bien (capítulo 8) y de organizar el trabajo para que otro instrumento revise el juicio. La ética clínica no empieza en el comité ni en el consentimiento; empieza en la calidad de la creencia que sostiene la primera frase de la ficha.</w:t>
+        <w:t xml:space="preserve">Una frase clínica no es moralmente neutra. Puede activar una cirugía, justificar aislamiento, etiquetar a una persona, limitar tratamientos o fijar una interpretación que otros repetirán. Quien escribe «rechaza», «no adherente», «funcional», «terminal» o «sin indicación» no sólo describe. Distribuye credibilidad, urgencia y recursos. La ética del razonamiento comienza antes de la decisión: comienza en la forma en que se recibe un testimonio y se concede fuerza a una afirmación.</w:t>
+      </w:r>
+    </w:p>
+    <w:p>
+      <w:pPr>
+        <w:pStyle w:val="BodyJ"/>
+      </w:pPr>
+      <w:r>
+        <w:t xml:space="preserve">Hay que decirlo de entrada, porque el resto del capítulo lo presupone: pensar bien es parte de la ética primordial del médico, no un refinamiento intelectual que se agrega a ella. Es su herramienta principal, de la que parte todo lo demás — y en la que, cuando falla, termina todo lo demás. La idea tiene un antecedente filosófico exacto. Clifford sostuvo en 1877 que creer algo sin evidencia suficiente es siempre, en todo lugar y para cualquiera, un acto reprochable (Clifford, 1877). Lo ilustró con un armador que, sin inspeccionar su barco, se convence de que es seguro y lo deja zarpar. Si el barco llega a puerto, el armador no es menos culpable, porque la creencia se formó sin derecho a formarse. La medicina es el oficio donde esa tesis deja de ser una exageración. El médico que escribe «se descarta» sin un método que excluya, o «cuadro habitual» sin haber mirado las rodillas moteadas, ha hecho lo del armador, y un desenlace benigno no lo absuelve. La viñeta 6 lo dice al revés: el mismo proceso con una crisis de pánico real habría sido igual de indefendible. Por eso el deber de pensar bien no se agota en la competencia. Incluye el deber de saber cuándo uno no está en condiciones de pensar bien (capítulo 8) y de organizar el trabajo para que otro instrumento revise el juicio. La ética clínica no empieza en el comité ni en el consentimiento; empieza en la calidad de la creencia que sostiene la primera frase de la ficha.</w:t>
       </w:r>
     </w:p>
     <w:p>
@@ -9886,7 +9955,7 @@
         <w:pStyle w:val="BodyJ"/>
       </w:pPr>
       <w:r>
-        <w:t xml:space="preserve">La falsa seguridad daña porque cierra la revisión y puede engañar al paciente. La duda indiscriminada también daña: transfiere carga, paraliza decisiones o abandona a la persona bajo una apariencia de neutralidad. La virtud está en calibrar. Decir "no lo sé" es profesional cuando se acompaña de qué sí se sabe, qué se hará, qué riesgo se vigila y cuándo se reevaluará.</w:t>
+        <w:t xml:space="preserve">La falsa seguridad daña porque cierra la revisión y puede engañar al paciente. La duda indiscriminada también daña: transfiere carga, paraliza decisiones o abandona a la persona bajo una apariencia de neutralidad. La virtud está en calibrar. Decir «no lo sé» es profesional cuando se acompaña de qué sí se sabe, qué se hará, qué riesgo se vigila y cuándo se reevaluará.</w:t>
       </w:r>
     </w:p>
     <w:p>
@@ -9911,7 +9980,7 @@
         <w:pStyle w:val="BodyJ"/>
       </w:pPr>
       <w:r>
-        <w:t xml:space="preserve">Hay una caricatura de la humildad epistémica que conviene desactivar: la del médico tibio, que afirma poco por miedo a equivocarse. Esa figura confunde humildad con timidez. La filosofía contemporánea de las virtudes intelectuales ofrece una definición más útil: ser intelectualmente humilde es atender a las propias limitaciones y apropiárselas — saber dónde termina lo que uno sabe, y dejar que ese saber actúe (Whitcomb et al., 2017). Definida así, la humildad no es un freno. Es un motor: la única disposición que mantiene el caso abierto después de que ya tenemos una respuesta que funciona.</w:t>
+        <w:t xml:space="preserve">Hay una caricatura de la humildad epistémica que es preciso desactivar: la del médico tibio, que afirma poco por miedo a equivocarse. Esa figura confunde humildad con timidez. La filosofía contemporánea de las virtudes intelectuales ofrece una definición más útil: ser intelectualmente humilde es atender a las propias limitaciones y apropiárselas — saber dónde termina lo que uno sabe, y dejar que ese saber actúe (Whitcomb et al., 2017). Definida así, la humildad no es un freno. Es un motor: la única disposición que mantiene el caso abierto después de que ya hay una respuesta que funciona.</w:t>
       </w:r>
     </w:p>
     <w:p>
@@ -9927,31 +9996,31 @@
         <w:pStyle w:val="BodyJ"/>
       </w:pPr>
       <w:r>
-        <w:t xml:space="preserve">Segundo, permite seguir aprendiendo. El feedback sólo enseña a quien puede recibirlo sin tratarlo como acusación. El portafolio de calibración, la conferencia de morbimortalidad, la corrección venida de cualquier miembro del equipo —de la enfermera de turno al propio paciente— funcionan únicamente sobre esa base. Un médico que no puede ser corregido no es un médico seguro: es un médico que dejó de aprender, con años de práctica acumulándose sobre los mismos errores.</w:t>
-      </w:r>
-    </w:p>
-    <w:p>
-      <w:pPr>
-        <w:pStyle w:val="BodyJ"/>
-      </w:pPr>
-      <w:r>
-        <w:t xml:space="preserve">Tercero —y es el efecto más clínico de todos—, permite reubicar el foco y el manejo. La dirección de la atención diagnóstica no es un voto de por vida: es una asignación provisional de recursos, revisable cuando la trayectoria contradice el mapa. El humilde redirige sin vivirlo como derrota — de lo urinario a lo abdominal, de la lesión estructural al trastorno funcional, del objetivo curativo al de confort — y ajusta el tratamiento con la misma naturalidad con que lo inició. El orgulloso, en cambio, defiende su primera formulación como se defiende una propiedad, y convierte cada dato discordante en un ataque que repeler. El anclaje es, visto así, un fracaso de humildad antes que un fallo de memoria: la información nueva estaba disponible; lo que faltó fue la disposición a dejarla mandar.</w:t>
-      </w:r>
-    </w:p>
-    <w:p>
-      <w:pPr>
-        <w:pStyle w:val="BodyJ"/>
-      </w:pPr>
-      <w:r>
-        <w:t xml:space="preserve">Vista así, la humildad no es una virtud separada de la phronesis que este libro viene invocando desde el capítulo 6: es su condición de funcionamiento. La prudencia práctica integra, en el caso particular, lo que ningún algoritmo integra por nosotros — conocimiento causal, emoción leída como dato, valores del paciente y oportunidad: el momento de actuar ahora o esperar. Esa integración sólo permanece honesta si alguien vigila sus límites, y la humildad es exactamente eso: la phronesis vuelta sobre sí misma, la parte de la prudencia que sabe cuánta de la propia prudencia es conjetura. Con ella queda a la vista el hilo que el libro venía tendiendo: el capítulo 2 mostró la abducción — la conjetura que crea explicaciones —; el capítulo 5, la metacognición que la vigila mientras trabaja; la humildad es la disposición que la mantiene abierta cuando ya produjo una respuesta cómoda. Generar, vigilar, mantener abierto: tres nombres de una misma lealtad al caso. Y conviene recordar la corrección de Varela que el capítulo 6 aceptó: esa lealtad no es vigilancia continua —el experto responde sin deliberar, y deliberar sin motivo lo degrada—, sino la disposición a reconocer el quiebre, el momento en que el saber hacer dejó de bastar.</w:t>
-      </w:r>
-    </w:p>
-    <w:p>
-      <w:pPr>
-        <w:pStyle w:val="BodyJ"/>
-      </w:pPr>
-      <w:r>
-        <w:t xml:space="preserve">Por eso este libro necesita la humildad no como ornamento ético sino como pieza estructural. La reevaluación del método HII-D es humildad convertida en procedimiento: la cláusula "qué me haría cambiar", escrita antes de saber si habrá que cambiar, es la forma que toma esta virtud cuando se la obliga a dejar huella en la ficha.</w:t>
+        <w:t xml:space="preserve">Segundo, permite seguir aprendiendo. El feedback sólo enseña a quien puede recibirlo sin tratarlo como acusación. El portafolio de calibración, la conferencia de morbimortalidad, la corrección venida de cualquier miembro del equipo —de la enfermera de turno al propio paciente— funcionan únicamente sobre esa base. Un médico que no puede ser corregido no es un médico seguro, sino uno que dejó de aprender, con años de práctica acumulándose sobre los mismos errores.</w:t>
+      </w:r>
+    </w:p>
+    <w:p>
+      <w:pPr>
+        <w:pStyle w:val="BodyJ"/>
+      </w:pPr>
+      <w:r>
+        <w:t xml:space="preserve">Tercero —y es el efecto más clínico de todos—, permite reubicar el foco y el manejo. La dirección de la atención diagnóstica no es un voto de por vida, sino una asignación provisional de recursos, revisable cuando la trayectoria contradice el mapa. El humilde redirige sin vivirlo como derrota — de lo urinario a lo abdominal, de la lesión estructural al trastorno funcional, del objetivo curativo al de confort — y ajusta el tratamiento con la misma naturalidad con que lo inició. El orgulloso, en cambio, defiende su primera formulación como se defiende una propiedad, y convierte cada dato discordante en un ataque que repeler. El anclaje es, visto así, un fracaso de humildad antes que un fallo de memoria: la información nueva estaba disponible; lo que faltó fue la disposición a dejarla mandar.</w:t>
+      </w:r>
+    </w:p>
+    <w:p>
+      <w:pPr>
+        <w:pStyle w:val="BodyJ"/>
+      </w:pPr>
+      <w:r>
+        <w:t xml:space="preserve">Vista así, la humildad no es una virtud separada de la phronesis que este libro viene invocando desde el capítulo 6: es su condición de funcionamiento. La prudencia práctica integra, en el caso particular, lo que ningún algoritmo integra por el clínico — conocimiento causal, emoción leída como dato, valores del paciente y oportunidad: el momento de actuar ahora o esperar. Esa integración sólo permanece honesta si alguien vigila sus límites, y la humildad es eso: la phronesis vuelta sobre sí misma, la parte de la prudencia que sabe cuánta de la propia prudencia es conjetura. Con ella queda a la vista el hilo que el libro venía tendiendo. El capítulo 2 mostró la abducción, la conjetura que crea explicaciones; el capítulo 5, la metacognición que la vigila mientras trabaja; la humildad es la disposición que la mantiene abierta cuando ya produjo una respuesta cómoda. Generar, vigilar, mantener abierto: tres nombres de una misma lealtad al caso. Y queda la corrección de Varela que el capítulo 6 aceptó: esa lealtad no es vigilancia continua —el experto responde sin deliberar, y deliberar sin motivo lo degrada—, sino la disposición a reconocer el quiebre, el momento en que el saber hacer dejó de bastar.</w:t>
+      </w:r>
+    </w:p>
+    <w:p>
+      <w:pPr>
+        <w:pStyle w:val="BodyJ"/>
+      </w:pPr>
+      <w:r>
+        <w:t xml:space="preserve">Por eso este libro necesita la humildad no como ornamento ético sino como pieza estructural. La reevaluación del método HII-D es humildad convertida en procedimiento: la cláusula «qué me haría cambiar», escrita antes de saber si habrá que cambiar, es la forma que toma esta virtud cuando se la obliga a dejar huella en la ficha.</w:t>
       </w:r>
     </w:p>
     <w:p>
@@ -9976,15 +10045,15 @@
         <w:pStyle w:val="BodyJ"/>
       </w:pPr>
       <w:r>
-        <w:t xml:space="preserve">Miranda Fricker denominó injusticia epistémica al daño cometido contra alguien en su capacidad de sujeto de conocimiento (Fricker, 2007). En salud, Carel y Kidd mostraron cómo el testimonio de pacientes puede recibir menor credibilidad o carecer de categorías interpretativas adecuadas, y cómo la propia experiencia de enfermar agudiza esa vulnerabilidad epistémica (Carel &amp; Kidd, 2014; Kidd &amp; Carel, 2017). El enfermo posee un conocimiento de primera persona sobre dolor, cambio funcional, tolerancia, valores y trayectoria cotidiana que no puede ser sustituido por mediciones externas. Ese conocimiento tampoco es infalible, pero merece evaluación y no descarte reflejo.</w:t>
-      </w:r>
-    </w:p>
-    <w:p>
-      <w:pPr>
-        <w:pStyle w:val="BodyJ"/>
-      </w:pPr>
-      <w:r>
-        <w:t xml:space="preserve">La filosofía del testimonio ayuda a precisar qué significa "evaluar sin descartar". Contra la sospecha heredada del empirismo —que creerle a otro es siempre conocimiento de segunda categoría—, Coady mostró que el testimonio es una fuente básica de conocimiento, tan constitutiva como la percepción o la memoria: sin una confianza por defecto en lo que otros informan, ni la ciencia ni la vida cotidiana serían posibles (Coady, 1992). Lackey corrigió el exceso opuesto: la confianza por defecto no es un cheque en blanco; el oyente responsable mantiene una sensibilidad activa a las señales de error o engaño, y el conocimiento testimonial se logra cuando ambas condiciones —decir fiable y escuchar vigilante— se cumplen a la vez (Lackey, 2008). La anamnesis es exactamente ese contrato epistémico: el paciente aporta un informe que el médico no puede obtener por ninguna otra vía, y el médico aporta el examen de consistencia, forma temporal y relación con otros hallazgos. Ni credulidad ni auditoría hostil: recepción con estándares. La injusticia testimonial es, en estos términos, un fallo del segundo contratante: aplicar a ciertos hablantes un estándar de vigilancia que no se aplica a otros, por razones que nada tienen que ver con la fiabilidad de su informe.</w:t>
+        <w:t xml:space="preserve">Miranda Fricker denominó injusticia epistémica al daño cometido contra alguien en su capacidad de sujeto de conocimiento (Fricker, 2007). En salud, Carel y Kidd describieron cómo el testimonio de pacientes puede recibir menor credibilidad o carecer de categorías interpretativas adecuadas, y cómo la propia experiencia de enfermar agudiza esa vulnerabilidad epistémica (Carel &amp; Kidd, 2014; Kidd &amp; Carel, 2017). El enfermo posee un conocimiento de primera persona sobre dolor, cambio funcional, tolerancia, valores y trayectoria cotidiana que no puede ser sustituido por mediciones externas. Ese conocimiento tampoco es infalible, pero exige evaluación y no descarte reflejo.</w:t>
+      </w:r>
+    </w:p>
+    <w:p>
+      <w:pPr>
+        <w:pStyle w:val="BodyJ"/>
+      </w:pPr>
+      <w:r>
+        <w:t xml:space="preserve">La filosofía del testimonio ayuda a precisar qué significa «evaluar sin descartar». Contra la sospecha heredada del empirismo —que creerle a otro es siempre conocimiento de segunda categoría—, Coady sostuvo que el testimonio es una fuente básica de conocimiento, tan constitutiva como la percepción o la memoria. Sin una confianza por defecto en lo que otros informan, ni la ciencia ni la vida cotidiana serían posibles (Coady, 1992). Lackey corrigió el exceso opuesto: la confianza por defecto no es un cheque en blanco; el oyente responsable mantiene una sensibilidad activa a las señales de error o engaño, y el conocimiento testimonial se logra cuando ambas condiciones —decir fiable y escuchar vigilante— se cumplen a la vez (Lackey, 2008). La anamnesis es ese contrato epistémico: el paciente aporta un informe que el médico no puede obtener por ninguna otra vía, y el médico aporta el examen de consistencia, forma temporal y relación con otros hallazgos. Ni credulidad ni auditoría hostil: recepción con estándares. La injusticia testimonial es, en estos términos, un fallo del segundo contratante: aplicar a ciertos hablantes un estándar de vigilancia que no se aplica a otros, por razones que nada tienen que ver con la fiabilidad de su informe.</w:t>
       </w:r>
     </w:p>
     <w:p>
@@ -10000,7 +10069,7 @@
         <w:pStyle w:val="BodyJ"/>
       </w:pPr>
       <w:r>
-        <w:t xml:space="preserve">Practicar una escucha epistémicamente justa exige preguntarse qué información privilegiada posee este paciente a la cual ningún monitor ni laboratorio tiene acceso, qué significado le atribuye a sus propios síntomas y qué biografía previa modela su aversión al riesgo. Exige, además, no confundir una discrepancia de valores con un déficit de comprensión: un enfermo puede entender perfectamente la evidencia médica y, aun así, jerarquizar los desenlaces de otro modo. Cuando Carmen advirtió en urgencias que "esta vez la hernia no se dejó acomodar y el dolor era otro", estaba entregando el indicador pronóstico más fino de todo su ingreso. Una nota clínica que hubiera borrado esa frase para traducirla como "dolor abdominal en paciente con hernia conocida" no habría cometido sólo una falta de empatía o una injusticia testimonial; habría cometido una amputación técnica de los datos. La regla general merece quedar escrita: una ficha que silencia el testimonio del enfermo es epistemológicamente más pobre, y cualquier frase medular que excluya la voz del paciente —cuando esa voz contiene el dato discriminante del cambio clínico— fracasa según su propio estándar de rigor.</w:t>
+        <w:t xml:space="preserve">Practicar una escucha epistémicamente justa exige preguntarse qué información privilegiada posee este paciente a la cual ningún monitor ni laboratorio tiene acceso, qué significado le atribuye a sus propios síntomas y qué biografía previa modela su aversión al riesgo. Exige, además, no confundir una discrepancia de valores con un déficit de comprensión: un enfermo puede entender perfectamente la evidencia médica y, aun así, jerarquizar los desenlaces de otro modo. Cuando Carmen advirtió en urgencias que «esta vez la hernia no se dejó acomodar y el dolor era otro», estaba entregando el indicador pronóstico más fino de todo su ingreso. Una nota clínica que hubiera borrado esa frase para traducirla como «dolor abdominal en paciente con hernia conocida» no habría cometido sólo una falta de empatía o una injusticia testimonial; habría cometido una amputación técnica de los datos. La regla general puede quedar escrita: una ficha que silencia el testimonio del enfermo es epistemológicamente más pobre, y cualquier frase medular que excluya la voz del paciente —cuando esa voz contiene el dato discriminante del cambio clínico— fracasa según su propio estándar de rigor.</w:t>
       </w:r>
     </w:p>
     <w:p>
@@ -10066,7 +10135,7 @@
         <w:pStyle w:val="BodyJ"/>
       </w:pPr>
       <w:r>
-        <w:t xml:space="preserve">Hay una variable que ningún modelo del razonamiento clínico incluye y que opera todos los días: el miedo. Miedo a la demanda, al reclamo, a la auditoría, al pasillo. Ese miedo no se queda en el cuerpo del médico; escribe en la ficha. La documentación defensiva —notas redactadas para un abogado imaginario y no para el siguiente lector clínico— es su síntoma más visible, y es un corruptor epistémico de primer orden: donde la frase medular busca hacer auditable el razonamiento, la nota defensiva busca hacerlo inatacable, que es casi lo contrario. Se omiten las dudas (podrían "usarse en contra"), se multiplican los exámenes cuya única indicación es la constancia, se prefiere la vaguedad que no compromete a la precisión que expone. El resultado es una ficha que protege menos de lo que cree: ante cualquier revisión seria, la nota vaga sin criterios de reapertura parece ocultamiento, mientras que la nota que muestra qué se sabía, qué se dudaba y cuándo se planeó reevaluar demuestra exactamente lo que el derecho sanitario pondera — un proceso razonable con la información disponible. La trazabilidad honesta no es ingenuidad jurídica; es la mejor defensa que la epistemología puede ofrecer, además de la única compatible con seguir pensando.</w:t>
+        <w:t xml:space="preserve">Hay una variable que ningún modelo del razonamiento clínico incluye y que opera todos los días: el miedo. Miedo a la demanda, al reclamo, a la auditoría, al pasillo. Ese miedo no se queda en el cuerpo del médico; escribe en la ficha. La documentación defensiva —notas redactadas para un abogado imaginario y no para el siguiente lector clínico— es su síntoma más visible, y es un corruptor epistémico de primer orden: donde la frase medular busca hacer auditable el razonamiento, la nota defensiva busca hacerlo inatacable, que es casi lo contrario. Se omiten las dudas (podrían «usarse en contra»), se multiplican los exámenes cuya única indicación es la constancia, se prefiere la vaguedad que no compromete a la precisión que expone. El resultado es una ficha que protege menos de lo que cree. Ante cualquier revisión seria, la nota vaga sin criterios de reapertura parece ocultamiento. La nota que muestra qué se sabía, qué se dudaba y cuándo se planeó reevaluar demuestra, en cambio, lo que el derecho sanitario pondera: un proceso razonable con la información disponible. La trazabilidad honesta no es ingenuidad jurídica; es la mejor defensa que la epistemología puede ofrecer, además de la única compatible con seguir pensando.</w:t>
       </w:r>
     </w:p>
     <w:p>
@@ -10099,15 +10168,15 @@
         <w:pStyle w:val="BodyJ"/>
       </w:pPr>
       <w:r>
-        <w:t xml:space="preserve">La relación clínica es asimétrica: el profesional posee conocimientos, acceso institucional y capacidad de activar intervenciones que el paciente no controla. Esa asimetría hace necesaria la recomendación experta, pero también exige que la autoridad sea explicable. "Yo haría esto" tiene valor cuando resume razones; se vuelve problemática cuando sustituye su examen.</w:t>
-      </w:r>
-    </w:p>
-    <w:p>
-      <w:pPr>
-        <w:pStyle w:val="BodyJ"/>
-      </w:pPr>
-      <w:r>
-        <w:t xml:space="preserve">Recomendar no es imponer ni retirarse. El médico debe señalar qué opción considera preferible, qué hechos sostienen esa preferencia, qué incertidumbres podrían modificarla y qué valores del paciente son decisivos. La neutralidad aparente puede abandonar a una persona precisamente cuando necesita orientación. La autoridad bien ejercida reduce complejidad sin ocultar desacuerdos razonables. La respuesta de la cirujana a Carmen —"yo le recomiendo operarse, y le digo por qué"— es la forma completa del gesto: recomendación, razones, límites y devolución de la decisión.</w:t>
+        <w:t xml:space="preserve">La relación clínica es asimétrica: el profesional posee conocimientos, acceso institucional y capacidad de activar intervenciones que el paciente no controla. Esa asimetría hace necesaria la recomendación experta, pero también exige que la autoridad sea explicable. «Yo haría esto» tiene valor cuando resume razones; se vuelve problemática cuando sustituye su examen.</w:t>
+      </w:r>
+    </w:p>
+    <w:p>
+      <w:pPr>
+        <w:pStyle w:val="BodyJ"/>
+      </w:pPr>
+      <w:r>
+        <w:t xml:space="preserve">Recomendar no es imponer ni retirarse. El médico debe señalar qué opción considera preferible, qué hechos sostienen esa preferencia, qué incertidumbres podrían modificarla y qué valores del paciente son decisivos. La neutralidad aparente puede abandonar a una persona precisamente cuando necesita orientación. La autoridad bien ejercida reduce complejidad sin ocultar desacuerdos razonables. La respuesta de la cirujana a Carmen —«yo le recomiendo operarse, y le digo por qué»— es la forma completa del gesto: recomendación, razones, límites y devolución de la decisión.</w:t>
       </w:r>
     </w:p>
     <w:p>
@@ -10131,7 +10200,7 @@
         <w:pStyle w:val="BodyJ"/>
       </w:pPr>
       <w:r>
-        <w:t xml:space="preserve">La lucidez une epistemología y ética. Sobreestimar la certeza puede conducir a intervenciones injustificadas; subestimar la gravedad puede negar protección; desacreditar un relato puede borrar el dato decisivo. Por ello, hechos, inferencias e incertidumbre no son sólo categorías del conocimiento. Son también una disciplina de respeto: permiten que el paciente sepa qué sostiene nuestra recomendación, dónde están sus límites y cómo responderemos si la realidad contradice lo esperado.</w:t>
+        <w:t xml:space="preserve">La lucidez une epistemología y ética. Sobreestimar la certeza puede conducir a intervenciones injustificadas; subestimar la gravedad puede negar protección; desacreditar un relato puede borrar el dato decisivo. Por ello, hechos, inferencias e incertidumbre no son sólo categorías del conocimiento. Son también una disciplina de respeto: permiten que el paciente sepa qué sostiene la recomendación, dónde están sus límites y cómo responderá el equipo si la realidad contradice lo esperado.</w:t>
       </w:r>
     </w:p>
     <w:p>
@@ -10203,7 +10272,7 @@
         </w:numPr>
       </w:pPr>
       <w:r>
-        <w:t xml:space="preserve">¿Hay en mis fichas una etiqueta ("funcional", "no adherente", "poco colaborador") que esté distribuyendo credibilidad en lugar de información?</w:t>
+        <w:t xml:space="preserve">¿Hay en mis fichas una etiqueta («funcional», «no adherente», «poco colaborador») que esté distribuyendo credibilidad en lugar de información?</w:t>
       </w:r>
     </w:p>
     <w:p>
@@ -10390,7 +10459,7 @@
         <w:pStyle w:val="BodyJ"/>
       </w:pPr>
       <w:r>
-        <w:t xml:space="preserve">HII-D entra a un territorio poblado, y conviene decir exactamente qué agrega. La nota SOAP y el registro orientado por problemas ordenan el documento (Weed, 1968a); la representación del problema comprime el caso (Bordage, 1994); los illness scripts organizan el conocimiento experto (Charlin et al., 2007; Custers, 2015); las teorías de doble proceso describen los modos de procesamiento (Evans &amp; Stanovich, 2013); la reflexión deliberada estructura la comparación de hipótesis (Mamede et al., 2008); los modelos de metacognición supervisan la confianza y la estrategia (Nelson &amp; Narens, 1990; Fleming &amp; Lau, 2014); y el programa de seguridad diagnóstica vigila trayectorias y sistemas (National Academies of Sciences, Engineering, and Medicine, 2015).</w:t>
+        <w:t xml:space="preserve">HII-D entra a un territorio poblado, y hay que decir qué agrega. La nota SOAP y el registro orientado por problemas ordenan el documento (Weed, 1968a); la representación del problema comprime el caso (Bordage, 1994); los illness scripts organizan el conocimiento experto (Charlin et al., 2007; Custers, 2015). Las teorías de doble proceso describen los modos de procesamiento (Evans &amp; Stanovich, 2013); la reflexión deliberada estructura la comparación de hipótesis (Mamede et al., 2008); los modelos de metacognición supervisan la confianza y la estrategia (Nelson &amp; Narens, 1990; Fleming &amp; Lau, 2014); y el programa de seguridad diagnóstica vigila trayectorias y sistemas (National Academies of Sciences, Engineering, and Medicine, 2015).</w:t>
       </w:r>
     </w:p>
     <w:tbl>
@@ -11344,7 +11413,7 @@
         <w:pStyle w:val="BodyJ"/>
       </w:pPr>
       <w:r>
-        <w:t xml:space="preserve">Antes de ordenar datos, conviene precisar qué decisión está en juego. "¿Cuál es el diagnóstico?" puede ser demasiado amplio. Preguntas más útiles son: ¿existe infección que justifique antibiótico?, ¿hay una complicación anatómica que exige cirugía urgente?, ¿el riesgo de recurrencia modifica la oportunidad de reparación?, ¿qué explicación del síntoma requiere excluirse antes de un manejo funcional?</w:t>
+        <w:t xml:space="preserve">Antes de ordenar datos, precise qué decisión está en juego. «¿Cuál es el diagnóstico?» puede ser demasiado amplio. Preguntas más útiles son: ¿existe infección que justifique antibiótico?, ¿hay una complicación anatómica que exige cirugía urgente?, ¿el riesgo de recurrencia modifica la oportunidad de reparación?, ¿qué explicación del síntoma requiere excluirse antes de un manejo funcional?</w:t>
       </w:r>
     </w:p>
     <w:p>
@@ -11451,7 +11520,7 @@
         <w:pStyle w:val="BodyJ"/>
       </w:pPr>
       <w:r>
-        <w:t xml:space="preserve">Aquí se reconoce la diferencia entre "no sé la etiología exacta" y "no sé si existe una amenaza inmediata". La segunda suele dominar la acción.</w:t>
+        <w:t xml:space="preserve">Aquí se reconoce la diferencia entre «no sé la etiología exacta» y «no sé si existe una amenaza inmediata». La segunda suele dominar la acción.</w:t>
       </w:r>
     </w:p>
     <w:p>
@@ -11476,7 +11545,7 @@
         <w:pStyle w:val="BodyJ"/>
       </w:pPr>
       <w:r>
-        <w:t xml:space="preserve">La decisión integra probabilidad, gravedad, tiempo, reversibilidad, capacidad de monitorización y valores — y el contexto global del paciente: funcionalidad basal, pronóstico de fondo, red de apoyo y fines declarados, los hechos que el capítulo 10 llamó de pleno derecho. Debe poder formularse: "aunque X no está demostrado, actúo porque…" o "aunque X es posible, no actúo todavía porque…". Esta frase obliga a distinguir compromiso práctico de certeza epistémica. Y ante intervenciones mayores, la pregunta de proporcionalidad cierra la capa: ¿esta medida guarda proporción con el pronóstico y con los fines de este enfermo?</w:t>
+        <w:t xml:space="preserve">La decisión integra probabilidad, gravedad, tiempo, reversibilidad, capacidad de monitorización y valores — y el contexto global del paciente: funcionalidad basal, pronóstico de fondo, red de apoyo y fines declarados, los hechos que el capítulo 10 llamó de pleno derecho. Debe poder formularse: «aunque X no está demostrado, actúo porque…» o «aunque X es posible, no actúo todavía porque…». Esta frase obliga a distinguir compromiso práctico de certeza epistémica. Y ante intervenciones mayores, la pregunta de proporcionalidad cierra la capa: ¿esta medida guarda proporción con el pronóstico y con los fines de este enfermo?</w:t>
       </w:r>
     </w:p>
     <w:p>
@@ -11697,7 +11766,7 @@
         <w:pStyle w:val="BodyJ"/>
       </w:pPr>
       <w:r>
-        <w:t xml:space="preserve">Sesenta segundos no producen una epistemología; producen algo más modesto y a veces suficiente: impiden que la frase "cuadro habitual, manejo habitual" se escriba sola. Si alguna de las cuatro respuestas incomoda —el hecho decisivo resulta heredado, la confianza no tiene fuente, la incertidumbre peligrosa no tiene vigilancia—, esa incomodidad es la indicación para la versión completa.</w:t>
+        <w:t xml:space="preserve">Sesenta segundos no producen una epistemología; producen algo más modesto y a veces suficiente: impiden que la frase «cuadro habitual, manejo habitual» se escriba sola. Si alguna de las cuatro respuestas incomoda —el hecho decisivo resulta heredado, la confianza no tiene fuente, la incertidumbre peligrosa no tiene vigilancia—, esa incomodidad es la indicación para la versión completa.</w:t>
       </w:r>
     </w:p>
     <w:p>
@@ -11763,7 +11832,7 @@
         <w:pStyle w:val="BodyJ"/>
       </w:pPr>
       <w:r>
-        <w:t xml:space="preserve">La calibración requiere comparar predicciones con resultados. Cuando sea posible, conviene registrar no sólo una hipótesis, sino un grado verbal o numérico de confianza y una expectativa temporal. Más tarde puede revisarse: ¿la certeza fue excesiva?, ¿la alternativa descartada ocurrió con frecuencia?, ¿el criterio de alarma fue sensible?, ¿la conducta se modificó cuando debía? Sin retorno de información, la experiencia puede acumular años sin transformarse en pericia.</w:t>
+        <w:t xml:space="preserve">La calibración requiere comparar predicciones con resultados. Cuando sea posible, registre no sólo una hipótesis, sino un grado verbal o numérico de confianza y una expectativa temporal. Más tarde puede revisarse: ¿la certeza fue excesiva?, ¿la alternativa descartada ocurrió con frecuencia?, ¿el criterio de alarma fue sensible?, ¿la conducta se modificó cuando debía? Sin retorno de información, la experiencia puede acumular años sin transformarse en pericia.</w:t>
       </w:r>
     </w:p>
     <w:p>
@@ -11812,7 +11881,7 @@
         <w:pStyle w:val="BodyJ"/>
       </w:pPr>
       <w:r>
-        <w:t xml:space="preserve">Tercero: si un servicio que adopta el léxico de certeza no modifica en algunos meses ninguna conducta medible —ningún "se descarta" reconvertido, ningún criterio de reapertura agregado, ninguna vigilancia activada que antes no existía—, el léxico es un póster, no una herramienta.</w:t>
+        <w:t xml:space="preserve">Tercero: si un servicio que adopta el léxico de certeza no modifica en algunos meses ninguna conducta medible —ningún «se descarta» reconvertido, ningún criterio de reapertura agregado, ninguna vigilancia activada que antes no existía—, el léxico es un póster, no una herramienta.</w:t>
       </w:r>
     </w:p>
     <w:p>
@@ -11853,7 +11922,7 @@
         <w:pStyle w:val="BodyJ"/>
       </w:pPr>
       <w:r>
-        <w:t xml:space="preserve">HII-D no sustituye protocolos, guías, probabilidades cuantitativas ni experiencia. Puede generar falsa prolijidad si se aplica mecánicamente. No todo caso necesita cuatro subtítulos. En urgencias, la acción puede preceder a la formulación completa; aun así, la reevaluación posterior debe reconstruirla. Debe decirse con la misma claridad: HII-D no ha sido validado como instrumento —no existen aún estudios de fiabilidad ni de impacto—, y este libro lo presenta como heurística de escritura y deliberación, no como tecnología probada. El método debe permanecer liviano. La extensión apropiada depende del riesgo, novedad y reversibilidad. Una decisión rutinaria puede requerir una línea; una situación de alto impacto merece una representación más desplegada. La profundidad debe ser selectiva y proporcional.</w:t>
+        <w:t xml:space="preserve">HII-D no sustituye protocolos, guías, probabilidades cuantitativas ni experiencia. Puede generar falsa prolijidad si se aplica mecánicamente. No todo caso necesita cuatro subtítulos. En urgencias, la acción puede preceder a la formulación completa; aun así, la reevaluación posterior debe reconstruirla. Debe decirse con la misma claridad: HII-D no ha sido validado como instrumento —no existen aún estudios de fiabilidad ni de impacto—, y este libro lo presenta como heurística de escritura y deliberación, no como tecnología probada. El método debe permanecer liviano. La extensión apropiada depende del riesgo, novedad y reversibilidad. Una decisión rutinaria puede requerir una línea; una situación de alto impacto pide una representación más desplegada. La profundidad debe ser selectiva y proporcional.</w:t>
       </w:r>
     </w:p>
     <w:p>
@@ -11900,7 +11969,7 @@
         <w:t xml:space="preserve">Solución comentada.</w:t>
       </w:r>
       <w:r>
-        <w:t xml:space="preserve"> No hay solución única, pero hay un patrón casi universal al comparar: la ficha suele contener los hechos y la decisión, y omitir las dos capas intermedias —el grado de la inferencia ("neumonía" sin "probable/demostrada") y la incertidumbre crítica con su vigilancia—. Es decir: registra qué se piensa y qué se hace, pero no cuánto derecho hay a pensarlo ni qué lo haría cambiar. Si su plantilla y su ficha coinciden, este libro le debe una disculpa por las horas invertidas. Si no coinciden, la plantilla acaba de mostrarle qué escribir mañana.</w:t>
+        <w:t xml:space="preserve"> No hay solución única, pero hay un patrón casi universal al comparar: la ficha suele contener los hechos y la decisión, y omitir las dos capas intermedias —el grado de la inferencia («neumonía» sin «probable/demostrada») y la incertidumbre crítica con su vigilancia—. Es decir: registra qué se piensa y qué se hace, pero no cuánto derecho hay a pensarlo ni qué lo haría cambiar. Si su plantilla y su ficha coinciden, este libro le debe una disculpa por las horas invertidas. Si no coinciden, la plantilla acaba de mostrarle qué escribir mañana.</w:t>
       </w:r>
     </w:p>
     <w:p>
@@ -11940,7 +12009,7 @@
         </w:numPr>
       </w:pPr>
       <w:r>
-        <w:t xml:space="preserve">¿Cuál es la pregunta operativa de mi caso más difícil —la decisión real en juego, no "el diagnóstico"?</w:t>
+        <w:t xml:space="preserve">¿Cuál es la pregunta operativa de mi caso más difícil —la decisión real en juego, no «el diagnóstico»?</w:t>
       </w:r>
     </w:p>
     <w:p>
@@ -12002,7 +12071,7 @@
         <w:pStyle w:val="BodyJ"/>
       </w:pPr>
       <w:r>
-        <w:t xml:space="preserve">Las viñetas siguientes son composiciones docentes. Cada una se presenta con la estructura HII-D y una frase medular. No son casos "resueltos": son casos representados. La invitación es leer cada uno dos veces —primero como clínico, buscando la conducta; después como lector metacognitivo, observando qué hace cada capa.</w:t>
+        <w:t xml:space="preserve">Las viñetas siguientes son composiciones docentes. Cada una se presenta con la estructura HII-D y una frase medular. No son casos «resueltos»: son casos representados. La invitación es leer cada uno dos veces —primero como clínico, buscando la conducta; después como lector metacognitivo, observando qué hace cada capa.</w:t>
       </w:r>
     </w:p>
     <w:p>
@@ -12095,7 +12164,7 @@
         <w:t xml:space="preserve">Decisión:</w:t>
       </w:r>
       <w:r>
-        <w:t xml:space="preserve"> solicitar evaluación quirúrgica precoz para planificar reparación electiva tras optimización médica y kinésica, documentando una decisión compartida. El fundamento para operar no es que "fracasó el manejo médico" (resolvió el cuadro agudo cuatro veces), sino que la gravedad vital alcanzada en este episodio vuelve inaceptable el riesgo de mantener una conducta expectante.</w:t>
+        <w:t xml:space="preserve"> solicitar evaluación quirúrgica precoz para planificar reparación electiva tras optimización médica y kinésica, documentando una decisión compartida. El fundamento para operar no es que «fracasó el manejo médico» (resolvió el cuadro agudo cuatro veces), sino que la gravedad vital alcanzada en este episodio vuelve inaceptable el riesgo de mantener una conducta expectante.</w:t>
       </w:r>
     </w:p>
     <w:p>
@@ -12110,7 +12179,7 @@
         <w:t xml:space="preserve">Frase medular:</w:t>
       </w:r>
       <w:r>
-        <w:t xml:space="preserve"> "Obstrucción intestinal recurrente por hernia incisional, por primera vez complicada con shock séptico y bacteriemia, sin isquemia aguda en tomografía. El salto cualitativo de gravedad modifica el umbral terapéutico y justifica priorizar la reparación electiva tras la recuperación fisiológica."</w:t>
+        <w:t xml:space="preserve"> «Obstrucción intestinal recurrente por hernia incisional, por primera vez complicada con shock séptico y bacteriemia, sin isquemia aguda en tomografía. El salto cualitativo de gravedad modifica el umbral terapéutico y justifica priorizar la reparación electiva tras la recuperación fisiológica.»</w:t>
       </w:r>
     </w:p>
     <w:p>
@@ -12125,7 +12194,7 @@
         <w:t xml:space="preserve">Epílogo.</w:t>
       </w:r>
       <w:r>
-        <w:t xml:space="preserve"> Carmen fue operada de forma programada seis semanas después. En pabellón se encontraron adherencias firmes y un anillo herniario estrecho, reparado sin incidentes mayores. En su control ambulatorio al mes, Carmen formuló su propio balance del proceso: "Esta vez el dolor tenía una explicación clara, y saber qué estábamos haciendo lo cambió todo". Su buena evolución no demuestra, por sí sola, que la indicación haya sido acertada: un desenlace feliz nunca valida retroactivamente un proceso defectuoso. Lo que cuenta es que la decisión era defendible antes de conocer el resultado, que es todo lo que puede exigírsele al juicio médico. La anotación rápida de su primera madrugada en urgencias —"cuadro habitual, manejo habitual"— permaneció en la ficha como testimonio de lo que una semana de trabajo epistémico permitió transformar.</w:t>
+        <w:t xml:space="preserve"> Carmen fue operada de forma programada seis semanas después. En pabellón se encontraron adherencias firmes y un anillo herniario estrecho, reparado sin incidentes mayores. En su control ambulatorio al mes, Carmen formuló su propio balance del proceso: «Esta vez el dolor tenía una explicación clara, y saber qué estábamos haciendo lo cambió todo». Su buena evolución no demuestra, por sí sola, que la indicación haya sido acertada: un desenlace feliz nunca valida retroactivamente un proceso defectuoso. Lo que cuenta es que la decisión era defendible antes de conocer el resultado, que es todo lo que puede exigírsele al juicio médico. La anotación rápida de su primera madrugada en urgencias —«cuadro habitual, manejo habitual»— permaneció en la ficha como testimonio de lo que una semana de trabajo epistémico permitió transformar.</w:t>
       </w:r>
     </w:p>
     <w:p>
@@ -12150,7 +12219,7 @@
         <w:pStyle w:val="BodyJ"/>
       </w:pPr>
       <w:r>
-        <w:t xml:space="preserve">Hombre con lesión medular completa, vejiga neurogénica, usuario crónico de sonda Foley y portador de un cáncer renal metastásico en progresión. Tras un recambio traumático de sonda, presenta orina turbia, piuria en el sedimento y urocultivo positivo. Al examen se encuentra afebril, hemodinámicamente estable y sin cambios respecto de su condición basal. Sus marcadores inflamatorios sanguíneos están elevados, sin valores previos para comparar y con su enfermedad tumoral activa como causa concomitante. Registra antecedente de colonización e infecciones previas por enterobacteria productora de BLEE.</w:t>
+        <w:t xml:space="preserve">Es el paciente de la cama 12 del capítulo 8, el mismo cuya ficha el capítulo 12 ordenó en la matriz HII-D; aquí, en la versión que cabe en una entrega de turno. Hombre con lesión medular completa, vejiga neurogénica, sonda Foley permanente y un cáncer renal metastásico en progresión. Tras un recambio traumático de sonda presenta orina turbia, piuria y urocultivo positivo; está afebril, estable y sin cambios respecto de su basal. Los marcadores inflamatorios están elevados, sin valores previos y con el tumor como causa concomitante, y tiene antecedente de colonización por enterobacteria productora de BLEE.</w:t>
       </w:r>
     </w:p>
     <w:p>
@@ -12165,7 +12234,7 @@
         <w:t xml:space="preserve">Hechos:</w:t>
       </w:r>
       <w:r>
-        <w:t xml:space="preserve"> usuario crónico de catéter urinario con recambio reciente; piuria y urocultivo positivo; estabilidad hemodinámica y ausencia de fiebre; imposibilidad neuroanatómica de evaluar síntomas urinarios bajos clásicos; elevación de reactantes de fase aguda sin basal conocido en paciente con cáncer renal metastásico; antecedente documentado de colonización por microorganismo productor de BLEE.</w:t>
+        <w:t xml:space="preserve"> recambio reciente de sonda; piuria y urocultivo positivo; afebril y estable; síntomas urinarios bajos no evaluables por el nivel lesional; reactantes elevados sin basal, con cáncer renal metastásico activo; colonización documentada por BLEE.</w:t>
       </w:r>
     </w:p>
     <w:p>
@@ -12225,7 +12294,7 @@
         <w:t xml:space="preserve">Frase medular:</w:t>
       </w:r>
       <w:r>
-        <w:t xml:space="preserve"> "Urocultivo positivo y piuria tras recambio de sonda Foley en paciente con lesión medular y antecedente de colonización por BLEE, sin respuesta sistémica ni signos autonómicos que configuren infección activa. Se interpreta como bacteriuria asociada a catéter; vigilancia clínica estricta con criterios explícitos de reapertura."</w:t>
+        <w:t xml:space="preserve"> «Urocultivo positivo y piuria tras recambio de sonda Foley en paciente con lesión medular y antecedente de colonización por BLEE, sin respuesta sistémica ni signos autonómicos que configuren infección activa. Se interpreta como bacteriuria asociada a catéter; vigilancia clínica estricta con criterios explícitos de reapertura.»</w:t>
       </w:r>
     </w:p>
     <w:p>
@@ -12295,7 +12364,7 @@
         <w:t xml:space="preserve">¿Qué daño importante produciría si me equivoco? (Incertidumbre crítica)</w:t>
       </w:r>
       <w:r>
-        <w:t xml:space="preserve"> Rotularlo como "dolor torácico atípico con ECG sin isquemia aguda" y enviarlo a esperar la troponina en una silla de la sala común mientras cursa una oclusión coronaria dinámica. La incertidumbre peligrosa no es la etiqueta nominal; es la ventana de tiempo de miocardio salvable.</w:t>
+        <w:t xml:space="preserve"> Rotularlo como «dolor torácico atípico con ECG sin isquemia aguda» y enviarlo a esperar la troponina en una silla de la sala común mientras cursa una oclusión coronaria dinámica. La incertidumbre peligrosa no es la etiqueta nominal; es la ventana de tiempo de miocardio salvable.</w:t>
       </w:r>
     </w:p>
     <w:p>
@@ -12310,7 +12379,7 @@
         <w:t xml:space="preserve">¿Qué hago ahora y qué me haría cambiar? (Decisión)</w:t>
       </w:r>
       <w:r>
-        <w:t xml:space="preserve"> Cama monitorizada, vía venosa, antiagregación inicial según protocolo, ECG seriado cada 15–30 minutos y rescate rápido de la troponina. Activar hemodinamia de inmediato si el trazado evoluciona a supradesnivel o si el dolor se vuelve refractario. Queda escrito: "SCA en evolución, no demostrado; manejo y monitorización continua por asimetría de consecuencias ante el riesgo vital de omisión".</w:t>
+        <w:t xml:space="preserve"> Cama monitorizada, vía venosa, antiagregación inicial según protocolo, ECG seriado cada 15–30 minutos y rescate rápido de la troponina. Activar hemodinamia de inmediato si el trazado evoluciona a supradesnivel o si el dolor se vuelve refractario. Queda escrito: «SCA en evolución, no demostrado; manejo y monitorización continua por asimetría de consecuencias ante el riesgo vital de omisión».</w:t>
       </w:r>
     </w:p>
     <w:p>
@@ -12325,7 +12394,7 @@
         <w:t xml:space="preserve">Frase medular:</w:t>
       </w:r>
       <w:r>
-        <w:t xml:space="preserve"> "Dolor torácico de perfil anginoso con descarga adrenérgica y ECG inicial no concluyente: se maneja como SCA probable bajo monitorización continua, por asimetría de consecuencias, mientras la seriación electrocardiográfica y enzimática confirma o degrada la hipótesis."</w:t>
+        <w:t xml:space="preserve"> «Dolor torácico de perfil anginoso con descarga adrenérgica y ECG inicial no concluyente: se maneja como SCA probable bajo monitorización continua, por asimetría de consecuencias, mientras la seriación electrocardiográfica y enzimática confirma o degrada la hipótesis.»</w:t>
       </w:r>
     </w:p>
     <w:p>
@@ -12340,7 +12409,7 @@
         <w:t xml:space="preserve">Lectura metacognitiva.</w:t>
       </w:r>
       <w:r>
-        <w:t xml:space="preserve"> En urgencias, el fallo catastrófico rara vez es intelectual: casi todo médico piensa en el infarto. Suele ser logístico y de diseño: la hipótesis correcta ("probable SCA") sin un circuito cerrado de reevaluación. ¿Quién toma y quién mira el segundo ECG a los 15 minutos si el turno colapsa? Fijar el criterio de reapertura con plazo y responsable es la mitad del tratamiento.</w:t>
+        <w:t xml:space="preserve"> En urgencias, el fallo catastrófico rara vez es intelectual: casi todo médico piensa en el infarto. Suele ser logístico y de diseño: la hipótesis correcta («probable SCA») sin un circuito cerrado de reevaluación. ¿Quién toma y quién mira el segundo ECG a los 15 minutos si el turno colapsa? Fijar el criterio de reapertura con plazo y responsable es la mitad del tratamiento.</w:t>
       </w:r>
     </w:p>
     <w:p>
@@ -12365,7 +12434,7 @@
         <w:pStyle w:val="BodyJ"/>
       </w:pPr>
       <w:r>
-        <w:t xml:space="preserve">Policlínico de atención primaria. Mujer de 47 años consulta por fatiga persistente de tres meses de evolución. Acude con exámenes de sangre "normales de hace poquito": un hemograma y un perfil bioquímico tomados hace cinco meses en un chequeo preventivo, dos meses antes de que comenzara el cansancio. Al interrogatorio dirigido agrega sudoración nocturna ocasional —que ella atribuye al inicio de la menopausia— y una baja de peso involuntaria de unos tres kilos que explica "porque he tenido menos apetito". La agenda médica está copada, con bloques de doce minutos por paciente.</w:t>
+        <w:t xml:space="preserve">Policlínico de atención primaria. Mujer de 47 años consulta por fatiga persistente de tres meses de evolución. Acude con exámenes de sangre «normales de hace poquito»: un hemograma y un perfil bioquímico tomados hace cinco meses en un chequeo preventivo, dos meses antes de que comenzara el cansancio. Al interrogatorio dirigido agrega sudoración nocturna ocasional —que ella atribuye al inicio de la menopausia— y una baja de peso involuntaria de unos tres kilos que explica «porque he tenido menos apetito». La agenda médica está copada, con bloques de doce minutos por paciente.</w:t>
       </w:r>
     </w:p>
     <w:p>
@@ -12380,7 +12449,7 @@
         <w:t xml:space="preserve">Hechos:</w:t>
       </w:r>
       <w:r>
-        <w:t xml:space="preserve"> fatiga progresiva de tres meses de duración (relato consistente); exámenes de laboratorio normales cuya fecha precede en dos meses al inicio del síntoma; sudoración nocturna y baja ponderal referidas con atribuciones causales benignas propuestas por la propia paciente; examen físico segmentario de hoy sin adenopatías periféricas ni visceromegalias palpables (exploración acotada por el tiempo de consulta).</w:t>
+        <w:t xml:space="preserve"> fatiga progresiva de tres meses (relato consistente); exámenes de laboratorio normales cuya fecha precede en dos meses al inicio del síntoma; sudoración nocturna y baja ponderal referidas con atribuciones benignas propuestas por la propia paciente. Examen físico segmentario de hoy sin adenopatías periféricas ni visceromegalias palpables, en una exploración acotada por el tiempo de consulta.</w:t>
       </w:r>
     </w:p>
     <w:p>
@@ -12440,7 +12509,7 @@
         <w:t xml:space="preserve">Frase medular:</w:t>
       </w:r>
       <w:r>
-        <w:t xml:space="preserve"> "Fatiga de tres meses asociada a sudoración nocturna y baja ponderal leve; dado que el laboratorio normal previo antecede al inicio de los síntomas y no cubre el período actual, se solicita estudio actualizado y se programa control longitudinal con pauta escrita de signos de alarma."</w:t>
+        <w:t xml:space="preserve"> «Fatiga de tres meses asociada a sudoración nocturna y baja ponderal leve; dado que el laboratorio normal previo antecede al inicio de los síntomas y no cubre el período actual, se solicita estudio actualizado y se programa control longitudinal con pauta escrita de signos de alarma.»</w:t>
       </w:r>
     </w:p>
     <w:p>
@@ -12455,7 +12524,7 @@
         <w:t xml:space="preserve">Lectura metacognitiva.</w:t>
       </w:r>
       <w:r>
-        <w:t xml:space="preserve"> Evidencia caducada: "tiene exámenes normales recientes" es un hecho cierto cuya fecha lo vuelve irrelevante para el problema nuevo. Y el tiempo longitudinal, la ventaja comparativa de la atención primaria, sólo es una herramienta diagnóstica cuando tiene fecha de reevaluación y criterios de reconsulta; sin ese diseño, dejar pasar el tiempo es apostar a que el cuadro sea benigno.</w:t>
+        <w:t xml:space="preserve"> Evidencia caducada: «tiene exámenes normales recientes» es un hecho cierto cuya fecha lo vuelve irrelevante para el problema nuevo. Y el tiempo longitudinal, la ventaja comparativa de la atención primaria, sólo es una herramienta diagnóstica cuando tiene fecha de reevaluación y criterios de reconsulta; sin ese diseño, dejar pasar el tiempo es apostar a que el cuadro sea benigno.</w:t>
       </w:r>
     </w:p>
     <w:p>
@@ -12480,7 +12549,7 @@
         <w:pStyle w:val="BodyJ"/>
       </w:pPr>
       <w:r>
-        <w:t xml:space="preserve">Hombre de 78 años con adenocarcinoma de páncreas metastásico en progresión tras tres líneas de quimioterapia. Ingresa al servicio de medicina interna por un deterioro funcional acelerado en las últimas tres semanas —pasó de caminar con apoyo dentro de su casa a permanecer postrado en cama—, sumado a una neumonía aguda hipoxémica. En el pasillo, la familia pregunta angustiada cuánto tiempo de vida le queda. Una de las hijas exige "que se le haga todo lo necesario para sacarlo adelante". Oncología anota en su interconsulta que, superado el cuadro infeccioso, "eventualmente podría evaluarse una ventana para una cuarta línea paliativa". El paciente, durante sus períodos de lucidez, repite que se siente profundamente agotado.</w:t>
+        <w:t xml:space="preserve">Hombre de 78 años con adenocarcinoma de páncreas metastásico en progresión tras tres líneas de quimioterapia. Ingresa al servicio de medicina interna por un deterioro funcional acelerado en las últimas tres semanas —pasó de caminar con apoyo dentro de su casa a permanecer postrado en cama—, sumado a una neumonía aguda hipoxémica. En el pasillo, la familia pregunta angustiada cuánto tiempo de vida le queda. Una de las hijas exige «que se le haga todo lo necesario para sacarlo adelante». Oncología anota en su interconsulta que, superado el cuadro infeccioso, «eventualmente podría evaluarse una ventana para una cuarta línea paliativa». El paciente, durante sus períodos de lucidez, repite que se siente profundamente agotado.</w:t>
       </w:r>
     </w:p>
     <w:p>
@@ -12510,7 +12579,7 @@
         <w:t xml:space="preserve">Inferencia:</w:t>
       </w:r>
       <w:r>
-        <w:t xml:space="preserve"> la neumonía es tratable en lo inmediato. La pendiente funcional previa indica, en cambio, una trayectoria irreversible de final de vida, con una sobrevida estimable en semanas a pocos meses. En ese escenario, "podría haber ventana para otra línea" no es una expectativa fundada en la evolución real, sino la mención abstracta de un fármaco disponible.</w:t>
+        <w:t xml:space="preserve"> la neumonía es tratable en lo inmediato. La pendiente funcional previa indica, en cambio, una trayectoria irreversible de final de vida, con una sobrevida estimable en semanas a pocos meses. En ese escenario, «podría haber ventana para otra línea» no es una expectativa fundada en la evolución real, sino la mención abstracta de un fármaco disponible.</w:t>
       </w:r>
     </w:p>
     <w:p>
@@ -12555,7 +12624,7 @@
         <w:t xml:space="preserve">Frase medular:</w:t>
       </w:r>
       <w:r>
-        <w:t xml:space="preserve"> "Neumonía aguda potencialmente reversible en paciente con cáncer de páncreas metastásico refractario y declive funcional acelerado hacia el final de la vida. Se trata la parte reversible con metas de alivio, se comunica la trayectoria sin fingir exactitud de plazos y las medidas invasivas se subordinan a las preferencias del enfermo."</w:t>
+        <w:t xml:space="preserve"> «Neumonía aguda potencialmente reversible en paciente con cáncer de páncreas metastásico refractario y declive funcional acelerado hacia el final de la vida. Se trata la parte reversible con metas de alivio, se comunica la trayectoria sin fingir exactitud de plazos y las medidas invasivas se subordinan a las preferencias del enfermo.»</w:t>
       </w:r>
     </w:p>
     <w:p>
@@ -12570,7 +12639,7 @@
         <w:t xml:space="preserve">Lectura metacognitiva.</w:t>
       </w:r>
       <w:r>
-        <w:t xml:space="preserve"> La pregunta "¿cuánto tiempo le queda?" tienta a dos respuestas simétricas y malas: una cifra inventada (certeza retórica) o un "eso sólo Dios lo sabe" que desorienta a la familia (abandono comunicacional). Y el caso expone la confusión cotidiana entre lo técnicamente factible —una cuarta línea, intubar— y lo clínicamente proporcionado: el juicio de proporcionalidad del capítulo 10 empieza por reconocer el declive basal como un hecho clínico duro.</w:t>
+        <w:t xml:space="preserve"> La pregunta «¿cuánto tiempo le queda?» tienta a dos respuestas simétricas y malas: una cifra inventada (certeza retórica) o un «eso sólo Dios lo sabe» que desorienta a la familia (abandono comunicacional). Y el caso expone la confusión cotidiana entre lo técnicamente factible —una cuarta línea, intubar— y lo clínicamente proporcionado: el juicio de proporcionalidad del capítulo 10 empieza por reconocer el declive basal como un hecho clínico duro.</w:t>
       </w:r>
     </w:p>
     <w:p>
@@ -12595,7 +12664,7 @@
         <w:pStyle w:val="BodyJ"/>
       </w:pPr>
       <w:r>
-        <w:t xml:space="preserve">Esta viñeta reconstruye un error completo con la disciplina de los capítulos 7 y 8: sin pegar la etiqueta de un sesgo y sin dejar que el desenlace conocido distorsione lo que era exigible saber en el momento de la consulta.</w:t>
+        <w:t xml:space="preserve">Esta viñeta reconstruye un error completo con la disciplina de los capítulos 7 y 8. Sin pegar la etiqueta de un sesgo, y sin dejar que el desenlace conocido distorsione lo que era exigible saber en el momento de la consulta.</w:t>
       </w:r>
     </w:p>
     <w:p>
@@ -12610,7 +12679,7 @@
         <w:t xml:space="preserve">El caso.</w:t>
       </w:r>
       <w:r>
-        <w:t xml:space="preserve"> Mujer de 29 años consulta en urgencias a las 23:40 por disnea de inicio súbito hace dos horas, palpitaciones y "sensación inminente de que me voy a morir". Registra antecedente de trastorno de pánico en control; la hoja de categorización del triage anota: "paciente ansiosa, cursa crisis de pánico conocida". Sus signos vitales de ingreso muestran frecuencia cardiaca de 118 lpm, presión arterial normal, saturación de oxígeno de 94% ambiental y auscultación cardiopulmonar descrita como "sin hallazgos patológicos". La evolución médica consigna: "Crisis de pánico en paciente con antecedente conocido. Se administra lorazepam sublingual, cede angustia. Alta con indicación de control en salud mental". A las 36 horas reingresa al reanimador traída por su pareja tras sufrir un síncope en el baño: el angioTAC confirma un tromboembolismo pulmonar (TEP) bilateral masivo con disfunción ventricular derecha aguda. Sobrevive tras trombólisis sistémica.</w:t>
+        <w:t xml:space="preserve"> Mujer de 29 años consulta en urgencias a las 23:40 por disnea de inicio súbito hace dos horas, palpitaciones y «sensación inminente de que me voy a morir». Registra antecedente de trastorno de pánico en control; la hoja de categorización del triage anota: «paciente ansiosa, cursa crisis de pánico conocida». Sus signos vitales de ingreso muestran frecuencia cardiaca de 118 lpm, presión arterial normal, saturación de oxígeno de 94% ambiental y auscultación cardiopulmonar descrita como «sin hallazgos patológicos». La evolución médica consigna: «Crisis de pánico en paciente con antecedente conocido. Se administra lorazepam sublingual, cede angustia. Alta con indicación de control en salud mental». A las 36 horas reingresa al reanimador traída por su pareja tras sufrir un síncope en el baño: el angioTAC confirma un tromboembolismo pulmonar (TEP) bilateral masivo con disfunción ventricular derecha aguda. Sobrevive tras trombólisis sistémica.</w:t>
       </w:r>
     </w:p>
     <w:p>
@@ -12637,7 +12706,7 @@
         <w:t xml:space="preserve">Hechos disponibles la primera noche:</w:t>
       </w:r>
       <w:r>
-        <w:t xml:space="preserve"> disnea de instalación brusca con hora de inicio precisa (relato consistente). Taquicardia sinusal de 118 lpm al ingreso, que persistía en 112 lpm en el control de enfermería previo al alta, una hora después del lorazepam y con la paciente ya tranquila: dato medido, registrado en la hoja de signos vitales y omitido en la nota médica. Saturación de 94% a aire ambiental, que alguien en el turno minimizó como "esperable porque está hiperventilando"; la hiperventilación por ansiedad eleva la presión arterial de oxígeno y lleva la saturación hacia 99–100%, nunca la baja a 94%. Uso de anticonceptivos orales combinados y un viaje interurbano en bus de nueve horas tres días antes: dos factores protrombóticos presentes en la historia reciente, que nadie interrogó porque nunca se abrió una hipótesis vascular. Y una etiqueta heredada desde la admisión ("crisis de pánico conocida"), que entró a la ficha médica con rango de diagnóstico antes de que el clínico pusiera el fonendoscopio sobre el tórax.</w:t>
+        <w:t xml:space="preserve"> disnea de instalación brusca con hora de inicio precisa (relato consistente). Taquicardia sinusal de 118 lpm al ingreso, que persistía en 112 lpm en el control de enfermería previo al alta, una hora después del lorazepam y con la paciente ya tranquila. Dato medido, registrado en la hoja de signos vitales y omitido en la nota médica. Saturación de 94% a aire ambiental, que alguien en el turno minimizó como «esperable porque está hiperventilando»; la hiperventilación por ansiedad eleva la presión arterial de oxígeno y lleva la saturación hacia 99–100%, nunca la baja a 94%. Uso de anticonceptivos orales combinados y un viaje interurbano en bus de nueve horas tres días antes: dos factores protrombóticos presentes en la historia reciente, que nadie interrogó porque nunca se abrió una hipótesis vascular. Y una etiqueta heredada desde la admisión («crisis de pánico conocida»), que entró a la ficha médica con rango de diagnóstico antes de que el clínico pusiera el fonendoscopio sobre el tórax.</w:t>
       </w:r>
     </w:p>
     <w:p>
@@ -12652,7 +12721,7 @@
         <w:t xml:space="preserve">Inferencia de la primera noche:</w:t>
       </w:r>
       <w:r>
-        <w:t xml:space="preserve"> "crisis de pánico" fue redactada como un hecho consumado, cuando su fuerza epistémica real era apenas la de una hipótesis posible, sustentada únicamente en el antecedente psiquiátrico y la similitud superficial del relato.</w:t>
+        <w:t xml:space="preserve"> «crisis de pánico» fue redactada como un hecho consumado, cuando su fuerza epistémica real era apenas la de una hipótesis posible, sustentada únicamente en el antecedente psiquiátrico y la similitud superficial del relato.</w:t>
       </w:r>
     </w:p>
     <w:p>
@@ -12682,7 +12751,7 @@
         <w:t xml:space="preserve">Decisión de la primera noche:</w:t>
       </w:r>
       <w:r>
-        <w:t xml:space="preserve"> la benzodiacepina era defendible como tratamiento sintomático inicial. El alta sin estudio adicional y sin una línea de signos de alarma —qué debía hacerla volver antes del "control en salud mental"— fue un cierre indefendible.</w:t>
+        <w:t xml:space="preserve"> la benzodiacepina era defendible como tratamiento sintomático inicial. El alta sin estudio adicional y sin una línea de signos de alarma —qué debía hacerla volver antes del «control en salud mental»— fue un cierre indefendible.</w:t>
       </w:r>
     </w:p>
     <w:p>
@@ -12697,7 +12766,7 @@
         <w:t xml:space="preserve">Dónde estuvo el punto de intercepción.</w:t>
       </w:r>
       <w:r>
-        <w:t xml:space="preserve"> En la lectura de los signos vitales previos al egreso. Una taquicardia persistente de 112 lpm en una paciente que ya no luce angustiada era la gran discordancia de la madrugada. Si la hipótesis del pánico hubiese sido verdadera, el control de la ansiedad debía normalizar la descarga simpática y bajar el pulso. La pregunta de desaceleración antes de firmar el alta —"¿qué dato objetivo de esta paciente no explica una crisis de pánico?"— tenía en ese minuto su máximo rendimiento y su mínimo costo. Habrían bastado dos preguntas de anamnesis dirigida, la regla PERC al lado de la camilla y un dímero-D. Treinta y seis horas más tarde, la pregunta no formulada la respondió el síncope.</w:t>
+        <w:t xml:space="preserve"> En la lectura de los signos vitales previos al egreso. Una taquicardia persistente de 112 lpm en una paciente que ya no luce angustiada era la gran discordancia de la madrugada. Si la hipótesis del pánico hubiese sido verdadera, el control de la ansiedad debía normalizar la descarga simpática y bajar el pulso. La pregunta de desaceleración antes de firmar el alta —«¿qué dato objetivo de esta paciente no explica una crisis de pánico?»— tenía en ese minuto su máximo rendimiento y su mínimo costo. Habrían bastado dos preguntas de anamnesis dirigida, la regla PERC al lado de la camilla y un dímero-D. Treinta y seis horas más tarde, la pregunta no formulada la respondió el síncope.</w:t>
       </w:r>
     </w:p>
     <w:p>
@@ -12727,7 +12796,7 @@
         <w:t xml:space="preserve">Frase medular (la que faltó la primera noche):</w:t>
       </w:r>
       <w:r>
-        <w:t xml:space="preserve"> "Disnea súbita y taquicardia persistente (112 tras ansiolisis) en mujer de 29 años con trastorno de pánico y anticonceptivos orales: crisis de pánico posible, pero la taquicardia y la saturación de 94% no están explicadas. PERC no cumplido (frecuencia cardiaca, saturación, estrógenos): no procede el alta sin estudiar embolia pulmonar. Dímero-D ahora; angioTAC si resulta elevado o la probabilidad clínica es intermedia. Reconsulta inmediata, por escrito, ante síncope, dolor torácico o disnea en reposo."</w:t>
+        <w:t xml:space="preserve"> «Disnea súbita y taquicardia persistente (112 tras ansiolisis) en mujer de 29 años con trastorno de pánico y anticonceptivos orales: crisis de pánico posible, pero la taquicardia y la saturación de 94% no están explicadas. PERC no cumplido (frecuencia cardiaca, saturación, estrógenos): no procede el alta sin estudiar embolia pulmonar. Dímero-D ahora; angioTAC si resulta elevado o la probabilidad clínica es intermedia. Reconsulta inmediata, por escrito, ante síncope, dolor torácico o disnea en reposo.»</w:t>
       </w:r>
     </w:p>
     <w:p>
@@ -12759,15 +12828,15 @@
           <w:sz w:val="25"/>
           <w:szCs w:val="25"/>
         </w:rPr>
-        <w:t xml:space="preserve">Viñeta 7. "Lo veo raro": el testimonio de la madre</w:t>
-      </w:r>
-    </w:p>
-    <w:p>
-      <w:pPr>
-        <w:pStyle w:val="BodyJ"/>
-      </w:pPr>
-      <w:r>
-        <w:t xml:space="preserve">Un lactante de cinco meses llega a urgencias a las 22:30. Afebril tras paracetamol en casa, signos vitales dentro de rangos para la edad, examen segmentario sin foco. La madre insiste: "No es él. No se ríe, no me busca, está como apagado". La sala está llena y el registro de triage dice "lactante febril en buenas condiciones generales".</w:t>
+        <w:t xml:space="preserve">Viñeta 7. «Lo veo raro»: el testimonio de la madre</w:t>
+      </w:r>
+    </w:p>
+    <w:p>
+      <w:pPr>
+        <w:pStyle w:val="BodyJ"/>
+      </w:pPr>
+      <w:r>
+        <w:t xml:space="preserve">Un lactante de cinco meses llega a urgencias a las 22:30. Afebril tras paracetamol en casa, signos vitales dentro de rangos para la edad, examen segmentario sin foco. La madre insiste: «No es él. No se ríe, no me busca, está como apagado». La sala está llena y el registro de triage dice «lactante febril en buenas condiciones generales».</w:t>
       </w:r>
     </w:p>
     <w:p>
@@ -12797,7 +12866,7 @@
         <w:t xml:space="preserve">Inferencia:</w:t>
       </w:r>
       <w:r>
-        <w:t xml:space="preserve"> cuadro viral banal es lo más probable por prevalencia. Pero la preocupación parental por "no ser él mismo" no es ruido afectivo: es una observación experta sobre el único basal disponible, y la evidencia le da rango de señal — en series de atención primaria, la intuición del clínico de que "algo anda mal", frecuentemente gatillada por la inquietud de los padres, tuvo mayor valor diagnóstico que la mayoría de los signos aislados para detectar infección grave (Van den Bruel et al., 2012).</w:t>
+        <w:t xml:space="preserve"> cuadro viral banal es lo más probable por prevalencia. Pero la preocupación parental por «no ser él mismo» no es ruido afectivo, sino una observación experta sobre el único basal disponible, y la evidencia le da rango de señal. En series de atención primaria, la intuición del clínico de que «algo anda mal», muchas veces gatillada por la inquietud de los padres, tuvo mayor valor diagnóstico que la mayoría de los signos aislados para detectar infección grave (Van den Bruel et al., 2012).</w:t>
       </w:r>
     </w:p>
     <w:p>
@@ -12827,7 +12896,7 @@
         <w:t xml:space="preserve">Decisión:</w:t>
       </w:r>
       <w:r>
-        <w:t xml:space="preserve"> el dato que gobierna la conducta no es la temperatura sino el cambio de comportamiento reportado. Observación prolongada en urgencias con reevaluación seriada del estado general, umbral bajo para laboratorio, y —si se decide alta— red de seguridad explícita y verificada con la madre: qué mirar, cuándo volver, por qué vía. "Se va tranquila" no es un criterio de alta; "sabe exactamente qué la haría volver" sí.</w:t>
+        <w:t xml:space="preserve"> el dato que gobierna la conducta no es la temperatura sino el cambio de comportamiento reportado. Observación prolongada en urgencias con reevaluación seriada del estado general, umbral bajo para laboratorio, y —si se decide alta— red de seguridad explícita y verificada con la madre: qué mirar, cuándo volver, por qué vía. «Se va tranquila» no es un criterio de alta; «sabe exactamente qué la haría volver» sí.</w:t>
       </w:r>
     </w:p>
     <w:p>
@@ -12842,7 +12911,7 @@
         <w:t xml:space="preserve">Frase medular:</w:t>
       </w:r>
       <w:r>
-        <w:t xml:space="preserve"> "Lactante afebril bajo antipiréticos y sin foco al examen, con cambio conductual significativo según su madre; el testimonio del cuidador se registra como observación del basal y gobierna la vigilancia: reevaluación seriada antes de decidir alta, con red de seguridad verificada."</w:t>
+        <w:t xml:space="preserve"> «Lactante afebril bajo antipiréticos y sin foco al examen, con cambio conductual significativo según su madre; el testimonio del cuidador se registra como observación del basal y gobierna la vigilancia: reevaluación seriada antes de decidir alta, con red de seguridad verificada.»</w:t>
       </w:r>
     </w:p>
     <w:p>
@@ -12857,7 +12926,7 @@
         <w:t xml:space="preserve">Lectura metacognitiva.</w:t>
       </w:r>
       <w:r>
-        <w:t xml:space="preserve"> La pediatría radicaliza el capítulo 1: el paciente no habla, y el "hecho" más valioso es un testimonio de tercero sobre un basal que el equipo no conoce. Descartar la preocupación materna como ansiedad es injusticia testimonial en versión pediátrica — y además, simplemente, mala medicina: pocas fuentes de información tienen mejor razón señal-ruido que quien mira a ese niño todos los días.</w:t>
+        <w:t xml:space="preserve"> La pediatría radicaliza el capítulo 1: el paciente no habla, y el «hecho» más valioso es un testimonio de tercero sobre un basal que el equipo no conoce. Descartar la preocupación materna como ansiedad es injusticia testimonial en versión pediátrica — y además, simplemente, mala medicina: pocas fuentes de información tienen mejor razón señal-ruido que quien mira a ese niño todos los días.</w:t>
       </w:r>
     </w:p>
     <w:p>
@@ -12874,15 +12943,15 @@
           <w:sz w:val="25"/>
           <w:szCs w:val="25"/>
         </w:rPr>
-        <w:t xml:space="preserve">Viñeta 8. El dolor abdominal de la paciente que "somatiza"</w:t>
-      </w:r>
-    </w:p>
-    <w:p>
-      <w:pPr>
-        <w:pStyle w:val="BodyJ"/>
-      </w:pPr>
-      <w:r>
-        <w:t xml:space="preserve">Una mujer de 34 años con esquizofrenia en tratamiento consulta por dolor abdominal de dos días. En el box, habla poco y evita la mirada; la nota de derivación dice "consultas frecuentes, quejas somáticas múltiples". Taquicardia de 110, abdomen difícil de evaluar — la paciente tolera mal la palpación y su tratamiento antipsicótico puede atenuar la expresión del dolor y enlentecer el tránsito.</w:t>
+        <w:t xml:space="preserve">Viñeta 8. El dolor abdominal de la paciente que «somatiza»</w:t>
+      </w:r>
+    </w:p>
+    <w:p>
+      <w:pPr>
+        <w:pStyle w:val="BodyJ"/>
+      </w:pPr>
+      <w:r>
+        <w:t xml:space="preserve">Una mujer de 34 años con esquizofrenia en tratamiento consulta por dolor abdominal de dos días. En el box, habla poco y evita la mirada; la nota de derivación dice «consultas frecuentes, quejas somáticas múltiples». Taquicardia de 110, abdomen difícil de evaluar — la paciente tolera mal la palpación y su tratamiento antipsicótico puede atenuar la expresión del dolor y enlentecer el tránsito.</w:t>
       </w:r>
     </w:p>
     <w:p>
@@ -12897,7 +12966,7 @@
         <w:t xml:space="preserve">Hechos:</w:t>
       </w:r>
       <w:r>
-        <w:t xml:space="preserve"> taquicardia sostenida (medida, reproducible); dos días de dolor según relato coherente en sus términos; examen abdominal técnicamente limitado —no negativo: limitado—; antecedente psiquiátrico que modifica la expresión clínica y farmacológica del cuadro; una etiqueta heredada ("somatiza") sin procedencia verificable.</w:t>
+        <w:t xml:space="preserve"> taquicardia sostenida (medida, reproducible); dos días de dolor según relato coherente en sus términos; examen abdominal técnicamente limitado —no negativo: limitado—; antecedente psiquiátrico que modifica la expresión clínica y farmacológica del cuadro; una etiqueta heredada («somatiza») sin procedencia verificable.</w:t>
       </w:r>
     </w:p>
     <w:p>
@@ -12912,7 +12981,7 @@
         <w:t xml:space="preserve">Inferencia:</w:t>
       </w:r>
       <w:r>
-        <w:t xml:space="preserve"> la explicación "queja somática en contexto de patología psiquiátrica" es posible, pero está recibiendo un peso que no proviene de los datos de hoy sino del estigma: nada en la taquicardia es psiquiátrico. El fenómeno tiene nombre —ensombrecimiento diagnóstico: atribuir los síntomas físicos a la enfermedad mental— y consecuencias medibles: las personas con enfermedad mental grave mueren 15 a 20 años antes, en gran parte por enfermedad física subdiagnosticada y subtratada (Thornicroft, 2011).</w:t>
+        <w:t xml:space="preserve"> la explicación «queja somática en contexto de patología psiquiátrica» es posible, pero está recibiendo un peso que no proviene de los datos de hoy sino del estigma: nada en la taquicardia es psiquiátrico. El fenómeno tiene nombre —ensombrecimiento diagnóstico: atribuir los síntomas físicos a la enfermedad mental— y consecuencias medibles: las personas con enfermedad mental grave mueren 15 a 20 años antes, en gran parte por enfermedad física subdiagnosticada y subtratada (Thornicroft, 2011).</w:t>
       </w:r>
     </w:p>
     <w:p>
@@ -12927,7 +12996,7 @@
         <w:t xml:space="preserve">Incertidumbre:</w:t>
       </w:r>
       <w:r>
-        <w:t xml:space="preserve"> la peligrosa es un abdomen quirúrgico enmascarado — por el antipsicótico, por la dificultad comunicativa y por la disposición del equipo a cerrar temprano. Es exactamente el caso donde el examen "poco confiable" obliga a más objetividad, no a menos: laboratorio e imagen deciden lo que la palpación no puede.</w:t>
+        <w:t xml:space="preserve"> la peligrosa es un abdomen quirúrgico enmascarado — por el antipsicótico, por la dificultad comunicativa y por la disposición del equipo a cerrar temprano. Es el caso donde el examen «poco confiable» obliga a más objetividad, no a menos: laboratorio e imagen deciden lo que la palpación no puede.</w:t>
       </w:r>
     </w:p>
     <w:p>
@@ -12942,7 +13011,7 @@
         <w:t xml:space="preserve">Decisión:</w:t>
       </w:r>
       <w:r>
-        <w:t xml:space="preserve"> mismo estándar que para cualquier paciente con dolor abdominal y taquicardia — laboratorio completo, imagen según hallazgos, reevaluación programada— más un estándar adicional: documentar explícitamente que la evaluación fue limitada y por qué, para que el siguiente lector no herede "abdomen negativo" donde hubo "abdomen no evaluable". La etiqueta "somatiza" no entra a la ficha sin procedencia.</w:t>
+        <w:t xml:space="preserve"> el mismo estándar que para cualquier paciente con dolor abdominal y taquicardia —laboratorio completo, imagen según hallazgos, reevaluación programada— y uno adicional. Documentar que la evaluación fue limitada y por qué, para que el siguiente lector no herede «abdomen negativo» donde hubo «abdomen no evaluable». La etiqueta «somatiza» no entra a la ficha sin procedencia.</w:t>
       </w:r>
     </w:p>
     <w:p>
@@ -12957,7 +13026,7 @@
         <w:t xml:space="preserve">Frase medular:</w:t>
       </w:r>
       <w:r>
-        <w:t xml:space="preserve"> "Dolor abdominal y taquicardia sostenida en paciente con esquizofrenia: examen abdominal limitado —no negativo— y expresión clínica posiblemente atenuada por antipsicóticos; se estudia con el estándar completo, dejando registrado que la atribución psiquiátrica del cuadro exigiría primero excluir lo que la taquicardia sugiere."</w:t>
+        <w:t xml:space="preserve"> «Dolor abdominal y taquicardia sostenida en paciente con esquizofrenia: examen abdominal limitado —no negativo— y expresión clínica posiblemente atenuada por antipsicóticos; se estudia con el estándar completo, dejando registrado que la atribución psiquiátrica del cuadro exigiría primero excluir lo que la taquicardia sugiere.»</w:t>
       </w:r>
     </w:p>
     <w:p>
@@ -12997,7 +13066,7 @@
         <w:pStyle w:val="BodyJ"/>
       </w:pPr>
       <w:r>
-        <w:t xml:space="preserve">En cada caso, la buena formulación evita dos extremos: describir sin interpretar o interpretar como si se hubiera observado directamente. El hecho guía la hipótesis; la incertidumbre modula su fuerza; la consecuencia define la decisión; la evolución conserva el derecho a corregir. Y en todas —de la urgencia de las 3:00 al final de la vida, del lactante que no habla a la paciente a la que no se le cree— la decisión termina con la misma cláusula: qué la haría cambiar, quién lo detectará y cuándo.</w:t>
+        <w:t xml:space="preserve">En cada caso, la buena formulación evita dos extremos: describir sin interpretar o interpretar como si se hubiera observado directamente. El hecho guía la hipótesis; la incertidumbre modula su fuerza; la consecuencia define la decisión; la evolución conserva el derecho a corregir. Y en todas la decisión termina con la misma cláusula: qué la haría cambiar, quién lo detectará y cuándo. De la urgencia de las 3:00 al final de la vida; del lactante que no habla a la paciente a la que no se le cree.</w:t>
       </w:r>
     </w:p>
     <w:p>
@@ -13035,7 +13104,7 @@
         <w:pStyle w:val="BodyJ"/>
       </w:pPr>
       <w:r>
-        <w:t xml:space="preserve">Una jefa de servicio que quiera "instalar metacognición" en su equipo no puede indicarla como se indica un antibiótico. Puede, en cambio, cambiar tres cosas que ve todas las semanas: qué se pregunta en la visita de sala, qué estructura tiene la ficha y qué pasa después de un error. Este capítulo trata de esas palancas.</w:t>
+        <w:t xml:space="preserve">Una jefa de servicio que quiera «instalar metacognición» en su equipo no puede indicarla como se indica un antibiótico. Puede, en cambio, cambiar tres cosas que ve todas las semanas: qué se pregunta en la visita de sala, qué estructura tiene la ficha y qué pasa después de un error. Este capítulo trata de esas palancas.</w:t>
       </w:r>
     </w:p>
     <w:p>
@@ -13093,15 +13162,15 @@
         <w:pStyle w:val="BodyJ"/>
       </w:pPr>
       <w:r>
-        <w:t xml:space="preserve">En formación, pedir "el diagnóstico" prematuramente favorece la adivinación. Es más útil solicitar primero una representación del problema y preguntar qué datos fueron transformados en calificadores. Bowen y Eva han destacado la enseñanza explícita del razonamiento, mientras la teoría de illness scripts explica por qué el conocimiento debe organizarse alrededor de condiciones, mecanismos y consecuencias (Eva, 2005; Bowen, 2006).</w:t>
-      </w:r>
-    </w:p>
-    <w:p>
-      <w:pPr>
-        <w:pStyle w:val="BodyJ"/>
-      </w:pPr>
-      <w:r>
-        <w:t xml:space="preserve">El docente puede pedir al aprendiz que marque cada frase como hecho, inferencia o incertidumbre. Luego puede comparar la versión inicial con una formulación experta, no para imponer estilo, sino para mostrar qué relaciones fueron seleccionadas. El feedback debe ser específico: "presentaste la bacteriuria como infección", "omitiste que la imagen sólo excluye complicación actual", "tu plan no indica qué te haría cambiar". La devolución constructiva tiene técnica y tradición docente propia en nuestra lengua: describir conducta observable en lugar de juzgar a la persona, equilibrar lo logrado con lo corregible y terminar en un plan (Alves de Lima, 2008). Y la evaluación debe mirar lo mismo que la enseñanza: premiar el diagnóstico correcto obtenido por un proceso frágil y castigar el incorrecto con incertidumbre bien calibrada enseña a ocultar dudas y a reconstruir narrativas retrospectivas; pedir la confianza antes de conocer la respuesta, y el plan de revisión junto con el diagnóstico, corrige ese incentivo.</w:t>
+        <w:t xml:space="preserve">En formación, pedir «el diagnóstico» prematuramente favorece la adivinación. Es más útil solicitar primero una representación del problema y preguntar qué datos fueron transformados en calificadores. Bowen y Eva han destacado la enseñanza explícita del razonamiento, mientras la teoría de illness scripts explica por qué el conocimiento debe organizarse alrededor de condiciones, mecanismos y consecuencias (Eva, 2005; Bowen, 2006).</w:t>
+      </w:r>
+    </w:p>
+    <w:p>
+      <w:pPr>
+        <w:pStyle w:val="BodyJ"/>
+      </w:pPr>
+      <w:r>
+        <w:t xml:space="preserve">El docente puede pedir al aprendiz que marque cada frase como hecho, inferencia o incertidumbre. Luego puede comparar la versión inicial con una formulación experta, no para imponer estilo, sino para mostrar qué relaciones fueron seleccionadas. El feedback debe ser específico: «presentaste la bacteriuria como infección», «omitiste que la imagen sólo excluye complicación actual», «tu plan no indica qué te haría cambiar». La devolución constructiva tiene técnica y tradición docente propia en nuestra lengua: describir conducta observable en lugar de juzgar a la persona, equilibrar lo logrado con lo corregible y terminar en un plan (Alves de Lima, 2008). Y la evaluación debe mirar lo mismo que la enseñanza. Premiar el diagnóstico correcto obtenido por un proceso frágil, y castigar el incorrecto con incertidumbre bien calibrada, enseña a ocultar dudas y a reconstruir narrativas retrospectivas. Pedir la confianza antes de conocer la respuesta, y el plan de revisión junto con el diagnóstico, corrige ese incentivo.</w:t>
       </w:r>
     </w:p>
     <w:p>
@@ -13126,15 +13195,15 @@
         <w:pStyle w:val="BodyJ"/>
       </w:pPr>
       <w:r>
-        <w:t xml:space="preserve">Este libro toma posición en una controversia real de la educación médica, y conviene declararla. De un lado, Croskerry y su tradición sostienen que conocer los sesgos y entrenar estrategias de debiasing mejora el diagnóstico (Croskerry, 2003; Croskerry et al., 2013a, 2013b). Del otro, Norman, Monteiro y colegas han acumulado evidencia incómoda: la mayoría de los errores diagnósticos se asocia a déficits de conocimiento más que a fallas puras de proceso, los cursos de "pensamiento crítico" generalizable transfieren poco, y obligar a reflexionar sistemáticamente sobre casos fáciles no mejora la precisión y consume tiempo (Norman et al., 2017; Monteiro &amp; Norman, 2013; Monteiro et al., 2020).</w:t>
-      </w:r>
-    </w:p>
-    <w:p>
-      <w:pPr>
-        <w:pStyle w:val="BodyJ"/>
-      </w:pPr>
-      <w:r>
-        <w:t xml:space="preserve">La posición de este libro es intermedia, pero no equidistante. Con los escépticos: no existe una habilidad general de "pensar bien" que flote por encima del conocimiento; la representación rica del problema —illness scripts, experiencia con feedback— es la condición de todo lo demás, y ningún método, HII-D incluido, compensa no saber medicina. Contra el escepticismo total: de esa evidencia no se sigue que la única intervención posible sea enseñar más contenido. Lo que este libro propone no es vigilancia interna permanente ni listas universales —las versiones que la evidencia ha desinflado—, sino artefactos externos y selectivos: un lenguaje que obliga a graduar afirmaciones, una estructura de nota que conserva las capas, pausas activadas por disparadores definidos y circuitos de feedback que conviertan experiencia en calibración. Es una apuesta con compromisos observables (véase el capítulo 15): si estas herramientas no cambian conductas medibles, deben abandonarse como cualquier hipótesis mimada. Entre tanto, la controversia se enseña mejor de lo que se oculta: un residente que conoce el debate sabrá desconfiar por igual del catálogo de sesgos como solución universal y del nihilismo pedagógico como coartada.</w:t>
+        <w:t xml:space="preserve">Este libro toma posición en una controversia real de la educación médica, y la declara. De un lado, Croskerry y su tradición sostienen que conocer los sesgos y entrenar estrategias de debiasing mejora el diagnóstico (Croskerry, 2003; Croskerry et al., 2013a, 2013b). Del otro, Norman, Monteiro y colegas han acumulado evidencia incómoda. La mayoría de los errores diagnósticos se asocia a déficits de conocimiento más que a fallas puras de proceso; los cursos de «pensamiento crítico» generalizable transfieren poco; y obligar a reflexionar sistemáticamente sobre casos fáciles no mejora la precisión y consume tiempo (Norman et al., 2017; Monteiro &amp; Norman, 2013; Monteiro et al., 2020).</w:t>
+      </w:r>
+    </w:p>
+    <w:p>
+      <w:pPr>
+        <w:pStyle w:val="BodyJ"/>
+      </w:pPr>
+      <w:r>
+        <w:t xml:space="preserve">La posición de este libro es intermedia, pero no equidistante. Con los escépticos: no existe una habilidad general de «pensar bien» que flote por encima del conocimiento; la representación rica del problema —illness scripts, experiencia con feedback— es la condición de todo lo demás, y ningún método, HII-D incluido, compensa no saber medicina. Contra el escepticismo total: de esa evidencia no se sigue que la única intervención posible sea enseñar más contenido. Lo que este libro propone no es vigilancia interna permanente ni listas universales, las versiones que la evidencia ha desinflado, sino artefactos externos y selectivos. Un lenguaje que obliga a graduar afirmaciones; una estructura de nota que conserva las capas; pausas activadas por disparadores definidos; circuitos de feedback que conviertan experiencia en calibración. Es una apuesta con compromisos observables (véase el capítulo 15): si estas herramientas no cambian conductas medibles, deben abandonarse como cualquier hipótesis mimada. Entre tanto, la controversia se enseña mejor de lo que se oculta: un residente que conoce el debate sabrá desconfiar por igual del catálogo de sesgos como solución universal y del nihilismo pedagógico como coartada.</w:t>
       </w:r>
     </w:p>
     <w:p>
@@ -13167,7 +13236,7 @@
         <w:pStyle w:val="BodyJ"/>
       </w:pPr>
       <w:r>
-        <w:t xml:space="preserve">La entrega de turno debe transmitir tareas epistémicas, no sólo tratamientos. "Pendiente observar si…" y "si ocurre X, reabrir Y" son componentes de seguridad.</w:t>
+        <w:t xml:space="preserve">La entrega de turno debe transmitir tareas epistémicas, no sólo tratamientos. «Pendiente observar si…» y «si ocurre X, reabrir Y» son componentes de seguridad.</w:t>
       </w:r>
     </w:p>
     <w:p>
@@ -13266,7 +13335,7 @@
         <w:pStyle w:val="BodyJ"/>
       </w:pPr>
       <w:r>
-        <w:t xml:space="preserve">La cultura importa. Un residente debe poder decir "no entiendo este dato" sin perder legitimidad; una enfermera debe poder señalar que la evolución no coincide con el diagnóstico; un especialista debe explicitar límites; un jefe debe corregirse en público. La revisabilidad se aprende por modelamiento.</w:t>
+        <w:t xml:space="preserve">La cultura importa. Un residente debe poder decir «no entiendo este dato» sin perder legitimidad; una enfermera debe poder señalar que la evolución no coincide con el diagnóstico; un especialista debe explicitar límites; un jefe debe corregirse en público. La revisabilidad se aprende por modelamiento.</w:t>
       </w:r>
     </w:p>
     <w:p>
@@ -13346,7 +13415,7 @@
         <w:t xml:space="preserve">Solución comentada.</w:t>
       </w:r>
       <w:r>
-        <w:t xml:space="preserve"> A modo de ejemplo, una descripción honesta puede parecerse a esto: dos a cuatro minutos por paciente, habla quien presenta y decide quien dirige, se pregunta "¿cómo está?" y "¿qué le falta?", y casi nunca "¿qué nos haría cambiar?". El rediseño más barato es esa tercera pregunta, hecha sólo a los pacientes que cumplen un disparador (reconsulta, discordancia entre gravedad y diagnóstico, 72 horas sin discusión): cuesta alrededor de un minuto por caso seleccionado y produce, de inmediato, criterios de reapertura que antes no existían. Si el rediseño necesita más de tres cambios o más de diez minutos por visita, probablemente está diseñando una reunión nueva en lugar de mejorar la que existe — y las reuniones nuevas mueren por inasistencia.</w:t>
+        <w:t xml:space="preserve"> A modo de ejemplo, una descripción honesta puede parecerse a esto: dos a cuatro minutos por paciente, habla quien presenta y decide quien dirige, se pregunta «¿cómo está?» y «¿qué le falta?», y casi nunca «¿qué nos haría cambiar?». El rediseño más barato es esa tercera pregunta, hecha sólo a los pacientes que cumplen un disparador (reconsulta, discordancia entre gravedad y diagnóstico, 72 horas sin discusión): cuesta alrededor de un minuto por caso seleccionado y produce, de inmediato, criterios de reapertura que antes no existían. Si el rediseño necesita más de tres cambios o más de diez minutos por visita, probablemente está diseñando una reunión nueva en lugar de mejorar la que existe — y las reuniones nuevas mueren por inasistencia.</w:t>
       </w:r>
     </w:p>
     <w:p>
@@ -13514,7 +13583,7 @@
         <w:pStyle w:val="BodyJ"/>
       </w:pPr>
       <w:r>
-        <w:t xml:space="preserve">Pero el dato más instructivo sobre el rol diagnóstico real es otro: un ensayo aleatorizado entregó a internistas un modelo de lenguaje como apoyo para resolver casos clínicos. El grupo con el modelo no diagnosticó mejor que el grupo sin él — y el modelo solo, sin médico, superó a ambos (Goh et al., 2024). La lectura fácil ("la máquina ya es mejor") pasa por alto la lección metacognitiva: el eslabón débil no fue el modelo ni el médico, sino la conversación entre ambos. Los clínicos usaron la herramienta como oráculo de confirmación — pegarle el caso y mirar si coincide con lo que ya pensaban — en vez de usarla para lo que mejor hace: ampliar el espacio de hipótesis, proponer el contraejemplo, señalar el dato que no encaja. La generación de alternativas es el momento creativo del diagnóstico; usada ahí, la IA es un multiplicador. Usada como confirmadora rápida, es un espejo del anclaje.</w:t>
+        <w:t xml:space="preserve">Pero el dato más instructivo sobre el rol diagnóstico real es otro: un ensayo aleatorizado entregó a internistas un modelo de lenguaje como apoyo para resolver casos clínicos. El grupo con el modelo no diagnosticó mejor que el grupo sin él — y el modelo solo, sin médico, superó a ambos (Goh et al., 2024). La lectura fácil («la máquina ya es mejor») pasa por alto la lección metacognitiva: el eslabón débil no fue el modelo ni el médico, sino la conversación entre ambos. Los clínicos usaron la herramienta como oráculo de confirmación — pegarle el caso y mirar si coincide con lo que ya pensaban — en vez de usarla para lo que mejor hace: ampliar el espacio de hipótesis, proponer el contraejemplo, señalar el dato que no encaja. La generación de alternativas es el momento creativo del diagnóstico; usada ahí, la IA es un multiplicador. Usada como confirmadora rápida, es un espejo del anclaje.</w:t>
       </w:r>
     </w:p>
     <w:p>
@@ -13539,15 +13608,15 @@
         <w:pStyle w:val="BodyJ"/>
       </w:pPr>
       <w:r>
-        <w:t xml:space="preserve">En la terapéutica la IA llega antes y por caminos menos visibles: alertas de deterioro, predictores de sepsis, sugerencias de dosis, detección de interacciones, estratificaciones de riesgo que deciden quién entra a un programa de cuidados. Aquí la evidencia ya dejó una parábola completa. Un modelo propietario de predicción de sepsis, desplegado en cientos de hospitales, fue validado externamente recién después de su adopción masiva: discriminaba mal, calibraba peor y generaba una carga de alertas capaz de fatigar a cualquier equipo (Wong et al., 2021). La falla profunda no fue estadística sino epistemológica: el sistema se adoptó sin exigirle la evidencia local que este libro pide para cualquier afirmación — ¿funciona aquí, con estos pacientes, con esta prevalencia? Una herramienta no hereda la validez de su marca, y la validación externa no es un trámite: es la diferencia entre una alerta y un ruido.</w:t>
-      </w:r>
-    </w:p>
-    <w:p>
-      <w:pPr>
-        <w:pStyle w:val="BodyJ"/>
-      </w:pPr>
-      <w:r>
-        <w:t xml:space="preserve">Hay un segundo límite terapéutico más silencioso. Una recomendación de intervención generada por IA opera sobre lo que está escrito, y el capítulo 10 mostró que lo menos escrito de la ficha es precisamente el contexto global — funcionalidad basal, pronóstico de fondo, red de apoyo, fines del paciente. Un sistema que no ve esos hechos no puede ponderarlos: recomendará la intervención "indicada" para la enfermedad documentada, que es exactamente el error de la indicación aislada. La IA no exime del cruce con la bioética; lo vuelve más urgente, porque automatiza la mitad técnica del razonamiento y deja la otra mitad — la que juzga si la intervención es proporcionada para este enfermo — enteramente del lado humano.</w:t>
+        <w:t xml:space="preserve">En la terapéutica la IA llega antes y por caminos menos visibles: alertas de deterioro, predictores de sepsis, sugerencias de dosis, detección de interacciones, estratificaciones de riesgo que deciden quién entra a un programa de cuidados. Aquí la evidencia ya dejó una parábola completa. Un modelo propietario de predicción de sepsis, desplegado en cientos de hospitales, fue validado externamente recién después de su adopción masiva: discriminaba mal, calibraba peor y generaba una carga de alertas capaz de fatigar a cualquier equipo (Wong et al., 2021). La falla profunda no fue estadística sino epistemológica: el sistema se adoptó sin exigirle la evidencia local que este libro pide para cualquier afirmación — ¿funciona aquí, con estos pacientes, con esta prevalencia? Una herramienta no hereda la validez de su marca, y la validación externa no es un trámite, sino la diferencia entre una alerta y un ruido.</w:t>
+      </w:r>
+    </w:p>
+    <w:p>
+      <w:pPr>
+        <w:pStyle w:val="BodyJ"/>
+      </w:pPr>
+      <w:r>
+        <w:t xml:space="preserve">Hay un segundo límite terapéutico más silencioso. Una recomendación de intervención generada por IA opera sobre lo que está escrito, y el capítulo 10 mostró que lo menos escrito de la ficha es precisamente el contexto global — funcionalidad basal, pronóstico de fondo, red de apoyo, fines del paciente. Un sistema que no ve esos hechos no puede ponderarlos: recomendará la intervención «indicada» para la enfermedad documentada, que es el error de la indicación aislada. La IA no exime del cruce con la bioética; lo vuelve más urgente, porque automatiza la mitad técnica del razonamiento y deja la otra mitad — la que juzga si la intervención es proporcionada para este enfermo — enteramente del lado humano.</w:t>
       </w:r>
     </w:p>
     <w:p>
@@ -13572,7 +13641,7 @@
         <w:pStyle w:val="BodyJ"/>
       </w:pPr>
       <w:r>
-        <w:t xml:space="preserve">Los riesgos de la IA clínica ya no son especulación: tienen literatura propia, y las advertencias sobre las consecuencias no intencionadas del aprendizaje automático —automatizar los sesgos de los datos, erosionar habilidades por deferencia— preceden a los modelos generativos (Cabitza et al., 2017). Conviene tenerlos en catálogo, con su parentesco epistémico a la vista:</w:t>
+        <w:t xml:space="preserve">Los riesgos de la IA clínica ya no son especulación: tienen literatura propia, y las advertencias sobre las consecuencias no intencionadas del aprendizaje automático —automatizar los sesgos de los datos, erosionar habilidades por deferencia— preceden a los modelos generativos (Cabitza et al., 2017). Vale tenerlos en catálogo, con su parentesco epistémico a la vista:</w:t>
       </w:r>
     </w:p>
     <w:p>
@@ -13629,7 +13698,7 @@
         <w:t xml:space="preserve">Atrofia de la pericia.</w:t>
       </w:r>
       <w:r>
-        <w:t xml:space="preserve"> La evidencia más inquietante es reciente: endoscopistas expuestos durante meses a la detección asistida de pólipos detectaron significativamente menos adenomas al volver a trabajar sin asistencia — seis puntos absolutos menos que antes de la exposición (Budzyń et al., 2025). La pericia perceptual se mantiene con práctica; si la máquina practica por nosotros, la cuenta llega en la primera guardia sin máquina.</w:t>
+        <w:t xml:space="preserve"> La evidencia más inquietante es reciente: endoscopistas expuestos durante meses a la detección asistida de pólipos detectaron significativamente menos adenomas al volver a trabajar sin asistencia — seis puntos absolutos menos que antes de la exposición (Budzyń et al., 2025). La pericia perceptual se mantiene con práctica; si la máquina practica por el clínico, la cuenta llega en la primera guardia sin máquina.</w:t>
       </w:r>
     </w:p>
     <w:p>
@@ -13667,7 +13736,7 @@
         <w:t xml:space="preserve">Sobreconfianza no calibrada.</w:t>
       </w:r>
       <w:r>
-        <w:t xml:space="preserve"> La confianza verbalizada de los modelos tiende a la sobreconfianza sistemática (Kadavath et al., 2022; Xiong et al., 2024): el "estoy bastante seguro" del modelo es tono, no calibración — la sobreconfianza humana, sin siquiera un historial propio de errores que la eduque. Y cuando el modelo "critica" o "revisa" su propia respuesta, esa autocrítica puede ser otra generación entrenada para imitar la evaluación: la pregunta práctica no es si el sistema sabe que sabe, sino si sus señales de confianza están empíricamente calibradas.</w:t>
+        <w:t xml:space="preserve"> La confianza verbalizada de los modelos tiende a la sobreconfianza sistemática (Kadavath et al., 2022; Xiong et al., 2024): el «estoy bastante seguro» del modelo es tono, no calibración — la sobreconfianza humana, sin siquiera un historial propio de errores que la eduque. Y cuando el modelo «critica» o «revisa» su propia respuesta, esa autocrítica puede ser otra generación entrenada para imitar la evaluación: la pregunta práctica no es si el sistema sabe que sabe, sino si sus señales de confianza están empíricamente calibradas.</w:t>
       </w:r>
     </w:p>
     <w:p>
@@ -13810,53 +13879,53 @@
         <w:pStyle w:val="BodyJ"/>
       </w:pPr>
       <w:r>
-        <w:t xml:space="preserve">Hay un riesgo más lento que todos los del catálogo, y puede importar más: el efecto de la IA sobre quien todavía está aprendiendo a razonar. La educación médica ya le puso nombres a la tríada (Abdulnour et al., 2025): </w:t>
-      </w:r>
-      <w:r>
-        <w:rPr>
-          <w:i/>
-          <w:iCs/>
-        </w:rPr>
-        <w:t xml:space="preserve">deskilling</w:t>
-      </w:r>
-      <w:r>
-        <w:t xml:space="preserve"> — sé razonar, delego repetidamente, dejo de ejercitar, la capacidad se deteriora—; </w:t>
-      </w:r>
-      <w:r>
-        <w:rPr>
-          <w:i/>
-          <w:iCs/>
-        </w:rPr>
-        <w:t xml:space="preserve">never-skilling</w:t>
-      </w:r>
-      <w:r>
-        <w:t xml:space="preserve"> — la IA estuvo disponible desde el inicio de la formación, la operación cognitiva nunca se ejecutó las veces necesarias, la competencia nunca se consolidó—; y </w:t>
-      </w:r>
-      <w:r>
-        <w:rPr>
-          <w:i/>
-          <w:iCs/>
-        </w:rPr>
-        <w:t xml:space="preserve">mis-skilling</w:t>
-      </w:r>
-      <w:r>
-        <w:t xml:space="preserve"> — se aprendió, pero patrones incorrectos, imitando salidas que nadie auditaba—. El segundo es el más grave porque es invisible: la habilidad perdida deja un recuerdo y una alarma; la que nunca se construyó no deja nada que echar de menos.</w:t>
-      </w:r>
-    </w:p>
-    <w:p>
-      <w:pPr>
-        <w:pStyle w:val="BodyJ"/>
-      </w:pPr>
-      <w:r>
-        <w:t xml:space="preserve">El mecanismo es preciso. Escribir la nota clínica no es registrar un pensamiento terminado: seleccionar qué dato importa, jerarquizarlo y estructurarlo es parte del proceso mismo de pensar — la ficha como instrumento de pensamiento. Por eso la automatización completa de la escritura clínica no ahorra sólo tiempo: puede eliminar la instancia en la que el clínico construye su razonamiento, degradando el registro y al registrador a la vez (McCoy et al., 2024). La ecuación merece escribirse entera: ahorro de trabajo cognitivo inmediato, a cambio de las operaciones mediante las cuales se construye la competencia.</w:t>
-      </w:r>
-    </w:p>
-    <w:p>
-      <w:pPr>
-        <w:pStyle w:val="BodyJ"/>
-      </w:pPr>
-      <w:r>
-        <w:t xml:space="preserve">Hay un tercer fenómeno que ni siquiera exige que la IA se equivoque: la captura cognitiva. Quien ve primero la respuesta del modelo ya no genera hipótesis desde el caso: su búsqueda de alternativas, su lectura de los datos y su ponderación posterior quedan condicionadas por lo que ya leyó — el anclaje de siempre, con la diferencia de que aquí el ancla puede llegar antes que el paciente. Una IA excelente que entrega demasiado pronto la hipótesis, la síntesis o la inferencia que el aprendiz debía producir no daña la respuesta de hoy; daña la arquitectura del aprendizaje. Porque el valor cognitivo de un caso no está sólo en llegar a la conclusión correcta: está en ejecutar las operaciones que permiten llegar a ella, revisarla y, cuando corresponde, abandonarla. Una herramienta que aumenta el porcentaje de respuestas correctas puede, paradójicamente, mejorar el desempeño de hoy mientras empeora al razonador de mañana.</w:t>
+        <w:t xml:space="preserve">Hay un riesgo más lento que todos los del catálogo, y puede importar más: el efecto de la IA sobre quien todavía está aprendiendo a razonar. La educación médica ya le puso nombres a la tríada (Abdulnour et al., 2025). </w:t>
+      </w:r>
+      <w:r>
+        <w:rPr>
+          <w:i/>
+          <w:iCs/>
+        </w:rPr>
+        <w:t xml:space="preserve">Deskilling</w:t>
+      </w:r>
+      <w:r>
+        <w:t xml:space="preserve">: sé razonar, delego repetidamente, dejo de ejercitar, la capacidad se deteriora. </w:t>
+      </w:r>
+      <w:r>
+        <w:rPr>
+          <w:i/>
+          <w:iCs/>
+        </w:rPr>
+        <w:t xml:space="preserve">Never-skilling</w:t>
+      </w:r>
+      <w:r>
+        <w:t xml:space="preserve">: la IA estuvo disponible desde el inicio de la formación, la operación cognitiva nunca se ejecutó las veces necesarias, la competencia nunca se consolidó. </w:t>
+      </w:r>
+      <w:r>
+        <w:rPr>
+          <w:i/>
+          <w:iCs/>
+        </w:rPr>
+        <w:t xml:space="preserve">Mis-skilling</w:t>
+      </w:r>
+      <w:r>
+        <w:t xml:space="preserve">: se aprendió, pero patrones incorrectos, imitando salidas que nadie auditaba. El segundo es el más grave porque es invisible: la habilidad perdida deja un recuerdo y una alarma; la que nunca se construyó no deja nada que echar de menos.</w:t>
+      </w:r>
+    </w:p>
+    <w:p>
+      <w:pPr>
+        <w:pStyle w:val="BodyJ"/>
+      </w:pPr>
+      <w:r>
+        <w:t xml:space="preserve">El mecanismo es preciso. Escribir la nota clínica no es registrar un pensamiento terminado: seleccionar qué dato importa, jerarquizarlo y estructurarlo es parte del proceso mismo de pensar — la ficha como instrumento de pensamiento. Por eso la automatización completa de la escritura clínica no ahorra sólo tiempo: puede eliminar la instancia en la que el clínico construye su razonamiento, degradando el registro y al registrador a la vez (McCoy et al., 2024). La ecuación hay que escribirla entera: ahorro de trabajo cognitivo inmediato, a cambio de las operaciones mediante las cuales se construye la competencia.</w:t>
+      </w:r>
+    </w:p>
+    <w:p>
+      <w:pPr>
+        <w:pStyle w:val="BodyJ"/>
+      </w:pPr>
+      <w:r>
+        <w:t xml:space="preserve">Hay un tercer fenómeno que ni siquiera exige que la IA se equivoque: la captura cognitiva. Quien ve primero la respuesta del modelo ya no genera hipótesis desde el caso: su búsqueda de alternativas, su lectura de los datos y su ponderación posterior quedan condicionadas por lo que ya leyó. Es el anclaje de siempre, con la diferencia de que aquí el ancla puede llegar antes que el paciente. Una IA excelente que entrega demasiado pronto la hipótesis, la síntesis o la inferencia que el aprendiz debía producir no daña la respuesta de hoy; daña la arquitectura del aprendizaje. Porque el valor cognitivo de un caso no está sólo en llegar a la conclusión correcta: está en ejecutar las operaciones que permiten llegar a ella, revisarla y, cuando corresponde, abandonarla. Una herramienta que aumenta el porcentaje de respuestas correctas puede, paradójicamente, mejorar el desempeño de hoy mientras empeora al razonador de mañana.</w:t>
       </w:r>
     </w:p>
     <w:p>
@@ -13889,15 +13958,15 @@
         <w:pStyle w:val="BodyJ"/>
       </w:pPr>
       <w:r>
-        <w:t xml:space="preserve">Hay una aplicación que ya está en las consultas y que toca el nervio de este libro: los escribas ambientales. Un micrófono escucha la conversación y un modelo redacta la nota. La adopción fue rápida: en un sistema integrado de Estados Unidos, cerca de 3.400 médicos usaron la herramienta en unas 300.000 consultas durante las diez semanas posteriores a su despliegue, con menos tiempo de documentación y mayor satisfacción (Tierney et al., 2024). El atractivo es real: devuelve al médico la mirada que la pantalla le robaba. Pero una conversación clínica no viene con capas. El médico dice "esto parece una neumonía, pero no me cierra la saturación", y la nota generada a partir de esa frase puede decir "neumonía". La duda dicha en voz alta se vuelve afirmación impresa; la modalidad epistémica —el "parece", el "no me cierra"— es exactamente lo que un resumen tiende a aplanar. Los primeros estudios con encuentros simulados muestran que el problema no es sólo teórico: al poner a prueba dos productos comerciales sobre once consultas guionadas, 31 de las 44 notas generadas contenían al menos un error, con una media de casi tres por nota; el tipo dominante fue la omisión —lo dicho en la consulta y ausente en la nota: 83% de los errores de un producto y 54% de los del otro—, seguida de contenido agregado o incorrecto (Biro et al., 2025).</w:t>
-      </w:r>
-    </w:p>
-    <w:p>
-      <w:pPr>
-        <w:pStyle w:val="BodyJ"/>
-      </w:pPr>
-      <w:r>
-        <w:t xml:space="preserve">De ahí una regla de diseño que este libro puede proponer con su propio vocabulario. Un escriba ambiental puede automatizar la capa H —qué se dijo, qué se midió, con hora y fuente— y hacerlo mejor que un humano cansado. No debería autocompletar la capa D ni la frase medular: la decisión, el criterio de reapertura y el grado de la inferencia tienen que salir de la mano del clínico, porque escribirlos es la instancia en que se piensan (McCoy et al., 2024). Donde la herramienta llene las cuatro capas, el never-skilling del apartado anterior tiene su vía de entrada más cómoda: notas impecables firmadas por médicos que ya no las construyen. La prueba de un buen escriba no es que la nota se lea bien; es que conserve el "no me cierra".</w:t>
+        <w:t xml:space="preserve">Hay una aplicación que ya está en las consultas y que toca el nervio de este libro: los escribas ambientales. Un micrófono escucha la conversación y un modelo redacta la nota. La adopción fue rápida: en un sistema integrado de Estados Unidos, cerca de 3.400 médicos usaron la herramienta en unas 300.000 consultas durante las diez semanas posteriores a su despliegue, con menos tiempo de documentación y mayor satisfacción (Tierney et al., 2024). El atractivo es real: devuelve al médico la mirada que la pantalla le robaba. Pero una conversación clínica no viene con capas. El médico dice «esto parece una neumonía, pero no me cierra la saturación», y la nota generada a partir de esa frase puede decir «neumonía». La duda dicha en voz alta se vuelve afirmación impresa; la modalidad epistémica —el «parece», el «no me cierra»— es lo que un resumen tiende a aplanar. Los primeros estudios con encuentros simulados sugieren que el problema no es sólo teórico. Al poner a prueba dos productos comerciales sobre once consultas guionadas, 31 de las 44 notas generadas contenían al menos un error, con una media de casi tres por nota. El tipo dominante fue la omisión, lo dicho en la consulta y ausente en la nota: 83% de los errores de un producto y 54% de los del otro, seguida de contenido agregado o incorrecto (Biro et al., 2025).</w:t>
+      </w:r>
+    </w:p>
+    <w:p>
+      <w:pPr>
+        <w:pStyle w:val="BodyJ"/>
+      </w:pPr>
+      <w:r>
+        <w:t xml:space="preserve">De ahí una regla de diseño que este libro puede proponer con su propio vocabulario. Un escriba ambiental puede automatizar la capa H —qué se dijo, qué se midió, con hora y fuente— y hacerlo mejor que un humano cansado. No debería autocompletar la capa D ni la frase medular: la decisión, el criterio de reapertura y el grado de la inferencia tienen que salir de la mano del clínico, porque escribirlos es la instancia en que se piensan (McCoy et al., 2024). Donde la herramienta llene las cuatro capas, el never-skilling del apartado anterior tiene su vía de entrada más cómoda: notas impecables firmadas por médicos que ya no las construyen. La prueba de un buen escriba no es que la nota se lea bien; es que conserve el «no me cierra».</w:t>
       </w:r>
     </w:p>
     <w:p>
@@ -13922,7 +13991,7 @@
         <w:pStyle w:val="BodyJ"/>
       </w:pPr>
       <w:r>
-        <w:t xml:space="preserve">La primera defensa ya está en este libro. El clínico responsable puede distinguir "lo vi", "lo infiero" y "no lo sé"; un modelo suele mezclar esas capas si nadie le exige separación, y puede transformar ausencia de información en un detalle probable, porque su objetivo generativo favorece la continuidad. La matriz HII-D funciona entonces como protocolo de auditoría de cualquier salida de IA:</w:t>
+        <w:t xml:space="preserve">La primera defensa ya está en este libro. El clínico responsable puede distinguir «lo vi», «lo infiero» y «no lo sé»; un modelo suele mezclar esas capas si nadie le exige separación, y puede transformar ausencia de información en un detalle probable, porque su objetivo generativo favorece la continuidad. La matriz HII-D funciona entonces como protocolo de auditoría de cualquier salida de IA:</w:t>
       </w:r>
     </w:p>
     <w:p>
@@ -14059,7 +14128,7 @@
         <w:t xml:space="preserve">Usar la herramienta para abrir, no para cerrar.</w:t>
       </w:r>
       <w:r>
-        <w:t xml:space="preserve"> Pedir alternativas, contraejemplos y "qué no encaja con este diagnóstico" aprovecha exactamente lo que el ensayo de Goh mostró que desaprovechamos; pedirle confirmación de la hipótesis propia industrializa el anclaje.</w:t>
+        <w:t xml:space="preserve"> Pedir alternativas, contraejemplos y «qué no encaja con este diagnóstico» aprovecha lo que el ensayo de Goh mostró que los médicos desaprovechan; pedirle confirmación de la hipótesis propia industrializa el anclaje.</w:t>
       </w:r>
     </w:p>
     <w:p>
@@ -14244,7 +14313,7 @@
         <w:t xml:space="preserve">Formación que supervise el uso, no sólo la respuesta.</w:t>
       </w:r>
       <w:r>
-        <w:t xml:space="preserve"> En docencia, observar cómo el aprendiz usa cognitivamente la herramienta — cuándo consulta, qué acepta, qué verifica, qué habría respondido antes de mirar — y proteger espacios deliberados de práctica sin asistencia (Abdulnour et al., 2025): la competencia que nunca se construyó no se puede "recuperar".</w:t>
+        <w:t xml:space="preserve"> En docencia, observar cómo el aprendiz usa cognitivamente la herramienta — cuándo consulta, qué acepta, qué verifica, qué habría respondido antes de mirar — y proteger espacios deliberados de práctica sin asistencia (Abdulnour et al., 2025): la competencia que nunca se construyó no se puede «recuperar».</w:t>
       </w:r>
     </w:p>
     <w:p>
@@ -14287,7 +14356,7 @@
         <w:pStyle w:val="BodyJ"/>
       </w:pPr>
       <w:r>
-        <w:t xml:space="preserve">Tome un caso real ya resuelto de su servicio —debidamente anonimizado— y péguelo en un asistente de lenguaje pidiendo evaluación y plan. Imprima la respuesta y márquela con tres colores: (1) afirmaciones sustentadas en datos que el caso contenía; (2) contenido que el modelo agregó — detalles "típicos", causalidades, datos que nadie le dio; (3) incertidumbre declarada. Después, haga una segunda pregunta al modelo: "¿qué evidencia haría improbable tu diagnóstico principal?".</w:t>
+        <w:t xml:space="preserve">Tome un caso real ya resuelto de su servicio —debidamente anonimizado— y péguelo en un asistente de lenguaje pidiendo evaluación y plan. Imprima la respuesta y márquela con tres colores: (1) afirmaciones sustentadas en datos que el caso contenía; (2) contenido que el modelo agregó — detalles «típicos», causalidades, datos que nadie le dio; (3) incertidumbre declarada. Después, haga una segunda pregunta al modelo: «¿qué evidencia haría improbable tu diagnóstico principal?».</w:t>
       </w:r>
     </w:p>
     <w:p>
@@ -14302,7 +14371,7 @@
         <w:t xml:space="preserve">Solución comentada.</w:t>
       </w:r>
       <w:r>
-        <w:t xml:space="preserve"> En ejercicios docentes, tres hallazgos vuelven una y otra vez. Primero, el color 2 aparece más de lo esperado: el modelo rellena huecos con verosimilitud — una evolución "esperable", un factor de riesgo "presumible" — y esa es exactamente la definición de confabulación; contarlas cura más que leer sobre ellas. Segundo, el color 3 suele ser genérico ("se sugiere correlacionar con la clínica") y no específico del caso: incertidumbre de fórmula, no de contenido — compárela con la que exige el léxico de certeza. Tercero, la respuesta a la segunda pregunta suele ser mejor que la primera: el modelo enumera con soltura los datos que refutarían su propia propuesta — pero sólo si alguien se lo pide. La herramienta contiene su propio antídoto; la pregunta que lo libera sigue siendo humana.</w:t>
+        <w:t xml:space="preserve"> En ejercicios docentes, tres hallazgos vuelven una y otra vez. Primero, el color 2 aparece más de lo esperado: el modelo rellena huecos con verosimilitud — una evolución «esperable», un factor de riesgo «presumible» — y esa es exactamente la definición de confabulación; contarlas cura más que leer sobre ellas. Segundo, el color 3 suele ser genérico («se sugiere correlacionar con la clínica») y no específico del caso: incertidumbre de fórmula, no de contenido — compárela con la que exige el léxico de certeza. Tercero, la respuesta a la segunda pregunta suele ser mejor que la primera: el modelo enumera con soltura los datos que refutarían su propia propuesta — pero sólo si alguien se lo pide. La herramienta contiene su propio antídoto; la pregunta que lo libera sigue siendo humana.</w:t>
       </w:r>
     </w:p>
     <w:p>
@@ -14404,7 +14473,7 @@
         <w:pStyle w:val="BodyJ"/>
       </w:pPr>
       <w:r>
-        <w:t xml:space="preserve">Hay un momento que los tratados no describen y todo clínico conoce: tres hallazgos sueltos —una taquicardia sin fiebre, un abdomen que "no convence", una frase de la hija— se ordenan de golpe bajo una sola explicación, y algo hace clic. El placer de ese instante no es administrativo. Es físico, breve y sospechosamente parecido al de un verso que cae en su lugar. Este capítulo toma ese parecido en serio: no como adorno humanista, sino como información sobre cómo funciona —y cómo falla— el juicio.</w:t>
+        <w:t xml:space="preserve">Hay un momento que los tratados no describen y todo clínico conoce: tres hallazgos sueltos —una taquicardia sin fiebre, un abdomen que «no convence», una frase de la hija— se ordenan de golpe bajo una sola explicación, y algo hace clic. El placer de ese instante no es administrativo. Es físico, breve y sospechosamente parecido al de un verso que cae en su lugar. Este capítulo toma ese parecido en serio: no como adorno humanista, sino como información sobre cómo funciona —y cómo falla— el juicio.</w:t>
       </w:r>
     </w:p>
     <w:p>
@@ -14437,7 +14506,7 @@
         <w:pStyle w:val="BodyJ"/>
       </w:pPr>
       <w:r>
-        <w:t xml:space="preserve">El parentesco es lógico antes que sentimental. Una metáfora es la hipótesis de que dos cosas lejanas comparten estructura; un diagnóstico es una metáfora que acepta ser puesta a prueba — "este cuadro es una colecistitis" apuesta a que lo que ocurre en este cuerpo comparte estructura con un patrón aprendido. Ambos movimientos son la abducción del capítulo 2, y ambos requieren el estado que este libro llamó humildad en funciones: sostener la conjetura con fuerza suficiente para trabajarla y soltura suficiente para dejarla caer. Bohm lo dijo desde la física: el acto creativo central —percibir un orden nuevo en lo que ya estaba a la vista— es el mismo en el arte y en la ciencia; cambian los materiales y el tribunal (Bohm, 1996).</w:t>
+        <w:t xml:space="preserve">El parentesco es lógico antes que sentimental. Una metáfora es la hipótesis de que dos cosas lejanas comparten estructura; un diagnóstico es una metáfora que acepta ser puesta a prueba — «este cuadro es una colecistitis» apuesta a que lo que ocurre en este cuerpo comparte estructura con un patrón aprendido. Ambos movimientos son la abducción del capítulo 2, y ambos requieren el estado que este libro llamó humildad en funciones: sostener la conjetura con fuerza suficiente para trabajarla y soltura suficiente para dejarla caer. Bohm lo dijo desde la física: el acto creativo central —percibir un orden nuevo en lo que ya estaba a la vista— es el mismo en el arte y en la ciencia; cambian los materiales y el tribunal (Bohm, 1996).</w:t>
       </w:r>
     </w:p>
     <w:p>
@@ -14462,15 +14531,15 @@
         <w:pStyle w:val="BodyJ"/>
       </w:pPr>
       <w:r>
-        <w:t xml:space="preserve">En 1916, Vicente Huidobro escribió el manifiesto de una poesía que no quería describir el mundo sino aumentarlo: "Por qué cantáis la rosa, ¡oh Poetas! / Hacedla florecer en el poema". Y remató con la línea más citada del creacionismo: "El poeta es un pequeño Dios" (Huidobro, 1916). El poema no canta la rosa: la crea. Como programa poético es glorioso. Como descripción de lo que el lenguaje puede hacer, es exactamente el peligro contra el que este libro lleva diecisiete capítulos escribiendo.</w:t>
-      </w:r>
-    </w:p>
-    <w:p>
-      <w:pPr>
-        <w:pStyle w:val="BodyJ"/>
-      </w:pPr>
-      <w:r>
-        <w:t xml:space="preserve">Porque la ficha clínica también hace florecer rosas. La "neumonía aspirativa" del prefacio —dos palabras limpias que crearon un antecedente que nadie observó— es creacionismo puro; el "somatiza" de la viñeta 8, también. El mecanismo ya es conocido: la ficha produce lo visible, y sus criaturas verbales adquieren vida institucional. La diferencia con la poesía es brutal: las rosas de Huidobro viven en el poema; las nuestras reciben antibióticos, cirugías y altas. El lenguaje clínico descuidado es creacionista por defecto — y un servicio lleno de pequeños dioses es un lugar peligroso para estar enfermo.</w:t>
+        <w:t xml:space="preserve">En 1916, Vicente Huidobro escribió el manifiesto de una poesía que no quería describir el mundo sino aumentarlo: «Por qué cantáis la rosa, ¡oh Poetas! / Hacedla florecer en el poema». Y remató con la línea más citada del creacionismo: «El poeta es un pequeño Dios» (Huidobro, 1916). El poema no canta la rosa: la crea. Como programa poético es glorioso. Como descripción de lo que el lenguaje puede hacer, es el peligro contra el que este libro lleva diecisiete capítulos escribiendo.</w:t>
+      </w:r>
+    </w:p>
+    <w:p>
+      <w:pPr>
+        <w:pStyle w:val="BodyJ"/>
+      </w:pPr>
+      <w:r>
+        <w:t xml:space="preserve">Porque la ficha clínica también hace florecer rosas. La «neumonía aspirativa» del prefacio —dos palabras limpias que crearon un antecedente que nadie observó— es creacionismo puro; el «somatiza» de la viñeta 8, también. El mecanismo ya es conocido: la ficha produce lo visible, y sus criaturas verbales adquieren vida institucional. La diferencia con la poesía es brutal: las rosas de Huidobro viven en el poema; las nuestras reciben antibióticos, cirugías y altas. El lenguaje clínico descuidado es creacionista por defecto — y un servicio lleno de pequeños dioses es un lugar peligroso para estar enfermo.</w:t>
       </w:r>
     </w:p>
     <w:p>
@@ -14495,15 +14564,15 @@
         <w:pStyle w:val="BodyJ"/>
       </w:pPr>
       <w:r>
-        <w:t xml:space="preserve">El antídoto también lo escribió un chileno, y no uno cualquiera: un profesor de mecánica racional que estudió cosmología en Oxford y sabía, por oficio diurno, lo que cuesta un dato. Nicanor Parra pasó su vida bajándole los humos a la palabra: primero con los antipoemas (Parra, 1954), después con un "Manifiesto" que es casi un léxico de certeza en verso: los poetas bajaron del Olimpo, la poesía debe escribirse en palabras de todos los días — y, con nombre y apellido implícitos, la condena de "la poesía de pequeño dios" (Parra, 1969). La réplica a Huidobro no es una interpretación: está en el texto.</w:t>
-      </w:r>
-    </w:p>
-    <w:p>
-      <w:pPr>
-        <w:pStyle w:val="BodyJ"/>
-      </w:pPr>
-      <w:r>
-        <w:t xml:space="preserve">La antipoesía es un programa epistemológico completo: quitarle a la palabra los poderes que no puede sostener y devolverla al tamaño de la experiencia. Visto desde ahí, el léxico de certeza es antipoesía aplicada: "sin evidencia actual de" es un verso parriano — feo, honesto, exacto, imposible de recitar con voz engolada. La ficha lúcida se escribe más cerca de Parra que de Huidobro: lengua de todos los días, dignidad del "no sé", desconfianza instintiva de toda frase que suene demasiado bien.</w:t>
+        <w:t xml:space="preserve">El antídoto también lo escribió un chileno, y no uno cualquiera: un profesor de mecánica racional que estudió cosmología en Oxford y sabía, por oficio diurno, lo que cuesta un dato. Nicanor Parra pasó su vida bajándole los humos a la palabra: primero con los antipoemas (Parra, 1954), después con un «Manifiesto» que es casi un léxico de certeza en verso: los poetas bajaron del Olimpo, la poesía debe escribirse en palabras de todos los días — y, con nombre y apellido implícitos, la condena de «la poesía de pequeño dios» (Parra, 1969). La réplica a Huidobro no es una interpretación: está en el texto.</w:t>
+      </w:r>
+    </w:p>
+    <w:p>
+      <w:pPr>
+        <w:pStyle w:val="BodyJ"/>
+      </w:pPr>
+      <w:r>
+        <w:t xml:space="preserve">La antipoesía es un programa epistemológico completo: quitarle a la palabra los poderes que no puede sostener y devolverla al tamaño de la experiencia. Visto desde ahí, el léxico de certeza es antipoesía aplicada: «sin evidencia actual de» es un verso parriano — feo, honesto, exacto, imposible de recitar con voz engolada. La ficha lúcida se escribe más cerca de Parra que de Huidobro: lengua de todos los días, dignidad del «no sé», desconfianza instintiva de toda frase que suene demasiado bien.</w:t>
       </w:r>
     </w:p>
     <w:p>
@@ -14569,15 +14638,15 @@
         <w:pStyle w:val="BodyJ"/>
       </w:pPr>
       <w:r>
-        <w:t xml:space="preserve">Si el parentesco es real, leer poesía no es un lujo cultural del médico: es gimnasio específico. Entrena la precisión léxica — el poeta agoniza entre dos palabras casi iguales, que es exactamente la distancia entre "descartado" y "sin evidencia actual de". Entrena la tolerancia a la ambigüedad sostenida — un poema no se "resuelve", se habita; como ciertas incertidumbres clínicas. Entrena el oído para el relato: la anamnesis tiene ritmo, silencios y palabras elegidas, y "esta vez la hernia no se dejó acomodar" es, técnicamente, un verso — el capítulo 1 pidió conservarlo textual por razones epistémicas; este capítulo agrega la razón estética, que es la misma. Y entrena, con Parra, la resistencia a la solemnidad: nadie que haya leído antipoesía vuelve a escribir "se procede a realizar manejo multidisciplinario integral" sin sonrojarse.</w:t>
-      </w:r>
-    </w:p>
-    <w:p>
-      <w:pPr>
-        <w:pStyle w:val="BodyJ"/>
-      </w:pPr>
-      <w:r>
-        <w:t xml:space="preserve">No es casualidad que el investigador principal de la saga del capítulo 9 —el ensayo que enseñó a medio mundo a mirar la piel antes que el número— escriba también poesía: el oído que distingue una palabra que trabaja de una palabra que decora es el mismo que distingue un blanco de reanimación que informa de uno que sólo tranquiliza.</w:t>
+        <w:t xml:space="preserve">Si el parentesco es real, leer poesía no es un lujo cultural del médico, sino gimnasio específico. Entrena la precisión léxica — el poeta agoniza entre dos palabras casi iguales, que es exactamente la distancia entre «descartado» y «sin evidencia actual de». Entrena la tolerancia a la ambigüedad sostenida — un poema no se «resuelve», se habita; como ciertas incertidumbres clínicas. Entrena el oído para el relato: la anamnesis tiene ritmo, silencios y palabras elegidas, y «esta vez la hernia no se dejó acomodar» es, técnicamente, un verso — el capítulo 1 pidió conservarlo textual por razones epistémicas; este capítulo agrega la razón estética, que es la misma. Y entrena, con Parra, la resistencia a la solemnidad: nadie que haya leído antipoesía vuelve a escribir «se procede a realizar manejo multidisciplinario integral» sin sonrojarse.</w:t>
+      </w:r>
+    </w:p>
+    <w:p>
+      <w:pPr>
+        <w:pStyle w:val="BodyJ"/>
+      </w:pPr>
+      <w:r>
+        <w:t xml:space="preserve">No es casualidad que el investigador principal de la saga del capítulo 9 —el ensayo que enseñó a medio mundo a mirar la piel antes que el número— escriba también poesía. El oído que distingue una palabra que trabaja de una palabra que decora es el mismo que distingue un blanco de reanimación que informa de uno que sólo tranquiliza.</w:t>
       </w:r>
     </w:p>
     <w:p>
@@ -14601,7 +14670,7 @@
         <w:pStyle w:val="BodyJ"/>
       </w:pPr>
       <w:r>
-        <w:t xml:space="preserve">Tome la frase medular de su paciente más reciente y sométala a dos preguntas. Primera: ¿hay en ella alguna palabra huidobriana — que haga florecer lo que nadie observó (un mecanismo no demostrado, una causal de contrabando, un "descartado" sin método)? Segunda: ¿puede reescribirse en palabras de todos los días sin perder un gramo de precisión — y si al traducirla se desinfla, qué la sostenía: la evidencia o la retórica?</w:t>
+        <w:t xml:space="preserve">Tome la frase medular de su paciente más reciente y sométala a dos preguntas. Primera: ¿hay en ella alguna palabra huidobriana — que haga florecer lo que nadie observó (un mecanismo no demostrado, una causal de contrabando, un «descartado» sin método)? Segunda: ¿puede reescribirse en palabras de todos los días sin perder un gramo de precisión — y si al traducirla se desinfla, qué la sostenía: la evidencia o la retórica?</w:t>
       </w:r>
     </w:p>
     <w:p>
@@ -14616,7 +14685,7 @@
         <w:t xml:space="preserve">Solución comentada.</w:t>
       </w:r>
       <w:r>
-        <w:t xml:space="preserve"> Ejemplo: "Shock séptico de foco urinario, descartándose foco abdominal". Prueba uno: "de foco urinario" hace florecer una causal (¿demostrada o presunta?), y "descartándose" es un gerundio que promete lo que todavía no ocurrió — dos rosas creadas en nueve palabras. Prueba dos, en lengua parriana: "Shock con urocultivo positivo; foco urinario probable; abdomen aún sin imagen". La segunda versión es menos imponente y más útil: sobrevive a la visita de la mañana. Si su frase pasa las dos pruebas, tiene lo que este libro entiende por estilo: exactitud que se puede defender en voz alta.</w:t>
+        <w:t xml:space="preserve"> Ejemplo: «Shock séptico de foco urinario, descartándose foco abdominal». Prueba uno: «de foco urinario» hace florecer una causal (¿demostrada o presunta?), y «descartándose» es un gerundio que promete lo que todavía no ocurrió — dos rosas creadas en nueve palabras. Prueba dos, en lengua parriana: «Shock con urocultivo positivo; foco urinario probable; abdomen aún sin imagen». La segunda versión es menos imponente y más útil: sobrevive a la visita de la mañana. Si su frase pasa las dos pruebas, tiene lo que este libro entiende por estilo: exactitud que se puede defender en voz alta.</w:t>
       </w:r>
     </w:p>
     <w:p>
@@ -14656,7 +14725,7 @@
         </w:numPr>
       </w:pPr>
       <w:r>
-        <w:t xml:space="preserve">¿Qué palabra de mi última nota está "haciendo florecer" algo que nadie observó?</w:t>
+        <w:t xml:space="preserve">¿Qué palabra de mi última nota está «haciendo florecer» algo que nadie observó?</w:t>
       </w:r>
     </w:p>
     <w:p>
@@ -14714,7 +14783,7 @@
         <w:pStyle w:val="BodyJ"/>
       </w:pPr>
       <w:r>
-        <w:t xml:space="preserve">Esta tensión no es un defecto que pueda eliminarse mediante mayor seguridad retórica. Es la estructura del trabajo clínico. Los hechos llegan incompletos y situados. Las inferencias organizan su significado, pero tienen grados. La incertidumbre puede reducirse, clasificarse o tolerarse; no siempre desaparece. La decisión incorpora probabilidad y, además, consecuencias, tiempo, reversibilidad, valores y capacidad de vigilancia.</w:t>
+        <w:t xml:space="preserve">Esta tensión no es un defecto que pueda eliminarse mediante mayor seguridad retórica, sino la estructura del trabajo clínico. Los hechos llegan incompletos y situados. Las inferencias organizan su significado, pero tienen grados. La incertidumbre puede reducirse, clasificarse o tolerarse; no siempre desaparece. La decisión incorpora probabilidad y, además, consecuencias, tiempo, reversibilidad, valores y capacidad de vigilancia.</w:t>
       </w:r>
     </w:p>
     <w:p>
@@ -14730,15 +14799,15 @@
         <w:pStyle w:val="BodyJ"/>
       </w:pPr>
       <w:r>
-        <w:t xml:space="preserve">El lenguaje clínico es uno de sus instrumentos más poderosos. La frase medular no es la más breve ni la más elegante. Es aquella que conserva la estructura decisiva del evento, distingue dato y explicación, expresa el grado de certeza y muestra por qué una conducta es razonable. Una frase así puede orientar a un equipo, proteger contra la inercia y mantener abierta la posibilidad de corrección. La historia de Carmen, que acompañó todo este libro, empezó con la frase contraria —"cuadro habitual, manejo habitual"— y terminó con una frase que cargaba, palabra por palabra, el trabajo de distinguir, graduar, dudar y decidir. Entre ambas frases no cambió la medicina disponible; cambió la epistemología con que se usó.</w:t>
-      </w:r>
-    </w:p>
-    <w:p>
-      <w:pPr>
-        <w:pStyle w:val="BodyJ"/>
-      </w:pPr>
-      <w:r>
-        <w:t xml:space="preserve">El mapa del comienzo (Figura 1) tendió tres hilos —las capas, el arco que va de la abducción a la humildad y el lenguaje que las conserva—; tres nudos de ese tejido conviene dejar a la vista. El primero va de la abducción a la humildad: la conjetura que crea explicaciones, la vigilancia que la acompaña mientras trabaja y la disposición que la mantiene abierta cuando ya produjo una respuesta cómoda son tres momentos de una misma lealtad al caso, y la prudencia práctica —la phronesis— es su nombre antiguo. El segundo va del dato al contexto: la funcionalidad, el pronóstico de fondo y la red de apoyo son hechos clínicos de pleno derecho, y una decisión que los omitió no es más objetiva sino más incompleta. El tercero va de la ficha al razonador: escribir la nota es parte de pensar, y por eso la inteligencia artificial —que produce exactamente la prosa fluida contra la que este libro entrena: hechos, inferencias e invenciones con la misma sintaxis— no cambia la disciplina, la vuelve urgente, sobre todo para quien todavía está formando el juicio que la herramienta ofrece reemplazar. Ante una respuesta automática como ante la propia narrativa, la pregunta es la misma: qué proviene del caso, qué fue inferido, qué permanece incierto y qué responsabilidad implica actuar.</w:t>
+        <w:t xml:space="preserve">El lenguaje clínico es uno de sus instrumentos más poderosos. La frase medular no es la más breve ni la más elegante, sino aquella que conserva la estructura decisiva del evento, distingue dato y explicación, expresa el grado de certeza y muestra por qué una conducta es razonable. Una frase así puede orientar a un equipo, proteger contra la inercia y mantener abierta la posibilidad de corrección. La historia de Carmen, que acompañó todo este libro, empezó con la frase contraria —«cuadro habitual, manejo habitual»— y terminó con una frase que cargaba, palabra por palabra, el trabajo de distinguir, graduar, dudar y decidir. Entre ambas frases no cambió la medicina disponible; cambió la epistemología con que se usó.</w:t>
+      </w:r>
+    </w:p>
+    <w:p>
+      <w:pPr>
+        <w:pStyle w:val="BodyJ"/>
+      </w:pPr>
+      <w:r>
+        <w:t xml:space="preserve">El mapa del comienzo (Figura 1) tendió tres hilos —las capas, el arco que va de la abducción a la humildad y el lenguaje que las conserva—; tres nudos de ese tejido quedan a la vista. El primero va de la abducción a la humildad. La conjetura que crea explicaciones, la vigilancia que la acompaña mientras trabaja y la disposición que la mantiene abierta cuando ya produjo una respuesta cómoda son tres momentos de una misma lealtad al caso; la prudencia práctica —la phronesis— es su nombre antiguo. El segundo va del dato al contexto: la funcionalidad, el pronóstico de fondo y la red de apoyo son hechos clínicos, y una decisión que los omitió no es más objetiva sino más incompleta. El tercero va de la ficha al razonador: escribir la nota es parte de pensar. Por eso la inteligencia artificial, que produce la prosa fluida contra la que este libro entrena —hechos, inferencias e invenciones con la misma sintaxis—, no cambia la disciplina: la vuelve urgente, sobre todo para quien todavía está formando el juicio que la herramienta ofrece reemplazar. Ante una respuesta automática como ante la propia narrativa, la pregunta es la misma: qué proviene del caso, qué fue inferido, qué permanece incierto y qué responsabilidad implica actuar.</w:t>
       </w:r>
     </w:p>
     <w:p>
@@ -14857,7 +14926,7 @@
         <w:pStyle w:val="Quote1"/>
       </w:pPr>
       <w:r>
-        <w:t xml:space="preserve">La lucidez clínica no consiste en ver la verdad completa. Consiste en no atribuir a nuestra representación más certeza de la que los hechos permiten, sin usar esa limitación como excusa para dejar de decidir.</w:t>
+        <w:t xml:space="preserve">La lucidez clínica no consiste en ver la verdad completa. Consiste en no atribuir a la propia representación más certeza de la que los hechos permiten, sin usar esa limitación como excusa para dejar de decidir.</w:t>
       </w:r>
     </w:p>
     <w:p>
@@ -14898,7 +14967,7 @@
         <w:pStyle w:val="BodyJ"/>
       </w:pPr>
       <w:r>
-        <w:t xml:space="preserve">La medicina necesita afirmaciones suficientemente firmes para coordinar acciones y suficientemente abiertas para admitir corrección. Esa doble exigencia no es una contradicción que deba resolverse eligiendo seguridad o duda. Es la forma propia del juicio clínico. La frase medular es valiosa porque condensa esa arquitectura: conserva el hecho, gradúa la inferencia, localiza la incertidumbre y hace visible la decisión.</w:t>
+        <w:t xml:space="preserve">La medicina necesita afirmaciones suficientemente firmes para coordinar acciones y suficientemente abiertas para admitir corrección. Esa doble exigencia no es una contradicción que deba resolverse eligiendo seguridad o duda, sino la forma propia del juicio clínico. La frase medular es valiosa porque condensa esa arquitectura: conserva el hecho, gradúa la inferencia, localiza la incertidumbre y hace visible la decisión.</w:t>
       </w:r>
     </w:p>
     <w:p>
@@ -15625,7 +15694,7 @@
                 <w:sz w:val="17"/>
                 <w:szCs w:val="17"/>
               </w:rPr>
-              <w:t xml:space="preserve">"Bacteriemia por E. coli documentada (2/2 hemocultivos)"</w:t>
+              <w:t xml:space="preserve">«Bacteriemia por E. coli documentada (2/2 hemocultivos)»</w:t>
             </w:r>
           </w:p>
         </w:tc>
@@ -15649,7 +15718,7 @@
                 <w:sz w:val="17"/>
                 <w:szCs w:val="17"/>
               </w:rPr>
-              <w:t xml:space="preserve">"Neumonía aspirativa documentada" (nadie presenció aspiración; la imagen no distingue mecanismo)</w:t>
+              <w:t xml:space="preserve">«Neumonía aspirativa documentada» (nadie presenció aspiración; la imagen no distingue mecanismo)</w:t>
             </w:r>
           </w:p>
         </w:tc>
@@ -15723,7 +15792,7 @@
                 <w:sz w:val="17"/>
                 <w:szCs w:val="17"/>
               </w:rPr>
-              <w:t xml:space="preserve">"Foco abdominal altamente probable: secuencia temporal, microbiología y ausencia de foco alternativo"</w:t>
+              <w:t xml:space="preserve">«Foco abdominal altamente probable: secuencia temporal, microbiología y ausencia de foco alternativo»</w:t>
             </w:r>
           </w:p>
         </w:tc>
@@ -15821,7 +15890,7 @@
                 <w:sz w:val="17"/>
                 <w:szCs w:val="17"/>
               </w:rPr>
-              <w:t xml:space="preserve">"ITU asociada a catéter urinario permanente (CUP) probable si aparece fiebre sin otro foco"</w:t>
+              <w:t xml:space="preserve">«ITU asociada a catéter urinario permanente (CUP) probable si aparece fiebre sin otro foco»</w:t>
             </w:r>
           </w:p>
         </w:tc>
@@ -15845,7 +15914,7 @@
                 <w:sz w:val="17"/>
                 <w:szCs w:val="17"/>
               </w:rPr>
-              <w:t xml:space="preserve">"Probable" para rellenar donde falta la explicación ("dolor probablemente multifactorial")</w:t>
+              <w:t xml:space="preserve">«Probable» para rellenar donde falta la explicación («dolor probablemente multifactorial»)</w:t>
             </w:r>
           </w:p>
         </w:tc>
@@ -15919,7 +15988,7 @@
                 <w:sz w:val="17"/>
                 <w:szCs w:val="17"/>
               </w:rPr>
-              <w:t xml:space="preserve">"Imagen compatible con neumonía; también con congestión"</w:t>
+              <w:t xml:space="preserve">«Imagen compatible con neumonía; también con congestión»</w:t>
             </w:r>
           </w:p>
         </w:tc>
@@ -15943,7 +16012,7 @@
                 <w:sz w:val="17"/>
                 <w:szCs w:val="17"/>
               </w:rPr>
-              <w:t xml:space="preserve">Leer "compatible con X" como "es X" en la nota siguiente</w:t>
+              <w:t xml:space="preserve">Leer «compatible con X» como «es X» en la nota siguiente</w:t>
             </w:r>
           </w:p>
         </w:tc>
@@ -16017,7 +16086,7 @@
                 <w:sz w:val="17"/>
                 <w:szCs w:val="17"/>
               </w:rPr>
-              <w:t xml:space="preserve">"Contribución farmacológica posible; se retira exposición"</w:t>
+              <w:t xml:space="preserve">«Contribución farmacológica posible; se retira exposición»</w:t>
             </w:r>
           </w:p>
         </w:tc>
@@ -16041,7 +16110,7 @@
                 <w:sz w:val="17"/>
                 <w:szCs w:val="17"/>
               </w:rPr>
-              <w:t xml:space="preserve">Listas de "posibles" sin consecuencia para estudio ni vigilancia</w:t>
+              <w:t xml:space="preserve">Listas de «posibles» sin consecuencia para estudio ni vigilancia</w:t>
             </w:r>
           </w:p>
         </w:tc>
@@ -16115,7 +16184,7 @@
                 <w:sz w:val="17"/>
                 <w:szCs w:val="17"/>
               </w:rPr>
-              <w:t xml:space="preserve">"Estrangulación no demostrada en imagen ni cirugía"</w:t>
+              <w:t xml:space="preserve">«Estrangulación no demostrada en imagen ni cirugía»</w:t>
             </w:r>
           </w:p>
         </w:tc>
@@ -16139,7 +16208,7 @@
                 <w:sz w:val="17"/>
                 <w:szCs w:val="17"/>
               </w:rPr>
-              <w:t xml:space="preserve">Confundirlo con "descartado" (ausencia de prueba ≠ prueba de ausencia)</w:t>
+              <w:t xml:space="preserve">Confundirlo con «descartado» (ausencia de prueba ≠ prueba de ausencia)</w:t>
             </w:r>
           </w:p>
         </w:tc>
@@ -16213,7 +16282,7 @@
                 <w:sz w:val="17"/>
                 <w:szCs w:val="17"/>
               </w:rPr>
-              <w:t xml:space="preserve">"Sin evidencia actual de isquemia en TAC"</w:t>
+              <w:t xml:space="preserve">«Sin evidencia actual de isquemia en TAC»</w:t>
             </w:r>
           </w:p>
         </w:tc>
@@ -16237,7 +16306,7 @@
                 <w:sz w:val="17"/>
                 <w:szCs w:val="17"/>
               </w:rPr>
-              <w:t xml:space="preserve">"Sin evidencia de isquemia" citado días después como "isquemia descartada"</w:t>
+              <w:t xml:space="preserve">«Sin evidencia de isquemia» citado días después como «isquemia descartada»</w:t>
             </w:r>
           </w:p>
         </w:tc>
@@ -16311,7 +16380,7 @@
                 <w:sz w:val="17"/>
                 <w:szCs w:val="17"/>
               </w:rPr>
-              <w:t xml:space="preserve">"Síntomas urinarios no evaluables por lesión medular"</w:t>
+              <w:t xml:space="preserve">«Síntomas urinarios no evaluables por lesión medular»</w:t>
             </w:r>
           </w:p>
         </w:tc>
@@ -16335,7 +16404,7 @@
                 <w:sz w:val="17"/>
                 <w:szCs w:val="17"/>
               </w:rPr>
-              <w:t xml:space="preserve">Registrar "niega disuria" en paciente que no puede percibirla</w:t>
+              <w:t xml:space="preserve">Registrar «niega disuria» en paciente que no puede percibirla</w:t>
             </w:r>
           </w:p>
         </w:tc>
@@ -16409,7 +16478,7 @@
                 <w:sz w:val="17"/>
                 <w:szCs w:val="17"/>
               </w:rPr>
-              <w:t xml:space="preserve">"TEP menos probable tras Doppler y dímero; no excluido"</w:t>
+              <w:t xml:space="preserve">«TEP menos probable tras Doppler y dímero; no excluido»</w:t>
             </w:r>
           </w:p>
         </w:tc>
@@ -16507,7 +16576,7 @@
                 <w:sz w:val="17"/>
                 <w:szCs w:val="17"/>
               </w:rPr>
-              <w:t xml:space="preserve">"Se descarta embarazo (β-hCG negativa)"</w:t>
+              <w:t xml:space="preserve">«Se descarta embarazo (β-hCG negativa)»</w:t>
             </w:r>
           </w:p>
         </w:tc>
@@ -16531,7 +16600,7 @@
                 <w:sz w:val="17"/>
                 <w:szCs w:val="17"/>
               </w:rPr>
-              <w:t xml:space="preserve">"Se descarta abdomen agudo" tras un examen único en evolución temprana</w:t>
+              <w:t xml:space="preserve">«Se descarta abdomen agudo» tras un examen único en evolución temprana</w:t>
             </w:r>
           </w:p>
         </w:tc>
@@ -16605,7 +16674,7 @@
                 <w:sz w:val="17"/>
                 <w:szCs w:val="17"/>
               </w:rPr>
-              <w:t xml:space="preserve">"Probabilidad de SCA suficientemente baja para alta con control en 72 h"</w:t>
+              <w:t xml:space="preserve">«Probabilidad de SCA suficientemente baja para alta con control en 72 h»</w:t>
             </w:r>
           </w:p>
         </w:tc>
@@ -16629,7 +16698,7 @@
                 <w:sz w:val="17"/>
                 <w:szCs w:val="17"/>
               </w:rPr>
-              <w:t xml:space="preserve">Presentarla al paciente como "usted no tiene nada"</w:t>
+              <w:t xml:space="preserve">Presentarla al paciente como «usted no tiene nada»</w:t>
             </w:r>
           </w:p>
         </w:tc>
@@ -16824,7 +16893,7 @@
         <w:pStyle w:val="BodyJ"/>
       </w:pPr>
       <w:r>
-        <w:t xml:space="preserve">Esta guía condensa el capítulo 16 en un plan concreto para un servicio que quiera adoptar el lenguaje y las prácticas del libro. Está pensada para un jefe de servicio, un programa de residencia o un grupo de clínicos con voluntad y poco tiempo. Tres advertencias previas: nada de esto está validado como tecnología (véase el capítulo 15, "Límites"); todo debe adaptarse al contexto local; y la palanca más barata —cómo se habla en la visita de sala— es también la más poderosa.</w:t>
+        <w:t xml:space="preserve">Esta guía condensa el capítulo 16 en un plan concreto para un servicio que quiera adoptar el lenguaje y las prácticas del libro. Está pensada para un jefe de servicio, un programa de residencia o un grupo de clínicos con voluntad y poco tiempo. Tres advertencias previas: nada de esto está validado como tecnología (véase el capítulo 15, «Límites»); todo debe adaptarse al contexto local; y la palanca más barata —cómo se habla en la visita de sala— es también la más poderosa.</w:t>
       </w:r>
     </w:p>
     <w:p>
@@ -16865,7 +16934,7 @@
         </w:numPr>
       </w:pPr>
       <w:r>
-        <w:t xml:space="preserve">Acordar tres reglas mínimas de escritura, no negociables y auditables: (1) "se descarta" sólo con método que excluya; (2) todo hallazgo negativo con su límite ("sin evidencia de X en Y"); (3) toda decisión relevante con criterio de reapertura ("reevaluar si...").</w:t>
+        <w:t xml:space="preserve">Acordar tres reglas mínimas de escritura, no negociables y auditables: (1) «se descarta» sólo con método que excluya; (2) todo hallazgo negativo con su límite («sin evidencia de X en Y»); (3) toda decisión relevante con criterio de reapertura («reevaluar si...»).</w:t>
       </w:r>
     </w:p>
     <w:p>
@@ -16906,7 +16975,7 @@
         </w:numPr>
       </w:pPr>
       <w:r>
-        <w:t xml:space="preserve">Elegir un disparador objetivo para la pausa diagnóstica (no "cuando haya tiempo"): reconsulta, evolución discordante con el diagnóstico, traslado recibido de otro equipo, o caso sin discusión hace 72 horas.</w:t>
+        <w:t xml:space="preserve">Elegir un disparador objetivo para la pausa diagnóstica (no «cuando haya tiempo»): reconsulta, evolución discordante con el diagnóstico, traslado recibido de otro equipo, o caso sin discusión hace 72 horas.</w:t>
       </w:r>
     </w:p>
     <w:p>
@@ -16930,7 +16999,7 @@
         </w:numPr>
       </w:pPr>
       <w:r>
-        <w:t xml:space="preserve">Entrega de turno: agregar una línea obligatoria por paciente inestable o incierto: "qué vigilar, qué reabriría el caso, quién verifica el pendiente".</w:t>
+        <w:t xml:space="preserve">Entrega de turno: agregar una línea obligatoria por paciente inestable o incierto: «qué vigilar, qué reabriría el caso, quién verifica el pendiente».</w:t>
       </w:r>
     </w:p>
     <w:p>
@@ -16971,7 +17040,7 @@
         </w:numPr>
       </w:pPr>
       <w:r>
-        <w:t xml:space="preserve">Prohibición práctica del fósil: cada evolución debe contener al menos una línea que responda "¿qué cambió desde ayer?" (en hechos, interpretación, incertidumbre o plan). Si nada cambió, escribirlo es información.</w:t>
+        <w:t xml:space="preserve">Prohibición práctica del fósil: cada evolución debe contener al menos una línea que responda «¿qué cambió desde ayer?» (en hechos, interpretación, incertidumbre o plan). Si nada cambió, escribirlo es información.</w:t>
       </w:r>
     </w:p>
     <w:p>
@@ -16983,7 +17052,7 @@
         </w:numPr>
       </w:pPr>
       <w:r>
-        <w:t xml:space="preserve">Revisar las plantillas electrónicas existentes: eliminar campos que inducen copia, agregar un campo breve de "criterio de reevaluación".</w:t>
+        <w:t xml:space="preserve">Revisar las plantillas electrónicas existentes: eliminar campos que inducen copia, agregar un campo breve de «criterio de reevaluación».</w:t>
       </w:r>
     </w:p>
     <w:p>
@@ -17061,7 +17130,7 @@
         <w:pStyle w:val="BodyJ"/>
       </w:pPr>
       <w:r>
-        <w:t xml:space="preserve">Tres indicadores simples, auditables sobre una muestra mensual de fichas: proporción de "se descarta" usados con método excluyente; proporción de decisiones mayores con criterio de reapertura explícito; proporción de altas inciertas con instrucciones de reconsulta específicas. No miden pensamiento; miden las huellas que el pensamiento deja. Su valor es la tendencia, no la cifra.</w:t>
+        <w:t xml:space="preserve">Tres indicadores simples, auditables sobre una muestra mensual de fichas: proporción de «se descarta» usados con método excluyente; proporción de decisiones mayores con criterio de reapertura explícito; proporción de altas inciertas con instrucciones de reconsulta específicas. No miden pensamiento; miden las huellas que el pensamiento deja. Su valor es la tendencia, no la cifra.</w:t>
       </w:r>
     </w:p>
     <w:p>
@@ -17094,7 +17163,7 @@
         <w:t xml:space="preserve">Abducción.</w:t>
       </w:r>
       <w:r>
-        <w:t xml:space="preserve"> Inferencia que propone la hipótesis que, de ser verdadera, volvería esperable lo observado. Descrita por Peirce (que la llamó primero "hipótesis"). Es el movimiento típico de la generación diagnóstica.</w:t>
+        <w:t xml:space="preserve"> Inferencia que propone la hipótesis que, de ser verdadera, volvería esperable lo observado. Descrita por Peirce (que la llamó primero «hipótesis»). Es el movimiento típico de la generación diagnóstica.</w:t>
       </w:r>
     </w:p>
     <w:p>
@@ -17199,7 +17268,7 @@
         <w:t xml:space="preserve">Conversaciones para la acción.</w:t>
       </w:r>
       <w:r>
-        <w:t xml:space="preserve"> Gramática del trabajo coordinado descrita por Flores y Winograd: pedido, promesa con condiciones de satisfacción y plazo, y declaración de cumplimiento. Leída así, una entrega de turno distribuye compromisos, no sólo información; "está cubierto" es una promesa sin dueño.</w:t>
+        <w:t xml:space="preserve"> Gramática del trabajo coordinado descrita por Flores y Winograd: pedido, promesa con condiciones de satisfacción y plazo, y declaración de cumplimiento. Leída así, una entrega de turno distribuye compromisos, no sólo información; «está cubierto» es una promesa sin dueño.</w:t>
       </w:r>
     </w:p>
     <w:p>
@@ -17424,7 +17493,7 @@
         <w:t xml:space="preserve">Ficha de proceso.</w:t>
       </w:r>
       <w:r>
-        <w:t xml:space="preserve"> Registro que, además de conclusiones y acciones (ficha de resultados), conjuga los verbos del razonamiento: sospechado, dudado, descartado, priorizado, inferido, realizado, repetido, comprobado, aprendido. Cada verbo cae en una capa de HII-D; "Neumonía. Ceftriaxona" no conjuga ninguno.</w:t>
+        <w:t xml:space="preserve"> Registro que, además de conclusiones y acciones (ficha de resultados), conjuga los verbos del razonamiento: sospechado, dudado, descartado, priorizado, inferido, realizado, repetido, comprobado, aprendido. Cada verbo cae en una capa de HII-D; «Neumonía. Ceftriaxona» no conjuga ninguno.</w:t>
       </w:r>
     </w:p>
     <w:p>
@@ -17439,7 +17508,7 @@
         <w:t xml:space="preserve">Fragilidad.</w:t>
       </w:r>
       <w:r>
-        <w:t xml:space="preserve"> Estado de vulnerabilidad fisiológica multisistémica que predice desenlaces con independencia de la edad y del diagnóstico de ingreso; evaluable clínicamente en minutos (Rockwood et al.). En la decisión terapéutica es un hecho de pleno derecho, no una impresión.</w:t>
+        <w:t xml:space="preserve"> Estado de vulnerabilidad fisiológica multisistémica que predice desenlaces con independencia de la edad y del diagnóstico de ingreso; evaluable clínicamente en minutos (Rockwood et al.). En la decisión terapéutica es un hecho, no una impresión.</w:t>
       </w:r>
     </w:p>
     <w:p>
@@ -17469,7 +17538,7 @@
         <w:t xml:space="preserve">Frecuencias naturales.</w:t>
       </w:r>
       <w:r>
-        <w:t xml:space="preserve"> Presentación de probabilidades como conteos sobre una población de referencia ("90 de cada 270 positivos"), que facilita el razonamiento bayesiano intuitivo (Gigerenzer).</w:t>
+        <w:t xml:space="preserve"> Presentación de probabilidades como conteos sobre una población de referencia («90 de cada 270 positivos»), que facilita el razonamiento bayesiano intuitivo (Gigerenzer).</w:t>
       </w:r>
     </w:p>
     <w:p>
@@ -17634,7 +17703,7 @@
         <w:t xml:space="preserve">Modalidad epistémica.</w:t>
       </w:r>
       <w:r>
-        <w:t xml:space="preserve"> Recursos del lenguaje que expresan el grado de certeza de una afirmación ("demostrado", "probable", "sin evidencia de").</w:t>
+        <w:t xml:space="preserve"> Recursos del lenguaje que expresan el grado de certeza de una afirmación («demostrado», «probable», «sin evidencia de»).</w:t>
       </w:r>
     </w:p>
     <w:p>
@@ -17664,7 +17733,7 @@
         <w:t xml:space="preserve">Observación activa.</w:t>
       </w:r>
       <w:r>
-        <w:t xml:space="preserve"> Espera diseñada como intervención diagnóstica: con objetivo, plazo, variables vigiladas, responsable y criterios de salida en ambas direcciones; lo contrario de "control según evolución".</w:t>
+        <w:t xml:space="preserve"> Espera diseñada como intervención diagnóstica: con objetivo, plazo, variables vigiladas, responsable y criterios de salida en ambas direcciones; lo contrario de «control según evolución».</w:t>
       </w:r>
     </w:p>
     <w:p>
@@ -17679,7 +17748,7 @@
         <w:t xml:space="preserve">Paradoja de la automatización.</w:t>
       </w:r>
       <w:r>
-        <w:t xml:space="preserve"> Cuanto más competente es un sistema automatizado, menos ejercita el humano las habilidades necesarias para detectar sus fallas — que es exactamente cuando más se las necesita (Abdulnour et al.).</w:t>
+        <w:t xml:space="preserve"> Cuanto más competente es un sistema automatizado, menos ejercita el humano las habilidades necesarias para detectar sus fallas — que es cuando más se las necesita (Abdulnour et al.).</w:t>
       </w:r>
     </w:p>
     <w:p>
@@ -18746,7 +18815,7 @@
         </w:numPr>
       </w:pPr>
       <w:r>
-        <w:t xml:space="preserve">Nota de enfermería como hecho de pleno derecho — 13</w:t>
+        <w:t xml:space="preserve">Nota de enfermería como hecho clínico — 13</w:t>
       </w:r>
     </w:p>
     <w:p>
@@ -19047,6 +19116,18 @@
       </w:pPr>
       <w:r>
         <w:t xml:space="preserve">Trayectoria y temporalidad — 11, Interludio I</w:t>
+      </w:r>
+    </w:p>
+    <w:p>
+      <w:pPr>
+        <w:pStyle w:val="BodyJ"/>
+        <w:numPr>
+          <w:ilvl w:val="0"/>
+          <w:numId w:val="6"/>
+        </w:numPr>
+      </w:pPr>
+      <w:r>
+        <w:t xml:space="preserve">Umbral y geografía (hospital insular, evacuación aeromédica) — 11</w:t>
       </w:r>
     </w:p>
     <w:p>

</xml_diff>

<commit_message>
Revisión automática del PR: build_docx.cjs (CommonJS, dependencia docx), figuras y portada resueltas en libro/, entregables escritos en libro/, toc_extract.py en el repo y cadena documentada; cronología del Interludio I; dossier, carta y protocolo del test de título actualizados y regenerados
Co-Authored-By: Claude Fable 5.1 <noreply@anthropic.com>
Claude-Session: https://claude.ai/code/session_01SPkhDdVzUCxJwqq61ddeLW
</commit_message>
<xml_diff>
--- a/libro/Hechos_inferencias_incertidumbre_edicion_revisada.docx
+++ b/libro/Hechos_inferencias_incertidumbre_edicion_revisada.docx
@@ -1348,7 +1348,7 @@
             <w:r>
               <w:drawing>
                 <wp:inline distT="0" distB="0" distL="0" distR="0">
-                  <wp:extent cx="5619750" cy="2562225"/>
+                  <wp:extent cx="5619750" cy="2571750"/>
                   <wp:effectExtent t="0" r="0" b="0" l="0"/>
                   <wp:docPr id="1" name="" descr="" title=""/>
                   <wp:cNvGraphicFramePr>
@@ -1373,7 +1373,7 @@
                         <pic:spPr bwMode="auto">
                           <a:xfrm>
                             <a:off x="0" y="0"/>
-                            <a:ext cx="5619750" cy="2562225"/>
+                            <a:ext cx="5619750" cy="2571750"/>
                           </a:xfrm>
                           <a:prstGeom prst="rect">
                             <a:avLst/>
@@ -3315,7 +3315,7 @@
             <w:r>
               <w:drawing>
                 <wp:inline distT="0" distB="0" distL="0" distR="0">
-                  <wp:extent cx="5619750" cy="3133725"/>
+                  <wp:extent cx="5619750" cy="3095625"/>
                   <wp:effectExtent t="0" r="0" b="0" l="0"/>
                   <wp:docPr id="1" name="" descr="" title=""/>
                   <wp:cNvGraphicFramePr>
@@ -3340,7 +3340,7 @@
                         <pic:spPr bwMode="auto">
                           <a:xfrm>
                             <a:off x="0" y="0"/>
-                            <a:ext cx="5619750" cy="3133725"/>
+                            <a:ext cx="5619750" cy="3095625"/>
                           </a:xfrm>
                           <a:prstGeom prst="rect">
                             <a:avLst/>
@@ -4953,7 +4953,7 @@
         <w:t xml:space="preserve">Hechos.</w:t>
       </w:r>
       <w:r>
-        <w:t xml:space="preserve"> Cuarto episodio obstructivo en doce meses sobre hernia incisional conocida (tres ingresos previos resueltos con manejo conservador según registro clínico). Episodio actual: ingresó de madrugada en shock con requerimiento de noradrenalina por 36 horas, lactato arterial máximo de 6,0 mmol/L (04:15 h del ingreso) y llene capilar de 5 segundos documentado por enfermería en urgencias. Hemocultivos periféricos 2/2 positivos a las 14 h para Escherichia coli multisensible. TAC de abdomen de ingreso con asas dilatadas en saco herniario, sin signos de isquemia, neumatosis ni perforación. Actualmente en su tercer día: afebril, sin vasoactivos hace 24 horas y con débito por sonda en descenso. Relato de ingreso textual: «esta vez la hernia no se dejó acomodar, el dolor era otro». Su hija, que la trajo, agrega lo que ninguna nota recogió: «las otras veces se le pasaba en el día; esta vez aguantó dos días en la casa y no quería venir».</w:t>
+        <w:t xml:space="preserve"> Cuarto episodio obstructivo en doce meses sobre hernia incisional conocida (tres ingresos previos resueltos con manejo conservador según registro clínico). Episodio actual: ingresó de madrugada en shock con requerimiento de noradrenalina por 36 horas, lactato arterial máximo de 6,0 mmol/L (04:15 h del ingreso) y llene capilar de 5 segundos documentado por enfermería en urgencias. Hemocultivos periféricos 2/2 positivos a las 14 h para Escherichia coli multisensible. TAC de abdomen de ingreso con asas dilatadas en saco herniario, sin signos de isquemia, neumatosis ni perforación. Actualmente en su tercer día: afebril, sin vasoactivos desde la tarde de ayer y con débito por sonda en descenso. Relato de ingreso textual: «esta vez la hernia no se dejó acomodar, el dolor era otro». Su hija, que la trajo, agrega lo que ninguna nota recogió: «las otras veces se le pasaba en el día; esta vez aguantó dos días en la casa y no quería venir».</w:t>
       </w:r>
     </w:p>
     <w:p>
@@ -7278,7 +7278,7 @@
             <w:r>
               <w:drawing>
                 <wp:inline distT="0" distB="0" distL="0" distR="0">
-                  <wp:extent cx="5619750" cy="2714625"/>
+                  <wp:extent cx="5619750" cy="2705100"/>
                   <wp:effectExtent t="0" r="0" b="0" l="0"/>
                   <wp:docPr id="1" name="" descr="" title=""/>
                   <wp:cNvGraphicFramePr>
@@ -7303,7 +7303,7 @@
                         <pic:spPr bwMode="auto">
                           <a:xfrm>
                             <a:off x="0" y="0"/>
-                            <a:ext cx="5619750" cy="2714625"/>
+                            <a:ext cx="5619750" cy="2705100"/>
                           </a:xfrm>
                           <a:prstGeom prst="rect">
                             <a:avLst/>

</xml_diff>

<commit_message>
Rebuild tras los bloques E y F (159 pp, TOC 38/38 con lista de figuras, 15 figuras) y README punto 35
Co-Authored-By: Claude Fable 5.1 <noreply@anthropic.com>
Claude-Session: https://claude.ai/code/session_01SPkhDdVzUCxJwqq61ddeLW
</commit_message>
<xml_diff>
--- a/libro/Hechos_inferencias_incertidumbre_edicion_revisada.docx
+++ b/libro/Hechos_inferencias_incertidumbre_edicion_revisada.docx
@@ -527,7 +527,7 @@
         <w:rPr>
           <w:color w:val="8A8A8A"/>
         </w:rPr>
-        <w:t xml:space="preserve">63</w:t>
+        <w:t xml:space="preserve">62</w:t>
       </w:r>
     </w:p>
     <w:p>
@@ -547,7 +547,7 @@
         <w:rPr>
           <w:color w:val="8A8A8A"/>
         </w:rPr>
-        <w:t xml:space="preserve">70</w:t>
+        <w:t xml:space="preserve">69</w:t>
       </w:r>
     </w:p>
     <w:p>
@@ -567,7 +567,7 @@
         <w:rPr>
           <w:color w:val="8A8A8A"/>
         </w:rPr>
-        <w:t xml:space="preserve">74</w:t>
+        <w:t xml:space="preserve">73</w:t>
       </w:r>
     </w:p>
     <w:p>
@@ -587,7 +587,7 @@
         <w:rPr>
           <w:color w:val="8A8A8A"/>
         </w:rPr>
-        <w:t xml:space="preserve">81</w:t>
+        <w:t xml:space="preserve">80</w:t>
       </w:r>
     </w:p>
     <w:p>
@@ -607,7 +607,7 @@
         <w:rPr>
           <w:color w:val="8A8A8A"/>
         </w:rPr>
-        <w:t xml:space="preserve">86</w:t>
+        <w:t xml:space="preserve">85</w:t>
       </w:r>
     </w:p>
     <w:p>
@@ -627,7 +627,7 @@
         <w:rPr>
           <w:color w:val="8A8A8A"/>
         </w:rPr>
-        <w:t xml:space="preserve">88</w:t>
+        <w:t xml:space="preserve">87</w:t>
       </w:r>
     </w:p>
     <w:p>
@@ -647,7 +647,7 @@
         <w:rPr>
           <w:color w:val="8A8A8A"/>
         </w:rPr>
-        <w:t xml:space="preserve">89</w:t>
+        <w:t xml:space="preserve">88</w:t>
       </w:r>
     </w:p>
     <w:p>
@@ -667,7 +667,7 @@
         <w:rPr>
           <w:color w:val="8A8A8A"/>
         </w:rPr>
-        <w:t xml:space="preserve">95</w:t>
+        <w:t xml:space="preserve">94</w:t>
       </w:r>
     </w:p>
     <w:p>
@@ -687,7 +687,7 @@
         <w:rPr>
           <w:color w:val="8A8A8A"/>
         </w:rPr>
-        <w:t xml:space="preserve">102</w:t>
+        <w:t xml:space="preserve">101</w:t>
       </w:r>
     </w:p>
     <w:p>
@@ -707,7 +707,7 @@
         <w:rPr>
           <w:color w:val="8A8A8A"/>
         </w:rPr>
-        <w:t xml:space="preserve">111</w:t>
+        <w:t xml:space="preserve">110</w:t>
       </w:r>
     </w:p>
     <w:p>
@@ -727,7 +727,7 @@
         <w:rPr>
           <w:color w:val="8A8A8A"/>
         </w:rPr>
-        <w:t xml:space="preserve">115</w:t>
+        <w:t xml:space="preserve">114</w:t>
       </w:r>
     </w:p>
     <w:p>
@@ -747,7 +747,7 @@
         <w:rPr>
           <w:color w:val="8A8A8A"/>
         </w:rPr>
-        <w:t xml:space="preserve">123</w:t>
+        <w:t xml:space="preserve">122</w:t>
       </w:r>
     </w:p>
     <w:p>
@@ -767,7 +767,7 @@
         <w:rPr>
           <w:color w:val="8A8A8A"/>
         </w:rPr>
-        <w:t xml:space="preserve">127</w:t>
+        <w:t xml:space="preserve">126</w:t>
       </w:r>
     </w:p>
     <w:p>
@@ -787,7 +787,7 @@
         <w:rPr>
           <w:color w:val="8A8A8A"/>
         </w:rPr>
-        <w:t xml:space="preserve">129</w:t>
+        <w:t xml:space="preserve">128</w:t>
       </w:r>
     </w:p>
     <w:p>
@@ -807,7 +807,7 @@
         <w:rPr>
           <w:color w:val="8A8A8A"/>
         </w:rPr>
-        <w:t xml:space="preserve">131</w:t>
+        <w:t xml:space="preserve">130</w:t>
       </w:r>
     </w:p>
     <w:p>
@@ -827,7 +827,7 @@
         <w:rPr>
           <w:color w:val="8A8A8A"/>
         </w:rPr>
-        <w:t xml:space="preserve">133</w:t>
+        <w:t xml:space="preserve">132</w:t>
       </w:r>
     </w:p>
     <w:p>
@@ -847,7 +847,7 @@
         <w:rPr>
           <w:color w:val="8A8A8A"/>
         </w:rPr>
-        <w:t xml:space="preserve">135</w:t>
+        <w:t xml:space="preserve">134</w:t>
       </w:r>
     </w:p>
     <w:p>
@@ -867,7 +867,7 @@
         <w:rPr>
           <w:color w:val="8A8A8A"/>
         </w:rPr>
-        <w:t xml:space="preserve">140</w:t>
+        <w:t xml:space="preserve">139</w:t>
       </w:r>
     </w:p>
     <w:p>
@@ -878,7 +878,7 @@
         </w:tabs>
       </w:pPr>
       <w:r>
-        <w:t xml:space="preserve">Nota metodológica y estatuto de las afirmaciones</w:t>
+        <w:t xml:space="preserve">Lista de figuras</w:t>
       </w:r>
       <w:r>
         <w:tab/>
@@ -887,7 +887,7 @@
         <w:rPr>
           <w:color w:val="8A8A8A"/>
         </w:rPr>
-        <w:t xml:space="preserve">144</w:t>
+        <w:t xml:space="preserve">143</w:t>
       </w:r>
     </w:p>
     <w:p>
@@ -898,6 +898,26 @@
         </w:tabs>
       </w:pPr>
       <w:r>
+        <w:t xml:space="preserve">Nota metodológica y estatuto de las afirmaciones</w:t>
+      </w:r>
+      <w:r>
+        <w:tab/>
+      </w:r>
+      <w:r>
+        <w:rPr>
+          <w:color w:val="8A8A8A"/>
+        </w:rPr>
+        <w:t xml:space="preserve">144</w:t>
+      </w:r>
+    </w:p>
+    <w:p>
+      <w:pPr>
+        <w:pStyle w:val="TocPart"/>
+        <w:tabs>
+          <w:tab w:val="right" w:pos="9026" w:leader="dot"/>
+        </w:tabs>
+      </w:pPr>
+      <w:r>
         <w:t xml:space="preserve">Referencias</w:t>
       </w:r>
       <w:r>
@@ -907,7 +927,7 @@
         <w:rPr>
           <w:color w:val="8A8A8A"/>
         </w:rPr>
-        <w:t xml:space="preserve">145</w:t>
+        <w:t xml:space="preserve">146</w:t>
       </w:r>
     </w:p>
     <w:p>
@@ -5487,7 +5507,7 @@
         <w:t xml:space="preserve">Solución comentada.</w:t>
       </w:r>
       <w:r>
-        <w:t xml:space="preserve"> No hay respuesta correcta: el ejercicio produce el dato que la práctica cotidiana casi nunca devuelve. Los patrones típicos que emergen: confianza declarada de 90% con tasa real de confirmación de 70–75% (sobreconfianza moderada, la más frecuente); dominios específicos sistemáticamente peor calibrados (los propios «cólicos renales» de cada uno); y alternativas anotadas que nunca se buscaron activamente. El objetivo no es castigarse: es descubrir en qué franja de confianza las propias palabras («probable», «seguro») dejan de corresponder a la realidad. Quien repite el ejercicio dos o tres veces al año construye la serie que convierte experiencia en calibración.</w:t>
+        <w:t xml:space="preserve"> No hay solución única: el ejercicio produce el dato que la práctica cotidiana casi nunca devuelve. Los patrones típicos que emergen en ejercicios docentes: confianza declarada de 90% con tasa real de confirmación de 70–75% (sobreconfianza moderada, la más frecuente); dominios específicos sistemáticamente peor calibrados (los propios «cólicos renales» de cada uno); y alternativas anotadas que nunca se buscaron activamente. El objetivo no es castigarse: es descubrir en qué franja de confianza las propias palabras («probable», «seguro») dejan de corresponder a la realidad. Quien repite el ejercicio dos o tres veces al año construye la serie que convierte experiencia en calibración.</w:t>
       </w:r>
     </w:p>
     <w:p>
@@ -5804,7 +5824,7 @@
         <w:pStyle w:val="BodyJ"/>
       </w:pPr>
       <w:r>
-        <w:t xml:space="preserve">La música ofrece la imagen más exacta de ese saber hacer, y no como metáfora. La improvisación en jazz es pericia que responde en tiempo real dentro de una estructura —la armonía, el tempo, los otros— sin deliberar nota por nota. Cuando se registró con resonancia funcional a pianistas profesionales improvisando, se observó una desactivación extensa de la corteza prefrontal dorsolateral, la región asociada al automonitoreo y al control consciente de la ejecución, junto con la activación de la corteza prefrontal medial (Limb &amp; Braun, 2008). El experto que improvisa apaga al supervisor. Eso es lo que Varela describe y lo que este libro no debe contradecir: la metacognición madura no es vigilancia continua, porque la vigilancia continua estropea la ejecución; es saber cuándo volver a encender al supervisor. La cirujana frente a Carmen improvisó sobre una estructura de doscientas paredes abdominales; la pausa del capítulo 8 es el momento en que el pianista deja de tocar porque escuchó una nota que no era de la pieza.</w:t>
+        <w:t xml:space="preserve">La música ofrece la imagen más exacta de ese saber hacer, y no como metáfora. La improvisación en jazz es pericia que responde en tiempo real dentro de una estructura —la armonía, el tempo, los otros— sin deliberar nota por nota. Cuando se registró con resonancia funcional a seis pianistas profesionales improvisando, se observó una desactivación extensa de la corteza prefrontal dorsolateral, la región asociada al automonitoreo y al control consciente de la ejecución, junto con la activación de la corteza prefrontal medial (Limb &amp; Braun, 2008). El experto que improvisa apaga al supervisor. Eso es lo que Varela describe y lo que este libro no debe contradecir: la metacognición madura no es vigilancia continua, porque la vigilancia continua estropea la ejecución; es saber cuándo volver a encender al supervisor. La cirujana frente a Carmen improvisó sobre una estructura de doscientas paredes abdominales; la pausa del capítulo 8 es el momento en que el pianista deja de tocar porque escuchó una nota que no era de la pieza.</w:t>
       </w:r>
     </w:p>
     <w:p>
@@ -6494,7 +6514,7 @@
         <w:pStyle w:val="BodyJ"/>
       </w:pPr>
       <w:r>
-        <w:t xml:space="preserve">La evidencia es más dura de lo que la cultura hospitalaria admite. Un metaanálisis de sesenta estudios estimó que menos de treinta horas sin dormir reducen el desempeño cognitivo general de los médicos en cerca de una desviación estándar, y el desempeño clínico en más de una y media (Philibert, 2005). El médico de las cuatro de la mañana no es el mismo instrumento que el de las nueve. Cuando se asignó al azar a internos de cuidados intensivos a turnos tradicionales de más de veinticuatro horas o a turnos acotados a dieciséis, los turnos largos produjeron un 36% más de errores graves, y los errores diagnósticos graves se multiplicaron por más de cinco (Landrigan et al., 2004). El efecto no exige noches. En más de 21.000 consultas por infección respiratoria, la probabilidad de salir con un antibiótico subió hora a hora dentro de la misma sesión de policlínico, con independencia del paciente y del diagnóstico: unas chances un 26% mayores en la cuarta hora que en la primera (Linder et al., 2014). Nadie decidió prescribir peor a las cuatro de la tarde; el umbral se movió solo, con el cansancio. Y el ánimo tampoco es neutro: en un experimento clásico, los médicos a quienes se indujo un afecto positivo integraron antes la información de un caso y se anclaron menos en su primera hipótesis (Estrada, Isen &amp; Young, 1997). El estado afectivo no acompaña al razonamiento; lo configura. Maturana lo había dicho desde la biología, en una formulación que esta sección adopta: las emociones son disposiciones corporales que especifican el dominio de acciones en que un organismo puede moverse en cada momento (Maturana, 1990). Un ánimo no es ruido sobre el razonamiento; es el repertorio de pensamientos y conductas disponibles, y por eso debe figurar entre los hechos.</w:t>
+        <w:t xml:space="preserve">La evidencia es más dura de lo que la cultura hospitalaria admite. Un metaanálisis de sesenta estudios estimó que menos de treinta horas sin dormir reducen el desempeño cognitivo general de los médicos en cerca de una desviación estándar, y el desempeño clínico en más de una y media (Philibert, 2005). El médico de las cuatro de la mañana no es el mismo instrumento que el de las nueve. Cuando se asignó al azar a veinticuatro internos de dos unidades de cuidados intensivos a turnos tradicionales con guardias de 24 horas o más, o a turnos acotados a dieciséis, los turnos largos produjeron un 36% más de errores graves, y los errores diagnósticos graves se multiplicaron por más de cinco (Landrigan et al., 2004). El dato es de internos y de cuidados intensivos; extenderlo a cualquier guardia es una inferencia, no un hecho. El efecto no exige noches. En más de 21.000 consultas por infección respiratoria, la probabilidad de salir con un antibiótico subió hora a hora dentro de la misma sesión de policlínico, con independencia del paciente y del diagnóstico: unas chances un 26% mayores en la cuarta hora que en la primera (Linder et al., 2014). Nadie decidió prescribir peor a las cuatro de la tarde; el umbral se movió solo, con el cansancio. Y el ánimo tampoco es neutro: en un experimento clásico, los médicos a quienes se indujo un afecto positivo integraron antes la información de un caso y se anclaron menos en su primera hipótesis (Estrada, Isen &amp; Young, 1997). El estado afectivo no acompaña al razonamiento; lo configura. Maturana lo había dicho desde la biología, en una formulación que esta sección adopta: las emociones son disposiciones corporales que especifican el dominio de acciones en que un organismo puede moverse en cada momento (Maturana, 1990). Un ánimo no es ruido sobre el razonamiento; es el repertorio de pensamientos y conductas disponibles, y por eso debe figurar entre los hechos.</w:t>
       </w:r>
     </w:p>
     <w:p>
@@ -7100,97 +7120,6 @@
       <w:r>
         <w:t xml:space="preserve">La aritmética, hecha explícita con Carmen y con cifras ilustrativas, lo muestra. Suponga que el ensayo clínico de referencia demostró que operar electivamente reduce un 50% el riesgo relativo de una nueva obstrucción a dos años, con un riesgo basal de 20% en la cohorte estudiada. Eso equivale a una reducción absoluta de 10 puntos: hay que operar a diez pacientes promedio para evitar una obstrucción. Pero Carmen no pertenece al promedio de ese estudio. Tras cuatro episodios en doce meses, cada vez más seguidos y el último con shock séptico, su probabilidad basal de volver a obstruirse con una complicación grave es mucho mayor: por ejemplo, un 60%. Si el beneficio relativo se mantuviera, la reducción absoluta en ella subiría a 30 puntos porcentuales: casi uno de cada tres casos como el suyo evitaría un evento potencialmente letal. Sin embargo, su denominador de daño también se aparta del ensayo: el EPOC moderado, el desacondicionamiento post-sepsis y una pared con cicatrices previas elevan su riesgo absoluto de complicaciones respiratorias o quirúrgicas. La aritmética clínica no decide por la paciente, pero desnuda qué hay que estimar antes de recomendar: dos riesgos basales individualizados, el de la enfermedad sin intervención y el del quirófano. Y muestra por qué la muletilla «está indicado por evidencia» suele esconder ambas estimaciones.</w:t>
       </w:r>
-    </w:p>
-    <w:tbl>
-      <w:tblPr>
-        <w:tblW w:type="dxa" w:w="9026"/>
-        <w:tblBorders>
-          <w:top w:val="none" w:color="FFFFFF" w:sz="0"/>
-          <w:left w:val="none" w:color="FFFFFF" w:sz="0"/>
-          <w:bottom w:val="none" w:color="FFFFFF" w:sz="0"/>
-          <w:right w:val="none" w:color="FFFFFF" w:sz="0"/>
-          <w:insideH w:val="none" w:color="FFFFFF" w:sz="0"/>
-          <w:insideV w:val="none" w:color="FFFFFF" w:sz="0"/>
-        </w:tblBorders>
-      </w:tblPr>
-      <w:tblGrid>
-        <w:gridCol w:w="9026"/>
-      </w:tblGrid>
-      <w:tr>
-        <w:trPr>
-          <w:cantSplit/>
-        </w:trPr>
-        <w:tc>
-          <w:tcPr>
-            <w:tcW w:type="dxa" w:w="9026"/>
-            <w:tcBorders>
-              <w:top w:val="none" w:color="FFFFFF" w:sz="0"/>
-              <w:left w:val="none" w:color="FFFFFF" w:sz="0"/>
-              <w:bottom w:val="none" w:color="FFFFFF" w:sz="0"/>
-              <w:right w:val="none" w:color="FFFFFF" w:sz="0"/>
-            </w:tcBorders>
-          </w:tcPr>
-          <w:p>
-            <w:pPr>
-              <w:spacing w:after="40" w:before="200"/>
-              <w:jc w:val="center"/>
-            </w:pPr>
-            <w:r>
-              <w:drawing>
-                <wp:inline distT="0" distB="0" distL="0" distR="0">
-                  <wp:extent cx="5619750" cy="2314575"/>
-                  <wp:effectExtent t="0" r="0" b="0" l="0"/>
-                  <wp:docPr id="1" name="" descr="" title=""/>
-                  <wp:cNvGraphicFramePr>
-                    <a:graphicFrameLocks xmlns:a="http://schemas.openxmlformats.org/drawingml/2006/main" noChangeAspect="1"/>
-                  </wp:cNvGraphicFramePr>
-                  <a:graphic xmlns:a="http://schemas.openxmlformats.org/drawingml/2006/main">
-                    <a:graphicData uri="http://schemas.openxmlformats.org/drawingml/2006/picture">
-                      <pic:pic xmlns:pic="http://schemas.openxmlformats.org/drawingml/2006/picture">
-                        <pic:nvPicPr>
-                          <pic:cNvPr id="0" name="" descr=""/>
-                          <pic:cNvPicPr>
-                            <a:picLocks noChangeAspect="1" noChangeArrowheads="1"/>
-                          </pic:cNvPicPr>
-                        </pic:nvPicPr>
-                        <pic:blipFill>
-                          <a:blip r:embed="rId17" cstate="none"/>
-                          <a:srcRect/>
-                          <a:stretch>
-                            <a:fillRect/>
-                          </a:stretch>
-                        </pic:blipFill>
-                        <pic:spPr bwMode="auto">
-                          <a:xfrm>
-                            <a:off x="0" y="0"/>
-                            <a:ext cx="5619750" cy="2314575"/>
-                          </a:xfrm>
-                          <a:prstGeom prst="rect">
-                            <a:avLst/>
-                          </a:prstGeom>
-                        </pic:spPr>
-                      </pic:pic>
-                    </a:graphicData>
-                  </a:graphic>
-                </wp:inline>
-              </w:drawing>
-            </w:r>
-          </w:p>
-          <w:p>
-            <w:pPr>
-              <w:pStyle w:val="Caption"/>
-            </w:pPr>
-            <w:r>
-              <w:t xml:space="preserve">Figura 9. La misma reducción relativa, dos beneficios absolutos: con cifras ilustrativas, operar electivamente evita una obstrucción por cada diez pacientes del ensayo y casi una por cada tres pacientes como Carmen. El riesgo quirúrgico de Carmen también se aleja del promedio, y esa segunda estimación suele quedar sin hacer.</w:t>
-            </w:r>
-          </w:p>
-        </w:tc>
-      </w:tr>
-    </w:tbl>
-    <w:p>
-      <w:pPr>
-        <w:spacing w:after="60"/>
-      </w:pPr>
     </w:p>
     <w:p>
       <w:pPr>
@@ -7294,7 +7223,7 @@
                           </pic:cNvPicPr>
                         </pic:nvPicPr>
                         <pic:blipFill>
-                          <a:blip r:embed="rId18" cstate="none"/>
+                          <a:blip r:embed="rId17" cstate="none"/>
                           <a:srcRect/>
                           <a:stretch>
                             <a:fillRect/>
@@ -7321,7 +7250,7 @@
               <w:pStyle w:val="Caption"/>
             </w:pPr>
             <w:r>
-              <w:t xml:space="preserve">Figura 10. Una década sobre un mismo dato: la saga ANDROMEDA. El mismo programa de investigación atraviesa un ensayo «negativo», su relectura bayesiana y una segunda prueba más severa — la trayectoria completa que este capítulo propone como modelo de lectura de la evidencia.</w:t>
+              <w:t xml:space="preserve">Figura 9. Una década sobre un mismo dato: la saga ANDROMEDA. El mismo programa de investigación atraviesa un ensayo «negativo», su relectura bayesiana y una segunda prueba más severa — la trayectoria completa que este capítulo propone como modelo de lectura de la evidencia.</w:t>
             </w:r>
           </w:p>
         </w:tc>
@@ -7569,7 +7498,7 @@
                           </pic:cNvPicPr>
                         </pic:nvPicPr>
                         <pic:blipFill>
-                          <a:blip r:embed="rId19" cstate="none"/>
+                          <a:blip r:embed="rId18" cstate="none"/>
                           <a:srcRect/>
                           <a:stretch>
                             <a:fillRect/>
@@ -7596,7 +7525,7 @@
               <w:pStyle w:val="Caption"/>
             </w:pPr>
             <w:r>
-              <w:t xml:space="preserve">Figura 11. El enfoque de umbrales de Pauker y Kassirer: la probabilidad de enfermedad se divide en tres zonas de conducta. Los umbrales no son fijos: se desplazan según el daño de omitir, el riesgo de la intervención y el rendimiento de las pruebas disponibles.</w:t>
+              <w:t xml:space="preserve">Figura 10. El enfoque de umbrales de Pauker y Kassirer: la probabilidad de enfermedad se divide en tres zonas de conducta. Los umbrales no son fijos: se desplazan según el daño de omitir, el riesgo de la intervención y el rendimiento de las pruebas disponibles.</w:t>
             </w:r>
           </w:p>
         </w:tc>
@@ -7637,7 +7566,7 @@
         <w:pStyle w:val="BodyJ"/>
       </w:pPr>
       <w:r>
-        <w:t xml:space="preserve">Los dos momentos de Carmen ilustran esta asimetría de costos. En la madrugada del ingreso, con la paciente en shock pero con una tomografía sin necrosis ni perforación libre, entrar a pabellón en plena inestabilidad hemodinámica conllevaba una mortalidad perioperatoria altísima. Como el cuadro cedió rápido con descompresión nasogástrica y antibióticos, el umbral para una cirugía de rescate inmediato era muy alto, y fue prudente no cruzarlo. Días después, con Carmen recuperada en sala, la matriz de consecuencias se invierte. El error más costoso ya no es operar a una paciente inestable, sino enviarla de alta con el anillo herniario intacto. Un quinto atascamiento reproduciría entonces el shock séptico en su casa, lejos de una cama crítica. La anatomía radiológica es la misma; lo que desplazó el umbral terapéutico hacia la reparación electiva fue el nuevo peso pronóstico del error de omisión. La Figura 12 pone los dos momentos uno junto al otro.</w:t>
+        <w:t xml:space="preserve">Los dos momentos de Carmen ilustran esta asimetría de costos. En la madrugada del ingreso, con la paciente en shock pero con una tomografía sin necrosis ni perforación libre, entrar a pabellón en plena inestabilidad hemodinámica conllevaba una mortalidad perioperatoria altísima. Como el cuadro cedió rápido con descompresión nasogástrica y antibióticos, el umbral para una cirugía de rescate inmediato era muy alto, y fue prudente no cruzarlo. Días después, con Carmen recuperada en sala, la matriz de consecuencias se invierte. El error más costoso ya no es operar a una paciente inestable, sino enviarla de alta con el anillo herniario intacto. Un quinto atascamiento reproduciría entonces el shock séptico en su casa, lejos de una cama crítica. La anatomía radiológica es la misma; lo que desplazó el umbral terapéutico hacia la reparación electiva fue el nuevo peso pronóstico del error de omisión. La Figura 11 pone los dos momentos uno junto al otro.</w:t>
       </w:r>
     </w:p>
     <w:tbl>
@@ -7693,7 +7622,7 @@
                           </pic:cNvPicPr>
                         </pic:nvPicPr>
                         <pic:blipFill>
-                          <a:blip r:embed="rId20" cstate="none"/>
+                          <a:blip r:embed="rId19" cstate="none"/>
                           <a:srcRect/>
                           <a:stretch>
                             <a:fillRect/>
@@ -7720,7 +7649,7 @@
               <w:pStyle w:val="Caption"/>
             </w:pPr>
             <w:r>
-              <w:t xml:space="preserve">Figura 12. La línea de tiempo de Carmen y el umbral que se mueve: en la madrugada, el daño esperado de operar en shock supera al de esperar; al día 7, el daño esperado de un alta sin operar supera al de una cirugía programada. Los hechos anatómicos no cambiaron; cambió el costo del error de omisión.</w:t>
+              <w:t xml:space="preserve">Figura 11. La línea de tiempo de Carmen y el umbral que se mueve: en la madrugada, el daño esperado de operar en shock supera al de esperar; al día 7, el daño esperado de un alta sin operar supera al de una cirugía programada. Los hechos anatómicos no cambiaron; cambió el costo del error de omisión.</w:t>
             </w:r>
           </w:p>
         </w:tc>
@@ -7763,7 +7692,7 @@
         <w:t xml:space="preserve">ya es suficiente</w:t>
       </w:r>
       <w:r>
-        <w:t xml:space="preserve"> exige ponderar qué tan grave sería equivocarse, y esa ponderación es un juicio de valor (Rudner, 1953). Heather Douglas llamó a esto riesgo inductivo y sostuvo que atraviesa toda la ciencia con consecuencias prácticas. Cuánta evidencia se exige antes de afirmar que un compuesto es tóxico depende de qué error —afirmar de más o afirmar de menos— produce más daño (Douglas, 2000).</w:t>
+        <w:t xml:space="preserve"> exige ponderar qué tan grave sería equivocarse, y esa ponderación es un juicio de valor (Rudner, 1953, p. 2). Heather Douglas llamó a esto riesgo inductivo y sostuvo que atraviesa toda la ciencia con consecuencias prácticas. Cuánta evidencia se exige antes de afirmar que un compuesto es tóxico depende de qué error —afirmar de más o afirmar de menos— produce más daño (Douglas, 2000, pp. 565-577).</w:t>
       </w:r>
     </w:p>
     <w:p>
@@ -7939,7 +7868,7 @@
                           </pic:cNvPicPr>
                         </pic:nvPicPr>
                         <pic:blipFill>
-                          <a:blip r:embed="rId21" cstate="none"/>
+                          <a:blip r:embed="rId20" cstate="none"/>
                           <a:srcRect/>
                           <a:stretch>
                             <a:fillRect/>
@@ -7966,7 +7895,7 @@
               <w:pStyle w:val="Caption"/>
             </w:pPr>
             <w:r>
-              <w:t xml:space="preserve">Figura 13. El cálculo del Taller 10 en frecuencias naturales: de 270 resultados positivos, sólo 90 corresponden a la enfermedad. La probabilidad postest (33%) queda lejos de la certeza que la intuición atribuye a una «prueba positiva».</w:t>
+              <w:t xml:space="preserve">Figura 12. El cálculo del Taller 10 en frecuencias naturales: de 270 resultados positivos, sólo 90 corresponden a la enfermedad. La probabilidad postest (33%) queda lejos de la certeza que la intuición atribuye a una «prueba positiva».</w:t>
             </w:r>
           </w:p>
         </w:tc>
@@ -8624,7 +8553,7 @@
                           </pic:cNvPicPr>
                         </pic:nvPicPr>
                         <pic:blipFill>
-                          <a:blip r:embed="rId22" cstate="none"/>
+                          <a:blip r:embed="rId21" cstate="none"/>
                           <a:srcRect/>
                           <a:stretch>
                             <a:fillRect/>
@@ -8651,7 +8580,7 @@
               <w:pStyle w:val="Caption"/>
             </w:pPr>
             <w:r>
-              <w:t xml:space="preserve">Figura 14. El viaje de una frase: la conjetura del prefacio se convierte en antecedente y el antecedente en hecho sin que nadie mienta en ningún punto. Al pie, de qué está hecha una evolución típica según Wang, Khanna y Najafi (2017).</w:t>
+              <w:t xml:space="preserve">Figura 13. El viaje de una frase: la conjetura del prefacio se convierte en antecedente y el antecedente en hecho sin que nadie mienta en ningún punto. Al pie, de qué está hecha una evolución típica según Wang, Khanna y Najafi (2017).</w:t>
             </w:r>
           </w:p>
         </w:tc>
@@ -8934,7 +8863,7 @@
         <w:pStyle w:val="BodyJ"/>
       </w:pPr>
       <w:r>
-        <w:t xml:space="preserve">Dos de esas líneas cargan evidencia que debe nombrarse. El «no» a los corticoides se apoya en que su beneficio en mortalidad se demostró en neumonía grave tratada en cuidados intensivos, no en sala: 6,2% con hidrocortisona frente a 11,9% con placebo a los 28 días (Dequin et al., 2023). La nota lo dice con una palabra: «sin criterios de gravedad». Y el «sin indicación de anaerobios» es un descarte con método, el de la anamnesis que no encontró aspiración, y por eso puede revisarse si la anamnesis cambia. La nota de proceso es apenas más larga que «Neumonía. Ceftriaxona» si se cuentan las líneas que una evolución típica dedica a repetir lo de ayer, y es otra cosa: cualquiera que la lea mañana sabe qué se pensó, qué quedó abierto y qué desmentiría el plan. El riesgo que este capítulo ya advirtió —la nota que crece sin pensar— no se corre aquí: la ficha de proceso no escribe más; escribe lo que hoy no se escribe nunca.</w:t>
+        <w:t xml:space="preserve">Dos de esas líneas cargan evidencia que debe nombrarse. El «no» a los corticoides se apoya en que su beneficio en mortalidad se demostró en neumonía grave tratada en cuidados intensivos, no en sala: 6,2% con hidrocortisona frente a 11,9% con placebo a los 28 días (Dequin et al., 2023). La nota lo dice con una palabra: «sin criterios de gravedad». Y las guías no coinciden: la de la ATS y la IDSA de 2019 recomendó no usar corticoides de rutina, con fuerza en la neumonía no grave y con reservas en la grave, mientras que la actualización de 2024 de la Society of Critical Care Medicine, ya con ese ensayo sobre la mesa, los recomienda en la neumonía bacteriana grave hospitalizada (Metlay et al., 2019; Chaudhuri et al., 2024). La ficha de proceso no zanja el desacuerdo; deja escrito con qué umbral de gravedad lo resolvió. Y el «sin indicación de anaerobios» es un descarte con método, el de la anamnesis que no encontró aspiración, y por eso puede revisarse si la anamnesis cambia. La nota de proceso es apenas más larga que «Neumonía. Ceftriaxona» si se cuentan las líneas que una evolución típica dedica a repetir lo de ayer, y es otra cosa: cualquiera que la lea mañana sabe qué se pensó, qué quedó abierto y qué desmentiría el plan. El riesgo que este capítulo ya advirtió —la nota que crece sin pensar— no se corre aquí: la ficha de proceso no escribe más; escribe lo que hoy no se escribe nunca.</w:t>
       </w:r>
     </w:p>
     <w:p>
@@ -9914,7 +9843,7 @@
         <w:pStyle w:val="BodyJ"/>
       </w:pPr>
       <w:r>
-        <w:t xml:space="preserve">Hay que decirlo de entrada, porque el resto del capítulo lo presupone: pensar bien es parte de la ética primordial del médico, no un refinamiento intelectual que se agrega a ella. Es su herramienta principal, de la que parte todo lo demás — y en la que, cuando falla, termina todo lo demás. La idea tiene un antecedente filosófico exacto. Clifford sostuvo en 1877 que creer algo sin evidencia suficiente es siempre, en todo lugar y para cualquiera, un acto reprochable (Clifford, 1877). Lo ilustró con un armador que, sin inspeccionar su barco, se convence de que es seguro y lo deja zarpar. Si el barco llega a puerto, el armador no es menos culpable, porque la creencia se formó sin derecho a formarse. La medicina es el oficio donde esa tesis deja de ser una exageración. El médico que escribe «se descarta» sin un método que excluya, o «cuadro habitual» sin haber mirado las rodillas moteadas, ha hecho lo del armador, y un desenlace benigno no lo absuelve. La viñeta 6 lo dice al revés: el mismo proceso con una crisis de pánico real habría sido igual de indefendible. Por eso el deber de pensar bien no se agota en la competencia. Incluye el deber de saber cuándo uno no está en condiciones de pensar bien (capítulo 8) y de organizar el trabajo para que otro instrumento revise el juicio. La ética clínica no empieza en el comité ni en el consentimiento; empieza en la calidad de la creencia que sostiene la primera frase de la ficha.</w:t>
+        <w:t xml:space="preserve">Hay que decirlo de entrada, porque el resto del capítulo lo presupone: pensar bien es parte de la ética primordial del médico, no un refinamiento intelectual que se agrega a ella. Es su herramienta principal, de la que parte todo lo demás — y en la que, cuando falla, termina todo lo demás. La idea tiene un antecedente filosófico exacto. Clifford sostuvo en 1877 que creer algo sin evidencia suficiente es siempre, en todo lugar y para cualquiera, un acto reprochable (Clifford, 1877, §I). Lo ilustró con un armador que, sin inspeccionar su barco, se convence de que es seguro y lo deja zarpar. Si el barco llega a puerto, el armador no es menos culpable, porque la creencia se formó sin derecho a formarse. La medicina es el oficio donde esa tesis deja de ser una exageración. El médico que escribe «se descarta» sin un método que excluya, o «cuadro habitual» sin haber mirado las rodillas moteadas, ha hecho lo del armador, y un desenlace benigno no lo absuelve. La viñeta 6 lo dice al revés: el mismo proceso con una crisis de pánico real habría sido igual de indefendible. Por eso el deber de pensar bien no se agota en la competencia. Incluye el deber de saber cuándo uno no está en condiciones de pensar bien (capítulo 8) y de organizar el trabajo para que otro instrumento revise el juicio. La ética clínica no empieza en el comité ni en el consentimiento; empieza en la calidad de la creencia que sostiene la primera frase de la ficha.</w:t>
       </w:r>
     </w:p>
     <w:p>
@@ -10053,7 +9982,7 @@
         <w:pStyle w:val="BodyJ"/>
       </w:pPr>
       <w:r>
-        <w:t xml:space="preserve">La filosofía del testimonio ayuda a precisar qué significa «evaluar sin descartar». Contra la sospecha heredada del empirismo —que creerle a otro es siempre conocimiento de segunda categoría—, Coady sostuvo que el testimonio es una fuente básica de conocimiento, tan constitutiva como la percepción o la memoria. Sin una confianza por defecto en lo que otros informan, ni la ciencia ni la vida cotidiana serían posibles (Coady, 1992). Lackey corrigió el exceso opuesto: la confianza por defecto no es un cheque en blanco; el oyente responsable mantiene una sensibilidad activa a las señales de error o engaño, y el conocimiento testimonial se logra cuando ambas condiciones —decir fiable y escuchar vigilante— se cumplen a la vez (Lackey, 2008). La anamnesis es ese contrato epistémico: el paciente aporta un informe que el médico no puede obtener por ninguna otra vía, y el médico aporta el examen de consistencia, forma temporal y relación con otros hallazgos. Ni credulidad ni auditoría hostil: recepción con estándares. La injusticia testimonial es, en estos términos, un fallo del segundo contratante: aplicar a ciertos hablantes un estándar de vigilancia que no se aplica a otros, por razones que nada tienen que ver con la fiabilidad de su informe.</w:t>
+        <w:t xml:space="preserve">La filosofía del testimonio ayuda a precisar qué significa «evaluar sin descartar». Contra la sospecha heredada del empirismo —que creerle a otro es siempre conocimiento de segunda categoría—, Coady sostuvo que el testimonio es una fuente básica de conocimiento, tan constitutiva como la percepción o la memoria. Sin una confianza por defecto en lo que otros informan, ni la ciencia ni la vida cotidiana serían posibles (Coady, 1992, caps. 4 y 8). Lackey corrigió el exceso opuesto: la confianza por defecto no es un cheque en blanco; el oyente responsable mantiene una sensibilidad activa a las señales de error o engaño, y el conocimiento testimonial se logra cuando ambas condiciones —decir fiable y escuchar vigilante— se cumplen a la vez (Lackey, 2008, caps. 6-7). La anamnesis es ese contrato epistémico: el paciente aporta un informe que el médico no puede obtener por ninguna otra vía, y el médico aporta el examen de consistencia, forma temporal y relación con otros hallazgos. Ni credulidad ni auditoría hostil: recepción con estándares. La injusticia testimonial es, en estos términos, un fallo del segundo contratante: aplicar a ciertos hablantes un estándar de vigilancia que no se aplica a otros, por razones que nada tienen que ver con la fiabilidad de su informe.</w:t>
       </w:r>
     </w:p>
     <w:p>
@@ -10399,7 +10328,7 @@
                           </pic:cNvPicPr>
                         </pic:nvPicPr>
                         <pic:blipFill>
-                          <a:blip r:embed="rId23" cstate="none"/>
+                          <a:blip r:embed="rId22" cstate="none"/>
                           <a:srcRect/>
                           <a:stretch>
                             <a:fillRect/>
@@ -10426,7 +10355,7 @@
               <w:pStyle w:val="Caption"/>
             </w:pPr>
             <w:r>
-              <w:t xml:space="preserve">Figura 15. El método HII-D en una página: cinco pasos, cuatro capas y un movimiento transversal de reevaluación que devuelve al mundo la capacidad de corregirnos.</w:t>
+              <w:t xml:space="preserve">Figura 14. El método HII-D en una página: cinco pasos, cuatro capas y un movimiento transversal de reevaluación que devuelve al mundo la capacidad de corregirnos.</w:t>
             </w:r>
           </w:p>
         </w:tc>
@@ -13763,7 +13692,7 @@
         <w:pStyle w:val="BodyJ"/>
       </w:pPr>
       <w:r>
-        <w:t xml:space="preserve">La columna vertebral del catálogo es una sola observación: la IA no introdujo errores nuevos en la medicina. Automatizó los que ya teníamos y les quitó los frenos naturales — la lentitud, la duda, el cansancio que a veces obligaba a pedir ayuda. La Figura 16 pone cada riesgo junto al sesgo que amplifica.</w:t>
+        <w:t xml:space="preserve">La columna vertebral del catálogo es una sola observación: la IA no introdujo errores nuevos en la medicina. Automatizó los que ya teníamos y les quitó los frenos naturales — la lentitud, la duda, el cansancio que a veces obligaba a pedir ayuda. La Figura 15 pone cada riesgo junto al sesgo que amplifica.</w:t>
       </w:r>
     </w:p>
     <w:tbl>
@@ -13819,7 +13748,7 @@
                           </pic:cNvPicPr>
                         </pic:nvPicPr>
                         <pic:blipFill>
-                          <a:blip r:embed="rId24" cstate="none"/>
+                          <a:blip r:embed="rId23" cstate="none"/>
                           <a:srcRect/>
                           <a:stretch>
                             <a:fillRect/>
@@ -13846,7 +13775,7 @@
               <w:pStyle w:val="Caption"/>
             </w:pPr>
             <w:r>
-              <w:t xml:space="preserve">Figura 16. Parentescos: cada riesgo de la IA clínica junto al sesgo que este libro ya había descrito y el capítulo donde vive. Ningún riesgo es nuevo; la novedad es el amplificador.</w:t>
+              <w:t xml:space="preserve">Figura 15. Parentescos: cada riesgo de la IA clínica junto al sesgo que este libro ya había descrito y el capítulo donde vive. Ningún riesgo es nuevo; la novedad es el amplificador.</w:t>
             </w:r>
           </w:p>
         </w:tc>
@@ -14959,7 +14888,7 @@
         <w:pStyle w:val="BodyJ"/>
       </w:pPr>
       <w:r>
-        <w:t xml:space="preserve">La epistemología clínica puede parecer abstracta hasta que se traduce en hábitos: verificar la fuente del dato decisivo; reformular una etiqueta como una proposición; nombrar la principal explicación rival; separar la gravedad de la probabilidad; registrar qué hará cambiar la conducta; y revisar después si la confianza estuvo bien calibrada. Ningún hábito elimina el error. Juntos construyen condiciones para reconocerlo antes y aprender de él después.</w:t>
+        <w:t xml:space="preserve">La epistemología clínica puede parecer abstracta hasta que se traduce en hábitos: verificar la fuente del dato decisivo; reformular una etiqueta como una proposición; nombrar la principal explicación rival; separar la gravedad de la probabilidad; registrar qué hará cambiar la conducta; y revisar después si la confianza estuvo bien calibrada. Ningún hábito elimina el error. Juntos construyen condiciones para reconocerlo antes y aprender de él después. El Apéndice C los convierte en un plan de tres meses para un servicio: el lenguaje primero, la pausa en la visita después, la ficha y el circuito de aprendizaje al final.</w:t>
       </w:r>
     </w:p>
     <w:p>
@@ -17156,6 +17085,14 @@
         <w:pStyle w:val="BodyJ"/>
       </w:pPr>
       <w:r>
+        <w:t xml:space="preserve">Los términos marcados con ∗ son propuestas de este libro; los demás se toman de la literatura, con su autor entre paréntesis cuando corresponde.</w:t>
+      </w:r>
+    </w:p>
+    <w:p>
+      <w:pPr>
+        <w:pStyle w:val="BodyJ"/>
+      </w:pPr>
+      <w:r>
         <w:rPr>
           <w:b/>
           <w:bCs/>
@@ -17205,7 +17142,7 @@
           <w:b/>
           <w:bCs/>
         </w:rPr>
-        <w:t xml:space="preserve">Captura cognitiva.</w:t>
+        <w:t xml:space="preserve">Captura cognitiva∗.</w:t>
       </w:r>
       <w:r>
         <w:t xml:space="preserve"> Condicionamiento de la búsqueda de hipótesis, la lectura de los datos y la ponderación por una respuesta vista antes de razonar — típicamente la de un asistente de IA. No exige que la respuesta sea errónea: una hipótesis correcta entregada demasiado pronto también sustituye las operaciones que forman el juicio.</w:t>
@@ -17295,7 +17232,7 @@
           <w:b/>
           <w:bCs/>
         </w:rPr>
-        <w:t xml:space="preserve">Creatividad clínica.</w:t>
+        <w:t xml:space="preserve">Creatividad clínica∗.</w:t>
       </w:r>
       <w:r>
         <w:t xml:space="preserve"> Momento generativo del juicio: conjeturar hipótesis (abducción), re-plantear el problema y crear opciones de manejo. Casi siempre es creatividad psicológica y exploratoria (Boden): nueva para el caso, no para la humanidad. Se ejerce en la generación y se corrige en la selección.</w:t>
@@ -17355,7 +17292,7 @@
           <w:b/>
           <w:bCs/>
         </w:rPr>
-        <w:t xml:space="preserve">Densidad epistémica.</w:t>
+        <w:t xml:space="preserve">Densidad epistémica∗.</w:t>
       </w:r>
       <w:r>
         <w:t xml:space="preserve"> Propiedad de una formulación clínica que conserva los ejes que cambian la interpretación (tiempo, severidad, mecanismo, evidencia contraria, consecuencia) en lugar de sólo abreviar.</w:t>
@@ -17475,7 +17412,7 @@
           <w:b/>
           <w:bCs/>
         </w:rPr>
-        <w:t xml:space="preserve">Estado del razonador.</w:t>
+        <w:t xml:space="preserve">Estado del razonador∗.</w:t>
       </w:r>
       <w:r>
         <w:t xml:space="preserve"> Condiciones en que se produce un juicio clínico —sueño, horas de turno, hora del día, ánimo, preocupaciones ajenas al caso—, tratadas como un hecho de la capa H sobre la confiabilidad del instrumento que infiere y como disparador de pausa o de segundo lector. Pensar cuesta, y el costo no es constante.</w:t>
@@ -17490,7 +17427,7 @@
           <w:b/>
           <w:bCs/>
         </w:rPr>
-        <w:t xml:space="preserve">Ficha de proceso.</w:t>
+        <w:t xml:space="preserve">Ficha de proceso∗.</w:t>
       </w:r>
       <w:r>
         <w:t xml:space="preserve"> Registro que, además de conclusiones y acciones (ficha de resultados), conjuga los verbos del razonamiento: sospechado, dudado, descartado, priorizado, inferido, realizado, repetido, comprobado, aprendido. Cada verbo cae en una capa de HII-D; «Neumonía. Ceftriaxona» no conjuga ninguno.</w:t>
@@ -17520,7 +17457,7 @@
           <w:b/>
           <w:bCs/>
         </w:rPr>
-        <w:t xml:space="preserve">Frase medular.</w:t>
+        <w:t xml:space="preserve">Frase medular∗.</w:t>
       </w:r>
       <w:r>
         <w:t xml:space="preserve"> Formulación breve que condensa la naturaleza del evento, el elemento que cambia el riesgo, el límite principal de certeza y su efecto sobre la conducta.</w:t>
@@ -17565,7 +17502,7 @@
           <w:b/>
           <w:bCs/>
         </w:rPr>
-        <w:t xml:space="preserve">HII-D.</w:t>
+        <w:t xml:space="preserve">HII-D∗.</w:t>
       </w:r>
       <w:r>
         <w:t xml:space="preserve"> Heurística de escritura y deliberación que ordena el razonamiento en Hechos, Inferencias, Incertidumbre y Decisión, más un movimiento transversal de reevaluación. No validada como instrumento.</w:t>
@@ -18047,6 +17984,18 @@
         </w:numPr>
       </w:pPr>
       <w:r>
+        <w:t xml:space="preserve">Antipoesía como léxico de certeza (Parra) — 18</w:t>
+      </w:r>
+    </w:p>
+    <w:p>
+      <w:pPr>
+        <w:pStyle w:val="BodyJ"/>
+        <w:numPr>
+          <w:ilvl w:val="0"/>
+          <w:numId w:val="6"/>
+        </w:numPr>
+      </w:pPr>
+      <w:r>
         <w:t xml:space="preserve">Atrofia de la pericia por asistencia de IA (deskilling) — 17</w:t>
       </w:r>
     </w:p>
@@ -18191,6 +18140,30 @@
         </w:numPr>
       </w:pPr>
       <w:r>
+        <w:t xml:space="preserve">Contexto global del paciente (funcionalidad, pronóstico de fondo, red de apoyo) — 10, 15, Ap A</w:t>
+      </w:r>
+    </w:p>
+    <w:p>
+      <w:pPr>
+        <w:pStyle w:val="BodyJ"/>
+        <w:numPr>
+          <w:ilvl w:val="0"/>
+          <w:numId w:val="6"/>
+        </w:numPr>
+      </w:pPr>
+      <w:r>
+        <w:t xml:space="preserve">Contrafactuales — 11</w:t>
+      </w:r>
+    </w:p>
+    <w:p>
+      <w:pPr>
+        <w:pStyle w:val="BodyJ"/>
+        <w:numPr>
+          <w:ilvl w:val="0"/>
+          <w:numId w:val="6"/>
+        </w:numPr>
+      </w:pPr>
+      <w:r>
         <w:t xml:space="preserve">Conversaciones para la acción (Flores y Winograd) — 13</w:t>
       </w:r>
     </w:p>
@@ -18203,7 +18176,7 @@
         </w:numPr>
       </w:pPr>
       <w:r>
-        <w:t xml:space="preserve">Contexto global del paciente (funcionalidad, pronóstico de fondo, red de apoyo) — 10, 15, Ap A</w:t>
+        <w:t xml:space="preserve">Copiado de notas (fósil narrativo; magnitud medida) — 12, Ap C</w:t>
       </w:r>
     </w:p>
     <w:p>
@@ -18215,7 +18188,7 @@
         </w:numPr>
       </w:pPr>
       <w:r>
-        <w:t xml:space="preserve">Contrafactuales — 11</w:t>
+        <w:t xml:space="preserve">Creatividad en el juicio clínico (abducción, problem setting, tercera opción) — 2, 18</w:t>
       </w:r>
     </w:p>
     <w:p>
@@ -18227,7 +18200,7 @@
         </w:numPr>
       </w:pPr>
       <w:r>
-        <w:t xml:space="preserve">Copiado de notas (fósil narrativo; magnitud medida) — 12, Ap C</w:t>
+        <w:t xml:space="preserve">Cuatro tópicos (Jonsen, Siegler y Winslade) — 10, Ap A</w:t>
       </w:r>
     </w:p>
     <w:p>
@@ -18239,7 +18212,7 @@
         </w:numPr>
       </w:pPr>
       <w:r>
-        <w:t xml:space="preserve">Creatividad en el juicio clínico (abducción, problem setting, tercera opción) — 2, 18</w:t>
+        <w:t xml:space="preserve">Debate sobre la enseñanza del razonamiento (Croskerry vs. Norman/Monteiro) — 16</w:t>
       </w:r>
     </w:p>
     <w:p>
@@ -18251,7 +18224,7 @@
         </w:numPr>
       </w:pPr>
       <w:r>
-        <w:t xml:space="preserve">Cuatro tópicos (Jonsen, Siegler y Winslade) — 10, Ap A</w:t>
+        <w:t xml:space="preserve">Decisión compartida — 14, Interludio III</w:t>
       </w:r>
     </w:p>
     <w:p>
@@ -18263,7 +18236,7 @@
         </w:numPr>
       </w:pPr>
       <w:r>
-        <w:t xml:space="preserve">Debate sobre la enseñanza del razonamiento (Croskerry vs. Norman/Monteiro) — 16</w:t>
+        <w:t xml:space="preserve">Deliberación moral (Gracia) — 10</w:t>
       </w:r>
     </w:p>
     <w:p>
@@ -18275,7 +18248,7 @@
         </w:numPr>
       </w:pPr>
       <w:r>
-        <w:t xml:space="preserve">Decisión compartida — 14, Interludio III</w:t>
+        <w:t xml:space="preserve">Densidad epistémica — 4; seis dimensiones de auditoría — 4, Ap B</w:t>
       </w:r>
     </w:p>
     <w:p>
@@ -18287,7 +18260,7 @@
         </w:numPr>
       </w:pPr>
       <w:r>
-        <w:t xml:space="preserve">Deliberación moral (Gracia) — 10</w:t>
+        <w:t xml:space="preserve">Desaceleración selectiva — 8, Interludio II; disparadores, incluido el estado del razonador — 8</w:t>
       </w:r>
     </w:p>
     <w:p>
@@ -18299,7 +18272,7 @@
         </w:numPr>
       </w:pPr>
       <w:r>
-        <w:t xml:space="preserve">Densidad epistémica — 4; seis dimensiones de auditoría — 4, Ap B</w:t>
+        <w:t xml:space="preserve">Desacuerdo clínico — 13, Interludio III</w:t>
       </w:r>
     </w:p>
     <w:p>
@@ -18311,7 +18284,7 @@
         </w:numPr>
       </w:pPr>
       <w:r>
-        <w:t xml:space="preserve">Desaceleración selectiva — 8, Interludio II; disparadores, incluido el estado del razonador — 8</w:t>
+        <w:t xml:space="preserve">Doble proceso — 6</w:t>
       </w:r>
     </w:p>
     <w:p>
@@ -18323,7 +18296,7 @@
         </w:numPr>
       </w:pPr>
       <w:r>
-        <w:t xml:space="preserve">Desacuerdo clínico — 13, Interludio III</w:t>
+        <w:t xml:space="preserve">Documentación defensiva — 14</w:t>
       </w:r>
     </w:p>
     <w:p>
@@ -18335,7 +18308,7 @@
         </w:numPr>
       </w:pPr>
       <w:r>
-        <w:t xml:space="preserve">Doble proceso — 6</w:t>
+        <w:t xml:space="preserve">Ensombrecimiento diagnóstico — CC (viñeta 8)</w:t>
       </w:r>
     </w:p>
     <w:p>
@@ -18347,7 +18320,7 @@
         </w:numPr>
       </w:pPr>
       <w:r>
-        <w:t xml:space="preserve">Documentación defensiva — 14</w:t>
+        <w:t xml:space="preserve">Errores asimétricos — 10, CC (viñeta 3)</w:t>
       </w:r>
     </w:p>
     <w:p>
@@ -18359,7 +18332,7 @@
         </w:numPr>
       </w:pPr>
       <w:r>
-        <w:t xml:space="preserve">Ensombrecimiento diagnóstico — CC (viñeta 8)</w:t>
+        <w:t xml:space="preserve">Escribas ambientales (regla «la capa H sí, la capa D no») — 17</w:t>
       </w:r>
     </w:p>
     <w:p>
@@ -18371,7 +18344,7 @@
         </w:numPr>
       </w:pPr>
       <w:r>
-        <w:t xml:space="preserve">Errores asimétricos — 10, CC (viñeta 3)</w:t>
+        <w:t xml:space="preserve">Estado de verificación de un diagnóstico en la ficha electrónica — 12</w:t>
       </w:r>
     </w:p>
     <w:p>
@@ -18383,6 +18356,18 @@
         </w:numPr>
       </w:pPr>
       <w:r>
+        <w:t xml:space="preserve">Estado del razonador (esfuerzo, sueño, ánimo; turnos como condición epistémica) — 8, 16, Ap A</w:t>
+      </w:r>
+    </w:p>
+    <w:p>
+      <w:pPr>
+        <w:pStyle w:val="BodyJ"/>
+        <w:numPr>
+          <w:ilvl w:val="0"/>
+          <w:numId w:val="6"/>
+        </w:numPr>
+      </w:pPr>
+      <w:r>
         <w:t xml:space="preserve">Ética de la creencia (Clifford); pensar bien como deber primordial — 14, C</w:t>
       </w:r>
     </w:p>
@@ -18395,7 +18380,7 @@
         </w:numPr>
       </w:pPr>
       <w:r>
-        <w:t xml:space="preserve">Escribas ambientales (regla «la capa H sí, la capa D no») — 17</w:t>
+        <w:t xml:space="preserve">Evidencia poblacional y particularización — 9</w:t>
       </w:r>
     </w:p>
     <w:p>
@@ -18407,7 +18392,7 @@
         </w:numPr>
       </w:pPr>
       <w:r>
-        <w:t xml:space="preserve">Estado de verificación de un diagnóstico en la ficha electrónica — 12</w:t>
+        <w:t xml:space="preserve">Falsabilidad del método HII-D — 15</w:t>
       </w:r>
     </w:p>
     <w:p>
@@ -18419,7 +18404,7 @@
         </w:numPr>
       </w:pPr>
       <w:r>
-        <w:t xml:space="preserve">Estado del razonador (esfuerzo, sueño, ánimo; turnos como condición epistémica) — 8, 16, Ap A</w:t>
+        <w:t xml:space="preserve">Feedback diagnóstico — 5, 16, Ap C</w:t>
       </w:r>
     </w:p>
     <w:p>
@@ -18431,7 +18416,7 @@
         </w:numPr>
       </w:pPr>
       <w:r>
-        <w:t xml:space="preserve">Evidencia poblacional y particularización — 9</w:t>
+        <w:t xml:space="preserve">Ficha como dispositivo que produce lo visible (Foucault) — 12</w:t>
       </w:r>
     </w:p>
     <w:p>
@@ -18443,7 +18428,7 @@
         </w:numPr>
       </w:pPr>
       <w:r>
-        <w:t xml:space="preserve">Falsabilidad del método HII-D — 15</w:t>
+        <w:t xml:space="preserve">Ficha de proceso vs. ficha de resultados (los verbos del razonamiento) — 12; Taller 12B</w:t>
       </w:r>
     </w:p>
     <w:p>
@@ -18455,7 +18440,7 @@
         </w:numPr>
       </w:pPr>
       <w:r>
-        <w:t xml:space="preserve">Feedback diagnóstico — 5, 16, Ap C</w:t>
+        <w:t xml:space="preserve">Fichas clínicas y plantillas — 12, 16, Ap C; ficha electrónica pensada desde HII-D — 12</w:t>
       </w:r>
     </w:p>
     <w:p>
@@ -18467,7 +18452,7 @@
         </w:numPr>
       </w:pPr>
       <w:r>
-        <w:t xml:space="preserve">Ficha como dispositivo que produce lo visible (Foucault) — 12</w:t>
+        <w:t xml:space="preserve">Formación clínica en la era de la IA (deskilling, never-skilling, mis-skilling) — 17</w:t>
       </w:r>
     </w:p>
     <w:p>
@@ -18479,7 +18464,7 @@
         </w:numPr>
       </w:pPr>
       <w:r>
-        <w:t xml:space="preserve">Ficha de proceso vs. ficha de resultados (los verbos del razonamiento) — 12; Taller 12B</w:t>
+        <w:t xml:space="preserve">Fragilidad y funcionalidad como hechos clínicos — 10, 15, Ap A</w:t>
       </w:r>
     </w:p>
     <w:p>
@@ -18491,7 +18476,7 @@
         </w:numPr>
       </w:pPr>
       <w:r>
-        <w:t xml:space="preserve">Fichas clínicas y plantillas — 12, 16, Ap C; ficha electrónica pensada desde HII-D — 12</w:t>
+        <w:t xml:space="preserve">Frase medular — 4, 12, C, CC (todas las viñetas); como argumento de Toulmin — 4</w:t>
       </w:r>
     </w:p>
     <w:p>
@@ -18503,7 +18488,7 @@
         </w:numPr>
       </w:pPr>
       <w:r>
-        <w:t xml:space="preserve">Formación clínica en la era de la IA (deskilling, never-skilling, mis-skilling) — 17</w:t>
+        <w:t xml:space="preserve">Frecuencias naturales — 2, 10</w:t>
       </w:r>
     </w:p>
     <w:p>
@@ -18515,7 +18500,7 @@
         </w:numPr>
       </w:pPr>
       <w:r>
-        <w:t xml:space="preserve">Fragilidad y funcionalidad como hechos clínicos — 10, 15, Ap A</w:t>
+        <w:t xml:space="preserve">Fuentes del hecho clínico (matriz de procedencia) — 1</w:t>
       </w:r>
     </w:p>
     <w:p>
@@ -18527,7 +18512,7 @@
         </w:numPr>
       </w:pPr>
       <w:r>
-        <w:t xml:space="preserve">Fuentes del hecho clínico (matriz de procedencia) — 1</w:t>
+        <w:t xml:space="preserve">Grados de facticidad — 1</w:t>
       </w:r>
     </w:p>
     <w:p>
@@ -18539,7 +18524,7 @@
         </w:numPr>
       </w:pPr>
       <w:r>
-        <w:t xml:space="preserve">Frase medular — 4, 12, C, CC (todas las viñetas); como argumento de Toulmin — 4</w:t>
+        <w:t xml:space="preserve">Hecho como estatus provisional (frontera hecho/inferencia) — 1</w:t>
       </w:r>
     </w:p>
     <w:p>
@@ -18551,7 +18536,7 @@
         </w:numPr>
       </w:pPr>
       <w:r>
-        <w:t xml:space="preserve">Frecuencias naturales — 2, 10</w:t>
+        <w:t xml:space="preserve">HII-D (método) — 12, 15, Ap A; auditoría de IA con — 17</w:t>
       </w:r>
     </w:p>
     <w:p>
@@ -18563,7 +18548,7 @@
         </w:numPr>
       </w:pPr>
       <w:r>
-        <w:t xml:space="preserve">Grados de facticidad — 1</w:t>
+        <w:t xml:space="preserve">Hindsight bias — 8, 11, 16, CC (viñeta 6)</w:t>
       </w:r>
     </w:p>
     <w:p>
@@ -18575,7 +18560,7 @@
         </w:numPr>
       </w:pPr>
       <w:r>
-        <w:t xml:space="preserve">Hecho como estatus provisional (frontera hecho/inferencia) — 1</w:t>
+        <w:t xml:space="preserve">Humildad epistémica como motor (explorar, aprender, reenfocar) — 14</w:t>
       </w:r>
     </w:p>
     <w:p>
@@ -18587,7 +18572,7 @@
         </w:numPr>
       </w:pPr>
       <w:r>
-        <w:t xml:space="preserve">Hindsight bias — 8, 11, 16, CC (viñeta 6)</w:t>
+        <w:t xml:space="preserve">Illness scripts — 2, 6, 16</w:t>
       </w:r>
     </w:p>
     <w:p>
@@ -18599,7 +18584,7 @@
         </w:numPr>
       </w:pPr>
       <w:r>
-        <w:t xml:space="preserve">HII-D (método) — 12, 15, Ap A; auditoría de IA con — 17</w:t>
+        <w:t xml:space="preserve">Improvisación y saber hacer (jazz; Limb y Braun) — 6</w:t>
       </w:r>
     </w:p>
     <w:p>
@@ -18611,7 +18596,7 @@
         </w:numPr>
       </w:pPr>
       <w:r>
-        <w:t xml:space="preserve">Humildad epistémica como motor (explorar, aprender, reenfocar) — 14</w:t>
+        <w:t xml:space="preserve">Incertidumbre: taxonomía y cartografía — 3; epistémica y aleatoria — 3; knightiana — 3</w:t>
       </w:r>
     </w:p>
     <w:p>
@@ -18623,7 +18608,7 @@
         </w:numPr>
       </w:pPr>
       <w:r>
-        <w:t xml:space="preserve">Illness scripts — 2, 6, 16</w:t>
+        <w:t xml:space="preserve">Injusticia epistémica — 14, CC (viñetas 6 y 8)</w:t>
       </w:r>
     </w:p>
     <w:p>
@@ -18635,7 +18620,7 @@
         </w:numPr>
       </w:pPr>
       <w:r>
-        <w:t xml:space="preserve">Improvisación y saber hacer (jazz; Limb y Braun) — 6</w:t>
+        <w:t xml:space="preserve">Inteligencia artificial: rol diagnóstico y terapéutico, catálogo de riesgos, defensas — 17</w:t>
       </w:r>
     </w:p>
     <w:p>
@@ -18647,7 +18632,7 @@
         </w:numPr>
       </w:pPr>
       <w:r>
-        <w:t xml:space="preserve">Incertidumbre: taxonomía y cartografía — 3; epistémica y aleatoria — 3; knightiana — 3</w:t>
+        <w:t xml:space="preserve">Intuición experta — 5, 6, Interludio II</w:t>
       </w:r>
     </w:p>
     <w:p>
@@ -18659,7 +18644,7 @@
         </w:numPr>
       </w:pPr>
       <w:r>
-        <w:t xml:space="preserve">Injusticia epistémica — 14, CC (viñetas 6 y 8)</w:t>
+        <w:t xml:space="preserve">Lectura de ensayos clínicos (significación, reanálisis bayesiano, saga ANDROMEDA) — 9</w:t>
       </w:r>
     </w:p>
     <w:p>
@@ -18671,7 +18656,7 @@
         </w:numPr>
       </w:pPr>
       <w:r>
-        <w:t xml:space="preserve">Inteligencia artificial: rol diagnóstico y terapéutico, catálogo de riesgos, defensas — 17</w:t>
+        <w:t xml:space="preserve">Léxico de certeza — 4, Ap B</w:t>
       </w:r>
     </w:p>
     <w:p>
@@ -18683,7 +18668,7 @@
         </w:numPr>
       </w:pPr>
       <w:r>
-        <w:t xml:space="preserve">Intuición experta — 5, 6, Interludio II</w:t>
+        <w:t xml:space="preserve">Marcador y enfermedad (lactato, perfusión, ANDROMEDA-SHOCK) — 1, 9</w:t>
       </w:r>
     </w:p>
     <w:p>
@@ -18695,7 +18680,7 @@
         </w:numPr>
       </w:pPr>
       <w:r>
-        <w:t xml:space="preserve">Lectura de ensayos clínicos (significación, reanálisis bayesiano, saga ANDROMEDA) — 9</w:t>
+        <w:t xml:space="preserve">Medicina basada en evidencia — 9</w:t>
       </w:r>
     </w:p>
     <w:p>
@@ -18707,7 +18692,7 @@
         </w:numPr>
       </w:pPr>
       <w:r>
-        <w:t xml:space="preserve">Léxico de certeza — 4, Ap B</w:t>
+        <w:t xml:space="preserve">Mente del principiante (Zen, shoshin) — 8</w:t>
       </w:r>
     </w:p>
     <w:p>
@@ -18719,7 +18704,7 @@
         </w:numPr>
       </w:pPr>
       <w:r>
-        <w:t xml:space="preserve">Marcador y enfermedad (lactato, perfusión, ANDROMEDA-SHOCK) — 1, 9</w:t>
+        <w:t xml:space="preserve">Meta-d′ y medición de la metacognición — 5</w:t>
       </w:r>
     </w:p>
     <w:p>
@@ -18731,7 +18716,7 @@
         </w:numPr>
       </w:pPr>
       <w:r>
-        <w:t xml:space="preserve">Medicina basada en evidencia — 9</w:t>
+        <w:t xml:space="preserve">Metacognición: definición y niveles — Int, 5; monitoreo y control — 5; social (señales del equipo y del paciente) — 5, 13; sensibilidad vs. sesgo — Int, 5; auditoría de salidas de IA — 17</w:t>
       </w:r>
     </w:p>
     <w:p>
@@ -18743,7 +18728,7 @@
         </w:numPr>
       </w:pPr>
       <w:r>
-        <w:t xml:space="preserve">Meta-d′ y medición de la metacognición — 5</w:t>
+        <w:t xml:space="preserve">Miedo y decisión (documentación defensiva, sobreestudio) — 3, 14</w:t>
       </w:r>
     </w:p>
     <w:p>
@@ -18755,7 +18740,7 @@
         </w:numPr>
       </w:pPr>
       <w:r>
-        <w:t xml:space="preserve">Mente del principiante (Zen, shoshin) — 8</w:t>
+        <w:t xml:space="preserve">Modelo de Toulmin (dato, garantía, calificador, refutación) — 4</w:t>
       </w:r>
     </w:p>
     <w:p>
@@ -18767,7 +18752,7 @@
         </w:numPr>
       </w:pPr>
       <w:r>
-        <w:t xml:space="preserve">Metacognición: definición y niveles — Int, 5; monitoreo y control — 5; social (señales del equipo y del paciente) — 5, 13; sensibilidad vs. sesgo — Int, 5; auditoría de salidas de IA — 17</w:t>
+        <w:t xml:space="preserve">Nota clínica generada por IA (degradación del registro) — 17</w:t>
       </w:r>
     </w:p>
     <w:p>
@@ -18779,7 +18764,7 @@
         </w:numPr>
       </w:pPr>
       <w:r>
-        <w:t xml:space="preserve">Miedo y decisión (documentación defensiva, sobreestudio) — 3, 14</w:t>
+        <w:t xml:space="preserve">Nota de enfermería como hecho clínico — 13</w:t>
       </w:r>
     </w:p>
     <w:p>
@@ -18791,7 +18776,7 @@
         </w:numPr>
       </w:pPr>
       <w:r>
-        <w:t xml:space="preserve">Modelo de Toulmin (dato, garantía, calificador, refutación) — 4</w:t>
+        <w:t xml:space="preserve">Objetividad entre paréntesis y observador (Maturana) — 1; emociones como dominio de acción — 8</w:t>
       </w:r>
     </w:p>
     <w:p>
@@ -18803,7 +18788,7 @@
         </w:numPr>
       </w:pPr>
       <w:r>
-        <w:t xml:space="preserve">Nota clínica generada por IA (degradación del registro) — 17</w:t>
+        <w:t xml:space="preserve">Observación activa — 11</w:t>
       </w:r>
     </w:p>
     <w:p>
@@ -18815,7 +18800,7 @@
         </w:numPr>
       </w:pPr>
       <w:r>
-        <w:t xml:space="preserve">Nota de enfermería como hecho clínico — 13</w:t>
+        <w:t xml:space="preserve">Paradoja de la automatización — 17</w:t>
       </w:r>
     </w:p>
     <w:p>
@@ -18827,7 +18812,7 @@
         </w:numPr>
       </w:pPr>
       <w:r>
-        <w:t xml:space="preserve">Objetividad entre paréntesis y observador (Maturana) — 1; emociones como dominio de acción — 8</w:t>
+        <w:t xml:space="preserve">Pausa diagnóstica — 8, 16, Ap B, Ap C</w:t>
       </w:r>
     </w:p>
     <w:p>
@@ -18839,7 +18824,7 @@
         </w:numPr>
       </w:pPr>
       <w:r>
-        <w:t xml:space="preserve">Observación activa — 11</w:t>
+        <w:t xml:space="preserve">Pericia y práctica deliberada — 6</w:t>
       </w:r>
     </w:p>
     <w:p>
@@ -18851,7 +18836,7 @@
         </w:numPr>
       </w:pPr>
       <w:r>
-        <w:t xml:space="preserve">Paradoja de la automatización — 17</w:t>
+        <w:t xml:space="preserve">Phronesis — 6, 14</w:t>
       </w:r>
     </w:p>
     <w:p>
@@ -18863,7 +18848,7 @@
         </w:numPr>
       </w:pPr>
       <w:r>
-        <w:t xml:space="preserve">Pausa diagnóstica — 8, 16, Ap B, Ap C</w:t>
+        <w:t xml:space="preserve">Poesía y juicio clínico (Huidobro, Parra; belleza como señal y trampa) — 18</w:t>
       </w:r>
     </w:p>
     <w:p>
@@ -18875,7 +18860,7 @@
         </w:numPr>
       </w:pPr>
       <w:r>
-        <w:t xml:space="preserve">Pericia y práctica deliberada — 6</w:t>
+        <w:t xml:space="preserve">Pronóstico e incertidumbre de plazo — CC (viñeta 5)</w:t>
       </w:r>
     </w:p>
     <w:p>
@@ -18887,7 +18872,7 @@
         </w:numPr>
       </w:pPr>
       <w:r>
-        <w:t xml:space="preserve">Phronesis — 6, 14</w:t>
+        <w:t xml:space="preserve">Proporcionalidad terapéutica (Taboada) — 10, 15, CC (viñeta 5)</w:t>
       </w:r>
     </w:p>
     <w:p>
@@ -18899,7 +18884,7 @@
         </w:numPr>
       </w:pPr>
       <w:r>
-        <w:t xml:space="preserve">Poesía y juicio clínico (Huidobro, Parra; belleza como señal y trampa) — 18</w:t>
+        <w:t xml:space="preserve">Proteína C reactiva: cinética y lectura temporal — 11, 12</w:t>
       </w:r>
     </w:p>
     <w:p>
@@ -18911,7 +18896,7 @@
         </w:numPr>
       </w:pPr>
       <w:r>
-        <w:t xml:space="preserve">Pronóstico e incertidumbre de plazo — CC (viñeta 5)</w:t>
+        <w:t xml:space="preserve">Prueba de Parra (Taller 18) — 18</w:t>
       </w:r>
     </w:p>
     <w:p>
@@ -18923,7 +18908,7 @@
         </w:numPr>
       </w:pPr>
       <w:r>
-        <w:t xml:space="preserve">Proteína C reactiva: cinética y lectura temporal — 11, 12</w:t>
+        <w:t xml:space="preserve">Pruebas severas (Popper) — 2</w:t>
       </w:r>
     </w:p>
     <w:p>
@@ -18935,7 +18920,7 @@
         </w:numPr>
       </w:pPr>
       <w:r>
-        <w:t xml:space="preserve">Proporcionalidad terapéutica (Taboada) — 10, 15, CC (viñeta 5)</w:t>
+        <w:t xml:space="preserve">Puntos de inflexión — 11, Interludio III</w:t>
       </w:r>
     </w:p>
     <w:p>
@@ -18947,7 +18932,7 @@
         </w:numPr>
       </w:pPr>
       <w:r>
-        <w:t xml:space="preserve">Pruebas severas (Popper) — 2</w:t>
+        <w:t xml:space="preserve">Reglas de decisión clínica (PERC) y umbral — CC (viñeta 6)</w:t>
       </w:r>
     </w:p>
     <w:p>
@@ -18959,7 +18944,7 @@
         </w:numPr>
       </w:pPr>
       <w:r>
-        <w:t xml:space="preserve">Puntos de inflexión — 11, Interludio III</w:t>
+        <w:t xml:space="preserve">Representación del problema — Int, 2, 8, 16</w:t>
       </w:r>
     </w:p>
     <w:p>
@@ -18971,7 +18956,7 @@
         </w:numPr>
       </w:pPr>
       <w:r>
-        <w:t xml:space="preserve">Reglas de decisión clínica (PERC) y umbral — CC (viñeta 6)</w:t>
+        <w:t xml:space="preserve">Riesgo inductivo (Rudner, Douglas) — 10</w:t>
       </w:r>
     </w:p>
     <w:p>
@@ -18983,7 +18968,7 @@
         </w:numPr>
       </w:pPr>
       <w:r>
-        <w:t xml:space="preserve">Representación del problema — Int, 2, 8, 16</w:t>
+        <w:t xml:space="preserve">Safety-netting — 11, CC (viñetas 3, 4 y 7)</w:t>
       </w:r>
     </w:p>
     <w:p>
@@ -18995,7 +18980,7 @@
         </w:numPr>
       </w:pPr>
       <w:r>
-        <w:t xml:space="preserve">Riesgo inductivo (Rudner, Douglas) — 10</w:t>
+        <w:t xml:space="preserve">Segunda víctima — 14</w:t>
       </w:r>
     </w:p>
     <w:p>
@@ -19007,7 +18992,7 @@
         </w:numPr>
       </w:pPr>
       <w:r>
-        <w:t xml:space="preserve">Safety-netting — 11, CC (viñetas 3, 4 y 7)</w:t>
+        <w:t xml:space="preserve">Sesgo algorítmico (Obermeyer) — 17</w:t>
       </w:r>
     </w:p>
     <w:p>
@@ -19019,7 +19004,7 @@
         </w:numPr>
       </w:pPr>
       <w:r>
-        <w:t xml:space="preserve">Segunda víctima — 14</w:t>
+        <w:t xml:space="preserve">Sesgo de automatización (Goddard) — 17</w:t>
       </w:r>
     </w:p>
     <w:p>
@@ -19031,7 +19016,7 @@
         </w:numPr>
       </w:pPr>
       <w:r>
-        <w:t xml:space="preserve">Sesgo algorítmico (Obermeyer) — 17</w:t>
+        <w:t xml:space="preserve">Sesgos cognitivos: alcance y límites del vocabulario — 7</w:t>
       </w:r>
     </w:p>
     <w:p>
@@ -19043,7 +19028,7 @@
         </w:numPr>
       </w:pPr>
       <w:r>
-        <w:t xml:space="preserve">Sesgo de automatización (Goddard) — 17</w:t>
+        <w:t xml:space="preserve">Sobreconfianza — 5, 7</w:t>
       </w:r>
     </w:p>
     <w:p>
@@ -19055,7 +19040,7 @@
         </w:numPr>
       </w:pPr>
       <w:r>
-        <w:t xml:space="preserve">Sesgos cognitivos: alcance y límites del vocabulario — 7</w:t>
+        <w:t xml:space="preserve">Sobreestudio e intervenciones innecesarias — 3</w:t>
       </w:r>
     </w:p>
     <w:p>
@@ -19067,7 +19052,7 @@
         </w:numPr>
       </w:pPr>
       <w:r>
-        <w:t xml:space="preserve">Sobreconfianza — 5, 7</w:t>
+        <w:t xml:space="preserve">Testimonio del paciente — 1, 14; epistemología del testimonio (Coady, Lackey) — 14; testimonio de terceros y cuidadores — CC (viñeta 7)</w:t>
       </w:r>
     </w:p>
     <w:p>
@@ -19079,7 +19064,7 @@
         </w:numPr>
       </w:pPr>
       <w:r>
-        <w:t xml:space="preserve">Sobreestudio e intervenciones innecesarias — 3</w:t>
+        <w:t xml:space="preserve">Trayectoria del error (estaciones y barreras) — 7</w:t>
       </w:r>
     </w:p>
     <w:p>
@@ -19091,7 +19076,7 @@
         </w:numPr>
       </w:pPr>
       <w:r>
-        <w:t xml:space="preserve">Testimonio del paciente — 1, 14; epistemología del testimonio (Coady, Lackey) — 14; testimonio de terceros y cuidadores — CC (viñeta 7)</w:t>
+        <w:t xml:space="preserve">Trayectoria y temporalidad — 11, Interludio I</w:t>
       </w:r>
     </w:p>
     <w:p>
@@ -19103,7 +19088,7 @@
         </w:numPr>
       </w:pPr>
       <w:r>
-        <w:t xml:space="preserve">Trayectoria del error (estaciones y barreras) — 7</w:t>
+        <w:t xml:space="preserve">Umbral y geografía (hospital insular, evacuación aeromédica) — 11</w:t>
       </w:r>
     </w:p>
     <w:p>
@@ -19115,7 +19100,7 @@
         </w:numPr>
       </w:pPr>
       <w:r>
-        <w:t xml:space="preserve">Trayectoria y temporalidad — 11, Interludio I</w:t>
+        <w:t xml:space="preserve">Umbrales de decisión — 10, Interludio III, CC (viñeta 3)</w:t>
       </w:r>
     </w:p>
     <w:p>
@@ -19127,7 +19112,7 @@
         </w:numPr>
       </w:pPr>
       <w:r>
-        <w:t xml:space="preserve">Umbral y geografía (hospital insular, evacuación aeromédica) — 11</w:t>
+        <w:t xml:space="preserve">Validación local y monitoreo de herramientas de IA — 17</w:t>
       </w:r>
     </w:p>
     <w:p>
@@ -19139,31 +19124,7 @@
         </w:numPr>
       </w:pPr>
       <w:r>
-        <w:t xml:space="preserve">Umbrales de decisión — 10, Interludio III, CC (viñeta 3)</w:t>
-      </w:r>
-    </w:p>
-    <w:p>
-      <w:pPr>
-        <w:pStyle w:val="BodyJ"/>
-        <w:numPr>
-          <w:ilvl w:val="0"/>
-          <w:numId w:val="6"/>
-        </w:numPr>
-      </w:pPr>
-      <w:r>
         <w:t xml:space="preserve">Validez del entorno e intuición (Kahneman y Klein) — 6</w:t>
-      </w:r>
-    </w:p>
-    <w:p>
-      <w:pPr>
-        <w:pStyle w:val="BodyJ"/>
-        <w:numPr>
-          <w:ilvl w:val="0"/>
-          <w:numId w:val="6"/>
-        </w:numPr>
-      </w:pPr>
-      <w:r>
-        <w:t xml:space="preserve">Validación local y monitoreo de herramientas de IA — 17</w:t>
       </w:r>
     </w:p>
     <w:p>
@@ -19193,97 +19154,187 @@
           <w:sz w:val="34"/>
           <w:szCs w:val="34"/>
         </w:rPr>
-        <w:t xml:space="preserve">Nota metodológica y estatuto de las afirmaciones</w:t>
-      </w:r>
-    </w:p>
-    <w:p>
-      <w:pPr>
-        <w:pStyle w:val="BodyJ"/>
-      </w:pPr>
-      <w:r>
-        <w:rPr>
-          <w:b/>
-          <w:bCs/>
-        </w:rPr>
-        <w:t xml:space="preserve">Naturaleza de la obra.</w:t>
-      </w:r>
-      <w:r>
-        <w:t xml:space="preserve"> Este libro es un ensayo académico de integración científico-filosófica dirigido a profesionales clínicos. No es una revisión sistemática, ni una guía clínica, ni contiene instrumentos validados.</w:t>
-      </w:r>
-    </w:p>
-    <w:p>
-      <w:pPr>
-        <w:pStyle w:val="BodyJ"/>
-      </w:pPr>
-      <w:r>
-        <w:rPr>
-          <w:b/>
-          <w:bCs/>
-        </w:rPr>
-        <w:t xml:space="preserve">Estrategia bibliográfica.</w:t>
-      </w:r>
-      <w:r>
-        <w:t xml:space="preserve"> Las fuentes provienen de tres cuerpos: investigación biomédica y de razonamiento clínico, filosofía de la ciencia y epistemología, y educación médica. Se privilegiaron fuentes primarias y revisiones reconocidas; el período cubierto llega hasta el cierre bibliográfico, en octubre de 2026. Durante la redacción se aplicó una regla fija: ninguna referencia entró al manuscrito sin verificación previa contra su fuente — autoría, año, revista y resultado. No se pretende exhaustividad sistemática: la selección sirve al argumento y se declara como tal.</w:t>
-      </w:r>
-    </w:p>
-    <w:p>
-      <w:pPr>
-        <w:pStyle w:val="BodyJ"/>
-      </w:pPr>
-      <w:r>
-        <w:rPr>
-          <w:b/>
-          <w:bCs/>
-        </w:rPr>
-        <w:t xml:space="preserve">Estatuto de las afirmaciones.</w:t>
-      </w:r>
-      <w:r>
-        <w:t xml:space="preserve"> El lector encontrará seis clases de enunciados, y el texto procura que cada uno se presente como lo que es: resultados verificados de fuentes primarias, citados con autor y año; conclusiones de revisiones o consensos; argumentos filosóficos, atribuidos a sus autores; experiencia autoral, narrada en primera persona; ejemplos docentes construidos, señalados como tales («en ejercicios docentes suele observarse…»); y propuestas originales del libro — la densidad epistémica, la frase medular y el método HII-D —, que no deben leerse como hallazgos sino como hipótesis de trabajo.</w:t>
-      </w:r>
-    </w:p>
-    <w:p>
-      <w:pPr>
-        <w:pStyle w:val="BodyJ"/>
-      </w:pPr>
-      <w:r>
-        <w:rPr>
-          <w:b/>
-          <w:bCs/>
-        </w:rPr>
-        <w:t xml:space="preserve">Los casos.</w:t>
-      </w:r>
-      <w:r>
-        <w:t xml:space="preserve"> Las escenas clínicas de este libro — Carmen, los interludios, las viñetas y los pasajes en primera persona — son composiciones docentes en el sentido declarado en la página legal: condensan experiencias reales y situaciones compuestas, sin reproducir episodios literales ni permitir identificación de personas o instituciones.</w:t>
-      </w:r>
-    </w:p>
-    <w:p>
-      <w:pPr>
-        <w:pStyle w:val="BodyJ"/>
-      </w:pPr>
-      <w:r>
-        <w:rPr>
-          <w:b/>
-          <w:bCs/>
-        </w:rPr>
-        <w:t xml:space="preserve">Uso de inteligencia artificial.</w:t>
-      </w:r>
-      <w:r>
-        <w:t xml:space="preserve"> Este manuscrito se desarrolló a partir de ideas y formulaciones del autor, con asistencia de inteligencia artificial en búsqueda inicial, organización, comparación bibliográfica, apoyo en redacción y edición. La IA no sustituyó la verificación de fuentes, el juicio clínico, la autoría ni la responsabilidad: las tesis, las decisiones de contenido y los errores pertenecen al autor. El libro intenta aplicar a su propia escritura la disciplina que su capítulo 17 recomienda.</w:t>
-      </w:r>
-    </w:p>
-    <w:p>
-      <w:pPr>
-        <w:pStyle w:val="BodyJ"/>
-      </w:pPr>
-      <w:r>
-        <w:rPr>
-          <w:b/>
-          <w:bCs/>
-        </w:rPr>
-        <w:t xml:space="preserve">HII-D.</w:t>
-      </w:r>
-      <w:r>
-        <w:t xml:space="preserve"> Es una heurística conceptual no validada. Sus compromisos de falsabilidad están en el capítulo 15 («Qué evidencia me haría abandonar este método»); su evaluación empírica — concordancia entre lectores, efecto sobre la reconstrucción del razonamiento y sobre conductas medibles, y costo en tiempo — es un programa pendiente, no un resultado.</w:t>
+        <w:t xml:space="preserve">Lista de figuras</w:t>
+      </w:r>
+    </w:p>
+    <w:p>
+      <w:pPr>
+        <w:pStyle w:val="BodyJ"/>
+        <w:numPr>
+          <w:ilvl w:val="0"/>
+          <w:numId w:val="6"/>
+        </w:numPr>
+      </w:pPr>
+      <w:r>
+        <w:t xml:space="preserve">Figura 1. Mapa del libro (Cómo leer este libro).</w:t>
+      </w:r>
+    </w:p>
+    <w:p>
+      <w:pPr>
+        <w:pStyle w:val="BodyJ"/>
+        <w:numPr>
+          <w:ilvl w:val="0"/>
+          <w:numId w:val="6"/>
+        </w:numPr>
+      </w:pPr>
+      <w:r>
+        <w:t xml:space="preserve">Figura 2. Las cuatro capas del conocimiento clínico, la franja de incertidumbre que las atraviesa y el circuito de reevaluación que vuelve a la pregunta y a los hechos (Introducción).</w:t>
+      </w:r>
+    </w:p>
+    <w:p>
+      <w:pPr>
+        <w:pStyle w:val="BodyJ"/>
+        <w:numPr>
+          <w:ilvl w:val="0"/>
+          <w:numId w:val="6"/>
+        </w:numPr>
+      </w:pPr>
+      <w:r>
+        <w:t xml:space="preserve">Figura 3. Fuentes del hecho clínico (Capítulo 1).</w:t>
+      </w:r>
+    </w:p>
+    <w:p>
+      <w:pPr>
+        <w:pStyle w:val="BodyJ"/>
+        <w:numPr>
+          <w:ilvl w:val="0"/>
+          <w:numId w:val="6"/>
+        </w:numPr>
+      </w:pPr>
+      <w:r>
+        <w:t xml:space="preserve">Figura 4. Un mapa de la incertidumbre clínica (adaptado de la taxonomía de Han et al.) (Capítulo 3).</w:t>
+      </w:r>
+    </w:p>
+    <w:p>
+      <w:pPr>
+        <w:pStyle w:val="BodyJ"/>
+        <w:numPr>
+          <w:ilvl w:val="0"/>
+          <w:numId w:val="6"/>
+        </w:numPr>
+      </w:pPr>
+      <w:r>
+        <w:t xml:space="preserve">Figura 5. La frase medular como argumento de Toulmin (Capítulo 4).</w:t>
+      </w:r>
+    </w:p>
+    <w:p>
+      <w:pPr>
+        <w:pStyle w:val="BodyJ"/>
+        <w:numPr>
+          <w:ilvl w:val="0"/>
+          <w:numId w:val="6"/>
+        </w:numPr>
+      </w:pPr>
+      <w:r>
+        <w:t xml:space="preserve">Figura 6. El modelo de dos niveles de Nelson y Narens (Capítulo 5).</w:t>
+      </w:r>
+    </w:p>
+    <w:p>
+      <w:pPr>
+        <w:pStyle w:val="BodyJ"/>
+        <w:numPr>
+          <w:ilvl w:val="0"/>
+          <w:numId w:val="6"/>
+        </w:numPr>
+      </w:pPr>
+      <w:r>
+        <w:t xml:space="preserve">Figura 7. Curva de calibración (Capítulo 5).</w:t>
+      </w:r>
+    </w:p>
+    <w:p>
+      <w:pPr>
+        <w:pStyle w:val="BodyJ"/>
+        <w:numPr>
+          <w:ilvl w:val="0"/>
+          <w:numId w:val="6"/>
+        </w:numPr>
+      </w:pPr>
+      <w:r>
+        <w:t xml:space="preserve">Figura 8. El error como trayectoria (Capítulo 7).</w:t>
+      </w:r>
+    </w:p>
+    <w:p>
+      <w:pPr>
+        <w:pStyle w:val="BodyJ"/>
+        <w:numPr>
+          <w:ilvl w:val="0"/>
+          <w:numId w:val="6"/>
+        </w:numPr>
+      </w:pPr>
+      <w:r>
+        <w:t xml:space="preserve">Figura 9. Una década sobre un mismo dato (Capítulo 9).</w:t>
+      </w:r>
+    </w:p>
+    <w:p>
+      <w:pPr>
+        <w:pStyle w:val="BodyJ"/>
+        <w:numPr>
+          <w:ilvl w:val="0"/>
+          <w:numId w:val="6"/>
+        </w:numPr>
+      </w:pPr>
+      <w:r>
+        <w:t xml:space="preserve">Figura 10. El enfoque de umbrales de Pauker y Kassirer (Capítulo 10).</w:t>
+      </w:r>
+    </w:p>
+    <w:p>
+      <w:pPr>
+        <w:pStyle w:val="BodyJ"/>
+        <w:numPr>
+          <w:ilvl w:val="0"/>
+          <w:numId w:val="6"/>
+        </w:numPr>
+      </w:pPr>
+      <w:r>
+        <w:t xml:space="preserve">Figura 11. La línea de tiempo de Carmen y el umbral que se mueve (Capítulo 10).</w:t>
+      </w:r>
+    </w:p>
+    <w:p>
+      <w:pPr>
+        <w:pStyle w:val="BodyJ"/>
+        <w:numPr>
+          <w:ilvl w:val="0"/>
+          <w:numId w:val="6"/>
+        </w:numPr>
+      </w:pPr>
+      <w:r>
+        <w:t xml:space="preserve">Figura 12. El cálculo del Taller 10 en frecuencias naturales (Capítulo 10).</w:t>
+      </w:r>
+    </w:p>
+    <w:p>
+      <w:pPr>
+        <w:pStyle w:val="BodyJ"/>
+        <w:numPr>
+          <w:ilvl w:val="0"/>
+          <w:numId w:val="6"/>
+        </w:numPr>
+      </w:pPr>
+      <w:r>
+        <w:t xml:space="preserve">Figura 13. El viaje de una frase (Capítulo 12).</w:t>
+      </w:r>
+    </w:p>
+    <w:p>
+      <w:pPr>
+        <w:pStyle w:val="BodyJ"/>
+        <w:numPr>
+          <w:ilvl w:val="0"/>
+          <w:numId w:val="6"/>
+        </w:numPr>
+      </w:pPr>
+      <w:r>
+        <w:t xml:space="preserve">Figura 14. El método HII-D en una página (Capítulo 15).</w:t>
+      </w:r>
+    </w:p>
+    <w:p>
+      <w:pPr>
+        <w:pStyle w:val="BodyJ"/>
+        <w:numPr>
+          <w:ilvl w:val="0"/>
+          <w:numId w:val="6"/>
+        </w:numPr>
+      </w:pPr>
+      <w:r>
+        <w:t xml:space="preserve">Figura 15. Parentescos: cada riesgo de la IA clínica junto al sesgo que este libro ya había descrito (Capítulo 17).</w:t>
       </w:r>
     </w:p>
     <w:p>
@@ -19301,6 +19352,159 @@
           <w:sz w:val="34"/>
           <w:szCs w:val="34"/>
         </w:rPr>
+        <w:t xml:space="preserve">Nota metodológica y estatuto de las afirmaciones</w:t>
+      </w:r>
+    </w:p>
+    <w:p>
+      <w:pPr>
+        <w:pStyle w:val="BodyJ"/>
+      </w:pPr>
+      <w:r>
+        <w:rPr>
+          <w:b/>
+          <w:bCs/>
+        </w:rPr>
+        <w:t xml:space="preserve">Naturaleza de la obra.</w:t>
+      </w:r>
+      <w:r>
+        <w:t xml:space="preserve"> Este libro es un ensayo académico de integración científico-filosófica dirigido a profesionales clínicos. No es una revisión sistemática, ni una guía clínica, ni contiene instrumentos validados.</w:t>
+      </w:r>
+    </w:p>
+    <w:p>
+      <w:pPr>
+        <w:pStyle w:val="BodyJ"/>
+      </w:pPr>
+      <w:r>
+        <w:rPr>
+          <w:b/>
+          <w:bCs/>
+        </w:rPr>
+        <w:t xml:space="preserve">Estrategia bibliográfica.</w:t>
+      </w:r>
+      <w:r>
+        <w:t xml:space="preserve"> Las fuentes provienen de tres cuerpos: investigación biomédica y de razonamiento clínico, filosofía de la ciencia y epistemología, y educación médica. Se privilegiaron fuentes primarias y revisiones reconocidas; el período cubierto llega hasta el cierre bibliográfico, en octubre de 2026. Durante la redacción se aplicó una regla fija: ninguna referencia entró al manuscrito sin verificación previa contra su fuente — autoría, año, revista y resultado. No se pretende exhaustividad sistemática: la selección sirve al argumento y se declara como tal.</w:t>
+      </w:r>
+    </w:p>
+    <w:p>
+      <w:pPr>
+        <w:pStyle w:val="BodyJ"/>
+      </w:pPr>
+      <w:r>
+        <w:rPr>
+          <w:b/>
+          <w:bCs/>
+        </w:rPr>
+        <w:t xml:space="preserve">Estatuto de las afirmaciones.</w:t>
+      </w:r>
+      <w:r>
+        <w:t xml:space="preserve"> El lector encontrará seis clases de enunciados, y el texto procura que cada uno se presente como lo que es: resultados verificados de fuentes primarias, citados con autor y año; conclusiones de revisiones o consensos; argumentos filosóficos, atribuidos a sus autores; experiencia autoral, narrada en primera persona; ejemplos docentes construidos, señalados como tales («en ejercicios docentes suele observarse…»); y propuestas originales del libro — la densidad epistémica, la frase medular y el método HII-D —, que no deben leerse como hallazgos sino como hipótesis de trabajo.</w:t>
+      </w:r>
+    </w:p>
+    <w:p>
+      <w:pPr>
+        <w:pStyle w:val="BodyJ"/>
+      </w:pPr>
+      <w:r>
+        <w:rPr>
+          <w:b/>
+          <w:bCs/>
+        </w:rPr>
+        <w:t xml:space="preserve">Los casos.</w:t>
+      </w:r>
+      <w:r>
+        <w:t xml:space="preserve"> Las escenas clínicas de este libro — Carmen, los interludios, las viñetas y los pasajes en primera persona — son composiciones docentes en el sentido declarado en la página legal: condensan experiencias reales y situaciones compuestas, sin reproducir episodios literales ni permitir identificación de personas o instituciones.</w:t>
+      </w:r>
+    </w:p>
+    <w:p>
+      <w:pPr>
+        <w:pStyle w:val="BodyJ"/>
+      </w:pPr>
+      <w:r>
+        <w:rPr>
+          <w:b/>
+          <w:bCs/>
+        </w:rPr>
+        <w:t xml:space="preserve">Uso de inteligencia artificial.</w:t>
+      </w:r>
+      <w:r>
+        <w:t xml:space="preserve"> Este manuscrito se desarrolló a partir de ideas y formulaciones del autor, con asistencia de inteligencia artificial en búsqueda inicial, organización, comparación bibliográfica, apoyo en redacción y edición. La IA no sustituyó la verificación de fuentes, el juicio clínico, la autoría ni la responsabilidad: las tesis, las decisiones de contenido y los errores pertenecen al autor. El libro intenta aplicar a su propia escritura la disciplina que su capítulo 17 recomienda.</w:t>
+      </w:r>
+    </w:p>
+    <w:p>
+      <w:pPr>
+        <w:pStyle w:val="BodyJ"/>
+      </w:pPr>
+      <w:r>
+        <w:rPr>
+          <w:b/>
+          <w:bCs/>
+        </w:rPr>
+        <w:t xml:space="preserve">Verificación de las referencias.</w:t>
+      </w:r>
+      <w:r>
+        <w:t xml:space="preserve"> Cada referencia se cotejó contra su fuente primaria antes de citarse, y el registro de ese cotejo —cifra por cifra— acompaña a las fuentes del libro. Cuatro se verificaron sólo por metadatos o por fuentes secundarias, y el lector debe saberlo: Estrada, Isen y Young (1997), cuyo texto completo no estuvo accesible, por lo que el hallazgo se enuncia tal como lo formula el título y sin cifras; la frase de Maturana (1970), tomada de su reimpresión y de </w:t>
+      </w:r>
+      <w:r>
+        <w:rPr>
+          <w:i/>
+          <w:iCs/>
+        </w:rPr>
+        <w:t xml:space="preserve">El árbol del conocimiento</w:t>
+      </w:r>
+      <w:r>
+        <w:t xml:space="preserve">; la cita de Suzuki (1970), confirmada contra la edición y no contra una copia del prólogo; y la localización de la tesis de Clifford (1877), tomada de la </w:t>
+      </w:r>
+      <w:r>
+        <w:rPr>
+          <w:i/>
+          <w:iCs/>
+        </w:rPr>
+        <w:t xml:space="preserve">Stanford Encyclopedia of Philosophy</w:t>
+      </w:r>
+      <w:r>
+        <w:t xml:space="preserve"> y no del volumen original de la </w:t>
+      </w:r>
+      <w:r>
+        <w:rPr>
+          <w:i/>
+          <w:iCs/>
+        </w:rPr>
+        <w:t xml:space="preserve">Contemporary Review</w:t>
+      </w:r>
+      <w:r>
+        <w:t xml:space="preserve">. Ninguna de ellas sostiene por sí sola una cifra ni una conducta. La distribución de citas es plana: de las 210 citas del cuerpo, ningún autor supera el 4%, y Croskerry, Norman y Kahneman —las voces dominantes de la literatura sobre razonamiento clínico— suman el 8%. Las referencias con siete o más autores listan los seis primeros seguidos de «et al.»; los ensayos firmados por un grupo conservan el nombre del grupo.</w:t>
+      </w:r>
+    </w:p>
+    <w:p>
+      <w:pPr>
+        <w:pStyle w:val="BodyJ"/>
+      </w:pPr>
+      <w:r>
+        <w:rPr>
+          <w:b/>
+          <w:bCs/>
+        </w:rPr>
+        <w:t xml:space="preserve">HII-D.</w:t>
+      </w:r>
+      <w:r>
+        <w:t xml:space="preserve"> Es una heurística conceptual no validada. Sus compromisos de falsabilidad están en el capítulo 15 («Qué evidencia me haría abandonar este método»); su evaluación empírica — concordancia entre lectores, efecto sobre la reconstrucción del razonamiento y sobre conductas medibles, y costo en tiempo — es un programa pendiente, no un resultado.</w:t>
+      </w:r>
+    </w:p>
+    <w:p>
+      <w:pPr>
+        <w:pStyle w:val="Heading1"/>
+        <w:pageBreakBefore/>
+        <w:spacing w:after="320" w:before="720"/>
+      </w:pPr>
+      <w:r>
+        <w:rPr>
+          <w:rFonts w:ascii="Georgia" w:cs="Georgia" w:eastAsia="Georgia" w:hAnsi="Georgia"/>
+          <w:b/>
+          <w:bCs/>
+          <w:color w:val="2B2B2B"/>
+          <w:sz w:val="34"/>
+          <w:szCs w:val="34"/>
+        </w:rPr>
         <w:t xml:space="preserve">Referencias</w:t>
       </w:r>
     </w:p>
@@ -19327,17 +19531,17 @@
         <w:pStyle w:val="BodyJ"/>
       </w:pPr>
       <w:r>
-        <w:t xml:space="preserve">Abdulnour, R.-E. E., et al. (2026). Crew resource management — Navigating AI's automation paradox. </w:t>
-      </w:r>
-      <w:r>
-        <w:rPr>
-          <w:i/>
-          <w:iCs/>
-        </w:rPr>
-        <w:t xml:space="preserve">New England Journal of Medicine</w:t>
-      </w:r>
-      <w:r>
-        <w:t xml:space="preserve">. Publicado en línea el 22 de julio de 2026.</w:t>
+        <w:t xml:space="preserve">Abdulnour, R.-E. E., Akbarialiabad, H., Haghighi, A., &amp; Leachman, S. A. (2026). Crew resource management — Navigating AI's automation paradox. </w:t>
+      </w:r>
+      <w:r>
+        <w:rPr>
+          <w:i/>
+          <w:iCs/>
+        </w:rPr>
+        <w:t xml:space="preserve">New England Journal of Medicine, 395</w:t>
+      </w:r>
+      <w:r>
+        <w:t xml:space="preserve">(8), 731–734.</w:t>
       </w:r>
     </w:p>
     <w:p>
@@ -19453,7 +19657,7 @@
         <w:pStyle w:val="BodyJ"/>
       </w:pPr>
       <w:r>
-        <w:t xml:space="preserve">Biro, J., Handley, J. L., Cobb, N. K., Kottamasu, V., Collins, J., Krevat, S., &amp; Ratwani, R. M. (2025). Accuracy and safety of AI-enabled scribe technology: Instrument validation study. </w:t>
+        <w:t xml:space="preserve">Biro, J., Handley, J. L., Cobb, N. K., Kottamasu, V., Collins, J., Krevat, S.,, et al. (2025). Accuracy and safety of AI-enabled scribe technology: Instrument validation study. </w:t>
       </w:r>
       <w:r>
         <w:rPr>
@@ -19561,7 +19765,7 @@
         <w:pStyle w:val="BodyJ"/>
       </w:pPr>
       <w:r>
-        <w:t xml:space="preserve">Budzyń, K., Romańczyk, M., Kitala, D., et al. (2025). Endoscopist deskilling risk after exposure to artificial intelligence in colonoscopy: A multicentre, observational study. </w:t>
+        <w:t xml:space="preserve">Budzyń, K., Romańczyk, M., Kitala, D., Kołodziej, P., Bugajski, M., Adami, H. O., et al. (2025). Endoscopist deskilling risk after exposure to artificial intelligence in colonoscopy: A multicentre, observational study. </w:t>
       </w:r>
       <w:r>
         <w:rPr>
@@ -19723,6 +19927,24 @@
         <w:pStyle w:val="BodyJ"/>
       </w:pPr>
       <w:r>
+        <w:t xml:space="preserve">Chaudhuri, D., Nei, A. M., Rochwerg, B., Balk, R. A., Asehnoune, K., Cadena, R., et al. (2024). 2024 focused update: Guidelines on use of corticosteroids in sepsis, acute respiratory distress syndrome, and community-acquired pneumonia. </w:t>
+      </w:r>
+      <w:r>
+        <w:rPr>
+          <w:i/>
+          <w:iCs/>
+        </w:rPr>
+        <w:t xml:space="preserve">Critical Care Medicine, 52</w:t>
+      </w:r>
+      <w:r>
+        <w:t xml:space="preserve">(5), e219–e233.</w:t>
+      </w:r>
+    </w:p>
+    <w:p>
+      <w:pPr>
+        <w:pStyle w:val="BodyJ"/>
+      </w:pPr>
+      <w:r>
         <w:t xml:space="preserve">Clifford, W. K. (1877). The ethics of belief. </w:t>
       </w:r>
       <w:r>
@@ -19849,7 +20071,7 @@
         <w:pStyle w:val="BodyJ"/>
       </w:pPr>
       <w:r>
-        <w:t xml:space="preserve">Dequin, P.-F., Meziani, F., Quenot, J.-P., Kamel, T., Ricard, J.-D., Badie, J., Reignier, J., Heming, N., Plantefève, G., Souweine, B., Voiriot, G., Colin, G., Frat, J.-P., Mira, J.-P., Barbarot, N., François, B., Louis, G., Gibot, S., Guitton, C., … Le Gouge, A. (2023). Hydrocortisone in severe community-acquired pneumonia. </w:t>
+        <w:t xml:space="preserve">Dequin, P.-F., Meziani, F., Quenot, J.-P., Kamel, T., Ricard, J.-D., Badie, J., et al. (2023). Hydrocortisone in severe community-acquired pneumonia. </w:t>
       </w:r>
       <w:r>
         <w:rPr>
@@ -20299,7 +20521,7 @@
         <w:pStyle w:val="BodyJ"/>
       </w:pPr>
       <w:r>
-        <w:t xml:space="preserve">Goh, E., Gallo, R., Hom, J., et al. (2024). Large language model influence on diagnostic reasoning: A randomized clinical trial. </w:t>
+        <w:t xml:space="preserve">Goh, E., Gallo, R., Hom, J., Strong, E., Weng, Y., Kerman, H., et al. (2024). Large language model influence on diagnostic reasoning: A randomized clinical trial. </w:t>
       </w:r>
       <w:r>
         <w:rPr>
@@ -20803,7 +21025,7 @@
         <w:pStyle w:val="BodyJ"/>
       </w:pPr>
       <w:r>
-        <w:t xml:space="preserve">Krasner, M. S., Epstein, R. M., Beckman, H., Suchman, A. L., Chapman, B., Mooney, C. J., &amp; Quill, T. E. (2009). Association of an educational program in mindful communication with burnout, empathy, and attitudes among primary care physicians. </w:t>
+        <w:t xml:space="preserve">Krasner, M. S., Epstein, R. M., Beckman, H., Suchman, A. L., Chapman, B., Mooney, C. J.,, et al. (2009). Association of an educational program in mindful communication with burnout, empathy, and attitudes among primary care physicians. </w:t>
       </w:r>
       <w:r>
         <w:rPr>
@@ -20857,7 +21079,7 @@
         <w:pStyle w:val="BodyJ"/>
       </w:pPr>
       <w:r>
-        <w:t xml:space="preserve">Landrigan, C. P., Rothschild, J. M., Cronin, J. W., Kaushal, R., Burdick, E., Katz, J. T., Lilly, C. M., Stone, P. H., Lockley, S. W., Bates, D. W., &amp; Czeisler, C. A. (2004). Effect of reducing interns' work hours on serious medical errors in intensive care units. </w:t>
+        <w:t xml:space="preserve">Landrigan, C. P., Rothschild, J. M., Cronin, J. W., Kaushal, R., Burdick, E., Katz, J. T., et al. (2004). Effect of reducing interns' work hours on serious medical errors in intensive care units. </w:t>
       </w:r>
       <w:r>
         <w:rPr>
@@ -20929,7 +21151,7 @@
         <w:pStyle w:val="BodyJ"/>
       </w:pPr>
       <w:r>
-        <w:t xml:space="preserve">Linder, J. A., Doctor, J. N., Friedberg, M. W., Reyes Nieva, H., Birks, C., Meeker, D., &amp; Fox, C. R. (2014). Time of day and the decision to prescribe antibiotics. </w:t>
+        <w:t xml:space="preserve">Linder, J. A., Doctor, J. N., Friedberg, M. W., Reyes Nieva, H., Birks, C., Meeker, D.,, et al. (2014). Time of day and the decision to prescribe antibiotics. </w:t>
       </w:r>
       <w:r>
         <w:rPr>
@@ -20965,7 +21187,7 @@
         <w:pStyle w:val="BodyJ"/>
       </w:pPr>
       <w:r>
-        <w:t xml:space="preserve">Mamede, S., van Gog, T., van den Berge, K., Rikers, R. M. J. P., van Saase, J. L. C. M., van Guldener, C., &amp; Schmidt, H. G. (2010). Effect of availability bias and reflective reasoning on diagnostic accuracy among internal medicine residents. </w:t>
+        <w:t xml:space="preserve">Mamede, S., van Gog, T., van den Berge, K., Rikers, R. M. J. P., van Saase, J. L. C. M., van Guldener, C.,, et al. (2010). Effect of availability bias and reflective reasoning on diagnostic accuracy among internal medicine residents. </w:t>
       </w:r>
       <w:r>
         <w:rPr>
@@ -21101,6 +21323,24 @@
         <w:pStyle w:val="BodyJ"/>
       </w:pPr>
       <w:r>
+        <w:t xml:space="preserve">Metlay, J. P., Waterer, G. W., Long, A. C., Anzueto, A., Brozek, J., Crothers, K., et al. (2019). Diagnosis and treatment of adults with community-acquired pneumonia: An official clinical practice guideline of the American Thoracic Society and Infectious Diseases Society of America. </w:t>
+      </w:r>
+      <w:r>
+        <w:rPr>
+          <w:i/>
+          <w:iCs/>
+        </w:rPr>
+        <w:t xml:space="preserve">American Journal of Respiratory and Critical Care Medicine, 200</w:t>
+      </w:r>
+      <w:r>
+        <w:t xml:space="preserve">(7), e45–e67.</w:t>
+      </w:r>
+    </w:p>
+    <w:p>
+      <w:pPr>
+        <w:pStyle w:val="BodyJ"/>
+      </w:pPr>
+      <w:r>
         <w:t xml:space="preserve">Meyer, A. N. D., Payne, V. L., Meeks, D. W., Rao, R., &amp; Singh, H. (2013). Physicians' diagnostic accuracy, confidence, and resource requests: A vignette study. </w:t>
       </w:r>
       <w:r>
@@ -21227,7 +21467,7 @@
         <w:pStyle w:val="BodyJ"/>
       </w:pPr>
       <w:r>
-        <w:t xml:space="preserve">Nicolle, L. E., Gupta, K., Bradley, S. F., Colgan, R., DeMuri, G. P., Drekonja, D., Eckert, L. O., Geerlings, S. E., Köves, B., Hooton, T. M., Juthani-Mehta, M., Knight, S. L., Saint, S., Schaeffer, A. J., Trautner, B., Wullt, B., &amp; Siemieniuk, R. (2019). Clinical practice guideline for the management of asymptomatic bacteriuria: 2019 update by the Infectious Diseases Society of America. </w:t>
+        <w:t xml:space="preserve">Nicolle, L. E., Gupta, K., Bradley, S. F., Colgan, R., DeMuri, G. P., Drekonja, D., et al. (2019). Clinical practice guideline for the management of asymptomatic bacteriuria: 2019 update by the Infectious Diseases Society of America. </w:t>
       </w:r>
       <w:r>
         <w:rPr>
@@ -21551,7 +21791,7 @@
         <w:pStyle w:val="BodyJ"/>
       </w:pPr>
       <w:r>
-        <w:t xml:space="preserve">Riquelme, A., Méndez, B., de la Fuente, P., Padilla, O., Benaglio, C., Sirhan, M., &amp; Labarca, J. (2011). Desarrollo y validación de encuesta de percepción del portafolio en estudiantes de medicina de pregrado. </w:t>
+        <w:t xml:space="preserve">Riquelme, A., Méndez, B., de la Fuente, P., Padilla, O., Benaglio, C., Sirhan, M.,, et al. (2011). Desarrollo y validación de encuesta de percepción del portafolio en estudiantes de medicina de pregrado. </w:t>
       </w:r>
       <w:r>
         <w:rPr>
@@ -21569,7 +21809,7 @@
         <w:pStyle w:val="BodyJ"/>
       </w:pPr>
       <w:r>
-        <w:t xml:space="preserve">Rockwood, K., Song, X., MacKnight, C., Bergman, H., Hogan, D. B., McDowell, I., &amp; Mitnitski, A. (2005). A global clinical measure of fitness and frailty in elderly people. </w:t>
+        <w:t xml:space="preserve">Rockwood, K., Song, X., MacKnight, C., Bergman, H., Hogan, D. B., McDowell, I.,, et al. (2005). A global clinical measure of fitness and frailty in elderly people. </w:t>
       </w:r>
       <w:r>
         <w:rPr>
@@ -21867,7 +22107,7 @@
         <w:pStyle w:val="BodyJ"/>
       </w:pPr>
       <w:r>
-        <w:t xml:space="preserve">Tierney, A. A., Gayre, G., Hoberman, B., Mattern, B., Ballesca, M., Kipnis, P., Liu, V., &amp; Lee, K. (2024). Ambient artificial intelligence scribes to alleviate the burden of clinical documentation. </w:t>
+        <w:t xml:space="preserve">Tierney, A. A., Gayre, G., Hoberman, B., Mattern, B., Ballesca, M., Kipnis, P., et al. (2024). Ambient artificial intelligence scribes to alleviate the burden of clinical documentation. </w:t>
       </w:r>
       <w:r>
         <w:rPr>
@@ -22083,7 +22323,7 @@
         <w:pStyle w:val="BodyJ"/>
       </w:pPr>
       <w:r>
-        <w:t xml:space="preserve">Wong, A., Otles, E., Donnelly, J. P., et al. (2021). External validation of a widely implemented proprietary sepsis prediction model in hospitalized patients. </w:t>
+        <w:t xml:space="preserve">Wong, A., Otles, E., Donnelly, J. P., Krumm, A., McCullough, J., DeTroyer-Cooley, O., et al. (2021). External validation of a widely implemented proprietary sepsis prediction model in hospitalized patients. </w:t>
       </w:r>
       <w:r>
         <w:rPr>
@@ -22137,7 +22377,7 @@
         <w:pStyle w:val="BodyJ"/>
       </w:pPr>
       <w:r>
-        <w:t xml:space="preserve">Xiong, M., Hu, Z., Lu, X., Li, Y., Fu, J., He, J., &amp; Hooi, B. (2024). Can LLMs express their uncertainty? An empirical evaluation of confidence elicitation in LLMs. </w:t>
+        <w:t xml:space="preserve">Xiong, M., Hu, Z., Lu, X., Li, Y., Fu, J., He, J.,, et al. (2024). Can LLMs express their uncertainty? An empirical evaluation of confidence elicitation in LLMs. </w:t>
       </w:r>
       <w:r>
         <w:rPr>
@@ -22155,7 +22395,7 @@
         <w:pStyle w:val="BodyJ"/>
       </w:pPr>
       <w:r>
-        <w:t xml:space="preserve">Zampieri, F. G., Damiani, L. P., Bakker, J., Ospina-Tascón, G. A., Castro, R., Cavalcanti, A. B., &amp; Hernández, G. (2020). Effects of a resuscitation strategy targeting peripheral perfusion status versus serum lactate levels among patients with septic shock: A Bayesian reanalysis of the ANDROMEDA-SHOCK trial. </w:t>
+        <w:t xml:space="preserve">Zampieri, F. G., Damiani, L. P., Bakker, J., Ospina-Tascón, G. A., Castro, R., Cavalcanti, A. B.,, et al. (2020). Effects of a resuscitation strategy targeting peripheral perfusion status versus serum lactate levels among patients with septic shock: A Bayesian reanalysis of the ANDROMEDA-SHOCK trial. </w:t>
       </w:r>
       <w:r>
         <w:rPr>

</xml_diff>

<commit_message>
Entregables reconstruidos tras la pasada de coherencia y README punto 37
DOCX, PDF y EPUB regenerados desde las fuentes de 4f44908 con la cadena
documentada: 165 páginas (161 de cuerpo), TOC 40/40 estable, EPUB con 44
capítulos y 15 figuras, 160 referencias sin huérfanas, cero comillas
rectas. El README registra las seis medidas con sus conteos antes y
después y deja constancia de que el techo de 140 páginas deja de
aplicarse como regla por decisión del autor.

Co-Authored-By: Claude Fable 5.1 <noreply@anthropic.com>
Claude-Session: https://claude.ai/code/session_01SPkhDdVzUCxJwqq61ddeLW
</commit_message>
<xml_diff>
--- a/libro/Hechos_inferencias_incertidumbre_edicion_revisada.docx
+++ b/libro/Hechos_inferencias_incertidumbre_edicion_revisada.docx
@@ -1139,7 +1139,7 @@
         <w:t xml:space="preserve">Parte III</w:t>
       </w:r>
       <w:r>
-        <w:t xml:space="preserve"> amplía el foco hacia la decisión en el tiempo y con otros. La evidencia poblacional y su traducción al caso singular; los umbrales donde los valores entran al cálculo y la decisión se cruza con la bioética; la trayectoria temporal; la ficha clínica; los equipos y la comunicación de la incertidumbre. La </w:t>
+        <w:t xml:space="preserve"> amplía el foco hacia la decisión en el tiempo y con otros. La evidencia poblacional y su traducción al caso singular; las decisiones por umbral, donde el precio del error decide cuánta evidencia basta, y su cruce con la bioética; la trayectoria temporal; la ficha clínica; los equipos y la comunicación de la incertidumbre. La </w:t>
       </w:r>
       <w:r>
         <w:rPr>
@@ -1368,7 +1368,7 @@
         <w:pStyle w:val="BodyJ"/>
       </w:pPr>
       <w:r>
-        <w:t xml:space="preserve">Este libro ordena ese trabajo en cuatro capas —lo observado, lo inferido, lo incierto y lo decidido— que la Figura 2 anticipa y que la Parte I desarrolla una por una.</w:t>
+        <w:t xml:space="preserve">Ese trabajo se ordena aquí en cuatro capas —lo observado, lo inferido, lo incierto y lo decidido— que la Figura 2 anticipa y que la Parte I desarrolla una por una.</w:t>
       </w:r>
     </w:p>
     <w:tbl>
@@ -1699,15 +1699,15 @@
         <w:pStyle w:val="BodyJ"/>
       </w:pPr>
       <w:r>
-        <w:t xml:space="preserve">Antes de seguir, hay que precisar qué estatuto tiene entonces la palabra «hecho» en este libro, porque la carga teórica de la observación parece amenazar la distinción que organiza todo lo demás: si toda observación ya contiene conceptos, ¿dónde termina el hecho y empieza la inferencia? La respuesta es pragmática, no ontológica. «Hecho» es el estatus provisional que un equipo concede a una afirmación cuando acuerda no cuestionarla para la decisión en curso. «Lactato 6,0» es un hecho mientras nadie discuta el método ni la hora; deja de serlo en el instante en que la decisión dependa de si la muestra era venosa o estaba hemolizada, y entonces hay que bajar un nivel y volver a mirar. La frontera entre capas no es una línea en la naturaleza, sino una línea que el equipo traza, puede volver a trazar y debe poder mostrar dónde la trazó. Eso —y no compartimentos puros— es lo que la Figura 2 llama separación funcional y gradual.</w:t>
-      </w:r>
-    </w:p>
-    <w:p>
-      <w:pPr>
-        <w:pStyle w:val="BodyJ"/>
-      </w:pPr>
-      <w:r>
-        <w:t xml:space="preserve">Esta posición tiene un antecedente chileno que pide reconocerse con la precisión que su propio autor exigía. Maturana formuló en 1970 la frase que cualquier ficha debería llevar como advertencia: todo lo dicho es dicho por un observador (Maturana, 1970; Maturana &amp; Varela, 1984). Y propuso después distinguir dos objetividades. La «objetividad sin paréntesis» es la del que cree hablar de la realidad sin mediación y usa esa creencia como argumento para obligar al otro; la «objetividad entre paréntesis» admite que toda afirmación válida lo es dentro de un dominio de condiciones que el observador puede declarar (Maturana, 1990). El «quién lo observó, cómo y cuándo» de este capítulo y el léxico de certeza del capítulo 4 son objetividad entre paréntesis vuelta hábito de escritura. Dos aclaraciones, para que el préstamo no se convierta en coartada. El paréntesis no le quita realidad al lactato: la paciente está hipoperfundida la mida quien la mida, y donde el constructivismo de Maturana da el paso de disolver esa diferencia, este libro no lo acompaña. Y declarar al observador no vuelve relativa la observación: la vuelve auditable, que es lo contrario. La trazabilidad es el paréntesis puesto por escrito.</w:t>
+        <w:t xml:space="preserve">Antes de seguir, hay que precisar qué estatuto tiene entonces aquí la palabra «hecho», porque la carga teórica de la observación parece amenazar la distinción que organiza todo lo demás: si toda observación ya contiene conceptos, ¿dónde termina el hecho y empieza la inferencia? La respuesta es pragmática, no ontológica. «Hecho» es el estatus provisional que un equipo concede a una afirmación cuando acuerda no cuestionarla para la decisión en curso. «Lactato 6,0» es un hecho mientras nadie discuta el método ni la hora; deja de serlo en el instante en que la decisión dependa de si la muestra era venosa o estaba hemolizada, y entonces hay que bajar un nivel y volver a mirar. La frontera entre capas no es una línea en la naturaleza, sino una línea que el equipo traza, puede volver a trazar y debe poder mostrar dónde la trazó. Eso —y no compartimentos puros— es lo que la Figura 2 llama separación funcional y gradual.</w:t>
+      </w:r>
+    </w:p>
+    <w:p>
+      <w:pPr>
+        <w:pStyle w:val="BodyJ"/>
+      </w:pPr>
+      <w:r>
+        <w:t xml:space="preserve">Esta posición tiene un antecedente chileno que pide reconocerse con la precisión que su propio autor exigía. Maturana formuló en 1970 la frase que cualquier ficha debería llevar como advertencia: todo lo dicho es dicho por un observador (Maturana, 1970; Maturana &amp; Varela, 1984). Y propuso después distinguir dos objetividades. La «objetividad sin paréntesis» es la del que cree hablar de la realidad sin mediación y usa esa creencia como argumento para obligar al otro; la «objetividad entre paréntesis» admite que toda afirmación válida lo es dentro de un dominio de condiciones que el observador puede declarar (Maturana, 1990). El «quién lo observó, cómo y cuándo» y el léxico de certeza del capítulo 4 son objetividad entre paréntesis vuelta hábito de escritura. Dos aclaraciones, para que el préstamo no se convierta en coartada. El paréntesis no le quita realidad al lactato: la paciente está hipoperfundida la mida quien la mida, y donde el constructivismo de Maturana da el paso de disolver esa diferencia, aquí no se lo acompaña. Y declarar al observador no vuelve relativa la observación: la vuelve auditable, que es lo contrario. La trazabilidad es el paréntesis puesto por escrito.</w:t>
       </w:r>
     </w:p>
     <w:p>
@@ -1740,7 +1740,7 @@
         <w:pStyle w:val="BodyJ"/>
       </w:pPr>
       <w:r>
-        <w:t xml:space="preserve">La ausencia de un dato tampoco es equivalente a un hallazgo negativo. «No consignado» significa que el registro no permite saber; «no evaluado» indica que la observación no se realizó; «ausente» supone una búsqueda adecuada; «sin evidencia de» añade el límite del método. Confundir estas expresiones crea certezas retrospectivas. En seguridad diagnóstica, la distinción entre ausencia de evidencia y evidencia de ausencia es fundamental; este libro vuelve a ella cada vez que un hallazgo negativo amenace con decidir demasiado.</w:t>
+        <w:t xml:space="preserve">La ausencia de un dato tampoco es equivalente a un hallazgo negativo. «No consignado» significa que el registro no permite saber; «no evaluado» indica que la observación no se realizó; «ausente» supone una búsqueda adecuada; «sin evidencia de» añade el límite del método. Confundir estas expresiones crea certezas retrospectivas. En seguridad diagnóstica, la distinción entre ausencia de evidencia y evidencia de ausencia es fundamental; los capítulos siguientes vuelven a ella cada vez que un hallazgo negativo amenace con decidir demasiado.</w:t>
       </w:r>
     </w:p>
     <w:p>
@@ -1764,7 +1764,7 @@
         <w:pStyle w:val="BodyJ"/>
       </w:pPr>
       <w:r>
-        <w:t xml:space="preserve">El mismo grupo había advertido antes contra el uso ingenuo de la «depuración de lactato» como blanco terapéutico (Hernández, Bellomo &amp; Bakker, 2019). La hiperlactatemia que persiste no siempre es hipoperfusión que persiste —puede ser estrés adrenérgico, menor aclaramiento u otra cosa—, y perseguir el número puede inducir más reanimación de la que el paciente tolera. Es la lección de este capítulo en versión de cuidados intensivos: tratar el marcador como si fuera el mecanismo no es un refinamiento; es una inferencia disfrazada de hecho, con volumen y vasopresores de por medio.</w:t>
+        <w:t xml:space="preserve">El mismo grupo había advertido antes contra el uso ingenuo de la «depuración de lactato» como blanco terapéutico (Hernández, Bellomo &amp; Bakker, 2019). La hiperlactatemia que persiste no siempre es hipoperfusión que persiste —puede ser estrés adrenérgico, menor aclaramiento u otra cosa—, y perseguir el número puede inducir más reanimación de la que el paciente tolera. Es la misma lección en versión de cuidados intensivos: tratar el marcador como si fuera el mecanismo no es un refinamiento; es una inferencia disfrazada de hecho, con volumen y vasopresores de por medio.</w:t>
       </w:r>
     </w:p>
     <w:p>
@@ -1830,7 +1830,7 @@
         <w:pStyle w:val="BodyJ"/>
       </w:pPr>
       <w:r>
-        <w:t xml:space="preserve">Canguilhem sostuvo que la medicina no describe simplemente desviaciones estadísticas: juzga relaciones entre el organismo, sus normas y su capacidad de habitar un medio (Canguilhem, 1971). El hecho clínico adquiere relevancia dentro de esa relación. Una cifra fuera de rango puede ser irrelevante; una variación dentro del rango puede ser decisiva para ese paciente. La observación científica y la singularidad no son opuestas, pero deben articularse.</w:t>
+        <w:t xml:space="preserve">Conservar el dato bajo la interpretación no es un escrúpulo de archivista: es lo que permite auditar la interpretación después, y la filosofía de la medicina lo dijo antes que la seguridad clínica. Canguilhem sostuvo que la medicina no describe simplemente desviaciones estadísticas: juzga relaciones entre el organismo, sus normas y su capacidad de habitar un medio (Canguilhem, 1971). El hecho clínico adquiere relevancia dentro de esa relación. Una cifra fuera de rango puede ser irrelevante; una variación dentro del rango puede ser decisiva para ese paciente. La observación científica y la singularidad no son opuestas, pero deben articularse.</w:t>
       </w:r>
     </w:p>
     <w:p>
@@ -2910,7 +2910,7 @@
         <w:pStyle w:val="BodyJ"/>
       </w:pPr>
       <w:r>
-        <w:t xml:space="preserve">Una representación del problema es una formulación breve que transforma datos particulares en relaciones clínicamente significativas. Utiliza calificadores como agudo o crónico, focal o difuso, progresivo o episódico, espontáneo o provocado. Bordage destacó que estas oposiciones semánticas ayudan a activar redes diagnósticas y a comparar el caso con estructuras de conocimiento elaboradas (Bordage, 1994).</w:t>
+        <w:t xml:space="preserve">Esa organización del conocimiento tiene una unidad de trabajo visible. Una representación del problema es una formulación breve que transforma datos particulares en relaciones clínicamente significativas. Utiliza calificadores como agudo o crónico, focal o difuso, progresivo o episódico, espontáneo o provocado. Bordage destacó que estas oposiciones semánticas ayudan a activar redes diagnósticas y a comparar el caso con estructuras de conocimiento elaboradas (Bordage, 1994).</w:t>
       </w:r>
     </w:p>
     <w:p>
@@ -2992,7 +2992,7 @@
         <w:pStyle w:val="BodyJ"/>
       </w:pPr>
       <w:r>
-        <w:t xml:space="preserve">Hay una palabra que la epistemología clínica suele evitar, como si amenazara su seriedad: creatividad. Este capítulo la devuelve al centro. Peirce, al bautizar la abducción en sus lecciones de 1903, la describió como la única operación lógica que introduce ideas nuevas. La deducción prueba lo que ya estaba contenido en las premisas y la inducción generaliza lo ya observado; la hipótesis que organiza un caso, en cambio, no se extrae de los datos: se conjetura hacia ellos. Todo diagnóstico contiene, en ese sentido estricto, un momento creativo. La pregunta no es si el clínico crea; es qué tan bien lo hace.</w:t>
+        <w:t xml:space="preserve">Hay una palabra que la epistemología clínica suele evitar, como si amenazara su seriedad: creatividad. Aquí se la devuelve al centro. Peirce, al bautizar la abducción en sus lecciones de 1903, la describió como la única operación lógica que introduce ideas nuevas. La deducción prueba lo que ya estaba contenido en las premisas y la inducción generaliza lo ya observado; la hipótesis que organiza un caso, en cambio, no se extrae de los datos: se conjetura hacia ellos. Todo diagnóstico contiene, en ese sentido estricto, un momento creativo. La pregunta no es si el clínico crea; es qué tan bien lo hace.</w:t>
       </w:r>
     </w:p>
     <w:p>
@@ -3008,7 +3008,7 @@
         <w:pStyle w:val="BodyJ"/>
       </w:pPr>
       <w:r>
-        <w:t xml:space="preserve">Bohm, físico y filósofo, agregó el diagnóstico del bloqueo. La creatividad es ante todo percepción de un orden nuevo en lo que ya está a la vista, y su obstáculo habitual no es la falta de inteligencia sino el apego a la infraestructura tácita de ideas con la que se trabaja sin verla (Bohm, 1996; Bohm &amp; Peat, 1987). Es el peligro de la fluidez que examinará el capítulo 6: el patrón conocido no sólo responde rápido — también impide percibir. Por eso varias herramientas de este libro que parecen puramente disciplinarias son, además, técnicas de creatividad: reformular el caso sin usar la etiqueta (capítulo 8) es un procedimiento para forzar la percepción de otro orden posible en los mismos hechos.</w:t>
+        <w:t xml:space="preserve">Bohm, físico y filósofo, agregó el diagnóstico del bloqueo. La creatividad es ante todo percepción de un orden nuevo en lo que ya está a la vista, y su obstáculo habitual no es la falta de inteligencia sino el apego a la infraestructura tácita de ideas con la que se trabaja sin verla (Bohm, 1996; Bohm &amp; Peat, 1987). Es el peligro de la fluidez que examinará el capítulo 6: el patrón conocido no sólo responde rápido — también impide percibir. Por eso varias de las herramientas que siguen, y que parecen puramente disciplinarias, son además técnicas de creatividad: reformular el caso sin usar la etiqueta (capítulo 8) es un procedimiento para forzar la percepción de otro orden posible en los mismos hechos.</w:t>
       </w:r>
     </w:p>
     <w:p>
@@ -3467,7 +3467,7 @@
         <w:pStyle w:val="BodyJ"/>
       </w:pPr>
       <w:r>
-        <w:t xml:space="preserve">Renée Fox describió cómo la incertidumbre acompaña la socialización médica: al inicio el estudiante no sabe si su duda se debe a ignorancia personal o a límites de la disciplina; más tarde aprende que incluso los expertos habitan zonas de no saber (Fox, 1980). La cultura médica, sin embargo, puede premiar la respuesta rápida y penalizar la duda visible. El resultado es una retórica de seguridad que no siempre corresponde a la evidencia.</w:t>
+        <w:t xml:space="preserve">Nada de esto se enseña como tal; la formación médica transmite la incertidumbre de otra manera. Renée Fox describió cómo la incertidumbre acompaña la socialización médica: al inicio el estudiante no sabe si su duda se debe a ignorancia personal o a límites de la disciplina; más tarde aprende que incluso los expertos habitan zonas de no saber (Fox, 1980). La cultura médica, sin embargo, puede premiar la respuesta rápida y penalizar la duda visible. El resultado es una retórica de seguridad que no siempre corresponde a la evidencia.</w:t>
       </w:r>
     </w:p>
     <w:p>
@@ -4591,15 +4591,15 @@
         <w:pStyle w:val="BodyJ"/>
       </w:pPr>
       <w:r>
-        <w:t xml:space="preserve">Dos aportes del siglo XX describen con precisión lo que este capítulo pide. El primero es de J. L. Austin: hay enunciados que no describen el mundo sino que hacen cosas en él — prometer, sentenciar, declarar (Austin, 1962). Buena parte del lenguaje clínico es performativo en ese sentido exacto: «se decide alta», «se descarta abdomen agudo» o «paciente no reanimable» no informan un estado de cosas; dan de alta, suspenden una vigilancia, fijan un límite de tratamiento. Por eso la exigencia de este capítulo no es estilística: una frase que hace cosas debe responder por lo que hace, no sólo por lo que dice. La pregunta de Austin, trasladada a la ficha: ¿qué acaba de hacer esta oración — y con qué derecho?</w:t>
-      </w:r>
-    </w:p>
-    <w:p>
-      <w:pPr>
-        <w:pStyle w:val="BodyJ"/>
-      </w:pPr>
-      <w:r>
-        <w:t xml:space="preserve">El segundo es de Stephen Toulmin, que propuso la anatomía mínima de toda afirmación práctica: un dato, una conclusión, la garantía que autoriza pasar del uno a la otra, el respaldo de esa garantía, un calificador modal que gradúa la fuerza («probablemente», «salvo que…») y las condiciones de refutación (Toulmin, 1958). La frase medular de este libro es, sin habérselo propuesto, un argumento de Toulmin comprimido: hechos (dato), inferencia graduada (conclusión con calificador), incertidumbre crítica (refutación posible) y decisión (lo que la garantía autoriza a hacer). Escribir «bacteriemia por gramnegativos en contexto de obstrucción: foco abdominal altamente probable, salvo hallazgo alternativo en imagen» es exhibir la anatomía completa; escribir «sepsis abdominal» es esconderla. Toulmin, que décadas después defendió junto a Jonsen la casuística clínica como forma legítima de razonamiento moral (Jonsen &amp; Toulmin, 1988), habría reconocido en la ficha bien escrita a su silogismo práctico favorito. La Figura 5 despliega esa anatomía sobre una frase de Carmen.</w:t>
+        <w:t xml:space="preserve">Dos aportes del siglo XX describen con precisión lo que aquí se pide. El primero es de J. L. Austin: hay enunciados que no describen el mundo sino que hacen cosas en él — prometer, sentenciar, declarar (Austin, 1962). Buena parte del lenguaje clínico es performativo en ese sentido exacto: «se decide alta», «se descarta abdomen agudo» o «paciente no reanimable» no informan un estado de cosas; dan de alta, suspenden una vigilancia, fijan un límite de tratamiento. Por eso la exigencia no es estilística: una frase que hace cosas debe responder por lo que hace, no sólo por lo que dice. La pregunta de Austin, trasladada a la ficha: ¿qué acaba de hacer esta oración — y con qué derecho?</w:t>
+      </w:r>
+    </w:p>
+    <w:p>
+      <w:pPr>
+        <w:pStyle w:val="BodyJ"/>
+      </w:pPr>
+      <w:r>
+        <w:t xml:space="preserve">El segundo es de Stephen Toulmin, que propuso la anatomía mínima de toda afirmación práctica: un dato, una conclusión, la garantía que autoriza pasar del uno a la otra, el respaldo de esa garantía, un calificador modal que gradúa la fuerza («probablemente», «salvo que…») y las condiciones de refutación (Toulmin, 1958). La frase medular es, sin habérselo propuesto, un argumento de Toulmin comprimido: hechos (dato), inferencia graduada (conclusión con calificador), incertidumbre crítica (refutación posible) y decisión (lo que la garantía autoriza a hacer). Escribir «bacteriemia por gramnegativos en contexto de obstrucción: foco abdominal altamente probable, salvo hallazgo alternativo en imagen» es exhibir la anatomía completa; escribir «sepsis abdominal» es esconderla. Toulmin, que décadas después defendió junto a Jonsen la casuística clínica como forma legítima de razonamiento moral (Jonsen &amp; Toulmin, 1988), habría reconocido en la ficha bien escrita a su silogismo práctico favorito. La Figura 5 despliega esa anatomía sobre una frase de Carmen.</w:t>
       </w:r>
     </w:p>
     <w:tbl>
@@ -5789,7 +5789,7 @@
         <w:pStyle w:val="BodyJ"/>
       </w:pPr>
       <w:r>
-        <w:t xml:space="preserve">Aristóteles distinguió el conocimiento teórico de la prudencia práctica, o phronesis: la capacidad de deliberar bien acerca de lo que conviene hacer en situaciones particulares. La clínica comparte esta estructura. La regla general necesita ser aplicada a un caso con bienes en tensión, información incompleta y consecuencias asimétricas (Aristóteles, 1985).</w:t>
+        <w:t xml:space="preserve">Hay una palabra antigua para la integración que ni el análisis ni la intuición logran por separado. Aristóteles distinguió el conocimiento teórico de la prudencia práctica, o phronesis: la capacidad de deliberar bien acerca de lo que conviene hacer en situaciones particulares. La clínica comparte esta estructura. La regla general necesita ser aplicada a un caso con bienes en tensión, información incompleta y consecuencias asimétricas (Aristóteles, 1985).</w:t>
       </w:r>
     </w:p>
     <w:p>
@@ -5846,7 +5846,7 @@
         <w:pStyle w:val="BodyJ"/>
       </w:pPr>
       <w:r>
-        <w:t xml:space="preserve">Varela, cuya obra con Maturana el capítulo 1 ya convocó, agrega una corrección que este libro debe aceptar. En las conferencias publicadas como </w:t>
+        <w:t xml:space="preserve">Varela, cuya obra con Maturana el capítulo 1 ya convocó, agrega una corrección que hay que aceptar. En las conferencias publicadas como </w:t>
       </w:r>
       <w:r>
         <w:rPr>
@@ -5864,7 +5864,7 @@
         <w:pStyle w:val="BodyJ"/>
       </w:pPr>
       <w:r>
-        <w:t xml:space="preserve">La música ofrece la imagen más exacta de ese saber hacer, y no como metáfora. La improvisación en jazz es pericia que responde en tiempo real dentro de una estructura —la armonía, el tempo, los otros— sin deliberar nota por nota. Cuando se registró con resonancia funcional a seis pianistas profesionales improvisando, se observó una desactivación extensa de la corteza prefrontal dorsolateral, la región asociada al automonitoreo y al control consciente de la ejecución, junto con la activación de la corteza prefrontal medial (Limb &amp; Braun, 2008). El experto que improvisa apaga al supervisor. Eso es lo que Varela describe y lo que este libro no debe contradecir: la metacognición madura no es vigilancia continua, porque la vigilancia continua estropea la ejecución; es saber cuándo volver a encender al supervisor. La cirujana frente a Carmen improvisó sobre una estructura de doscientas paredes abdominales; la pausa del capítulo 8 es el momento en que el pianista deja de tocar porque escuchó una nota que no era de la pieza.</w:t>
+        <w:t xml:space="preserve">La música ofrece la imagen más exacta de ese saber hacer, y no como metáfora. La improvisación en jazz es pericia que responde en tiempo real dentro de una estructura —la armonía, el tempo, los otros— sin deliberar nota por nota. Cuando se registró con resonancia funcional a seis pianistas profesionales improvisando, se observó una desactivación extensa de la corteza prefrontal dorsolateral, la región asociada al automonitoreo y al control consciente de la ejecución, junto con la activación de la corteza prefrontal medial (Limb &amp; Braun, 2008). El experto que improvisa apaga al supervisor. Eso es lo que Varela describe y lo que no hay que contradecir: la metacognición madura no es vigilancia continua, porque la vigilancia continua estropea la ejecución; es saber cuándo volver a encender al supervisor. La cirujana frente a Carmen improvisó sobre una estructura de doscientas paredes abdominales; la pausa del capítulo 8 es el momento en que el pianista deja de tocar porque escuchó una nota que no era de la pieza.</w:t>
       </w:r>
     </w:p>
     <w:p>
@@ -6205,7 +6205,7 @@
         <w:pStyle w:val="BodyJ"/>
       </w:pPr>
       <w:r>
-        <w:t xml:space="preserve">La sobreconfianza ha sido vinculada al error diagnóstico, especialmente cuando impide buscar evidencia o revisar una conclusión (Berner &amp; Graber, 2008). Sin embargo, medirla no es trivial. La confianza puede ser apropiada en casos fáciles y excesiva en casos difíciles. Meyer y colaboradores observaron que la relación entre confianza y exactitud es imperfecta, lo que refuerza la necesidad de calibración y feedback (Meyer et al., 2013).</w:t>
+        <w:t xml:space="preserve">El prior tiene, sin embargo, una patología propia. La sobreconfianza ha sido vinculada al error diagnóstico, especialmente cuando impide buscar evidencia o revisar una conclusión (Berner &amp; Graber, 2008). Sin embargo, medirla no es trivial. La confianza puede ser apropiada en casos fáciles y excesiva en casos difíciles. Meyer y colaboradores observaron que la relación entre confianza y exactitud es imperfecta, lo que refuerza la necesidad de calibración y feedback (Meyer et al., 2013).</w:t>
       </w:r>
     </w:p>
     <w:p>
@@ -6561,7 +6561,7 @@
         <w:pStyle w:val="BodyJ"/>
       </w:pPr>
       <w:r>
-        <w:t xml:space="preserve">Hay un supuesto silencioso en todo lo anterior: que quien debe desacelerar dispone de la energía para hacerlo. Pensar cuesta. La deliberación consume recursos que el reconocimiento de patrones no gasta, y la mente obedece una ley del menor esfuerzo: cuando puede no pensar, no piensa (Kahneman, 2011). Descartar en modo automático no es una falla ocasional; es el estado por defecto, y pensar de verdad es una decisión que se toma contra él. Este libro ha hablado de disposiciones —humildad, curiosidad, lealtad al caso— como si estuvieran siempre disponibles. No lo están. Dependen de tres cosas que ningún modelo del razonamiento clínico incluye y que cualquier médico de turno conoce: cuánto durmió, cómo está de ánimo y qué otra cosa lo preocupa.</w:t>
+        <w:t xml:space="preserve">Hay un supuesto silencioso en todo lo anterior: que quien debe desacelerar dispone de la energía para hacerlo. Pensar cuesta. La deliberación consume recursos que el reconocimiento de patrones no gasta, y la mente obedece una ley del menor esfuerzo: cuando puede no pensar, no piensa (Kahneman, 2011). Descartar en modo automático no es una falla ocasional; es el estado por defecto, y pensar de verdad es una decisión que se toma contra él. Hasta aquí se ha hablado de disposiciones —humildad, curiosidad, lealtad al caso— como si estuvieran siempre disponibles. No lo están. Dependen de tres cosas que los modelos del razonamiento clínico omiten y cualquier médico de turno conoce: cuánto durmió, cómo está de ánimo y qué otra cosa lo preocupa.</w:t>
       </w:r>
     </w:p>
     <w:p>
@@ -6593,7 +6593,7 @@
         <w:pStyle w:val="BodyJ"/>
       </w:pPr>
       <w:r>
-        <w:t xml:space="preserve">Segundo, no apostar a la voluntad. Las herramientas de este libro que más valen a las cuatro de la mañana son las que no necesitan energía para activarse: el criterio de reapertura escrito cuando todavía había lucidez, la pregunta fija de la entrega de turno, la regla de ocho ítems al lado de la camilla, la versión de sesenta segundos. Son prótesis del esfuerzo: trasladan el pensamiento desde el momento en que no está disponible hacia el momento en que lo estuvo, o hacia otra persona. El diseño reemplaza al ánimo porque el ánimo no es confiable, y esa es la razón para diseñar.</w:t>
+        <w:t xml:space="preserve">Segundo, no apostar a la voluntad. Las herramientas que más valen a las cuatro de la mañana son las que no necesitan energía para activarse: el criterio de reapertura escrito cuando todavía había lucidez, la pregunta fija de la entrega de turno, la regla de ocho ítems al lado de la camilla, la versión de sesenta segundos. Son prótesis del esfuerzo: trasladan el pensamiento desde el momento en que no está disponible hacia el momento en que lo estuvo, o hacia otra persona. El diseño reemplaza al ánimo porque el ánimo no es confiable, y esa es la razón para diseñar.</w:t>
       </w:r>
     </w:p>
     <w:p>
@@ -6763,15 +6763,15 @@
         <w:pStyle w:val="BodyJ"/>
       </w:pPr>
       <w:r>
-        <w:t xml:space="preserve">Lo segundo que el Zen aporta es el «no saber» como disciplina y no como derrota: sostener la pregunta abierta sin precipitarse a cerrarla, que es el «no lo sé» del capítulo 14 y la cartografía del capítulo 3. Y lo tercero es la atención misma como práctica que se entrena. Epstein, cuyo concepto de práctica atenta este capítulo ya usó, lo trajo explícitamente de esa tradición (Epstein, 1999), y con Krasner observó en setenta médicos de atención primaria que un programa de comunicación atenta se asoció con menos agotamiento y más empatía, aunque sin grupo control (Krasner et al., 2009). El estado del que piensa, tratado páginas atrás, tiene aquí su contraparte: si el ánimo y el cansancio son hechos, la atención es una habilidad, y las habilidades se practican.</w:t>
-      </w:r>
-    </w:p>
-    <w:p>
-      <w:pPr>
-        <w:pStyle w:val="BodyJ"/>
-      </w:pPr>
-      <w:r>
-        <w:t xml:space="preserve">Dos límites, para que el préstamo no se vuelva decorado. Este libro toma del Zen una disciplina de la atención y una actitud ante el no saber, no una metafísica ni una terapéutica. Y la mente del principiante no reemplaza al </w:t>
+        <w:t xml:space="preserve">Lo segundo que el Zen aporta es el «no saber» como disciplina y no como derrota: sostener la pregunta abierta sin precipitarse a cerrarla, que es el «no lo sé» del capítulo 14 y la cartografía del capítulo 3. Y lo tercero es la atención misma como práctica que se entrena. Epstein, cuyo concepto de práctica atenta ya apareció páginas atrás, lo trajo explícitamente de esa tradición (Epstein, 1999), y con Krasner observó en setenta médicos de atención primaria que un programa de comunicación atenta se asoció con menos agotamiento y más empatía, aunque sin grupo control (Krasner et al., 2009). El estado del que piensa, tratado páginas atrás, tiene aquí su contraparte: si el ánimo y el cansancio son hechos, la atención es una habilidad, y las habilidades se practican.</w:t>
+      </w:r>
+    </w:p>
+    <w:p>
+      <w:pPr>
+        <w:pStyle w:val="BodyJ"/>
+      </w:pPr>
+      <w:r>
+        <w:t xml:space="preserve">Dos límites, para que el préstamo no se vuelva decorado. Del Zen se toma aquí una disciplina de la atención y una actitud ante el no saber, no una metafísica ni una terapéutica. Y la mente del principiante no reemplaza al </w:t>
       </w:r>
       <w:r>
         <w:rPr>
@@ -6781,7 +6781,7 @@
         <w:t xml:space="preserve">illness script</w:t>
       </w:r>
       <w:r>
-        <w:t xml:space="preserve">: el experto que mira como principiante sigue sabiendo lo que sabe; lo que suspende es la prisa con que ese saber cierra el caso. Varela, practicante budista que escribió desde esa experiencia, dijo en el capítulo 6 lo que la une con la pericia: el saber hacer responde sin deliberar, y la deliberación entra en el quiebre. La pausa de este capítulo es ese quiebre buscado a propósito: un respiro entre el patrón que se encendió y la frase que lo fija.</w:t>
+        <w:t xml:space="preserve">: el experto que mira como principiante sigue sabiendo lo que sabe; lo que suspende es la prisa con que ese saber cierra el caso. Varela, practicante budista que escribió desde esa experiencia, dijo en el capítulo 6 lo que la une con la pericia: el saber hacer responde sin deliberar, y la deliberación entra en el quiebre. La pausa diagnóstica es ese quiebre buscado a propósito: un respiro entre el patrón que se encendió y la frase que lo fija.</w:t>
       </w:r>
     </w:p>
     <w:p>
@@ -7011,7 +7011,7 @@
         <w:pStyle w:val="BodyJ"/>
       </w:pPr>
       <w:r>
-        <w:t xml:space="preserve">La historia clínica de Carmen registra qué se hizo. No registra —casi ninguna ficha lo hace— cómo se pensó. Esta es la reconstrucción.</w:t>
+        <w:t xml:space="preserve">La ficha clínica de Carmen registra qué se hizo. No registra —casi ninguna ficha lo hace— cómo se pensó. Esta es la reconstrucción.</w:t>
       </w:r>
     </w:p>
     <w:p>
@@ -7237,7 +7237,7 @@
         <w:pStyle w:val="BodyJ"/>
       </w:pPr>
       <w:r>
-        <w:t xml:space="preserve">La respuesta madura del propio grupo no fue proclamar victoria ni acatar el veredicto: fue refinar la hipótesis —fenotipos hemodinámicos, un algoritmo personalizado— y volver a someterla a una prueba más severa. Seis años después, el segundo ensayo, ahora en 86 centros de 19 países, mostró que la estrategia personalizada guiada por relleno capilar era superior al cuidado habitual (Hernández et al., 2025). La saga deja tres lecciones para este capítulo. Un ensayo no se lee solo, porque el marco inferencial es parte de la lectura. «No significativo» no significa «sin efecto», y tratarlos como sinónimos es una decisión con costos. Y la incertidumbre residual no se resuelve con retórica, sino con la siguiente pregunta bien diseñada. Hay una cuarta lección que excede la epistemología: esa ciencia de primera línea se hizo desde América Latina, coordinada desde Chile — el mismo continente clínico desde el que este libro escribe.</w:t>
+        <w:t xml:space="preserve">La respuesta madura del propio grupo no fue proclamar victoria ni acatar el veredicto: fue refinar la hipótesis —fenotipos hemodinámicos, un algoritmo personalizado— y volver a someterla a una prueba más severa. Seis años después, el segundo ensayo, ahora en 86 centros de 19 países, mostró que la estrategia personalizada guiada por relleno capilar era superior al cuidado habitual (Hernández et al., 2025). La saga deja tres lecciones. Un ensayo no se lee solo, porque el marco inferencial es parte de la lectura. «No significativo» no significa «sin efecto», y tratarlos como sinónimos es una decisión con costos. Y la incertidumbre residual no se resuelve con retórica, sino con la siguiente pregunta bien diseñada. Hay una cuarta lección que excede la epistemología: esa ciencia de primera línea se hizo desde América Latina, coordinada desde Chile — el mismo continente clínico desde el que escribo.</w:t>
       </w:r>
     </w:p>
     <w:tbl>
@@ -7320,7 +7320,7 @@
               <w:pStyle w:val="Caption"/>
             </w:pPr>
             <w:r>
-              <w:t xml:space="preserve">Figura 9. Una década sobre un mismo dato: la saga ANDROMEDA. El mismo programa de investigación atraviesa un ensayo «negativo», su relectura bayesiana y una segunda prueba más severa — la trayectoria completa que este capítulo propone como modelo de lectura de la evidencia.</w:t>
+              <w:t xml:space="preserve">Figura 9. Una década sobre un mismo dato: la saga ANDROMEDA. El mismo programa de investigación atraviesa un ensayo «negativo», su relectura bayesiana y una segunda prueba más severa — la trayectoria completa que vale como modelo de lectura de la evidencia.</w:t>
             </w:r>
           </w:p>
         </w:tc>
@@ -7803,7 +7803,7 @@
         <w:pStyle w:val="BodyJ"/>
       </w:pPr>
       <w:r>
-        <w:t xml:space="preserve">Hasta aquí, este capítulo pudo leerse como si decidir fuera un problema de dos variables: probabilidad y consecuencias. La bioética obliga a hacer explícita la pregunta que esa fórmula esconde: ¿consecuencias para quién, medidas en qué moneda? Una intervención terapéutica no actúa sobre una enfermedad; actúa sobre una persona. Y la persona, además de la enfermedad, tiene una funcionalidad previa, una trayectoria de fondo, una red que la sostiene —o no— y fines propios que nadie puede presumir desde el pasillo. Por eso el razonamiento médico y la bioética no se cruzan al final del proceso, cuando alguien convoca al comité de ética: se cruzan en la premisa, en la decisión previa de qué cuenta como hecho relevante del caso.</w:t>
+        <w:t xml:space="preserve">Hasta aquí, decidir pudo parecer un problema de dos variables: probabilidad y consecuencias. La bioética obliga a hacer explícita la pregunta que esa fórmula esconde: ¿consecuencias para quién, medidas en qué moneda? Una intervención terapéutica no actúa sobre una enfermedad; actúa sobre una persona. Y la persona, además de la enfermedad, tiene una funcionalidad previa, una trayectoria de fondo, una red que la sostiene —o no— y fines propios que nadie puede presumir desde el pasillo. Por eso el razonamiento médico y la bioética no se cruzan al final del proceso, cuando alguien convoca al comité de ética: se cruzan en la premisa, en la decisión previa de qué cuenta como hecho relevante del caso.</w:t>
       </w:r>
     </w:p>
     <w:p>
@@ -7835,15 +7835,15 @@
         <w:pStyle w:val="BodyJ"/>
       </w:pPr>
       <w:r>
-        <w:t xml:space="preserve">Dos ideas del mundo hispanohablante completan la caja. La primera es la proporcionalidad terapéutica: la obligación moral de implementar sólo aquellas medidas que guarden debida proporción entre los medios empleados y el resultado previsible (Taboada, 2000). El juicio de proporcionalidad integra pronóstico, cargas de la intervención y fines del paciente, y por eso depende por completo de la calidad epistémica que este libro viene trabajando. Un pronóstico inflado por certeza retórica no produce una decisión más esperanzadora; produce un juicio de proporcionalidad falso. La segunda es la deliberación como método (Gracia, 2001). Cuando los valores entran en conflicto, la decisión no se calcula, se delibera: identificar qué valores chocan, enumerar los cursos de acción extremos, buscar los intermedios y elegir el curso prudente que pueda defenderse en público. La deliberación es a los valores lo que el diagnóstico diferencial a las hipótesis: un método para no quedarse con la primera respuesta disponible. Los cursos extremos — «hacer todo», «no hacer nada» — casi nunca son los prudentes, y suelen ser los que se eligen cuando nadie deliberó.</w:t>
-      </w:r>
-    </w:p>
-    <w:p>
-      <w:pPr>
-        <w:pStyle w:val="BodyJ"/>
-      </w:pPr>
-      <w:r>
-        <w:t xml:space="preserve">El lector encontrará este cruce ejecutado dos veces en este libro sin la palabra «bioética». Una, en la conversación donde la cirujana recomienda operar a Carmen y le devuelve la decisión (Interludio III). Otra, en la viñeta del final de la vida, donde la incertidumbre que domina no es pronóstica sino de metas (Cuaderno de casos, viñeta 5). En ambas, lo decisivo no fue un principio abstracto: fue que la funcionalidad, la trayectoria y los fines del paciente estuvieran dentro del razonamiento desde el principio. Esa es la tesis de esta sección: la bioética no llega al final a ponerle límites a un razonamiento ya terminado — estaba en el principio, decidiendo qué se mira. Una decisión que ignoró la funcionalidad, el pronóstico de fondo y la red de apoyo no es más «objetiva» por haberse limitado a lo técnico: es más incompleta. Le faltan hechos, no sólo sensibilidad.</w:t>
+        <w:t xml:space="preserve">Dos ideas del mundo hispanohablante completan la caja. La primera es la proporcionalidad terapéutica: la obligación moral de implementar sólo aquellas medidas que guarden debida proporción entre los medios empleados y el resultado previsible (Taboada, 2000). El juicio de proporcionalidad integra pronóstico, cargas de la intervención y fines del paciente, y por eso depende por completo de la calidad epistémica de las capas anteriores. Un pronóstico inflado por certeza retórica no produce una decisión más esperanzadora; produce un juicio de proporcionalidad falso. La segunda es la deliberación como método (Gracia, 2001). Cuando los valores entran en conflicto, la decisión no se calcula, se delibera: identificar qué valores chocan, enumerar los cursos de acción extremos, buscar los intermedios y elegir el curso prudente que pueda defenderse en público. La deliberación es a los valores lo que el diagnóstico diferencial a las hipótesis: un método para no quedarse con la primera respuesta disponible. Los cursos extremos — «hacer todo», «no hacer nada» — casi nunca son los prudentes, y suelen ser los que se eligen cuando nadie deliberó.</w:t>
+      </w:r>
+    </w:p>
+    <w:p>
+      <w:pPr>
+        <w:pStyle w:val="BodyJ"/>
+      </w:pPr>
+      <w:r>
+        <w:t xml:space="preserve">Este cruce aparece ejecutado dos veces más adelante sin la palabra «bioética». Una, en la conversación donde la cirujana recomienda operar a Carmen y le devuelve la decisión (Interludio III). Otra, en la viñeta del final de la vida, donde la incertidumbre que domina no es pronóstica sino de metas (Cuaderno de casos, viñeta 5). En ambas, lo decisivo no fue un principio abstracto: fue que la funcionalidad, la trayectoria y los fines del paciente estuvieran dentro del razonamiento desde el principio. Esa es la tesis de esta sección: la bioética no llega al final a ponerle límites a un razonamiento ya terminado — estaba en el principio, decidiendo qué se mira. Una decisión que ignoró la funcionalidad, el pronóstico de fondo y la red de apoyo no es más «objetiva» por haberse limitado a lo técnico: es más incompleta. Le faltan hechos, no sólo sensibilidad.</w:t>
       </w:r>
     </w:p>
     <w:p>
@@ -8244,7 +8244,7 @@
         <w:pStyle w:val="BodyJ"/>
       </w:pPr>
       <w:r>
-        <w:t xml:space="preserve">La geografía desplaza el umbral tanto como la velocidad. En un hospital insular, a cinco horas de vuelo del escáner y del cirujano más cercanos, una mujer de 40 años consulta a las 16:00 por dolor en la fosa iliaca derecha de doce horas, con fiebre baja y leucocitosis moderada; la ecografía no logra ver el apéndice. En la ciudad, el plan sería observación activa y tomografía si el dolor localiza. En la isla no hay tomografía, el avión ambulancia tarda horas en llegar y, pasada cierta hora, no despega hasta el día siguiente. La probabilidad de apendicitis es la misma en los dos lugares; lo que cambia es el costo de esperar. El «control a las 4 horas» del taller de este capítulo se convierte en «decidir antes de que cierre la ventana de evacuación», y por eso el umbral para trasladar es más bajo que el umbral para operar. La decisión defendible se escribe con la geografía dentro: «apendicitis probable, no demostrada; se solicita evacuación aeromédica ahora, porque la ventana de traslado vence antes que la ventana de observación». Esperar la certeza que el escáner daría es, aquí, elegir el error más caro.</w:t>
+        <w:t xml:space="preserve">La geografía desplaza el umbral tanto como la velocidad. En un hospital insular, a cinco horas de vuelo del escáner y del cirujano más cercanos, una mujer de 40 años consulta a las 16:00 por dolor en la fosa iliaca derecha de doce horas, con fiebre baja y leucocitosis moderada; la ecografía no logra ver el apéndice. En la ciudad, el plan sería observación activa y tomografía si el dolor localiza. En la isla no hay tomografía, el avión ambulancia tarda horas en llegar y, pasada cierta hora, no despega hasta el día siguiente. La probabilidad de apendicitis es la misma en los dos lugares; lo que cambia es el costo de esperar. El «control a las 4 horas» del Taller 11 se convierte en «decidir antes de que cierre la ventana de evacuación», y por eso el umbral para trasladar es más bajo que el umbral para operar. La decisión defendible se escribe con la geografía dentro: «apendicitis probable, no demostrada; se solicita evacuación aeromédica ahora, porque la ventana de traslado vence antes que la ventana de observación». Esperar la certeza que el escáner daría es, aquí, elegir el error más caro.</w:t>
       </w:r>
     </w:p>
     <w:p>
@@ -8269,7 +8269,7 @@
         <w:pStyle w:val="BodyJ"/>
       </w:pPr>
       <w:r>
-        <w:t xml:space="preserve">Las afirmaciones causales contienen una comparación implícita: qué habría ocurrido sin la exposición, sin la enfermedad o sin la intervención. Ese escenario contrafactual no puede observarse simultáneamente en el mismo paciente. La inferencia causal utiliza comparadores, mecanismos, secuencia y diseños de estudio para aproximarse a él (Hernán &amp; Robins, 2020; Pearl &amp; Mackenzie, 2018). En clínica, los contrafactuales también sirven como disciplina mental: «si esta hipótesis fuera falsa, ¿qué patrón alternativo esperaría?»; «si no intervengo hoy, ¿qué desenlace evitable se vuelve plausible?»; «si operamos y el mecanismo supuesto no existe, ¿qué daño habremos causado?».</w:t>
+        <w:t xml:space="preserve">Decidir antes de la certeza obliga a razonar sobre lo que habría pasado sin la decisión, y ahí entra la causalidad. Las afirmaciones causales contienen una comparación implícita: qué habría ocurrido sin la exposición, sin la enfermedad o sin la intervención. Ese escenario contrafactual no puede observarse simultáneamente en el mismo paciente. La inferencia causal utiliza comparadores, mecanismos, secuencia y diseños de estudio para aproximarse a él (Hernán &amp; Robins, 2020; Pearl &amp; Mackenzie, 2018). En clínica, los contrafactuales también sirven como disciplina mental: «si esta hipótesis fuera falsa, ¿qué patrón alternativo esperaría?»; «si no intervengo hoy, ¿qué desenlace evitable se vuelve plausible?»; «si operamos y el mecanismo supuesto no existe, ¿qué daño habremos causado?».</w:t>
       </w:r>
     </w:p>
     <w:p>
@@ -8302,7 +8302,7 @@
         <w:pStyle w:val="BodyJ"/>
       </w:pPr>
       <w:r>
-        <w:t xml:space="preserve">Algunas evoluciones cambian cualitativamente el caso. Una recurrencia menor puede convertirse en un episodio con shock; una enfermedad estable puede adquirir disfunción orgánica; una respuesta inicial puede dar paso a deterioro. El punto de inflexión no es sólo otro dato: redefine el riesgo de estrategias futuras. La frase clínica medular debe hacerlo visible.</w:t>
+        <w:t xml:space="preserve">Algunas evoluciones cambian cualitativamente el caso. Una recurrencia menor puede convertirse en un episodio con shock; una enfermedad estable puede adquirir disfunción orgánica; una respuesta inicial puede dar paso a deterioro. El punto de inflexión no es sólo otro dato: redefine el riesgo de estrategias futuras. La frase medular debe hacerlo visible.</w:t>
       </w:r>
     </w:p>
     <w:p>
@@ -8373,7 +8373,7 @@
         <w:pStyle w:val="BodyJ"/>
       </w:pPr>
       <w:r>
-        <w:t xml:space="preserve">Esta estructura explicita los cuatro pilares que validan al tiempo como prueba diagnóstica. Qué se busca evaluar: la trayectoria del dolor y la tolerancia oral. En qué ventana: 4 a 8 horas. Qué variables gatillan acción, con plazos y responsables definidos. Y cuáles son los umbrales de salida en ambas direcciones: escalar el estudio o dar el alta. Compárese con la anotación habitual «control según evolución», una fórmula vacía que delega en el azar lo que debía quedar gobernado por el diseño del plan.</w:t>
+        <w:t xml:space="preserve">Esta estructura explicita los cuatro pilares que validan al tiempo como prueba diagnóstica. Qué se busca evaluar: la trayectoria del dolor y la tolerancia oral. En qué ventana: 4 a 8 horas. Qué variables gatillan acción, con plazos y responsables definidos. Y cuáles son las salidas en ambas direcciones: escalar el estudio o dar el alta. Compárese con la anotación habitual «control según evolución», una fórmula vacía que delega en el azar lo que debía quedar gobernado por el diseño del plan.</w:t>
       </w:r>
     </w:p>
     <w:p>
@@ -8533,7 +8533,7 @@
         <w:pStyle w:val="BodyJ"/>
       </w:pPr>
       <w:r>
-        <w:t xml:space="preserve">Foucault sostuvo que la clínica moderna no nació simplemente de mirar mejor, sino de reorganizar qué era decible y registrable. El hospital, la autopsia y el registro crearon un espacio donde ciertos fenómenos pudieron convertirse en signos y otros ni siquiera podían formularse (Foucault, 1966). La ficha contemporánea hace hoy ese mismo trabajo, silenciosamente. Sus campos deciden qué existe institucionalmente: si la plantilla tiene casilla para «dolor EVA» pero no hay lugar para «esta vez el dolor era otro», la primera afirmación sobrevivirá en el registro y la segunda morirá en el pasillo. Lo que no cabe en el formulario no se pierde por descuido; se pierde por diseño.</w:t>
+        <w:t xml:space="preserve">La trazabilidad tiene una consecuencia menos evidente: el formato del registro decide qué puede llegar a ser un hecho. Foucault sostuvo que la clínica moderna no nació simplemente de mirar mejor, sino de reorganizar qué era decible y registrable. El hospital, la autopsia y el registro crearon un espacio donde ciertos fenómenos pudieron convertirse en signos y otros ni siquiera podían formularse (Foucault, 1966). La ficha contemporánea hace hoy ese mismo trabajo, silenciosamente. Sus campos deciden qué existe institucionalmente: si la plantilla tiene casilla para «dolor EVA» pero no hay lugar para «esta vez el dolor era otro», la primera afirmación sobrevivirá en el registro y la segunda morirá en el pasillo. Lo que no cabe en el formulario no se pierde por descuido; se pierde por diseño.</w:t>
       </w:r>
     </w:p>
     <w:p>
@@ -8774,7 +8774,7 @@
         <w:t xml:space="preserve">D — Decisión</w:t>
       </w:r>
       <w:r>
-        <w:t xml:space="preserve">: conducta, razón, umbral y criterio de reevaluación.</w:t>
+        <w:t xml:space="preserve">: conducta, razón, umbral y criterio de reapertura.</w:t>
       </w:r>
     </w:p>
     <w:p>
@@ -8948,7 +8948,7 @@
         <w:pStyle w:val="BodyJ"/>
       </w:pPr>
       <w:r>
-        <w:t xml:space="preserve">Dos de esas líneas cargan evidencia que debe nombrarse. El «no» a los corticoides se apoya en que su beneficio en mortalidad se demostró en neumonía grave tratada en cuidados intensivos, no en sala: 6,2% con hidrocortisona frente a 11,9% con placebo a los 28 días (Dequin et al., 2023). La nota lo dice con una palabra: «sin criterios de gravedad». Y las guías no coinciden: la de la ATS y la IDSA de 2019 recomendó no usar corticoides de rutina, con fuerza en la neumonía no grave y con reservas en la grave, mientras que la actualización de 2024 de la Society of Critical Care Medicine, ya con ese ensayo sobre la mesa, los recomienda en la neumonía bacteriana grave hospitalizada (Metlay et al., 2019; Chaudhuri et al., 2024). La ficha de proceso no zanja el desacuerdo; deja escrito con qué umbral de gravedad lo resolvió. Y el «sin indicación de anaerobios» es un descarte con método, el de la anamnesis que no encontró aspiración, y por eso puede revisarse si la anamnesis cambia. La nota de proceso es apenas más larga que «Neumonía. Ceftriaxona» si se cuentan las líneas que una evolución típica dedica a repetir lo de ayer, y es otra cosa: cualquiera que la lea mañana sabe qué se pensó, qué quedó abierto y qué desmentiría el plan. El riesgo que este capítulo ya advirtió —la nota que crece sin pensar— no se corre aquí: la ficha de proceso no escribe más; escribe lo que hoy no se escribe nunca.</w:t>
+        <w:t xml:space="preserve">Dos de esas líneas cargan evidencia que debe nombrarse. El «no» a los corticoides se apoya en que su beneficio en mortalidad se demostró en neumonía grave tratada en cuidados intensivos, no en sala: 6,2% con hidrocortisona frente a 11,9% con placebo a los 28 días (Dequin et al., 2023). La nota lo dice con una palabra: «sin criterios de gravedad». Y las guías no coinciden: la de la ATS y la IDSA de 2019 recomendó no usar corticoides de rutina, con fuerza en la neumonía no grave y con reservas en la grave, mientras que la actualización de 2024 de la Society of Critical Care Medicine, ya con ese ensayo sobre la mesa, los recomienda en la neumonía bacteriana grave hospitalizada (Metlay et al., 2019; Chaudhuri et al., 2024). La ficha de proceso no zanja el desacuerdo; deja escrito con qué umbral de gravedad lo resolvió. Y el «sin indicación de anaerobios» es un descarte con método, el de la anamnesis que no encontró aspiración, y por eso puede revisarse si la anamnesis cambia. La nota de proceso es apenas más larga que «Neumonía. Ceftriaxona» si se cuentan las líneas que una evolución típica dedica a repetir lo de ayer, y es otra cosa: cualquiera que la lea mañana sabe qué se pensó, qué quedó abierto y qué desmentiría el plan. El riesgo ya advertido —la nota que crece sin pensar— no se corre aquí: la ficha de proceso no escribe más; escribe lo que hoy no se escribe nunca.</w:t>
       </w:r>
     </w:p>
     <w:p>
@@ -9127,7 +9127,7 @@
         <w:t xml:space="preserve">Solución comentada.</w:t>
       </w:r>
       <w:r>
-        <w:t xml:space="preserve"> No hay solución única. El ejercicio suele mostrar tres cosas. La mitad de las preguntas escondidas nunca se formularon: nadie dudó de nada porque nadie preguntó. «Descarté» casi nunca viene con método. Y «comprobaré» es el verbo que más cuesta conjugar, porque obliga a predecir y a ponerle fecha a la predicción. Si la ficha de proceso no cabe en ocho líneas, está describiendo y no decidiendo: no es la historia clínica completa, es el esqueleto de las decisiones. Y si cabe en dos, probablemente faltan verbos: una nota sin «dudé» ni «comprobaré» es una ficha de resultados con otro formato.</w:t>
+        <w:t xml:space="preserve"> No hay solución única. El ejercicio suele mostrar tres cosas. La mitad de las preguntas escondidas nunca se formularon: nadie dudó de nada porque nadie preguntó. «Descarté» casi nunca viene con método. Y «comprobaré» es el verbo que más cuesta conjugar, porque obliga a predecir y a ponerle fecha a la predicción. Si la ficha de proceso no cabe en ocho líneas, está describiendo y no decidiendo: no es la ficha clínica completa, es el esqueleto de las decisiones. Y si cabe en dos, probablemente faltan verbos: una nota sin «dudé» ni «comprobaré» es una ficha de resultados con otro formato.</w:t>
       </w:r>
     </w:p>
     <w:p>
@@ -9410,7 +9410,7 @@
         <w:pStyle w:val="BodyJ"/>
       </w:pPr>
       <w:r>
-        <w:t xml:space="preserve">Muchos clínicos temen que expresar incertidumbre debilite la confianza del paciente o del equipo. El resultado puede ser un lenguaje excesivamente categórico. El dilema es falso: la alternativa a la certeza no es la desorientación, sino una explicación estructurada de lo que se sabe, lo que se sospecha, lo que importa y qué se hará.</w:t>
+        <w:t xml:space="preserve">Queda la conversación más difícil del equipo, que es con quien no pertenece a él: el paciente. Muchos clínicos temen que expresar incertidumbre debilite la confianza del paciente o del equipo. El resultado puede ser un lenguaje excesivamente categórico. El dilema es falso: la alternativa a la certeza no es la desorientación, sino una explicación estructurada de lo que se sabe, lo que se sospecha, lo que importa y qué se hará.</w:t>
       </w:r>
     </w:p>
     <w:p>
@@ -10041,15 +10041,15 @@
         <w:pStyle w:val="BodyJ"/>
       </w:pPr>
       <w:r>
-        <w:t xml:space="preserve">Vista así, la humildad no es una virtud separada de la phronesis que este libro viene invocando desde el capítulo 6: es su condición de funcionamiento. La prudencia práctica integra, en el caso particular, lo que ningún algoritmo integra por el clínico — conocimiento causal, emoción leída como dato, valores del paciente y oportunidad: el momento de actuar ahora o esperar. Esa integración sólo permanece honesta si alguien vigila sus límites, y la humildad es eso: la phronesis vuelta sobre sí misma, la parte de la prudencia que sabe cuánta de la propia prudencia es conjetura. Con ella queda a la vista el hilo que el libro venía tendiendo. El capítulo 2 mostró la abducción, la conjetura que crea explicaciones; el capítulo 5, la metacognición que la vigila mientras trabaja; la humildad es la disposición que la mantiene abierta cuando ya produjo una respuesta cómoda. Generar, vigilar, mantener abierto: tres nombres de una misma lealtad al caso. Y queda la corrección de Varela que el capítulo 6 aceptó: esa lealtad no es vigilancia continua —el experto responde sin deliberar, y deliberar sin motivo lo degrada—, sino la disposición a reconocer el quiebre, el momento en que el saber hacer dejó de bastar.</w:t>
-      </w:r>
-    </w:p>
-    <w:p>
-      <w:pPr>
-        <w:pStyle w:val="BodyJ"/>
-      </w:pPr>
-      <w:r>
-        <w:t xml:space="preserve">Por eso este libro necesita la humildad no como ornamento ético sino como pieza estructural. La reevaluación del método HII-D es humildad convertida en procedimiento: la cláusula «qué me haría cambiar», escrita antes de saber si habrá que cambiar, es la forma que toma esta virtud cuando se la obliga a dejar huella en la ficha.</w:t>
+        <w:t xml:space="preserve">Vista así, la humildad no es una virtud separada de la phronesis invocada desde el capítulo 6: es su condición de funcionamiento. La prudencia práctica integra, en el caso particular, lo que ningún algoritmo integra por el clínico — conocimiento causal, emoción leída como dato, valores del paciente y oportunidad: el momento de actuar ahora o esperar. Esa integración sólo permanece honesta si alguien vigila sus límites, y la humildad es eso: la phronesis vuelta sobre sí misma, la parte de la prudencia que sabe cuánta de la propia prudencia es conjetura. Con ella queda a la vista el hilo que el libro venía tendiendo. El capítulo 2 mostró la abducción, la conjetura que crea explicaciones; el capítulo 5, la metacognición que la vigila mientras trabaja; la humildad es la disposición que la mantiene abierta cuando ya produjo una respuesta cómoda. Generar, vigilar, mantener abierto: tres nombres de una misma lealtad al caso. Y queda la corrección de Varela que el capítulo 6 aceptó: esa lealtad no es vigilancia continua —el experto responde sin deliberar, y deliberar sin motivo lo degrada—, sino la disposición a reconocer el quiebre, el momento en que el saber hacer dejó de bastar.</w:t>
+      </w:r>
+    </w:p>
+    <w:p>
+      <w:pPr>
+        <w:pStyle w:val="BodyJ"/>
+      </w:pPr>
+      <w:r>
+        <w:t xml:space="preserve">Por eso la humildad entra aquí no como ornamento ético sino como pieza estructural. La reevaluación del método HII-D es humildad convertida en procedimiento: la cláusula «qué me haría cambiar», escrita antes de saber si habrá que cambiar, es la forma que toma esta virtud cuando se la obliga a dejar huella en la ficha.</w:t>
       </w:r>
     </w:p>
     <w:p>
@@ -10074,7 +10074,7 @@
         <w:pStyle w:val="BodyJ"/>
       </w:pPr>
       <w:r>
-        <w:t xml:space="preserve">Miranda Fricker denominó injusticia epistémica al daño cometido contra alguien en su capacidad de sujeto de conocimiento (Fricker, 2007). En salud, Carel y Kidd describieron cómo el testimonio de pacientes puede recibir menor credibilidad o carecer de categorías interpretativas adecuadas, y cómo la propia experiencia de enfermar agudiza esa vulnerabilidad epistémica (Carel &amp; Kidd, 2014; Kidd &amp; Carel, 2017). El enfermo posee un conocimiento de primera persona sobre dolor, cambio funcional, tolerancia, valores y trayectoria cotidiana que no puede ser sustituido por mediciones externas. Ese conocimiento tampoco es infalible, pero exige evaluación y no descarte reflejo.</w:t>
+        <w:t xml:space="preserve">La humildad tiene también una dirección hacia afuera: cómo se recibe lo que otro sabe. Miranda Fricker denominó injusticia epistémica al daño cometido contra alguien en su capacidad de sujeto de conocimiento (Fricker, 2007). En salud, Carel y Kidd describieron cómo el testimonio de pacientes puede recibir menor credibilidad o carecer de categorías interpretativas adecuadas, y cómo la propia experiencia de enfermar agudiza esa vulnerabilidad epistémica (Carel &amp; Kidd, 2014; Kidd &amp; Carel, 2017). El enfermo posee un conocimiento de primera persona sobre dolor, cambio funcional, tolerancia, valores y trayectoria cotidiana que no puede ser sustituido por mediciones externas. Ese conocimiento tampoco es infalible, pero exige evaluación y no descarte reflejo.</w:t>
       </w:r>
     </w:p>
     <w:p>
@@ -10197,7 +10197,7 @@
         <w:pStyle w:val="BodyJ"/>
       </w:pPr>
       <w:r>
-        <w:t xml:space="preserve">La relación clínica es asimétrica: el profesional posee conocimientos, acceso institucional y capacidad de activar intervenciones que el paciente no controla. Esa asimetría hace necesaria la recomendación experta, pero también exige que la autoridad sea explicable. «Yo haría esto» tiene valor cuando resume razones; se vuelve problemática cuando sustituye su examen.</w:t>
+        <w:t xml:space="preserve">Cuidar al que erró no suspende la asimetría de la relación clínica; la vuelve más exigente. La relación clínica es asimétrica: el profesional posee conocimientos, acceso institucional y capacidad de activar intervenciones que el paciente no controla. Esa asimetría hace necesaria la recomendación experta, pero también exige que la autoridad sea explicable. «Yo haría esto» tiene valor cuando resume razones; se vuelve problemática cuando sustituye su examen.</w:t>
       </w:r>
     </w:p>
     <w:p>
@@ -11450,7 +11450,7 @@
         <w:pStyle w:val="BodyJ"/>
       </w:pPr>
       <w:r>
-        <w:t xml:space="preserve">La misma información adquiere distinta relevancia según la pregunta. Definirla evita estudiar todo sin jerarquía.</w:t>
+        <w:t xml:space="preserve">La misma información adquiere distinta relevancia según la pregunta. Definirla evita estudiar todo sin jerarquía. Para Carmen, al tercer día, la pregunta no era «¿qué tiene?» sino «¿qué pasa si vuelve a ocurrir?», y de esa pregunta dependía si la hernia se opera o se sigue esperando.</w:t>
       </w:r>
     </w:p>
     <w:p>
@@ -11483,7 +11483,7 @@
         <w:pStyle w:val="BodyJ"/>
       </w:pPr>
       <w:r>
-        <w:t xml:space="preserve">Una técnica útil es escribir primero sin diagnósticos: edad y contexto; temporalidad; fisiología; examen; microbiología; imagen; respuesta; antecedentes que modifican prior. Esta suspensión breve impide que la etiqueta ordene retroactivamente los datos.</w:t>
+        <w:t xml:space="preserve">Una técnica útil es escribir primero sin diagnósticos: edad y contexto; temporalidad; fisiología; examen; microbiología; imagen; respuesta; antecedentes que modifican prior. Esta suspensión breve impide que la etiqueta ordene retroactivamente los datos. Los hechos decisivos de Carmen caben en una línea cada uno, con su fuente: cuarto episodio en doce meses; lactato de 6,0 mmol/L a las 04:15; llene capilar de cinco segundos medido por Marcela; hemocultivos positivos a las 14 horas; tomografía sin isquemia; y la frase textual «esta vez la hernia no se dejó acomodar».</w:t>
       </w:r>
     </w:p>
     <w:p>
@@ -11516,7 +11516,7 @@
         <w:pStyle w:val="BodyJ"/>
       </w:pPr>
       <w:r>
-        <w:t xml:space="preserve">Una inferencia clínica útil explica por qué los hechos se agrupan y qué predice. Si no cambia comprensión, conducta o vigilancia, quizá sea sólo un nombre.</w:t>
+        <w:t xml:space="preserve">Una inferencia clínica útil explica por qué los hechos se agrupan y qué predice. Si no cambia comprensión, conducta o vigilancia, quizá sea sólo un nombre. En Carmen, tres inferencias con tres grados: obstrucción mecánica, demostrada; sepsis de foco abdominal, altamente probable; isquemia parietal transitoria, posible. Una nota apurada las habría escrito con el mismo verbo.</w:t>
       </w:r>
     </w:p>
     <w:p>
@@ -11549,7 +11549,7 @@
         <w:pStyle w:val="BodyJ"/>
       </w:pPr>
       <w:r>
-        <w:t xml:space="preserve">Aquí se reconoce la diferencia entre «no sé la etiología exacta» y «no sé si existe una amenaza inmediata». La segunda suele dominar la acción.</w:t>
+        <w:t xml:space="preserve">Aquí se reconoce la diferencia entre «no sé la etiología exacta» y «no sé si existe una amenaza inmediata». La segunda suele dominar la acción. La incertidumbre peligrosa de Carmen no era etiológica sino pronóstica: cuándo volverá a obstruirse y con qué gravedad. Ningún examen la reduce; la trayectoria la desplazó.</w:t>
       </w:r>
     </w:p>
     <w:p>
@@ -11582,7 +11582,107 @@
         <w:pStyle w:val="BodyJ"/>
       </w:pPr>
       <w:r>
-        <w:t xml:space="preserve">Toda decisión incluye un plan de reapertura: criterio clínico, examen pendiente, plazo o evento. Sin él, HII-D queda incompleto.</w:t>
+        <w:t xml:space="preserve">Toda decisión incluye un plan de reapertura: criterio clínico, examen pendiente, plazo o evento. Sin él, HII-D queda incompleto. Así quedó escrita la de Carmen: reparación electiva tras la recuperación, porque el costo esperado de un quinto episodio fuera del hospital supera el riesgo de una cirugía programada; reevaluar si aparece dolor desproporcionado, fiebre o íleo antes de pabellón; responsable, el equipo tratante. La plantilla condensada que recoge estas ocho líneas está en el Apéndice A, y el Interludio I es su primera versión completa.</w:t>
+      </w:r>
+    </w:p>
+    <w:p>
+      <w:pPr>
+        <w:pStyle w:val="TallerHead"/>
+      </w:pPr>
+      <w:r>
+        <w:t xml:space="preserve">Caja de herramientas. HII-D en sesenta segundos</w:t>
+      </w:r>
+    </w:p>
+    <w:p>
+      <w:pPr>
+        <w:pStyle w:val="BodyJ"/>
+      </w:pPr>
+      <w:r>
+        <w:t xml:space="preserve">La versión completa es para casos difíciles. Para el resto —el ingreso número doce de la noche, la reevaluación entre dos urgencias— existe una versión mínima de cuatro preguntas, pensada para decirse mentalmente en el pasillo:</w:t>
+      </w:r>
+    </w:p>
+    <w:p>
+      <w:pPr>
+        <w:pStyle w:val="BodyJ"/>
+        <w:numPr>
+          <w:ilvl w:val="0"/>
+          <w:numId w:val="22"/>
+        </w:numPr>
+      </w:pPr>
+      <w:r>
+        <w:rPr>
+          <w:b/>
+          <w:bCs/>
+        </w:rPr>
+        <w:t xml:space="preserve">¿Qué vi y qué me contaron?</w:t>
+      </w:r>
+      <w:r>
+        <w:t xml:space="preserve"> (un hecho decisivo, con su fuente)</w:t>
+      </w:r>
+    </w:p>
+    <w:p>
+      <w:pPr>
+        <w:pStyle w:val="BodyJ"/>
+        <w:numPr>
+          <w:ilvl w:val="0"/>
+          <w:numId w:val="22"/>
+        </w:numPr>
+      </w:pPr>
+      <w:r>
+        <w:rPr>
+          <w:b/>
+          <w:bCs/>
+        </w:rPr>
+        <w:t xml:space="preserve">¿Qué creo y cuánto derecho tengo a creerlo?</w:t>
+      </w:r>
+      <w:r>
+        <w:t xml:space="preserve"> (la inferencia principal, con su grado)</w:t>
+      </w:r>
+    </w:p>
+    <w:p>
+      <w:pPr>
+        <w:pStyle w:val="BodyJ"/>
+        <w:numPr>
+          <w:ilvl w:val="0"/>
+          <w:numId w:val="22"/>
+        </w:numPr>
+      </w:pPr>
+      <w:r>
+        <w:rPr>
+          <w:b/>
+          <w:bCs/>
+        </w:rPr>
+        <w:t xml:space="preserve">¿Qué daño importante podría producir si estoy equivocado?</w:t>
+      </w:r>
+      <w:r>
+        <w:t xml:space="preserve"> (la incertidumbre peligrosa, no todas)</w:t>
+      </w:r>
+    </w:p>
+    <w:p>
+      <w:pPr>
+        <w:pStyle w:val="BodyJ"/>
+        <w:numPr>
+          <w:ilvl w:val="0"/>
+          <w:numId w:val="22"/>
+        </w:numPr>
+      </w:pPr>
+      <w:r>
+        <w:rPr>
+          <w:b/>
+          <w:bCs/>
+        </w:rPr>
+        <w:t xml:space="preserve">¿Qué hago, y qué me haría cambiar antes del próximo control?</w:t>
+      </w:r>
+      <w:r>
+        <w:t xml:space="preserve"> (decisión con criterio de reapertura)</w:t>
+      </w:r>
+    </w:p>
+    <w:p>
+      <w:pPr>
+        <w:pStyle w:val="BodyJ"/>
+      </w:pPr>
+      <w:r>
+        <w:t xml:space="preserve">Sesenta segundos no producen una epistemología; producen algo más modesto y a veces suficiente: impiden que la frase «cuadro habitual, manejo habitual» se escriba sola. Si alguna de las cuatro respuestas incomoda —el hecho decisivo resulta heredado, la confianza no tiene fuente, la incertidumbre peligrosa no tiene vigilancia—, esa incomodidad es la indicación para la versión completa.</w:t>
       </w:r>
     </w:p>
     <w:p>
@@ -11599,203 +11699,23 @@
           <w:sz w:val="25"/>
           <w:szCs w:val="25"/>
         </w:rPr>
-        <w:t xml:space="preserve">Plantilla condensada</w:t>
-      </w:r>
-    </w:p>
-    <w:p>
-      <w:pPr>
-        <w:pStyle w:val="BodyJ"/>
-        <w:numPr>
-          <w:ilvl w:val="0"/>
-          <w:numId w:val="6"/>
-        </w:numPr>
-      </w:pPr>
-      <w:r>
-        <w:t xml:space="preserve">Pregunta operativa:</w:t>
-      </w:r>
-    </w:p>
-    <w:p>
-      <w:pPr>
-        <w:pStyle w:val="BodyJ"/>
-        <w:numPr>
-          <w:ilvl w:val="0"/>
-          <w:numId w:val="6"/>
-        </w:numPr>
-      </w:pPr>
-      <w:r>
-        <w:t xml:space="preserve">Hechos decisivos:</w:t>
-      </w:r>
-    </w:p>
-    <w:p>
-      <w:pPr>
-        <w:pStyle w:val="BodyJ"/>
-        <w:numPr>
-          <w:ilvl w:val="0"/>
-          <w:numId w:val="6"/>
-        </w:numPr>
-      </w:pPr>
-      <w:r>
-        <w:t xml:space="preserve">Inferencia principal y grado:</w:t>
-      </w:r>
-    </w:p>
-    <w:p>
-      <w:pPr>
-        <w:pStyle w:val="BodyJ"/>
-        <w:numPr>
-          <w:ilvl w:val="0"/>
-          <w:numId w:val="6"/>
-        </w:numPr>
-      </w:pPr>
-      <w:r>
-        <w:t xml:space="preserve">Alternativa que cambiaría conducta:</w:t>
-      </w:r>
-    </w:p>
-    <w:p>
-      <w:pPr>
-        <w:pStyle w:val="BodyJ"/>
-        <w:numPr>
-          <w:ilvl w:val="0"/>
-          <w:numId w:val="6"/>
-        </w:numPr>
-      </w:pPr>
-      <w:r>
-        <w:t xml:space="preserve">Incertidumbre crítica:</w:t>
-      </w:r>
-    </w:p>
-    <w:p>
-      <w:pPr>
-        <w:pStyle w:val="BodyJ"/>
-        <w:numPr>
-          <w:ilvl w:val="0"/>
-          <w:numId w:val="6"/>
-        </w:numPr>
-      </w:pPr>
-      <w:r>
-        <w:t xml:space="preserve">Contexto global (funcionalidad, pronóstico de fondo, red de apoyo):</w:t>
-      </w:r>
-    </w:p>
-    <w:p>
-      <w:pPr>
-        <w:pStyle w:val="BodyJ"/>
-        <w:numPr>
-          <w:ilvl w:val="0"/>
-          <w:numId w:val="6"/>
-        </w:numPr>
-      </w:pPr>
-      <w:r>
-        <w:t xml:space="preserve">Decisión y razón:</w:t>
-      </w:r>
-    </w:p>
-    <w:p>
-      <w:pPr>
-        <w:pStyle w:val="BodyJ"/>
-        <w:numPr>
-          <w:ilvl w:val="0"/>
-          <w:numId w:val="6"/>
-        </w:numPr>
-      </w:pPr>
-      <w:r>
-        <w:t xml:space="preserve">Criterio de reevaluación:</w:t>
-      </w:r>
-    </w:p>
-    <w:p>
-      <w:pPr>
-        <w:pStyle w:val="TallerHead"/>
-      </w:pPr>
-      <w:r>
-        <w:t xml:space="preserve">Caja de herramientas. HII-D en 60 segundos</w:t>
-      </w:r>
-    </w:p>
-    <w:p>
-      <w:pPr>
-        <w:pStyle w:val="BodyJ"/>
-      </w:pPr>
-      <w:r>
-        <w:t xml:space="preserve">La versión completa es para casos difíciles. Para el resto —el ingreso número doce de la noche, la reevaluación entre dos urgencias— existe una versión mínima de cuatro preguntas, pensada para decirse mentalmente en el pasillo:</w:t>
-      </w:r>
-    </w:p>
-    <w:p>
-      <w:pPr>
-        <w:pStyle w:val="BodyJ"/>
-        <w:numPr>
-          <w:ilvl w:val="0"/>
-          <w:numId w:val="22"/>
-        </w:numPr>
-      </w:pPr>
-      <w:r>
-        <w:rPr>
-          <w:b/>
-          <w:bCs/>
-        </w:rPr>
-        <w:t xml:space="preserve">¿Qué vi y qué me contaron?</w:t>
-      </w:r>
-      <w:r>
-        <w:t xml:space="preserve"> (un hecho decisivo, con su fuente)</w:t>
-      </w:r>
-    </w:p>
-    <w:p>
-      <w:pPr>
-        <w:pStyle w:val="BodyJ"/>
-        <w:numPr>
-          <w:ilvl w:val="0"/>
-          <w:numId w:val="22"/>
-        </w:numPr>
-      </w:pPr>
-      <w:r>
-        <w:rPr>
-          <w:b/>
-          <w:bCs/>
-        </w:rPr>
-        <w:t xml:space="preserve">¿Qué creo y cuánto derecho tengo a creerlo?</w:t>
-      </w:r>
-      <w:r>
-        <w:t xml:space="preserve"> (la inferencia principal, con su grado)</w:t>
-      </w:r>
-    </w:p>
-    <w:p>
-      <w:pPr>
-        <w:pStyle w:val="BodyJ"/>
-        <w:numPr>
-          <w:ilvl w:val="0"/>
-          <w:numId w:val="22"/>
-        </w:numPr>
-      </w:pPr>
-      <w:r>
-        <w:rPr>
-          <w:b/>
-          <w:bCs/>
-        </w:rPr>
-        <w:t xml:space="preserve">¿Qué daño importante podría producir si estoy equivocado?</w:t>
-      </w:r>
-      <w:r>
-        <w:t xml:space="preserve"> (la incertidumbre peligrosa, no todas)</w:t>
-      </w:r>
-    </w:p>
-    <w:p>
-      <w:pPr>
-        <w:pStyle w:val="BodyJ"/>
-        <w:numPr>
-          <w:ilvl w:val="0"/>
-          <w:numId w:val="22"/>
-        </w:numPr>
-      </w:pPr>
-      <w:r>
-        <w:rPr>
-          <w:b/>
-          <w:bCs/>
-        </w:rPr>
-        <w:t xml:space="preserve">¿Qué hago, y qué me haría cambiar antes del próximo control?</w:t>
-      </w:r>
-      <w:r>
-        <w:t xml:space="preserve"> (decisión con criterio de reapertura)</w:t>
-      </w:r>
-    </w:p>
-    <w:p>
-      <w:pPr>
-        <w:pStyle w:val="BodyJ"/>
-      </w:pPr>
-      <w:r>
-        <w:t xml:space="preserve">Sesenta segundos no producen una epistemología; producen algo más modesto y a veces suficiente: impiden que la frase «cuadro habitual, manejo habitual» se escriba sola. Si alguna de las cuatro respuestas incomoda —el hecho decisivo resulta heredado, la confianza no tiene fuente, la incertidumbre peligrosa no tiene vigilancia—, esa incomodidad es la indicación para la versión completa.</w:t>
+        <w:t xml:space="preserve">Uso en equipo</w:t>
+      </w:r>
+    </w:p>
+    <w:p>
+      <w:pPr>
+        <w:pStyle w:val="BodyJ"/>
+      </w:pPr>
+      <w:r>
+        <w:t xml:space="preserve">En una visita de sala, cada integrante puede desafiar una capa distinta. Enfermería aporta evolución y respuesta; radiología delimita lo que la imagen muestra y lo que no; microbiología precisa relevancia y contaminación; cirugía integra anatomía y oportunidad; el paciente aporta síntomas, preferencias y desenlaces que valora. El método no centraliza el conocimiento en una sola voz.</w:t>
+      </w:r>
+    </w:p>
+    <w:p>
+      <w:pPr>
+        <w:pStyle w:val="BodyJ"/>
+      </w:pPr>
+      <w:r>
+        <w:t xml:space="preserve">También puede usarse para revisar una nota, un informe de alta o una respuesta de IA. La pregunta siempre es la misma: ¿la fuerza del lenguaje corresponde a la fuerza de la evidencia y la decisión corresponde a las consecuencias?</w:t>
       </w:r>
     </w:p>
     <w:p>
@@ -11812,23 +11732,23 @@
           <w:sz w:val="25"/>
           <w:szCs w:val="25"/>
         </w:rPr>
-        <w:t xml:space="preserve">Uso en equipo</w:t>
-      </w:r>
-    </w:p>
-    <w:p>
-      <w:pPr>
-        <w:pStyle w:val="BodyJ"/>
-      </w:pPr>
-      <w:r>
-        <w:t xml:space="preserve">En una visita de sala, cada integrante puede desafiar una capa distinta. Enfermería aporta evolución y respuesta; radiología delimita lo que la imagen muestra y lo que no; microbiología precisa relevancia y contaminación; cirugía integra anatomía y oportunidad; el paciente aporta síntomas, preferencias y desenlaces que valora. El método no centraliza el conocimiento en una sola voz.</w:t>
-      </w:r>
-    </w:p>
-    <w:p>
-      <w:pPr>
-        <w:pStyle w:val="BodyJ"/>
-      </w:pPr>
-      <w:r>
-        <w:t xml:space="preserve">También puede usarse para revisar una nota, un informe de alta o una respuesta de IA. La pregunta siempre es la misma: ¿la fuerza del lenguaje corresponde a la fuerza de la evidencia y la decisión corresponde a las consecuencias?</w:t>
+        <w:t xml:space="preserve">Calibración y auditoría del método</w:t>
+      </w:r>
+    </w:p>
+    <w:p>
+      <w:pPr>
+        <w:pStyle w:val="BodyJ"/>
+      </w:pPr>
+      <w:r>
+        <w:t xml:space="preserve">HII-D puede usarse retrospectivamente para examinar decisiones. La pregunta no es sólo si el diagnóstico final coincidió, sino si los hechos fueron representados con fidelidad, si las inferencias recibieron una fuerza proporcional, si la incertidumbre relevante fue identificada y si la decisión era defendible con la información disponible. Este análisis evita confundir calidad del proceso con fortuna del desenlace.</w:t>
+      </w:r>
+    </w:p>
+    <w:p>
+      <w:pPr>
+        <w:pStyle w:val="BodyJ"/>
+      </w:pPr>
+      <w:r>
+        <w:t xml:space="preserve">La calibración requiere comparar predicciones con resultados. Cuando sea posible, registre no sólo una hipótesis, sino un grado verbal o numérico de confianza y una expectativa temporal. Más tarde puede revisarse: ¿la certeza fue excesiva?, ¿la alternativa descartada ocurrió con frecuencia?, ¿el criterio de alarma fue sensible?, ¿la conducta se modificó cuando debía? Sin retorno de información, la experiencia puede acumular años sin transformarse en pericia.</w:t>
       </w:r>
     </w:p>
     <w:p>
@@ -11845,23 +11765,55 @@
           <w:sz w:val="25"/>
           <w:szCs w:val="25"/>
         </w:rPr>
-        <w:t xml:space="preserve">Calibración y auditoría del método</w:t>
-      </w:r>
-    </w:p>
-    <w:p>
-      <w:pPr>
-        <w:pStyle w:val="BodyJ"/>
-      </w:pPr>
-      <w:r>
-        <w:t xml:space="preserve">HII-D puede usarse retrospectivamente para examinar decisiones. La pregunta no es sólo si el diagnóstico final coincidió, sino si los hechos fueron representados con fidelidad, si las inferencias recibieron una fuerza proporcional, si la incertidumbre relevante fue identificada y si la decisión era defendible con la información disponible. Este análisis evita confundir calidad del proceso con fortuna del desenlace.</w:t>
-      </w:r>
-    </w:p>
-    <w:p>
-      <w:pPr>
-        <w:pStyle w:val="BodyJ"/>
-      </w:pPr>
-      <w:r>
-        <w:t xml:space="preserve">La calibración requiere comparar predicciones con resultados. Cuando sea posible, registre no sólo una hipótesis, sino un grado verbal o numérico de confianza y una expectativa temporal. Más tarde puede revisarse: ¿la certeza fue excesiva?, ¿la alternativa descartada ocurrió con frecuencia?, ¿el criterio de alarma fue sensible?, ¿la conducta se modificó cuando debía? Sin retorno de información, la experiencia puede acumular años sin transformarse en pericia.</w:t>
+        <w:t xml:space="preserve">Qué evidencia me haría abandonar este método</w:t>
+      </w:r>
+    </w:p>
+    <w:p>
+      <w:pPr>
+        <w:pStyle w:val="BodyJ"/>
+      </w:pPr>
+      <w:r>
+        <w:t xml:space="preserve">Un libro que exige compromisos observables a cada hipótesis clínica debe formular los suyos. Estos son los míos.</w:t>
+      </w:r>
+    </w:p>
+    <w:p>
+      <w:pPr>
+        <w:pStyle w:val="BodyJ"/>
+      </w:pPr>
+      <w:r>
+        <w:t xml:space="preserve">Primero: si clínicos entrenados no logran un acuerdo razonable al clasificar las frases de una nota en hechos, inferencias e incertidumbre, la distinción central del método es subjetiva en la práctica, y HII-D debe reformularse o abandonarse. La trazabilidad que promete depende de que las capas sean reconocibles entre lectores, no sólo para quien escribe.</w:t>
+      </w:r>
+    </w:p>
+    <w:p>
+      <w:pPr>
+        <w:pStyle w:val="BodyJ"/>
+      </w:pPr>
+      <w:r>
+        <w:t xml:space="preserve">Segundo: si las notas escritas con esta disciplina no difieren de las convencionales en instrumentos estándar de calidad de registro, ni en la capacidad de otro clínico para reconstruir el razonamiento a partir de ellas, el método es cosmética con nombre propio.</w:t>
+      </w:r>
+    </w:p>
+    <w:p>
+      <w:pPr>
+        <w:pStyle w:val="BodyJ"/>
+      </w:pPr>
+      <w:r>
+        <w:t xml:space="preserve">Tercero: si un servicio que adopta el léxico de certeza no modifica en algunos meses ninguna conducta medible —ningún «se descarta» reconvertido, ningún criterio de reapertura agregado, ninguna vigilancia activada que antes no existía—, el léxico es un póster, no una herramienta.</w:t>
+      </w:r>
+    </w:p>
+    <w:p>
+      <w:pPr>
+        <w:pStyle w:val="BodyJ"/>
+      </w:pPr>
+      <w:r>
+        <w:t xml:space="preserve">Cuarto: si el tiempo que consume la versión completa supera de forma sostenida el beneficio detectable, la respuesta racional no es la fe sino la poda: quedarse con la versión de sesenta segundos, o con nada.</w:t>
+      </w:r>
+    </w:p>
+    <w:p>
+      <w:pPr>
+        <w:pStyle w:val="BodyJ"/>
+      </w:pPr>
+      <w:r>
+        <w:t xml:space="preserve">Formular estas condiciones no es un gesto retórico de modestia. Es la diferencia entre proponer una hipótesis y fundar una escuela. Prefiero lo primero: que el método quede expuesto a la misma reevaluación que le exige a cada diagnóstico, y que el mundo conserve, también aquí, la capacidad de corregirnos.</w:t>
       </w:r>
     </w:p>
     <w:p>
@@ -11878,55 +11830,164 @@
           <w:sz w:val="25"/>
           <w:szCs w:val="25"/>
         </w:rPr>
-        <w:t xml:space="preserve">Qué evidencia me haría abandonar este método</w:t>
-      </w:r>
-    </w:p>
-    <w:p>
-      <w:pPr>
-        <w:pStyle w:val="BodyJ"/>
-      </w:pPr>
-      <w:r>
-        <w:t xml:space="preserve">Un libro que exige compromisos observables a cada hipótesis clínica debe formular los suyos. Estos son los míos.</w:t>
-      </w:r>
-    </w:p>
-    <w:p>
-      <w:pPr>
-        <w:pStyle w:val="BodyJ"/>
-      </w:pPr>
-      <w:r>
-        <w:t xml:space="preserve">Primero: si clínicos entrenados no logran un acuerdo razonable al clasificar las frases de una nota en hechos, inferencias e incertidumbre, la distinción central del método es subjetiva en la práctica, y HII-D debe reformularse o abandonarse. La trazabilidad que promete depende de que las capas sean reconocibles entre lectores, no sólo para quien escribe.</w:t>
-      </w:r>
-    </w:p>
-    <w:p>
-      <w:pPr>
-        <w:pStyle w:val="BodyJ"/>
-      </w:pPr>
-      <w:r>
-        <w:t xml:space="preserve">Segundo: si las notas escritas con esta disciplina no difieren de las convencionales en instrumentos estándar de calidad de registro, ni en la capacidad de otro clínico para reconstruir el razonamiento a partir de ellas, el método es cosmética con nombre propio.</w:t>
-      </w:r>
-    </w:p>
-    <w:p>
-      <w:pPr>
-        <w:pStyle w:val="BodyJ"/>
-      </w:pPr>
-      <w:r>
-        <w:t xml:space="preserve">Tercero: si un servicio que adopta el léxico de certeza no modifica en algunos meses ninguna conducta medible —ningún «se descarta» reconvertido, ningún criterio de reapertura agregado, ninguna vigilancia activada que antes no existía—, el léxico es un póster, no una herramienta.</w:t>
-      </w:r>
-    </w:p>
-    <w:p>
-      <w:pPr>
-        <w:pStyle w:val="BodyJ"/>
-      </w:pPr>
-      <w:r>
-        <w:t xml:space="preserve">Cuarto: si el tiempo que consume la versión completa supera de forma sostenida el beneficio detectable, la respuesta racional no es la fe sino la poda: quedarse con la versión de sesenta segundos, o con nada.</w:t>
-      </w:r>
-    </w:p>
-    <w:p>
-      <w:pPr>
-        <w:pStyle w:val="BodyJ"/>
-      </w:pPr>
-      <w:r>
-        <w:t xml:space="preserve">Formular estas condiciones no es un gesto retórico de modestia. Es la diferencia entre proponer una hipótesis y fundar una escuela. Prefiero lo primero: que el método quede expuesto a la misma reevaluación que le exige a cada diagnóstico, y que el mundo conserve, también aquí, la capacidad de corregirnos.</w:t>
+        <w:t xml:space="preserve">Límites</w:t>
+      </w:r>
+    </w:p>
+    <w:p>
+      <w:pPr>
+        <w:pStyle w:val="BodyJ"/>
+      </w:pPr>
+      <w:r>
+        <w:t xml:space="preserve">HII-D no sustituye protocolos, guías, probabilidades cuantitativas ni experiencia. Puede generar falsa prolijidad si se aplica mecánicamente. No todo caso necesita cuatro subtítulos. En urgencias, la acción puede preceder a la formulación completa; aun así, la reevaluación posterior debe reconstruirla. Debe decirse con la misma claridad: HII-D no ha sido validado como instrumento —no existen aún estudios de fiabilidad ni de impacto—, y este libro lo presenta como heurística de escritura y deliberación, no como tecnología probada. El método debe permanecer liviano. La extensión apropiada depende del riesgo, novedad y reversibilidad. Una decisión rutinaria puede requerir una línea; una situación de alto impacto pide una representación más desplegada. La profundidad debe ser selectiva y proporcional.</w:t>
+      </w:r>
+    </w:p>
+    <w:p>
+      <w:pPr>
+        <w:pStyle w:val="Quote1"/>
+      </w:pPr>
+      <w:r>
+        <w:t xml:space="preserve">Hechos sin inferencia son inventario; inferencias sin incertidumbre son dogma; incertidumbre sin decisión es parálisis; decisión sin reevaluación es inercia.</w:t>
+      </w:r>
+    </w:p>
+    <w:p>
+      <w:pPr>
+        <w:pStyle w:val="BodyJ"/>
+      </w:pPr>
+      <w:r>
+        <w:t xml:space="preserve">El valor del método depende de una actitud: aceptar que la claridad no consiste en eliminar la complejidad, sino en ordenar qué tipo de conocimiento representa cada afirmación.</w:t>
+      </w:r>
+    </w:p>
+    <w:p>
+      <w:pPr>
+        <w:pStyle w:val="TallerHead"/>
+      </w:pPr>
+      <w:r>
+        <w:t xml:space="preserve">Taller 15. Su paciente, esta semana</w:t>
+      </w:r>
+    </w:p>
+    <w:p>
+      <w:pPr>
+        <w:pStyle w:val="BodyJ"/>
+      </w:pPr>
+      <w:r>
+        <w:t xml:space="preserve">Elija el caso más incómodo de su lista actual —el que genera discusión en cada visita o el que nadie discute hace días— y complete por escrito la plantilla condensada del Apéndice A. Después compárela con la última evolución de la ficha: ¿qué contiene la plantilla que la ficha no registra?</w:t>
+      </w:r>
+    </w:p>
+    <w:p>
+      <w:pPr>
+        <w:pStyle w:val="BodyJ"/>
+      </w:pPr>
+      <w:r>
+        <w:rPr>
+          <w:i/>
+          <w:iCs/>
+        </w:rPr>
+        <w:t xml:space="preserve">Solución comentada.</w:t>
+      </w:r>
+      <w:r>
+        <w:t xml:space="preserve"> No hay solución única, pero hay un patrón casi universal al comparar: la ficha suele contener los hechos y la decisión, y omitir las dos capas intermedias —el grado de la inferencia («neumonía» sin «probable/demostrada») y la incertidumbre crítica con su vigilancia—. Es decir: registra qué se piensa y qué se hace, pero no cuánto derecho hay a pensarlo ni qué lo haría cambiar. Si su plantilla y su ficha coinciden, este libro le debe una disculpa por las horas invertidas. Si no coinciden, la plantilla acaba de mostrarle qué escribir mañana.</w:t>
+      </w:r>
+    </w:p>
+    <w:p>
+      <w:pPr>
+        <w:pStyle w:val="EnUnaFrase"/>
+      </w:pPr>
+      <w:r>
+        <w:rPr>
+          <w:b/>
+          <w:bCs/>
+        </w:rPr>
+        <w:t xml:space="preserve">En una frase.</w:t>
+      </w:r>
+      <w:r>
+        <w:t xml:space="preserve"> HII-D es el libro entero plegado en una hoja: pregunta, hechos con procedencia, inferencias graduadas, incertidumbre priorizada, decisión por umbral y reapertura programada.</w:t>
+      </w:r>
+    </w:p>
+    <w:p>
+      <w:pPr>
+        <w:pStyle w:val="BodyJ"/>
+        <w:spacing w:after="80" w:before="160"/>
+      </w:pPr>
+      <w:r>
+        <w:rPr>
+          <w:b/>
+          <w:bCs/>
+        </w:rPr>
+        <w:t xml:space="preserve">Tres preguntas para la próxima visita.</w:t>
+      </w:r>
+    </w:p>
+    <w:p>
+      <w:pPr>
+        <w:pStyle w:val="BodyJ"/>
+        <w:numPr>
+          <w:ilvl w:val="0"/>
+          <w:numId w:val="23"/>
+        </w:numPr>
+      </w:pPr>
+      <w:r>
+        <w:t xml:space="preserve">¿Cuál es la pregunta operativa de mi caso más difícil —la decisión real en juego, no «el diagnóstico»?</w:t>
+      </w:r>
+    </w:p>
+    <w:p>
+      <w:pPr>
+        <w:pStyle w:val="BodyJ"/>
+        <w:numPr>
+          <w:ilvl w:val="0"/>
+          <w:numId w:val="23"/>
+        </w:numPr>
+      </w:pPr>
+      <w:r>
+        <w:t xml:space="preserve">¿Mi nota de hoy permite a otro médico reconstruir mis cuatro capas, o sólo mi conclusión?</w:t>
+      </w:r>
+    </w:p>
+    <w:p>
+      <w:pPr>
+        <w:pStyle w:val="BodyJ"/>
+        <w:numPr>
+          <w:ilvl w:val="0"/>
+          <w:numId w:val="23"/>
+        </w:numPr>
+      </w:pPr>
+      <w:r>
+        <w:t xml:space="preserve">¿Qué decisión de esta semana tomé sin criterio de reapertura, y todavía estoy a tiempo de escribirlo?</w:t>
+      </w:r>
+    </w:p>
+    <w:p>
+      <w:pPr>
+        <w:pStyle w:val="Heading2"/>
+        <w:pageBreakBefore/>
+        <w:spacing w:after="300" w:before="600"/>
+      </w:pPr>
+      <w:r>
+        <w:rPr>
+          <w:rFonts w:ascii="Georgia" w:cs="Georgia" w:eastAsia="Georgia" w:hAnsi="Georgia"/>
+          <w:b/>
+          <w:bCs/>
+          <w:color w:val="8C2F2F"/>
+          <w:sz w:val="22"/>
+          <w:szCs w:val="22"/>
+        </w:rPr>
+        <w:t xml:space="preserve">Cuaderno de casos</w:t>
+      </w:r>
+      <w:r>
+        <w:rPr>
+          <w:rFonts w:ascii="Georgia" w:cs="Georgia" w:eastAsia="Georgia" w:hAnsi="Georgia"/>
+          <w:b/>
+          <w:bCs/>
+          <w:color w:val="3D5A6C"/>
+          <w:sz w:val="32"/>
+          <w:szCs w:val="32"/>
+        </w:rPr>
+        <w:br/>
+        <w:t xml:space="preserve">Ocho viñetas para una lectura metacognitiva</w:t>
+      </w:r>
+    </w:p>
+    <w:p>
+      <w:pPr>
+        <w:pStyle w:val="BodyJ"/>
+      </w:pPr>
+      <w:r>
+        <w:t xml:space="preserve">Las viñetas siguientes son composiciones docentes. Cada una se presenta con la estructura HII-D y una frase medular. No son casos «resueltos»: son casos representados. La invitación es leer cada uno dos veces —primero como clínico, buscando la conducta; después como lector metacognitivo, observando qué hace cada capa.</w:t>
       </w:r>
     </w:p>
     <w:p>
@@ -11943,126 +12004,985 @@
           <w:sz w:val="25"/>
           <w:szCs w:val="25"/>
         </w:rPr>
-        <w:t xml:space="preserve">Límites</w:t>
-      </w:r>
-    </w:p>
-    <w:p>
-      <w:pPr>
-        <w:pStyle w:val="BodyJ"/>
-      </w:pPr>
-      <w:r>
-        <w:t xml:space="preserve">HII-D no sustituye protocolos, guías, probabilidades cuantitativas ni experiencia. Puede generar falsa prolijidad si se aplica mecánicamente. No todo caso necesita cuatro subtítulos. En urgencias, la acción puede preceder a la formulación completa; aun así, la reevaluación posterior debe reconstruirla. Debe decirse con la misma claridad: HII-D no ha sido validado como instrumento —no existen aún estudios de fiabilidad ni de impacto—, y este libro lo presenta como heurística de escritura y deliberación, no como tecnología probada. El método debe permanecer liviano. La extensión apropiada depende del riesgo, novedad y reversibilidad. Una decisión rutinaria puede requerir una línea; una situación de alto impacto pide una representación más desplegada. La profundidad debe ser selectiva y proporcional.</w:t>
-      </w:r>
-    </w:p>
-    <w:p>
-      <w:pPr>
-        <w:pStyle w:val="Quote1"/>
-      </w:pPr>
-      <w:r>
-        <w:t xml:space="preserve">Hechos sin inferencia son inventario; inferencias sin incertidumbre son dogma; incertidumbre sin decisión es parálisis; decisión sin reevaluación es inercia.</w:t>
-      </w:r>
-    </w:p>
-    <w:p>
-      <w:pPr>
-        <w:pStyle w:val="BodyJ"/>
-      </w:pPr>
-      <w:r>
-        <w:t xml:space="preserve">El valor del método depende de una actitud: aceptar que la claridad no consiste en eliminar la complejidad, sino en ordenar qué tipo de conocimiento representa cada afirmación.</w:t>
-      </w:r>
-    </w:p>
-    <w:p>
-      <w:pPr>
-        <w:pStyle w:val="TallerHead"/>
-      </w:pPr>
-      <w:r>
-        <w:t xml:space="preserve">Taller 15. Su paciente, esta semana</w:t>
-      </w:r>
-    </w:p>
-    <w:p>
-      <w:pPr>
-        <w:pStyle w:val="BodyJ"/>
-      </w:pPr>
-      <w:r>
-        <w:t xml:space="preserve">Elija el caso más incómodo de su lista actual —el que genera discusión en cada visita o el que nadie discute hace días— y complete la plantilla condensada por escrito. Después compárela con la última evolución de la ficha: ¿qué contiene la plantilla que la ficha no registra?</w:t>
-      </w:r>
-    </w:p>
-    <w:p>
-      <w:pPr>
-        <w:pStyle w:val="BodyJ"/>
-      </w:pPr>
-      <w:r>
-        <w:rPr>
-          <w:i/>
-          <w:iCs/>
-        </w:rPr>
-        <w:t xml:space="preserve">Solución comentada.</w:t>
-      </w:r>
-      <w:r>
-        <w:t xml:space="preserve"> No hay solución única, pero hay un patrón casi universal al comparar: la ficha suele contener los hechos y la decisión, y omitir las dos capas intermedias —el grado de la inferencia («neumonía» sin «probable/demostrada») y la incertidumbre crítica con su vigilancia—. Es decir: registra qué se piensa y qué se hace, pero no cuánto derecho hay a pensarlo ni qué lo haría cambiar. Si su plantilla y su ficha coinciden, este libro le debe una disculpa por las horas invertidas. Si no coinciden, la plantilla acaba de mostrarle qué escribir mañana.</w:t>
-      </w:r>
-    </w:p>
-    <w:p>
-      <w:pPr>
-        <w:pStyle w:val="EnUnaFrase"/>
-      </w:pPr>
-      <w:r>
-        <w:rPr>
-          <w:b/>
-          <w:bCs/>
-        </w:rPr>
-        <w:t xml:space="preserve">En una frase.</w:t>
-      </w:r>
-      <w:r>
-        <w:t xml:space="preserve"> HII-D es el libro entero plegado en una hoja: pregunta, hechos con procedencia, inferencias graduadas, incertidumbre priorizada, decisión por umbral y reapertura programada.</w:t>
-      </w:r>
-    </w:p>
-    <w:p>
-      <w:pPr>
-        <w:pStyle w:val="BodyJ"/>
-        <w:spacing w:after="80" w:before="160"/>
-      </w:pPr>
-      <w:r>
-        <w:rPr>
-          <w:b/>
-          <w:bCs/>
-        </w:rPr>
-        <w:t xml:space="preserve">Tres preguntas para la próxima visita.</w:t>
-      </w:r>
-    </w:p>
-    <w:p>
-      <w:pPr>
-        <w:pStyle w:val="BodyJ"/>
-        <w:numPr>
-          <w:ilvl w:val="0"/>
-          <w:numId w:val="23"/>
-        </w:numPr>
-      </w:pPr>
-      <w:r>
-        <w:t xml:space="preserve">¿Cuál es la pregunta operativa de mi caso más difícil —la decisión real en juego, no «el diagnóstico»?</w:t>
-      </w:r>
-    </w:p>
-    <w:p>
-      <w:pPr>
-        <w:pStyle w:val="BodyJ"/>
-        <w:numPr>
-          <w:ilvl w:val="0"/>
-          <w:numId w:val="23"/>
-        </w:numPr>
-      </w:pPr>
-      <w:r>
-        <w:t xml:space="preserve">¿Mi nota de hoy permite a otro médico reconstruir mis cuatro capas, o sólo mi conclusión?</w:t>
-      </w:r>
-    </w:p>
-    <w:p>
-      <w:pPr>
-        <w:pStyle w:val="BodyJ"/>
-        <w:numPr>
-          <w:ilvl w:val="0"/>
-          <w:numId w:val="23"/>
-        </w:numPr>
-      </w:pPr>
-      <w:r>
-        <w:t xml:space="preserve">¿Qué decisión de esta semana tomé sin criterio de reapertura, y todavía estoy a tiempo de escribirlo?</w:t>
+        <w:t xml:space="preserve">Viñeta 1. Carmen: obstrucción recurrente y cambio cualitativo de riesgo</w:t>
+      </w:r>
+    </w:p>
+    <w:p>
+      <w:pPr>
+        <w:pStyle w:val="BodyJ"/>
+      </w:pPr>
+      <w:r>
+        <w:t xml:space="preserve">La historia de Carmen atraviesa todo este libro; aquí se presenta en su versión condensada, tal como se sintetizaría en una entrega de turno o en una discusión clínica.</w:t>
+      </w:r>
+    </w:p>
+    <w:p>
+      <w:pPr>
+        <w:pStyle w:val="BodyJ"/>
+      </w:pPr>
+      <w:r>
+        <w:t xml:space="preserve">Mujer de 61 años con hernia incisional de la línea media y tres hospitalizaciones en el último año por suboclusión intestinal, todas resueltas con manejo médico conservador. Ingresa por un cuarto episodio obstructivo, esta vez asociado a shock séptico, hiperlactatemia (6,0 mmol/L), hipoperfusión periférica (llene capilar de 5 segundos) y bacteriemia por bacilos gramnegativos (2/2 hemocultivos). Evoluciona favorablemente con reposo digestivo, descompresión por sonda nasogástrica, noradrenalina y antibioterapia. La tomografía de abdomen no muestra perforación, isquemia mesentérica ni estrangulación actual.</w:t>
+      </w:r>
+    </w:p>
+    <w:p>
+      <w:pPr>
+        <w:pStyle w:val="BodyJ"/>
+      </w:pPr>
+      <w:r>
+        <w:rPr>
+          <w:i/>
+          <w:iCs/>
+        </w:rPr>
+        <w:t xml:space="preserve">Hechos:</w:t>
+      </w:r>
+      <w:r>
+        <w:t xml:space="preserve"> recurrencia obstructiva documentada y con intervalos cada vez más cortos; episodio actual con compromiso hemodinámico vital y bacteriemia demostrada; respuesta clínica favorable al soporte intensivo; ausencia de complicación quirúrgica aguda en la tomografía inicial.</w:t>
+      </w:r>
+    </w:p>
+    <w:p>
+      <w:pPr>
+        <w:pStyle w:val="BodyJ"/>
+      </w:pPr>
+      <w:r>
+        <w:rPr>
+          <w:i/>
+          <w:iCs/>
+        </w:rPr>
+        <w:t xml:space="preserve">Inferencia:</w:t>
+      </w:r>
+      <w:r>
+        <w:t xml:space="preserve"> el foco abdominal de la bacteriemia, secundario al evento obstructivo, es altamente probable por secuencia temporal y microbiología compatible, aunque el mecanismo íntimo (translocación bacteriana o microisquemia transitoria) no esté demostrado. La ausencia de estrangulación tomográfica desactiva la urgencia quirúrgica inmediata, pero no mitiga el riesgo acumulado de recurrencia.</w:t>
+      </w:r>
+    </w:p>
+    <w:p>
+      <w:pPr>
+        <w:pStyle w:val="BodyJ"/>
+      </w:pPr>
+      <w:r>
+        <w:rPr>
+          <w:i/>
+          <w:iCs/>
+        </w:rPr>
+        <w:t xml:space="preserve">Incertidumbre:</w:t>
+      </w:r>
+      <w:r>
+        <w:t xml:space="preserve"> son inciertos el plazo hasta una quinta obstrucción, la magnitud del daño si ésta ocurre fuera del hospital y la reserva funcional efectiva de la paciente para enfrentar el estrés quirúrgico una vez recuperada.</w:t>
+      </w:r>
+    </w:p>
+    <w:p>
+      <w:pPr>
+        <w:pStyle w:val="BodyJ"/>
+      </w:pPr>
+      <w:r>
+        <w:rPr>
+          <w:i/>
+          <w:iCs/>
+        </w:rPr>
+        <w:t xml:space="preserve">Decisión:</w:t>
+      </w:r>
+      <w:r>
+        <w:t xml:space="preserve"> solicitar evaluación quirúrgica precoz para planificar reparación electiva tras optimización médica y kinésica, documentando una decisión compartida. El fundamento para operar no es que «fracasó el manejo médico» (resolvió el cuadro agudo cuatro veces), sino que la gravedad vital alcanzada en este episodio vuelve inaceptable el riesgo de mantener una conducta expectante.</w:t>
+      </w:r>
+    </w:p>
+    <w:p>
+      <w:pPr>
+        <w:pStyle w:val="BodyJ"/>
+      </w:pPr>
+      <w:r>
+        <w:rPr>
+          <w:i/>
+          <w:iCs/>
+        </w:rPr>
+        <w:t xml:space="preserve">Frase medular:</w:t>
+      </w:r>
+      <w:r>
+        <w:t xml:space="preserve"> «Obstrucción intestinal recurrente por hernia incisional, por primera vez complicada con shock séptico y bacteriemia, sin isquemia aguda en tomografía. El salto cualitativo de gravedad modifica el umbral terapéutico y justifica priorizar la reparación electiva tras la recuperación fisiológica.»</w:t>
+      </w:r>
+    </w:p>
+    <w:p>
+      <w:pPr>
+        <w:pStyle w:val="BodyJ"/>
+      </w:pPr>
+      <w:r>
+        <w:rPr>
+          <w:i/>
+          <w:iCs/>
+        </w:rPr>
+        <w:t xml:space="preserve">Epílogo.</w:t>
+      </w:r>
+      <w:r>
+        <w:t xml:space="preserve"> Carmen fue operada de forma programada seis semanas después. En pabellón se encontraron adherencias firmes y un anillo herniario estrecho, reparado sin incidentes mayores. En su control ambulatorio al mes, Carmen formuló su propio balance del proceso: «Esta vez el dolor tenía una explicación clara, y saber qué estábamos haciendo lo cambió todo». Su buena evolución no demuestra, por sí sola, que la indicación haya sido acertada: un desenlace feliz nunca valida retroactivamente un proceso defectuoso. Lo que cuenta es que la decisión era defendible antes de conocer el resultado, que es todo lo que puede exigírsele al juicio médico. La anotación rápida de su primera madrugada en urgencias —«cuadro habitual, manejo habitual»— permaneció en la ficha como testimonio de lo que una semana de trabajo epistémico permitió transformar.</w:t>
+      </w:r>
+    </w:p>
+    <w:p>
+      <w:pPr>
+        <w:pStyle w:val="Heading3"/>
+        <w:spacing w:after="120" w:before="280"/>
+      </w:pPr>
+      <w:r>
+        <w:rPr>
+          <w:rFonts w:ascii="Georgia" w:cs="Georgia" w:eastAsia="Georgia" w:hAnsi="Georgia"/>
+          <w:b/>
+          <w:bCs/>
+          <w:color w:val="2B2B2B"/>
+          <w:sz w:val="25"/>
+          <w:szCs w:val="25"/>
+        </w:rPr>
+        <w:t xml:space="preserve">Viñeta 2. Bacteriuria en paciente con sonda permanente</w:t>
+      </w:r>
+    </w:p>
+    <w:p>
+      <w:pPr>
+        <w:pStyle w:val="BodyJ"/>
+      </w:pPr>
+      <w:r>
+        <w:t xml:space="preserve">Es el paciente de la cama 12 del capítulo 8, el mismo cuya ficha el capítulo 12 ordenó en la matriz HII-D; aquí, en la versión que cabe en una entrega de turno. Hombre con lesión medular completa, vejiga neurogénica, sonda Foley permanente y un cáncer renal metastásico en progresión. Tras un recambio traumático de sonda presenta orina turbia, piuria y urocultivo positivo; está afebril, estable y sin cambios respecto de su basal. Los marcadores inflamatorios están elevados, sin valores previos y con el tumor como causa concomitante, y tiene antecedente de colonización por enterobacteria productora de BLEE.</w:t>
+      </w:r>
+    </w:p>
+    <w:p>
+      <w:pPr>
+        <w:pStyle w:val="BodyJ"/>
+      </w:pPr>
+      <w:r>
+        <w:rPr>
+          <w:i/>
+          <w:iCs/>
+        </w:rPr>
+        <w:t xml:space="preserve">Hechos:</w:t>
+      </w:r>
+      <w:r>
+        <w:t xml:space="preserve"> recambio reciente de sonda; piuria y urocultivo positivo; afebril y estable; síntomas urinarios bajos no evaluables por el nivel lesional; reactantes elevados sin basal, con cáncer renal metastásico activo; colonización documentada por BLEE.</w:t>
+      </w:r>
+    </w:p>
+    <w:p>
+      <w:pPr>
+        <w:pStyle w:val="BodyJ"/>
+      </w:pPr>
+      <w:r>
+        <w:rPr>
+          <w:i/>
+          <w:iCs/>
+        </w:rPr>
+        <w:t xml:space="preserve">Inferencia:</w:t>
+      </w:r>
+      <w:r>
+        <w:t xml:space="preserve"> el cuadro es altamente compatible con una bacteriuria asociada a catéter por colonización crónica (favorecida por el arrastre del recambio) más que con una infección urinaria sintomática asociada a sonda. Por sí solas, ni la turbidez ni la piuria discriminan entre colonización e infección invasiva en pacientes sondados, y la elevación inflamatoria sistémica es explicable por su neoplasia de base.</w:t>
+      </w:r>
+    </w:p>
+    <w:p>
+      <w:pPr>
+        <w:pStyle w:val="BodyJ"/>
+      </w:pPr>
+      <w:r>
+        <w:rPr>
+          <w:i/>
+          <w:iCs/>
+        </w:rPr>
+        <w:t xml:space="preserve">Incertidumbre:</w:t>
+      </w:r>
+      <w:r>
+        <w:t xml:space="preserve"> la denervación medular enmascara la disuria y el dolor lumbar, por lo que persiste la duda de una infección incipiente con expresión clínica atípica.</w:t>
+      </w:r>
+    </w:p>
+    <w:p>
+      <w:pPr>
+        <w:pStyle w:val="BodyJ"/>
+      </w:pPr>
+      <w:r>
+        <w:rPr>
+          <w:i/>
+          <w:iCs/>
+        </w:rPr>
+        <w:t xml:space="preserve">Decisión:</w:t>
+      </w:r>
+      <w:r>
+        <w:t xml:space="preserve"> no iniciar tratamiento antibiótico empírico. Instaurar vigilancia clínica dirigida a signos equivalentes de respuesta sistémica o autonómica (fiebre nueva, inestabilidad hemodinámica, aumento súbito de espasticidad, sudoración o malestar general inexplicable). Aquí, el antecedente de germen BLEE no es un gatillo para prescribir antes, sino al revés. Como el tratamiento exigiría carbapenémicos, de alto impacto ecológico y toxicidad potencial, el umbral clínico para iniciar antibióticos debe ser más exigente.</w:t>
+      </w:r>
+    </w:p>
+    <w:p>
+      <w:pPr>
+        <w:pStyle w:val="BodyJ"/>
+      </w:pPr>
+      <w:r>
+        <w:rPr>
+          <w:i/>
+          <w:iCs/>
+        </w:rPr>
+        <w:t xml:space="preserve">Frase medular:</w:t>
+      </w:r>
+      <w:r>
+        <w:t xml:space="preserve"> «Urocultivo positivo y piuria tras recambio de sonda Foley en paciente con lesión medular y antecedente de colonización por BLEE, sin respuesta sistémica ni signos autonómicos que configuren infección activa. Se interpreta como bacteriuria asociada a catéter; vigilancia clínica estricta con criterios explícitos de reapertura.»</w:t>
+      </w:r>
+    </w:p>
+    <w:p>
+      <w:pPr>
+        <w:pStyle w:val="Heading3"/>
+        <w:spacing w:after="120" w:before="280"/>
+      </w:pPr>
+      <w:r>
+        <w:rPr>
+          <w:rFonts w:ascii="Georgia" w:cs="Georgia" w:eastAsia="Georgia" w:hAnsi="Georgia"/>
+          <w:b/>
+          <w:bCs/>
+          <w:color w:val="2B2B2B"/>
+          <w:sz w:val="25"/>
+          <w:szCs w:val="25"/>
+        </w:rPr>
+        <w:t xml:space="preserve">Viñeta 3. Tres de la mañana: decidir con el reloj en contra</w:t>
+      </w:r>
+    </w:p>
+    <w:p>
+      <w:pPr>
+        <w:pStyle w:val="BodyJ"/>
+      </w:pPr>
+      <w:r>
+        <w:t xml:space="preserve">Servicio de urgencias, 03:10. Hombre de 54 años, tabáquico activo, consulta por dolor retroesternal opresivo de 40 minutos de evolución, acompañado de diaforesis fría. El electrocardiograma de ingreso muestra alteraciones inespecíficas de la repolarización, sin supradesnivel del ST. La primera troponina está en proceso en el laboratorio. En la sala de espera hay nueve pacientes pendientes de atención y queda un solo cupo en el box de reanimación. Bajo esta presión asistencial no hay margen para redactar una plantilla extensa, pero sí hay sesenta segundos para estructurar el juicio.</w:t>
+      </w:r>
+    </w:p>
+    <w:p>
+      <w:pPr>
+        <w:pStyle w:val="BodyJ"/>
+      </w:pPr>
+      <w:r>
+        <w:rPr>
+          <w:i/>
+          <w:iCs/>
+        </w:rPr>
+        <w:t xml:space="preserve">¿Qué vi y qué me contaron? (Hechos)</w:t>
+      </w:r>
+      <w:r>
+        <w:t xml:space="preserve"> Dolor torácico visceral opresivo con signos autonómicos objetivos (diaforesis fría presenciada en el triage) y un ECG inicial anormal aunque no diagnóstico.</w:t>
+      </w:r>
+    </w:p>
+    <w:p>
+      <w:pPr>
+        <w:pStyle w:val="BodyJ"/>
+      </w:pPr>
+      <w:r>
+        <w:rPr>
+          <w:i/>
+          <w:iCs/>
+        </w:rPr>
+        <w:t xml:space="preserve">¿Qué creo y cuánto derecho tengo a creerlo? (Inferencia)</w:t>
+      </w:r>
+      <w:r>
+        <w:t xml:space="preserve"> Síndrome coronario agudo (SCA) probable; la semiología isquémica típica y el perfil de riesgo tienen mayor peso pretest que un primer trazado electrocardiográfico no concluyente. Diagnóstico aún no demostrado.</w:t>
+      </w:r>
+    </w:p>
+    <w:p>
+      <w:pPr>
+        <w:pStyle w:val="BodyJ"/>
+      </w:pPr>
+      <w:r>
+        <w:rPr>
+          <w:i/>
+          <w:iCs/>
+        </w:rPr>
+        <w:t xml:space="preserve">¿Qué daño importante produciría si me equivoco? (Incertidumbre crítica)</w:t>
+      </w:r>
+      <w:r>
+        <w:t xml:space="preserve"> Rotularlo como «dolor torácico atípico con ECG sin isquemia aguda» y enviarlo a esperar la troponina en una silla de la sala común mientras cursa una oclusión coronaria dinámica. La incertidumbre peligrosa no es la etiqueta nominal; es la ventana de tiempo de miocardio salvable.</w:t>
+      </w:r>
+    </w:p>
+    <w:p>
+      <w:pPr>
+        <w:pStyle w:val="BodyJ"/>
+      </w:pPr>
+      <w:r>
+        <w:rPr>
+          <w:i/>
+          <w:iCs/>
+        </w:rPr>
+        <w:t xml:space="preserve">¿Qué hago ahora y qué me haría cambiar? (Decisión)</w:t>
+      </w:r>
+      <w:r>
+        <w:t xml:space="preserve"> Cama monitorizada, vía venosa, antiagregación inicial según protocolo, ECG seriado cada 15–30 minutos y rescate rápido de la troponina. Activar hemodinamia de inmediato si el trazado evoluciona a supradesnivel o si el dolor se vuelve refractario. Queda escrito: «SCA en evolución, no demostrado; manejo y monitorización continua por asimetría de consecuencias ante el riesgo vital de omisión».</w:t>
+      </w:r>
+    </w:p>
+    <w:p>
+      <w:pPr>
+        <w:pStyle w:val="BodyJ"/>
+      </w:pPr>
+      <w:r>
+        <w:rPr>
+          <w:i/>
+          <w:iCs/>
+        </w:rPr>
+        <w:t xml:space="preserve">Frase medular:</w:t>
+      </w:r>
+      <w:r>
+        <w:t xml:space="preserve"> «Dolor torácico de perfil anginoso con descarga adrenérgica y ECG inicial no concluyente: se maneja como SCA probable bajo monitorización continua, por asimetría de consecuencias, mientras la seriación electrocardiográfica y enzimática confirma o degrada la hipótesis.»</w:t>
+      </w:r>
+    </w:p>
+    <w:p>
+      <w:pPr>
+        <w:pStyle w:val="BodyJ"/>
+      </w:pPr>
+      <w:r>
+        <w:rPr>
+          <w:i/>
+          <w:iCs/>
+        </w:rPr>
+        <w:t xml:space="preserve">Lectura metacognitiva.</w:t>
+      </w:r>
+      <w:r>
+        <w:t xml:space="preserve"> En urgencias, el fallo catastrófico rara vez es intelectual: casi todo médico piensa en el infarto. Suele ser logístico y de diseño: la hipótesis correcta («probable SCA») sin un circuito cerrado de reevaluación. ¿Quién toma y quién mira el segundo ECG a los 15 minutos si el turno colapsa? Fijar el criterio de reapertura con plazo y responsable es la mitad del tratamiento.</w:t>
+      </w:r>
+    </w:p>
+    <w:p>
+      <w:pPr>
+        <w:pStyle w:val="Heading3"/>
+        <w:spacing w:after="120" w:before="280"/>
+      </w:pPr>
+      <w:r>
+        <w:rPr>
+          <w:rFonts w:ascii="Georgia" w:cs="Georgia" w:eastAsia="Georgia" w:hAnsi="Georgia"/>
+          <w:b/>
+          <w:bCs/>
+          <w:color w:val="2B2B2B"/>
+          <w:sz w:val="25"/>
+          <w:szCs w:val="25"/>
+        </w:rPr>
+        <w:t xml:space="preserve">Viñeta 4. La consulta ambulatoria y el chequeo reciente</w:t>
+      </w:r>
+    </w:p>
+    <w:p>
+      <w:pPr>
+        <w:pStyle w:val="BodyJ"/>
+      </w:pPr>
+      <w:r>
+        <w:t xml:space="preserve">Policlínico de atención primaria. Mujer de 47 años consulta por fatiga persistente de tres meses de evolución. Acude con exámenes de sangre «normales de hace poquito»: un hemograma y un perfil bioquímico tomados hace cinco meses en un chequeo preventivo, dos meses antes de que comenzara el cansancio. Al interrogatorio dirigido agrega sudoración nocturna ocasional —que ella atribuye al inicio de la menopausia— y una baja de peso involuntaria de unos tres kilos que explica «porque he tenido menos apetito». La agenda médica está copada, con bloques de doce minutos por paciente.</w:t>
+      </w:r>
+    </w:p>
+    <w:p>
+      <w:pPr>
+        <w:pStyle w:val="BodyJ"/>
+      </w:pPr>
+      <w:r>
+        <w:rPr>
+          <w:i/>
+          <w:iCs/>
+        </w:rPr>
+        <w:t xml:space="preserve">Hechos:</w:t>
+      </w:r>
+      <w:r>
+        <w:t xml:space="preserve"> fatiga progresiva de tres meses (relato consistente); exámenes de laboratorio normales cuya fecha precede en dos meses al inicio del síntoma; sudoración nocturna y baja ponderal referidas con atribuciones benignas propuestas por la propia paciente. Examen físico segmentario de hoy sin adenopatías periféricas ni visceromegalias palpables, en una exploración acotada por el tiempo de consulta.</w:t>
+      </w:r>
+    </w:p>
+    <w:p>
+      <w:pPr>
+        <w:pStyle w:val="BodyJ"/>
+      </w:pPr>
+      <w:r>
+        <w:rPr>
+          <w:i/>
+          <w:iCs/>
+        </w:rPr>
+        <w:t xml:space="preserve">Inferencia:</w:t>
+      </w:r>
+      <w:r>
+        <w:t xml:space="preserve"> por prevalencia, la mayoría de las fatigas en atención primaria son funcionales, carenciales o adaptativas. Pero fatiga prolongada, sudoración nocturna y baja de peso configuran un síndrome constitucional que impide el cierre diagnóstico. Los exámenes que trae la paciente no descartan patología orgánica actual por una razón temporal simple: fueron tomados cuando la enfermedad aún no se manifestaba.</w:t>
+      </w:r>
+    </w:p>
+    <w:p>
+      <w:pPr>
+        <w:pStyle w:val="BodyJ"/>
+      </w:pPr>
+      <w:r>
+        <w:rPr>
+          <w:i/>
+          <w:iCs/>
+        </w:rPr>
+        <w:t xml:space="preserve">Incertidumbre:</w:t>
+      </w:r>
+      <w:r>
+        <w:t xml:space="preserve"> la duda relevante hoy no es determinar la etiología exacta en doce minutos, sino responder si subyace un proceso sistémico, inflamatorio o neoplásico en curso. Esa incertidumbre no se reduce alargando la entrevista de hoy, sino actualizando el laboratorio y utilizando el seguimiento longitudinal.</w:t>
+      </w:r>
+    </w:p>
+    <w:p>
+      <w:pPr>
+        <w:pStyle w:val="BodyJ"/>
+      </w:pPr>
+      <w:r>
+        <w:rPr>
+          <w:i/>
+          <w:iCs/>
+        </w:rPr>
+        <w:t xml:space="preserve">Decisión:</w:t>
+      </w:r>
+      <w:r>
+        <w:t xml:space="preserve"> estudio actualizado dirigido (hemograma con frotis, VHS, PCR, TSH, glicemia, perfil hepático y renal, LDH) y control presencial en dos semanas con la misma médica. Red de seguridad por escrito (safety-netting): adelantar la consulta si aparece fiebre cuantificada, aumento de volumen ganglionar, dolor óseo localizado o progresión de la baja de peso.</w:t>
+      </w:r>
+    </w:p>
+    <w:p>
+      <w:pPr>
+        <w:pStyle w:val="BodyJ"/>
+      </w:pPr>
+      <w:r>
+        <w:rPr>
+          <w:i/>
+          <w:iCs/>
+        </w:rPr>
+        <w:t xml:space="preserve">Frase medular:</w:t>
+      </w:r>
+      <w:r>
+        <w:t xml:space="preserve"> «Fatiga de tres meses asociada a sudoración nocturna y baja ponderal leve; dado que el laboratorio normal previo antecede al inicio de los síntomas y no cubre el período actual, se solicita estudio actualizado y se programa control longitudinal con pauta escrita de signos de alarma.»</w:t>
+      </w:r>
+    </w:p>
+    <w:p>
+      <w:pPr>
+        <w:pStyle w:val="BodyJ"/>
+      </w:pPr>
+      <w:r>
+        <w:rPr>
+          <w:i/>
+          <w:iCs/>
+        </w:rPr>
+        <w:t xml:space="preserve">Lectura metacognitiva.</w:t>
+      </w:r>
+      <w:r>
+        <w:t xml:space="preserve"> Evidencia caducada: «tiene exámenes normales recientes» es un hecho cierto cuya fecha lo vuelve irrelevante para el problema nuevo. Y el tiempo longitudinal, la ventaja comparativa de la atención primaria, sólo es una herramienta diagnóstica cuando tiene fecha de reevaluación y criterios de reconsulta; sin ese diseño, dejar pasar el tiempo es apostar a que el cuadro sea benigno.</w:t>
+      </w:r>
+    </w:p>
+    <w:p>
+      <w:pPr>
+        <w:pStyle w:val="Heading3"/>
+        <w:spacing w:after="120" w:before="280"/>
+      </w:pPr>
+      <w:r>
+        <w:rPr>
+          <w:rFonts w:ascii="Georgia" w:cs="Georgia" w:eastAsia="Georgia" w:hAnsi="Georgia"/>
+          <w:b/>
+          <w:bCs/>
+          <w:color w:val="2B2B2B"/>
+          <w:sz w:val="25"/>
+          <w:szCs w:val="25"/>
+        </w:rPr>
+        <w:t xml:space="preserve">Viñeta 5. Pronóstico incierto al final de la vida</w:t>
+      </w:r>
+    </w:p>
+    <w:p>
+      <w:pPr>
+        <w:pStyle w:val="BodyJ"/>
+      </w:pPr>
+      <w:r>
+        <w:t xml:space="preserve">Hombre de 78 años con adenocarcinoma de páncreas metastásico en progresión tras tres líneas de quimioterapia. Ingresa al servicio de medicina interna por un deterioro funcional acelerado en las últimas tres semanas —pasó de caminar con apoyo dentro de su casa a permanecer postrado en cama—, sumado a una neumonía aguda hipoxémica. En el pasillo, la familia pregunta angustiada cuánto tiempo de vida le queda. Una de las hijas exige «que se le haga todo lo necesario para sacarlo adelante». Oncología anota en su interconsulta que, superado el cuadro infeccioso, «eventualmente podría evaluarse una ventana para una cuarta línea paliativa». El paciente, durante sus períodos de lucidez, repite que se siente profundamente agotado.</w:t>
+      </w:r>
+    </w:p>
+    <w:p>
+      <w:pPr>
+        <w:pStyle w:val="BodyJ"/>
+      </w:pPr>
+      <w:r>
+        <w:rPr>
+          <w:i/>
+          <w:iCs/>
+        </w:rPr>
+        <w:t xml:space="preserve">Hechos:</w:t>
+      </w:r>
+      <w:r>
+        <w:t xml:space="preserve"> neoplasia pancreática metastásica con progresión documentada bajo tercera línea oncológica; declive funcional severo y rápido en las últimas semanas (objetivable con una escala de fragilidad y de desempeño); neumonía bacteriana aguda superpuesta; manifestación reiterada de cansancio vital por parte del paciente en al menos dos entrevistas clínicas lúcidas.</w:t>
+      </w:r>
+    </w:p>
+    <w:p>
+      <w:pPr>
+        <w:pStyle w:val="BodyJ"/>
+      </w:pPr>
+      <w:r>
+        <w:rPr>
+          <w:i/>
+          <w:iCs/>
+        </w:rPr>
+        <w:t xml:space="preserve">Inferencia:</w:t>
+      </w:r>
+      <w:r>
+        <w:t xml:space="preserve"> la neumonía es tratable en lo inmediato. La pendiente funcional previa indica, en cambio, una trayectoria irreversible de final de vida, con una sobrevida estimable en semanas a pocos meses. En ese escenario, «podría haber ventana para otra línea» no es una expectativa fundada en la evolución real, sino la mención abstracta de un fármaco disponible.</w:t>
+      </w:r>
+    </w:p>
+    <w:p>
+      <w:pPr>
+        <w:pStyle w:val="BodyJ"/>
+      </w:pPr>
+      <w:r>
+        <w:rPr>
+          <w:i/>
+          <w:iCs/>
+        </w:rPr>
+        <w:t xml:space="preserve">Incertidumbre:</w:t>
+      </w:r>
+      <w:r>
+        <w:t xml:space="preserve"> el plazo exacto es incognoscible (incertidumbre aleatoria irreductible); lo honesto es comunicar la dirección de la pendiente y los escenarios probables. Pero la incertidumbre que domina el caso no es pronóstica sino de metas: ¿cómo quiere vivir este hombre el tiempo que le queda y qué cargas terapéuticas está dispuesto a tolerar?</w:t>
+      </w:r>
+    </w:p>
+    <w:p>
+      <w:pPr>
+        <w:pStyle w:val="BodyJ"/>
+      </w:pPr>
+      <w:r>
+        <w:rPr>
+          <w:i/>
+          <w:iCs/>
+        </w:rPr>
+        <w:t xml:space="preserve">Decisión:</w:t>
+      </w:r>
+      <w:r>
+        <w:t xml:space="preserve"> antibióticos endovenosos y oxigenoterapia no invasiva con un objetivo explícito de alivio sintomático y eventual retorno a su casa (medidas reversibles y proporcionadas). Suspender la discusión sobre nuevas quimioterapias. Reunión familiar estructurada para alinear el plan con la voluntad del paciente. Reevaluación a las 72 horas según respuesta funcional y confort.</w:t>
+      </w:r>
+    </w:p>
+    <w:p>
+      <w:pPr>
+        <w:pStyle w:val="BodyJ"/>
+      </w:pPr>
+      <w:r>
+        <w:rPr>
+          <w:i/>
+          <w:iCs/>
+        </w:rPr>
+        <w:t xml:space="preserve">Frase medular:</w:t>
+      </w:r>
+      <w:r>
+        <w:t xml:space="preserve"> «Neumonía aguda potencialmente reversible en paciente con cáncer de páncreas metastásico refractario y declive funcional acelerado hacia el final de la vida. Se trata la parte reversible con metas de alivio, se comunica la trayectoria sin fingir exactitud de plazos y las medidas invasivas se subordinan a las preferencias del enfermo.»</w:t>
+      </w:r>
+    </w:p>
+    <w:p>
+      <w:pPr>
+        <w:pStyle w:val="BodyJ"/>
+      </w:pPr>
+      <w:r>
+        <w:rPr>
+          <w:i/>
+          <w:iCs/>
+        </w:rPr>
+        <w:t xml:space="preserve">Lectura metacognitiva.</w:t>
+      </w:r>
+      <w:r>
+        <w:t xml:space="preserve"> La pregunta «¿cuánto tiempo le queda?» tienta a dos respuestas simétricas y malas: una cifra inventada (certeza retórica) o un «eso sólo Dios lo sabe» que desorienta a la familia (abandono comunicacional). Y el caso expone la confusión cotidiana entre lo técnicamente factible —una cuarta línea, intubar— y lo clínicamente proporcionado: el juicio de proporcionalidad del capítulo 10 empieza por reconocer el declive basal como un hecho clínico duro.</w:t>
+      </w:r>
+    </w:p>
+    <w:p>
+      <w:pPr>
+        <w:pStyle w:val="Heading3"/>
+        <w:spacing w:after="120" w:before="280"/>
+      </w:pPr>
+      <w:r>
+        <w:rPr>
+          <w:rFonts w:ascii="Georgia" w:cs="Georgia" w:eastAsia="Georgia" w:hAnsi="Georgia"/>
+          <w:b/>
+          <w:bCs/>
+          <w:color w:val="2B2B2B"/>
+          <w:sz w:val="25"/>
+          <w:szCs w:val="25"/>
+        </w:rPr>
+        <w:t xml:space="preserve">Viñeta 6. Anatomía de un error consumado</w:t>
+      </w:r>
+    </w:p>
+    <w:p>
+      <w:pPr>
+        <w:pStyle w:val="BodyJ"/>
+      </w:pPr>
+      <w:r>
+        <w:t xml:space="preserve">Esta viñeta reconstruye un error completo con la disciplina de los capítulos 7 y 8. Sin pegar la etiqueta de un sesgo, y sin dejar que el desenlace conocido distorsione lo que era exigible saber en el momento de la consulta.</w:t>
+      </w:r>
+    </w:p>
+    <w:p>
+      <w:pPr>
+        <w:pStyle w:val="BodyJ"/>
+      </w:pPr>
+      <w:r>
+        <w:rPr>
+          <w:i/>
+          <w:iCs/>
+        </w:rPr>
+        <w:t xml:space="preserve">El caso.</w:t>
+      </w:r>
+      <w:r>
+        <w:t xml:space="preserve"> Mujer de 29 años consulta en urgencias a las 23:40 por disnea de inicio súbito hace dos horas, palpitaciones y «sensación inminente de que me voy a morir». Registra antecedente de trastorno de pánico en control; la hoja de categorización del triage anota: «paciente ansiosa, cursa crisis de pánico conocida». Sus signos vitales de ingreso muestran frecuencia cardiaca de 118 lpm, presión arterial normal, saturación de oxígeno de 94% ambiental y auscultación cardiopulmonar descrita como «sin hallazgos patológicos». La evolución médica consigna: «Crisis de pánico en paciente con antecedente conocido. Se administra lorazepam sublingual, cede angustia. Alta con indicación de control en salud mental». A las 36 horas reingresa al reanimador traída por su pareja tras sufrir un síncope en el baño: el angioTAC confirma un tromboembolismo pulmonar (TEP) bilateral masivo con disfunción ventricular derecha aguda. Sobrevive tras trombólisis sistémica.</w:t>
+      </w:r>
+    </w:p>
+    <w:p>
+      <w:pPr>
+        <w:pStyle w:val="BodyJ"/>
+      </w:pPr>
+      <w:r>
+        <w:rPr>
+          <w:i/>
+          <w:iCs/>
+        </w:rPr>
+        <w:t xml:space="preserve">Reconstrucción epistémica por capas.</w:t>
+      </w:r>
+    </w:p>
+    <w:p>
+      <w:pPr>
+        <w:pStyle w:val="BodyJ"/>
+      </w:pPr>
+      <w:r>
+        <w:rPr>
+          <w:b/>
+          <w:bCs/>
+        </w:rPr>
+        <w:t xml:space="preserve">Hechos disponibles la primera noche:</w:t>
+      </w:r>
+      <w:r>
+        <w:t xml:space="preserve"> disnea de instalación brusca con hora de inicio precisa (relato consistente). Taquicardia sinusal de 118 lpm al ingreso, que persistía en 112 lpm en el control de enfermería previo al alta, una hora después del lorazepam y con la paciente ya tranquila. Dato medido, registrado en la hoja de signos vitales y omitido en la nota médica. Saturación de 94% a aire ambiental, que alguien en el turno minimizó como «esperable porque está hiperventilando»; la hiperventilación por ansiedad eleva la presión arterial de oxígeno y lleva la saturación hacia 99–100%, nunca la baja a 94%. Uso de anticonceptivos orales combinados y un viaje interurbano en bus de nueve horas tres días antes: dos factores protrombóticos presentes en la historia reciente, que nadie interrogó porque nunca se abrió una hipótesis vascular. Y una etiqueta heredada desde la admisión («crisis de pánico conocida»), que entró a la ficha médica con rango de diagnóstico antes de que el clínico pusiera el fonendoscopio sobre el tórax.</w:t>
+      </w:r>
+    </w:p>
+    <w:p>
+      <w:pPr>
+        <w:pStyle w:val="BodyJ"/>
+      </w:pPr>
+      <w:r>
+        <w:rPr>
+          <w:b/>
+          <w:bCs/>
+        </w:rPr>
+        <w:t xml:space="preserve">Inferencia de la primera noche:</w:t>
+      </w:r>
+      <w:r>
+        <w:t xml:space="preserve"> «crisis de pánico» fue redactada como un hecho consumado, cuando su fuerza epistémica real era apenas la de una hipótesis posible, sustentada únicamente en el antecedente psiquiátrico y la similitud superficial del relato.</w:t>
+      </w:r>
+    </w:p>
+    <w:p>
+      <w:pPr>
+        <w:pStyle w:val="BodyJ"/>
+      </w:pPr>
+      <w:r>
+        <w:rPr>
+          <w:b/>
+          <w:bCs/>
+        </w:rPr>
+        <w:t xml:space="preserve">Incertidumbre nunca formulada:</w:t>
+      </w:r>
+      <w:r>
+        <w:t xml:space="preserve"> ¿qué proceso fisiopatológico explica que una mujer de 29 años mantenga una frecuencia cardiaca de 112 lpm estando ya sedada y sin angustia, junto con una saturación de 94% que contradice una hiperventilación psicógena? Para este escenario exacto se diseñaron y validaron los criterios PERC (Pulmonary Embolism Rule-out Criteria): ocho variables que permiten excluir razonablemente un TEP sin dímero-D, sólo cuando un paciente de baja sospecha no cumple ninguna (Kline et al., 2004). Esta paciente incumplía tres: frecuencia cardiaca ≥100 lpm, saturación &lt;95% y uso de estrógenos. La regla no falló esa noche; nunca fue convocada, porque el cierre prematuro impidió sospechar que había algo que descartar.</w:t>
+      </w:r>
+    </w:p>
+    <w:p>
+      <w:pPr>
+        <w:pStyle w:val="BodyJ"/>
+      </w:pPr>
+      <w:r>
+        <w:rPr>
+          <w:b/>
+          <w:bCs/>
+        </w:rPr>
+        <w:t xml:space="preserve">Decisión de la primera noche:</w:t>
+      </w:r>
+      <w:r>
+        <w:t xml:space="preserve"> la benzodiacepina era defendible como tratamiento sintomático inicial. El alta sin estudio adicional y sin una línea de signos de alarma —qué debía hacerla volver antes del «control en salud mental»— fue un cierre indefendible.</w:t>
+      </w:r>
+    </w:p>
+    <w:p>
+      <w:pPr>
+        <w:pStyle w:val="BodyJ"/>
+      </w:pPr>
+      <w:r>
+        <w:rPr>
+          <w:i/>
+          <w:iCs/>
+        </w:rPr>
+        <w:t xml:space="preserve">Dónde estuvo el punto de intercepción.</w:t>
+      </w:r>
+      <w:r>
+        <w:t xml:space="preserve"> En la lectura de los signos vitales previos al egreso. Una taquicardia persistente de 112 lpm en una paciente que ya no luce angustiada era la gran discordancia de la madrugada. Si la hipótesis del pánico hubiese sido verdadera, el control de la ansiedad debía normalizar la descarga simpática y bajar el pulso. La pregunta de desaceleración antes de firmar el alta —«¿qué dato objetivo de esta paciente no explica una crisis de pánico?»— tenía en ese minuto su máximo rendimiento y su mínimo costo. Habrían bastado dos preguntas de anamnesis dirigida, la regla PERC al lado de la camilla y un dímero-D. Treinta y seis horas más tarde, la pregunta no formulada la respondió el síncope.</w:t>
+      </w:r>
+    </w:p>
+    <w:p>
+      <w:pPr>
+        <w:pStyle w:val="BodyJ"/>
+      </w:pPr>
+      <w:r>
+        <w:rPr>
+          <w:i/>
+          <w:iCs/>
+        </w:rPr>
+        <w:t xml:space="preserve">Lo que no debe concluirse.</w:t>
+      </w:r>
+      <w:r>
+        <w:t xml:space="preserve"> El desenlace no demuestra que toda disnea en una paciente con trastorno de pánico sea una embolia, ni que el médico fuera incompetente: con la información de la primera noche, la crisis de pánico era la explicación más frecuente. Lo indefendible era la arquitectura: una etiqueta de triage convertida en diagnóstico antes del examen, un dato medido —la taquicardia persistente— registrado sin que nadie le pidiera explicación, dos preguntas de anamnesis que la etiqueta volvió innecesarias y un alta sin criterio de reapertura. El mismo proceso con desenlace benigno —una crisis de pánico real— habría dejado la misma vulnerabilidad instalada para la siguiente paciente a la que se le cree menos por su diagnóstico.</w:t>
+      </w:r>
+    </w:p>
+    <w:p>
+      <w:pPr>
+        <w:pStyle w:val="BodyJ"/>
+      </w:pPr>
+      <w:r>
+        <w:rPr>
+          <w:i/>
+          <w:iCs/>
+        </w:rPr>
+        <w:t xml:space="preserve">Frase medular (la que faltó la primera noche):</w:t>
+      </w:r>
+      <w:r>
+        <w:t xml:space="preserve"> «Disnea súbita y taquicardia persistente (112 tras ansiolisis) en mujer de 29 años con trastorno de pánico y anticonceptivos orales: crisis de pánico posible, pero la taquicardia y la saturación de 94% no están explicadas. PERC no cumplido (frecuencia cardiaca, saturación, estrógenos): no procede el alta sin estudiar embolia pulmonar. Dímero-D ahora; angioTAC si resulta elevado o la probabilidad clínica es intermedia. Reconsulta inmediata, por escrito, ante síncope, dolor torácico o disnea en reposo.»</w:t>
+      </w:r>
+    </w:p>
+    <w:p>
+      <w:pPr>
+        <w:pStyle w:val="BodyJ"/>
+      </w:pPr>
+      <w:r>
+        <w:rPr>
+          <w:i/>
+          <w:iCs/>
+        </w:rPr>
+        <w:t xml:space="preserve">Lectura metacognitiva.</w:t>
+      </w:r>
+      <w:r>
+        <w:t xml:space="preserve"> La frase que faltó no requería más conocimiento del que cualquier médico de urgencias ya tiene: requería que el antecedente psiquiátrico no descontara el valor de dos signos medidos. Esta viñeta es el capítulo 14 en su forma más silenciosa: la injusticia testimonial no le dijo a la paciente que no le creía; simplemente dejó de preguntar. Y es también el capítulo 10: la regla PERC es un umbral explícito, y los umbrales explícitos sólo protegen a quien recuerda que hay una hipótesis que someterles. La disciplina de escritura habría bastado: separar el hecho (taquicardia persistente no explicada) de la etiqueta (pánico), conservar la incertidumbre y programar la reapertura.</w:t>
+      </w:r>
+    </w:p>
+    <w:p>
+      <w:pPr>
+        <w:pStyle w:val="Heading3"/>
+        <w:spacing w:after="120" w:before="280"/>
+      </w:pPr>
+      <w:r>
+        <w:rPr>
+          <w:rFonts w:ascii="Georgia" w:cs="Georgia" w:eastAsia="Georgia" w:hAnsi="Georgia"/>
+          <w:b/>
+          <w:bCs/>
+          <w:color w:val="2B2B2B"/>
+          <w:sz w:val="25"/>
+          <w:szCs w:val="25"/>
+        </w:rPr>
+        <w:t xml:space="preserve">Viñeta 7. «Lo veo raro»: el testimonio de la madre</w:t>
+      </w:r>
+    </w:p>
+    <w:p>
+      <w:pPr>
+        <w:pStyle w:val="BodyJ"/>
+      </w:pPr>
+      <w:r>
+        <w:t xml:space="preserve">Un lactante de cinco meses llega a urgencias a las 22:30. Afebril tras paracetamol en casa, signos vitales dentro de rangos para la edad, examen segmentario sin foco. La madre insiste: «No es él. No se ríe, no me busca, está como apagado». La sala está llena y el registro de triage dice «lactante febril en buenas condiciones generales».</w:t>
+      </w:r>
+    </w:p>
+    <w:p>
+      <w:pPr>
+        <w:pStyle w:val="BodyJ"/>
+      </w:pPr>
+      <w:r>
+        <w:rPr>
+          <w:i/>
+          <w:iCs/>
+        </w:rPr>
+        <w:t xml:space="preserve">Hechos:</w:t>
+      </w:r>
+      <w:r>
+        <w:t xml:space="preserve"> temperatura normalizada bajo antipirético (dato medido, pero bajo intervención); examen sin foco en una evaluación puntual; y un relato de tercero que describe un cambio conductual respecto del basal — información longitudinal a la que ningún examen de veinte minutos accede.</w:t>
+      </w:r>
+    </w:p>
+    <w:p>
+      <w:pPr>
+        <w:pStyle w:val="BodyJ"/>
+      </w:pPr>
+      <w:r>
+        <w:rPr>
+          <w:i/>
+          <w:iCs/>
+        </w:rPr>
+        <w:t xml:space="preserve">Inferencia:</w:t>
+      </w:r>
+      <w:r>
+        <w:t xml:space="preserve"> cuadro viral banal es lo más probable por prevalencia. Pero la preocupación parental por «no ser él mismo» no es ruido afectivo, sino una observación experta sobre el único basal disponible, y la evidencia le da rango de señal. En series de atención primaria, la intuición del clínico de que «algo anda mal», muchas veces gatillada por la inquietud de los padres, tuvo mayor valor diagnóstico que la mayoría de los signos aislados para detectar infección grave (Van den Bruel et al., 2012).</w:t>
+      </w:r>
+    </w:p>
+    <w:p>
+      <w:pPr>
+        <w:pStyle w:val="BodyJ"/>
+      </w:pPr>
+      <w:r>
+        <w:rPr>
+          <w:i/>
+          <w:iCs/>
+        </w:rPr>
+        <w:t xml:space="preserve">Incertidumbre:</w:t>
+      </w:r>
+      <w:r>
+        <w:t xml:space="preserve"> la peligrosa es una sola: infección bacteriana grave en fase temprana, cuando el examen todavía no la muestra. Reducible sólo parcialmente con laboratorio; la evolución de las próximas horas es la mejor prueba disponible.</w:t>
+      </w:r>
+    </w:p>
+    <w:p>
+      <w:pPr>
+        <w:pStyle w:val="BodyJ"/>
+      </w:pPr>
+      <w:r>
+        <w:rPr>
+          <w:i/>
+          <w:iCs/>
+        </w:rPr>
+        <w:t xml:space="preserve">Decisión:</w:t>
+      </w:r>
+      <w:r>
+        <w:t xml:space="preserve"> el dato que gobierna la conducta no es la temperatura sino el cambio de comportamiento reportado. Observación prolongada en urgencias con reevaluación seriada del estado general, umbral bajo para laboratorio, y —si se decide alta— red de seguridad explícita y verificada con la madre: qué mirar, cuándo volver, por qué vía. «Se va tranquila» no es un criterio de alta; «sabe exactamente qué la haría volver» sí.</w:t>
+      </w:r>
+    </w:p>
+    <w:p>
+      <w:pPr>
+        <w:pStyle w:val="BodyJ"/>
+      </w:pPr>
+      <w:r>
+        <w:rPr>
+          <w:i/>
+          <w:iCs/>
+        </w:rPr>
+        <w:t xml:space="preserve">Frase medular:</w:t>
+      </w:r>
+      <w:r>
+        <w:t xml:space="preserve"> «Lactante afebril bajo antipiréticos y sin foco al examen, con cambio conductual significativo según su madre; el testimonio del cuidador se registra como observación del basal y gobierna la vigilancia: reevaluación seriada antes de decidir alta, con red de seguridad verificada.»</w:t>
+      </w:r>
+    </w:p>
+    <w:p>
+      <w:pPr>
+        <w:pStyle w:val="BodyJ"/>
+      </w:pPr>
+      <w:r>
+        <w:rPr>
+          <w:i/>
+          <w:iCs/>
+        </w:rPr>
+        <w:t xml:space="preserve">Lectura metacognitiva.</w:t>
+      </w:r>
+      <w:r>
+        <w:t xml:space="preserve"> La pediatría radicaliza el capítulo 1: el paciente no habla, y el «hecho» más valioso es un testimonio de tercero sobre un basal que el equipo no conoce. Descartar la preocupación materna como ansiedad es injusticia testimonial en versión pediátrica — y además, simplemente, mala medicina: pocas fuentes de información tienen mejor razón señal-ruido que quien mira a ese niño todos los días.</w:t>
+      </w:r>
+    </w:p>
+    <w:p>
+      <w:pPr>
+        <w:pStyle w:val="Heading3"/>
+        <w:spacing w:after="120" w:before="280"/>
+      </w:pPr>
+      <w:r>
+        <w:rPr>
+          <w:rFonts w:ascii="Georgia" w:cs="Georgia" w:eastAsia="Georgia" w:hAnsi="Georgia"/>
+          <w:b/>
+          <w:bCs/>
+          <w:color w:val="2B2B2B"/>
+          <w:sz w:val="25"/>
+          <w:szCs w:val="25"/>
+        </w:rPr>
+        <w:t xml:space="preserve">Viñeta 8. El dolor abdominal de la paciente que «somatiza»</w:t>
+      </w:r>
+    </w:p>
+    <w:p>
+      <w:pPr>
+        <w:pStyle w:val="BodyJ"/>
+      </w:pPr>
+      <w:r>
+        <w:t xml:space="preserve">Una mujer de 34 años con esquizofrenia en tratamiento consulta por dolor abdominal de dos días. En el box, habla poco y evita la mirada; la nota de derivación dice «consultas frecuentes, quejas somáticas múltiples». Taquicardia de 110, abdomen difícil de evaluar — la paciente tolera mal la palpación y su tratamiento antipsicótico puede atenuar la expresión del dolor y enlentecer el tránsito.</w:t>
+      </w:r>
+    </w:p>
+    <w:p>
+      <w:pPr>
+        <w:pStyle w:val="BodyJ"/>
+      </w:pPr>
+      <w:r>
+        <w:rPr>
+          <w:i/>
+          <w:iCs/>
+        </w:rPr>
+        <w:t xml:space="preserve">Hechos:</w:t>
+      </w:r>
+      <w:r>
+        <w:t xml:space="preserve"> taquicardia sostenida (medida, reproducible); dos días de dolor según relato coherente en sus términos; examen abdominal técnicamente limitado —no negativo: limitado—; antecedente psiquiátrico que modifica la expresión clínica y farmacológica del cuadro; una etiqueta heredada («somatiza») sin procedencia verificable.</w:t>
+      </w:r>
+    </w:p>
+    <w:p>
+      <w:pPr>
+        <w:pStyle w:val="BodyJ"/>
+      </w:pPr>
+      <w:r>
+        <w:rPr>
+          <w:i/>
+          <w:iCs/>
+        </w:rPr>
+        <w:t xml:space="preserve">Inferencia:</w:t>
+      </w:r>
+      <w:r>
+        <w:t xml:space="preserve"> la explicación «queja somática en contexto de patología psiquiátrica» es posible, pero está recibiendo un peso que no proviene de los datos de hoy sino del estigma: nada en la taquicardia es psiquiátrico. El fenómeno tiene nombre —ensombrecimiento diagnóstico: atribuir los síntomas físicos a la enfermedad mental— y consecuencias medibles: las personas con enfermedad mental grave mueren 15 a 20 años antes, en gran parte por enfermedad física subdiagnosticada y subtratada (Thornicroft, 2011).</w:t>
+      </w:r>
+    </w:p>
+    <w:p>
+      <w:pPr>
+        <w:pStyle w:val="BodyJ"/>
+      </w:pPr>
+      <w:r>
+        <w:rPr>
+          <w:i/>
+          <w:iCs/>
+        </w:rPr>
+        <w:t xml:space="preserve">Incertidumbre:</w:t>
+      </w:r>
+      <w:r>
+        <w:t xml:space="preserve"> la peligrosa es un abdomen quirúrgico enmascarado — por el antipsicótico, por la dificultad comunicativa y por la disposición del equipo a cerrar temprano. Es el caso donde el examen «poco confiable» obliga a más objetividad, no a menos: laboratorio e imagen deciden lo que la palpación no puede.</w:t>
+      </w:r>
+    </w:p>
+    <w:p>
+      <w:pPr>
+        <w:pStyle w:val="BodyJ"/>
+      </w:pPr>
+      <w:r>
+        <w:rPr>
+          <w:i/>
+          <w:iCs/>
+        </w:rPr>
+        <w:t xml:space="preserve">Decisión:</w:t>
+      </w:r>
+      <w:r>
+        <w:t xml:space="preserve"> el mismo estándar que para cualquier paciente con dolor abdominal y taquicardia —laboratorio completo, imagen según hallazgos, reevaluación programada— y uno adicional. Documentar que la evaluación fue limitada y por qué, para que el siguiente lector no herede «abdomen negativo» donde hubo «abdomen no evaluable». La etiqueta «somatiza» no entra a la ficha sin procedencia.</w:t>
+      </w:r>
+    </w:p>
+    <w:p>
+      <w:pPr>
+        <w:pStyle w:val="BodyJ"/>
+      </w:pPr>
+      <w:r>
+        <w:rPr>
+          <w:i/>
+          <w:iCs/>
+        </w:rPr>
+        <w:t xml:space="preserve">Frase medular:</w:t>
+      </w:r>
+      <w:r>
+        <w:t xml:space="preserve"> «Dolor abdominal y taquicardia sostenida en paciente con esquizofrenia: examen abdominal limitado —no negativo— y expresión clínica posiblemente atenuada por antipsicóticos; se estudia con el estándar completo, dejando registrado que la atribución psiquiátrica del cuadro exigiría primero excluir lo que la taquicardia sugiere.»</w:t>
+      </w:r>
+    </w:p>
+    <w:p>
+      <w:pPr>
+        <w:pStyle w:val="BodyJ"/>
+      </w:pPr>
+      <w:r>
+        <w:rPr>
+          <w:i/>
+          <w:iCs/>
+        </w:rPr>
+        <w:t xml:space="preserve">Lectura metacognitiva.</w:t>
+      </w:r>
+      <w:r>
+        <w:t xml:space="preserve"> Aquí la injusticia testimonial —descontar el relato por quién lo dice— tiene mortalidad: no es sólo un agravio moral sino un mecanismo causal de la brecha de 15 a 20 años de vida. Nótese el movimiento epistémico central: cuando el testimonio y el examen valen menos de lo habitual, el estándar de estudio objetivo sube en compensación. El ensombrecimiento hace exactamente lo contrario — usa la dificultad como excusa para bajar el estándar — y por eso mata.</w:t>
+      </w:r>
+    </w:p>
+    <w:p>
+      <w:pPr>
+        <w:pStyle w:val="Heading3"/>
+        <w:spacing w:after="120" w:before="280"/>
+      </w:pPr>
+      <w:r>
+        <w:rPr>
+          <w:rFonts w:ascii="Georgia" w:cs="Georgia" w:eastAsia="Georgia" w:hAnsi="Georgia"/>
+          <w:b/>
+          <w:bCs/>
+          <w:color w:val="2B2B2B"/>
+          <w:sz w:val="25"/>
+          <w:szCs w:val="25"/>
+        </w:rPr>
+        <w:t xml:space="preserve">Lo común a las ocho viñetas</w:t>
+      </w:r>
+    </w:p>
+    <w:p>
+      <w:pPr>
+        <w:pStyle w:val="BodyJ"/>
+      </w:pPr>
+      <w:r>
+        <w:t xml:space="preserve">En cada caso, la buena formulación evita dos extremos: describir sin interpretar o interpretar como si se hubiera observado directamente. El hecho guía la hipótesis; la incertidumbre modula su fuerza; la consecuencia define la decisión; la evolución conserva el derecho a corregir. Y en todas la decisión termina con la misma cláusula: qué la haría cambiar, quién lo detectará y cuándo. De la urgencia de las 3:00 al final de la vida; del lactante que no habla a la paciente a la que no se le cree.</w:t>
       </w:r>
     </w:p>
     <w:p>
@@ -12080,7 +13000,7 @@
           <w:sz w:val="22"/>
           <w:szCs w:val="22"/>
         </w:rPr>
-        <w:t xml:space="preserve">Cuaderno de casos</w:t>
+        <w:t xml:space="preserve">Capítulo 16</w:t>
       </w:r>
       <w:r>
         <w:rPr>
@@ -12092,15 +13012,15 @@
           <w:szCs w:val="32"/>
         </w:rPr>
         <w:br/>
-        <w:t xml:space="preserve">Ocho viñetas para una lectura metacognitiva</w:t>
-      </w:r>
-    </w:p>
-    <w:p>
-      <w:pPr>
-        <w:pStyle w:val="BodyJ"/>
-      </w:pPr>
-      <w:r>
-        <w:t xml:space="preserve">Las viñetas siguientes son composiciones docentes. Cada una se presenta con la estructura HII-D y una frase medular. No son casos «resueltos»: son casos representados. La invitación es leer cada uno dos veces —primero como clínico, buscando la conducta; después como lector metacognitivo, observando qué hace cada capa.</w:t>
+        <w:t xml:space="preserve">Enseñar y organizar la metacognición clínica</w:t>
+      </w:r>
+    </w:p>
+    <w:p>
+      <w:pPr>
+        <w:pStyle w:val="BodyJ"/>
+      </w:pPr>
+      <w:r>
+        <w:t xml:space="preserve">Una jefa de servicio que quiera «instalar metacognición» en su equipo no puede indicarla como se indica un antibiótico. Puede, en cambio, cambiar tres cosas que ve todas las semanas: qué se pregunta en la visita de sala, qué estructura tiene la ficha y qué pasa después de un error. Este capítulo trata de esas palancas.</w:t>
       </w:r>
     </w:p>
     <w:p>
@@ -12117,113 +13037,23 @@
           <w:sz w:val="25"/>
           <w:szCs w:val="25"/>
         </w:rPr>
-        <w:t xml:space="preserve">Viñeta 1. Carmen: obstrucción recurrente y cambio cualitativo de riesgo</w:t>
-      </w:r>
-    </w:p>
-    <w:p>
-      <w:pPr>
-        <w:pStyle w:val="BodyJ"/>
-      </w:pPr>
-      <w:r>
-        <w:t xml:space="preserve">La historia de Carmen atraviesa todo este libro; aquí se presenta en su versión condensada, tal como se sintetizaría en una entrega de turno o en una discusión clínica.</w:t>
-      </w:r>
-    </w:p>
-    <w:p>
-      <w:pPr>
-        <w:pStyle w:val="BodyJ"/>
-      </w:pPr>
-      <w:r>
-        <w:t xml:space="preserve">Mujer de 61 años con hernia incisional de la línea media y tres hospitalizaciones en el último año por suboclusión intestinal, todas resueltas con manejo médico conservador. Ingresa por un cuarto episodio obstructivo, esta vez asociado a shock séptico, hiperlactatemia (6,0 mmol/L), hipoperfusión periférica (llene capilar de 5 segundos) y bacteriemia por bacilos gramnegativos (2/2 hemocultivos). Evoluciona favorablemente con reposo digestivo, descompresión por sonda nasogástrica, noradrenalina y antibioterapia. La tomografía de abdomen no muestra perforación, isquemia mesentérica ni estrangulación actual.</w:t>
-      </w:r>
-    </w:p>
-    <w:p>
-      <w:pPr>
-        <w:pStyle w:val="BodyJ"/>
-      </w:pPr>
-      <w:r>
-        <w:rPr>
-          <w:i/>
-          <w:iCs/>
-        </w:rPr>
-        <w:t xml:space="preserve">Hechos:</w:t>
-      </w:r>
-      <w:r>
-        <w:t xml:space="preserve"> recurrencia obstructiva documentada y con intervalos cada vez más cortos; episodio actual con compromiso hemodinámico vital y bacteriemia demostrada; respuesta clínica favorable al soporte intensivo; ausencia de complicación quirúrgica aguda en la tomografía inicial.</w:t>
-      </w:r>
-    </w:p>
-    <w:p>
-      <w:pPr>
-        <w:pStyle w:val="BodyJ"/>
-      </w:pPr>
-      <w:r>
-        <w:rPr>
-          <w:i/>
-          <w:iCs/>
-        </w:rPr>
-        <w:t xml:space="preserve">Inferencia:</w:t>
-      </w:r>
-      <w:r>
-        <w:t xml:space="preserve"> el foco abdominal de la bacteriemia, secundario al evento obstructivo, es altamente probable por secuencia temporal y microbiología compatible, aunque el mecanismo íntimo (translocación bacteriana o microisquemia transitoria) no esté demostrado. La ausencia de estrangulación tomográfica desactiva la urgencia quirúrgica inmediata, pero no mitiga el riesgo acumulado de recurrencia.</w:t>
-      </w:r>
-    </w:p>
-    <w:p>
-      <w:pPr>
-        <w:pStyle w:val="BodyJ"/>
-      </w:pPr>
-      <w:r>
-        <w:rPr>
-          <w:i/>
-          <w:iCs/>
-        </w:rPr>
-        <w:t xml:space="preserve">Incertidumbre:</w:t>
-      </w:r>
-      <w:r>
-        <w:t xml:space="preserve"> son inciertos el plazo hasta una quinta obstrucción, la magnitud del daño si ésta ocurre fuera del hospital y la reserva funcional efectiva de la paciente para enfrentar el estrés quirúrgico una vez recuperada.</w:t>
-      </w:r>
-    </w:p>
-    <w:p>
-      <w:pPr>
-        <w:pStyle w:val="BodyJ"/>
-      </w:pPr>
-      <w:r>
-        <w:rPr>
-          <w:i/>
-          <w:iCs/>
-        </w:rPr>
-        <w:t xml:space="preserve">Decisión:</w:t>
-      </w:r>
-      <w:r>
-        <w:t xml:space="preserve"> solicitar evaluación quirúrgica precoz para planificar reparación electiva tras optimización médica y kinésica, documentando una decisión compartida. El fundamento para operar no es que «fracasó el manejo médico» (resolvió el cuadro agudo cuatro veces), sino que la gravedad vital alcanzada en este episodio vuelve inaceptable el riesgo de mantener una conducta expectante.</w:t>
-      </w:r>
-    </w:p>
-    <w:p>
-      <w:pPr>
-        <w:pStyle w:val="BodyJ"/>
-      </w:pPr>
-      <w:r>
-        <w:rPr>
-          <w:i/>
-          <w:iCs/>
-        </w:rPr>
-        <w:t xml:space="preserve">Frase medular:</w:t>
-      </w:r>
-      <w:r>
-        <w:t xml:space="preserve"> «Obstrucción intestinal recurrente por hernia incisional, por primera vez complicada con shock séptico y bacteriemia, sin isquemia aguda en tomografía. El salto cualitativo de gravedad modifica el umbral terapéutico y justifica priorizar la reparación electiva tras la recuperación fisiológica.»</w:t>
-      </w:r>
-    </w:p>
-    <w:p>
-      <w:pPr>
-        <w:pStyle w:val="BodyJ"/>
-      </w:pPr>
-      <w:r>
-        <w:rPr>
-          <w:i/>
-          <w:iCs/>
-        </w:rPr>
-        <w:t xml:space="preserve">Epílogo.</w:t>
-      </w:r>
-      <w:r>
-        <w:t xml:space="preserve"> Carmen fue operada de forma programada seis semanas después. En pabellón se encontraron adherencias firmes y un anillo herniario estrecho, reparado sin incidentes mayores. En su control ambulatorio al mes, Carmen formuló su propio balance del proceso: «Esta vez el dolor tenía una explicación clara, y saber qué estábamos haciendo lo cambió todo». Su buena evolución no demuestra, por sí sola, que la indicación haya sido acertada: un desenlace feliz nunca valida retroactivamente un proceso defectuoso. Lo que cuenta es que la decisión era defendible antes de conocer el resultado, que es todo lo que puede exigírsele al juicio médico. La anotación rápida de su primera madrugada en urgencias —«cuadro habitual, manejo habitual»— permaneció en la ficha como testimonio de lo que una semana de trabajo epistémico permitió transformar.</w:t>
+        <w:t xml:space="preserve">De la virtud individual al diseño institucional</w:t>
+      </w:r>
+    </w:p>
+    <w:p>
+      <w:pPr>
+        <w:pStyle w:val="BodyJ"/>
+      </w:pPr>
+      <w:r>
+        <w:t xml:space="preserve">La metacognición suele presentarse como una habilidad personal: el médico debe ser humilde, reflexivo y consciente de sus sesgos. Esa expectativa es insuficiente si el sistema oculta resultados, interrumpe el trabajo, fragmenta información y castiga la duda. La lucidez necesita infraestructura. Y esa infraestructura incluye los turnos: un servicio que deja las decisiones mayores para la hora veinte de una guardia está decidiendo con un instrumento degradado (capítulo 8), y el diseño de los horarios es, por eso, una decisión epistémica antes que administrativa.</w:t>
+      </w:r>
+    </w:p>
+    <w:p>
+      <w:pPr>
+        <w:pStyle w:val="BodyJ"/>
+      </w:pPr>
+      <w:r>
+        <w:t xml:space="preserve">La National Academies recomendó educación diagnóstica, trabajo en equipo, tecnologías que apoyen el proceso y mecanismos de feedback y aprendizaje (National Academies of Sciences, Engineering, and Medicine, 2015). Una institución metacognitiva no sólo registra errores; hace visible cómo se piensa y crea momentos para revisar.</w:t>
       </w:r>
     </w:p>
     <w:p>
@@ -12240,90 +13070,23 @@
           <w:sz w:val="25"/>
           <w:szCs w:val="25"/>
         </w:rPr>
-        <w:t xml:space="preserve">Viñeta 2. Bacteriuria en paciente con sonda permanente</w:t>
-      </w:r>
-    </w:p>
-    <w:p>
-      <w:pPr>
-        <w:pStyle w:val="BodyJ"/>
-      </w:pPr>
-      <w:r>
-        <w:t xml:space="preserve">Es el paciente de la cama 12 del capítulo 8, el mismo cuya ficha el capítulo 12 ordenó en la matriz HII-D; aquí, en la versión que cabe en una entrega de turno. Hombre con lesión medular completa, vejiga neurogénica, sonda Foley permanente y un cáncer renal metastásico en progresión. Tras un recambio traumático de sonda presenta orina turbia, piuria y urocultivo positivo; está afebril, estable y sin cambios respecto de su basal. Los marcadores inflamatorios están elevados, sin valores previos y con el tumor como causa concomitante, y tiene antecedente de colonización por enterobacteria productora de BLEE.</w:t>
-      </w:r>
-    </w:p>
-    <w:p>
-      <w:pPr>
-        <w:pStyle w:val="BodyJ"/>
-      </w:pPr>
-      <w:r>
-        <w:rPr>
-          <w:i/>
-          <w:iCs/>
-        </w:rPr>
-        <w:t xml:space="preserve">Hechos:</w:t>
-      </w:r>
-      <w:r>
-        <w:t xml:space="preserve"> recambio reciente de sonda; piuria y urocultivo positivo; afebril y estable; síntomas urinarios bajos no evaluables por el nivel lesional; reactantes elevados sin basal, con cáncer renal metastásico activo; colonización documentada por BLEE.</w:t>
-      </w:r>
-    </w:p>
-    <w:p>
-      <w:pPr>
-        <w:pStyle w:val="BodyJ"/>
-      </w:pPr>
-      <w:r>
-        <w:rPr>
-          <w:i/>
-          <w:iCs/>
-        </w:rPr>
-        <w:t xml:space="preserve">Inferencia:</w:t>
-      </w:r>
-      <w:r>
-        <w:t xml:space="preserve"> el cuadro es altamente compatible con una bacteriuria asociada a catéter por colonización crónica (favorecida por el arrastre del recambio) más que con una infección urinaria sintomática asociada a sonda. Por sí solas, ni la turbidez ni la piuria discriminan entre colonización e infección invasiva en pacientes sondados, y la elevación inflamatoria sistémica es explicable por su neoplasia de base.</w:t>
-      </w:r>
-    </w:p>
-    <w:p>
-      <w:pPr>
-        <w:pStyle w:val="BodyJ"/>
-      </w:pPr>
-      <w:r>
-        <w:rPr>
-          <w:i/>
-          <w:iCs/>
-        </w:rPr>
-        <w:t xml:space="preserve">Incertidumbre:</w:t>
-      </w:r>
-      <w:r>
-        <w:t xml:space="preserve"> la denervación medular enmascara la disuria y el dolor lumbar, por lo que persiste la duda de una infección incipiente con expresión clínica atípica.</w:t>
-      </w:r>
-    </w:p>
-    <w:p>
-      <w:pPr>
-        <w:pStyle w:val="BodyJ"/>
-      </w:pPr>
-      <w:r>
-        <w:rPr>
-          <w:i/>
-          <w:iCs/>
-        </w:rPr>
-        <w:t xml:space="preserve">Decisión:</w:t>
-      </w:r>
-      <w:r>
-        <w:t xml:space="preserve"> no iniciar tratamiento antibiótico empírico. Instaurar vigilancia clínica dirigida a signos equivalentes de respuesta sistémica o autonómica (fiebre nueva, inestabilidad hemodinámica, aumento súbito de espasticidad, sudoración o malestar general inexplicable). Aquí, el antecedente de germen BLEE no es un gatillo para prescribir antes, sino al revés. Como el tratamiento exigiría carbapenémicos, de alto impacto ecológico y toxicidad potencial, el umbral clínico para iniciar antibióticos debe ser más exigente.</w:t>
-      </w:r>
-    </w:p>
-    <w:p>
-      <w:pPr>
-        <w:pStyle w:val="BodyJ"/>
-      </w:pPr>
-      <w:r>
-        <w:rPr>
-          <w:i/>
-          <w:iCs/>
-        </w:rPr>
-        <w:t xml:space="preserve">Frase medular:</w:t>
-      </w:r>
-      <w:r>
-        <w:t xml:space="preserve"> «Urocultivo positivo y piuria tras recambio de sonda Foley en paciente con lesión medular y antecedente de colonización por BLEE, sin respuesta sistémica ni signos autonómicos que configuren infección activa. Se interpreta como bacteriuria asociada a catéter; vigilancia clínica estricta con criterios explícitos de reapertura.»</w:t>
+        <w:t xml:space="preserve">Enseñar representaciones, no sólo respuestas</w:t>
+      </w:r>
+    </w:p>
+    <w:p>
+      <w:pPr>
+        <w:pStyle w:val="BodyJ"/>
+      </w:pPr>
+      <w:r>
+        <w:t xml:space="preserve">En formación, pedir «el diagnóstico» prematuramente favorece la adivinación. Es más útil solicitar primero una representación del problema y preguntar qué datos fueron transformados en calificadores. Bowen y Eva han destacado la enseñanza explícita del razonamiento, mientras la teoría de illness scripts explica por qué el conocimiento debe organizarse alrededor de condiciones, mecanismos y consecuencias (Eva, 2005; Bowen, 2006).</w:t>
+      </w:r>
+    </w:p>
+    <w:p>
+      <w:pPr>
+        <w:pStyle w:val="BodyJ"/>
+      </w:pPr>
+      <w:r>
+        <w:t xml:space="preserve">El docente puede pedir al aprendiz que marque cada frase como hecho, inferencia o incertidumbre. Luego puede comparar la versión inicial con una formulación experta, no para imponer estilo, sino para mostrar qué relaciones fueron seleccionadas. El feedback debe ser específico: «presentaste la bacteriuria como infección», «omitiste que la imagen sólo excluye complicación actual», «tu plan no indica qué te haría cambiar». La devolución constructiva tiene técnica y tradición docente propia en nuestra lengua: describir conducta observable en lugar de juzgar a la persona, equilibrar lo logrado con lo corregible y terminar en un plan (Alves de Lima, 2008). Y la evaluación debe mirar lo mismo que la enseñanza. Premiar el diagnóstico correcto obtenido por un proceso frágil, y castigar el incorrecto con incertidumbre bien calibrada, enseña a ocultar dudas y a reconstruir narrativas retrospectivas. Pedir la confianza antes de conocer la respuesta, y el plan de revisión junto con el diagnóstico, corrige ese incentivo.</w:t>
       </w:r>
     </w:p>
     <w:p>
@@ -12340,105 +13103,23 @@
           <w:sz w:val="25"/>
           <w:szCs w:val="25"/>
         </w:rPr>
-        <w:t xml:space="preserve">Viñeta 3. Tres de la mañana: decidir con el reloj en contra</w:t>
-      </w:r>
-    </w:p>
-    <w:p>
-      <w:pPr>
-        <w:pStyle w:val="BodyJ"/>
-      </w:pPr>
-      <w:r>
-        <w:t xml:space="preserve">Servicio de urgencias, 03:10. Hombre de 54 años, tabáquico activo, consulta por dolor retroesternal opresivo de 40 minutos de evolución, acompañado de diaforesis fría. El electrocardiograma de ingreso muestra alteraciones inespecíficas de la repolarización, sin supradesnivel del ST. La primera troponina está en proceso en el laboratorio. En la sala de espera hay nueve pacientes pendientes de atención y queda un solo cupo en el box de reanimación. Bajo esta presión asistencial no hay margen para redactar una plantilla extensa, pero sí hay sesenta segundos para estructurar el juicio.</w:t>
-      </w:r>
-    </w:p>
-    <w:p>
-      <w:pPr>
-        <w:pStyle w:val="BodyJ"/>
-      </w:pPr>
-      <w:r>
-        <w:rPr>
-          <w:i/>
-          <w:iCs/>
-        </w:rPr>
-        <w:t xml:space="preserve">¿Qué vi y qué me contaron? (Hechos)</w:t>
-      </w:r>
-      <w:r>
-        <w:t xml:space="preserve"> Dolor torácico visceral opresivo con signos autonómicos objetivos (diaforesis fría presenciada en el triage) y un ECG inicial anormal aunque no diagnóstico.</w:t>
-      </w:r>
-    </w:p>
-    <w:p>
-      <w:pPr>
-        <w:pStyle w:val="BodyJ"/>
-      </w:pPr>
-      <w:r>
-        <w:rPr>
-          <w:i/>
-          <w:iCs/>
-        </w:rPr>
-        <w:t xml:space="preserve">¿Qué creo y cuánto derecho tengo a creerlo? (Inferencia)</w:t>
-      </w:r>
-      <w:r>
-        <w:t xml:space="preserve"> Síndrome coronario agudo (SCA) probable; la semiología isquémica típica y el perfil de riesgo tienen mayor peso pretest que un primer trazado electrocardiográfico no concluyente. Diagnóstico aún no demostrado.</w:t>
-      </w:r>
-    </w:p>
-    <w:p>
-      <w:pPr>
-        <w:pStyle w:val="BodyJ"/>
-      </w:pPr>
-      <w:r>
-        <w:rPr>
-          <w:i/>
-          <w:iCs/>
-        </w:rPr>
-        <w:t xml:space="preserve">¿Qué daño importante produciría si me equivoco? (Incertidumbre crítica)</w:t>
-      </w:r>
-      <w:r>
-        <w:t xml:space="preserve"> Rotularlo como «dolor torácico atípico con ECG sin isquemia aguda» y enviarlo a esperar la troponina en una silla de la sala común mientras cursa una oclusión coronaria dinámica. La incertidumbre peligrosa no es la etiqueta nominal; es la ventana de tiempo de miocardio salvable.</w:t>
-      </w:r>
-    </w:p>
-    <w:p>
-      <w:pPr>
-        <w:pStyle w:val="BodyJ"/>
-      </w:pPr>
-      <w:r>
-        <w:rPr>
-          <w:i/>
-          <w:iCs/>
-        </w:rPr>
-        <w:t xml:space="preserve">¿Qué hago ahora y qué me haría cambiar? (Decisión)</w:t>
-      </w:r>
-      <w:r>
-        <w:t xml:space="preserve"> Cama monitorizada, vía venosa, antiagregación inicial según protocolo, ECG seriado cada 15–30 minutos y rescate rápido de la troponina. Activar hemodinamia de inmediato si el trazado evoluciona a supradesnivel o si el dolor se vuelve refractario. Queda escrito: «SCA en evolución, no demostrado; manejo y monitorización continua por asimetría de consecuencias ante el riesgo vital de omisión».</w:t>
-      </w:r>
-    </w:p>
-    <w:p>
-      <w:pPr>
-        <w:pStyle w:val="BodyJ"/>
-      </w:pPr>
-      <w:r>
-        <w:rPr>
-          <w:i/>
-          <w:iCs/>
-        </w:rPr>
-        <w:t xml:space="preserve">Frase medular:</w:t>
-      </w:r>
-      <w:r>
-        <w:t xml:space="preserve"> «Dolor torácico de perfil anginoso con descarga adrenérgica y ECG inicial no concluyente: se maneja como SCA probable bajo monitorización continua, por asimetría de consecuencias, mientras la seriación electrocardiográfica y enzimática confirma o degrada la hipótesis.»</w:t>
-      </w:r>
-    </w:p>
-    <w:p>
-      <w:pPr>
-        <w:pStyle w:val="BodyJ"/>
-      </w:pPr>
-      <w:r>
-        <w:rPr>
-          <w:i/>
-          <w:iCs/>
-        </w:rPr>
-        <w:t xml:space="preserve">Lectura metacognitiva.</w:t>
-      </w:r>
-      <w:r>
-        <w:t xml:space="preserve"> En urgencias, el fallo catastrófico rara vez es intelectual: casi todo médico piensa en el infarto. Suele ser logístico y de diseño: la hipótesis correcta («probable SCA») sin un circuito cerrado de reevaluación. ¿Quién toma y quién mira el segundo ECG a los 15 minutos si el turno colapsa? Fijar el criterio de reapertura con plazo y responsable es la mitad del tratamiento.</w:t>
+        <w:t xml:space="preserve">Un debate honesto: ¿se puede enseñar a pensar mejor?</w:t>
+      </w:r>
+    </w:p>
+    <w:p>
+      <w:pPr>
+        <w:pStyle w:val="BodyJ"/>
+      </w:pPr>
+      <w:r>
+        <w:t xml:space="preserve">Este libro toma posición en una controversia real de la educación médica, y la declara. De un lado, Croskerry y su tradición sostienen que conocer los sesgos y entrenar estrategias de debiasing mejora el diagnóstico (Croskerry, 2003; Croskerry et al., 2013a, 2013b). Del otro, Norman, Monteiro y colegas han acumulado evidencia incómoda. La mayoría de los errores diagnósticos se asocia a déficits de conocimiento más que a fallas puras de proceso; los cursos de «pensamiento crítico» generalizable transfieren poco; y obligar a reflexionar sistemáticamente sobre casos fáciles no mejora la precisión y consume tiempo (Norman et al., 2017; Monteiro &amp; Norman, 2013; Monteiro et al., 2020).</w:t>
+      </w:r>
+    </w:p>
+    <w:p>
+      <w:pPr>
+        <w:pStyle w:val="BodyJ"/>
+      </w:pPr>
+      <w:r>
+        <w:t xml:space="preserve">La posición es intermedia, pero no equidistante. Con los escépticos: no existe una habilidad general de «pensar bien» que flote por encima del conocimiento; la representación rica del problema —illness scripts, experiencia con feedback— es la condición de todo lo demás, y ningún método, HII-D incluido, compensa no saber medicina. Contra el escepticismo total: de esa evidencia no se sigue que la única intervención posible sea enseñar más contenido. Lo que se propone aquí no es vigilancia interna permanente ni listas universales, las versiones que la evidencia ha desinflado, sino artefactos externos y selectivos. Un lenguaje que obliga a graduar afirmaciones; una estructura de nota que conserva las capas; pausas activadas por disparadores definidos; circuitos de feedback que conviertan experiencia en calibración. Es una apuesta con compromisos observables (véase el capítulo 15): si estas herramientas no cambian conductas medibles, deben abandonarse como cualquier hipótesis mimada. Entre tanto, la controversia se enseña mejor de lo que se oculta: un residente que conoce el debate sabrá desconfiar por igual del catálogo de sesgos como solución universal y del nihilismo pedagógico como coartada.</w:t>
       </w:r>
     </w:p>
     <w:p>
@@ -12455,105 +13136,23 @@
           <w:sz w:val="25"/>
           <w:szCs w:val="25"/>
         </w:rPr>
-        <w:t xml:space="preserve">Viñeta 4. La consulta ambulatoria y el chequeo reciente</w:t>
-      </w:r>
-    </w:p>
-    <w:p>
-      <w:pPr>
-        <w:pStyle w:val="BodyJ"/>
-      </w:pPr>
-      <w:r>
-        <w:t xml:space="preserve">Policlínico de atención primaria. Mujer de 47 años consulta por fatiga persistente de tres meses de evolución. Acude con exámenes de sangre «normales de hace poquito»: un hemograma y un perfil bioquímico tomados hace cinco meses en un chequeo preventivo, dos meses antes de que comenzara el cansancio. Al interrogatorio dirigido agrega sudoración nocturna ocasional —que ella atribuye al inicio de la menopausia— y una baja de peso involuntaria de unos tres kilos que explica «porque he tenido menos apetito». La agenda médica está copada, con bloques de doce minutos por paciente.</w:t>
-      </w:r>
-    </w:p>
-    <w:p>
-      <w:pPr>
-        <w:pStyle w:val="BodyJ"/>
-      </w:pPr>
-      <w:r>
-        <w:rPr>
-          <w:i/>
-          <w:iCs/>
-        </w:rPr>
-        <w:t xml:space="preserve">Hechos:</w:t>
-      </w:r>
-      <w:r>
-        <w:t xml:space="preserve"> fatiga progresiva de tres meses (relato consistente); exámenes de laboratorio normales cuya fecha precede en dos meses al inicio del síntoma; sudoración nocturna y baja ponderal referidas con atribuciones benignas propuestas por la propia paciente. Examen físico segmentario de hoy sin adenopatías periféricas ni visceromegalias palpables, en una exploración acotada por el tiempo de consulta.</w:t>
-      </w:r>
-    </w:p>
-    <w:p>
-      <w:pPr>
-        <w:pStyle w:val="BodyJ"/>
-      </w:pPr>
-      <w:r>
-        <w:rPr>
-          <w:i/>
-          <w:iCs/>
-        </w:rPr>
-        <w:t xml:space="preserve">Inferencia:</w:t>
-      </w:r>
-      <w:r>
-        <w:t xml:space="preserve"> por prevalencia, la mayoría de las fatigas en atención primaria son funcionales, carenciales o adaptativas. Pero fatiga prolongada, sudoración nocturna y baja de peso configuran un síndrome constitucional que impide el cierre diagnóstico. Los exámenes que trae la paciente no descartan patología orgánica actual por una razón temporal simple: fueron tomados cuando la enfermedad aún no se manifestaba.</w:t>
-      </w:r>
-    </w:p>
-    <w:p>
-      <w:pPr>
-        <w:pStyle w:val="BodyJ"/>
-      </w:pPr>
-      <w:r>
-        <w:rPr>
-          <w:i/>
-          <w:iCs/>
-        </w:rPr>
-        <w:t xml:space="preserve">Incertidumbre:</w:t>
-      </w:r>
-      <w:r>
-        <w:t xml:space="preserve"> la duda relevante hoy no es determinar la etiología exacta en doce minutos, sino responder si subyace un proceso sistémico, inflamatorio o neoplásico en curso. Esa incertidumbre no se reduce alargando la entrevista de hoy, sino actualizando el laboratorio y utilizando el seguimiento longitudinal.</w:t>
-      </w:r>
-    </w:p>
-    <w:p>
-      <w:pPr>
-        <w:pStyle w:val="BodyJ"/>
-      </w:pPr>
-      <w:r>
-        <w:rPr>
-          <w:i/>
-          <w:iCs/>
-        </w:rPr>
-        <w:t xml:space="preserve">Decisión:</w:t>
-      </w:r>
-      <w:r>
-        <w:t xml:space="preserve"> estudio actualizado dirigido (hemograma con frotis, VHS, PCR, TSH, glicemia, perfil hepático y renal, LDH) y control presencial en dos semanas con la misma médica. Red de seguridad por escrito (safety-netting): adelantar la consulta si aparece fiebre cuantificada, aumento de volumen ganglionar, dolor óseo localizado o progresión de la baja de peso.</w:t>
-      </w:r>
-    </w:p>
-    <w:p>
-      <w:pPr>
-        <w:pStyle w:val="BodyJ"/>
-      </w:pPr>
-      <w:r>
-        <w:rPr>
-          <w:i/>
-          <w:iCs/>
-        </w:rPr>
-        <w:t xml:space="preserve">Frase medular:</w:t>
-      </w:r>
-      <w:r>
-        <w:t xml:space="preserve"> «Fatiga de tres meses asociada a sudoración nocturna y baja ponderal leve; dado que el laboratorio normal previo antecede al inicio de los síntomas y no cubre el período actual, se solicita estudio actualizado y se programa control longitudinal con pauta escrita de signos de alarma.»</w:t>
-      </w:r>
-    </w:p>
-    <w:p>
-      <w:pPr>
-        <w:pStyle w:val="BodyJ"/>
-      </w:pPr>
-      <w:r>
-        <w:rPr>
-          <w:i/>
-          <w:iCs/>
-        </w:rPr>
-        <w:t xml:space="preserve">Lectura metacognitiva.</w:t>
-      </w:r>
-      <w:r>
-        <w:t xml:space="preserve"> Evidencia caducada: «tiene exámenes normales recientes» es un hecho cierto cuya fecha lo vuelve irrelevante para el problema nuevo. Y el tiempo longitudinal, la ventaja comparativa de la atención primaria, sólo es una herramienta diagnóstica cuando tiene fecha de reevaluación y criterios de reconsulta; sin ese diseño, dejar pasar el tiempo es apostar a que el cuadro sea benigno.</w:t>
+        <w:t xml:space="preserve">Visitas de sala y entregas de turno</w:t>
+      </w:r>
+    </w:p>
+    <w:p>
+      <w:pPr>
+        <w:pStyle w:val="BodyJ"/>
+      </w:pPr>
+      <w:r>
+        <w:t xml:space="preserve">Las tres palancas prometidas al inicio son, por orden de costo, la visita, la revisión de errores y la ficha. Una visita de sala puede incorporar una pausa breve en casos seleccionados, y no hace falta inventarle preguntas: las cuatro de la versión de sesenta segundos (capítulo 15) bastan, y el Apéndice C dice con qué disparadores instalarlas, en cuántas semanas y qué medir. Lo que este capítulo aporta es el porqué: la pausa en voz alta es el único momento en que el equipo entero mira la misma representación del problema, y quien dirige la visita la enseña modelándola, no interrogando.</w:t>
+      </w:r>
+    </w:p>
+    <w:p>
+      <w:pPr>
+        <w:pStyle w:val="BodyJ"/>
+      </w:pPr>
+      <w:r>
+        <w:t xml:space="preserve">La entrega de turno debe transmitir tareas epistémicas, no sólo tratamientos. «Pendiente observar si…» y «si ocurre X, reabrir Y» son componentes de seguridad.</w:t>
       </w:r>
     </w:p>
     <w:p>
@@ -12570,105 +13169,23 @@
           <w:sz w:val="25"/>
           <w:szCs w:val="25"/>
         </w:rPr>
-        <w:t xml:space="preserve">Viñeta 5. Pronóstico incierto al final de la vida</w:t>
-      </w:r>
-    </w:p>
-    <w:p>
-      <w:pPr>
-        <w:pStyle w:val="BodyJ"/>
-      </w:pPr>
-      <w:r>
-        <w:t xml:space="preserve">Hombre de 78 años con adenocarcinoma de páncreas metastásico en progresión tras tres líneas de quimioterapia. Ingresa al servicio de medicina interna por un deterioro funcional acelerado en las últimas tres semanas —pasó de caminar con apoyo dentro de su casa a permanecer postrado en cama—, sumado a una neumonía aguda hipoxémica. En el pasillo, la familia pregunta angustiada cuánto tiempo de vida le queda. Una de las hijas exige «que se le haga todo lo necesario para sacarlo adelante». Oncología anota en su interconsulta que, superado el cuadro infeccioso, «eventualmente podría evaluarse una ventana para una cuarta línea paliativa». El paciente, durante sus períodos de lucidez, repite que se siente profundamente agotado.</w:t>
-      </w:r>
-    </w:p>
-    <w:p>
-      <w:pPr>
-        <w:pStyle w:val="BodyJ"/>
-      </w:pPr>
-      <w:r>
-        <w:rPr>
-          <w:i/>
-          <w:iCs/>
-        </w:rPr>
-        <w:t xml:space="preserve">Hechos:</w:t>
-      </w:r>
-      <w:r>
-        <w:t xml:space="preserve"> neoplasia pancreática metastásica con progresión documentada bajo tercera línea oncológica; declive funcional severo y rápido en las últimas semanas (objetivable con una escala de fragilidad y de desempeño); neumonía bacteriana aguda superpuesta; manifestación reiterada de cansancio vital por parte del paciente en al menos dos entrevistas clínicas lúcidas.</w:t>
-      </w:r>
-    </w:p>
-    <w:p>
-      <w:pPr>
-        <w:pStyle w:val="BodyJ"/>
-      </w:pPr>
-      <w:r>
-        <w:rPr>
-          <w:i/>
-          <w:iCs/>
-        </w:rPr>
-        <w:t xml:space="preserve">Inferencia:</w:t>
-      </w:r>
-      <w:r>
-        <w:t xml:space="preserve"> la neumonía es tratable en lo inmediato. La pendiente funcional previa indica, en cambio, una trayectoria irreversible de final de vida, con una sobrevida estimable en semanas a pocos meses. En ese escenario, «podría haber ventana para otra línea» no es una expectativa fundada en la evolución real, sino la mención abstracta de un fármaco disponible.</w:t>
-      </w:r>
-    </w:p>
-    <w:p>
-      <w:pPr>
-        <w:pStyle w:val="BodyJ"/>
-      </w:pPr>
-      <w:r>
-        <w:rPr>
-          <w:i/>
-          <w:iCs/>
-        </w:rPr>
-        <w:t xml:space="preserve">Incertidumbre:</w:t>
-      </w:r>
-      <w:r>
-        <w:t xml:space="preserve"> el plazo exacto es incognoscible (incertidumbre aleatoria irreductible); lo honesto es comunicar la dirección de la pendiente y los escenarios probables. Pero la incertidumbre que domina el caso no es pronóstica sino de metas: ¿cómo quiere vivir este hombre el tiempo que le queda y qué cargas terapéuticas está dispuesto a tolerar?</w:t>
-      </w:r>
-    </w:p>
-    <w:p>
-      <w:pPr>
-        <w:pStyle w:val="BodyJ"/>
-      </w:pPr>
-      <w:r>
-        <w:rPr>
-          <w:i/>
-          <w:iCs/>
-        </w:rPr>
-        <w:t xml:space="preserve">Decisión:</w:t>
-      </w:r>
-      <w:r>
-        <w:t xml:space="preserve"> antibióticos endovenosos y oxigenoterapia no invasiva con un objetivo explícito de alivio sintomático y eventual retorno a su casa (medidas reversibles y proporcionadas). Suspender la discusión sobre nuevas quimioterapias. Reunión familiar estructurada para alinear el plan con la voluntad del paciente. Reevaluación a las 72 horas según respuesta funcional y confort.</w:t>
-      </w:r>
-    </w:p>
-    <w:p>
-      <w:pPr>
-        <w:pStyle w:val="BodyJ"/>
-      </w:pPr>
-      <w:r>
-        <w:rPr>
-          <w:i/>
-          <w:iCs/>
-        </w:rPr>
-        <w:t xml:space="preserve">Frase medular:</w:t>
-      </w:r>
-      <w:r>
-        <w:t xml:space="preserve"> «Neumonía aguda potencialmente reversible en paciente con cáncer de páncreas metastásico refractario y declive funcional acelerado hacia el final de la vida. Se trata la parte reversible con metas de alivio, se comunica la trayectoria sin fingir exactitud de plazos y las medidas invasivas se subordinan a las preferencias del enfermo.»</w:t>
-      </w:r>
-    </w:p>
-    <w:p>
-      <w:pPr>
-        <w:pStyle w:val="BodyJ"/>
-      </w:pPr>
-      <w:r>
-        <w:rPr>
-          <w:i/>
-          <w:iCs/>
-        </w:rPr>
-        <w:t xml:space="preserve">Lectura metacognitiva.</w:t>
-      </w:r>
-      <w:r>
-        <w:t xml:space="preserve"> La pregunta «¿cuánto tiempo le queda?» tienta a dos respuestas simétricas y malas: una cifra inventada (certeza retórica) o un «eso sólo Dios lo sabe» que desorienta a la familia (abandono comunicacional). Y el caso expone la confusión cotidiana entre lo técnicamente factible —una cuarta línea, intubar— y lo clínicamente proporcionado: el juicio de proporcionalidad del capítulo 10 empieza por reconocer el declive basal como un hecho clínico duro.</w:t>
+        <w:t xml:space="preserve">Conferencias de aprendizaje</w:t>
+      </w:r>
+    </w:p>
+    <w:p>
+      <w:pPr>
+        <w:pStyle w:val="BodyJ"/>
+      </w:pPr>
+      <w:r>
+        <w:t xml:space="preserve">La morbimortalidad tradicional puede centrarse en quién se equivocó o en una secuencia factual sin análisis cognitivo. Una revisión más útil reconstruye la evolución de la representación: qué se pensó en cada punto, qué señales estaban disponibles, qué información faltó, qué condiciones favorecieron la inercia y qué barrera podría permitir corrección futura. La viñeta 6 del cuaderno de casos es un ejemplo del formato: capas, oportunidades y barreras, sin moralismo retrospectivo.</w:t>
+      </w:r>
+    </w:p>
+    <w:p>
+      <w:pPr>
+        <w:pStyle w:val="BodyJ"/>
+      </w:pPr>
+      <w:r>
+        <w:t xml:space="preserve">Debe evitarse el hindsight bias. El desenlace no convierte automáticamente en obvia una alternativa que tenía baja probabilidad inicial. El aprendizaje surge al identificar oportunidades razonables de actualización, no al exigir omnisciencia retrospectiva.</w:t>
       </w:r>
     </w:p>
     <w:p>
@@ -12685,162 +13202,23 @@
           <w:sz w:val="25"/>
           <w:szCs w:val="25"/>
         </w:rPr>
-        <w:t xml:space="preserve">Viñeta 6. Anatomía de un error consumado</w:t>
-      </w:r>
-    </w:p>
-    <w:p>
-      <w:pPr>
-        <w:pStyle w:val="BodyJ"/>
-      </w:pPr>
-      <w:r>
-        <w:t xml:space="preserve">Esta viñeta reconstruye un error completo con la disciplina de los capítulos 7 y 8. Sin pegar la etiqueta de un sesgo, y sin dejar que el desenlace conocido distorsione lo que era exigible saber en el momento de la consulta.</w:t>
-      </w:r>
-    </w:p>
-    <w:p>
-      <w:pPr>
-        <w:pStyle w:val="BodyJ"/>
-      </w:pPr>
-      <w:r>
-        <w:rPr>
-          <w:i/>
-          <w:iCs/>
-        </w:rPr>
-        <w:t xml:space="preserve">El caso.</w:t>
-      </w:r>
-      <w:r>
-        <w:t xml:space="preserve"> Mujer de 29 años consulta en urgencias a las 23:40 por disnea de inicio súbito hace dos horas, palpitaciones y «sensación inminente de que me voy a morir». Registra antecedente de trastorno de pánico en control; la hoja de categorización del triage anota: «paciente ansiosa, cursa crisis de pánico conocida». Sus signos vitales de ingreso muestran frecuencia cardiaca de 118 lpm, presión arterial normal, saturación de oxígeno de 94% ambiental y auscultación cardiopulmonar descrita como «sin hallazgos patológicos». La evolución médica consigna: «Crisis de pánico en paciente con antecedente conocido. Se administra lorazepam sublingual, cede angustia. Alta con indicación de control en salud mental». A las 36 horas reingresa al reanimador traída por su pareja tras sufrir un síncope en el baño: el angioTAC confirma un tromboembolismo pulmonar (TEP) bilateral masivo con disfunción ventricular derecha aguda. Sobrevive tras trombólisis sistémica.</w:t>
-      </w:r>
-    </w:p>
-    <w:p>
-      <w:pPr>
-        <w:pStyle w:val="BodyJ"/>
-      </w:pPr>
-      <w:r>
-        <w:rPr>
-          <w:i/>
-          <w:iCs/>
-        </w:rPr>
-        <w:t xml:space="preserve">Reconstrucción epistémica por capas.</w:t>
-      </w:r>
-    </w:p>
-    <w:p>
-      <w:pPr>
-        <w:pStyle w:val="BodyJ"/>
-      </w:pPr>
-      <w:r>
-        <w:rPr>
-          <w:b/>
-          <w:bCs/>
-        </w:rPr>
-        <w:t xml:space="preserve">Hechos disponibles la primera noche:</w:t>
-      </w:r>
-      <w:r>
-        <w:t xml:space="preserve"> disnea de instalación brusca con hora de inicio precisa (relato consistente). Taquicardia sinusal de 118 lpm al ingreso, que persistía en 112 lpm en el control de enfermería previo al alta, una hora después del lorazepam y con la paciente ya tranquila. Dato medido, registrado en la hoja de signos vitales y omitido en la nota médica. Saturación de 94% a aire ambiental, que alguien en el turno minimizó como «esperable porque está hiperventilando»; la hiperventilación por ansiedad eleva la presión arterial de oxígeno y lleva la saturación hacia 99–100%, nunca la baja a 94%. Uso de anticonceptivos orales combinados y un viaje interurbano en bus de nueve horas tres días antes: dos factores protrombóticos presentes en la historia reciente, que nadie interrogó porque nunca se abrió una hipótesis vascular. Y una etiqueta heredada desde la admisión («crisis de pánico conocida»), que entró a la ficha médica con rango de diagnóstico antes de que el clínico pusiera el fonendoscopio sobre el tórax.</w:t>
-      </w:r>
-    </w:p>
-    <w:p>
-      <w:pPr>
-        <w:pStyle w:val="BodyJ"/>
-      </w:pPr>
-      <w:r>
-        <w:rPr>
-          <w:b/>
-          <w:bCs/>
-        </w:rPr>
-        <w:t xml:space="preserve">Inferencia de la primera noche:</w:t>
-      </w:r>
-      <w:r>
-        <w:t xml:space="preserve"> «crisis de pánico» fue redactada como un hecho consumado, cuando su fuerza epistémica real era apenas la de una hipótesis posible, sustentada únicamente en el antecedente psiquiátrico y la similitud superficial del relato.</w:t>
-      </w:r>
-    </w:p>
-    <w:p>
-      <w:pPr>
-        <w:pStyle w:val="BodyJ"/>
-      </w:pPr>
-      <w:r>
-        <w:rPr>
-          <w:b/>
-          <w:bCs/>
-        </w:rPr>
-        <w:t xml:space="preserve">Incertidumbre nunca formulada:</w:t>
-      </w:r>
-      <w:r>
-        <w:t xml:space="preserve"> ¿qué proceso fisiopatológico explica que una mujer de 29 años mantenga una frecuencia cardiaca de 112 lpm estando ya sedada y sin angustia, junto con una saturación de 94% que contradice una hiperventilación psicógena? Para este escenario exacto se diseñaron y validaron los criterios PERC (Pulmonary Embolism Rule-out Criteria): ocho variables que permiten excluir razonablemente un TEP sin dímero-D, sólo cuando un paciente de baja sospecha no cumple ninguna (Kline et al., 2004). Esta paciente incumplía tres: frecuencia cardiaca ≥100 lpm, saturación &lt;95% y uso de estrógenos. La regla no falló esa noche; nunca fue convocada, porque el cierre prematuro impidió sospechar que había algo que descartar.</w:t>
-      </w:r>
-    </w:p>
-    <w:p>
-      <w:pPr>
-        <w:pStyle w:val="BodyJ"/>
-      </w:pPr>
-      <w:r>
-        <w:rPr>
-          <w:b/>
-          <w:bCs/>
-        </w:rPr>
-        <w:t xml:space="preserve">Decisión de la primera noche:</w:t>
-      </w:r>
-      <w:r>
-        <w:t xml:space="preserve"> la benzodiacepina era defendible como tratamiento sintomático inicial. El alta sin estudio adicional y sin una línea de signos de alarma —qué debía hacerla volver antes del «control en salud mental»— fue un cierre indefendible.</w:t>
-      </w:r>
-    </w:p>
-    <w:p>
-      <w:pPr>
-        <w:pStyle w:val="BodyJ"/>
-      </w:pPr>
-      <w:r>
-        <w:rPr>
-          <w:i/>
-          <w:iCs/>
-        </w:rPr>
-        <w:t xml:space="preserve">Dónde estuvo el punto de intercepción.</w:t>
-      </w:r>
-      <w:r>
-        <w:t xml:space="preserve"> En la lectura de los signos vitales previos al egreso. Una taquicardia persistente de 112 lpm en una paciente que ya no luce angustiada era la gran discordancia de la madrugada. Si la hipótesis del pánico hubiese sido verdadera, el control de la ansiedad debía normalizar la descarga simpática y bajar el pulso. La pregunta de desaceleración antes de firmar el alta —«¿qué dato objetivo de esta paciente no explica una crisis de pánico?»— tenía en ese minuto su máximo rendimiento y su mínimo costo. Habrían bastado dos preguntas de anamnesis dirigida, la regla PERC al lado de la camilla y un dímero-D. Treinta y seis horas más tarde, la pregunta no formulada la respondió el síncope.</w:t>
-      </w:r>
-    </w:p>
-    <w:p>
-      <w:pPr>
-        <w:pStyle w:val="BodyJ"/>
-      </w:pPr>
-      <w:r>
-        <w:rPr>
-          <w:i/>
-          <w:iCs/>
-        </w:rPr>
-        <w:t xml:space="preserve">Lo que no debe concluirse.</w:t>
-      </w:r>
-      <w:r>
-        <w:t xml:space="preserve"> El desenlace no demuestra que toda disnea en una paciente con trastorno de pánico sea una embolia, ni que el médico fuera incompetente: con la información de la primera noche, la crisis de pánico era la explicación más frecuente. Lo indefendible era la arquitectura: una etiqueta de triage convertida en diagnóstico antes del examen, un dato medido —la taquicardia persistente— registrado sin que nadie le pidiera explicación, dos preguntas de anamnesis que la etiqueta volvió innecesarias y un alta sin condición de reapertura. El mismo proceso con desenlace benigno —una crisis de pánico real— habría dejado la misma vulnerabilidad instalada para la siguiente paciente a la que se le cree menos por su diagnóstico.</w:t>
-      </w:r>
-    </w:p>
-    <w:p>
-      <w:pPr>
-        <w:pStyle w:val="BodyJ"/>
-      </w:pPr>
-      <w:r>
-        <w:rPr>
-          <w:i/>
-          <w:iCs/>
-        </w:rPr>
-        <w:t xml:space="preserve">Frase medular (la que faltó la primera noche):</w:t>
-      </w:r>
-      <w:r>
-        <w:t xml:space="preserve"> «Disnea súbita y taquicardia persistente (112 tras ansiolisis) en mujer de 29 años con trastorno de pánico y anticonceptivos orales: crisis de pánico posible, pero la taquicardia y la saturación de 94% no están explicadas. PERC no cumplido (frecuencia cardiaca, saturación, estrógenos): no procede el alta sin estudiar embolia pulmonar. Dímero-D ahora; angioTAC si resulta elevado o la probabilidad clínica es intermedia. Reconsulta inmediata, por escrito, ante síncope, dolor torácico o disnea en reposo.»</w:t>
-      </w:r>
-    </w:p>
-    <w:p>
-      <w:pPr>
-        <w:pStyle w:val="BodyJ"/>
-      </w:pPr>
-      <w:r>
-        <w:rPr>
-          <w:i/>
-          <w:iCs/>
-        </w:rPr>
-        <w:t xml:space="preserve">Lectura metacognitiva.</w:t>
-      </w:r>
-      <w:r>
-        <w:t xml:space="preserve"> La frase que faltó no requería más conocimiento del que cualquier médico de urgencias ya tiene: requería que el antecedente psiquiátrico no descontara el valor de dos signos medidos. Esta viñeta es el capítulo 14 en su forma más silenciosa: la injusticia testimonial no le dijo a la paciente que no le creía; simplemente dejó de preguntar. Y es también el capítulo 10: la regla PERC es un umbral explícito, y los umbrales explícitos sólo protegen a quien recuerda que hay una hipótesis que someterles. La disciplina de escritura habría bastado: separar el hecho (taquicardia persistente no explicada) de la etiqueta (pánico), conservar la incertidumbre y programar la reapertura.</w:t>
+        <w:t xml:space="preserve">Feedback diagnóstico</w:t>
+      </w:r>
+    </w:p>
+    <w:p>
+      <w:pPr>
+        <w:pStyle w:val="BodyJ"/>
+      </w:pPr>
+      <w:r>
+        <w:t xml:space="preserve">Los médicos necesitan saber qué ocurrió con pacientes derivados, dados de alta o transferidos. Sistemas simples pueden devolver diagnósticos finales, resultados discrepantes, reconsultas y cambios terapéuticos. La calibración requiere series, no recuerdos aislados.</w:t>
+      </w:r>
+    </w:p>
+    <w:p>
+      <w:pPr>
+        <w:pStyle w:val="BodyJ"/>
+      </w:pPr>
+      <w:r>
+        <w:t xml:space="preserve">Un portafolio privado puede registrar: hipótesis principal, confianza aproximada, alternativa relevante, desenlace y aprendizaje. No busca puntuar moralmente; busca detectar patrones: sobreconfianza en un dominio, subestimación de recurrencias, tendencia a tratar cultivos sin síndrome o dificultad para reconocer diagnósticos funcionales. El Taller 5 es su versión mínima. El portafolio como instrumento docente tiene además desarrollo propio en la educación médica latinoamericana, incluida la validación en español de instrumentos para evaluar su uso (Riquelme et al., 2011).</w:t>
       </w:r>
     </w:p>
     <w:p>
@@ -12857,105 +13235,23 @@
           <w:sz w:val="25"/>
           <w:szCs w:val="25"/>
         </w:rPr>
-        <w:t xml:space="preserve">Viñeta 7. «Lo veo raro»: el testimonio de la madre</w:t>
-      </w:r>
-    </w:p>
-    <w:p>
-      <w:pPr>
-        <w:pStyle w:val="BodyJ"/>
-      </w:pPr>
-      <w:r>
-        <w:t xml:space="preserve">Un lactante de cinco meses llega a urgencias a las 22:30. Afebril tras paracetamol en casa, signos vitales dentro de rangos para la edad, examen segmentario sin foco. La madre insiste: «No es él. No se ríe, no me busca, está como apagado». La sala está llena y el registro de triage dice «lactante febril en buenas condiciones generales».</w:t>
-      </w:r>
-    </w:p>
-    <w:p>
-      <w:pPr>
-        <w:pStyle w:val="BodyJ"/>
-      </w:pPr>
-      <w:r>
-        <w:rPr>
-          <w:i/>
-          <w:iCs/>
-        </w:rPr>
-        <w:t xml:space="preserve">Hechos:</w:t>
-      </w:r>
-      <w:r>
-        <w:t xml:space="preserve"> temperatura normalizada bajo antipirético (dato medido, pero bajo intervención); examen sin foco en una evaluación puntual; y un relato de tercero que describe un cambio conductual respecto del basal — información longitudinal a la que ningún examen de veinte minutos accede.</w:t>
-      </w:r>
-    </w:p>
-    <w:p>
-      <w:pPr>
-        <w:pStyle w:val="BodyJ"/>
-      </w:pPr>
-      <w:r>
-        <w:rPr>
-          <w:i/>
-          <w:iCs/>
-        </w:rPr>
-        <w:t xml:space="preserve">Inferencia:</w:t>
-      </w:r>
-      <w:r>
-        <w:t xml:space="preserve"> cuadro viral banal es lo más probable por prevalencia. Pero la preocupación parental por «no ser él mismo» no es ruido afectivo, sino una observación experta sobre el único basal disponible, y la evidencia le da rango de señal. En series de atención primaria, la intuición del clínico de que «algo anda mal», muchas veces gatillada por la inquietud de los padres, tuvo mayor valor diagnóstico que la mayoría de los signos aislados para detectar infección grave (Van den Bruel et al., 2012).</w:t>
-      </w:r>
-    </w:p>
-    <w:p>
-      <w:pPr>
-        <w:pStyle w:val="BodyJ"/>
-      </w:pPr>
-      <w:r>
-        <w:rPr>
-          <w:i/>
-          <w:iCs/>
-        </w:rPr>
-        <w:t xml:space="preserve">Incertidumbre:</w:t>
-      </w:r>
-      <w:r>
-        <w:t xml:space="preserve"> la peligrosa es una sola: infección bacteriana grave en fase temprana, cuando el examen todavía no la muestra. Reducible sólo parcialmente con laboratorio; la evolución de las próximas horas es la mejor prueba disponible.</w:t>
-      </w:r>
-    </w:p>
-    <w:p>
-      <w:pPr>
-        <w:pStyle w:val="BodyJ"/>
-      </w:pPr>
-      <w:r>
-        <w:rPr>
-          <w:i/>
-          <w:iCs/>
-        </w:rPr>
-        <w:t xml:space="preserve">Decisión:</w:t>
-      </w:r>
-      <w:r>
-        <w:t xml:space="preserve"> el dato que gobierna la conducta no es la temperatura sino el cambio de comportamiento reportado. Observación prolongada en urgencias con reevaluación seriada del estado general, umbral bajo para laboratorio, y —si se decide alta— red de seguridad explícita y verificada con la madre: qué mirar, cuándo volver, por qué vía. «Se va tranquila» no es un criterio de alta; «sabe exactamente qué la haría volver» sí.</w:t>
-      </w:r>
-    </w:p>
-    <w:p>
-      <w:pPr>
-        <w:pStyle w:val="BodyJ"/>
-      </w:pPr>
-      <w:r>
-        <w:rPr>
-          <w:i/>
-          <w:iCs/>
-        </w:rPr>
-        <w:t xml:space="preserve">Frase medular:</w:t>
-      </w:r>
-      <w:r>
-        <w:t xml:space="preserve"> «Lactante afebril bajo antipiréticos y sin foco al examen, con cambio conductual significativo según su madre; el testimonio del cuidador se registra como observación del basal y gobierna la vigilancia: reevaluación seriada antes de decidir alta, con red de seguridad verificada.»</w:t>
-      </w:r>
-    </w:p>
-    <w:p>
-      <w:pPr>
-        <w:pStyle w:val="BodyJ"/>
-      </w:pPr>
-      <w:r>
-        <w:rPr>
-          <w:i/>
-          <w:iCs/>
-        </w:rPr>
-        <w:t xml:space="preserve">Lectura metacognitiva.</w:t>
-      </w:r>
-      <w:r>
-        <w:t xml:space="preserve"> La pediatría radicaliza el capítulo 1: el paciente no habla, y el «hecho» más valioso es un testimonio de tercero sobre un basal que el equipo no conoce. Descartar la preocupación materna como ansiedad es injusticia testimonial en versión pediátrica — y además, simplemente, mala medicina: pocas fuentes de información tienen mejor razón señal-ruido que quien mira a ese niño todos los días.</w:t>
+        <w:t xml:space="preserve">Lenguaje institucional</w:t>
+      </w:r>
+    </w:p>
+    <w:p>
+      <w:pPr>
+        <w:pStyle w:val="BodyJ"/>
+      </w:pPr>
+      <w:r>
+        <w:t xml:space="preserve">La tercera palanca es la ficha, y su primera forma es la plantilla. Las plantillas de ficha pueden apoyar o degradar el pensamiento. Campos obligatorios interminables producen copia; campos demasiado libres ocultan información crítica. Una plantilla equilibrada incluye problema, hechos nuevos, evaluación con grado de certeza, plan y criterios de reevaluación. La tecnología debería facilitar comparación temporal y procedencia de datos, no sólo acumular texto.</w:t>
+      </w:r>
+    </w:p>
+    <w:p>
+      <w:pPr>
+        <w:pStyle w:val="BodyJ"/>
+      </w:pPr>
+      <w:r>
+        <w:t xml:space="preserve">La cultura importa. Un residente debe poder decir «no entiendo este dato» sin perder legitimidad; una enfermera debe poder señalar que la evolución no coincide con el diagnóstico; un especialista debe explicitar límites; un jefe debe corregirse en público. La revisabilidad se aprende por modelamiento.</w:t>
       </w:r>
     </w:p>
     <w:p>
@@ -12972,105 +13268,172 @@
           <w:sz w:val="25"/>
           <w:szCs w:val="25"/>
         </w:rPr>
-        <w:t xml:space="preserve">Viñeta 8. El dolor abdominal de la paciente que «somatiza»</w:t>
-      </w:r>
-    </w:p>
-    <w:p>
-      <w:pPr>
-        <w:pStyle w:val="BodyJ"/>
-      </w:pPr>
-      <w:r>
-        <w:t xml:space="preserve">Una mujer de 34 años con esquizofrenia en tratamiento consulta por dolor abdominal de dos días. En el box, habla poco y evita la mirada; la nota de derivación dice «consultas frecuentes, quejas somáticas múltiples». Taquicardia de 110, abdomen difícil de evaluar — la paciente tolera mal la palpación y su tratamiento antipsicótico puede atenuar la expresión del dolor y enlentecer el tránsito.</w:t>
-      </w:r>
-    </w:p>
-    <w:p>
-      <w:pPr>
-        <w:pStyle w:val="BodyJ"/>
-      </w:pPr>
-      <w:r>
-        <w:rPr>
-          <w:i/>
-          <w:iCs/>
-        </w:rPr>
-        <w:t xml:space="preserve">Hechos:</w:t>
-      </w:r>
-      <w:r>
-        <w:t xml:space="preserve"> taquicardia sostenida (medida, reproducible); dos días de dolor según relato coherente en sus términos; examen abdominal técnicamente limitado —no negativo: limitado—; antecedente psiquiátrico que modifica la expresión clínica y farmacológica del cuadro; una etiqueta heredada («somatiza») sin procedencia verificable.</w:t>
-      </w:r>
-    </w:p>
-    <w:p>
-      <w:pPr>
-        <w:pStyle w:val="BodyJ"/>
-      </w:pPr>
-      <w:r>
-        <w:rPr>
-          <w:i/>
-          <w:iCs/>
-        </w:rPr>
-        <w:t xml:space="preserve">Inferencia:</w:t>
-      </w:r>
-      <w:r>
-        <w:t xml:space="preserve"> la explicación «queja somática en contexto de patología psiquiátrica» es posible, pero está recibiendo un peso que no proviene de los datos de hoy sino del estigma: nada en la taquicardia es psiquiátrico. El fenómeno tiene nombre —ensombrecimiento diagnóstico: atribuir los síntomas físicos a la enfermedad mental— y consecuencias medibles: las personas con enfermedad mental grave mueren 15 a 20 años antes, en gran parte por enfermedad física subdiagnosticada y subtratada (Thornicroft, 2011).</w:t>
-      </w:r>
-    </w:p>
-    <w:p>
-      <w:pPr>
-        <w:pStyle w:val="BodyJ"/>
-      </w:pPr>
-      <w:r>
-        <w:rPr>
-          <w:i/>
-          <w:iCs/>
-        </w:rPr>
-        <w:t xml:space="preserve">Incertidumbre:</w:t>
-      </w:r>
-      <w:r>
-        <w:t xml:space="preserve"> la peligrosa es un abdomen quirúrgico enmascarado — por el antipsicótico, por la dificultad comunicativa y por la disposición del equipo a cerrar temprano. Es el caso donde el examen «poco confiable» obliga a más objetividad, no a menos: laboratorio e imagen deciden lo que la palpación no puede.</w:t>
-      </w:r>
-    </w:p>
-    <w:p>
-      <w:pPr>
-        <w:pStyle w:val="BodyJ"/>
-      </w:pPr>
-      <w:r>
-        <w:rPr>
-          <w:i/>
-          <w:iCs/>
-        </w:rPr>
-        <w:t xml:space="preserve">Decisión:</w:t>
-      </w:r>
-      <w:r>
-        <w:t xml:space="preserve"> el mismo estándar que para cualquier paciente con dolor abdominal y taquicardia —laboratorio completo, imagen según hallazgos, reevaluación programada— y uno adicional. Documentar que la evaluación fue limitada y por qué, para que el siguiente lector no herede «abdomen negativo» donde hubo «abdomen no evaluable». La etiqueta «somatiza» no entra a la ficha sin procedencia.</w:t>
-      </w:r>
-    </w:p>
-    <w:p>
-      <w:pPr>
-        <w:pStyle w:val="BodyJ"/>
-      </w:pPr>
-      <w:r>
-        <w:rPr>
-          <w:i/>
-          <w:iCs/>
-        </w:rPr>
-        <w:t xml:space="preserve">Frase medular:</w:t>
-      </w:r>
-      <w:r>
-        <w:t xml:space="preserve"> «Dolor abdominal y taquicardia sostenida en paciente con esquizofrenia: examen abdominal limitado —no negativo— y expresión clínica posiblemente atenuada por antipsicóticos; se estudia con el estándar completo, dejando registrado que la atribución psiquiátrica del cuadro exigiría primero excluir lo que la taquicardia sugiere.»</w:t>
-      </w:r>
-    </w:p>
-    <w:p>
-      <w:pPr>
-        <w:pStyle w:val="BodyJ"/>
-      </w:pPr>
-      <w:r>
-        <w:rPr>
-          <w:i/>
-          <w:iCs/>
-        </w:rPr>
-        <w:t xml:space="preserve">Lectura metacognitiva.</w:t>
-      </w:r>
-      <w:r>
-        <w:t xml:space="preserve"> Aquí la injusticia testimonial —descontar el relato por quién lo dice— tiene mortalidad: no es sólo un agravio moral sino un mecanismo causal de la brecha de 15 a 20 años de vida. Nótese el movimiento epistémico central: cuando el testimonio y el examen valen menos de lo habitual, el estándar de estudio objetivo sube en compensación. El ensombrecimiento hace exactamente lo contrario — usa la dificultad como excusa para bajar el estándar — y por eso mata.</w:t>
+        <w:t xml:space="preserve">Una competencia profesional</w:t>
+      </w:r>
+    </w:p>
+    <w:p>
+      <w:pPr>
+        <w:pStyle w:val="BodyJ"/>
+      </w:pPr>
+      <w:r>
+        <w:t xml:space="preserve">La metacognición no reemplaza conocimiento, técnica ni ética. Los coordina. Puede enseñarse mediante casos contrastados, reflexión estructurada, práctica deliberada y feedback, pero no como asignatura aislada de la clínica (Sandars, 2009; Schmidt &amp; Mamede, 2015).</w:t>
+      </w:r>
+    </w:p>
+    <w:p>
+      <w:pPr>
+        <w:pStyle w:val="Quote1"/>
+      </w:pPr>
+      <w:r>
+        <w:t xml:space="preserve">Una organización clínica aprende cuando convierte las discrepancias entre lo pensado y lo ocurrido en información accesible, no en culpa silenciosa ni en relato retrospectivo perfecto.</w:t>
+      </w:r>
+    </w:p>
+    <w:p>
+      <w:pPr>
+        <w:pStyle w:val="BodyJ"/>
+      </w:pPr>
+      <w:r>
+        <w:t xml:space="preserve">La medicina del futuro necesitará profesionales capaces de trabajar con información creciente, equipos complejos e inteligencia artificial. La competencia decisiva no será sólo producir más respuestas, sino reconocer qué tipo de respuesta se está produciendo y qué evidencia le da derecho a orientar una acción.</w:t>
+      </w:r>
+    </w:p>
+    <w:p>
+      <w:pPr>
+        <w:pStyle w:val="BodyJ"/>
+      </w:pPr>
+      <w:r>
+        <w:t xml:space="preserve">Enseñar metacognición es enseñar una relación con el conocimiento: suficiente confianza para actuar, suficiente humildad para revisar y suficiente precisión para explicar por qué.</w:t>
+      </w:r>
+    </w:p>
+    <w:p>
+      <w:pPr>
+        <w:pStyle w:val="TallerHead"/>
+      </w:pPr>
+      <w:r>
+        <w:t xml:space="preserve">Taller 16. Rediseñar la visita de sala</w:t>
+      </w:r>
+    </w:p>
+    <w:p>
+      <w:pPr>
+        <w:pStyle w:val="BodyJ"/>
+      </w:pPr>
+      <w:r>
+        <w:t xml:space="preserve">Describa por escrito la visita de sala de su servicio tal como ocurre de verdad: minutos por paciente, quién habla, qué se pregunta siempre y qué no se pregunta nunca. Luego rediséñela con tres cambios como máximo —un disparador objetivo de pausa, una pregunta obligatoria por paciente inestable o incierto, una regla de entrega de turno— y estime el costo en minutos por visita.</w:t>
+      </w:r>
+    </w:p>
+    <w:p>
+      <w:pPr>
+        <w:pStyle w:val="BodyJ"/>
+      </w:pPr>
+      <w:r>
+        <w:rPr>
+          <w:i/>
+          <w:iCs/>
+        </w:rPr>
+        <w:t xml:space="preserve">Solución comentada.</w:t>
+      </w:r>
+      <w:r>
+        <w:t xml:space="preserve"> A modo de ejemplo, una descripción honesta puede parecerse a esto: dos a cuatro minutos por paciente, habla quien presenta y decide quien dirige, se pregunta «¿cómo está?» y «¿qué le falta?», y casi nunca «¿qué nos haría cambiar?». El rediseño más barato es esa tercera pregunta, hecha sólo a los pacientes que cumplen un disparador (reconsulta, discordancia entre gravedad y diagnóstico, 72 horas sin discusión): cuesta alrededor de un minuto por caso seleccionado y produce, de inmediato, criterios de reapertura que antes no existían. Si el rediseño necesita más de tres cambios o más de diez minutos por visita, probablemente está diseñando una reunión nueva en lugar de mejorar la que existe — y las reuniones nuevas mueren por inasistencia.</w:t>
+      </w:r>
+    </w:p>
+    <w:p>
+      <w:pPr>
+        <w:pStyle w:val="EnUnaFrase"/>
+      </w:pPr>
+      <w:r>
+        <w:rPr>
+          <w:b/>
+          <w:bCs/>
+        </w:rPr>
+        <w:t xml:space="preserve">En una frase.</w:t>
+      </w:r>
+      <w:r>
+        <w:t xml:space="preserve"> La metacognición clínica se enseña con representaciones y feedback, y se organiza con visitas de sala, fichas y revisiones diseñadas para hacer visible el pensamiento — no se decreta.</w:t>
+      </w:r>
+    </w:p>
+    <w:p>
+      <w:pPr>
+        <w:pStyle w:val="BodyJ"/>
+        <w:spacing w:after="80" w:before="160"/>
+      </w:pPr>
+      <w:r>
+        <w:rPr>
+          <w:b/>
+          <w:bCs/>
+        </w:rPr>
+        <w:t xml:space="preserve">Tres preguntas para la próxima visita.</w:t>
+      </w:r>
+    </w:p>
+    <w:p>
+      <w:pPr>
+        <w:pStyle w:val="BodyJ"/>
+        <w:numPr>
+          <w:ilvl w:val="0"/>
+          <w:numId w:val="24"/>
+        </w:numPr>
+      </w:pPr>
+      <w:r>
+        <w:t xml:space="preserve">La última vez que enseñé un caso, ¿pedí el diagnóstico o pedí primero la representación del problema?</w:t>
+      </w:r>
+    </w:p>
+    <w:p>
+      <w:pPr>
+        <w:pStyle w:val="BodyJ"/>
+        <w:numPr>
+          <w:ilvl w:val="0"/>
+          <w:numId w:val="24"/>
+        </w:numPr>
+      </w:pPr>
+      <w:r>
+        <w:t xml:space="preserve">¿Qué pasó con el último paciente que derivé o di de alta con diagnóstico incierto — y cómo podría enterarme sistemáticamente?</w:t>
+      </w:r>
+    </w:p>
+    <w:p>
+      <w:pPr>
+        <w:pStyle w:val="BodyJ"/>
+        <w:numPr>
+          <w:ilvl w:val="0"/>
+          <w:numId w:val="24"/>
+        </w:numPr>
+      </w:pPr>
+      <w:r>
+        <w:t xml:space="preserve">Si mañana dirigiera mi servicio, ¿cuál de las tres palancas (visita de sala, ficha, revisión de errores) cambiaría primero, y qué costaría?</w:t>
+      </w:r>
+    </w:p>
+    <w:p>
+      <w:pPr>
+        <w:pStyle w:val="Heading2"/>
+        <w:pageBreakBefore/>
+        <w:spacing w:after="300" w:before="600"/>
+      </w:pPr>
+      <w:r>
+        <w:rPr>
+          <w:rFonts w:ascii="Georgia" w:cs="Georgia" w:eastAsia="Georgia" w:hAnsi="Georgia"/>
+          <w:b/>
+          <w:bCs/>
+          <w:color w:val="8C2F2F"/>
+          <w:sz w:val="22"/>
+          <w:szCs w:val="22"/>
+        </w:rPr>
+        <w:t xml:space="preserve">Capítulo 17</w:t>
+      </w:r>
+      <w:r>
+        <w:rPr>
+          <w:rFonts w:ascii="Georgia" w:cs="Georgia" w:eastAsia="Georgia" w:hAnsi="Georgia"/>
+          <w:b/>
+          <w:bCs/>
+          <w:color w:val="3D5A6C"/>
+          <w:sz w:val="32"/>
+          <w:szCs w:val="32"/>
+        </w:rPr>
+        <w:br/>
+        <w:t xml:space="preserve">La inteligencia artificial en el proceso clínico: roles, riesgos y defensas</w:t>
+      </w:r>
+    </w:p>
+    <w:p>
+      <w:pPr>
+        <w:pStyle w:val="BodyJ"/>
+      </w:pPr>
+      <w:r>
+        <w:t xml:space="preserve">Un residente pega la historia de un paciente en un asistente de lenguaje y recibe, en ocho segundos, una evaluación impecablemente redactada: diagnóstico probable, diferenciales ordenados, plan sugerido. Todo suena verosímil. Este capítulo hace tres preguntas, en orden: qué puede hacer realmente esta tecnología en el proceso diagnóstico y terapéutico; qué riesgos trae — no en abstracto, sino con la evidencia ya disponible—; y cómo enfrentarlos sin renunciar a la herramienta ni al juicio. Y sostiene una tesis transversal: casi ninguno de estos riesgos es nuevo. Cada uno es un sesgo ya descrito en capítulos anteriores, ahora con amplificador.</w:t>
       </w:r>
     </w:p>
     <w:p>
@@ -13087,53 +13450,23 @@
           <w:sz w:val="25"/>
           <w:szCs w:val="25"/>
         </w:rPr>
-        <w:t xml:space="preserve">Lo común a las ocho viñetas</w:t>
-      </w:r>
-    </w:p>
-    <w:p>
-      <w:pPr>
-        <w:pStyle w:val="BodyJ"/>
-      </w:pPr>
-      <w:r>
-        <w:t xml:space="preserve">En cada caso, la buena formulación evita dos extremos: describir sin interpretar o interpretar como si se hubiera observado directamente. El hecho guía la hipótesis; la incertidumbre modula su fuerza; la consecuencia define la decisión; la evolución conserva el derecho a corregir. Y en todas la decisión termina con la misma cláusula: qué la haría cambiar, quién lo detectará y cuándo. De la urgencia de las 3:00 al final de la vida; del lactante que no habla a la paciente a la que no se le cree.</w:t>
-      </w:r>
-    </w:p>
-    <w:p>
-      <w:pPr>
-        <w:pStyle w:val="Heading2"/>
-        <w:pageBreakBefore/>
-        <w:spacing w:after="300" w:before="600"/>
-      </w:pPr>
-      <w:r>
-        <w:rPr>
-          <w:rFonts w:ascii="Georgia" w:cs="Georgia" w:eastAsia="Georgia" w:hAnsi="Georgia"/>
-          <w:b/>
-          <w:bCs/>
-          <w:color w:val="8C2F2F"/>
-          <w:sz w:val="22"/>
-          <w:szCs w:val="22"/>
-        </w:rPr>
-        <w:t xml:space="preserve">Capítulo 16</w:t>
-      </w:r>
-      <w:r>
-        <w:rPr>
-          <w:rFonts w:ascii="Georgia" w:cs="Georgia" w:eastAsia="Georgia" w:hAnsi="Georgia"/>
-          <w:b/>
-          <w:bCs/>
-          <w:color w:val="3D5A6C"/>
-          <w:sz w:val="32"/>
-          <w:szCs w:val="32"/>
-        </w:rPr>
-        <w:br/>
-        <w:t xml:space="preserve">Enseñar y organizar la metacognición clínica</w:t>
-      </w:r>
-    </w:p>
-    <w:p>
-      <w:pPr>
-        <w:pStyle w:val="BodyJ"/>
-      </w:pPr>
-      <w:r>
-        <w:t xml:space="preserve">Una jefa de servicio que quiera «instalar metacognición» en su equipo no puede indicarla como se indica un antibiótico. Puede, en cambio, cambiar tres cosas que ve todas las semanas: qué se pregunta en la visita de sala, qué estructura tiene la ficha y qué pasa después de un error. Este capítulo trata de esas palancas.</w:t>
+        <w:t xml:space="preserve">Lenguaje plausible y verdad</w:t>
+      </w:r>
+    </w:p>
+    <w:p>
+      <w:pPr>
+        <w:pStyle w:val="BodyJ"/>
+      </w:pPr>
+      <w:r>
+        <w:t xml:space="preserve">Los grandes modelos de lenguaje generan continuaciones plausibles a partir de patrones aprendidos en enormes corpus. Su fluidez puede producir respuestas clínicamente útiles, pero también afirmaciones falsas presentadas con coherencia. La literatura denomina hallucination a contenido no sustentado o inconsistente con la fuente o el mundo (Ji et al., 2023). El término es metafórico: el modelo no tiene una experiencia perceptiva que se desorganice como en la alucinación humana.</w:t>
+      </w:r>
+    </w:p>
+    <w:p>
+      <w:pPr>
+        <w:pStyle w:val="BodyJ"/>
+      </w:pPr>
+      <w:r>
+        <w:t xml:space="preserve">La medicina reconoce el peligro porque también trabaja con narrativas plausibles. Un clínico puede completar huecos, atribuir causalidad o recordar un dato de manera congruente con su hipótesis. La semejanza no implica identidad. El médico posee cuerpo, responsabilidad, acceso al paciente, experiencia situada y capacidad de actuar; el modelo manipula representaciones lingüísticas y depende del contexto que recibe.</w:t>
       </w:r>
     </w:p>
     <w:p>
@@ -13150,23 +13483,23 @@
           <w:sz w:val="25"/>
           <w:szCs w:val="25"/>
         </w:rPr>
-        <w:t xml:space="preserve">De la virtud individual al diseño institucional</w:t>
-      </w:r>
-    </w:p>
-    <w:p>
-      <w:pPr>
-        <w:pStyle w:val="BodyJ"/>
-      </w:pPr>
-      <w:r>
-        <w:t xml:space="preserve">La metacognición suele presentarse como una habilidad personal: el médico debe ser humilde, reflexivo y consciente de sus sesgos. Esa expectativa es insuficiente si el sistema oculta resultados, interrumpe el trabajo, fragmenta información y castiga la duda. La lucidez necesita infraestructura. Y esa infraestructura incluye los turnos: un servicio que deja las decisiones mayores para la hora veinte de una guardia está decidiendo con un instrumento degradado (capítulo 8), y el diseño de los horarios es, por eso, una decisión epistémica antes que administrativa.</w:t>
-      </w:r>
-    </w:p>
-    <w:p>
-      <w:pPr>
-        <w:pStyle w:val="BodyJ"/>
-      </w:pPr>
-      <w:r>
-        <w:t xml:space="preserve">La National Academies recomendó educación diagnóstica, trabajo en equipo, tecnologías que apoyen el proceso y mecanismos de feedback y aprendizaje (National Academies of Sciences, Engineering, and Medicine, 2015). Una institución metacognitiva no sólo registra errores; hace visible cómo se piensa y crea momentos para revisar.</w:t>
+        <w:t xml:space="preserve">El rol en el proceso diagnóstico</w:t>
+      </w:r>
+    </w:p>
+    <w:p>
+      <w:pPr>
+        <w:pStyle w:val="BodyJ"/>
+      </w:pPr>
+      <w:r>
+        <w:t xml:space="preserve">Los sistemas actuales hacen bien tareas delimitadas de reconocimiento: señalar pólipos durante una colonoscopía, priorizar radiografías con probable neumotórax, graduar una retinopatía diabética. En esas tareas el patrón está en la imagen y el estándar de referencia es relativamente estable. Los modelos de lenguaje agregaron otra capa: generan diferenciales, resumen historias y responden preguntas clínicas con un conocimiento médico codificado que, en exámenes y casos seleccionados, alcanza rendimiento alto (Singhal et al., 2023; Lee et al., 2023).</w:t>
+      </w:r>
+    </w:p>
+    <w:p>
+      <w:pPr>
+        <w:pStyle w:val="BodyJ"/>
+      </w:pPr>
+      <w:r>
+        <w:t xml:space="preserve">Pero el dato más instructivo sobre el rol diagnóstico real es otro: un ensayo aleatorizado entregó a internistas un modelo de lenguaje como apoyo para resolver casos clínicos. El grupo con el modelo no diagnosticó mejor que el grupo sin él — y el modelo solo, sin médico, superó a ambos (Goh et al., 2024). La lectura fácil («la máquina ya es mejor») pasa por alto la lección metacognitiva: el eslabón débil no fue el modelo ni el médico, sino la conversación entre ambos. Los clínicos usaron la herramienta como oráculo de confirmación — pegarle el caso y mirar si coincide con lo que ya pensaban — en vez de usarla para lo que mejor hace: ampliar el espacio de hipótesis, proponer el contraejemplo, señalar el dato que no encaja. La generación de alternativas es el momento creativo del diagnóstico; usada ahí, la IA es un multiplicador. Usada como confirmadora rápida, es un espejo del anclaje.</w:t>
       </w:r>
     </w:p>
     <w:p>
@@ -13183,452 +13516,6 @@
           <w:sz w:val="25"/>
           <w:szCs w:val="25"/>
         </w:rPr>
-        <w:t xml:space="preserve">Enseñar representaciones, no sólo respuestas</w:t>
-      </w:r>
-    </w:p>
-    <w:p>
-      <w:pPr>
-        <w:pStyle w:val="BodyJ"/>
-      </w:pPr>
-      <w:r>
-        <w:t xml:space="preserve">En formación, pedir «el diagnóstico» prematuramente favorece la adivinación. Es más útil solicitar primero una representación del problema y preguntar qué datos fueron transformados en calificadores. Bowen y Eva han destacado la enseñanza explícita del razonamiento, mientras la teoría de illness scripts explica por qué el conocimiento debe organizarse alrededor de condiciones, mecanismos y consecuencias (Eva, 2005; Bowen, 2006).</w:t>
-      </w:r>
-    </w:p>
-    <w:p>
-      <w:pPr>
-        <w:pStyle w:val="BodyJ"/>
-      </w:pPr>
-      <w:r>
-        <w:t xml:space="preserve">El docente puede pedir al aprendiz que marque cada frase como hecho, inferencia o incertidumbre. Luego puede comparar la versión inicial con una formulación experta, no para imponer estilo, sino para mostrar qué relaciones fueron seleccionadas. El feedback debe ser específico: «presentaste la bacteriuria como infección», «omitiste que la imagen sólo excluye complicación actual», «tu plan no indica qué te haría cambiar». La devolución constructiva tiene técnica y tradición docente propia en nuestra lengua: describir conducta observable en lugar de juzgar a la persona, equilibrar lo logrado con lo corregible y terminar en un plan (Alves de Lima, 2008). Y la evaluación debe mirar lo mismo que la enseñanza. Premiar el diagnóstico correcto obtenido por un proceso frágil, y castigar el incorrecto con incertidumbre bien calibrada, enseña a ocultar dudas y a reconstruir narrativas retrospectivas. Pedir la confianza antes de conocer la respuesta, y el plan de revisión junto con el diagnóstico, corrige ese incentivo.</w:t>
-      </w:r>
-    </w:p>
-    <w:p>
-      <w:pPr>
-        <w:pStyle w:val="Heading3"/>
-        <w:spacing w:after="120" w:before="280"/>
-      </w:pPr>
-      <w:r>
-        <w:rPr>
-          <w:rFonts w:ascii="Georgia" w:cs="Georgia" w:eastAsia="Georgia" w:hAnsi="Georgia"/>
-          <w:b/>
-          <w:bCs/>
-          <w:color w:val="2B2B2B"/>
-          <w:sz w:val="25"/>
-          <w:szCs w:val="25"/>
-        </w:rPr>
-        <w:t xml:space="preserve">Un debate honesto: ¿se puede enseñar a pensar mejor?</w:t>
-      </w:r>
-    </w:p>
-    <w:p>
-      <w:pPr>
-        <w:pStyle w:val="BodyJ"/>
-      </w:pPr>
-      <w:r>
-        <w:t xml:space="preserve">Este libro toma posición en una controversia real de la educación médica, y la declara. De un lado, Croskerry y su tradición sostienen que conocer los sesgos y entrenar estrategias de debiasing mejora el diagnóstico (Croskerry, 2003; Croskerry et al., 2013a, 2013b). Del otro, Norman, Monteiro y colegas han acumulado evidencia incómoda. La mayoría de los errores diagnósticos se asocia a déficits de conocimiento más que a fallas puras de proceso; los cursos de «pensamiento crítico» generalizable transfieren poco; y obligar a reflexionar sistemáticamente sobre casos fáciles no mejora la precisión y consume tiempo (Norman et al., 2017; Monteiro &amp; Norman, 2013; Monteiro et al., 2020).</w:t>
-      </w:r>
-    </w:p>
-    <w:p>
-      <w:pPr>
-        <w:pStyle w:val="BodyJ"/>
-      </w:pPr>
-      <w:r>
-        <w:t xml:space="preserve">La posición de este libro es intermedia, pero no equidistante. Con los escépticos: no existe una habilidad general de «pensar bien» que flote por encima del conocimiento; la representación rica del problema —illness scripts, experiencia con feedback— es la condición de todo lo demás, y ningún método, HII-D incluido, compensa no saber medicina. Contra el escepticismo total: de esa evidencia no se sigue que la única intervención posible sea enseñar más contenido. Lo que este libro propone no es vigilancia interna permanente ni listas universales, las versiones que la evidencia ha desinflado, sino artefactos externos y selectivos. Un lenguaje que obliga a graduar afirmaciones; una estructura de nota que conserva las capas; pausas activadas por disparadores definidos; circuitos de feedback que conviertan experiencia en calibración. Es una apuesta con compromisos observables (véase el capítulo 15): si estas herramientas no cambian conductas medibles, deben abandonarse como cualquier hipótesis mimada. Entre tanto, la controversia se enseña mejor de lo que se oculta: un residente que conoce el debate sabrá desconfiar por igual del catálogo de sesgos como solución universal y del nihilismo pedagógico como coartada.</w:t>
-      </w:r>
-    </w:p>
-    <w:p>
-      <w:pPr>
-        <w:pStyle w:val="Heading3"/>
-        <w:spacing w:after="120" w:before="280"/>
-      </w:pPr>
-      <w:r>
-        <w:rPr>
-          <w:rFonts w:ascii="Georgia" w:cs="Georgia" w:eastAsia="Georgia" w:hAnsi="Georgia"/>
-          <w:b/>
-          <w:bCs/>
-          <w:color w:val="2B2B2B"/>
-          <w:sz w:val="25"/>
-          <w:szCs w:val="25"/>
-        </w:rPr>
-        <w:t xml:space="preserve">Visitas de sala y entregas de turno</w:t>
-      </w:r>
-    </w:p>
-    <w:p>
-      <w:pPr>
-        <w:pStyle w:val="BodyJ"/>
-      </w:pPr>
-      <w:r>
-        <w:t xml:space="preserve">Una visita de sala puede incorporar una pausa breve en casos seleccionados, y no hace falta inventarle preguntas: las cuatro de la versión de sesenta segundos (capítulo 15) bastan, y el Apéndice C dice con qué disparadores instalarlas, en cuántas semanas y qué medir. Lo que este capítulo aporta es el porqué: la pausa en voz alta es el único momento en que el equipo entero mira la misma representación del problema, y quien dirige la visita la enseña modelándola, no interrogando.</w:t>
-      </w:r>
-    </w:p>
-    <w:p>
-      <w:pPr>
-        <w:pStyle w:val="BodyJ"/>
-      </w:pPr>
-      <w:r>
-        <w:t xml:space="preserve">La entrega de turno debe transmitir tareas epistémicas, no sólo tratamientos. «Pendiente observar si…» y «si ocurre X, reabrir Y» son componentes de seguridad.</w:t>
-      </w:r>
-    </w:p>
-    <w:p>
-      <w:pPr>
-        <w:pStyle w:val="Heading3"/>
-        <w:spacing w:after="120" w:before="280"/>
-      </w:pPr>
-      <w:r>
-        <w:rPr>
-          <w:rFonts w:ascii="Georgia" w:cs="Georgia" w:eastAsia="Georgia" w:hAnsi="Georgia"/>
-          <w:b/>
-          <w:bCs/>
-          <w:color w:val="2B2B2B"/>
-          <w:sz w:val="25"/>
-          <w:szCs w:val="25"/>
-        </w:rPr>
-        <w:t xml:space="preserve">Conferencias de aprendizaje</w:t>
-      </w:r>
-    </w:p>
-    <w:p>
-      <w:pPr>
-        <w:pStyle w:val="BodyJ"/>
-      </w:pPr>
-      <w:r>
-        <w:t xml:space="preserve">La morbimortalidad tradicional puede centrarse en quién se equivocó o en una secuencia factual sin análisis cognitivo. Una revisión más útil reconstruye la evolución de la representación: qué se pensó en cada punto, qué señales estaban disponibles, qué información faltó, qué condiciones favorecieron la inercia y qué barrera podría permitir corrección futura. La viñeta 6 del cuaderno de casos es un ejemplo del formato: capas, oportunidades y barreras, sin moralismo retrospectivo.</w:t>
-      </w:r>
-    </w:p>
-    <w:p>
-      <w:pPr>
-        <w:pStyle w:val="BodyJ"/>
-      </w:pPr>
-      <w:r>
-        <w:t xml:space="preserve">Debe evitarse el hindsight bias. El desenlace no convierte automáticamente en obvia una alternativa que tenía baja probabilidad inicial. El aprendizaje surge al identificar oportunidades razonables de actualización, no al exigir omnisciencia retrospectiva.</w:t>
-      </w:r>
-    </w:p>
-    <w:p>
-      <w:pPr>
-        <w:pStyle w:val="Heading3"/>
-        <w:spacing w:after="120" w:before="280"/>
-      </w:pPr>
-      <w:r>
-        <w:rPr>
-          <w:rFonts w:ascii="Georgia" w:cs="Georgia" w:eastAsia="Georgia" w:hAnsi="Georgia"/>
-          <w:b/>
-          <w:bCs/>
-          <w:color w:val="2B2B2B"/>
-          <w:sz w:val="25"/>
-          <w:szCs w:val="25"/>
-        </w:rPr>
-        <w:t xml:space="preserve">Feedback diagnóstico</w:t>
-      </w:r>
-    </w:p>
-    <w:p>
-      <w:pPr>
-        <w:pStyle w:val="BodyJ"/>
-      </w:pPr>
-      <w:r>
-        <w:t xml:space="preserve">Los médicos necesitan saber qué ocurrió con pacientes derivados, dados de alta o transferidos. Sistemas simples pueden devolver diagnósticos finales, resultados discrepantes, reconsultas y cambios terapéuticos. La calibración requiere series, no recuerdos aislados.</w:t>
-      </w:r>
-    </w:p>
-    <w:p>
-      <w:pPr>
-        <w:pStyle w:val="BodyJ"/>
-      </w:pPr>
-      <w:r>
-        <w:t xml:space="preserve">Un portafolio privado puede registrar: hipótesis principal, confianza aproximada, alternativa relevante, desenlace y aprendizaje. No busca puntuar moralmente; busca detectar patrones: exceso de confianza en un dominio, subestimación de recurrencias, tendencia a tratar cultivos sin síndrome o dificultad para reconocer diagnósticos funcionales. El Taller 5 de este libro es su versión mínima. El portafolio como instrumento docente tiene además desarrollo propio en la educación médica latinoamericana, incluida la validación en español de instrumentos para evaluar su uso (Riquelme et al., 2011).</w:t>
-      </w:r>
-    </w:p>
-    <w:p>
-      <w:pPr>
-        <w:pStyle w:val="Heading3"/>
-        <w:spacing w:after="120" w:before="280"/>
-      </w:pPr>
-      <w:r>
-        <w:rPr>
-          <w:rFonts w:ascii="Georgia" w:cs="Georgia" w:eastAsia="Georgia" w:hAnsi="Georgia"/>
-          <w:b/>
-          <w:bCs/>
-          <w:color w:val="2B2B2B"/>
-          <w:sz w:val="25"/>
-          <w:szCs w:val="25"/>
-        </w:rPr>
-        <w:t xml:space="preserve">Lenguaje institucional</w:t>
-      </w:r>
-    </w:p>
-    <w:p>
-      <w:pPr>
-        <w:pStyle w:val="BodyJ"/>
-      </w:pPr>
-      <w:r>
-        <w:t xml:space="preserve">Las plantillas de ficha pueden apoyar o degradar el pensamiento. Campos obligatorios interminables producen copia; campos demasiado libres ocultan información crítica. Una plantilla equilibrada incluye problema, hechos nuevos, evaluación con grado de certeza, plan y criterios de reevaluación. La tecnología debería facilitar comparación temporal y procedencia de datos, no sólo acumular texto.</w:t>
-      </w:r>
-    </w:p>
-    <w:p>
-      <w:pPr>
-        <w:pStyle w:val="BodyJ"/>
-      </w:pPr>
-      <w:r>
-        <w:t xml:space="preserve">La cultura importa. Un residente debe poder decir «no entiendo este dato» sin perder legitimidad; una enfermera debe poder señalar que la evolución no coincide con el diagnóstico; un especialista debe explicitar límites; un jefe debe corregirse en público. La revisabilidad se aprende por modelamiento.</w:t>
-      </w:r>
-    </w:p>
-    <w:p>
-      <w:pPr>
-        <w:pStyle w:val="Heading3"/>
-        <w:spacing w:after="120" w:before="280"/>
-      </w:pPr>
-      <w:r>
-        <w:rPr>
-          <w:rFonts w:ascii="Georgia" w:cs="Georgia" w:eastAsia="Georgia" w:hAnsi="Georgia"/>
-          <w:b/>
-          <w:bCs/>
-          <w:color w:val="2B2B2B"/>
-          <w:sz w:val="25"/>
-          <w:szCs w:val="25"/>
-        </w:rPr>
-        <w:t xml:space="preserve">Una competencia profesional</w:t>
-      </w:r>
-    </w:p>
-    <w:p>
-      <w:pPr>
-        <w:pStyle w:val="BodyJ"/>
-      </w:pPr>
-      <w:r>
-        <w:t xml:space="preserve">La metacognición no reemplaza conocimiento, técnica ni ética. Los coordina. Puede enseñarse mediante casos contrastados, reflexión estructurada, práctica deliberada y feedback, pero no como asignatura aislada de la clínica (Sandars, 2009; Schmidt &amp; Mamede, 2015).</w:t>
-      </w:r>
-    </w:p>
-    <w:p>
-      <w:pPr>
-        <w:pStyle w:val="Quote1"/>
-      </w:pPr>
-      <w:r>
-        <w:t xml:space="preserve">Una organización clínica aprende cuando convierte las discrepancias entre lo pensado y lo ocurrido en información accesible, no en culpa silenciosa ni en relato retrospectivo perfecto.</w:t>
-      </w:r>
-    </w:p>
-    <w:p>
-      <w:pPr>
-        <w:pStyle w:val="BodyJ"/>
-      </w:pPr>
-      <w:r>
-        <w:t xml:space="preserve">La medicina del futuro necesitará profesionales capaces de trabajar con información creciente, equipos complejos e inteligencia artificial. La competencia decisiva no será sólo producir más respuestas, sino reconocer qué tipo de respuesta se está produciendo y qué evidencia le da derecho a orientar una acción.</w:t>
-      </w:r>
-    </w:p>
-    <w:p>
-      <w:pPr>
-        <w:pStyle w:val="BodyJ"/>
-      </w:pPr>
-      <w:r>
-        <w:t xml:space="preserve">Enseñar metacognición es enseñar una relación con el conocimiento: suficiente confianza para actuar, suficiente humildad para revisar y suficiente precisión para explicar por qué.</w:t>
-      </w:r>
-    </w:p>
-    <w:p>
-      <w:pPr>
-        <w:pStyle w:val="TallerHead"/>
-      </w:pPr>
-      <w:r>
-        <w:t xml:space="preserve">Taller 16. Rediseñar la visita de sala</w:t>
-      </w:r>
-    </w:p>
-    <w:p>
-      <w:pPr>
-        <w:pStyle w:val="BodyJ"/>
-      </w:pPr>
-      <w:r>
-        <w:t xml:space="preserve">Describa por escrito la visita de sala de su servicio tal como ocurre de verdad: minutos por paciente, quién habla, qué se pregunta siempre y qué no se pregunta nunca. Luego rediséñela con tres cambios como máximo —un disparador objetivo de pausa, una pregunta obligatoria por paciente inestable o incierto, una regla de entrega de turno— y estime el costo en minutos por visita.</w:t>
-      </w:r>
-    </w:p>
-    <w:p>
-      <w:pPr>
-        <w:pStyle w:val="BodyJ"/>
-      </w:pPr>
-      <w:r>
-        <w:rPr>
-          <w:i/>
-          <w:iCs/>
-        </w:rPr>
-        <w:t xml:space="preserve">Solución comentada.</w:t>
-      </w:r>
-      <w:r>
-        <w:t xml:space="preserve"> A modo de ejemplo, una descripción honesta puede parecerse a esto: dos a cuatro minutos por paciente, habla quien presenta y decide quien dirige, se pregunta «¿cómo está?» y «¿qué le falta?», y casi nunca «¿qué nos haría cambiar?». El rediseño más barato es esa tercera pregunta, hecha sólo a los pacientes que cumplen un disparador (reconsulta, discordancia entre gravedad y diagnóstico, 72 horas sin discusión): cuesta alrededor de un minuto por caso seleccionado y produce, de inmediato, criterios de reapertura que antes no existían. Si el rediseño necesita más de tres cambios o más de diez minutos por visita, probablemente está diseñando una reunión nueva en lugar de mejorar la que existe — y las reuniones nuevas mueren por inasistencia.</w:t>
-      </w:r>
-    </w:p>
-    <w:p>
-      <w:pPr>
-        <w:pStyle w:val="EnUnaFrase"/>
-      </w:pPr>
-      <w:r>
-        <w:rPr>
-          <w:b/>
-          <w:bCs/>
-        </w:rPr>
-        <w:t xml:space="preserve">En una frase.</w:t>
-      </w:r>
-      <w:r>
-        <w:t xml:space="preserve"> La metacognición clínica se enseña con representaciones y feedback, y se organiza con visitas de sala, fichas y revisiones diseñadas para hacer visible el pensamiento — no se decreta.</w:t>
-      </w:r>
-    </w:p>
-    <w:p>
-      <w:pPr>
-        <w:pStyle w:val="BodyJ"/>
-        <w:spacing w:after="80" w:before="160"/>
-      </w:pPr>
-      <w:r>
-        <w:rPr>
-          <w:b/>
-          <w:bCs/>
-        </w:rPr>
-        <w:t xml:space="preserve">Tres preguntas para la próxima visita.</w:t>
-      </w:r>
-    </w:p>
-    <w:p>
-      <w:pPr>
-        <w:pStyle w:val="BodyJ"/>
-        <w:numPr>
-          <w:ilvl w:val="0"/>
-          <w:numId w:val="24"/>
-        </w:numPr>
-      </w:pPr>
-      <w:r>
-        <w:t xml:space="preserve">La última vez que enseñé un caso, ¿pedí el diagnóstico o pedí primero la representación del problema?</w:t>
-      </w:r>
-    </w:p>
-    <w:p>
-      <w:pPr>
-        <w:pStyle w:val="BodyJ"/>
-        <w:numPr>
-          <w:ilvl w:val="0"/>
-          <w:numId w:val="24"/>
-        </w:numPr>
-      </w:pPr>
-      <w:r>
-        <w:t xml:space="preserve">¿Qué pasó con el último paciente que derivé o di de alta con diagnóstico incierto — y cómo podría enterarme sistemáticamente?</w:t>
-      </w:r>
-    </w:p>
-    <w:p>
-      <w:pPr>
-        <w:pStyle w:val="BodyJ"/>
-        <w:numPr>
-          <w:ilvl w:val="0"/>
-          <w:numId w:val="24"/>
-        </w:numPr>
-      </w:pPr>
-      <w:r>
-        <w:t xml:space="preserve">Si mañana dirigiera mi servicio, ¿cuál de las tres palancas (visita de sala, ficha, revisión de errores) cambiaría primero, y qué costaría?</w:t>
-      </w:r>
-    </w:p>
-    <w:p>
-      <w:pPr>
-        <w:pStyle w:val="Heading2"/>
-        <w:pageBreakBefore/>
-        <w:spacing w:after="300" w:before="600"/>
-      </w:pPr>
-      <w:r>
-        <w:rPr>
-          <w:rFonts w:ascii="Georgia" w:cs="Georgia" w:eastAsia="Georgia" w:hAnsi="Georgia"/>
-          <w:b/>
-          <w:bCs/>
-          <w:color w:val="8C2F2F"/>
-          <w:sz w:val="22"/>
-          <w:szCs w:val="22"/>
-        </w:rPr>
-        <w:t xml:space="preserve">Capítulo 17</w:t>
-      </w:r>
-      <w:r>
-        <w:rPr>
-          <w:rFonts w:ascii="Georgia" w:cs="Georgia" w:eastAsia="Georgia" w:hAnsi="Georgia"/>
-          <w:b/>
-          <w:bCs/>
-          <w:color w:val="3D5A6C"/>
-          <w:sz w:val="32"/>
-          <w:szCs w:val="32"/>
-        </w:rPr>
-        <w:br/>
-        <w:t xml:space="preserve">La inteligencia artificial en el proceso clínico: roles, riesgos y defensas</w:t>
-      </w:r>
-    </w:p>
-    <w:p>
-      <w:pPr>
-        <w:pStyle w:val="BodyJ"/>
-      </w:pPr>
-      <w:r>
-        <w:t xml:space="preserve">Un residente pega la historia de un paciente en un asistente de lenguaje y recibe, en ocho segundos, una evaluación impecablemente redactada: diagnóstico probable, diferenciales ordenados, plan sugerido. Todo suena verosímil. Este capítulo hace tres preguntas, en orden: qué puede hacer realmente esta tecnología en el proceso diagnóstico y terapéutico; qué riesgos trae — no en abstracto, sino con la evidencia ya disponible—; y cómo enfrentarlos sin renunciar a la herramienta ni al juicio. Y sostiene una tesis transversal: casi ninguno de estos riesgos es nuevo. Cada uno es un sesgo que este libro ya describió, ahora con amplificador.</w:t>
-      </w:r>
-    </w:p>
-    <w:p>
-      <w:pPr>
-        <w:pStyle w:val="Heading3"/>
-        <w:spacing w:after="120" w:before="280"/>
-      </w:pPr>
-      <w:r>
-        <w:rPr>
-          <w:rFonts w:ascii="Georgia" w:cs="Georgia" w:eastAsia="Georgia" w:hAnsi="Georgia"/>
-          <w:b/>
-          <w:bCs/>
-          <w:color w:val="2B2B2B"/>
-          <w:sz w:val="25"/>
-          <w:szCs w:val="25"/>
-        </w:rPr>
-        <w:t xml:space="preserve">Lenguaje plausible y verdad</w:t>
-      </w:r>
-    </w:p>
-    <w:p>
-      <w:pPr>
-        <w:pStyle w:val="BodyJ"/>
-      </w:pPr>
-      <w:r>
-        <w:t xml:space="preserve">Los grandes modelos de lenguaje generan continuaciones plausibles a partir de patrones aprendidos en enormes corpus. Su fluidez puede producir respuestas clínicamente útiles, pero también afirmaciones falsas presentadas con coherencia. La literatura denomina hallucination a contenido no sustentado o inconsistente con la fuente o el mundo (Ji et al., 2023). El término es metafórico: el modelo no tiene una experiencia perceptiva que se desorganice como en la alucinación humana.</w:t>
-      </w:r>
-    </w:p>
-    <w:p>
-      <w:pPr>
-        <w:pStyle w:val="BodyJ"/>
-      </w:pPr>
-      <w:r>
-        <w:t xml:space="preserve">La medicina reconoce el peligro porque también trabaja con narrativas plausibles. Un clínico puede completar huecos, atribuir causalidad o recordar un dato de manera congruente con su hipótesis. La semejanza no implica identidad. El médico posee cuerpo, responsabilidad, acceso al paciente, experiencia situada y capacidad de actuar; el modelo manipula representaciones lingüísticas y depende del contexto que recibe.</w:t>
-      </w:r>
-    </w:p>
-    <w:p>
-      <w:pPr>
-        <w:pStyle w:val="Heading3"/>
-        <w:spacing w:after="120" w:before="280"/>
-      </w:pPr>
-      <w:r>
-        <w:rPr>
-          <w:rFonts w:ascii="Georgia" w:cs="Georgia" w:eastAsia="Georgia" w:hAnsi="Georgia"/>
-          <w:b/>
-          <w:bCs/>
-          <w:color w:val="2B2B2B"/>
-          <w:sz w:val="25"/>
-          <w:szCs w:val="25"/>
-        </w:rPr>
-        <w:t xml:space="preserve">El rol en el proceso diagnóstico</w:t>
-      </w:r>
-    </w:p>
-    <w:p>
-      <w:pPr>
-        <w:pStyle w:val="BodyJ"/>
-      </w:pPr>
-      <w:r>
-        <w:t xml:space="preserve">Los sistemas actuales hacen bien tareas delimitadas de reconocimiento: señalar pólipos durante una colonoscopía, priorizar radiografías con probable neumotórax, graduar una retinopatía diabética. En esas tareas el patrón está en la imagen y el estándar de referencia es relativamente estable. Los modelos de lenguaje agregaron otra capa: generan diferenciales, resumen historias y responden preguntas clínicas con un conocimiento médico codificado que, en exámenes y casos seleccionados, alcanza rendimiento alto (Singhal et al., 2023; Lee et al., 2023).</w:t>
-      </w:r>
-    </w:p>
-    <w:p>
-      <w:pPr>
-        <w:pStyle w:val="BodyJ"/>
-      </w:pPr>
-      <w:r>
-        <w:t xml:space="preserve">Pero el dato más instructivo sobre el rol diagnóstico real es otro: un ensayo aleatorizado entregó a internistas un modelo de lenguaje como apoyo para resolver casos clínicos. El grupo con el modelo no diagnosticó mejor que el grupo sin él — y el modelo solo, sin médico, superó a ambos (Goh et al., 2024). La lectura fácil («la máquina ya es mejor») pasa por alto la lección metacognitiva: el eslabón débil no fue el modelo ni el médico, sino la conversación entre ambos. Los clínicos usaron la herramienta como oráculo de confirmación — pegarle el caso y mirar si coincide con lo que ya pensaban — en vez de usarla para lo que mejor hace: ampliar el espacio de hipótesis, proponer el contraejemplo, señalar el dato que no encaja. La generación de alternativas es el momento creativo del diagnóstico; usada ahí, la IA es un multiplicador. Usada como confirmadora rápida, es un espejo del anclaje.</w:t>
-      </w:r>
-    </w:p>
-    <w:p>
-      <w:pPr>
-        <w:pStyle w:val="Heading3"/>
-        <w:spacing w:after="120" w:before="280"/>
-      </w:pPr>
-      <w:r>
-        <w:rPr>
-          <w:rFonts w:ascii="Georgia" w:cs="Georgia" w:eastAsia="Georgia" w:hAnsi="Georgia"/>
-          <w:b/>
-          <w:bCs/>
-          <w:color w:val="2B2B2B"/>
-          <w:sz w:val="25"/>
-          <w:szCs w:val="25"/>
-        </w:rPr>
         <w:t xml:space="preserve">El rol en el proceso terapéutico</w:t>
       </w:r>
     </w:p>
@@ -13637,7 +13524,7 @@
         <w:pStyle w:val="BodyJ"/>
       </w:pPr>
       <w:r>
-        <w:t xml:space="preserve">En la terapéutica la IA llega antes y por caminos menos visibles: alertas de deterioro, predictores de sepsis, sugerencias de dosis, detección de interacciones, estratificaciones de riesgo que deciden quién entra a un programa de cuidados. Aquí la evidencia ya dejó una parábola completa. Un modelo propietario de predicción de sepsis, desplegado en cientos de hospitales, fue validado externamente recién después de su adopción masiva: discriminaba mal, calibraba peor y generaba una carga de alertas capaz de fatigar a cualquier equipo (Wong et al., 2021). La falla profunda no fue estadística sino epistemológica: el sistema se adoptó sin exigirle la evidencia local que este libro pide para cualquier afirmación — ¿funciona aquí, con estos pacientes, con esta prevalencia? Una herramienta no hereda la validez de su marca, y la validación externa no es un trámite, sino la diferencia entre una alerta y un ruido.</w:t>
+        <w:t xml:space="preserve">En la terapéutica la IA llega antes y por caminos menos visibles: alertas de deterioro, predictores de sepsis, sugerencias de dosis, detección de interacciones, estratificaciones de riesgo que deciden quién entra a un programa de cuidados. Aquí la evidencia ya dejó una parábola completa. Un modelo propietario de predicción de sepsis, desplegado en cientos de hospitales, fue validado externamente recién después de su adopción masiva: discriminaba mal, calibraba peor y generaba una carga de alertas capaz de fatigar a cualquier equipo (Wong et al., 2021). La falla profunda no fue estadística sino epistemológica: el sistema se adoptó sin exigirle la evidencia local que se le pide a cualquier afirmación clínica — ¿funciona aquí, con estos pacientes, con esta prevalencia? Una herramienta no hereda la validez de su marca, y la validación externa no es un trámite, sino la diferencia entre una alerta y un ruido.</w:t>
       </w:r>
     </w:p>
     <w:p>
@@ -13875,7 +13762,7 @@
               <w:pStyle w:val="Caption"/>
             </w:pPr>
             <w:r>
-              <w:t xml:space="preserve">Figura 15. Parentescos: cada riesgo de la IA clínica junto al sesgo que este libro ya había descrito y el capítulo donde vive. Ningún riesgo es nuevo; la novedad es el amplificador.</w:t>
+              <w:t xml:space="preserve">Figura 15. Parentescos: cada riesgo de la IA clínica junto al sesgo ya descrito y el capítulo donde vive. Ningún riesgo es nuevo; la novedad es el amplificador.</w:t>
             </w:r>
           </w:p>
         </w:tc>
@@ -13962,7 +13849,7 @@
         <w:pStyle w:val="BodyJ"/>
       </w:pPr>
       <w:r>
-        <w:t xml:space="preserve">La aviación conoce esta trampa con nombre propio: la paradoja de la automatización — cuanto más competente es el sistema, menos ejercita el humano las habilidades necesarias para detectar cuándo falla, que es exactamente cuando más se lo necesita (Abdulnour et al., 2026). La respuesta pedagógica propuesta frente a ella coincide, casi palabra por palabra, con la disciplina de este libro: razonar primero de forma independiente, consultar después, y usar la IA para desafiar, ampliar o refinar ese razonamiento — nunca para reemplazar su ejecución.</w:t>
+        <w:t xml:space="preserve">La aviación conoce esta trampa con nombre propio: la paradoja de la automatización — cuanto más competente es el sistema, menos ejercita el humano las habilidades necesarias para detectar cuándo falla, que es exactamente cuando más se lo necesita (Abdulnour et al., 2026). La respuesta pedagógica propuesta frente a ella coincide, casi palabra por palabra, con lo que vienen pidiendo los capítulos anteriores: razonar primero de forma independiente, consultar después, y usar la IA para desafiar, ampliar o refinar ese razonamiento — nunca para reemplazar su ejecución.</w:t>
       </w:r>
     </w:p>
     <w:p>
@@ -13995,7 +13882,7 @@
         <w:pStyle w:val="BodyJ"/>
       </w:pPr>
       <w:r>
-        <w:t xml:space="preserve">De ahí una regla de diseño que este libro puede proponer con su propio vocabulario. Un escriba ambiental puede automatizar la capa H —qué se dijo, qué se midió, con hora y fuente— y hacerlo mejor que un humano cansado. No debería autocompletar la capa D ni la frase medular: la decisión, el criterio de reapertura y el grado de la inferencia tienen que salir de la mano del clínico, porque escribirlos es la instancia en que se piensan (McCoy et al., 2024). Donde la herramienta llene las cuatro capas, el never-skilling del apartado anterior tiene su vía de entrada más cómoda: notas impecables firmadas por médicos que ya no las construyen. La prueba de un buen escriba no es que la nota se lea bien; es que conserve el «no me cierra».</w:t>
+        <w:t xml:space="preserve">De ahí una regla de diseño, dicha en el vocabulario de las capas. Un escriba ambiental puede automatizar la capa H —qué se dijo, qué se midió, con hora y fuente— y hacerlo mejor que un humano cansado. No debería autocompletar la capa D ni la frase medular: la decisión, el criterio de reapertura y el grado de la inferencia tienen que salir de la mano del clínico, porque escribirlos es la instancia en que se piensan (McCoy et al., 2024). Donde la herramienta llene las cuatro capas, el never-skilling del apartado anterior tiene su vía de entrada más cómoda: notas impecables firmadas por médicos que ya no las construyen. La prueba de un buen escriba no es que la nota se lea bien; es que conserve el «no me cierra».</w:t>
       </w:r>
     </w:p>
     <w:p>
@@ -14020,7 +13907,7 @@
         <w:pStyle w:val="BodyJ"/>
       </w:pPr>
       <w:r>
-        <w:t xml:space="preserve">La primera defensa ya está en este libro. El clínico responsable puede distinguir «lo vi», «lo infiero» y «no lo sé»; un modelo suele mezclar esas capas si nadie le exige separación, y puede transformar ausencia de información en un detalle probable, porque su objetivo generativo favorece la continuidad. La matriz HII-D funciona entonces como protocolo de auditoría de cualquier salida de IA:</w:t>
+        <w:t xml:space="preserve">La primera defensa ya está escrita en los capítulos anteriores. El clínico responsable puede distinguir «lo vi», «lo infiero» y «no lo sé»; un modelo suele mezclar esas capas si nadie le exige separación, y puede transformar ausencia de información en un detalle probable, porque su objetivo generativo favorece la continuidad. La matriz HII-D funciona entonces como protocolo de auditoría de cualquier salida de IA:</w:t>
       </w:r>
     </w:p>
     <w:p>
@@ -14535,7 +14422,7 @@
         <w:pStyle w:val="BodyJ"/>
       </w:pPr>
       <w:r>
-        <w:t xml:space="preserve">El parentesco es lógico antes que sentimental. Una metáfora es la hipótesis de que dos cosas lejanas comparten estructura; un diagnóstico es una metáfora que acepta ser puesta a prueba — «este cuadro es una colecistitis» apuesta a que lo que ocurre en este cuerpo comparte estructura con un patrón aprendido. Ambos movimientos son la abducción del capítulo 2, y ambos requieren el estado que este libro llamó humildad en funciones: sostener la conjetura con fuerza suficiente para trabajarla y soltura suficiente para dejarla caer. Bohm lo dijo desde la física: el acto creativo central —percibir un orden nuevo en lo que ya estaba a la vista— es el mismo en el arte y en la ciencia; cambian los materiales y el tribunal (Bohm, 1996).</w:t>
+        <w:t xml:space="preserve">El parentesco es lógico antes que sentimental. Una metáfora es la hipótesis de que dos cosas lejanas comparten estructura; un diagnóstico es una metáfora que acepta ser puesta a prueba — «este cuadro es una colecistitis» apuesta a que lo que ocurre en este cuerpo comparte estructura con un patrón aprendido. Ambos movimientos son la abducción del capítulo 2, y ambos requieren el estado que el capítulo 14 llamó humildad en funciones: sostener la conjetura con fuerza suficiente para trabajarla y soltura suficiente para dejarla caer. Bohm lo dijo desde la física: el acto creativo central —percibir un orden nuevo en lo que ya estaba a la vista— es el mismo en el arte y en la ciencia; cambian los materiales y el tribunal (Bohm, 1996).</w:t>
       </w:r>
     </w:p>
     <w:p>
@@ -14634,7 +14521,7 @@
         <w:pStyle w:val="BodyJ"/>
       </w:pPr>
       <w:r>
-        <w:t xml:space="preserve">Pero este libro ya conoció a la impostora. La historia coherente del hindsight, la narrativa atractiva que infla la confianza, la prosa fluida de los modelos de lenguaje: todas son bellas y ninguna es, por serlo, verdadera. La belleza no distingue entre orden hallado y orden impuesto — para eso están las pruebas severas. La regla que concilia ambas caras cabe en una línea: la elegancia selecciona hipótesis; nunca las confirma. El verso puede quedarse bello para siempre; el diagnóstico tiene que amanecer verdadero, y la evolución lo audita cada mañana.</w:t>
+        <w:t xml:space="preserve">Pero el lector ya conoció a la impostora. La historia coherente del hindsight, la narrativa atractiva que infla la confianza, la prosa fluida de los modelos de lenguaje: todas son bellas y ninguna es, por serlo, verdadera. La belleza no distingue entre orden hallado y orden impuesto — para eso están las pruebas severas. La regla que concilia ambas caras cabe en una línea: la elegancia selecciona hipótesis; nunca las confirma. El verso puede quedarse bello para siempre; el diagnóstico tiene que amanecer verdadero, y la evolución lo audita cada mañana.</w:t>
       </w:r>
     </w:p>
     <w:p>
@@ -14714,7 +14601,7 @@
         <w:t xml:space="preserve">Solución comentada.</w:t>
       </w:r>
       <w:r>
-        <w:t xml:space="preserve"> Ejemplo: «Shock séptico de foco urinario, descartándose foco abdominal». Prueba uno: «de foco urinario» hace florecer una causal (¿demostrada o presunta?), y «descartándose» es un gerundio que promete lo que todavía no ocurrió — dos rosas creadas en nueve palabras. Prueba dos, en lengua parriana: «Shock con urocultivo positivo; foco urinario probable; abdomen aún sin imagen». La segunda versión es menos imponente y más útil: sobrevive a la visita de la mañana. Si su frase pasa las dos pruebas, tiene lo que este libro entiende por estilo: exactitud que se puede defender en voz alta.</w:t>
+        <w:t xml:space="preserve"> Ejemplo: «Shock séptico de foco urinario, descartándose foco abdominal». Prueba uno: «de foco urinario» hace florecer una causal (¿demostrada o presunta?), y «descartándose» es un gerundio que promete lo que todavía no ocurrió — dos rosas creadas en nueve palabras. Prueba dos, en lengua parriana: «Shock con urocultivo positivo; foco urinario probable; abdomen aún sin imagen». La segunda versión es menos imponente y más útil: sobrevive a la visita de la mañana. Si su frase pasa las dos pruebas, tiene lo que aquí se entiende por estilo: exactitud que se puede defender en voz alta.</w:t>
       </w:r>
     </w:p>
     <w:p>
@@ -14836,7 +14723,7 @@
         <w:pStyle w:val="BodyJ"/>
       </w:pPr>
       <w:r>
-        <w:t xml:space="preserve">El mapa del comienzo (Figura 1) tendió tres hilos —las capas, el arco que va de la abducción a la humildad y el lenguaje que las conserva—; tres nudos de ese tejido quedan a la vista. El primero va de la abducción a la humildad. La conjetura que crea explicaciones, la vigilancia que la acompaña mientras trabaja y la disposición que la mantiene abierta cuando ya produjo una respuesta cómoda son tres momentos de una misma lealtad al caso; la prudencia práctica —la phronesis— es su nombre antiguo. El segundo va del dato al contexto: la funcionalidad, el pronóstico de fondo y la red de apoyo son hechos clínicos, y una decisión que los omitió no es más objetiva sino más incompleta. El tercero va de la ficha al razonador: escribir la nota es parte de pensar. Por eso la inteligencia artificial, que produce la prosa fluida contra la que este libro entrena —hechos, inferencias e invenciones con la misma sintaxis—, no cambia la disciplina: la vuelve urgente, sobre todo para quien todavía está formando el juicio que la herramienta ofrece reemplazar. Ante una respuesta automática como ante la propia narrativa, la pregunta es la misma: qué proviene del caso, qué fue inferido, qué permanece incierto y qué responsabilidad implica actuar.</w:t>
+        <w:t xml:space="preserve">El mapa del comienzo (Figura 1) prometió tres hilos: las capas del conocimiento, el camino de la conjetura a la humildad y la lengua que conserva o borra las capas. Tres nudos de ese tejido quedan a la vista. El primero va de la abducción a la humildad. Conjeturar, vigilar la conjetura y no cerrarla antes de tiempo son tres momentos de un mismo gesto, y el capítulo 14 le dio su nombre antiguo, phronesis. Lo que puede agregarse aquí es el orden de los fracasos: sin conjetura no hay diagnóstico; sin vigilancia, el diagnóstico se vuelve certeza; sin humildad, la certeza se vuelve ficha. El segundo va del dato al contexto: la funcionalidad, el pronóstico de fondo y la red de apoyo son hechos clínicos, y una decisión que los omitió no es más objetiva sino más incompleta. El tercero va de la ficha al razonador: escribir la nota es parte de pensar. Por eso la inteligencia artificial, que produce la prosa fluida contra la que entrena cada capítulo —hechos, inferencias e invenciones con la misma sintaxis—, no cambia la disciplina: la vuelve urgente, sobre todo para quien todavía está formando el juicio que la herramienta ofrece reemplazar. Ante una respuesta automática como ante la propia narrativa, la pregunta es la misma: qué proviene del caso, qué fue inferido, qué permanece incierto y qué responsabilidad implica actuar.</w:t>
       </w:r>
     </w:p>
     <w:p>
@@ -14996,7 +14883,7 @@
         <w:pStyle w:val="BodyJ"/>
       </w:pPr>
       <w:r>
-        <w:t xml:space="preserve">La medicina necesita afirmaciones suficientemente firmes para coordinar acciones y suficientemente abiertas para admitir corrección. Esa doble exigencia no es una contradicción que deba resolverse eligiendo seguridad o duda, sino la forma propia del juicio clínico. La frase medular es valiosa porque condensa esa arquitectura: conserva el hecho, gradúa la inferencia, localiza la incertidumbre y hace visible la decisión.</w:t>
+        <w:t xml:space="preserve">La medicina necesita afirmaciones suficientemente firmes para coordinar acciones y suficientemente abiertas para admitir corrección. Esa doble exigencia no es una contradicción que deba resolverse eligiendo seguridad o duda, sino la forma propia del juicio clínico.</w:t>
       </w:r>
     </w:p>
     <w:p>
@@ -15434,58 +15321,25 @@
           <w:b/>
           <w:bCs/>
         </w:rPr>
-        <w:t xml:space="preserve">Versión de 60 segundos</w:t>
-      </w:r>
-      <w:r>
-        <w:t xml:space="preserve"> (para casos de rutina o alta presión de tiempo)</w:t>
-      </w:r>
-    </w:p>
-    <w:p>
-      <w:pPr>
-        <w:pStyle w:val="BodyJ"/>
-        <w:numPr>
-          <w:ilvl w:val="0"/>
-          <w:numId w:val="28"/>
-        </w:numPr>
-      </w:pPr>
-      <w:r>
-        <w:t xml:space="preserve">¿Qué vi y qué me contaron? (un hecho decisivo, con fuente)</w:t>
-      </w:r>
-    </w:p>
-    <w:p>
-      <w:pPr>
-        <w:pStyle w:val="BodyJ"/>
-        <w:numPr>
-          <w:ilvl w:val="0"/>
-          <w:numId w:val="28"/>
-        </w:numPr>
-      </w:pPr>
-      <w:r>
-        <w:t xml:space="preserve">¿Qué creo y cuánto derecho tengo a creerlo? (inferencia con grado)</w:t>
-      </w:r>
-    </w:p>
-    <w:p>
-      <w:pPr>
-        <w:pStyle w:val="BodyJ"/>
-        <w:numPr>
-          <w:ilvl w:val="0"/>
-          <w:numId w:val="28"/>
-        </w:numPr>
-      </w:pPr>
-      <w:r>
-        <w:t xml:space="preserve">¿Qué daño importante podría producir si estoy equivocado? (la incertidumbre peligrosa)</w:t>
-      </w:r>
-    </w:p>
-    <w:p>
-      <w:pPr>
-        <w:pStyle w:val="BodyJ"/>
-        <w:numPr>
-          <w:ilvl w:val="0"/>
-          <w:numId w:val="28"/>
-        </w:numPr>
-      </w:pPr>
-      <w:r>
-        <w:t xml:space="preserve">¿Qué hago y qué me haría cambiar antes del próximo control? (decisión con reapertura)</w:t>
+        <w:t xml:space="preserve">Plantilla condensada</w:t>
+      </w:r>
+      <w:r>
+        <w:t xml:space="preserve"> (una línea por campo, para la nota difícil): pregunta operativa · hechos decisivos · inferencia principal y grado · alternativa que cambiaría la conducta · incertidumbre crítica · contexto global · decisión y razón · criterio de reapertura.</w:t>
+      </w:r>
+    </w:p>
+    <w:p>
+      <w:pPr>
+        <w:pStyle w:val="BodyJ"/>
+      </w:pPr>
+      <w:r>
+        <w:rPr>
+          <w:b/>
+          <w:bCs/>
+        </w:rPr>
+        <w:t xml:space="preserve">Versión de sesenta segundos</w:t>
+      </w:r>
+      <w:r>
+        <w:t xml:space="preserve"> (para casos de rutina o alta presión de tiempo): las cuatro preguntas de la caja del capítulo 15, reproducidas en la tarjeta de la última página.</w:t>
       </w:r>
     </w:p>
     <w:p>
@@ -16760,7 +16614,7 @@
         <w:pStyle w:val="BodyJ"/>
         <w:numPr>
           <w:ilvl w:val="0"/>
-          <w:numId w:val="29"/>
+          <w:numId w:val="28"/>
         </w:numPr>
       </w:pPr>
       <w:r>
@@ -16772,7 +16626,7 @@
         <w:pStyle w:val="BodyJ"/>
         <w:numPr>
           <w:ilvl w:val="0"/>
-          <w:numId w:val="29"/>
+          <w:numId w:val="28"/>
         </w:numPr>
       </w:pPr>
       <w:r>
@@ -16784,7 +16638,7 @@
         <w:pStyle w:val="BodyJ"/>
         <w:numPr>
           <w:ilvl w:val="0"/>
-          <w:numId w:val="29"/>
+          <w:numId w:val="28"/>
         </w:numPr>
       </w:pPr>
       <w:r>
@@ -16796,7 +16650,7 @@
         <w:pStyle w:val="BodyJ"/>
         <w:numPr>
           <w:ilvl w:val="0"/>
-          <w:numId w:val="29"/>
+          <w:numId w:val="28"/>
         </w:numPr>
       </w:pPr>
       <w:r>
@@ -16808,7 +16662,7 @@
         <w:pStyle w:val="BodyJ"/>
         <w:numPr>
           <w:ilvl w:val="0"/>
-          <w:numId w:val="29"/>
+          <w:numId w:val="28"/>
         </w:numPr>
       </w:pPr>
       <w:r>
@@ -16820,7 +16674,7 @@
         <w:pStyle w:val="BodyJ"/>
         <w:numPr>
           <w:ilvl w:val="0"/>
-          <w:numId w:val="29"/>
+          <w:numId w:val="28"/>
         </w:numPr>
       </w:pPr>
       <w:r>
@@ -16832,7 +16686,7 @@
         <w:pStyle w:val="BodyJ"/>
         <w:numPr>
           <w:ilvl w:val="0"/>
-          <w:numId w:val="29"/>
+          <w:numId w:val="28"/>
         </w:numPr>
       </w:pPr>
       <w:r>
@@ -16844,7 +16698,7 @@
         <w:pStyle w:val="BodyJ"/>
         <w:numPr>
           <w:ilvl w:val="0"/>
-          <w:numId w:val="29"/>
+          <w:numId w:val="28"/>
         </w:numPr>
       </w:pPr>
       <w:r>
@@ -16856,7 +16710,7 @@
         <w:pStyle w:val="BodyJ"/>
         <w:numPr>
           <w:ilvl w:val="0"/>
-          <w:numId w:val="29"/>
+          <w:numId w:val="28"/>
         </w:numPr>
       </w:pPr>
       <w:r>
@@ -16868,7 +16722,7 @@
         <w:pStyle w:val="BodyJ"/>
         <w:numPr>
           <w:ilvl w:val="0"/>
-          <w:numId w:val="29"/>
+          <w:numId w:val="28"/>
         </w:numPr>
       </w:pPr>
       <w:r>
@@ -16880,7 +16734,7 @@
         <w:pStyle w:val="BodyJ"/>
         <w:numPr>
           <w:ilvl w:val="0"/>
-          <w:numId w:val="29"/>
+          <w:numId w:val="28"/>
         </w:numPr>
       </w:pPr>
       <w:r>
@@ -16892,7 +16746,7 @@
         <w:pStyle w:val="BodyJ"/>
         <w:numPr>
           <w:ilvl w:val="0"/>
-          <w:numId w:val="29"/>
+          <w:numId w:val="28"/>
         </w:numPr>
       </w:pPr>
       <w:r>
@@ -17016,7 +16870,7 @@
         </w:numPr>
       </w:pPr>
       <w:r>
-        <w:t xml:space="preserve">Cuando se active, usar las cuatro preguntas de la versión de 60 segundos en voz alta. Duración objetivo: dos minutos por caso. Quien dirige la visita modela; no interroga.</w:t>
+        <w:t xml:space="preserve">Cuando se active, usar las cuatro preguntas de la versión de sesenta segundos en voz alta. Duración objetivo: dos minutos por caso. Quien dirige la visita modela; no interroga.</w:t>
       </w:r>
     </w:p>
     <w:p>
@@ -17081,7 +16935,7 @@
         </w:numPr>
       </w:pPr>
       <w:r>
-        <w:t xml:space="preserve">Revisar las plantillas electrónicas existentes: eliminar campos que inducen copia, agregar un campo breve de «criterio de reevaluación».</w:t>
+        <w:t xml:space="preserve">Revisar las plantillas electrónicas existentes: eliminar campos que inducen copia, agregar un campo breve de «criterio de reapertura».</w:t>
       </w:r>
     </w:p>
     <w:p>
@@ -20529,7 +20383,7 @@
         </w:numPr>
       </w:pPr>
       <w:r>
-        <w:t xml:space="preserve">Figura 15. Parentescos: cada riesgo de la IA clínica junto al sesgo que este libro ya había descrito (Capítulo 17).</w:t>
+        <w:t xml:space="preserve">Figura 15. Parentescos: cada riesgo de la IA clínica junto al sesgo ya descrito (Capítulo 17).</w:t>
       </w:r>
     </w:p>
     <w:p>
@@ -23626,7 +23480,7 @@
         <w:pStyle w:val="BodyJ"/>
       </w:pPr>
       <w:r>
-        <w:t xml:space="preserve">Para recortar y llevar en el bolsillo del delantal. Cuatro preguntas y una cláusula; en voz alta en la visita de sala o por escrito antes de firmar un alta. La versión completa está en el capítulo 15 y en el Apéndice A.</w:t>
+        <w:t xml:space="preserve">Para recortar y llevar en el bolsillo del delantal. Cuatro preguntas y un criterio de reapertura; en voz alta en la visita de sala o por escrito antes de firmar un alta. La versión completa está en el capítulo 15 y en el Apéndice A.</w:t>
       </w:r>
     </w:p>
     <w:tbl>
@@ -23832,7 +23686,7 @@
                 <w:sz w:val="17"/>
                 <w:szCs w:val="17"/>
               </w:rPr>
-              <w:t xml:space="preserve">Cláusula de cierre:</w:t>
+              <w:t xml:space="preserve">Criterio de reapertura:</w:t>
             </w:r>
             <w:r>
               <w:rPr>
@@ -24391,18 +24245,6 @@
     </w:lvl>
   </w:abstractNum>
   <w:abstractNum w:abstractNumId="28" w15:restartNumberingAfterBreak="0">
-    <w:multiLevelType w:val="hybridMultilevel"/>
-    <w:lvl w:ilvl="0" w15:tentative="1">
-      <w:start w:val="1"/>
-      <w:numFmt w:val="decimal"/>
-      <w:lvlText w:val="%1."/>
-      <w:lvlJc w:val="left"/>
-      <w:pPr>
-        <w:ind w:left="560" w:hanging="280"/>
-      </w:pPr>
-    </w:lvl>
-  </w:abstractNum>
-  <w:abstractNum w:abstractNumId="29" w15:restartNumberingAfterBreak="0">
     <w:multiLevelType w:val="hybridMultilevel"/>
     <w:lvl w:ilvl="0" w15:tentative="1">
       <w:start w:val="1"/>
@@ -24578,12 +24420,6 @@
   </w:num>
   <w:num w:numId="28">
     <w:abstractNumId w:val="28"/>
-    <w:lvlOverride w:ilvl="0">
-      <w:startOverride w:val="1"/>
-    </w:lvlOverride>
-  </w:num>
-  <w:num w:numId="29">
-    <w:abstractNumId w:val="29"/>
     <w:lvlOverride w:ilvl="0">
       <w:startOverride w:val="1"/>
     </w:lvlOverride>

</xml_diff>

<commit_message>
Bisagra del capítulo 13 sin sacar al paciente del equipo; plural de «criterios de reevaluación» retirado
La revisión automática del PR señaló que la oración bisagra nueva del
capítulo 13 («con quien no pertenece a él: el paciente») contradecía la
apertura del mismo capítulo, que incluye a pacientes y familiares en la
cognición distribuida del equipo. Queda: «la que sostiene con el
paciente, que forma parte de la red y es quien más arriesga en ella».
De paso, «criterios de reevaluación» en plural (caps. 13 y 16), que el
conteo en singular de la pasada anterior no había visto, pasa al término
canónico «criterios de reapertura». Entregables reconstruidos: 165
páginas, TOC 40/40 estable.

Co-Authored-By: Claude Fable 5.1 <noreply@anthropic.com>
Claude-Session: https://claude.ai/code/session_01SPkhDdVzUCxJwqq61ddeLW
</commit_message>
<xml_diff>
--- a/libro/Hechos_inferencias_incertidumbre_edicion_revisada.docx
+++ b/libro/Hechos_inferencias_incertidumbre_edicion_revisada.docx
@@ -9377,7 +9377,7 @@
         <w:pStyle w:val="BodyJ"/>
       </w:pPr>
       <w:r>
-        <w:t xml:space="preserve">Un sistema seguro no depende de que cada individuo recuerde cuestionarlo todo. Diseña momentos y artefactos que facilitan detectar discordancias: tendencias visibles, alertas selectivas, listas de problemas actualizadas, criterios de reevaluación, acceso a datos fuente y roles claros para escalar preocupación. La National Academies conceptualizó el diagnóstico como un proceso de equipo y aprendizaje continuo, no como un acto aislado (National Academies of Sciences, Engineering, and Medicine, 2015).</w:t>
+        <w:t xml:space="preserve">Un sistema seguro no depende de que cada individuo recuerde cuestionarlo todo. Diseña momentos y artefactos que facilitan detectar discordancias: tendencias visibles, alertas selectivas, listas de problemas actualizadas, criterios de reapertura, acceso a datos fuente y roles claros para escalar preocupación. La National Academies conceptualizó el diagnóstico como un proceso de equipo y aprendizaje continuo, no como un acto aislado (National Academies of Sciences, Engineering, and Medicine, 2015).</w:t>
       </w:r>
     </w:p>
     <w:p>
@@ -9410,7 +9410,7 @@
         <w:pStyle w:val="BodyJ"/>
       </w:pPr>
       <w:r>
-        <w:t xml:space="preserve">Queda la conversación más difícil del equipo, que es con quien no pertenece a él: el paciente. Muchos clínicos temen que expresar incertidumbre debilite la confianza del paciente o del equipo. El resultado puede ser un lenguaje excesivamente categórico. El dilema es falso: la alternativa a la certeza no es la desorientación, sino una explicación estructurada de lo que se sabe, lo que se sospecha, lo que importa y qué se hará.</w:t>
+        <w:t xml:space="preserve">Queda la conversación más difícil del equipo: la que sostiene con el paciente, que forma parte de la red y es quien más arriesga en ella. Muchos clínicos temen que expresar incertidumbre debilite la confianza del paciente o del equipo. El resultado puede ser un lenguaje excesivamente categórico. El dilema es falso: la alternativa a la certeza no es la desorientación, sino una explicación estructurada de lo que se sabe, lo que se sospecha, lo que importa y qué se hará.</w:t>
       </w:r>
     </w:p>
     <w:p>
@@ -13243,7 +13243,7 @@
         <w:pStyle w:val="BodyJ"/>
       </w:pPr>
       <w:r>
-        <w:t xml:space="preserve">La tercera palanca es la ficha, y su primera forma es la plantilla. Las plantillas de ficha pueden apoyar o degradar el pensamiento. Campos obligatorios interminables producen copia; campos demasiado libres ocultan información crítica. Una plantilla equilibrada incluye problema, hechos nuevos, evaluación con grado de certeza, plan y criterios de reevaluación. La tecnología debería facilitar comparación temporal y procedencia de datos, no sólo acumular texto.</w:t>
+        <w:t xml:space="preserve">La tercera palanca es la ficha, y su primera forma es la plantilla. Las plantillas de ficha pueden apoyar o degradar el pensamiento. Campos obligatorios interminables producen copia; campos demasiado libres ocultan información crítica. Una plantilla equilibrada incluye problema, hechos nuevos, evaluación con grado de certeza, plan y criterios de reapertura. La tecnología debería facilitar comparación temporal y procedencia de datos, no sólo acumular texto.</w:t>
       </w:r>
     </w:p>
     <w:p>

</xml_diff>

<commit_message>
Entregables reconstruidos con el Glosario bilingüe y README punto 38
DOCX, PDF y EPUB regenerados desde las fuentes de 9a297dc: 166 páginas
(162 de cuerpo; el Glosario crece una página), TOC 40/40 estable, EPUB
con 44 capítulos, 160 referencias sin huérfanas, cero comillas rectas.
El README registra la regla del Glosario bilingüe, las entradas nuevas
y el criterio editorial acordado con el autor.

Co-Authored-By: Claude Fable 5.1 <noreply@anthropic.com>
Claude-Session: https://claude.ai/code/session_01SPkhDdVzUCxJwqq61ddeLW
</commit_message>
<xml_diff>
--- a/libro/Hechos_inferencias_incertidumbre_edicion_revisada.docx
+++ b/libro/Hechos_inferencias_incertidumbre_edicion_revisada.docx
@@ -887,7 +887,7 @@
         <w:rPr>
           <w:color w:val="8A8A8A"/>
         </w:rPr>
-        <w:t xml:space="preserve">144</w:t>
+        <w:t xml:space="preserve">145</w:t>
       </w:r>
     </w:p>
     <w:p>
@@ -907,7 +907,7 @@
         <w:rPr>
           <w:color w:val="8A8A8A"/>
         </w:rPr>
-        <w:t xml:space="preserve">148</w:t>
+        <w:t xml:space="preserve">149</w:t>
       </w:r>
     </w:p>
     <w:p>
@@ -927,7 +927,7 @@
         <w:rPr>
           <w:color w:val="8A8A8A"/>
         </w:rPr>
-        <w:t xml:space="preserve">149</w:t>
+        <w:t xml:space="preserve">150</w:t>
       </w:r>
     </w:p>
     <w:p>
@@ -947,7 +947,7 @@
         <w:rPr>
           <w:color w:val="8A8A8A"/>
         </w:rPr>
-        <w:t xml:space="preserve">151</w:t>
+        <w:t xml:space="preserve">152</w:t>
       </w:r>
     </w:p>
     <w:p>
@@ -967,7 +967,7 @@
         <w:rPr>
           <w:color w:val="8A8A8A"/>
         </w:rPr>
-        <w:t xml:space="preserve">161</w:t>
+        <w:t xml:space="preserve">162</w:t>
       </w:r>
     </w:p>
     <w:p>
@@ -5682,7 +5682,7 @@
         <w:pStyle w:val="BodyJ"/>
       </w:pPr>
       <w:r>
-        <w:t xml:space="preserve">Schmidt y Rikers describieron un desarrollo desde conocimiento biomédico elaborado hacia encapsulación y formación de illness scripts (Schmidt &amp; Rikers, 2007). El experto no olvida la fisiología; la comprime en conceptos clínicos que pueden desplegarse cuando aparece una anomalía. La experiencia permite saltar niveles, pero el salto sigue apoyado en estructuras aprendidas.</w:t>
+        <w:t xml:space="preserve">Schmidt y Rikers describieron un desarrollo desde conocimiento biomédico elaborado hacia encapsulación (knowledge encapsulation) y formación de illness scripts (Schmidt &amp; Rikers, 2007). El experto no olvida la fisiología; la comprime en conceptos clínicos que pueden desplegarse cuando aparece una anomalía. La experiencia permite saltar niveles, pero el salto sigue apoyado en estructuras aprendidas.</w:t>
       </w:r>
     </w:p>
     <w:p>
@@ -5756,7 +5756,7 @@
         <w:pStyle w:val="BodyJ"/>
       </w:pPr>
       <w:r>
-        <w:t xml:space="preserve">Las teorías de doble proceso distinguen un modo rápido, asociativo y automático de otro más lento, analítico y controlado. En clínica han sido útiles para explicar reconocimiento de patrones y revisión deliberada (Croskerry, 2009; Norman, 2009). No deben interpretarse como dos sistemas anatómicos aislados ni como una oposición moral entre intuición mala y análisis bueno. Los procesos interactúan y ambos pueden acertar o errar (Evans &amp; Stanovich, 2013).</w:t>
+        <w:t xml:space="preserve">Las teorías de doble proceso (dual-process theories) distinguen un modo rápido, asociativo y automático de otro más lento, analítico y controlado. En clínica han sido útiles para explicar reconocimiento de patrones y revisión deliberada (Croskerry, 2009; Norman, 2009). No deben interpretarse como dos sistemas anatómicos aislados ni como una oposición moral entre intuición mala y análisis bueno. Los procesos interactúan y ambos pueden acertar o errar (Evans &amp; Stanovich, 2013).</w:t>
       </w:r>
     </w:p>
     <w:p>
@@ -5830,7 +5830,7 @@
         <w:pStyle w:val="BodyJ"/>
       </w:pPr>
       <w:r>
-        <w:t xml:space="preserve">¿Cuándo confiar, entonces, en la primera impresión? La respuesta menos romántica salió del debate entre el programa de los sesgos y el de la pericia naturalista, que terminó en un acuerdo célebre (Kahneman &amp; Klein, 2009). La intuición es confiable cuando se formó en un entorno de validez alta —regularidades estables entre señales y desenlaces— y con oportunidad real de aprenderlas, es decir, feedback oportuno y veraz. Sin esas dos condiciones la sensación de saber crece igual, pero sin correlato. La clínica contiene ambos mundos. La sala de reanimación y la lectura de patrones radiológicos entrenan intuiciones con feedback rápido; la consulta de síntomas inespecíficos cuyos desenlaces nadie vuelve a ver produce fluidez sin calibración — la sobreconfianza del capítulo 5, fabricada por el entorno. La pregunta operativa frente a la propia seguridad no es «¿cuánta experiencia tengo?», sino «¿en qué entorno se formó esta impresión, y quién me avisó cuando fallé?».</w:t>
+        <w:t xml:space="preserve">¿Cuándo confiar, entonces, en la primera impresión? La respuesta menos romántica salió del debate entre el programa de los sesgos y el de la pericia naturalista, que terminó en un acuerdo célebre (Kahneman &amp; Klein, 2009). La intuición es confiable cuando se formó en un entorno de validez alta (high-validity environment) —regularidades estables entre señales y desenlaces— y con oportunidad real de aprenderlas, es decir, feedback oportuno y veraz. Sin esas dos condiciones la sensación de saber crece igual, pero sin correlato. La clínica contiene ambos mundos. La sala de reanimación y la lectura de patrones radiológicos entrenan intuiciones con feedback rápido; la consulta de síntomas inespecíficos cuyos desenlaces nadie vuelve a ver produce fluidez sin calibración — la sobreconfianza del capítulo 5, fabricada por el entorno. La pregunta operativa frente a la propia seguridad no es «¿cuánta experiencia tengo?», sino «¿en qué entorno se formó esta impresión, y quién me avisó cuando fallé?».</w:t>
       </w:r>
     </w:p>
     <w:p>
@@ -5856,7 +5856,7 @@
         <w:t xml:space="preserve">Ética y acción</w:t>
       </w:r>
       <w:r>
-        <w:t xml:space="preserve"> sostuvo que la pericia ética —y la pericia en general— no es deliberación sino un saber hacer inmediato, encarnado, que responde a la situación sin pasar por reglas ni por juicios explícitos (Varela, 1996). La deliberación aparece sólo en el quiebre, cuando la respuesta espontánea falla o la situación no calza con lo aprendido. La cirujana que abre este capítulo no calló un razonamiento en ese minuto: no lo había. Esto parece contradecir un libro que pide explicitar en cada página, y no lo contradice si se lee bien. Las pausas del capítulo 8 son los quiebres de Varela puestos por diseño donde la experiencia enseña que la respuesta inmediata se equivoca. La explicitación de la cirujana en el pasillo no fue parte de su juicio sino de su transmisión. Y la ficha no fotografía la cognición del que escribe: le presta al siguiente lector lo que necesita para revisarla. Lo que Varela corrige es la descripción: la buena práctica no consiste en pensar explícitamente, consiste en responder bien y en reconocer el quiebre. Y lo que advierte es un costo: la explicitación sin disparador no protege al experto, lo degrada a principiante. Por eso la versión completa de HII-D se reserva para los casos difíciles, y la humildad que el capítulo 14 defenderá no es la del que duda de todo, sino la del que sabe cuándo su saber hacer dejó de bastar.</w:t>
+        <w:t xml:space="preserve"> sostuvo que la pericia ética —y la pericia en general— no es deliberación sino un saber hacer inmediato, encarnado, que responde a la situación sin pasar por reglas ni por juicios explícitos (Varela, 1996). La deliberación aparece sólo en el quiebre (breakdown), cuando la respuesta espontánea falla o la situación no calza con lo aprendido. La cirujana que abre este capítulo no calló un razonamiento en ese minuto: no lo había. Esto parece contradecir un libro que pide explicitar en cada página, y no lo contradice si se lee bien. Las pausas del capítulo 8 son los quiebres de Varela puestos por diseño donde la experiencia enseña que la respuesta inmediata se equivoca. La explicitación de la cirujana en el pasillo no fue parte de su juicio sino de su transmisión. Y la ficha no fotografía la cognición del que escribe: le presta al siguiente lector lo que necesita para revisarla. Lo que Varela corrige es la descripción: la buena práctica no consiste en pensar explícitamente, consiste en responder bien y en reconocer el quiebre. Y lo que advierte es un costo: la explicitación sin disparador no protege al experto, lo degrada a principiante. Por eso la versión completa de HII-D se reserva para los casos difíciles, y la humildad que el capítulo 14 defenderá no es la del que duda de todo, sino la del que sabe cuándo su saber hacer dejó de bastar.</w:t>
       </w:r>
     </w:p>
     <w:p>
@@ -6745,7 +6745,7 @@
         <w:t xml:space="preserve">Shoshin</w:t>
       </w:r>
       <w:r>
-        <w:t xml:space="preserve">, la mente del principiante, no es ignorancia, sino la disposición a mirar lo que ya se conoce como si fuera la primera vez, sin que el nombre decida por adelantado. Presentar el caso sin la etiqueta es </w:t>
+        <w:t xml:space="preserve">, la mente del principiante (beginner's mind), no es ignorancia, sino la disposición a mirar lo que ya se conoce como si fuera la primera vez, sin que el nombre decida por adelantado. Presentar el caso sin la etiqueta es </w:t>
       </w:r>
       <w:r>
         <w:rPr>
@@ -6806,7 +6806,7 @@
         <w:pStyle w:val="BodyJ"/>
       </w:pPr>
       <w:r>
-        <w:t xml:space="preserve">Una pausa diagnóstica puede incorporarse a visitas de sala, altas y entregas de turno. No necesita preguntar por todas las enfermedades posibles. Debe focalizarse en riesgos: ¿qué podría estar pasando que no estamos tratando?, ¿qué supuesto no verificamos?, ¿qué explicación alternativa cambia el destino o el tiempo de intervención?</w:t>
+        <w:t xml:space="preserve">Una pausa diagnóstica (diagnostic time-out) puede incorporarse a visitas de sala, altas y entregas de turno. No necesita preguntar por todas las enfermedades posibles. Debe focalizarse en riesgos: ¿qué podría estar pasando que no estamos tratando?, ¿qué supuesto no verificamos?, ¿qué explicación alternativa cambia el destino o el tiempo de intervención?</w:t>
       </w:r>
     </w:p>
     <w:p>
@@ -7512,7 +7512,7 @@
         <w:pStyle w:val="BodyJ"/>
       </w:pPr>
       <w:r>
-        <w:t xml:space="preserve">Pauker y Kassirer formalizaron el enfoque de umbrales: bajo cierto nivel de probabilidad no se investiga o trata; en una zona intermedia se testea; sobre un umbral se actúa (Pauker &amp; Kassirer, 1980). Los valores exactos rara vez se calculan al lado de la cama, pero la estructura es útil. El umbral depende de sensibilidad y especificidad de pruebas, beneficio y daño del tratamiento, urgencia, reversibilidad y preferencias.</w:t>
+        <w:t xml:space="preserve">Pauker y Kassirer formalizaron el enfoque de umbrales (threshold approach): bajo cierto nivel de probabilidad no se investiga o trata; en una zona intermedia se testea; sobre un umbral se actúa (Pauker &amp; Kassirer, 1980). Los valores exactos rara vez se calculan al lado de la cama, pero la estructura es útil. El umbral depende de sensibilidad y especificidad de pruebas, beneficio y daño del tratamiento, urgencia, reversibilidad y preferencias.</w:t>
       </w:r>
     </w:p>
     <w:tbl>
@@ -7762,7 +7762,7 @@
         <w:t xml:space="preserve">ya es suficiente</w:t>
       </w:r>
       <w:r>
-        <w:t xml:space="preserve"> exige ponderar qué tan grave sería equivocarse, y esa ponderación es un juicio de valor (Rudner, 1953, p. 2). Heather Douglas llamó a esto riesgo inductivo y sostuvo que atraviesa toda la ciencia con consecuencias prácticas. Cuánta evidencia se exige antes de afirmar que un compuesto es tóxico depende de qué error —afirmar de más o afirmar de menos— produce más daño (Douglas, 2000, pp. 565-577).</w:t>
+        <w:t xml:space="preserve"> exige ponderar qué tan grave sería equivocarse, y esa ponderación es un juicio de valor (Rudner, 1953, p. 2). Heather Douglas llamó a esto riesgo inductivo (inductive risk) y sostuvo que atraviesa toda la ciencia con consecuencias prácticas. Cuánta evidencia se exige antes de afirmar que un compuesto es tóxico depende de qué error —afirmar de más o afirmar de menos— produce más daño (Douglas, 2000, pp. 565-577).</w:t>
       </w:r>
     </w:p>
     <w:p>
@@ -7827,7 +7827,7 @@
         <w:pStyle w:val="BodyJ"/>
       </w:pPr>
       <w:r>
-        <w:t xml:space="preserve">La bioética clínica ofrece herramientas de trabajo para este cruce, y la más difundida tiene un aire de familia con HII-D. Jonsen, Siegler y Winslade propusieron ordenar todo caso en cuatro tópicos: indicaciones médicas, preferencias del paciente, calidad de vida y rasgos contextuales — familia, cultura, recursos, ley (Jonsen, Siegler &amp; Winslade, 2022). El orden importa y no es una jerarquía: las indicaciones van primero porque sin ellas no hay caso, pero nunca van solas. Usado con honestidad, el método funciona como una lista de verificación deliberativa: ningún cuadrante puede quedar vacío sin que la decisión quede coja, y el cuadrante que más cuesta llenar señala qué conversación falta.</w:t>
+        <w:t xml:space="preserve">La bioética clínica ofrece herramientas de trabajo para este cruce, y la más difundida tiene un aire de familia con HII-D. Jonsen, Siegler y Winslade propusieron ordenar todo caso en cuatro tópicos (four topics): indicaciones médicas, preferencias del paciente, calidad de vida y rasgos contextuales — familia, cultura, recursos, ley (Jonsen, Siegler &amp; Winslade, 2022). El orden importa y no es una jerarquía: las indicaciones van primero porque sin ellas no hay caso, pero nunca van solas. Usado con honestidad, el método funciona como una lista de verificación deliberativa: ningún cuadrante puede quedar vacío sin que la decisión quede coja, y el cuadrante que más cuesta llenar señala qué conversación falta.</w:t>
       </w:r>
     </w:p>
     <w:p>
@@ -9551,7 +9551,7 @@
         <w:pStyle w:val="BodyJ"/>
       </w:pPr>
       <w:r>
-        <w:t xml:space="preserve">Hay una gramática para eso, y la escribió un chileno. Flores, con Winograd, describió el trabajo coordinado como una red de «conversaciones para la acción»: alguien pide, alguien promete, la promesa tiene condiciones de satisfacción y un plazo, y se cierra con una declaración de cumplimiento o de incumplimiento (Winograd &amp; Flores, 1986). Leída así, una entrega de turno no transfiere información: distribuye compromisos. «Está cubierto» es una promesa sin dueño ni condiciones. «El hemocultivo lo revisa la residente de noche a las 2:00 y avisa si crece un gramnegativo» es una promesa completa: quién, qué, cuándo y cómo se sabrá que se cumplió. Es la pregunta de Austin del capítulo 4 —qué acaba de hacer esta oración— aplicada a la frase más frecuente del hospital. La incertidumbre no desaparece al entregarla; cambia de dueño, y la gramática de Flores obliga a decir a quién.</w:t>
+        <w:t xml:space="preserve">Hay una gramática para eso, y la escribió un chileno. Flores, con Winograd, describió el trabajo coordinado como una red de «conversaciones para la acción» (conversation for action): alguien pide, alguien promete, la promesa tiene condiciones de satisfacción y un plazo, y se cierra con una declaración de cumplimiento o de incumplimiento (Winograd &amp; Flores, 1986). Leída así, una entrega de turno no transfiere información: distribuye compromisos. «Está cubierto» es una promesa sin dueño ni condiciones. «El hemocultivo lo revisa la residente de noche a las 2:00 y avisa si crece un gramnegativo» es una promesa completa: quién, qué, cuándo y cómo se sabrá que se cumplió. Es la pregunta de Austin del capítulo 4 —qué acaba de hacer esta oración— aplicada a la frase más frecuente del hospital. La incertidumbre no desaparece al entregarla; cambia de dueño, y la gramática de Flores obliga a decir a quién.</w:t>
       </w:r>
     </w:p>
     <w:p>
@@ -9943,7 +9943,17 @@
         <w:pStyle w:val="BodyJ"/>
       </w:pPr>
       <w:r>
-        <w:t xml:space="preserve">Hay que decirlo de entrada, porque el resto del capítulo lo presupone: pensar bien es parte de la ética primordial del médico, no un refinamiento intelectual que se agrega a ella. Es su herramienta principal, de la que parte todo lo demás — y en la que, cuando falla, termina todo lo demás. La idea tiene un antecedente filosófico exacto. Clifford sostuvo en 1877 que creer algo sin evidencia suficiente es siempre, en todo lugar y para cualquiera, un acto reprochable (Clifford, 1877, §I). Lo ilustró con un armador que, sin inspeccionar su barco, se convence de que es seguro y lo deja zarpar. Si el barco llega a puerto, el armador no es menos culpable, porque la creencia se formó sin derecho a formarse. La medicina es el oficio donde esa tesis deja de ser una exageración. El médico que escribe «se descarta» sin un método que excluya, o «cuadro habitual» sin haber mirado las rodillas moteadas, ha hecho lo del armador, y un desenlace benigno no lo absuelve. La viñeta 6 lo dice al revés: el mismo proceso con una crisis de pánico real habría sido igual de indefendible. Por eso el deber de pensar bien no se agota en la competencia. Incluye el deber de saber cuándo uno no está en condiciones de pensar bien (capítulo 8) y de organizar el trabajo para que otro instrumento revise el juicio. La ética clínica no empieza en el comité ni en el consentimiento; empieza en la calidad de la creencia que sostiene la primera frase de la ficha.</w:t>
+        <w:t xml:space="preserve">Hay que decirlo de entrada, porque el resto del capítulo lo presupone: pensar bien es parte de la ética primordial del médico, no un refinamiento intelectual que se agrega a ella. Es su herramienta principal, de la que parte todo lo demás — y en la que, cuando falla, termina todo lo demás. La idea tiene un antecedente filosófico exacto. Clifford sostuvo en 1877, en «La ética de la creencia» (</w:t>
+      </w:r>
+      <w:r>
+        <w:rPr>
+          <w:i/>
+          <w:iCs/>
+        </w:rPr>
+        <w:t xml:space="preserve">The Ethics of Belief</w:t>
+      </w:r>
+      <w:r>
+        <w:t xml:space="preserve">), que creer algo sin evidencia suficiente es siempre, en todo lugar y para cualquiera, un acto reprochable (Clifford, 1877, §I). Lo ilustró con un armador que, sin inspeccionar su barco, se convence de que es seguro y lo deja zarpar. Si el barco llega a puerto, el armador no es menos culpable, porque la creencia se formó sin derecho a formarse. La medicina es el oficio donde esa tesis deja de ser una exageración. El médico que escribe «se descarta» sin un método que excluya, o «cuadro habitual» sin haber mirado las rodillas moteadas, ha hecho lo del armador, y un desenlace benigno no lo absuelve. La viñeta 6 lo dice al revés: el mismo proceso con una crisis de pánico real habría sido igual de indefendible. Por eso el deber de pensar bien no se agota en la competencia. Incluye el deber de saber cuándo uno no está en condiciones de pensar bien (capítulo 8) y de organizar el trabajo para que otro instrumento revise el juicio. La ética clínica no empieza en el comité ni en el consentimiento; empieza en la calidad de la creencia que sostiene la primera frase de la ficha.</w:t>
       </w:r>
     </w:p>
     <w:p>
@@ -10131,7 +10141,7 @@
         <w:pStyle w:val="BodyJ"/>
       </w:pPr>
       <w:r>
-        <w:t xml:space="preserve">La decisión compartida no significa que médico y paciente aporten lo mismo. El profesional ofrece conocimiento técnico, estimación de consecuencias y recomendación; el paciente aporta experiencia, objetivos y tolerancia al riesgo (Elwyn et al., 2012).</w:t>
+        <w:t xml:space="preserve">La decisión compartida (shared decision-making) no significa que médico y paciente aporten lo mismo. El profesional ofrece conocimiento técnico, estimación de consecuencias y recomendación; el paciente aporta experiencia, objetivos y tolerancia al riesgo (Elwyn et al., 2012).</w:t>
       </w:r>
     </w:p>
     <w:p>
@@ -12897,7 +12907,7 @@
         <w:t xml:space="preserve">Inferencia:</w:t>
       </w:r>
       <w:r>
-        <w:t xml:space="preserve"> la explicación «queja somática en contexto de patología psiquiátrica» es posible, pero está recibiendo un peso que no proviene de los datos de hoy sino del estigma: nada en la taquicardia es psiquiátrico. El fenómeno tiene nombre —ensombrecimiento diagnóstico: atribuir los síntomas físicos a la enfermedad mental— y consecuencias medibles: las personas con enfermedad mental grave mueren 15 a 20 años antes, en gran parte por enfermedad física subdiagnosticada y subtratada (Thornicroft, 2011).</w:t>
+        <w:t xml:space="preserve"> la explicación «queja somática en contexto de patología psiquiátrica» es posible, pero está recibiendo un peso que no proviene de los datos de hoy sino del estigma: nada en la taquicardia es psiquiátrico. El fenómeno tiene nombre —ensombrecimiento diagnóstico (diagnostic overshadowing): atribuir los síntomas físicos a la enfermedad mental— y consecuencias medibles: las personas con enfermedad mental grave mueren 15 a 20 años antes, en gran parte por enfermedad física subdiagnosticada y subtratada (Thornicroft, 2011).</w:t>
       </w:r>
     </w:p>
     <w:p>
@@ -13849,7 +13859,7 @@
         <w:pStyle w:val="BodyJ"/>
       </w:pPr>
       <w:r>
-        <w:t xml:space="preserve">La aviación conoce esta trampa con nombre propio: la paradoja de la automatización — cuanto más competente es el sistema, menos ejercita el humano las habilidades necesarias para detectar cuándo falla, que es exactamente cuando más se lo necesita (Abdulnour et al., 2026). La respuesta pedagógica propuesta frente a ella coincide, casi palabra por palabra, con lo que vienen pidiendo los capítulos anteriores: razonar primero de forma independiente, consultar después, y usar la IA para desafiar, ampliar o refinar ese razonamiento — nunca para reemplazar su ejecución.</w:t>
+        <w:t xml:space="preserve">La aviación conoce esta trampa con nombre propio: la paradoja de la automatización (automation paradox) — cuanto más competente es el sistema, menos ejercita el humano las habilidades necesarias para detectar cuándo falla, que es exactamente cuando más se lo necesita (Abdulnour et al., 2026). La respuesta pedagógica propuesta frente a ella coincide, casi palabra por palabra, con lo que vienen pidiendo los capítulos anteriores: razonar primero de forma independiente, consultar después, y usar la IA para desafiar, ampliar o refinar ese razonamiento — nunca para reemplazar su ejecución.</w:t>
       </w:r>
     </w:p>
     <w:p>
@@ -13882,7 +13892,7 @@
         <w:pStyle w:val="BodyJ"/>
       </w:pPr>
       <w:r>
-        <w:t xml:space="preserve">De ahí una regla de diseño, dicha en el vocabulario de las capas. Un escriba ambiental puede automatizar la capa H —qué se dijo, qué se midió, con hora y fuente— y hacerlo mejor que un humano cansado. No debería autocompletar la capa D ni la frase medular: la decisión, el criterio de reapertura y el grado de la inferencia tienen que salir de la mano del clínico, porque escribirlos es la instancia en que se piensan (McCoy et al., 2024). Donde la herramienta llene las cuatro capas, el never-skilling del apartado anterior tiene su vía de entrada más cómoda: notas impecables firmadas por médicos que ya no las construyen. La prueba de un buen escriba no es que la nota se lea bien; es que conserve el «no me cierra».</w:t>
+        <w:t xml:space="preserve">De ahí una regla de diseño, dicha en el vocabulario de las capas. Un escriba ambiental (ambient scribe) puede automatizar la capa H —qué se dijo, qué se midió, con hora y fuente— y hacerlo mejor que un humano cansado. No debería autocompletar la capa D ni la frase medular: la decisión, el criterio de reapertura y el grado de la inferencia tienen que salir de la mano del clínico, porque escribirlos es la instancia en que se piensan (McCoy et al., 2024). Donde la herramienta llene las cuatro capas, el never-skilling del apartado anterior tiene su vía de entrada más cómoda: notas impecables firmadas por médicos que ya no las construyen. La prueba de un buen escriba no es que la nota se lea bien; es que conserve el «no me cierra».</w:t>
       </w:r>
     </w:p>
     <w:p>
@@ -18086,19 +18096,19 @@
         <w:pStyle w:val="BodyJ"/>
       </w:pPr>
       <w:r>
-        <w:t xml:space="preserve">Los términos marcados con ∗ son propuestas de este libro; los demás se toman de la literatura, con su autor entre paréntesis cuando corresponde.</w:t>
-      </w:r>
-    </w:p>
-    <w:p>
-      <w:pPr>
-        <w:pStyle w:val="BodyJ"/>
-      </w:pPr>
-      <w:r>
-        <w:rPr>
-          <w:b/>
-          <w:bCs/>
-        </w:rPr>
-        <w:t xml:space="preserve">Abducción.</w:t>
+        <w:t xml:space="preserve">Los términos marcados con ∗ son propuestas de este libro; los demás se toman de la literatura, con su autor entre paréntesis cuando corresponde. Cuando el concepto tiene un nombre establecido en inglés, va entre paréntesis para que pueda buscarse en la literatura.</w:t>
+      </w:r>
+    </w:p>
+    <w:p>
+      <w:pPr>
+        <w:pStyle w:val="BodyJ"/>
+      </w:pPr>
+      <w:r>
+        <w:rPr>
+          <w:b/>
+          <w:bCs/>
+        </w:rPr>
+        <w:t xml:space="preserve">Abducción (abduction).</w:t>
       </w:r>
       <w:r>
         <w:t xml:space="preserve"> Inferencia que propone la hipótesis que, de ser verdadera, volvería esperable lo observado. Descrita por Peirce (que la llamó primero «hipótesis»). Es el movimiento típico de la generación diagnóstica.</w:t>
@@ -18113,7 +18123,7 @@
           <w:b/>
           <w:bCs/>
         </w:rPr>
-        <w:t xml:space="preserve">Anclaje.</w:t>
+        <w:t xml:space="preserve">Anclaje (anchoring).</w:t>
       </w:r>
       <w:r>
         <w:t xml:space="preserve"> Persistencia de una hipótesis inicial que conserva autoridad aun cuando la evidencia acumulada la ha degradado.</w:t>
@@ -18128,7 +18138,7 @@
           <w:b/>
           <w:bCs/>
         </w:rPr>
-        <w:t xml:space="preserve">Calibración.</w:t>
+        <w:t xml:space="preserve">Calibración (calibration).</w:t>
       </w:r>
       <w:r>
         <w:t xml:space="preserve"> Correspondencia entre la confianza declarada y la proporción real de aciertos, evaluada sobre una serie de juicios.</w:t>
@@ -18158,7 +18168,7 @@
           <w:b/>
           <w:bCs/>
         </w:rPr>
-        <w:t xml:space="preserve">Cierre prematuro.</w:t>
+        <w:t xml:space="preserve">Cierre prematuro (premature closure).</w:t>
       </w:r>
       <w:r>
         <w:t xml:space="preserve"> Aceptación de un diagnóstico antes de haberlo verificado suficientemente, con suspensión de la búsqueda de alternativas.</w:t>
@@ -18173,7 +18183,7 @@
           <w:b/>
           <w:bCs/>
         </w:rPr>
-        <w:t xml:space="preserve">Cognición distribuida.</w:t>
+        <w:t xml:space="preserve">Cognición distribuida (distributed cognition).</w:t>
       </w:r>
       <w:r>
         <w:t xml:space="preserve"> Marco que estudia cómo el procesamiento de información se realiza a través de personas y artefactos coordinados, no sólo dentro de mentes individuales (Hutchins).</w:t>
@@ -18188,7 +18198,7 @@
           <w:b/>
           <w:bCs/>
         </w:rPr>
-        <w:t xml:space="preserve">Conocimiento tácito.</w:t>
+        <w:t xml:space="preserve">Conocimiento tácito (tacit knowledge).</w:t>
       </w:r>
       <w:r>
         <w:t xml:space="preserve"> Capacidad de reconocer o ejecutar más de lo que puede formularse explícitamente (Polanyi).</w:t>
@@ -18203,7 +18213,7 @@
           <w:b/>
           <w:bCs/>
         </w:rPr>
-        <w:t xml:space="preserve">Conversaciones para la acción.</w:t>
+        <w:t xml:space="preserve">Conversaciones para la acción (conversation for action).</w:t>
       </w:r>
       <w:r>
         <w:t xml:space="preserve"> Gramática del trabajo coordinado descrita por Flores y Winograd: pedido, promesa con condiciones de satisfacción y plazo, y declaración de cumplimiento. Leída así, una entrega de turno distribuye compromisos, no sólo información; «está cubierto» es una promesa sin dueño.</w:t>
@@ -18218,7 +18228,7 @@
           <w:b/>
           <w:bCs/>
         </w:rPr>
-        <w:t xml:space="preserve">Contrafactual.</w:t>
+        <w:t xml:space="preserve">Contrafactual (counterfactual).</w:t>
       </w:r>
       <w:r>
         <w:t xml:space="preserve"> Escenario comparativo implícito en toda afirmación causal: qué habría ocurrido sin la exposición o la intervención.</w:t>
@@ -18248,7 +18258,22 @@
           <w:b/>
           <w:bCs/>
         </w:rPr>
-        <w:t xml:space="preserve">Cuatro tópicos (método de los).</w:t>
+        <w:t xml:space="preserve">Criterio de reapertura∗.</w:t>
+      </w:r>
+      <w:r>
+        <w:t xml:space="preserve"> Cambio clínico, resultado pendiente, plazo o evento que, escrito antes de cerrar el caso y con un responsable, obliga a reabrirlo («reevaluar si…; responsable: …; plazo: …»). Es la reevaluación de HII-D vuelta cláusula concreta y el compromiso del equipo, distinto de la red de seguridad, que es lo que el paciente vigila en su casa. Sin él, la decisión queda sin fecha de vencimiento.</w:t>
+      </w:r>
+    </w:p>
+    <w:p>
+      <w:pPr>
+        <w:pStyle w:val="BodyJ"/>
+      </w:pPr>
+      <w:r>
+        <w:rPr>
+          <w:b/>
+          <w:bCs/>
+        </w:rPr>
+        <w:t xml:space="preserve">Cuatro tópicos (método de los; four topics).</w:t>
       </w:r>
       <w:r>
         <w:t xml:space="preserve"> Lista de verificación deliberativa de la ética clínica que ordena todo caso en indicaciones médicas, preferencias del paciente, calidad de vida y rasgos contextuales (Jonsen, Siegler y Winslade). Ningún cuadrante puede quedar vacío sin que la decisión quede incompleta.</w:t>
@@ -18263,7 +18288,7 @@
           <w:b/>
           <w:bCs/>
         </w:rPr>
-        <w:t xml:space="preserve">Decisión compartida.</w:t>
+        <w:t xml:space="preserve">Decisión compartida (shared decision-making).</w:t>
       </w:r>
       <w:r>
         <w:t xml:space="preserve"> Proceso de deliberación entre profesional y paciente sobre opciones, evidencia y preferencias, distinto de la mera entrega de información (Elwyn).</w:t>
@@ -18323,7 +18348,7 @@
           <w:b/>
           <w:bCs/>
         </w:rPr>
-        <w:t xml:space="preserve">Doble proceso.</w:t>
+        <w:t xml:space="preserve">Doble proceso (dual-process theories).</w:t>
       </w:r>
       <w:r>
         <w:t xml:space="preserve"> Familia de teorías que distingue procesamiento rápido, asociativo y automático de procesamiento lento, analítico y controlado; ambos pueden acertar o errar.</w:t>
@@ -18353,7 +18378,7 @@
           <w:b/>
           <w:bCs/>
         </w:rPr>
-        <w:t xml:space="preserve">Encapsulación.</w:t>
+        <w:t xml:space="preserve">Encapsulación (knowledge encapsulation).</w:t>
       </w:r>
       <w:r>
         <w:t xml:space="preserve"> Compresión del conocimiento biomédico en conceptos clínicos de nivel superior, característica del desarrollo de la pericia (Schmidt y Rikers).</w:t>
@@ -18368,7 +18393,7 @@
           <w:b/>
           <w:bCs/>
         </w:rPr>
-        <w:t xml:space="preserve">Ensombrecimiento diagnóstico.</w:t>
+        <w:t xml:space="preserve">Ensombrecimiento diagnóstico (diagnostic overshadowing).</w:t>
       </w:r>
       <w:r>
         <w:t xml:space="preserve"> Atribución de síntomas físicos a la enfermedad mental de base, con el consiguiente subdiagnóstico somático; contribuye a la mortalidad prematura en salud mental (Thornicroft).</w:t>
@@ -18383,7 +18408,7 @@
           <w:b/>
           <w:bCs/>
         </w:rPr>
-        <w:t xml:space="preserve">Escriba ambiental.</w:t>
+        <w:t xml:space="preserve">Escriba ambiental (ambient scribe).</w:t>
       </w:r>
       <w:r>
         <w:t xml:space="preserve"> Sistema de IA que escucha la consulta y redacta la nota clínica. Puede automatizar la capa de hechos; no debería autocompletar la decisión ni la frase medular, porque escribirlas es parte de pensarlas, y tiende a aplanar la modalidad epistémica de lo dicho en voz alta.</w:t>
@@ -18398,7 +18423,7 @@
           <w:b/>
           <w:bCs/>
         </w:rPr>
-        <w:t xml:space="preserve">Ética de la creencia.</w:t>
+        <w:t xml:space="preserve">Ética de la creencia (ethics of belief).</w:t>
       </w:r>
       <w:r>
         <w:t xml:space="preserve"> Tesis de Clifford (1877) según la cual creer sin evidencia suficiente es en sí mismo reprochable, con independencia del desenlace; en clínica, fundamento del deber de pensar bien como parte de la ética primordial del médico y de la regla de que un buen desenlace no valida un proceso defectuoso.</w:t>
@@ -18443,7 +18468,7 @@
           <w:b/>
           <w:bCs/>
         </w:rPr>
-        <w:t xml:space="preserve">Fragilidad.</w:t>
+        <w:t xml:space="preserve">Fragilidad (frailty).</w:t>
       </w:r>
       <w:r>
         <w:t xml:space="preserve"> Estado de vulnerabilidad fisiológica multisistémica que predice desenlaces con independencia de la edad y del diagnóstico de ingreso; evaluable clínicamente en minutos (Rockwood et al.). En la decisión terapéutica es un hecho, no una impresión.</w:t>
@@ -18473,7 +18498,7 @@
           <w:b/>
           <w:bCs/>
         </w:rPr>
-        <w:t xml:space="preserve">Frecuencias naturales.</w:t>
+        <w:t xml:space="preserve">Frecuencias naturales (natural frequencies).</w:t>
       </w:r>
       <w:r>
         <w:t xml:space="preserve"> Presentación de probabilidades como conteos sobre una población de referencia («90 de cada 270 positivos»), que facilita el razonamiento bayesiano intuitivo (Gigerenzer).</w:t>
@@ -18518,10 +18543,10 @@
           <w:b/>
           <w:bCs/>
         </w:rPr>
-        <w:t xml:space="preserve">Humildad epistémica.</w:t>
-      </w:r>
-      <w:r>
-        <w:t xml:space="preserve"> Atención y apropiación de las propias limitaciones cognitivas (Whitcomb et al.). No es timidez para afirmar: es la disposición que mantiene el caso abierto — permite seguir explorando, seguir aprendiendo y reubicar el foco y el manejo cuando la trayectoria contradice el mapa.</w:t>
+        <w:t xml:space="preserve">Humildad epistémica (epistemic humility).</w:t>
+      </w:r>
+      <w:r>
+        <w:t xml:space="preserve"> Atención y apropiación de las propias limitaciones cognitivas (Whitcomb et al., que hablan de intellectual humility). No es timidez para afirmar: es la disposición que mantiene el caso abierto — permite seguir explorando, seguir aprendiendo y reubicar el foco y el manejo cuando la trayectoria contradice el mapa.</w:t>
       </w:r>
     </w:p>
     <w:p>
@@ -18548,7 +18573,7 @@
           <w:b/>
           <w:bCs/>
         </w:rPr>
-        <w:t xml:space="preserve">Incertidumbre aleatoria.</w:t>
+        <w:t xml:space="preserve">Incertidumbre aleatoria (aleatory uncertainty).</w:t>
       </w:r>
       <w:r>
         <w:t xml:space="preserve"> La que proviene de variabilidad o contingencia que persiste aun con conocimiento completo del sistema.</w:t>
@@ -18563,7 +18588,7 @@
           <w:b/>
           <w:bCs/>
         </w:rPr>
-        <w:t xml:space="preserve">Incertidumbre epistémica.</w:t>
+        <w:t xml:space="preserve">Incertidumbre epistémica (epistemic uncertainty).</w:t>
       </w:r>
       <w:r>
         <w:t xml:space="preserve"> La que proviene de conocimiento insuficiente y puede, en principio, reducirse con información.</w:t>
@@ -18578,7 +18603,7 @@
           <w:b/>
           <w:bCs/>
         </w:rPr>
-        <w:t xml:space="preserve">Injusticia epistémica.</w:t>
+        <w:t xml:space="preserve">Injusticia epistémica (epistemic injustice).</w:t>
       </w:r>
       <w:r>
         <w:t xml:space="preserve"> Daño cometido contra alguien en su capacidad de sujeto de conocimiento: testimonial (credibilidad rebajada por prejuicio) o hermenéutica (falta de categorías para expresar la experiencia) (Fricker).</w:t>
@@ -18593,7 +18618,22 @@
           <w:b/>
           <w:bCs/>
         </w:rPr>
-        <w:t xml:space="preserve">Mente del principiante (shoshin).</w:t>
+        <w:t xml:space="preserve">Léxico de certeza∗.</w:t>
+      </w:r>
+      <w:r>
+        <w:t xml:space="preserve"> Escala verbal de cinco grados —demostrado, altamente probable, probable, posible, no sustentado— con la que toda inferencia escrita declara cuánto derecho tiene a afirmarse (Apéndice B). Es un caso particular de la modalidad epistémica, fijado para que el equipo use las mismas palabras con el mismo significado.</w:t>
+      </w:r>
+    </w:p>
+    <w:p>
+      <w:pPr>
+        <w:pStyle w:val="BodyJ"/>
+      </w:pPr>
+      <w:r>
+        <w:rPr>
+          <w:b/>
+          <w:bCs/>
+        </w:rPr>
+        <w:t xml:space="preserve">Mente del principiante (shoshin, beginner's mind).</w:t>
       </w:r>
       <w:r>
         <w:t xml:space="preserve"> Disposición, tomada del Zen, a mirar lo conocido como si fuera la primera vez, sin que el nombre decida por adelantado. Presentar el caso sin la etiqueta es su versión clínica; no reemplaza al illness script, suspende la prisa con que cierra el caso.</w:t>
@@ -18608,7 +18648,7 @@
           <w:b/>
           <w:bCs/>
         </w:rPr>
-        <w:t xml:space="preserve">Metacognición.</w:t>
+        <w:t xml:space="preserve">Metacognición (metacognition).</w:t>
       </w:r>
       <w:r>
         <w:t xml:space="preserve"> Conocimiento y regulación de los propios procesos cognitivos: monitorear la comprensión, valorar la confianza, decidir cambiar de estrategia (Flavell; Nelson y Narens).</w:t>
@@ -18638,7 +18678,7 @@
           <w:b/>
           <w:bCs/>
         </w:rPr>
-        <w:t xml:space="preserve">Modalidad epistémica.</w:t>
+        <w:t xml:space="preserve">Modalidad epistémica (epistemic modality).</w:t>
       </w:r>
       <w:r>
         <w:t xml:space="preserve"> Recursos del lenguaje que expresan el grado de certeza de una afirmación («demostrado», «probable», «sin evidencia de»).</w:t>
@@ -18683,7 +18723,7 @@
           <w:b/>
           <w:bCs/>
         </w:rPr>
-        <w:t xml:space="preserve">Paradoja de la automatización.</w:t>
+        <w:t xml:space="preserve">Paradoja de la automatización (automation paradox).</w:t>
       </w:r>
       <w:r>
         <w:t xml:space="preserve"> Cuanto más competente es un sistema automatizado, menos ejercita el humano las habilidades necesarias para detectar sus fallas — que es cuando más se las necesita (Abdulnour et al.).</w:t>
@@ -18698,7 +18738,7 @@
           <w:b/>
           <w:bCs/>
         </w:rPr>
-        <w:t xml:space="preserve">Pausa diagnóstica.</w:t>
+        <w:t xml:space="preserve">Pausa diagnóstica (diagnostic time-out).</w:t>
       </w:r>
       <w:r>
         <w:t xml:space="preserve"> Interrupción breve y selectiva del flujo clínico, activada por disparadores definidos (reconsulta, evolución discordante, transferencia), para reformular el caso sin su etiqueta y localizar la incertidumbre peligrosa.</w:t>
@@ -18728,7 +18768,7 @@
           <w:b/>
           <w:bCs/>
         </w:rPr>
-        <w:t xml:space="preserve">Probabilidad pretest / postest.</w:t>
+        <w:t xml:space="preserve">Probabilidad pretest / postest (pre-test / post-test probability).</w:t>
       </w:r>
       <w:r>
         <w:t xml:space="preserve"> Probabilidad de una condición antes y después de incorporar el resultado de una prueba; su relación depende del rendimiento de la prueba y de la prevalencia.</w:t>
@@ -18758,7 +18798,7 @@
           <w:b/>
           <w:bCs/>
         </w:rPr>
-        <w:t xml:space="preserve">Quiebre.</w:t>
+        <w:t xml:space="preserve">Quiebre (breakdown).</w:t>
       </w:r>
       <w:r>
         <w:t xml:space="preserve"> Momento en que la respuesta inmediata del experto falla o la situación no calza con lo aprendido, y la deliberación explícita entra en escena (Varela). Las pausas selectivas de este libro son quiebres puestos por diseño.</w:t>
@@ -18773,7 +18813,22 @@
           <w:b/>
           <w:bCs/>
         </w:rPr>
-        <w:t xml:space="preserve">Representación del problema.</w:t>
+        <w:t xml:space="preserve">Red de seguridad (safety-netting).</w:t>
+      </w:r>
+      <w:r>
+        <w:t xml:space="preserve"> Instrucciones explícitas de reconsulta y vigilancia que acompañan una decisión tomada bajo incertidumbre, especialmente en ambulatorio: lo que el paciente y su familia vigilan en la casa. El criterio de reapertura es su contraparte dentro del equipo.</w:t>
+      </w:r>
+    </w:p>
+    <w:p>
+      <w:pPr>
+        <w:pStyle w:val="BodyJ"/>
+      </w:pPr>
+      <w:r>
+        <w:rPr>
+          <w:b/>
+          <w:bCs/>
+        </w:rPr>
+        <w:t xml:space="preserve">Representación del problema (problem representation).</w:t>
       </w:r>
       <w:r>
         <w:t xml:space="preserve"> Formulación compacta que transforma los datos del caso en relaciones clínicamente significativas mediante calificadores semánticos.</w:t>
@@ -18788,7 +18843,7 @@
           <w:b/>
           <w:bCs/>
         </w:rPr>
-        <w:t xml:space="preserve">Riesgo inductivo.</w:t>
+        <w:t xml:space="preserve">Riesgo inductivo (inductive risk).</w:t>
       </w:r>
       <w:r>
         <w:t xml:space="preserve"> Tesis de que aceptar o rechazar una hipótesis exige decidir cuánta evidencia es suficiente, y de que esa decisión depende del costo de cada error posible; fundamenta filosóficamente los umbrales de decisión clínica (Rudner; Douglas).</w:t>
@@ -18803,22 +18858,7 @@
           <w:b/>
           <w:bCs/>
         </w:rPr>
-        <w:t xml:space="preserve">Safety-netting (red de seguridad).</w:t>
-      </w:r>
-      <w:r>
-        <w:t xml:space="preserve"> Instrucciones explícitas de reconsulta y vigilancia que acompañan una decisión tomada bajo incertidumbre, especialmente en ambulatorio.</w:t>
-      </w:r>
-    </w:p>
-    <w:p>
-      <w:pPr>
-        <w:pStyle w:val="BodyJ"/>
-      </w:pPr>
-      <w:r>
-        <w:rPr>
-          <w:b/>
-          <w:bCs/>
-        </w:rPr>
-        <w:t xml:space="preserve">Segunda víctima.</w:t>
+        <w:t xml:space="preserve">Segunda víctima (second victim).</w:t>
       </w:r>
       <w:r>
         <w:t xml:space="preserve"> El clínico dañado por su propio error —culpa, vergüenza, aislamiento— (Wu). Su cuidado no es indulgencia: sin él no hay análisis de trayectoria ni aprendizaje del error.</w:t>
@@ -18833,7 +18873,22 @@
           <w:b/>
           <w:bCs/>
         </w:rPr>
-        <w:t xml:space="preserve">Sensibilidad metacognitiva.</w:t>
+        <w:t xml:space="preserve">Segundo lector∗.</w:t>
+      </w:r>
+      <w:r>
+        <w:t xml:space="preserve"> Otro médico, un especialista, un equipo interdisciplinario o una herramienta de apoyo que revisa el juicio antes de que se fije y aporta una representación distinta del mismo caso. Lo activan disparadores clínicos (reconsulta, evolución discordante, transferencia) y también el estado del razonador: turno largo, madrugada, ánimo alterado. No sustituye a la segunda opinión formal; la precede y cuesta menos.</w:t>
+      </w:r>
+    </w:p>
+    <w:p>
+      <w:pPr>
+        <w:pStyle w:val="BodyJ"/>
+      </w:pPr>
+      <w:r>
+        <w:rPr>
+          <w:b/>
+          <w:bCs/>
+        </w:rPr>
+        <w:t xml:space="preserve">Sensibilidad metacognitiva (metacognitive sensitivity).</w:t>
       </w:r>
       <w:r>
         <w:t xml:space="preserve"> Capacidad de discriminar los propios aciertos de los propios errores mediante la confianza; distinta del sesgo metacognitivo (tendencia global a confiar mucho o poco).</w:t>
@@ -18848,7 +18903,7 @@
           <w:b/>
           <w:bCs/>
         </w:rPr>
-        <w:t xml:space="preserve">Sesgo de automatización.</w:t>
+        <w:t xml:space="preserve">Sesgo de automatización (automation bias).</w:t>
       </w:r>
       <w:r>
         <w:t xml:space="preserve"> Tendencia a aceptar la recomendación de un sistema automatizado por encima de la propia evidencia o el propio juicio; los apoyos a la decisión corrigen errores humanos e introducen errores nuevos por deferencia (Goddard et al.). Pariente del anclaje, con interfaz.</w:t>
@@ -18863,7 +18918,22 @@
           <w:b/>
           <w:bCs/>
         </w:rPr>
-        <w:t xml:space="preserve">Testimonio (epistemología del).</w:t>
+        <w:t xml:space="preserve">Sobreconfianza (overconfidence).</w:t>
+      </w:r>
+      <w:r>
+        <w:t xml:space="preserve"> Confianza declarada mayor que la exactitud real; falla de calibración asociada al error diagnóstico porque impide buscar evidencia o revisar una conclusión (Berner y Graber). Medirla no es trivial: la confianza puede ser apropiada en los casos fáciles y excesiva en los difíciles.</w:t>
+      </w:r>
+    </w:p>
+    <w:p>
+      <w:pPr>
+        <w:pStyle w:val="BodyJ"/>
+      </w:pPr>
+      <w:r>
+        <w:rPr>
+          <w:b/>
+          <w:bCs/>
+        </w:rPr>
+        <w:t xml:space="preserve">Testimonio (epistemología del; epistemology of testimony).</w:t>
       </w:r>
       <w:r>
         <w:t xml:space="preserve"> Estudio del conocimiento obtenido mediante informes de otros. Coady defendió la confianza por defecto como condición de todo conocimiento compartido; Lackey añadió la vigilancia activa del oyente. La anamnesis es su caso clínico paradigmático.</w:t>
@@ -18878,7 +18948,7 @@
           <w:b/>
           <w:bCs/>
         </w:rPr>
-        <w:t xml:space="preserve">Umbral de decisión.</w:t>
+        <w:t xml:space="preserve">Umbral de decisión (decision threshold).</w:t>
       </w:r>
       <w:r>
         <w:t xml:space="preserve"> Nivel de probabilidad sobre el cual una conducta (testear, tratar) supera a sus alternativas, dado el balance de daños y beneficios (Pauker y Kassirer).</w:t>
@@ -18893,7 +18963,7 @@
           <w:b/>
           <w:bCs/>
         </w:rPr>
-        <w:t xml:space="preserve">Validez del entorno.</w:t>
+        <w:t xml:space="preserve">Validez del entorno (high-validity environment).</w:t>
       </w:r>
       <w:r>
         <w:t xml:space="preserve"> Grado en que un ambiente de práctica ofrece regularidades estables entre señales y desenlaces, junto a oportunidad de aprenderlas con feedback oportuno; condición para que la intuición experta sea confiable (Kahneman y Klein).</w:t>
@@ -18908,7 +18978,7 @@
           <w:b/>
           <w:bCs/>
         </w:rPr>
-        <w:t xml:space="preserve">Validez externa / transportabilidad.</w:t>
+        <w:t xml:space="preserve">Validez externa / transportabilidad (external validity / transportability).</w:t>
       </w:r>
       <w:r>
         <w:t xml:space="preserve"> Grado en que un resultado de investigación puede aplicarse fuera del contexto en que fue producido; no es propiedad binaria del estudio sino relación entre evidencia y uso propuesto.</w:t>
@@ -19201,6 +19271,18 @@
         </w:numPr>
       </w:pPr>
       <w:r>
+        <w:t xml:space="preserve">Criterio de reapertura — 8, 12, 15, Interludio III, CC (viñeta 6), Ap A, Ap C</w:t>
+      </w:r>
+    </w:p>
+    <w:p>
+      <w:pPr>
+        <w:pStyle w:val="BodyJ"/>
+        <w:numPr>
+          <w:ilvl w:val="0"/>
+          <w:numId w:val="6"/>
+        </w:numPr>
+      </w:pPr>
+      <w:r>
         <w:t xml:space="preserve">Cuatro tópicos (Jonsen, Siegler y Winslade) — 10, Ap A</w:t>
       </w:r>
     </w:p>
@@ -19969,6 +20051,18 @@
         </w:numPr>
       </w:pPr>
       <w:r>
+        <w:t xml:space="preserve">Red de seguridad (safety-netting) — 11, CC (viñetas 3, 4 y 7)</w:t>
+      </w:r>
+    </w:p>
+    <w:p>
+      <w:pPr>
+        <w:pStyle w:val="BodyJ"/>
+        <w:numPr>
+          <w:ilvl w:val="0"/>
+          <w:numId w:val="6"/>
+        </w:numPr>
+      </w:pPr>
+      <w:r>
         <w:t xml:space="preserve">Reglas de decisión clínica (PERC) y umbral — CC (viñeta 6)</w:t>
       </w:r>
     </w:p>
@@ -20005,19 +20099,19 @@
         </w:numPr>
       </w:pPr>
       <w:r>
-        <w:t xml:space="preserve">Safety-netting — 11, CC (viñetas 3, 4 y 7)</w:t>
-      </w:r>
-    </w:p>
-    <w:p>
-      <w:pPr>
-        <w:pStyle w:val="BodyJ"/>
-        <w:numPr>
-          <w:ilvl w:val="0"/>
-          <w:numId w:val="6"/>
-        </w:numPr>
-      </w:pPr>
-      <w:r>
         <w:t xml:space="preserve">Segunda víctima — 14</w:t>
+      </w:r>
+    </w:p>
+    <w:p>
+      <w:pPr>
+        <w:pStyle w:val="BodyJ"/>
+        <w:numPr>
+          <w:ilvl w:val="0"/>
+          <w:numId w:val="6"/>
+        </w:numPr>
+      </w:pPr>
+      <w:r>
+        <w:t xml:space="preserve">Segundo lector — 5, 8, 17</w:t>
       </w:r>
     </w:p>
     <w:p>

</xml_diff>

<commit_message>
Léxico de certeza: el quinto grado es «no demostrado» en todo el libro, como lo definen el capítulo 4 y el Apéndice B
La revisión automática del PR señaló que la entrada nueva del Glosario
prometía un grado «no sustentado» que el Apéndice B no define. El
nombre canónico es «no demostrado» (cap. 4, Apéndice B); el cap. 15, el
Apéndice A, el Glosario y la tarjeta final lo decían de otra manera y
quedan alineados. La entrada del Glosario distingue ahora la escala de
afirmación (cinco grados) de las expresiones de ausencia y de exclusión
del Apéndice B. Las dos ocurrencias de «contenido no sustentado» del
cap. 17 (hallucination) son otro sentido y se conservan. Entregables
reconstruidos: 166 páginas, TOC estable.

Co-Authored-By: Claude Fable 5.1 <noreply@anthropic.com>
Claude-Session: https://claude.ai/code/session_01SPkhDdVzUCxJwqq61ddeLW
</commit_message>
<xml_diff>
--- a/libro/Hechos_inferencias_incertidumbre_edicion_revisada.docx
+++ b/libro/Hechos_inferencias_incertidumbre_edicion_revisada.docx
@@ -11518,7 +11518,7 @@
         <w:pStyle w:val="BodyJ"/>
       </w:pPr>
       <w:r>
-        <w:t xml:space="preserve">Se propone una representación principal y, si importa, alternativas. Cada inferencia se acompaña de una fuerza verbal proporcional: demostrado, altamente probable, probable, posible o no sustentado. Deben explicitarse los enlaces causales no observados.</w:t>
+        <w:t xml:space="preserve">Se propone una representación principal y, si importa, alternativas. Cada inferencia se acompaña de una fuerza verbal proporcional: demostrado, altamente probable, probable, posible o no demostrado. Deben explicitarse los enlaces causales no observados.</w:t>
       </w:r>
     </w:p>
     <w:p>
@@ -15059,7 +15059,7 @@
         </w:numPr>
       </w:pPr>
       <w:r>
-        <w:t xml:space="preserve">Grado de certeza: demostrado / altamente probable / probable / posible / no sustentado.</w:t>
+        <w:t xml:space="preserve">Grado de certeza: demostrado / altamente probable / probable / posible / no demostrado.</w:t>
       </w:r>
     </w:p>
     <w:p>
@@ -18621,7 +18621,7 @@
         <w:t xml:space="preserve">Léxico de certeza∗.</w:t>
       </w:r>
       <w:r>
-        <w:t xml:space="preserve"> Escala verbal de cinco grados —demostrado, altamente probable, probable, posible, no sustentado— con la que toda inferencia escrita declara cuánto derecho tiene a afirmarse (Apéndice B). Es un caso particular de la modalidad epistémica, fijado para que el equipo use las mismas palabras con el mismo significado.</w:t>
+        <w:t xml:space="preserve"> Escala verbal con la que toda inferencia escrita declara cuánto derecho tiene a afirmarse —demostrado, altamente probable, probable, posible, no demostrado—, junto a las expresiones de ausencia y de exclusión que no deben confundirse con ella (sin evidencia actual de, no evaluable, se descarta), definidas en el Apéndice B. Es un caso particular de la modalidad epistémica, fijado para que el equipo use las mismas palabras con el mismo significado.</w:t>
       </w:r>
     </w:p>
     <w:p>
@@ -23688,7 +23688,7 @@
                 <w:sz w:val="17"/>
                 <w:szCs w:val="17"/>
               </w:rPr>
-              <w:t xml:space="preserve"> La inferencia con su grado: demostrado, altamente probable, probable, posible, no sustentado.</w:t>
+              <w:t xml:space="preserve"> La inferencia con su grado: demostrado, altamente probable, probable, posible, no demostrado.</w:t>
             </w:r>
           </w:p>
         </w:tc>
@@ -23803,7 +23803,7 @@
         <w:pStyle w:val="BodyJ"/>
       </w:pPr>
       <w:r>
-        <w:t xml:space="preserve">Léxico mínimo: demostrado · altamente probable · probable · posible · no sustentado · sin evidencia actual de · descartado, sólo con un método que excluya.</w:t>
+        <w:t xml:space="preserve">Léxico mínimo: demostrado · altamente probable · probable · posible · no demostrado · sin evidencia actual de · descartado, sólo con un método que excluya.</w:t>
       </w:r>
     </w:p>
     <w:sectPr>

</xml_diff>

<commit_message>
Entregables reconstruidos tras las tres medidas de coherencia y README punto 39
DOCX, PDF y EPUB regenerados desde las fuentes de e9449d7: 166 páginas
(162 de cuerpo), TOC 40/40 estable, EPUB con 44 capítulos, 160
referencias sin huérfanas, cero comillas rectas. Sondas: las cuatro
preguntas con una sola redacción en sus tres lugares, los diez títulos
nuevos, las tres frases de Carmen y las bisagras presentes una vez cada
uno. El README registra las tres medidas.

Co-Authored-By: Claude Fable 5.1 <noreply@anthropic.com>
Claude-Session: https://claude.ai/code/session_01SPkhDdVzUCxJwqq61ddeLW
</commit_message>
<xml_diff>
--- a/libro/Hechos_inferencias_incertidumbre_edicion_revisada.docx
+++ b/libro/Hechos_inferencias_incertidumbre_edicion_revisada.docx
@@ -4564,7 +4564,7 @@
           <w:b/>
           <w:bCs/>
         </w:rPr>
-        <w:t xml:space="preserve">Sin evidencia de</w:t>
+        <w:t xml:space="preserve">Sin evidencia actual de</w:t>
       </w:r>
       <w:r>
         <w:t xml:space="preserve">: el método empleado no mostró el fenómeno; la fuerza depende de su sensibilidad y oportunidad.</w:t>
@@ -4707,7 +4707,7 @@
           <w:sz w:val="25"/>
           <w:szCs w:val="25"/>
         </w:rPr>
-        <w:t xml:space="preserve">Verbos que ocultan</w:t>
+        <w:t xml:space="preserve">Verbos que ocultan, frases que operan</w:t>
       </w:r>
     </w:p>
     <w:p>
@@ -4728,27 +4728,10 @@
     </w:p>
     <w:p>
       <w:pPr>
-        <w:pStyle w:val="Heading3"/>
-        <w:spacing w:after="120" w:before="280"/>
-      </w:pPr>
-      <w:r>
-        <w:rPr>
-          <w:rFonts w:ascii="Georgia" w:cs="Georgia" w:eastAsia="Georgia" w:hAnsi="Georgia"/>
-          <w:b/>
-          <w:bCs/>
-          <w:color w:val="2B2B2B"/>
-          <w:sz w:val="25"/>
-          <w:szCs w:val="25"/>
-        </w:rPr>
-        <w:t xml:space="preserve">Frases operativas</w:t>
-      </w:r>
-    </w:p>
-    <w:p>
-      <w:pPr>
-        <w:pStyle w:val="BodyJ"/>
-      </w:pPr>
-      <w:r>
-        <w:t xml:space="preserve">Una frase operativa actúa como un argumento de Toulmin comprimido: enlaza el dato observado con la acción a través de una garantía clínica explícita. No prescribe necesariamente una conducta única, pero transparenta por qué se desplaza el umbral terapéutico. «Cuarto episodio de suboclusión en doce meses» documenta aceleración de la frecuencia; «primer ingreso complicado con shock y bacteriemia» establece un cambio cualitativo en la severidad biológica. «Sin evidencia tomográfica de isquemia actual» acota la urgencia quirúrgica inmediata, y «alto riesgo de recurrencia grave fuera del hospital» fundamenta la indicación de reparación electiva pronta.</w:t>
+        <w:pStyle w:val="BodyJ"/>
+      </w:pPr>
+      <w:r>
+        <w:t xml:space="preserve">Lo contrario del verbo que oculta es la frase que opera. Una frase operativa actúa como un argumento de Toulmin comprimido: enlaza el dato observado con la acción a través de una garantía clínica explícita. No prescribe necesariamente una conducta única, pero transparenta por qué se desplaza el umbral terapéutico. «Cuarto episodio de suboclusión en doce meses» documenta aceleración de la frecuencia; «primer ingreso complicado con shock y bacteriemia» establece un cambio cualitativo en la severidad biológica. «Sin evidencia tomográfica de isquemia actual» acota la urgencia quirúrgica inmediata, y «alto riesgo de recurrencia grave fuera del hospital» fundamenta la indicación de reparación electiva pronta.</w:t>
       </w:r>
     </w:p>
     <w:p>
@@ -5748,7 +5731,7 @@
           <w:sz w:val="25"/>
           <w:szCs w:val="25"/>
         </w:rPr>
-        <w:t xml:space="preserve">Dos procesos, no dos médicos</w:t>
+        <w:t xml:space="preserve">Dos procesos, no dos médicos: la phronesis</w:t>
       </w:r>
     </w:p>
     <w:p>
@@ -5765,6 +5748,22 @@
       </w:pPr>
       <w:r>
         <w:t xml:space="preserve">El análisis depende del conocimiento disponible. Un médico puede pensar lentamente y equivocarse por déficit conceptual. La intuición experta puede superar una lista analítica en un patrón familiar. Norman y colaboradores han insistido en que los errores atribuidos a sesgo frecuentemente incluyen conocimiento insuficiente y que enseñar sólo a «pensar despacio» no reemplaza la construcción de representaciones robustas (Norman et al., 2017).</w:t>
+      </w:r>
+    </w:p>
+    <w:p>
+      <w:pPr>
+        <w:pStyle w:val="BodyJ"/>
+      </w:pPr>
+      <w:r>
+        <w:t xml:space="preserve">Hay una palabra antigua para la integración que ni el análisis ni la intuición logran por separado. Aristóteles distinguió el conocimiento teórico de la prudencia práctica, o phronesis: la capacidad de deliberar bien acerca de lo que conviene hacer en situaciones particulares. La clínica comparte esta estructura. La regla general necesita ser aplicada a un caso con bienes en tensión, información incompleta y consecuencias asimétricas (Aristóteles, 1985).</w:t>
+      </w:r>
+    </w:p>
+    <w:p>
+      <w:pPr>
+        <w:pStyle w:val="BodyJ"/>
+      </w:pPr>
+      <w:r>
+        <w:t xml:space="preserve">Gadamer y Montgomery recuperaron esta idea para la medicina: el juicio no es una desviación de la ciencia, sino el modo en que la ciencia se vuelve acción en una persona concreta (Gadamer, 1996; Montgomery, 2006). La pericia madura integra conocimiento causal, reconocimiento, probabilidad, valores y temporalidad.</w:t>
       </w:r>
     </w:p>
     <w:p>
@@ -5781,23 +5780,175 @@
           <w:sz w:val="25"/>
           <w:szCs w:val="25"/>
         </w:rPr>
-        <w:t xml:space="preserve">Phronesis</w:t>
-      </w:r>
-    </w:p>
-    <w:p>
-      <w:pPr>
-        <w:pStyle w:val="BodyJ"/>
-      </w:pPr>
-      <w:r>
-        <w:t xml:space="preserve">Hay una palabra antigua para la integración que ni el análisis ni la intuición logran por separado. Aristóteles distinguió el conocimiento teórico de la prudencia práctica, o phronesis: la capacidad de deliberar bien acerca de lo que conviene hacer en situaciones particulares. La clínica comparte esta estructura. La regla general necesita ser aplicada a un caso con bienes en tensión, información incompleta y consecuencias asimétricas (Aristóteles, 1985).</w:t>
-      </w:r>
-    </w:p>
-    <w:p>
-      <w:pPr>
-        <w:pStyle w:val="BodyJ"/>
-      </w:pPr>
-      <w:r>
-        <w:t xml:space="preserve">Gadamer y Montgomery recuperaron esta idea para la medicina: el juicio no es una desviación de la ciencia, sino el modo en que la ciencia se vuelve acción en una persona concreta (Gadamer, 1996; Montgomery, 2006). La pericia madura integra conocimiento causal, reconocimiento, probabilidad, valores y temporalidad.</w:t>
+        <w:t xml:space="preserve">El peligro de la fluidez</w:t>
+      </w:r>
+    </w:p>
+    <w:p>
+      <w:pPr>
+        <w:pStyle w:val="BodyJ"/>
+      </w:pPr>
+      <w:r>
+        <w:t xml:space="preserve">La misma fluidez que hace eficaz al experto puede ocultar supuestos. El patrón familiar reduce carga cognitiva, pero favorece asimilación: lo nuevo se fuerza a encajar en lo conocido. El experto necesita mecanismos para detectar excepciones. Una representación discrepante, una evolución atípica o una consecuencia desproporcionada deben reabrir el caso.</w:t>
+      </w:r>
+    </w:p>
+    <w:p>
+      <w:pPr>
+        <w:pStyle w:val="BodyJ"/>
+      </w:pPr>
+      <w:r>
+        <w:t xml:space="preserve">¿Cuándo confiar, entonces, en la primera impresión? La respuesta menos romántica salió del debate entre el programa de los sesgos y el de la pericia naturalista, que terminó en un acuerdo célebre (Kahneman &amp; Klein, 2009). La intuición es confiable cuando se formó en un entorno de validez alta (high-validity environment) —regularidades estables entre señales y desenlaces— y con oportunidad real de aprenderlas, es decir, feedback oportuno y veraz. Sin esas dos condiciones la sensación de saber crece igual, pero sin correlato. La clínica contiene ambos mundos. La sala de reanimación y la lectura de patrones radiológicos entrenan intuiciones con feedback rápido; la consulta de síntomas inespecíficos cuyos desenlaces nadie vuelve a ver produce fluidez sin calibración — la sobreconfianza del capítulo 5, fabricada por el entorno. La pregunta operativa frente a la propia seguridad no es «¿cuánta experiencia tengo?», sino «¿en qué entorno se formó esta impresión, y quién me avisó cuando fallé?».</w:t>
+      </w:r>
+    </w:p>
+    <w:p>
+      <w:pPr>
+        <w:pStyle w:val="BodyJ"/>
+      </w:pPr>
+      <w:r>
+        <w:t xml:space="preserve">Enseñar la pericia clínica no puede reducirse a dictar conclusiones. Exige hacer visible qué pistas perceptivas resultaron decisivas, qué alternativas se descartaron en silencio y qué hallazgo físico habría cambiado la mano. Cuando el interno le preguntó en el pasillo cómo lo había decidido tan rápido, la cirujana hizo el ejercicio de desempaquetar su intuición. Un episodio que demostró potencial letal (shock séptico) pese a un escáner sin necrosis; intervalos libres de enfermedad cada vez más cortos; y un examen físico donde el abdomen «avisa pero todavía no exige»: una hernia parcialmente reductible, sensible en el anillo fibroso, pero con pared blanda y sin sufrimiento cutáneo ni irritación peritoneal. Desplegar el juicio experto en variables observables es lo único que impide que el aprendiz imite el tono de autoridad sin haber adquirido los criterios que lo sostienen.</w:t>
+      </w:r>
+    </w:p>
+    <w:p>
+      <w:pPr>
+        <w:pStyle w:val="BodyJ"/>
+      </w:pPr>
+      <w:r>
+        <w:t xml:space="preserve">Varela, cuya obra con Maturana el capítulo 1 ya convocó, agrega una corrección que hay que aceptar. En las conferencias publicadas como </w:t>
+      </w:r>
+      <w:r>
+        <w:rPr>
+          <w:i/>
+          <w:iCs/>
+        </w:rPr>
+        <w:t xml:space="preserve">Ética y acción</w:t>
+      </w:r>
+      <w:r>
+        <w:t xml:space="preserve"> sostuvo que la pericia ética —y la pericia en general— no es deliberación sino un saber hacer inmediato, encarnado, que responde a la situación sin pasar por reglas ni por juicios explícitos (Varela, 1996). La deliberación aparece sólo en el quiebre (breakdown), cuando la respuesta espontánea falla o la situación no calza con lo aprendido. La cirujana que abre este capítulo no calló un razonamiento en ese minuto: no lo había. Esto parece contradecir un libro que pide explicitar en cada página, y no lo contradice si se lee bien. Las pausas del capítulo 8 son los quiebres de Varela puestos por diseño donde la experiencia enseña que la respuesta inmediata se equivoca. La explicitación de la cirujana en el pasillo no fue parte de su juicio sino de su transmisión. Y la ficha no fotografía la cognición del que escribe: le presta al siguiente lector lo que necesita para revisarla. Lo que Varela corrige es la descripción: la buena práctica no consiste en pensar explícitamente, consiste en responder bien y en reconocer el quiebre. Y lo que advierte es un costo: la explicitación sin disparador no protege al experto, lo degrada a principiante. Por eso la versión completa de HII-D se reserva para los casos difíciles, y la humildad que el capítulo 14 defenderá no es la del que duda de todo, sino la del que sabe cuándo su saber hacer dejó de bastar.</w:t>
+      </w:r>
+    </w:p>
+    <w:p>
+      <w:pPr>
+        <w:pStyle w:val="BodyJ"/>
+      </w:pPr>
+      <w:r>
+        <w:t xml:space="preserve">La música ofrece la imagen más exacta de ese saber hacer, y no como metáfora. La improvisación en jazz es pericia que responde en tiempo real dentro de una estructura —la armonía, el tempo, los otros— sin deliberar nota por nota. Cuando se registró con resonancia funcional a seis pianistas profesionales improvisando, se observó una desactivación extensa de la corteza prefrontal dorsolateral, la región asociada al automonitoreo y al control consciente de la ejecución, junto con la activación de la corteza prefrontal medial (Limb &amp; Braun, 2008). El experto que improvisa apaga al supervisor. Eso es lo que Varela describe y lo que no hay que contradecir: la metacognición madura no es vigilancia continua, porque la vigilancia continua estropea la ejecución; es saber cuándo volver a encender al supervisor. La cirujana frente a Carmen improvisó sobre una estructura de doscientas paredes abdominales; la pausa del capítulo 8 es el momento en que el pianista deja de tocar porque escuchó una nota que no era de la pieza.</w:t>
+      </w:r>
+    </w:p>
+    <w:p>
+      <w:pPr>
+        <w:pStyle w:val="Quote1"/>
+      </w:pPr>
+      <w:r>
+        <w:t xml:space="preserve">La intuición clínica es conocimiento comprimido; la metacognición decide cuándo esa compresión debe volver a desplegarse.</w:t>
+      </w:r>
+    </w:p>
+    <w:p>
+      <w:pPr>
+        <w:pStyle w:val="BodyJ"/>
+      </w:pPr>
+      <w:r>
+        <w:t xml:space="preserve">La excelencia no pertenece al médico que siempre analiza todo ni al que siempre «ve» el diagnóstico. Pertenece a quien cambia de modo de pensamiento según la estructura del caso y puede justificar ese cambio.</w:t>
+      </w:r>
+    </w:p>
+    <w:p>
+      <w:pPr>
+        <w:pStyle w:val="EnUnaFrase"/>
+      </w:pPr>
+      <w:r>
+        <w:rPr>
+          <w:b/>
+          <w:bCs/>
+        </w:rPr>
+        <w:t xml:space="preserve">En una frase.</w:t>
+      </w:r>
+      <w:r>
+        <w:t xml:space="preserve"> La intuición experta es conocimiento organizado que se ejecuta rápido; su valor depende del entorno que la entrenó y de la disposición a desplegarla cuando el caso no encaja.</w:t>
+      </w:r>
+    </w:p>
+    <w:p>
+      <w:pPr>
+        <w:pStyle w:val="BodyJ"/>
+        <w:spacing w:after="80" w:before="160"/>
+      </w:pPr>
+      <w:r>
+        <w:rPr>
+          <w:b/>
+          <w:bCs/>
+        </w:rPr>
+        <w:t xml:space="preserve">Tres preguntas para la próxima visita.</w:t>
+      </w:r>
+    </w:p>
+    <w:p>
+      <w:pPr>
+        <w:pStyle w:val="BodyJ"/>
+        <w:numPr>
+          <w:ilvl w:val="0"/>
+          <w:numId w:val="11"/>
+        </w:numPr>
+      </w:pPr>
+      <w:r>
+        <w:t xml:space="preserve">¿En qué dominio tengo suficiente experiencia con feedback real como para confiar en mi primera impresión?</w:t>
+      </w:r>
+    </w:p>
+    <w:p>
+      <w:pPr>
+        <w:pStyle w:val="BodyJ"/>
+        <w:numPr>
+          <w:ilvl w:val="0"/>
+          <w:numId w:val="11"/>
+        </w:numPr>
+      </w:pPr>
+      <w:r>
+        <w:t xml:space="preserve">La última vez que «vi» un diagnóstico al instante, ¿qué características lo activaron? ¿Puedo nombrarlas?</w:t>
+      </w:r>
+    </w:p>
+    <w:p>
+      <w:pPr>
+        <w:pStyle w:val="BodyJ"/>
+        <w:numPr>
+          <w:ilvl w:val="0"/>
+          <w:numId w:val="11"/>
+        </w:numPr>
+      </w:pPr>
+      <w:r>
+        <w:t xml:space="preserve">¿Qué caso reciente forcé a encajar en un patrón conocido cuando algo no calzaba?</w:t>
+      </w:r>
+    </w:p>
+    <w:p>
+      <w:pPr>
+        <w:pStyle w:val="Heading2"/>
+        <w:pageBreakBefore/>
+        <w:spacing w:after="300" w:before="600"/>
+      </w:pPr>
+      <w:r>
+        <w:rPr>
+          <w:rFonts w:ascii="Georgia" w:cs="Georgia" w:eastAsia="Georgia" w:hAnsi="Georgia"/>
+          <w:b/>
+          <w:bCs/>
+          <w:color w:val="8C2F2F"/>
+          <w:sz w:val="22"/>
+          <w:szCs w:val="22"/>
+        </w:rPr>
+        <w:t xml:space="preserve">Capítulo 7</w:t>
+      </w:r>
+      <w:r>
+        <w:rPr>
+          <w:rFonts w:ascii="Georgia" w:cs="Georgia" w:eastAsia="Georgia" w:hAnsi="Georgia"/>
+          <w:b/>
+          <w:bCs/>
+          <w:color w:val="3D5A6C"/>
+          <w:sz w:val="32"/>
+          <w:szCs w:val="32"/>
+        </w:rPr>
+        <w:br/>
+        <w:t xml:space="preserve">Error, sesgo y ecología del diagnóstico</w:t>
+      </w:r>
+    </w:p>
+    <w:p>
+      <w:pPr>
+        <w:pStyle w:val="BodyJ"/>
+      </w:pPr>
+      <w:r>
+        <w:t xml:space="preserve">Voy a contar un error mío. Una paciente de ochenta y dos años, traída por su hija por decaimiento hipoactivo de dos días y orina de mal olor. La hoja de atención de urgencias traía escrito «antecedente de ITU a repetición», el sedimento mostraba piuria y el urocultivo preliminar informó desarrollo bacteriano. Indiqué ceftriaxona, escribí «ITU baja/alta en anciana frágil, evolución favorable esperable» y pasé al siguiente ingreso de la tarde. Al tercer día la paciente seguía postrada e inapetente; al cuarto agregó fiebre alta, ictericia subclínica y defensa en el hipocondrio derecho: era una colecistitis aguda gangrenosa. Durante años conté este caso diciendo «me anclé en la ITU». Hoy entiendo que esa etiqueta psicológica, aunque cierta, era otra forma de cierre prematuro: bautizar el sesgo me ahorraba reconstruir la arquitectura real del fallo. Este capítulo trata de esa reconstrucción.</w:t>
       </w:r>
     </w:p>
     <w:p>
@@ -5814,192 +5965,7 @@
           <w:sz w:val="25"/>
           <w:szCs w:val="25"/>
         </w:rPr>
-        <w:t xml:space="preserve">El peligro de la fluidez</w:t>
-      </w:r>
-    </w:p>
-    <w:p>
-      <w:pPr>
-        <w:pStyle w:val="BodyJ"/>
-      </w:pPr>
-      <w:r>
-        <w:t xml:space="preserve">La misma fluidez que hace eficaz al experto puede ocultar supuestos. El patrón familiar reduce carga cognitiva, pero favorece asimilación: lo nuevo se fuerza a encajar en lo conocido. El experto necesita mecanismos para detectar excepciones. Una representación discrepante, una evolución atípica o una consecuencia desproporcionada deben reabrir el caso.</w:t>
-      </w:r>
-    </w:p>
-    <w:p>
-      <w:pPr>
-        <w:pStyle w:val="BodyJ"/>
-      </w:pPr>
-      <w:r>
-        <w:t xml:space="preserve">¿Cuándo confiar, entonces, en la primera impresión? La respuesta menos romántica salió del debate entre el programa de los sesgos y el de la pericia naturalista, que terminó en un acuerdo célebre (Kahneman &amp; Klein, 2009). La intuición es confiable cuando se formó en un entorno de validez alta (high-validity environment) —regularidades estables entre señales y desenlaces— y con oportunidad real de aprenderlas, es decir, feedback oportuno y veraz. Sin esas dos condiciones la sensación de saber crece igual, pero sin correlato. La clínica contiene ambos mundos. La sala de reanimación y la lectura de patrones radiológicos entrenan intuiciones con feedback rápido; la consulta de síntomas inespecíficos cuyos desenlaces nadie vuelve a ver produce fluidez sin calibración — la sobreconfianza del capítulo 5, fabricada por el entorno. La pregunta operativa frente a la propia seguridad no es «¿cuánta experiencia tengo?», sino «¿en qué entorno se formó esta impresión, y quién me avisó cuando fallé?».</w:t>
-      </w:r>
-    </w:p>
-    <w:p>
-      <w:pPr>
-        <w:pStyle w:val="BodyJ"/>
-      </w:pPr>
-      <w:r>
-        <w:t xml:space="preserve">Enseñar la pericia clínica no puede reducirse a dictar conclusiones. Exige hacer visible qué pistas perceptivas resultaron decisivas, qué alternativas se descartaron en silencio y qué hallazgo físico habría cambiado la mano. Cuando el interno le preguntó en el pasillo cómo lo había decidido tan rápido, la cirujana hizo el ejercicio de desempaquetar su intuición. Un episodio que demostró potencial letal (shock séptico) pese a un escáner sin necrosis; intervalos libres de enfermedad cada vez más cortos; y un examen físico donde el abdomen «avisa pero todavía no exige»: una hernia parcialmente reductible, sensible en el anillo fibroso, pero con pared blanda y sin sufrimiento cutáneo ni irritación peritoneal. Desplegar el juicio experto en variables observables es lo único que impide que el aprendiz imite el tono de autoridad sin haber adquirido los criterios que lo sostienen.</w:t>
-      </w:r>
-    </w:p>
-    <w:p>
-      <w:pPr>
-        <w:pStyle w:val="BodyJ"/>
-      </w:pPr>
-      <w:r>
-        <w:t xml:space="preserve">Varela, cuya obra con Maturana el capítulo 1 ya convocó, agrega una corrección que hay que aceptar. En las conferencias publicadas como </w:t>
-      </w:r>
-      <w:r>
-        <w:rPr>
-          <w:i/>
-          <w:iCs/>
-        </w:rPr>
-        <w:t xml:space="preserve">Ética y acción</w:t>
-      </w:r>
-      <w:r>
-        <w:t xml:space="preserve"> sostuvo que la pericia ética —y la pericia en general— no es deliberación sino un saber hacer inmediato, encarnado, que responde a la situación sin pasar por reglas ni por juicios explícitos (Varela, 1996). La deliberación aparece sólo en el quiebre (breakdown), cuando la respuesta espontánea falla o la situación no calza con lo aprendido. La cirujana que abre este capítulo no calló un razonamiento en ese minuto: no lo había. Esto parece contradecir un libro que pide explicitar en cada página, y no lo contradice si se lee bien. Las pausas del capítulo 8 son los quiebres de Varela puestos por diseño donde la experiencia enseña que la respuesta inmediata se equivoca. La explicitación de la cirujana en el pasillo no fue parte de su juicio sino de su transmisión. Y la ficha no fotografía la cognición del que escribe: le presta al siguiente lector lo que necesita para revisarla. Lo que Varela corrige es la descripción: la buena práctica no consiste en pensar explícitamente, consiste en responder bien y en reconocer el quiebre. Y lo que advierte es un costo: la explicitación sin disparador no protege al experto, lo degrada a principiante. Por eso la versión completa de HII-D se reserva para los casos difíciles, y la humildad que el capítulo 14 defenderá no es la del que duda de todo, sino la del que sabe cuándo su saber hacer dejó de bastar.</w:t>
-      </w:r>
-    </w:p>
-    <w:p>
-      <w:pPr>
-        <w:pStyle w:val="BodyJ"/>
-      </w:pPr>
-      <w:r>
-        <w:t xml:space="preserve">La música ofrece la imagen más exacta de ese saber hacer, y no como metáfora. La improvisación en jazz es pericia que responde en tiempo real dentro de una estructura —la armonía, el tempo, los otros— sin deliberar nota por nota. Cuando se registró con resonancia funcional a seis pianistas profesionales improvisando, se observó una desactivación extensa de la corteza prefrontal dorsolateral, la región asociada al automonitoreo y al control consciente de la ejecución, junto con la activación de la corteza prefrontal medial (Limb &amp; Braun, 2008). El experto que improvisa apaga al supervisor. Eso es lo que Varela describe y lo que no hay que contradecir: la metacognición madura no es vigilancia continua, porque la vigilancia continua estropea la ejecución; es saber cuándo volver a encender al supervisor. La cirujana frente a Carmen improvisó sobre una estructura de doscientas paredes abdominales; la pausa del capítulo 8 es el momento en que el pianista deja de tocar porque escuchó una nota que no era de la pieza.</w:t>
-      </w:r>
-    </w:p>
-    <w:p>
-      <w:pPr>
-        <w:pStyle w:val="Quote1"/>
-      </w:pPr>
-      <w:r>
-        <w:t xml:space="preserve">La intuición clínica es conocimiento comprimido; la metacognición decide cuándo esa compresión debe volver a desplegarse.</w:t>
-      </w:r>
-    </w:p>
-    <w:p>
-      <w:pPr>
-        <w:pStyle w:val="BodyJ"/>
-      </w:pPr>
-      <w:r>
-        <w:t xml:space="preserve">La excelencia no pertenece al médico que siempre analiza todo ni al que siempre «ve» el diagnóstico. Pertenece a quien cambia de modo de pensamiento según la estructura del caso y puede justificar ese cambio.</w:t>
-      </w:r>
-    </w:p>
-    <w:p>
-      <w:pPr>
-        <w:pStyle w:val="EnUnaFrase"/>
-      </w:pPr>
-      <w:r>
-        <w:rPr>
-          <w:b/>
-          <w:bCs/>
-        </w:rPr>
-        <w:t xml:space="preserve">En una frase.</w:t>
-      </w:r>
-      <w:r>
-        <w:t xml:space="preserve"> La intuición experta es conocimiento organizado que se ejecuta rápido; su valor depende del entorno que la entrenó y de la disposición a desplegarla cuando el caso no encaja.</w:t>
-      </w:r>
-    </w:p>
-    <w:p>
-      <w:pPr>
-        <w:pStyle w:val="BodyJ"/>
-        <w:spacing w:after="80" w:before="160"/>
-      </w:pPr>
-      <w:r>
-        <w:rPr>
-          <w:b/>
-          <w:bCs/>
-        </w:rPr>
-        <w:t xml:space="preserve">Tres preguntas para la próxima visita.</w:t>
-      </w:r>
-    </w:p>
-    <w:p>
-      <w:pPr>
-        <w:pStyle w:val="BodyJ"/>
-        <w:numPr>
-          <w:ilvl w:val="0"/>
-          <w:numId w:val="11"/>
-        </w:numPr>
-      </w:pPr>
-      <w:r>
-        <w:t xml:space="preserve">¿En qué dominio tengo suficiente experiencia con feedback real como para confiar en mi primera impresión?</w:t>
-      </w:r>
-    </w:p>
-    <w:p>
-      <w:pPr>
-        <w:pStyle w:val="BodyJ"/>
-        <w:numPr>
-          <w:ilvl w:val="0"/>
-          <w:numId w:val="11"/>
-        </w:numPr>
-      </w:pPr>
-      <w:r>
-        <w:t xml:space="preserve">La última vez que «vi» un diagnóstico al instante, ¿qué características lo activaron? ¿Puedo nombrarlas?</w:t>
-      </w:r>
-    </w:p>
-    <w:p>
-      <w:pPr>
-        <w:pStyle w:val="BodyJ"/>
-        <w:numPr>
-          <w:ilvl w:val="0"/>
-          <w:numId w:val="11"/>
-        </w:numPr>
-      </w:pPr>
-      <w:r>
-        <w:t xml:space="preserve">¿Qué caso reciente forcé a encajar en un patrón conocido cuando algo no calzaba?</w:t>
-      </w:r>
-    </w:p>
-    <w:p>
-      <w:pPr>
-        <w:pStyle w:val="Heading2"/>
-        <w:pageBreakBefore/>
-        <w:spacing w:after="300" w:before="600"/>
-      </w:pPr>
-      <w:r>
-        <w:rPr>
-          <w:rFonts w:ascii="Georgia" w:cs="Georgia" w:eastAsia="Georgia" w:hAnsi="Georgia"/>
-          <w:b/>
-          <w:bCs/>
-          <w:color w:val="8C2F2F"/>
-          <w:sz w:val="22"/>
-          <w:szCs w:val="22"/>
-        </w:rPr>
-        <w:t xml:space="preserve">Capítulo 7</w:t>
-      </w:r>
-      <w:r>
-        <w:rPr>
-          <w:rFonts w:ascii="Georgia" w:cs="Georgia" w:eastAsia="Georgia" w:hAnsi="Georgia"/>
-          <w:b/>
-          <w:bCs/>
-          <w:color w:val="3D5A6C"/>
-          <w:sz w:val="32"/>
-          <w:szCs w:val="32"/>
-        </w:rPr>
-        <w:br/>
-        <w:t xml:space="preserve">Error, sesgo y ecología del diagnóstico</w:t>
-      </w:r>
-    </w:p>
-    <w:p>
-      <w:pPr>
-        <w:pStyle w:val="BodyJ"/>
-      </w:pPr>
-      <w:r>
-        <w:t xml:space="preserve">Voy a contar un error mío. Una paciente de ochenta y dos años, traída por su hija por decaimiento hipoactivo de dos días y orina de mal olor. La hoja de atención de urgencias traía escrito «antecedente de ITU a repetición», el sedimento mostraba piuria y el urocultivo preliminar informó desarrollo bacteriano. Indiqué ceftriaxona, escribí «ITU baja/alta en anciana frágil, evolución favorable esperable» y pasé al siguiente ingreso de la tarde. Al tercer día la paciente seguía postrada e inapetente; al cuarto agregó fiebre alta, ictericia subclínica y defensa en el hipocondrio derecho: era una colecistitis aguda gangrenosa. Durante años conté este caso diciendo «me anclé en la ITU». Hoy entiendo que esa etiqueta psicológica, aunque cierta, era otra forma de cierre prematuro: bautizar el sesgo me ahorraba reconstruir la arquitectura real del fallo. Este capítulo trata de esa reconstrucción.</w:t>
-      </w:r>
-    </w:p>
-    <w:p>
-      <w:pPr>
-        <w:pStyle w:val="Heading3"/>
-        <w:spacing w:after="120" w:before="280"/>
-      </w:pPr>
-      <w:r>
-        <w:rPr>
-          <w:rFonts w:ascii="Georgia" w:cs="Georgia" w:eastAsia="Georgia" w:hAnsi="Georgia"/>
-          <w:b/>
-          <w:bCs/>
-          <w:color w:val="2B2B2B"/>
-          <w:sz w:val="25"/>
-          <w:szCs w:val="25"/>
-        </w:rPr>
-        <w:t xml:space="preserve">El atractivo de nombrar el sesgo</w:t>
+        <w:t xml:space="preserve">Del nombre del sesgo a la trayectoria del error</w:t>
       </w:r>
     </w:p>
     <w:p>
@@ -6015,24 +5981,7 @@
         <w:pStyle w:val="BodyJ"/>
       </w:pPr>
       <w:r>
-        <w:t xml:space="preserve">El vocabulario es útil porque permite reconocer patrones. Pero también puede producir una explicación retrospectiva demasiado fácil. Después de un error, casi siempre es posible encontrar un sesgo que parezca describirlo. Etiquetar «anclaje» no demuestra el mecanismo ni explica por qué el anclaje ocurrió en ese momento, con ese equipo y bajo esas condiciones.</w:t>
-      </w:r>
-    </w:p>
-    <w:p>
-      <w:pPr>
-        <w:pStyle w:val="Heading3"/>
-        <w:spacing w:after="120" w:before="280"/>
-      </w:pPr>
-      <w:r>
-        <w:rPr>
-          <w:rFonts w:ascii="Georgia" w:cs="Georgia" w:eastAsia="Georgia" w:hAnsi="Georgia"/>
-          <w:b/>
-          <w:bCs/>
-          <w:color w:val="2B2B2B"/>
-          <w:sz w:val="25"/>
-          <w:szCs w:val="25"/>
-        </w:rPr>
-        <w:t xml:space="preserve">Error como trayectoria</w:t>
+        <w:t xml:space="preserve">El vocabulario es útil porque permite reconocer patrones. Pero también puede producir una explicación retrospectiva demasiado fácil. Después de un error, casi siempre es posible encontrar un sesgo que parezca describirlo. Etiquetar «anclaje» no demuestra el mecanismo ni explica por qué el anclaje ocurrió en ese momento, con ese equipo y bajo esas condiciones. «Cuadro habitual, manejo habitual», la frase con que ingresó Carmen, es anclaje de manual, y nombrarlo así no explica lo que importa: por qué una frase que había sido verdadera tres veces pudo viajar intacta hasta la madrugada en que dejó de serlo.</w:t>
       </w:r>
     </w:p>
     <w:p>
@@ -6164,7 +6113,7 @@
           <w:sz w:val="25"/>
           <w:szCs w:val="25"/>
         </w:rPr>
-        <w:t xml:space="preserve">Sesgo, conocimiento y señal</w:t>
+        <w:t xml:space="preserve">Sesgo, conocimiento y confianza</w:t>
       </w:r>
     </w:p>
     <w:p>
@@ -6181,6 +6130,22 @@
       </w:pPr>
       <w:r>
         <w:t xml:space="preserve">Las heurísticas tampoco son enemigas de la racionalidad. Gigerenzer ha mostrado que reglas simples pueden ser adaptativas cuando corresponden a la estructura del ambiente (Gigerenzer &amp; Gaissmaier, 2011). El problema no es usar atajos, sino usarlos fuera de su ecología de validez. «Lo frecuente es frecuente» funciona como prior, no como veto a la evidencia discordante.</w:t>
+      </w:r>
+    </w:p>
+    <w:p>
+      <w:pPr>
+        <w:pStyle w:val="BodyJ"/>
+      </w:pPr>
+      <w:r>
+        <w:t xml:space="preserve">El prior tiene, sin embargo, una patología propia. La sobreconfianza ha sido vinculada al error diagnóstico, especialmente cuando impide buscar evidencia o revisar una conclusión (Berner &amp; Graber, 2008). Sin embargo, medirla no es trivial. La confianza puede ser apropiada en casos fáciles y excesiva en casos difíciles. Meyer y colaboradores observaron que la relación entre confianza y exactitud es imperfecta, lo que refuerza la necesidad de calibración y feedback (Meyer et al., 2013).</w:t>
+      </w:r>
+    </w:p>
+    <w:p>
+      <w:pPr>
+        <w:pStyle w:val="BodyJ"/>
+      </w:pPr>
+      <w:r>
+        <w:t xml:space="preserve">Una cultura que castiga toda expresión de duda puede aumentar la sobreconfianza performativa. El médico aprende a hablar con certeza aunque piense probabilísticamente. Por el contrario, una cultura que equipara autoridad con infalibilidad dificulta la corrección temprana. La seguridad clínica requiere autoridad revisable.</w:t>
       </w:r>
     </w:p>
     <w:p>
@@ -6197,23 +6162,247 @@
           <w:sz w:val="25"/>
           <w:szCs w:val="25"/>
         </w:rPr>
-        <w:t xml:space="preserve">Sobreconfianza</w:t>
-      </w:r>
-    </w:p>
-    <w:p>
-      <w:pPr>
-        <w:pStyle w:val="BodyJ"/>
-      </w:pPr>
-      <w:r>
-        <w:t xml:space="preserve">El prior tiene, sin embargo, una patología propia. La sobreconfianza ha sido vinculada al error diagnóstico, especialmente cuando impide buscar evidencia o revisar una conclusión (Berner &amp; Graber, 2008). Sin embargo, medirla no es trivial. La confianza puede ser apropiada en casos fáciles y excesiva en casos difíciles. Meyer y colaboradores observaron que la relación entre confianza y exactitud es imperfecta, lo que refuerza la necesidad de calibración y feedback (Meyer et al., 2013).</w:t>
-      </w:r>
-    </w:p>
-    <w:p>
-      <w:pPr>
-        <w:pStyle w:val="BodyJ"/>
-      </w:pPr>
-      <w:r>
-        <w:t xml:space="preserve">Una cultura que castiga toda expresión de duda puede aumentar la sobreconfianza performativa. El médico aprende a hablar con certeza aunque piense probabilísticamente. Por el contrario, una cultura que equipara autoridad con infalibilidad dificulta la corrección temprana. La seguridad clínica requiere autoridad revisable.</w:t>
+        <w:t xml:space="preserve">Debiasing con prudencia</w:t>
+      </w:r>
+    </w:p>
+    <w:p>
+      <w:pPr>
+        <w:pStyle w:val="BodyJ"/>
+      </w:pPr>
+      <w:r>
+        <w:t xml:space="preserve">Las estrategias de debiasing incluyen considerar alternativas, usar reglas de forzamiento, listas de verificación, pausas diagnósticas y reflexión estructurada. Sus fundamentos teóricos y sus obstáculos prácticos han sido descritos en detalle (Croskerry et al., 2013a, 2013b), pero la evidencia de eficacia es heterogénea y los efectos dependen del contexto (Graber et al., 2012; Lambe et al., 2016). Una lista aplicada a todos los casos puede generar fatiga y ruido. La intervención más prometedora suele ser selectiva: identificar situaciones de alto riesgo cognitivo y activar una respuesta específica.</w:t>
+      </w:r>
+    </w:p>
+    <w:p>
+      <w:pPr>
+        <w:pStyle w:val="BodyJ"/>
+      </w:pPr>
+      <w:r>
+        <w:t xml:space="preserve">En lugar de preguntar siempre «¿qué sesgo tengo?», puede ser más útil preguntar:</w:t>
+      </w:r>
+    </w:p>
+    <w:p>
+      <w:pPr>
+        <w:pStyle w:val="BodyJ"/>
+        <w:numPr>
+          <w:ilvl w:val="0"/>
+          <w:numId w:val="6"/>
+        </w:numPr>
+      </w:pPr>
+      <w:r>
+        <w:t xml:space="preserve">¿qué dato sostiene desproporcionadamente mi conclusión?;</w:t>
+      </w:r>
+    </w:p>
+    <w:p>
+      <w:pPr>
+        <w:pStyle w:val="BodyJ"/>
+        <w:numPr>
+          <w:ilvl w:val="0"/>
+          <w:numId w:val="6"/>
+        </w:numPr>
+      </w:pPr>
+      <w:r>
+        <w:t xml:space="preserve">¿qué hallazgo estoy reinterpretando para que encaje?;</w:t>
+      </w:r>
+    </w:p>
+    <w:p>
+      <w:pPr>
+        <w:pStyle w:val="BodyJ"/>
+        <w:numPr>
+          <w:ilvl w:val="0"/>
+          <w:numId w:val="6"/>
+        </w:numPr>
+      </w:pPr>
+      <w:r>
+        <w:t xml:space="preserve">¿qué alternativa cambiaría la conducta?;</w:t>
+      </w:r>
+    </w:p>
+    <w:p>
+      <w:pPr>
+        <w:pStyle w:val="BodyJ"/>
+        <w:numPr>
+          <w:ilvl w:val="0"/>
+          <w:numId w:val="6"/>
+        </w:numPr>
+      </w:pPr>
+      <w:r>
+        <w:t xml:space="preserve">¿qué elemento del sistema impide recibir feedback?;</w:t>
+      </w:r>
+    </w:p>
+    <w:p>
+      <w:pPr>
+        <w:pStyle w:val="BodyJ"/>
+        <w:numPr>
+          <w:ilvl w:val="0"/>
+          <w:numId w:val="6"/>
+        </w:numPr>
+      </w:pPr>
+      <w:r>
+        <w:t xml:space="preserve">¿qué supuse que otro miembro del equipo había verificado?</w:t>
+      </w:r>
+    </w:p>
+    <w:p>
+      <w:pPr>
+        <w:pStyle w:val="Quote1"/>
+      </w:pPr>
+      <w:r>
+        <w:t xml:space="preserve">El sesgo es una posibilidad explicativa; el análisis serio del error exige reconstruir la interacción entre mente, conocimiento, tarea y sistema.</w:t>
+      </w:r>
+    </w:p>
+    <w:p>
+      <w:pPr>
+        <w:pStyle w:val="BodyJ"/>
+      </w:pPr>
+      <w:r>
+        <w:t xml:space="preserve">La metacognición no debe convertirse en vigilancia moral del pensamiento. Debe ser una ingeniería humilde de condiciones que permitan detectar, corregir y aprender antes de que la coherencia narrativa se vuelva irreversible.</w:t>
+      </w:r>
+    </w:p>
+    <w:p>
+      <w:pPr>
+        <w:pStyle w:val="TallerHead"/>
+      </w:pPr>
+      <w:r>
+        <w:t xml:space="preserve">Taller 7. Reconstruir una trayectoria, no asignar un sesgo</w:t>
+      </w:r>
+    </w:p>
+    <w:p>
+      <w:pPr>
+        <w:pStyle w:val="BodyJ"/>
+      </w:pPr>
+      <w:r>
+        <w:t xml:space="preserve">Tome el error de la colecistitis narrado al inicio del capítulo (o, mejor, un error propio que recuerde con suficiente detalle). Prohibido usar nombres de sesgos. Responda: (1) ¿qué información existía y en qué formato viajaba?, (2) ¿qué dato confirmatorio valía menos de lo que se le atribuyó, y por qué?, (3) ¿en qué momento exacto una señal discordante fue reinterpretada para encajar?, (4) ¿qué barrera —humana, escrita o tecnológica— habría interceptado el error, y cuánto habría costado tenerla?</w:t>
+      </w:r>
+    </w:p>
+    <w:p>
+      <w:pPr>
+        <w:pStyle w:val="BodyJ"/>
+      </w:pPr>
+      <w:r>
+        <w:rPr>
+          <w:i/>
+          <w:iCs/>
+        </w:rPr>
+        <w:t xml:space="preserve">Error típico.</w:t>
+      </w:r>
+      <w:r>
+        <w:t xml:space="preserve"> En ejercicios docentes, la respuesta más frecuente viola la regla en la segunda línea: «hubo anclaje y sesgo de confirmación». Nombrar el sesgo se siente como análisis, pero no responde ninguna de las cuatro preguntas: no dice en qué formato viajaba la frase, por qué el urocultivo valía menos, en qué minuto «sigue decaída» se volvió «responde lento» ni qué barrera habría costado diez segundos. El sesgo es el nombre del desenlace; la trayectoria es lo que se puede cambiar.</w:t>
+      </w:r>
+    </w:p>
+    <w:p>
+      <w:pPr>
+        <w:pStyle w:val="BodyJ"/>
+      </w:pPr>
+      <w:r>
+        <w:rPr>
+          <w:i/>
+          <w:iCs/>
+        </w:rPr>
+        <w:t xml:space="preserve">Solución comentada.</w:t>
+      </w:r>
+      <w:r>
+        <w:t xml:space="preserve"> Sobre el caso del capítulo: (1) «ITU a repetición» viajaba como antecedente sin procedencia —el formato (frase heredada en ficha) le daba más autoridad que su origen (nadie sabía quién la escribió ni con qué base). (2) El urocultivo: en una mujer de ochenta y dos años sin síndrome miccional, la bacteriuria tiene alta prevalencia basal; confirma poco cuando la probabilidad pretest de otra causa es sustancial. (3) El día 3: «sigue decaída» se convirtió en «responde lento», una reinterpretación que inmunizaba la hipótesis. (4) Dos barreras de bajo costo y alto impacto: dejar escrito un criterio de reapertura obligatorio al indicar el tratamiento empírico («si no recupera estado basal ni apetito en 48 h, reexaminar abdomen dirigido y solicitar pruebas hepáticas o imagen») e instituir en la visita médica de sala la pregunta de resistencia: «¿qué hallazgo de esta paciente no queda explicado por una infección urinaria?». La hipoactividad severa sin síndrome miccional era la pieza suelta. El análisis de trayectoria termina cuando se diseña la barrera operativa, no cuando se rotula el sesgo del médico.</w:t>
+      </w:r>
+    </w:p>
+    <w:p>
+      <w:pPr>
+        <w:pStyle w:val="EnUnaFrase"/>
+      </w:pPr>
+      <w:r>
+        <w:rPr>
+          <w:b/>
+          <w:bCs/>
+        </w:rPr>
+        <w:t xml:space="preserve">En una frase.</w:t>
+      </w:r>
+      <w:r>
+        <w:t xml:space="preserve"> Nombrar el sesgo es el comienzo del análisis, no su conclusión: el error real es una trayectoria que atraviesa mente, conocimiento, tarea y sistema.</w:t>
+      </w:r>
+    </w:p>
+    <w:p>
+      <w:pPr>
+        <w:pStyle w:val="BodyJ"/>
+        <w:spacing w:after="80" w:before="160"/>
+      </w:pPr>
+      <w:r>
+        <w:rPr>
+          <w:b/>
+          <w:bCs/>
+        </w:rPr>
+        <w:t xml:space="preserve">Tres preguntas para la próxima visita.</w:t>
+      </w:r>
+    </w:p>
+    <w:p>
+      <w:pPr>
+        <w:pStyle w:val="BodyJ"/>
+        <w:numPr>
+          <w:ilvl w:val="0"/>
+          <w:numId w:val="12"/>
+        </w:numPr>
+      </w:pPr>
+      <w:r>
+        <w:t xml:space="preserve">¿Qué frase heredada estoy tratando como hecho en mi paciente más complejo?</w:t>
+      </w:r>
+    </w:p>
+    <w:p>
+      <w:pPr>
+        <w:pStyle w:val="BodyJ"/>
+        <w:numPr>
+          <w:ilvl w:val="0"/>
+          <w:numId w:val="12"/>
+        </w:numPr>
+      </w:pPr>
+      <w:r>
+        <w:t xml:space="preserve">¿Qué dato «confirmatorio» de hoy confirmaría también la hipótesis rival?</w:t>
+      </w:r>
+    </w:p>
+    <w:p>
+      <w:pPr>
+        <w:pStyle w:val="BodyJ"/>
+        <w:numPr>
+          <w:ilvl w:val="0"/>
+          <w:numId w:val="12"/>
+        </w:numPr>
+      </w:pPr>
+      <w:r>
+        <w:t xml:space="preserve">¿Qué evolución atípica estoy reinterpretando para no reabrir el caso?</w:t>
+      </w:r>
+    </w:p>
+    <w:p>
+      <w:pPr>
+        <w:pStyle w:val="Heading2"/>
+        <w:pageBreakBefore/>
+        <w:spacing w:after="300" w:before="600"/>
+      </w:pPr>
+      <w:r>
+        <w:rPr>
+          <w:rFonts w:ascii="Georgia" w:cs="Georgia" w:eastAsia="Georgia" w:hAnsi="Georgia"/>
+          <w:b/>
+          <w:bCs/>
+          <w:color w:val="8C2F2F"/>
+          <w:sz w:val="22"/>
+          <w:szCs w:val="22"/>
+        </w:rPr>
+        <w:t xml:space="preserve">Capítulo 8</w:t>
+      </w:r>
+      <w:r>
+        <w:rPr>
+          <w:rFonts w:ascii="Georgia" w:cs="Georgia" w:eastAsia="Georgia" w:hAnsi="Georgia"/>
+          <w:b/>
+          <w:bCs/>
+          <w:color w:val="3D5A6C"/>
+          <w:sz w:val="32"/>
+          <w:szCs w:val="32"/>
+        </w:rPr>
+        <w:br/>
+        <w:t xml:space="preserve">Desacelerar: cuándo, en qué estado y con qué mente</w:t>
+      </w:r>
+    </w:p>
+    <w:p>
+      <w:pPr>
+        <w:pStyle w:val="BodyJ"/>
+      </w:pPr>
+      <w:r>
+        <w:t xml:space="preserve">En la visita médica de las 8:30, el residente presenta la cama 12 en cuarenta segundos: «Pielonefritis aguda en su tercer día de tratamiento antibiótico, afebril, con buena respuesta clínica». La internista a cargo de la sala mira dos segundos la curva de signos vitales y los exámenes en pantalla y le pide: «Preséntamelo de nuevo, pero sin usar la palabra pielonefritis ni infección». El residente toma aire y reestructura: «Hombre con lesión medular completa y usuario crónico de sonda Foley; tras recambio traumático de sonda presentó orina turbia, piuria y urocultivo positivo, manteniéndose siempre afebril, hemodinámicamente estable y sin disuria ni dolor lumbar evaluables por su nivel lesional; cursa con PCR elevada estable y tiene un cáncer renal metastásico activo como causa inflamatoria concomitante...». Antes de terminar la tercera oración, ya nadie en la sala cree que el paciente tenga una pielonefritis. Ese es exactamente el punto de este capítulo.</w:t>
       </w:r>
     </w:p>
     <w:p>
@@ -6230,247 +6419,39 @@
           <w:sz w:val="25"/>
           <w:szCs w:val="25"/>
         </w:rPr>
-        <w:t xml:space="preserve">Debiasing con prudencia</w:t>
-      </w:r>
-    </w:p>
-    <w:p>
-      <w:pPr>
-        <w:pStyle w:val="BodyJ"/>
-      </w:pPr>
-      <w:r>
-        <w:t xml:space="preserve">Las estrategias de debiasing incluyen considerar alternativas, usar reglas de forzamiento, listas de verificación, pausas diagnósticas y reflexión estructurada. Sus fundamentos teóricos y sus obstáculos prácticos han sido descritos en detalle (Croskerry et al., 2013a, 2013b), pero la evidencia de eficacia es heterogénea y los efectos dependen del contexto (Graber et al., 2012; Lambe et al., 2016). Una lista aplicada a todos los casos puede generar fatiga y ruido. La intervención más prometedora suele ser selectiva: identificar situaciones de alto riesgo cognitivo y activar una respuesta específica.</w:t>
-      </w:r>
-    </w:p>
-    <w:p>
-      <w:pPr>
-        <w:pStyle w:val="BodyJ"/>
-      </w:pPr>
-      <w:r>
-        <w:t xml:space="preserve">En lugar de preguntar siempre «¿qué sesgo tengo?», puede ser más útil preguntar:</w:t>
-      </w:r>
-    </w:p>
-    <w:p>
-      <w:pPr>
-        <w:pStyle w:val="BodyJ"/>
-        <w:numPr>
-          <w:ilvl w:val="0"/>
-          <w:numId w:val="6"/>
-        </w:numPr>
-      </w:pPr>
-      <w:r>
-        <w:t xml:space="preserve">¿qué dato sostiene desproporcionadamente mi conclusión?;</w:t>
-      </w:r>
-    </w:p>
-    <w:p>
-      <w:pPr>
-        <w:pStyle w:val="BodyJ"/>
-        <w:numPr>
-          <w:ilvl w:val="0"/>
-          <w:numId w:val="6"/>
-        </w:numPr>
-      </w:pPr>
-      <w:r>
-        <w:t xml:space="preserve">¿qué hallazgo estoy reinterpretando para que encaje?;</w:t>
-      </w:r>
-    </w:p>
-    <w:p>
-      <w:pPr>
-        <w:pStyle w:val="BodyJ"/>
-        <w:numPr>
-          <w:ilvl w:val="0"/>
-          <w:numId w:val="6"/>
-        </w:numPr>
-      </w:pPr>
-      <w:r>
-        <w:t xml:space="preserve">¿qué alternativa cambiaría la conducta?;</w:t>
-      </w:r>
-    </w:p>
-    <w:p>
-      <w:pPr>
-        <w:pStyle w:val="BodyJ"/>
-        <w:numPr>
-          <w:ilvl w:val="0"/>
-          <w:numId w:val="6"/>
-        </w:numPr>
-      </w:pPr>
-      <w:r>
-        <w:t xml:space="preserve">¿qué elemento del sistema impide recibir feedback?;</w:t>
-      </w:r>
-    </w:p>
-    <w:p>
-      <w:pPr>
-        <w:pStyle w:val="BodyJ"/>
-        <w:numPr>
-          <w:ilvl w:val="0"/>
-          <w:numId w:val="6"/>
-        </w:numPr>
-      </w:pPr>
-      <w:r>
-        <w:t xml:space="preserve">¿qué supuse que otro miembro del equipo había verificado?</w:t>
-      </w:r>
-    </w:p>
-    <w:p>
-      <w:pPr>
-        <w:pStyle w:val="Quote1"/>
-      </w:pPr>
-      <w:r>
-        <w:t xml:space="preserve">El sesgo es una posibilidad explicativa; el análisis serio del error exige reconstruir la interacción entre mente, conocimiento, tarea y sistema.</w:t>
-      </w:r>
-    </w:p>
-    <w:p>
-      <w:pPr>
-        <w:pStyle w:val="BodyJ"/>
-      </w:pPr>
-      <w:r>
-        <w:t xml:space="preserve">La metacognición no debe convertirse en vigilancia moral del pensamiento. Debe ser una ingeniería humilde de condiciones que permitan detectar, corregir y aprender antes de que la coherencia narrativa se vuelva irreversible.</w:t>
-      </w:r>
-    </w:p>
-    <w:p>
-      <w:pPr>
-        <w:pStyle w:val="TallerHead"/>
-      </w:pPr>
-      <w:r>
-        <w:t xml:space="preserve">Taller 7. Reconstruir una trayectoria, no asignar un sesgo</w:t>
-      </w:r>
-    </w:p>
-    <w:p>
-      <w:pPr>
-        <w:pStyle w:val="BodyJ"/>
-      </w:pPr>
-      <w:r>
-        <w:t xml:space="preserve">Tome el error de la colecistitis narrado al inicio del capítulo (o, mejor, un error propio que recuerde con suficiente detalle). Prohibido usar nombres de sesgos. Responda: (1) ¿qué información existía y en qué formato viajaba?, (2) ¿qué dato confirmatorio valía menos de lo que se le atribuyó, y por qué?, (3) ¿en qué momento exacto una señal discordante fue reinterpretada para encajar?, (4) ¿qué barrera —humana, escrita o tecnológica— habría interceptado el error, y cuánto habría costado tenerla?</w:t>
-      </w:r>
-    </w:p>
-    <w:p>
-      <w:pPr>
-        <w:pStyle w:val="BodyJ"/>
-      </w:pPr>
-      <w:r>
-        <w:rPr>
-          <w:i/>
-          <w:iCs/>
-        </w:rPr>
-        <w:t xml:space="preserve">Error típico.</w:t>
-      </w:r>
-      <w:r>
-        <w:t xml:space="preserve"> En ejercicios docentes, la respuesta más frecuente viola la regla en la segunda línea: «hubo anclaje y sesgo de confirmación». Nombrar el sesgo se siente como análisis, pero no responde ninguna de las cuatro preguntas: no dice en qué formato viajaba la frase, por qué el urocultivo valía menos, en qué minuto «sigue decaída» se volvió «responde lento» ni qué barrera habría costado diez segundos. El sesgo es el nombre del desenlace; la trayectoria es lo que se puede cambiar.</w:t>
-      </w:r>
-    </w:p>
-    <w:p>
-      <w:pPr>
-        <w:pStyle w:val="BodyJ"/>
-      </w:pPr>
-      <w:r>
-        <w:rPr>
-          <w:i/>
-          <w:iCs/>
-        </w:rPr>
-        <w:t xml:space="preserve">Solución comentada.</w:t>
-      </w:r>
-      <w:r>
-        <w:t xml:space="preserve"> Sobre el caso del capítulo: (1) «ITU a repetición» viajaba como antecedente sin procedencia —el formato (frase heredada en ficha) le daba más autoridad que su origen (nadie sabía quién la escribió ni con qué base). (2) El urocultivo: en una mujer de ochenta y dos años sin síndrome miccional, la bacteriuria tiene alta prevalencia basal; confirma poco cuando la probabilidad pretest de otra causa es sustancial. (3) El día 3: «sigue decaída» se convirtió en «responde lento», una reinterpretación que inmunizaba la hipótesis. (4) Dos barreras de bajo costo y alto impacto: dejar escrito un criterio de reapertura obligatorio al indicar el tratamiento empírico («si no recupera estado basal ni apetito en 48 h, reexaminar abdomen dirigido y solicitar pruebas hepáticas o imagen») e instituir en la visita médica de sala la pregunta de resistencia: «¿qué hallazgo de esta paciente no queda explicado por una infección urinaria?». La hipoactividad severa sin síndrome miccional era la pieza suelta. El análisis de trayectoria termina cuando se diseña la barrera operativa, no cuando se rotula el sesgo del médico.</w:t>
-      </w:r>
-    </w:p>
-    <w:p>
-      <w:pPr>
-        <w:pStyle w:val="EnUnaFrase"/>
-      </w:pPr>
-      <w:r>
-        <w:rPr>
-          <w:b/>
-          <w:bCs/>
-        </w:rPr>
-        <w:t xml:space="preserve">En una frase.</w:t>
-      </w:r>
-      <w:r>
-        <w:t xml:space="preserve"> Nombrar el sesgo es el comienzo del análisis, no su conclusión: el error real es una trayectoria que atraviesa mente, conocimiento, tarea y sistema.</w:t>
-      </w:r>
-    </w:p>
-    <w:p>
-      <w:pPr>
-        <w:pStyle w:val="BodyJ"/>
-        <w:spacing w:after="80" w:before="160"/>
-      </w:pPr>
-      <w:r>
-        <w:rPr>
-          <w:b/>
-          <w:bCs/>
-        </w:rPr>
-        <w:t xml:space="preserve">Tres preguntas para la próxima visita.</w:t>
-      </w:r>
-    </w:p>
-    <w:p>
-      <w:pPr>
-        <w:pStyle w:val="BodyJ"/>
-        <w:numPr>
-          <w:ilvl w:val="0"/>
-          <w:numId w:val="12"/>
-        </w:numPr>
-      </w:pPr>
-      <w:r>
-        <w:t xml:space="preserve">¿Qué frase heredada estoy tratando como hecho en mi paciente más complejo?</w:t>
-      </w:r>
-    </w:p>
-    <w:p>
-      <w:pPr>
-        <w:pStyle w:val="BodyJ"/>
-        <w:numPr>
-          <w:ilvl w:val="0"/>
-          <w:numId w:val="12"/>
-        </w:numPr>
-      </w:pPr>
-      <w:r>
-        <w:t xml:space="preserve">¿Qué dato «confirmatorio» de hoy confirmaría también la hipótesis rival?</w:t>
-      </w:r>
-    </w:p>
-    <w:p>
-      <w:pPr>
-        <w:pStyle w:val="BodyJ"/>
-        <w:numPr>
-          <w:ilvl w:val="0"/>
-          <w:numId w:val="12"/>
-        </w:numPr>
-      </w:pPr>
-      <w:r>
-        <w:t xml:space="preserve">¿Qué evolución atípica estoy reinterpretando para no reabrir el caso?</w:t>
-      </w:r>
-    </w:p>
-    <w:p>
-      <w:pPr>
-        <w:pStyle w:val="Heading2"/>
-        <w:pageBreakBefore/>
-        <w:spacing w:after="300" w:before="600"/>
-      </w:pPr>
-      <w:r>
-        <w:rPr>
-          <w:rFonts w:ascii="Georgia" w:cs="Georgia" w:eastAsia="Georgia" w:hAnsi="Georgia"/>
-          <w:b/>
-          <w:bCs/>
-          <w:color w:val="8C2F2F"/>
-          <w:sz w:val="22"/>
-          <w:szCs w:val="22"/>
-        </w:rPr>
-        <w:t xml:space="preserve">Capítulo 8</w:t>
-      </w:r>
-      <w:r>
-        <w:rPr>
-          <w:rFonts w:ascii="Georgia" w:cs="Georgia" w:eastAsia="Georgia" w:hAnsi="Georgia"/>
-          <w:b/>
-          <w:bCs/>
-          <w:color w:val="3D5A6C"/>
-          <w:sz w:val="32"/>
-          <w:szCs w:val="32"/>
-        </w:rPr>
-        <w:br/>
-        <w:t xml:space="preserve">Desacelerar: cuándo, en qué estado y con qué mente</w:t>
-      </w:r>
-    </w:p>
-    <w:p>
-      <w:pPr>
-        <w:pStyle w:val="BodyJ"/>
-      </w:pPr>
-      <w:r>
-        <w:t xml:space="preserve">En la visita médica de las 8:30, el residente presenta la cama 12 en cuarenta segundos: «Pielonefritis aguda en su tercer día de tratamiento antibiótico, afebril, con buena respuesta clínica». La internista a cargo de la sala mira dos segundos la curva de signos vitales y los exámenes en pantalla y le pide: «Preséntamelo de nuevo, pero sin usar la palabra pielonefritis ni infección». El residente toma aire y reestructura: «Hombre con lesión medular completa y usuario crónico de sonda Foley; tras recambio traumático de sonda presentó orina turbia, piuria y urocultivo positivo, manteniéndose siempre afebril, hemodinámicamente estable y sin disuria ni dolor lumbar evaluables por su nivel lesional; cursa con PCR elevada estable y tiene un cáncer renal metastásico activo como causa inflamatoria concomitante...». Antes de terminar la tercera oración, ya nadie en la sala cree que el paciente tenga una pielonefritis. Ese es exactamente el punto de este capítulo.</w:t>
+        <w:t xml:space="preserve">Reflexionar no es rumiar: cuándo desacelerar</w:t>
+      </w:r>
+    </w:p>
+    <w:p>
+      <w:pPr>
+        <w:pStyle w:val="BodyJ"/>
+      </w:pPr>
+      <w:r>
+        <w:t xml:space="preserve">Schön describió al profesional reflexivo como alguien capaz de pensar durante y después de la acción, especialmente cuando la situación resiste las categorías habituales (Schön, 1983). En medicina, reflexión no significa prolongar indefinidamente cada decisión. Significa volver deliberadamente sobre la representación del problema, examinar supuestos y reorganizar la evidencia cuando existe una razón para hacerlo.</w:t>
+      </w:r>
+    </w:p>
+    <w:p>
+      <w:pPr>
+        <w:pStyle w:val="BodyJ"/>
+      </w:pPr>
+      <w:r>
+        <w:t xml:space="preserve">La práctica atenta de Epstein añade una dimensión: curiosidad, presencia y capacidad de reconocer las propias respuestas emocionales y categorías (Epstein, 1999). La reflexión clínica eficaz es concreta. Tiene un objeto, un disparador y una consecuencia posible.</w:t>
+      </w:r>
+    </w:p>
+    <w:p>
+      <w:pPr>
+        <w:pStyle w:val="BodyJ"/>
+      </w:pPr>
+      <w:r>
+        <w:t xml:space="preserve">Moulton y colaboradores propusieron «desacelerar cuando se debe» como característica del juicio experto. Los profesionales alternan entre flujo automático y esfuerzo deliberado cuando detectan señales de dificultad, novedad o peligro (Moulton et al., 2007). La dificultad es que el momento de desacelerar también debe ser reconocido; si la metacognición falla, el clínico continúa con fluidez precisamente cuando debería detenerse.</w:t>
+      </w:r>
+    </w:p>
+    <w:p>
+      <w:pPr>
+        <w:pStyle w:val="BodyJ"/>
+      </w:pPr>
+      <w:r>
+        <w:t xml:space="preserve">Disparadores razonables incluyen: evolución inesperada; reconsulta; falta de respuesta; discrepancia entre el diagnóstico y la gravedad; datos incompatibles; transición de cuidados; presión emocional; caso raro en un dominio poco familiar; decisión irreversible con evidencia débil; y el estado del propio razonador —hora, horas de turno, ánimo, preocupación ajena al caso—, que la sección siguiente desarrolla. La desaceleración debe ser proporcional. Puede durar treinta segundos o requerir una discusión formal.</w:t>
       </w:r>
     </w:p>
     <w:p>
@@ -6487,72 +6468,6 @@
           <w:sz w:val="25"/>
           <w:szCs w:val="25"/>
         </w:rPr>
-        <w:t xml:space="preserve">Reflexionar no es rumiar</w:t>
-      </w:r>
-    </w:p>
-    <w:p>
-      <w:pPr>
-        <w:pStyle w:val="BodyJ"/>
-      </w:pPr>
-      <w:r>
-        <w:t xml:space="preserve">Schön describió al profesional reflexivo como alguien capaz de pensar durante y después de la acción, especialmente cuando la situación resiste las categorías habituales (Schön, 1983). En medicina, reflexión no significa prolongar indefinidamente cada decisión. Significa volver deliberadamente sobre la representación del problema, examinar supuestos y reorganizar la evidencia cuando existe una razón para hacerlo.</w:t>
-      </w:r>
-    </w:p>
-    <w:p>
-      <w:pPr>
-        <w:pStyle w:val="BodyJ"/>
-      </w:pPr>
-      <w:r>
-        <w:t xml:space="preserve">La práctica atenta de Epstein añade una dimensión: curiosidad, presencia y capacidad de reconocer las propias respuestas emocionales y categorías (Epstein, 1999). La reflexión clínica eficaz es concreta. Tiene un objeto, un disparador y una consecuencia posible.</w:t>
-      </w:r>
-    </w:p>
-    <w:p>
-      <w:pPr>
-        <w:pStyle w:val="Heading3"/>
-        <w:spacing w:after="120" w:before="280"/>
-      </w:pPr>
-      <w:r>
-        <w:rPr>
-          <w:rFonts w:ascii="Georgia" w:cs="Georgia" w:eastAsia="Georgia" w:hAnsi="Georgia"/>
-          <w:b/>
-          <w:bCs/>
-          <w:color w:val="2B2B2B"/>
-          <w:sz w:val="25"/>
-          <w:szCs w:val="25"/>
-        </w:rPr>
-        <w:t xml:space="preserve">Cuándo desacelerar</w:t>
-      </w:r>
-    </w:p>
-    <w:p>
-      <w:pPr>
-        <w:pStyle w:val="BodyJ"/>
-      </w:pPr>
-      <w:r>
-        <w:t xml:space="preserve">Moulton y colaboradores propusieron «desacelerar cuando se debe» como característica del juicio experto. Los profesionales alternan entre flujo automático y esfuerzo deliberado cuando detectan señales de dificultad, novedad o peligro (Moulton et al., 2007). La dificultad es que el momento de desacelerar también debe ser reconocido; si la metacognición falla, el clínico continúa con fluidez precisamente cuando debería detenerse.</w:t>
-      </w:r>
-    </w:p>
-    <w:p>
-      <w:pPr>
-        <w:pStyle w:val="BodyJ"/>
-      </w:pPr>
-      <w:r>
-        <w:t xml:space="preserve">Disparadores razonables incluyen: evolución inesperada; reconsulta; falta de respuesta; discrepancia entre el diagnóstico y la gravedad; datos incompatibles; transición de cuidados; presión emocional; caso raro en un dominio poco familiar; decisión irreversible con evidencia débil; y el estado del propio razonador —hora, horas de turno, ánimo, preocupación ajena al caso—, que la sección siguiente desarrolla. La desaceleración debe ser proporcional. Puede durar treinta segundos o requerir una discusión formal.</w:t>
-      </w:r>
-    </w:p>
-    <w:p>
-      <w:pPr>
-        <w:pStyle w:val="Heading3"/>
-        <w:spacing w:after="120" w:before="280"/>
-      </w:pPr>
-      <w:r>
-        <w:rPr>
-          <w:rFonts w:ascii="Georgia" w:cs="Georgia" w:eastAsia="Georgia" w:hAnsi="Georgia"/>
-          <w:b/>
-          <w:bCs/>
-          <w:color w:val="2B2B2B"/>
-          <w:sz w:val="25"/>
-          <w:szCs w:val="25"/>
-        </w:rPr>
         <w:t xml:space="preserve">El estado del que piensa: esfuerzo, sueño y ánimo</w:t>
       </w:r>
     </w:p>
@@ -6585,7 +6500,7 @@
         <w:pStyle w:val="BodyJ"/>
       </w:pPr>
       <w:r>
-        <w:t xml:space="preserve">Primero, tratar el propio estado como un hecho de la capa H. «¿En qué condiciones estoy pensando esto?» es una pregunta con respuesta observable: la hora, las horas de turno, lo dormido, el ánimo, la preocupación ajena al caso que ocupa la mitad de la atención. Y esa respuesta es un dato sobre la confiabilidad del instrumento que está produciendo las inferencias, tan pertinente como la calibración de un gasómetro. Reconocerlo no es debilidad, sino la trazabilidad que el capítulo 1 exige a cualquier observación, aplicada al observador. Por eso la lista de disparadores de esta sección tiene un ítem más: el estado del razonador. Turno largo, madrugada, ánimo alterado o una preocupación que no es el paciente son condiciones que, por sí solas, justifican la pausa breve o el segundo lector, aunque el caso parezca fácil. Sobre todo si parece fácil.</w:t>
+        <w:t xml:space="preserve">Primero, tratar el propio estado como un hecho de la capa H. «¿En qué condiciones estoy pensando esto?» es una pregunta con respuesta observable: la hora, las horas de turno, lo dormido, el ánimo, la preocupación ajena al caso que ocupa la mitad de la atención. Y esa respuesta es un dato sobre la confiabilidad del instrumento que está produciendo las inferencias, tan pertinente como la calibración de un gasómetro. Reconocerlo no es debilidad, sino la trazabilidad que el capítulo 1 exige a cualquier observación, aplicada al observador. Por eso la lista de disparadores de la sección anterior tiene un ítem más: el estado del razonador. Turno largo, madrugada, ánimo alterado o una preocupación que no es el paciente son condiciones que, por sí solas, justifican la pausa breve o el segundo lector, aunque el caso parezca fácil. Sobre todo si parece fácil.</w:t>
       </w:r>
     </w:p>
     <w:p>
@@ -8302,7 +8217,7 @@
         <w:pStyle w:val="BodyJ"/>
       </w:pPr>
       <w:r>
-        <w:t xml:space="preserve">Algunas evoluciones cambian cualitativamente el caso. Una recurrencia menor puede convertirse en un episodio con shock; una enfermedad estable puede adquirir disfunción orgánica; una respuesta inicial puede dar paso a deterioro. El punto de inflexión no es sólo otro dato: redefine el riesgo de estrategias futuras. La frase medular debe hacerlo visible.</w:t>
+        <w:t xml:space="preserve">Algunas evoluciones cambian cualitativamente el caso. Una recurrencia menor puede convertirse en un episodio con shock; una enfermedad estable puede adquirir disfunción orgánica; una respuesta inicial puede dar paso a deterioro. El cuarto episodio de Carmen es el ejemplo de este libro: no fue uno más de la serie, sino el que cambió de categoría, y la trayectoria —intervalos cada vez más cortos, primer shock— pesó más que cualquier dato aislado. El punto de inflexión no es sólo otro dato: redefine el riesgo de estrategias futuras. La frase medular debe hacerlo visible.</w:t>
       </w:r>
     </w:p>
     <w:p>
@@ -8492,7 +8407,7 @@
           <w:sz w:val="25"/>
           <w:szCs w:val="25"/>
         </w:rPr>
-        <w:t xml:space="preserve">Registrar no es archivar</w:t>
+        <w:t xml:space="preserve">Registrar no es archivar: la ficha produce lo visible</w:t>
       </w:r>
     </w:p>
     <w:p>
@@ -8513,27 +8428,10 @@
     </w:p>
     <w:p>
       <w:pPr>
-        <w:pStyle w:val="Heading3"/>
-        <w:spacing w:after="120" w:before="280"/>
-      </w:pPr>
-      <w:r>
-        <w:rPr>
-          <w:rFonts w:ascii="Georgia" w:cs="Georgia" w:eastAsia="Georgia" w:hAnsi="Georgia"/>
-          <w:b/>
-          <w:bCs/>
-          <w:color w:val="2B2B2B"/>
-          <w:sz w:val="25"/>
-          <w:szCs w:val="25"/>
-        </w:rPr>
-        <w:t xml:space="preserve">La ficha produce lo visible</w:t>
-      </w:r>
-    </w:p>
-    <w:p>
-      <w:pPr>
-        <w:pStyle w:val="BodyJ"/>
-      </w:pPr>
-      <w:r>
-        <w:t xml:space="preserve">La trazabilidad tiene una consecuencia menos evidente: el formato del registro decide qué puede llegar a ser un hecho. Foucault sostuvo que la clínica moderna no nació simplemente de mirar mejor, sino de reorganizar qué era decible y registrable. El hospital, la autopsia y el registro crearon un espacio donde ciertos fenómenos pudieron convertirse en signos y otros ni siquiera podían formularse (Foucault, 1966). La ficha contemporánea hace hoy ese mismo trabajo, silenciosamente. Sus campos deciden qué existe institucionalmente: si la plantilla tiene casilla para «dolor EVA» pero no hay lugar para «esta vez el dolor era otro», la primera afirmación sobrevivirá en el registro y la segunda morirá en el pasillo. Lo que no cabe en el formulario no se pierde por descuido; se pierde por diseño.</w:t>
+        <w:pStyle w:val="BodyJ"/>
+      </w:pPr>
+      <w:r>
+        <w:t xml:space="preserve">La trazabilidad tiene una consecuencia menos evidente: el formato del registro decide qué puede llegar a ser un hecho. Foucault sostuvo que la clínica moderna no nació simplemente de mirar mejor, sino de reorganizar qué era decible y registrable. El hospital, la autopsia y el registro crearon un espacio donde ciertos fenómenos pudieron convertirse en signos y otros ni siquiera podían formularse (Foucault, 1966). La ficha contemporánea hace hoy ese mismo trabajo, silenciosamente. Sus campos deciden qué existe institucionalmente: si la plantilla tiene casilla para «dolor EVA» pero no hay lugar para «esta vez el dolor era otro», la primera afirmación sobrevivirá en el registro y la segunda morirá en el pasillo. La segunda frase es de Carmen (capítulo 1), y el ejemplo no es hipotético: la plantilla decide si una frase así llega al siguiente turno. Lo que no cabe en el formulario no se pierde por descuido; se pierde por diseño.</w:t>
       </w:r>
     </w:p>
     <w:p>
@@ -8690,7 +8588,7 @@
           <w:sz w:val="25"/>
           <w:szCs w:val="25"/>
         </w:rPr>
-        <w:t xml:space="preserve">La matriz HII-D</w:t>
+        <w:t xml:space="preserve">La matriz HII-D y la frase medular</w:t>
       </w:r>
     </w:p>
     <w:p>
@@ -8851,6 +8749,30 @@
       </w:r>
       <w:r>
         <w:t xml:space="preserve"> no iniciar antibióticos ahora. Mantener vigilancia clínica estrecha ante la aparición de fiebre, inestabilidad hemodinámica, aumento de espasticidad o disreflexia autonómica. El antecedente de colonización multirresistente —declarado en la capa de hechos— eleva el daño ecológico e individual de un tratamiento innecesario, y exige un umbral clínico estricto antes de prescribir.</w:t>
+      </w:r>
+    </w:p>
+    <w:p>
+      <w:pPr>
+        <w:pStyle w:val="BodyJ"/>
+      </w:pPr>
+      <w:r>
+        <w:t xml:space="preserve">Después de ordenar el caso, el paso siguiente es formular una frase medular. No reemplaza la evolución completa; ofrece una representación operativa. Debe incluir la naturaleza del evento, la inferencia con su grado, la incertidumbre crítica —el límite principal de certeza, que suele ser el elemento que cambia el riesgo— y el efecto sobre la conducta.</w:t>
+      </w:r>
+    </w:p>
+    <w:p>
+      <w:pPr>
+        <w:pStyle w:val="BodyJ"/>
+      </w:pPr>
+      <w:r>
+        <w:t xml:space="preserve">En el caso anterior: «Bacteriuria y piuria tras recambio de sonda Foley en paciente con vejiga neurogénica y antecedente de colonización multirresistente, sin signos sistémicos ni autonómicos que configuren infección activa; se difiere antibioterapia bajo vigilancia dirigida para evitar selección de resistencia.»</w:t>
+      </w:r>
+    </w:p>
+    <w:p>
+      <w:pPr>
+        <w:pStyle w:val="BodyJ"/>
+      </w:pPr>
+      <w:r>
+        <w:t xml:space="preserve">La frase contiene una inferencia y una conducta. No declara que la infección sea imposible. Explica por qué la evidencia actual no supera el umbral terapéutico.</w:t>
       </w:r>
     </w:p>
     <w:p>
@@ -8867,31 +8789,55 @@
           <w:sz w:val="25"/>
           <w:szCs w:val="25"/>
         </w:rPr>
-        <w:t xml:space="preserve">Frase medular</w:t>
-      </w:r>
-    </w:p>
-    <w:p>
-      <w:pPr>
-        <w:pStyle w:val="BodyJ"/>
-      </w:pPr>
-      <w:r>
-        <w:t xml:space="preserve">Después de ordenar el caso, el paso siguiente es formular una frase medular. No reemplaza la evolución completa; ofrece una representación operativa. Debe incluir la naturaleza del evento, el elemento que cambia el riesgo y el límite principal de certeza.</w:t>
-      </w:r>
-    </w:p>
-    <w:p>
-      <w:pPr>
-        <w:pStyle w:val="BodyJ"/>
-      </w:pPr>
-      <w:r>
-        <w:t xml:space="preserve">En el caso anterior: «Bacteriuria y piuria tras recambio de sonda Foley en paciente con vejiga neurogénica y antecedente de colonización multirresistente, sin signos sistémicos ni autonómicos que configuren infección activa; se difiere antibioterapia bajo vigilancia dirigida para evitar selección de resistencia.»</w:t>
-      </w:r>
-    </w:p>
-    <w:p>
-      <w:pPr>
-        <w:pStyle w:val="BodyJ"/>
-      </w:pPr>
-      <w:r>
-        <w:t xml:space="preserve">La frase contiene una inferencia y una conducta. No declara que la infección sea imposible. Explica por qué la evidencia actual no supera el umbral terapéutico.</w:t>
+        <w:t xml:space="preserve">La ficha de resultados y la ficha de proceso</w:t>
+      </w:r>
+    </w:p>
+    <w:p>
+      <w:pPr>
+        <w:pStyle w:val="BodyJ"/>
+      </w:pPr>
+      <w:r>
+        <w:t xml:space="preserve">«Neumonía. Ceftriaxona 2 g.» Casi toda ficha contiene notas así, y casi nadie las considera incompletas: tienen un diagnóstico y un tratamiento, que es lo que la plantilla pide. Pero la flecha entre esas dos palabras esconde una cascada de decisiones que alguien tomó, o dejó de tomar, y que la nota no registra. ¿Tiene realmente neumonía, y en base a qué? ¿Requiere hospitalizarse, y en qué unidad? ¿Qué factores anuncian una evolución tórpida? ¿A qué microorganismos apunta la cobertura empírica, y cuáles quedan deliberadamente fuera? ¿Hay que cubrir anaerobios? ¿Qué complicación conviene descartar, y con qué? ¿Necesita oxígeno? ¿Se beneficia de corticoides, y qué lo vuelve riesgoso en este paciente? ¿Cuánto esperar para evaluar la respuesta, y con qué cinética se lee la PCR? Cada pregunta es un HII-D en miniatura; la nota de resultados las comprime todas en una preposición que ni siquiera está escrita.</w:t>
+      </w:r>
+    </w:p>
+    <w:p>
+      <w:pPr>
+        <w:pStyle w:val="BodyJ"/>
+      </w:pPr>
+      <w:r>
+        <w:t xml:space="preserve">Hay, entonces, dos fichas que suelen confundirse. La ficha de resultados registra conclusiones y acciones: lo que se decidió. La ficha de proceso registra, además, los verbos que llevaron hasta ahí. Qué se sospechó y por qué; de qué se dudó; qué se descartó y con qué método; qué se priorizó; qué se infirió y con qué grado; qué se realizó; qué se repitió; qué se comprobó; qué se aprendió. No es una lista de virtudes: es una gramática, y cada verbo cae en una capa del método. Sospechado e inferido son la capa I; dudado, descartado y priorizado son la incertidumbre; realizado y repetido son la decisión; comprobado y aprendido son la reevaluación. La ficha de resultados conjuga un solo verbo, «se indica», y por eso no puede ser auditada: no hay camino que recorrer.</w:t>
+      </w:r>
+    </w:p>
+    <w:p>
+      <w:pPr>
+        <w:pStyle w:val="BodyJ"/>
+      </w:pPr>
+      <w:r>
+        <w:t xml:space="preserve">La misma neumonía, escrita como proceso, cabe en ocho líneas:</w:t>
+      </w:r>
+    </w:p>
+    <w:p>
+      <w:pPr>
+        <w:pStyle w:val="Quote1"/>
+      </w:pPr>
+      <w:r>
+        <w:t xml:space="preserve">Sospecho neumonía adquirida en la comunidad en un hombre de 67 años, diabético compensado, por fiebre de tres días, tos productiva, crépitos en la base derecha y opacidad nueva en la radiografía. Dudé de insuficiencia cardiaca (sin edema ni ingurgitación, radiografía sin congestión) y de embolia (sin factores de riesgo, dolor pleurítico ni hemoptisis): las degrado a poco probables, no las descarto. Descarto aspiración por anamnesis, no por imagen: no hubo vómito ni compromiso de conciencia. Priorizo la hipoxemia: saturación 92% ambiental y frecuencia respiratoria 26, oxígeno por naricera; sala y no intermedio, porque no hay hipotensión, confusión ni urea elevada. Infiero cobertura para neumococo y atípicos (ceftriaxona más macrólido); sin factores para Pseudomonas ni estafilococo resistente, sin indicación de anaerobios. Corticoides: no, sin criterios de gravedad, y su diabetes elevaría además el costo. Comprobaré a las 72 horas con dos predicciones: afebril y con menos oxígeno; PCR en descenso al cuarto día. Repetiré imagen sólo si persiste la fiebre o aparece matidez: el derrame es la complicación que busco. Reabrir si a las 72 horas no se cumple alguna de las dos predicciones.</w:t>
+      </w:r>
+    </w:p>
+    <w:p>
+      <w:pPr>
+        <w:pStyle w:val="BodyJ"/>
+      </w:pPr>
+      <w:r>
+        <w:t xml:space="preserve">Dos de esas líneas cargan evidencia que debe nombrarse. El «no» a los corticoides se apoya en que su beneficio en mortalidad se demostró en neumonía grave tratada en cuidados intensivos, no en sala: 6,2% con hidrocortisona frente a 11,9% con placebo a los 28 días (Dequin et al., 2023). La nota lo dice con una palabra: «sin criterios de gravedad». Y las guías no coinciden: la de la ATS y la IDSA de 2019 recomendó no usar corticoides de rutina, con fuerza en la neumonía no grave y con reservas en la grave, mientras que la actualización de 2024 de la Society of Critical Care Medicine, ya con ese ensayo sobre la mesa, los recomienda en la neumonía bacteriana grave hospitalizada (Metlay et al., 2019; Chaudhuri et al., 2024). La ficha de proceso no zanja el desacuerdo; deja escrito con qué umbral de gravedad lo resolvió. Y el «sin indicación de anaerobios» es un descarte con método, el de la anamnesis que no encontró aspiración, y por eso puede revisarse si la anamnesis cambia. La nota de proceso es apenas más larga que «Neumonía. Ceftriaxona» si se cuentan las líneas que una evolución típica dedica a repetir lo de ayer, y es otra cosa: cualquiera que la lea mañana sabe qué se pensó, qué quedó abierto y qué desmentiría el plan. El riesgo ya advertido —la nota que crece sin pensar— no se corre aquí: la ficha de proceso no escribe más; escribe lo que hoy no se escribe nunca.</w:t>
+      </w:r>
+    </w:p>
+    <w:p>
+      <w:pPr>
+        <w:pStyle w:val="BodyJ"/>
+      </w:pPr>
+      <w:r>
+        <w:t xml:space="preserve">El último verbo pide párrafo propio, porque es donde la ficha de resultados falla con más silencio: comprobar. «Neumonía. Ceftriaxona» no dice cuándo ni con qué se sabrá si funcionó, y así la respuesta se juzga con lo que llegue primero, que casi siempre es la PCR de las 48 horas. Si viene más alta que al ingreso, con el paciente afebril, comiendo y sin oxígeno, la nota de resultados no tiene con qué leerla y el reflejo es escalar el antibiótico. La ficha de proceso sí tiene con qué, porque escribió la predicción con su tiempo, la cinética del marcador que el capítulo 11 describió. Y la dejó anotada antes de que llegara el resultado: «una PCR alta a las 48 horas con paciente bien no reabre el caso; una PCR que no cae al cuarto día, sí».</w:t>
       </w:r>
     </w:p>
     <w:p>
@@ -8908,31 +8854,23 @@
           <w:sz w:val="25"/>
           <w:szCs w:val="25"/>
         </w:rPr>
-        <w:t xml:space="preserve">La ficha de resultados y la ficha de proceso</w:t>
-      </w:r>
-    </w:p>
-    <w:p>
-      <w:pPr>
-        <w:pStyle w:val="BodyJ"/>
-      </w:pPr>
-      <w:r>
-        <w:t xml:space="preserve">«Neumonía. Ceftriaxona 2 g.» Casi toda ficha contiene notas así, y casi nadie las considera incompletas: tienen un diagnóstico y un tratamiento, que es lo que la plantilla pide. Pero la flecha entre esas dos palabras esconde una cascada de decisiones que alguien tomó, o dejó de tomar, y que la nota no registra. ¿Tiene realmente neumonía, y en base a qué? ¿Requiere hospitalizarse, y en qué unidad? ¿Qué factores anuncian una evolución tórpida? ¿A qué microorganismos apunta la cobertura empírica, y cuáles quedan deliberadamente fuera? ¿Hay que cubrir anaerobios? ¿Qué complicación conviene descartar, y con qué? ¿Necesita oxígeno? ¿Se beneficia de corticoides, y qué lo vuelve riesgoso en este paciente? ¿Cuánto esperar para evaluar la respuesta, y con qué cinética se lee la PCR? Cada pregunta es un HII-D en miniatura; la nota de resultados las comprime todas en una preposición que ni siquiera está escrita.</w:t>
-      </w:r>
-    </w:p>
-    <w:p>
-      <w:pPr>
-        <w:pStyle w:val="BodyJ"/>
-      </w:pPr>
-      <w:r>
-        <w:t xml:space="preserve">Hay, entonces, dos fichas que suelen confundirse. La ficha de resultados registra conclusiones y acciones: lo que se decidió. La ficha de proceso registra, además, los verbos que llevaron hasta ahí. Qué se sospechó y por qué; de qué se dudó; qué se descartó y con qué método; qué se priorizó; qué se infirió y con qué grado; qué se realizó; qué se repitió; qué se comprobó; qué se aprendió. No es una lista de virtudes: es una gramática, y cada verbo cae en una capa del método. Sospechado e inferido son la capa I; dudado, descartado y priorizado son la incertidumbre; realizado y repetido son la decisión; comprobado y aprendido son la reevaluación. La ficha de resultados conjuga un solo verbo, «se indica», y por eso no puede ser auditada: no hay camino que recorrer.</w:t>
-      </w:r>
-    </w:p>
-    <w:p>
-      <w:pPr>
-        <w:pStyle w:val="BodyJ"/>
-      </w:pPr>
-      <w:r>
-        <w:t xml:space="preserve">La misma neumonía, escrita como proceso, cabe en ocho líneas:</w:t>
+        <w:t xml:space="preserve">Temporalidad y revisión</w:t>
+      </w:r>
+    </w:p>
+    <w:p>
+      <w:pPr>
+        <w:pStyle w:val="BodyJ"/>
+      </w:pPr>
+      <w:r>
+        <w:t xml:space="preserve">La nota clínica debe preservar el tiempo. «Actualmente estable» no borra shock previo; «sin dolor» después de analgesia no describe el ingreso; «imagen sin complicación» no garantiza el futuro. Las fechas y secuencias permiten distinguir respuesta, coincidencia y causalidad.</w:t>
+      </w:r>
+    </w:p>
+    <w:p>
+      <w:pPr>
+        <w:pStyle w:val="BodyJ"/>
+      </w:pPr>
+      <w:r>
+        <w:t xml:space="preserve">También debe registrar qué haría cambiar. «Reevaluar si fiebre o deterioro» es mejor que «control evolutivo», porque define el mecanismo de revisión. Una decisión sin criterio de reapertura se vuelve inercia.</w:t>
       </w:r>
     </w:p>
     <w:p>
@@ -8940,23 +8878,239 @@
         <w:pStyle w:val="Quote1"/>
       </w:pPr>
       <w:r>
-        <w:t xml:space="preserve">Sospecho neumonía adquirida en la comunidad en un hombre de 67 años, diabético compensado, por fiebre de tres días, tos productiva, crépitos en la base derecha y opacidad nueva en la radiografía. Dudé de insuficiencia cardiaca (sin edema ni ingurgitación, radiografía sin congestión) y de embolia (sin factores de riesgo, dolor pleurítico ni hemoptisis): las degrado a poco probables, no las descarto. Descarto aspiración por anamnesis, no por imagen: no hubo vómito ni compromiso de conciencia. Priorizo la hipoxemia: saturación 92% ambiental y frecuencia respiratoria 26, oxígeno por naricera; sala y no intermedio, porque no hay hipotensión, confusión ni urea elevada. Infiero cobertura para neumococo y atípicos (ceftriaxona más macrólido); sin factores para Pseudomonas ni estafilococo resistente, sin indicación de anaerobios. Corticoides: no, sin criterios de gravedad, y su diabetes elevaría además el costo. Comprobaré a las 72 horas con dos predicciones: afebril y con menos oxígeno; PCR en descenso al cuarto día. Repetiré imagen sólo si persiste la fiebre o aparece matidez: el derrame es la complicación que busco. Reabrir si a las 72 horas no se cumple alguna de las dos predicciones.</w:t>
-      </w:r>
-    </w:p>
-    <w:p>
-      <w:pPr>
-        <w:pStyle w:val="BodyJ"/>
-      </w:pPr>
-      <w:r>
-        <w:t xml:space="preserve">Dos de esas líneas cargan evidencia que debe nombrarse. El «no» a los corticoides se apoya en que su beneficio en mortalidad se demostró en neumonía grave tratada en cuidados intensivos, no en sala: 6,2% con hidrocortisona frente a 11,9% con placebo a los 28 días (Dequin et al., 2023). La nota lo dice con una palabra: «sin criterios de gravedad». Y las guías no coinciden: la de la ATS y la IDSA de 2019 recomendó no usar corticoides de rutina, con fuerza en la neumonía no grave y con reservas en la grave, mientras que la actualización de 2024 de la Society of Critical Care Medicine, ya con ese ensayo sobre la mesa, los recomienda en la neumonía bacteriana grave hospitalizada (Metlay et al., 2019; Chaudhuri et al., 2024). La ficha de proceso no zanja el desacuerdo; deja escrito con qué umbral de gravedad lo resolvió. Y el «sin indicación de anaerobios» es un descarte con método, el de la anamnesis que no encontró aspiración, y por eso puede revisarse si la anamnesis cambia. La nota de proceso es apenas más larga que «Neumonía. Ceftriaxona» si se cuentan las líneas que una evolución típica dedica a repetir lo de ayer, y es otra cosa: cualquiera que la lea mañana sabe qué se pensó, qué quedó abierto y qué desmentiría el plan. El riesgo ya advertido —la nota que crece sin pensar— no se corre aquí: la ficha de proceso no escribe más; escribe lo que hoy no se escribe nunca.</w:t>
-      </w:r>
-    </w:p>
-    <w:p>
-      <w:pPr>
-        <w:pStyle w:val="BodyJ"/>
-      </w:pPr>
-      <w:r>
-        <w:t xml:space="preserve">El último verbo pide párrafo propio, porque es donde la ficha de resultados falla con más silencio: comprobar. «Neumonía. Ceftriaxona» no dice cuándo ni con qué se sabrá si funcionó, y así la respuesta se juzga con lo que llegue primero, que casi siempre es la PCR de las 48 horas. Si viene más alta que al ingreso, con el paciente afebril, comiendo y sin oxígeno, la nota de resultados no tiene con qué leerla y el reflejo es escalar el antibiótico. La ficha de proceso sí tiene con qué, porque escribió la predicción con su tiempo, la cinética del marcador que el capítulo 11 describió. Y la dejó anotada antes de que llegara el resultado: «una PCR alta a las 48 horas con paciente bien no reabre el caso; una PCR que no cae al cuarto día, sí».</w:t>
+        <w:t xml:space="preserve">Una ficha de calidad no sólo cuenta lo que el equipo piensa; permite examinar cómo llegó a pensarlo y en qué condiciones debería dejar de pensarlo.</w:t>
+      </w:r>
+    </w:p>
+    <w:p>
+      <w:pPr>
+        <w:pStyle w:val="TallerHead"/>
+      </w:pPr>
+      <w:r>
+        <w:t xml:space="preserve">Taller 12. Desfosilizar una evolución</w:t>
+      </w:r>
+    </w:p>
+    <w:p>
+      <w:pPr>
+        <w:pStyle w:val="BodyJ"/>
+      </w:pPr>
+      <w:r>
+        <w:t xml:space="preserve">La siguiente nota se ha copiado casi idéntica durante cinco días seguidos: «Paciente cursando neumonía en tratamiento antibiótico, hemodinamia estable, afebril, se mantiene manejo». Al quinto día, los datos reales en la hoja de enfermería y en el sistema son otros. Sigue afebril, pero el requerimiento de oxígeno subió de 2 a 4 L/min en 48 horas, la PCR está estacionaria (180→165 mg/L) y hay un derrame pleural nuevo en la radiografía de tórax de control. Reescriba la evolución del día 5 aplicando la estructura HII-D.</w:t>
+      </w:r>
+    </w:p>
+    <w:p>
+      <w:pPr>
+        <w:pStyle w:val="BodyJ"/>
+      </w:pPr>
+      <w:r>
+        <w:rPr>
+          <w:i/>
+          <w:iCs/>
+        </w:rPr>
+        <w:t xml:space="preserve">Solución comentada.</w:t>
+      </w:r>
+      <w:r>
+        <w:t xml:space="preserve"> La evolución desfosilizada:</w:t>
+      </w:r>
+    </w:p>
+    <w:p>
+      <w:pPr>
+        <w:pStyle w:val="Quote1"/>
+      </w:pPr>
+      <w:r>
+        <w:rPr>
+          <w:i/>
+          <w:iCs/>
+        </w:rPr>
+        <w:t xml:space="preserve">Hechos:</w:t>
+      </w:r>
+      <w:r>
+        <w:t xml:space="preserve"> día 5 de tratamiento antibiótico por neumonía adquirida en la comunidad. Afebril desde el día 2 y normotenso, pero con deterioro del intercambio gaseoso (requerimiento de O2 por naricera en ascenso de 2 a 4 L/min en 48 h), PCR estancada (180→165 mg/L) y aparición de derrame pleural ipsilateral en la radiografía de hoy. </w:t>
+      </w:r>
+      <w:r>
+        <w:rPr>
+          <w:i/>
+          <w:iCs/>
+        </w:rPr>
+        <w:t xml:space="preserve">Inferencia:</w:t>
+      </w:r>
+      <w:r>
+        <w:t xml:space="preserve"> evolución clínica y radiológica discordante con una neumonía en resolución; alta probabilidad de derrame paraneumónico complicado o empiema; falla de cobertura antimicrobiana o diagnóstico alternativo pasan a ser posibles. </w:t>
+      </w:r>
+      <w:r>
+        <w:rPr>
+          <w:i/>
+          <w:iCs/>
+        </w:rPr>
+        <w:t xml:space="preserve">Incertidumbre:</w:t>
+      </w:r>
+      <w:r>
+        <w:t xml:space="preserve"> naturaleza fisicoquímica y microbiológica del líquido pleural desconocida hasta su punción; la ausencia de fiebre no excluye una colección supurada. </w:t>
+      </w:r>
+      <w:r>
+        <w:rPr>
+          <w:i/>
+          <w:iCs/>
+        </w:rPr>
+        <w:t xml:space="preserve">Decisión:</w:t>
+      </w:r>
+      <w:r>
+        <w:t xml:space="preserve"> toracocentesis diagnóstica hoy, guiada por ecografía, y ajuste del esquema según el estudio del líquido; si el procedimiento no se concreta en 24 h, interconsulta a cirugía de tórax. Criterio de reapertura inmediata: cualquier incremento adicional en el aporte de oxígeno o taquipnea progresiva obliga a adelantar el drenaje.</w:t>
+      </w:r>
+    </w:p>
+    <w:p>
+      <w:pPr>
+        <w:pStyle w:val="BodyJ"/>
+      </w:pPr>
+      <w:r>
+        <w:t xml:space="preserve">Nótese que la nota copiada durante cinco días no contenía mentiras literales —el paciente seguía afebril y normotenso—, pero operaba como un fósil narrativo: describía la fisiología del día 2 ignorando la trayectoria del día 5. Desfosilizar la evolución no exigió inventar datos sofisticados, sino dejar de omitir las tendencias que ya estaban a la vista.</w:t>
+      </w:r>
+    </w:p>
+    <w:p>
+      <w:pPr>
+        <w:pStyle w:val="TallerHead"/>
+      </w:pPr>
+      <w:r>
+        <w:t xml:space="preserve">Taller 12B. Conjugue los verbos</w:t>
+      </w:r>
+    </w:p>
+    <w:p>
+      <w:pPr>
+        <w:pStyle w:val="BodyJ"/>
+      </w:pPr>
+      <w:r>
+        <w:t xml:space="preserve">Tome su última evolución de una línea —«X en tratamiento, estable»— y escriba primero las preguntas que esconde (al menos seis). Después, reescríbala como ficha de proceso en no más de ocho líneas, con los verbos: sospecho, dudé, descarto, priorizo, infiero, realizo, comprobaré, repetiré, aprendí.</w:t>
+      </w:r>
+    </w:p>
+    <w:p>
+      <w:pPr>
+        <w:pStyle w:val="BodyJ"/>
+      </w:pPr>
+      <w:r>
+        <w:rPr>
+          <w:i/>
+          <w:iCs/>
+        </w:rPr>
+        <w:t xml:space="preserve">Error típico.</w:t>
+      </w:r>
+      <w:r>
+        <w:t xml:space="preserve"> La ficha de proceso conjugada en pasiva y sin sujeto: «se sospechó», «se descartó», «se comprobará». Los verbos están, pero nadie los ejecuta, y «se comprobará» sin fecha ni responsable es «control según evolución» con mejor vocabulario. El segundo error es el inventario: nueve verbos usados una vez cada uno y en orden, como lista de asistencia, cuando el caso real necesitaba tres «dudé» y ningún «repetiré».</w:t>
+      </w:r>
+    </w:p>
+    <w:p>
+      <w:pPr>
+        <w:pStyle w:val="BodyJ"/>
+      </w:pPr>
+      <w:r>
+        <w:rPr>
+          <w:i/>
+          <w:iCs/>
+        </w:rPr>
+        <w:t xml:space="preserve">Solución comentada.</w:t>
+      </w:r>
+      <w:r>
+        <w:t xml:space="preserve"> No hay solución única. El ejercicio suele mostrar tres cosas. La mitad de las preguntas escondidas nunca se formularon: nadie dudó de nada porque nadie preguntó. «Descarté» casi nunca viene con método. Y «comprobaré» es el verbo que más cuesta conjugar, porque obliga a predecir y a ponerle fecha a la predicción. Si la ficha de proceso no cabe en ocho líneas, está describiendo y no decidiendo: no es la ficha clínica completa, es el esqueleto de las decisiones. Y si cabe en dos, probablemente faltan verbos: una nota sin «dudé» ni «comprobaré» es una ficha de resultados con otro formato.</w:t>
+      </w:r>
+    </w:p>
+    <w:p>
+      <w:pPr>
+        <w:pStyle w:val="EnUnaFrase"/>
+      </w:pPr>
+      <w:r>
+        <w:rPr>
+          <w:b/>
+          <w:bCs/>
+        </w:rPr>
+        <w:t xml:space="preserve">En una frase.</w:t>
+      </w:r>
+      <w:r>
+        <w:t xml:space="preserve"> La ficha es una tecnología del pensamiento colectivo: bien escrita hace auditable el juicio y programable su revisión; copiada, convierte hipótesis viejas en hechos falsos.</w:t>
+      </w:r>
+    </w:p>
+    <w:p>
+      <w:pPr>
+        <w:pStyle w:val="BodyJ"/>
+        <w:spacing w:after="80" w:before="160"/>
+      </w:pPr>
+      <w:r>
+        <w:rPr>
+          <w:b/>
+          <w:bCs/>
+        </w:rPr>
+        <w:t xml:space="preserve">Tres preguntas para la próxima visita.</w:t>
+      </w:r>
+    </w:p>
+    <w:p>
+      <w:pPr>
+        <w:pStyle w:val="BodyJ"/>
+        <w:numPr>
+          <w:ilvl w:val="0"/>
+          <w:numId w:val="18"/>
+        </w:numPr>
+      </w:pPr>
+      <w:r>
+        <w:t xml:space="preserve">¿Qué párrafo de mi evolución de hoy es copia de ayer, y sigue siendo verdad?</w:t>
+      </w:r>
+    </w:p>
+    <w:p>
+      <w:pPr>
+        <w:pStyle w:val="BodyJ"/>
+        <w:numPr>
+          <w:ilvl w:val="0"/>
+          <w:numId w:val="18"/>
+        </w:numPr>
+      </w:pPr>
+      <w:r>
+        <w:t xml:space="preserve">Si yo no estuviera mañana, ¿el médico que me reemplace sabría por mi nota qué vigilar y qué reabriría el caso?</w:t>
+      </w:r>
+    </w:p>
+    <w:p>
+      <w:pPr>
+        <w:pStyle w:val="BodyJ"/>
+        <w:numPr>
+          <w:ilvl w:val="0"/>
+          <w:numId w:val="18"/>
+        </w:numPr>
+      </w:pPr>
+      <w:r>
+        <w:t xml:space="preserve">¿Mi lista de problemas distingue hechos, hipótesis, acciones pendientes e incertidumbres, o todo tiene el mismo estatus?</w:t>
+      </w:r>
+    </w:p>
+    <w:p>
+      <w:pPr>
+        <w:pStyle w:val="Heading2"/>
+        <w:pageBreakBefore/>
+        <w:spacing w:after="300" w:before="600"/>
+      </w:pPr>
+      <w:r>
+        <w:rPr>
+          <w:rFonts w:ascii="Georgia" w:cs="Georgia" w:eastAsia="Georgia" w:hAnsi="Georgia"/>
+          <w:b/>
+          <w:bCs/>
+          <w:color w:val="8C2F2F"/>
+          <w:sz w:val="22"/>
+          <w:szCs w:val="22"/>
+        </w:rPr>
+        <w:t xml:space="preserve">Capítulo 13</w:t>
+      </w:r>
+      <w:r>
+        <w:rPr>
+          <w:rFonts w:ascii="Georgia" w:cs="Georgia" w:eastAsia="Georgia" w:hAnsi="Georgia"/>
+          <w:b/>
+          <w:bCs/>
+          <w:color w:val="3D5A6C"/>
+          <w:sz w:val="32"/>
+          <w:szCs w:val="32"/>
+        </w:rPr>
+        <w:br/>
+        <w:t xml:space="preserve">Pensar con otros: equipos, desacuerdo y comunicación de la incertidumbre</w:t>
+      </w:r>
+    </w:p>
+    <w:p>
+      <w:pPr>
+        <w:pStyle w:val="BodyJ"/>
+      </w:pPr>
+      <w:r>
+        <w:t xml:space="preserve">A las 02:00 de la madrugada, Paola, la enfermera de turno, registra en su hoja: «paciente más quejumbrosa, rechaza la cena, diuresis en el límite inferior». A las 08:00, en la entrega de turno médica, el caso se resume en dos palabras: «sin novedades». Entre ambos registros no hay negligencia ni mala fe; hay una cadena de transmisión donde la señal clínica fue comprimida hasta desaparecer. Este capítulo trata del conocimiento clínico como propiedad distribuida de un equipo —médicos, enfermeras, técnicos, kinesiólogos, paciente, familia y sistemas de registro— y de cómo esa información se degrada, se discute y se comunica.</w:t>
       </w:r>
     </w:p>
     <w:p>
@@ -8973,263 +9127,31 @@
           <w:sz w:val="25"/>
           <w:szCs w:val="25"/>
         </w:rPr>
-        <w:t xml:space="preserve">Temporalidad y revisión</w:t>
-      </w:r>
-    </w:p>
-    <w:p>
-      <w:pPr>
-        <w:pStyle w:val="BodyJ"/>
-      </w:pPr>
-      <w:r>
-        <w:t xml:space="preserve">La nota clínica debe preservar el tiempo. «Actualmente estable» no borra shock previo; «sin dolor» después de analgesia no describe el ingreso; «imagen sin complicación» no garantiza el futuro. Las fechas y secuencias permiten distinguir respuesta, coincidencia y causalidad.</w:t>
-      </w:r>
-    </w:p>
-    <w:p>
-      <w:pPr>
-        <w:pStyle w:val="BodyJ"/>
-      </w:pPr>
-      <w:r>
-        <w:t xml:space="preserve">También debe registrar qué haría cambiar. «Reevaluar si fiebre o deterioro» es mejor que «control evolutivo», porque define el mecanismo de revisión. Una decisión sin criterio de reapertura se vuelve inercia.</w:t>
-      </w:r>
-    </w:p>
-    <w:p>
-      <w:pPr>
-        <w:pStyle w:val="Quote1"/>
-      </w:pPr>
-      <w:r>
-        <w:t xml:space="preserve">Una ficha de calidad no sólo cuenta lo que el equipo piensa; permite examinar cómo llegó a pensarlo y en qué condiciones debería dejar de pensarlo.</w:t>
-      </w:r>
-    </w:p>
-    <w:p>
-      <w:pPr>
-        <w:pStyle w:val="TallerHead"/>
-      </w:pPr>
-      <w:r>
-        <w:t xml:space="preserve">Taller 12. Desfosilizar una evolución</w:t>
-      </w:r>
-    </w:p>
-    <w:p>
-      <w:pPr>
-        <w:pStyle w:val="BodyJ"/>
-      </w:pPr>
-      <w:r>
-        <w:t xml:space="preserve">La siguiente nota se ha copiado casi idéntica durante cinco días seguidos: «Paciente cursando neumonía en tratamiento antibiótico, hemodinamia estable, afebril, se mantiene manejo». Al quinto día, los datos reales en la hoja de enfermería y en el sistema son otros. Sigue afebril, pero el requerimiento de oxígeno subió de 2 a 4 L/min en 48 horas, la PCR está estacionaria (180→165 mg/L) y hay un derrame pleural nuevo en la radiografía de tórax de control. Reescriba la evolución del día 5 aplicando la estructura HII-D.</w:t>
-      </w:r>
-    </w:p>
-    <w:p>
-      <w:pPr>
-        <w:pStyle w:val="BodyJ"/>
-      </w:pPr>
-      <w:r>
-        <w:rPr>
-          <w:i/>
-          <w:iCs/>
-        </w:rPr>
-        <w:t xml:space="preserve">Solución comentada.</w:t>
-      </w:r>
-      <w:r>
-        <w:t xml:space="preserve"> La evolución desfosilizada:</w:t>
-      </w:r>
-    </w:p>
-    <w:p>
-      <w:pPr>
-        <w:pStyle w:val="Quote1"/>
-      </w:pPr>
-      <w:r>
-        <w:rPr>
-          <w:i/>
-          <w:iCs/>
-        </w:rPr>
-        <w:t xml:space="preserve">Hechos:</w:t>
-      </w:r>
-      <w:r>
-        <w:t xml:space="preserve"> día 5 de tratamiento antibiótico por neumonía adquirida en la comunidad. Afebril desde el día 2 y normotenso, pero con deterioro del intercambio gaseoso (requerimiento de O2 por naricera en ascenso de 2 a 4 L/min en 48 h), PCR estancada (180→165 mg/L) y aparición de derrame pleural ipsilateral en la radiografía de hoy. </w:t>
-      </w:r>
-      <w:r>
-        <w:rPr>
-          <w:i/>
-          <w:iCs/>
-        </w:rPr>
-        <w:t xml:space="preserve">Inferencia:</w:t>
-      </w:r>
-      <w:r>
-        <w:t xml:space="preserve"> evolución clínica y radiológica discordante con una neumonía en resolución; alta probabilidad de derrame paraneumónico complicado o empiema; falla de cobertura antimicrobiana o diagnóstico alternativo pasan a ser posibles. </w:t>
-      </w:r>
-      <w:r>
-        <w:rPr>
-          <w:i/>
-          <w:iCs/>
-        </w:rPr>
-        <w:t xml:space="preserve">Incertidumbre:</w:t>
-      </w:r>
-      <w:r>
-        <w:t xml:space="preserve"> naturaleza fisicoquímica y microbiológica del líquido pleural desconocida hasta su punción; la ausencia de fiebre no excluye una colección supurada. </w:t>
-      </w:r>
-      <w:r>
-        <w:rPr>
-          <w:i/>
-          <w:iCs/>
-        </w:rPr>
-        <w:t xml:space="preserve">Decisión:</w:t>
-      </w:r>
-      <w:r>
-        <w:t xml:space="preserve"> toracocentesis diagnóstica hoy, guiada por ecografía, y ajuste del esquema según el estudio del líquido; si el procedimiento no se concreta en 24 h, interconsulta a cirugía de tórax. Criterio de reapertura inmediata: cualquier incremento adicional en el aporte de oxígeno o taquipnea progresiva obliga a adelantar el drenaje.</w:t>
-      </w:r>
-    </w:p>
-    <w:p>
-      <w:pPr>
-        <w:pStyle w:val="BodyJ"/>
-      </w:pPr>
-      <w:r>
-        <w:t xml:space="preserve">Nótese que la nota copiada durante cinco días no contenía mentiras literales —el paciente seguía afebril y normotenso—, pero operaba como un fósil narrativo: describía la fisiología del día 2 ignorando la trayectoria del día 5. Desfosilizar la evolución no exigió inventar datos sofisticados, sino dejar de omitir las tendencias que ya estaban a la vista.</w:t>
-      </w:r>
-    </w:p>
-    <w:p>
-      <w:pPr>
-        <w:pStyle w:val="TallerHead"/>
-      </w:pPr>
-      <w:r>
-        <w:t xml:space="preserve">Taller 12B. Conjugue los verbos</w:t>
-      </w:r>
-    </w:p>
-    <w:p>
-      <w:pPr>
-        <w:pStyle w:val="BodyJ"/>
-      </w:pPr>
-      <w:r>
-        <w:t xml:space="preserve">Tome su última evolución de una línea —«X en tratamiento, estable»— y escriba primero las preguntas que esconde (al menos seis). Después, reescríbala como ficha de proceso en no más de ocho líneas, con los verbos: sospecho, dudé, descarto, priorizo, infiero, realizo, comprobaré, repetiré, aprendí.</w:t>
-      </w:r>
-    </w:p>
-    <w:p>
-      <w:pPr>
-        <w:pStyle w:val="BodyJ"/>
-      </w:pPr>
-      <w:r>
-        <w:rPr>
-          <w:i/>
-          <w:iCs/>
-        </w:rPr>
-        <w:t xml:space="preserve">Error típico.</w:t>
-      </w:r>
-      <w:r>
-        <w:t xml:space="preserve"> La ficha de proceso conjugada en pasiva y sin sujeto: «se sospechó», «se descartó», «se comprobará». Los verbos están, pero nadie los ejecuta, y «se comprobará» sin fecha ni responsable es «control según evolución» con mejor vocabulario. El segundo error es el inventario: nueve verbos usados una vez cada uno y en orden, como lista de asistencia, cuando el caso real necesitaba tres «dudé» y ningún «repetiré».</w:t>
-      </w:r>
-    </w:p>
-    <w:p>
-      <w:pPr>
-        <w:pStyle w:val="BodyJ"/>
-      </w:pPr>
-      <w:r>
-        <w:rPr>
-          <w:i/>
-          <w:iCs/>
-        </w:rPr>
-        <w:t xml:space="preserve">Solución comentada.</w:t>
-      </w:r>
-      <w:r>
-        <w:t xml:space="preserve"> No hay solución única. El ejercicio suele mostrar tres cosas. La mitad de las preguntas escondidas nunca se formularon: nadie dudó de nada porque nadie preguntó. «Descarté» casi nunca viene con método. Y «comprobaré» es el verbo que más cuesta conjugar, porque obliga a predecir y a ponerle fecha a la predicción. Si la ficha de proceso no cabe en ocho líneas, está describiendo y no decidiendo: no es la ficha clínica completa, es el esqueleto de las decisiones. Y si cabe en dos, probablemente faltan verbos: una nota sin «dudé» ni «comprobaré» es una ficha de resultados con otro formato.</w:t>
-      </w:r>
-    </w:p>
-    <w:p>
-      <w:pPr>
-        <w:pStyle w:val="EnUnaFrase"/>
-      </w:pPr>
-      <w:r>
-        <w:rPr>
-          <w:b/>
-          <w:bCs/>
-        </w:rPr>
-        <w:t xml:space="preserve">En una frase.</w:t>
-      </w:r>
-      <w:r>
-        <w:t xml:space="preserve"> La ficha es una tecnología del pensamiento colectivo: bien escrita hace auditable el juicio y programable su revisión; copiada, convierte hipótesis viejas en hechos falsos.</w:t>
-      </w:r>
-    </w:p>
-    <w:p>
-      <w:pPr>
-        <w:pStyle w:val="BodyJ"/>
-        <w:spacing w:after="80" w:before="160"/>
-      </w:pPr>
-      <w:r>
-        <w:rPr>
-          <w:b/>
-          <w:bCs/>
-        </w:rPr>
-        <w:t xml:space="preserve">Tres preguntas para la próxima visita.</w:t>
-      </w:r>
-    </w:p>
-    <w:p>
-      <w:pPr>
-        <w:pStyle w:val="BodyJ"/>
-        <w:numPr>
-          <w:ilvl w:val="0"/>
-          <w:numId w:val="18"/>
-        </w:numPr>
-      </w:pPr>
-      <w:r>
-        <w:t xml:space="preserve">¿Qué párrafo de mi evolución de hoy es copia de ayer, y sigue siendo verdad?</w:t>
-      </w:r>
-    </w:p>
-    <w:p>
-      <w:pPr>
-        <w:pStyle w:val="BodyJ"/>
-        <w:numPr>
-          <w:ilvl w:val="0"/>
-          <w:numId w:val="18"/>
-        </w:numPr>
-      </w:pPr>
-      <w:r>
-        <w:t xml:space="preserve">Si yo no estuviera mañana, ¿el médico que me reemplace sabría por mi nota qué vigilar y qué reabriría el caso?</w:t>
-      </w:r>
-    </w:p>
-    <w:p>
-      <w:pPr>
-        <w:pStyle w:val="BodyJ"/>
-        <w:numPr>
-          <w:ilvl w:val="0"/>
-          <w:numId w:val="18"/>
-        </w:numPr>
-      </w:pPr>
-      <w:r>
-        <w:t xml:space="preserve">¿Mi lista de problemas distingue hechos, hipótesis, acciones pendientes e incertidumbres, o todo tiene el mismo estatus?</w:t>
-      </w:r>
-    </w:p>
-    <w:p>
-      <w:pPr>
-        <w:pStyle w:val="Heading2"/>
-        <w:pageBreakBefore/>
-        <w:spacing w:after="300" w:before="600"/>
-      </w:pPr>
-      <w:r>
-        <w:rPr>
-          <w:rFonts w:ascii="Georgia" w:cs="Georgia" w:eastAsia="Georgia" w:hAnsi="Georgia"/>
-          <w:b/>
-          <w:bCs/>
-          <w:color w:val="8C2F2F"/>
-          <w:sz w:val="22"/>
-          <w:szCs w:val="22"/>
-        </w:rPr>
-        <w:t xml:space="preserve">Capítulo 13</w:t>
-      </w:r>
-      <w:r>
-        <w:rPr>
-          <w:rFonts w:ascii="Georgia" w:cs="Georgia" w:eastAsia="Georgia" w:hAnsi="Georgia"/>
-          <w:b/>
-          <w:bCs/>
-          <w:color w:val="3D5A6C"/>
-          <w:sz w:val="32"/>
-          <w:szCs w:val="32"/>
-        </w:rPr>
-        <w:br/>
-        <w:t xml:space="preserve">Pensar con otros: equipos, desacuerdo y comunicación de la incertidumbre</w:t>
-      </w:r>
-    </w:p>
-    <w:p>
-      <w:pPr>
-        <w:pStyle w:val="BodyJ"/>
-      </w:pPr>
-      <w:r>
-        <w:t xml:space="preserve">A las 02:00 de la madrugada, Paola, la enfermera de turno, registra en su hoja: «paciente más quejumbrosa, rechaza la cena, diuresis en el límite inferior». A las 08:00, en la entrega de turno médica, el caso se resume en dos palabras: «sin novedades». Entre ambos registros no hay negligencia ni mala fe; hay una cadena de transmisión donde la señal clínica fue comprimida hasta desaparecer. Este capítulo trata del conocimiento clínico como propiedad distribuida de un equipo —médicos, enfermeras, técnicos, kinesiólogos, paciente, familia y sistemas de registro— y de cómo esa información se degrada, se discute y se comunica.</w:t>
+        <w:t xml:space="preserve">La mente clínica no termina en el cráneo</w:t>
+      </w:r>
+    </w:p>
+    <w:p>
+      <w:pPr>
+        <w:pStyle w:val="BodyJ"/>
+      </w:pPr>
+      <w:r>
+        <w:t xml:space="preserve">La imagen clásica del razonamiento médico muestra a un profesional que reúne datos, formula hipótesis y decide. Esa unidad de análisis es necesaria, pero insuficiente para la práctica contemporánea. El conocimiento clínico se distribuye entre médicos, enfermería, kinesiólogos, técnicos, pacientes, familiares, monitores, formularios, sistemas informáticos y rutinas organizacionales. Nadie posee por sí solo el caso completo. Hutchins llamó cognición distribuida al estudio de cómo el procesamiento de información se realiza a través de personas y artefactos coordinados (Hutchins, 1995).</w:t>
+      </w:r>
+    </w:p>
+    <w:p>
+      <w:pPr>
+        <w:pStyle w:val="BodyJ"/>
+      </w:pPr>
+      <w:r>
+        <w:t xml:space="preserve">En una unidad hospitalaria, la enfermera puede reconocer primero un cambio de perfusión; el laboratorio produce una medición crítica; el sistema decide cómo la muestra se etiqueta y cuándo el resultado se hace visible. El médico integra el patrón, un familiar aporta la trayectoria basal y una hoja de balance conserva información que ninguna memoria individual podría reconstruir. La decisión emerge de esa red. La responsabilidad profesional permanece, pero el objeto metacognitivo debe ampliarse: no sólo «¿cómo pensé?», sino «¿cómo circuló y se transformó la información?».</w:t>
+      </w:r>
+    </w:p>
+    <w:p>
+      <w:pPr>
+        <w:pStyle w:val="BodyJ"/>
+      </w:pPr>
+      <w:r>
+        <w:t xml:space="preserve">Vale la pena volver al registro de enfermería de las 02:00. «Más quejumbrosa, rechaza la cena, diuresis en el límite» contiene tres hechos clínicos completos que ninguna evolución médica de esa mañana recogió. Primero, un cambio respecto del basal, detectado por quien evalúa a la paciente cada dos horas y no una vez al día. Segundo, una conducta —dejar de comer cuando venía alimentándose bien— que es signo clínico precoz y no anécdota doméstica. Tercero, una pendiente descendente que antecede por horas a la hipotensión que activará las alarmas. Es la observación profesional en su dimensión más valiosa: la serie temporal corta, un dominio sobre el cual enfermería posee un acceso epistémico privilegiado. Cuando la entrega de turno de las 08:00 tradujo todo eso como «sin novedades», no faltó a la verdad deliberadamente: aplicó a los datos de enfermería un filtro de irrelevancia que jamás aplicaría a un examen de laboratorio. La cognición distribuida comienza cuando el equipo reconoce quién tiene el mejor puesto de observación para cada fenómeno. El de enfermería es el intervalo de veinte horas entre una visita médica y la siguiente: justo donde los pacientes hospitalizados empiezan a deteriorarse.</w:t>
       </w:r>
     </w:p>
     <w:p>
@@ -9246,31 +9168,31 @@
           <w:sz w:val="25"/>
           <w:szCs w:val="25"/>
         </w:rPr>
-        <w:t xml:space="preserve">La mente clínica no termina en el cráneo</w:t>
-      </w:r>
-    </w:p>
-    <w:p>
-      <w:pPr>
-        <w:pStyle w:val="BodyJ"/>
-      </w:pPr>
-      <w:r>
-        <w:t xml:space="preserve">La imagen clásica del razonamiento médico muestra a un profesional que reúne datos, formula hipótesis y decide. Esa unidad de análisis es necesaria, pero insuficiente para la práctica contemporánea. El conocimiento clínico se distribuye entre médicos, enfermería, kinesiólogos, técnicos, pacientes, familiares, monitores, formularios, sistemas informáticos y rutinas organizacionales. Nadie posee por sí solo el caso completo. Hutchins llamó cognición distribuida al estudio de cómo el procesamiento de información se realiza a través de personas y artefactos coordinados (Hutchins, 1995).</w:t>
-      </w:r>
-    </w:p>
-    <w:p>
-      <w:pPr>
-        <w:pStyle w:val="BodyJ"/>
-      </w:pPr>
-      <w:r>
-        <w:t xml:space="preserve">En una unidad hospitalaria, la enfermera puede reconocer primero un cambio de perfusión; el laboratorio produce una medición crítica; el sistema decide cómo la muestra se etiqueta y cuándo el resultado se hace visible. El médico integra el patrón, un familiar aporta la trayectoria basal y una hoja de balance conserva información que ninguna memoria individual podría reconstruir. La decisión emerge de esa red. La responsabilidad profesional permanece, pero el objeto metacognitivo debe ampliarse: no sólo «¿cómo pensé?», sino «¿cómo circuló y se transformó la información?».</w:t>
-      </w:r>
-    </w:p>
-    <w:p>
-      <w:pPr>
-        <w:pStyle w:val="BodyJ"/>
-      </w:pPr>
-      <w:r>
-        <w:t xml:space="preserve">Vale la pena volver al registro de enfermería de las 02:00. «Más quejumbrosa, rechaza la cena, diuresis en el límite» contiene tres hechos clínicos completos que ninguna evolución médica de esa mañana recogió. Primero, un cambio respecto del basal, detectado por quien evalúa a la paciente cada dos horas y no una vez al día. Segundo, una conducta —dejar de comer cuando venía alimentándose bien— que es signo clínico precoz y no anécdota doméstica. Tercero, una pendiente descendente que antecede por horas a la hipotensión que activará las alarmas. Es la observación profesional en su dimensión más valiosa: la serie temporal corta, un dominio sobre el cual enfermería posee un acceso epistémico privilegiado. Cuando la entrega de turno de las 08:00 tradujo todo eso como «sin novedades», no faltó a la verdad deliberadamente: aplicó a los datos de enfermería un filtro de irrelevancia que jamás aplicaría a un examen de laboratorio. La cognición distribuida comienza cuando el equipo reconoce quién tiene el mejor puesto de observación para cada fenómeno. El de enfermería es el intervalo de veinte horas entre una visita médica y la siguiente: justo donde los pacientes hospitalizados empiezan a deteriorarse.</w:t>
+        <w:t xml:space="preserve">Transferir es transformar</w:t>
+      </w:r>
+    </w:p>
+    <w:p>
+      <w:pPr>
+        <w:pStyle w:val="BodyJ"/>
+      </w:pPr>
+      <w:r>
+        <w:t xml:space="preserve">Ningún dato clínico viaja intacto a través de una institución. En cada entrega de turno, interconsulta telefónica o resumen de traslado, la información se selecciona, se comprime y se reinterpreta. «Paciente estable» puede esconder un requerimiento de oxígeno que se duplicó en silencio. «Urocultivo positivo» suele perder en el camino que el paciente es usuario crónico de sonda y está asintomático. «TAC sin complicaciones agudas» se traduce, sin que nadie lo decida, como «hernia no complicada», y borra el hecho de que la paciente ingresó en shock séptico. Y los artefactos tecnológicos también editorializan: la interfaz de la ficha electrónica jerarquiza ciertas casillas, esconde las notas de otros estamentos en pestañas separadas y fuerza realidades clínicas continuas dentro de menús desplegables administrativos.</w:t>
+      </w:r>
+    </w:p>
+    <w:p>
+      <w:pPr>
+        <w:pStyle w:val="BodyJ"/>
+      </w:pPr>
+      <w:r>
+        <w:t xml:space="preserve">Rajkomar y Blandford describieron cómo la administración de infusiones en UCI puede comprenderse mediante cognición distribuida, atendiendo a la interacción entre profesionales, bombas, prescripciones y entorno (Rajkomar &amp; Blandford, 2012). La lección es general: muchos errores que parecen «de una persona» son fallas de propagación, representación o coordinación. El sistema puede aumentar la capacidad cognitiva mediante redundancia y memoria externa, pero también fragmentar la situación y ocultar señales.</w:t>
+      </w:r>
+    </w:p>
+    <w:p>
+      <w:pPr>
+        <w:pStyle w:val="BodyJ"/>
+      </w:pPr>
+      <w:r>
+        <w:t xml:space="preserve">La ficha clínica es uno de estos artefactos. Una nota bien estructurada conserva procedencia, temporalidad y grado de certeza para el siguiente lector. Una nota retórica transmite una conclusión sin las condiciones para revisarla. La calidad epistemológica del equipo depende de que las representaciones sean auditables.</w:t>
       </w:r>
     </w:p>
     <w:p>
@@ -9287,48 +9209,7 @@
           <w:sz w:val="25"/>
           <w:szCs w:val="25"/>
         </w:rPr>
-        <w:t xml:space="preserve">Transferir es transformar</w:t>
-      </w:r>
-    </w:p>
-    <w:p>
-      <w:pPr>
-        <w:pStyle w:val="BodyJ"/>
-      </w:pPr>
-      <w:r>
-        <w:t xml:space="preserve">Ningún dato clínico viaja intacto a través de una institución. En cada entrega de turno, interconsulta telefónica o resumen de traslado, la información se selecciona, se comprime y se reinterpreta. «Paciente estable» puede esconder un requerimiento de oxígeno que se duplicó en silencio. «Urocultivo positivo» suele perder en el camino que el paciente es usuario crónico de sonda y está asintomático. «TAC sin complicaciones agudas» se traduce, sin que nadie lo decida, como «hernia no complicada», y borra el hecho de que la paciente ingresó en shock séptico. Y los artefactos tecnológicos también editorializan: la interfaz de la ficha electrónica jerarquiza ciertas casillas, esconde las notas de otros estamentos en pestañas separadas y fuerza realidades clínicas continuas dentro de menús desplegables administrativos.</w:t>
-      </w:r>
-    </w:p>
-    <w:p>
-      <w:pPr>
-        <w:pStyle w:val="BodyJ"/>
-      </w:pPr>
-      <w:r>
-        <w:t xml:space="preserve">Rajkomar y Blandford describieron cómo la administración de infusiones en UCI puede comprenderse mediante cognición distribuida, atendiendo a la interacción entre profesionales, bombas, prescripciones y entorno (Rajkomar &amp; Blandford, 2012). La lección es general: muchos errores que parecen «de una persona» son fallas de propagación, representación o coordinación. El sistema puede aumentar la capacidad cognitiva mediante redundancia y memoria externa, pero también fragmentar la situación y ocultar señales.</w:t>
-      </w:r>
-    </w:p>
-    <w:p>
-      <w:pPr>
-        <w:pStyle w:val="BodyJ"/>
-      </w:pPr>
-      <w:r>
-        <w:t xml:space="preserve">La ficha clínica es uno de estos artefactos. Una nota bien estructurada conserva procedencia, temporalidad y grado de certeza para el siguiente lector. Una nota retórica transmite una conclusión sin las condiciones para revisarla. La calidad epistemológica del equipo depende de que las representaciones sean auditables.</w:t>
-      </w:r>
-    </w:p>
-    <w:p>
-      <w:pPr>
-        <w:pStyle w:val="Heading3"/>
-        <w:spacing w:after="120" w:before="280"/>
-      </w:pPr>
-      <w:r>
-        <w:rPr>
-          <w:rFonts w:ascii="Georgia" w:cs="Georgia" w:eastAsia="Georgia" w:hAnsi="Georgia"/>
-          <w:b/>
-          <w:bCs/>
-          <w:color w:val="2B2B2B"/>
-          <w:sz w:val="25"/>
-          <w:szCs w:val="25"/>
-        </w:rPr>
-        <w:t xml:space="preserve">El desacuerdo como instrumento</w:t>
+        <w:t xml:space="preserve">El desacuerdo como instrumento y el diseño para la corrección</w:t>
       </w:r>
     </w:p>
     <w:p>
@@ -9357,27 +9238,10 @@
     </w:p>
     <w:p>
       <w:pPr>
-        <w:pStyle w:val="Heading3"/>
-        <w:spacing w:after="120" w:before="280"/>
-      </w:pPr>
-      <w:r>
-        <w:rPr>
-          <w:rFonts w:ascii="Georgia" w:cs="Georgia" w:eastAsia="Georgia" w:hAnsi="Georgia"/>
-          <w:b/>
-          <w:bCs/>
-          <w:color w:val="2B2B2B"/>
-          <w:sz w:val="25"/>
-          <w:szCs w:val="25"/>
-        </w:rPr>
-        <w:t xml:space="preserve">Diseño para la corrección</w:t>
-      </w:r>
-    </w:p>
-    <w:p>
-      <w:pPr>
-        <w:pStyle w:val="BodyJ"/>
-      </w:pPr>
-      <w:r>
-        <w:t xml:space="preserve">Un sistema seguro no depende de que cada individuo recuerde cuestionarlo todo. Diseña momentos y artefactos que facilitan detectar discordancias: tendencias visibles, alertas selectivas, listas de problemas actualizadas, criterios de reapertura, acceso a datos fuente y roles claros para escalar preocupación. La National Academies conceptualizó el diagnóstico como un proceso de equipo y aprendizaje continuo, no como un acto aislado (National Academies of Sciences, Engineering, and Medicine, 2015).</w:t>
+        <w:pStyle w:val="BodyJ"/>
+      </w:pPr>
+      <w:r>
+        <w:t xml:space="preserve">Ese lenguaje común necesita un sistema que lo sostenga. Un sistema seguro no depende de que cada individuo recuerde cuestionarlo todo. Diseña momentos y artefactos que facilitan detectar discordancias: tendencias visibles, alertas selectivas, listas de problemas actualizadas, criterios de reapertura, acceso a datos fuente y roles claros para escalar preocupación. La National Academies conceptualizó el diagnóstico como un proceso de equipo y aprendizaje continuo, no como un acto aislado (National Academies of Sciences, Engineering, and Medicine, 2015).</w:t>
       </w:r>
     </w:p>
     <w:p>
@@ -11592,7 +11456,7 @@
         <w:pStyle w:val="BodyJ"/>
       </w:pPr>
       <w:r>
-        <w:t xml:space="preserve">Toda decisión incluye un plan de reapertura: criterio clínico, examen pendiente, plazo o evento. Sin él, HII-D queda incompleto. Así quedó escrita la de Carmen: reparación electiva tras la recuperación, porque el costo esperado de un quinto episodio fuera del hospital supera el riesgo de una cirugía programada; reevaluar si aparece dolor desproporcionado, fiebre o íleo antes de pabellón; responsable, el equipo tratante. La plantilla condensada que recoge estas ocho líneas está en el Apéndice A, y el Interludio I es su primera versión completa.</w:t>
+        <w:t xml:space="preserve">Toda decisión incluye un plan de reapertura: criterio clínico, resultado pendiente, plazo o evento. Sin él, HII-D queda incompleto. Así quedó escrita la de Carmen: reparación electiva tras la recuperación, porque el costo esperado de un quinto episodio fuera del hospital supera el riesgo de una cirugía programada; reevaluar si aparece dolor desproporcionado, fiebre o íleo antes de pabellón; responsable, el equipo tratante. La plantilla condensada que recoge estas ocho líneas está en el Apéndice A, y el Interludio I es su primera versión completa.</w:t>
       </w:r>
     </w:p>
     <w:p>
@@ -11681,7 +11545,7 @@
           <w:b/>
           <w:bCs/>
         </w:rPr>
-        <w:t xml:space="preserve">¿Qué hago, y qué me haría cambiar antes del próximo control?</w:t>
+        <w:t xml:space="preserve">¿Qué hago y qué me haría cambiar antes del próximo control?</w:t>
       </w:r>
       <w:r>
         <w:t xml:space="preserve"> (decisión con criterio de reapertura)</w:t>
@@ -11709,7 +11573,7 @@
           <w:sz w:val="25"/>
           <w:szCs w:val="25"/>
         </w:rPr>
-        <w:t xml:space="preserve">Uso en equipo</w:t>
+        <w:t xml:space="preserve">Uso en equipo, calibración y auditoría</w:t>
       </w:r>
     </w:p>
     <w:p>
@@ -11726,6 +11590,22 @@
       </w:pPr>
       <w:r>
         <w:t xml:space="preserve">También puede usarse para revisar una nota, un informe de alta o una respuesta de IA. La pregunta siempre es la misma: ¿la fuerza del lenguaje corresponde a la fuerza de la evidencia y la decisión corresponde a las consecuencias?</w:t>
+      </w:r>
+    </w:p>
+    <w:p>
+      <w:pPr>
+        <w:pStyle w:val="BodyJ"/>
+      </w:pPr>
+      <w:r>
+        <w:t xml:space="preserve">HII-D puede usarse retrospectivamente para examinar decisiones. La pregunta no es sólo si el diagnóstico final coincidió, sino si los hechos fueron representados con fidelidad, si las inferencias recibieron una fuerza proporcional, si la incertidumbre relevante fue identificada y si la decisión era defendible con la información disponible. Este análisis evita confundir calidad del proceso con fortuna del desenlace.</w:t>
+      </w:r>
+    </w:p>
+    <w:p>
+      <w:pPr>
+        <w:pStyle w:val="BodyJ"/>
+      </w:pPr>
+      <w:r>
+        <w:t xml:space="preserve">La calibración requiere comparar predicciones con resultados. Cuando sea posible, registre no sólo una hipótesis, sino un grado verbal o numérico de confianza y una expectativa temporal. Más tarde puede revisarse: ¿la certeza fue excesiva?, ¿la alternativa descartada ocurrió con frecuencia?, ¿el criterio de alarma fue sensible?, ¿la conducta se modificó cuando debía? Sin retorno de información, la experiencia puede acumular años sin transformarse en pericia.</w:t>
       </w:r>
     </w:p>
     <w:p>
@@ -11742,23 +11622,55 @@
           <w:sz w:val="25"/>
           <w:szCs w:val="25"/>
         </w:rPr>
-        <w:t xml:space="preserve">Calibración y auditoría del método</w:t>
-      </w:r>
-    </w:p>
-    <w:p>
-      <w:pPr>
-        <w:pStyle w:val="BodyJ"/>
-      </w:pPr>
-      <w:r>
-        <w:t xml:space="preserve">HII-D puede usarse retrospectivamente para examinar decisiones. La pregunta no es sólo si el diagnóstico final coincidió, sino si los hechos fueron representados con fidelidad, si las inferencias recibieron una fuerza proporcional, si la incertidumbre relevante fue identificada y si la decisión era defendible con la información disponible. Este análisis evita confundir calidad del proceso con fortuna del desenlace.</w:t>
-      </w:r>
-    </w:p>
-    <w:p>
-      <w:pPr>
-        <w:pStyle w:val="BodyJ"/>
-      </w:pPr>
-      <w:r>
-        <w:t xml:space="preserve">La calibración requiere comparar predicciones con resultados. Cuando sea posible, registre no sólo una hipótesis, sino un grado verbal o numérico de confianza y una expectativa temporal. Más tarde puede revisarse: ¿la certeza fue excesiva?, ¿la alternativa descartada ocurrió con frecuencia?, ¿el criterio de alarma fue sensible?, ¿la conducta se modificó cuando debía? Sin retorno de información, la experiencia puede acumular años sin transformarse en pericia.</w:t>
+        <w:t xml:space="preserve">Qué evidencia me haría abandonar este método</w:t>
+      </w:r>
+    </w:p>
+    <w:p>
+      <w:pPr>
+        <w:pStyle w:val="BodyJ"/>
+      </w:pPr>
+      <w:r>
+        <w:t xml:space="preserve">Un libro que exige compromisos observables a cada hipótesis clínica debe formular los suyos. Estos son los míos.</w:t>
+      </w:r>
+    </w:p>
+    <w:p>
+      <w:pPr>
+        <w:pStyle w:val="BodyJ"/>
+      </w:pPr>
+      <w:r>
+        <w:t xml:space="preserve">Primero: si clínicos entrenados no logran un acuerdo razonable al clasificar las frases de una nota en hechos, inferencias e incertidumbre, la distinción central del método es subjetiva en la práctica, y HII-D debe reformularse o abandonarse. La trazabilidad que promete depende de que las capas sean reconocibles entre lectores, no sólo para quien escribe.</w:t>
+      </w:r>
+    </w:p>
+    <w:p>
+      <w:pPr>
+        <w:pStyle w:val="BodyJ"/>
+      </w:pPr>
+      <w:r>
+        <w:t xml:space="preserve">Segundo: si las notas escritas con esta disciplina no difieren de las convencionales en instrumentos estándar de calidad de registro, ni en la capacidad de otro clínico para reconstruir el razonamiento a partir de ellas, el método es cosmética con nombre propio.</w:t>
+      </w:r>
+    </w:p>
+    <w:p>
+      <w:pPr>
+        <w:pStyle w:val="BodyJ"/>
+      </w:pPr>
+      <w:r>
+        <w:t xml:space="preserve">Tercero: si un servicio que adopta el léxico de certeza no modifica en algunos meses ninguna conducta medible —ningún «se descarta» reconvertido, ningún criterio de reapertura agregado, ninguna vigilancia activada que antes no existía—, el léxico es un póster, no una herramienta.</w:t>
+      </w:r>
+    </w:p>
+    <w:p>
+      <w:pPr>
+        <w:pStyle w:val="BodyJ"/>
+      </w:pPr>
+      <w:r>
+        <w:t xml:space="preserve">Cuarto: si el tiempo que consume la versión completa supera de forma sostenida el beneficio detectable, la respuesta racional no es la fe sino la poda: quedarse con la versión de sesenta segundos, o con nada.</w:t>
+      </w:r>
+    </w:p>
+    <w:p>
+      <w:pPr>
+        <w:pStyle w:val="BodyJ"/>
+      </w:pPr>
+      <w:r>
+        <w:t xml:space="preserve">Formular estas condiciones no es un gesto retórico de modestia. Es la diferencia entre proponer una hipótesis y fundar una escuela. Prefiero lo primero: que el método quede expuesto a la misma reevaluación que le exige a cada diagnóstico, y que el mundo conserve, también aquí, la capacidad de corregirnos.</w:t>
       </w:r>
     </w:p>
     <w:p>
@@ -11775,55 +11687,164 @@
           <w:sz w:val="25"/>
           <w:szCs w:val="25"/>
         </w:rPr>
-        <w:t xml:space="preserve">Qué evidencia me haría abandonar este método</w:t>
-      </w:r>
-    </w:p>
-    <w:p>
-      <w:pPr>
-        <w:pStyle w:val="BodyJ"/>
-      </w:pPr>
-      <w:r>
-        <w:t xml:space="preserve">Un libro que exige compromisos observables a cada hipótesis clínica debe formular los suyos. Estos son los míos.</w:t>
-      </w:r>
-    </w:p>
-    <w:p>
-      <w:pPr>
-        <w:pStyle w:val="BodyJ"/>
-      </w:pPr>
-      <w:r>
-        <w:t xml:space="preserve">Primero: si clínicos entrenados no logran un acuerdo razonable al clasificar las frases de una nota en hechos, inferencias e incertidumbre, la distinción central del método es subjetiva en la práctica, y HII-D debe reformularse o abandonarse. La trazabilidad que promete depende de que las capas sean reconocibles entre lectores, no sólo para quien escribe.</w:t>
-      </w:r>
-    </w:p>
-    <w:p>
-      <w:pPr>
-        <w:pStyle w:val="BodyJ"/>
-      </w:pPr>
-      <w:r>
-        <w:t xml:space="preserve">Segundo: si las notas escritas con esta disciplina no difieren de las convencionales en instrumentos estándar de calidad de registro, ni en la capacidad de otro clínico para reconstruir el razonamiento a partir de ellas, el método es cosmética con nombre propio.</w:t>
-      </w:r>
-    </w:p>
-    <w:p>
-      <w:pPr>
-        <w:pStyle w:val="BodyJ"/>
-      </w:pPr>
-      <w:r>
-        <w:t xml:space="preserve">Tercero: si un servicio que adopta el léxico de certeza no modifica en algunos meses ninguna conducta medible —ningún «se descarta» reconvertido, ningún criterio de reapertura agregado, ninguna vigilancia activada que antes no existía—, el léxico es un póster, no una herramienta.</w:t>
-      </w:r>
-    </w:p>
-    <w:p>
-      <w:pPr>
-        <w:pStyle w:val="BodyJ"/>
-      </w:pPr>
-      <w:r>
-        <w:t xml:space="preserve">Cuarto: si el tiempo que consume la versión completa supera de forma sostenida el beneficio detectable, la respuesta racional no es la fe sino la poda: quedarse con la versión de sesenta segundos, o con nada.</w:t>
-      </w:r>
-    </w:p>
-    <w:p>
-      <w:pPr>
-        <w:pStyle w:val="BodyJ"/>
-      </w:pPr>
-      <w:r>
-        <w:t xml:space="preserve">Formular estas condiciones no es un gesto retórico de modestia. Es la diferencia entre proponer una hipótesis y fundar una escuela. Prefiero lo primero: que el método quede expuesto a la misma reevaluación que le exige a cada diagnóstico, y que el mundo conserve, también aquí, la capacidad de corregirnos.</w:t>
+        <w:t xml:space="preserve">Límites</w:t>
+      </w:r>
+    </w:p>
+    <w:p>
+      <w:pPr>
+        <w:pStyle w:val="BodyJ"/>
+      </w:pPr>
+      <w:r>
+        <w:t xml:space="preserve">HII-D no sustituye protocolos, guías, probabilidades cuantitativas ni experiencia. Puede generar falsa prolijidad si se aplica mecánicamente. No todo caso necesita cuatro subtítulos. En urgencias, la acción puede preceder a la formulación completa; aun así, la reevaluación posterior debe reconstruirla. Debe decirse con la misma claridad: HII-D no ha sido validado como instrumento —no existen aún estudios de fiabilidad ni de impacto—, y este libro lo presenta como heurística de escritura y deliberación, no como tecnología probada. El método debe permanecer liviano. La extensión apropiada depende del riesgo, novedad y reversibilidad. Una decisión rutinaria puede requerir una línea; una situación de alto impacto pide una representación más desplegada. La profundidad debe ser selectiva y proporcional.</w:t>
+      </w:r>
+    </w:p>
+    <w:p>
+      <w:pPr>
+        <w:pStyle w:val="Quote1"/>
+      </w:pPr>
+      <w:r>
+        <w:t xml:space="preserve">Hechos sin inferencia son inventario; inferencias sin incertidumbre son dogma; incertidumbre sin decisión es parálisis; decisión sin reevaluación es inercia.</w:t>
+      </w:r>
+    </w:p>
+    <w:p>
+      <w:pPr>
+        <w:pStyle w:val="BodyJ"/>
+      </w:pPr>
+      <w:r>
+        <w:t xml:space="preserve">El valor del método depende de una actitud: aceptar que la claridad no consiste en eliminar la complejidad, sino en ordenar qué tipo de conocimiento representa cada afirmación.</w:t>
+      </w:r>
+    </w:p>
+    <w:p>
+      <w:pPr>
+        <w:pStyle w:val="TallerHead"/>
+      </w:pPr>
+      <w:r>
+        <w:t xml:space="preserve">Taller 15. Su paciente, esta semana</w:t>
+      </w:r>
+    </w:p>
+    <w:p>
+      <w:pPr>
+        <w:pStyle w:val="BodyJ"/>
+      </w:pPr>
+      <w:r>
+        <w:t xml:space="preserve">Elija el caso más incómodo de su lista actual —el que genera discusión en cada visita o el que nadie discute hace días— y complete por escrito la plantilla condensada del Apéndice A. Después compárela con la última evolución de la ficha: ¿qué contiene la plantilla que la ficha no registra?</w:t>
+      </w:r>
+    </w:p>
+    <w:p>
+      <w:pPr>
+        <w:pStyle w:val="BodyJ"/>
+      </w:pPr>
+      <w:r>
+        <w:rPr>
+          <w:i/>
+          <w:iCs/>
+        </w:rPr>
+        <w:t xml:space="preserve">Solución comentada.</w:t>
+      </w:r>
+      <w:r>
+        <w:t xml:space="preserve"> No hay solución única, pero hay un patrón casi universal al comparar: la ficha suele contener los hechos y la decisión, y omitir las dos capas intermedias —el grado de la inferencia («neumonía» sin «probable/demostrada») y la incertidumbre crítica con su vigilancia—. Es decir: registra qué se piensa y qué se hace, pero no cuánto derecho hay a pensarlo ni qué lo haría cambiar. Si su plantilla y su ficha coinciden, este libro le debe una disculpa por las horas invertidas. Si no coinciden, la plantilla acaba de mostrarle qué escribir mañana.</w:t>
+      </w:r>
+    </w:p>
+    <w:p>
+      <w:pPr>
+        <w:pStyle w:val="EnUnaFrase"/>
+      </w:pPr>
+      <w:r>
+        <w:rPr>
+          <w:b/>
+          <w:bCs/>
+        </w:rPr>
+        <w:t xml:space="preserve">En una frase.</w:t>
+      </w:r>
+      <w:r>
+        <w:t xml:space="preserve"> HII-D es el libro entero plegado en una hoja: pregunta, hechos con procedencia, inferencias graduadas, incertidumbre priorizada, decisión por umbral y reapertura programada.</w:t>
+      </w:r>
+    </w:p>
+    <w:p>
+      <w:pPr>
+        <w:pStyle w:val="BodyJ"/>
+        <w:spacing w:after="80" w:before="160"/>
+      </w:pPr>
+      <w:r>
+        <w:rPr>
+          <w:b/>
+          <w:bCs/>
+        </w:rPr>
+        <w:t xml:space="preserve">Tres preguntas para la próxima visita.</w:t>
+      </w:r>
+    </w:p>
+    <w:p>
+      <w:pPr>
+        <w:pStyle w:val="BodyJ"/>
+        <w:numPr>
+          <w:ilvl w:val="0"/>
+          <w:numId w:val="23"/>
+        </w:numPr>
+      </w:pPr>
+      <w:r>
+        <w:t xml:space="preserve">¿Cuál es la pregunta operativa de mi caso más difícil —la decisión real en juego, no «el diagnóstico»?</w:t>
+      </w:r>
+    </w:p>
+    <w:p>
+      <w:pPr>
+        <w:pStyle w:val="BodyJ"/>
+        <w:numPr>
+          <w:ilvl w:val="0"/>
+          <w:numId w:val="23"/>
+        </w:numPr>
+      </w:pPr>
+      <w:r>
+        <w:t xml:space="preserve">¿Mi nota de hoy permite a otro médico reconstruir mis cuatro capas, o sólo mi conclusión?</w:t>
+      </w:r>
+    </w:p>
+    <w:p>
+      <w:pPr>
+        <w:pStyle w:val="BodyJ"/>
+        <w:numPr>
+          <w:ilvl w:val="0"/>
+          <w:numId w:val="23"/>
+        </w:numPr>
+      </w:pPr>
+      <w:r>
+        <w:t xml:space="preserve">¿Qué decisión de esta semana tomé sin criterio de reapertura, y todavía estoy a tiempo de escribirlo?</w:t>
+      </w:r>
+    </w:p>
+    <w:p>
+      <w:pPr>
+        <w:pStyle w:val="Heading2"/>
+        <w:pageBreakBefore/>
+        <w:spacing w:after="300" w:before="600"/>
+      </w:pPr>
+      <w:r>
+        <w:rPr>
+          <w:rFonts w:ascii="Georgia" w:cs="Georgia" w:eastAsia="Georgia" w:hAnsi="Georgia"/>
+          <w:b/>
+          <w:bCs/>
+          <w:color w:val="8C2F2F"/>
+          <w:sz w:val="22"/>
+          <w:szCs w:val="22"/>
+        </w:rPr>
+        <w:t xml:space="preserve">Cuaderno de casos</w:t>
+      </w:r>
+      <w:r>
+        <w:rPr>
+          <w:rFonts w:ascii="Georgia" w:cs="Georgia" w:eastAsia="Georgia" w:hAnsi="Georgia"/>
+          <w:b/>
+          <w:bCs/>
+          <w:color w:val="3D5A6C"/>
+          <w:sz w:val="32"/>
+          <w:szCs w:val="32"/>
+        </w:rPr>
+        <w:br/>
+        <w:t xml:space="preserve">Ocho viñetas para una lectura metacognitiva</w:t>
+      </w:r>
+    </w:p>
+    <w:p>
+      <w:pPr>
+        <w:pStyle w:val="BodyJ"/>
+      </w:pPr>
+      <w:r>
+        <w:t xml:space="preserve">Las viñetas siguientes son composiciones docentes. Cada una se presenta con la estructura HII-D y una frase medular. No son casos «resueltos»: son casos representados. La invitación es leer cada uno dos veces —primero como clínico, buscando la conducta; después como lector metacognitivo, observando qué hace cada capa.</w:t>
       </w:r>
     </w:p>
     <w:p>
@@ -11840,126 +11861,985 @@
           <w:sz w:val="25"/>
           <w:szCs w:val="25"/>
         </w:rPr>
-        <w:t xml:space="preserve">Límites</w:t>
-      </w:r>
-    </w:p>
-    <w:p>
-      <w:pPr>
-        <w:pStyle w:val="BodyJ"/>
-      </w:pPr>
-      <w:r>
-        <w:t xml:space="preserve">HII-D no sustituye protocolos, guías, probabilidades cuantitativas ni experiencia. Puede generar falsa prolijidad si se aplica mecánicamente. No todo caso necesita cuatro subtítulos. En urgencias, la acción puede preceder a la formulación completa; aun así, la reevaluación posterior debe reconstruirla. Debe decirse con la misma claridad: HII-D no ha sido validado como instrumento —no existen aún estudios de fiabilidad ni de impacto—, y este libro lo presenta como heurística de escritura y deliberación, no como tecnología probada. El método debe permanecer liviano. La extensión apropiada depende del riesgo, novedad y reversibilidad. Una decisión rutinaria puede requerir una línea; una situación de alto impacto pide una representación más desplegada. La profundidad debe ser selectiva y proporcional.</w:t>
-      </w:r>
-    </w:p>
-    <w:p>
-      <w:pPr>
-        <w:pStyle w:val="Quote1"/>
-      </w:pPr>
-      <w:r>
-        <w:t xml:space="preserve">Hechos sin inferencia son inventario; inferencias sin incertidumbre son dogma; incertidumbre sin decisión es parálisis; decisión sin reevaluación es inercia.</w:t>
-      </w:r>
-    </w:p>
-    <w:p>
-      <w:pPr>
-        <w:pStyle w:val="BodyJ"/>
-      </w:pPr>
-      <w:r>
-        <w:t xml:space="preserve">El valor del método depende de una actitud: aceptar que la claridad no consiste en eliminar la complejidad, sino en ordenar qué tipo de conocimiento representa cada afirmación.</w:t>
-      </w:r>
-    </w:p>
-    <w:p>
-      <w:pPr>
-        <w:pStyle w:val="TallerHead"/>
-      </w:pPr>
-      <w:r>
-        <w:t xml:space="preserve">Taller 15. Su paciente, esta semana</w:t>
-      </w:r>
-    </w:p>
-    <w:p>
-      <w:pPr>
-        <w:pStyle w:val="BodyJ"/>
-      </w:pPr>
-      <w:r>
-        <w:t xml:space="preserve">Elija el caso más incómodo de su lista actual —el que genera discusión en cada visita o el que nadie discute hace días— y complete por escrito la plantilla condensada del Apéndice A. Después compárela con la última evolución de la ficha: ¿qué contiene la plantilla que la ficha no registra?</w:t>
-      </w:r>
-    </w:p>
-    <w:p>
-      <w:pPr>
-        <w:pStyle w:val="BodyJ"/>
-      </w:pPr>
-      <w:r>
-        <w:rPr>
-          <w:i/>
-          <w:iCs/>
-        </w:rPr>
-        <w:t xml:space="preserve">Solución comentada.</w:t>
-      </w:r>
-      <w:r>
-        <w:t xml:space="preserve"> No hay solución única, pero hay un patrón casi universal al comparar: la ficha suele contener los hechos y la decisión, y omitir las dos capas intermedias —el grado de la inferencia («neumonía» sin «probable/demostrada») y la incertidumbre crítica con su vigilancia—. Es decir: registra qué se piensa y qué se hace, pero no cuánto derecho hay a pensarlo ni qué lo haría cambiar. Si su plantilla y su ficha coinciden, este libro le debe una disculpa por las horas invertidas. Si no coinciden, la plantilla acaba de mostrarle qué escribir mañana.</w:t>
-      </w:r>
-    </w:p>
-    <w:p>
-      <w:pPr>
-        <w:pStyle w:val="EnUnaFrase"/>
-      </w:pPr>
-      <w:r>
-        <w:rPr>
-          <w:b/>
-          <w:bCs/>
-        </w:rPr>
-        <w:t xml:space="preserve">En una frase.</w:t>
-      </w:r>
-      <w:r>
-        <w:t xml:space="preserve"> HII-D es el libro entero plegado en una hoja: pregunta, hechos con procedencia, inferencias graduadas, incertidumbre priorizada, decisión por umbral y reapertura programada.</w:t>
-      </w:r>
-    </w:p>
-    <w:p>
-      <w:pPr>
-        <w:pStyle w:val="BodyJ"/>
-        <w:spacing w:after="80" w:before="160"/>
-      </w:pPr>
-      <w:r>
-        <w:rPr>
-          <w:b/>
-          <w:bCs/>
-        </w:rPr>
-        <w:t xml:space="preserve">Tres preguntas para la próxima visita.</w:t>
-      </w:r>
-    </w:p>
-    <w:p>
-      <w:pPr>
-        <w:pStyle w:val="BodyJ"/>
-        <w:numPr>
-          <w:ilvl w:val="0"/>
-          <w:numId w:val="23"/>
-        </w:numPr>
-      </w:pPr>
-      <w:r>
-        <w:t xml:space="preserve">¿Cuál es la pregunta operativa de mi caso más difícil —la decisión real en juego, no «el diagnóstico»?</w:t>
-      </w:r>
-    </w:p>
-    <w:p>
-      <w:pPr>
-        <w:pStyle w:val="BodyJ"/>
-        <w:numPr>
-          <w:ilvl w:val="0"/>
-          <w:numId w:val="23"/>
-        </w:numPr>
-      </w:pPr>
-      <w:r>
-        <w:t xml:space="preserve">¿Mi nota de hoy permite a otro médico reconstruir mis cuatro capas, o sólo mi conclusión?</w:t>
-      </w:r>
-    </w:p>
-    <w:p>
-      <w:pPr>
-        <w:pStyle w:val="BodyJ"/>
-        <w:numPr>
-          <w:ilvl w:val="0"/>
-          <w:numId w:val="23"/>
-        </w:numPr>
-      </w:pPr>
-      <w:r>
-        <w:t xml:space="preserve">¿Qué decisión de esta semana tomé sin criterio de reapertura, y todavía estoy a tiempo de escribirlo?</w:t>
+        <w:t xml:space="preserve">Viñeta 1. Carmen: obstrucción recurrente y cambio cualitativo de riesgo</w:t>
+      </w:r>
+    </w:p>
+    <w:p>
+      <w:pPr>
+        <w:pStyle w:val="BodyJ"/>
+      </w:pPr>
+      <w:r>
+        <w:t xml:space="preserve">La historia de Carmen atraviesa todo este libro; aquí se presenta en su versión condensada, tal como se sintetizaría en una entrega de turno o en una discusión clínica.</w:t>
+      </w:r>
+    </w:p>
+    <w:p>
+      <w:pPr>
+        <w:pStyle w:val="BodyJ"/>
+      </w:pPr>
+      <w:r>
+        <w:t xml:space="preserve">Mujer de 61 años con hernia incisional de la línea media y tres hospitalizaciones en el último año por suboclusión intestinal, todas resueltas con manejo médico conservador. Ingresa por un cuarto episodio obstructivo, esta vez asociado a shock séptico, hiperlactatemia (6,0 mmol/L), hipoperfusión periférica (llene capilar de 5 segundos) y bacteriemia por bacilos gramnegativos (2/2 hemocultivos). Evoluciona favorablemente con reposo digestivo, descompresión por sonda nasogástrica, noradrenalina y antibioterapia. La tomografía de abdomen no muestra perforación, isquemia mesentérica ni estrangulación actual.</w:t>
+      </w:r>
+    </w:p>
+    <w:p>
+      <w:pPr>
+        <w:pStyle w:val="BodyJ"/>
+      </w:pPr>
+      <w:r>
+        <w:rPr>
+          <w:i/>
+          <w:iCs/>
+        </w:rPr>
+        <w:t xml:space="preserve">Hechos:</w:t>
+      </w:r>
+      <w:r>
+        <w:t xml:space="preserve"> recurrencia obstructiva documentada y con intervalos cada vez más cortos; episodio actual con compromiso hemodinámico vital y bacteriemia demostrada; respuesta clínica favorable al soporte intensivo; ausencia de complicación quirúrgica aguda en la tomografía inicial.</w:t>
+      </w:r>
+    </w:p>
+    <w:p>
+      <w:pPr>
+        <w:pStyle w:val="BodyJ"/>
+      </w:pPr>
+      <w:r>
+        <w:rPr>
+          <w:i/>
+          <w:iCs/>
+        </w:rPr>
+        <w:t xml:space="preserve">Inferencia:</w:t>
+      </w:r>
+      <w:r>
+        <w:t xml:space="preserve"> el foco abdominal de la bacteriemia, secundario al evento obstructivo, es altamente probable por secuencia temporal y microbiología compatible, aunque el mecanismo íntimo (translocación bacteriana o microisquemia transitoria) no esté demostrado. La ausencia de estrangulación tomográfica desactiva la urgencia quirúrgica inmediata, pero no mitiga el riesgo acumulado de recurrencia.</w:t>
+      </w:r>
+    </w:p>
+    <w:p>
+      <w:pPr>
+        <w:pStyle w:val="BodyJ"/>
+      </w:pPr>
+      <w:r>
+        <w:rPr>
+          <w:i/>
+          <w:iCs/>
+        </w:rPr>
+        <w:t xml:space="preserve">Incertidumbre:</w:t>
+      </w:r>
+      <w:r>
+        <w:t xml:space="preserve"> son inciertos el plazo hasta una quinta obstrucción, la magnitud del daño si ésta ocurre fuera del hospital y la reserva funcional efectiva de la paciente para enfrentar el estrés quirúrgico una vez recuperada.</w:t>
+      </w:r>
+    </w:p>
+    <w:p>
+      <w:pPr>
+        <w:pStyle w:val="BodyJ"/>
+      </w:pPr>
+      <w:r>
+        <w:rPr>
+          <w:i/>
+          <w:iCs/>
+        </w:rPr>
+        <w:t xml:space="preserve">Decisión:</w:t>
+      </w:r>
+      <w:r>
+        <w:t xml:space="preserve"> solicitar evaluación quirúrgica precoz para planificar reparación electiva tras optimización médica y kinésica, documentando una decisión compartida. El fundamento para operar no es que «fracasó el manejo médico» (resolvió el cuadro agudo cuatro veces), sino que la gravedad vital alcanzada en este episodio vuelve inaceptable el riesgo de mantener una conducta expectante.</w:t>
+      </w:r>
+    </w:p>
+    <w:p>
+      <w:pPr>
+        <w:pStyle w:val="BodyJ"/>
+      </w:pPr>
+      <w:r>
+        <w:rPr>
+          <w:i/>
+          <w:iCs/>
+        </w:rPr>
+        <w:t xml:space="preserve">Frase medular:</w:t>
+      </w:r>
+      <w:r>
+        <w:t xml:space="preserve"> «Obstrucción intestinal recurrente por hernia incisional, por primera vez complicada con shock séptico y bacteriemia, sin isquemia aguda en tomografía. El salto cualitativo de gravedad modifica el umbral terapéutico y justifica priorizar la reparación electiva tras la recuperación fisiológica.»</w:t>
+      </w:r>
+    </w:p>
+    <w:p>
+      <w:pPr>
+        <w:pStyle w:val="BodyJ"/>
+      </w:pPr>
+      <w:r>
+        <w:rPr>
+          <w:i/>
+          <w:iCs/>
+        </w:rPr>
+        <w:t xml:space="preserve">Epílogo.</w:t>
+      </w:r>
+      <w:r>
+        <w:t xml:space="preserve"> Carmen fue operada de forma programada seis semanas después. En pabellón se encontraron adherencias firmes y un anillo herniario estrecho, reparado sin incidentes mayores. En su control ambulatorio al mes, Carmen formuló su propio balance del proceso: «Esta vez el dolor tenía una explicación clara, y saber qué estábamos haciendo lo cambió todo». Su buena evolución no demuestra, por sí sola, que la indicación haya sido acertada: un desenlace feliz nunca valida retroactivamente un proceso defectuoso. Lo que cuenta es que la decisión era defendible antes de conocer el resultado, que es todo lo que puede exigírsele al juicio médico. La anotación rápida de su primera madrugada en urgencias —«cuadro habitual, manejo habitual»— permaneció en la ficha como testimonio de lo que una semana de trabajo epistémico permitió transformar.</w:t>
+      </w:r>
+    </w:p>
+    <w:p>
+      <w:pPr>
+        <w:pStyle w:val="Heading3"/>
+        <w:spacing w:after="120" w:before="280"/>
+      </w:pPr>
+      <w:r>
+        <w:rPr>
+          <w:rFonts w:ascii="Georgia" w:cs="Georgia" w:eastAsia="Georgia" w:hAnsi="Georgia"/>
+          <w:b/>
+          <w:bCs/>
+          <w:color w:val="2B2B2B"/>
+          <w:sz w:val="25"/>
+          <w:szCs w:val="25"/>
+        </w:rPr>
+        <w:t xml:space="preserve">Viñeta 2. Bacteriuria en paciente con sonda permanente</w:t>
+      </w:r>
+    </w:p>
+    <w:p>
+      <w:pPr>
+        <w:pStyle w:val="BodyJ"/>
+      </w:pPr>
+      <w:r>
+        <w:t xml:space="preserve">Es el paciente de la cama 12 del capítulo 8, el mismo cuya ficha el capítulo 12 ordenó en la matriz HII-D; aquí, en la versión que cabe en una entrega de turno. Hombre con lesión medular completa, vejiga neurogénica, sonda Foley permanente y un cáncer renal metastásico en progresión. Tras un recambio traumático de sonda presenta orina turbia, piuria y urocultivo positivo; está afebril, estable y sin cambios respecto de su basal. Los marcadores inflamatorios están elevados, sin valores previos y con el tumor como causa concomitante, y tiene antecedente de colonización por enterobacteria productora de BLEE.</w:t>
+      </w:r>
+    </w:p>
+    <w:p>
+      <w:pPr>
+        <w:pStyle w:val="BodyJ"/>
+      </w:pPr>
+      <w:r>
+        <w:rPr>
+          <w:i/>
+          <w:iCs/>
+        </w:rPr>
+        <w:t xml:space="preserve">Hechos:</w:t>
+      </w:r>
+      <w:r>
+        <w:t xml:space="preserve"> recambio reciente de sonda; piuria y urocultivo positivo; afebril y estable; síntomas urinarios bajos no evaluables por el nivel lesional; reactantes elevados sin basal, con cáncer renal metastásico activo; colonización documentada por BLEE.</w:t>
+      </w:r>
+    </w:p>
+    <w:p>
+      <w:pPr>
+        <w:pStyle w:val="BodyJ"/>
+      </w:pPr>
+      <w:r>
+        <w:rPr>
+          <w:i/>
+          <w:iCs/>
+        </w:rPr>
+        <w:t xml:space="preserve">Inferencia:</w:t>
+      </w:r>
+      <w:r>
+        <w:t xml:space="preserve"> el cuadro es altamente compatible con una bacteriuria asociada a catéter por colonización crónica (favorecida por el arrastre del recambio) más que con una infección urinaria sintomática asociada a sonda. Por sí solas, ni la turbidez ni la piuria discriminan entre colonización e infección invasiva en pacientes sondados, y la elevación inflamatoria sistémica es explicable por su neoplasia de base.</w:t>
+      </w:r>
+    </w:p>
+    <w:p>
+      <w:pPr>
+        <w:pStyle w:val="BodyJ"/>
+      </w:pPr>
+      <w:r>
+        <w:rPr>
+          <w:i/>
+          <w:iCs/>
+        </w:rPr>
+        <w:t xml:space="preserve">Incertidumbre:</w:t>
+      </w:r>
+      <w:r>
+        <w:t xml:space="preserve"> la denervación medular enmascara la disuria y el dolor lumbar, por lo que persiste la duda de una infección incipiente con expresión clínica atípica.</w:t>
+      </w:r>
+    </w:p>
+    <w:p>
+      <w:pPr>
+        <w:pStyle w:val="BodyJ"/>
+      </w:pPr>
+      <w:r>
+        <w:rPr>
+          <w:i/>
+          <w:iCs/>
+        </w:rPr>
+        <w:t xml:space="preserve">Decisión:</w:t>
+      </w:r>
+      <w:r>
+        <w:t xml:space="preserve"> no iniciar tratamiento antibiótico empírico. Instaurar vigilancia clínica dirigida a signos equivalentes de respuesta sistémica o autonómica (fiebre nueva, inestabilidad hemodinámica, aumento súbito de espasticidad, sudoración o malestar general inexplicable). Aquí, el antecedente de germen BLEE no es un gatillo para prescribir antes, sino al revés. Como el tratamiento exigiría carbapenémicos, de alto impacto ecológico y toxicidad potencial, el umbral clínico para iniciar antibióticos debe ser más exigente.</w:t>
+      </w:r>
+    </w:p>
+    <w:p>
+      <w:pPr>
+        <w:pStyle w:val="BodyJ"/>
+      </w:pPr>
+      <w:r>
+        <w:rPr>
+          <w:i/>
+          <w:iCs/>
+        </w:rPr>
+        <w:t xml:space="preserve">Frase medular:</w:t>
+      </w:r>
+      <w:r>
+        <w:t xml:space="preserve"> «Urocultivo positivo y piuria tras recambio de sonda Foley en paciente con lesión medular y antecedente de colonización por BLEE, sin respuesta sistémica ni signos autonómicos que configuren infección activa. Se interpreta como bacteriuria asociada a catéter; vigilancia clínica estricta con criterios explícitos de reapertura.»</w:t>
+      </w:r>
+    </w:p>
+    <w:p>
+      <w:pPr>
+        <w:pStyle w:val="Heading3"/>
+        <w:spacing w:after="120" w:before="280"/>
+      </w:pPr>
+      <w:r>
+        <w:rPr>
+          <w:rFonts w:ascii="Georgia" w:cs="Georgia" w:eastAsia="Georgia" w:hAnsi="Georgia"/>
+          <w:b/>
+          <w:bCs/>
+          <w:color w:val="2B2B2B"/>
+          <w:sz w:val="25"/>
+          <w:szCs w:val="25"/>
+        </w:rPr>
+        <w:t xml:space="preserve">Viñeta 3. Tres de la mañana: decidir con el reloj en contra</w:t>
+      </w:r>
+    </w:p>
+    <w:p>
+      <w:pPr>
+        <w:pStyle w:val="BodyJ"/>
+      </w:pPr>
+      <w:r>
+        <w:t xml:space="preserve">Servicio de urgencias, 03:10. Hombre de 54 años, tabáquico activo, consulta por dolor retroesternal opresivo de 40 minutos de evolución, acompañado de diaforesis fría. El electrocardiograma de ingreso muestra alteraciones inespecíficas de la repolarización, sin supradesnivel del ST. La primera troponina está en proceso en el laboratorio. En la sala de espera hay nueve pacientes pendientes de atención y queda un solo cupo en el box de reanimación. Bajo esta presión asistencial no hay margen para redactar una plantilla extensa, pero sí hay sesenta segundos para estructurar el juicio.</w:t>
+      </w:r>
+    </w:p>
+    <w:p>
+      <w:pPr>
+        <w:pStyle w:val="BodyJ"/>
+      </w:pPr>
+      <w:r>
+        <w:rPr>
+          <w:i/>
+          <w:iCs/>
+        </w:rPr>
+        <w:t xml:space="preserve">¿Qué vi y qué me contaron? (Hechos)</w:t>
+      </w:r>
+      <w:r>
+        <w:t xml:space="preserve"> Dolor torácico visceral opresivo con signos autonómicos objetivos (diaforesis fría presenciada en el triage) y un ECG inicial anormal aunque no diagnóstico.</w:t>
+      </w:r>
+    </w:p>
+    <w:p>
+      <w:pPr>
+        <w:pStyle w:val="BodyJ"/>
+      </w:pPr>
+      <w:r>
+        <w:rPr>
+          <w:i/>
+          <w:iCs/>
+        </w:rPr>
+        <w:t xml:space="preserve">¿Qué creo y cuánto derecho tengo a creerlo? (Inferencia)</w:t>
+      </w:r>
+      <w:r>
+        <w:t xml:space="preserve"> Síndrome coronario agudo (SCA) probable; la semiología isquémica típica y el perfil de riesgo tienen mayor peso pretest que un primer trazado electrocardiográfico no concluyente. Diagnóstico aún no demostrado.</w:t>
+      </w:r>
+    </w:p>
+    <w:p>
+      <w:pPr>
+        <w:pStyle w:val="BodyJ"/>
+      </w:pPr>
+      <w:r>
+        <w:rPr>
+          <w:i/>
+          <w:iCs/>
+        </w:rPr>
+        <w:t xml:space="preserve">¿Qué daño importante podría producir si estoy equivocado? (Incertidumbre crítica)</w:t>
+      </w:r>
+      <w:r>
+        <w:t xml:space="preserve"> Rotularlo como «dolor torácico atípico con ECG sin isquemia aguda» y enviarlo a esperar la troponina en una silla de la sala común mientras cursa una oclusión coronaria dinámica. La incertidumbre peligrosa no es la etiqueta nominal; es la ventana de tiempo de miocardio salvable.</w:t>
+      </w:r>
+    </w:p>
+    <w:p>
+      <w:pPr>
+        <w:pStyle w:val="BodyJ"/>
+      </w:pPr>
+      <w:r>
+        <w:rPr>
+          <w:i/>
+          <w:iCs/>
+        </w:rPr>
+        <w:t xml:space="preserve">¿Qué hago y qué me haría cambiar antes del próximo control? (Decisión)</w:t>
+      </w:r>
+      <w:r>
+        <w:t xml:space="preserve"> Cama monitorizada, vía venosa, antiagregación inicial según protocolo, ECG seriado cada 15–30 minutos y rescate rápido de la troponina. Activar hemodinamia de inmediato si el trazado evoluciona a supradesnivel o si el dolor se vuelve refractario. Queda escrito: «SCA en evolución, no demostrado; manejo y monitorización continua por asimetría de consecuencias ante el riesgo vital de omisión».</w:t>
+      </w:r>
+    </w:p>
+    <w:p>
+      <w:pPr>
+        <w:pStyle w:val="BodyJ"/>
+      </w:pPr>
+      <w:r>
+        <w:rPr>
+          <w:i/>
+          <w:iCs/>
+        </w:rPr>
+        <w:t xml:space="preserve">Frase medular:</w:t>
+      </w:r>
+      <w:r>
+        <w:t xml:space="preserve"> «Dolor torácico de perfil anginoso con descarga adrenérgica y ECG inicial no concluyente: se maneja como SCA probable bajo monitorización continua, por asimetría de consecuencias, mientras la seriación electrocardiográfica y enzimática confirma o degrada la hipótesis.»</w:t>
+      </w:r>
+    </w:p>
+    <w:p>
+      <w:pPr>
+        <w:pStyle w:val="BodyJ"/>
+      </w:pPr>
+      <w:r>
+        <w:rPr>
+          <w:i/>
+          <w:iCs/>
+        </w:rPr>
+        <w:t xml:space="preserve">Lectura metacognitiva.</w:t>
+      </w:r>
+      <w:r>
+        <w:t xml:space="preserve"> En urgencias, el fallo catastrófico rara vez es intelectual: casi todo médico piensa en el infarto. Suele ser logístico y de diseño: la hipótesis correcta («probable SCA») sin un circuito cerrado de reevaluación. ¿Quién toma y quién mira el segundo ECG a los 15 minutos si el turno colapsa? Fijar el criterio de reapertura con plazo y responsable es la mitad del tratamiento.</w:t>
+      </w:r>
+    </w:p>
+    <w:p>
+      <w:pPr>
+        <w:pStyle w:val="Heading3"/>
+        <w:spacing w:after="120" w:before="280"/>
+      </w:pPr>
+      <w:r>
+        <w:rPr>
+          <w:rFonts w:ascii="Georgia" w:cs="Georgia" w:eastAsia="Georgia" w:hAnsi="Georgia"/>
+          <w:b/>
+          <w:bCs/>
+          <w:color w:val="2B2B2B"/>
+          <w:sz w:val="25"/>
+          <w:szCs w:val="25"/>
+        </w:rPr>
+        <w:t xml:space="preserve">Viñeta 4. La consulta ambulatoria y el chequeo reciente</w:t>
+      </w:r>
+    </w:p>
+    <w:p>
+      <w:pPr>
+        <w:pStyle w:val="BodyJ"/>
+      </w:pPr>
+      <w:r>
+        <w:t xml:space="preserve">Policlínico de atención primaria. Mujer de 47 años consulta por fatiga persistente de tres meses de evolución. Acude con exámenes de sangre «normales de hace poquito»: un hemograma y un perfil bioquímico tomados hace cinco meses en un chequeo preventivo, dos meses antes de que comenzara el cansancio. Al interrogatorio dirigido agrega sudoración nocturna ocasional —que ella atribuye al inicio de la menopausia— y una baja de peso involuntaria de unos tres kilos que explica «porque he tenido menos apetito». La agenda médica está copada, con bloques de doce minutos por paciente.</w:t>
+      </w:r>
+    </w:p>
+    <w:p>
+      <w:pPr>
+        <w:pStyle w:val="BodyJ"/>
+      </w:pPr>
+      <w:r>
+        <w:rPr>
+          <w:i/>
+          <w:iCs/>
+        </w:rPr>
+        <w:t xml:space="preserve">Hechos:</w:t>
+      </w:r>
+      <w:r>
+        <w:t xml:space="preserve"> fatiga progresiva de tres meses (relato consistente); exámenes de laboratorio normales cuya fecha precede en dos meses al inicio del síntoma; sudoración nocturna y baja ponderal referidas con atribuciones benignas propuestas por la propia paciente. Examen físico segmentario de hoy sin adenopatías periféricas ni visceromegalias palpables, en una exploración acotada por el tiempo de consulta.</w:t>
+      </w:r>
+    </w:p>
+    <w:p>
+      <w:pPr>
+        <w:pStyle w:val="BodyJ"/>
+      </w:pPr>
+      <w:r>
+        <w:rPr>
+          <w:i/>
+          <w:iCs/>
+        </w:rPr>
+        <w:t xml:space="preserve">Inferencia:</w:t>
+      </w:r>
+      <w:r>
+        <w:t xml:space="preserve"> por prevalencia, la mayoría de las fatigas en atención primaria son funcionales, carenciales o adaptativas. Pero fatiga prolongada, sudoración nocturna y baja de peso configuran un síndrome constitucional que impide el cierre diagnóstico. Los exámenes que trae la paciente no descartan patología orgánica actual por una razón temporal simple: fueron tomados cuando la enfermedad aún no se manifestaba.</w:t>
+      </w:r>
+    </w:p>
+    <w:p>
+      <w:pPr>
+        <w:pStyle w:val="BodyJ"/>
+      </w:pPr>
+      <w:r>
+        <w:rPr>
+          <w:i/>
+          <w:iCs/>
+        </w:rPr>
+        <w:t xml:space="preserve">Incertidumbre:</w:t>
+      </w:r>
+      <w:r>
+        <w:t xml:space="preserve"> la duda relevante hoy no es determinar la etiología exacta en doce minutos, sino responder si subyace un proceso sistémico, inflamatorio o neoplásico en curso. Esa incertidumbre no se reduce alargando la entrevista de hoy, sino actualizando el laboratorio y utilizando el seguimiento longitudinal.</w:t>
+      </w:r>
+    </w:p>
+    <w:p>
+      <w:pPr>
+        <w:pStyle w:val="BodyJ"/>
+      </w:pPr>
+      <w:r>
+        <w:rPr>
+          <w:i/>
+          <w:iCs/>
+        </w:rPr>
+        <w:t xml:space="preserve">Decisión:</w:t>
+      </w:r>
+      <w:r>
+        <w:t xml:space="preserve"> estudio actualizado dirigido (hemograma con frotis, VHS, PCR, TSH, glicemia, perfil hepático y renal, LDH) y control presencial en dos semanas con la misma médica. Red de seguridad por escrito (safety-netting): adelantar la consulta si aparece fiebre cuantificada, aumento de volumen ganglionar, dolor óseo localizado o progresión de la baja de peso.</w:t>
+      </w:r>
+    </w:p>
+    <w:p>
+      <w:pPr>
+        <w:pStyle w:val="BodyJ"/>
+      </w:pPr>
+      <w:r>
+        <w:rPr>
+          <w:i/>
+          <w:iCs/>
+        </w:rPr>
+        <w:t xml:space="preserve">Frase medular:</w:t>
+      </w:r>
+      <w:r>
+        <w:t xml:space="preserve"> «Fatiga de tres meses asociada a sudoración nocturna y baja ponderal leve; dado que el laboratorio normal previo antecede al inicio de los síntomas y no cubre el período actual, se solicita estudio actualizado y se programa control longitudinal con pauta escrita de signos de alarma.»</w:t>
+      </w:r>
+    </w:p>
+    <w:p>
+      <w:pPr>
+        <w:pStyle w:val="BodyJ"/>
+      </w:pPr>
+      <w:r>
+        <w:rPr>
+          <w:i/>
+          <w:iCs/>
+        </w:rPr>
+        <w:t xml:space="preserve">Lectura metacognitiva.</w:t>
+      </w:r>
+      <w:r>
+        <w:t xml:space="preserve"> Evidencia caducada: «tiene exámenes normales recientes» es un hecho cierto cuya fecha lo vuelve irrelevante para el problema nuevo. Y el tiempo longitudinal, la ventaja comparativa de la atención primaria, sólo es una herramienta diagnóstica cuando tiene fecha de reevaluación y criterios de reconsulta; sin ese diseño, dejar pasar el tiempo es apostar a que el cuadro sea benigno.</w:t>
+      </w:r>
+    </w:p>
+    <w:p>
+      <w:pPr>
+        <w:pStyle w:val="Heading3"/>
+        <w:spacing w:after="120" w:before="280"/>
+      </w:pPr>
+      <w:r>
+        <w:rPr>
+          <w:rFonts w:ascii="Georgia" w:cs="Georgia" w:eastAsia="Georgia" w:hAnsi="Georgia"/>
+          <w:b/>
+          <w:bCs/>
+          <w:color w:val="2B2B2B"/>
+          <w:sz w:val="25"/>
+          <w:szCs w:val="25"/>
+        </w:rPr>
+        <w:t xml:space="preserve">Viñeta 5. Pronóstico incierto al final de la vida</w:t>
+      </w:r>
+    </w:p>
+    <w:p>
+      <w:pPr>
+        <w:pStyle w:val="BodyJ"/>
+      </w:pPr>
+      <w:r>
+        <w:t xml:space="preserve">Hombre de 78 años con adenocarcinoma de páncreas metastásico en progresión tras tres líneas de quimioterapia. Ingresa al servicio de medicina interna por un deterioro funcional acelerado en las últimas tres semanas —pasó de caminar con apoyo dentro de su casa a permanecer postrado en cama—, sumado a una neumonía aguda hipoxémica. En el pasillo, la familia pregunta angustiada cuánto tiempo de vida le queda. Una de las hijas exige «que se le haga todo lo necesario para sacarlo adelante». Oncología anota en su interconsulta que, superado el cuadro infeccioso, «eventualmente podría evaluarse una ventana para una cuarta línea paliativa». El paciente, durante sus períodos de lucidez, repite que se siente profundamente agotado.</w:t>
+      </w:r>
+    </w:p>
+    <w:p>
+      <w:pPr>
+        <w:pStyle w:val="BodyJ"/>
+      </w:pPr>
+      <w:r>
+        <w:rPr>
+          <w:i/>
+          <w:iCs/>
+        </w:rPr>
+        <w:t xml:space="preserve">Hechos:</w:t>
+      </w:r>
+      <w:r>
+        <w:t xml:space="preserve"> neoplasia pancreática metastásica con progresión documentada bajo tercera línea oncológica; declive funcional severo y rápido en las últimas semanas (objetivable con una escala de fragilidad y de desempeño); neumonía bacteriana aguda superpuesta; manifestación reiterada de cansancio vital por parte del paciente en al menos dos entrevistas clínicas lúcidas.</w:t>
+      </w:r>
+    </w:p>
+    <w:p>
+      <w:pPr>
+        <w:pStyle w:val="BodyJ"/>
+      </w:pPr>
+      <w:r>
+        <w:rPr>
+          <w:i/>
+          <w:iCs/>
+        </w:rPr>
+        <w:t xml:space="preserve">Inferencia:</w:t>
+      </w:r>
+      <w:r>
+        <w:t xml:space="preserve"> la neumonía es tratable en lo inmediato. La pendiente funcional previa indica, en cambio, una trayectoria irreversible de final de vida, con una sobrevida estimable en semanas a pocos meses. En ese escenario, «podría haber ventana para otra línea» no es una expectativa fundada en la evolución real, sino la mención abstracta de un fármaco disponible.</w:t>
+      </w:r>
+    </w:p>
+    <w:p>
+      <w:pPr>
+        <w:pStyle w:val="BodyJ"/>
+      </w:pPr>
+      <w:r>
+        <w:rPr>
+          <w:i/>
+          <w:iCs/>
+        </w:rPr>
+        <w:t xml:space="preserve">Incertidumbre:</w:t>
+      </w:r>
+      <w:r>
+        <w:t xml:space="preserve"> el plazo exacto es incognoscible (incertidumbre aleatoria irreductible); lo honesto es comunicar la dirección de la pendiente y los escenarios probables. Pero la incertidumbre que domina el caso no es pronóstica sino de metas: ¿cómo quiere vivir este hombre el tiempo que le queda y qué cargas terapéuticas está dispuesto a tolerar?</w:t>
+      </w:r>
+    </w:p>
+    <w:p>
+      <w:pPr>
+        <w:pStyle w:val="BodyJ"/>
+      </w:pPr>
+      <w:r>
+        <w:rPr>
+          <w:i/>
+          <w:iCs/>
+        </w:rPr>
+        <w:t xml:space="preserve">Decisión:</w:t>
+      </w:r>
+      <w:r>
+        <w:t xml:space="preserve"> antibióticos endovenosos y oxigenoterapia no invasiva con un objetivo explícito de alivio sintomático y eventual retorno a su casa (medidas reversibles y proporcionadas). Suspender la discusión sobre nuevas quimioterapias. Reunión familiar estructurada para alinear el plan con la voluntad del paciente. Reevaluación a las 72 horas según respuesta funcional y confort.</w:t>
+      </w:r>
+    </w:p>
+    <w:p>
+      <w:pPr>
+        <w:pStyle w:val="BodyJ"/>
+      </w:pPr>
+      <w:r>
+        <w:rPr>
+          <w:i/>
+          <w:iCs/>
+        </w:rPr>
+        <w:t xml:space="preserve">Frase medular:</w:t>
+      </w:r>
+      <w:r>
+        <w:t xml:space="preserve"> «Neumonía aguda potencialmente reversible en paciente con cáncer de páncreas metastásico refractario y declive funcional acelerado hacia el final de la vida. Se trata la parte reversible con metas de alivio, se comunica la trayectoria sin fingir exactitud de plazos y las medidas invasivas se subordinan a las preferencias del enfermo.»</w:t>
+      </w:r>
+    </w:p>
+    <w:p>
+      <w:pPr>
+        <w:pStyle w:val="BodyJ"/>
+      </w:pPr>
+      <w:r>
+        <w:rPr>
+          <w:i/>
+          <w:iCs/>
+        </w:rPr>
+        <w:t xml:space="preserve">Lectura metacognitiva.</w:t>
+      </w:r>
+      <w:r>
+        <w:t xml:space="preserve"> La pregunta «¿cuánto tiempo le queda?» tienta a dos respuestas simétricas y malas: una cifra inventada (certeza retórica) o un «eso sólo Dios lo sabe» que desorienta a la familia (abandono comunicacional). Y el caso expone la confusión cotidiana entre lo técnicamente factible —una cuarta línea, intubar— y lo clínicamente proporcionado: el juicio de proporcionalidad del capítulo 10 empieza por reconocer el declive basal como un hecho clínico duro.</w:t>
+      </w:r>
+    </w:p>
+    <w:p>
+      <w:pPr>
+        <w:pStyle w:val="Heading3"/>
+        <w:spacing w:after="120" w:before="280"/>
+      </w:pPr>
+      <w:r>
+        <w:rPr>
+          <w:rFonts w:ascii="Georgia" w:cs="Georgia" w:eastAsia="Georgia" w:hAnsi="Georgia"/>
+          <w:b/>
+          <w:bCs/>
+          <w:color w:val="2B2B2B"/>
+          <w:sz w:val="25"/>
+          <w:szCs w:val="25"/>
+        </w:rPr>
+        <w:t xml:space="preserve">Viñeta 6. Anatomía de un error consumado</w:t>
+      </w:r>
+    </w:p>
+    <w:p>
+      <w:pPr>
+        <w:pStyle w:val="BodyJ"/>
+      </w:pPr>
+      <w:r>
+        <w:t xml:space="preserve">Esta viñeta reconstruye un error completo con la disciplina de los capítulos 7 y 8. Sin pegar la etiqueta de un sesgo, y sin dejar que el desenlace conocido distorsione lo que era exigible saber en el momento de la consulta.</w:t>
+      </w:r>
+    </w:p>
+    <w:p>
+      <w:pPr>
+        <w:pStyle w:val="BodyJ"/>
+      </w:pPr>
+      <w:r>
+        <w:rPr>
+          <w:i/>
+          <w:iCs/>
+        </w:rPr>
+        <w:t xml:space="preserve">El caso.</w:t>
+      </w:r>
+      <w:r>
+        <w:t xml:space="preserve"> Mujer de 29 años consulta en urgencias a las 23:40 por disnea de inicio súbito hace dos horas, palpitaciones y «sensación inminente de que me voy a morir». Registra antecedente de trastorno de pánico en control; la hoja de categorización del triage anota: «paciente ansiosa, cursa crisis de pánico conocida». Sus signos vitales de ingreso muestran frecuencia cardiaca de 118 lpm, presión arterial normal, saturación de oxígeno de 94% ambiental y auscultación cardiopulmonar descrita como «sin hallazgos patológicos». La evolución médica consigna: «Crisis de pánico en paciente con antecedente conocido. Se administra lorazepam sublingual, cede angustia. Alta con indicación de control en salud mental». A las 36 horas reingresa al reanimador traída por su pareja tras sufrir un síncope en el baño: el angioTAC confirma un tromboembolismo pulmonar (TEP) bilateral masivo con disfunción ventricular derecha aguda. Sobrevive tras trombólisis sistémica.</w:t>
+      </w:r>
+    </w:p>
+    <w:p>
+      <w:pPr>
+        <w:pStyle w:val="BodyJ"/>
+      </w:pPr>
+      <w:r>
+        <w:rPr>
+          <w:i/>
+          <w:iCs/>
+        </w:rPr>
+        <w:t xml:space="preserve">Reconstrucción epistémica por capas.</w:t>
+      </w:r>
+    </w:p>
+    <w:p>
+      <w:pPr>
+        <w:pStyle w:val="BodyJ"/>
+      </w:pPr>
+      <w:r>
+        <w:rPr>
+          <w:b/>
+          <w:bCs/>
+        </w:rPr>
+        <w:t xml:space="preserve">Hechos disponibles la primera noche:</w:t>
+      </w:r>
+      <w:r>
+        <w:t xml:space="preserve"> disnea de instalación brusca con hora de inicio precisa (relato consistente). Taquicardia sinusal de 118 lpm al ingreso, que persistía en 112 lpm en el control de enfermería previo al alta, una hora después del lorazepam y con la paciente ya tranquila. Dato medido, registrado en la hoja de signos vitales y omitido en la nota médica. Saturación de 94% a aire ambiental, que alguien en el turno minimizó como «esperable porque está hiperventilando»; la hiperventilación por ansiedad eleva la presión arterial de oxígeno y lleva la saturación hacia 99–100%, nunca la baja a 94%. Uso de anticonceptivos orales combinados y un viaje interurbano en bus de nueve horas tres días antes: dos factores protrombóticos presentes en la historia reciente, que nadie interrogó porque nunca se abrió una hipótesis vascular. Y una etiqueta heredada desde la admisión («crisis de pánico conocida»), que entró a la ficha médica con rango de diagnóstico antes de que el clínico pusiera el fonendoscopio sobre el tórax.</w:t>
+      </w:r>
+    </w:p>
+    <w:p>
+      <w:pPr>
+        <w:pStyle w:val="BodyJ"/>
+      </w:pPr>
+      <w:r>
+        <w:rPr>
+          <w:b/>
+          <w:bCs/>
+        </w:rPr>
+        <w:t xml:space="preserve">Inferencia de la primera noche:</w:t>
+      </w:r>
+      <w:r>
+        <w:t xml:space="preserve"> «crisis de pánico» fue redactada como un hecho consumado, cuando su fuerza epistémica real era apenas la de una hipótesis posible, sustentada únicamente en el antecedente psiquiátrico y la similitud superficial del relato.</w:t>
+      </w:r>
+    </w:p>
+    <w:p>
+      <w:pPr>
+        <w:pStyle w:val="BodyJ"/>
+      </w:pPr>
+      <w:r>
+        <w:rPr>
+          <w:b/>
+          <w:bCs/>
+        </w:rPr>
+        <w:t xml:space="preserve">Incertidumbre nunca formulada:</w:t>
+      </w:r>
+      <w:r>
+        <w:t xml:space="preserve"> ¿qué proceso fisiopatológico explica que una mujer de 29 años mantenga una frecuencia cardiaca de 112 lpm estando ya sedada y sin angustia, junto con una saturación de 94% que contradice una hiperventilación psicógena? Para este escenario exacto se diseñaron y validaron los criterios PERC (Pulmonary Embolism Rule-out Criteria): ocho variables que permiten excluir razonablemente un TEP sin dímero-D, sólo cuando un paciente de baja sospecha no cumple ninguna (Kline et al., 2004). Esta paciente incumplía tres: frecuencia cardiaca ≥100 lpm, saturación &lt;95% y uso de estrógenos. La regla no falló esa noche; nunca fue convocada, porque el cierre prematuro impidió sospechar que había algo que descartar.</w:t>
+      </w:r>
+    </w:p>
+    <w:p>
+      <w:pPr>
+        <w:pStyle w:val="BodyJ"/>
+      </w:pPr>
+      <w:r>
+        <w:rPr>
+          <w:b/>
+          <w:bCs/>
+        </w:rPr>
+        <w:t xml:space="preserve">Decisión de la primera noche:</w:t>
+      </w:r>
+      <w:r>
+        <w:t xml:space="preserve"> la benzodiacepina era defendible como tratamiento sintomático inicial. El alta sin estudio adicional y sin una línea de signos de alarma —qué debía hacerla volver antes del «control en salud mental»— fue un cierre indefendible.</w:t>
+      </w:r>
+    </w:p>
+    <w:p>
+      <w:pPr>
+        <w:pStyle w:val="BodyJ"/>
+      </w:pPr>
+      <w:r>
+        <w:rPr>
+          <w:i/>
+          <w:iCs/>
+        </w:rPr>
+        <w:t xml:space="preserve">Dónde estuvo el punto de intercepción.</w:t>
+      </w:r>
+      <w:r>
+        <w:t xml:space="preserve"> En la lectura de los signos vitales previos al egreso. Una taquicardia persistente de 112 lpm en una paciente que ya no luce angustiada era la gran discordancia de la madrugada. Si la hipótesis del pánico hubiese sido verdadera, el control de la ansiedad debía normalizar la descarga simpática y bajar el pulso. La pregunta de desaceleración antes de firmar el alta —«¿qué dato objetivo de esta paciente no explica una crisis de pánico?»— tenía en ese minuto su máximo rendimiento y su mínimo costo. Habrían bastado dos preguntas de anamnesis dirigida, la regla PERC al lado de la camilla y un dímero-D. Treinta y seis horas más tarde, la pregunta no formulada la respondió el síncope.</w:t>
+      </w:r>
+    </w:p>
+    <w:p>
+      <w:pPr>
+        <w:pStyle w:val="BodyJ"/>
+      </w:pPr>
+      <w:r>
+        <w:rPr>
+          <w:i/>
+          <w:iCs/>
+        </w:rPr>
+        <w:t xml:space="preserve">Lo que no debe concluirse.</w:t>
+      </w:r>
+      <w:r>
+        <w:t xml:space="preserve"> El desenlace no demuestra que toda disnea en una paciente con trastorno de pánico sea una embolia, ni que el médico fuera incompetente: con la información de la primera noche, la crisis de pánico era la explicación más frecuente. Lo indefendible era la arquitectura: una etiqueta de triage convertida en diagnóstico antes del examen, un dato medido —la taquicardia persistente— registrado sin que nadie le pidiera explicación, dos preguntas de anamnesis que la etiqueta volvió innecesarias y un alta sin criterio de reapertura. El mismo proceso con desenlace benigno —una crisis de pánico real— habría dejado la misma vulnerabilidad instalada para la siguiente paciente a la que se le cree menos por su diagnóstico.</w:t>
+      </w:r>
+    </w:p>
+    <w:p>
+      <w:pPr>
+        <w:pStyle w:val="BodyJ"/>
+      </w:pPr>
+      <w:r>
+        <w:rPr>
+          <w:i/>
+          <w:iCs/>
+        </w:rPr>
+        <w:t xml:space="preserve">Frase medular (la que faltó la primera noche):</w:t>
+      </w:r>
+      <w:r>
+        <w:t xml:space="preserve"> «Disnea súbita y taquicardia persistente (112 tras ansiolisis) en mujer de 29 años con trastorno de pánico y anticonceptivos orales: crisis de pánico posible, pero la taquicardia y la saturación de 94% no están explicadas. PERC no cumplido (frecuencia cardiaca, saturación, estrógenos): no procede el alta sin estudiar embolia pulmonar. Dímero-D ahora; angioTAC si resulta elevado o la probabilidad clínica es intermedia. Reconsulta inmediata, por escrito, ante síncope, dolor torácico o disnea en reposo.»</w:t>
+      </w:r>
+    </w:p>
+    <w:p>
+      <w:pPr>
+        <w:pStyle w:val="BodyJ"/>
+      </w:pPr>
+      <w:r>
+        <w:rPr>
+          <w:i/>
+          <w:iCs/>
+        </w:rPr>
+        <w:t xml:space="preserve">Lectura metacognitiva.</w:t>
+      </w:r>
+      <w:r>
+        <w:t xml:space="preserve"> La frase que faltó no requería más conocimiento del que cualquier médico de urgencias ya tiene: requería que el antecedente psiquiátrico no descontara el valor de dos signos medidos. Esta viñeta es el capítulo 14 en su forma más silenciosa: la injusticia testimonial no le dijo a la paciente que no le creía; simplemente dejó de preguntar. Y es también el capítulo 10: la regla PERC es un umbral explícito, y los umbrales explícitos sólo protegen a quien recuerda que hay una hipótesis que someterles. La disciplina de escritura habría bastado: separar el hecho (taquicardia persistente no explicada) de la etiqueta (pánico), conservar la incertidumbre y programar la reapertura.</w:t>
+      </w:r>
+    </w:p>
+    <w:p>
+      <w:pPr>
+        <w:pStyle w:val="Heading3"/>
+        <w:spacing w:after="120" w:before="280"/>
+      </w:pPr>
+      <w:r>
+        <w:rPr>
+          <w:rFonts w:ascii="Georgia" w:cs="Georgia" w:eastAsia="Georgia" w:hAnsi="Georgia"/>
+          <w:b/>
+          <w:bCs/>
+          <w:color w:val="2B2B2B"/>
+          <w:sz w:val="25"/>
+          <w:szCs w:val="25"/>
+        </w:rPr>
+        <w:t xml:space="preserve">Viñeta 7. «Lo veo raro»: el testimonio de la madre</w:t>
+      </w:r>
+    </w:p>
+    <w:p>
+      <w:pPr>
+        <w:pStyle w:val="BodyJ"/>
+      </w:pPr>
+      <w:r>
+        <w:t xml:space="preserve">Un lactante de cinco meses llega a urgencias a las 22:30. Afebril tras paracetamol en casa, signos vitales dentro de rangos para la edad, examen segmentario sin foco. La madre insiste: «No es él. No se ríe, no me busca, está como apagado». La sala está llena y el registro de triage dice «lactante febril en buenas condiciones generales».</w:t>
+      </w:r>
+    </w:p>
+    <w:p>
+      <w:pPr>
+        <w:pStyle w:val="BodyJ"/>
+      </w:pPr>
+      <w:r>
+        <w:rPr>
+          <w:i/>
+          <w:iCs/>
+        </w:rPr>
+        <w:t xml:space="preserve">Hechos:</w:t>
+      </w:r>
+      <w:r>
+        <w:t xml:space="preserve"> temperatura normalizada bajo antipirético (dato medido, pero bajo intervención); examen sin foco en una evaluación puntual; y un relato de tercero que describe un cambio conductual respecto del basal — información longitudinal a la que ningún examen de veinte minutos accede.</w:t>
+      </w:r>
+    </w:p>
+    <w:p>
+      <w:pPr>
+        <w:pStyle w:val="BodyJ"/>
+      </w:pPr>
+      <w:r>
+        <w:rPr>
+          <w:i/>
+          <w:iCs/>
+        </w:rPr>
+        <w:t xml:space="preserve">Inferencia:</w:t>
+      </w:r>
+      <w:r>
+        <w:t xml:space="preserve"> cuadro viral banal es lo más probable por prevalencia. Pero la preocupación parental por «no ser él mismo» no es ruido afectivo, sino una observación experta sobre el único basal disponible, y la evidencia le da rango de señal. En series de atención primaria, la intuición del clínico de que «algo anda mal», muchas veces gatillada por la inquietud de los padres, tuvo mayor valor diagnóstico que la mayoría de los signos aislados para detectar infección grave (Van den Bruel et al., 2012).</w:t>
+      </w:r>
+    </w:p>
+    <w:p>
+      <w:pPr>
+        <w:pStyle w:val="BodyJ"/>
+      </w:pPr>
+      <w:r>
+        <w:rPr>
+          <w:i/>
+          <w:iCs/>
+        </w:rPr>
+        <w:t xml:space="preserve">Incertidumbre:</w:t>
+      </w:r>
+      <w:r>
+        <w:t xml:space="preserve"> la peligrosa es una sola: infección bacteriana grave en fase temprana, cuando el examen todavía no la muestra. Reducible sólo parcialmente con laboratorio; la evolución de las próximas horas es la mejor prueba disponible.</w:t>
+      </w:r>
+    </w:p>
+    <w:p>
+      <w:pPr>
+        <w:pStyle w:val="BodyJ"/>
+      </w:pPr>
+      <w:r>
+        <w:rPr>
+          <w:i/>
+          <w:iCs/>
+        </w:rPr>
+        <w:t xml:space="preserve">Decisión:</w:t>
+      </w:r>
+      <w:r>
+        <w:t xml:space="preserve"> el dato que gobierna la conducta no es la temperatura sino el cambio de comportamiento reportado. Observación prolongada en urgencias con reevaluación seriada del estado general, umbral bajo para laboratorio, y —si se decide alta— red de seguridad explícita y verificada con la madre: qué mirar, cuándo volver, por qué vía. «Se va tranquila» no es un criterio de alta; «sabe exactamente qué la haría volver» sí.</w:t>
+      </w:r>
+    </w:p>
+    <w:p>
+      <w:pPr>
+        <w:pStyle w:val="BodyJ"/>
+      </w:pPr>
+      <w:r>
+        <w:rPr>
+          <w:i/>
+          <w:iCs/>
+        </w:rPr>
+        <w:t xml:space="preserve">Frase medular:</w:t>
+      </w:r>
+      <w:r>
+        <w:t xml:space="preserve"> «Lactante afebril bajo antipiréticos y sin foco al examen, con cambio conductual significativo según su madre; el testimonio del cuidador se registra como observación del basal y gobierna la vigilancia: reevaluación seriada antes de decidir alta, con red de seguridad verificada.»</w:t>
+      </w:r>
+    </w:p>
+    <w:p>
+      <w:pPr>
+        <w:pStyle w:val="BodyJ"/>
+      </w:pPr>
+      <w:r>
+        <w:rPr>
+          <w:i/>
+          <w:iCs/>
+        </w:rPr>
+        <w:t xml:space="preserve">Lectura metacognitiva.</w:t>
+      </w:r>
+      <w:r>
+        <w:t xml:space="preserve"> La pediatría radicaliza el capítulo 1: el paciente no habla, y el «hecho» más valioso es un testimonio de tercero sobre un basal que el equipo no conoce. Descartar la preocupación materna como ansiedad es injusticia testimonial en versión pediátrica — y además, simplemente, mala medicina: pocas fuentes de información tienen mejor razón señal-ruido que quien mira a ese niño todos los días.</w:t>
+      </w:r>
+    </w:p>
+    <w:p>
+      <w:pPr>
+        <w:pStyle w:val="Heading3"/>
+        <w:spacing w:after="120" w:before="280"/>
+      </w:pPr>
+      <w:r>
+        <w:rPr>
+          <w:rFonts w:ascii="Georgia" w:cs="Georgia" w:eastAsia="Georgia" w:hAnsi="Georgia"/>
+          <w:b/>
+          <w:bCs/>
+          <w:color w:val="2B2B2B"/>
+          <w:sz w:val="25"/>
+          <w:szCs w:val="25"/>
+        </w:rPr>
+        <w:t xml:space="preserve">Viñeta 8. El dolor abdominal de la paciente que «somatiza»</w:t>
+      </w:r>
+    </w:p>
+    <w:p>
+      <w:pPr>
+        <w:pStyle w:val="BodyJ"/>
+      </w:pPr>
+      <w:r>
+        <w:t xml:space="preserve">Una mujer de 34 años con esquizofrenia en tratamiento consulta por dolor abdominal de dos días. En el box, habla poco y evita la mirada; la nota de derivación dice «consultas frecuentes, quejas somáticas múltiples». Taquicardia de 110, abdomen difícil de evaluar — la paciente tolera mal la palpación y su tratamiento antipsicótico puede atenuar la expresión del dolor y enlentecer el tránsito.</w:t>
+      </w:r>
+    </w:p>
+    <w:p>
+      <w:pPr>
+        <w:pStyle w:val="BodyJ"/>
+      </w:pPr>
+      <w:r>
+        <w:rPr>
+          <w:i/>
+          <w:iCs/>
+        </w:rPr>
+        <w:t xml:space="preserve">Hechos:</w:t>
+      </w:r>
+      <w:r>
+        <w:t xml:space="preserve"> taquicardia sostenida (medida, reproducible); dos días de dolor según relato coherente en sus términos; examen abdominal técnicamente limitado —no negativo: limitado—; antecedente psiquiátrico que modifica la expresión clínica y farmacológica del cuadro; una etiqueta heredada («somatiza») sin procedencia verificable.</w:t>
+      </w:r>
+    </w:p>
+    <w:p>
+      <w:pPr>
+        <w:pStyle w:val="BodyJ"/>
+      </w:pPr>
+      <w:r>
+        <w:rPr>
+          <w:i/>
+          <w:iCs/>
+        </w:rPr>
+        <w:t xml:space="preserve">Inferencia:</w:t>
+      </w:r>
+      <w:r>
+        <w:t xml:space="preserve"> la explicación «queja somática en contexto de patología psiquiátrica» es posible, pero está recibiendo un peso que no proviene de los datos de hoy sino del estigma: nada en la taquicardia es psiquiátrico. El fenómeno tiene nombre —ensombrecimiento diagnóstico (diagnostic overshadowing): atribuir los síntomas físicos a la enfermedad mental— y consecuencias medibles: las personas con enfermedad mental grave mueren 15 a 20 años antes, en gran parte por enfermedad física subdiagnosticada y subtratada (Thornicroft, 2011).</w:t>
+      </w:r>
+    </w:p>
+    <w:p>
+      <w:pPr>
+        <w:pStyle w:val="BodyJ"/>
+      </w:pPr>
+      <w:r>
+        <w:rPr>
+          <w:i/>
+          <w:iCs/>
+        </w:rPr>
+        <w:t xml:space="preserve">Incertidumbre:</w:t>
+      </w:r>
+      <w:r>
+        <w:t xml:space="preserve"> la peligrosa es un abdomen quirúrgico enmascarado — por el antipsicótico, por la dificultad comunicativa y por la disposición del equipo a cerrar temprano. Es el caso donde el examen «poco confiable» obliga a más objetividad, no a menos: laboratorio e imagen deciden lo que la palpación no puede.</w:t>
+      </w:r>
+    </w:p>
+    <w:p>
+      <w:pPr>
+        <w:pStyle w:val="BodyJ"/>
+      </w:pPr>
+      <w:r>
+        <w:rPr>
+          <w:i/>
+          <w:iCs/>
+        </w:rPr>
+        <w:t xml:space="preserve">Decisión:</w:t>
+      </w:r>
+      <w:r>
+        <w:t xml:space="preserve"> el mismo estándar que para cualquier paciente con dolor abdominal y taquicardia —laboratorio completo, imagen según hallazgos, reevaluación programada— y uno adicional. Documentar que la evaluación fue limitada y por qué, para que el siguiente lector no herede «abdomen negativo» donde hubo «abdomen no evaluable». La etiqueta «somatiza» no entra a la ficha sin procedencia.</w:t>
+      </w:r>
+    </w:p>
+    <w:p>
+      <w:pPr>
+        <w:pStyle w:val="BodyJ"/>
+      </w:pPr>
+      <w:r>
+        <w:rPr>
+          <w:i/>
+          <w:iCs/>
+        </w:rPr>
+        <w:t xml:space="preserve">Frase medular:</w:t>
+      </w:r>
+      <w:r>
+        <w:t xml:space="preserve"> «Dolor abdominal y taquicardia sostenida en paciente con esquizofrenia: examen abdominal limitado —no negativo— y expresión clínica posiblemente atenuada por antipsicóticos; se estudia con el estándar completo, dejando registrado que la atribución psiquiátrica del cuadro exigiría primero excluir lo que la taquicardia sugiere.»</w:t>
+      </w:r>
+    </w:p>
+    <w:p>
+      <w:pPr>
+        <w:pStyle w:val="BodyJ"/>
+      </w:pPr>
+      <w:r>
+        <w:rPr>
+          <w:i/>
+          <w:iCs/>
+        </w:rPr>
+        <w:t xml:space="preserve">Lectura metacognitiva.</w:t>
+      </w:r>
+      <w:r>
+        <w:t xml:space="preserve"> Aquí la injusticia testimonial —descontar el relato por quién lo dice— tiene mortalidad: no es sólo un agravio moral sino un mecanismo causal de la brecha de 15 a 20 años de vida. Nótese el movimiento epistémico central: cuando el testimonio y el examen valen menos de lo habitual, el estándar de estudio objetivo sube en compensación. El ensombrecimiento hace exactamente lo contrario — usa la dificultad como excusa para bajar el estándar — y por eso mata.</w:t>
+      </w:r>
+    </w:p>
+    <w:p>
+      <w:pPr>
+        <w:pStyle w:val="Heading3"/>
+        <w:spacing w:after="120" w:before="280"/>
+      </w:pPr>
+      <w:r>
+        <w:rPr>
+          <w:rFonts w:ascii="Georgia" w:cs="Georgia" w:eastAsia="Georgia" w:hAnsi="Georgia"/>
+          <w:b/>
+          <w:bCs/>
+          <w:color w:val="2B2B2B"/>
+          <w:sz w:val="25"/>
+          <w:szCs w:val="25"/>
+        </w:rPr>
+        <w:t xml:space="preserve">Lo común a las ocho viñetas</w:t>
+      </w:r>
+    </w:p>
+    <w:p>
+      <w:pPr>
+        <w:pStyle w:val="BodyJ"/>
+      </w:pPr>
+      <w:r>
+        <w:t xml:space="preserve">En cada caso, la buena formulación evita dos extremos: describir sin interpretar o interpretar como si se hubiera observado directamente. El hecho guía la hipótesis; la incertidumbre modula su fuerza; la consecuencia define la decisión; la evolución conserva el derecho a corregir. Y en todas la decisión termina con la misma cláusula: qué la haría cambiar, quién lo detectará y cuándo. De la urgencia de las 3:00 al final de la vida; del lactante que no habla a la paciente a la que no se le cree.</w:t>
       </w:r>
     </w:p>
     <w:p>
@@ -11977,7 +12857,7 @@
           <w:sz w:val="22"/>
           <w:szCs w:val="22"/>
         </w:rPr>
-        <w:t xml:space="preserve">Cuaderno de casos</w:t>
+        <w:t xml:space="preserve">Capítulo 16</w:t>
       </w:r>
       <w:r>
         <w:rPr>
@@ -11989,15 +12869,15 @@
           <w:szCs w:val="32"/>
         </w:rPr>
         <w:br/>
-        <w:t xml:space="preserve">Ocho viñetas para una lectura metacognitiva</w:t>
-      </w:r>
-    </w:p>
-    <w:p>
-      <w:pPr>
-        <w:pStyle w:val="BodyJ"/>
-      </w:pPr>
-      <w:r>
-        <w:t xml:space="preserve">Las viñetas siguientes son composiciones docentes. Cada una se presenta con la estructura HII-D y una frase medular. No son casos «resueltos»: son casos representados. La invitación es leer cada uno dos veces —primero como clínico, buscando la conducta; después como lector metacognitivo, observando qué hace cada capa.</w:t>
+        <w:t xml:space="preserve">Enseñar y organizar la metacognición clínica</w:t>
+      </w:r>
+    </w:p>
+    <w:p>
+      <w:pPr>
+        <w:pStyle w:val="BodyJ"/>
+      </w:pPr>
+      <w:r>
+        <w:t xml:space="preserve">Una jefa de servicio que quiera «instalar metacognición» en su equipo no puede indicarla como se indica un antibiótico. Puede, en cambio, cambiar tres cosas que ve todas las semanas: qué se pregunta en la visita de sala, qué estructura tiene la ficha y qué pasa después de un error. Este capítulo trata de esas palancas.</w:t>
       </w:r>
     </w:p>
     <w:p>
@@ -12014,113 +12894,23 @@
           <w:sz w:val="25"/>
           <w:szCs w:val="25"/>
         </w:rPr>
-        <w:t xml:space="preserve">Viñeta 1. Carmen: obstrucción recurrente y cambio cualitativo de riesgo</w:t>
-      </w:r>
-    </w:p>
-    <w:p>
-      <w:pPr>
-        <w:pStyle w:val="BodyJ"/>
-      </w:pPr>
-      <w:r>
-        <w:t xml:space="preserve">La historia de Carmen atraviesa todo este libro; aquí se presenta en su versión condensada, tal como se sintetizaría en una entrega de turno o en una discusión clínica.</w:t>
-      </w:r>
-    </w:p>
-    <w:p>
-      <w:pPr>
-        <w:pStyle w:val="BodyJ"/>
-      </w:pPr>
-      <w:r>
-        <w:t xml:space="preserve">Mujer de 61 años con hernia incisional de la línea media y tres hospitalizaciones en el último año por suboclusión intestinal, todas resueltas con manejo médico conservador. Ingresa por un cuarto episodio obstructivo, esta vez asociado a shock séptico, hiperlactatemia (6,0 mmol/L), hipoperfusión periférica (llene capilar de 5 segundos) y bacteriemia por bacilos gramnegativos (2/2 hemocultivos). Evoluciona favorablemente con reposo digestivo, descompresión por sonda nasogástrica, noradrenalina y antibioterapia. La tomografía de abdomen no muestra perforación, isquemia mesentérica ni estrangulación actual.</w:t>
-      </w:r>
-    </w:p>
-    <w:p>
-      <w:pPr>
-        <w:pStyle w:val="BodyJ"/>
-      </w:pPr>
-      <w:r>
-        <w:rPr>
-          <w:i/>
-          <w:iCs/>
-        </w:rPr>
-        <w:t xml:space="preserve">Hechos:</w:t>
-      </w:r>
-      <w:r>
-        <w:t xml:space="preserve"> recurrencia obstructiva documentada y con intervalos cada vez más cortos; episodio actual con compromiso hemodinámico vital y bacteriemia demostrada; respuesta clínica favorable al soporte intensivo; ausencia de complicación quirúrgica aguda en la tomografía inicial.</w:t>
-      </w:r>
-    </w:p>
-    <w:p>
-      <w:pPr>
-        <w:pStyle w:val="BodyJ"/>
-      </w:pPr>
-      <w:r>
-        <w:rPr>
-          <w:i/>
-          <w:iCs/>
-        </w:rPr>
-        <w:t xml:space="preserve">Inferencia:</w:t>
-      </w:r>
-      <w:r>
-        <w:t xml:space="preserve"> el foco abdominal de la bacteriemia, secundario al evento obstructivo, es altamente probable por secuencia temporal y microbiología compatible, aunque el mecanismo íntimo (translocación bacteriana o microisquemia transitoria) no esté demostrado. La ausencia de estrangulación tomográfica desactiva la urgencia quirúrgica inmediata, pero no mitiga el riesgo acumulado de recurrencia.</w:t>
-      </w:r>
-    </w:p>
-    <w:p>
-      <w:pPr>
-        <w:pStyle w:val="BodyJ"/>
-      </w:pPr>
-      <w:r>
-        <w:rPr>
-          <w:i/>
-          <w:iCs/>
-        </w:rPr>
-        <w:t xml:space="preserve">Incertidumbre:</w:t>
-      </w:r>
-      <w:r>
-        <w:t xml:space="preserve"> son inciertos el plazo hasta una quinta obstrucción, la magnitud del daño si ésta ocurre fuera del hospital y la reserva funcional efectiva de la paciente para enfrentar el estrés quirúrgico una vez recuperada.</w:t>
-      </w:r>
-    </w:p>
-    <w:p>
-      <w:pPr>
-        <w:pStyle w:val="BodyJ"/>
-      </w:pPr>
-      <w:r>
-        <w:rPr>
-          <w:i/>
-          <w:iCs/>
-        </w:rPr>
-        <w:t xml:space="preserve">Decisión:</w:t>
-      </w:r>
-      <w:r>
-        <w:t xml:space="preserve"> solicitar evaluación quirúrgica precoz para planificar reparación electiva tras optimización médica y kinésica, documentando una decisión compartida. El fundamento para operar no es que «fracasó el manejo médico» (resolvió el cuadro agudo cuatro veces), sino que la gravedad vital alcanzada en este episodio vuelve inaceptable el riesgo de mantener una conducta expectante.</w:t>
-      </w:r>
-    </w:p>
-    <w:p>
-      <w:pPr>
-        <w:pStyle w:val="BodyJ"/>
-      </w:pPr>
-      <w:r>
-        <w:rPr>
-          <w:i/>
-          <w:iCs/>
-        </w:rPr>
-        <w:t xml:space="preserve">Frase medular:</w:t>
-      </w:r>
-      <w:r>
-        <w:t xml:space="preserve"> «Obstrucción intestinal recurrente por hernia incisional, por primera vez complicada con shock séptico y bacteriemia, sin isquemia aguda en tomografía. El salto cualitativo de gravedad modifica el umbral terapéutico y justifica priorizar la reparación electiva tras la recuperación fisiológica.»</w:t>
-      </w:r>
-    </w:p>
-    <w:p>
-      <w:pPr>
-        <w:pStyle w:val="BodyJ"/>
-      </w:pPr>
-      <w:r>
-        <w:rPr>
-          <w:i/>
-          <w:iCs/>
-        </w:rPr>
-        <w:t xml:space="preserve">Epílogo.</w:t>
-      </w:r>
-      <w:r>
-        <w:t xml:space="preserve"> Carmen fue operada de forma programada seis semanas después. En pabellón se encontraron adherencias firmes y un anillo herniario estrecho, reparado sin incidentes mayores. En su control ambulatorio al mes, Carmen formuló su propio balance del proceso: «Esta vez el dolor tenía una explicación clara, y saber qué estábamos haciendo lo cambió todo». Su buena evolución no demuestra, por sí sola, que la indicación haya sido acertada: un desenlace feliz nunca valida retroactivamente un proceso defectuoso. Lo que cuenta es que la decisión era defendible antes de conocer el resultado, que es todo lo que puede exigírsele al juicio médico. La anotación rápida de su primera madrugada en urgencias —«cuadro habitual, manejo habitual»— permaneció en la ficha como testimonio de lo que una semana de trabajo epistémico permitió transformar.</w:t>
+        <w:t xml:space="preserve">De la virtud individual al diseño institucional</w:t>
+      </w:r>
+    </w:p>
+    <w:p>
+      <w:pPr>
+        <w:pStyle w:val="BodyJ"/>
+      </w:pPr>
+      <w:r>
+        <w:t xml:space="preserve">La metacognición suele presentarse como una habilidad personal: el médico debe ser humilde, reflexivo y consciente de sus sesgos. Esa expectativa es insuficiente si el sistema oculta resultados, interrumpe el trabajo, fragmenta información y castiga la duda. La lucidez necesita infraestructura. Y esa infraestructura incluye los turnos: un servicio que deja las decisiones mayores para la hora veinte de una guardia está decidiendo con un instrumento degradado (capítulo 8), y el diseño de los horarios es, por eso, una decisión epistémica antes que administrativa.</w:t>
+      </w:r>
+    </w:p>
+    <w:p>
+      <w:pPr>
+        <w:pStyle w:val="BodyJ"/>
+      </w:pPr>
+      <w:r>
+        <w:t xml:space="preserve">La National Academies recomendó educación diagnóstica, trabajo en equipo, tecnologías que apoyen el proceso y mecanismos de feedback y aprendizaje (National Academies of Sciences, Engineering, and Medicine, 2015). Una institución metacognitiva no sólo registra errores; hace visible cómo se piensa y crea momentos para revisar.</w:t>
       </w:r>
     </w:p>
     <w:p>
@@ -12137,90 +12927,23 @@
           <w:sz w:val="25"/>
           <w:szCs w:val="25"/>
         </w:rPr>
-        <w:t xml:space="preserve">Viñeta 2. Bacteriuria en paciente con sonda permanente</w:t>
-      </w:r>
-    </w:p>
-    <w:p>
-      <w:pPr>
-        <w:pStyle w:val="BodyJ"/>
-      </w:pPr>
-      <w:r>
-        <w:t xml:space="preserve">Es el paciente de la cama 12 del capítulo 8, el mismo cuya ficha el capítulo 12 ordenó en la matriz HII-D; aquí, en la versión que cabe en una entrega de turno. Hombre con lesión medular completa, vejiga neurogénica, sonda Foley permanente y un cáncer renal metastásico en progresión. Tras un recambio traumático de sonda presenta orina turbia, piuria y urocultivo positivo; está afebril, estable y sin cambios respecto de su basal. Los marcadores inflamatorios están elevados, sin valores previos y con el tumor como causa concomitante, y tiene antecedente de colonización por enterobacteria productora de BLEE.</w:t>
-      </w:r>
-    </w:p>
-    <w:p>
-      <w:pPr>
-        <w:pStyle w:val="BodyJ"/>
-      </w:pPr>
-      <w:r>
-        <w:rPr>
-          <w:i/>
-          <w:iCs/>
-        </w:rPr>
-        <w:t xml:space="preserve">Hechos:</w:t>
-      </w:r>
-      <w:r>
-        <w:t xml:space="preserve"> recambio reciente de sonda; piuria y urocultivo positivo; afebril y estable; síntomas urinarios bajos no evaluables por el nivel lesional; reactantes elevados sin basal, con cáncer renal metastásico activo; colonización documentada por BLEE.</w:t>
-      </w:r>
-    </w:p>
-    <w:p>
-      <w:pPr>
-        <w:pStyle w:val="BodyJ"/>
-      </w:pPr>
-      <w:r>
-        <w:rPr>
-          <w:i/>
-          <w:iCs/>
-        </w:rPr>
-        <w:t xml:space="preserve">Inferencia:</w:t>
-      </w:r>
-      <w:r>
-        <w:t xml:space="preserve"> el cuadro es altamente compatible con una bacteriuria asociada a catéter por colonización crónica (favorecida por el arrastre del recambio) más que con una infección urinaria sintomática asociada a sonda. Por sí solas, ni la turbidez ni la piuria discriminan entre colonización e infección invasiva en pacientes sondados, y la elevación inflamatoria sistémica es explicable por su neoplasia de base.</w:t>
-      </w:r>
-    </w:p>
-    <w:p>
-      <w:pPr>
-        <w:pStyle w:val="BodyJ"/>
-      </w:pPr>
-      <w:r>
-        <w:rPr>
-          <w:i/>
-          <w:iCs/>
-        </w:rPr>
-        <w:t xml:space="preserve">Incertidumbre:</w:t>
-      </w:r>
-      <w:r>
-        <w:t xml:space="preserve"> la denervación medular enmascara la disuria y el dolor lumbar, por lo que persiste la duda de una infección incipiente con expresión clínica atípica.</w:t>
-      </w:r>
-    </w:p>
-    <w:p>
-      <w:pPr>
-        <w:pStyle w:val="BodyJ"/>
-      </w:pPr>
-      <w:r>
-        <w:rPr>
-          <w:i/>
-          <w:iCs/>
-        </w:rPr>
-        <w:t xml:space="preserve">Decisión:</w:t>
-      </w:r>
-      <w:r>
-        <w:t xml:space="preserve"> no iniciar tratamiento antibiótico empírico. Instaurar vigilancia clínica dirigida a signos equivalentes de respuesta sistémica o autonómica (fiebre nueva, inestabilidad hemodinámica, aumento súbito de espasticidad, sudoración o malestar general inexplicable). Aquí, el antecedente de germen BLEE no es un gatillo para prescribir antes, sino al revés. Como el tratamiento exigiría carbapenémicos, de alto impacto ecológico y toxicidad potencial, el umbral clínico para iniciar antibióticos debe ser más exigente.</w:t>
-      </w:r>
-    </w:p>
-    <w:p>
-      <w:pPr>
-        <w:pStyle w:val="BodyJ"/>
-      </w:pPr>
-      <w:r>
-        <w:rPr>
-          <w:i/>
-          <w:iCs/>
-        </w:rPr>
-        <w:t xml:space="preserve">Frase medular:</w:t>
-      </w:r>
-      <w:r>
-        <w:t xml:space="preserve"> «Urocultivo positivo y piuria tras recambio de sonda Foley en paciente con lesión medular y antecedente de colonización por BLEE, sin respuesta sistémica ni signos autonómicos que configuren infección activa. Se interpreta como bacteriuria asociada a catéter; vigilancia clínica estricta con criterios explícitos de reapertura.»</w:t>
+        <w:t xml:space="preserve">Enseñar representaciones, no sólo respuestas</w:t>
+      </w:r>
+    </w:p>
+    <w:p>
+      <w:pPr>
+        <w:pStyle w:val="BodyJ"/>
+      </w:pPr>
+      <w:r>
+        <w:t xml:space="preserve">En formación, pedir «el diagnóstico» prematuramente favorece la adivinación. Es más útil solicitar primero una representación del problema y preguntar qué datos fueron transformados en calificadores. Bowen y Eva han destacado la enseñanza explícita del razonamiento, mientras la teoría de illness scripts explica por qué el conocimiento debe organizarse alrededor de condiciones, mecanismos y consecuencias (Eva, 2005; Bowen, 2006).</w:t>
+      </w:r>
+    </w:p>
+    <w:p>
+      <w:pPr>
+        <w:pStyle w:val="BodyJ"/>
+      </w:pPr>
+      <w:r>
+        <w:t xml:space="preserve">El docente puede pedir al aprendiz que marque cada frase como hecho, inferencia o incertidumbre. Luego puede comparar la versión inicial con una formulación experta, no para imponer estilo, sino para mostrar qué relaciones fueron seleccionadas. El feedback debe ser específico: «presentaste la bacteriuria como infección», «omitiste que la imagen sólo excluye complicación actual», «tu plan no indica qué te haría cambiar». La devolución constructiva tiene técnica y tradición docente propia en nuestra lengua: describir conducta observable en lugar de juzgar a la persona, equilibrar lo logrado con lo corregible y terminar en un plan (Alves de Lima, 2008). Y la evaluación debe mirar lo mismo que la enseñanza. Premiar el diagnóstico correcto obtenido por un proceso frágil, y castigar el incorrecto con incertidumbre bien calibrada, enseña a ocultar dudas y a reconstruir narrativas retrospectivas. Pedir la confianza antes de conocer la respuesta, y el plan de revisión junto con el diagnóstico, corrige ese incentivo.</w:t>
       </w:r>
     </w:p>
     <w:p>
@@ -12237,105 +12960,23 @@
           <w:sz w:val="25"/>
           <w:szCs w:val="25"/>
         </w:rPr>
-        <w:t xml:space="preserve">Viñeta 3. Tres de la mañana: decidir con el reloj en contra</w:t>
-      </w:r>
-    </w:p>
-    <w:p>
-      <w:pPr>
-        <w:pStyle w:val="BodyJ"/>
-      </w:pPr>
-      <w:r>
-        <w:t xml:space="preserve">Servicio de urgencias, 03:10. Hombre de 54 años, tabáquico activo, consulta por dolor retroesternal opresivo de 40 minutos de evolución, acompañado de diaforesis fría. El electrocardiograma de ingreso muestra alteraciones inespecíficas de la repolarización, sin supradesnivel del ST. La primera troponina está en proceso en el laboratorio. En la sala de espera hay nueve pacientes pendientes de atención y queda un solo cupo en el box de reanimación. Bajo esta presión asistencial no hay margen para redactar una plantilla extensa, pero sí hay sesenta segundos para estructurar el juicio.</w:t>
-      </w:r>
-    </w:p>
-    <w:p>
-      <w:pPr>
-        <w:pStyle w:val="BodyJ"/>
-      </w:pPr>
-      <w:r>
-        <w:rPr>
-          <w:i/>
-          <w:iCs/>
-        </w:rPr>
-        <w:t xml:space="preserve">¿Qué vi y qué me contaron? (Hechos)</w:t>
-      </w:r>
-      <w:r>
-        <w:t xml:space="preserve"> Dolor torácico visceral opresivo con signos autonómicos objetivos (diaforesis fría presenciada en el triage) y un ECG inicial anormal aunque no diagnóstico.</w:t>
-      </w:r>
-    </w:p>
-    <w:p>
-      <w:pPr>
-        <w:pStyle w:val="BodyJ"/>
-      </w:pPr>
-      <w:r>
-        <w:rPr>
-          <w:i/>
-          <w:iCs/>
-        </w:rPr>
-        <w:t xml:space="preserve">¿Qué creo y cuánto derecho tengo a creerlo? (Inferencia)</w:t>
-      </w:r>
-      <w:r>
-        <w:t xml:space="preserve"> Síndrome coronario agudo (SCA) probable; la semiología isquémica típica y el perfil de riesgo tienen mayor peso pretest que un primer trazado electrocardiográfico no concluyente. Diagnóstico aún no demostrado.</w:t>
-      </w:r>
-    </w:p>
-    <w:p>
-      <w:pPr>
-        <w:pStyle w:val="BodyJ"/>
-      </w:pPr>
-      <w:r>
-        <w:rPr>
-          <w:i/>
-          <w:iCs/>
-        </w:rPr>
-        <w:t xml:space="preserve">¿Qué daño importante produciría si me equivoco? (Incertidumbre crítica)</w:t>
-      </w:r>
-      <w:r>
-        <w:t xml:space="preserve"> Rotularlo como «dolor torácico atípico con ECG sin isquemia aguda» y enviarlo a esperar la troponina en una silla de la sala común mientras cursa una oclusión coronaria dinámica. La incertidumbre peligrosa no es la etiqueta nominal; es la ventana de tiempo de miocardio salvable.</w:t>
-      </w:r>
-    </w:p>
-    <w:p>
-      <w:pPr>
-        <w:pStyle w:val="BodyJ"/>
-      </w:pPr>
-      <w:r>
-        <w:rPr>
-          <w:i/>
-          <w:iCs/>
-        </w:rPr>
-        <w:t xml:space="preserve">¿Qué hago ahora y qué me haría cambiar? (Decisión)</w:t>
-      </w:r>
-      <w:r>
-        <w:t xml:space="preserve"> Cama monitorizada, vía venosa, antiagregación inicial según protocolo, ECG seriado cada 15–30 minutos y rescate rápido de la troponina. Activar hemodinamia de inmediato si el trazado evoluciona a supradesnivel o si el dolor se vuelve refractario. Queda escrito: «SCA en evolución, no demostrado; manejo y monitorización continua por asimetría de consecuencias ante el riesgo vital de omisión».</w:t>
-      </w:r>
-    </w:p>
-    <w:p>
-      <w:pPr>
-        <w:pStyle w:val="BodyJ"/>
-      </w:pPr>
-      <w:r>
-        <w:rPr>
-          <w:i/>
-          <w:iCs/>
-        </w:rPr>
-        <w:t xml:space="preserve">Frase medular:</w:t>
-      </w:r>
-      <w:r>
-        <w:t xml:space="preserve"> «Dolor torácico de perfil anginoso con descarga adrenérgica y ECG inicial no concluyente: se maneja como SCA probable bajo monitorización continua, por asimetría de consecuencias, mientras la seriación electrocardiográfica y enzimática confirma o degrada la hipótesis.»</w:t>
-      </w:r>
-    </w:p>
-    <w:p>
-      <w:pPr>
-        <w:pStyle w:val="BodyJ"/>
-      </w:pPr>
-      <w:r>
-        <w:rPr>
-          <w:i/>
-          <w:iCs/>
-        </w:rPr>
-        <w:t xml:space="preserve">Lectura metacognitiva.</w:t>
-      </w:r>
-      <w:r>
-        <w:t xml:space="preserve"> En urgencias, el fallo catastrófico rara vez es intelectual: casi todo médico piensa en el infarto. Suele ser logístico y de diseño: la hipótesis correcta («probable SCA») sin un circuito cerrado de reevaluación. ¿Quién toma y quién mira el segundo ECG a los 15 minutos si el turno colapsa? Fijar el criterio de reapertura con plazo y responsable es la mitad del tratamiento.</w:t>
+        <w:t xml:space="preserve">Un debate honesto: ¿se puede enseñar a pensar mejor?</w:t>
+      </w:r>
+    </w:p>
+    <w:p>
+      <w:pPr>
+        <w:pStyle w:val="BodyJ"/>
+      </w:pPr>
+      <w:r>
+        <w:t xml:space="preserve">Este libro toma posición en una controversia real de la educación médica, y la declara. De un lado, Croskerry y su tradición sostienen que conocer los sesgos y entrenar estrategias de debiasing mejora el diagnóstico (Croskerry, 2003; Croskerry et al., 2013a, 2013b). Del otro, Norman, Monteiro y colegas han acumulado evidencia incómoda. La mayoría de los errores diagnósticos se asocia a déficits de conocimiento más que a fallas puras de proceso; los cursos de «pensamiento crítico» generalizable transfieren poco; y obligar a reflexionar sistemáticamente sobre casos fáciles no mejora la precisión y consume tiempo (Norman et al., 2017; Monteiro &amp; Norman, 2013; Monteiro et al., 2020).</w:t>
+      </w:r>
+    </w:p>
+    <w:p>
+      <w:pPr>
+        <w:pStyle w:val="BodyJ"/>
+      </w:pPr>
+      <w:r>
+        <w:t xml:space="preserve">La posición es intermedia, pero no equidistante. Con los escépticos: no existe una habilidad general de «pensar bien» que flote por encima del conocimiento; la representación rica del problema —illness scripts, experiencia con feedback— es la condición de todo lo demás, y ningún método, HII-D incluido, compensa no saber medicina. Contra el escepticismo total: de esa evidencia no se sigue que la única intervención posible sea enseñar más contenido. Lo que se propone aquí no es vigilancia interna permanente ni listas universales, las versiones que la evidencia ha desinflado, sino artefactos externos y selectivos. Un lenguaje que obliga a graduar afirmaciones; una estructura de nota que conserva las capas; pausas activadas por disparadores definidos; circuitos de feedback que conviertan experiencia en calibración. Es una apuesta con compromisos observables (véase el capítulo 15): si estas herramientas no cambian conductas medibles, deben abandonarse como cualquier hipótesis mimada. Entre tanto, la controversia se enseña mejor de lo que se oculta: un residente que conoce el debate sabrá desconfiar por igual del catálogo de sesgos como solución universal y del nihilismo pedagógico como coartada.</w:t>
       </w:r>
     </w:p>
     <w:p>
@@ -12352,801 +12993,7 @@
           <w:sz w:val="25"/>
           <w:szCs w:val="25"/>
         </w:rPr>
-        <w:t xml:space="preserve">Viñeta 4. La consulta ambulatoria y el chequeo reciente</w:t>
-      </w:r>
-    </w:p>
-    <w:p>
-      <w:pPr>
-        <w:pStyle w:val="BodyJ"/>
-      </w:pPr>
-      <w:r>
-        <w:t xml:space="preserve">Policlínico de atención primaria. Mujer de 47 años consulta por fatiga persistente de tres meses de evolución. Acude con exámenes de sangre «normales de hace poquito»: un hemograma y un perfil bioquímico tomados hace cinco meses en un chequeo preventivo, dos meses antes de que comenzara el cansancio. Al interrogatorio dirigido agrega sudoración nocturna ocasional —que ella atribuye al inicio de la menopausia— y una baja de peso involuntaria de unos tres kilos que explica «porque he tenido menos apetito». La agenda médica está copada, con bloques de doce minutos por paciente.</w:t>
-      </w:r>
-    </w:p>
-    <w:p>
-      <w:pPr>
-        <w:pStyle w:val="BodyJ"/>
-      </w:pPr>
-      <w:r>
-        <w:rPr>
-          <w:i/>
-          <w:iCs/>
-        </w:rPr>
-        <w:t xml:space="preserve">Hechos:</w:t>
-      </w:r>
-      <w:r>
-        <w:t xml:space="preserve"> fatiga progresiva de tres meses (relato consistente); exámenes de laboratorio normales cuya fecha precede en dos meses al inicio del síntoma; sudoración nocturna y baja ponderal referidas con atribuciones benignas propuestas por la propia paciente. Examen físico segmentario de hoy sin adenopatías periféricas ni visceromegalias palpables, en una exploración acotada por el tiempo de consulta.</w:t>
-      </w:r>
-    </w:p>
-    <w:p>
-      <w:pPr>
-        <w:pStyle w:val="BodyJ"/>
-      </w:pPr>
-      <w:r>
-        <w:rPr>
-          <w:i/>
-          <w:iCs/>
-        </w:rPr>
-        <w:t xml:space="preserve">Inferencia:</w:t>
-      </w:r>
-      <w:r>
-        <w:t xml:space="preserve"> por prevalencia, la mayoría de las fatigas en atención primaria son funcionales, carenciales o adaptativas. Pero fatiga prolongada, sudoración nocturna y baja de peso configuran un síndrome constitucional que impide el cierre diagnóstico. Los exámenes que trae la paciente no descartan patología orgánica actual por una razón temporal simple: fueron tomados cuando la enfermedad aún no se manifestaba.</w:t>
-      </w:r>
-    </w:p>
-    <w:p>
-      <w:pPr>
-        <w:pStyle w:val="BodyJ"/>
-      </w:pPr>
-      <w:r>
-        <w:rPr>
-          <w:i/>
-          <w:iCs/>
-        </w:rPr>
-        <w:t xml:space="preserve">Incertidumbre:</w:t>
-      </w:r>
-      <w:r>
-        <w:t xml:space="preserve"> la duda relevante hoy no es determinar la etiología exacta en doce minutos, sino responder si subyace un proceso sistémico, inflamatorio o neoplásico en curso. Esa incertidumbre no se reduce alargando la entrevista de hoy, sino actualizando el laboratorio y utilizando el seguimiento longitudinal.</w:t>
-      </w:r>
-    </w:p>
-    <w:p>
-      <w:pPr>
-        <w:pStyle w:val="BodyJ"/>
-      </w:pPr>
-      <w:r>
-        <w:rPr>
-          <w:i/>
-          <w:iCs/>
-        </w:rPr>
-        <w:t xml:space="preserve">Decisión:</w:t>
-      </w:r>
-      <w:r>
-        <w:t xml:space="preserve"> estudio actualizado dirigido (hemograma con frotis, VHS, PCR, TSH, glicemia, perfil hepático y renal, LDH) y control presencial en dos semanas con la misma médica. Red de seguridad por escrito (safety-netting): adelantar la consulta si aparece fiebre cuantificada, aumento de volumen ganglionar, dolor óseo localizado o progresión de la baja de peso.</w:t>
-      </w:r>
-    </w:p>
-    <w:p>
-      <w:pPr>
-        <w:pStyle w:val="BodyJ"/>
-      </w:pPr>
-      <w:r>
-        <w:rPr>
-          <w:i/>
-          <w:iCs/>
-        </w:rPr>
-        <w:t xml:space="preserve">Frase medular:</w:t>
-      </w:r>
-      <w:r>
-        <w:t xml:space="preserve"> «Fatiga de tres meses asociada a sudoración nocturna y baja ponderal leve; dado que el laboratorio normal previo antecede al inicio de los síntomas y no cubre el período actual, se solicita estudio actualizado y se programa control longitudinal con pauta escrita de signos de alarma.»</w:t>
-      </w:r>
-    </w:p>
-    <w:p>
-      <w:pPr>
-        <w:pStyle w:val="BodyJ"/>
-      </w:pPr>
-      <w:r>
-        <w:rPr>
-          <w:i/>
-          <w:iCs/>
-        </w:rPr>
-        <w:t xml:space="preserve">Lectura metacognitiva.</w:t>
-      </w:r>
-      <w:r>
-        <w:t xml:space="preserve"> Evidencia caducada: «tiene exámenes normales recientes» es un hecho cierto cuya fecha lo vuelve irrelevante para el problema nuevo. Y el tiempo longitudinal, la ventaja comparativa de la atención primaria, sólo es una herramienta diagnóstica cuando tiene fecha de reevaluación y criterios de reconsulta; sin ese diseño, dejar pasar el tiempo es apostar a que el cuadro sea benigno.</w:t>
-      </w:r>
-    </w:p>
-    <w:p>
-      <w:pPr>
-        <w:pStyle w:val="Heading3"/>
-        <w:spacing w:after="120" w:before="280"/>
-      </w:pPr>
-      <w:r>
-        <w:rPr>
-          <w:rFonts w:ascii="Georgia" w:cs="Georgia" w:eastAsia="Georgia" w:hAnsi="Georgia"/>
-          <w:b/>
-          <w:bCs/>
-          <w:color w:val="2B2B2B"/>
-          <w:sz w:val="25"/>
-          <w:szCs w:val="25"/>
-        </w:rPr>
-        <w:t xml:space="preserve">Viñeta 5. Pronóstico incierto al final de la vida</w:t>
-      </w:r>
-    </w:p>
-    <w:p>
-      <w:pPr>
-        <w:pStyle w:val="BodyJ"/>
-      </w:pPr>
-      <w:r>
-        <w:t xml:space="preserve">Hombre de 78 años con adenocarcinoma de páncreas metastásico en progresión tras tres líneas de quimioterapia. Ingresa al servicio de medicina interna por un deterioro funcional acelerado en las últimas tres semanas —pasó de caminar con apoyo dentro de su casa a permanecer postrado en cama—, sumado a una neumonía aguda hipoxémica. En el pasillo, la familia pregunta angustiada cuánto tiempo de vida le queda. Una de las hijas exige «que se le haga todo lo necesario para sacarlo adelante». Oncología anota en su interconsulta que, superado el cuadro infeccioso, «eventualmente podría evaluarse una ventana para una cuarta línea paliativa». El paciente, durante sus períodos de lucidez, repite que se siente profundamente agotado.</w:t>
-      </w:r>
-    </w:p>
-    <w:p>
-      <w:pPr>
-        <w:pStyle w:val="BodyJ"/>
-      </w:pPr>
-      <w:r>
-        <w:rPr>
-          <w:i/>
-          <w:iCs/>
-        </w:rPr>
-        <w:t xml:space="preserve">Hechos:</w:t>
-      </w:r>
-      <w:r>
-        <w:t xml:space="preserve"> neoplasia pancreática metastásica con progresión documentada bajo tercera línea oncológica; declive funcional severo y rápido en las últimas semanas (objetivable con una escala de fragilidad y de desempeño); neumonía bacteriana aguda superpuesta; manifestación reiterada de cansancio vital por parte del paciente en al menos dos entrevistas clínicas lúcidas.</w:t>
-      </w:r>
-    </w:p>
-    <w:p>
-      <w:pPr>
-        <w:pStyle w:val="BodyJ"/>
-      </w:pPr>
-      <w:r>
-        <w:rPr>
-          <w:i/>
-          <w:iCs/>
-        </w:rPr>
-        <w:t xml:space="preserve">Inferencia:</w:t>
-      </w:r>
-      <w:r>
-        <w:t xml:space="preserve"> la neumonía es tratable en lo inmediato. La pendiente funcional previa indica, en cambio, una trayectoria irreversible de final de vida, con una sobrevida estimable en semanas a pocos meses. En ese escenario, «podría haber ventana para otra línea» no es una expectativa fundada en la evolución real, sino la mención abstracta de un fármaco disponible.</w:t>
-      </w:r>
-    </w:p>
-    <w:p>
-      <w:pPr>
-        <w:pStyle w:val="BodyJ"/>
-      </w:pPr>
-      <w:r>
-        <w:rPr>
-          <w:i/>
-          <w:iCs/>
-        </w:rPr>
-        <w:t xml:space="preserve">Incertidumbre:</w:t>
-      </w:r>
-      <w:r>
-        <w:t xml:space="preserve"> el plazo exacto es incognoscible (incertidumbre aleatoria irreductible); lo honesto es comunicar la dirección de la pendiente y los escenarios probables. Pero la incertidumbre que domina el caso no es pronóstica sino de metas: ¿cómo quiere vivir este hombre el tiempo que le queda y qué cargas terapéuticas está dispuesto a tolerar?</w:t>
-      </w:r>
-    </w:p>
-    <w:p>
-      <w:pPr>
-        <w:pStyle w:val="BodyJ"/>
-      </w:pPr>
-      <w:r>
-        <w:rPr>
-          <w:i/>
-          <w:iCs/>
-        </w:rPr>
-        <w:t xml:space="preserve">Decisión:</w:t>
-      </w:r>
-      <w:r>
-        <w:t xml:space="preserve"> antibióticos endovenosos y oxigenoterapia no invasiva con un objetivo explícito de alivio sintomático y eventual retorno a su casa (medidas reversibles y proporcionadas). Suspender la discusión sobre nuevas quimioterapias. Reunión familiar estructurada para alinear el plan con la voluntad del paciente. Reevaluación a las 72 horas según respuesta funcional y confort.</w:t>
-      </w:r>
-    </w:p>
-    <w:p>
-      <w:pPr>
-        <w:pStyle w:val="BodyJ"/>
-      </w:pPr>
-      <w:r>
-        <w:rPr>
-          <w:i/>
-          <w:iCs/>
-        </w:rPr>
-        <w:t xml:space="preserve">Frase medular:</w:t>
-      </w:r>
-      <w:r>
-        <w:t xml:space="preserve"> «Neumonía aguda potencialmente reversible en paciente con cáncer de páncreas metastásico refractario y declive funcional acelerado hacia el final de la vida. Se trata la parte reversible con metas de alivio, se comunica la trayectoria sin fingir exactitud de plazos y las medidas invasivas se subordinan a las preferencias del enfermo.»</w:t>
-      </w:r>
-    </w:p>
-    <w:p>
-      <w:pPr>
-        <w:pStyle w:val="BodyJ"/>
-      </w:pPr>
-      <w:r>
-        <w:rPr>
-          <w:i/>
-          <w:iCs/>
-        </w:rPr>
-        <w:t xml:space="preserve">Lectura metacognitiva.</w:t>
-      </w:r>
-      <w:r>
-        <w:t xml:space="preserve"> La pregunta «¿cuánto tiempo le queda?» tienta a dos respuestas simétricas y malas: una cifra inventada (certeza retórica) o un «eso sólo Dios lo sabe» que desorienta a la familia (abandono comunicacional). Y el caso expone la confusión cotidiana entre lo técnicamente factible —una cuarta línea, intubar— y lo clínicamente proporcionado: el juicio de proporcionalidad del capítulo 10 empieza por reconocer el declive basal como un hecho clínico duro.</w:t>
-      </w:r>
-    </w:p>
-    <w:p>
-      <w:pPr>
-        <w:pStyle w:val="Heading3"/>
-        <w:spacing w:after="120" w:before="280"/>
-      </w:pPr>
-      <w:r>
-        <w:rPr>
-          <w:rFonts w:ascii="Georgia" w:cs="Georgia" w:eastAsia="Georgia" w:hAnsi="Georgia"/>
-          <w:b/>
-          <w:bCs/>
-          <w:color w:val="2B2B2B"/>
-          <w:sz w:val="25"/>
-          <w:szCs w:val="25"/>
-        </w:rPr>
-        <w:t xml:space="preserve">Viñeta 6. Anatomía de un error consumado</w:t>
-      </w:r>
-    </w:p>
-    <w:p>
-      <w:pPr>
-        <w:pStyle w:val="BodyJ"/>
-      </w:pPr>
-      <w:r>
-        <w:t xml:space="preserve">Esta viñeta reconstruye un error completo con la disciplina de los capítulos 7 y 8. Sin pegar la etiqueta de un sesgo, y sin dejar que el desenlace conocido distorsione lo que era exigible saber en el momento de la consulta.</w:t>
-      </w:r>
-    </w:p>
-    <w:p>
-      <w:pPr>
-        <w:pStyle w:val="BodyJ"/>
-      </w:pPr>
-      <w:r>
-        <w:rPr>
-          <w:i/>
-          <w:iCs/>
-        </w:rPr>
-        <w:t xml:space="preserve">El caso.</w:t>
-      </w:r>
-      <w:r>
-        <w:t xml:space="preserve"> Mujer de 29 años consulta en urgencias a las 23:40 por disnea de inicio súbito hace dos horas, palpitaciones y «sensación inminente de que me voy a morir». Registra antecedente de trastorno de pánico en control; la hoja de categorización del triage anota: «paciente ansiosa, cursa crisis de pánico conocida». Sus signos vitales de ingreso muestran frecuencia cardiaca de 118 lpm, presión arterial normal, saturación de oxígeno de 94% ambiental y auscultación cardiopulmonar descrita como «sin hallazgos patológicos». La evolución médica consigna: «Crisis de pánico en paciente con antecedente conocido. Se administra lorazepam sublingual, cede angustia. Alta con indicación de control en salud mental». A las 36 horas reingresa al reanimador traída por su pareja tras sufrir un síncope en el baño: el angioTAC confirma un tromboembolismo pulmonar (TEP) bilateral masivo con disfunción ventricular derecha aguda. Sobrevive tras trombólisis sistémica.</w:t>
-      </w:r>
-    </w:p>
-    <w:p>
-      <w:pPr>
-        <w:pStyle w:val="BodyJ"/>
-      </w:pPr>
-      <w:r>
-        <w:rPr>
-          <w:i/>
-          <w:iCs/>
-        </w:rPr>
-        <w:t xml:space="preserve">Reconstrucción epistémica por capas.</w:t>
-      </w:r>
-    </w:p>
-    <w:p>
-      <w:pPr>
-        <w:pStyle w:val="BodyJ"/>
-      </w:pPr>
-      <w:r>
-        <w:rPr>
-          <w:b/>
-          <w:bCs/>
-        </w:rPr>
-        <w:t xml:space="preserve">Hechos disponibles la primera noche:</w:t>
-      </w:r>
-      <w:r>
-        <w:t xml:space="preserve"> disnea de instalación brusca con hora de inicio precisa (relato consistente). Taquicardia sinusal de 118 lpm al ingreso, que persistía en 112 lpm en el control de enfermería previo al alta, una hora después del lorazepam y con la paciente ya tranquila. Dato medido, registrado en la hoja de signos vitales y omitido en la nota médica. Saturación de 94% a aire ambiental, que alguien en el turno minimizó como «esperable porque está hiperventilando»; la hiperventilación por ansiedad eleva la presión arterial de oxígeno y lleva la saturación hacia 99–100%, nunca la baja a 94%. Uso de anticonceptivos orales combinados y un viaje interurbano en bus de nueve horas tres días antes: dos factores protrombóticos presentes en la historia reciente, que nadie interrogó porque nunca se abrió una hipótesis vascular. Y una etiqueta heredada desde la admisión («crisis de pánico conocida»), que entró a la ficha médica con rango de diagnóstico antes de que el clínico pusiera el fonendoscopio sobre el tórax.</w:t>
-      </w:r>
-    </w:p>
-    <w:p>
-      <w:pPr>
-        <w:pStyle w:val="BodyJ"/>
-      </w:pPr>
-      <w:r>
-        <w:rPr>
-          <w:b/>
-          <w:bCs/>
-        </w:rPr>
-        <w:t xml:space="preserve">Inferencia de la primera noche:</w:t>
-      </w:r>
-      <w:r>
-        <w:t xml:space="preserve"> «crisis de pánico» fue redactada como un hecho consumado, cuando su fuerza epistémica real era apenas la de una hipótesis posible, sustentada únicamente en el antecedente psiquiátrico y la similitud superficial del relato.</w:t>
-      </w:r>
-    </w:p>
-    <w:p>
-      <w:pPr>
-        <w:pStyle w:val="BodyJ"/>
-      </w:pPr>
-      <w:r>
-        <w:rPr>
-          <w:b/>
-          <w:bCs/>
-        </w:rPr>
-        <w:t xml:space="preserve">Incertidumbre nunca formulada:</w:t>
-      </w:r>
-      <w:r>
-        <w:t xml:space="preserve"> ¿qué proceso fisiopatológico explica que una mujer de 29 años mantenga una frecuencia cardiaca de 112 lpm estando ya sedada y sin angustia, junto con una saturación de 94% que contradice una hiperventilación psicógena? Para este escenario exacto se diseñaron y validaron los criterios PERC (Pulmonary Embolism Rule-out Criteria): ocho variables que permiten excluir razonablemente un TEP sin dímero-D, sólo cuando un paciente de baja sospecha no cumple ninguna (Kline et al., 2004). Esta paciente incumplía tres: frecuencia cardiaca ≥100 lpm, saturación &lt;95% y uso de estrógenos. La regla no falló esa noche; nunca fue convocada, porque el cierre prematuro impidió sospechar que había algo que descartar.</w:t>
-      </w:r>
-    </w:p>
-    <w:p>
-      <w:pPr>
-        <w:pStyle w:val="BodyJ"/>
-      </w:pPr>
-      <w:r>
-        <w:rPr>
-          <w:b/>
-          <w:bCs/>
-        </w:rPr>
-        <w:t xml:space="preserve">Decisión de la primera noche:</w:t>
-      </w:r>
-      <w:r>
-        <w:t xml:space="preserve"> la benzodiacepina era defendible como tratamiento sintomático inicial. El alta sin estudio adicional y sin una línea de signos de alarma —qué debía hacerla volver antes del «control en salud mental»— fue un cierre indefendible.</w:t>
-      </w:r>
-    </w:p>
-    <w:p>
-      <w:pPr>
-        <w:pStyle w:val="BodyJ"/>
-      </w:pPr>
-      <w:r>
-        <w:rPr>
-          <w:i/>
-          <w:iCs/>
-        </w:rPr>
-        <w:t xml:space="preserve">Dónde estuvo el punto de intercepción.</w:t>
-      </w:r>
-      <w:r>
-        <w:t xml:space="preserve"> En la lectura de los signos vitales previos al egreso. Una taquicardia persistente de 112 lpm en una paciente que ya no luce angustiada era la gran discordancia de la madrugada. Si la hipótesis del pánico hubiese sido verdadera, el control de la ansiedad debía normalizar la descarga simpática y bajar el pulso. La pregunta de desaceleración antes de firmar el alta —«¿qué dato objetivo de esta paciente no explica una crisis de pánico?»— tenía en ese minuto su máximo rendimiento y su mínimo costo. Habrían bastado dos preguntas de anamnesis dirigida, la regla PERC al lado de la camilla y un dímero-D. Treinta y seis horas más tarde, la pregunta no formulada la respondió el síncope.</w:t>
-      </w:r>
-    </w:p>
-    <w:p>
-      <w:pPr>
-        <w:pStyle w:val="BodyJ"/>
-      </w:pPr>
-      <w:r>
-        <w:rPr>
-          <w:i/>
-          <w:iCs/>
-        </w:rPr>
-        <w:t xml:space="preserve">Lo que no debe concluirse.</w:t>
-      </w:r>
-      <w:r>
-        <w:t xml:space="preserve"> El desenlace no demuestra que toda disnea en una paciente con trastorno de pánico sea una embolia, ni que el médico fuera incompetente: con la información de la primera noche, la crisis de pánico era la explicación más frecuente. Lo indefendible era la arquitectura: una etiqueta de triage convertida en diagnóstico antes del examen, un dato medido —la taquicardia persistente— registrado sin que nadie le pidiera explicación, dos preguntas de anamnesis que la etiqueta volvió innecesarias y un alta sin criterio de reapertura. El mismo proceso con desenlace benigno —una crisis de pánico real— habría dejado la misma vulnerabilidad instalada para la siguiente paciente a la que se le cree menos por su diagnóstico.</w:t>
-      </w:r>
-    </w:p>
-    <w:p>
-      <w:pPr>
-        <w:pStyle w:val="BodyJ"/>
-      </w:pPr>
-      <w:r>
-        <w:rPr>
-          <w:i/>
-          <w:iCs/>
-        </w:rPr>
-        <w:t xml:space="preserve">Frase medular (la que faltó la primera noche):</w:t>
-      </w:r>
-      <w:r>
-        <w:t xml:space="preserve"> «Disnea súbita y taquicardia persistente (112 tras ansiolisis) en mujer de 29 años con trastorno de pánico y anticonceptivos orales: crisis de pánico posible, pero la taquicardia y la saturación de 94% no están explicadas. PERC no cumplido (frecuencia cardiaca, saturación, estrógenos): no procede el alta sin estudiar embolia pulmonar. Dímero-D ahora; angioTAC si resulta elevado o la probabilidad clínica es intermedia. Reconsulta inmediata, por escrito, ante síncope, dolor torácico o disnea en reposo.»</w:t>
-      </w:r>
-    </w:p>
-    <w:p>
-      <w:pPr>
-        <w:pStyle w:val="BodyJ"/>
-      </w:pPr>
-      <w:r>
-        <w:rPr>
-          <w:i/>
-          <w:iCs/>
-        </w:rPr>
-        <w:t xml:space="preserve">Lectura metacognitiva.</w:t>
-      </w:r>
-      <w:r>
-        <w:t xml:space="preserve"> La frase que faltó no requería más conocimiento del que cualquier médico de urgencias ya tiene: requería que el antecedente psiquiátrico no descontara el valor de dos signos medidos. Esta viñeta es el capítulo 14 en su forma más silenciosa: la injusticia testimonial no le dijo a la paciente que no le creía; simplemente dejó de preguntar. Y es también el capítulo 10: la regla PERC es un umbral explícito, y los umbrales explícitos sólo protegen a quien recuerda que hay una hipótesis que someterles. La disciplina de escritura habría bastado: separar el hecho (taquicardia persistente no explicada) de la etiqueta (pánico), conservar la incertidumbre y programar la reapertura.</w:t>
-      </w:r>
-    </w:p>
-    <w:p>
-      <w:pPr>
-        <w:pStyle w:val="Heading3"/>
-        <w:spacing w:after="120" w:before="280"/>
-      </w:pPr>
-      <w:r>
-        <w:rPr>
-          <w:rFonts w:ascii="Georgia" w:cs="Georgia" w:eastAsia="Georgia" w:hAnsi="Georgia"/>
-          <w:b/>
-          <w:bCs/>
-          <w:color w:val="2B2B2B"/>
-          <w:sz w:val="25"/>
-          <w:szCs w:val="25"/>
-        </w:rPr>
-        <w:t xml:space="preserve">Viñeta 7. «Lo veo raro»: el testimonio de la madre</w:t>
-      </w:r>
-    </w:p>
-    <w:p>
-      <w:pPr>
-        <w:pStyle w:val="BodyJ"/>
-      </w:pPr>
-      <w:r>
-        <w:t xml:space="preserve">Un lactante de cinco meses llega a urgencias a las 22:30. Afebril tras paracetamol en casa, signos vitales dentro de rangos para la edad, examen segmentario sin foco. La madre insiste: «No es él. No se ríe, no me busca, está como apagado». La sala está llena y el registro de triage dice «lactante febril en buenas condiciones generales».</w:t>
-      </w:r>
-    </w:p>
-    <w:p>
-      <w:pPr>
-        <w:pStyle w:val="BodyJ"/>
-      </w:pPr>
-      <w:r>
-        <w:rPr>
-          <w:i/>
-          <w:iCs/>
-        </w:rPr>
-        <w:t xml:space="preserve">Hechos:</w:t>
-      </w:r>
-      <w:r>
-        <w:t xml:space="preserve"> temperatura normalizada bajo antipirético (dato medido, pero bajo intervención); examen sin foco en una evaluación puntual; y un relato de tercero que describe un cambio conductual respecto del basal — información longitudinal a la que ningún examen de veinte minutos accede.</w:t>
-      </w:r>
-    </w:p>
-    <w:p>
-      <w:pPr>
-        <w:pStyle w:val="BodyJ"/>
-      </w:pPr>
-      <w:r>
-        <w:rPr>
-          <w:i/>
-          <w:iCs/>
-        </w:rPr>
-        <w:t xml:space="preserve">Inferencia:</w:t>
-      </w:r>
-      <w:r>
-        <w:t xml:space="preserve"> cuadro viral banal es lo más probable por prevalencia. Pero la preocupación parental por «no ser él mismo» no es ruido afectivo, sino una observación experta sobre el único basal disponible, y la evidencia le da rango de señal. En series de atención primaria, la intuición del clínico de que «algo anda mal», muchas veces gatillada por la inquietud de los padres, tuvo mayor valor diagnóstico que la mayoría de los signos aislados para detectar infección grave (Van den Bruel et al., 2012).</w:t>
-      </w:r>
-    </w:p>
-    <w:p>
-      <w:pPr>
-        <w:pStyle w:val="BodyJ"/>
-      </w:pPr>
-      <w:r>
-        <w:rPr>
-          <w:i/>
-          <w:iCs/>
-        </w:rPr>
-        <w:t xml:space="preserve">Incertidumbre:</w:t>
-      </w:r>
-      <w:r>
-        <w:t xml:space="preserve"> la peligrosa es una sola: infección bacteriana grave en fase temprana, cuando el examen todavía no la muestra. Reducible sólo parcialmente con laboratorio; la evolución de las próximas horas es la mejor prueba disponible.</w:t>
-      </w:r>
-    </w:p>
-    <w:p>
-      <w:pPr>
-        <w:pStyle w:val="BodyJ"/>
-      </w:pPr>
-      <w:r>
-        <w:rPr>
-          <w:i/>
-          <w:iCs/>
-        </w:rPr>
-        <w:t xml:space="preserve">Decisión:</w:t>
-      </w:r>
-      <w:r>
-        <w:t xml:space="preserve"> el dato que gobierna la conducta no es la temperatura sino el cambio de comportamiento reportado. Observación prolongada en urgencias con reevaluación seriada del estado general, umbral bajo para laboratorio, y —si se decide alta— red de seguridad explícita y verificada con la madre: qué mirar, cuándo volver, por qué vía. «Se va tranquila» no es un criterio de alta; «sabe exactamente qué la haría volver» sí.</w:t>
-      </w:r>
-    </w:p>
-    <w:p>
-      <w:pPr>
-        <w:pStyle w:val="BodyJ"/>
-      </w:pPr>
-      <w:r>
-        <w:rPr>
-          <w:i/>
-          <w:iCs/>
-        </w:rPr>
-        <w:t xml:space="preserve">Frase medular:</w:t>
-      </w:r>
-      <w:r>
-        <w:t xml:space="preserve"> «Lactante afebril bajo antipiréticos y sin foco al examen, con cambio conductual significativo según su madre; el testimonio del cuidador se registra como observación del basal y gobierna la vigilancia: reevaluación seriada antes de decidir alta, con red de seguridad verificada.»</w:t>
-      </w:r>
-    </w:p>
-    <w:p>
-      <w:pPr>
-        <w:pStyle w:val="BodyJ"/>
-      </w:pPr>
-      <w:r>
-        <w:rPr>
-          <w:i/>
-          <w:iCs/>
-        </w:rPr>
-        <w:t xml:space="preserve">Lectura metacognitiva.</w:t>
-      </w:r>
-      <w:r>
-        <w:t xml:space="preserve"> La pediatría radicaliza el capítulo 1: el paciente no habla, y el «hecho» más valioso es un testimonio de tercero sobre un basal que el equipo no conoce. Descartar la preocupación materna como ansiedad es injusticia testimonial en versión pediátrica — y además, simplemente, mala medicina: pocas fuentes de información tienen mejor razón señal-ruido que quien mira a ese niño todos los días.</w:t>
-      </w:r>
-    </w:p>
-    <w:p>
-      <w:pPr>
-        <w:pStyle w:val="Heading3"/>
-        <w:spacing w:after="120" w:before="280"/>
-      </w:pPr>
-      <w:r>
-        <w:rPr>
-          <w:rFonts w:ascii="Georgia" w:cs="Georgia" w:eastAsia="Georgia" w:hAnsi="Georgia"/>
-          <w:b/>
-          <w:bCs/>
-          <w:color w:val="2B2B2B"/>
-          <w:sz w:val="25"/>
-          <w:szCs w:val="25"/>
-        </w:rPr>
-        <w:t xml:space="preserve">Viñeta 8. El dolor abdominal de la paciente que «somatiza»</w:t>
-      </w:r>
-    </w:p>
-    <w:p>
-      <w:pPr>
-        <w:pStyle w:val="BodyJ"/>
-      </w:pPr>
-      <w:r>
-        <w:t xml:space="preserve">Una mujer de 34 años con esquizofrenia en tratamiento consulta por dolor abdominal de dos días. En el box, habla poco y evita la mirada; la nota de derivación dice «consultas frecuentes, quejas somáticas múltiples». Taquicardia de 110, abdomen difícil de evaluar — la paciente tolera mal la palpación y su tratamiento antipsicótico puede atenuar la expresión del dolor y enlentecer el tránsito.</w:t>
-      </w:r>
-    </w:p>
-    <w:p>
-      <w:pPr>
-        <w:pStyle w:val="BodyJ"/>
-      </w:pPr>
-      <w:r>
-        <w:rPr>
-          <w:i/>
-          <w:iCs/>
-        </w:rPr>
-        <w:t xml:space="preserve">Hechos:</w:t>
-      </w:r>
-      <w:r>
-        <w:t xml:space="preserve"> taquicardia sostenida (medida, reproducible); dos días de dolor según relato coherente en sus términos; examen abdominal técnicamente limitado —no negativo: limitado—; antecedente psiquiátrico que modifica la expresión clínica y farmacológica del cuadro; una etiqueta heredada («somatiza») sin procedencia verificable.</w:t>
-      </w:r>
-    </w:p>
-    <w:p>
-      <w:pPr>
-        <w:pStyle w:val="BodyJ"/>
-      </w:pPr>
-      <w:r>
-        <w:rPr>
-          <w:i/>
-          <w:iCs/>
-        </w:rPr>
-        <w:t xml:space="preserve">Inferencia:</w:t>
-      </w:r>
-      <w:r>
-        <w:t xml:space="preserve"> la explicación «queja somática en contexto de patología psiquiátrica» es posible, pero está recibiendo un peso que no proviene de los datos de hoy sino del estigma: nada en la taquicardia es psiquiátrico. El fenómeno tiene nombre —ensombrecimiento diagnóstico (diagnostic overshadowing): atribuir los síntomas físicos a la enfermedad mental— y consecuencias medibles: las personas con enfermedad mental grave mueren 15 a 20 años antes, en gran parte por enfermedad física subdiagnosticada y subtratada (Thornicroft, 2011).</w:t>
-      </w:r>
-    </w:p>
-    <w:p>
-      <w:pPr>
-        <w:pStyle w:val="BodyJ"/>
-      </w:pPr>
-      <w:r>
-        <w:rPr>
-          <w:i/>
-          <w:iCs/>
-        </w:rPr>
-        <w:t xml:space="preserve">Incertidumbre:</w:t>
-      </w:r>
-      <w:r>
-        <w:t xml:space="preserve"> la peligrosa es un abdomen quirúrgico enmascarado — por el antipsicótico, por la dificultad comunicativa y por la disposición del equipo a cerrar temprano. Es el caso donde el examen «poco confiable» obliga a más objetividad, no a menos: laboratorio e imagen deciden lo que la palpación no puede.</w:t>
-      </w:r>
-    </w:p>
-    <w:p>
-      <w:pPr>
-        <w:pStyle w:val="BodyJ"/>
-      </w:pPr>
-      <w:r>
-        <w:rPr>
-          <w:i/>
-          <w:iCs/>
-        </w:rPr>
-        <w:t xml:space="preserve">Decisión:</w:t>
-      </w:r>
-      <w:r>
-        <w:t xml:space="preserve"> el mismo estándar que para cualquier paciente con dolor abdominal y taquicardia —laboratorio completo, imagen según hallazgos, reevaluación programada— y uno adicional. Documentar que la evaluación fue limitada y por qué, para que el siguiente lector no herede «abdomen negativo» donde hubo «abdomen no evaluable». La etiqueta «somatiza» no entra a la ficha sin procedencia.</w:t>
-      </w:r>
-    </w:p>
-    <w:p>
-      <w:pPr>
-        <w:pStyle w:val="BodyJ"/>
-      </w:pPr>
-      <w:r>
-        <w:rPr>
-          <w:i/>
-          <w:iCs/>
-        </w:rPr>
-        <w:t xml:space="preserve">Frase medular:</w:t>
-      </w:r>
-      <w:r>
-        <w:t xml:space="preserve"> «Dolor abdominal y taquicardia sostenida en paciente con esquizofrenia: examen abdominal limitado —no negativo— y expresión clínica posiblemente atenuada por antipsicóticos; se estudia con el estándar completo, dejando registrado que la atribución psiquiátrica del cuadro exigiría primero excluir lo que la taquicardia sugiere.»</w:t>
-      </w:r>
-    </w:p>
-    <w:p>
-      <w:pPr>
-        <w:pStyle w:val="BodyJ"/>
-      </w:pPr>
-      <w:r>
-        <w:rPr>
-          <w:i/>
-          <w:iCs/>
-        </w:rPr>
-        <w:t xml:space="preserve">Lectura metacognitiva.</w:t>
-      </w:r>
-      <w:r>
-        <w:t xml:space="preserve"> Aquí la injusticia testimonial —descontar el relato por quién lo dice— tiene mortalidad: no es sólo un agravio moral sino un mecanismo causal de la brecha de 15 a 20 años de vida. Nótese el movimiento epistémico central: cuando el testimonio y el examen valen menos de lo habitual, el estándar de estudio objetivo sube en compensación. El ensombrecimiento hace exactamente lo contrario — usa la dificultad como excusa para bajar el estándar — y por eso mata.</w:t>
-      </w:r>
-    </w:p>
-    <w:p>
-      <w:pPr>
-        <w:pStyle w:val="Heading3"/>
-        <w:spacing w:after="120" w:before="280"/>
-      </w:pPr>
-      <w:r>
-        <w:rPr>
-          <w:rFonts w:ascii="Georgia" w:cs="Georgia" w:eastAsia="Georgia" w:hAnsi="Georgia"/>
-          <w:b/>
-          <w:bCs/>
-          <w:color w:val="2B2B2B"/>
-          <w:sz w:val="25"/>
-          <w:szCs w:val="25"/>
-        </w:rPr>
-        <w:t xml:space="preserve">Lo común a las ocho viñetas</w:t>
-      </w:r>
-    </w:p>
-    <w:p>
-      <w:pPr>
-        <w:pStyle w:val="BodyJ"/>
-      </w:pPr>
-      <w:r>
-        <w:t xml:space="preserve">En cada caso, la buena formulación evita dos extremos: describir sin interpretar o interpretar como si se hubiera observado directamente. El hecho guía la hipótesis; la incertidumbre modula su fuerza; la consecuencia define la decisión; la evolución conserva el derecho a corregir. Y en todas la decisión termina con la misma cláusula: qué la haría cambiar, quién lo detectará y cuándo. De la urgencia de las 3:00 al final de la vida; del lactante que no habla a la paciente a la que no se le cree.</w:t>
-      </w:r>
-    </w:p>
-    <w:p>
-      <w:pPr>
-        <w:pStyle w:val="Heading2"/>
-        <w:pageBreakBefore/>
-        <w:spacing w:after="300" w:before="600"/>
-      </w:pPr>
-      <w:r>
-        <w:rPr>
-          <w:rFonts w:ascii="Georgia" w:cs="Georgia" w:eastAsia="Georgia" w:hAnsi="Georgia"/>
-          <w:b/>
-          <w:bCs/>
-          <w:color w:val="8C2F2F"/>
-          <w:sz w:val="22"/>
-          <w:szCs w:val="22"/>
-        </w:rPr>
-        <w:t xml:space="preserve">Capítulo 16</w:t>
-      </w:r>
-      <w:r>
-        <w:rPr>
-          <w:rFonts w:ascii="Georgia" w:cs="Georgia" w:eastAsia="Georgia" w:hAnsi="Georgia"/>
-          <w:b/>
-          <w:bCs/>
-          <w:color w:val="3D5A6C"/>
-          <w:sz w:val="32"/>
-          <w:szCs w:val="32"/>
-        </w:rPr>
-        <w:br/>
-        <w:t xml:space="preserve">Enseñar y organizar la metacognición clínica</w:t>
-      </w:r>
-    </w:p>
-    <w:p>
-      <w:pPr>
-        <w:pStyle w:val="BodyJ"/>
-      </w:pPr>
-      <w:r>
-        <w:t xml:space="preserve">Una jefa de servicio que quiera «instalar metacognición» en su equipo no puede indicarla como se indica un antibiótico. Puede, en cambio, cambiar tres cosas que ve todas las semanas: qué se pregunta en la visita de sala, qué estructura tiene la ficha y qué pasa después de un error. Este capítulo trata de esas palancas.</w:t>
-      </w:r>
-    </w:p>
-    <w:p>
-      <w:pPr>
-        <w:pStyle w:val="Heading3"/>
-        <w:spacing w:after="120" w:before="280"/>
-      </w:pPr>
-      <w:r>
-        <w:rPr>
-          <w:rFonts w:ascii="Georgia" w:cs="Georgia" w:eastAsia="Georgia" w:hAnsi="Georgia"/>
-          <w:b/>
-          <w:bCs/>
-          <w:color w:val="2B2B2B"/>
-          <w:sz w:val="25"/>
-          <w:szCs w:val="25"/>
-        </w:rPr>
-        <w:t xml:space="preserve">De la virtud individual al diseño institucional</w:t>
-      </w:r>
-    </w:p>
-    <w:p>
-      <w:pPr>
-        <w:pStyle w:val="BodyJ"/>
-      </w:pPr>
-      <w:r>
-        <w:t xml:space="preserve">La metacognición suele presentarse como una habilidad personal: el médico debe ser humilde, reflexivo y consciente de sus sesgos. Esa expectativa es insuficiente si el sistema oculta resultados, interrumpe el trabajo, fragmenta información y castiga la duda. La lucidez necesita infraestructura. Y esa infraestructura incluye los turnos: un servicio que deja las decisiones mayores para la hora veinte de una guardia está decidiendo con un instrumento degradado (capítulo 8), y el diseño de los horarios es, por eso, una decisión epistémica antes que administrativa.</w:t>
-      </w:r>
-    </w:p>
-    <w:p>
-      <w:pPr>
-        <w:pStyle w:val="BodyJ"/>
-      </w:pPr>
-      <w:r>
-        <w:t xml:space="preserve">La National Academies recomendó educación diagnóstica, trabajo en equipo, tecnologías que apoyen el proceso y mecanismos de feedback y aprendizaje (National Academies of Sciences, Engineering, and Medicine, 2015). Una institución metacognitiva no sólo registra errores; hace visible cómo se piensa y crea momentos para revisar.</w:t>
-      </w:r>
-    </w:p>
-    <w:p>
-      <w:pPr>
-        <w:pStyle w:val="Heading3"/>
-        <w:spacing w:after="120" w:before="280"/>
-      </w:pPr>
-      <w:r>
-        <w:rPr>
-          <w:rFonts w:ascii="Georgia" w:cs="Georgia" w:eastAsia="Georgia" w:hAnsi="Georgia"/>
-          <w:b/>
-          <w:bCs/>
-          <w:color w:val="2B2B2B"/>
-          <w:sz w:val="25"/>
-          <w:szCs w:val="25"/>
-        </w:rPr>
-        <w:t xml:space="preserve">Enseñar representaciones, no sólo respuestas</w:t>
-      </w:r>
-    </w:p>
-    <w:p>
-      <w:pPr>
-        <w:pStyle w:val="BodyJ"/>
-      </w:pPr>
-      <w:r>
-        <w:t xml:space="preserve">En formación, pedir «el diagnóstico» prematuramente favorece la adivinación. Es más útil solicitar primero una representación del problema y preguntar qué datos fueron transformados en calificadores. Bowen y Eva han destacado la enseñanza explícita del razonamiento, mientras la teoría de illness scripts explica por qué el conocimiento debe organizarse alrededor de condiciones, mecanismos y consecuencias (Eva, 2005; Bowen, 2006).</w:t>
-      </w:r>
-    </w:p>
-    <w:p>
-      <w:pPr>
-        <w:pStyle w:val="BodyJ"/>
-      </w:pPr>
-      <w:r>
-        <w:t xml:space="preserve">El docente puede pedir al aprendiz que marque cada frase como hecho, inferencia o incertidumbre. Luego puede comparar la versión inicial con una formulación experta, no para imponer estilo, sino para mostrar qué relaciones fueron seleccionadas. El feedback debe ser específico: «presentaste la bacteriuria como infección», «omitiste que la imagen sólo excluye complicación actual», «tu plan no indica qué te haría cambiar». La devolución constructiva tiene técnica y tradición docente propia en nuestra lengua: describir conducta observable en lugar de juzgar a la persona, equilibrar lo logrado con lo corregible y terminar en un plan (Alves de Lima, 2008). Y la evaluación debe mirar lo mismo que la enseñanza. Premiar el diagnóstico correcto obtenido por un proceso frágil, y castigar el incorrecto con incertidumbre bien calibrada, enseña a ocultar dudas y a reconstruir narrativas retrospectivas. Pedir la confianza antes de conocer la respuesta, y el plan de revisión junto con el diagnóstico, corrige ese incentivo.</w:t>
-      </w:r>
-    </w:p>
-    <w:p>
-      <w:pPr>
-        <w:pStyle w:val="Heading3"/>
-        <w:spacing w:after="120" w:before="280"/>
-      </w:pPr>
-      <w:r>
-        <w:rPr>
-          <w:rFonts w:ascii="Georgia" w:cs="Georgia" w:eastAsia="Georgia" w:hAnsi="Georgia"/>
-          <w:b/>
-          <w:bCs/>
-          <w:color w:val="2B2B2B"/>
-          <w:sz w:val="25"/>
-          <w:szCs w:val="25"/>
-        </w:rPr>
-        <w:t xml:space="preserve">Un debate honesto: ¿se puede enseñar a pensar mejor?</w:t>
-      </w:r>
-    </w:p>
-    <w:p>
-      <w:pPr>
-        <w:pStyle w:val="BodyJ"/>
-      </w:pPr>
-      <w:r>
-        <w:t xml:space="preserve">Este libro toma posición en una controversia real de la educación médica, y la declara. De un lado, Croskerry y su tradición sostienen que conocer los sesgos y entrenar estrategias de debiasing mejora el diagnóstico (Croskerry, 2003; Croskerry et al., 2013a, 2013b). Del otro, Norman, Monteiro y colegas han acumulado evidencia incómoda. La mayoría de los errores diagnósticos se asocia a déficits de conocimiento más que a fallas puras de proceso; los cursos de «pensamiento crítico» generalizable transfieren poco; y obligar a reflexionar sistemáticamente sobre casos fáciles no mejora la precisión y consume tiempo (Norman et al., 2017; Monteiro &amp; Norman, 2013; Monteiro et al., 2020).</w:t>
-      </w:r>
-    </w:p>
-    <w:p>
-      <w:pPr>
-        <w:pStyle w:val="BodyJ"/>
-      </w:pPr>
-      <w:r>
-        <w:t xml:space="preserve">La posición es intermedia, pero no equidistante. Con los escépticos: no existe una habilidad general de «pensar bien» que flote por encima del conocimiento; la representación rica del problema —illness scripts, experiencia con feedback— es la condición de todo lo demás, y ningún método, HII-D incluido, compensa no saber medicina. Contra el escepticismo total: de esa evidencia no se sigue que la única intervención posible sea enseñar más contenido. Lo que se propone aquí no es vigilancia interna permanente ni listas universales, las versiones que la evidencia ha desinflado, sino artefactos externos y selectivos. Un lenguaje que obliga a graduar afirmaciones; una estructura de nota que conserva las capas; pausas activadas por disparadores definidos; circuitos de feedback que conviertan experiencia en calibración. Es una apuesta con compromisos observables (véase el capítulo 15): si estas herramientas no cambian conductas medibles, deben abandonarse como cualquier hipótesis mimada. Entre tanto, la controversia se enseña mejor de lo que se oculta: un residente que conoce el debate sabrá desconfiar por igual del catálogo de sesgos como solución universal y del nihilismo pedagógico como coartada.</w:t>
-      </w:r>
-    </w:p>
-    <w:p>
-      <w:pPr>
-        <w:pStyle w:val="Heading3"/>
-        <w:spacing w:after="120" w:before="280"/>
-      </w:pPr>
-      <w:r>
-        <w:rPr>
-          <w:rFonts w:ascii="Georgia" w:cs="Georgia" w:eastAsia="Georgia" w:hAnsi="Georgia"/>
-          <w:b/>
-          <w:bCs/>
-          <w:color w:val="2B2B2B"/>
-          <w:sz w:val="25"/>
-          <w:szCs w:val="25"/>
-        </w:rPr>
-        <w:t xml:space="preserve">Visitas de sala y entregas de turno</w:t>
+        <w:t xml:space="preserve">Tres palancas: la visita, la revisión de errores y la ficha</w:t>
       </w:r>
     </w:p>
     <w:p>
@@ -13167,27 +13014,10 @@
     </w:p>
     <w:p>
       <w:pPr>
-        <w:pStyle w:val="Heading3"/>
-        <w:spacing w:after="120" w:before="280"/>
-      </w:pPr>
-      <w:r>
-        <w:rPr>
-          <w:rFonts w:ascii="Georgia" w:cs="Georgia" w:eastAsia="Georgia" w:hAnsi="Georgia"/>
-          <w:b/>
-          <w:bCs/>
-          <w:color w:val="2B2B2B"/>
-          <w:sz w:val="25"/>
-          <w:szCs w:val="25"/>
-        </w:rPr>
-        <w:t xml:space="preserve">Conferencias de aprendizaje</w:t>
-      </w:r>
-    </w:p>
-    <w:p>
-      <w:pPr>
-        <w:pStyle w:val="BodyJ"/>
-      </w:pPr>
-      <w:r>
-        <w:t xml:space="preserve">La morbimortalidad tradicional puede centrarse en quién se equivocó o en una secuencia factual sin análisis cognitivo. Una revisión más útil reconstruye la evolución de la representación: qué se pensó en cada punto, qué señales estaban disponibles, qué información faltó, qué condiciones favorecieron la inercia y qué barrera podría permitir corrección futura. La viñeta 6 del cuaderno de casos es un ejemplo del formato: capas, oportunidades y barreras, sin moralismo retrospectivo.</w:t>
+        <w:pStyle w:val="BodyJ"/>
+      </w:pPr>
+      <w:r>
+        <w:t xml:space="preserve">La segunda palanca es la revisión de errores, y tiene una forma pública y otra privada. La morbimortalidad tradicional puede centrarse en quién se equivocó o en una secuencia factual sin análisis cognitivo. Una revisión más útil reconstruye la evolución de la representación: qué se pensó en cada punto, qué señales estaban disponibles, qué información faltó, qué condiciones favorecieron la inercia y qué barrera podría permitir corrección futura. La viñeta 6 del cuaderno de casos es un ejemplo del formato: capas, oportunidades y barreras, sin moralismo retrospectivo.</w:t>
       </w:r>
     </w:p>
     <w:p>
@@ -13200,27 +13030,10 @@
     </w:p>
     <w:p>
       <w:pPr>
-        <w:pStyle w:val="Heading3"/>
-        <w:spacing w:after="120" w:before="280"/>
-      </w:pPr>
-      <w:r>
-        <w:rPr>
-          <w:rFonts w:ascii="Georgia" w:cs="Georgia" w:eastAsia="Georgia" w:hAnsi="Georgia"/>
-          <w:b/>
-          <w:bCs/>
-          <w:color w:val="2B2B2B"/>
-          <w:sz w:val="25"/>
-          <w:szCs w:val="25"/>
-        </w:rPr>
-        <w:t xml:space="preserve">Feedback diagnóstico</w:t>
-      </w:r>
-    </w:p>
-    <w:p>
-      <w:pPr>
-        <w:pStyle w:val="BodyJ"/>
-      </w:pPr>
-      <w:r>
-        <w:t xml:space="preserve">Los médicos necesitan saber qué ocurrió con pacientes derivados, dados de alta o transferidos. Sistemas simples pueden devolver diagnósticos finales, resultados discrepantes, reconsultas y cambios terapéuticos. La calibración requiere series, no recuerdos aislados.</w:t>
+        <w:pStyle w:val="BodyJ"/>
+      </w:pPr>
+      <w:r>
+        <w:t xml:space="preserve">La forma privada es el feedback diagnóstico: los médicos necesitan saber qué ocurrió con pacientes derivados, dados de alta o transferidos. Sistemas simples pueden devolver diagnósticos finales, resultados discrepantes, reconsultas y cambios terapéuticos. La calibración requiere series, no recuerdos aislados.</w:t>
       </w:r>
     </w:p>
     <w:p>
@@ -13229,23 +13042,6 @@
       </w:pPr>
       <w:r>
         <w:t xml:space="preserve">Un portafolio privado puede registrar: hipótesis principal, confianza aproximada, alternativa relevante, desenlace y aprendizaje. No busca puntuar moralmente; busca detectar patrones: sobreconfianza en un dominio, subestimación de recurrencias, tendencia a tratar cultivos sin síndrome o dificultad para reconocer diagnósticos funcionales. El Taller 5 es su versión mínima. El portafolio como instrumento docente tiene además desarrollo propio en la educación médica latinoamericana, incluida la validación en español de instrumentos para evaluar su uso (Riquelme et al., 2011).</w:t>
-      </w:r>
-    </w:p>
-    <w:p>
-      <w:pPr>
-        <w:pStyle w:val="Heading3"/>
-        <w:spacing w:after="120" w:before="280"/>
-      </w:pPr>
-      <w:r>
-        <w:rPr>
-          <w:rFonts w:ascii="Georgia" w:cs="Georgia" w:eastAsia="Georgia" w:hAnsi="Georgia"/>
-          <w:b/>
-          <w:bCs/>
-          <w:color w:val="2B2B2B"/>
-          <w:sz w:val="25"/>
-          <w:szCs w:val="25"/>
-        </w:rPr>
-        <w:t xml:space="preserve">Lenguaje institucional</w:t>
       </w:r>
     </w:p>
     <w:p>
@@ -15319,7 +15115,7 @@
         <w:pStyle w:val="BodyJ"/>
       </w:pPr>
       <w:r>
-        <w:t xml:space="preserve">Una o dos frases que expresen la naturaleza del evento, el grado de inferencia, la incertidumbre crítica y el efecto sobre la conducta.</w:t>
+        <w:t xml:space="preserve">Una o dos frases que expresen la naturaleza del evento, la inferencia con su grado, la incertidumbre crítica y el efecto sobre la conducta.</w:t>
       </w:r>
     </w:p>
     <w:p>
@@ -18321,7 +18117,7 @@
         <w:t xml:space="preserve">Densidad epistémica∗.</w:t>
       </w:r>
       <w:r>
-        <w:t xml:space="preserve"> Propiedad de una formulación clínica que conserva los ejes que cambian la interpretación (tiempo, severidad, mecanismo, evidencia contraria, consecuencia) en lugar de sólo abreviar.</w:t>
+        <w:t xml:space="preserve"> Propiedad de una formulación clínica que conserva lo que una frase pierde con más frecuencia —procedencia, temporalidad, transparencia inferencial, calibración modal, relevancia decisional y revisabilidad: las seis dimensiones de auditoría del capítulo 4— en lugar de sólo abreviar.</w:t>
       </w:r>
     </w:p>
     <w:p>
@@ -18441,7 +18237,7 @@
         <w:t xml:space="preserve">Estado del razonador∗.</w:t>
       </w:r>
       <w:r>
-        <w:t xml:space="preserve"> Condiciones en que se produce un juicio clínico —sueño, horas de turno, hora del día, ánimo, preocupaciones ajenas al caso—, tratadas como un hecho de la capa H sobre la confiabilidad del instrumento que infiere y como disparador de pausa o de segundo lector. Pensar cuesta, y el costo no es constante.</w:t>
+        <w:t xml:space="preserve"> Condiciones en que se produce un juicio clínico —hora del día, horas de turno, sueño, ánimo, preocupación ajena al caso—, tratadas como un hecho de la capa H sobre la confiabilidad del instrumento que infiere y como disparador de pausa o de segundo lector. Pensar cuesta, y el costo no es constante.</w:t>
       </w:r>
     </w:p>
     <w:p>
@@ -18486,7 +18282,7 @@
         <w:t xml:space="preserve">Frase medular∗.</w:t>
       </w:r>
       <w:r>
-        <w:t xml:space="preserve"> Formulación breve que condensa la naturaleza del evento, el elemento que cambia el riesgo, el límite principal de certeza y su efecto sobre la conducta.</w:t>
+        <w:t xml:space="preserve"> Formulación breve que condensa la naturaleza del evento, la inferencia con su grado, la incertidumbre crítica y el efecto sobre la conducta: las cuatro capas de HII-D en una o dos frases.</w:t>
       </w:r>
     </w:p>
     <w:p>
@@ -18531,7 +18327,7 @@
         <w:t xml:space="preserve">HII-D∗.</w:t>
       </w:r>
       <w:r>
-        <w:t xml:space="preserve"> Heurística de escritura y deliberación que ordena el razonamiento en Hechos, Inferencias, Incertidumbre y Decisión, más un movimiento transversal de reevaluación. No validada como instrumento.</w:t>
+        <w:t xml:space="preserve"> Heurística de escritura y deliberación que, a partir de una pregunta operativa, ordena el razonamiento en Hechos, Inferencias, Incertidumbre y Decisión, más un movimiento transversal de reevaluación. No validada como instrumento.</w:t>
       </w:r>
     </w:p>
     <w:p>
@@ -18741,7 +18537,7 @@
         <w:t xml:space="preserve">Pausa diagnóstica (diagnostic time-out).</w:t>
       </w:r>
       <w:r>
-        <w:t xml:space="preserve"> Interrupción breve y selectiva del flujo clínico, activada por disparadores definidos (reconsulta, evolución discordante, transferencia), para reformular el caso sin su etiqueta y localizar la incertidumbre peligrosa.</w:t>
+        <w:t xml:space="preserve"> Interrupción breve y selectiva del flujo clínico, activada por disparadores definidos (reconsulta, evolución inesperada o discordante con el diagnóstico, transición de cuidados, estado del razonador), para reformular el caso sin su etiqueta y localizar la incertidumbre peligrosa.</w:t>
       </w:r>
     </w:p>
     <w:p>

</xml_diff>

<commit_message>
Entregables reconstruidos tras la segunda tanda de coherencia y README punto 40
DOCX, PDF y EPUB regenerados desde las fuentes de 3ef36e1: 166 páginas
(162 de cuerpo), TOC 40/40 estable, EPUB con 44 capítulos, cero
comillas rectas. Sondas: los cuatro títulos nuevos, las frases partidas
y las variaciones de «por eso» presentes; «exactamente» en 3 y «por
eso» en 13. El README registra la segunda tanda y la medida de citas
descartada tras medirla.

Co-Authored-By: Claude Fable 5.1 <noreply@anthropic.com>
Claude-Session: https://claude.ai/code/session_01SPkhDdVzUCxJwqq61ddeLW
</commit_message>
<xml_diff>
--- a/libro/Hechos_inferencias_incertidumbre_edicion_revisada.docx
+++ b/libro/Hechos_inferencias_incertidumbre_edicion_revisada.docx
@@ -146,7 +146,7 @@
           <w:sz w:val="18"/>
           <w:szCs w:val="18"/>
         </w:rPr>
-        <w:t xml:space="preserve">Edición de trabajo, 2026. Ensayo académico dirigido a profesionales de la salud. Las escenas narradas en primera persona condensan experiencias reales del autor y situaciones clínicas compuestas: conservan el conflicto cognitivo y moral que las originó, pero no reproducen literalmente un único episodio ni permiten identificar pacientes, familiares, profesionales o instituciones; los datos, circunstancias y trayectorias fueron modificados y combinados con fines docentes. Lo mismo vale para todas las viñetas clínicas del libro. Carmen es un personaje clínico compuesto, construido para acompañar el argumento; no corresponde a una paciente identificable. Este manuscrito fue desarrollado a partir de ideas y formulaciones del autor, con asistencia de inteligencia artificial en investigación, redacción y edición; la responsabilidad por el contenido, las tesis y los errores es del autor. No sustituye guías clínicas, evaluación especializada ni juicio profesional en casos individuales.</w:t>
+        <w:t xml:space="preserve">Edición de trabajo, 2026. Ensayo académico dirigido a profesionales de la salud. Las escenas narradas en primera persona condensan experiencias reales del autor y situaciones clínicas compuestas: conservan el conflicto cognitivo y moral que las originó, pero no reproducen literalmente un único episodio ni permiten identificar pacientes, familiares, profesionales o instituciones. Los datos, circunstancias y trayectorias fueron modificados y combinados con fines docentes. Lo mismo vale para todas las viñetas clínicas del libro. Carmen es un personaje clínico compuesto, construido para acompañar el argumento; no corresponde a una paciente identificable. Este manuscrito fue desarrollado a partir de ideas y formulaciones del autor, con asistencia de inteligencia artificial en investigación, redacción y edición; la responsabilidad por el contenido, las tesis y los errores es del autor. No sustituye guías clínicas, evaluación especializada ni juicio profesional en casos individuales.</w:t>
       </w:r>
     </w:p>
     <w:p>
@@ -3008,7 +3008,7 @@
         <w:pStyle w:val="BodyJ"/>
       </w:pPr>
       <w:r>
-        <w:t xml:space="preserve">Bohm, físico y filósofo, agregó el diagnóstico del bloqueo. La creatividad es ante todo percepción de un orden nuevo en lo que ya está a la vista, y su obstáculo habitual no es la falta de inteligencia sino el apego a la infraestructura tácita de ideas con la que se trabaja sin verla (Bohm, 1996; Bohm &amp; Peat, 1987). Es el peligro de la fluidez que examinará el capítulo 6: el patrón conocido no sólo responde rápido — también impide percibir. Por eso varias de las herramientas que siguen, y que parecen puramente disciplinarias, son además técnicas de creatividad: reformular el caso sin usar la etiqueta (capítulo 8) es un procedimiento para forzar la percepción de otro orden posible en los mismos hechos.</w:t>
+        <w:t xml:space="preserve">Bohm, físico y filósofo, agregó el diagnóstico del bloqueo. La creatividad es ante todo percepción de un orden nuevo en lo que ya está a la vista, y su obstáculo habitual no es la falta de inteligencia sino el apego a la infraestructura tácita de ideas con la que se trabaja sin verla (Bohm, 1996; Bohm &amp; Peat, 1987). Es el peligro de la fluidez que examinará el capítulo 6: el patrón conocido no sólo responde rápido — también impide percibir. De ahí que varias de las herramientas que siguen, y que parecen puramente disciplinarias, sean además técnicas de creatividad: reformular el caso sin usar la etiqueta (capítulo 8) es un procedimiento para forzar la percepción de otro orden posible en los mismos hechos.</w:t>
       </w:r>
     </w:p>
     <w:p>
@@ -3032,7 +3032,7 @@
         <w:pStyle w:val="BodyJ"/>
       </w:pPr>
       <w:r>
-        <w:t xml:space="preserve">Por eso a la generación le sigue, de inmediato, la prueba de resistencia: generar con libertad y podar con severidad no son virtudes rivales, sino las dos mitades del mismo juicio.</w:t>
+        <w:t xml:space="preserve">A la generación le sigue, de inmediato, la prueba de resistencia: generar con libertad y podar con severidad no son virtudes rivales, sino las dos mitades del mismo juicio.</w:t>
       </w:r>
     </w:p>
     <w:p>
@@ -3153,7 +3153,7 @@
         <w:pStyle w:val="BodyJ"/>
       </w:pPr>
       <w:r>
-        <w:t xml:space="preserve">La abducción elige la explicación más plausible; la predicción pregunta qué debería observarse después; la decisión evalúa qué acción es preferible aun si la explicación permanece abierta. En ocasiones varias etiologías convergen en el mismo manejo inicial. En otras, una pequeña diferencia causal cambia por completo la conducta. Por eso, el diagnóstico diferencial debe organizarse según discriminación clínica y no sólo semejanza nominal.</w:t>
+        <w:t xml:space="preserve">La abducción elige la explicación más plausible; la predicción pregunta qué debería observarse después; la decisión evalúa qué acción es preferible aun si la explicación permanece abierta. En ocasiones varias etiologías convergen en el mismo manejo inicial. En otras, una pequeña diferencia causal cambia por completo la conducta. El diagnóstico diferencial debe organizarse, entonces, según discriminación clínica y no sólo semejanza nominal.</w:t>
       </w:r>
     </w:p>
     <w:p>
@@ -4599,7 +4599,7 @@
         <w:pStyle w:val="BodyJ"/>
       </w:pPr>
       <w:r>
-        <w:t xml:space="preserve">El segundo es de Stephen Toulmin, que propuso la anatomía mínima de toda afirmación práctica: un dato, una conclusión, la garantía que autoriza pasar del uno a la otra, el respaldo de esa garantía, un calificador modal que gradúa la fuerza («probablemente», «salvo que…») y las condiciones de refutación (Toulmin, 1958). La frase medular es, sin habérselo propuesto, un argumento de Toulmin comprimido: hechos (dato), inferencia graduada (conclusión con calificador), incertidumbre crítica (refutación posible) y decisión (lo que la garantía autoriza a hacer). Escribir «bacteriemia por gramnegativos en contexto de obstrucción: foco abdominal altamente probable, salvo hallazgo alternativo en imagen» es exhibir la anatomía completa; escribir «sepsis abdominal» es esconderla. Toulmin, que décadas después defendió junto a Jonsen la casuística clínica como forma legítima de razonamiento moral (Jonsen &amp; Toulmin, 1988), habría reconocido en la ficha bien escrita a su silogismo práctico favorito. La Figura 5 despliega esa anatomía sobre una frase de Carmen.</w:t>
+        <w:t xml:space="preserve">El segundo es de Stephen Toulmin, que propuso la anatomía mínima de toda afirmación práctica: un dato, una conclusión, la garantía que autoriza pasar del uno a la otra y el respaldo de esa garantía. A eso agregó un calificador modal que gradúa la fuerza («probablemente», «salvo que…») y las condiciones de refutación (Toulmin, 1958). La frase medular es, sin habérselo propuesto, un argumento de Toulmin comprimido: hechos (dato), inferencia graduada (conclusión con calificador), incertidumbre crítica (refutación posible) y decisión (lo que la garantía autoriza a hacer). Escribir «bacteriemia por gramnegativos en contexto de obstrucción: foco abdominal altamente probable, salvo hallazgo alternativo en imagen» es exhibir la anatomía completa; escribir «sepsis abdominal» es esconderla. Toulmin, que décadas después defendió junto a Jonsen la casuística clínica como forma legítima de razonamiento moral (Jonsen &amp; Toulmin, 1988), habría reconocido en la ficha bien escrita a su silogismo práctico favorito. La Figura 5 despliega esa anatomía sobre una frase de Carmen.</w:t>
       </w:r>
     </w:p>
     <w:tbl>
@@ -5384,7 +5384,7 @@
         <w:pStyle w:val="BodyJ"/>
       </w:pPr>
       <w:r>
-        <w:t xml:space="preserve">La investigación contemporánea no se conforma con preguntar «qué tan seguro estás». Distingue y mide por separado tres cosas: el sesgo metacognitivo (la tendencia global a declarar confianzas altas o bajas), la calibración (si el 80% declarado corresponde a un 80% de aciertos reales) y la sensibilidad metacognitiva (si la confianza sube cuando aciertas y baja cuando te equivocas, independiente de su nivel absoluto). Para esta última existe un estándar: el meta-d′, que expresa cuánta de la información disponible para decidir aprovecha el observador al evaluar su propia decisión; dividido por la sensibilidad de la tarea (el llamado M-ratio), permite comparar personas y dominios (Maniscalco &amp; Lau, 2012; Fleming &amp; Lau, 2014). Dos hallazgos de esta literatura importan a la clínica: la sensibilidad metacognitiva varía sustancialmente entre individuos de igual desempeño, y tiene un componente parcialmente general junto a componentes específicos de dominio (Rouault et al., 2018) — ser buen juez de las propias respuestas en un ámbito no garantiza serlo en otro. La letra chica también importa: estas medidas exigen decenas de juicios comparables con desenlace conocido, justo lo que la práctica clínica no devuelve por sí sola. Esa es la justificación técnica del portafolio del Taller 5: no calcula un meta-d′ formal, pero construye la serie sin la cual ninguna medición —ni siquiera la intuitiva— es posible.</w:t>
+        <w:t xml:space="preserve">La investigación contemporánea no se conforma con preguntar «qué tan seguro estás». Distingue y mide por separado tres cosas: el sesgo metacognitivo (la tendencia global a declarar confianzas altas o bajas), la calibración (si el 80% declarado corresponde a un 80% de aciertos reales) y la sensibilidad metacognitiva (si la confianza sube cuando aciertas y baja cuando te equivocas, independiente de su nivel absoluto). Para esta última existe un estándar: el meta-d′, que expresa cuánta de la información disponible para decidir aprovecha el observador al evaluar su propia decisión; dividido por la sensibilidad de la tarea (el llamado M-ratio), permite comparar personas y dominios (Maniscalco &amp; Lau, 2012; Fleming &amp; Lau, 2014). Dos hallazgos de esta literatura importan a la clínica: la sensibilidad metacognitiva varía sustancialmente entre individuos de igual desempeño, y tiene un componente parcialmente general junto a componentes específicos de dominio (Rouault et al., 2018). Ser buen juez de las propias respuestas en un ámbito no garantiza serlo en otro. La letra chica también importa: estas medidas exigen decenas de juicios comparables con desenlace conocido, justo lo que la práctica clínica no devuelve por sí sola. Esa es la justificación técnica del portafolio del Taller 5: no calcula un meta-d′ formal, pero construye la serie sin la cual ninguna medición —ni siquiera la intuitiva— es posible.</w:t>
       </w:r>
     </w:p>
     <w:p>
@@ -5417,7 +5417,7 @@
         <w:pStyle w:val="BodyJ"/>
       </w:pPr>
       <w:r>
-        <w:t xml:space="preserve">Mi falso cólico renal de aquella noche reunía todas las claves de la fluidez cognitiva de Koriat: el patrón clínico era arquetípico, yo había tratado decenas de cólicos similares en urgencias y el relato cerraba sin fisuras. Pero ninguna de esas señales internas medía lo único determinante para la sobrevida del enfermo: la probabilidad previa de que, en un hipertenso de casi setenta años que debuta con dolor lumbar agudo, una catástrofe aórtica estuviera imitando el patrón urológico. La pregunta metacognitiva útil no es «¿debo confiar en mi intuición?», sino «¿bajo qué condiciones ecológicas es confiable esta intuición?». Como argumentaron Kahneman y Klein, la validez intuitiva aumenta cuando el entorno posee regularidades estables, existe exposición extensa y el clínico recibe retroalimentación oportuna sobre sus aciertos y errores; se desploma, en cambio, frente a presentaciones solapadas donde el desenlace real ocurre horas después y en otro servicio (Kahneman &amp; Klein, 2009).</w:t>
+        <w:t xml:space="preserve">Mi falso cólico renal de aquella noche reunía todas las claves de la fluidez cognitiva de Koriat: el patrón clínico era arquetípico, yo había tratado decenas de cólicos similares en urgencias y el relato cerraba sin fisuras. Pero ninguna de esas señales internas medía lo único determinante para la sobrevida del enfermo: la probabilidad previa de que, en un hipertenso de casi setenta años que debuta con dolor lumbar agudo, una catástrofe aórtica estuviera imitando el patrón urológico. La pregunta metacognitiva útil no es «¿debo confiar en mi intuición?», sino «¿bajo qué condiciones ecológicas es confiable esta intuición?». Como argumentaron Kahneman y Klein, la validez intuitiva aumenta cuando el entorno posee regularidades estables, existe exposición extensa y el clínico recibe retroalimentación oportuna sobre sus aciertos y errores. Se desploma, en cambio, frente a presentaciones solapadas donde el desenlace real ocurre horas después y en otro servicio (Kahneman &amp; Klein, 2009).</w:t>
       </w:r>
     </w:p>
     <w:p>
@@ -5809,6 +5809,23 @@
     </w:p>
     <w:p>
       <w:pPr>
+        <w:pStyle w:val="Heading3"/>
+        <w:spacing w:after="120" w:before="280"/>
+      </w:pPr>
+      <w:r>
+        <w:rPr>
+          <w:rFonts w:ascii="Georgia" w:cs="Georgia" w:eastAsia="Georgia" w:hAnsi="Georgia"/>
+          <w:b/>
+          <w:bCs/>
+          <w:color w:val="2B2B2B"/>
+          <w:sz w:val="25"/>
+          <w:szCs w:val="25"/>
+        </w:rPr>
+        <w:t xml:space="preserve">El saber hacer y el quiebre</w:t>
+      </w:r>
+    </w:p>
+    <w:p>
+      <w:pPr>
         <w:pStyle w:val="BodyJ"/>
       </w:pPr>
       <w:r>
@@ -5997,7 +6014,7 @@
         <w:pStyle w:val="BodyJ"/>
       </w:pPr>
       <w:r>
-        <w:t xml:space="preserve">Mi error con aquella colecistitis, analizado como trayectoria ecológica y no como pecado mental aislado, recorrió al menos cinco estaciones. Primero, una frase heredada de urgencias («ITU a repetición») que ingresó a mi nota con jerarquía de hecho comprobado. Segundo, un error de ponderación bayesiana: olvidé que la bacteriuria asintomática ronda el 20% en mujeres de ochenta años o más que viven en la comunidad, y es todavía más frecuente en las institucionalizadas (Nicolle et al., 2019), de modo que un urocultivo positivo sin disuria ni dolor lumbar tenía un valor predictivo bajísimo para explicar su postración aguda. Tercero, un examen abdominal superficial practicado por trámite porque mi hipótesis ya estaba cerrada. Cuarto, cuarenta y ocho horas de falta de respuesta clínica que inmunicé con un lugar común geriátrico («los adultos mayores tardan más en prender con el antibiótico»). Y quinto, un diseño de trabajo sin barreras de salida: ningún criterio escrito de reevaluación a las 48 horas ni una pregunta en la visita de sala que desafiara la etiqueta inicial. El sesgo de anclaje estuvo presente, pero el error fue el sistema completo operando en línea. La responsabilidad cognitiva individual no desaparece; se vuelve contextual. La Figura 8 dibuja la trayectoria y marca dónde una barrera la habría interceptado.</w:t>
+        <w:t xml:space="preserve">Mi error con aquella colecistitis, analizado como trayectoria ecológica y no como pecado mental aislado, recorrió al menos cinco estaciones. Primero, una frase heredada de urgencias («ITU a repetición») que ingresó a mi nota con jerarquía de hecho comprobado. Segundo, un error de ponderación bayesiana: olvidé que la bacteriuria asintomática ronda el 20% en mujeres de ochenta años o más que viven en la comunidad, y es todavía más frecuente en las institucionalizadas (Nicolle et al., 2019). De modo que un urocultivo positivo sin disuria ni dolor lumbar tenía un valor predictivo bajísimo para explicar su postración aguda. Tercero, un examen abdominal superficial practicado por trámite porque mi hipótesis ya estaba cerrada. Cuarto, cuarenta y ocho horas de falta de respuesta clínica que inmunicé con un lugar común geriátrico («los adultos mayores tardan más en prender con el antibiótico»). Y quinto, un diseño de trabajo sin barreras de salida: ningún criterio escrito de reevaluación a las 48 horas ni una pregunta en la visita de sala que desafiara la etiqueta inicial. El sesgo de anclaje estuvo presente, pero el error fue el sistema completo operando en línea. La responsabilidad cognitiva individual no desaparece; se vuelve contextual. La Figura 8 dibuja la trayectoria y marca dónde una barrera la habría interceptado.</w:t>
       </w:r>
     </w:p>
     <w:tbl>
@@ -6402,7 +6419,7 @@
         <w:pStyle w:val="BodyJ"/>
       </w:pPr>
       <w:r>
-        <w:t xml:space="preserve">En la visita médica de las 8:30, el residente presenta la cama 12 en cuarenta segundos: «Pielonefritis aguda en su tercer día de tratamiento antibiótico, afebril, con buena respuesta clínica». La internista a cargo de la sala mira dos segundos la curva de signos vitales y los exámenes en pantalla y le pide: «Preséntamelo de nuevo, pero sin usar la palabra pielonefritis ni infección». El residente toma aire y reestructura: «Hombre con lesión medular completa y usuario crónico de sonda Foley; tras recambio traumático de sonda presentó orina turbia, piuria y urocultivo positivo, manteniéndose siempre afebril, hemodinámicamente estable y sin disuria ni dolor lumbar evaluables por su nivel lesional; cursa con PCR elevada estable y tiene un cáncer renal metastásico activo como causa inflamatoria concomitante...». Antes de terminar la tercera oración, ya nadie en la sala cree que el paciente tenga una pielonefritis. Ese es exactamente el punto de este capítulo.</w:t>
+        <w:t xml:space="preserve">En la visita médica de las 8:30, el residente presenta la cama 12 en cuarenta segundos: «Pielonefritis aguda en su tercer día de tratamiento antibiótico, afebril, con buena respuesta clínica». La internista a cargo de la sala mira dos segundos la curva de signos vitales y los exámenes en pantalla y le pide: «Preséntamelo de nuevo, pero sin usar la palabra pielonefritis ni infección». El residente toma aire y reestructura: «Hombre con lesión medular completa y usuario crónico de sonda Foley; tras recambio traumático de sonda presentó orina turbia, piuria y urocultivo positivo, manteniéndose siempre afebril, hemodinámicamente estable y sin disuria ni dolor lumbar evaluables por su nivel lesional; cursa con PCR elevada estable y tiene un cáncer renal metastásico activo como causa inflamatoria concomitante...». Antes de terminar la tercera oración, ya nadie en la sala cree que el paciente tenga una pielonefritis. Ese es el punto de este capítulo.</w:t>
       </w:r>
     </w:p>
     <w:p>
@@ -6484,47 +6501,7 @@
         <w:pStyle w:val="BodyJ"/>
       </w:pPr>
       <w:r>
-        <w:t xml:space="preserve">La evidencia es más dura de lo que la cultura hospitalaria admite. Un metaanálisis de sesenta estudios estimó que menos de treinta horas sin dormir reducen el desempeño cognitivo general de los médicos en cerca de una desviación estándar, y el desempeño clínico en más de una y media (Philibert, 2005). El médico de las cuatro de la mañana no es el mismo instrumento que el de las nueve. Cuando se asignó al azar a veinticuatro internos de dos unidades de cuidados intensivos a turnos tradicionales con guardias de 24 horas o más, o a turnos acotados a dieciséis, los turnos largos produjeron un 36% más de errores graves, y los errores diagnósticos graves se multiplicaron por más de cinco (Landrigan et al., 2004). El dato es de internos y de cuidados intensivos; extenderlo a cualquier guardia es una inferencia, no un hecho. El efecto no exige noches. En más de 21.000 consultas por infección respiratoria, la probabilidad de salir con un antibiótico subió hora a hora dentro de la misma sesión de policlínico, con independencia del paciente y del diagnóstico: unas chances un 26% mayores en la cuarta hora que en la primera (Linder et al., 2014). Nadie decidió prescribir peor a las cuatro de la tarde; el umbral se movió solo, con el cansancio. Y el ánimo tampoco es neutro: en un experimento clásico, los médicos a quienes se indujo un afecto positivo integraron antes la información de un caso y se anclaron menos en su primera hipótesis (Estrada, Isen &amp; Young, 1997). El estado afectivo no acompaña al razonamiento; lo configura. Maturana lo había dicho desde la biología, en una formulación que esta sección adopta: las emociones son disposiciones corporales que especifican el dominio de acciones en que un organismo puede moverse en cada momento (Maturana, 1990). Un ánimo no es ruido sobre el razonamiento; es el repertorio de pensamientos y conductas disponibles, y por eso debe figurar entre los hechos.</w:t>
-      </w:r>
-    </w:p>
-    <w:p>
-      <w:pPr>
-        <w:pStyle w:val="BodyJ"/>
-      </w:pPr>
-      <w:r>
-        <w:t xml:space="preserve">¿Qué hacer con esto, si no se puede decretar el descanso ni el buen ánimo? Tres cosas, todas coherentes con el resto del libro.</w:t>
-      </w:r>
-    </w:p>
-    <w:p>
-      <w:pPr>
-        <w:pStyle w:val="BodyJ"/>
-      </w:pPr>
-      <w:r>
-        <w:t xml:space="preserve">Primero, tratar el propio estado como un hecho de la capa H. «¿En qué condiciones estoy pensando esto?» es una pregunta con respuesta observable: la hora, las horas de turno, lo dormido, el ánimo, la preocupación ajena al caso que ocupa la mitad de la atención. Y esa respuesta es un dato sobre la confiabilidad del instrumento que está produciendo las inferencias, tan pertinente como la calibración de un gasómetro. Reconocerlo no es debilidad, sino la trazabilidad que el capítulo 1 exige a cualquier observación, aplicada al observador. Por eso la lista de disparadores de la sección anterior tiene un ítem más: el estado del razonador. Turno largo, madrugada, ánimo alterado o una preocupación que no es el paciente son condiciones que, por sí solas, justifican la pausa breve o el segundo lector, aunque el caso parezca fácil. Sobre todo si parece fácil.</w:t>
-      </w:r>
-    </w:p>
-    <w:p>
-      <w:pPr>
-        <w:pStyle w:val="BodyJ"/>
-      </w:pPr>
-      <w:r>
-        <w:t xml:space="preserve">Segundo, no apostar a la voluntad. Las herramientas que más valen a las cuatro de la mañana son las que no necesitan energía para activarse: el criterio de reapertura escrito cuando todavía había lucidez, la pregunta fija de la entrega de turno, la regla de ocho ítems al lado de la camilla, la versión de sesenta segundos. Son prótesis del esfuerzo: trasladan el pensamiento desde el momento en que no está disponible hacia el momento en que lo estuvo, o hacia otra persona. El diseño reemplaza al ánimo porque el ánimo no es confiable, y esa es la razón para diseñar.</w:t>
-      </w:r>
-    </w:p>
-    <w:p>
-      <w:pPr>
-        <w:pStyle w:val="BodyJ"/>
-      </w:pPr>
-      <w:r>
-        <w:t xml:space="preserve">Tercero, usar el relevo. La entrega de turno, además de transferir información, es el momento en que un cerebro descansado revisa lo que decidió uno cansado, y eso cambia qué se entrega. «Lo vi a las cinco, con doce horas encima; la hipótesis es X y no alcancé a pensar en Y» es una frase que un equipo maduro puede decir sin vergüenza, y vale más que «sin novedades». El capítulo 13 desarrolla la mitad colectiva de esta idea; el capítulo 16, su mitad institucional, porque los turnos y el descanso son condiciones epistémicas antes que laborales.</w:t>
-      </w:r>
-    </w:p>
-    <w:p>
-      <w:pPr>
-        <w:pStyle w:val="BodyJ"/>
-      </w:pPr>
-      <w:r>
-        <w:t xml:space="preserve">Nada de esto convierte al clínico cansado en lúcido. Lo convierte en alguien que sabe en qué estado está pensando y organiza el trabajo para que su juicio sea revisado por un instrumento mejor calibrado: una regla, una nota escrita antes, un colega que acaba de llegar.</w:t>
+        <w:t xml:space="preserve">La evidencia es más dura de lo que la cultura hospitalaria admite. Un metaanálisis de sesenta estudios estimó que menos de treinta horas sin dormir reducen el desempeño cognitivo general de los médicos en cerca de una desviación estándar, y el desempeño clínico en más de una y media (Philibert, 2005). El médico de las cuatro de la mañana no es el mismo instrumento que el de las nueve. Cuando se asignó al azar a veinticuatro internos de dos unidades de cuidados intensivos a turnos tradicionales con guardias de 24 horas o más, o a turnos acotados a dieciséis horas, los turnos largos produjeron un 36% más de errores graves. Los errores diagnósticos graves se multiplicaron por más de cinco (Landrigan et al., 2004). El dato es de internos y de cuidados intensivos; extenderlo a cualquier guardia es una inferencia, no un hecho. El efecto no exige noches. En más de 21.000 consultas por infección respiratoria, la probabilidad de salir con un antibiótico subió hora a hora dentro de la misma sesión de policlínico, con independencia del paciente y del diagnóstico: unas chances un 26% mayores en la cuarta hora que en la primera (Linder et al., 2014). Nadie decidió prescribir peor a las cuatro de la tarde; el umbral se movió solo, con el cansancio. Y el ánimo tampoco es neutro: en un experimento clásico, los médicos a quienes se indujo un afecto positivo integraron antes la información de un caso y se anclaron menos en su primera hipótesis (Estrada, Isen &amp; Young, 1997). El estado afectivo no acompaña al razonamiento; lo configura. Maturana lo había dicho desde la biología, en una formulación que esta sección adopta: las emociones son disposiciones corporales que especifican el dominio de acciones en que un organismo puede moverse en cada momento (Maturana, 1990). Un ánimo no es ruido sobre el razonamiento; es el repertorio de pensamientos y conductas disponibles, y debe figurar entre los hechos.</w:t>
       </w:r>
     </w:p>
     <w:p>
@@ -6541,6 +6518,63 @@
           <w:sz w:val="25"/>
           <w:szCs w:val="25"/>
         </w:rPr>
+        <w:t xml:space="preserve">Qué hacer con el estado del que piensa</w:t>
+      </w:r>
+    </w:p>
+    <w:p>
+      <w:pPr>
+        <w:pStyle w:val="BodyJ"/>
+      </w:pPr>
+      <w:r>
+        <w:t xml:space="preserve">¿Qué hacer con esto, si no se puede decretar el descanso ni el buen ánimo? Tres cosas, todas coherentes con el resto del libro.</w:t>
+      </w:r>
+    </w:p>
+    <w:p>
+      <w:pPr>
+        <w:pStyle w:val="BodyJ"/>
+      </w:pPr>
+      <w:r>
+        <w:t xml:space="preserve">Primero, tratar el propio estado como un hecho de la capa H. «¿En qué condiciones estoy pensando esto?» es una pregunta con respuesta observable: la hora, las horas de turno, lo dormido, el ánimo, la preocupación ajena al caso que ocupa la mitad de la atención. Y esa respuesta es un dato sobre la confiabilidad del instrumento que está produciendo las inferencias, tan pertinente como la calibración de un gasómetro. Reconocerlo no es debilidad, sino la trazabilidad que el capítulo 1 exige a cualquier observación, aplicada al observador. La lista de disparadores de la sección anterior tiene, por lo mismo, un ítem más: el estado del razonador. Turno largo, madrugada, ánimo alterado o una preocupación que no es el paciente son condiciones que, por sí solas, justifican la pausa breve o el segundo lector, aunque el caso parezca fácil. Sobre todo si parece fácil.</w:t>
+      </w:r>
+    </w:p>
+    <w:p>
+      <w:pPr>
+        <w:pStyle w:val="BodyJ"/>
+      </w:pPr>
+      <w:r>
+        <w:t xml:space="preserve">Segundo, no apostar a la voluntad. Las herramientas que más valen a las cuatro de la mañana son las que no necesitan energía para activarse: el criterio de reapertura escrito cuando todavía había lucidez, la pregunta fija de la entrega de turno, la regla de ocho ítems al lado de la camilla, la versión de sesenta segundos. Son prótesis del esfuerzo: trasladan el pensamiento desde el momento en que no está disponible hacia el momento en que lo estuvo, o hacia otra persona. El diseño reemplaza al ánimo porque el ánimo no es confiable, y esa es la razón para diseñar.</w:t>
+      </w:r>
+    </w:p>
+    <w:p>
+      <w:pPr>
+        <w:pStyle w:val="BodyJ"/>
+      </w:pPr>
+      <w:r>
+        <w:t xml:space="preserve">Tercero, usar el relevo. La entrega de turno, además de transferir información, es el momento en que un cerebro descansado revisa lo que decidió uno cansado, y eso cambia qué se entrega. «Lo vi a las cinco, con doce horas encima; la hipótesis es X y no alcancé a pensar en Y» es una frase que un equipo maduro puede decir sin vergüenza, y vale más que «sin novedades». El capítulo 13 desarrolla la mitad colectiva de esta idea; el capítulo 16, su mitad institucional, porque los turnos y el descanso son condiciones epistémicas antes que laborales.</w:t>
+      </w:r>
+    </w:p>
+    <w:p>
+      <w:pPr>
+        <w:pStyle w:val="BodyJ"/>
+      </w:pPr>
+      <w:r>
+        <w:t xml:space="preserve">Nada de esto convierte al clínico cansado en lúcido. Lo convierte en alguien que sabe en qué estado está pensando y organiza el trabajo para que su juicio sea revisado por un instrumento mejor calibrado: una regla, una nota escrita antes, un colega que acaba de llegar.</w:t>
+      </w:r>
+    </w:p>
+    <w:p>
+      <w:pPr>
+        <w:pStyle w:val="Heading3"/>
+        <w:spacing w:after="120" w:before="280"/>
+      </w:pPr>
+      <w:r>
+        <w:rPr>
+          <w:rFonts w:ascii="Georgia" w:cs="Georgia" w:eastAsia="Georgia" w:hAnsi="Georgia"/>
+          <w:b/>
+          <w:bCs/>
+          <w:color w:val="2B2B2B"/>
+          <w:sz w:val="25"/>
+          <w:szCs w:val="25"/>
+        </w:rPr>
         <w:t xml:space="preserve">Reflexión estructurada</w:t>
       </w:r>
     </w:p>
@@ -6549,7 +6583,7 @@
         <w:pStyle w:val="BodyJ"/>
       </w:pPr>
       <w:r>
-        <w:t xml:space="preserve">Mamede y colaboradores estudiaron la reflexión deliberada y encontraron que, en ciertos problemas complejos, comparar hipótesis mediante evidencia a favor y en contra puede mejorar la precisión diagnóstica (Mamede et al., 2008). El mismo grupo mostró después algo más específico: la exposición reciente a ciertos diagnósticos induce sesgo de disponibilidad en residentes, y la reflexión estructurada revierte ese efecto (Mamede et al., 2010) — la mejor evidencia disponible de que la pausa correcta no es un ritual, sino un antídoto con indicación precisa. Otros trabajos y revisiones muestran resultados variables, lo que impide convertir la reflexión en una receta universal (Graber et al., 2012; Lambe et al., 2016).</w:t>
+        <w:t xml:space="preserve">Mamede y colaboradores estudiaron la reflexión deliberada y encontraron que, en ciertos problemas complejos, comparar hipótesis mediante evidencia a favor y en contra puede mejorar la precisión diagnóstica (Mamede et al., 2008). El mismo grupo mostró después algo más específico: la exposición reciente a ciertos diagnósticos induce sesgo de disponibilidad en residentes, y la reflexión estructurada revierte ese efecto (Mamede et al., 2010). Es la mejor evidencia disponible de que la pausa correcta no es un ritual, sino un antídoto con indicación precisa. Otros trabajos y revisiones muestran resultados variables, lo que impide convertir la reflexión en una receta universal (Graber et al., 2012; Lambe et al., 2016).</w:t>
       </w:r>
     </w:p>
     <w:p>
@@ -7284,7 +7318,7 @@
         <w:pStyle w:val="BodyJ"/>
       </w:pPr>
       <w:r>
-        <w:t xml:space="preserve">Una deliberación bien formulada declara, por eso, qué proviene de estudios, qué se extrapola, qué aporta la historia individual, qué depende del contexto local y qué permanece desconocido. La competencia metacognitiva consiste en reconocer cuándo se está citando un resultado, cuándo extrapolando, cuándo suponiendo un mecanismo y cuándo una preferencia está inclinando la balanza. La pregunta final no es «¿existe evidencia?», sino «¿qué evidencia existe, para qué afirmación, con qué transportabilidad y con qué consecuencias para esta persona?».</w:t>
+        <w:t xml:space="preserve">Una deliberación bien formulada declara qué proviene de estudios, qué se extrapola, qué aporta la historia individual, qué depende del contexto local y qué permanece desconocido. La competencia metacognitiva consiste en reconocer cuándo se está citando un resultado, cuándo extrapolando, cuándo suponiendo un mecanismo y cuándo una preferencia está inclinando la balanza. La pregunta final no es «¿existe evidencia?», sino «¿qué evidencia existe, para qué afirmación, con qué transportabilidad y con qué consecuencias para esta persona?».</w:t>
       </w:r>
     </w:p>
     <w:p>
@@ -7739,6 +7773,23 @@
     </w:p>
     <w:p>
       <w:pPr>
+        <w:pStyle w:val="Heading3"/>
+        <w:spacing w:after="120" w:before="280"/>
+      </w:pPr>
+      <w:r>
+        <w:rPr>
+          <w:rFonts w:ascii="Georgia" w:cs="Georgia" w:eastAsia="Georgia" w:hAnsi="Georgia"/>
+          <w:b/>
+          <w:bCs/>
+          <w:color w:val="2B2B2B"/>
+          <w:sz w:val="25"/>
+          <w:szCs w:val="25"/>
+        </w:rPr>
+        <w:t xml:space="preserve">Cuatro tópicos, proporcionalidad y deliberación</w:t>
+      </w:r>
+    </w:p>
+    <w:p>
+      <w:pPr>
         <w:pStyle w:val="BodyJ"/>
       </w:pPr>
       <w:r>
@@ -7750,7 +7801,7 @@
         <w:pStyle w:val="BodyJ"/>
       </w:pPr>
       <w:r>
-        <w:t xml:space="preserve">Dos ideas del mundo hispanohablante completan la caja. La primera es la proporcionalidad terapéutica: la obligación moral de implementar sólo aquellas medidas que guarden debida proporción entre los medios empleados y el resultado previsible (Taboada, 2000). El juicio de proporcionalidad integra pronóstico, cargas de la intervención y fines del paciente, y por eso depende por completo de la calidad epistémica de las capas anteriores. Un pronóstico inflado por certeza retórica no produce una decisión más esperanzadora; produce un juicio de proporcionalidad falso. La segunda es la deliberación como método (Gracia, 2001). Cuando los valores entran en conflicto, la decisión no se calcula, se delibera: identificar qué valores chocan, enumerar los cursos de acción extremos, buscar los intermedios y elegir el curso prudente que pueda defenderse en público. La deliberación es a los valores lo que el diagnóstico diferencial a las hipótesis: un método para no quedarse con la primera respuesta disponible. Los cursos extremos — «hacer todo», «no hacer nada» — casi nunca son los prudentes, y suelen ser los que se eligen cuando nadie deliberó.</w:t>
+        <w:t xml:space="preserve">Dos ideas del mundo hispanohablante completan la caja. La primera es la proporcionalidad terapéutica: la obligación moral de implementar sólo aquellas medidas que guarden debida proporción entre los medios empleados y el resultado previsible (Taboada, 2000). El juicio de proporcionalidad integra pronóstico, cargas de la intervención y fines del paciente, y depende por completo de la calidad epistémica de las capas anteriores. Un pronóstico inflado por certeza retórica no produce una decisión más esperanzadora; produce un juicio de proporcionalidad falso. La segunda es la deliberación como método (Gracia, 2001). Cuando los valores entran en conflicto, la decisión no se calcula, se delibera: identificar qué valores chocan, enumerar los cursos de acción extremos, buscar los intermedios y elegir el curso prudente que pueda defenderse en público. La deliberación es a los valores lo que el diagnóstico diferencial a las hipótesis: un método para no quedarse con la primera respuesta disponible. Los cursos extremos — «hacer todo», «no hacer nada» — casi nunca son los prudentes, y suelen ser los que se eligen cuando nadie deliberó.</w:t>
       </w:r>
     </w:p>
     <w:p>
@@ -8102,7 +8153,7 @@
         <w:pStyle w:val="BodyJ"/>
       </w:pPr>
       <w:r>
-        <w:t xml:space="preserve">Los marcadores tienen, además, su propio tiempo, y leerlos sin él fabrica falsos fracasos. La proteína C reactiva empieza a subir unas seis horas después del estímulo, alcanza su máximo alrededor de las 48 y tiene una vida media de unas 19 horas (Pepys &amp; Hirschfield, 2003). Una PCR de las 48 horas más alta que la del ingreso, en una neumonía cuyo paciente ya está afebril, comiendo y sin oxígeno, no es un fracaso del antibiótico sino la cinética esperada de un estímulo reciente. Escalar el tratamiento por ella es tratar al número. Lo que informa es el cuarto día. En la cohorte de Edimburgo, una PCR de ingreso bajo 100 mg/L se asoció con menos complicaciones y menos mortalidad (Chalmers et al., 2008). La caída de al menos la mitad al cuarto día se ha usado como marcador de estabilidad, aunque agrega poco a los criterios clínicos salvo para detectar la neumonía complicada (Akram et al., 2013). Es la lección del lactato del capítulo 1 con otro marcador: el estado del paciente manda sobre el número y la trayectoria manda sobre el valor aislado. Por eso una predicción útil lleva su plazo escrito: no «PCR en descenso», sino «PCR en descenso al cuarto día».</w:t>
+        <w:t xml:space="preserve">Los marcadores tienen, además, su propio tiempo, y leerlos sin él fabrica falsos fracasos. La proteína C reactiva empieza a subir unas seis horas después del estímulo, alcanza su máximo alrededor de las 48 y tiene una vida media de unas 19 horas (Pepys &amp; Hirschfield, 2003). Una PCR de las 48 horas más alta que la del ingreso, en una neumonía cuyo paciente ya está afebril, comiendo y sin oxígeno, no es un fracaso del antibiótico sino la cinética esperada de un estímulo reciente. Escalar el tratamiento por ella es tratar al número. Lo que informa es el cuarto día. En la cohorte de Edimburgo, una PCR de ingreso bajo 100 mg/L se asoció con menos complicaciones y menos mortalidad (Chalmers et al., 2008). La caída de al menos la mitad al cuarto día se ha usado como marcador de estabilidad, aunque agrega poco a los criterios clínicos salvo para detectar la neumonía complicada (Akram et al., 2013). Es la lección del lactato del capítulo 1 con otro marcador: el estado del paciente manda sobre el número y la trayectoria manda sobre el valor aislado. Una predicción útil lleva, entonces, su plazo escrito: no «PCR en descenso», sino «PCR en descenso al cuarto día».</w:t>
       </w:r>
     </w:p>
     <w:p>
@@ -8439,7 +8490,7 @@
         <w:pStyle w:val="BodyJ"/>
       </w:pPr>
       <w:r>
-        <w:t xml:space="preserve">Esta perspectiva cambia el estatuto del registro: no es una ventana neutra sobre el caso, sino un instrumento óptico con distorsiones propias. Los menús desplegables convierten un continuo en categorías administrativas; los campos obligatorios producen texto ritual; las frases autocompletadas homogeneizan descripciones que eran distintas. Nada de esto es neutral para el razonamiento, porque —como vimos en el capítulo 4— el equipo piensa con las representaciones que el artefacto le permite conservar. Una epistemología clínica operativa incluye, por eso, la crítica del formulario: preguntar qué vuelve visible, qué vuelve invisible y a quién sirve esa distribución. El médico no siempre puede rediseñar la plantilla; siempre puede saber qué le está haciendo a su percepción.</w:t>
+        <w:t xml:space="preserve">Esta perspectiva cambia el estatuto del registro: no es una ventana neutra sobre el caso, sino un instrumento óptico con distorsiones propias. Los menús desplegables convierten un continuo en categorías administrativas; los campos obligatorios producen texto ritual; las frases autocompletadas homogeneizan descripciones que eran distintas. Nada de esto es neutral para el razonamiento, porque —como vimos en el capítulo 4— el equipo piensa con las representaciones que el artefacto le permite conservar. Una epistemología clínica operativa incluye la crítica del formulario: preguntar qué vuelve visible, qué vuelve invisible y a quién sirve esa distribución. El médico no siempre puede rediseñar la plantilla; siempre puede saber qué le está haciendo a su percepción.</w:t>
       </w:r>
     </w:p>
     <w:p>
@@ -8810,38 +8861,6 @@
     </w:p>
     <w:p>
       <w:pPr>
-        <w:pStyle w:val="BodyJ"/>
-      </w:pPr>
-      <w:r>
-        <w:t xml:space="preserve">La misma neumonía, escrita como proceso, cabe en ocho líneas:</w:t>
-      </w:r>
-    </w:p>
-    <w:p>
-      <w:pPr>
-        <w:pStyle w:val="Quote1"/>
-      </w:pPr>
-      <w:r>
-        <w:t xml:space="preserve">Sospecho neumonía adquirida en la comunidad en un hombre de 67 años, diabético compensado, por fiebre de tres días, tos productiva, crépitos en la base derecha y opacidad nueva en la radiografía. Dudé de insuficiencia cardiaca (sin edema ni ingurgitación, radiografía sin congestión) y de embolia (sin factores de riesgo, dolor pleurítico ni hemoptisis): las degrado a poco probables, no las descarto. Descarto aspiración por anamnesis, no por imagen: no hubo vómito ni compromiso de conciencia. Priorizo la hipoxemia: saturación 92% ambiental y frecuencia respiratoria 26, oxígeno por naricera; sala y no intermedio, porque no hay hipotensión, confusión ni urea elevada. Infiero cobertura para neumococo y atípicos (ceftriaxona más macrólido); sin factores para Pseudomonas ni estafilococo resistente, sin indicación de anaerobios. Corticoides: no, sin criterios de gravedad, y su diabetes elevaría además el costo. Comprobaré a las 72 horas con dos predicciones: afebril y con menos oxígeno; PCR en descenso al cuarto día. Repetiré imagen sólo si persiste la fiebre o aparece matidez: el derrame es la complicación que busco. Reabrir si a las 72 horas no se cumple alguna de las dos predicciones.</w:t>
-      </w:r>
-    </w:p>
-    <w:p>
-      <w:pPr>
-        <w:pStyle w:val="BodyJ"/>
-      </w:pPr>
-      <w:r>
-        <w:t xml:space="preserve">Dos de esas líneas cargan evidencia que debe nombrarse. El «no» a los corticoides se apoya en que su beneficio en mortalidad se demostró en neumonía grave tratada en cuidados intensivos, no en sala: 6,2% con hidrocortisona frente a 11,9% con placebo a los 28 días (Dequin et al., 2023). La nota lo dice con una palabra: «sin criterios de gravedad». Y las guías no coinciden: la de la ATS y la IDSA de 2019 recomendó no usar corticoides de rutina, con fuerza en la neumonía no grave y con reservas en la grave, mientras que la actualización de 2024 de la Society of Critical Care Medicine, ya con ese ensayo sobre la mesa, los recomienda en la neumonía bacteriana grave hospitalizada (Metlay et al., 2019; Chaudhuri et al., 2024). La ficha de proceso no zanja el desacuerdo; deja escrito con qué umbral de gravedad lo resolvió. Y el «sin indicación de anaerobios» es un descarte con método, el de la anamnesis que no encontró aspiración, y por eso puede revisarse si la anamnesis cambia. La nota de proceso es apenas más larga que «Neumonía. Ceftriaxona» si se cuentan las líneas que una evolución típica dedica a repetir lo de ayer, y es otra cosa: cualquiera que la lea mañana sabe qué se pensó, qué quedó abierto y qué desmentiría el plan. El riesgo ya advertido —la nota que crece sin pensar— no se corre aquí: la ficha de proceso no escribe más; escribe lo que hoy no se escribe nunca.</w:t>
-      </w:r>
-    </w:p>
-    <w:p>
-      <w:pPr>
-        <w:pStyle w:val="BodyJ"/>
-      </w:pPr>
-      <w:r>
-        <w:t xml:space="preserve">El último verbo pide párrafo propio, porque es donde la ficha de resultados falla con más silencio: comprobar. «Neumonía. Ceftriaxona» no dice cuándo ni con qué se sabrá si funcionó, y así la respuesta se juzga con lo que llegue primero, que casi siempre es la PCR de las 48 horas. Si viene más alta que al ingreso, con el paciente afebril, comiendo y sin oxígeno, la nota de resultados no tiene con qué leerla y el reflejo es escalar el antibiótico. La ficha de proceso sí tiene con qué, porque escribió la predicción con su tiempo, la cinética del marcador que el capítulo 11 describió. Y la dejó anotada antes de que llegara el resultado: «una PCR alta a las 48 horas con paciente bien no reabre el caso; una PCR que no cae al cuarto día, sí».</w:t>
-      </w:r>
-    </w:p>
-    <w:p>
-      <w:pPr>
         <w:pStyle w:val="Heading3"/>
         <w:spacing w:after="120" w:before="280"/>
       </w:pPr>
@@ -8854,6 +8873,55 @@
           <w:sz w:val="25"/>
           <w:szCs w:val="25"/>
         </w:rPr>
+        <w:t xml:space="preserve">La neumonía escrita como proceso</w:t>
+      </w:r>
+    </w:p>
+    <w:p>
+      <w:pPr>
+        <w:pStyle w:val="BodyJ"/>
+      </w:pPr>
+      <w:r>
+        <w:t xml:space="preserve">La misma neumonía, escrita como proceso, cabe en ocho líneas:</w:t>
+      </w:r>
+    </w:p>
+    <w:p>
+      <w:pPr>
+        <w:pStyle w:val="Quote1"/>
+      </w:pPr>
+      <w:r>
+        <w:t xml:space="preserve">Sospecho neumonía adquirida en la comunidad en un hombre de 67 años, diabético compensado, por fiebre de tres días, tos productiva, crépitos en la base derecha y opacidad nueva en la radiografía. Dudé de insuficiencia cardiaca (sin edema ni ingurgitación, radiografía sin congestión) y de embolia (sin factores de riesgo, dolor pleurítico ni hemoptisis): las degrado a poco probables, no las descarto. Descarto aspiración por anamnesis, no por imagen: no hubo vómito ni compromiso de conciencia. Priorizo la hipoxemia: saturación 92% ambiental y frecuencia respiratoria 26, oxígeno por naricera; sala y no intermedio, porque no hay hipotensión, confusión ni urea elevada. Infiero cobertura para neumococo y atípicos (ceftriaxona más macrólido); sin factores para Pseudomonas ni estafilococo resistente, sin indicación de anaerobios. Corticoides: no, sin criterios de gravedad, y su diabetes elevaría además el costo. Comprobaré a las 72 horas con dos predicciones: afebril y con menos oxígeno; PCR en descenso al cuarto día. Repetiré imagen sólo si persiste la fiebre o aparece matidez: el derrame es la complicación que busco. Reabrir si a las 72 horas no se cumple alguna de las dos predicciones.</w:t>
+      </w:r>
+    </w:p>
+    <w:p>
+      <w:pPr>
+        <w:pStyle w:val="BodyJ"/>
+      </w:pPr>
+      <w:r>
+        <w:t xml:space="preserve">Dos de esas líneas cargan evidencia que debe nombrarse. El «no» a los corticoides se apoya en que su beneficio en mortalidad se demostró en neumonía grave tratada en cuidados intensivos, no en sala: 6,2% con hidrocortisona frente a 11,9% con placebo a los 28 días (Dequin et al., 2023). La nota lo dice con una palabra: «sin criterios de gravedad». Y las guías no coinciden: la de la ATS y la IDSA de 2019 recomendó no usar corticoides de rutina, con fuerza en la neumonía no grave y con reservas en la grave (Metlay et al., 2019). La actualización de 2024 de la Society of Critical Care Medicine, ya con ese ensayo sobre la mesa, los recomienda en la neumonía bacteriana grave hospitalizada (Chaudhuri et al., 2024). La ficha de proceso no zanja el desacuerdo; deja escrito con qué umbral de gravedad lo resolvió. Y el «sin indicación de anaerobios» es un descarte con método, el de la anamnesis que no encontró aspiración, y por eso puede revisarse si la anamnesis cambia. La nota de proceso es apenas más larga que «Neumonía. Ceftriaxona» si se cuentan las líneas que una evolución típica dedica a repetir lo de ayer, y es otra cosa: cualquiera que la lea mañana sabe qué se pensó, qué quedó abierto y qué desmentiría el plan. El riesgo ya advertido —la nota que crece sin pensar— no se corre aquí: la ficha de proceso no escribe más; escribe lo que hoy no se escribe nunca.</w:t>
+      </w:r>
+    </w:p>
+    <w:p>
+      <w:pPr>
+        <w:pStyle w:val="BodyJ"/>
+      </w:pPr>
+      <w:r>
+        <w:t xml:space="preserve">El último verbo pide párrafo propio, porque es donde la ficha de resultados falla con más silencio: comprobar. «Neumonía. Ceftriaxona» no dice cuándo ni con qué se sabrá si funcionó, y así la respuesta se juzga con lo que llegue primero, que casi siempre es la PCR de las 48 horas. Si viene más alta que al ingreso, con el paciente afebril, comiendo y sin oxígeno, la nota de resultados no tiene con qué leerla y el reflejo es escalar el antibiótico. La ficha de proceso sí tiene con qué, porque escribió la predicción con su tiempo, la cinética del marcador que el capítulo 11 describió. Y la dejó anotada antes de que llegara el resultado: «una PCR alta a las 48 horas con paciente bien no reabre el caso; una PCR que no cae al cuarto día, sí».</w:t>
+      </w:r>
+    </w:p>
+    <w:p>
+      <w:pPr>
+        <w:pStyle w:val="Heading3"/>
+        <w:spacing w:after="120" w:before="280"/>
+      </w:pPr>
+      <w:r>
+        <w:rPr>
+          <w:rFonts w:ascii="Georgia" w:cs="Georgia" w:eastAsia="Georgia" w:hAnsi="Georgia"/>
+          <w:b/>
+          <w:bCs/>
+          <w:color w:val="2B2B2B"/>
+          <w:sz w:val="25"/>
+          <w:szCs w:val="25"/>
+        </w:rPr>
         <w:t xml:space="preserve">Temporalidad y revisión</w:t>
       </w:r>
     </w:p>
@@ -9774,7 +9842,7 @@
         <w:pStyle w:val="BodyJ"/>
       </w:pPr>
       <w:r>
-        <w:t xml:space="preserve">Hay una frase de tres palabras que me tomó años aprender a pronunciar frente a la familia de un paciente grave: «no lo sé». La primera vez que me atreví a decirla completa —«todavía no sé con certeza por qué empeoró hoy; pero sí sé qué complicaciones graves ya descartamos, sé qué variables vamos a vigilar esta noche y sé a qué hora de mañana tendremos nuevos resultados»— temía provocar desconfianza o angustia. Encontré exactamente lo contrario: alivio. Esa familia no exigía que yo fuera omnisciente; necesitaba saber que nuestra incertidumbre estaba gobernada por un plan. Este capítulo trata de la distancia moral y técnica que separa el aparentar seguridad del ejercer responsabilidad.</w:t>
+        <w:t xml:space="preserve">Hay una frase de tres palabras que me tomó años aprender a pronunciar frente a la familia de un paciente grave: «no lo sé». La primera vez que me atreví a decirla completa —«todavía no sé con certeza por qué empeoró hoy; pero sí sé qué complicaciones graves ya descartamos, sé qué variables vamos a vigilar esta noche y sé a qué hora de mañana tendremos nuevos resultados»— temía provocar desconfianza o angustia. Encontré lo contrario: alivio. Esa familia no exigía que yo fuera omnisciente; necesitaba saber que nuestra incertidumbre estaba gobernada por un plan. Este capítulo trata de la distancia moral y técnica que separa el aparentar seguridad del ejercer responsabilidad.</w:t>
       </w:r>
     </w:p>
     <w:p>
@@ -9956,7 +10024,7 @@
         <w:pStyle w:val="BodyJ"/>
       </w:pPr>
       <w:r>
-        <w:t xml:space="preserve">La filosofía del testimonio ayuda a precisar qué significa «evaluar sin descartar». Contra la sospecha heredada del empirismo —que creerle a otro es siempre conocimiento de segunda categoría—, Coady sostuvo que el testimonio es una fuente básica de conocimiento, tan constitutiva como la percepción o la memoria. Sin una confianza por defecto en lo que otros informan, ni la ciencia ni la vida cotidiana serían posibles (Coady, 1992, caps. 4 y 8). Lackey corrigió el exceso opuesto: la confianza por defecto no es un cheque en blanco; el oyente responsable mantiene una sensibilidad activa a las señales de error o engaño, y el conocimiento testimonial se logra cuando ambas condiciones —decir fiable y escuchar vigilante— se cumplen a la vez (Lackey, 2008, caps. 6-7). La anamnesis es ese contrato epistémico: el paciente aporta un informe que el médico no puede obtener por ninguna otra vía, y el médico aporta el examen de consistencia, forma temporal y relación con otros hallazgos. Ni credulidad ni auditoría hostil: recepción con estándares. La injusticia testimonial es, en estos términos, un fallo del segundo contratante: aplicar a ciertos hablantes un estándar de vigilancia que no se aplica a otros, por razones que nada tienen que ver con la fiabilidad de su informe.</w:t>
+        <w:t xml:space="preserve">La filosofía del testimonio ayuda a precisar qué significa «evaluar sin descartar». Contra la sospecha heredada del empirismo —que creerle a otro es siempre conocimiento de segunda categoría—, Coady sostuvo que el testimonio es una fuente básica de conocimiento, tan constitutiva como la percepción o la memoria. Sin una confianza por defecto en lo que otros informan, ni la ciencia ni la vida cotidiana serían posibles (Coady, 1992, caps. 4 y 8). Lackey corrigió el exceso opuesto: la confianza por defecto no es un cheque en blanco. El oyente responsable mantiene una sensibilidad activa a las señales de error o engaño, y el conocimiento testimonial se logra cuando ambas condiciones —decir fiable y escuchar vigilante— se cumplen a la vez (Lackey, 2008, caps. 6-7). La anamnesis es ese contrato epistémico: el paciente aporta un informe que el médico no puede obtener por ninguna otra vía, y el médico aporta el examen de consistencia, forma temporal y relación con otros hallazgos. Ni credulidad ni auditoría hostil: recepción con estándares. La injusticia testimonial es, en estos términos, un fallo del segundo contratante: aplicar a ciertos hablantes un estándar de vigilancia que no se aplica a otros, por razones que nada tienen que ver con la fiabilidad de su informe.</w:t>
       </w:r>
     </w:p>
     <w:p>
@@ -10126,7 +10194,7 @@
         <w:t xml:space="preserve">En una frase.</w:t>
       </w:r>
       <w:r>
-        <w:t xml:space="preserve"> Afirmar, dudar y recomendar son actos morales: la humildad epistémica bien entendida produce decisiones más firmes, no más tibias, porque cada afirmación carga exactamente el peso que puede sostener.</w:t>
+        <w:t xml:space="preserve"> Afirmar, dudar y recomendar son actos morales: la humildad epistémica bien entendida produce decisiones más firmes, no más tibias, porque cada afirmación carga sólo el peso que puede sostener.</w:t>
       </w:r>
     </w:p>
     <w:p>
@@ -12814,7 +12882,7 @@
         <w:t xml:space="preserve">Lectura metacognitiva.</w:t>
       </w:r>
       <w:r>
-        <w:t xml:space="preserve"> Aquí la injusticia testimonial —descontar el relato por quién lo dice— tiene mortalidad: no es sólo un agravio moral sino un mecanismo causal de la brecha de 15 a 20 años de vida. Nótese el movimiento epistémico central: cuando el testimonio y el examen valen menos de lo habitual, el estándar de estudio objetivo sube en compensación. El ensombrecimiento hace exactamente lo contrario — usa la dificultad como excusa para bajar el estándar — y por eso mata.</w:t>
+        <w:t xml:space="preserve"> Aquí la injusticia testimonial —descontar el relato por quién lo dice— tiene mortalidad: no es sólo un agravio moral sino un mecanismo causal de la brecha de 15 a 20 años de vida. Nótese el movimiento epistémico central: cuando el testimonio y el examen valen menos de lo habitual, el estándar de estudio objetivo sube en compensación. El ensombrecimiento hace lo contrario — usa la dificultad como excusa para bajar el estándar — y por eso mata.</w:t>
       </w:r>
     </w:p>
     <w:p>
@@ -12902,7 +12970,7 @@
         <w:pStyle w:val="BodyJ"/>
       </w:pPr>
       <w:r>
-        <w:t xml:space="preserve">La metacognición suele presentarse como una habilidad personal: el médico debe ser humilde, reflexivo y consciente de sus sesgos. Esa expectativa es insuficiente si el sistema oculta resultados, interrumpe el trabajo, fragmenta información y castiga la duda. La lucidez necesita infraestructura. Y esa infraestructura incluye los turnos: un servicio que deja las decisiones mayores para la hora veinte de una guardia está decidiendo con un instrumento degradado (capítulo 8), y el diseño de los horarios es, por eso, una decisión epistémica antes que administrativa.</w:t>
+        <w:t xml:space="preserve">La metacognición suele presentarse como una habilidad personal: el médico debe ser humilde, reflexivo y consciente de sus sesgos. Esa expectativa es insuficiente si el sistema oculta resultados, interrumpe el trabajo, fragmenta información y castiga la duda. La lucidez necesita infraestructura. Y esa infraestructura incluye los turnos: un servicio que deja las decisiones mayores para la hora veinte de una guardia está decidiendo con un instrumento degradado (capítulo 8), y el diseño de los horarios es, en consecuencia, una decisión epistémica antes que administrativa.</w:t>
       </w:r>
     </w:p>
     <w:p>
@@ -13639,7 +13707,7 @@
         <w:pStyle w:val="BodyJ"/>
       </w:pPr>
       <w:r>
-        <w:t xml:space="preserve">El mecanismo es preciso. Escribir la nota clínica no es registrar un pensamiento terminado: seleccionar qué dato importa, jerarquizarlo y estructurarlo es parte del proceso mismo de pensar — la ficha como instrumento de pensamiento. Por eso la automatización completa de la escritura clínica no ahorra sólo tiempo: puede eliminar la instancia en la que el clínico construye su razonamiento, degradando el registro y al registrador a la vez (McCoy et al., 2024). La ecuación hay que escribirla entera: ahorro de trabajo cognitivo inmediato, a cambio de las operaciones mediante las cuales se construye la competencia.</w:t>
+        <w:t xml:space="preserve">El mecanismo es preciso. Escribir la nota clínica no es registrar un pensamiento terminado: seleccionar qué dato importa, jerarquizarlo y estructurarlo es parte del proceso mismo de pensar — la ficha como instrumento de pensamiento. De ahí que la automatización completa de la escritura clínica no ahorre sólo tiempo: puede eliminar la instancia en la que el clínico construye su razonamiento, degradando el registro y al registrador a la vez (McCoy et al., 2024). La ecuación hay que escribirla entera: ahorro de trabajo cognitivo inmediato, a cambio de las operaciones mediante las cuales se construye la competencia.</w:t>
       </w:r>
     </w:p>
     <w:p>
@@ -13655,7 +13723,7 @@
         <w:pStyle w:val="BodyJ"/>
       </w:pPr>
       <w:r>
-        <w:t xml:space="preserve">La aviación conoce esta trampa con nombre propio: la paradoja de la automatización (automation paradox) — cuanto más competente es el sistema, menos ejercita el humano las habilidades necesarias para detectar cuándo falla, que es exactamente cuando más se lo necesita (Abdulnour et al., 2026). La respuesta pedagógica propuesta frente a ella coincide, casi palabra por palabra, con lo que vienen pidiendo los capítulos anteriores: razonar primero de forma independiente, consultar después, y usar la IA para desafiar, ampliar o refinar ese razonamiento — nunca para reemplazar su ejecución.</w:t>
+        <w:t xml:space="preserve">La aviación conoce esta trampa con nombre propio: la paradoja de la automatización (automation paradox) — cuanto más competente es el sistema, menos ejercita el humano las habilidades necesarias para detectar cuándo falla, que es cuando más se lo necesita (Abdulnour et al., 2026). La respuesta pedagógica propuesta frente a ella coincide, casi palabra por palabra, con lo que vienen pidiendo los capítulos anteriores: razonar primero de forma independiente, consultar después, y usar la IA para desafiar, ampliar o refinar ese razonamiento — nunca para reemplazar su ejecución.</w:t>
       </w:r>
     </w:p>
     <w:p>
@@ -14093,7 +14161,7 @@
         <w:t xml:space="preserve">Solución comentada.</w:t>
       </w:r>
       <w:r>
-        <w:t xml:space="preserve"> En ejercicios docentes, tres hallazgos vuelven una y otra vez. Primero, el color 2 aparece más de lo esperado: el modelo rellena huecos con verosimilitud — una evolución «esperable», un factor de riesgo «presumible» — y esa es exactamente la definición de confabulación; contarlas cura más que leer sobre ellas. Segundo, el color 3 suele ser genérico («se sugiere correlacionar con la clínica») y no específico del caso: incertidumbre de fórmula, no de contenido — compárela con la que exige el léxico de certeza. Tercero, la respuesta a la segunda pregunta suele ser mejor que la primera: el modelo enumera con soltura los datos que refutarían su propia propuesta — pero sólo si alguien se lo pide. La herramienta contiene su propio antídoto; la pregunta que lo libera sigue siendo humana.</w:t>
+        <w:t xml:space="preserve"> En ejercicios docentes, tres hallazgos vuelven una y otra vez. Primero, el color 2 aparece más de lo esperado: el modelo rellena huecos con verosimilitud — una evolución «esperable», un factor de riesgo «presumible» — y esa es la definición de confabulación; contarlas cura más que leer sobre ellas. Segundo, el color 3 suele ser genérico («se sugiere correlacionar con la clínica») y no específico del caso: incertidumbre de fórmula, no de contenido — compárela con la que exige el léxico de certeza. Tercero, la respuesta a la segunda pregunta suele ser mejor que la primera: el modelo enumera con soltura los datos que refutarían su propia propuesta — pero sólo si alguien se lo pide. La herramienta contiene su propio antídoto; la pregunta que lo libera sigue siendo humana.</w:t>
       </w:r>
     </w:p>
     <w:p>
@@ -14108,7 +14176,7 @@
         <w:t xml:space="preserve">En una frase.</w:t>
       </w:r>
       <w:r>
-        <w:t xml:space="preserve"> La IA generativa produce exactamente aquello contra lo que este libro entrena: prosa fluida donde hechos, inferencias e incertidumbre llegan mezclados — auditarla con HII-D es el mismo ejercicio que auditar la propia escritura.</w:t>
+        <w:t xml:space="preserve"> La IA generativa produce aquello contra lo que este libro entrena: prosa fluida donde hechos, inferencias e incertidumbre llegan mezclados — auditarla con HII-D es el mismo ejercicio que auditar la propia escritura.</w:t>
       </w:r>
     </w:p>
     <w:p>
@@ -14360,7 +14428,7 @@
         <w:pStyle w:val="BodyJ"/>
       </w:pPr>
       <w:r>
-        <w:t xml:space="preserve">Si el parentesco es real, leer poesía no es un lujo cultural del médico, sino gimnasio específico. Entrena la precisión léxica — el poeta agoniza entre dos palabras casi iguales, que es exactamente la distancia entre «descartado» y «sin evidencia actual de». Entrena la tolerancia a la ambigüedad sostenida — un poema no se «resuelve», se habita; como ciertas incertidumbres clínicas. Entrena el oído para el relato: la anamnesis tiene ritmo, silencios y palabras elegidas, y «esta vez la hernia no se dejó acomodar» es, técnicamente, un verso — el capítulo 1 pidió conservarlo textual por razones epistémicas; este capítulo agrega la razón estética, que es la misma. Y entrena, con Parra, la resistencia a la solemnidad: nadie que haya leído antipoesía vuelve a escribir «se procede a realizar manejo multidisciplinario integral» sin sonrojarse.</w:t>
+        <w:t xml:space="preserve">Si el parentesco es real, leer poesía no es un lujo cultural del médico, sino gimnasio específico. Entrena la precisión léxica — el poeta agoniza entre dos palabras casi iguales, que es la distancia entre «descartado» y «sin evidencia actual de». Entrena la tolerancia a la ambigüedad sostenida — un poema no se «resuelve», se habita; como ciertas incertidumbres clínicas. Entrena el oído para el relato: la anamnesis tiene ritmo, silencios y palabras elegidas, y «esta vez la hernia no se dejó acomodar» es, técnicamente, un verso — el capítulo 1 pidió conservarlo textual por razones epistémicas; este capítulo agrega la razón estética, que es la misma. Y entrena, con Parra, la resistencia a la solemnidad: nadie que haya leído antipoesía vuelve a escribir «se procede a realizar manejo multidisciplinario integral» sin sonrojarse.</w:t>
       </w:r>
     </w:p>
     <w:p>

</xml_diff>

<commit_message>
Libro: DOCX, PDF y EPUB reconstruidos con el Prefacio nuevo
Reconstrucción completa desde las fuentes (cotejo de figuras sin derivas, figuras sin cambios, DOCX en dos pasadas con el índice de páginas reales, PDF con LibreOffice, EPUB con pandoc). Mismas 166 páginas físicas y el mismo índice; el PDF no contiene ya «historia clínica» ni «no sustentado».

Co-Authored-By: Claude Opus 5.5 <noreply@anthropic.com>
Claude-Session: https://claude.ai/code/session_01SPkhDdVzUCxJwqq61ddeLW
</commit_message>
<xml_diff>
--- a/libro/Hechos_inferencias_incertidumbre_edicion_revisada.docx
+++ b/libro/Hechos_inferencias_incertidumbre_edicion_revisada.docx
@@ -1003,7 +1003,7 @@
         <w:pStyle w:val="BodyJ"/>
       </w:pPr>
       <w:r>
-        <w:t xml:space="preserve">Durante mi residencia escribí una frase que tardé años en devolver a su tamaño real. El paciente había vomitado durante la noche; en la radiografía de la mañana aparecieron infiltrados basales. Yo escribí: «neumonía aspirativa». Dos palabras limpias y verosímiles que saltaban sin escalas desde el vómito y la sombra radiológica hasta una infección bacteriana establecida. La frase viajó conmigo a la entrega de turno, de la entrega a la visita médica, de la visita a la epicrisis y de la epicrisis a la nota de ingreso siguiente, meses después, redactada por alguien que nunca vio al paciente vomitar. Nadie mintió en ningún momento. Pero en algún punto del trayecto una hipótesis razonable se había convertido en un antecedente, y el antecedente en un hecho. Cuando volví a encontrar la frase, ya nadie recordaba que había nacido siendo una conjetura mía, escrita a las siete de la mañana, con la certeza frágil de quien lleva doce horas de turno.</w:t>
+        <w:t xml:space="preserve">Durante mi residencia escribí una frase que tardé años en devolver a su tamaño real. La enfermera de noche había anotado un vómito a las tres de la madrugada. Nadie vio al paciente aspirar; no tuvo fiebre ni disnea nueva, no cambió su requerimiento de oxígeno, y en la radiografía de la mañana aparecieron infiltrados basales que no teníamos con qué comparar, porque no había una placa previa. Yo escribí: «neumonía aspirativa». Dos palabras limpias y verosímiles que saltaban sin escalas desde un vómito referido y una sombra radiológica hasta una infección bacteriana establecida. Si hubo aspiración, y nadie la presenció, pudo causar una neumonitis química, que no se trata con antibióticos, o una neumonía bacteriana, que sí; la radiografía no distingue entre ambas, y sin placa previa ni siquiera sabíamos si esos infiltrados eran nuevos. Mi frase eligió la neumonía sin un solo dato que la separara de las otras posibilidades. La frase viajó conmigo a la entrega de turno, de la entrega a la visita médica, de la visita a la epicrisis y de la epicrisis a la nota de ingreso siguiente, meses después, redactada por alguien que nunca vio al paciente vomitar. Nadie mintió en ningún momento. Pero en algún punto del trayecto una hipótesis razonable se había convertido en un antecedente, y el antecedente en un hecho. Cuando volví a encontrar la frase, ya nadie recordaba que había nacido siendo una conjetura mía, escrita a las siete de la mañana, con la certeza frágil de quien lleva doce horas de turno.</w:t>
       </w:r>
     </w:p>
     <w:p>
@@ -1732,7 +1732,7 @@
         <w:pStyle w:val="BodyJ"/>
       </w:pPr>
       <w:r>
-        <w:t xml:space="preserve">Los hechos clínicos son incompletos por diseño. Ninguna anamnesis recoge toda la experiencia del paciente, ningún examen físico agota el cuerpo y ningún panel de laboratorio representa la totalidad del proceso biológico. La historia clínica es una muestra orientada por preguntas. Lo que no se pregunta puede quedar inexistente en el registro, aunque haya estado presente en la realidad.</w:t>
+        <w:t xml:space="preserve">Los hechos clínicos son incompletos por diseño. Ninguna anamnesis recoge toda la experiencia del paciente, ningún examen físico agota el cuerpo y ningún panel de laboratorio representa la totalidad del proceso biológico. La ficha clínica es una muestra orientada por preguntas. Lo que no se pregunta puede quedar inexistente en el registro, aunque haya estado presente en la realidad.</w:t>
       </w:r>
     </w:p>
     <w:p>
@@ -13332,7 +13332,7 @@
         <w:pStyle w:val="BodyJ"/>
       </w:pPr>
       <w:r>
-        <w:t xml:space="preserve">Los grandes modelos de lenguaje generan continuaciones plausibles a partir de patrones aprendidos en enormes corpus. Su fluidez puede producir respuestas clínicamente útiles, pero también afirmaciones falsas presentadas con coherencia. La literatura denomina hallucination a contenido no sustentado o inconsistente con la fuente o el mundo (Ji et al., 2023). El término es metafórico: el modelo no tiene una experiencia perceptiva que se desorganice como en la alucinación humana.</w:t>
+        <w:t xml:space="preserve">Los grandes modelos de lenguaje generan continuaciones plausibles a partir de patrones aprendidos en enormes corpus. Su fluidez puede producir respuestas clínicamente útiles, pero también afirmaciones falsas presentadas con coherencia. La literatura denomina hallucination al contenido generado que carece de sentido o es infiel a su fuente, sea un documento o, en las preguntas abiertas, el conocimiento del mundo (Ji et al., 2023). El término es metafórico: el modelo no tiene una experiencia perceptiva que se desorganice como en la alucinación humana.</w:t>
       </w:r>
     </w:p>
     <w:p>
@@ -13450,7 +13450,7 @@
         <w:t xml:space="preserve">Confabulación.</w:t>
       </w:r>
       <w:r>
-        <w:t xml:space="preserve"> Contenido no sustentado presentado con coherencia (Ji et al., 2023). Es la certeza retórica industrializada: prosa donde los hechos, las inferencias y lo inventado llegan con la misma sintaxis.</w:t>
+        <w:t xml:space="preserve"> Contenido que contradice la fuente o que ésta no permite verificar, presentado con coherencia (Ji et al., 2023). Es la certeza retórica industrializada: prosa donde los hechos, las inferencias y lo inventado llegan con la misma sintaxis.</w:t>
       </w:r>
     </w:p>
     <w:p>

</xml_diff>